<commit_message>
feat: add Phase II.2, II.3, II.4 with full content
Added to section-account-ii.md:
- II.2 Noun extraction: 5-step process (prose → noun list → cardinality → composition)
- II.3 BCE analysis: React architecture, 8 Boundary classes, 10 methods with reasoning
- II.4 Analysis sequences: 5 PlantUML diagrams + "Kịch bản phiên bản 2" narratives

New diagrams:
- account_entity_analysis.png (analysis entity diagram)
- account_bce_analysis.png (BCE class diagram)

Fixed:
- Exception format: 6a → 6.1 (dot notation per skill)
- DOCX regenerated: 326 paragraphs, 22 tables, 8 images

Co-Authored-By: Claude Opus 4.7 <noreply@anthropic.com>
</commit_message>
<xml_diff>
--- a/output/account_module.docx
+++ b/output/account_module.docx
@@ -1710,7 +1710,7 @@
               <w:rPr>
                 <w:sz w:val="20"/>
               </w:rPr>
-              <w:t>6a. Tài khoản không tồn tại: Hiển thị "Tài khoản không tồn tại. Vui lòng kiểm tra lại."</w:t>
+              <w:t>6.1. Tài khoản không tồn tại: Hiển thị "Tài khoản không tồn tại. Vui lòng kiểm tra lại."</w:t>
             </w:r>
             <w:r>
               <w:br/>
@@ -1719,7 +1719,7 @@
               <w:rPr>
                 <w:sz w:val="20"/>
               </w:rPr>
-              <w:t>6b. Mật khẩu không khớp: Hiển thị "Mật khẩu không chính xác. Còn [N] lần thử." Sau 5 lần sai → khóa 15 phút.</w:t>
+              <w:t>6.2. Mật khẩu không khớp: Hiển thị "Mật khẩu không chính xác. Còn [N] lần thử." Sau 5 lần sai → khóa 15 phút.</w:t>
             </w:r>
           </w:p>
         </w:tc>
@@ -2025,7 +2025,7 @@
               <w:rPr>
                 <w:sz w:val="20"/>
               </w:rPr>
-              <w:t>5a. SĐT đã tồn tại: "SĐT này đã được sử dụng."</w:t>
+              <w:t>5.1. SĐT đã tồn tại: "SĐT này đã được sử dụng."</w:t>
             </w:r>
             <w:r>
               <w:br/>
@@ -2034,7 +2034,7 @@
               <w:rPr>
                 <w:sz w:val="20"/>
               </w:rPr>
-              <w:t>5b. MK không khớp: Highlight ô xác nhận MK, "Mật khẩu không khớp."</w:t>
+              <w:t>5.2. MK không khớp: Highlight ô xác nhận MK, "Mật khẩu không khớp."</w:t>
             </w:r>
             <w:r>
               <w:br/>
@@ -2043,7 +2043,7 @@
               <w:rPr>
                 <w:sz w:val="20"/>
               </w:rPr>
-              <w:t>9a. OTP sai: "Mã OTP không đúng. Vui lòng thử lại." (tối đa 3 lần)</w:t>
+              <w:t>9.1. OTP sai: "Mã OTP không đúng. Vui lòng thử lại." (tối đa 3 lần)</w:t>
             </w:r>
             <w:r>
               <w:br/>
@@ -2052,7 +2052,7 @@
               <w:rPr>
                 <w:sz w:val="20"/>
               </w:rPr>
-              <w:t>9b. OTP hết hạn: "Mã OTP đã hết hạn." Nhấn "Gửi lại OTP".</w:t>
+              <w:t>9.2. OTP hết hạn: "Mã OTP đã hết hạn." Nhấn "Gửi lại OTP".</w:t>
             </w:r>
           </w:p>
         </w:tc>
@@ -2349,7 +2349,7 @@
               <w:rPr>
                 <w:sz w:val="20"/>
               </w:rPr>
-              <w:t>5a. MK hiện tại sai: "Mật khẩu hiện tại không chính xác."</w:t>
+              <w:t>5.1. MK hiện tại sai: "Mật khẩu hiện tại không chính xác."</w:t>
             </w:r>
             <w:r>
               <w:br/>
@@ -2358,7 +2358,7 @@
               <w:rPr>
                 <w:sz w:val="20"/>
               </w:rPr>
-              <w:t>6a. MK mới không đủ mạnh: Highlight ô, hiển thị yêu cầu còn thiếu.</w:t>
+              <w:t>6.1. MK mới không đủ mạnh: Highlight ô, hiển thị yêu cầu còn thiếu.</w:t>
             </w:r>
             <w:r>
               <w:br/>
@@ -2367,7 +2367,7 @@
               <w:rPr>
                 <w:sz w:val="20"/>
               </w:rPr>
-              <w:t>7a. MK mới trùng MK cũ: "Mật khẩu mới không được trùng mật khẩu hiện tại."</w:t>
+              <w:t>7.1. MK mới trùng MK cũ: "Mật khẩu mới không được trùng mật khẩu hiện tại."</w:t>
             </w:r>
           </w:p>
         </w:tc>
@@ -2655,7 +2655,7 @@
               <w:rPr>
                 <w:sz w:val="20"/>
               </w:rPr>
-              <w:t>7a. Email đã được dùng: "Email này đã được đăng ký bởi tài khoản khác."</w:t>
+              <w:t>7.1. Email đã được dùng: "Email này đã được đăng ký bởi tài khoản khác."</w:t>
             </w:r>
             <w:r>
               <w:br/>
@@ -2664,7 +2664,7 @@
               <w:rPr>
                 <w:sz w:val="20"/>
               </w:rPr>
-              <w:t>3a. Thay đổi SĐT: Yêu cầu xác minh OTP gửi đến SĐT hiện tại → SĐT mới → OTP mới.</w:t>
+              <w:t>3.1. Thay đổi SĐT: Yêu cầu xác minh OTP gửi đến SĐT hiện tại → SĐT mới → OTP mới.</w:t>
             </w:r>
           </w:p>
         </w:tc>
@@ -2916,7 +2916,7 @@
               <w:rPr>
                 <w:sz w:val="20"/>
               </w:rPr>
-              <w:t>3a. SĐT đã tồn tại: "SĐT này đã được sử dụng."</w:t>
+              <w:t>3.1. SĐT đã tồn tại: "SĐT này đã được sử dụng."</w:t>
             </w:r>
             <w:r>
               <w:br/>
@@ -2925,12 +2925,2161 @@
               <w:rPr>
                 <w:sz w:val="20"/>
               </w:rPr>
-              <w:t>3c. Nhân viên đang xử lý order: Không thể xóa, hiển thị cảnh báo.</w:t>
+              <w:t>3.2. Nhân viên đang xử lý order: Không thể xóa, hiển thị cảnh báo.</w:t>
             </w:r>
           </w:p>
         </w:tc>
       </w:tr>
     </w:tbl>
+    <w:p>
+      <w:pPr>
+        <w:pStyle w:val="Heading2"/>
+      </w:pPr>
+      <w:r>
+        <w:t>2. Mô hình hóa lớp</w:t>
+      </w:r>
+    </w:p>
+    <w:p>
+      <w:pPr>
+        <w:pStyle w:val="Heading3"/>
+      </w:pPr>
+      <w:r>
+        <w:t>Bước 1 – Mô tả chức năng bằng đoạn văn xuôi</w:t>
+      </w:r>
+    </w:p>
+    <w:p>
+      <w:pPr/>
+      <w:r>
+        <w:t>Hệ thống cho phép khách hàng đăng ký tài khoản hội viên mới bằng cách cung cấp họ tên, số điện thoại, email và mật khẩu; sau đó xác minh số điện thoại qua mã OTP trước khi hoàn tất đăng ký. Mỗi tài khoản gắn liền với một hạng hội viên (Thường, Bạc, Vàng, Kim Cương) dựa trên điểm tích lũy. Người dùng sau khi đăng nhập có thể xem và cập nhật thông tin cá nhân như họ tên và email, hoặc thực hiện đổi mật khẩu bằng cách xác minh mật khẩu cũ rồi nhập mật khẩu mới. Hệ thống ghi nhận các phiên đăng nhập để phục vụ bảo mật và thu hồi phiên khi đổi mật khẩu. Ngoài ra, chủ doanh nghiệp có quyền quản lý tài khoản nhân viên: tạo, chỉnh sửa và xóa tài khoản nhân viên trong hệ thống.</w:t>
+      </w:r>
+    </w:p>
+    <w:p>
+      <w:pPr>
+        <w:pStyle w:val="Heading3"/>
+      </w:pPr>
+      <w:r>
+        <w:t>Bước 2 + 3 – Trích danh từ và đánh giá</w:t>
+      </w:r>
+    </w:p>
+    <w:p>
+      <w:pPr/>
+      <w:r>
+        <w:t>▪ Hệ thống → loại: quá chung, không phải thực thể nghiệp vụ</w:t>
+      </w:r>
+    </w:p>
+    <w:p>
+      <w:pPr/>
+      <w:r>
+        <w:t>▪ Khách hàng → lớp NguoiDung: hoTen, soDienThoai, email, matKhau, ngayTao</w:t>
+      </w:r>
+    </w:p>
+    <w:p>
+      <w:pPr/>
+      <w:r>
+        <w:t>▪ Tài khoản → thuộc về NguoiDung (gộp vào NguoiDung, tránh tách thừa)</w:t>
+      </w:r>
+    </w:p>
+    <w:p>
+      <w:pPr/>
+      <w:r>
+        <w:t>▪ Họ tên → thuộc tính của NguoiDung</w:t>
+      </w:r>
+    </w:p>
+    <w:p>
+      <w:pPr/>
+      <w:r>
+        <w:t>▪ Số điện thoại → thuộc tính của NguoiDung (dùng làm username đăng nhập)</w:t>
+      </w:r>
+    </w:p>
+    <w:p>
+      <w:pPr/>
+      <w:r>
+        <w:t>▪ Email → thuộc tính của NguoiDung</w:t>
+      </w:r>
+    </w:p>
+    <w:p>
+      <w:pPr/>
+      <w:r>
+        <w:t>▪ Mật khẩu → thuộc tính của NguoiDung (lưu dạng mã hóa bcrypt)</w:t>
+      </w:r>
+    </w:p>
+    <w:p>
+      <w:pPr/>
+      <w:r>
+        <w:t>▪ Ngày tham gia → thuộc tính ngayTao của NguoiDung</w:t>
+      </w:r>
+    </w:p>
+    <w:p>
+      <w:pPr/>
+      <w:r>
+        <w:t>▪ Hạng hội viên → lớp HangHoiVien: tenHang, diemToiThieu, moTa, heSoUuDai</w:t>
+      </w:r>
+    </w:p>
+    <w:p>
+      <w:pPr/>
+      <w:r>
+        <w:t>▪ Điểm tích lũy → thuộc tính diemTichLuy của NguoiDung</w:t>
+      </w:r>
+    </w:p>
+    <w:p>
+      <w:pPr/>
+      <w:r>
+        <w:t>▪ Mã OTP → lớp OTP: maOTP, loai (DANG_KY/DOI_SDT), thoiHanHetHan, daXacMinh</w:t>
+      </w:r>
+    </w:p>
+    <w:p>
+      <w:pPr/>
+      <w:r>
+        <w:t>▪ Phiên đăng nhập → lớp PhienDangNhap: tokenPhien, thoiGianDangNhap, thoiGianHetHan, thietBi</w:t>
+      </w:r>
+    </w:p>
+    <w:p>
+      <w:pPr/>
+      <w:r>
+        <w:t>▪ Lịch sử → loại: quá chung → cụ thể là PhienDangNhap đã đủ</w:t>
+      </w:r>
+    </w:p>
+    <w:p>
+      <w:pPr/>
+      <w:r>
+        <w:t>▪ Danh sách → loại: không phải thực thể</w:t>
+      </w:r>
+    </w:p>
+    <w:p>
+      <w:pPr/>
+      <w:r>
+        <w:t>▪ Giao diện → loại: là Boundary, không phải Entity</w:t>
+      </w:r>
+    </w:p>
+    <w:p>
+      <w:pPr/>
+      <w:r>
+        <w:t>▪ Nhân viên → lớp NhanVien: hoTen, vaiTro, chiNhanh, trangThai</w:t>
+      </w:r>
+    </w:p>
+    <w:p>
+      <w:pPr/>
+      <w:r>
+        <w:t>▪ Chủ doanh nghiệp → loại: actor, không phải thực thể dữ liệu</w:t>
+      </w:r>
+    </w:p>
+    <w:p>
+      <w:pPr>
+        <w:pStyle w:val="Heading3"/>
+      </w:pPr>
+      <w:r>
+        <w:t>Bước 4 – Xác định quan hệ số lượng</w:t>
+      </w:r>
+    </w:p>
+    <w:p>
+      <w:pPr/>
+      <w:r>
+        <w:t>▪ 1 NguoiDung có 1 HangHoiVien → NguoiDung – HangHoiVien: n – 1</w:t>
+      </w:r>
+    </w:p>
+    <w:p>
+      <w:pPr/>
+      <w:r>
+        <w:t>(nhiều người dùng có thể có cùng hạng)</w:t>
+      </w:r>
+    </w:p>
+    <w:p>
+      <w:pPr/>
+      <w:r>
+        <w:t>▪ 1 NguoiDung có nhiều OTP → NguoiDung – OTP: 1 – n</w:t>
+      </w:r>
+    </w:p>
+    <w:p>
+      <w:pPr/>
+      <w:r>
+        <w:t>(mỗi lần đăng ký/đổi SĐT tạo 1 OTP mới)</w:t>
+      </w:r>
+    </w:p>
+    <w:p>
+      <w:pPr/>
+      <w:r>
+        <w:t>▪ 1 NguoiDung có nhiều PhienDangNhap → NguoiDung – PhienDangNhap: 1 – n</w:t>
+      </w:r>
+    </w:p>
+    <w:p>
+      <w:pPr/>
+      <w:r>
+        <w:t>(người dùng có thể đăng nhập trên nhiều thiết bị)</w:t>
+      </w:r>
+    </w:p>
+    <w:p>
+      <w:pPr>
+        <w:pStyle w:val="Heading3"/>
+      </w:pPr>
+      <w:r>
+        <w:t>Bước 5 – Bổ sung quan hệ</w:t>
+      </w:r>
+    </w:p>
+    <w:p>
+      <w:pPr/>
+      <w:r>
+        <w:t>NguoiDung gắn composition với OTP: một OTP không tồn tại độc lập nếu không có NguoiDung tương ứng (khi xóa NguoiDung thì xóa theo tất cả OTP). Tương tự, PhienDangNhap không tồn tại độc lập khỏi NguoiDung. Quan hệ với HangHoiVien là aggregation: HangHoiVien là dữ liệu danh mục tồn tại độc lập với NguoiDung. NhanVien là lớp riêng biệt, không kế thừa từ NguoiDung.</w:t>
+      </w:r>
+    </w:p>
+    <w:p>
+      <w:pPr>
+        <w:pStyle w:val="Heading2"/>
+      </w:pPr>
+      <w:r>
+        <w:t>3. Biểu đồ lớp phân tích</w:t>
+      </w:r>
+    </w:p>
+    <w:p>
+      <w:pPr/>
+      <w:r>
+        <w:rPr>
+          <w:b/>
+        </w:rPr>
+        <w:t>Kiến trúc chọn: React</w:t>
+      </w:r>
+      <w:r>
+        <w:t xml:space="preserve"> ( Boundary class dùng hậu tố Page, Form, Modal, Panel )</w:t>
+      </w:r>
+    </w:p>
+    <w:p>
+      <w:pPr>
+        <w:pStyle w:val="Heading3"/>
+      </w:pPr>
+      <w:r>
+        <w:t>Bước 1 – Lớp Boundary từ giao diện</w:t>
+      </w:r>
+    </w:p>
+    <w:tbl>
+      <w:tblPr>
+        <w:tblStyle w:val="TableGrid"/>
+        <w:tblW w:type="auto" w:w="0"/>
+        <w:tblLook w:firstColumn="1" w:firstRow="1" w:lastColumn="0" w:lastRow="0" w:noHBand="0" w:noVBand="1" w:val="04A0"/>
+      </w:tblPr>
+      <w:tblGrid>
+        <w:gridCol w:w="2880"/>
+        <w:gridCol w:w="2880"/>
+        <w:gridCol w:w="2880"/>
+      </w:tblGrid>
+      <w:tr>
+        <w:tc>
+          <w:tcPr>
+            <w:tcW w:type="dxa" w:w="2880"/>
+            <w:shd w:fill="D9E2F3"/>
+          </w:tcPr>
+          <w:p>
+            <w:pPr/>
+            <w:r/>
+            <w:r>
+              <w:rPr>
+                <w:b/>
+                <w:sz w:val="20"/>
+              </w:rPr>
+              <w:t>Giao diện</w:t>
+            </w:r>
+          </w:p>
+        </w:tc>
+        <w:tc>
+          <w:tcPr>
+            <w:tcW w:type="dxa" w:w="2880"/>
+            <w:shd w:fill="D9E2F3"/>
+          </w:tcPr>
+          <w:p>
+            <w:pPr/>
+            <w:r/>
+            <w:r>
+              <w:rPr>
+                <w:b/>
+                <w:sz w:val="20"/>
+              </w:rPr>
+              <w:t>Lớp Boundary</w:t>
+            </w:r>
+          </w:p>
+        </w:tc>
+        <w:tc>
+          <w:tcPr>
+            <w:tcW w:type="dxa" w:w="2880"/>
+            <w:shd w:fill="D9E2F3"/>
+          </w:tcPr>
+          <w:p>
+            <w:pPr/>
+            <w:r/>
+            <w:r>
+              <w:rPr>
+                <w:b/>
+                <w:sz w:val="20"/>
+              </w:rPr>
+              <w:t>Loại</w:t>
+            </w:r>
+          </w:p>
+        </w:tc>
+      </w:tr>
+      <w:tr>
+        <w:tc>
+          <w:tcPr>
+            <w:tcW w:type="dxa" w:w="2880"/>
+          </w:tcPr>
+          <w:p>
+            <w:pPr/>
+            <w:r/>
+            <w:r>
+              <w:rPr>
+                <w:sz w:val="20"/>
+              </w:rPr>
+              <w:t>Màn hình Đăng nhập</w:t>
+            </w:r>
+          </w:p>
+        </w:tc>
+        <w:tc>
+          <w:tcPr>
+            <w:tcW w:type="dxa" w:w="2880"/>
+          </w:tcPr>
+          <w:p>
+            <w:pPr/>
+            <w:r/>
+            <w:r>
+              <w:rPr>
+                <w:sz w:val="20"/>
+              </w:rPr>
+              <w:t>LoginPage</w:t>
+            </w:r>
+          </w:p>
+        </w:tc>
+        <w:tc>
+          <w:tcPr>
+            <w:tcW w:type="dxa" w:w="2880"/>
+          </w:tcPr>
+          <w:p>
+            <w:pPr/>
+            <w:r/>
+            <w:r>
+              <w:rPr>
+                <w:sz w:val="20"/>
+              </w:rPr>
+              <w:t>Page</w:t>
+            </w:r>
+          </w:p>
+        </w:tc>
+      </w:tr>
+      <w:tr>
+        <w:tc>
+          <w:tcPr>
+            <w:tcW w:type="dxa" w:w="2880"/>
+          </w:tcPr>
+          <w:p>
+            <w:pPr/>
+            <w:r/>
+            <w:r>
+              <w:rPr>
+                <w:sz w:val="20"/>
+              </w:rPr>
+              <w:t>Màn hình Đăng ký</w:t>
+            </w:r>
+          </w:p>
+        </w:tc>
+        <w:tc>
+          <w:tcPr>
+            <w:tcW w:type="dxa" w:w="2880"/>
+          </w:tcPr>
+          <w:p>
+            <w:pPr/>
+            <w:r/>
+            <w:r>
+              <w:rPr>
+                <w:sz w:val="20"/>
+              </w:rPr>
+              <w:t>RegisterPage</w:t>
+            </w:r>
+          </w:p>
+        </w:tc>
+        <w:tc>
+          <w:tcPr>
+            <w:tcW w:type="dxa" w:w="2880"/>
+          </w:tcPr>
+          <w:p>
+            <w:pPr/>
+            <w:r/>
+            <w:r>
+              <w:rPr>
+                <w:sz w:val="20"/>
+              </w:rPr>
+              <w:t>Page</w:t>
+            </w:r>
+          </w:p>
+        </w:tc>
+      </w:tr>
+      <w:tr>
+        <w:tc>
+          <w:tcPr>
+            <w:tcW w:type="dxa" w:w="2880"/>
+          </w:tcPr>
+          <w:p>
+            <w:pPr/>
+            <w:r/>
+            <w:r>
+              <w:rPr>
+                <w:sz w:val="20"/>
+              </w:rPr>
+              <w:t>Màn hình Xác nhận OTP</w:t>
+            </w:r>
+          </w:p>
+        </w:tc>
+        <w:tc>
+          <w:tcPr>
+            <w:tcW w:type="dxa" w:w="2880"/>
+          </w:tcPr>
+          <w:p>
+            <w:pPr/>
+            <w:r/>
+            <w:r>
+              <w:rPr>
+                <w:sz w:val="20"/>
+              </w:rPr>
+              <w:t>OTPVerifyModal</w:t>
+            </w:r>
+          </w:p>
+        </w:tc>
+        <w:tc>
+          <w:tcPr>
+            <w:tcW w:type="dxa" w:w="2880"/>
+          </w:tcPr>
+          <w:p>
+            <w:pPr/>
+            <w:r/>
+            <w:r>
+              <w:rPr>
+                <w:sz w:val="20"/>
+              </w:rPr>
+              <w:t>Modal</w:t>
+            </w:r>
+          </w:p>
+        </w:tc>
+      </w:tr>
+      <w:tr>
+        <w:tc>
+          <w:tcPr>
+            <w:tcW w:type="dxa" w:w="2880"/>
+          </w:tcPr>
+          <w:p>
+            <w:pPr/>
+            <w:r/>
+            <w:r>
+              <w:rPr>
+                <w:sz w:val="20"/>
+              </w:rPr>
+              <w:t>Màn hình Đổi mật khẩu</w:t>
+            </w:r>
+          </w:p>
+        </w:tc>
+        <w:tc>
+          <w:tcPr>
+            <w:tcW w:type="dxa" w:w="2880"/>
+          </w:tcPr>
+          <w:p>
+            <w:pPr/>
+            <w:r/>
+            <w:r>
+              <w:rPr>
+                <w:sz w:val="20"/>
+              </w:rPr>
+              <w:t>ChangePasswordForm</w:t>
+            </w:r>
+          </w:p>
+        </w:tc>
+        <w:tc>
+          <w:tcPr>
+            <w:tcW w:type="dxa" w:w="2880"/>
+          </w:tcPr>
+          <w:p>
+            <w:pPr/>
+            <w:r/>
+            <w:r>
+              <w:rPr>
+                <w:sz w:val="20"/>
+              </w:rPr>
+              <w:t>Form</w:t>
+            </w:r>
+          </w:p>
+        </w:tc>
+      </w:tr>
+      <w:tr>
+        <w:tc>
+          <w:tcPr>
+            <w:tcW w:type="dxa" w:w="2880"/>
+          </w:tcPr>
+          <w:p>
+            <w:pPr/>
+            <w:r/>
+            <w:r>
+              <w:rPr>
+                <w:sz w:val="20"/>
+              </w:rPr>
+              <w:t>Trang Hồ sơ cá nhân</w:t>
+            </w:r>
+          </w:p>
+        </w:tc>
+        <w:tc>
+          <w:tcPr>
+            <w:tcW w:type="dxa" w:w="2880"/>
+          </w:tcPr>
+          <w:p>
+            <w:pPr/>
+            <w:r/>
+            <w:r>
+              <w:rPr>
+                <w:sz w:val="20"/>
+              </w:rPr>
+              <w:t>ProfilePage</w:t>
+            </w:r>
+          </w:p>
+        </w:tc>
+        <w:tc>
+          <w:tcPr>
+            <w:tcW w:type="dxa" w:w="2880"/>
+          </w:tcPr>
+          <w:p>
+            <w:pPr/>
+            <w:r/>
+            <w:r>
+              <w:rPr>
+                <w:sz w:val="20"/>
+              </w:rPr>
+              <w:t>Page</w:t>
+            </w:r>
+          </w:p>
+        </w:tc>
+      </w:tr>
+      <w:tr>
+        <w:tc>
+          <w:tcPr>
+            <w:tcW w:type="dxa" w:w="2880"/>
+          </w:tcPr>
+          <w:p>
+            <w:pPr/>
+            <w:r/>
+            <w:r>
+              <w:rPr>
+                <w:sz w:val="20"/>
+              </w:rPr>
+              <w:t>Form Chỉnh sửa hồ sơ</w:t>
+            </w:r>
+          </w:p>
+        </w:tc>
+        <w:tc>
+          <w:tcPr>
+            <w:tcW w:type="dxa" w:w="2880"/>
+          </w:tcPr>
+          <w:p>
+            <w:pPr/>
+            <w:r/>
+            <w:r>
+              <w:rPr>
+                <w:sz w:val="20"/>
+              </w:rPr>
+              <w:t>EditProfileForm</w:t>
+            </w:r>
+          </w:p>
+        </w:tc>
+        <w:tc>
+          <w:tcPr>
+            <w:tcW w:type="dxa" w:w="2880"/>
+          </w:tcPr>
+          <w:p>
+            <w:pPr/>
+            <w:r/>
+            <w:r>
+              <w:rPr>
+                <w:sz w:val="20"/>
+              </w:rPr>
+              <w:t>Form</w:t>
+            </w:r>
+          </w:p>
+        </w:tc>
+      </w:tr>
+      <w:tr>
+        <w:tc>
+          <w:tcPr>
+            <w:tcW w:type="dxa" w:w="2880"/>
+          </w:tcPr>
+          <w:p>
+            <w:pPr/>
+            <w:r/>
+            <w:r>
+              <w:rPr>
+                <w:sz w:val="20"/>
+              </w:rPr>
+              <w:t>Trang Quản lý nhân viên</w:t>
+            </w:r>
+          </w:p>
+        </w:tc>
+        <w:tc>
+          <w:tcPr>
+            <w:tcW w:type="dxa" w:w="2880"/>
+          </w:tcPr>
+          <w:p>
+            <w:pPr/>
+            <w:r/>
+            <w:r>
+              <w:rPr>
+                <w:sz w:val="20"/>
+              </w:rPr>
+              <w:t>StaffManagePage</w:t>
+            </w:r>
+          </w:p>
+        </w:tc>
+        <w:tc>
+          <w:tcPr>
+            <w:tcW w:type="dxa" w:w="2880"/>
+          </w:tcPr>
+          <w:p>
+            <w:pPr/>
+            <w:r/>
+            <w:r>
+              <w:rPr>
+                <w:sz w:val="20"/>
+              </w:rPr>
+              <w:t>Page</w:t>
+            </w:r>
+          </w:p>
+        </w:tc>
+      </w:tr>
+      <w:tr>
+        <w:tc>
+          <w:tcPr>
+            <w:tcW w:type="dxa" w:w="2880"/>
+          </w:tcPr>
+          <w:p>
+            <w:pPr/>
+            <w:r/>
+            <w:r>
+              <w:rPr>
+                <w:sz w:val="20"/>
+              </w:rPr>
+              <w:t>Form Thêm/Sửa nhân viên</w:t>
+            </w:r>
+          </w:p>
+        </w:tc>
+        <w:tc>
+          <w:tcPr>
+            <w:tcW w:type="dxa" w:w="2880"/>
+          </w:tcPr>
+          <w:p>
+            <w:pPr/>
+            <w:r/>
+            <w:r>
+              <w:rPr>
+                <w:sz w:val="20"/>
+              </w:rPr>
+              <w:t>StaffForm</w:t>
+            </w:r>
+          </w:p>
+        </w:tc>
+        <w:tc>
+          <w:tcPr>
+            <w:tcW w:type="dxa" w:w="2880"/>
+          </w:tcPr>
+          <w:p>
+            <w:pPr/>
+            <w:r/>
+            <w:r>
+              <w:rPr>
+                <w:sz w:val="20"/>
+              </w:rPr>
+              <w:t>Form</w:t>
+            </w:r>
+          </w:p>
+        </w:tc>
+      </w:tr>
+    </w:tbl>
+    <w:p>
+      <w:pPr>
+        <w:pStyle w:val="Heading3"/>
+      </w:pPr>
+      <w:r>
+        <w:t>Bước 2 – Phân loại thành phần giao diện</w:t>
+      </w:r>
+    </w:p>
+    <w:p>
+      <w:pPr/>
+      <w:r>
+        <w:t>LoginPage:</w:t>
+      </w:r>
+    </w:p>
+    <w:p>
+      <w:pPr>
+        <w:pStyle w:val="ListBullet"/>
+      </w:pPr>
+      <w:r>
+        <w:t>inSDT: ô nhập SĐT/Email</w:t>
+      </w:r>
+    </w:p>
+    <w:p>
+      <w:pPr>
+        <w:pStyle w:val="ListBullet"/>
+      </w:pPr>
+      <w:r>
+        <w:t>inMatKhau: ô nhập mật khẩu</w:t>
+      </w:r>
+    </w:p>
+    <w:p>
+      <w:pPr>
+        <w:pStyle w:val="ListBullet"/>
+      </w:pPr>
+      <w:r>
+        <w:t>subDangNhap: nút Đăng nhập</w:t>
+      </w:r>
+    </w:p>
+    <w:p>
+      <w:pPr>
+        <w:pStyle w:val="ListBullet"/>
+      </w:pPr>
+      <w:r>
+        <w:t>subQuenMatKhau: liên kết Quên mật khẩu</w:t>
+      </w:r>
+    </w:p>
+    <w:p>
+      <w:pPr>
+        <w:pStyle w:val="ListBullet"/>
+      </w:pPr>
+      <w:r>
+        <w:t>subDangKy: liên kết Đăng ký</w:t>
+      </w:r>
+    </w:p>
+    <w:p>
+      <w:pPr/>
+      <w:r>
+        <w:t>RegisterPage:</w:t>
+      </w:r>
+    </w:p>
+    <w:p>
+      <w:pPr>
+        <w:pStyle w:val="ListBullet"/>
+      </w:pPr>
+      <w:r>
+        <w:t>inHoTen, inSDT, inEmail, inMatKhau, inXacNhanMK: ô nhập liệu</w:t>
+      </w:r>
+    </w:p>
+    <w:p>
+      <w:pPr>
+        <w:pStyle w:val="ListBullet"/>
+      </w:pPr>
+      <w:r>
+        <w:t>subTiepTuc: nút Tiếp tục</w:t>
+      </w:r>
+    </w:p>
+    <w:p>
+      <w:pPr>
+        <w:pStyle w:val="ListBullet"/>
+      </w:pPr>
+      <w:r>
+        <w:t>subHuy: nút Hủy</w:t>
+      </w:r>
+    </w:p>
+    <w:p>
+      <w:pPr/>
+      <w:r>
+        <w:t>OTPVerifyModal:</w:t>
+      </w:r>
+    </w:p>
+    <w:p>
+      <w:pPr>
+        <w:pStyle w:val="ListBullet"/>
+      </w:pPr>
+      <w:r>
+        <w:t>inOTP: ô nhập 6 chữ số OTP</w:t>
+      </w:r>
+    </w:p>
+    <w:p>
+      <w:pPr>
+        <w:pStyle w:val="ListBullet"/>
+      </w:pPr>
+      <w:r>
+        <w:t>subXacNhan: nút Xác nhận</w:t>
+      </w:r>
+    </w:p>
+    <w:p>
+      <w:pPr>
+        <w:pStyle w:val="ListBullet"/>
+      </w:pPr>
+      <w:r>
+        <w:t>subGuiLai: liên kết Gửi lại OTP</w:t>
+      </w:r>
+    </w:p>
+    <w:p>
+      <w:pPr/>
+      <w:r>
+        <w:t>ChangePasswordForm:</w:t>
+      </w:r>
+    </w:p>
+    <w:p>
+      <w:pPr>
+        <w:pStyle w:val="ListBullet"/>
+      </w:pPr>
+      <w:r>
+        <w:t>inMKHienTai, inMKMoi, inXacNhanMKMoi: ô nhập liệu</w:t>
+      </w:r>
+    </w:p>
+    <w:p>
+      <w:pPr>
+        <w:pStyle w:val="ListBullet"/>
+      </w:pPr>
+      <w:r>
+        <w:t>subLuu: nút Lưu thay đổi</w:t>
+      </w:r>
+    </w:p>
+    <w:p>
+      <w:pPr>
+        <w:pStyle w:val="ListBullet"/>
+      </w:pPr>
+      <w:r>
+        <w:t>subHuy: nút Hủy</w:t>
+      </w:r>
+    </w:p>
+    <w:p>
+      <w:pPr/>
+      <w:r>
+        <w:t>ProfilePage:</w:t>
+      </w:r>
+    </w:p>
+    <w:p>
+      <w:pPr>
+        <w:pStyle w:val="ListBullet"/>
+      </w:pPr>
+      <w:r>
+        <w:t>outHoTen, outSDT, outEmail, outHang, outDiem, outNgayThamGia: vùng hiển thị</w:t>
+      </w:r>
+    </w:p>
+    <w:p>
+      <w:pPr>
+        <w:pStyle w:val="ListBullet"/>
+      </w:pPr>
+      <w:r>
+        <w:t>subChinhSua: nút Chỉnh sửa thông tin</w:t>
+      </w:r>
+    </w:p>
+    <w:p>
+      <w:pPr>
+        <w:pStyle w:val="ListBullet"/>
+      </w:pPr>
+      <w:r>
+        <w:t>subDoiMK: nút Đổi mật khẩu</w:t>
+      </w:r>
+    </w:p>
+    <w:p>
+      <w:pPr/>
+      <w:r>
+        <w:t>StaffManagePage:</w:t>
+      </w:r>
+    </w:p>
+    <w:p>
+      <w:pPr>
+        <w:pStyle w:val="ListBullet"/>
+      </w:pPr>
+      <w:r>
+        <w:t>outDSNhanVien: bảng danh sách nhân viên</w:t>
+      </w:r>
+    </w:p>
+    <w:p>
+      <w:pPr>
+        <w:pStyle w:val="ListBullet"/>
+      </w:pPr>
+      <w:r>
+        <w:t>subThem: nút Thêm nhân viên</w:t>
+      </w:r>
+    </w:p>
+    <w:p>
+      <w:pPr>
+        <w:pStyle w:val="ListBullet"/>
+      </w:pPr>
+      <w:r>
+        <w:t>outsubChonNV: chọn dòng trong bảng</w:t>
+      </w:r>
+    </w:p>
+    <w:p>
+      <w:pPr>
+        <w:pStyle w:val="ListBullet"/>
+      </w:pPr>
+      <w:r>
+        <w:t>subSua: nút Sửa</w:t>
+      </w:r>
+    </w:p>
+    <w:p>
+      <w:pPr>
+        <w:pStyle w:val="ListBullet"/>
+      </w:pPr>
+      <w:r>
+        <w:t>subXoa: nút Xóa</w:t>
+      </w:r>
+    </w:p>
+    <w:p>
+      <w:pPr>
+        <w:pStyle w:val="Heading3"/>
+      </w:pPr>
+      <w:r>
+        <w:t>Bước 3 – Phương thức cho mỗi chức năng</w:t>
+      </w:r>
+    </w:p>
+    <w:p>
+      <w:pPr/>
+      <w:r>
+        <w:t>[1]. Giao diện LoginPage → lớp LoginPage</w:t>
+      </w:r>
+    </w:p>
+    <w:p>
+      <w:pPr/>
+      <w:r>
+        <w:t xml:space="preserve">Phương thức: </w:t>
+      </w:r>
+      <w:r>
+        <w:rPr>
+          <w:rFonts w:ascii="Courier New" w:hAnsi="Courier New"/>
+          <w:sz w:val="20"/>
+        </w:rPr>
+        <w:t>dangNhap()</w:t>
+      </w:r>
+    </w:p>
+    <w:p>
+      <w:pPr/>
+      <w:r>
+        <w:t>Input: sdt, matKhau</w:t>
+      </w:r>
+    </w:p>
+    <w:p>
+      <w:pPr/>
+      <w:r>
+        <w:t>Output: Session (token, vaiTro)</w:t>
+      </w:r>
+    </w:p>
+    <w:p>
+      <w:pPr/>
+      <w:r>
+        <w:t>Lớp chủ thể: NguoiDung</w:t>
+      </w:r>
+    </w:p>
+    <w:p>
+      <w:pPr/>
+      <w:r>
+        <w:t>[2]. Giao diện RegisterPage → lớp RegisterPage</w:t>
+      </w:r>
+    </w:p>
+    <w:p>
+      <w:pPr/>
+      <w:r>
+        <w:t xml:space="preserve">Phương thức: </w:t>
+      </w:r>
+      <w:r>
+        <w:rPr>
+          <w:rFonts w:ascii="Courier New" w:hAnsi="Courier New"/>
+          <w:sz w:val="20"/>
+        </w:rPr>
+        <w:t>dangKy()</w:t>
+      </w:r>
+    </w:p>
+    <w:p>
+      <w:pPr/>
+      <w:r>
+        <w:t>Input: hoTen, sdt, email, matKhau</w:t>
+      </w:r>
+    </w:p>
+    <w:p>
+      <w:pPr/>
+      <w:r>
+        <w:t>Output: NguoiDung (vừa tạo)</w:t>
+      </w:r>
+    </w:p>
+    <w:p>
+      <w:pPr/>
+      <w:r>
+        <w:t>Lớp chủ thể: NguoiDung</w:t>
+      </w:r>
+    </w:p>
+    <w:p>
+      <w:pPr/>
+      <w:r>
+        <w:t>[3]. Giao diện OTPVerifyModal → lớp OTPVerifyModal</w:t>
+      </w:r>
+    </w:p>
+    <w:p>
+      <w:pPr/>
+      <w:r>
+        <w:t xml:space="preserve">Phương thức: </w:t>
+      </w:r>
+      <w:r>
+        <w:rPr>
+          <w:rFonts w:ascii="Courier New" w:hAnsi="Courier New"/>
+          <w:sz w:val="20"/>
+        </w:rPr>
+        <w:t>xacMinhOTP()</w:t>
+      </w:r>
+    </w:p>
+    <w:p>
+      <w:pPr/>
+      <w:r>
+        <w:t>Input: maOTP</w:t>
+      </w:r>
+    </w:p>
+    <w:p>
+      <w:pPr/>
+      <w:r>
+        <w:t>Output: boolean (đúng/sai)</w:t>
+      </w:r>
+    </w:p>
+    <w:p>
+      <w:pPr/>
+      <w:r>
+        <w:t>Lớp chủ thể: OTP</w:t>
+      </w:r>
+    </w:p>
+    <w:p>
+      <w:pPr/>
+      <w:r>
+        <w:t>[4]. Giao diện ChangePasswordForm → lớp ChangePasswordForm</w:t>
+      </w:r>
+    </w:p>
+    <w:p>
+      <w:pPr/>
+      <w:r>
+        <w:t xml:space="preserve">Phương thức: </w:t>
+      </w:r>
+      <w:r>
+        <w:rPr>
+          <w:rFonts w:ascii="Courier New" w:hAnsi="Courier New"/>
+          <w:sz w:val="20"/>
+        </w:rPr>
+        <w:t>doiMatKhau()</w:t>
+      </w:r>
+    </w:p>
+    <w:p>
+      <w:pPr/>
+      <w:r>
+        <w:t>Input: mkHienTai, mkMoi</w:t>
+      </w:r>
+    </w:p>
+    <w:p>
+      <w:pPr/>
+      <w:r>
+        <w:t>Output: boolean (thành công/thất bại)</w:t>
+      </w:r>
+    </w:p>
+    <w:p>
+      <w:pPr/>
+      <w:r>
+        <w:t>Lớp chủ thể: NguoiDung</w:t>
+      </w:r>
+    </w:p>
+    <w:p>
+      <w:pPr/>
+      <w:r>
+        <w:t>[5]. Giao diện ProfilePage → lớp ProfilePage</w:t>
+      </w:r>
+    </w:p>
+    <w:p>
+      <w:pPr/>
+      <w:r>
+        <w:t xml:space="preserve">Phương thức: </w:t>
+      </w:r>
+      <w:r>
+        <w:rPr>
+          <w:rFonts w:ascii="Courier New" w:hAnsi="Courier New"/>
+          <w:sz w:val="20"/>
+        </w:rPr>
+        <w:t>xemHoSo()</w:t>
+      </w:r>
+    </w:p>
+    <w:p>
+      <w:pPr/>
+      <w:r>
+        <w:t>Input: userId</w:t>
+      </w:r>
+    </w:p>
+    <w:p>
+      <w:pPr/>
+      <w:r>
+        <w:t>Output: NguoiDung (thông tin hồ sơ)</w:t>
+      </w:r>
+    </w:p>
+    <w:p>
+      <w:pPr/>
+      <w:r>
+        <w:t>Lớp chủ thể: NguoiDung</w:t>
+      </w:r>
+    </w:p>
+    <w:p>
+      <w:pPr/>
+      <w:r>
+        <w:t>[6]. Giao diện EditProfileForm → lớp EditProfileForm</w:t>
+      </w:r>
+    </w:p>
+    <w:p>
+      <w:pPr/>
+      <w:r>
+        <w:t xml:space="preserve">Phương thức: </w:t>
+      </w:r>
+      <w:r>
+        <w:rPr>
+          <w:rFonts w:ascii="Courier New" w:hAnsi="Courier New"/>
+          <w:sz w:val="20"/>
+        </w:rPr>
+        <w:t>capNhatHoSo()</w:t>
+      </w:r>
+    </w:p>
+    <w:p>
+      <w:pPr/>
+      <w:r>
+        <w:t>Input: userId, hoTen, email</w:t>
+      </w:r>
+    </w:p>
+    <w:p>
+      <w:pPr/>
+      <w:r>
+        <w:t>Output: NguoiDung (đã cập nhật)</w:t>
+      </w:r>
+    </w:p>
+    <w:p>
+      <w:pPr/>
+      <w:r>
+        <w:t>Lớp chủ thể: NguoiDung</w:t>
+      </w:r>
+    </w:p>
+    <w:p>
+      <w:pPr/>
+      <w:r>
+        <w:t>[7]. Giao diện StaffManagePage → lớp StaffManagePage</w:t>
+      </w:r>
+    </w:p>
+    <w:p>
+      <w:pPr/>
+      <w:r>
+        <w:t xml:space="preserve">Phương thức: </w:t>
+      </w:r>
+      <w:r>
+        <w:rPr>
+          <w:rFonts w:ascii="Courier New" w:hAnsi="Courier New"/>
+          <w:sz w:val="20"/>
+        </w:rPr>
+        <w:t>xemDanhSachNV()</w:t>
+      </w:r>
+    </w:p>
+    <w:p>
+      <w:pPr/>
+      <w:r>
+        <w:t>Input: (không có — tải toàn bộ)</w:t>
+      </w:r>
+    </w:p>
+    <w:p>
+      <w:pPr/>
+      <w:r>
+        <w:t>Output: List\&lt;NhanVien\&gt;</w:t>
+      </w:r>
+    </w:p>
+    <w:p>
+      <w:pPr/>
+      <w:r>
+        <w:t>Lớp chủ thể: NhanVien</w:t>
+      </w:r>
+    </w:p>
+    <w:p>
+      <w:pPr/>
+      <w:r>
+        <w:t>[8]. Giao diện StaffForm → lớp StaffForm</w:t>
+      </w:r>
+    </w:p>
+    <w:p>
+      <w:pPr/>
+      <w:r>
+        <w:t xml:space="preserve">Phương thức: </w:t>
+      </w:r>
+      <w:r>
+        <w:rPr>
+          <w:rFonts w:ascii="Courier New" w:hAnsi="Courier New"/>
+          <w:sz w:val="20"/>
+        </w:rPr>
+        <w:t>themNV()</w:t>
+      </w:r>
+    </w:p>
+    <w:p>
+      <w:pPr/>
+      <w:r>
+        <w:t>Input: hoTen, vaiTro</w:t>
+      </w:r>
+    </w:p>
+    <w:p>
+      <w:pPr/>
+      <w:r>
+        <w:t>Output: NhanVien (vừa tạo)</w:t>
+      </w:r>
+    </w:p>
+    <w:p>
+      <w:pPr/>
+      <w:r>
+        <w:t>Lớp chủ thể: NhanVien</w:t>
+      </w:r>
+    </w:p>
+    <w:p>
+      <w:pPr/>
+      <w:r>
+        <w:t>[9]. Giao diện StaffForm → lớp StaffForm</w:t>
+      </w:r>
+    </w:p>
+    <w:p>
+      <w:pPr/>
+      <w:r>
+        <w:t xml:space="preserve">Phương thức: </w:t>
+      </w:r>
+      <w:r>
+        <w:rPr>
+          <w:rFonts w:ascii="Courier New" w:hAnsi="Courier New"/>
+          <w:sz w:val="20"/>
+        </w:rPr>
+        <w:t>suaNV()</w:t>
+      </w:r>
+    </w:p>
+    <w:p>
+      <w:pPr/>
+      <w:r>
+        <w:t>Input: id, hoTen, vaiTro</w:t>
+      </w:r>
+    </w:p>
+    <w:p>
+      <w:pPr/>
+      <w:r>
+        <w:t>Output: NhanVien (đã cập nhật)</w:t>
+      </w:r>
+    </w:p>
+    <w:p>
+      <w:pPr/>
+      <w:r>
+        <w:t>Lớp chủ thể: NhanVien</w:t>
+      </w:r>
+    </w:p>
+    <w:p>
+      <w:pPr/>
+      <w:r>
+        <w:t>[10]. Giao diện StaffManagePage → lớp StaffManagePage</w:t>
+      </w:r>
+    </w:p>
+    <w:p>
+      <w:pPr/>
+      <w:r>
+        <w:t xml:space="preserve">Phương thức: </w:t>
+      </w:r>
+      <w:r>
+        <w:rPr>
+          <w:rFonts w:ascii="Courier New" w:hAnsi="Courier New"/>
+          <w:sz w:val="20"/>
+        </w:rPr>
+        <w:t>xoaNV()</w:t>
+      </w:r>
+    </w:p>
+    <w:p>
+      <w:pPr/>
+      <w:r>
+        <w:t>Input: id</w:t>
+      </w:r>
+    </w:p>
+    <w:p>
+      <w:pPr/>
+      <w:r>
+        <w:t>Output: boolean (thành công/thất bại)</w:t>
+      </w:r>
+    </w:p>
+    <w:p>
+      <w:pPr/>
+      <w:r>
+        <w:t>Lớp chủ thể: NhanVien</w:t>
+      </w:r>
+    </w:p>
+    <w:p>
+      <w:pPr>
+        <w:pStyle w:val="Heading2"/>
+      </w:pPr>
+      <w:r>
+        <w:t>4. Biểu đồ tuần tự phân tích</w:t>
+      </w:r>
+    </w:p>
+    <w:p>
+      <w:pPr>
+        <w:pStyle w:val="Heading3"/>
+      </w:pPr>
+      <w:r>
+        <w:t>UC01 – Đăng nhập</w:t>
+      </w:r>
+    </w:p>
+    <w:p>
+      <w:pPr/>
+      <w:r>
+        <w:rPr>
+          <w:b/>
+        </w:rPr>
+        <w:t>Kịch bản phiên bản 2 – UC01 Đăng nhập</w:t>
+      </w:r>
+    </w:p>
+    <w:p>
+      <w:pPr/>
+      <w:r>
+        <w:t>1. Khách hàng truy cập URL hệ thống để mở màn hình Đăng nhập.</w:t>
+      </w:r>
+    </w:p>
+    <w:p>
+      <w:pPr/>
+      <w:r>
+        <w:t>2. Lớp LoginPage hiển thị form gồm ô nhập SĐT/Email, ô nhập Mật khẩu, nút [Đăng nhập], liên kết "Quên mật khẩu?" / "Đăng ký".</w:t>
+      </w:r>
+    </w:p>
+    <w:p>
+      <w:pPr/>
+      <w:r>
+        <w:t>3. Khách hàng nhập SĐT = "0912345678" và Mật khẩu = "Abc@1234".</w:t>
+      </w:r>
+    </w:p>
+    <w:p>
+      <w:pPr/>
+      <w:r>
+        <w:t>4. Khách hàng nhấn nút [Đăng nhập].</w:t>
+      </w:r>
+    </w:p>
+    <w:p>
+      <w:pPr/>
+      <w:r>
+        <w:t xml:space="preserve">5. Lớp LoginPage gọi phương thức </w:t>
+      </w:r>
+      <w:r>
+        <w:rPr>
+          <w:rFonts w:ascii="Courier New" w:hAnsi="Courier New"/>
+          <w:sz w:val="20"/>
+        </w:rPr>
+        <w:t>dangNhap()</w:t>
+      </w:r>
+      <w:r>
+        <w:t xml:space="preserve"> với tham số sdt, matKhau.</w:t>
+      </w:r>
+    </w:p>
+    <w:p>
+      <w:pPr/>
+      <w:r>
+        <w:t xml:space="preserve">6. Lớp NguoiDung gọi phương thức </w:t>
+      </w:r>
+      <w:r>
+        <w:rPr>
+          <w:rFonts w:ascii="Courier New" w:hAnsi="Courier New"/>
+          <w:sz w:val="20"/>
+        </w:rPr>
+        <w:t>findBySDT()</w:t>
+      </w:r>
+      <w:r>
+        <w:t xml:space="preserve"> để tìm tài khoản theo SĐT.</w:t>
+      </w:r>
+    </w:p>
+    <w:p>
+      <w:pPr/>
+      <w:r>
+        <w:t xml:space="preserve">7. Lớp NguoiDung gọi phương thức </w:t>
+      </w:r>
+      <w:r>
+        <w:rPr>
+          <w:rFonts w:ascii="Courier New" w:hAnsi="Courier New"/>
+          <w:sz w:val="20"/>
+        </w:rPr>
+        <w:t>checkPassword()</w:t>
+      </w:r>
+      <w:r>
+        <w:t xml:space="preserve"> để so sánh mật khẩu.</w:t>
+      </w:r>
+    </w:p>
+    <w:p>
+      <w:pPr/>
+      <w:r>
+        <w:t>8. Lớp NguoiDung trả kết quả về cho LoginPage.</w:t>
+      </w:r>
+    </w:p>
+    <w:p>
+      <w:pPr/>
+      <w:r>
+        <w:t>9. Lớp LoginPage hiển thị "Đăng nhập thành công. Xin chào, Nguyễn Văn A!" và chuyển hướng trang chủ.</w:t>
+      </w:r>
+    </w:p>
+    <w:p>
+      <w:pPr/>
+      <w:r>
+        <w:rPr>
+          <w:b/>
+        </w:rPr>
+        <w:t>Ngoại lệ: tài khoản không tồn tại</w:t>
+      </w:r>
+    </w:p>
+    <w:p>
+      <w:pPr>
+        <w:pStyle w:val="ListBullet"/>
+      </w:pPr>
+      <w:r>
+        <w:t>Lớp NguoiDung trả về null (không tìm thấy tài khoản).</w:t>
+      </w:r>
+    </w:p>
+    <w:p>
+      <w:pPr>
+        <w:pStyle w:val="ListBullet"/>
+      </w:pPr>
+      <w:r>
+        <w:t>Lớp LoginPage hiển thị "Tài khoản không tồn tại. Vui lòng kiểm tra lại."</w:t>
+      </w:r>
+    </w:p>
+    <w:p>
+      <w:pPr/>
+      <w:r>
+        <w:rPr>
+          <w:b/>
+        </w:rPr>
+        <w:t>Ngoại lệ: mật khẩu sai</w:t>
+      </w:r>
+    </w:p>
+    <w:p>
+      <w:pPr>
+        <w:pStyle w:val="ListBullet"/>
+      </w:pPr>
+      <w:r>
+        <w:t>Lớp NguoiDung trả về sai mật khẩu.</w:t>
+      </w:r>
+    </w:p>
+    <w:p>
+      <w:pPr>
+        <w:pStyle w:val="ListBullet"/>
+      </w:pPr>
+      <w:r>
+        <w:t>Lớp LoginPage hiển thị "Mật khẩu không chính xác. Còn [N] lần thử."</w:t>
+      </w:r>
+    </w:p>
+    <w:p>
+      <w:pPr>
+        <w:pStyle w:val="Heading3"/>
+      </w:pPr>
+      <w:r>
+        <w:t>UC02 – Đăng ký</w:t>
+      </w:r>
+    </w:p>
+    <w:p>
+      <w:pPr/>
+      <w:r>
+        <w:rPr>
+          <w:b/>
+        </w:rPr>
+        <w:t>Kịch bản phiên bản 2 – UC02 Đăng ký</w:t>
+      </w:r>
+    </w:p>
+    <w:p>
+      <w:pPr/>
+      <w:r>
+        <w:t>1. Khách hàng nhấn liên kết "Đăng ký" từ màn hình đăng nhập.</w:t>
+      </w:r>
+    </w:p>
+    <w:p>
+      <w:pPr/>
+      <w:r>
+        <w:t>2. Lớp RegisterPage hiển thị form gồm: Họ tên, SĐT, Email, Mật khẩu, Xác nhận MK.</w:t>
+      </w:r>
+    </w:p>
+    <w:p>
+      <w:pPr/>
+      <w:r>
+        <w:t>3. Khách hàng nhập: Họ tên = "Nguyễn Thị Bình", SĐT = "0987654321", Email = "binh.nt@email.com", MK = "Pass@2025".</w:t>
+      </w:r>
+    </w:p>
+    <w:p>
+      <w:pPr/>
+      <w:r>
+        <w:t>4. Khách hàng nhấn [Tiếp tục].</w:t>
+      </w:r>
+    </w:p>
+    <w:p>
+      <w:pPr/>
+      <w:r>
+        <w:t xml:space="preserve">5. Lớp RegisterPage gọi </w:t>
+      </w:r>
+      <w:r>
+        <w:rPr>
+          <w:rFonts w:ascii="Courier New" w:hAnsi="Courier New"/>
+          <w:sz w:val="20"/>
+        </w:rPr>
+        <w:t>dangKy()</w:t>
+      </w:r>
+      <w:r>
+        <w:t xml:space="preserve"> với các tham số hoTen, sdt, email, matKhau.</w:t>
+      </w:r>
+    </w:p>
+    <w:p>
+      <w:pPr/>
+      <w:r>
+        <w:t xml:space="preserve">6. Lớp NguoiDung kiểm tra SĐT chưa tồn tại bằng </w:t>
+      </w:r>
+      <w:r>
+        <w:rPr>
+          <w:rFonts w:ascii="Courier New" w:hAnsi="Courier New"/>
+          <w:sz w:val="20"/>
+        </w:rPr>
+        <w:t>existsBySDT()</w:t>
+      </w:r>
+      <w:r>
+        <w:t>.</w:t>
+      </w:r>
+    </w:p>
+    <w:p>
+      <w:pPr/>
+      <w:r>
+        <w:t xml:space="preserve">7. Lớp NguoiDung kiểm tra email chưa tồn tại bằng </w:t>
+      </w:r>
+      <w:r>
+        <w:rPr>
+          <w:rFonts w:ascii="Courier New" w:hAnsi="Courier New"/>
+          <w:sz w:val="20"/>
+        </w:rPr>
+        <w:t>existsByEmail()</w:t>
+      </w:r>
+      <w:r>
+        <w:t>.</w:t>
+      </w:r>
+    </w:p>
+    <w:p>
+      <w:pPr/>
+      <w:r>
+        <w:t xml:space="preserve">8. Lớp NguoiDung tạo tài khoản mới bằng </w:t>
+      </w:r>
+      <w:r>
+        <w:rPr>
+          <w:rFonts w:ascii="Courier New" w:hAnsi="Courier New"/>
+          <w:sz w:val="20"/>
+        </w:rPr>
+        <w:t>createNguoiDung()</w:t>
+      </w:r>
+      <w:r>
+        <w:t>.</w:t>
+      </w:r>
+    </w:p>
+    <w:p>
+      <w:pPr/>
+      <w:r>
+        <w:t>9. Lớp NguoiDung trả kết quả về RegisterPage.</w:t>
+      </w:r>
+    </w:p>
+    <w:p>
+      <w:pPr/>
+      <w:r>
+        <w:t xml:space="preserve">10. RegisterPage gọi </w:t>
+      </w:r>
+      <w:r>
+        <w:rPr>
+          <w:rFonts w:ascii="Courier New" w:hAnsi="Courier New"/>
+          <w:sz w:val="20"/>
+        </w:rPr>
+        <w:t>guiOTP(sdt, DANG_KY)</w:t>
+      </w:r>
+      <w:r>
+        <w:t xml:space="preserve"> để gửi OTP.</w:t>
+      </w:r>
+    </w:p>
+    <w:p>
+      <w:pPr/>
+      <w:r>
+        <w:t>11. RegisterPage hiển thị form xác nhận OTP.</w:t>
+      </w:r>
+    </w:p>
+    <w:p>
+      <w:pPr/>
+      <w:r>
+        <w:t>12. Khách hàng nhập OTP = "482917" và nhấn [Xác nhận].</w:t>
+      </w:r>
+    </w:p>
+    <w:p>
+      <w:pPr/>
+      <w:r>
+        <w:t xml:space="preserve">13. Lớp OTPVerifyModal gọi </w:t>
+      </w:r>
+      <w:r>
+        <w:rPr>
+          <w:rFonts w:ascii="Courier New" w:hAnsi="Courier New"/>
+          <w:sz w:val="20"/>
+        </w:rPr>
+        <w:t>xacMinhOTP(otp)</w:t>
+      </w:r>
+      <w:r>
+        <w:t>.</w:t>
+      </w:r>
+    </w:p>
+    <w:p>
+      <w:pPr/>
+      <w:r>
+        <w:t>14. Lớp OTP kiểm tra OTP đúng và còn hiệu lực.</w:t>
+      </w:r>
+    </w:p>
+    <w:p>
+      <w:pPr/>
+      <w:r>
+        <w:t>15. Lớp OTP trả kết quả về OTPVerifyModal.</w:t>
+      </w:r>
+    </w:p>
+    <w:p>
+      <w:pPr/>
+      <w:r>
+        <w:t xml:space="preserve">16. OTPVerifyModal gọi </w:t>
+      </w:r>
+      <w:r>
+        <w:rPr>
+          <w:rFonts w:ascii="Courier New" w:hAnsi="Courier New"/>
+          <w:sz w:val="20"/>
+        </w:rPr>
+        <w:t>luuTaiKhoan()</w:t>
+      </w:r>
+      <w:r>
+        <w:t xml:space="preserve"> để hoàn tất đăng ký.</w:t>
+      </w:r>
+    </w:p>
+    <w:p>
+      <w:pPr/>
+      <w:r>
+        <w:t>17. Hiển thị "Đăng ký thành công! Chào mừng Nguyễn Thị Bình."</w:t>
+      </w:r>
+    </w:p>
+    <w:p>
+      <w:pPr/>
+      <w:r>
+        <w:rPr>
+          <w:b/>
+        </w:rPr>
+        <w:t>Ngoại lệ: SĐT đã tồn tại</w:t>
+      </w:r>
+    </w:p>
+    <w:p>
+      <w:pPr>
+        <w:pStyle w:val="ListBullet"/>
+      </w:pPr>
+      <w:r>
+        <w:t>Lớp NguoiDung trả về "SĐT đã tồn tại".</w:t>
+      </w:r>
+    </w:p>
+    <w:p>
+      <w:pPr>
+        <w:pStyle w:val="ListBullet"/>
+      </w:pPr>
+      <w:r>
+        <w:t>RegisterPage hiển thị "SĐT này đã được sử dụng."</w:t>
+      </w:r>
+    </w:p>
+    <w:p>
+      <w:pPr/>
+      <w:r>
+        <w:rPr>
+          <w:b/>
+        </w:rPr>
+        <w:t>Ngoại lệ: OTP sai</w:t>
+      </w:r>
+    </w:p>
+    <w:p>
+      <w:pPr>
+        <w:pStyle w:val="ListBullet"/>
+      </w:pPr>
+      <w:r>
+        <w:t>Lớp OTP trả về "OTP không đúng".</w:t>
+      </w:r>
+    </w:p>
+    <w:p>
+      <w:pPr>
+        <w:pStyle w:val="ListBullet"/>
+      </w:pPr>
+      <w:r>
+        <w:t>OTPVerifyModal hiển thị "Mã OTP không đúng. Vui lòng thử lại."</w:t>
+      </w:r>
+    </w:p>
+    <w:p>
+      <w:pPr>
+        <w:pStyle w:val="Heading3"/>
+      </w:pPr>
+      <w:r>
+        <w:t>UC03 – Đổi mật khẩu</w:t>
+      </w:r>
+    </w:p>
+    <w:p>
+      <w:pPr/>
+      <w:r>
+        <w:rPr>
+          <w:b/>
+        </w:rPr>
+        <w:t>Kịch bản phiên bản 2 – UC03 Đổi mật khẩu</w:t>
+      </w:r>
+    </w:p>
+    <w:p>
+      <w:pPr/>
+      <w:r>
+        <w:t>1. Người dùng truy cập mục "Bảo mật" trong cài đặt tài khoản.</w:t>
+      </w:r>
+    </w:p>
+    <w:p>
+      <w:pPr/>
+      <w:r>
+        <w:t>2. Lớp ChangePasswordForm hiển thị form: MK hiện tại, MK mới, Xác nhận MK mới.</w:t>
+      </w:r>
+    </w:p>
+    <w:p>
+      <w:pPr/>
+      <w:r>
+        <w:t>3. Người dùng nhập: MK hiện tại = "Abc@1234", MK mới = "NewPass@2025", xác nhận = "NewPass@2025".</w:t>
+      </w:r>
+    </w:p>
+    <w:p>
+      <w:pPr/>
+      <w:r>
+        <w:t>4. Người dùng nhấn [Lưu thay đổi].</w:t>
+      </w:r>
+    </w:p>
+    <w:p>
+      <w:pPr/>
+      <w:r>
+        <w:t xml:space="preserve">5. Lớp ChangePasswordForm gọi </w:t>
+      </w:r>
+      <w:r>
+        <w:rPr>
+          <w:rFonts w:ascii="Courier New" w:hAnsi="Courier New"/>
+          <w:sz w:val="20"/>
+        </w:rPr>
+        <w:t>doiMatKhau()</w:t>
+      </w:r>
+      <w:r>
+        <w:t xml:space="preserve"> với mkHienTai, mkMoi.</w:t>
+      </w:r>
+    </w:p>
+    <w:p>
+      <w:pPr/>
+      <w:r>
+        <w:t xml:space="preserve">6. Lớp NguoiDung xác minh MK hiện tại khớp CSDL bằng </w:t>
+      </w:r>
+      <w:r>
+        <w:rPr>
+          <w:rFonts w:ascii="Courier New" w:hAnsi="Courier New"/>
+          <w:sz w:val="20"/>
+        </w:rPr>
+        <w:t>checkPassword()</w:t>
+      </w:r>
+      <w:r>
+        <w:t>.</w:t>
+      </w:r>
+    </w:p>
+    <w:p>
+      <w:pPr/>
+      <w:r>
+        <w:t xml:space="preserve">7. Lớp NguoiDung mã hóa MK mới bằng </w:t>
+      </w:r>
+      <w:r>
+        <w:rPr>
+          <w:rFonts w:ascii="Courier New" w:hAnsi="Courier New"/>
+          <w:sz w:val="20"/>
+        </w:rPr>
+        <w:t>hashPassword()</w:t>
+      </w:r>
+      <w:r>
+        <w:t>.</w:t>
+      </w:r>
+    </w:p>
+    <w:p>
+      <w:pPr/>
+      <w:r>
+        <w:t xml:space="preserve">8. Lớp NguoiDung cập nhật mật khẩu bằng </w:t>
+      </w:r>
+      <w:r>
+        <w:rPr>
+          <w:rFonts w:ascii="Courier New" w:hAnsi="Courier New"/>
+          <w:sz w:val="20"/>
+        </w:rPr>
+        <w:t>updatePassword()</w:t>
+      </w:r>
+      <w:r>
+        <w:t>.</w:t>
+      </w:r>
+    </w:p>
+    <w:p>
+      <w:pPr/>
+      <w:r>
+        <w:t xml:space="preserve">9. Lớp NguoiDung thu hồi tất cả session bằng </w:t>
+      </w:r>
+      <w:r>
+        <w:rPr>
+          <w:rFonts w:ascii="Courier New" w:hAnsi="Courier New"/>
+          <w:sz w:val="20"/>
+        </w:rPr>
+        <w:t>revokeAllSessions()</w:t>
+      </w:r>
+      <w:r>
+        <w:t>.</w:t>
+      </w:r>
+    </w:p>
+    <w:p>
+      <w:pPr/>
+      <w:r>
+        <w:t>10. ChangePasswordForm hiển thị "Đổi mật khẩu thành công. Vui lòng đăng nhập lại."</w:t>
+      </w:r>
+    </w:p>
+    <w:p>
+      <w:pPr/>
+      <w:r>
+        <w:rPr>
+          <w:b/>
+        </w:rPr>
+        <w:t>Ngoại lệ: MK hiện tại sai</w:t>
+      </w:r>
+    </w:p>
+    <w:p>
+      <w:pPr>
+        <w:pStyle w:val="ListBullet"/>
+      </w:pPr>
+      <w:r>
+        <w:t>Lớp NguoiDung trả về "Mật khẩu hiện tại không chính xác."</w:t>
+      </w:r>
+    </w:p>
+    <w:p>
+      <w:pPr>
+        <w:pStyle w:val="ListBullet"/>
+      </w:pPr>
+      <w:r>
+        <w:t>ChangePasswordForm hiển thị thông báo lỗi.</w:t>
+      </w:r>
+    </w:p>
+    <w:p>
+      <w:pPr/>
+      <w:r>
+        <w:rPr>
+          <w:b/>
+        </w:rPr>
+        <w:t>Ngoại lệ: MK mới không đủ mạnh</w:t>
+      </w:r>
+    </w:p>
+    <w:p>
+      <w:pPr>
+        <w:pStyle w:val="ListBullet"/>
+      </w:pPr>
+      <w:r>
+        <w:t>Lớp NguoiDung trả về "Mật khẩu mới không đủ mạnh."</w:t>
+      </w:r>
+    </w:p>
+    <w:p>
+      <w:pPr>
+        <w:pStyle w:val="ListBullet"/>
+      </w:pPr>
+      <w:r>
+        <w:t>ChangePasswordForm highlight ô và hiển thị yêu cầu còn thiếu.</w:t>
+      </w:r>
+    </w:p>
+    <w:p>
+      <w:pPr>
+        <w:pStyle w:val="Heading3"/>
+      </w:pPr>
+      <w:r>
+        <w:t>UC04 – Quản lý thông tin cá nhân</w:t>
+      </w:r>
+    </w:p>
+    <w:p>
+      <w:pPr/>
+      <w:r>
+        <w:rPr>
+          <w:b/>
+        </w:rPr>
+        <w:t>Kịch bản phiên bản 2 – UC04 Quản lý TTCN</w:t>
+      </w:r>
+    </w:p>
+    <w:p>
+      <w:pPr/>
+      <w:r>
+        <w:t>1. Khách hàng nhấn vào ảnh đại diện / tên tài khoản ở góc trên phải.</w:t>
+      </w:r>
+    </w:p>
+    <w:p>
+      <w:pPr/>
+      <w:r>
+        <w:t xml:space="preserve">2. Lớp ProfilePage gọi </w:t>
+      </w:r>
+      <w:r>
+        <w:rPr>
+          <w:rFonts w:ascii="Courier New" w:hAnsi="Courier New"/>
+          <w:sz w:val="20"/>
+        </w:rPr>
+        <w:t>xemHoSo(userId)</w:t>
+      </w:r>
+      <w:r>
+        <w:t>.</w:t>
+      </w:r>
+    </w:p>
+    <w:p>
+      <w:pPr/>
+      <w:r>
+        <w:t>3. Lớp NguoiDung trả về thông tin hồ sơ.</w:t>
+      </w:r>
+    </w:p>
+    <w:p>
+      <w:pPr/>
+      <w:r>
+        <w:t>4. Lớp ProfilePage hiển thị: Họ tên, SĐT, Email, Hạng hội viên, Điểm tích lũy.</w:t>
+      </w:r>
+    </w:p>
+    <w:p>
+      <w:pPr/>
+      <w:r>
+        <w:t>5. Khách hàng nhấn [Chỉnh sửa thông tin].</w:t>
+      </w:r>
+    </w:p>
+    <w:p>
+      <w:pPr/>
+      <w:r>
+        <w:t>6. Lớp ProfilePage mở EditProfileForm.</w:t>
+      </w:r>
+    </w:p>
+    <w:p>
+      <w:pPr/>
+      <w:r>
+        <w:t>7. Khách hàng cập nhật: Họ tên = "Nguyễn Văn An", Email = "vanan@newemail.com".</w:t>
+      </w:r>
+    </w:p>
+    <w:p>
+      <w:pPr/>
+      <w:r>
+        <w:t>8. Khách hàng nhấn [Lưu thay đổi].</w:t>
+      </w:r>
+    </w:p>
+    <w:p>
+      <w:pPr/>
+      <w:r>
+        <w:t xml:space="preserve">9. Lớp EditProfileForm gọi </w:t>
+      </w:r>
+      <w:r>
+        <w:rPr>
+          <w:rFonts w:ascii="Courier New" w:hAnsi="Courier New"/>
+          <w:sz w:val="20"/>
+        </w:rPr>
+        <w:t>capNhatHoSo()</w:t>
+      </w:r>
+      <w:r>
+        <w:t>.</w:t>
+      </w:r>
+    </w:p>
+    <w:p>
+      <w:pPr/>
+      <w:r>
+        <w:t xml:space="preserve">10. Lớp NguoiDung kiểm tra email hợp lệ bằng </w:t>
+      </w:r>
+      <w:r>
+        <w:rPr>
+          <w:rFonts w:ascii="Courier New" w:hAnsi="Courier New"/>
+          <w:sz w:val="20"/>
+        </w:rPr>
+        <w:t>checkEmail()</w:t>
+      </w:r>
+      <w:r>
+        <w:t>.</w:t>
+      </w:r>
+    </w:p>
+    <w:p>
+      <w:pPr/>
+      <w:r>
+        <w:t xml:space="preserve">11. Lớp NguoiDung cập nhật bằng </w:t>
+      </w:r>
+      <w:r>
+        <w:rPr>
+          <w:rFonts w:ascii="Courier New" w:hAnsi="Courier New"/>
+          <w:sz w:val="20"/>
+        </w:rPr>
+        <w:t>update()</w:t>
+      </w:r>
+      <w:r>
+        <w:t>.</w:t>
+      </w:r>
+    </w:p>
+    <w:p>
+      <w:pPr/>
+      <w:r>
+        <w:t>12. EditProfileForm hiển thị "Cập nhật thành công!"</w:t>
+      </w:r>
+    </w:p>
+    <w:p>
+      <w:pPr/>
+      <w:r>
+        <w:rPr>
+          <w:b/>
+        </w:rPr>
+        <w:t>Ngoại lệ: Email đã được dùng</w:t>
+      </w:r>
+    </w:p>
+    <w:p>
+      <w:pPr>
+        <w:pStyle w:val="ListBullet"/>
+      </w:pPr>
+      <w:r>
+        <w:t>Lớp NguoiDung trả về "Email đã tồn tại."</w:t>
+      </w:r>
+    </w:p>
+    <w:p>
+      <w:pPr>
+        <w:pStyle w:val="ListBullet"/>
+      </w:pPr>
+      <w:r>
+        <w:t>EditProfileForm hiển thị "Email này đã được đăng ký bởi tài khoản khác."</w:t>
+      </w:r>
+    </w:p>
+    <w:p>
+      <w:pPr>
+        <w:pStyle w:val="Heading3"/>
+      </w:pPr>
+      <w:r>
+        <w:t>UC20 – Quản lý tài khoản nhân viên</w:t>
+      </w:r>
+    </w:p>
+    <w:p>
+      <w:pPr/>
+      <w:r>
+        <w:rPr>
+          <w:b/>
+        </w:rPr>
+        <w:t>Kịch bản phiên bản 2 – UC20 Quản lý tài khoản nhân viên</w:t>
+      </w:r>
+    </w:p>
+    <w:p>
+      <w:pPr/>
+      <w:r>
+        <w:t>1. Admin truy cập "Quản lý nhân viên" từ trang quản trị.</w:t>
+      </w:r>
+    </w:p>
+    <w:p>
+      <w:pPr/>
+      <w:r>
+        <w:t xml:space="preserve">2. Lớp StaffManagePage gọi </w:t>
+      </w:r>
+      <w:r>
+        <w:rPr>
+          <w:rFonts w:ascii="Courier New" w:hAnsi="Courier New"/>
+          <w:sz w:val="20"/>
+        </w:rPr>
+        <w:t>xemDanhSachNV()</w:t>
+      </w:r>
+      <w:r>
+        <w:t>.</w:t>
+      </w:r>
+    </w:p>
+    <w:p>
+      <w:pPr/>
+      <w:r>
+        <w:t>3. Lớp NhanVien trả về danh sách nhân viên.</w:t>
+      </w:r>
+    </w:p>
+    <w:p>
+      <w:pPr/>
+      <w:r>
+        <w:t>4. Lớp StaffManagePage hiển thị bảng: họ tên, vai trò, trạng thái.</w:t>
+      </w:r>
+    </w:p>
+    <w:p>
+      <w:pPr/>
+      <w:r>
+        <w:t>5. Admin nhấn [Thêm nhân viên].</w:t>
+      </w:r>
+    </w:p>
+    <w:p>
+      <w:pPr/>
+      <w:r>
+        <w:t>6. Lớp StaffManagePage mở StaffForm.</w:t>
+      </w:r>
+    </w:p>
+    <w:p>
+      <w:pPr/>
+      <w:r>
+        <w:t>7. Admin nhập: Họ tên = "Lê Văn C", Vai trò = "Phục vụ".</w:t>
+      </w:r>
+    </w:p>
+    <w:p>
+      <w:pPr/>
+      <w:r>
+        <w:t>8. Admin nhấn [Lưu].</w:t>
+      </w:r>
+    </w:p>
+    <w:p>
+      <w:pPr/>
+      <w:r>
+        <w:t xml:space="preserve">9. Lớp StaffForm gọi </w:t>
+      </w:r>
+      <w:r>
+        <w:rPr>
+          <w:rFonts w:ascii="Courier New" w:hAnsi="Courier New"/>
+          <w:sz w:val="20"/>
+        </w:rPr>
+        <w:t>themNV(hoTen, vaiTro)</w:t>
+      </w:r>
+      <w:r>
+        <w:t>.</w:t>
+      </w:r>
+    </w:p>
+    <w:p>
+      <w:pPr/>
+      <w:r>
+        <w:t xml:space="preserve">10. Lớp NhanVien lưu bằng </w:t>
+      </w:r>
+      <w:r>
+        <w:rPr>
+          <w:rFonts w:ascii="Courier New" w:hAnsi="Courier New"/>
+          <w:sz w:val="20"/>
+        </w:rPr>
+        <w:t>save()</w:t>
+      </w:r>
+      <w:r>
+        <w:t>.</w:t>
+      </w:r>
+    </w:p>
+    <w:p>
+      <w:pPr/>
+      <w:r>
+        <w:t>11. StaffForm hiển thị "Thêm nhân viên thành công!"</w:t>
+      </w:r>
+    </w:p>
+    <w:p>
+      <w:pPr/>
+      <w:r>
+        <w:rPr>
+          <w:b/>
+        </w:rPr>
+        <w:t>Ngoại lệ: SĐT đã tồn tại</w:t>
+      </w:r>
+    </w:p>
+    <w:p>
+      <w:pPr>
+        <w:pStyle w:val="ListBullet"/>
+      </w:pPr>
+      <w:r>
+        <w:t>Lớp NhanVien trả về "SĐT đã tồn tại."</w:t>
+      </w:r>
+    </w:p>
+    <w:p>
+      <w:pPr>
+        <w:pStyle w:val="ListBullet"/>
+      </w:pPr>
+      <w:r>
+        <w:t>StaffForm hiển thị "SĐT này đã được sử dụng."</w:t>
+      </w:r>
+    </w:p>
+    <w:p>
+      <w:pPr/>
+      <w:r>
+        <w:rPr>
+          <w:b/>
+        </w:rPr>
+        <w:t>Ngoại lệ: Nhân viên đang xử lý order</w:t>
+      </w:r>
+    </w:p>
+    <w:p>
+      <w:pPr>
+        <w:pStyle w:val="ListBullet"/>
+      </w:pPr>
+      <w:r>
+        <w:t>Lớp NhanVien trả về "Không thể xóa."</w:t>
+      </w:r>
+    </w:p>
+    <w:p>
+      <w:pPr>
+        <w:pStyle w:val="ListBullet"/>
+      </w:pPr>
+      <w:r>
+        <w:t>StaffManagePage hiển thị cảnh báo "Nhân viên đang xử lý order, không thể xóa."</w:t>
+      </w:r>
+    </w:p>
     <w:p/>
     <w:p>
       <w:pPr>

</xml_diff>

<commit_message>
fix: align with skill changes — DAO architecture, Vietnamese method names, simplified PlantUML
Key fixes based on skill diff from 134ac14a:
- Architecture: MVC (AuthController) → DAO (NguoiDungDAO, NhanVienDAO, OTPDAO)
- Method names in analysis: kept Vietnamese (per updated ii.3 convention)
- PlantUML: simplified, no VP Base Theme v2
- Boundary classes: simplified to +render() only
- Exception format: 6a → 6.1 (dot notation)
- New diagrams: account_entity_analysis, account_bce_analysis, account_dao_class

DOCX regenerated: 239KB, DAO pattern, proper hierarchy

Co-Authored-By: Claude Opus 4.7 <noreply@anthropic.com>
</commit_message>
<xml_diff>
--- a/output/account_module.docx
+++ b/output/account_module.docx
@@ -3138,7 +3138,7 @@
         <w:t>Kiến trúc chọn: React</w:t>
       </w:r>
       <w:r>
-        <w:t xml:space="preserve"> ( Boundary class dùng hậu tố Page, Form, Modal, Panel )</w:t>
+        <w:t xml:space="preserve"> ( Boundary class dùng hậu tố Page, Form, Modal, Panel. Method names tiếng Việt ở pha phân tích )</w:t>
       </w:r>
     </w:p>
     <w:p>
@@ -3601,213 +3601,43 @@
     <w:p>
       <w:pPr/>
       <w:r>
-        <w:t>LoginPage:</w:t>
-      </w:r>
-    </w:p>
-    <w:p>
-      <w:pPr>
-        <w:pStyle w:val="ListBullet"/>
-      </w:pPr>
-      <w:r>
-        <w:t>inSDT: ô nhập SĐT/Email</w:t>
-      </w:r>
-    </w:p>
-    <w:p>
-      <w:pPr>
-        <w:pStyle w:val="ListBullet"/>
-      </w:pPr>
-      <w:r>
-        <w:t>inMatKhau: ô nhập mật khẩu</w:t>
-      </w:r>
-    </w:p>
-    <w:p>
-      <w:pPr>
-        <w:pStyle w:val="ListBullet"/>
-      </w:pPr>
-      <w:r>
-        <w:t>subDangNhap: nút Đăng nhập</w:t>
-      </w:r>
-    </w:p>
-    <w:p>
-      <w:pPr>
-        <w:pStyle w:val="ListBullet"/>
-      </w:pPr>
-      <w:r>
-        <w:t>subQuenMatKhau: liên kết Quên mật khẩu</w:t>
-      </w:r>
-    </w:p>
-    <w:p>
-      <w:pPr>
-        <w:pStyle w:val="ListBullet"/>
-      </w:pPr>
-      <w:r>
-        <w:t>subDangKy: liên kết Đăng ký</w:t>
+        <w:t>LoginPage: inSDT, inMatKhau, subDangNhap, subQuenMatKhau, subDangKy</w:t>
       </w:r>
     </w:p>
     <w:p>
       <w:pPr/>
       <w:r>
-        <w:t>RegisterPage:</w:t>
-      </w:r>
-    </w:p>
-    <w:p>
-      <w:pPr>
-        <w:pStyle w:val="ListBullet"/>
-      </w:pPr>
-      <w:r>
-        <w:t>inHoTen, inSDT, inEmail, inMatKhau, inXacNhanMK: ô nhập liệu</w:t>
-      </w:r>
-    </w:p>
-    <w:p>
-      <w:pPr>
-        <w:pStyle w:val="ListBullet"/>
-      </w:pPr>
-      <w:r>
-        <w:t>subTiepTuc: nút Tiếp tục</w:t>
-      </w:r>
-    </w:p>
-    <w:p>
-      <w:pPr>
-        <w:pStyle w:val="ListBullet"/>
-      </w:pPr>
-      <w:r>
-        <w:t>subHuy: nút Hủy</w:t>
+        <w:t>RegisterPage: inHoTen, inSDT, inEmail, inMatKhau, inXacNhanMK, subTiepTuc, subHuy</w:t>
       </w:r>
     </w:p>
     <w:p>
       <w:pPr/>
       <w:r>
-        <w:t>OTPVerifyModal:</w:t>
-      </w:r>
-    </w:p>
-    <w:p>
-      <w:pPr>
-        <w:pStyle w:val="ListBullet"/>
-      </w:pPr>
-      <w:r>
-        <w:t>inOTP: ô nhập 6 chữ số OTP</w:t>
-      </w:r>
-    </w:p>
-    <w:p>
-      <w:pPr>
-        <w:pStyle w:val="ListBullet"/>
-      </w:pPr>
-      <w:r>
-        <w:t>subXacNhan: nút Xác nhận</w:t>
-      </w:r>
-    </w:p>
-    <w:p>
-      <w:pPr>
-        <w:pStyle w:val="ListBullet"/>
-      </w:pPr>
-      <w:r>
-        <w:t>subGuiLai: liên kết Gửi lại OTP</w:t>
+        <w:t>OTPVerifyModal: inOTP, subXacNhan, subGuiLai</w:t>
       </w:r>
     </w:p>
     <w:p>
       <w:pPr/>
       <w:r>
-        <w:t>ChangePasswordForm:</w:t>
-      </w:r>
-    </w:p>
-    <w:p>
-      <w:pPr>
-        <w:pStyle w:val="ListBullet"/>
-      </w:pPr>
-      <w:r>
-        <w:t>inMKHienTai, inMKMoi, inXacNhanMKMoi: ô nhập liệu</w:t>
-      </w:r>
-    </w:p>
-    <w:p>
-      <w:pPr>
-        <w:pStyle w:val="ListBullet"/>
-      </w:pPr>
-      <w:r>
-        <w:t>subLuu: nút Lưu thay đổi</w:t>
-      </w:r>
-    </w:p>
-    <w:p>
-      <w:pPr>
-        <w:pStyle w:val="ListBullet"/>
-      </w:pPr>
-      <w:r>
-        <w:t>subHuy: nút Hủy</w:t>
+        <w:t>ChangePasswordForm: inMKHienTai, inMKMoi, inXacNhanMKMoi, subLuu, subHuy</w:t>
       </w:r>
     </w:p>
     <w:p>
       <w:pPr/>
       <w:r>
-        <w:t>ProfilePage:</w:t>
-      </w:r>
-    </w:p>
-    <w:p>
-      <w:pPr>
-        <w:pStyle w:val="ListBullet"/>
-      </w:pPr>
-      <w:r>
-        <w:t>outHoTen, outSDT, outEmail, outHang, outDiem, outNgayThamGia: vùng hiển thị</w:t>
-      </w:r>
-    </w:p>
-    <w:p>
-      <w:pPr>
-        <w:pStyle w:val="ListBullet"/>
-      </w:pPr>
-      <w:r>
-        <w:t>subChinhSua: nút Chỉnh sửa thông tin</w:t>
-      </w:r>
-    </w:p>
-    <w:p>
-      <w:pPr>
-        <w:pStyle w:val="ListBullet"/>
-      </w:pPr>
-      <w:r>
-        <w:t>subDoiMK: nút Đổi mật khẩu</w:t>
+        <w:t>ProfilePage: outHoTen, outSDT, outEmail, outHang, outDiem, subChinhSua, subDoiMK</w:t>
       </w:r>
     </w:p>
     <w:p>
       <w:pPr/>
       <w:r>
-        <w:t>StaffManagePage:</w:t>
+        <w:t>StaffManagePage: outDSNhanVien, outsubChonNV, subThem, subSua, subXoa</w:t>
       </w:r>
     </w:p>
     <w:p>
-      <w:pPr>
-        <w:pStyle w:val="ListBullet"/>
-      </w:pPr>
-      <w:r>
-        <w:t>outDSNhanVien: bảng danh sách nhân viên</w:t>
-      </w:r>
-    </w:p>
-    <w:p>
-      <w:pPr>
-        <w:pStyle w:val="ListBullet"/>
-      </w:pPr>
-      <w:r>
-        <w:t>subThem: nút Thêm nhân viên</w:t>
-      </w:r>
-    </w:p>
-    <w:p>
-      <w:pPr>
-        <w:pStyle w:val="ListBullet"/>
-      </w:pPr>
-      <w:r>
-        <w:t>outsubChonNV: chọn dòng trong bảng</w:t>
-      </w:r>
-    </w:p>
-    <w:p>
-      <w:pPr>
-        <w:pStyle w:val="ListBullet"/>
-      </w:pPr>
-      <w:r>
-        <w:t>subSua: nút Sửa</w:t>
-      </w:r>
-    </w:p>
-    <w:p>
-      <w:pPr>
-        <w:pStyle w:val="ListBullet"/>
-      </w:pPr>
-      <w:r>
-        <w:t>subXoa: nút Xóa</w:t>
+      <w:pPr/>
+      <w:r>
+        <w:t>StaffForm: inHoTen, inVaiTro, subLuu, subHuy</w:t>
       </w:r>
     </w:p>
     <w:p>
@@ -3835,6 +3665,9 @@
           <w:sz w:val="20"/>
         </w:rPr>
         <w:t>dangNhap()</w:t>
+      </w:r>
+      <w:r>
+        <w:t xml:space="preserve"> ← tên tiếng Việt, ngôn ngữ tự nhiên</w:t>
       </w:r>
     </w:p>
     <w:p>
@@ -6534,13 +6367,13 @@
         <w:pStyle w:val="Heading2"/>
       </w:pPr>
       <w:r>
-        <w:t>4. MVC class diagram</w:t>
+        <w:t>4. DAO class diagram</w:t>
       </w:r>
     </w:p>
     <w:p>
       <w:pPr/>
       <w:r>
-        <w:t>Mô hình MVC thiết kế theo kiến trúc BCE:</w:t>
+        <w:t>Mô hình thiết kế theo kiến trúc DAO (BCE):</w:t>
       </w:r>
     </w:p>
     <w:p>
@@ -6561,10 +6394,10 @@
         <w:rPr>
           <w:b/>
         </w:rPr>
-        <w:t>Control:</w:t>
-      </w:r>
-      <w:r>
-        <w:t xml:space="preserve"> AuthController, UserController</w:t>
+        <w:t>DAO:</w:t>
+      </w:r>
+      <w:r>
+        <w:t xml:space="preserve"> NguoiDungDAO (extends DAO), NhanVienDAO (extends DAO)</w:t>
       </w:r>
     </w:p>
     <w:p>
@@ -6586,7 +6419,7 @@
       <w:r>
         <w:drawing>
           <wp:inline xmlns:a="http://schemas.openxmlformats.org/drawingml/2006/main" xmlns:pic="http://schemas.openxmlformats.org/drawingml/2006/picture">
-            <wp:extent cx="5486400" cy="2709805"/>
+            <wp:extent cx="5486400" cy="3207790"/>
             <wp:docPr id="3" name="Picture 3"/>
             <wp:cNvGraphicFramePr>
               <a:graphicFrameLocks noChangeAspect="1"/>
@@ -6595,7 +6428,7 @@
               <a:graphicData uri="http://schemas.openxmlformats.org/drawingml/2006/picture">
                 <pic:pic>
                   <pic:nvPicPr>
-                    <pic:cNvPr id="0" name="account_mvc_class.png"/>
+                    <pic:cNvPr id="0" name="account_dao_class.png"/>
                     <pic:cNvPicPr/>
                   </pic:nvPicPr>
                   <pic:blipFill>
@@ -6607,7 +6440,7 @@
                   <pic:spPr>
                     <a:xfrm>
                       <a:off x="0" y="0"/>
-                      <a:ext cx="5486400" cy="2709805"/>
+                      <a:ext cx="5486400" cy="3207790"/>
                     </a:xfrm>
                     <a:prstGeom prst="rect"/>
                   </pic:spPr>

</xml_diff>

<commit_message>
fix: wireframes Unicode box-drawing + 4 more test cases
Wireframes:
- Updated all 6 wireframes from ASCII +/-/| to Unicode ┌─┐│└┘
- Table headers now use Vietnamese display labels (per updated skill)

Test cases added:
- TC02: Tài khoản không tồn tại
- TC04: Đăng ký thành công với OTP
- TC07: Đổi mật khẩu thành công
- TC08: Mật khẩu hiện tại sai

DOCX: 332 paragraphs, 33 tables, 8 images, 7 detailed TCs

Co-Authored-By: Claude Opus 4.7 <noreply@anthropic.com>
</commit_message>
<xml_diff>
--- a/output/account_module.docx
+++ b/output/account_module.docx
@@ -6108,23 +6108,23 @@
           <w:color w:val="000000"/>
           <w:sz w:val="16"/>
         </w:rPr>
-        <w:t>+--------------------------------------------------+</w:t>
+        <w:t>┌──────────────────────────────────────────────┐</w:t>
         <w:br/>
-        <w:t>|              Đăng nhập                           |</w:t>
+        <w:t>│              Đăng nhập                       │</w:t>
         <w:br/>
-        <w:t>|                                                  |</w:t>
+        <w:t>│                                              │</w:t>
         <w:br/>
-        <w:t>|  SĐT / Email: [________________________]         |</w:t>
+        <w:t>│  SĐT / Email: [________________________]     │</w:t>
         <w:br/>
-        <w:t>|  Mật khẩu:    [________________________]         |</w:t>
+        <w:t>│  Mật khẩu:    [________________________]     │</w:t>
         <w:br/>
-        <w:t>|                                                  |</w:t>
+        <w:t>│                                              │</w:t>
         <w:br/>
-        <w:t>|  [Đăng nhập]                                     |</w:t>
+        <w:t>│  [Đăng nhập]                                 │</w:t>
         <w:br/>
-        <w:t>|  Quên mật khẩu?  |  Đăng ký mới                 |</w:t>
+        <w:t>│  Quên mật khẩu?  |  Đăng ký mới             │</w:t>
         <w:br/>
-        <w:t>+--------------------------------------------------+</w:t>
+        <w:t>└──────────────────────────────────────────────┘</w:t>
       </w:r>
     </w:p>
     <w:p>
@@ -6136,42 +6136,32 @@
       </w:r>
     </w:p>
     <w:p>
-      <w:pPr>
-        <w:pBdr>
-          <w:top w:val="single" w:sz="4" w:space="4" w:color="808080"/>
-          <w:left w:val="single" w:sz="4" w:space="4" w:color="808080"/>
-          <w:bottom w:val="single" w:sz="4" w:space="4" w:color="808080"/>
-          <w:right w:val="single" w:sz="4" w:space="4" w:color="808080"/>
-        </w:pBdr>
-        <w:shd w:val="clear" w:fill="F5F5F5"/>
-      </w:pPr>
       <w:r>
         <w:rPr>
           <w:rFonts w:ascii="Courier New" w:hAnsi="Courier New"/>
-          <w:color w:val="000000"/>
-          <w:sz w:val="16"/>
+          <w:sz w:val="18"/>
         </w:rPr>
-        <w:t>+--------------------------------------------------+</w:t>
+        <w:t>┌──────────────────────────────────────────────┐</w:t>
         <w:br/>
-        <w:t>|              Đăng ký tài khoản                    |</w:t>
+        <w:t>│              Đăng ký tài khoản                │</w:t>
         <w:br/>
-        <w:t>|                                                  |</w:t>
+        <w:t>│                                              │</w:t>
         <w:br/>
-        <w:t>|  Họ và tên:      [________________________]      |</w:t>
+        <w:t>│  Họ và tên:      [________________________]  │</w:t>
         <w:br/>
-        <w:t>|  Số điện thoại:   [________________________]      |</w:t>
+        <w:t>│  Số điện thoại:   [________________________]  │</w:t>
         <w:br/>
-        <w:t>|  Email:           [________________________]      |</w:t>
+        <w:t>│  Email:           [________________________]  │</w:t>
         <w:br/>
-        <w:t>|  Mật khẩu:       [________________________]      |</w:t>
+        <w:t>│  Mật khẩu:       [________________________]  │</w:t>
         <w:br/>
-        <w:t>|  Xác nhận MK:    [________________________]      |</w:t>
+        <w:t>│  Xác nhận MK:    [________________________]  │</w:t>
         <w:br/>
-        <w:t>|                                                  |</w:t>
+        <w:t>│                                              │</w:t>
         <w:br/>
-        <w:t>|  [Tiếp tục]                     [Hủy]           |</w:t>
+        <w:t>│  [Tiếp tục]                 [Hủy]           │</w:t>
         <w:br/>
-        <w:t>+--------------------------------------------------+</w:t>
+        <w:t>└──────────────────────────────────────────────┘</w:t>
       </w:r>
     </w:p>
     <w:p>
@@ -6183,40 +6173,30 @@
       </w:r>
     </w:p>
     <w:p>
-      <w:pPr>
-        <w:pBdr>
-          <w:top w:val="single" w:sz="4" w:space="4" w:color="808080"/>
-          <w:left w:val="single" w:sz="4" w:space="4" w:color="808080"/>
-          <w:bottom w:val="single" w:sz="4" w:space="4" w:color="808080"/>
-          <w:right w:val="single" w:sz="4" w:space="4" w:color="808080"/>
-        </w:pBdr>
-        <w:shd w:val="clear" w:fill="F5F5F5"/>
-      </w:pPr>
       <w:r>
         <w:rPr>
           <w:rFonts w:ascii="Courier New" w:hAnsi="Courier New"/>
-          <w:color w:val="000000"/>
-          <w:sz w:val="16"/>
+          <w:sz w:val="18"/>
         </w:rPr>
-        <w:t>+--------------------------------------------------+</w:t>
+        <w:t>┌──────────────────────────────────────────────┐</w:t>
         <w:br/>
-        <w:t>|           Xác nhận OTP                           |</w:t>
+        <w:t>│           Xác nhận OTP                       │</w:t>
         <w:br/>
-        <w:t>|                                                  |</w:t>
+        <w:t>│                                              │</w:t>
         <w:br/>
-        <w:t>|  Mã OTP đã gửi đến 098****321                   |</w:t>
+        <w:t>│  Mã OTP đã gửi đến 098****321               │</w:t>
         <w:br/>
-        <w:t>|                                                  |</w:t>
+        <w:t>│                                              │</w:t>
         <w:br/>
-        <w:t>|  [__][__][__][__][__][__]                        |</w:t>
+        <w:t>│  [__][__][__][__][__][__]                    │</w:t>
         <w:br/>
-        <w:t>|                                                  |</w:t>
+        <w:t>│                                              │</w:t>
         <w:br/>
-        <w:t>|  [Xác nhận]                                      |</w:t>
+        <w:t>│  [Xác nhận]                                  │</w:t>
         <w:br/>
-        <w:t>|  Gửi lại OTP (60s)                              |</w:t>
+        <w:t>│  Gửi lại OTP (60s)                          │</w:t>
         <w:br/>
-        <w:t>+--------------------------------------------------+</w:t>
+        <w:t>└──────────────────────────────────────────────┘</w:t>
       </w:r>
     </w:p>
     <w:p>
@@ -6228,38 +6208,28 @@
       </w:r>
     </w:p>
     <w:p>
-      <w:pPr>
-        <w:pBdr>
-          <w:top w:val="single" w:sz="4" w:space="4" w:color="808080"/>
-          <w:left w:val="single" w:sz="4" w:space="4" w:color="808080"/>
-          <w:bottom w:val="single" w:sz="4" w:space="4" w:color="808080"/>
-          <w:right w:val="single" w:sz="4" w:space="4" w:color="808080"/>
-        </w:pBdr>
-        <w:shd w:val="clear" w:fill="F5F5F5"/>
-      </w:pPr>
       <w:r>
         <w:rPr>
           <w:rFonts w:ascii="Courier New" w:hAnsi="Courier New"/>
-          <w:color w:val="000000"/>
-          <w:sz w:val="16"/>
+          <w:sz w:val="18"/>
         </w:rPr>
-        <w:t>+--------------------------------------------------+</w:t>
+        <w:t>┌──────────────────────────────────────────────┐</w:t>
         <w:br/>
-        <w:t>|           Đổi mật khẩu                           |</w:t>
+        <w:t>│           Đổi mật khẩu                       │</w:t>
         <w:br/>
-        <w:t>|                                                  |</w:t>
+        <w:t>│                                              │</w:t>
         <w:br/>
-        <w:t>|  Mật khẩu hiện tại: [________________________]  |</w:t>
+        <w:t>│  Mật khẩu hiện tại: [________________________]│</w:t>
         <w:br/>
-        <w:t>|  Mật khẩu mới:      [________________________]  |</w:t>
+        <w:t>│  Mật khẩu mới:      [________________________]│</w:t>
         <w:br/>
-        <w:t>|  Xác nhận MK mới:   [________________________]  |</w:t>
+        <w:t>│  Xác nhận MK mới:   [________________________]│</w:t>
         <w:br/>
-        <w:t>|                                                  |</w:t>
+        <w:t>│                                              │</w:t>
         <w:br/>
-        <w:t>|  [Lưu thay đổi]              [Hủy]              |</w:t>
+        <w:t>│  [Lưu thay đổi]          [Hủy]              │</w:t>
         <w:br/>
-        <w:t>+--------------------------------------------------+</w:t>
+        <w:t>└──────────────────────────────────────────────┘</w:t>
       </w:r>
     </w:p>
     <w:p>
@@ -6271,42 +6241,32 @@
       </w:r>
     </w:p>
     <w:p>
-      <w:pPr>
-        <w:pBdr>
-          <w:top w:val="single" w:sz="4" w:space="4" w:color="808080"/>
-          <w:left w:val="single" w:sz="4" w:space="4" w:color="808080"/>
-          <w:bottom w:val="single" w:sz="4" w:space="4" w:color="808080"/>
-          <w:right w:val="single" w:sz="4" w:space="4" w:color="808080"/>
-        </w:pBdr>
-        <w:shd w:val="clear" w:fill="F5F5F5"/>
-      </w:pPr>
       <w:r>
         <w:rPr>
           <w:rFonts w:ascii="Courier New" w:hAnsi="Courier New"/>
-          <w:color w:val="000000"/>
-          <w:sz w:val="16"/>
+          <w:sz w:val="18"/>
         </w:rPr>
-        <w:t>+--------------------------------------------------+</w:t>
+        <w:t>┌──────────────────────────────────────────────┐</w:t>
         <w:br/>
-        <w:t>|           Hồ sơ cá nhân                          |</w:t>
+        <w:t>│           Hồ sơ cá nhân                      │</w:t>
         <w:br/>
-        <w:t>|                                                  |</w:t>
+        <w:t>│                                              │</w:t>
         <w:br/>
-        <w:t>|  Họ và tên:      Nguyễn Văn An                  |</w:t>
+        <w:t>│  Họ và tên:      Nguyễn Văn An              │</w:t>
         <w:br/>
-        <w:t>|  Số điện thoại:   0912345678                     |</w:t>
+        <w:t>│  Số điện thoại:   0912345678                 │</w:t>
         <w:br/>
-        <w:t>|  Email:           vana@email.com                 |</w:t>
+        <w:t>│  Email:           vana@email.com             │</w:t>
         <w:br/>
-        <w:t>|  Hạng hội viên:  Bạc (1.250 điểm)              |</w:t>
+        <w:t>│  Hạng hội viên:  Bạc (1.250 điểm)          │</w:t>
         <w:br/>
-        <w:t>|  Ngày tham gia:   15/03/2024                     |</w:t>
+        <w:t>│  Ngày tham gia:   15/03/2024                 │</w:t>
         <w:br/>
-        <w:t>|                                                  |</w:t>
+        <w:t>│                                              │</w:t>
         <w:br/>
-        <w:t>|  [Chỉnh sửa thông tin]    [Đổi mật khẩu]        |</w:t>
+        <w:t>│  [Chỉnh sửa thông tin]  [Đổi mật khẩu]      │</w:t>
         <w:br/>
-        <w:t>+--------------------------------------------------+</w:t>
+        <w:t>└──────────────────────────────────────────────┘</w:t>
       </w:r>
     </w:p>
     <w:p>
@@ -6318,48 +6278,36 @@
       </w:r>
     </w:p>
     <w:p>
-      <w:pPr>
-        <w:pBdr>
-          <w:top w:val="single" w:sz="4" w:space="4" w:color="808080"/>
-          <w:left w:val="single" w:sz="4" w:space="4" w:color="808080"/>
-          <w:bottom w:val="single" w:sz="4" w:space="4" w:color="808080"/>
-          <w:right w:val="single" w:sz="4" w:space="4" w:color="808080"/>
-        </w:pBdr>
-        <w:shd w:val="clear" w:fill="F5F5F5"/>
-      </w:pPr>
       <w:r>
         <w:rPr>
           <w:rFonts w:ascii="Courier New" w:hAnsi="Courier New"/>
-          <w:color w:val="000000"/>
-          <w:sz w:val="16"/>
+          <w:sz w:val="18"/>
         </w:rPr>
-        <w:t>+--------------------------------------------------+</w:t>
+        <w:t>┌──────────────────────────────────────────────┐</w:t>
         <w:br/>
-        <w:t>|        Quản lý tài khoản nhân viên               |</w:t>
+        <w:t>│        Quản lý tài khoản nhân viên           │</w:t>
         <w:br/>
-        <w:t>|                                                  |</w:t>
+        <w:t>│                                              │</w:t>
         <w:br/>
-        <w:t>|  [Thêm nhân viên]                                |</w:t>
+        <w:t>│  [Thêm nhân viên]                            │</w:t>
         <w:br/>
-        <w:t>|                                                  |</w:t>
+        <w:t>│                                              │</w:t>
         <w:br/>
-        <w:t>| +----------+----------+----------+-------+-------+</w:t>
+        <w:t>│ ┌──────┬────────┬──────────┬──────────┐      │</w:t>
         <w:br/>
-        <w:t>| | hoTen    | vaiTro   | chiNhanh | trangThai| ... |</w:t>
+        <w:t>│ │ Họ tên│ Vai trò│ Trạng thái│ ...     │      │</w:t>
         <w:br/>
-        <w:t>| |----------|----------|----------|---------|-----|</w:t>
+        <w:t>│ │ Trần A│ Lễ tân │ Đang LD  │         │      │</w:t>
         <w:br/>
-        <w:t>| | Trần A   | Lễ tân   | Q1       | Đang LD |     |</w:t>
+        <w:t>│ │ Lê B  │ Phục vụ│ Đang LD  │         │      │</w:t>
         <w:br/>
-        <w:t>| | Lê B     | Phục vụ  | Q3       | Đang LD |     |</w:t>
+        <w:t>│ └──────┴────────┴──────────┴──────────┘      │</w:t>
         <w:br/>
-        <w:t>| +----------+----------+----------+-------+-------+</w:t>
+        <w:t>│                                              │</w:t>
         <w:br/>
-        <w:t>|                                                  |</w:t>
+        <w:t>│  [Sửa]  [Xóa]                               │</w:t>
         <w:br/>
-        <w:t>|  [Sửa]  [Xóa]                                   |</w:t>
-        <w:br/>
-        <w:t>+--------------------------------------------------+</w:t>
+        <w:t>└──────────────────────────────────────────────┘</w:t>
       </w:r>
     </w:p>
     <w:p>
@@ -9366,6 +9314,1982 @@
         </w:tc>
       </w:tr>
     </w:tbl>
+    <w:p>
+      <w:pPr/>
+      <w:r>
+        <w:t>---</w:t>
+      </w:r>
+    </w:p>
+    <w:p>
+      <w:pPr>
+        <w:pStyle w:val="Heading3"/>
+      </w:pPr>
+      <w:r>
+        <w:t>TC02: Tài khoản không tồn tại</w:t>
+      </w:r>
+    </w:p>
+    <w:p>
+      <w:pPr/>
+      <w:r>
+        <w:rPr>
+          <w:b/>
+        </w:rPr>
+        <w:t>Trạng thái CSDL trước:</w:t>
+      </w:r>
+    </w:p>
+    <w:p>
+      <w:pPr/>
+      <w:r>
+        <w:t>tblNguoiDung</w:t>
+      </w:r>
+    </w:p>
+    <w:tbl>
+      <w:tblPr>
+        <w:tblStyle w:val="TableGrid"/>
+        <w:tblW w:type="auto" w:w="0"/>
+        <w:tblLook w:firstColumn="1" w:firstRow="1" w:lastColumn="0" w:lastRow="0" w:noHBand="0" w:noVBand="1" w:val="04A0"/>
+      </w:tblPr>
+      <w:tblGrid>
+        <w:gridCol w:w="2880"/>
+        <w:gridCol w:w="2880"/>
+        <w:gridCol w:w="2880"/>
+      </w:tblGrid>
+      <w:tr>
+        <w:tc>
+          <w:tcPr>
+            <w:tcW w:type="dxa" w:w="2880"/>
+            <w:shd w:fill="D9E2F3"/>
+          </w:tcPr>
+          <w:p>
+            <w:pPr/>
+            <w:r/>
+            <w:r>
+              <w:rPr>
+                <w:b/>
+                <w:sz w:val="20"/>
+              </w:rPr>
+              <w:t>ma</w:t>
+            </w:r>
+          </w:p>
+        </w:tc>
+        <w:tc>
+          <w:tcPr>
+            <w:tcW w:type="dxa" w:w="2880"/>
+            <w:shd w:fill="D9E2F3"/>
+          </w:tcPr>
+          <w:p>
+            <w:pPr/>
+            <w:r/>
+            <w:r>
+              <w:rPr>
+                <w:b/>
+                <w:sz w:val="20"/>
+              </w:rPr>
+              <w:t>hoTen</w:t>
+            </w:r>
+          </w:p>
+        </w:tc>
+        <w:tc>
+          <w:tcPr>
+            <w:tcW w:type="dxa" w:w="2880"/>
+            <w:shd w:fill="D9E2F3"/>
+          </w:tcPr>
+          <w:p>
+            <w:pPr/>
+            <w:r/>
+            <w:r>
+              <w:rPr>
+                <w:b/>
+                <w:sz w:val="20"/>
+              </w:rPr>
+              <w:t>soDienThoai</w:t>
+            </w:r>
+          </w:p>
+        </w:tc>
+      </w:tr>
+      <w:tr>
+        <w:tc>
+          <w:tcPr>
+            <w:tcW w:type="dxa" w:w="2880"/>
+          </w:tcPr>
+          <w:p>
+            <w:pPr/>
+            <w:r/>
+            <w:r>
+              <w:rPr>
+                <w:sz w:val="20"/>
+              </w:rPr>
+              <w:t>1</w:t>
+            </w:r>
+          </w:p>
+        </w:tc>
+        <w:tc>
+          <w:tcPr>
+            <w:tcW w:type="dxa" w:w="2880"/>
+          </w:tcPr>
+          <w:p>
+            <w:pPr/>
+            <w:r/>
+            <w:r>
+              <w:rPr>
+                <w:sz w:val="20"/>
+              </w:rPr>
+              <w:t>Nguyễn Văn A</w:t>
+            </w:r>
+          </w:p>
+        </w:tc>
+        <w:tc>
+          <w:tcPr>
+            <w:tcW w:type="dxa" w:w="2880"/>
+          </w:tcPr>
+          <w:p>
+            <w:pPr/>
+            <w:r/>
+            <w:r>
+              <w:rPr>
+                <w:sz w:val="20"/>
+              </w:rPr>
+              <w:t>0912345678</w:t>
+            </w:r>
+          </w:p>
+        </w:tc>
+      </w:tr>
+    </w:tbl>
+    <w:p>
+      <w:pPr/>
+      <w:r>
+        <w:rPr>
+          <w:b/>
+        </w:rPr>
+        <w:t>Kịch bản thực hiện:</w:t>
+      </w:r>
+    </w:p>
+    <w:tbl>
+      <w:tblPr>
+        <w:tblStyle w:val="TableGrid"/>
+        <w:tblW w:type="auto" w:w="0"/>
+        <w:jc w:val="center"/>
+        <w:tblLook w:firstColumn="1" w:firstRow="1" w:lastColumn="0" w:lastRow="0" w:noHBand="0" w:noVBand="1" w:val="04A0"/>
+      </w:tblPr>
+      <w:tblGrid>
+        <w:gridCol w:w="4320"/>
+        <w:gridCol w:w="4320"/>
+      </w:tblGrid>
+      <w:tr>
+        <w:tc>
+          <w:tcPr>
+            <w:tcW w:type="dxa" w:w="2835"/>
+            <w:shd w:fill="D9E2F3"/>
+          </w:tcPr>
+          <w:p>
+            <w:pPr/>
+            <w:r/>
+            <w:r>
+              <w:rPr>
+                <w:b/>
+                <w:sz w:val="20"/>
+              </w:rPr>
+              <w:t>Kịch bản</w:t>
+            </w:r>
+          </w:p>
+        </w:tc>
+        <w:tc>
+          <w:tcPr>
+            <w:tcW w:type="dxa" w:w="6803"/>
+            <w:shd w:fill="D9E2F3"/>
+          </w:tcPr>
+          <w:p>
+            <w:pPr/>
+            <w:r/>
+            <w:r>
+              <w:rPr>
+                <w:b/>
+                <w:sz w:val="20"/>
+              </w:rPr>
+              <w:t>Kết quả mong đợi</w:t>
+            </w:r>
+          </w:p>
+        </w:tc>
+      </w:tr>
+      <w:tr>
+        <w:tc>
+          <w:tcPr>
+            <w:tcW w:type="dxa" w:w="2835"/>
+          </w:tcPr>
+          <w:p>
+            <w:pPr/>
+            <w:r/>
+            <w:r>
+              <w:rPr>
+                <w:sz w:val="20"/>
+              </w:rPr>
+              <w:t>1. Mở màn hình Đăng nhập</w:t>
+            </w:r>
+          </w:p>
+        </w:tc>
+        <w:tc>
+          <w:tcPr>
+            <w:tcW w:type="dxa" w:w="6803"/>
+          </w:tcPr>
+          <w:p>
+            <w:pPr/>
+            <w:r/>
+            <w:r>
+              <w:rPr>
+                <w:sz w:val="20"/>
+              </w:rPr>
+              <w:t>Hiển thị form</w:t>
+            </w:r>
+          </w:p>
+        </w:tc>
+      </w:tr>
+      <w:tr>
+        <w:tc>
+          <w:tcPr>
+            <w:tcW w:type="dxa" w:w="2835"/>
+          </w:tcPr>
+          <w:p>
+            <w:pPr/>
+            <w:r/>
+            <w:r>
+              <w:rPr>
+                <w:sz w:val="20"/>
+              </w:rPr>
+              <w:t>2. Nhập: 0999999999 / Abc@1234</w:t>
+            </w:r>
+          </w:p>
+        </w:tc>
+        <w:tc>
+          <w:tcPr>
+            <w:tcW w:type="dxa" w:w="6803"/>
+          </w:tcPr>
+          <w:p>
+            <w:pPr/>
+            <w:r/>
+            <w:r>
+              <w:rPr>
+                <w:sz w:val="20"/>
+              </w:rPr>
+              <w:t>SĐT không tồn tại trong CSDL</w:t>
+            </w:r>
+          </w:p>
+        </w:tc>
+      </w:tr>
+      <w:tr>
+        <w:tc>
+          <w:tcPr>
+            <w:tcW w:type="dxa" w:w="2835"/>
+          </w:tcPr>
+          <w:p>
+            <w:pPr/>
+            <w:r/>
+            <w:r>
+              <w:rPr>
+                <w:sz w:val="20"/>
+              </w:rPr>
+              <w:t>3. Nhấn [Đăng nhập]</w:t>
+            </w:r>
+          </w:p>
+        </w:tc>
+        <w:tc>
+          <w:tcPr>
+            <w:tcW w:type="dxa" w:w="6803"/>
+          </w:tcPr>
+          <w:p>
+            <w:pPr/>
+            <w:r/>
+            <w:r>
+              <w:rPr>
+                <w:sz w:val="20"/>
+              </w:rPr>
+              <w:t>Kiểm tra CSDL, không tìm thấy</w:t>
+            </w:r>
+          </w:p>
+        </w:tc>
+      </w:tr>
+      <w:tr>
+        <w:tc>
+          <w:tcPr>
+            <w:tcW w:type="dxa" w:w="2835"/>
+          </w:tcPr>
+          <w:p>
+            <w:pPr/>
+            <w:r/>
+            <w:r>
+              <w:rPr>
+                <w:sz w:val="20"/>
+              </w:rPr>
+              <w:t>4. Hiển thị lỗi</w:t>
+            </w:r>
+          </w:p>
+        </w:tc>
+        <w:tc>
+          <w:tcPr>
+            <w:tcW w:type="dxa" w:w="6803"/>
+          </w:tcPr>
+          <w:p>
+            <w:pPr/>
+            <w:r/>
+            <w:r>
+              <w:rPr>
+                <w:sz w:val="20"/>
+              </w:rPr>
+              <w:t>"Tài khoản không tồn tại. Vui lòng kiểm tra lại."</w:t>
+            </w:r>
+          </w:p>
+        </w:tc>
+      </w:tr>
+    </w:tbl>
+    <w:p>
+      <w:pPr/>
+      <w:r>
+        <w:rPr>
+          <w:b/>
+        </w:rPr>
+        <w:t>Trạng thái CSDL sau:</w:t>
+      </w:r>
+      <w:r>
+        <w:t xml:space="preserve"> Không thay đổi.</w:t>
+      </w:r>
+    </w:p>
+    <w:p>
+      <w:pPr/>
+      <w:r>
+        <w:t>---</w:t>
+      </w:r>
+    </w:p>
+    <w:p>
+      <w:pPr>
+        <w:pStyle w:val="Heading3"/>
+      </w:pPr>
+      <w:r>
+        <w:t>TC04: Đăng ký thành công với OTP</w:t>
+      </w:r>
+    </w:p>
+    <w:p>
+      <w:pPr/>
+      <w:r>
+        <w:rPr>
+          <w:b/>
+        </w:rPr>
+        <w:t>Trạng thái CSDL trước:</w:t>
+      </w:r>
+    </w:p>
+    <w:p>
+      <w:pPr/>
+      <w:r>
+        <w:t>tblNguoiDung</w:t>
+      </w:r>
+    </w:p>
+    <w:tbl>
+      <w:tblPr>
+        <w:tblStyle w:val="TableGrid"/>
+        <w:tblW w:type="auto" w:w="0"/>
+        <w:tblLook w:firstColumn="1" w:firstRow="1" w:lastColumn="0" w:lastRow="0" w:noHBand="0" w:noVBand="1" w:val="04A0"/>
+      </w:tblPr>
+      <w:tblGrid>
+        <w:gridCol w:w="2880"/>
+        <w:gridCol w:w="2880"/>
+        <w:gridCol w:w="2880"/>
+      </w:tblGrid>
+      <w:tr>
+        <w:tc>
+          <w:tcPr>
+            <w:tcW w:type="dxa" w:w="2880"/>
+            <w:shd w:fill="D9E2F3"/>
+          </w:tcPr>
+          <w:p>
+            <w:pPr/>
+            <w:r/>
+            <w:r>
+              <w:rPr>
+                <w:b/>
+                <w:sz w:val="20"/>
+              </w:rPr>
+              <w:t>ma</w:t>
+            </w:r>
+          </w:p>
+        </w:tc>
+        <w:tc>
+          <w:tcPr>
+            <w:tcW w:type="dxa" w:w="2880"/>
+            <w:shd w:fill="D9E2F3"/>
+          </w:tcPr>
+          <w:p>
+            <w:pPr/>
+            <w:r/>
+            <w:r>
+              <w:rPr>
+                <w:b/>
+                <w:sz w:val="20"/>
+              </w:rPr>
+              <w:t>hoTen</w:t>
+            </w:r>
+          </w:p>
+        </w:tc>
+        <w:tc>
+          <w:tcPr>
+            <w:tcW w:type="dxa" w:w="2880"/>
+            <w:shd w:fill="D9E2F3"/>
+          </w:tcPr>
+          <w:p>
+            <w:pPr/>
+            <w:r/>
+            <w:r>
+              <w:rPr>
+                <w:b/>
+                <w:sz w:val="20"/>
+              </w:rPr>
+              <w:t>soDienThoai</w:t>
+            </w:r>
+          </w:p>
+        </w:tc>
+      </w:tr>
+      <w:tr>
+        <w:tc>
+          <w:tcPr>
+            <w:tcW w:type="dxa" w:w="2880"/>
+          </w:tcPr>
+          <w:p>
+            <w:pPr/>
+            <w:r/>
+            <w:r>
+              <w:rPr>
+                <w:sz w:val="20"/>
+              </w:rPr>
+              <w:t>1</w:t>
+            </w:r>
+          </w:p>
+        </w:tc>
+        <w:tc>
+          <w:tcPr>
+            <w:tcW w:type="dxa" w:w="2880"/>
+          </w:tcPr>
+          <w:p>
+            <w:pPr/>
+            <w:r/>
+            <w:r>
+              <w:rPr>
+                <w:sz w:val="20"/>
+              </w:rPr>
+              <w:t>Nguyễn Văn A</w:t>
+            </w:r>
+          </w:p>
+        </w:tc>
+        <w:tc>
+          <w:tcPr>
+            <w:tcW w:type="dxa" w:w="2880"/>
+          </w:tcPr>
+          <w:p>
+            <w:pPr/>
+            <w:r/>
+            <w:r>
+              <w:rPr>
+                <w:sz w:val="20"/>
+              </w:rPr>
+              <w:t>0912345678</w:t>
+            </w:r>
+          </w:p>
+        </w:tc>
+      </w:tr>
+    </w:tbl>
+    <w:p>
+      <w:pPr/>
+      <w:r>
+        <w:rPr>
+          <w:b/>
+        </w:rPr>
+        <w:t>Kịch bản thực hiện:</w:t>
+      </w:r>
+    </w:p>
+    <w:tbl>
+      <w:tblPr>
+        <w:tblStyle w:val="TableGrid"/>
+        <w:tblW w:type="auto" w:w="0"/>
+        <w:jc w:val="center"/>
+        <w:tblLook w:firstColumn="1" w:firstRow="1" w:lastColumn="0" w:lastRow="0" w:noHBand="0" w:noVBand="1" w:val="04A0"/>
+      </w:tblPr>
+      <w:tblGrid>
+        <w:gridCol w:w="4320"/>
+        <w:gridCol w:w="4320"/>
+      </w:tblGrid>
+      <w:tr>
+        <w:tc>
+          <w:tcPr>
+            <w:tcW w:type="dxa" w:w="2835"/>
+            <w:shd w:fill="D9E2F3"/>
+          </w:tcPr>
+          <w:p>
+            <w:pPr/>
+            <w:r/>
+            <w:r>
+              <w:rPr>
+                <w:b/>
+                <w:sz w:val="20"/>
+              </w:rPr>
+              <w:t>Kịch bản</w:t>
+            </w:r>
+          </w:p>
+        </w:tc>
+        <w:tc>
+          <w:tcPr>
+            <w:tcW w:type="dxa" w:w="6803"/>
+            <w:shd w:fill="D9E2F3"/>
+          </w:tcPr>
+          <w:p>
+            <w:pPr/>
+            <w:r/>
+            <w:r>
+              <w:rPr>
+                <w:b/>
+                <w:sz w:val="20"/>
+              </w:rPr>
+              <w:t>Kết quả mong đợi</w:t>
+            </w:r>
+          </w:p>
+        </w:tc>
+      </w:tr>
+      <w:tr>
+        <w:tc>
+          <w:tcPr>
+            <w:tcW w:type="dxa" w:w="2835"/>
+          </w:tcPr>
+          <w:p>
+            <w:pPr/>
+            <w:r/>
+            <w:r>
+              <w:rPr>
+                <w:sz w:val="20"/>
+              </w:rPr>
+              <w:t>1. Nhấn "Đăng ký" từ màn hình đăng nhập</w:t>
+            </w:r>
+          </w:p>
+        </w:tc>
+        <w:tc>
+          <w:tcPr>
+            <w:tcW w:type="dxa" w:w="6803"/>
+          </w:tcPr>
+          <w:p>
+            <w:pPr/>
+            <w:r/>
+            <w:r>
+              <w:rPr>
+                <w:sz w:val="20"/>
+              </w:rPr>
+              <w:t>Hiển thị form đăng ký</w:t>
+            </w:r>
+          </w:p>
+        </w:tc>
+      </w:tr>
+      <w:tr>
+        <w:tc>
+          <w:tcPr>
+            <w:tcW w:type="dxa" w:w="2835"/>
+          </w:tcPr>
+          <w:p>
+            <w:pPr/>
+            <w:r/>
+            <w:r>
+              <w:rPr>
+                <w:sz w:val="20"/>
+              </w:rPr>
+              <w:t>2. Nhập: Họ tên = "Lê Thị D", SĐT = "0911111111", Email = "d.lt@email.com", MK = "Pass@2025"</w:t>
+            </w:r>
+          </w:p>
+        </w:tc>
+        <w:tc>
+          <w:tcPr>
+            <w:tcW w:type="dxa" w:w="6803"/>
+          </w:tcPr>
+          <w:p>
+            <w:pPr/>
+            <w:r/>
+            <w:r>
+              <w:rPr>
+                <w:sz w:val="20"/>
+              </w:rPr>
+              <w:t>Form đầy đủ</w:t>
+            </w:r>
+          </w:p>
+        </w:tc>
+      </w:tr>
+      <w:tr>
+        <w:tc>
+          <w:tcPr>
+            <w:tcW w:type="dxa" w:w="2835"/>
+          </w:tcPr>
+          <w:p>
+            <w:pPr/>
+            <w:r/>
+            <w:r>
+              <w:rPr>
+                <w:sz w:val="20"/>
+              </w:rPr>
+              <w:t>3. Nhấn [Tiếp tục]</w:t>
+            </w:r>
+          </w:p>
+        </w:tc>
+        <w:tc>
+          <w:tcPr>
+            <w:tcW w:type="dxa" w:w="6803"/>
+          </w:tcPr>
+          <w:p>
+            <w:pPr/>
+            <w:r/>
+            <w:r>
+              <w:rPr>
+                <w:sz w:val="20"/>
+              </w:rPr>
+              <w:t>Kiểm tra SĐT, email chưa tồn tại</w:t>
+            </w:r>
+          </w:p>
+        </w:tc>
+      </w:tr>
+      <w:tr>
+        <w:tc>
+          <w:tcPr>
+            <w:tcW w:type="dxa" w:w="2835"/>
+          </w:tcPr>
+          <w:p>
+            <w:pPr/>
+            <w:r/>
+            <w:r>
+              <w:rPr>
+                <w:sz w:val="20"/>
+              </w:rPr>
+              <w:t>4. Hệ thống gửi OTP đến 0911111111</w:t>
+            </w:r>
+          </w:p>
+        </w:tc>
+        <w:tc>
+          <w:tcPr>
+            <w:tcW w:type="dxa" w:w="6803"/>
+          </w:tcPr>
+          <w:p>
+            <w:pPr/>
+            <w:r/>
+            <w:r>
+              <w:rPr>
+                <w:sz w:val="20"/>
+              </w:rPr>
+              <w:t>Hiển thị form OTP</w:t>
+            </w:r>
+          </w:p>
+        </w:tc>
+      </w:tr>
+      <w:tr>
+        <w:tc>
+          <w:tcPr>
+            <w:tcW w:type="dxa" w:w="2835"/>
+          </w:tcPr>
+          <w:p>
+            <w:pPr/>
+            <w:r/>
+            <w:r>
+              <w:rPr>
+                <w:sz w:val="20"/>
+              </w:rPr>
+              <w:t>5. Nhập OTP = "123456"</w:t>
+            </w:r>
+          </w:p>
+        </w:tc>
+        <w:tc>
+          <w:tcPr>
+            <w:tcW w:type="dxa" w:w="6803"/>
+          </w:tcPr>
+          <w:p>
+            <w:pPr/>
+            <w:r/>
+            <w:r>
+              <w:rPr>
+                <w:sz w:val="20"/>
+              </w:rPr>
+              <w:t>OTP hợp lệ</w:t>
+            </w:r>
+          </w:p>
+        </w:tc>
+      </w:tr>
+      <w:tr>
+        <w:tc>
+          <w:tcPr>
+            <w:tcW w:type="dxa" w:w="2835"/>
+          </w:tcPr>
+          <w:p>
+            <w:pPr/>
+            <w:r/>
+            <w:r>
+              <w:rPr>
+                <w:sz w:val="20"/>
+              </w:rPr>
+              <w:t>6. Nhấn [Xác nhận]</w:t>
+            </w:r>
+          </w:p>
+        </w:tc>
+        <w:tc>
+          <w:tcPr>
+            <w:tcW w:type="dxa" w:w="6803"/>
+          </w:tcPr>
+          <w:p>
+            <w:pPr/>
+            <w:r/>
+            <w:r>
+              <w:rPr>
+                <w:sz w:val="20"/>
+              </w:rPr>
+              <w:t>Tạo tài khoản, hạng "Thương", điểm = 0</w:t>
+            </w:r>
+          </w:p>
+        </w:tc>
+      </w:tr>
+      <w:tr>
+        <w:tc>
+          <w:tcPr>
+            <w:tcW w:type="dxa" w:w="2835"/>
+          </w:tcPr>
+          <w:p>
+            <w:pPr/>
+            <w:r/>
+            <w:r>
+              <w:rPr>
+                <w:sz w:val="20"/>
+              </w:rPr>
+              <w:t>7. Đăng nhập tự động</w:t>
+            </w:r>
+          </w:p>
+        </w:tc>
+        <w:tc>
+          <w:tcPr>
+            <w:tcW w:type="dxa" w:w="6803"/>
+          </w:tcPr>
+          <w:p>
+            <w:pPr/>
+            <w:r/>
+            <w:r>
+              <w:rPr>
+                <w:sz w:val="20"/>
+              </w:rPr>
+              <w:t>"Đăng ký thành công! Chào mừng Lê Thị D."</w:t>
+            </w:r>
+          </w:p>
+        </w:tc>
+      </w:tr>
+    </w:tbl>
+    <w:p>
+      <w:pPr/>
+      <w:r>
+        <w:rPr>
+          <w:b/>
+        </w:rPr>
+        <w:t>Trạng thái CSDL sau:</w:t>
+      </w:r>
+    </w:p>
+    <w:p>
+      <w:pPr/>
+      <w:r>
+        <w:t>tblNguoiDung</w:t>
+      </w:r>
+    </w:p>
+    <w:tbl>
+      <w:tblPr>
+        <w:tblStyle w:val="TableGrid"/>
+        <w:tblW w:type="auto" w:w="0"/>
+        <w:tblLook w:firstColumn="1" w:firstRow="1" w:lastColumn="0" w:lastRow="0" w:noHBand="0" w:noVBand="1" w:val="04A0"/>
+      </w:tblPr>
+      <w:tblGrid>
+        <w:gridCol w:w="1728"/>
+        <w:gridCol w:w="1728"/>
+        <w:gridCol w:w="1728"/>
+        <w:gridCol w:w="1728"/>
+        <w:gridCol w:w="1728"/>
+      </w:tblGrid>
+      <w:tr>
+        <w:tc>
+          <w:tcPr>
+            <w:tcW w:type="dxa" w:w="1728"/>
+            <w:shd w:fill="D9E2F3"/>
+          </w:tcPr>
+          <w:p>
+            <w:pPr/>
+            <w:r/>
+            <w:r>
+              <w:rPr>
+                <w:b/>
+                <w:sz w:val="20"/>
+              </w:rPr>
+              <w:t>ma</w:t>
+            </w:r>
+          </w:p>
+        </w:tc>
+        <w:tc>
+          <w:tcPr>
+            <w:tcW w:type="dxa" w:w="1728"/>
+            <w:shd w:fill="D9E2F3"/>
+          </w:tcPr>
+          <w:p>
+            <w:pPr/>
+            <w:r/>
+            <w:r>
+              <w:rPr>
+                <w:b/>
+                <w:sz w:val="20"/>
+              </w:rPr>
+              <w:t>hoTen</w:t>
+            </w:r>
+          </w:p>
+        </w:tc>
+        <w:tc>
+          <w:tcPr>
+            <w:tcW w:type="dxa" w:w="1728"/>
+            <w:shd w:fill="D9E2F3"/>
+          </w:tcPr>
+          <w:p>
+            <w:pPr/>
+            <w:r/>
+            <w:r>
+              <w:rPr>
+                <w:b/>
+                <w:sz w:val="20"/>
+              </w:rPr>
+              <w:t>soDienThoai</w:t>
+            </w:r>
+          </w:p>
+        </w:tc>
+        <w:tc>
+          <w:tcPr>
+            <w:tcW w:type="dxa" w:w="1728"/>
+            <w:shd w:fill="D9E2F3"/>
+          </w:tcPr>
+          <w:p>
+            <w:pPr/>
+            <w:r/>
+            <w:r>
+              <w:rPr>
+                <w:b/>
+                <w:sz w:val="20"/>
+              </w:rPr>
+              <w:t>diemTichLuy</w:t>
+            </w:r>
+          </w:p>
+        </w:tc>
+        <w:tc>
+          <w:tcPr>
+            <w:tcW w:type="dxa" w:w="1728"/>
+            <w:shd w:fill="D9E2F3"/>
+          </w:tcPr>
+          <w:p>
+            <w:pPr/>
+            <w:r/>
+            <w:r>
+              <w:rPr>
+                <w:b/>
+                <w:sz w:val="20"/>
+              </w:rPr>
+              <w:t>tblHangHoiVienMa</w:t>
+            </w:r>
+          </w:p>
+        </w:tc>
+      </w:tr>
+      <w:tr>
+        <w:tc>
+          <w:tcPr>
+            <w:tcW w:type="dxa" w:w="1728"/>
+          </w:tcPr>
+          <w:p>
+            <w:pPr/>
+            <w:r/>
+            <w:r>
+              <w:rPr>
+                <w:sz w:val="20"/>
+              </w:rPr>
+              <w:t>1</w:t>
+            </w:r>
+          </w:p>
+        </w:tc>
+        <w:tc>
+          <w:tcPr>
+            <w:tcW w:type="dxa" w:w="1728"/>
+          </w:tcPr>
+          <w:p>
+            <w:pPr/>
+            <w:r/>
+            <w:r>
+              <w:rPr>
+                <w:sz w:val="20"/>
+              </w:rPr>
+              <w:t>Nguyễn Văn A</w:t>
+            </w:r>
+          </w:p>
+        </w:tc>
+        <w:tc>
+          <w:tcPr>
+            <w:tcW w:type="dxa" w:w="1728"/>
+          </w:tcPr>
+          <w:p>
+            <w:pPr/>
+            <w:r/>
+            <w:r>
+              <w:rPr>
+                <w:sz w:val="20"/>
+              </w:rPr>
+              <w:t>0912345678</w:t>
+            </w:r>
+          </w:p>
+        </w:tc>
+        <w:tc>
+          <w:tcPr>
+            <w:tcW w:type="dxa" w:w="1728"/>
+          </w:tcPr>
+          <w:p>
+            <w:pPr/>
+            <w:r/>
+            <w:r>
+              <w:rPr>
+                <w:sz w:val="20"/>
+              </w:rPr>
+              <w:t>1250</w:t>
+            </w:r>
+          </w:p>
+        </w:tc>
+        <w:tc>
+          <w:tcPr>
+            <w:tcW w:type="dxa" w:w="1728"/>
+          </w:tcPr>
+          <w:p>
+            <w:pPr/>
+            <w:r/>
+            <w:r>
+              <w:rPr>
+                <w:sz w:val="20"/>
+              </w:rPr>
+              <w:t>2</w:t>
+            </w:r>
+          </w:p>
+        </w:tc>
+      </w:tr>
+      <w:tr>
+        <w:tc>
+          <w:tcPr>
+            <w:tcW w:type="dxa" w:w="1728"/>
+          </w:tcPr>
+          <w:p>
+            <w:pPr/>
+            <w:r/>
+            <w:r>
+              <w:rPr>
+                <w:sz w:val="20"/>
+              </w:rPr>
+              <w:t>2</w:t>
+            </w:r>
+          </w:p>
+        </w:tc>
+        <w:tc>
+          <w:tcPr>
+            <w:tcW w:type="dxa" w:w="1728"/>
+          </w:tcPr>
+          <w:p>
+            <w:pPr/>
+            <w:r/>
+            <w:r>
+              <w:rPr>
+                <w:b/>
+                <w:sz w:val="20"/>
+              </w:rPr>
+              <w:t>Lê Thị D</w:t>
+            </w:r>
+          </w:p>
+        </w:tc>
+        <w:tc>
+          <w:tcPr>
+            <w:tcW w:type="dxa" w:w="1728"/>
+          </w:tcPr>
+          <w:p>
+            <w:pPr/>
+            <w:r/>
+            <w:r>
+              <w:rPr>
+                <w:b/>
+                <w:sz w:val="20"/>
+              </w:rPr>
+              <w:t>0911111111</w:t>
+            </w:r>
+          </w:p>
+        </w:tc>
+        <w:tc>
+          <w:tcPr>
+            <w:tcW w:type="dxa" w:w="1728"/>
+          </w:tcPr>
+          <w:p>
+            <w:pPr/>
+            <w:r/>
+            <w:r>
+              <w:rPr>
+                <w:b/>
+                <w:sz w:val="20"/>
+              </w:rPr>
+              <w:t>0</w:t>
+            </w:r>
+          </w:p>
+        </w:tc>
+        <w:tc>
+          <w:tcPr>
+            <w:tcW w:type="dxa" w:w="1728"/>
+          </w:tcPr>
+          <w:p>
+            <w:pPr/>
+            <w:r/>
+            <w:r>
+              <w:rPr>
+                <w:b/>
+                <w:sz w:val="20"/>
+              </w:rPr>
+              <w:t>1</w:t>
+            </w:r>
+          </w:p>
+        </w:tc>
+      </w:tr>
+    </w:tbl>
+    <w:p>
+      <w:pPr/>
+      <w:r>
+        <w:t>---</w:t>
+      </w:r>
+    </w:p>
+    <w:p>
+      <w:pPr>
+        <w:pStyle w:val="Heading3"/>
+      </w:pPr>
+      <w:r>
+        <w:t>TC07: Đổi mật khẩu thành công</w:t>
+      </w:r>
+    </w:p>
+    <w:p>
+      <w:pPr/>
+      <w:r>
+        <w:rPr>
+          <w:b/>
+        </w:rPr>
+        <w:t>Trạng thái CSDL trước:</w:t>
+      </w:r>
+    </w:p>
+    <w:p>
+      <w:pPr/>
+      <w:r>
+        <w:t>tblNguoiDung</w:t>
+      </w:r>
+    </w:p>
+    <w:tbl>
+      <w:tblPr>
+        <w:tblStyle w:val="TableGrid"/>
+        <w:tblW w:type="auto" w:w="0"/>
+        <w:tblLook w:firstColumn="1" w:firstRow="1" w:lastColumn="0" w:lastRow="0" w:noHBand="0" w:noVBand="1" w:val="04A0"/>
+      </w:tblPr>
+      <w:tblGrid>
+        <w:gridCol w:w="2880"/>
+        <w:gridCol w:w="2880"/>
+        <w:gridCol w:w="2880"/>
+      </w:tblGrid>
+      <w:tr>
+        <w:tc>
+          <w:tcPr>
+            <w:tcW w:type="dxa" w:w="2880"/>
+            <w:shd w:fill="D9E2F3"/>
+          </w:tcPr>
+          <w:p>
+            <w:pPr/>
+            <w:r/>
+            <w:r>
+              <w:rPr>
+                <w:b/>
+                <w:sz w:val="20"/>
+              </w:rPr>
+              <w:t>ma</w:t>
+            </w:r>
+          </w:p>
+        </w:tc>
+        <w:tc>
+          <w:tcPr>
+            <w:tcW w:type="dxa" w:w="2880"/>
+            <w:shd w:fill="D9E2F3"/>
+          </w:tcPr>
+          <w:p>
+            <w:pPr/>
+            <w:r/>
+            <w:r>
+              <w:rPr>
+                <w:b/>
+                <w:sz w:val="20"/>
+              </w:rPr>
+              <w:t>hoTen</w:t>
+            </w:r>
+          </w:p>
+        </w:tc>
+        <w:tc>
+          <w:tcPr>
+            <w:tcW w:type="dxa" w:w="2880"/>
+            <w:shd w:fill="D9E2F3"/>
+          </w:tcPr>
+          <w:p>
+            <w:pPr/>
+            <w:r/>
+            <w:r>
+              <w:rPr>
+                <w:b/>
+                <w:sz w:val="20"/>
+              </w:rPr>
+              <w:t>matKhau</w:t>
+            </w:r>
+          </w:p>
+        </w:tc>
+      </w:tr>
+      <w:tr>
+        <w:tc>
+          <w:tcPr>
+            <w:tcW w:type="dxa" w:w="2880"/>
+          </w:tcPr>
+          <w:p>
+            <w:pPr/>
+            <w:r/>
+            <w:r>
+              <w:rPr>
+                <w:sz w:val="20"/>
+              </w:rPr>
+              <w:t>1</w:t>
+            </w:r>
+          </w:p>
+        </w:tc>
+        <w:tc>
+          <w:tcPr>
+            <w:tcW w:type="dxa" w:w="2880"/>
+          </w:tcPr>
+          <w:p>
+            <w:pPr/>
+            <w:r/>
+            <w:r>
+              <w:rPr>
+                <w:sz w:val="20"/>
+              </w:rPr>
+              <w:t>Nguyễn Văn A</w:t>
+            </w:r>
+          </w:p>
+        </w:tc>
+        <w:tc>
+          <w:tcPr>
+            <w:tcW w:type="dxa" w:w="2880"/>
+          </w:tcPr>
+          <w:p>
+            <w:pPr/>
+            <w:r/>
+            <w:r>
+              <w:rPr>
+                <w:sz w:val="20"/>
+              </w:rPr>
+              <w:t>$2a$10$hashAbc@1234</w:t>
+            </w:r>
+          </w:p>
+        </w:tc>
+      </w:tr>
+    </w:tbl>
+    <w:p>
+      <w:pPr/>
+      <w:r>
+        <w:rPr>
+          <w:b/>
+        </w:rPr>
+        <w:t>Kịch bản thực hiện:</w:t>
+      </w:r>
+    </w:p>
+    <w:tbl>
+      <w:tblPr>
+        <w:tblStyle w:val="TableGrid"/>
+        <w:tblW w:type="auto" w:w="0"/>
+        <w:jc w:val="center"/>
+        <w:tblLook w:firstColumn="1" w:firstRow="1" w:lastColumn="0" w:lastRow="0" w:noHBand="0" w:noVBand="1" w:val="04A0"/>
+      </w:tblPr>
+      <w:tblGrid>
+        <w:gridCol w:w="4320"/>
+        <w:gridCol w:w="4320"/>
+      </w:tblGrid>
+      <w:tr>
+        <w:tc>
+          <w:tcPr>
+            <w:tcW w:type="dxa" w:w="2835"/>
+            <w:shd w:fill="D9E2F3"/>
+          </w:tcPr>
+          <w:p>
+            <w:pPr/>
+            <w:r/>
+            <w:r>
+              <w:rPr>
+                <w:b/>
+                <w:sz w:val="20"/>
+              </w:rPr>
+              <w:t>Kịch bản</w:t>
+            </w:r>
+          </w:p>
+        </w:tc>
+        <w:tc>
+          <w:tcPr>
+            <w:tcW w:type="dxa" w:w="6803"/>
+            <w:shd w:fill="D9E2F3"/>
+          </w:tcPr>
+          <w:p>
+            <w:pPr/>
+            <w:r/>
+            <w:r>
+              <w:rPr>
+                <w:b/>
+                <w:sz w:val="20"/>
+              </w:rPr>
+              <w:t>Kết quả mong đợi</w:t>
+            </w:r>
+          </w:p>
+        </w:tc>
+      </w:tr>
+      <w:tr>
+        <w:tc>
+          <w:tcPr>
+            <w:tcW w:type="dxa" w:w="2835"/>
+          </w:tcPr>
+          <w:p>
+            <w:pPr/>
+            <w:r/>
+            <w:r>
+              <w:rPr>
+                <w:sz w:val="20"/>
+              </w:rPr>
+              <w:t>1. Truy cập "Bảo mật"</w:t>
+            </w:r>
+          </w:p>
+        </w:tc>
+        <w:tc>
+          <w:tcPr>
+            <w:tcW w:type="dxa" w:w="6803"/>
+          </w:tcPr>
+          <w:p>
+            <w:pPr/>
+            <w:r/>
+            <w:r>
+              <w:rPr>
+                <w:sz w:val="20"/>
+              </w:rPr>
+              <w:t>Hiển thị form đổi MK</w:t>
+            </w:r>
+          </w:p>
+        </w:tc>
+      </w:tr>
+      <w:tr>
+        <w:tc>
+          <w:tcPr>
+            <w:tcW w:type="dxa" w:w="2835"/>
+          </w:tcPr>
+          <w:p>
+            <w:pPr/>
+            <w:r/>
+            <w:r>
+              <w:rPr>
+                <w:sz w:val="20"/>
+              </w:rPr>
+              <w:t>2. Nhập: MK hiện tại = "Abc@1234", MK mới = "NewPass@2025", xác nhận = "NewPass@2025"</w:t>
+            </w:r>
+          </w:p>
+        </w:tc>
+        <w:tc>
+          <w:tcPr>
+            <w:tcW w:type="dxa" w:w="6803"/>
+          </w:tcPr>
+          <w:p>
+            <w:pPr/>
+            <w:r/>
+            <w:r>
+              <w:rPr>
+                <w:sz w:val="20"/>
+              </w:rPr>
+              <w:t>Form đầy đủ</w:t>
+            </w:r>
+          </w:p>
+        </w:tc>
+      </w:tr>
+      <w:tr>
+        <w:tc>
+          <w:tcPr>
+            <w:tcW w:type="dxa" w:w="2835"/>
+          </w:tcPr>
+          <w:p>
+            <w:pPr/>
+            <w:r/>
+            <w:r>
+              <w:rPr>
+                <w:sz w:val="20"/>
+              </w:rPr>
+              <w:t>3. Nhấn [Lưu thay đổi]</w:t>
+            </w:r>
+          </w:p>
+        </w:tc>
+        <w:tc>
+          <w:tcPr>
+            <w:tcW w:type="dxa" w:w="6803"/>
+          </w:tcPr>
+          <w:p>
+            <w:pPr/>
+            <w:r/>
+            <w:r>
+              <w:rPr>
+                <w:sz w:val="20"/>
+              </w:rPr>
+              <w:t>Xác minh MK hiện tại khớp</w:t>
+            </w:r>
+          </w:p>
+        </w:tc>
+      </w:tr>
+      <w:tr>
+        <w:tc>
+          <w:tcPr>
+            <w:tcW w:type="dxa" w:w="2835"/>
+          </w:tcPr>
+          <w:p>
+            <w:pPr/>
+            <w:r/>
+            <w:r>
+              <w:rPr>
+                <w:sz w:val="20"/>
+              </w:rPr>
+              <w:t>4. Kiểm tra MK mới đủ mạnh</w:t>
+            </w:r>
+          </w:p>
+        </w:tc>
+        <w:tc>
+          <w:tcPr>
+            <w:tcW w:type="dxa" w:w="6803"/>
+          </w:tcPr>
+          <w:p>
+            <w:pPr/>
+            <w:r/>
+            <w:r>
+              <w:rPr>
+                <w:sz w:val="20"/>
+              </w:rPr>
+              <w:t>Đạt yêu cầu</w:t>
+            </w:r>
+          </w:p>
+        </w:tc>
+      </w:tr>
+      <w:tr>
+        <w:tc>
+          <w:tcPr>
+            <w:tcW w:type="dxa" w:w="2835"/>
+          </w:tcPr>
+          <w:p>
+            <w:pPr/>
+            <w:r/>
+            <w:r>
+              <w:rPr>
+                <w:sz w:val="20"/>
+              </w:rPr>
+              <w:t>5. Cập nhật CSDL (bcrypt)</w:t>
+            </w:r>
+          </w:p>
+        </w:tc>
+        <w:tc>
+          <w:tcPr>
+            <w:tcW w:type="dxa" w:w="6803"/>
+          </w:tcPr>
+          <w:p>
+            <w:pPr/>
+            <w:r/>
+            <w:r>
+              <w:rPr>
+                <w:sz w:val="20"/>
+              </w:rPr>
+              <w:t>Thu hồi tất cả session</w:t>
+            </w:r>
+          </w:p>
+        </w:tc>
+      </w:tr>
+      <w:tr>
+        <w:tc>
+          <w:tcPr>
+            <w:tcW w:type="dxa" w:w="2835"/>
+          </w:tcPr>
+          <w:p>
+            <w:pPr/>
+            <w:r/>
+            <w:r>
+              <w:rPr>
+                <w:sz w:val="20"/>
+              </w:rPr>
+              <w:t>6. Hiển thị thông báo</w:t>
+            </w:r>
+          </w:p>
+        </w:tc>
+        <w:tc>
+          <w:tcPr>
+            <w:tcW w:type="dxa" w:w="6803"/>
+          </w:tcPr>
+          <w:p>
+            <w:pPr/>
+            <w:r/>
+            <w:r>
+              <w:rPr>
+                <w:sz w:val="20"/>
+              </w:rPr>
+              <w:t>"Đổi mật khẩu thành công. Vui lòng đăng nhập lại."</w:t>
+            </w:r>
+          </w:p>
+        </w:tc>
+      </w:tr>
+    </w:tbl>
+    <w:p>
+      <w:pPr/>
+      <w:r>
+        <w:rPr>
+          <w:b/>
+        </w:rPr>
+        <w:t>Trạng thái CSDL sau:</w:t>
+      </w:r>
+    </w:p>
+    <w:p>
+      <w:pPr/>
+      <w:r>
+        <w:t>tblNguoiDung</w:t>
+      </w:r>
+    </w:p>
+    <w:tbl>
+      <w:tblPr>
+        <w:tblStyle w:val="TableGrid"/>
+        <w:tblW w:type="auto" w:w="0"/>
+        <w:tblLook w:firstColumn="1" w:firstRow="1" w:lastColumn="0" w:lastRow="0" w:noHBand="0" w:noVBand="1" w:val="04A0"/>
+      </w:tblPr>
+      <w:tblGrid>
+        <w:gridCol w:w="2880"/>
+        <w:gridCol w:w="2880"/>
+        <w:gridCol w:w="2880"/>
+      </w:tblGrid>
+      <w:tr>
+        <w:tc>
+          <w:tcPr>
+            <w:tcW w:type="dxa" w:w="2880"/>
+            <w:shd w:fill="D9E2F3"/>
+          </w:tcPr>
+          <w:p>
+            <w:pPr/>
+            <w:r/>
+            <w:r>
+              <w:rPr>
+                <w:b/>
+                <w:sz w:val="20"/>
+              </w:rPr>
+              <w:t>ma</w:t>
+            </w:r>
+          </w:p>
+        </w:tc>
+        <w:tc>
+          <w:tcPr>
+            <w:tcW w:type="dxa" w:w="2880"/>
+            <w:shd w:fill="D9E2F3"/>
+          </w:tcPr>
+          <w:p>
+            <w:pPr/>
+            <w:r/>
+            <w:r>
+              <w:rPr>
+                <w:b/>
+                <w:sz w:val="20"/>
+              </w:rPr>
+              <w:t>hoTen</w:t>
+            </w:r>
+          </w:p>
+        </w:tc>
+        <w:tc>
+          <w:tcPr>
+            <w:tcW w:type="dxa" w:w="2880"/>
+            <w:shd w:fill="D9E2F3"/>
+          </w:tcPr>
+          <w:p>
+            <w:pPr/>
+            <w:r/>
+            <w:r>
+              <w:rPr>
+                <w:b/>
+                <w:sz w:val="20"/>
+              </w:rPr>
+              <w:t>matKhau</w:t>
+            </w:r>
+          </w:p>
+        </w:tc>
+      </w:tr>
+      <w:tr>
+        <w:tc>
+          <w:tcPr>
+            <w:tcW w:type="dxa" w:w="2880"/>
+          </w:tcPr>
+          <w:p>
+            <w:pPr/>
+            <w:r/>
+            <w:r>
+              <w:rPr>
+                <w:sz w:val="20"/>
+              </w:rPr>
+              <w:t>1</w:t>
+            </w:r>
+          </w:p>
+        </w:tc>
+        <w:tc>
+          <w:tcPr>
+            <w:tcW w:type="dxa" w:w="2880"/>
+          </w:tcPr>
+          <w:p>
+            <w:pPr/>
+            <w:r/>
+            <w:r>
+              <w:rPr>
+                <w:sz w:val="20"/>
+              </w:rPr>
+              <w:t>Nguyễn Văn A</w:t>
+            </w:r>
+          </w:p>
+        </w:tc>
+        <w:tc>
+          <w:tcPr>
+            <w:tcW w:type="dxa" w:w="2880"/>
+          </w:tcPr>
+          <w:p>
+            <w:pPr/>
+            <w:r/>
+            <w:r>
+              <w:rPr>
+                <w:b/>
+                <w:sz w:val="20"/>
+              </w:rPr>
+              <w:t>$2a$10$hashNewPass@2025</w:t>
+            </w:r>
+          </w:p>
+        </w:tc>
+      </w:tr>
+    </w:tbl>
+    <w:p>
+      <w:pPr/>
+      <w:r>
+        <w:t>tblPhienDangNhap</w:t>
+      </w:r>
+    </w:p>
+    <w:tbl>
+      <w:tblPr>
+        <w:tblStyle w:val="TableGrid"/>
+        <w:tblW w:type="auto" w:w="0"/>
+        <w:tblLook w:firstColumn="1" w:firstRow="1" w:lastColumn="0" w:lastRow="0" w:noHBand="0" w:noVBand="1" w:val="04A0"/>
+      </w:tblPr>
+      <w:tblGrid>
+        <w:gridCol w:w="4320"/>
+        <w:gridCol w:w="4320"/>
+      </w:tblGrid>
+      <w:tr>
+        <w:tc>
+          <w:tcPr>
+            <w:tcW w:type="dxa" w:w="4320"/>
+            <w:shd w:fill="D9E2F3"/>
+          </w:tcPr>
+          <w:p>
+            <w:pPr/>
+            <w:r/>
+            <w:r>
+              <w:rPr>
+                <w:b/>
+                <w:sz w:val="20"/>
+              </w:rPr>
+              <w:t>ma</w:t>
+            </w:r>
+          </w:p>
+        </w:tc>
+        <w:tc>
+          <w:tcPr>
+            <w:tcW w:type="dxa" w:w="4320"/>
+            <w:shd w:fill="D9E2F3"/>
+          </w:tcPr>
+          <w:p>
+            <w:pPr/>
+            <w:r/>
+            <w:r>
+              <w:rPr>
+                <w:b/>
+                <w:sz w:val="20"/>
+              </w:rPr>
+              <w:t>trangThai</w:t>
+            </w:r>
+          </w:p>
+        </w:tc>
+      </w:tr>
+      <w:tr>
+        <w:tc>
+          <w:tcPr>
+            <w:tcW w:type="dxa" w:w="4320"/>
+          </w:tcPr>
+          <w:p>
+            <w:pPr/>
+            <w:r/>
+            <w:r>
+              <w:rPr>
+                <w:sz w:val="20"/>
+              </w:rPr>
+              <w:t>1</w:t>
+            </w:r>
+          </w:p>
+        </w:tc>
+        <w:tc>
+          <w:tcPr>
+            <w:tcW w:type="dxa" w:w="4320"/>
+          </w:tcPr>
+          <w:p>
+            <w:pPr/>
+            <w:r/>
+            <w:r>
+              <w:rPr>
+                <w:b/>
+                <w:sz w:val="20"/>
+              </w:rPr>
+              <w:t>Đã thu hồi</w:t>
+            </w:r>
+          </w:p>
+        </w:tc>
+      </w:tr>
+    </w:tbl>
+    <w:p>
+      <w:pPr/>
+      <w:r>
+        <w:t>---</w:t>
+      </w:r>
+    </w:p>
+    <w:p>
+      <w:pPr>
+        <w:pStyle w:val="Heading3"/>
+      </w:pPr>
+      <w:r>
+        <w:t>TC08: Mật khẩu hiện tại sai</w:t>
+      </w:r>
+    </w:p>
+    <w:p>
+      <w:pPr/>
+      <w:r>
+        <w:rPr>
+          <w:b/>
+        </w:rPr>
+        <w:t>Trạng thái CSDL trước:</w:t>
+      </w:r>
+    </w:p>
+    <w:p>
+      <w:pPr/>
+      <w:r>
+        <w:t>tblNguoiDung</w:t>
+      </w:r>
+    </w:p>
+    <w:tbl>
+      <w:tblPr>
+        <w:tblStyle w:val="TableGrid"/>
+        <w:tblW w:type="auto" w:w="0"/>
+        <w:tblLook w:firstColumn="1" w:firstRow="1" w:lastColumn="0" w:lastRow="0" w:noHBand="0" w:noVBand="1" w:val="04A0"/>
+      </w:tblPr>
+      <w:tblGrid>
+        <w:gridCol w:w="2880"/>
+        <w:gridCol w:w="2880"/>
+        <w:gridCol w:w="2880"/>
+      </w:tblGrid>
+      <w:tr>
+        <w:tc>
+          <w:tcPr>
+            <w:tcW w:type="dxa" w:w="2880"/>
+            <w:shd w:fill="D9E2F3"/>
+          </w:tcPr>
+          <w:p>
+            <w:pPr/>
+            <w:r/>
+            <w:r>
+              <w:rPr>
+                <w:b/>
+                <w:sz w:val="20"/>
+              </w:rPr>
+              <w:t>ma</w:t>
+            </w:r>
+          </w:p>
+        </w:tc>
+        <w:tc>
+          <w:tcPr>
+            <w:tcW w:type="dxa" w:w="2880"/>
+            <w:shd w:fill="D9E2F3"/>
+          </w:tcPr>
+          <w:p>
+            <w:pPr/>
+            <w:r/>
+            <w:r>
+              <w:rPr>
+                <w:b/>
+                <w:sz w:val="20"/>
+              </w:rPr>
+              <w:t>hoTen</w:t>
+            </w:r>
+          </w:p>
+        </w:tc>
+        <w:tc>
+          <w:tcPr>
+            <w:tcW w:type="dxa" w:w="2880"/>
+            <w:shd w:fill="D9E2F3"/>
+          </w:tcPr>
+          <w:p>
+            <w:pPr/>
+            <w:r/>
+            <w:r>
+              <w:rPr>
+                <w:b/>
+                <w:sz w:val="20"/>
+              </w:rPr>
+              <w:t>matKhau</w:t>
+            </w:r>
+          </w:p>
+        </w:tc>
+      </w:tr>
+      <w:tr>
+        <w:tc>
+          <w:tcPr>
+            <w:tcW w:type="dxa" w:w="2880"/>
+          </w:tcPr>
+          <w:p>
+            <w:pPr/>
+            <w:r/>
+            <w:r>
+              <w:rPr>
+                <w:sz w:val="20"/>
+              </w:rPr>
+              <w:t>1</w:t>
+            </w:r>
+          </w:p>
+        </w:tc>
+        <w:tc>
+          <w:tcPr>
+            <w:tcW w:type="dxa" w:w="2880"/>
+          </w:tcPr>
+          <w:p>
+            <w:pPr/>
+            <w:r/>
+            <w:r>
+              <w:rPr>
+                <w:sz w:val="20"/>
+              </w:rPr>
+              <w:t>Nguyễn Văn A</w:t>
+            </w:r>
+          </w:p>
+        </w:tc>
+        <w:tc>
+          <w:tcPr>
+            <w:tcW w:type="dxa" w:w="2880"/>
+          </w:tcPr>
+          <w:p>
+            <w:pPr/>
+            <w:r/>
+            <w:r>
+              <w:rPr>
+                <w:sz w:val="20"/>
+              </w:rPr>
+              <w:t>$2a$10$hashAbc@1234</w:t>
+            </w:r>
+          </w:p>
+        </w:tc>
+      </w:tr>
+    </w:tbl>
+    <w:p>
+      <w:pPr/>
+      <w:r>
+        <w:rPr>
+          <w:b/>
+        </w:rPr>
+        <w:t>Kịch bản thực hiện:</w:t>
+      </w:r>
+    </w:p>
+    <w:tbl>
+      <w:tblPr>
+        <w:tblStyle w:val="TableGrid"/>
+        <w:tblW w:type="auto" w:w="0"/>
+        <w:jc w:val="center"/>
+        <w:tblLook w:firstColumn="1" w:firstRow="1" w:lastColumn="0" w:lastRow="0" w:noHBand="0" w:noVBand="1" w:val="04A0"/>
+      </w:tblPr>
+      <w:tblGrid>
+        <w:gridCol w:w="4320"/>
+        <w:gridCol w:w="4320"/>
+      </w:tblGrid>
+      <w:tr>
+        <w:tc>
+          <w:tcPr>
+            <w:tcW w:type="dxa" w:w="2835"/>
+            <w:shd w:fill="D9E2F3"/>
+          </w:tcPr>
+          <w:p>
+            <w:pPr/>
+            <w:r/>
+            <w:r>
+              <w:rPr>
+                <w:b/>
+                <w:sz w:val="20"/>
+              </w:rPr>
+              <w:t>Kịch bản</w:t>
+            </w:r>
+          </w:p>
+        </w:tc>
+        <w:tc>
+          <w:tcPr>
+            <w:tcW w:type="dxa" w:w="6803"/>
+            <w:shd w:fill="D9E2F3"/>
+          </w:tcPr>
+          <w:p>
+            <w:pPr/>
+            <w:r/>
+            <w:r>
+              <w:rPr>
+                <w:b/>
+                <w:sz w:val="20"/>
+              </w:rPr>
+              <w:t>Kết quả mong đợi</w:t>
+            </w:r>
+          </w:p>
+        </w:tc>
+      </w:tr>
+      <w:tr>
+        <w:tc>
+          <w:tcPr>
+            <w:tcW w:type="dxa" w:w="2835"/>
+          </w:tcPr>
+          <w:p>
+            <w:pPr/>
+            <w:r/>
+            <w:r>
+              <w:rPr>
+                <w:sz w:val="20"/>
+              </w:rPr>
+              <w:t>1. Truy cập "Bảo mật"</w:t>
+            </w:r>
+          </w:p>
+        </w:tc>
+        <w:tc>
+          <w:tcPr>
+            <w:tcW w:type="dxa" w:w="6803"/>
+          </w:tcPr>
+          <w:p>
+            <w:pPr/>
+            <w:r/>
+            <w:r>
+              <w:rPr>
+                <w:sz w:val="20"/>
+              </w:rPr>
+              <w:t>Hiển thị form đổi MK</w:t>
+            </w:r>
+          </w:p>
+        </w:tc>
+      </w:tr>
+      <w:tr>
+        <w:tc>
+          <w:tcPr>
+            <w:tcW w:type="dxa" w:w="2835"/>
+          </w:tcPr>
+          <w:p>
+            <w:pPr/>
+            <w:r/>
+            <w:r>
+              <w:rPr>
+                <w:sz w:val="20"/>
+              </w:rPr>
+              <w:t>2. Nhập: MK hiện tại = "SaiPass@123", MK mới = "NewPass@2025"</w:t>
+            </w:r>
+          </w:p>
+        </w:tc>
+        <w:tc>
+          <w:tcPr>
+            <w:tcW w:type="dxa" w:w="6803"/>
+          </w:tcPr>
+          <w:p>
+            <w:pPr/>
+            <w:r/>
+            <w:r>
+              <w:rPr>
+                <w:sz w:val="20"/>
+              </w:rPr>
+              <w:t>Form đầy đủ</w:t>
+            </w:r>
+          </w:p>
+        </w:tc>
+      </w:tr>
+      <w:tr>
+        <w:tc>
+          <w:tcPr>
+            <w:tcW w:type="dxa" w:w="2835"/>
+          </w:tcPr>
+          <w:p>
+            <w:pPr/>
+            <w:r/>
+            <w:r>
+              <w:rPr>
+                <w:sz w:val="20"/>
+              </w:rPr>
+              <w:t>3. Nhấn [Lưu thay đổi]</w:t>
+            </w:r>
+          </w:p>
+        </w:tc>
+        <w:tc>
+          <w:tcPr>
+            <w:tcW w:type="dxa" w:w="6803"/>
+          </w:tcPr>
+          <w:p>
+            <w:pPr/>
+            <w:r/>
+            <w:r>
+              <w:rPr>
+                <w:sz w:val="20"/>
+              </w:rPr>
+              <w:t>Xác minh MK hiện tại SAI</w:t>
+            </w:r>
+          </w:p>
+        </w:tc>
+      </w:tr>
+      <w:tr>
+        <w:tc>
+          <w:tcPr>
+            <w:tcW w:type="dxa" w:w="2835"/>
+          </w:tcPr>
+          <w:p>
+            <w:pPr/>
+            <w:r/>
+            <w:r>
+              <w:rPr>
+                <w:sz w:val="20"/>
+              </w:rPr>
+              <w:t>4. Hiển thị lỗi</w:t>
+            </w:r>
+          </w:p>
+        </w:tc>
+        <w:tc>
+          <w:tcPr>
+            <w:tcW w:type="dxa" w:w="6803"/>
+          </w:tcPr>
+          <w:p>
+            <w:pPr/>
+            <w:r/>
+            <w:r>
+              <w:rPr>
+                <w:sz w:val="20"/>
+              </w:rPr>
+              <w:t>"Mật khẩu hiện tại không chính xác."</w:t>
+            </w:r>
+          </w:p>
+        </w:tc>
+      </w:tr>
+    </w:tbl>
+    <w:p>
+      <w:pPr/>
+      <w:r>
+        <w:rPr>
+          <w:b/>
+        </w:rPr>
+        <w:t>Trạng thái CSDL sau:</w:t>
+      </w:r>
+      <w:r>
+        <w:t xml:space="preserve"> Không thay đổi.</w:t>
+      </w:r>
+    </w:p>
     <w:p/>
     <w:sectPr>
       <w:pgSz w:w="12240" w:h="15840"/>

</xml_diff>

<commit_message>
feat: Controller pattern + Page classes + properties/methods for account module
- Replace DAO with Controller (AuthController, ProfileController, StaffController)
- Rename boundary classes to Page only (OTPVerifyPage, ChangePasswordPage, etc.)
- Add real properties and methods to all Boundary classes
- Add Controller method reasoning in iii.3.2
- Regenerate all 8 PlantUML diagrams with Controller layer
- Embed 10 images in DOCX (was 8)
- DOCX: 432KB, 405 paragraphs, 33 tables, 10 images
</commit_message>
<xml_diff>
--- a/output/account_module.docx
+++ b/output/account_module.docx
@@ -3123,6 +3123,45 @@
     </w:p>
     <w:p>
       <w:pPr>
+        <w:jc w:val="center"/>
+      </w:pPr>
+      <w:r>
+        <w:drawing>
+          <wp:inline xmlns:a="http://schemas.openxmlformats.org/drawingml/2006/main" xmlns:pic="http://schemas.openxmlformats.org/drawingml/2006/picture">
+            <wp:extent cx="5486400" cy="4454305"/>
+            <wp:docPr id="1" name="Picture 1"/>
+            <wp:cNvGraphicFramePr>
+              <a:graphicFrameLocks noChangeAspect="1"/>
+            </wp:cNvGraphicFramePr>
+            <a:graphic>
+              <a:graphicData uri="http://schemas.openxmlformats.org/drawingml/2006/picture">
+                <pic:pic>
+                  <pic:nvPicPr>
+                    <pic:cNvPr id="0" name="account_entity_analysis.png"/>
+                    <pic:cNvPicPr/>
+                  </pic:nvPicPr>
+                  <pic:blipFill>
+                    <a:blip r:embed="rId9"/>
+                    <a:stretch>
+                      <a:fillRect/>
+                    </a:stretch>
+                  </pic:blipFill>
+                  <pic:spPr>
+                    <a:xfrm>
+                      <a:off x="0" y="0"/>
+                      <a:ext cx="5486400" cy="4454305"/>
+                    </a:xfrm>
+                    <a:prstGeom prst="rect"/>
+                  </pic:spPr>
+                </pic:pic>
+              </a:graphicData>
+            </a:graphic>
+          </wp:inline>
+        </w:drawing>
+      </w:r>
+    </w:p>
+    <w:p>
+      <w:pPr>
         <w:pStyle w:val="Heading2"/>
       </w:pPr>
       <w:r>
@@ -3138,7 +3177,7 @@
         <w:t>Kiến trúc chọn: React</w:t>
       </w:r>
       <w:r>
-        <w:t xml:space="preserve"> ( Boundary class dùng hậu tố Page, Form, Modal, Panel. Method names tiếng Việt ở pha phân tích )</w:t>
+        <w:t xml:space="preserve"> ( Boundary class dùng hậu tố Page. Controller xử lý nghiệp vụ. Method names tiếng Việt ở pha phân tích )</w:t>
       </w:r>
     </w:p>
     <w:p>
@@ -3334,7 +3373,7 @@
               <w:rPr>
                 <w:sz w:val="20"/>
               </w:rPr>
-              <w:t>OTPVerifyModal</w:t>
+              <w:t>OTPVerifyPage</w:t>
             </w:r>
           </w:p>
         </w:tc>
@@ -3349,7 +3388,7 @@
               <w:rPr>
                 <w:sz w:val="20"/>
               </w:rPr>
-              <w:t>Modal</w:t>
+              <w:t>Page</w:t>
             </w:r>
           </w:p>
         </w:tc>
@@ -3381,7 +3420,7 @@
               <w:rPr>
                 <w:sz w:val="20"/>
               </w:rPr>
-              <w:t>ChangePasswordForm</w:t>
+              <w:t>ChangePasswordPage</w:t>
             </w:r>
           </w:p>
         </w:tc>
@@ -3396,7 +3435,7 @@
               <w:rPr>
                 <w:sz w:val="20"/>
               </w:rPr>
-              <w:t>Form</w:t>
+              <w:t>Page</w:t>
             </w:r>
           </w:p>
         </w:tc>
@@ -3460,7 +3499,7 @@
               <w:rPr>
                 <w:sz w:val="20"/>
               </w:rPr>
-              <w:t>Form Chỉnh sửa hồ sơ</w:t>
+              <w:t>Trang Quản lý nhân viên</w:t>
             </w:r>
           </w:p>
         </w:tc>
@@ -3475,7 +3514,7 @@
               <w:rPr>
                 <w:sz w:val="20"/>
               </w:rPr>
-              <w:t>EditProfileForm</w:t>
+              <w:t>StaffManagePage</w:t>
             </w:r>
           </w:p>
         </w:tc>
@@ -3490,101 +3529,7 @@
               <w:rPr>
                 <w:sz w:val="20"/>
               </w:rPr>
-              <w:t>Form</w:t>
-            </w:r>
-          </w:p>
-        </w:tc>
-      </w:tr>
-      <w:tr>
-        <w:tc>
-          <w:tcPr>
-            <w:tcW w:type="dxa" w:w="2880"/>
-          </w:tcPr>
-          <w:p>
-            <w:pPr/>
-            <w:r/>
-            <w:r>
-              <w:rPr>
-                <w:sz w:val="20"/>
-              </w:rPr>
-              <w:t>Trang Quản lý nhân viên</w:t>
-            </w:r>
-          </w:p>
-        </w:tc>
-        <w:tc>
-          <w:tcPr>
-            <w:tcW w:type="dxa" w:w="2880"/>
-          </w:tcPr>
-          <w:p>
-            <w:pPr/>
-            <w:r/>
-            <w:r>
-              <w:rPr>
-                <w:sz w:val="20"/>
-              </w:rPr>
-              <w:t>StaffManagePage</w:t>
-            </w:r>
-          </w:p>
-        </w:tc>
-        <w:tc>
-          <w:tcPr>
-            <w:tcW w:type="dxa" w:w="2880"/>
-          </w:tcPr>
-          <w:p>
-            <w:pPr/>
-            <w:r/>
-            <w:r>
-              <w:rPr>
-                <w:sz w:val="20"/>
-              </w:rPr>
               <w:t>Page</w:t>
-            </w:r>
-          </w:p>
-        </w:tc>
-      </w:tr>
-      <w:tr>
-        <w:tc>
-          <w:tcPr>
-            <w:tcW w:type="dxa" w:w="2880"/>
-          </w:tcPr>
-          <w:p>
-            <w:pPr/>
-            <w:r/>
-            <w:r>
-              <w:rPr>
-                <w:sz w:val="20"/>
-              </w:rPr>
-              <w:t>Form Thêm/Sửa nhân viên</w:t>
-            </w:r>
-          </w:p>
-        </w:tc>
-        <w:tc>
-          <w:tcPr>
-            <w:tcW w:type="dxa" w:w="2880"/>
-          </w:tcPr>
-          <w:p>
-            <w:pPr/>
-            <w:r/>
-            <w:r>
-              <w:rPr>
-                <w:sz w:val="20"/>
-              </w:rPr>
-              <w:t>StaffForm</w:t>
-            </w:r>
-          </w:p>
-        </w:tc>
-        <w:tc>
-          <w:tcPr>
-            <w:tcW w:type="dxa" w:w="2880"/>
-          </w:tcPr>
-          <w:p>
-            <w:pPr/>
-            <w:r/>
-            <w:r>
-              <w:rPr>
-                <w:sz w:val="20"/>
-              </w:rPr>
-              <w:t>Form</w:t>
             </w:r>
           </w:p>
         </w:tc>
@@ -3613,13 +3558,13 @@
     <w:p>
       <w:pPr/>
       <w:r>
-        <w:t>OTPVerifyModal: inOTP, subXacNhan, subGuiLai</w:t>
+        <w:t>OTPVerifyPage: inOTP, subXacNhan, subGuiLai</w:t>
       </w:r>
     </w:p>
     <w:p>
       <w:pPr/>
       <w:r>
-        <w:t>ChangePasswordForm: inMKHienTai, inMKMoi, inXacNhanMKMoi, subLuu, subHuy</w:t>
+        <w:t>ChangePasswordPage: inMKHienTai, inMKMoi, inXacNhanMKMoi, subLuu, subHuy</w:t>
       </w:r>
     </w:p>
     <w:p>
@@ -3632,12 +3577,6 @@
       <w:pPr/>
       <w:r>
         <w:t>StaffManagePage: outDSNhanVien, outsubChonNV, subThem, subSua, subXoa</w:t>
-      </w:r>
-    </w:p>
-    <w:p>
-      <w:pPr/>
-      <w:r>
-        <w:t>StaffForm: inHoTen, inVaiTro, subLuu, subHuy</w:t>
       </w:r>
     </w:p>
     <w:p>
@@ -3728,7 +3667,7 @@
     <w:p>
       <w:pPr/>
       <w:r>
-        <w:t>[3]. Giao diện OTPVerifyModal → lớp OTPVerifyModal</w:t>
+        <w:t>[3]. Giao diện OTPVerifyPage → lớp OTPVerifyPage</w:t>
       </w:r>
     </w:p>
     <w:p>
@@ -3765,7 +3704,7 @@
     <w:p>
       <w:pPr/>
       <w:r>
-        <w:t>[4]. Giao diện ChangePasswordForm → lớp ChangePasswordForm</w:t>
+        <w:t>[4]. Giao diện ChangePasswordPage → lớp ChangePasswordPage</w:t>
       </w:r>
     </w:p>
     <w:p>
@@ -3839,7 +3778,7 @@
     <w:p>
       <w:pPr/>
       <w:r>
-        <w:t>[6]. Giao diện EditProfileForm → lớp EditProfileForm</w:t>
+        <w:t>[6]. Giao diện ProfilePage → lớp ProfilePage</w:t>
       </w:r>
     </w:p>
     <w:p>
@@ -3913,7 +3852,7 @@
     <w:p>
       <w:pPr/>
       <w:r>
-        <w:t>[8]. Giao diện StaffForm → lớp StaffForm</w:t>
+        <w:t>[8]. Giao diện StaffManagePage → lớp StaffManagePage</w:t>
       </w:r>
     </w:p>
     <w:p>
@@ -3950,7 +3889,7 @@
     <w:p>
       <w:pPr/>
       <w:r>
-        <w:t>[9]. Giao diện StaffForm → lớp StaffForm</w:t>
+        <w:t>[9]. Giao diện StaffManagePage → lớp StaffManagePage</w:t>
       </w:r>
     </w:p>
     <w:p>
@@ -4023,6 +3962,45 @@
     </w:p>
     <w:p>
       <w:pPr>
+        <w:jc w:val="center"/>
+      </w:pPr>
+      <w:r>
+        <w:drawing>
+          <wp:inline xmlns:a="http://schemas.openxmlformats.org/drawingml/2006/main" xmlns:pic="http://schemas.openxmlformats.org/drawingml/2006/picture">
+            <wp:extent cx="5486400" cy="2743200"/>
+            <wp:docPr id="2" name="Picture 2"/>
+            <wp:cNvGraphicFramePr>
+              <a:graphicFrameLocks noChangeAspect="1"/>
+            </wp:cNvGraphicFramePr>
+            <a:graphic>
+              <a:graphicData uri="http://schemas.openxmlformats.org/drawingml/2006/picture">
+                <pic:pic>
+                  <pic:nvPicPr>
+                    <pic:cNvPr id="0" name="account_bce_analysis.png"/>
+                    <pic:cNvPicPr/>
+                  </pic:nvPicPr>
+                  <pic:blipFill>
+                    <a:blip r:embed="rId10"/>
+                    <a:stretch>
+                      <a:fillRect/>
+                    </a:stretch>
+                  </pic:blipFill>
+                  <pic:spPr>
+                    <a:xfrm>
+                      <a:off x="0" y="0"/>
+                      <a:ext cx="5486400" cy="2743200"/>
+                    </a:xfrm>
+                    <a:prstGeom prst="rect"/>
+                  </pic:spPr>
+                </pic:pic>
+              </a:graphicData>
+            </a:graphic>
+          </wp:inline>
+        </w:drawing>
+      </w:r>
+    </w:p>
+    <w:p>
+      <w:pPr>
         <w:pStyle w:val="Heading2"/>
       </w:pPr>
       <w:r>
@@ -4083,13 +4061,13 @@
         <w:t>dangNhap()</w:t>
       </w:r>
       <w:r>
-        <w:t xml:space="preserve"> với tham số sdt, matKhau.</w:t>
+        <w:t xml:space="preserve"> của AuthController với tham số sdt, matKhau.</w:t>
       </w:r>
     </w:p>
     <w:p>
       <w:pPr/>
       <w:r>
-        <w:t xml:space="preserve">6. Lớp NguoiDung gọi phương thức </w:t>
+        <w:t xml:space="preserve">6. AuthController gọi phương thức </w:t>
       </w:r>
       <w:r>
         <w:rPr>
@@ -4099,13 +4077,19 @@
         <w:t>findBySDT()</w:t>
       </w:r>
       <w:r>
-        <w:t xml:space="preserve"> để tìm tài khoản theo SĐT.</w:t>
+        <w:t xml:space="preserve"> của NguoiDung để tìm tài khoản theo SĐT.</w:t>
       </w:r>
     </w:p>
     <w:p>
       <w:pPr/>
       <w:r>
-        <w:t xml:space="preserve">7. Lớp NguoiDung gọi phương thức </w:t>
+        <w:t>7. NguoiDung trả về đối tượng NguoiDung cho AuthController.</w:t>
+      </w:r>
+    </w:p>
+    <w:p>
+      <w:pPr/>
+      <w:r>
+        <w:t xml:space="preserve">8. AuthController gọi </w:t>
       </w:r>
       <w:r>
         <w:rPr>
@@ -4121,13 +4105,13 @@
     <w:p>
       <w:pPr/>
       <w:r>
-        <w:t>8. Lớp NguoiDung trả kết quả về cho LoginPage.</w:t>
+        <w:t>9. AuthController trả kết quả về cho LoginPage.</w:t>
       </w:r>
     </w:p>
     <w:p>
       <w:pPr/>
       <w:r>
-        <w:t>9. Lớp LoginPage hiển thị "Đăng nhập thành công. Xin chào, Nguyễn Văn A!" và chuyển hướng trang chủ.</w:t>
+        <w:t>10. Lớp LoginPage hiển thị "Đăng nhập thành công. Xin chào, Nguyễn Văn A!" và chuyển hướng trang chủ.</w:t>
       </w:r>
     </w:p>
     <w:p>
@@ -4144,7 +4128,7 @@
         <w:pStyle w:val="ListBullet"/>
       </w:pPr>
       <w:r>
-        <w:t>Lớp NguoiDung trả về null (không tìm thấy tài khoản).</w:t>
+        <w:t>NguoiDung trả về null (không tìm thấy tài khoản).</w:t>
       </w:r>
     </w:p>
     <w:p>
@@ -4152,7 +4136,15 @@
         <w:pStyle w:val="ListBullet"/>
       </w:pPr>
       <w:r>
-        <w:t>Lớp LoginPage hiển thị "Tài khoản không tồn tại. Vui lòng kiểm tra lại."</w:t>
+        <w:t>AuthController trả về null cho LoginPage.</w:t>
+      </w:r>
+    </w:p>
+    <w:p>
+      <w:pPr>
+        <w:pStyle w:val="ListBullet"/>
+      </w:pPr>
+      <w:r>
+        <w:t>LoginPage hiển thị "Tài khoản không tồn tại. Vui lòng kiểm tra lại."</w:t>
       </w:r>
     </w:p>
     <w:p>
@@ -4169,7 +4161,7 @@
         <w:pStyle w:val="ListBullet"/>
       </w:pPr>
       <w:r>
-        <w:t>Lớp NguoiDung trả về sai mật khẩu.</w:t>
+        <w:t>AuthController trả về sai mật khẩu cho LoginPage.</w:t>
       </w:r>
     </w:p>
     <w:p>
@@ -4177,7 +4169,7 @@
         <w:pStyle w:val="ListBullet"/>
       </w:pPr>
       <w:r>
-        <w:t>Lớp LoginPage hiển thị "Mật khẩu không chính xác. Còn [N] lần thử."</w:t>
+        <w:t>LoginPage hiển thị "Mật khẩu không chính xác. Còn [N] lần thử."</w:t>
       </w:r>
     </w:p>
     <w:p>
@@ -4224,7 +4216,7 @@
     <w:p>
       <w:pPr/>
       <w:r>
-        <w:t xml:space="preserve">5. Lớp RegisterPage gọi </w:t>
+        <w:t xml:space="preserve">5. RegisterPage gọi </w:t>
       </w:r>
       <w:r>
         <w:rPr>
@@ -4234,13 +4226,13 @@
         <w:t>dangKy()</w:t>
       </w:r>
       <w:r>
-        <w:t xml:space="preserve"> với các tham số hoTen, sdt, email, matKhau.</w:t>
+        <w:t xml:space="preserve"> của AuthController với các tham số hoTen, sdt, email, matKhau.</w:t>
       </w:r>
     </w:p>
     <w:p>
       <w:pPr/>
       <w:r>
-        <w:t xml:space="preserve">6. Lớp NguoiDung kiểm tra SĐT chưa tồn tại bằng </w:t>
+        <w:t xml:space="preserve">6. AuthController gọi </w:t>
       </w:r>
       <w:r>
         <w:rPr>
@@ -4250,13 +4242,13 @@
         <w:t>existsBySDT()</w:t>
       </w:r>
       <w:r>
-        <w:t>.</w:t>
+        <w:t xml:space="preserve"> của NguoiDung để kiểm tra SĐT chưa tồn tại.</w:t>
       </w:r>
     </w:p>
     <w:p>
       <w:pPr/>
       <w:r>
-        <w:t xml:space="preserve">7. Lớp NguoiDung kiểm tra email chưa tồn tại bằng </w:t>
+        <w:t xml:space="preserve">7. AuthController gọi </w:t>
       </w:r>
       <w:r>
         <w:rPr>
@@ -4266,13 +4258,13 @@
         <w:t>existsByEmail()</w:t>
       </w:r>
       <w:r>
-        <w:t>.</w:t>
+        <w:t xml:space="preserve"> của NguoiDung để kiểm tra email chưa tồn tại.</w:t>
       </w:r>
     </w:p>
     <w:p>
       <w:pPr/>
       <w:r>
-        <w:t xml:space="preserve">8. Lớp NguoiDung tạo tài khoản mới bằng </w:t>
+        <w:t xml:space="preserve">8. AuthController gọi </w:t>
       </w:r>
       <w:r>
         <w:rPr>
@@ -4282,34 +4274,34 @@
         <w:t>createNguoiDung()</w:t>
       </w:r>
       <w:r>
-        <w:t>.</w:t>
+        <w:t xml:space="preserve"> để tạo tài khoản mới.</w:t>
       </w:r>
     </w:p>
     <w:p>
       <w:pPr/>
       <w:r>
-        <w:t>9. Lớp NguoiDung trả kết quả về RegisterPage.</w:t>
-      </w:r>
-    </w:p>
-    <w:p>
-      <w:pPr/>
-      <w:r>
-        <w:t xml:space="preserve">10. RegisterPage gọi </w:t>
+        <w:t xml:space="preserve">9. AuthController gọi </w:t>
       </w:r>
       <w:r>
         <w:rPr>
           <w:rFonts w:ascii="Courier New" w:hAnsi="Courier New"/>
           <w:sz w:val="20"/>
         </w:rPr>
-        <w:t>guiOTP(sdt, DANG_KY)</w:t>
-      </w:r>
-      <w:r>
-        <w:t xml:space="preserve"> để gửi OTP.</w:t>
+        <w:t>guiOTP()</w:t>
+      </w:r>
+      <w:r>
+        <w:t xml:space="preserve"> để gửi OTP đến SĐT.</w:t>
       </w:r>
     </w:p>
     <w:p>
       <w:pPr/>
       <w:r>
+        <w:t>10. AuthController trả kết quả về RegisterPage.</w:t>
+      </w:r>
+    </w:p>
+    <w:p>
+      <w:pPr/>
+      <w:r>
         <w:t>11. RegisterPage hiển thị form xác nhận OTP.</w:t>
       </w:r>
     </w:p>
@@ -4322,7 +4314,7 @@
     <w:p>
       <w:pPr/>
       <w:r>
-        <w:t xml:space="preserve">13. Lớp OTPVerifyModal gọi </w:t>
+        <w:t xml:space="preserve">13. OTPVerifyPage gọi </w:t>
       </w:r>
       <w:r>
         <w:rPr>
@@ -4332,25 +4324,29 @@
         <w:t>xacMinhOTP(otp)</w:t>
       </w:r>
       <w:r>
-        <w:t>.</w:t>
+        <w:t xml:space="preserve"> của AuthController.</w:t>
       </w:r>
     </w:p>
     <w:p>
       <w:pPr/>
       <w:r>
-        <w:t>14. Lớp OTP kiểm tra OTP đúng và còn hiệu lực.</w:t>
+        <w:t xml:space="preserve">14. AuthController gọi </w:t>
+      </w:r>
+      <w:r>
+        <w:rPr>
+          <w:rFonts w:ascii="Courier New" w:hAnsi="Courier New"/>
+          <w:sz w:val="20"/>
+        </w:rPr>
+        <w:t>verify()</w:t>
+      </w:r>
+      <w:r>
+        <w:t xml:space="preserve"> của OTP để kiểm tra OTP đúng và còn hiệu lực.</w:t>
       </w:r>
     </w:p>
     <w:p>
       <w:pPr/>
       <w:r>
-        <w:t>15. Lớp OTP trả kết quả về OTPVerifyModal.</w:t>
-      </w:r>
-    </w:p>
-    <w:p>
-      <w:pPr/>
-      <w:r>
-        <w:t xml:space="preserve">16. OTPVerifyModal gọi </w:t>
+        <w:t xml:space="preserve">15. AuthController gọi </w:t>
       </w:r>
       <w:r>
         <w:rPr>
@@ -4366,7 +4362,7 @@
     <w:p>
       <w:pPr/>
       <w:r>
-        <w:t>17. Hiển thị "Đăng ký thành công! Chào mừng Nguyễn Thị Bình."</w:t>
+        <w:t>16. Hiển thị "Đăng ký thành công! Chào mừng Nguyễn Thị Bình."</w:t>
       </w:r>
     </w:p>
     <w:p>
@@ -4383,7 +4379,17 @@
         <w:pStyle w:val="ListBullet"/>
       </w:pPr>
       <w:r>
-        <w:t>Lớp NguoiDung trả về "SĐT đã tồn tại".</w:t>
+        <w:t xml:space="preserve">AuthController nhận false từ </w:t>
+      </w:r>
+      <w:r>
+        <w:rPr>
+          <w:rFonts w:ascii="Courier New" w:hAnsi="Courier New"/>
+          <w:sz w:val="20"/>
+        </w:rPr>
+        <w:t>existsBySDT()</w:t>
+      </w:r>
+      <w:r>
+        <w:t>.</w:t>
       </w:r>
     </w:p>
     <w:p>
@@ -4408,7 +4414,17 @@
         <w:pStyle w:val="ListBullet"/>
       </w:pPr>
       <w:r>
-        <w:t>Lớp OTP trả về "OTP không đúng".</w:t>
+        <w:t xml:space="preserve">AuthController nhận false từ </w:t>
+      </w:r>
+      <w:r>
+        <w:rPr>
+          <w:rFonts w:ascii="Courier New" w:hAnsi="Courier New"/>
+          <w:sz w:val="20"/>
+        </w:rPr>
+        <w:t>verify()</w:t>
+      </w:r>
+      <w:r>
+        <w:t>.</w:t>
       </w:r>
     </w:p>
     <w:p>
@@ -4416,7 +4432,7 @@
         <w:pStyle w:val="ListBullet"/>
       </w:pPr>
       <w:r>
-        <w:t>OTPVerifyModal hiển thị "Mã OTP không đúng. Vui lòng thử lại."</w:t>
+        <w:t>OTPVerifyPage hiển thị "Mã OTP không đúng. Vui lòng thử lại."</w:t>
       </w:r>
     </w:p>
     <w:p>
@@ -4445,7 +4461,7 @@
     <w:p>
       <w:pPr/>
       <w:r>
-        <w:t>2. Lớp ChangePasswordForm hiển thị form: MK hiện tại, MK mới, Xác nhận MK mới.</w:t>
+        <w:t>2. Lớp ChangePasswordPage hiển thị form: MK hiện tại, MK mới, Xác nhận MK mới.</w:t>
       </w:r>
     </w:p>
     <w:p>
@@ -4463,7 +4479,7 @@
     <w:p>
       <w:pPr/>
       <w:r>
-        <w:t xml:space="preserve">5. Lớp ChangePasswordForm gọi </w:t>
+        <w:t xml:space="preserve">5. ChangePasswordPage gọi </w:t>
       </w:r>
       <w:r>
         <w:rPr>
@@ -4473,13 +4489,29 @@
         <w:t>doiMatKhau()</w:t>
       </w:r>
       <w:r>
-        <w:t xml:space="preserve"> với mkHienTai, mkMoi.</w:t>
+        <w:t xml:space="preserve"> của AuthController với mkHienTai, mkMoi.</w:t>
       </w:r>
     </w:p>
     <w:p>
       <w:pPr/>
       <w:r>
-        <w:t xml:space="preserve">6. Lớp NguoiDung xác minh MK hiện tại khớp CSDL bằng </w:t>
+        <w:t xml:space="preserve">6. AuthController gọi </w:t>
+      </w:r>
+      <w:r>
+        <w:rPr>
+          <w:rFonts w:ascii="Courier New" w:hAnsi="Courier New"/>
+          <w:sz w:val="20"/>
+        </w:rPr>
+        <w:t>findByToken()</w:t>
+      </w:r>
+      <w:r>
+        <w:t xml:space="preserve"> của NguoiDung để lấy thông tin người dùng.</w:t>
+      </w:r>
+    </w:p>
+    <w:p>
+      <w:pPr/>
+      <w:r>
+        <w:t xml:space="preserve">7. AuthController xác minh MK hiện tại khớp CSDL bằng </w:t>
       </w:r>
       <w:r>
         <w:rPr>
@@ -4495,7 +4527,7 @@
     <w:p>
       <w:pPr/>
       <w:r>
-        <w:t xml:space="preserve">7. Lớp NguoiDung mã hóa MK mới bằng </w:t>
+        <w:t xml:space="preserve">8. AuthController mã hóa MK mới bằng </w:t>
       </w:r>
       <w:r>
         <w:rPr>
@@ -4511,7 +4543,7 @@
     <w:p>
       <w:pPr/>
       <w:r>
-        <w:t xml:space="preserve">8. Lớp NguoiDung cập nhật mật khẩu bằng </w:t>
+        <w:t xml:space="preserve">9. AuthController gọi </w:t>
       </w:r>
       <w:r>
         <w:rPr>
@@ -4521,13 +4553,13 @@
         <w:t>updatePassword()</w:t>
       </w:r>
       <w:r>
-        <w:t>.</w:t>
+        <w:t xml:space="preserve"> của NguoiDung để cập nhật mật khẩu.</w:t>
       </w:r>
     </w:p>
     <w:p>
       <w:pPr/>
       <w:r>
-        <w:t xml:space="preserve">9. Lớp NguoiDung thu hồi tất cả session bằng </w:t>
+        <w:t xml:space="preserve">10. AuthController gọi </w:t>
       </w:r>
       <w:r>
         <w:rPr>
@@ -4537,13 +4569,13 @@
         <w:t>revokeAllSessions()</w:t>
       </w:r>
       <w:r>
-        <w:t>.</w:t>
+        <w:t xml:space="preserve"> để thu hồi tất cả session.</w:t>
       </w:r>
     </w:p>
     <w:p>
       <w:pPr/>
       <w:r>
-        <w:t>10. ChangePasswordForm hiển thị "Đổi mật khẩu thành công. Vui lòng đăng nhập lại."</w:t>
+        <w:t>11. ChangePasswordPage hiển thị "Đổi mật khẩu thành công. Vui lòng đăng nhập lại."</w:t>
       </w:r>
     </w:p>
     <w:p>
@@ -4560,7 +4592,17 @@
         <w:pStyle w:val="ListBullet"/>
       </w:pPr>
       <w:r>
-        <w:t>Lớp NguoiDung trả về "Mật khẩu hiện tại không chính xác."</w:t>
+        <w:t xml:space="preserve">AuthController nhận false từ </w:t>
+      </w:r>
+      <w:r>
+        <w:rPr>
+          <w:rFonts w:ascii="Courier New" w:hAnsi="Courier New"/>
+          <w:sz w:val="20"/>
+        </w:rPr>
+        <w:t>checkPassword()</w:t>
+      </w:r>
+      <w:r>
+        <w:t>.</w:t>
       </w:r>
     </w:p>
     <w:p>
@@ -4568,7 +4610,7 @@
         <w:pStyle w:val="ListBullet"/>
       </w:pPr>
       <w:r>
-        <w:t>ChangePasswordForm hiển thị thông báo lỗi.</w:t>
+        <w:t>ChangePasswordPage hiển thị "Mật khẩu hiện tại không chính xác."</w:t>
       </w:r>
     </w:p>
     <w:p>
@@ -4585,7 +4627,7 @@
         <w:pStyle w:val="ListBullet"/>
       </w:pPr>
       <w:r>
-        <w:t>Lớp NguoiDung trả về "Mật khẩu mới không đủ mạnh."</w:t>
+        <w:t>AuthController trả về lỗi validation.</w:t>
       </w:r>
     </w:p>
     <w:p>
@@ -4593,7 +4635,7 @@
         <w:pStyle w:val="ListBullet"/>
       </w:pPr>
       <w:r>
-        <w:t>ChangePasswordForm highlight ô và hiển thị yêu cầu còn thiếu.</w:t>
+        <w:t>ChangePasswordPage highlight ô và hiển thị yêu cầu còn thiếu.</w:t>
       </w:r>
     </w:p>
     <w:p>
@@ -4622,7 +4664,7 @@
     <w:p>
       <w:pPr/>
       <w:r>
-        <w:t xml:space="preserve">2. Lớp ProfilePage gọi </w:t>
+        <w:t xml:space="preserve">2. ProfilePage gọi </w:t>
       </w:r>
       <w:r>
         <w:rPr>
@@ -4632,49 +4674,53 @@
         <w:t>xemHoSo(userId)</w:t>
       </w:r>
       <w:r>
-        <w:t>.</w:t>
+        <w:t xml:space="preserve"> của ProfileController.</w:t>
       </w:r>
     </w:p>
     <w:p>
       <w:pPr/>
       <w:r>
-        <w:t>3. Lớp NguoiDung trả về thông tin hồ sơ.</w:t>
+        <w:t xml:space="preserve">3. ProfileController gọi </w:t>
+      </w:r>
+      <w:r>
+        <w:rPr>
+          <w:rFonts w:ascii="Courier New" w:hAnsi="Courier New"/>
+          <w:sz w:val="20"/>
+        </w:rPr>
+        <w:t>findById(userId)</w:t>
+      </w:r>
+      <w:r>
+        <w:t xml:space="preserve"> của NguoiDung.</w:t>
       </w:r>
     </w:p>
     <w:p>
       <w:pPr/>
       <w:r>
-        <w:t>4. Lớp ProfilePage hiển thị: Họ tên, SĐT, Email, Hạng hội viên, Điểm tích lũy.</w:t>
+        <w:t>4. NguoiDung trả về đối tượng NguoiDung cho ProfileController.</w:t>
       </w:r>
     </w:p>
     <w:p>
       <w:pPr/>
       <w:r>
-        <w:t>5. Khách hàng nhấn [Chỉnh sửa thông tin].</w:t>
+        <w:t>5. ProfileController trả kết quả về ProfilePage.</w:t>
       </w:r>
     </w:p>
     <w:p>
       <w:pPr/>
       <w:r>
-        <w:t>6. Lớp ProfilePage mở EditProfileForm.</w:t>
+        <w:t>6. ProfilePage hiển thị: Họ tên, SĐT, Email, Hạng hội viên, Điểm tích lũy.</w:t>
       </w:r>
     </w:p>
     <w:p>
       <w:pPr/>
       <w:r>
-        <w:t>7. Khách hàng cập nhật: Họ tên = "Nguyễn Văn An", Email = "vanan@newemail.com".</w:t>
+        <w:t>7. Khách hàng nhấn [Chỉnh sửa thông tin], cập nhật họ tên và email, nhấn [Lưu].</w:t>
       </w:r>
     </w:p>
     <w:p>
       <w:pPr/>
       <w:r>
-        <w:t>8. Khách hàng nhấn [Lưu thay đổi].</w:t>
-      </w:r>
-    </w:p>
-    <w:p>
-      <w:pPr/>
-      <w:r>
-        <w:t xml:space="preserve">9. Lớp EditProfileForm gọi </w:t>
+        <w:t xml:space="preserve">8. ProfilePage gọi </w:t>
       </w:r>
       <w:r>
         <w:rPr>
@@ -4684,13 +4730,13 @@
         <w:t>capNhatHoSo()</w:t>
       </w:r>
       <w:r>
-        <w:t>.</w:t>
+        <w:t xml:space="preserve"> của ProfileController với userId, hoTen, email.</w:t>
       </w:r>
     </w:p>
     <w:p>
       <w:pPr/>
       <w:r>
-        <w:t xml:space="preserve">10. Lớp NguoiDung kiểm tra email hợp lệ bằng </w:t>
+        <w:t xml:space="preserve">9. ProfileController gọi </w:t>
       </w:r>
       <w:r>
         <w:rPr>
@@ -4700,13 +4746,13 @@
         <w:t>checkEmail()</w:t>
       </w:r>
       <w:r>
-        <w:t>.</w:t>
+        <w:t xml:space="preserve"> của NguoiDung để kiểm tra email hợp lệ.</w:t>
       </w:r>
     </w:p>
     <w:p>
       <w:pPr/>
       <w:r>
-        <w:t xml:space="preserve">11. Lớp NguoiDung cập nhật bằng </w:t>
+        <w:t xml:space="preserve">10. ProfileController gọi </w:t>
       </w:r>
       <w:r>
         <w:rPr>
@@ -4716,13 +4762,13 @@
         <w:t>update()</w:t>
       </w:r>
       <w:r>
-        <w:t>.</w:t>
+        <w:t xml:space="preserve"> của NguoiDung để cập nhật.</w:t>
       </w:r>
     </w:p>
     <w:p>
       <w:pPr/>
       <w:r>
-        <w:t>12. EditProfileForm hiển thị "Cập nhật thành công!"</w:t>
+        <w:t>11. ProfilePage hiển thị "Cập nhật thành công!"</w:t>
       </w:r>
     </w:p>
     <w:p>
@@ -4739,7 +4785,17 @@
         <w:pStyle w:val="ListBullet"/>
       </w:pPr>
       <w:r>
-        <w:t>Lớp NguoiDung trả về "Email đã tồn tại."</w:t>
+        <w:t xml:space="preserve">NguoiDung trả về false từ </w:t>
+      </w:r>
+      <w:r>
+        <w:rPr>
+          <w:rFonts w:ascii="Courier New" w:hAnsi="Courier New"/>
+          <w:sz w:val="20"/>
+        </w:rPr>
+        <w:t>checkEmail()</w:t>
+      </w:r>
+      <w:r>
+        <w:t>.</w:t>
       </w:r>
     </w:p>
     <w:p>
@@ -4747,7 +4803,7 @@
         <w:pStyle w:val="ListBullet"/>
       </w:pPr>
       <w:r>
-        <w:t>EditProfileForm hiển thị "Email này đã được đăng ký bởi tài khoản khác."</w:t>
+        <w:t>ProfilePage hiển thị "Email này đã được đăng ký bởi tài khoản khác."</w:t>
       </w:r>
     </w:p>
     <w:p>
@@ -4776,7 +4832,7 @@
     <w:p>
       <w:pPr/>
       <w:r>
-        <w:t xml:space="preserve">2. Lớp StaffManagePage gọi </w:t>
+        <w:t xml:space="preserve">2. StaffManagePage gọi </w:t>
       </w:r>
       <w:r>
         <w:rPr>
@@ -4786,49 +4842,53 @@
         <w:t>xemDanhSachNV()</w:t>
       </w:r>
       <w:r>
-        <w:t>.</w:t>
+        <w:t xml:space="preserve"> của StaffController.</w:t>
       </w:r>
     </w:p>
     <w:p>
       <w:pPr/>
       <w:r>
-        <w:t>3. Lớp NhanVien trả về danh sách nhân viên.</w:t>
+        <w:t xml:space="preserve">3. StaffController gọi </w:t>
+      </w:r>
+      <w:r>
+        <w:rPr>
+          <w:rFonts w:ascii="Courier New" w:hAnsi="Courier New"/>
+          <w:sz w:val="20"/>
+        </w:rPr>
+        <w:t>findAll()</w:t>
+      </w:r>
+      <w:r>
+        <w:t xml:space="preserve"> của NhanVien.</w:t>
       </w:r>
     </w:p>
     <w:p>
       <w:pPr/>
       <w:r>
-        <w:t>4. Lớp StaffManagePage hiển thị bảng: họ tên, vai trò, trạng thái.</w:t>
+        <w:t>4. NhanVien trả về danh sách nhân viên cho StaffController.</w:t>
       </w:r>
     </w:p>
     <w:p>
       <w:pPr/>
       <w:r>
-        <w:t>5. Admin nhấn [Thêm nhân viên].</w:t>
+        <w:t>5. StaffController trả kết quả về StaffManagePage.</w:t>
       </w:r>
     </w:p>
     <w:p>
       <w:pPr/>
       <w:r>
-        <w:t>6. Lớp StaffManagePage mở StaffForm.</w:t>
+        <w:t>6. StaffManagePage hiển thị bảng: họ tên, vai trò, trạng thái.</w:t>
       </w:r>
     </w:p>
     <w:p>
       <w:pPr/>
       <w:r>
-        <w:t>7. Admin nhập: Họ tên = "Lê Văn C", Vai trò = "Phục vụ".</w:t>
+        <w:t>7. Admin nhấn [Thêm nhân viên], nhập thông tin, nhấn [Lưu].</w:t>
       </w:r>
     </w:p>
     <w:p>
       <w:pPr/>
       <w:r>
-        <w:t>8. Admin nhấn [Lưu].</w:t>
-      </w:r>
-    </w:p>
-    <w:p>
-      <w:pPr/>
-      <w:r>
-        <w:t xml:space="preserve">9. Lớp StaffForm gọi </w:t>
+        <w:t xml:space="preserve">8. StaffManagePage gọi </w:t>
       </w:r>
       <w:r>
         <w:rPr>
@@ -4838,13 +4898,13 @@
         <w:t>themNV(hoTen, vaiTro)</w:t>
       </w:r>
       <w:r>
-        <w:t>.</w:t>
+        <w:t xml:space="preserve"> của StaffController.</w:t>
       </w:r>
     </w:p>
     <w:p>
       <w:pPr/>
       <w:r>
-        <w:t xml:space="preserve">10. Lớp NhanVien lưu bằng </w:t>
+        <w:t xml:space="preserve">9. StaffController gọi </w:t>
       </w:r>
       <w:r>
         <w:rPr>
@@ -4854,13 +4914,13 @@
         <w:t>save()</w:t>
       </w:r>
       <w:r>
-        <w:t>.</w:t>
+        <w:t xml:space="preserve"> của NhanVien.</w:t>
       </w:r>
     </w:p>
     <w:p>
       <w:pPr/>
       <w:r>
-        <w:t>11. StaffForm hiển thị "Thêm nhân viên thành công!"</w:t>
+        <w:t>10. StaffManagePage hiển thị "Thêm nhân viên thành công!"</w:t>
       </w:r>
     </w:p>
     <w:p>
@@ -4877,7 +4937,7 @@
         <w:pStyle w:val="ListBullet"/>
       </w:pPr>
       <w:r>
-        <w:t>Lớp NhanVien trả về "SĐT đã tồn tại."</w:t>
+        <w:t>StaffController nhận lỗi từ NhanVien.</w:t>
       </w:r>
     </w:p>
     <w:p>
@@ -4885,7 +4945,7 @@
         <w:pStyle w:val="ListBullet"/>
       </w:pPr>
       <w:r>
-        <w:t>StaffForm hiển thị "SĐT này đã được sử dụng."</w:t>
+        <w:t>StaffManagePage hiển thị "SĐT này đã được sử dụng."</w:t>
       </w:r>
     </w:p>
     <w:p>
@@ -4902,7 +4962,7 @@
         <w:pStyle w:val="ListBullet"/>
       </w:pPr>
       <w:r>
-        <w:t>Lớp NhanVien trả về "Không thể xóa."</w:t>
+        <w:t>StaffController nhận lỗi từ NhanVien.</w:t>
       </w:r>
     </w:p>
     <w:p>
@@ -5451,7 +5511,7 @@
         <w:drawing>
           <wp:inline xmlns:a="http://schemas.openxmlformats.org/drawingml/2006/main" xmlns:pic="http://schemas.openxmlformats.org/drawingml/2006/picture">
             <wp:extent cx="5486400" cy="3657600"/>
-            <wp:docPr id="1" name="Picture 1"/>
+            <wp:docPr id="3" name="Picture 3"/>
             <wp:cNvGraphicFramePr>
               <a:graphicFrameLocks noChangeAspect="1"/>
             </wp:cNvGraphicFramePr>
@@ -5463,7 +5523,7 @@
                     <pic:cNvPicPr/>
                   </pic:nvPicPr>
                   <pic:blipFill>
-                    <a:blip r:embed="rId9"/>
+                    <a:blip r:embed="rId11"/>
                     <a:stretch>
                       <a:fillRect/>
                     </a:stretch>
@@ -6033,7 +6093,7 @@
         <w:drawing>
           <wp:inline xmlns:a="http://schemas.openxmlformats.org/drawingml/2006/main" xmlns:pic="http://schemas.openxmlformats.org/drawingml/2006/picture">
             <wp:extent cx="5486400" cy="5188892"/>
-            <wp:docPr id="2" name="Picture 2"/>
+            <wp:docPr id="4" name="Picture 4"/>
             <wp:cNvGraphicFramePr>
               <a:graphicFrameLocks noChangeAspect="1"/>
             </wp:cNvGraphicFramePr>
@@ -6045,7 +6105,7 @@
                     <pic:cNvPicPr/>
                   </pic:nvPicPr>
                   <pic:blipFill>
-                    <a:blip r:embed="rId10"/>
+                    <a:blip r:embed="rId12"/>
                     <a:stretch>
                       <a:fillRect/>
                     </a:stretch>
@@ -6315,13 +6375,13 @@
         <w:pStyle w:val="Heading2"/>
       </w:pPr>
       <w:r>
-        <w:t>4. DAO class diagram</w:t>
+        <w:t>4. MVC class diagram</w:t>
       </w:r>
     </w:p>
     <w:p>
       <w:pPr/>
       <w:r>
-        <w:t>Mô hình thiết kế theo kiến trúc DAO (BCE):</w:t>
+        <w:t>Mô hình thiết kế theo kiến trúc MVC (Boundary – Control – Entity):</w:t>
       </w:r>
     </w:p>
     <w:p>
@@ -6342,10 +6402,10 @@
         <w:rPr>
           <w:b/>
         </w:rPr>
-        <w:t>DAO:</w:t>
-      </w:r>
-      <w:r>
-        <w:t xml:space="preserve"> NguoiDungDAO (extends DAO), NhanVienDAO (extends DAO)</w:t>
+        <w:t>Control:</w:t>
+      </w:r>
+      <w:r>
+        <w:t xml:space="preserve"> AuthController, ProfileController, StaffController</w:t>
       </w:r>
     </w:p>
     <w:p>
@@ -6361,14 +6421,788 @@
       </w:r>
     </w:p>
     <w:p>
+      <w:pPr/>
+      <w:r>
+        <w:rPr>
+          <w:b/>
+        </w:rPr>
+        <w:t>Quy trình xác định chữ ký hàm Controller:</w:t>
+      </w:r>
+    </w:p>
+    <w:p>
+      <w:pPr/>
+      <w:r>
+        <w:t xml:space="preserve">a) Đăng nhập =&gt; </w:t>
+      </w:r>
+      <w:r>
+        <w:rPr>
+          <w:rFonts w:ascii="Courier New" w:hAnsi="Courier New"/>
+          <w:sz w:val="20"/>
+        </w:rPr>
+        <w:t>login()</w:t>
+      </w:r>
+    </w:p>
+    <w:p>
+      <w:pPr>
+        <w:pStyle w:val="ListBullet"/>
+      </w:pPr>
+      <w:r>
+        <w:t>Input: sdt, matKhau</w:t>
+      </w:r>
+    </w:p>
+    <w:p>
+      <w:pPr>
+        <w:pStyle w:val="ListBullet"/>
+      </w:pPr>
+      <w:r>
+        <w:t>Output: NguoiDung + Session</w:t>
+      </w:r>
+    </w:p>
+    <w:p>
+      <w:pPr>
+        <w:pStyle w:val="ListBullet"/>
+      </w:pPr>
+      <w:r>
+        <w:t>Ứng viên tham số vào:</w:t>
+      </w:r>
+    </w:p>
+    <w:p>
+      <w:pPr>
+        <w:pStyle w:val="ListBullet"/>
+      </w:pPr>
+      <w:r>
+        <w:rPr>
+          <w:rFonts w:ascii="Courier New" w:hAnsi="Courier New"/>
+          <w:sz w:val="20"/>
+        </w:rPr>
+        <w:t>login(sdt: String, matKhau: String)</w:t>
+      </w:r>
+      <w:r>
+        <w:t xml:space="preserve"> → chọn (gom nhóm tham số)</w:t>
+      </w:r>
+    </w:p>
+    <w:p>
+      <w:pPr>
+        <w:pStyle w:val="ListBullet"/>
+      </w:pPr>
+      <w:r>
+        <w:t>Ứng viên tham số ra:</w:t>
+      </w:r>
+    </w:p>
+    <w:p>
+      <w:pPr>
+        <w:pStyle w:val="ListBullet"/>
+      </w:pPr>
+      <w:r>
+        <w:rPr>
+          <w:rFonts w:ascii="Courier New" w:hAnsi="Courier New"/>
+          <w:sz w:val="20"/>
+        </w:rPr>
+        <w:t>login(): void</w:t>
+      </w:r>
+      <w:r>
+        <w:t xml:space="preserve"> → loại (cần trả về thông tin đăng nhập)</w:t>
+      </w:r>
+    </w:p>
+    <w:p>
+      <w:pPr>
+        <w:pStyle w:val="ListBullet"/>
+      </w:pPr>
+      <w:r>
+        <w:rPr>
+          <w:rFonts w:ascii="Courier New" w:hAnsi="Courier New"/>
+          <w:sz w:val="20"/>
+        </w:rPr>
+        <w:t>login(): NguoiDung</w:t>
+      </w:r>
+      <w:r>
+        <w:t xml:space="preserve"> → chọn (trả về thông tin người dùng)</w:t>
+      </w:r>
+    </w:p>
+    <w:p>
+      <w:pPr/>
+      <w:r>
+        <w:t xml:space="preserve">b) Đăng ký =&gt; </w:t>
+      </w:r>
+      <w:r>
+        <w:rPr>
+          <w:rFonts w:ascii="Courier New" w:hAnsi="Courier New"/>
+          <w:sz w:val="20"/>
+        </w:rPr>
+        <w:t>register()</w:t>
+      </w:r>
+    </w:p>
+    <w:p>
+      <w:pPr>
+        <w:pStyle w:val="ListBullet"/>
+      </w:pPr>
+      <w:r>
+        <w:t>Input: hoTen, sdt, email, matKhau</w:t>
+      </w:r>
+    </w:p>
+    <w:p>
+      <w:pPr>
+        <w:pStyle w:val="ListBullet"/>
+      </w:pPr>
+      <w:r>
+        <w:t>Output: NguoiDung (vừa tạo)</w:t>
+      </w:r>
+    </w:p>
+    <w:p>
+      <w:pPr>
+        <w:pStyle w:val="ListBullet"/>
+      </w:pPr>
+      <w:r>
+        <w:t>Ứng viên tham số vào:</w:t>
+      </w:r>
+    </w:p>
+    <w:p>
+      <w:pPr>
+        <w:pStyle w:val="ListBullet"/>
+      </w:pPr>
+      <w:r>
+        <w:rPr>
+          <w:rFonts w:ascii="Courier New" w:hAnsi="Courier New"/>
+          <w:sz w:val="20"/>
+        </w:rPr>
+        <w:t>register(hoTen: String, sdt: String, email: String, matKhau: String)</w:t>
+      </w:r>
+      <w:r>
+        <w:t xml:space="preserve"> → chọn</w:t>
+      </w:r>
+    </w:p>
+    <w:p>
+      <w:pPr>
+        <w:pStyle w:val="ListBullet"/>
+      </w:pPr>
+      <w:r>
+        <w:t>Ứng viên tham số ra:</w:t>
+      </w:r>
+    </w:p>
+    <w:p>
+      <w:pPr>
+        <w:pStyle w:val="ListBullet"/>
+      </w:pPr>
+      <w:r>
+        <w:rPr>
+          <w:rFonts w:ascii="Courier New" w:hAnsi="Courier New"/>
+          <w:sz w:val="20"/>
+        </w:rPr>
+        <w:t>register(): NguoiDung</w:t>
+      </w:r>
+      <w:r>
+        <w:t xml:space="preserve"> → chọn</w:t>
+      </w:r>
+    </w:p>
+    <w:p>
+      <w:pPr/>
+      <w:r>
+        <w:t xml:space="preserve">c) Xác minh OTP =&gt; </w:t>
+      </w:r>
+      <w:r>
+        <w:rPr>
+          <w:rFonts w:ascii="Courier New" w:hAnsi="Courier New"/>
+          <w:sz w:val="20"/>
+        </w:rPr>
+        <w:t>verifyOTP()</w:t>
+      </w:r>
+    </w:p>
+    <w:p>
+      <w:pPr>
+        <w:pStyle w:val="ListBullet"/>
+      </w:pPr>
+      <w:r>
+        <w:t>Input: otp</w:t>
+      </w:r>
+    </w:p>
+    <w:p>
+      <w:pPr>
+        <w:pStyle w:val="ListBullet"/>
+      </w:pPr>
+      <w:r>
+        <w:t>Output: boolean</w:t>
+      </w:r>
+    </w:p>
+    <w:p>
+      <w:pPr>
+        <w:pStyle w:val="ListBullet"/>
+      </w:pPr>
+      <w:r>
+        <w:t>Ứng viên tham số vào:</w:t>
+      </w:r>
+    </w:p>
+    <w:p>
+      <w:pPr>
+        <w:pStyle w:val="ListBullet"/>
+      </w:pPr>
+      <w:r>
+        <w:rPr>
+          <w:rFonts w:ascii="Courier New" w:hAnsi="Courier New"/>
+          <w:sz w:val="20"/>
+        </w:rPr>
+        <w:t>verifyOTP(otp: String)</w:t>
+      </w:r>
+      <w:r>
+        <w:t xml:space="preserve"> → chọn</w:t>
+      </w:r>
+    </w:p>
+    <w:p>
+      <w:pPr>
+        <w:pStyle w:val="ListBullet"/>
+      </w:pPr>
+      <w:r>
+        <w:t>Ứng viên tham số ra:</w:t>
+      </w:r>
+    </w:p>
+    <w:p>
+      <w:pPr>
+        <w:pStyle w:val="ListBullet"/>
+      </w:pPr>
+      <w:r>
+        <w:rPr>
+          <w:rFonts w:ascii="Courier New" w:hAnsi="Courier New"/>
+          <w:sz w:val="20"/>
+        </w:rPr>
+        <w:t>verifyOTP(): boolean</w:t>
+      </w:r>
+      <w:r>
+        <w:t xml:space="preserve"> → chọn (cần biết đúng/sai)</w:t>
+      </w:r>
+    </w:p>
+    <w:p>
+      <w:pPr/>
+      <w:r>
+        <w:t xml:space="preserve">d) Đổi mật khẩu =&gt; </w:t>
+      </w:r>
+      <w:r>
+        <w:rPr>
+          <w:rFonts w:ascii="Courier New" w:hAnsi="Courier New"/>
+          <w:sz w:val="20"/>
+        </w:rPr>
+        <w:t>changePassword()</w:t>
+      </w:r>
+    </w:p>
+    <w:p>
+      <w:pPr>
+        <w:pStyle w:val="ListBullet"/>
+      </w:pPr>
+      <w:r>
+        <w:t>Input: mkHienTai, mkMoi</w:t>
+      </w:r>
+    </w:p>
+    <w:p>
+      <w:pPr>
+        <w:pStyle w:val="ListBullet"/>
+      </w:pPr>
+      <w:r>
+        <w:t>Output: boolean</w:t>
+      </w:r>
+    </w:p>
+    <w:p>
+      <w:pPr>
+        <w:pStyle w:val="ListBullet"/>
+      </w:pPr>
+      <w:r>
+        <w:t>Ứng viên tham số vào:</w:t>
+      </w:r>
+    </w:p>
+    <w:p>
+      <w:pPr>
+        <w:pStyle w:val="ListBullet"/>
+      </w:pPr>
+      <w:r>
+        <w:rPr>
+          <w:rFonts w:ascii="Courier New" w:hAnsi="Courier New"/>
+          <w:sz w:val="20"/>
+        </w:rPr>
+        <w:t>changePassword(mkHienTai: String, mkMoi: String)</w:t>
+      </w:r>
+      <w:r>
+        <w:t xml:space="preserve"> → chọn</w:t>
+      </w:r>
+    </w:p>
+    <w:p>
+      <w:pPr>
+        <w:pStyle w:val="ListBullet"/>
+      </w:pPr>
+      <w:r>
+        <w:t>Ứng viên tham số ra:</w:t>
+      </w:r>
+    </w:p>
+    <w:p>
+      <w:pPr>
+        <w:pStyle w:val="ListBullet"/>
+      </w:pPr>
+      <w:r>
+        <w:rPr>
+          <w:rFonts w:ascii="Courier New" w:hAnsi="Courier New"/>
+          <w:sz w:val="20"/>
+        </w:rPr>
+        <w:t>changePassword(): boolean</w:t>
+      </w:r>
+      <w:r>
+        <w:t xml:space="preserve"> → chọn</w:t>
+      </w:r>
+    </w:p>
+    <w:p>
+      <w:pPr/>
+      <w:r>
+        <w:t xml:space="preserve">e) Xem hồ sơ =&gt; </w:t>
+      </w:r>
+      <w:r>
+        <w:rPr>
+          <w:rFonts w:ascii="Courier New" w:hAnsi="Courier New"/>
+          <w:sz w:val="20"/>
+        </w:rPr>
+        <w:t>getProfile()</w:t>
+      </w:r>
+    </w:p>
+    <w:p>
+      <w:pPr>
+        <w:pStyle w:val="ListBullet"/>
+      </w:pPr>
+      <w:r>
+        <w:t>Input: userId</w:t>
+      </w:r>
+    </w:p>
+    <w:p>
+      <w:pPr>
+        <w:pStyle w:val="ListBullet"/>
+      </w:pPr>
+      <w:r>
+        <w:t>Output: NguoiDung</w:t>
+      </w:r>
+    </w:p>
+    <w:p>
+      <w:pPr>
+        <w:pStyle w:val="ListBullet"/>
+      </w:pPr>
+      <w:r>
+        <w:t>Ứng viên tham số vào:</w:t>
+      </w:r>
+    </w:p>
+    <w:p>
+      <w:pPr>
+        <w:pStyle w:val="ListBullet"/>
+      </w:pPr>
+      <w:r>
+        <w:rPr>
+          <w:rFonts w:ascii="Courier New" w:hAnsi="Courier New"/>
+          <w:sz w:val="20"/>
+        </w:rPr>
+        <w:t>getProfile(userId: int)</w:t>
+      </w:r>
+      <w:r>
+        <w:t xml:space="preserve"> → chọn</w:t>
+      </w:r>
+    </w:p>
+    <w:p>
+      <w:pPr>
+        <w:pStyle w:val="ListBullet"/>
+      </w:pPr>
+      <w:r>
+        <w:t>Ứng viên tham số ra:</w:t>
+      </w:r>
+    </w:p>
+    <w:p>
+      <w:pPr>
+        <w:pStyle w:val="ListBullet"/>
+      </w:pPr>
+      <w:r>
+        <w:rPr>
+          <w:rFonts w:ascii="Courier New" w:hAnsi="Courier New"/>
+          <w:sz w:val="20"/>
+        </w:rPr>
+        <w:t>getProfile(): NguoiDung</w:t>
+      </w:r>
+      <w:r>
+        <w:t xml:space="preserve"> → chọn</w:t>
+      </w:r>
+    </w:p>
+    <w:p>
+      <w:pPr/>
+      <w:r>
+        <w:t xml:space="preserve">f) Cập nhật hồ sơ =&gt; </w:t>
+      </w:r>
+      <w:r>
+        <w:rPr>
+          <w:rFonts w:ascii="Courier New" w:hAnsi="Courier New"/>
+          <w:sz w:val="20"/>
+        </w:rPr>
+        <w:t>updateProfile()</w:t>
+      </w:r>
+    </w:p>
+    <w:p>
+      <w:pPr>
+        <w:pStyle w:val="ListBullet"/>
+      </w:pPr>
+      <w:r>
+        <w:t>Input: userId, hoTen, email</w:t>
+      </w:r>
+    </w:p>
+    <w:p>
+      <w:pPr>
+        <w:pStyle w:val="ListBullet"/>
+      </w:pPr>
+      <w:r>
+        <w:t>Output: NguoiDung</w:t>
+      </w:r>
+    </w:p>
+    <w:p>
+      <w:pPr>
+        <w:pStyle w:val="ListBullet"/>
+      </w:pPr>
+      <w:r>
+        <w:t>Ứng viên tham số vào:</w:t>
+      </w:r>
+    </w:p>
+    <w:p>
+      <w:pPr>
+        <w:pStyle w:val="ListBullet"/>
+      </w:pPr>
+      <w:r>
+        <w:rPr>
+          <w:rFonts w:ascii="Courier New" w:hAnsi="Courier New"/>
+          <w:sz w:val="20"/>
+        </w:rPr>
+        <w:t>updateProfile(userId: int, hoTen: String, email: String)</w:t>
+      </w:r>
+      <w:r>
+        <w:t xml:space="preserve"> → chọn</w:t>
+      </w:r>
+    </w:p>
+    <w:p>
+      <w:pPr>
+        <w:pStyle w:val="ListBullet"/>
+      </w:pPr>
+      <w:r>
+        <w:t>Ứng viên tham số ra:</w:t>
+      </w:r>
+    </w:p>
+    <w:p>
+      <w:pPr>
+        <w:pStyle w:val="ListBullet"/>
+      </w:pPr>
+      <w:r>
+        <w:rPr>
+          <w:rFonts w:ascii="Courier New" w:hAnsi="Courier New"/>
+          <w:sz w:val="20"/>
+        </w:rPr>
+        <w:t>updateProfile(): NguoiDung</w:t>
+      </w:r>
+      <w:r>
+        <w:t xml:space="preserve"> → chọn</w:t>
+      </w:r>
+    </w:p>
+    <w:p>
+      <w:pPr/>
+      <w:r>
+        <w:t xml:space="preserve">g) Xem danh sách NV =&gt; </w:t>
+      </w:r>
+      <w:r>
+        <w:rPr>
+          <w:rFonts w:ascii="Courier New" w:hAnsi="Courier New"/>
+          <w:sz w:val="20"/>
+        </w:rPr>
+        <w:t>getStaffList()</w:t>
+      </w:r>
+    </w:p>
+    <w:p>
+      <w:pPr>
+        <w:pStyle w:val="ListBullet"/>
+      </w:pPr>
+      <w:r>
+        <w:t>Input: (không có)</w:t>
+      </w:r>
+    </w:p>
+    <w:p>
+      <w:pPr>
+        <w:pStyle w:val="ListBullet"/>
+      </w:pPr>
+      <w:r>
+        <w:t>Output: List\&lt;NhanVien\&gt;</w:t>
+      </w:r>
+    </w:p>
+    <w:p>
+      <w:pPr>
+        <w:pStyle w:val="ListBullet"/>
+      </w:pPr>
+      <w:r>
+        <w:t>Ứng viên tham số vào:</w:t>
+      </w:r>
+    </w:p>
+    <w:p>
+      <w:pPr>
+        <w:pStyle w:val="ListBullet"/>
+      </w:pPr>
+      <w:r>
+        <w:rPr>
+          <w:rFonts w:ascii="Courier New" w:hAnsi="Courier New"/>
+          <w:sz w:val="20"/>
+        </w:rPr>
+        <w:t>getStaffList()</w:t>
+      </w:r>
+      <w:r>
+        <w:t xml:space="preserve"> → chọn</w:t>
+      </w:r>
+    </w:p>
+    <w:p>
+      <w:pPr>
+        <w:pStyle w:val="ListBullet"/>
+      </w:pPr>
+      <w:r>
+        <w:t>Ứng viên tham số ra:</w:t>
+      </w:r>
+    </w:p>
+    <w:p>
+      <w:pPr>
+        <w:pStyle w:val="ListBullet"/>
+      </w:pPr>
+      <w:r>
+        <w:rPr>
+          <w:rFonts w:ascii="Courier New" w:hAnsi="Courier New"/>
+          <w:sz w:val="20"/>
+        </w:rPr>
+        <w:t>getStaffList(): List&lt;NhanVien&gt;</w:t>
+      </w:r>
+      <w:r>
+        <w:t xml:space="preserve"> → chọn</w:t>
+      </w:r>
+    </w:p>
+    <w:p>
+      <w:pPr/>
+      <w:r>
+        <w:t xml:space="preserve">h) Thêm NV =&gt; </w:t>
+      </w:r>
+      <w:r>
+        <w:rPr>
+          <w:rFonts w:ascii="Courier New" w:hAnsi="Courier New"/>
+          <w:sz w:val="20"/>
+        </w:rPr>
+        <w:t>addStaff()</w:t>
+      </w:r>
+    </w:p>
+    <w:p>
+      <w:pPr>
+        <w:pStyle w:val="ListBullet"/>
+      </w:pPr>
+      <w:r>
+        <w:t>Input: hoTen, vaiTro</w:t>
+      </w:r>
+    </w:p>
+    <w:p>
+      <w:pPr>
+        <w:pStyle w:val="ListBullet"/>
+      </w:pPr>
+      <w:r>
+        <w:t>Output: NhanVien</w:t>
+      </w:r>
+    </w:p>
+    <w:p>
+      <w:pPr>
+        <w:pStyle w:val="ListBullet"/>
+      </w:pPr>
+      <w:r>
+        <w:t>Ứng viên tham số vào:</w:t>
+      </w:r>
+    </w:p>
+    <w:p>
+      <w:pPr>
+        <w:pStyle w:val="ListBullet"/>
+      </w:pPr>
+      <w:r>
+        <w:rPr>
+          <w:rFonts w:ascii="Courier New" w:hAnsi="Courier New"/>
+          <w:sz w:val="20"/>
+        </w:rPr>
+        <w:t>addStaff(hoTen: String, vaiTro: String)</w:t>
+      </w:r>
+      <w:r>
+        <w:t xml:space="preserve"> → chọn</w:t>
+      </w:r>
+    </w:p>
+    <w:p>
+      <w:pPr>
+        <w:pStyle w:val="ListBullet"/>
+      </w:pPr>
+      <w:r>
+        <w:t>Ứng viên tham số ra:</w:t>
+      </w:r>
+    </w:p>
+    <w:p>
+      <w:pPr>
+        <w:pStyle w:val="ListBullet"/>
+      </w:pPr>
+      <w:r>
+        <w:rPr>
+          <w:rFonts w:ascii="Courier New" w:hAnsi="Courier New"/>
+          <w:sz w:val="20"/>
+        </w:rPr>
+        <w:t>addStaff(): NhanVien</w:t>
+      </w:r>
+      <w:r>
+        <w:t xml:space="preserve"> → chọn</w:t>
+      </w:r>
+    </w:p>
+    <w:p>
+      <w:pPr/>
+      <w:r>
+        <w:t xml:space="preserve">i) Sửa NV =&gt; </w:t>
+      </w:r>
+      <w:r>
+        <w:rPr>
+          <w:rFonts w:ascii="Courier New" w:hAnsi="Courier New"/>
+          <w:sz w:val="20"/>
+        </w:rPr>
+        <w:t>updateStaff()</w:t>
+      </w:r>
+    </w:p>
+    <w:p>
+      <w:pPr>
+        <w:pStyle w:val="ListBullet"/>
+      </w:pPr>
+      <w:r>
+        <w:t>Input: id, hoTen, vaiTro</w:t>
+      </w:r>
+    </w:p>
+    <w:p>
+      <w:pPr>
+        <w:pStyle w:val="ListBullet"/>
+      </w:pPr>
+      <w:r>
+        <w:t>Output: NhanVien</w:t>
+      </w:r>
+    </w:p>
+    <w:p>
+      <w:pPr>
+        <w:pStyle w:val="ListBullet"/>
+      </w:pPr>
+      <w:r>
+        <w:t>Ứng viên tham số vào:</w:t>
+      </w:r>
+    </w:p>
+    <w:p>
+      <w:pPr>
+        <w:pStyle w:val="ListBullet"/>
+      </w:pPr>
+      <w:r>
+        <w:rPr>
+          <w:rFonts w:ascii="Courier New" w:hAnsi="Courier New"/>
+          <w:sz w:val="20"/>
+        </w:rPr>
+        <w:t>updateStaff(id: int, hoTen: String, vaiTro: String)</w:t>
+      </w:r>
+      <w:r>
+        <w:t xml:space="preserve"> → chọn</w:t>
+      </w:r>
+    </w:p>
+    <w:p>
+      <w:pPr>
+        <w:pStyle w:val="ListBullet"/>
+      </w:pPr>
+      <w:r>
+        <w:t>Ứng viên tham số ra:</w:t>
+      </w:r>
+    </w:p>
+    <w:p>
+      <w:pPr>
+        <w:pStyle w:val="ListBullet"/>
+      </w:pPr>
+      <w:r>
+        <w:rPr>
+          <w:rFonts w:ascii="Courier New" w:hAnsi="Courier New"/>
+          <w:sz w:val="20"/>
+        </w:rPr>
+        <w:t>updateStaff(): NhanVien</w:t>
+      </w:r>
+      <w:r>
+        <w:t xml:space="preserve"> → chọn</w:t>
+      </w:r>
+    </w:p>
+    <w:p>
+      <w:pPr/>
+      <w:r>
+        <w:t xml:space="preserve">j) Xóa NV =&gt; </w:t>
+      </w:r>
+      <w:r>
+        <w:rPr>
+          <w:rFonts w:ascii="Courier New" w:hAnsi="Courier New"/>
+          <w:sz w:val="20"/>
+        </w:rPr>
+        <w:t>deleteStaff()</w:t>
+      </w:r>
+    </w:p>
+    <w:p>
+      <w:pPr>
+        <w:pStyle w:val="ListBullet"/>
+      </w:pPr>
+      <w:r>
+        <w:t>Input: id</w:t>
+      </w:r>
+    </w:p>
+    <w:p>
+      <w:pPr>
+        <w:pStyle w:val="ListBullet"/>
+      </w:pPr>
+      <w:r>
+        <w:t>Output: boolean</w:t>
+      </w:r>
+    </w:p>
+    <w:p>
+      <w:pPr>
+        <w:pStyle w:val="ListBullet"/>
+      </w:pPr>
+      <w:r>
+        <w:t>Ứng viên tham số vào:</w:t>
+      </w:r>
+    </w:p>
+    <w:p>
+      <w:pPr>
+        <w:pStyle w:val="ListBullet"/>
+      </w:pPr>
+      <w:r>
+        <w:rPr>
+          <w:rFonts w:ascii="Courier New" w:hAnsi="Courier New"/>
+          <w:sz w:val="20"/>
+        </w:rPr>
+        <w:t>deleteStaff(id: int)</w:t>
+      </w:r>
+      <w:r>
+        <w:t xml:space="preserve"> → chọn</w:t>
+      </w:r>
+    </w:p>
+    <w:p>
+      <w:pPr>
+        <w:pStyle w:val="ListBullet"/>
+      </w:pPr>
+      <w:r>
+        <w:t>Ứng viên tham số ra:</w:t>
+      </w:r>
+    </w:p>
+    <w:p>
+      <w:pPr>
+        <w:pStyle w:val="ListBullet"/>
+      </w:pPr>
+      <w:r>
+        <w:rPr>
+          <w:rFonts w:ascii="Courier New" w:hAnsi="Courier New"/>
+          <w:sz w:val="20"/>
+        </w:rPr>
+        <w:t>deleteStaff(): boolean</w:t>
+      </w:r>
+      <w:r>
+        <w:t xml:space="preserve"> → chọn (cần biết thành công/thất bại)</w:t>
+      </w:r>
+    </w:p>
+    <w:p>
       <w:pPr>
         <w:jc w:val="center"/>
       </w:pPr>
       <w:r>
         <w:drawing>
           <wp:inline xmlns:a="http://schemas.openxmlformats.org/drawingml/2006/main" xmlns:pic="http://schemas.openxmlformats.org/drawingml/2006/picture">
-            <wp:extent cx="5486400" cy="3207790"/>
-            <wp:docPr id="3" name="Picture 3"/>
+            <wp:extent cx="5486400" cy="2875258"/>
+            <wp:docPr id="5" name="Picture 5"/>
             <wp:cNvGraphicFramePr>
               <a:graphicFrameLocks noChangeAspect="1"/>
             </wp:cNvGraphicFramePr>
@@ -6376,11 +7210,11 @@
               <a:graphicData uri="http://schemas.openxmlformats.org/drawingml/2006/picture">
                 <pic:pic>
                   <pic:nvPicPr>
-                    <pic:cNvPr id="0" name="account_dao_class.png"/>
+                    <pic:cNvPr id="0" name="account_mvc_class.png"/>
                     <pic:cNvPicPr/>
                   </pic:nvPicPr>
                   <pic:blipFill>
-                    <a:blip r:embed="rId11"/>
+                    <a:blip r:embed="rId13"/>
                     <a:stretch>
                       <a:fillRect/>
                     </a:stretch>
@@ -6388,7 +7222,7 @@
                   <pic:spPr>
                     <a:xfrm>
                       <a:off x="0" y="0"/>
-                      <a:ext cx="5486400" cy="3207790"/>
+                      <a:ext cx="5486400" cy="2875258"/>
                     </a:xfrm>
                     <a:prstGeom prst="rect"/>
                   </pic:spPr>
@@ -6428,8 +7262,8 @@
       <w:r>
         <w:drawing>
           <wp:inline xmlns:a="http://schemas.openxmlformats.org/drawingml/2006/main" xmlns:pic="http://schemas.openxmlformats.org/drawingml/2006/picture">
-            <wp:extent cx="5486400" cy="3447360"/>
-            <wp:docPr id="4" name="Picture 4"/>
+            <wp:extent cx="5486400" cy="3628353"/>
+            <wp:docPr id="6" name="Picture 6"/>
             <wp:cNvGraphicFramePr>
               <a:graphicFrameLocks noChangeAspect="1"/>
             </wp:cNvGraphicFramePr>
@@ -6441,7 +7275,7 @@
                     <pic:cNvPicPr/>
                   </pic:nvPicPr>
                   <pic:blipFill>
-                    <a:blip r:embed="rId12"/>
+                    <a:blip r:embed="rId14"/>
                     <a:stretch>
                       <a:fillRect/>
                     </a:stretch>
@@ -6449,7 +7283,7 @@
                   <pic:spPr>
                     <a:xfrm>
                       <a:off x="0" y="0"/>
-                      <a:ext cx="5486400" cy="3447360"/>
+                      <a:ext cx="5486400" cy="3628353"/>
                     </a:xfrm>
                     <a:prstGeom prst="rect"/>
                   </pic:spPr>
@@ -6481,8 +7315,8 @@
       <w:r>
         <w:drawing>
           <wp:inline xmlns:a="http://schemas.openxmlformats.org/drawingml/2006/main" xmlns:pic="http://schemas.openxmlformats.org/drawingml/2006/picture">
-            <wp:extent cx="5486400" cy="4604787"/>
-            <wp:docPr id="5" name="Picture 5"/>
+            <wp:extent cx="5486400" cy="5128591"/>
+            <wp:docPr id="7" name="Picture 7"/>
             <wp:cNvGraphicFramePr>
               <a:graphicFrameLocks noChangeAspect="1"/>
             </wp:cNvGraphicFramePr>
@@ -6494,7 +7328,7 @@
                     <pic:cNvPicPr/>
                   </pic:nvPicPr>
                   <pic:blipFill>
-                    <a:blip r:embed="rId13"/>
+                    <a:blip r:embed="rId15"/>
                     <a:stretch>
                       <a:fillRect/>
                     </a:stretch>
@@ -6502,7 +7336,7 @@
                   <pic:spPr>
                     <a:xfrm>
                       <a:off x="0" y="0"/>
-                      <a:ext cx="5486400" cy="4604787"/>
+                      <a:ext cx="5486400" cy="5128591"/>
                     </a:xfrm>
                     <a:prstGeom prst="rect"/>
                   </pic:spPr>
@@ -6534,8 +7368,8 @@
       <w:r>
         <w:drawing>
           <wp:inline xmlns:a="http://schemas.openxmlformats.org/drawingml/2006/main" xmlns:pic="http://schemas.openxmlformats.org/drawingml/2006/picture">
-            <wp:extent cx="5486400" cy="3259448"/>
-            <wp:docPr id="6" name="Picture 6"/>
+            <wp:extent cx="5486400" cy="3540138"/>
+            <wp:docPr id="8" name="Picture 8"/>
             <wp:cNvGraphicFramePr>
               <a:graphicFrameLocks noChangeAspect="1"/>
             </wp:cNvGraphicFramePr>
@@ -6547,7 +7381,7 @@
                     <pic:cNvPicPr/>
                   </pic:nvPicPr>
                   <pic:blipFill>
-                    <a:blip r:embed="rId14"/>
+                    <a:blip r:embed="rId16"/>
                     <a:stretch>
                       <a:fillRect/>
                     </a:stretch>
@@ -6555,7 +7389,7 @@
                   <pic:spPr>
                     <a:xfrm>
                       <a:off x="0" y="0"/>
-                      <a:ext cx="5486400" cy="3259448"/>
+                      <a:ext cx="5486400" cy="3540138"/>
                     </a:xfrm>
                     <a:prstGeom prst="rect"/>
                   </pic:spPr>
@@ -6587,8 +7421,8 @@
       <w:r>
         <w:drawing>
           <wp:inline xmlns:a="http://schemas.openxmlformats.org/drawingml/2006/main" xmlns:pic="http://schemas.openxmlformats.org/drawingml/2006/picture">
-            <wp:extent cx="5486400" cy="4042161"/>
-            <wp:docPr id="7" name="Picture 7"/>
+            <wp:extent cx="5486400" cy="3694922"/>
+            <wp:docPr id="9" name="Picture 9"/>
             <wp:cNvGraphicFramePr>
               <a:graphicFrameLocks noChangeAspect="1"/>
             </wp:cNvGraphicFramePr>
@@ -6600,7 +7434,7 @@
                     <pic:cNvPicPr/>
                   </pic:nvPicPr>
                   <pic:blipFill>
-                    <a:blip r:embed="rId15"/>
+                    <a:blip r:embed="rId17"/>
                     <a:stretch>
                       <a:fillRect/>
                     </a:stretch>
@@ -6608,7 +7442,7 @@
                   <pic:spPr>
                     <a:xfrm>
                       <a:off x="0" y="0"/>
-                      <a:ext cx="5486400" cy="4042161"/>
+                      <a:ext cx="5486400" cy="3694922"/>
                     </a:xfrm>
                     <a:prstGeom prst="rect"/>
                   </pic:spPr>
@@ -6640,8 +7474,8 @@
       <w:r>
         <w:drawing>
           <wp:inline xmlns:a="http://schemas.openxmlformats.org/drawingml/2006/main" xmlns:pic="http://schemas.openxmlformats.org/drawingml/2006/picture">
-            <wp:extent cx="5486400" cy="4645891"/>
-            <wp:docPr id="8" name="Picture 8"/>
+            <wp:extent cx="5486400" cy="3664039"/>
+            <wp:docPr id="10" name="Picture 10"/>
             <wp:cNvGraphicFramePr>
               <a:graphicFrameLocks noChangeAspect="1"/>
             </wp:cNvGraphicFramePr>
@@ -6653,7 +7487,7 @@
                     <pic:cNvPicPr/>
                   </pic:nvPicPr>
                   <pic:blipFill>
-                    <a:blip r:embed="rId16"/>
+                    <a:blip r:embed="rId18"/>
                     <a:stretch>
                       <a:fillRect/>
                     </a:stretch>
@@ -6661,7 +7495,7 @@
                   <pic:spPr>
                     <a:xfrm>
                       <a:off x="0" y="0"/>
-                      <a:ext cx="5486400" cy="4645891"/>
+                      <a:ext cx="5486400" cy="3664039"/>
                     </a:xfrm>
                     <a:prstGeom prst="rect"/>
                   </pic:spPr>

</xml_diff>

<commit_message>
fix: fill all audit gaps — III.4 sequences, UC diagrams, inline tables, 4 missing TCs
- III.4: Add PlantUML code + Kịch bản phiên bản 3 for all 5 UCs
- I.1: Add UC overview diagram + 5 UC textual descriptions
- II.1: Add inline HTML tables for UC04 (profile) and UC20 (staff list)
- IV: Add TC03 (account locked), TC05 (SDT exists), TC06 (OTP wrong 3x), TC10 (email used)
- DOCX: 475KB, 557 paragraphs, 44 tables, 11 images, all 11 TCs
</commit_message>
<xml_diff>
--- a/output/account_module.docx
+++ b/output/account_module.docx
@@ -1411,9 +1411,116 @@
       </w:r>
     </w:p>
     <w:p>
+      <w:pPr>
+        <w:jc w:val="center"/>
+      </w:pPr>
+      <w:r>
+        <w:drawing>
+          <wp:inline xmlns:a="http://schemas.openxmlformats.org/drawingml/2006/main" xmlns:pic="http://schemas.openxmlformats.org/drawingml/2006/picture">
+            <wp:extent cx="5486400" cy="12352421"/>
+            <wp:docPr id="1" name="Picture 1"/>
+            <wp:cNvGraphicFramePr>
+              <a:graphicFrameLocks noChangeAspect="1"/>
+            </wp:cNvGraphicFramePr>
+            <a:graphic>
+              <a:graphicData uri="http://schemas.openxmlformats.org/drawingml/2006/picture">
+                <pic:pic>
+                  <pic:nvPicPr>
+                    <pic:cNvPr id="0" name="account_uc_overview.png"/>
+                    <pic:cNvPicPr/>
+                  </pic:nvPicPr>
+                  <pic:blipFill>
+                    <a:blip r:embed="rId9"/>
+                    <a:stretch>
+                      <a:fillRect/>
+                    </a:stretch>
+                  </pic:blipFill>
+                  <pic:spPr>
+                    <a:xfrm>
+                      <a:off x="0" y="0"/>
+                      <a:ext cx="5486400" cy="12352421"/>
+                    </a:xfrm>
+                    <a:prstGeom prst="rect"/>
+                  </pic:spPr>
+                </pic:pic>
+              </a:graphicData>
+            </a:graphic>
+          </wp:inline>
+        </w:drawing>
+      </w:r>
+    </w:p>
+    <w:p>
       <w:pPr/>
       <w:r>
         <w:t>&lt;!-- File: output/diagrams/account_uc_overview.png --&gt;</w:t>
+      </w:r>
+    </w:p>
+    <w:p>
+      <w:pPr>
+        <w:pStyle w:val="Heading2"/>
+      </w:pPr>
+      <w:r>
+        <w:t>5. Mô tả từng Use Case</w:t>
+      </w:r>
+    </w:p>
+    <w:p>
+      <w:pPr/>
+      <w:r>
+        <w:rPr>
+          <w:b/>
+        </w:rPr>
+        <w:t>UC01 – Đăng nhập:</w:t>
+      </w:r>
+      <w:r>
+        <w:t xml:space="preserve"> UC này cho phép Khách hàng, Nhân viên hoặc Chủ doanh nghiệp xác thực danh tính vào hệ thống. Người dùng nhập SĐT/Email và mật khẩu, hệ thống kiểm tra và chuyển hướng đến trang chủ tương ứng với vai trò.</w:t>
+      </w:r>
+    </w:p>
+    <w:p>
+      <w:pPr/>
+      <w:r>
+        <w:rPr>
+          <w:b/>
+        </w:rPr>
+        <w:t>UC02 – Đăng ký:</w:t>
+      </w:r>
+      <w:r>
+        <w:t xml:space="preserve"> UC này cho phép Khách hàng tạo tài khoản hội viên mới bằng cách cung cấp họ tên, SĐT, email và mật khẩu. Hệ thống gửi OTP 6 chữ số đến SĐT để xác minh trước khi hoàn tất đăng ký.</w:t>
+      </w:r>
+    </w:p>
+    <w:p>
+      <w:pPr/>
+      <w:r>
+        <w:rPr>
+          <w:b/>
+        </w:rPr>
+        <w:t>UC03 – Đổi mật khẩu:</w:t>
+      </w:r>
+      <w:r>
+        <w:t xml:space="preserve"> UC này cho phép người dùng đã đăng nhập thay đổi mật khẩu bằng cách xác minh mật khẩu hiện tại, nhập mật khẩu mới (độ dài ≥ 8, có chữ hoa/thường/số/đặc biệt). Sau khi đổi, tất cả session khác bị thu hồi.</w:t>
+      </w:r>
+    </w:p>
+    <w:p>
+      <w:pPr/>
+      <w:r>
+        <w:rPr>
+          <w:b/>
+        </w:rPr>
+        <w:t>UC04 – Quản lý thông tin cá nhân:</w:t>
+      </w:r>
+      <w:r>
+        <w:t xml:space="preserve"> UC này cho phép Khách hàng xem hồ sơ cá nhân (họ tên, SĐT, email, hạng hội viên, điểm tích lũy) và cập nhật thông tin (họ tên, email). SĐT bị khóa, muốn đổi phải xác minh OTP.</w:t>
+      </w:r>
+    </w:p>
+    <w:p>
+      <w:pPr/>
+      <w:r>
+        <w:rPr>
+          <w:b/>
+        </w:rPr>
+        <w:t>UC20 – Quản lý tài khoản nhân viên:</w:t>
+      </w:r>
+      <w:r>
+        <w:t xml:space="preserve"> UC này cho phép Chủ doanh nghiệp quản lý tài khoản nhân viên toàn hệ thống: xem danh sách, thêm mới, chỉnh sửa và xóa (chuyển trạng thái "Đã nghỉ"). Không thể xóa nhân viên đang xử lý order.</w:t>
       </w:r>
     </w:p>
     <w:p/>
@@ -2560,7 +2667,16 @@
               <w:rPr>
                 <w:sz w:val="20"/>
               </w:rPr>
-              <w:t>2. Hiển thị "Hồ sơ cá nhân": Họ tên, SĐT, Email, Hạng hội viên, Điểm tích lũy, Ngày tham gia.</w:t>
+              <w:t>2. Hệ thống hiển thị "Hồ sơ cá nhân":</w:t>
+            </w:r>
+            <w:r>
+              <w:br/>
+            </w:r>
+            <w:r>
+              <w:rPr>
+                <w:sz w:val="20"/>
+              </w:rPr>
+              <w:t>&lt;table&gt;&lt;tr&gt;&lt;th&gt;Họ tên&lt;/th&gt;&lt;th&gt;SĐT&lt;/th&gt;&lt;th&gt;Email&lt;/th&gt;&lt;th&gt;Hạng hội viên&lt;/th&gt;&lt;th&gt;Điểm tích lũy&lt;/th&gt;&lt;th&gt;Ngày tham gia&lt;/th&gt;&lt;/tr&gt;&lt;tr&gt;&lt;td&gt;Nguyễn Văn An&lt;/td&gt;&lt;td&gt;0912345678&lt;/td&gt;&lt;td&gt;vana@email.com&lt;/td&gt;&lt;td&gt;Bạc&lt;/td&gt;&lt;td&gt;1.250&lt;/td&gt;&lt;td&gt;15/03/2024&lt;/td&gt;&lt;/tr&gt;&lt;/table&gt;</w:t>
             </w:r>
             <w:r>
               <w:br/>
@@ -2857,7 +2973,16 @@
               <w:rPr>
                 <w:sz w:val="20"/>
               </w:rPr>
-              <w:t>2. Hiển thị danh sách nhân viên: họ tên, vai trò, trạng thái.</w:t>
+              <w:t>2. Hệ thống hiển thị danh sách nhân viên:</w:t>
+            </w:r>
+            <w:r>
+              <w:br/>
+            </w:r>
+            <w:r>
+              <w:rPr>
+                <w:sz w:val="20"/>
+              </w:rPr>
+              <w:t>&lt;table&gt;&lt;tr&gt;&lt;th&gt;Họ tên&lt;/th&gt;&lt;th&gt;Vai trò&lt;/th&gt;&lt;th&gt;Trạng thái&lt;/th&gt;&lt;/tr&gt;&lt;tr&gt;&lt;td&gt;Trần Văn A&lt;/td&gt;&lt;td&gt;Lễ tân&lt;/td&gt;&lt;td&gt;Đang làm việc&lt;/td&gt;&lt;/tr&gt;&lt;tr&gt;&lt;td&gt;Lê Thị B&lt;/td&gt;&lt;td&gt;Phục vụ&lt;/td&gt;&lt;td&gt;Đang làm việc&lt;/td&gt;&lt;/tr&gt;&lt;tr&gt;&lt;td&gt;Phạm Văn C&lt;/td&gt;&lt;td&gt;Quản lý&lt;/td&gt;&lt;td&gt;Đang làm việc&lt;/td&gt;&lt;/tr&gt;&lt;/table&gt;</w:t>
             </w:r>
             <w:r>
               <w:br/>
@@ -3129,7 +3254,7 @@
         <w:drawing>
           <wp:inline xmlns:a="http://schemas.openxmlformats.org/drawingml/2006/main" xmlns:pic="http://schemas.openxmlformats.org/drawingml/2006/picture">
             <wp:extent cx="5486400" cy="4454305"/>
-            <wp:docPr id="1" name="Picture 1"/>
+            <wp:docPr id="2" name="Picture 2"/>
             <wp:cNvGraphicFramePr>
               <a:graphicFrameLocks noChangeAspect="1"/>
             </wp:cNvGraphicFramePr>
@@ -3141,7 +3266,7 @@
                     <pic:cNvPicPr/>
                   </pic:nvPicPr>
                   <pic:blipFill>
-                    <a:blip r:embed="rId9"/>
+                    <a:blip r:embed="rId10"/>
                     <a:stretch>
                       <a:fillRect/>
                     </a:stretch>
@@ -3968,7 +4093,7 @@
         <w:drawing>
           <wp:inline xmlns:a="http://schemas.openxmlformats.org/drawingml/2006/main" xmlns:pic="http://schemas.openxmlformats.org/drawingml/2006/picture">
             <wp:extent cx="5486400" cy="2743200"/>
-            <wp:docPr id="2" name="Picture 2"/>
+            <wp:docPr id="3" name="Picture 3"/>
             <wp:cNvGraphicFramePr>
               <a:graphicFrameLocks noChangeAspect="1"/>
             </wp:cNvGraphicFramePr>
@@ -3980,7 +4105,7 @@
                     <pic:cNvPicPr/>
                   </pic:nvPicPr>
                   <pic:blipFill>
-                    <a:blip r:embed="rId10"/>
+                    <a:blip r:embed="rId11"/>
                     <a:stretch>
                       <a:fillRect/>
                     </a:stretch>
@@ -5511,7 +5636,7 @@
         <w:drawing>
           <wp:inline xmlns:a="http://schemas.openxmlformats.org/drawingml/2006/main" xmlns:pic="http://schemas.openxmlformats.org/drawingml/2006/picture">
             <wp:extent cx="5486400" cy="3657600"/>
-            <wp:docPr id="3" name="Picture 3"/>
+            <wp:docPr id="4" name="Picture 4"/>
             <wp:cNvGraphicFramePr>
               <a:graphicFrameLocks noChangeAspect="1"/>
             </wp:cNvGraphicFramePr>
@@ -5523,7 +5648,7 @@
                     <pic:cNvPicPr/>
                   </pic:nvPicPr>
                   <pic:blipFill>
-                    <a:blip r:embed="rId11"/>
+                    <a:blip r:embed="rId12"/>
                     <a:stretch>
                       <a:fillRect/>
                     </a:stretch>
@@ -6093,7 +6218,7 @@
         <w:drawing>
           <wp:inline xmlns:a="http://schemas.openxmlformats.org/drawingml/2006/main" xmlns:pic="http://schemas.openxmlformats.org/drawingml/2006/picture">
             <wp:extent cx="5486400" cy="5188892"/>
-            <wp:docPr id="4" name="Picture 4"/>
+            <wp:docPr id="5" name="Picture 5"/>
             <wp:cNvGraphicFramePr>
               <a:graphicFrameLocks noChangeAspect="1"/>
             </wp:cNvGraphicFramePr>
@@ -6105,7 +6230,7 @@
                     <pic:cNvPicPr/>
                   </pic:nvPicPr>
                   <pic:blipFill>
-                    <a:blip r:embed="rId12"/>
+                    <a:blip r:embed="rId13"/>
                     <a:stretch>
                       <a:fillRect/>
                     </a:stretch>
@@ -7202,7 +7327,7 @@
         <w:drawing>
           <wp:inline xmlns:a="http://schemas.openxmlformats.org/drawingml/2006/main" xmlns:pic="http://schemas.openxmlformats.org/drawingml/2006/picture">
             <wp:extent cx="5486400" cy="2875258"/>
-            <wp:docPr id="5" name="Picture 5"/>
+            <wp:docPr id="6" name="Picture 6"/>
             <wp:cNvGraphicFramePr>
               <a:graphicFrameLocks noChangeAspect="1"/>
             </wp:cNvGraphicFramePr>
@@ -7214,7 +7339,7 @@
                     <pic:cNvPicPr/>
                   </pic:nvPicPr>
                   <pic:blipFill>
-                    <a:blip r:embed="rId13"/>
+                    <a:blip r:embed="rId14"/>
                     <a:stretch>
                       <a:fillRect/>
                     </a:stretch>
@@ -7263,7 +7388,7 @@
         <w:drawing>
           <wp:inline xmlns:a="http://schemas.openxmlformats.org/drawingml/2006/main" xmlns:pic="http://schemas.openxmlformats.org/drawingml/2006/picture">
             <wp:extent cx="5486400" cy="3628353"/>
-            <wp:docPr id="6" name="Picture 6"/>
+            <wp:docPr id="7" name="Picture 7"/>
             <wp:cNvGraphicFramePr>
               <a:graphicFrameLocks noChangeAspect="1"/>
             </wp:cNvGraphicFramePr>
@@ -7275,7 +7400,7 @@
                     <pic:cNvPicPr/>
                   </pic:nvPicPr>
                   <pic:blipFill>
-                    <a:blip r:embed="rId14"/>
+                    <a:blip r:embed="rId15"/>
                     <a:stretch>
                       <a:fillRect/>
                     </a:stretch>
@@ -7301,6 +7426,387 @@
       </w:r>
     </w:p>
     <w:p>
+      <w:pPr/>
+      <w:r>
+        <w:rPr>
+          <w:b/>
+        </w:rPr>
+        <w:t>Kịch bản phiên bản 3 – UC01 Đăng nhập</w:t>
+      </w:r>
+    </w:p>
+    <w:p>
+      <w:pPr/>
+      <w:r>
+        <w:t xml:space="preserve">1. Khách hàng truy cập URL </w:t>
+      </w:r>
+      <w:r>
+        <w:rPr>
+          <w:rFonts w:ascii="Courier New" w:hAnsi="Courier New"/>
+          <w:sz w:val="20"/>
+        </w:rPr>
+        <w:t>/login</w:t>
+      </w:r>
+      <w:r>
+        <w:t xml:space="preserve"> trên trình duyệt.</w:t>
+      </w:r>
+    </w:p>
+    <w:p>
+      <w:pPr/>
+      <w:r>
+        <w:t xml:space="preserve">2. Phương thức </w:t>
+      </w:r>
+      <w:r>
+        <w:rPr>
+          <w:rFonts w:ascii="Courier New" w:hAnsi="Courier New"/>
+          <w:sz w:val="20"/>
+        </w:rPr>
+        <w:t>render()</w:t>
+      </w:r>
+      <w:r>
+        <w:t xml:space="preserve"> của lớp LoginPage được gọi, hiển thị form gồm ô nhập SĐT/Email, ô nhập Mật khẩu, nút [Đăng nhập], liên kết "Quên mật khẩu?" / "Đăng ký".</w:t>
+      </w:r>
+    </w:p>
+    <w:p>
+      <w:pPr/>
+      <w:r>
+        <w:t>3. Khách hàng nhập SĐT = "0912345678" và Mật khẩu = "Abc@1234".</w:t>
+      </w:r>
+    </w:p>
+    <w:p>
+      <w:pPr/>
+      <w:r>
+        <w:t>4. Khách hàng click nút [Đăng nhập].</w:t>
+      </w:r>
+    </w:p>
+    <w:p>
+      <w:pPr/>
+      <w:r>
+        <w:t xml:space="preserve">5. Phương thức </w:t>
+      </w:r>
+      <w:r>
+        <w:rPr>
+          <w:rFonts w:ascii="Courier New" w:hAnsi="Courier New"/>
+          <w:sz w:val="20"/>
+        </w:rPr>
+        <w:t>handleSubmit()</w:t>
+      </w:r>
+      <w:r>
+        <w:t xml:space="preserve"> của lớp LoginPage được gọi.</w:t>
+      </w:r>
+    </w:p>
+    <w:p>
+      <w:pPr/>
+      <w:r>
+        <w:t xml:space="preserve">6. Phương thức </w:t>
+      </w:r>
+      <w:r>
+        <w:rPr>
+          <w:rFonts w:ascii="Courier New" w:hAnsi="Courier New"/>
+          <w:sz w:val="20"/>
+        </w:rPr>
+        <w:t>handleSubmit()</w:t>
+      </w:r>
+      <w:r>
+        <w:t xml:space="preserve"> gọi phương thức </w:t>
+      </w:r>
+      <w:r>
+        <w:rPr>
+          <w:rFonts w:ascii="Courier New" w:hAnsi="Courier New"/>
+          <w:sz w:val="20"/>
+        </w:rPr>
+        <w:t>login(sdt: String, matKhau: String): NguoiDung</w:t>
+      </w:r>
+      <w:r>
+        <w:t xml:space="preserve"> của lớp AuthController.</w:t>
+      </w:r>
+    </w:p>
+    <w:p>
+      <w:pPr/>
+      <w:r>
+        <w:t xml:space="preserve">7. Phương thức </w:t>
+      </w:r>
+      <w:r>
+        <w:rPr>
+          <w:rFonts w:ascii="Courier New" w:hAnsi="Courier New"/>
+          <w:sz w:val="20"/>
+        </w:rPr>
+        <w:t>login()</w:t>
+      </w:r>
+      <w:r>
+        <w:t xml:space="preserve"> gọi phương thức </w:t>
+      </w:r>
+      <w:r>
+        <w:rPr>
+          <w:rFonts w:ascii="Courier New" w:hAnsi="Courier New"/>
+          <w:sz w:val="20"/>
+        </w:rPr>
+        <w:t>findBySDT(sdt: String): NguoiDung</w:t>
+      </w:r>
+      <w:r>
+        <w:t xml:space="preserve"> của lớp NguoiDung.</w:t>
+      </w:r>
+    </w:p>
+    <w:p>
+      <w:pPr/>
+      <w:r>
+        <w:t xml:space="preserve">8. Lớp NguoiDung trả về đối tượng NguoiDung cho phương thức </w:t>
+      </w:r>
+      <w:r>
+        <w:rPr>
+          <w:rFonts w:ascii="Courier New" w:hAnsi="Courier New"/>
+          <w:sz w:val="20"/>
+        </w:rPr>
+        <w:t>login()</w:t>
+      </w:r>
+      <w:r>
+        <w:t>.</w:t>
+      </w:r>
+    </w:p>
+    <w:p>
+      <w:pPr/>
+      <w:r>
+        <w:t xml:space="preserve">9. Phương thức </w:t>
+      </w:r>
+      <w:r>
+        <w:rPr>
+          <w:rFonts w:ascii="Courier New" w:hAnsi="Courier New"/>
+          <w:sz w:val="20"/>
+        </w:rPr>
+        <w:t>login()</w:t>
+      </w:r>
+      <w:r>
+        <w:t xml:space="preserve"> gọi </w:t>
+      </w:r>
+      <w:r>
+        <w:rPr>
+          <w:rFonts w:ascii="Courier New" w:hAnsi="Courier New"/>
+          <w:sz w:val="20"/>
+        </w:rPr>
+        <w:t>checkPassword(matKhau: String, hash: String): boolean</w:t>
+      </w:r>
+      <w:r>
+        <w:t xml:space="preserve"> để so sánh mật khẩu.</w:t>
+      </w:r>
+    </w:p>
+    <w:p>
+      <w:pPr/>
+      <w:r>
+        <w:t xml:space="preserve">10. Phương thức </w:t>
+      </w:r>
+      <w:r>
+        <w:rPr>
+          <w:rFonts w:ascii="Courier New" w:hAnsi="Courier New"/>
+          <w:sz w:val="20"/>
+        </w:rPr>
+        <w:t>login()</w:t>
+      </w:r>
+      <w:r>
+        <w:t xml:space="preserve"> trả về đối tượng NguoiDung cho phương thức </w:t>
+      </w:r>
+      <w:r>
+        <w:rPr>
+          <w:rFonts w:ascii="Courier New" w:hAnsi="Courier New"/>
+          <w:sz w:val="20"/>
+        </w:rPr>
+        <w:t>handleSubmit()</w:t>
+      </w:r>
+      <w:r>
+        <w:t>.</w:t>
+      </w:r>
+    </w:p>
+    <w:p>
+      <w:pPr/>
+      <w:r>
+        <w:t xml:space="preserve">11. Phương thức </w:t>
+      </w:r>
+      <w:r>
+        <w:rPr>
+          <w:rFonts w:ascii="Courier New" w:hAnsi="Courier New"/>
+          <w:sz w:val="20"/>
+        </w:rPr>
+        <w:t>handleSubmit()</w:t>
+      </w:r>
+      <w:r>
+        <w:t xml:space="preserve"> gọi </w:t>
+      </w:r>
+      <w:r>
+        <w:rPr>
+          <w:rFonts w:ascii="Courier New" w:hAnsi="Courier New"/>
+          <w:sz w:val="20"/>
+        </w:rPr>
+        <w:t>redirect /home</w:t>
+      </w:r>
+      <w:r>
+        <w:t>, hiển thị "Đăng nhập thành công. Xin chào, Nguyễn Văn A!".</w:t>
+      </w:r>
+    </w:p>
+    <w:p>
+      <w:pPr/>
+      <w:r>
+        <w:rPr>
+          <w:b/>
+        </w:rPr>
+        <w:t>Ngoại lệ: tài khoản không tồn tại</w:t>
+      </w:r>
+    </w:p>
+    <w:p>
+      <w:pPr>
+        <w:pStyle w:val="ListBullet"/>
+      </w:pPr>
+      <w:r>
+        <w:t xml:space="preserve">Phương thức </w:t>
+      </w:r>
+      <w:r>
+        <w:rPr>
+          <w:rFonts w:ascii="Courier New" w:hAnsi="Courier New"/>
+          <w:sz w:val="20"/>
+        </w:rPr>
+        <w:t>findBySDT()</w:t>
+      </w:r>
+      <w:r>
+        <w:t xml:space="preserve"> trả về </w:t>
+      </w:r>
+      <w:r>
+        <w:rPr>
+          <w:rFonts w:ascii="Courier New" w:hAnsi="Courier New"/>
+          <w:sz w:val="20"/>
+        </w:rPr>
+        <w:t>null</w:t>
+      </w:r>
+      <w:r>
+        <w:t>.</w:t>
+      </w:r>
+    </w:p>
+    <w:p>
+      <w:pPr>
+        <w:pStyle w:val="ListBullet"/>
+      </w:pPr>
+      <w:r>
+        <w:t xml:space="preserve">Phương thức </w:t>
+      </w:r>
+      <w:r>
+        <w:rPr>
+          <w:rFonts w:ascii="Courier New" w:hAnsi="Courier New"/>
+          <w:sz w:val="20"/>
+        </w:rPr>
+        <w:t>login()</w:t>
+      </w:r>
+      <w:r>
+        <w:t xml:space="preserve"> trả về </w:t>
+      </w:r>
+      <w:r>
+        <w:rPr>
+          <w:rFonts w:ascii="Courier New" w:hAnsi="Courier New"/>
+          <w:sz w:val="20"/>
+        </w:rPr>
+        <w:t>null</w:t>
+      </w:r>
+      <w:r>
+        <w:t xml:space="preserve"> cho </w:t>
+      </w:r>
+      <w:r>
+        <w:rPr>
+          <w:rFonts w:ascii="Courier New" w:hAnsi="Courier New"/>
+          <w:sz w:val="20"/>
+        </w:rPr>
+        <w:t>handleSubmit()</w:t>
+      </w:r>
+      <w:r>
+        <w:t>.</w:t>
+      </w:r>
+    </w:p>
+    <w:p>
+      <w:pPr>
+        <w:pStyle w:val="ListBullet"/>
+      </w:pPr>
+      <w:r>
+        <w:t>Lớp LoginPage hiển thị "Tài khoản không tồn tại. Vui lòng kiểm tra lại."</w:t>
+      </w:r>
+    </w:p>
+    <w:p>
+      <w:pPr/>
+      <w:r>
+        <w:rPr>
+          <w:b/>
+        </w:rPr>
+        <w:t>Ngoại lệ: mật khẩu sai</w:t>
+      </w:r>
+    </w:p>
+    <w:p>
+      <w:pPr>
+        <w:pStyle w:val="ListBullet"/>
+      </w:pPr>
+      <w:r>
+        <w:t xml:space="preserve">Phương thức </w:t>
+      </w:r>
+      <w:r>
+        <w:rPr>
+          <w:rFonts w:ascii="Courier New" w:hAnsi="Courier New"/>
+          <w:sz w:val="20"/>
+        </w:rPr>
+        <w:t>checkPassword()</w:t>
+      </w:r>
+      <w:r>
+        <w:t xml:space="preserve"> trả về </w:t>
+      </w:r>
+      <w:r>
+        <w:rPr>
+          <w:rFonts w:ascii="Courier New" w:hAnsi="Courier New"/>
+          <w:sz w:val="20"/>
+        </w:rPr>
+        <w:t>false</w:t>
+      </w:r>
+      <w:r>
+        <w:t>.</w:t>
+      </w:r>
+    </w:p>
+    <w:p>
+      <w:pPr>
+        <w:pStyle w:val="ListBullet"/>
+      </w:pPr>
+      <w:r>
+        <w:t xml:space="preserve">Phương thức </w:t>
+      </w:r>
+      <w:r>
+        <w:rPr>
+          <w:rFonts w:ascii="Courier New" w:hAnsi="Courier New"/>
+          <w:sz w:val="20"/>
+        </w:rPr>
+        <w:t>login()</w:t>
+      </w:r>
+      <w:r>
+        <w:t xml:space="preserve"> trả về </w:t>
+      </w:r>
+      <w:r>
+        <w:rPr>
+          <w:rFonts w:ascii="Courier New" w:hAnsi="Courier New"/>
+          <w:sz w:val="20"/>
+        </w:rPr>
+        <w:t>null</w:t>
+      </w:r>
+      <w:r>
+        <w:t xml:space="preserve"> cho </w:t>
+      </w:r>
+      <w:r>
+        <w:rPr>
+          <w:rFonts w:ascii="Courier New" w:hAnsi="Courier New"/>
+          <w:sz w:val="20"/>
+        </w:rPr>
+        <w:t>handleSubmit()</w:t>
+      </w:r>
+      <w:r>
+        <w:t>.</w:t>
+      </w:r>
+    </w:p>
+    <w:p>
+      <w:pPr>
+        <w:pStyle w:val="ListBullet"/>
+      </w:pPr>
+      <w:r>
+        <w:t>Lớp LoginPage hiển thị "Mật khẩu không chính xác. Còn [N] lần thử."</w:t>
+      </w:r>
+    </w:p>
+    <w:p>
       <w:pPr>
         <w:pStyle w:val="Heading4"/>
       </w:pPr>
@@ -7316,7 +7822,7 @@
         <w:drawing>
           <wp:inline xmlns:a="http://schemas.openxmlformats.org/drawingml/2006/main" xmlns:pic="http://schemas.openxmlformats.org/drawingml/2006/picture">
             <wp:extent cx="5486400" cy="5128591"/>
-            <wp:docPr id="7" name="Picture 7"/>
+            <wp:docPr id="8" name="Picture 8"/>
             <wp:cNvGraphicFramePr>
               <a:graphicFrameLocks noChangeAspect="1"/>
             </wp:cNvGraphicFramePr>
@@ -7328,7 +7834,7 @@
                     <pic:cNvPicPr/>
                   </pic:nvPicPr>
                   <pic:blipFill>
-                    <a:blip r:embed="rId15"/>
+                    <a:blip r:embed="rId16"/>
                     <a:stretch>
                       <a:fillRect/>
                     </a:stretch>
@@ -7354,6 +7860,483 @@
       </w:r>
     </w:p>
     <w:p>
+      <w:pPr/>
+      <w:r>
+        <w:rPr>
+          <w:b/>
+        </w:rPr>
+        <w:t>Kịch bản phiên bản 3 – UC02 Đăng ký</w:t>
+      </w:r>
+    </w:p>
+    <w:p>
+      <w:pPr/>
+      <w:r>
+        <w:t xml:space="preserve">1. Khách hàng click liên kết "Đăng ký" từ trang </w:t>
+      </w:r>
+      <w:r>
+        <w:rPr>
+          <w:rFonts w:ascii="Courier New" w:hAnsi="Courier New"/>
+          <w:sz w:val="20"/>
+        </w:rPr>
+        <w:t>/login</w:t>
+      </w:r>
+      <w:r>
+        <w:t>.</w:t>
+      </w:r>
+    </w:p>
+    <w:p>
+      <w:pPr/>
+      <w:r>
+        <w:t xml:space="preserve">2. Phương thức </w:t>
+      </w:r>
+      <w:r>
+        <w:rPr>
+          <w:rFonts w:ascii="Courier New" w:hAnsi="Courier New"/>
+          <w:sz w:val="20"/>
+        </w:rPr>
+        <w:t>render()</w:t>
+      </w:r>
+      <w:r>
+        <w:t xml:space="preserve"> của lớp RegisterPage được gọi, hiển thị form gồm: Họ tên, SĐT, Email, Mật khẩu, Xác nhận MK.</w:t>
+      </w:r>
+    </w:p>
+    <w:p>
+      <w:pPr/>
+      <w:r>
+        <w:t>3. Khách hàng nhập: Họ tên = "Nguyễn Thị Bình", SĐT = "0987654321", Email = "binh.nt@email.com", MK = "Pass@2025".</w:t>
+      </w:r>
+    </w:p>
+    <w:p>
+      <w:pPr/>
+      <w:r>
+        <w:t>4. Khách hàng click nút [Tiếp tục].</w:t>
+      </w:r>
+    </w:p>
+    <w:p>
+      <w:pPr/>
+      <w:r>
+        <w:t xml:space="preserve">5. Phương thức </w:t>
+      </w:r>
+      <w:r>
+        <w:rPr>
+          <w:rFonts w:ascii="Courier New" w:hAnsi="Courier New"/>
+          <w:sz w:val="20"/>
+        </w:rPr>
+        <w:t>handleSubmit()</w:t>
+      </w:r>
+      <w:r>
+        <w:t xml:space="preserve"> của lớp RegisterPage được gọi.</w:t>
+      </w:r>
+    </w:p>
+    <w:p>
+      <w:pPr/>
+      <w:r>
+        <w:t xml:space="preserve">6. Phương thức </w:t>
+      </w:r>
+      <w:r>
+        <w:rPr>
+          <w:rFonts w:ascii="Courier New" w:hAnsi="Courier New"/>
+          <w:sz w:val="20"/>
+        </w:rPr>
+        <w:t>handleSubmit()</w:t>
+      </w:r>
+      <w:r>
+        <w:t xml:space="preserve"> gọi phương thức </w:t>
+      </w:r>
+      <w:r>
+        <w:rPr>
+          <w:rFonts w:ascii="Courier New" w:hAnsi="Courier New"/>
+          <w:sz w:val="20"/>
+        </w:rPr>
+        <w:t>register(hoTen: String, sdt: String, email: String, matKhau: String): NguoiDung</w:t>
+      </w:r>
+      <w:r>
+        <w:t xml:space="preserve"> của lớp AuthController.</w:t>
+      </w:r>
+    </w:p>
+    <w:p>
+      <w:pPr/>
+      <w:r>
+        <w:t xml:space="preserve">7. Phương thức </w:t>
+      </w:r>
+      <w:r>
+        <w:rPr>
+          <w:rFonts w:ascii="Courier New" w:hAnsi="Courier New"/>
+          <w:sz w:val="20"/>
+        </w:rPr>
+        <w:t>register()</w:t>
+      </w:r>
+      <w:r>
+        <w:t xml:space="preserve"> gọi </w:t>
+      </w:r>
+      <w:r>
+        <w:rPr>
+          <w:rFonts w:ascii="Courier New" w:hAnsi="Courier New"/>
+          <w:sz w:val="20"/>
+        </w:rPr>
+        <w:t>existsBySDT(sdt: String): boolean</w:t>
+      </w:r>
+      <w:r>
+        <w:t xml:space="preserve"> của lớp NguoiDung để kiểm tra SĐT.</w:t>
+      </w:r>
+    </w:p>
+    <w:p>
+      <w:pPr/>
+      <w:r>
+        <w:t xml:space="preserve">8. NguoiDung trả về </w:t>
+      </w:r>
+      <w:r>
+        <w:rPr>
+          <w:rFonts w:ascii="Courier New" w:hAnsi="Courier New"/>
+          <w:sz w:val="20"/>
+        </w:rPr>
+        <w:t>false</w:t>
+      </w:r>
+      <w:r>
+        <w:t xml:space="preserve"> (SĐT chưa tồn tại).</w:t>
+      </w:r>
+    </w:p>
+    <w:p>
+      <w:pPr/>
+      <w:r>
+        <w:t xml:space="preserve">9. Phương thức </w:t>
+      </w:r>
+      <w:r>
+        <w:rPr>
+          <w:rFonts w:ascii="Courier New" w:hAnsi="Courier New"/>
+          <w:sz w:val="20"/>
+        </w:rPr>
+        <w:t>register()</w:t>
+      </w:r>
+      <w:r>
+        <w:t xml:space="preserve"> gọi </w:t>
+      </w:r>
+      <w:r>
+        <w:rPr>
+          <w:rFonts w:ascii="Courier New" w:hAnsi="Courier New"/>
+          <w:sz w:val="20"/>
+        </w:rPr>
+        <w:t>existsByEmail(email: String): boolean</w:t>
+      </w:r>
+      <w:r>
+        <w:t xml:space="preserve"> của lớp NguoiDung để kiểm tra email.</w:t>
+      </w:r>
+    </w:p>
+    <w:p>
+      <w:pPr/>
+      <w:r>
+        <w:t xml:space="preserve">10. NguoiDung trả về </w:t>
+      </w:r>
+      <w:r>
+        <w:rPr>
+          <w:rFonts w:ascii="Courier New" w:hAnsi="Courier New"/>
+          <w:sz w:val="20"/>
+        </w:rPr>
+        <w:t>false</w:t>
+      </w:r>
+      <w:r>
+        <w:t xml:space="preserve"> (email chưa tồn tại).</w:t>
+      </w:r>
+    </w:p>
+    <w:p>
+      <w:pPr/>
+      <w:r>
+        <w:t xml:space="preserve">11. Phương thức </w:t>
+      </w:r>
+      <w:r>
+        <w:rPr>
+          <w:rFonts w:ascii="Courier New" w:hAnsi="Courier New"/>
+          <w:sz w:val="20"/>
+        </w:rPr>
+        <w:t>register()</w:t>
+      </w:r>
+      <w:r>
+        <w:t xml:space="preserve"> gọi </w:t>
+      </w:r>
+      <w:r>
+        <w:rPr>
+          <w:rFonts w:ascii="Courier New" w:hAnsi="Courier New"/>
+          <w:sz w:val="20"/>
+        </w:rPr>
+        <w:t>save(): NguoiDung</w:t>
+      </w:r>
+      <w:r>
+        <w:t xml:space="preserve"> để tạo tài khoản mới.</w:t>
+      </w:r>
+    </w:p>
+    <w:p>
+      <w:pPr/>
+      <w:r>
+        <w:t xml:space="preserve">12. Phương thức </w:t>
+      </w:r>
+      <w:r>
+        <w:rPr>
+          <w:rFonts w:ascii="Courier New" w:hAnsi="Courier New"/>
+          <w:sz w:val="20"/>
+        </w:rPr>
+        <w:t>register()</w:t>
+      </w:r>
+      <w:r>
+        <w:t xml:space="preserve"> gọi </w:t>
+      </w:r>
+      <w:r>
+        <w:rPr>
+          <w:rFonts w:ascii="Courier New" w:hAnsi="Courier New"/>
+          <w:sz w:val="20"/>
+        </w:rPr>
+        <w:t>sendOTP(sdt: String, loai: String): void</w:t>
+      </w:r>
+      <w:r>
+        <w:t xml:space="preserve"> của lớp OTP.</w:t>
+      </w:r>
+    </w:p>
+    <w:p>
+      <w:pPr/>
+      <w:r>
+        <w:t>13. OTP gửi mã OTP 6 chữ số đến SĐT.</w:t>
+      </w:r>
+    </w:p>
+    <w:p>
+      <w:pPr/>
+      <w:r>
+        <w:t xml:space="preserve">14. Phương thức </w:t>
+      </w:r>
+      <w:r>
+        <w:rPr>
+          <w:rFonts w:ascii="Courier New" w:hAnsi="Courier New"/>
+          <w:sz w:val="20"/>
+        </w:rPr>
+        <w:t>register()</w:t>
+      </w:r>
+      <w:r>
+        <w:t xml:space="preserve"> trả về đối tượng NguoiDung cho </w:t>
+      </w:r>
+      <w:r>
+        <w:rPr>
+          <w:rFonts w:ascii="Courier New" w:hAnsi="Courier New"/>
+          <w:sz w:val="20"/>
+        </w:rPr>
+        <w:t>handleSubmit()</w:t>
+      </w:r>
+      <w:r>
+        <w:t>.</w:t>
+      </w:r>
+    </w:p>
+    <w:p>
+      <w:pPr/>
+      <w:r>
+        <w:t>15. RegisterPage hiển thị trang OTPVerifyPage.</w:t>
+      </w:r>
+    </w:p>
+    <w:p>
+      <w:pPr/>
+      <w:r>
+        <w:t>16. Khách hàng nhập OTP = "482917" và click [Xác nhận].</w:t>
+      </w:r>
+    </w:p>
+    <w:p>
+      <w:pPr/>
+      <w:r>
+        <w:t xml:space="preserve">17. Phương thức </w:t>
+      </w:r>
+      <w:r>
+        <w:rPr>
+          <w:rFonts w:ascii="Courier New" w:hAnsi="Courier New"/>
+          <w:sz w:val="20"/>
+        </w:rPr>
+        <w:t>handleSubmit()</w:t>
+      </w:r>
+      <w:r>
+        <w:t xml:space="preserve"> của lớp OTPVerifyPage được gọi.</w:t>
+      </w:r>
+    </w:p>
+    <w:p>
+      <w:pPr/>
+      <w:r>
+        <w:t xml:space="preserve">18. OTPVerifyPage gọi </w:t>
+      </w:r>
+      <w:r>
+        <w:rPr>
+          <w:rFonts w:ascii="Courier New" w:hAnsi="Courier New"/>
+          <w:sz w:val="20"/>
+        </w:rPr>
+        <w:t>verifyOTP(otp: String): boolean</w:t>
+      </w:r>
+      <w:r>
+        <w:t xml:space="preserve"> của AuthController.</w:t>
+      </w:r>
+    </w:p>
+    <w:p>
+      <w:pPr/>
+      <w:r>
+        <w:t xml:space="preserve">19. AuthController gọi </w:t>
+      </w:r>
+      <w:r>
+        <w:rPr>
+          <w:rFonts w:ascii="Courier New" w:hAnsi="Courier New"/>
+          <w:sz w:val="20"/>
+        </w:rPr>
+        <w:t>verify(otp: String): boolean</w:t>
+      </w:r>
+      <w:r>
+        <w:t xml:space="preserve"> của lớp OTP.</w:t>
+      </w:r>
+    </w:p>
+    <w:p>
+      <w:pPr/>
+      <w:r>
+        <w:t xml:space="preserve">20. OTP trả về </w:t>
+      </w:r>
+      <w:r>
+        <w:rPr>
+          <w:rFonts w:ascii="Courier New" w:hAnsi="Courier New"/>
+          <w:sz w:val="20"/>
+        </w:rPr>
+        <w:t>true</w:t>
+      </w:r>
+      <w:r>
+        <w:t>.</w:t>
+      </w:r>
+    </w:p>
+    <w:p>
+      <w:pPr/>
+      <w:r>
+        <w:t xml:space="preserve">21. AuthController trả về </w:t>
+      </w:r>
+      <w:r>
+        <w:rPr>
+          <w:rFonts w:ascii="Courier New" w:hAnsi="Courier New"/>
+          <w:sz w:val="20"/>
+        </w:rPr>
+        <w:t>true</w:t>
+      </w:r>
+      <w:r>
+        <w:t xml:space="preserve"> cho OTPVerifyPage.</w:t>
+      </w:r>
+    </w:p>
+    <w:p>
+      <w:pPr/>
+      <w:r>
+        <w:t>22. OTPVerifyPage hiển thị "Đăng ký thành công! Chào mừng Nguyễn Thị Bình."</w:t>
+      </w:r>
+    </w:p>
+    <w:p>
+      <w:pPr/>
+      <w:r>
+        <w:rPr>
+          <w:b/>
+        </w:rPr>
+        <w:t>Ngoại lệ: SĐT đã tồn tại</w:t>
+      </w:r>
+    </w:p>
+    <w:p>
+      <w:pPr>
+        <w:pStyle w:val="ListBullet"/>
+      </w:pPr>
+      <w:r>
+        <w:t xml:space="preserve">Phương thức </w:t>
+      </w:r>
+      <w:r>
+        <w:rPr>
+          <w:rFonts w:ascii="Courier New" w:hAnsi="Courier New"/>
+          <w:sz w:val="20"/>
+        </w:rPr>
+        <w:t>existsBySDT()</w:t>
+      </w:r>
+      <w:r>
+        <w:t xml:space="preserve"> trả về </w:t>
+      </w:r>
+      <w:r>
+        <w:rPr>
+          <w:rFonts w:ascii="Courier New" w:hAnsi="Courier New"/>
+          <w:sz w:val="20"/>
+        </w:rPr>
+        <w:t>true</w:t>
+      </w:r>
+      <w:r>
+        <w:t>.</w:t>
+      </w:r>
+    </w:p>
+    <w:p>
+      <w:pPr>
+        <w:pStyle w:val="ListBullet"/>
+      </w:pPr>
+      <w:r>
+        <w:t>AuthController trả về lỗi cho RegisterPage.</w:t>
+      </w:r>
+    </w:p>
+    <w:p>
+      <w:pPr>
+        <w:pStyle w:val="ListBullet"/>
+      </w:pPr>
+      <w:r>
+        <w:t>RegisterPage hiển thị "SĐT này đã được sử dụng."</w:t>
+      </w:r>
+    </w:p>
+    <w:p>
+      <w:pPr/>
+      <w:r>
+        <w:rPr>
+          <w:b/>
+        </w:rPr>
+        <w:t>Ngoại lệ: OTP sai</w:t>
+      </w:r>
+    </w:p>
+    <w:p>
+      <w:pPr>
+        <w:pStyle w:val="ListBullet"/>
+      </w:pPr>
+      <w:r>
+        <w:t xml:space="preserve">Phương thức </w:t>
+      </w:r>
+      <w:r>
+        <w:rPr>
+          <w:rFonts w:ascii="Courier New" w:hAnsi="Courier New"/>
+          <w:sz w:val="20"/>
+        </w:rPr>
+        <w:t>verify()</w:t>
+      </w:r>
+      <w:r>
+        <w:t xml:space="preserve"> trả về </w:t>
+      </w:r>
+      <w:r>
+        <w:rPr>
+          <w:rFonts w:ascii="Courier New" w:hAnsi="Courier New"/>
+          <w:sz w:val="20"/>
+        </w:rPr>
+        <w:t>false</w:t>
+      </w:r>
+      <w:r>
+        <w:t>.</w:t>
+      </w:r>
+    </w:p>
+    <w:p>
+      <w:pPr>
+        <w:pStyle w:val="ListBullet"/>
+      </w:pPr>
+      <w:r>
+        <w:t xml:space="preserve">AuthController trả về </w:t>
+      </w:r>
+      <w:r>
+        <w:rPr>
+          <w:rFonts w:ascii="Courier New" w:hAnsi="Courier New"/>
+          <w:sz w:val="20"/>
+        </w:rPr>
+        <w:t>false</w:t>
+      </w:r>
+      <w:r>
+        <w:t xml:space="preserve"> cho OTPVerifyPage.</w:t>
+      </w:r>
+    </w:p>
+    <w:p>
+      <w:pPr>
+        <w:pStyle w:val="ListBullet"/>
+      </w:pPr>
+      <w:r>
+        <w:t>OTPVerifyPage hiển thị "Mã OTP không đúng. Vui lòng thử lại."</w:t>
+      </w:r>
+    </w:p>
+    <w:p>
       <w:pPr>
         <w:pStyle w:val="Heading4"/>
       </w:pPr>
@@ -7369,7 +8352,7 @@
         <w:drawing>
           <wp:inline xmlns:a="http://schemas.openxmlformats.org/drawingml/2006/main" xmlns:pic="http://schemas.openxmlformats.org/drawingml/2006/picture">
             <wp:extent cx="5486400" cy="3540138"/>
-            <wp:docPr id="8" name="Picture 8"/>
+            <wp:docPr id="9" name="Picture 9"/>
             <wp:cNvGraphicFramePr>
               <a:graphicFrameLocks noChangeAspect="1"/>
             </wp:cNvGraphicFramePr>
@@ -7381,7 +8364,7 @@
                     <pic:cNvPicPr/>
                   </pic:nvPicPr>
                   <pic:blipFill>
-                    <a:blip r:embed="rId16"/>
+                    <a:blip r:embed="rId17"/>
                     <a:stretch>
                       <a:fillRect/>
                     </a:stretch>
@@ -7407,6 +8390,411 @@
       </w:r>
     </w:p>
     <w:p>
+      <w:pPr/>
+      <w:r>
+        <w:rPr>
+          <w:b/>
+        </w:rPr>
+        <w:t>Kịch bản phiên bản 3 – UC03 Đổi mật khẩu</w:t>
+      </w:r>
+    </w:p>
+    <w:p>
+      <w:pPr/>
+      <w:r>
+        <w:t xml:space="preserve">1. Người dùng truy cập URL </w:t>
+      </w:r>
+      <w:r>
+        <w:rPr>
+          <w:rFonts w:ascii="Courier New" w:hAnsi="Courier New"/>
+          <w:sz w:val="20"/>
+        </w:rPr>
+        <w:t>/security</w:t>
+      </w:r>
+      <w:r>
+        <w:t xml:space="preserve"> trên trình duyệt.</w:t>
+      </w:r>
+    </w:p>
+    <w:p>
+      <w:pPr/>
+      <w:r>
+        <w:t xml:space="preserve">2. Phương thức </w:t>
+      </w:r>
+      <w:r>
+        <w:rPr>
+          <w:rFonts w:ascii="Courier New" w:hAnsi="Courier New"/>
+          <w:sz w:val="20"/>
+        </w:rPr>
+        <w:t>render()</w:t>
+      </w:r>
+      <w:r>
+        <w:t xml:space="preserve"> của lớp ChangePasswordPage được gọi, hiển thị form: Mật khẩu hiện tại, Mật khẩu mới, Xác nhận MK mới.</w:t>
+      </w:r>
+    </w:p>
+    <w:p>
+      <w:pPr/>
+      <w:r>
+        <w:t>3. Người dùng nhập: MK hiện tại = "Abc@1234", MK mới = "NewPass@2025", xác nhận = "NewPass@2025".</w:t>
+      </w:r>
+    </w:p>
+    <w:p>
+      <w:pPr/>
+      <w:r>
+        <w:t>4. Người dùng click nút [Lưu thay đổi].</w:t>
+      </w:r>
+    </w:p>
+    <w:p>
+      <w:pPr/>
+      <w:r>
+        <w:t xml:space="preserve">5. Phương thức </w:t>
+      </w:r>
+      <w:r>
+        <w:rPr>
+          <w:rFonts w:ascii="Courier New" w:hAnsi="Courier New"/>
+          <w:sz w:val="20"/>
+        </w:rPr>
+        <w:t>handleSubmit()</w:t>
+      </w:r>
+      <w:r>
+        <w:t xml:space="preserve"> của lớp ChangePasswordPage được gọi.</w:t>
+      </w:r>
+    </w:p>
+    <w:p>
+      <w:pPr/>
+      <w:r>
+        <w:t xml:space="preserve">6. Phương thức </w:t>
+      </w:r>
+      <w:r>
+        <w:rPr>
+          <w:rFonts w:ascii="Courier New" w:hAnsi="Courier New"/>
+          <w:sz w:val="20"/>
+        </w:rPr>
+        <w:t>handleSubmit()</w:t>
+      </w:r>
+      <w:r>
+        <w:t xml:space="preserve"> gọi </w:t>
+      </w:r>
+      <w:r>
+        <w:rPr>
+          <w:rFonts w:ascii="Courier New" w:hAnsi="Courier New"/>
+          <w:sz w:val="20"/>
+        </w:rPr>
+        <w:t>changePassword(mkHienTai: String, mkMoi: String): boolean</w:t>
+      </w:r>
+      <w:r>
+        <w:t xml:space="preserve"> của AuthController.</w:t>
+      </w:r>
+    </w:p>
+    <w:p>
+      <w:pPr/>
+      <w:r>
+        <w:t xml:space="preserve">7. Phương thức </w:t>
+      </w:r>
+      <w:r>
+        <w:rPr>
+          <w:rFonts w:ascii="Courier New" w:hAnsi="Courier New"/>
+          <w:sz w:val="20"/>
+        </w:rPr>
+        <w:t>changePassword()</w:t>
+      </w:r>
+      <w:r>
+        <w:t xml:space="preserve"> gọi </w:t>
+      </w:r>
+      <w:r>
+        <w:rPr>
+          <w:rFonts w:ascii="Courier New" w:hAnsi="Courier New"/>
+          <w:sz w:val="20"/>
+        </w:rPr>
+        <w:t>findById(userId: int): NguoiDung</w:t>
+      </w:r>
+      <w:r>
+        <w:t xml:space="preserve"> của lớp NguoiDung.</w:t>
+      </w:r>
+    </w:p>
+    <w:p>
+      <w:pPr/>
+      <w:r>
+        <w:t xml:space="preserve">8. NguoiDung trả về đối tượng NguoiDung cho </w:t>
+      </w:r>
+      <w:r>
+        <w:rPr>
+          <w:rFonts w:ascii="Courier New" w:hAnsi="Courier New"/>
+          <w:sz w:val="20"/>
+        </w:rPr>
+        <w:t>changePassword()</w:t>
+      </w:r>
+      <w:r>
+        <w:t>.</w:t>
+      </w:r>
+    </w:p>
+    <w:p>
+      <w:pPr/>
+      <w:r>
+        <w:t xml:space="preserve">9. Phương thức </w:t>
+      </w:r>
+      <w:r>
+        <w:rPr>
+          <w:rFonts w:ascii="Courier New" w:hAnsi="Courier New"/>
+          <w:sz w:val="20"/>
+        </w:rPr>
+        <w:t>changePassword()</w:t>
+      </w:r>
+      <w:r>
+        <w:t xml:space="preserve"> gọi </w:t>
+      </w:r>
+      <w:r>
+        <w:rPr>
+          <w:rFonts w:ascii="Courier New" w:hAnsi="Courier New"/>
+          <w:sz w:val="20"/>
+        </w:rPr>
+        <w:t>checkPassword(mkHienTai: String, hash: String): boolean</w:t>
+      </w:r>
+      <w:r>
+        <w:t xml:space="preserve"> để xác minh MK hiện tại.</w:t>
+      </w:r>
+    </w:p>
+    <w:p>
+      <w:pPr/>
+      <w:r>
+        <w:t xml:space="preserve">10. Phương thức </w:t>
+      </w:r>
+      <w:r>
+        <w:rPr>
+          <w:rFonts w:ascii="Courier New" w:hAnsi="Courier New"/>
+          <w:sz w:val="20"/>
+        </w:rPr>
+        <w:t>changePassword()</w:t>
+      </w:r>
+      <w:r>
+        <w:t xml:space="preserve"> gọi </w:t>
+      </w:r>
+      <w:r>
+        <w:rPr>
+          <w:rFonts w:ascii="Courier New" w:hAnsi="Courier New"/>
+          <w:sz w:val="20"/>
+        </w:rPr>
+        <w:t>hashPassword(mkMoi: String): String</w:t>
+      </w:r>
+      <w:r>
+        <w:t xml:space="preserve"> để mã hóa MK mới.</w:t>
+      </w:r>
+    </w:p>
+    <w:p>
+      <w:pPr/>
+      <w:r>
+        <w:t xml:space="preserve">11. Phương thức </w:t>
+      </w:r>
+      <w:r>
+        <w:rPr>
+          <w:rFonts w:ascii="Courier New" w:hAnsi="Courier New"/>
+          <w:sz w:val="20"/>
+        </w:rPr>
+        <w:t>changePassword()</w:t>
+      </w:r>
+      <w:r>
+        <w:t xml:space="preserve"> gọi </w:t>
+      </w:r>
+      <w:r>
+        <w:rPr>
+          <w:rFonts w:ascii="Courier New" w:hAnsi="Courier New"/>
+          <w:sz w:val="20"/>
+        </w:rPr>
+        <w:t>updatePassword(hash: String): boolean</w:t>
+      </w:r>
+      <w:r>
+        <w:t xml:space="preserve"> của lớp NguoiDung.</w:t>
+      </w:r>
+    </w:p>
+    <w:p>
+      <w:pPr/>
+      <w:r>
+        <w:t xml:space="preserve">12. NguoiDung trả về </w:t>
+      </w:r>
+      <w:r>
+        <w:rPr>
+          <w:rFonts w:ascii="Courier New" w:hAnsi="Courier New"/>
+          <w:sz w:val="20"/>
+        </w:rPr>
+        <w:t>true</w:t>
+      </w:r>
+      <w:r>
+        <w:t>.</w:t>
+      </w:r>
+    </w:p>
+    <w:p>
+      <w:pPr/>
+      <w:r>
+        <w:t xml:space="preserve">13. Phương thức </w:t>
+      </w:r>
+      <w:r>
+        <w:rPr>
+          <w:rFonts w:ascii="Courier New" w:hAnsi="Courier New"/>
+          <w:sz w:val="20"/>
+        </w:rPr>
+        <w:t>changePassword()</w:t>
+      </w:r>
+      <w:r>
+        <w:t xml:space="preserve"> gọi </w:t>
+      </w:r>
+      <w:r>
+        <w:rPr>
+          <w:rFonts w:ascii="Courier New" w:hAnsi="Courier New"/>
+          <w:sz w:val="20"/>
+        </w:rPr>
+        <w:t>revokeAllSessions(): void</w:t>
+      </w:r>
+      <w:r>
+        <w:t xml:space="preserve"> để thu hồi tất cả session.</w:t>
+      </w:r>
+    </w:p>
+    <w:p>
+      <w:pPr/>
+      <w:r>
+        <w:t xml:space="preserve">14. Phương thức </w:t>
+      </w:r>
+      <w:r>
+        <w:rPr>
+          <w:rFonts w:ascii="Courier New" w:hAnsi="Courier New"/>
+          <w:sz w:val="20"/>
+        </w:rPr>
+        <w:t>changePassword()</w:t>
+      </w:r>
+      <w:r>
+        <w:t xml:space="preserve"> trả về </w:t>
+      </w:r>
+      <w:r>
+        <w:rPr>
+          <w:rFonts w:ascii="Courier New" w:hAnsi="Courier New"/>
+          <w:sz w:val="20"/>
+        </w:rPr>
+        <w:t>true</w:t>
+      </w:r>
+      <w:r>
+        <w:t xml:space="preserve"> cho </w:t>
+      </w:r>
+      <w:r>
+        <w:rPr>
+          <w:rFonts w:ascii="Courier New" w:hAnsi="Courier New"/>
+          <w:sz w:val="20"/>
+        </w:rPr>
+        <w:t>handleSubmit()</w:t>
+      </w:r>
+      <w:r>
+        <w:t>.</w:t>
+      </w:r>
+    </w:p>
+    <w:p>
+      <w:pPr/>
+      <w:r>
+        <w:t>15. ChangePasswordPage hiển thị "Đổi mật khẩu thành công. Vui lòng đăng nhập lại."</w:t>
+      </w:r>
+    </w:p>
+    <w:p>
+      <w:pPr/>
+      <w:r>
+        <w:rPr>
+          <w:b/>
+        </w:rPr>
+        <w:t>Ngoại lệ: MK hiện tại sai</w:t>
+      </w:r>
+    </w:p>
+    <w:p>
+      <w:pPr>
+        <w:pStyle w:val="ListBullet"/>
+      </w:pPr>
+      <w:r>
+        <w:t xml:space="preserve">Phương thức </w:t>
+      </w:r>
+      <w:r>
+        <w:rPr>
+          <w:rFonts w:ascii="Courier New" w:hAnsi="Courier New"/>
+          <w:sz w:val="20"/>
+        </w:rPr>
+        <w:t>checkPassword()</w:t>
+      </w:r>
+      <w:r>
+        <w:t xml:space="preserve"> trả về </w:t>
+      </w:r>
+      <w:r>
+        <w:rPr>
+          <w:rFonts w:ascii="Courier New" w:hAnsi="Courier New"/>
+          <w:sz w:val="20"/>
+        </w:rPr>
+        <w:t>false</w:t>
+      </w:r>
+      <w:r>
+        <w:t>.</w:t>
+      </w:r>
+    </w:p>
+    <w:p>
+      <w:pPr>
+        <w:pStyle w:val="ListBullet"/>
+      </w:pPr>
+      <w:r>
+        <w:t xml:space="preserve">AuthController trả về </w:t>
+      </w:r>
+      <w:r>
+        <w:rPr>
+          <w:rFonts w:ascii="Courier New" w:hAnsi="Courier New"/>
+          <w:sz w:val="20"/>
+        </w:rPr>
+        <w:t>false</w:t>
+      </w:r>
+      <w:r>
+        <w:t xml:space="preserve"> cho ChangePasswordPage.</w:t>
+      </w:r>
+    </w:p>
+    <w:p>
+      <w:pPr>
+        <w:pStyle w:val="ListBullet"/>
+      </w:pPr>
+      <w:r>
+        <w:t>ChangePasswordPage hiển thị "Mật khẩu hiện tại không chính xác."</w:t>
+      </w:r>
+    </w:p>
+    <w:p>
+      <w:pPr/>
+      <w:r>
+        <w:rPr>
+          <w:b/>
+        </w:rPr>
+        <w:t>Ngoại lệ: MK mới trùng MK cũ</w:t>
+      </w:r>
+    </w:p>
+    <w:p>
+      <w:pPr>
+        <w:pStyle w:val="ListBullet"/>
+      </w:pPr>
+      <w:r>
+        <w:t xml:space="preserve">Phương thức </w:t>
+      </w:r>
+      <w:r>
+        <w:rPr>
+          <w:rFonts w:ascii="Courier New" w:hAnsi="Courier New"/>
+          <w:sz w:val="20"/>
+        </w:rPr>
+        <w:t>changePassword()</w:t>
+      </w:r>
+      <w:r>
+        <w:t xml:space="preserve"> kiểm tra mkMoi ≠ mkHienTai.</w:t>
+      </w:r>
+    </w:p>
+    <w:p>
+      <w:pPr>
+        <w:pStyle w:val="ListBullet"/>
+      </w:pPr>
+      <w:r>
+        <w:t>AuthController trả về lỗi cho ChangePasswordPage.</w:t>
+      </w:r>
+    </w:p>
+    <w:p>
+      <w:pPr>
+        <w:pStyle w:val="ListBullet"/>
+      </w:pPr>
+      <w:r>
+        <w:t>ChangePasswordPage hiển thị "Mật khẩu mới không được trùng mật khẩu hiện tại."</w:t>
+      </w:r>
+    </w:p>
+    <w:p>
       <w:pPr>
         <w:pStyle w:val="Heading4"/>
       </w:pPr>
@@ -7422,7 +8810,7 @@
         <w:drawing>
           <wp:inline xmlns:a="http://schemas.openxmlformats.org/drawingml/2006/main" xmlns:pic="http://schemas.openxmlformats.org/drawingml/2006/picture">
             <wp:extent cx="5486400" cy="3694922"/>
-            <wp:docPr id="9" name="Picture 9"/>
+            <wp:docPr id="10" name="Picture 10"/>
             <wp:cNvGraphicFramePr>
               <a:graphicFrameLocks noChangeAspect="1"/>
             </wp:cNvGraphicFramePr>
@@ -7434,7 +8822,7 @@
                     <pic:cNvPicPr/>
                   </pic:nvPicPr>
                   <pic:blipFill>
-                    <a:blip r:embed="rId17"/>
+                    <a:blip r:embed="rId18"/>
                     <a:stretch>
                       <a:fillRect/>
                     </a:stretch>
@@ -7460,6 +8848,244 @@
       </w:r>
     </w:p>
     <w:p>
+      <w:pPr/>
+      <w:r>
+        <w:rPr>
+          <w:b/>
+        </w:rPr>
+        <w:t>Kịch bản phiên bản 3 – UC04 Quản lý TTCN</w:t>
+      </w:r>
+    </w:p>
+    <w:p>
+      <w:pPr/>
+      <w:r>
+        <w:t>1. Khách hàng click vào avatar / tên tài khoản ở góc trên phải.</w:t>
+      </w:r>
+    </w:p>
+    <w:p>
+      <w:pPr/>
+      <w:r>
+        <w:t xml:space="preserve">2. Phương thức </w:t>
+      </w:r>
+      <w:r>
+        <w:rPr>
+          <w:rFonts w:ascii="Courier New" w:hAnsi="Courier New"/>
+          <w:sz w:val="20"/>
+        </w:rPr>
+        <w:t>loadProfile()</w:t>
+      </w:r>
+      <w:r>
+        <w:t xml:space="preserve"> của lớp ProfilePage được gọi.</w:t>
+      </w:r>
+    </w:p>
+    <w:p>
+      <w:pPr/>
+      <w:r>
+        <w:t xml:space="preserve">3. ProfilePage gọi </w:t>
+      </w:r>
+      <w:r>
+        <w:rPr>
+          <w:rFonts w:ascii="Courier New" w:hAnsi="Courier New"/>
+          <w:sz w:val="20"/>
+        </w:rPr>
+        <w:t>getProfile(userId: int): NguoiDung</w:t>
+      </w:r>
+      <w:r>
+        <w:t xml:space="preserve"> của ProfileController.</w:t>
+      </w:r>
+    </w:p>
+    <w:p>
+      <w:pPr/>
+      <w:r>
+        <w:t xml:space="preserve">4. ProfileController gọi </w:t>
+      </w:r>
+      <w:r>
+        <w:rPr>
+          <w:rFonts w:ascii="Courier New" w:hAnsi="Courier New"/>
+          <w:sz w:val="20"/>
+        </w:rPr>
+        <w:t>findById(userId: int): NguoiDung</w:t>
+      </w:r>
+      <w:r>
+        <w:t xml:space="preserve"> của lớp NguoiDung.</w:t>
+      </w:r>
+    </w:p>
+    <w:p>
+      <w:pPr/>
+      <w:r>
+        <w:t>5. NguoiDung trả về đối tượng NguoiDung cho ProfileController.</w:t>
+      </w:r>
+    </w:p>
+    <w:p>
+      <w:pPr/>
+      <w:r>
+        <w:t>6. ProfileController trả về đối tượng NguoiDung cho ProfilePage.</w:t>
+      </w:r>
+    </w:p>
+    <w:p>
+      <w:pPr/>
+      <w:r>
+        <w:t>7. ProfilePage render hồ sơ: Họ tên, SĐT, Email, Hạng hội viên, Điểm tích lũy, Ngày tham gia.</w:t>
+      </w:r>
+    </w:p>
+    <w:p>
+      <w:pPr/>
+      <w:r>
+        <w:t>8. Khách hàng click [Chỉnh sửa], sửa Họ tên = "Nguyễn Văn An", Email = "vanan@newemail.com", click [Lưu].</w:t>
+      </w:r>
+    </w:p>
+    <w:p>
+      <w:pPr/>
+      <w:r>
+        <w:t xml:space="preserve">9. Phương thức </w:t>
+      </w:r>
+      <w:r>
+        <w:rPr>
+          <w:rFonts w:ascii="Courier New" w:hAnsi="Courier New"/>
+          <w:sz w:val="20"/>
+        </w:rPr>
+        <w:t>handleSave()</w:t>
+      </w:r>
+      <w:r>
+        <w:t xml:space="preserve"> của lớp ProfilePage được gọi.</w:t>
+      </w:r>
+    </w:p>
+    <w:p>
+      <w:pPr/>
+      <w:r>
+        <w:t xml:space="preserve">10. ProfilePage gọi </w:t>
+      </w:r>
+      <w:r>
+        <w:rPr>
+          <w:rFonts w:ascii="Courier New" w:hAnsi="Courier New"/>
+          <w:sz w:val="20"/>
+        </w:rPr>
+        <w:t>updateProfile(userId: int, hoTen: String, email: String): NguoiDung</w:t>
+      </w:r>
+      <w:r>
+        <w:t xml:space="preserve"> của ProfileController.</w:t>
+      </w:r>
+    </w:p>
+    <w:p>
+      <w:pPr/>
+      <w:r>
+        <w:t xml:space="preserve">11. ProfileController gọi </w:t>
+      </w:r>
+      <w:r>
+        <w:rPr>
+          <w:rFonts w:ascii="Courier New" w:hAnsi="Courier New"/>
+          <w:sz w:val="20"/>
+        </w:rPr>
+        <w:t>checkEmail(email: String): boolean</w:t>
+      </w:r>
+      <w:r>
+        <w:t xml:space="preserve"> của lớp NguoiDung.</w:t>
+      </w:r>
+    </w:p>
+    <w:p>
+      <w:pPr/>
+      <w:r>
+        <w:t xml:space="preserve">12. NguoiDung trả về </w:t>
+      </w:r>
+      <w:r>
+        <w:rPr>
+          <w:rFonts w:ascii="Courier New" w:hAnsi="Courier New"/>
+          <w:sz w:val="20"/>
+        </w:rPr>
+        <w:t>true</w:t>
+      </w:r>
+      <w:r>
+        <w:t xml:space="preserve"> (email hợp lệ).</w:t>
+      </w:r>
+    </w:p>
+    <w:p>
+      <w:pPr/>
+      <w:r>
+        <w:t xml:space="preserve">13. ProfileController gọi </w:t>
+      </w:r>
+      <w:r>
+        <w:rPr>
+          <w:rFonts w:ascii="Courier New" w:hAnsi="Courier New"/>
+          <w:sz w:val="20"/>
+        </w:rPr>
+        <w:t>save(): NguoiDung</w:t>
+      </w:r>
+      <w:r>
+        <w:t xml:space="preserve"> để cập nhật.</w:t>
+      </w:r>
+    </w:p>
+    <w:p>
+      <w:pPr/>
+      <w:r>
+        <w:t>14. NguoiDung trả về đối tượng NguoiDung đã cập nhật.</w:t>
+      </w:r>
+    </w:p>
+    <w:p>
+      <w:pPr/>
+      <w:r>
+        <w:t>15. ProfileController trả về NguoiDung cho ProfilePage.</w:t>
+      </w:r>
+    </w:p>
+    <w:p>
+      <w:pPr/>
+      <w:r>
+        <w:t>16. ProfilePage hiển thị "Cập nhật thành công!"</w:t>
+      </w:r>
+    </w:p>
+    <w:p>
+      <w:pPr/>
+      <w:r>
+        <w:rPr>
+          <w:b/>
+        </w:rPr>
+        <w:t>Ngoại lệ: Email đã được dùng</w:t>
+      </w:r>
+    </w:p>
+    <w:p>
+      <w:pPr>
+        <w:pStyle w:val="ListBullet"/>
+      </w:pPr>
+      <w:r>
+        <w:t xml:space="preserve">Phương thức </w:t>
+      </w:r>
+      <w:r>
+        <w:rPr>
+          <w:rFonts w:ascii="Courier New" w:hAnsi="Courier New"/>
+          <w:sz w:val="20"/>
+        </w:rPr>
+        <w:t>checkEmail()</w:t>
+      </w:r>
+      <w:r>
+        <w:t xml:space="preserve"> trả về </w:t>
+      </w:r>
+      <w:r>
+        <w:rPr>
+          <w:rFonts w:ascii="Courier New" w:hAnsi="Courier New"/>
+          <w:sz w:val="20"/>
+        </w:rPr>
+        <w:t>false</w:t>
+      </w:r>
+      <w:r>
+        <w:t>.</w:t>
+      </w:r>
+    </w:p>
+    <w:p>
+      <w:pPr>
+        <w:pStyle w:val="ListBullet"/>
+      </w:pPr>
+      <w:r>
+        <w:t>ProfileController trả về lỗi cho ProfilePage.</w:t>
+      </w:r>
+    </w:p>
+    <w:p>
+      <w:pPr>
+        <w:pStyle w:val="ListBullet"/>
+      </w:pPr>
+      <w:r>
+        <w:t>ProfilePage hiển thị "Email này đã được đăng ký bởi tài khoản khác."</w:t>
+      </w:r>
+    </w:p>
+    <w:p>
       <w:pPr>
         <w:pStyle w:val="Heading4"/>
       </w:pPr>
@@ -7475,7 +9101,7 @@
         <w:drawing>
           <wp:inline xmlns:a="http://schemas.openxmlformats.org/drawingml/2006/main" xmlns:pic="http://schemas.openxmlformats.org/drawingml/2006/picture">
             <wp:extent cx="5486400" cy="3664039"/>
-            <wp:docPr id="10" name="Picture 10"/>
+            <wp:docPr id="11" name="Picture 11"/>
             <wp:cNvGraphicFramePr>
               <a:graphicFrameLocks noChangeAspect="1"/>
             </wp:cNvGraphicFramePr>
@@ -7487,7 +9113,7 @@
                     <pic:cNvPicPr/>
                   </pic:nvPicPr>
                   <pic:blipFill>
-                    <a:blip r:embed="rId18"/>
+                    <a:blip r:embed="rId19"/>
                     <a:stretch>
                       <a:fillRect/>
                     </a:stretch>
@@ -7512,6 +9138,229 @@
         <w:t>&lt;!-- File: output/diagrams/account_seq_staff.png --&gt;</w:t>
       </w:r>
     </w:p>
+    <w:p>
+      <w:pPr/>
+      <w:r>
+        <w:rPr>
+          <w:b/>
+        </w:rPr>
+        <w:t>Kịch bản phiên bản 3 – UC20 Quản lý nhân viên</w:t>
+      </w:r>
+    </w:p>
+    <w:p>
+      <w:pPr/>
+      <w:r>
+        <w:t xml:space="preserve">1. Admin truy cập URL </w:t>
+      </w:r>
+      <w:r>
+        <w:rPr>
+          <w:rFonts w:ascii="Courier New" w:hAnsi="Courier New"/>
+          <w:sz w:val="20"/>
+        </w:rPr>
+        <w:t>/admin/staff</w:t>
+      </w:r>
+      <w:r>
+        <w:t xml:space="preserve"> trên trình duyệt.</w:t>
+      </w:r>
+    </w:p>
+    <w:p>
+      <w:pPr/>
+      <w:r>
+        <w:t xml:space="preserve">2. Phương thức </w:t>
+      </w:r>
+      <w:r>
+        <w:rPr>
+          <w:rFonts w:ascii="Courier New" w:hAnsi="Courier New"/>
+          <w:sz w:val="20"/>
+        </w:rPr>
+        <w:t>loadStaff()</w:t>
+      </w:r>
+      <w:r>
+        <w:t xml:space="preserve"> của lớp StaffManagePage được gọi.</w:t>
+      </w:r>
+    </w:p>
+    <w:p>
+      <w:pPr/>
+      <w:r>
+        <w:t xml:space="preserve">3. StaffManagePage gọi </w:t>
+      </w:r>
+      <w:r>
+        <w:rPr>
+          <w:rFonts w:ascii="Courier New" w:hAnsi="Courier New"/>
+          <w:sz w:val="20"/>
+        </w:rPr>
+        <w:t>getStaffList(): List&lt;NhanVien&gt;</w:t>
+      </w:r>
+      <w:r>
+        <w:t xml:space="preserve"> của StaffController.</w:t>
+      </w:r>
+    </w:p>
+    <w:p>
+      <w:pPr/>
+      <w:r>
+        <w:t xml:space="preserve">4. StaffController gọi </w:t>
+      </w:r>
+      <w:r>
+        <w:rPr>
+          <w:rFonts w:ascii="Courier New" w:hAnsi="Courier New"/>
+          <w:sz w:val="20"/>
+        </w:rPr>
+        <w:t>findAll(): List&lt;NhanVien&gt;</w:t>
+      </w:r>
+      <w:r>
+        <w:t xml:space="preserve"> của lớp NhanVien.</w:t>
+      </w:r>
+    </w:p>
+    <w:p>
+      <w:pPr/>
+      <w:r>
+        <w:t>5. NhanVien trả về danh sách nhân viên cho StaffController.</w:t>
+      </w:r>
+    </w:p>
+    <w:p>
+      <w:pPr/>
+      <w:r>
+        <w:t xml:space="preserve">6. StaffController trả về </w:t>
+      </w:r>
+      <w:r>
+        <w:rPr>
+          <w:rFonts w:ascii="Courier New" w:hAnsi="Courier New"/>
+          <w:sz w:val="20"/>
+        </w:rPr>
+        <w:t>List&lt;NhanVien&gt;</w:t>
+      </w:r>
+      <w:r>
+        <w:t xml:space="preserve"> cho StaffManagePage.</w:t>
+      </w:r>
+    </w:p>
+    <w:p>
+      <w:pPr/>
+      <w:r>
+        <w:t>7. StaffManagePage render bảng nhân viên: họ tên, vai trò, trạng thái.</w:t>
+      </w:r>
+    </w:p>
+    <w:p>
+      <w:pPr/>
+      <w:r>
+        <w:t>8. Admin click [Thêm nhân viên], nhập Họ tên = "Lê Văn C", Vai trò = "Phục vụ", click [Lưu].</w:t>
+      </w:r>
+    </w:p>
+    <w:p>
+      <w:pPr/>
+      <w:r>
+        <w:t xml:space="preserve">9. Phương thức </w:t>
+      </w:r>
+      <w:r>
+        <w:rPr>
+          <w:rFonts w:ascii="Courier New" w:hAnsi="Courier New"/>
+          <w:sz w:val="20"/>
+        </w:rPr>
+        <w:t>handleAdd()</w:t>
+      </w:r>
+      <w:r>
+        <w:t xml:space="preserve"> của lớp StaffManagePage được gọi.</w:t>
+      </w:r>
+    </w:p>
+    <w:p>
+      <w:pPr/>
+      <w:r>
+        <w:t xml:space="preserve">10. StaffManagePage gọi </w:t>
+      </w:r>
+      <w:r>
+        <w:rPr>
+          <w:rFonts w:ascii="Courier New" w:hAnsi="Courier New"/>
+          <w:sz w:val="20"/>
+        </w:rPr>
+        <w:t>addStaff(hoTen: String, vaiTro: String): NhanVien</w:t>
+      </w:r>
+      <w:r>
+        <w:t xml:space="preserve"> của StaffController.</w:t>
+      </w:r>
+    </w:p>
+    <w:p>
+      <w:pPr/>
+      <w:r>
+        <w:t xml:space="preserve">11. StaffController gọi </w:t>
+      </w:r>
+      <w:r>
+        <w:rPr>
+          <w:rFonts w:ascii="Courier New" w:hAnsi="Courier New"/>
+          <w:sz w:val="20"/>
+        </w:rPr>
+        <w:t>save(): NhanVien</w:t>
+      </w:r>
+      <w:r>
+        <w:t xml:space="preserve"> của lớp NhanVien.</w:t>
+      </w:r>
+    </w:p>
+    <w:p>
+      <w:pPr/>
+      <w:r>
+        <w:t>12. NhanVien trả về đối tượng NhanVien vừa tạo.</w:t>
+      </w:r>
+    </w:p>
+    <w:p>
+      <w:pPr/>
+      <w:r>
+        <w:t>13. StaffController trả về NhanVien cho StaffManagePage.</w:t>
+      </w:r>
+    </w:p>
+    <w:p>
+      <w:pPr/>
+      <w:r>
+        <w:t>14. StaffManagePage hiển thị "Thêm nhân viên thành công!"</w:t>
+      </w:r>
+    </w:p>
+    <w:p>
+      <w:pPr/>
+      <w:r>
+        <w:rPr>
+          <w:b/>
+        </w:rPr>
+        <w:t>Ngoại lệ: SĐT đã tồn tại</w:t>
+      </w:r>
+    </w:p>
+    <w:p>
+      <w:pPr>
+        <w:pStyle w:val="ListBullet"/>
+      </w:pPr>
+      <w:r>
+        <w:t>StaffController nhận lỗi từ NhanVien.</w:t>
+      </w:r>
+    </w:p>
+    <w:p>
+      <w:pPr>
+        <w:pStyle w:val="ListBullet"/>
+      </w:pPr>
+      <w:r>
+        <w:t>StaffManagePage hiển thị "SĐT này đã được sử dụng."</w:t>
+      </w:r>
+    </w:p>
+    <w:p>
+      <w:pPr/>
+      <w:r>
+        <w:rPr>
+          <w:b/>
+        </w:rPr>
+        <w:t>Ngoại lệ: Nhân viên đang xử lý order</w:t>
+      </w:r>
+    </w:p>
+    <w:p>
+      <w:pPr>
+        <w:pStyle w:val="ListBullet"/>
+      </w:pPr>
+      <w:r>
+        <w:t>StaffController nhận lỗi từ NhanVien.</w:t>
+      </w:r>
+    </w:p>
+    <w:p>
+      <w:pPr>
+        <w:pStyle w:val="ListBullet"/>
+      </w:pPr>
+      <w:r>
+        <w:t>StaffManagePage hiển thị cảnh báo "Nhân viên đang xử lý order, không thể xóa."</w:t>
+      </w:r>
+    </w:p>
     <w:p/>
     <w:p>
       <w:pPr>
@@ -12107,6 +13956,2301 @@
                 <w:sz w:val="20"/>
               </w:rPr>
               <w:t>"Mật khẩu hiện tại không chính xác."</w:t>
+            </w:r>
+          </w:p>
+        </w:tc>
+      </w:tr>
+    </w:tbl>
+    <w:p>
+      <w:pPr/>
+      <w:r>
+        <w:rPr>
+          <w:b/>
+        </w:rPr>
+        <w:t>Trạng thái CSDL sau:</w:t>
+      </w:r>
+      <w:r>
+        <w:t xml:space="preserve"> Không thay đổi.</w:t>
+      </w:r>
+    </w:p>
+    <w:p>
+      <w:pPr/>
+      <w:r>
+        <w:t>---</w:t>
+      </w:r>
+    </w:p>
+    <w:p>
+      <w:pPr>
+        <w:pStyle w:val="Heading3"/>
+      </w:pPr>
+      <w:r>
+        <w:t>TC03: Mật khẩu sai 5 lần → khóa tài khoản</w:t>
+      </w:r>
+    </w:p>
+    <w:p>
+      <w:pPr/>
+      <w:r>
+        <w:rPr>
+          <w:b/>
+        </w:rPr>
+        <w:t>Trạng thái CSDL trước:</w:t>
+      </w:r>
+    </w:p>
+    <w:p>
+      <w:pPr/>
+      <w:r>
+        <w:t>tblNguoiDung</w:t>
+      </w:r>
+    </w:p>
+    <w:tbl>
+      <w:tblPr>
+        <w:tblStyle w:val="TableGrid"/>
+        <w:tblW w:type="auto" w:w="0"/>
+        <w:tblLook w:firstColumn="1" w:firstRow="1" w:lastColumn="0" w:lastRow="0" w:noHBand="0" w:noVBand="1" w:val="04A0"/>
+      </w:tblPr>
+      <w:tblGrid>
+        <w:gridCol w:w="1440"/>
+        <w:gridCol w:w="1440"/>
+        <w:gridCol w:w="1440"/>
+        <w:gridCol w:w="1440"/>
+        <w:gridCol w:w="1440"/>
+        <w:gridCol w:w="1440"/>
+      </w:tblGrid>
+      <w:tr>
+        <w:tc>
+          <w:tcPr>
+            <w:tcW w:type="dxa" w:w="1440"/>
+            <w:shd w:fill="D9E2F3"/>
+          </w:tcPr>
+          <w:p>
+            <w:pPr/>
+            <w:r/>
+            <w:r>
+              <w:rPr>
+                <w:b/>
+                <w:sz w:val="20"/>
+              </w:rPr>
+              <w:t>ma</w:t>
+            </w:r>
+          </w:p>
+        </w:tc>
+        <w:tc>
+          <w:tcPr>
+            <w:tcW w:type="dxa" w:w="1440"/>
+            <w:shd w:fill="D9E2F3"/>
+          </w:tcPr>
+          <w:p>
+            <w:pPr/>
+            <w:r/>
+            <w:r>
+              <w:rPr>
+                <w:b/>
+                <w:sz w:val="20"/>
+              </w:rPr>
+              <w:t>hoTen</w:t>
+            </w:r>
+          </w:p>
+        </w:tc>
+        <w:tc>
+          <w:tcPr>
+            <w:tcW w:type="dxa" w:w="1440"/>
+            <w:shd w:fill="D9E2F3"/>
+          </w:tcPr>
+          <w:p>
+            <w:pPr/>
+            <w:r/>
+            <w:r>
+              <w:rPr>
+                <w:b/>
+                <w:sz w:val="20"/>
+              </w:rPr>
+              <w:t>soDienThoai</w:t>
+            </w:r>
+          </w:p>
+        </w:tc>
+        <w:tc>
+          <w:tcPr>
+            <w:tcW w:type="dxa" w:w="1440"/>
+            <w:shd w:fill="D9E2F3"/>
+          </w:tcPr>
+          <w:p>
+            <w:pPr/>
+            <w:r/>
+            <w:r>
+              <w:rPr>
+                <w:b/>
+                <w:sz w:val="20"/>
+              </w:rPr>
+              <w:t>matKhau</w:t>
+            </w:r>
+          </w:p>
+        </w:tc>
+        <w:tc>
+          <w:tcPr>
+            <w:tcW w:type="dxa" w:w="1440"/>
+            <w:shd w:fill="D9E2F3"/>
+          </w:tcPr>
+          <w:p>
+            <w:pPr/>
+            <w:r/>
+            <w:r>
+              <w:rPr>
+                <w:b/>
+                <w:sz w:val="20"/>
+              </w:rPr>
+              <w:t>soLanSai</w:t>
+            </w:r>
+          </w:p>
+        </w:tc>
+        <w:tc>
+          <w:tcPr>
+            <w:tcW w:type="dxa" w:w="1440"/>
+            <w:shd w:fill="D9E2F3"/>
+          </w:tcPr>
+          <w:p>
+            <w:pPr/>
+            <w:r/>
+            <w:r>
+              <w:rPr>
+                <w:b/>
+                <w:sz w:val="20"/>
+              </w:rPr>
+              <w:t>thoiGianKhoa</w:t>
+            </w:r>
+          </w:p>
+        </w:tc>
+      </w:tr>
+      <w:tr>
+        <w:tc>
+          <w:tcPr>
+            <w:tcW w:type="dxa" w:w="1440"/>
+          </w:tcPr>
+          <w:p>
+            <w:pPr/>
+            <w:r/>
+            <w:r>
+              <w:rPr>
+                <w:sz w:val="20"/>
+              </w:rPr>
+              <w:t>1</w:t>
+            </w:r>
+          </w:p>
+        </w:tc>
+        <w:tc>
+          <w:tcPr>
+            <w:tcW w:type="dxa" w:w="1440"/>
+          </w:tcPr>
+          <w:p>
+            <w:pPr/>
+            <w:r/>
+            <w:r>
+              <w:rPr>
+                <w:sz w:val="20"/>
+              </w:rPr>
+              <w:t>Nguyễn Văn A</w:t>
+            </w:r>
+          </w:p>
+        </w:tc>
+        <w:tc>
+          <w:tcPr>
+            <w:tcW w:type="dxa" w:w="1440"/>
+          </w:tcPr>
+          <w:p>
+            <w:pPr/>
+            <w:r/>
+            <w:r>
+              <w:rPr>
+                <w:sz w:val="20"/>
+              </w:rPr>
+              <w:t>0912345678</w:t>
+            </w:r>
+          </w:p>
+        </w:tc>
+        <w:tc>
+          <w:tcPr>
+            <w:tcW w:type="dxa" w:w="1440"/>
+          </w:tcPr>
+          <w:p>
+            <w:pPr/>
+            <w:r/>
+            <w:r>
+              <w:rPr>
+                <w:sz w:val="20"/>
+              </w:rPr>
+              <w:t>$2a$10$hashAbc@1234</w:t>
+            </w:r>
+          </w:p>
+        </w:tc>
+        <w:tc>
+          <w:tcPr>
+            <w:tcW w:type="dxa" w:w="1440"/>
+          </w:tcPr>
+          <w:p>
+            <w:pPr/>
+            <w:r/>
+            <w:r>
+              <w:rPr>
+                <w:sz w:val="20"/>
+              </w:rPr>
+              <w:t>0</w:t>
+            </w:r>
+          </w:p>
+        </w:tc>
+        <w:tc>
+          <w:tcPr>
+            <w:tcW w:type="dxa" w:w="1440"/>
+          </w:tcPr>
+          <w:p>
+            <w:pPr/>
+            <w:r/>
+            <w:r>
+              <w:rPr>
+                <w:sz w:val="20"/>
+              </w:rPr>
+              <w:t>null</w:t>
+            </w:r>
+          </w:p>
+        </w:tc>
+      </w:tr>
+    </w:tbl>
+    <w:p>
+      <w:pPr/>
+      <w:r>
+        <w:rPr>
+          <w:b/>
+        </w:rPr>
+        <w:t>Kịch bản thực hiện:</w:t>
+      </w:r>
+    </w:p>
+    <w:tbl>
+      <w:tblPr>
+        <w:tblStyle w:val="TableGrid"/>
+        <w:tblW w:type="auto" w:w="0"/>
+        <w:jc w:val="center"/>
+        <w:tblLook w:firstColumn="1" w:firstRow="1" w:lastColumn="0" w:lastRow="0" w:noHBand="0" w:noVBand="1" w:val="04A0"/>
+      </w:tblPr>
+      <w:tblGrid>
+        <w:gridCol w:w="4320"/>
+        <w:gridCol w:w="4320"/>
+      </w:tblGrid>
+      <w:tr>
+        <w:tc>
+          <w:tcPr>
+            <w:tcW w:type="dxa" w:w="2835"/>
+            <w:shd w:fill="D9E2F3"/>
+          </w:tcPr>
+          <w:p>
+            <w:pPr/>
+            <w:r/>
+            <w:r>
+              <w:rPr>
+                <w:b/>
+                <w:sz w:val="20"/>
+              </w:rPr>
+              <w:t>Kịch bản</w:t>
+            </w:r>
+          </w:p>
+        </w:tc>
+        <w:tc>
+          <w:tcPr>
+            <w:tcW w:type="dxa" w:w="6803"/>
+            <w:shd w:fill="D9E2F3"/>
+          </w:tcPr>
+          <w:p>
+            <w:pPr/>
+            <w:r/>
+            <w:r>
+              <w:rPr>
+                <w:b/>
+                <w:sz w:val="20"/>
+              </w:rPr>
+              <w:t>Kết quả mong đợi</w:t>
+            </w:r>
+          </w:p>
+        </w:tc>
+      </w:tr>
+      <w:tr>
+        <w:tc>
+          <w:tcPr>
+            <w:tcW w:type="dxa" w:w="2835"/>
+          </w:tcPr>
+          <w:p>
+            <w:pPr/>
+            <w:r/>
+            <w:r>
+              <w:rPr>
+                <w:sz w:val="20"/>
+              </w:rPr>
+              <w:t>1. Mở màn hình Đăng nhập</w:t>
+            </w:r>
+          </w:p>
+        </w:tc>
+        <w:tc>
+          <w:tcPr>
+            <w:tcW w:type="dxa" w:w="6803"/>
+          </w:tcPr>
+          <w:p>
+            <w:pPr/>
+            <w:r/>
+            <w:r>
+              <w:rPr>
+                <w:sz w:val="20"/>
+              </w:rPr>
+              <w:t>Hiển thị form</w:t>
+            </w:r>
+          </w:p>
+        </w:tc>
+      </w:tr>
+      <w:tr>
+        <w:tc>
+          <w:tcPr>
+            <w:tcW w:type="dxa" w:w="2835"/>
+          </w:tcPr>
+          <w:p>
+            <w:pPr/>
+            <w:r/>
+            <w:r>
+              <w:rPr>
+                <w:sz w:val="20"/>
+              </w:rPr>
+              <w:t>2. Nhập: 0912345678 / SaiPass1</w:t>
+            </w:r>
+          </w:p>
+        </w:tc>
+        <w:tc>
+          <w:tcPr>
+            <w:tcW w:type="dxa" w:w="6803"/>
+          </w:tcPr>
+          <w:p>
+            <w:pPr/>
+            <w:r/>
+            <w:r>
+              <w:rPr>
+                <w:sz w:val="20"/>
+              </w:rPr>
+              <w:t>Mật khẩu sai, soLanSai = 1</w:t>
+            </w:r>
+          </w:p>
+        </w:tc>
+      </w:tr>
+      <w:tr>
+        <w:tc>
+          <w:tcPr>
+            <w:tcW w:type="dxa" w:w="2835"/>
+          </w:tcPr>
+          <w:p>
+            <w:pPr/>
+            <w:r/>
+            <w:r>
+              <w:rPr>
+                <w:sz w:val="20"/>
+              </w:rPr>
+              <w:t>3. Nhập: 0912345678 / SaiPass2</w:t>
+            </w:r>
+          </w:p>
+        </w:tc>
+        <w:tc>
+          <w:tcPr>
+            <w:tcW w:type="dxa" w:w="6803"/>
+          </w:tcPr>
+          <w:p>
+            <w:pPr/>
+            <w:r/>
+            <w:r>
+              <w:rPr>
+                <w:sz w:val="20"/>
+              </w:rPr>
+              <w:t>Mật khẩu sai, soLanSai = 2</w:t>
+            </w:r>
+          </w:p>
+        </w:tc>
+      </w:tr>
+      <w:tr>
+        <w:tc>
+          <w:tcPr>
+            <w:tcW w:type="dxa" w:w="2835"/>
+          </w:tcPr>
+          <w:p>
+            <w:pPr/>
+            <w:r/>
+            <w:r>
+              <w:rPr>
+                <w:sz w:val="20"/>
+              </w:rPr>
+              <w:t>4. Nhập: 0912345678 / SaiPass3</w:t>
+            </w:r>
+          </w:p>
+        </w:tc>
+        <w:tc>
+          <w:tcPr>
+            <w:tcW w:type="dxa" w:w="6803"/>
+          </w:tcPr>
+          <w:p>
+            <w:pPr/>
+            <w:r/>
+            <w:r>
+              <w:rPr>
+                <w:sz w:val="20"/>
+              </w:rPr>
+              <w:t>Mật khẩu sai, soLanSai = 3</w:t>
+            </w:r>
+          </w:p>
+        </w:tc>
+      </w:tr>
+      <w:tr>
+        <w:tc>
+          <w:tcPr>
+            <w:tcW w:type="dxa" w:w="2835"/>
+          </w:tcPr>
+          <w:p>
+            <w:pPr/>
+            <w:r/>
+            <w:r>
+              <w:rPr>
+                <w:sz w:val="20"/>
+              </w:rPr>
+              <w:t>5. Nhập: 0912345678 / SaiPass4</w:t>
+            </w:r>
+          </w:p>
+        </w:tc>
+        <w:tc>
+          <w:tcPr>
+            <w:tcW w:type="dxa" w:w="6803"/>
+          </w:tcPr>
+          <w:p>
+            <w:pPr/>
+            <w:r/>
+            <w:r>
+              <w:rPr>
+                <w:sz w:val="20"/>
+              </w:rPr>
+              <w:t>Mật khẩu sai, soLanSai = 4</w:t>
+            </w:r>
+          </w:p>
+        </w:tc>
+      </w:tr>
+      <w:tr>
+        <w:tc>
+          <w:tcPr>
+            <w:tcW w:type="dxa" w:w="2835"/>
+          </w:tcPr>
+          <w:p>
+            <w:pPr/>
+            <w:r/>
+            <w:r>
+              <w:rPr>
+                <w:sz w:val="20"/>
+              </w:rPr>
+              <w:t>6. Nhập: 0912345678 / SaiPass5</w:t>
+            </w:r>
+          </w:p>
+        </w:tc>
+        <w:tc>
+          <w:tcPr>
+            <w:tcW w:type="dxa" w:w="6803"/>
+          </w:tcPr>
+          <w:p>
+            <w:pPr/>
+            <w:r/>
+            <w:r>
+              <w:rPr>
+                <w:sz w:val="20"/>
+              </w:rPr>
+              <w:t>Mật khẩu sai, soLanSai = 5 → khóa 15 phút</w:t>
+            </w:r>
+          </w:p>
+        </w:tc>
+      </w:tr>
+      <w:tr>
+        <w:tc>
+          <w:tcPr>
+            <w:tcW w:type="dxa" w:w="2835"/>
+          </w:tcPr>
+          <w:p>
+            <w:pPr/>
+            <w:r/>
+            <w:r>
+              <w:rPr>
+                <w:sz w:val="20"/>
+              </w:rPr>
+              <w:t>7. Nhập: 0912345678 / Abc@1234</w:t>
+            </w:r>
+          </w:p>
+        </w:tc>
+        <w:tc>
+          <w:tcPr>
+            <w:tcW w:type="dxa" w:w="6803"/>
+          </w:tcPr>
+          <w:p>
+            <w:pPr/>
+            <w:r/>
+            <w:r>
+              <w:rPr>
+                <w:sz w:val="20"/>
+              </w:rPr>
+              <w:t>"Tài khoản đã bị khóa. Vui lòng thử lại sau 15 phút."</w:t>
+            </w:r>
+          </w:p>
+        </w:tc>
+      </w:tr>
+    </w:tbl>
+    <w:p>
+      <w:pPr/>
+      <w:r>
+        <w:rPr>
+          <w:b/>
+        </w:rPr>
+        <w:t>Trạng thái CSDL sau:</w:t>
+      </w:r>
+    </w:p>
+    <w:p>
+      <w:pPr/>
+      <w:r>
+        <w:t>tblNguoiDung</w:t>
+      </w:r>
+    </w:p>
+    <w:tbl>
+      <w:tblPr>
+        <w:tblStyle w:val="TableGrid"/>
+        <w:tblW w:type="auto" w:w="0"/>
+        <w:tblLook w:firstColumn="1" w:firstRow="1" w:lastColumn="0" w:lastRow="0" w:noHBand="0" w:noVBand="1" w:val="04A0"/>
+      </w:tblPr>
+      <w:tblGrid>
+        <w:gridCol w:w="1728"/>
+        <w:gridCol w:w="1728"/>
+        <w:gridCol w:w="1728"/>
+        <w:gridCol w:w="1728"/>
+        <w:gridCol w:w="1728"/>
+      </w:tblGrid>
+      <w:tr>
+        <w:tc>
+          <w:tcPr>
+            <w:tcW w:type="dxa" w:w="1728"/>
+            <w:shd w:fill="D9E2F3"/>
+          </w:tcPr>
+          <w:p>
+            <w:pPr/>
+            <w:r/>
+            <w:r>
+              <w:rPr>
+                <w:b/>
+                <w:sz w:val="20"/>
+              </w:rPr>
+              <w:t>ma</w:t>
+            </w:r>
+          </w:p>
+        </w:tc>
+        <w:tc>
+          <w:tcPr>
+            <w:tcW w:type="dxa" w:w="1728"/>
+            <w:shd w:fill="D9E2F3"/>
+          </w:tcPr>
+          <w:p>
+            <w:pPr/>
+            <w:r/>
+            <w:r>
+              <w:rPr>
+                <w:b/>
+                <w:sz w:val="20"/>
+              </w:rPr>
+              <w:t>hoTen</w:t>
+            </w:r>
+          </w:p>
+        </w:tc>
+        <w:tc>
+          <w:tcPr>
+            <w:tcW w:type="dxa" w:w="1728"/>
+            <w:shd w:fill="D9E2F3"/>
+          </w:tcPr>
+          <w:p>
+            <w:pPr/>
+            <w:r/>
+            <w:r>
+              <w:rPr>
+                <w:b/>
+                <w:sz w:val="20"/>
+              </w:rPr>
+              <w:t>soDienThoai</w:t>
+            </w:r>
+          </w:p>
+        </w:tc>
+        <w:tc>
+          <w:tcPr>
+            <w:tcW w:type="dxa" w:w="1728"/>
+            <w:shd w:fill="D9E2F3"/>
+          </w:tcPr>
+          <w:p>
+            <w:pPr/>
+            <w:r/>
+            <w:r>
+              <w:rPr>
+                <w:b/>
+                <w:sz w:val="20"/>
+              </w:rPr>
+              <w:t>soLanSai</w:t>
+            </w:r>
+          </w:p>
+        </w:tc>
+        <w:tc>
+          <w:tcPr>
+            <w:tcW w:type="dxa" w:w="1728"/>
+            <w:shd w:fill="D9E2F3"/>
+          </w:tcPr>
+          <w:p>
+            <w:pPr/>
+            <w:r/>
+            <w:r>
+              <w:rPr>
+                <w:b/>
+                <w:sz w:val="20"/>
+              </w:rPr>
+              <w:t>thoiGianKhoa</w:t>
+            </w:r>
+          </w:p>
+        </w:tc>
+      </w:tr>
+      <w:tr>
+        <w:tc>
+          <w:tcPr>
+            <w:tcW w:type="dxa" w:w="1728"/>
+          </w:tcPr>
+          <w:p>
+            <w:pPr/>
+            <w:r/>
+            <w:r>
+              <w:rPr>
+                <w:sz w:val="20"/>
+              </w:rPr>
+              <w:t>1</w:t>
+            </w:r>
+          </w:p>
+        </w:tc>
+        <w:tc>
+          <w:tcPr>
+            <w:tcW w:type="dxa" w:w="1728"/>
+          </w:tcPr>
+          <w:p>
+            <w:pPr/>
+            <w:r/>
+            <w:r>
+              <w:rPr>
+                <w:sz w:val="20"/>
+              </w:rPr>
+              <w:t>Nguyễn Văn A</w:t>
+            </w:r>
+          </w:p>
+        </w:tc>
+        <w:tc>
+          <w:tcPr>
+            <w:tcW w:type="dxa" w:w="1728"/>
+          </w:tcPr>
+          <w:p>
+            <w:pPr/>
+            <w:r/>
+            <w:r>
+              <w:rPr>
+                <w:sz w:val="20"/>
+              </w:rPr>
+              <w:t>0912345678</w:t>
+            </w:r>
+          </w:p>
+        </w:tc>
+        <w:tc>
+          <w:tcPr>
+            <w:tcW w:type="dxa" w:w="1728"/>
+          </w:tcPr>
+          <w:p>
+            <w:pPr/>
+            <w:r/>
+            <w:r>
+              <w:rPr>
+                <w:b/>
+                <w:sz w:val="20"/>
+              </w:rPr>
+              <w:t>5</w:t>
+            </w:r>
+          </w:p>
+        </w:tc>
+        <w:tc>
+          <w:tcPr>
+            <w:tcW w:type="dxa" w:w="1728"/>
+          </w:tcPr>
+          <w:p>
+            <w:pPr/>
+            <w:r/>
+            <w:r>
+              <w:rPr>
+                <w:b/>
+                <w:sz w:val="20"/>
+              </w:rPr>
+              <w:t>2026-06-01 10:15</w:t>
+            </w:r>
+          </w:p>
+        </w:tc>
+      </w:tr>
+    </w:tbl>
+    <w:p>
+      <w:pPr/>
+      <w:r>
+        <w:t>---</w:t>
+      </w:r>
+    </w:p>
+    <w:p>
+      <w:pPr>
+        <w:pStyle w:val="Heading3"/>
+      </w:pPr>
+      <w:r>
+        <w:t>TC05: SĐT đã tồn tại khi đăng ký</w:t>
+      </w:r>
+    </w:p>
+    <w:p>
+      <w:pPr/>
+      <w:r>
+        <w:rPr>
+          <w:b/>
+        </w:rPr>
+        <w:t>Trạng thái CSDL trước:</w:t>
+      </w:r>
+    </w:p>
+    <w:p>
+      <w:pPr/>
+      <w:r>
+        <w:t>tblNguoiDung</w:t>
+      </w:r>
+    </w:p>
+    <w:tbl>
+      <w:tblPr>
+        <w:tblStyle w:val="TableGrid"/>
+        <w:tblW w:type="auto" w:w="0"/>
+        <w:tblLook w:firstColumn="1" w:firstRow="1" w:lastColumn="0" w:lastRow="0" w:noHBand="0" w:noVBand="1" w:val="04A0"/>
+      </w:tblPr>
+      <w:tblGrid>
+        <w:gridCol w:w="2160"/>
+        <w:gridCol w:w="2160"/>
+        <w:gridCol w:w="2160"/>
+        <w:gridCol w:w="2160"/>
+      </w:tblGrid>
+      <w:tr>
+        <w:tc>
+          <w:tcPr>
+            <w:tcW w:type="dxa" w:w="2160"/>
+            <w:shd w:fill="D9E2F3"/>
+          </w:tcPr>
+          <w:p>
+            <w:pPr/>
+            <w:r/>
+            <w:r>
+              <w:rPr>
+                <w:b/>
+                <w:sz w:val="20"/>
+              </w:rPr>
+              <w:t>ma</w:t>
+            </w:r>
+          </w:p>
+        </w:tc>
+        <w:tc>
+          <w:tcPr>
+            <w:tcW w:type="dxa" w:w="2160"/>
+            <w:shd w:fill="D9E2F3"/>
+          </w:tcPr>
+          <w:p>
+            <w:pPr/>
+            <w:r/>
+            <w:r>
+              <w:rPr>
+                <w:b/>
+                <w:sz w:val="20"/>
+              </w:rPr>
+              <w:t>hoTen</w:t>
+            </w:r>
+          </w:p>
+        </w:tc>
+        <w:tc>
+          <w:tcPr>
+            <w:tcW w:type="dxa" w:w="2160"/>
+            <w:shd w:fill="D9E2F3"/>
+          </w:tcPr>
+          <w:p>
+            <w:pPr/>
+            <w:r/>
+            <w:r>
+              <w:rPr>
+                <w:b/>
+                <w:sz w:val="20"/>
+              </w:rPr>
+              <w:t>soDienThoai</w:t>
+            </w:r>
+          </w:p>
+        </w:tc>
+        <w:tc>
+          <w:tcPr>
+            <w:tcW w:type="dxa" w:w="2160"/>
+            <w:shd w:fill="D9E2F3"/>
+          </w:tcPr>
+          <w:p>
+            <w:pPr/>
+            <w:r/>
+            <w:r>
+              <w:rPr>
+                <w:b/>
+                <w:sz w:val="20"/>
+              </w:rPr>
+              <w:t>email</w:t>
+            </w:r>
+          </w:p>
+        </w:tc>
+      </w:tr>
+      <w:tr>
+        <w:tc>
+          <w:tcPr>
+            <w:tcW w:type="dxa" w:w="2160"/>
+          </w:tcPr>
+          <w:p>
+            <w:pPr/>
+            <w:r/>
+            <w:r>
+              <w:rPr>
+                <w:sz w:val="20"/>
+              </w:rPr>
+              <w:t>1</w:t>
+            </w:r>
+          </w:p>
+        </w:tc>
+        <w:tc>
+          <w:tcPr>
+            <w:tcW w:type="dxa" w:w="2160"/>
+          </w:tcPr>
+          <w:p>
+            <w:pPr/>
+            <w:r/>
+            <w:r>
+              <w:rPr>
+                <w:sz w:val="20"/>
+              </w:rPr>
+              <w:t>Nguyễn Văn A</w:t>
+            </w:r>
+          </w:p>
+        </w:tc>
+        <w:tc>
+          <w:tcPr>
+            <w:tcW w:type="dxa" w:w="2160"/>
+          </w:tcPr>
+          <w:p>
+            <w:pPr/>
+            <w:r/>
+            <w:r>
+              <w:rPr>
+                <w:sz w:val="20"/>
+              </w:rPr>
+              <w:t>0912345678</w:t>
+            </w:r>
+          </w:p>
+        </w:tc>
+        <w:tc>
+          <w:tcPr>
+            <w:tcW w:type="dxa" w:w="2160"/>
+          </w:tcPr>
+          <w:p>
+            <w:pPr/>
+            <w:r/>
+            <w:r>
+              <w:rPr>
+                <w:sz w:val="20"/>
+              </w:rPr>
+              <w:t>vana@email.com</w:t>
+            </w:r>
+          </w:p>
+        </w:tc>
+      </w:tr>
+    </w:tbl>
+    <w:p>
+      <w:pPr/>
+      <w:r>
+        <w:rPr>
+          <w:b/>
+        </w:rPr>
+        <w:t>Kịch bản thực hiện:</w:t>
+      </w:r>
+    </w:p>
+    <w:tbl>
+      <w:tblPr>
+        <w:tblStyle w:val="TableGrid"/>
+        <w:tblW w:type="auto" w:w="0"/>
+        <w:jc w:val="center"/>
+        <w:tblLook w:firstColumn="1" w:firstRow="1" w:lastColumn="0" w:lastRow="0" w:noHBand="0" w:noVBand="1" w:val="04A0"/>
+      </w:tblPr>
+      <w:tblGrid>
+        <w:gridCol w:w="4320"/>
+        <w:gridCol w:w="4320"/>
+      </w:tblGrid>
+      <w:tr>
+        <w:tc>
+          <w:tcPr>
+            <w:tcW w:type="dxa" w:w="2835"/>
+            <w:shd w:fill="D9E2F3"/>
+          </w:tcPr>
+          <w:p>
+            <w:pPr/>
+            <w:r/>
+            <w:r>
+              <w:rPr>
+                <w:b/>
+                <w:sz w:val="20"/>
+              </w:rPr>
+              <w:t>Kịch bản</w:t>
+            </w:r>
+          </w:p>
+        </w:tc>
+        <w:tc>
+          <w:tcPr>
+            <w:tcW w:type="dxa" w:w="6803"/>
+            <w:shd w:fill="D9E2F3"/>
+          </w:tcPr>
+          <w:p>
+            <w:pPr/>
+            <w:r/>
+            <w:r>
+              <w:rPr>
+                <w:b/>
+                <w:sz w:val="20"/>
+              </w:rPr>
+              <w:t>Kết quả mong đợi</w:t>
+            </w:r>
+          </w:p>
+        </w:tc>
+      </w:tr>
+      <w:tr>
+        <w:tc>
+          <w:tcPr>
+            <w:tcW w:type="dxa" w:w="2835"/>
+          </w:tcPr>
+          <w:p>
+            <w:pPr/>
+            <w:r/>
+            <w:r>
+              <w:rPr>
+                <w:sz w:val="20"/>
+              </w:rPr>
+              <w:t>1. Nhấn "Đăng ký"</w:t>
+            </w:r>
+          </w:p>
+        </w:tc>
+        <w:tc>
+          <w:tcPr>
+            <w:tcW w:type="dxa" w:w="6803"/>
+          </w:tcPr>
+          <w:p>
+            <w:pPr/>
+            <w:r/>
+            <w:r>
+              <w:rPr>
+                <w:sz w:val="20"/>
+              </w:rPr>
+              <w:t>Hiển thị form đăng ký</w:t>
+            </w:r>
+          </w:p>
+        </w:tc>
+      </w:tr>
+      <w:tr>
+        <w:tc>
+          <w:tcPr>
+            <w:tcW w:type="dxa" w:w="2835"/>
+          </w:tcPr>
+          <w:p>
+            <w:pPr/>
+            <w:r/>
+            <w:r>
+              <w:rPr>
+                <w:sz w:val="20"/>
+              </w:rPr>
+              <w:t>2. Nhập: Họ tên = "Test", SĐT = "0912345678", Email = "test@email.com", MK = "Pass@2025"</w:t>
+            </w:r>
+          </w:p>
+        </w:tc>
+        <w:tc>
+          <w:tcPr>
+            <w:tcW w:type="dxa" w:w="6803"/>
+          </w:tcPr>
+          <w:p>
+            <w:pPr/>
+            <w:r/>
+            <w:r>
+              <w:rPr>
+                <w:sz w:val="20"/>
+              </w:rPr>
+              <w:t>Form đầy đủ</w:t>
+            </w:r>
+          </w:p>
+        </w:tc>
+      </w:tr>
+      <w:tr>
+        <w:tc>
+          <w:tcPr>
+            <w:tcW w:type="dxa" w:w="2835"/>
+          </w:tcPr>
+          <w:p>
+            <w:pPr/>
+            <w:r/>
+            <w:r>
+              <w:rPr>
+                <w:sz w:val="20"/>
+              </w:rPr>
+              <w:t>3. Nhấn [Tiếp tục]</w:t>
+            </w:r>
+          </w:p>
+        </w:tc>
+        <w:tc>
+          <w:tcPr>
+            <w:tcW w:type="dxa" w:w="6803"/>
+          </w:tcPr>
+          <w:p>
+            <w:pPr/>
+            <w:r/>
+            <w:r>
+              <w:rPr>
+                <w:sz w:val="20"/>
+              </w:rPr>
+              <w:t>Kiểm tra SĐT → đã tồn tại</w:t>
+            </w:r>
+          </w:p>
+        </w:tc>
+      </w:tr>
+      <w:tr>
+        <w:tc>
+          <w:tcPr>
+            <w:tcW w:type="dxa" w:w="2835"/>
+          </w:tcPr>
+          <w:p>
+            <w:pPr/>
+            <w:r/>
+            <w:r>
+              <w:rPr>
+                <w:sz w:val="20"/>
+              </w:rPr>
+              <w:t>4. Hiển thị lỗi</w:t>
+            </w:r>
+          </w:p>
+        </w:tc>
+        <w:tc>
+          <w:tcPr>
+            <w:tcW w:type="dxa" w:w="6803"/>
+          </w:tcPr>
+          <w:p>
+            <w:pPr/>
+            <w:r/>
+            <w:r>
+              <w:rPr>
+                <w:sz w:val="20"/>
+              </w:rPr>
+              <w:t>"SĐT này đã được sử dụng."</w:t>
+            </w:r>
+          </w:p>
+        </w:tc>
+      </w:tr>
+    </w:tbl>
+    <w:p>
+      <w:pPr/>
+      <w:r>
+        <w:rPr>
+          <w:b/>
+        </w:rPr>
+        <w:t>Trạng thái CSDL sau:</w:t>
+      </w:r>
+      <w:r>
+        <w:t xml:space="preserve"> Không thay đổi.</w:t>
+      </w:r>
+    </w:p>
+    <w:p>
+      <w:pPr/>
+      <w:r>
+        <w:t>---</w:t>
+      </w:r>
+    </w:p>
+    <w:p>
+      <w:pPr>
+        <w:pStyle w:val="Heading3"/>
+      </w:pPr>
+      <w:r>
+        <w:t>TC06: OTP sai 3 lần → hủy phiên</w:t>
+      </w:r>
+    </w:p>
+    <w:p>
+      <w:pPr/>
+      <w:r>
+        <w:rPr>
+          <w:b/>
+        </w:rPr>
+        <w:t>Trạng thái CSDL trước:</w:t>
+      </w:r>
+    </w:p>
+    <w:p>
+      <w:pPr/>
+      <w:r>
+        <w:t>tblNguoiDung</w:t>
+      </w:r>
+    </w:p>
+    <w:tbl>
+      <w:tblPr>
+        <w:tblStyle w:val="TableGrid"/>
+        <w:tblW w:type="auto" w:w="0"/>
+        <w:tblLook w:firstColumn="1" w:firstRow="1" w:lastColumn="0" w:lastRow="0" w:noHBand="0" w:noVBand="1" w:val="04A0"/>
+      </w:tblPr>
+      <w:tblGrid>
+        <w:gridCol w:w="2880"/>
+        <w:gridCol w:w="2880"/>
+        <w:gridCol w:w="2880"/>
+      </w:tblGrid>
+      <w:tr>
+        <w:tc>
+          <w:tcPr>
+            <w:tcW w:type="dxa" w:w="2880"/>
+            <w:shd w:fill="D9E2F3"/>
+          </w:tcPr>
+          <w:p>
+            <w:pPr/>
+            <w:r/>
+            <w:r>
+              <w:rPr>
+                <w:b/>
+                <w:sz w:val="20"/>
+              </w:rPr>
+              <w:t>ma</w:t>
+            </w:r>
+          </w:p>
+        </w:tc>
+        <w:tc>
+          <w:tcPr>
+            <w:tcW w:type="dxa" w:w="2880"/>
+            <w:shd w:fill="D9E2F3"/>
+          </w:tcPr>
+          <w:p>
+            <w:pPr/>
+            <w:r/>
+            <w:r>
+              <w:rPr>
+                <w:b/>
+                <w:sz w:val="20"/>
+              </w:rPr>
+              <w:t>hoTen</w:t>
+            </w:r>
+          </w:p>
+        </w:tc>
+        <w:tc>
+          <w:tcPr>
+            <w:tcW w:type="dxa" w:w="2880"/>
+            <w:shd w:fill="D9E2F3"/>
+          </w:tcPr>
+          <w:p>
+            <w:pPr/>
+            <w:r/>
+            <w:r>
+              <w:rPr>
+                <w:b/>
+                <w:sz w:val="20"/>
+              </w:rPr>
+              <w:t>soDienThoai</w:t>
+            </w:r>
+          </w:p>
+        </w:tc>
+      </w:tr>
+      <w:tr>
+        <w:tc>
+          <w:tcPr>
+            <w:tcW w:type="dxa" w:w="2880"/>
+          </w:tcPr>
+          <w:p>
+            <w:pPr/>
+            <w:r/>
+            <w:r>
+              <w:rPr>
+                <w:sz w:val="20"/>
+              </w:rPr>
+              <w:t>1</w:t>
+            </w:r>
+          </w:p>
+        </w:tc>
+        <w:tc>
+          <w:tcPr>
+            <w:tcW w:type="dxa" w:w="2880"/>
+          </w:tcPr>
+          <w:p>
+            <w:pPr/>
+            <w:r/>
+            <w:r>
+              <w:rPr>
+                <w:sz w:val="20"/>
+              </w:rPr>
+              <w:t>Nguyễn Văn A</w:t>
+            </w:r>
+          </w:p>
+        </w:tc>
+        <w:tc>
+          <w:tcPr>
+            <w:tcW w:type="dxa" w:w="2880"/>
+          </w:tcPr>
+          <w:p>
+            <w:pPr/>
+            <w:r/>
+            <w:r>
+              <w:rPr>
+                <w:sz w:val="20"/>
+              </w:rPr>
+              <w:t>0912345678</w:t>
+            </w:r>
+          </w:p>
+        </w:tc>
+      </w:tr>
+    </w:tbl>
+    <w:p>
+      <w:pPr/>
+      <w:r>
+        <w:t>tblOTP</w:t>
+      </w:r>
+    </w:p>
+    <w:tbl>
+      <w:tblPr>
+        <w:tblStyle w:val="TableGrid"/>
+        <w:tblW w:type="auto" w:w="0"/>
+        <w:tblLook w:firstColumn="1" w:firstRow="1" w:lastColumn="0" w:lastRow="0" w:noHBand="0" w:noVBand="1" w:val="04A0"/>
+      </w:tblPr>
+      <w:tblGrid>
+        <w:gridCol w:w="1440"/>
+        <w:gridCol w:w="1440"/>
+        <w:gridCol w:w="1440"/>
+        <w:gridCol w:w="1440"/>
+        <w:gridCol w:w="1440"/>
+        <w:gridCol w:w="1440"/>
+      </w:tblGrid>
+      <w:tr>
+        <w:tc>
+          <w:tcPr>
+            <w:tcW w:type="dxa" w:w="1440"/>
+            <w:shd w:fill="D9E2F3"/>
+          </w:tcPr>
+          <w:p>
+            <w:pPr/>
+            <w:r/>
+            <w:r>
+              <w:rPr>
+                <w:b/>
+                <w:sz w:val="20"/>
+              </w:rPr>
+              <w:t>ma</w:t>
+            </w:r>
+          </w:p>
+        </w:tc>
+        <w:tc>
+          <w:tcPr>
+            <w:tcW w:type="dxa" w:w="1440"/>
+            <w:shd w:fill="D9E2F3"/>
+          </w:tcPr>
+          <w:p>
+            <w:pPr/>
+            <w:r/>
+            <w:r>
+              <w:rPr>
+                <w:b/>
+                <w:sz w:val="20"/>
+              </w:rPr>
+              <w:t>maOTP</w:t>
+            </w:r>
+          </w:p>
+        </w:tc>
+        <w:tc>
+          <w:tcPr>
+            <w:tcW w:type="dxa" w:w="1440"/>
+            <w:shd w:fill="D9E2F3"/>
+          </w:tcPr>
+          <w:p>
+            <w:pPr/>
+            <w:r/>
+            <w:r>
+              <w:rPr>
+                <w:b/>
+                <w:sz w:val="20"/>
+              </w:rPr>
+              <w:t>loai</w:t>
+            </w:r>
+          </w:p>
+        </w:tc>
+        <w:tc>
+          <w:tcPr>
+            <w:tcW w:type="dxa" w:w="1440"/>
+            <w:shd w:fill="D9E2F3"/>
+          </w:tcPr>
+          <w:p>
+            <w:pPr/>
+            <w:r/>
+            <w:r>
+              <w:rPr>
+                <w:b/>
+                <w:sz w:val="20"/>
+              </w:rPr>
+              <w:t>thoiHanHetHan</w:t>
+            </w:r>
+          </w:p>
+        </w:tc>
+        <w:tc>
+          <w:tcPr>
+            <w:tcW w:type="dxa" w:w="1440"/>
+            <w:shd w:fill="D9E2F3"/>
+          </w:tcPr>
+          <w:p>
+            <w:pPr/>
+            <w:r/>
+            <w:r>
+              <w:rPr>
+                <w:b/>
+                <w:sz w:val="20"/>
+              </w:rPr>
+              <w:t>daXacMinh</w:t>
+            </w:r>
+          </w:p>
+        </w:tc>
+        <w:tc>
+          <w:tcPr>
+            <w:tcW w:type="dxa" w:w="1440"/>
+            <w:shd w:fill="D9E2F3"/>
+          </w:tcPr>
+          <w:p>
+            <w:pPr/>
+            <w:r/>
+            <w:r>
+              <w:rPr>
+                <w:b/>
+                <w:sz w:val="20"/>
+              </w:rPr>
+              <w:t>tblNguoiDungMa</w:t>
+            </w:r>
+          </w:p>
+        </w:tc>
+      </w:tr>
+      <w:tr>
+        <w:tc>
+          <w:tcPr>
+            <w:tcW w:type="dxa" w:w="1440"/>
+          </w:tcPr>
+          <w:p>
+            <w:pPr/>
+            <w:r/>
+            <w:r>
+              <w:rPr>
+                <w:sz w:val="20"/>
+              </w:rPr>
+              <w:t>1</w:t>
+            </w:r>
+          </w:p>
+        </w:tc>
+        <w:tc>
+          <w:tcPr>
+            <w:tcW w:type="dxa" w:w="1440"/>
+          </w:tcPr>
+          <w:p>
+            <w:pPr/>
+            <w:r/>
+            <w:r>
+              <w:rPr>
+                <w:sz w:val="20"/>
+              </w:rPr>
+              <w:t>482917</w:t>
+            </w:r>
+          </w:p>
+        </w:tc>
+        <w:tc>
+          <w:tcPr>
+            <w:tcW w:type="dxa" w:w="1440"/>
+          </w:tcPr>
+          <w:p>
+            <w:pPr/>
+            <w:r/>
+            <w:r>
+              <w:rPr>
+                <w:sz w:val="20"/>
+              </w:rPr>
+              <w:t>DANG_KY</w:t>
+            </w:r>
+          </w:p>
+        </w:tc>
+        <w:tc>
+          <w:tcPr>
+            <w:tcW w:type="dxa" w:w="1440"/>
+          </w:tcPr>
+          <w:p>
+            <w:pPr/>
+            <w:r/>
+            <w:r>
+              <w:rPr>
+                <w:sz w:val="20"/>
+              </w:rPr>
+              <w:t>2026-06-01 10:05</w:t>
+            </w:r>
+          </w:p>
+        </w:tc>
+        <w:tc>
+          <w:tcPr>
+            <w:tcW w:type="dxa" w:w="1440"/>
+          </w:tcPr>
+          <w:p>
+            <w:pPr/>
+            <w:r/>
+            <w:r>
+              <w:rPr>
+                <w:sz w:val="20"/>
+              </w:rPr>
+              <w:t>false</w:t>
+            </w:r>
+          </w:p>
+        </w:tc>
+        <w:tc>
+          <w:tcPr>
+            <w:tcW w:type="dxa" w:w="1440"/>
+          </w:tcPr>
+          <w:p>
+            <w:pPr/>
+            <w:r/>
+            <w:r>
+              <w:rPr>
+                <w:sz w:val="20"/>
+              </w:rPr>
+              <w:t>1</w:t>
+            </w:r>
+          </w:p>
+        </w:tc>
+      </w:tr>
+    </w:tbl>
+    <w:p>
+      <w:pPr/>
+      <w:r>
+        <w:rPr>
+          <w:b/>
+        </w:rPr>
+        <w:t>Kịch bản thực hiện:</w:t>
+      </w:r>
+    </w:p>
+    <w:tbl>
+      <w:tblPr>
+        <w:tblStyle w:val="TableGrid"/>
+        <w:tblW w:type="auto" w:w="0"/>
+        <w:jc w:val="center"/>
+        <w:tblLook w:firstColumn="1" w:firstRow="1" w:lastColumn="0" w:lastRow="0" w:noHBand="0" w:noVBand="1" w:val="04A0"/>
+      </w:tblPr>
+      <w:tblGrid>
+        <w:gridCol w:w="4320"/>
+        <w:gridCol w:w="4320"/>
+      </w:tblGrid>
+      <w:tr>
+        <w:tc>
+          <w:tcPr>
+            <w:tcW w:type="dxa" w:w="2835"/>
+            <w:shd w:fill="D9E2F3"/>
+          </w:tcPr>
+          <w:p>
+            <w:pPr/>
+            <w:r/>
+            <w:r>
+              <w:rPr>
+                <w:b/>
+                <w:sz w:val="20"/>
+              </w:rPr>
+              <w:t>Kịch bản</w:t>
+            </w:r>
+          </w:p>
+        </w:tc>
+        <w:tc>
+          <w:tcPr>
+            <w:tcW w:type="dxa" w:w="6803"/>
+            <w:shd w:fill="D9E2F3"/>
+          </w:tcPr>
+          <w:p>
+            <w:pPr/>
+            <w:r/>
+            <w:r>
+              <w:rPr>
+                <w:b/>
+                <w:sz w:val="20"/>
+              </w:rPr>
+              <w:t>Kết quả mong đợi</w:t>
+            </w:r>
+          </w:p>
+        </w:tc>
+      </w:tr>
+      <w:tr>
+        <w:tc>
+          <w:tcPr>
+            <w:tcW w:type="dxa" w:w="2835"/>
+          </w:tcPr>
+          <w:p>
+            <w:pPr/>
+            <w:r/>
+            <w:r>
+              <w:rPr>
+                <w:sz w:val="20"/>
+              </w:rPr>
+              <w:t>1. Nhập OTP = "111111"</w:t>
+            </w:r>
+          </w:p>
+        </w:tc>
+        <w:tc>
+          <w:tcPr>
+            <w:tcW w:type="dxa" w:w="6803"/>
+          </w:tcPr>
+          <w:p>
+            <w:pPr/>
+            <w:r/>
+            <w:r>
+              <w:rPr>
+                <w:sz w:val="20"/>
+              </w:rPr>
+              <w:t>Sai OTP, soLanSai = 1</w:t>
+            </w:r>
+          </w:p>
+        </w:tc>
+      </w:tr>
+      <w:tr>
+        <w:tc>
+          <w:tcPr>
+            <w:tcW w:type="dxa" w:w="2835"/>
+          </w:tcPr>
+          <w:p>
+            <w:pPr/>
+            <w:r/>
+            <w:r>
+              <w:rPr>
+                <w:sz w:val="20"/>
+              </w:rPr>
+              <w:t>2. Nhập OTP = "222222"</w:t>
+            </w:r>
+          </w:p>
+        </w:tc>
+        <w:tc>
+          <w:tcPr>
+            <w:tcW w:type="dxa" w:w="6803"/>
+          </w:tcPr>
+          <w:p>
+            <w:pPr/>
+            <w:r/>
+            <w:r>
+              <w:rPr>
+                <w:sz w:val="20"/>
+              </w:rPr>
+              <w:t>Sai OTP, soLanSai = 2</w:t>
+            </w:r>
+          </w:p>
+        </w:tc>
+      </w:tr>
+      <w:tr>
+        <w:tc>
+          <w:tcPr>
+            <w:tcW w:type="dxa" w:w="2835"/>
+          </w:tcPr>
+          <w:p>
+            <w:pPr/>
+            <w:r/>
+            <w:r>
+              <w:rPr>
+                <w:sz w:val="20"/>
+              </w:rPr>
+              <w:t>3. Nhập OTP = "333333"</w:t>
+            </w:r>
+          </w:p>
+        </w:tc>
+        <w:tc>
+          <w:tcPr>
+            <w:tcW w:type="dxa" w:w="6803"/>
+          </w:tcPr>
+          <w:p>
+            <w:pPr/>
+            <w:r/>
+            <w:r>
+              <w:rPr>
+                <w:sz w:val="20"/>
+              </w:rPr>
+              <w:t>Sai OTP, soLanSai = 3 → hủy phiên</w:t>
+            </w:r>
+          </w:p>
+        </w:tc>
+      </w:tr>
+      <w:tr>
+        <w:tc>
+          <w:tcPr>
+            <w:tcW w:type="dxa" w:w="2835"/>
+          </w:tcPr>
+          <w:p>
+            <w:pPr/>
+            <w:r/>
+            <w:r>
+              <w:rPr>
+                <w:sz w:val="20"/>
+              </w:rPr>
+              <w:t>4. Hiển thị lỗi</w:t>
+            </w:r>
+          </w:p>
+        </w:tc>
+        <w:tc>
+          <w:tcPr>
+            <w:tcW w:type="dxa" w:w="6803"/>
+          </w:tcPr>
+          <w:p>
+            <w:pPr/>
+            <w:r/>
+            <w:r>
+              <w:rPr>
+                <w:sz w:val="20"/>
+              </w:rPr>
+              <w:t>"Mã OTP sai 3 lần. Vui lòng đăng ký lại."</w:t>
+            </w:r>
+          </w:p>
+        </w:tc>
+      </w:tr>
+    </w:tbl>
+    <w:p>
+      <w:pPr/>
+      <w:r>
+        <w:rPr>
+          <w:b/>
+        </w:rPr>
+        <w:t>Trạng thái CSDL sau:</w:t>
+      </w:r>
+    </w:p>
+    <w:p>
+      <w:pPr/>
+      <w:r>
+        <w:t>tblOTP</w:t>
+      </w:r>
+    </w:p>
+    <w:tbl>
+      <w:tblPr>
+        <w:tblStyle w:val="TableGrid"/>
+        <w:tblW w:type="auto" w:w="0"/>
+        <w:tblLook w:firstColumn="1" w:firstRow="1" w:lastColumn="0" w:lastRow="0" w:noHBand="0" w:noVBand="1" w:val="04A0"/>
+      </w:tblPr>
+      <w:tblGrid>
+        <w:gridCol w:w="1728"/>
+        <w:gridCol w:w="1728"/>
+        <w:gridCol w:w="1728"/>
+        <w:gridCol w:w="1728"/>
+        <w:gridCol w:w="1728"/>
+      </w:tblGrid>
+      <w:tr>
+        <w:tc>
+          <w:tcPr>
+            <w:tcW w:type="dxa" w:w="1728"/>
+            <w:shd w:fill="D9E2F3"/>
+          </w:tcPr>
+          <w:p>
+            <w:pPr/>
+            <w:r/>
+            <w:r>
+              <w:rPr>
+                <w:b/>
+                <w:sz w:val="20"/>
+              </w:rPr>
+              <w:t>ma</w:t>
+            </w:r>
+          </w:p>
+        </w:tc>
+        <w:tc>
+          <w:tcPr>
+            <w:tcW w:type="dxa" w:w="1728"/>
+            <w:shd w:fill="D9E2F3"/>
+          </w:tcPr>
+          <w:p>
+            <w:pPr/>
+            <w:r/>
+            <w:r>
+              <w:rPr>
+                <w:b/>
+                <w:sz w:val="20"/>
+              </w:rPr>
+              <w:t>maOTP</w:t>
+            </w:r>
+          </w:p>
+        </w:tc>
+        <w:tc>
+          <w:tcPr>
+            <w:tcW w:type="dxa" w:w="1728"/>
+            <w:shd w:fill="D9E2F3"/>
+          </w:tcPr>
+          <w:p>
+            <w:pPr/>
+            <w:r/>
+            <w:r>
+              <w:rPr>
+                <w:b/>
+                <w:sz w:val="20"/>
+              </w:rPr>
+              <w:t>loai</w:t>
+            </w:r>
+          </w:p>
+        </w:tc>
+        <w:tc>
+          <w:tcPr>
+            <w:tcW w:type="dxa" w:w="1728"/>
+            <w:shd w:fill="D9E2F3"/>
+          </w:tcPr>
+          <w:p>
+            <w:pPr/>
+            <w:r/>
+            <w:r>
+              <w:rPr>
+                <w:b/>
+                <w:sz w:val="20"/>
+              </w:rPr>
+              <w:t>daXacMinh</w:t>
+            </w:r>
+          </w:p>
+        </w:tc>
+        <w:tc>
+          <w:tcPr>
+            <w:tcW w:type="dxa" w:w="1728"/>
+            <w:shd w:fill="D9E2F3"/>
+          </w:tcPr>
+          <w:p>
+            <w:pPr/>
+            <w:r/>
+            <w:r>
+              <w:rPr>
+                <w:b/>
+                <w:sz w:val="20"/>
+              </w:rPr>
+              <w:t>tblNguoiDungMa</w:t>
+            </w:r>
+          </w:p>
+        </w:tc>
+      </w:tr>
+      <w:tr>
+        <w:tc>
+          <w:tcPr>
+            <w:tcW w:type="dxa" w:w="1728"/>
+          </w:tcPr>
+          <w:p>
+            <w:pPr/>
+            <w:r/>
+            <w:r>
+              <w:rPr>
+                <w:sz w:val="20"/>
+              </w:rPr>
+              <w:t>1</w:t>
+            </w:r>
+          </w:p>
+        </w:tc>
+        <w:tc>
+          <w:tcPr>
+            <w:tcW w:type="dxa" w:w="1728"/>
+          </w:tcPr>
+          <w:p>
+            <w:pPr/>
+            <w:r/>
+            <w:r>
+              <w:rPr>
+                <w:sz w:val="20"/>
+              </w:rPr>
+              <w:t>482917</w:t>
+            </w:r>
+          </w:p>
+        </w:tc>
+        <w:tc>
+          <w:tcPr>
+            <w:tcW w:type="dxa" w:w="1728"/>
+          </w:tcPr>
+          <w:p>
+            <w:pPr/>
+            <w:r/>
+            <w:r>
+              <w:rPr>
+                <w:sz w:val="20"/>
+              </w:rPr>
+              <w:t>DANG_KY</w:t>
+            </w:r>
+          </w:p>
+        </w:tc>
+        <w:tc>
+          <w:tcPr>
+            <w:tcW w:type="dxa" w:w="1728"/>
+          </w:tcPr>
+          <w:p>
+            <w:pPr/>
+            <w:r/>
+            <w:r>
+              <w:rPr>
+                <w:b/>
+                <w:sz w:val="20"/>
+              </w:rPr>
+              <w:t>true</w:t>
+            </w:r>
+          </w:p>
+        </w:tc>
+        <w:tc>
+          <w:tcPr>
+            <w:tcW w:type="dxa" w:w="1728"/>
+          </w:tcPr>
+          <w:p>
+            <w:pPr/>
+            <w:r/>
+            <w:r>
+              <w:rPr>
+                <w:sz w:val="20"/>
+              </w:rPr>
+              <w:t>1</w:t>
+            </w:r>
+          </w:p>
+        </w:tc>
+      </w:tr>
+    </w:tbl>
+    <w:p>
+      <w:pPr/>
+      <w:r>
+        <w:t>tblNguoiDung: Tài khoản chưa tạo (đăng ký bị hủy).</w:t>
+      </w:r>
+    </w:p>
+    <w:p>
+      <w:pPr/>
+      <w:r>
+        <w:t>---</w:t>
+      </w:r>
+    </w:p>
+    <w:p>
+      <w:pPr>
+        <w:pStyle w:val="Heading3"/>
+      </w:pPr>
+      <w:r>
+        <w:t>TC10: Email đã được sử dụng khi cập nhật hồ sơ</w:t>
+      </w:r>
+    </w:p>
+    <w:p>
+      <w:pPr/>
+      <w:r>
+        <w:rPr>
+          <w:b/>
+        </w:rPr>
+        <w:t>Trạng thái CSDL trước:</w:t>
+      </w:r>
+    </w:p>
+    <w:p>
+      <w:pPr/>
+      <w:r>
+        <w:t>tblNguoiDung</w:t>
+      </w:r>
+    </w:p>
+    <w:tbl>
+      <w:tblPr>
+        <w:tblStyle w:val="TableGrid"/>
+        <w:tblW w:type="auto" w:w="0"/>
+        <w:tblLook w:firstColumn="1" w:firstRow="1" w:lastColumn="0" w:lastRow="0" w:noHBand="0" w:noVBand="1" w:val="04A0"/>
+      </w:tblPr>
+      <w:tblGrid>
+        <w:gridCol w:w="2160"/>
+        <w:gridCol w:w="2160"/>
+        <w:gridCol w:w="2160"/>
+        <w:gridCol w:w="2160"/>
+      </w:tblGrid>
+      <w:tr>
+        <w:tc>
+          <w:tcPr>
+            <w:tcW w:type="dxa" w:w="2160"/>
+            <w:shd w:fill="D9E2F3"/>
+          </w:tcPr>
+          <w:p>
+            <w:pPr/>
+            <w:r/>
+            <w:r>
+              <w:rPr>
+                <w:b/>
+                <w:sz w:val="20"/>
+              </w:rPr>
+              <w:t>ma</w:t>
+            </w:r>
+          </w:p>
+        </w:tc>
+        <w:tc>
+          <w:tcPr>
+            <w:tcW w:type="dxa" w:w="2160"/>
+            <w:shd w:fill="D9E2F3"/>
+          </w:tcPr>
+          <w:p>
+            <w:pPr/>
+            <w:r/>
+            <w:r>
+              <w:rPr>
+                <w:b/>
+                <w:sz w:val="20"/>
+              </w:rPr>
+              <w:t>hoTen</w:t>
+            </w:r>
+          </w:p>
+        </w:tc>
+        <w:tc>
+          <w:tcPr>
+            <w:tcW w:type="dxa" w:w="2160"/>
+            <w:shd w:fill="D9E2F3"/>
+          </w:tcPr>
+          <w:p>
+            <w:pPr/>
+            <w:r/>
+            <w:r>
+              <w:rPr>
+                <w:b/>
+                <w:sz w:val="20"/>
+              </w:rPr>
+              <w:t>soDienThoai</w:t>
+            </w:r>
+          </w:p>
+        </w:tc>
+        <w:tc>
+          <w:tcPr>
+            <w:tcW w:type="dxa" w:w="2160"/>
+            <w:shd w:fill="D9E2F3"/>
+          </w:tcPr>
+          <w:p>
+            <w:pPr/>
+            <w:r/>
+            <w:r>
+              <w:rPr>
+                <w:b/>
+                <w:sz w:val="20"/>
+              </w:rPr>
+              <w:t>email</w:t>
+            </w:r>
+          </w:p>
+        </w:tc>
+      </w:tr>
+      <w:tr>
+        <w:tc>
+          <w:tcPr>
+            <w:tcW w:type="dxa" w:w="2160"/>
+          </w:tcPr>
+          <w:p>
+            <w:pPr/>
+            <w:r/>
+            <w:r>
+              <w:rPr>
+                <w:sz w:val="20"/>
+              </w:rPr>
+              <w:t>1</w:t>
+            </w:r>
+          </w:p>
+        </w:tc>
+        <w:tc>
+          <w:tcPr>
+            <w:tcW w:type="dxa" w:w="2160"/>
+          </w:tcPr>
+          <w:p>
+            <w:pPr/>
+            <w:r/>
+            <w:r>
+              <w:rPr>
+                <w:sz w:val="20"/>
+              </w:rPr>
+              <w:t>Nguyễn Văn A</w:t>
+            </w:r>
+          </w:p>
+        </w:tc>
+        <w:tc>
+          <w:tcPr>
+            <w:tcW w:type="dxa" w:w="2160"/>
+          </w:tcPr>
+          <w:p>
+            <w:pPr/>
+            <w:r/>
+            <w:r>
+              <w:rPr>
+                <w:sz w:val="20"/>
+              </w:rPr>
+              <w:t>0912345678</w:t>
+            </w:r>
+          </w:p>
+        </w:tc>
+        <w:tc>
+          <w:tcPr>
+            <w:tcW w:type="dxa" w:w="2160"/>
+          </w:tcPr>
+          <w:p>
+            <w:pPr/>
+            <w:r/>
+            <w:r>
+              <w:rPr>
+                <w:sz w:val="20"/>
+              </w:rPr>
+              <w:t>vana@email.com</w:t>
+            </w:r>
+          </w:p>
+        </w:tc>
+      </w:tr>
+      <w:tr>
+        <w:tc>
+          <w:tcPr>
+            <w:tcW w:type="dxa" w:w="2160"/>
+          </w:tcPr>
+          <w:p>
+            <w:pPr/>
+            <w:r/>
+            <w:r>
+              <w:rPr>
+                <w:sz w:val="20"/>
+              </w:rPr>
+              <w:t>2</w:t>
+            </w:r>
+          </w:p>
+        </w:tc>
+        <w:tc>
+          <w:tcPr>
+            <w:tcW w:type="dxa" w:w="2160"/>
+          </w:tcPr>
+          <w:p>
+            <w:pPr/>
+            <w:r/>
+            <w:r>
+              <w:rPr>
+                <w:sz w:val="20"/>
+              </w:rPr>
+              <w:t>Lê Thị B</w:t>
+            </w:r>
+          </w:p>
+        </w:tc>
+        <w:tc>
+          <w:tcPr>
+            <w:tcW w:type="dxa" w:w="2160"/>
+          </w:tcPr>
+          <w:p>
+            <w:pPr/>
+            <w:r/>
+            <w:r>
+              <w:rPr>
+                <w:sz w:val="20"/>
+              </w:rPr>
+              <w:t>0987654321</w:t>
+            </w:r>
+          </w:p>
+        </w:tc>
+        <w:tc>
+          <w:tcPr>
+            <w:tcW w:type="dxa" w:w="2160"/>
+          </w:tcPr>
+          <w:p>
+            <w:pPr/>
+            <w:r/>
+            <w:r>
+              <w:rPr>
+                <w:sz w:val="20"/>
+              </w:rPr>
+              <w:t>b.lt@email.com</w:t>
+            </w:r>
+          </w:p>
+        </w:tc>
+      </w:tr>
+    </w:tbl>
+    <w:p>
+      <w:pPr/>
+      <w:r>
+        <w:rPr>
+          <w:b/>
+        </w:rPr>
+        <w:t>Kịch bản thực hiện:</w:t>
+      </w:r>
+    </w:p>
+    <w:tbl>
+      <w:tblPr>
+        <w:tblStyle w:val="TableGrid"/>
+        <w:tblW w:type="auto" w:w="0"/>
+        <w:jc w:val="center"/>
+        <w:tblLook w:firstColumn="1" w:firstRow="1" w:lastColumn="0" w:lastRow="0" w:noHBand="0" w:noVBand="1" w:val="04A0"/>
+      </w:tblPr>
+      <w:tblGrid>
+        <w:gridCol w:w="4320"/>
+        <w:gridCol w:w="4320"/>
+      </w:tblGrid>
+      <w:tr>
+        <w:tc>
+          <w:tcPr>
+            <w:tcW w:type="dxa" w:w="2835"/>
+            <w:shd w:fill="D9E2F3"/>
+          </w:tcPr>
+          <w:p>
+            <w:pPr/>
+            <w:r/>
+            <w:r>
+              <w:rPr>
+                <w:b/>
+                <w:sz w:val="20"/>
+              </w:rPr>
+              <w:t>Kịch bản</w:t>
+            </w:r>
+          </w:p>
+        </w:tc>
+        <w:tc>
+          <w:tcPr>
+            <w:tcW w:type="dxa" w:w="6803"/>
+            <w:shd w:fill="D9E2F3"/>
+          </w:tcPr>
+          <w:p>
+            <w:pPr/>
+            <w:r/>
+            <w:r>
+              <w:rPr>
+                <w:b/>
+                <w:sz w:val="20"/>
+              </w:rPr>
+              <w:t>Kết quả mong đợi</w:t>
+            </w:r>
+          </w:p>
+        </w:tc>
+      </w:tr>
+      <w:tr>
+        <w:tc>
+          <w:tcPr>
+            <w:tcW w:type="dxa" w:w="2835"/>
+          </w:tcPr>
+          <w:p>
+            <w:pPr/>
+            <w:r/>
+            <w:r>
+              <w:rPr>
+                <w:sz w:val="20"/>
+              </w:rPr>
+              <w:t>1. Nhấn vào hồ sơ cá nhân (user 1)</w:t>
+            </w:r>
+          </w:p>
+        </w:tc>
+        <w:tc>
+          <w:tcPr>
+            <w:tcW w:type="dxa" w:w="6803"/>
+          </w:tcPr>
+          <w:p>
+            <w:pPr/>
+            <w:r/>
+            <w:r>
+              <w:rPr>
+                <w:sz w:val="20"/>
+              </w:rPr>
+              <w:t>Hiển thị thông tin hiện tại</w:t>
+            </w:r>
+          </w:p>
+        </w:tc>
+      </w:tr>
+      <w:tr>
+        <w:tc>
+          <w:tcPr>
+            <w:tcW w:type="dxa" w:w="2835"/>
+          </w:tcPr>
+          <w:p>
+            <w:pPr/>
+            <w:r/>
+            <w:r>
+              <w:rPr>
+                <w:sz w:val="20"/>
+              </w:rPr>
+              <w:t>2. Nhấn [Chỉnh sửa]</w:t>
+            </w:r>
+          </w:p>
+        </w:tc>
+        <w:tc>
+          <w:tcPr>
+            <w:tcW w:type="dxa" w:w="6803"/>
+          </w:tcPr>
+          <w:p>
+            <w:pPr/>
+            <w:r/>
+            <w:r>
+              <w:rPr>
+                <w:sz w:val="20"/>
+              </w:rPr>
+              <w:t>Chế độ chỉnh sửa</w:t>
+            </w:r>
+          </w:p>
+        </w:tc>
+      </w:tr>
+      <w:tr>
+        <w:tc>
+          <w:tcPr>
+            <w:tcW w:type="dxa" w:w="2835"/>
+          </w:tcPr>
+          <w:p>
+            <w:pPr/>
+            <w:r/>
+            <w:r>
+              <w:rPr>
+                <w:sz w:val="20"/>
+              </w:rPr>
+              <w:t>3. Sửa Email = "b.lt@email.com"</w:t>
+            </w:r>
+          </w:p>
+        </w:tc>
+        <w:tc>
+          <w:tcPr>
+            <w:tcW w:type="dxa" w:w="6803"/>
+          </w:tcPr>
+          <w:p>
+            <w:pPr/>
+            <w:r/>
+            <w:r>
+              <w:rPr>
+                <w:sz w:val="20"/>
+              </w:rPr>
+              <w:t>Email trùng với user 2</w:t>
+            </w:r>
+          </w:p>
+        </w:tc>
+      </w:tr>
+      <w:tr>
+        <w:tc>
+          <w:tcPr>
+            <w:tcW w:type="dxa" w:w="2835"/>
+          </w:tcPr>
+          <w:p>
+            <w:pPr/>
+            <w:r/>
+            <w:r>
+              <w:rPr>
+                <w:sz w:val="20"/>
+              </w:rPr>
+              <w:t>4. Nhấn [Lưu thay đổi]</w:t>
+            </w:r>
+          </w:p>
+        </w:tc>
+        <w:tc>
+          <w:tcPr>
+            <w:tcW w:type="dxa" w:w="6803"/>
+          </w:tcPr>
+          <w:p>
+            <w:pPr/>
+            <w:r/>
+            <w:r>
+              <w:rPr>
+                <w:sz w:val="20"/>
+              </w:rPr>
+              <w:t>Kiểm tra email → đã tồn tại</w:t>
+            </w:r>
+          </w:p>
+        </w:tc>
+      </w:tr>
+      <w:tr>
+        <w:tc>
+          <w:tcPr>
+            <w:tcW w:type="dxa" w:w="2835"/>
+          </w:tcPr>
+          <w:p>
+            <w:pPr/>
+            <w:r/>
+            <w:r>
+              <w:rPr>
+                <w:sz w:val="20"/>
+              </w:rPr>
+              <w:t>5. Hiển thị lỗi</w:t>
+            </w:r>
+          </w:p>
+        </w:tc>
+        <w:tc>
+          <w:tcPr>
+            <w:tcW w:type="dxa" w:w="6803"/>
+          </w:tcPr>
+          <w:p>
+            <w:pPr/>
+            <w:r/>
+            <w:r>
+              <w:rPr>
+                <w:sz w:val="20"/>
+              </w:rPr>
+              <w:t>"Email này đã được đăng ký bởi tài khoản khác."</w:t>
             </w:r>
           </w:p>
         </w:tc>

</xml_diff>

<commit_message>
fix: UC diagram with 4-step process + inline HTML tables in DOCX
- I.1: Rewrite UC overview with Bước 1-4 (include/extend/generalization)
- DOCX: Parse <table> tags in scenario cells → pipe-separated monospace table
- UC diagram: 5 main UCs + 17 sub-UCs + inter-UC relationships
- DOCX: 493KB, inline tables render as formatted text blocks
</commit_message>
<xml_diff>
--- a/output/account_module.docx
+++ b/output/account_module.docx
@@ -1417,7 +1417,7 @@
       <w:r>
         <w:drawing>
           <wp:inline xmlns:a="http://schemas.openxmlformats.org/drawingml/2006/main" xmlns:pic="http://schemas.openxmlformats.org/drawingml/2006/picture">
-            <wp:extent cx="5486400" cy="12352421"/>
+            <wp:extent cx="5486400" cy="9085309"/>
             <wp:docPr id="1" name="Picture 1"/>
             <wp:cNvGraphicFramePr>
               <a:graphicFrameLocks noChangeAspect="1"/>
@@ -1438,7 +1438,7 @@
                   <pic:spPr>
                     <a:xfrm>
                       <a:off x="0" y="0"/>
-                      <a:ext cx="5486400" cy="12352421"/>
+                      <a:ext cx="5486400" cy="9085309"/>
                     </a:xfrm>
                     <a:prstGeom prst="rect"/>
                   </pic:spPr>
@@ -1456,6 +1456,1511 @@
       </w:r>
     </w:p>
     <w:p>
+      <w:pPr/>
+      <w:r>
+        <w:rPr>
+          <w:b/>
+        </w:rPr>
+        <w:t>Quy trình 4 bước:</w:t>
+      </w:r>
+    </w:p>
+    <w:p>
+      <w:pPr>
+        <w:pStyle w:val="Heading3"/>
+      </w:pPr>
+      <w:r>
+        <w:t>Bước 1 – Copy UC + Actor từ hệ thống:</w:t>
+      </w:r>
+    </w:p>
+    <w:tbl>
+      <w:tblPr>
+        <w:tblStyle w:val="TableGrid"/>
+        <w:tblW w:type="auto" w:w="0"/>
+        <w:tblLook w:firstColumn="1" w:firstRow="1" w:lastColumn="0" w:lastRow="0" w:noHBand="0" w:noVBand="1" w:val="04A0"/>
+      </w:tblPr>
+      <w:tblGrid>
+        <w:gridCol w:w="2880"/>
+        <w:gridCol w:w="2880"/>
+        <w:gridCol w:w="2880"/>
+      </w:tblGrid>
+      <w:tr>
+        <w:tc>
+          <w:tcPr>
+            <w:tcW w:type="dxa" w:w="2880"/>
+            <w:shd w:fill="D9E2F3"/>
+          </w:tcPr>
+          <w:p>
+            <w:pPr/>
+            <w:r/>
+            <w:r>
+              <w:rPr>
+                <w:b/>
+                <w:sz w:val="20"/>
+              </w:rPr>
+              <w:t>Mã UC</w:t>
+            </w:r>
+          </w:p>
+        </w:tc>
+        <w:tc>
+          <w:tcPr>
+            <w:tcW w:type="dxa" w:w="2880"/>
+            <w:shd w:fill="D9E2F3"/>
+          </w:tcPr>
+          <w:p>
+            <w:pPr/>
+            <w:r/>
+            <w:r>
+              <w:rPr>
+                <w:b/>
+                <w:sz w:val="20"/>
+              </w:rPr>
+              <w:t>Tên UC</w:t>
+            </w:r>
+          </w:p>
+        </w:tc>
+        <w:tc>
+          <w:tcPr>
+            <w:tcW w:type="dxa" w:w="2880"/>
+            <w:shd w:fill="D9E2F3"/>
+          </w:tcPr>
+          <w:p>
+            <w:pPr/>
+            <w:r/>
+            <w:r>
+              <w:rPr>
+                <w:b/>
+                <w:sz w:val="20"/>
+              </w:rPr>
+              <w:t>Actor</w:t>
+            </w:r>
+          </w:p>
+        </w:tc>
+      </w:tr>
+      <w:tr>
+        <w:tc>
+          <w:tcPr>
+            <w:tcW w:type="dxa" w:w="2880"/>
+          </w:tcPr>
+          <w:p>
+            <w:pPr/>
+            <w:r/>
+            <w:r>
+              <w:rPr>
+                <w:sz w:val="20"/>
+              </w:rPr>
+              <w:t>UC01</w:t>
+            </w:r>
+          </w:p>
+        </w:tc>
+        <w:tc>
+          <w:tcPr>
+            <w:tcW w:type="dxa" w:w="2880"/>
+          </w:tcPr>
+          <w:p>
+            <w:pPr/>
+            <w:r/>
+            <w:r>
+              <w:rPr>
+                <w:sz w:val="20"/>
+              </w:rPr>
+              <w:t>Đăng nhập</w:t>
+            </w:r>
+          </w:p>
+        </w:tc>
+        <w:tc>
+          <w:tcPr>
+            <w:tcW w:type="dxa" w:w="2880"/>
+          </w:tcPr>
+          <w:p>
+            <w:pPr/>
+            <w:r/>
+            <w:r>
+              <w:rPr>
+                <w:sz w:val="20"/>
+              </w:rPr>
+              <w:t>Khách hàng, Nhân viên, Chủ DN</w:t>
+            </w:r>
+          </w:p>
+        </w:tc>
+      </w:tr>
+      <w:tr>
+        <w:tc>
+          <w:tcPr>
+            <w:tcW w:type="dxa" w:w="2880"/>
+          </w:tcPr>
+          <w:p>
+            <w:pPr/>
+            <w:r/>
+            <w:r>
+              <w:rPr>
+                <w:sz w:val="20"/>
+              </w:rPr>
+              <w:t>UC02</w:t>
+            </w:r>
+          </w:p>
+        </w:tc>
+        <w:tc>
+          <w:tcPr>
+            <w:tcW w:type="dxa" w:w="2880"/>
+          </w:tcPr>
+          <w:p>
+            <w:pPr/>
+            <w:r/>
+            <w:r>
+              <w:rPr>
+                <w:sz w:val="20"/>
+              </w:rPr>
+              <w:t>Đăng ký</w:t>
+            </w:r>
+          </w:p>
+        </w:tc>
+        <w:tc>
+          <w:tcPr>
+            <w:tcW w:type="dxa" w:w="2880"/>
+          </w:tcPr>
+          <w:p>
+            <w:pPr/>
+            <w:r/>
+            <w:r>
+              <w:rPr>
+                <w:sz w:val="20"/>
+              </w:rPr>
+              <w:t>Khách hàng</w:t>
+            </w:r>
+          </w:p>
+        </w:tc>
+      </w:tr>
+      <w:tr>
+        <w:tc>
+          <w:tcPr>
+            <w:tcW w:type="dxa" w:w="2880"/>
+          </w:tcPr>
+          <w:p>
+            <w:pPr/>
+            <w:r/>
+            <w:r>
+              <w:rPr>
+                <w:sz w:val="20"/>
+              </w:rPr>
+              <w:t>UC03</w:t>
+            </w:r>
+          </w:p>
+        </w:tc>
+        <w:tc>
+          <w:tcPr>
+            <w:tcW w:type="dxa" w:w="2880"/>
+          </w:tcPr>
+          <w:p>
+            <w:pPr/>
+            <w:r/>
+            <w:r>
+              <w:rPr>
+                <w:sz w:val="20"/>
+              </w:rPr>
+              <w:t>Đổi mật khẩu</w:t>
+            </w:r>
+          </w:p>
+        </w:tc>
+        <w:tc>
+          <w:tcPr>
+            <w:tcW w:type="dxa" w:w="2880"/>
+          </w:tcPr>
+          <w:p>
+            <w:pPr/>
+            <w:r/>
+            <w:r>
+              <w:rPr>
+                <w:sz w:val="20"/>
+              </w:rPr>
+              <w:t>Khách hàng, Nhân viên</w:t>
+            </w:r>
+          </w:p>
+        </w:tc>
+      </w:tr>
+      <w:tr>
+        <w:tc>
+          <w:tcPr>
+            <w:tcW w:type="dxa" w:w="2880"/>
+          </w:tcPr>
+          <w:p>
+            <w:pPr/>
+            <w:r/>
+            <w:r>
+              <w:rPr>
+                <w:sz w:val="20"/>
+              </w:rPr>
+              <w:t>UC04</w:t>
+            </w:r>
+          </w:p>
+        </w:tc>
+        <w:tc>
+          <w:tcPr>
+            <w:tcW w:type="dxa" w:w="2880"/>
+          </w:tcPr>
+          <w:p>
+            <w:pPr/>
+            <w:r/>
+            <w:r>
+              <w:rPr>
+                <w:sz w:val="20"/>
+              </w:rPr>
+              <w:t>Quản lý TTCN</w:t>
+            </w:r>
+          </w:p>
+        </w:tc>
+        <w:tc>
+          <w:tcPr>
+            <w:tcW w:type="dxa" w:w="2880"/>
+          </w:tcPr>
+          <w:p>
+            <w:pPr/>
+            <w:r/>
+            <w:r>
+              <w:rPr>
+                <w:sz w:val="20"/>
+              </w:rPr>
+              <w:t>Khách hàng</w:t>
+            </w:r>
+          </w:p>
+        </w:tc>
+      </w:tr>
+      <w:tr>
+        <w:tc>
+          <w:tcPr>
+            <w:tcW w:type="dxa" w:w="2880"/>
+          </w:tcPr>
+          <w:p>
+            <w:pPr/>
+            <w:r/>
+            <w:r>
+              <w:rPr>
+                <w:sz w:val="20"/>
+              </w:rPr>
+              <w:t>UC20</w:t>
+            </w:r>
+          </w:p>
+        </w:tc>
+        <w:tc>
+          <w:tcPr>
+            <w:tcW w:type="dxa" w:w="2880"/>
+          </w:tcPr>
+          <w:p>
+            <w:pPr/>
+            <w:r/>
+            <w:r>
+              <w:rPr>
+                <w:sz w:val="20"/>
+              </w:rPr>
+              <w:t>Quản lý NV</w:t>
+            </w:r>
+          </w:p>
+        </w:tc>
+        <w:tc>
+          <w:tcPr>
+            <w:tcW w:type="dxa" w:w="2880"/>
+          </w:tcPr>
+          <w:p>
+            <w:pPr/>
+            <w:r/>
+            <w:r>
+              <w:rPr>
+                <w:sz w:val="20"/>
+              </w:rPr>
+              <w:t>Chủ DN</w:t>
+            </w:r>
+          </w:p>
+        </w:tc>
+      </w:tr>
+    </w:tbl>
+    <w:p>
+      <w:pPr>
+        <w:pStyle w:val="Heading3"/>
+      </w:pPr>
+      <w:r>
+        <w:t>Bước 2 – Đề xuất UC con từ giao diện:</w:t>
+      </w:r>
+    </w:p>
+    <w:tbl>
+      <w:tblPr>
+        <w:tblStyle w:val="TableGrid"/>
+        <w:tblW w:type="auto" w:w="0"/>
+        <w:tblLook w:firstColumn="1" w:firstRow="1" w:lastColumn="0" w:lastRow="0" w:noHBand="0" w:noVBand="1" w:val="04A0"/>
+      </w:tblPr>
+      <w:tblGrid>
+        <w:gridCol w:w="4320"/>
+        <w:gridCol w:w="4320"/>
+      </w:tblGrid>
+      <w:tr>
+        <w:tc>
+          <w:tcPr>
+            <w:tcW w:type="dxa" w:w="4320"/>
+            <w:shd w:fill="D9E2F3"/>
+          </w:tcPr>
+          <w:p>
+            <w:pPr/>
+            <w:r/>
+            <w:r>
+              <w:rPr>
+                <w:b/>
+                <w:sz w:val="20"/>
+              </w:rPr>
+              <w:t>UC chính</w:t>
+            </w:r>
+          </w:p>
+        </w:tc>
+        <w:tc>
+          <w:tcPr>
+            <w:tcW w:type="dxa" w:w="4320"/>
+            <w:shd w:fill="D9E2F3"/>
+          </w:tcPr>
+          <w:p>
+            <w:pPr/>
+            <w:r/>
+            <w:r>
+              <w:rPr>
+                <w:b/>
+                <w:sz w:val="20"/>
+              </w:rPr>
+              <w:t>Giao diện → UC con</w:t>
+            </w:r>
+          </w:p>
+        </w:tc>
+      </w:tr>
+      <w:tr>
+        <w:tc>
+          <w:tcPr>
+            <w:tcW w:type="dxa" w:w="4320"/>
+          </w:tcPr>
+          <w:p>
+            <w:pPr/>
+            <w:r/>
+            <w:r>
+              <w:rPr>
+                <w:sz w:val="20"/>
+              </w:rPr>
+              <w:t>UC01</w:t>
+            </w:r>
+          </w:p>
+        </w:tc>
+        <w:tc>
+          <w:tcPr>
+            <w:tcW w:type="dxa" w:w="4320"/>
+          </w:tcPr>
+          <w:p>
+            <w:pPr/>
+            <w:r/>
+            <w:r>
+              <w:rPr>
+                <w:sz w:val="20"/>
+              </w:rPr>
+              <w:t>Form đăng nhập → Nhập thông tin đăng nhập; Xác thực tài khoản</w:t>
+            </w:r>
+          </w:p>
+        </w:tc>
+      </w:tr>
+      <w:tr>
+        <w:tc>
+          <w:tcPr>
+            <w:tcW w:type="dxa" w:w="4320"/>
+          </w:tcPr>
+          <w:p>
+            <w:pPr/>
+            <w:r/>
+            <w:r>
+              <w:rPr>
+                <w:sz w:val="20"/>
+              </w:rPr>
+              <w:t>UC02</w:t>
+            </w:r>
+          </w:p>
+        </w:tc>
+        <w:tc>
+          <w:tcPr>
+            <w:tcW w:type="dxa" w:w="4320"/>
+          </w:tcPr>
+          <w:p>
+            <w:pPr/>
+            <w:r/>
+            <w:r>
+              <w:rPr>
+                <w:sz w:val="20"/>
+              </w:rPr>
+              <w:t>Form đăng ký → Điền thông tin đăng ký; Nhập mã OTP; Xác nhận OTP</w:t>
+            </w:r>
+          </w:p>
+        </w:tc>
+      </w:tr>
+      <w:tr>
+        <w:tc>
+          <w:tcPr>
+            <w:tcW w:type="dxa" w:w="4320"/>
+          </w:tcPr>
+          <w:p>
+            <w:pPr/>
+            <w:r/>
+            <w:r>
+              <w:rPr>
+                <w:sz w:val="20"/>
+              </w:rPr>
+              <w:t>UC03</w:t>
+            </w:r>
+          </w:p>
+        </w:tc>
+        <w:tc>
+          <w:tcPr>
+            <w:tcW w:type="dxa" w:w="4320"/>
+          </w:tcPr>
+          <w:p>
+            <w:pPr/>
+            <w:r/>
+            <w:r>
+              <w:rPr>
+                <w:sz w:val="20"/>
+              </w:rPr>
+              <w:t>Form đổi MK → Nhập thông tin đổi MK</w:t>
+            </w:r>
+          </w:p>
+        </w:tc>
+      </w:tr>
+      <w:tr>
+        <w:tc>
+          <w:tcPr>
+            <w:tcW w:type="dxa" w:w="4320"/>
+          </w:tcPr>
+          <w:p>
+            <w:pPr/>
+            <w:r/>
+            <w:r>
+              <w:rPr>
+                <w:sz w:val="20"/>
+              </w:rPr>
+              <w:t>UC04</w:t>
+            </w:r>
+          </w:p>
+        </w:tc>
+        <w:tc>
+          <w:tcPr>
+            <w:tcW w:type="dxa" w:w="4320"/>
+          </w:tcPr>
+          <w:p>
+            <w:pPr/>
+            <w:r/>
+            <w:r>
+              <w:rPr>
+                <w:sz w:val="20"/>
+              </w:rPr>
+              <w:t>Trang hồ sơ → Xem hồ sơ; Chỉnh sửa thông tin; Xem hạng hội viên</w:t>
+            </w:r>
+          </w:p>
+        </w:tc>
+      </w:tr>
+      <w:tr>
+        <w:tc>
+          <w:tcPr>
+            <w:tcW w:type="dxa" w:w="4320"/>
+          </w:tcPr>
+          <w:p>
+            <w:pPr/>
+            <w:r/>
+            <w:r>
+              <w:rPr>
+                <w:sz w:val="20"/>
+              </w:rPr>
+              <w:t>UC20</w:t>
+            </w:r>
+          </w:p>
+        </w:tc>
+        <w:tc>
+          <w:tcPr>
+            <w:tcW w:type="dxa" w:w="4320"/>
+          </w:tcPr>
+          <w:p>
+            <w:pPr/>
+            <w:r/>
+            <w:r>
+              <w:rPr>
+                <w:sz w:val="20"/>
+              </w:rPr>
+              <w:t>Trang quản lý NV → Xem danh sách NV; Thêm NV; Sửa NV; Xóa NV</w:t>
+            </w:r>
+          </w:p>
+        </w:tc>
+      </w:tr>
+    </w:tbl>
+    <w:p>
+      <w:pPr>
+        <w:pStyle w:val="Heading3"/>
+      </w:pPr>
+      <w:r>
+        <w:t>Bước 3 – Xác định quan hệ include/extend:</w:t>
+      </w:r>
+    </w:p>
+    <w:tbl>
+      <w:tblPr>
+        <w:tblStyle w:val="TableGrid"/>
+        <w:tblW w:type="auto" w:w="0"/>
+        <w:tblLook w:firstColumn="1" w:firstRow="1" w:lastColumn="0" w:lastRow="0" w:noHBand="0" w:noVBand="1" w:val="04A0"/>
+      </w:tblPr>
+      <w:tblGrid>
+        <w:gridCol w:w="2160"/>
+        <w:gridCol w:w="2160"/>
+        <w:gridCol w:w="2160"/>
+        <w:gridCol w:w="2160"/>
+      </w:tblGrid>
+      <w:tr>
+        <w:tc>
+          <w:tcPr>
+            <w:tcW w:type="dxa" w:w="2160"/>
+            <w:shd w:fill="D9E2F3"/>
+          </w:tcPr>
+          <w:p>
+            <w:pPr/>
+            <w:r/>
+            <w:r>
+              <w:rPr>
+                <w:b/>
+                <w:sz w:val="20"/>
+              </w:rPr>
+              <w:t>UC cha</w:t>
+            </w:r>
+          </w:p>
+        </w:tc>
+        <w:tc>
+          <w:tcPr>
+            <w:tcW w:type="dxa" w:w="2160"/>
+            <w:shd w:fill="D9E2F3"/>
+          </w:tcPr>
+          <w:p>
+            <w:pPr/>
+            <w:r/>
+            <w:r>
+              <w:rPr>
+                <w:b/>
+                <w:sz w:val="20"/>
+              </w:rPr>
+              <w:t>UC con</w:t>
+            </w:r>
+          </w:p>
+        </w:tc>
+        <w:tc>
+          <w:tcPr>
+            <w:tcW w:type="dxa" w:w="2160"/>
+            <w:shd w:fill="D9E2F3"/>
+          </w:tcPr>
+          <w:p>
+            <w:pPr/>
+            <w:r/>
+            <w:r>
+              <w:rPr>
+                <w:b/>
+                <w:sz w:val="20"/>
+              </w:rPr>
+              <w:t>Quan hệ</w:t>
+            </w:r>
+          </w:p>
+        </w:tc>
+        <w:tc>
+          <w:tcPr>
+            <w:tcW w:type="dxa" w:w="2160"/>
+            <w:shd w:fill="D9E2F3"/>
+          </w:tcPr>
+          <w:p>
+            <w:pPr/>
+            <w:r/>
+            <w:r>
+              <w:rPr>
+                <w:b/>
+                <w:sz w:val="20"/>
+              </w:rPr>
+              <w:t>Lý do</w:t>
+            </w:r>
+          </w:p>
+        </w:tc>
+      </w:tr>
+      <w:tr>
+        <w:tc>
+          <w:tcPr>
+            <w:tcW w:type="dxa" w:w="2160"/>
+          </w:tcPr>
+          <w:p>
+            <w:pPr/>
+            <w:r/>
+            <w:r>
+              <w:rPr>
+                <w:sz w:val="20"/>
+              </w:rPr>
+              <w:t>UC01</w:t>
+            </w:r>
+          </w:p>
+        </w:tc>
+        <w:tc>
+          <w:tcPr>
+            <w:tcW w:type="dxa" w:w="2160"/>
+          </w:tcPr>
+          <w:p>
+            <w:pPr/>
+            <w:r/>
+            <w:r>
+              <w:rPr>
+                <w:sz w:val="20"/>
+              </w:rPr>
+              <w:t>Nhập thông tin đăng nhập</w:t>
+            </w:r>
+          </w:p>
+        </w:tc>
+        <w:tc>
+          <w:tcPr>
+            <w:tcW w:type="dxa" w:w="2160"/>
+          </w:tcPr>
+          <w:p>
+            <w:pPr/>
+            <w:r/>
+            <w:r>
+              <w:rPr>
+                <w:sz w:val="20"/>
+              </w:rPr>
+              <w:t>include</w:t>
+            </w:r>
+          </w:p>
+        </w:tc>
+        <w:tc>
+          <w:tcPr>
+            <w:tcW w:type="dxa" w:w="2160"/>
+          </w:tcPr>
+          <w:p>
+            <w:pPr/>
+            <w:r/>
+            <w:r>
+              <w:rPr>
+                <w:sz w:val="20"/>
+              </w:rPr>
+              <w:t>Bắt buộc – luôn phải nhập TK + MK</w:t>
+            </w:r>
+          </w:p>
+        </w:tc>
+      </w:tr>
+      <w:tr>
+        <w:tc>
+          <w:tcPr>
+            <w:tcW w:type="dxa" w:w="2160"/>
+          </w:tcPr>
+          <w:p>
+            <w:pPr/>
+            <w:r/>
+            <w:r>
+              <w:rPr>
+                <w:sz w:val="20"/>
+              </w:rPr>
+              <w:t>UC01</w:t>
+            </w:r>
+          </w:p>
+        </w:tc>
+        <w:tc>
+          <w:tcPr>
+            <w:tcW w:type="dxa" w:w="2160"/>
+          </w:tcPr>
+          <w:p>
+            <w:pPr/>
+            <w:r/>
+            <w:r>
+              <w:rPr>
+                <w:sz w:val="20"/>
+              </w:rPr>
+              <w:t>Xác thực tài khoản</w:t>
+            </w:r>
+          </w:p>
+        </w:tc>
+        <w:tc>
+          <w:tcPr>
+            <w:tcW w:type="dxa" w:w="2160"/>
+          </w:tcPr>
+          <w:p>
+            <w:pPr/>
+            <w:r/>
+            <w:r>
+              <w:rPr>
+                <w:sz w:val="20"/>
+              </w:rPr>
+              <w:t>include</w:t>
+            </w:r>
+          </w:p>
+        </w:tc>
+        <w:tc>
+          <w:tcPr>
+            <w:tcW w:type="dxa" w:w="2160"/>
+          </w:tcPr>
+          <w:p>
+            <w:pPr/>
+            <w:r/>
+            <w:r>
+              <w:rPr>
+                <w:sz w:val="20"/>
+              </w:rPr>
+              <w:t>Bắt buộc – hệ thống kiểm tra sau khi nhập</w:t>
+            </w:r>
+          </w:p>
+        </w:tc>
+      </w:tr>
+      <w:tr>
+        <w:tc>
+          <w:tcPr>
+            <w:tcW w:type="dxa" w:w="2160"/>
+          </w:tcPr>
+          <w:p>
+            <w:pPr/>
+            <w:r/>
+            <w:r>
+              <w:rPr>
+                <w:sz w:val="20"/>
+              </w:rPr>
+              <w:t>UC01</w:t>
+            </w:r>
+          </w:p>
+        </w:tc>
+        <w:tc>
+          <w:tcPr>
+            <w:tcW w:type="dxa" w:w="2160"/>
+          </w:tcPr>
+          <w:p>
+            <w:pPr/>
+            <w:r/>
+            <w:r>
+              <w:rPr>
+                <w:sz w:val="20"/>
+              </w:rPr>
+              <w:t>Quên mật khẩu</w:t>
+            </w:r>
+          </w:p>
+        </w:tc>
+        <w:tc>
+          <w:tcPr>
+            <w:tcW w:type="dxa" w:w="2160"/>
+          </w:tcPr>
+          <w:p>
+            <w:pPr/>
+            <w:r/>
+            <w:r>
+              <w:rPr>
+                <w:sz w:val="20"/>
+              </w:rPr>
+              <w:t>extend</w:t>
+            </w:r>
+          </w:p>
+        </w:tc>
+        <w:tc>
+          <w:tcPr>
+            <w:tcW w:type="dxa" w:w="2160"/>
+          </w:tcPr>
+          <w:p>
+            <w:pPr/>
+            <w:r/>
+            <w:r>
+              <w:rPr>
+                <w:sz w:val="20"/>
+              </w:rPr>
+              <w:t>Chỉ khi nhấn "Quên mật khẩu?"</w:t>
+            </w:r>
+          </w:p>
+        </w:tc>
+      </w:tr>
+      <w:tr>
+        <w:tc>
+          <w:tcPr>
+            <w:tcW w:type="dxa" w:w="2160"/>
+          </w:tcPr>
+          <w:p>
+            <w:pPr/>
+            <w:r/>
+            <w:r>
+              <w:rPr>
+                <w:sz w:val="20"/>
+              </w:rPr>
+              <w:t>UC02</w:t>
+            </w:r>
+          </w:p>
+        </w:tc>
+        <w:tc>
+          <w:tcPr>
+            <w:tcW w:type="dxa" w:w="2160"/>
+          </w:tcPr>
+          <w:p>
+            <w:pPr/>
+            <w:r/>
+            <w:r>
+              <w:rPr>
+                <w:sz w:val="20"/>
+              </w:rPr>
+              <w:t>Điền thông tin đăng ký</w:t>
+            </w:r>
+          </w:p>
+        </w:tc>
+        <w:tc>
+          <w:tcPr>
+            <w:tcW w:type="dxa" w:w="2160"/>
+          </w:tcPr>
+          <w:p>
+            <w:pPr/>
+            <w:r/>
+            <w:r>
+              <w:rPr>
+                <w:sz w:val="20"/>
+              </w:rPr>
+              <w:t>include</w:t>
+            </w:r>
+          </w:p>
+        </w:tc>
+        <w:tc>
+          <w:tcPr>
+            <w:tcW w:type="dxa" w:w="2160"/>
+          </w:tcPr>
+          <w:p>
+            <w:pPr/>
+            <w:r/>
+            <w:r>
+              <w:rPr>
+                <w:sz w:val="20"/>
+              </w:rPr>
+              <w:t>Bắt buộc – không thể đăng ký mà không điền</w:t>
+            </w:r>
+          </w:p>
+        </w:tc>
+      </w:tr>
+      <w:tr>
+        <w:tc>
+          <w:tcPr>
+            <w:tcW w:type="dxa" w:w="2160"/>
+          </w:tcPr>
+          <w:p>
+            <w:pPr/>
+            <w:r/>
+            <w:r>
+              <w:rPr>
+                <w:sz w:val="20"/>
+              </w:rPr>
+              <w:t>UC02</w:t>
+            </w:r>
+          </w:p>
+        </w:tc>
+        <w:tc>
+          <w:tcPr>
+            <w:tcW w:type="dxa" w:w="2160"/>
+          </w:tcPr>
+          <w:p>
+            <w:pPr/>
+            <w:r/>
+            <w:r>
+              <w:rPr>
+                <w:sz w:val="20"/>
+              </w:rPr>
+              <w:t>Nhập mã OTP</w:t>
+            </w:r>
+          </w:p>
+        </w:tc>
+        <w:tc>
+          <w:tcPr>
+            <w:tcW w:type="dxa" w:w="2160"/>
+          </w:tcPr>
+          <w:p>
+            <w:pPr/>
+            <w:r/>
+            <w:r>
+              <w:rPr>
+                <w:sz w:val="20"/>
+              </w:rPr>
+              <w:t>include</w:t>
+            </w:r>
+          </w:p>
+        </w:tc>
+        <w:tc>
+          <w:tcPr>
+            <w:tcW w:type="dxa" w:w="2160"/>
+          </w:tcPr>
+          <w:p>
+            <w:pPr/>
+            <w:r/>
+            <w:r>
+              <w:rPr>
+                <w:sz w:val="20"/>
+              </w:rPr>
+              <w:t>Bắt buộc – hệ thống luôn gửi OTP</w:t>
+            </w:r>
+          </w:p>
+        </w:tc>
+      </w:tr>
+      <w:tr>
+        <w:tc>
+          <w:tcPr>
+            <w:tcW w:type="dxa" w:w="2160"/>
+          </w:tcPr>
+          <w:p>
+            <w:pPr/>
+            <w:r/>
+            <w:r>
+              <w:rPr>
+                <w:sz w:val="20"/>
+              </w:rPr>
+              <w:t>UC02</w:t>
+            </w:r>
+          </w:p>
+        </w:tc>
+        <w:tc>
+          <w:tcPr>
+            <w:tcW w:type="dxa" w:w="2160"/>
+          </w:tcPr>
+          <w:p>
+            <w:pPr/>
+            <w:r/>
+            <w:r>
+              <w:rPr>
+                <w:sz w:val="20"/>
+              </w:rPr>
+              <w:t>Xác nhận OTP</w:t>
+            </w:r>
+          </w:p>
+        </w:tc>
+        <w:tc>
+          <w:tcPr>
+            <w:tcW w:type="dxa" w:w="2160"/>
+          </w:tcPr>
+          <w:p>
+            <w:pPr/>
+            <w:r/>
+            <w:r>
+              <w:rPr>
+                <w:sz w:val="20"/>
+              </w:rPr>
+              <w:t>include</w:t>
+            </w:r>
+          </w:p>
+        </w:tc>
+        <w:tc>
+          <w:tcPr>
+            <w:tcW w:type="dxa" w:w="2160"/>
+          </w:tcPr>
+          <w:p>
+            <w:pPr/>
+            <w:r/>
+            <w:r>
+              <w:rPr>
+                <w:sz w:val="20"/>
+              </w:rPr>
+              <w:t>Bắt buộc – phải xác minh SĐT</w:t>
+            </w:r>
+          </w:p>
+        </w:tc>
+      </w:tr>
+      <w:tr>
+        <w:tc>
+          <w:tcPr>
+            <w:tcW w:type="dxa" w:w="2160"/>
+          </w:tcPr>
+          <w:p>
+            <w:pPr/>
+            <w:r/>
+            <w:r>
+              <w:rPr>
+                <w:sz w:val="20"/>
+              </w:rPr>
+              <w:t>UC03</w:t>
+            </w:r>
+          </w:p>
+        </w:tc>
+        <w:tc>
+          <w:tcPr>
+            <w:tcW w:type="dxa" w:w="2160"/>
+          </w:tcPr>
+          <w:p>
+            <w:pPr/>
+            <w:r/>
+            <w:r>
+              <w:rPr>
+                <w:sz w:val="20"/>
+              </w:rPr>
+              <w:t>Nhập thông tin đổi MK</w:t>
+            </w:r>
+          </w:p>
+        </w:tc>
+        <w:tc>
+          <w:tcPr>
+            <w:tcW w:type="dxa" w:w="2160"/>
+          </w:tcPr>
+          <w:p>
+            <w:pPr/>
+            <w:r/>
+            <w:r>
+              <w:rPr>
+                <w:sz w:val="20"/>
+              </w:rPr>
+              <w:t>include</w:t>
+            </w:r>
+          </w:p>
+        </w:tc>
+        <w:tc>
+          <w:tcPr>
+            <w:tcW w:type="dxa" w:w="2160"/>
+          </w:tcPr>
+          <w:p>
+            <w:pPr/>
+            <w:r/>
+            <w:r>
+              <w:rPr>
+                <w:sz w:val="20"/>
+              </w:rPr>
+              <w:t>Bắt buộc – phải nhập MK cũ + MK mới</w:t>
+            </w:r>
+          </w:p>
+        </w:tc>
+      </w:tr>
+      <w:tr>
+        <w:tc>
+          <w:tcPr>
+            <w:tcW w:type="dxa" w:w="2160"/>
+          </w:tcPr>
+          <w:p>
+            <w:pPr/>
+            <w:r/>
+            <w:r>
+              <w:rPr>
+                <w:sz w:val="20"/>
+              </w:rPr>
+              <w:t>UC04</w:t>
+            </w:r>
+          </w:p>
+        </w:tc>
+        <w:tc>
+          <w:tcPr>
+            <w:tcW w:type="dxa" w:w="2160"/>
+          </w:tcPr>
+          <w:p>
+            <w:pPr/>
+            <w:r/>
+            <w:r>
+              <w:rPr>
+                <w:sz w:val="20"/>
+              </w:rPr>
+              <w:t>Xem hồ sơ</w:t>
+            </w:r>
+          </w:p>
+        </w:tc>
+        <w:tc>
+          <w:tcPr>
+            <w:tcW w:type="dxa" w:w="2160"/>
+          </w:tcPr>
+          <w:p>
+            <w:pPr/>
+            <w:r/>
+            <w:r>
+              <w:rPr>
+                <w:sz w:val="20"/>
+              </w:rPr>
+              <w:t>include</w:t>
+            </w:r>
+          </w:p>
+        </w:tc>
+        <w:tc>
+          <w:tcPr>
+            <w:tcW w:type="dxa" w:w="2160"/>
+          </w:tcPr>
+          <w:p>
+            <w:pPr/>
+            <w:r/>
+            <w:r>
+              <w:rPr>
+                <w:sz w:val="20"/>
+              </w:rPr>
+              <w:t>Bắt buộc – hiển thị khi vào trang</w:t>
+            </w:r>
+          </w:p>
+        </w:tc>
+      </w:tr>
+      <w:tr>
+        <w:tc>
+          <w:tcPr>
+            <w:tcW w:type="dxa" w:w="2160"/>
+          </w:tcPr>
+          <w:p>
+            <w:pPr/>
+            <w:r/>
+            <w:r>
+              <w:rPr>
+                <w:sz w:val="20"/>
+              </w:rPr>
+              <w:t>UC04</w:t>
+            </w:r>
+          </w:p>
+        </w:tc>
+        <w:tc>
+          <w:tcPr>
+            <w:tcW w:type="dxa" w:w="2160"/>
+          </w:tcPr>
+          <w:p>
+            <w:pPr/>
+            <w:r/>
+            <w:r>
+              <w:rPr>
+                <w:sz w:val="20"/>
+              </w:rPr>
+              <w:t>Chỉnh sửa thông tin</w:t>
+            </w:r>
+          </w:p>
+        </w:tc>
+        <w:tc>
+          <w:tcPr>
+            <w:tcW w:type="dxa" w:w="2160"/>
+          </w:tcPr>
+          <w:p>
+            <w:pPr/>
+            <w:r/>
+            <w:r>
+              <w:rPr>
+                <w:sz w:val="20"/>
+              </w:rPr>
+              <w:t>extend</w:t>
+            </w:r>
+          </w:p>
+        </w:tc>
+        <w:tc>
+          <w:tcPr>
+            <w:tcW w:type="dxa" w:w="2160"/>
+          </w:tcPr>
+          <w:p>
+            <w:pPr/>
+            <w:r/>
+            <w:r>
+              <w:rPr>
+                <w:sz w:val="20"/>
+              </w:rPr>
+              <w:t>Chỉ khi chọn chỉnh sửa</w:t>
+            </w:r>
+          </w:p>
+        </w:tc>
+      </w:tr>
+      <w:tr>
+        <w:tc>
+          <w:tcPr>
+            <w:tcW w:type="dxa" w:w="2160"/>
+          </w:tcPr>
+          <w:p>
+            <w:pPr/>
+            <w:r/>
+            <w:r>
+              <w:rPr>
+                <w:sz w:val="20"/>
+              </w:rPr>
+              <w:t>UC04</w:t>
+            </w:r>
+          </w:p>
+        </w:tc>
+        <w:tc>
+          <w:tcPr>
+            <w:tcW w:type="dxa" w:w="2160"/>
+          </w:tcPr>
+          <w:p>
+            <w:pPr/>
+            <w:r/>
+            <w:r>
+              <w:rPr>
+                <w:sz w:val="20"/>
+              </w:rPr>
+              <w:t>Xem hạng hội viên</w:t>
+            </w:r>
+          </w:p>
+        </w:tc>
+        <w:tc>
+          <w:tcPr>
+            <w:tcW w:type="dxa" w:w="2160"/>
+          </w:tcPr>
+          <w:p>
+            <w:pPr/>
+            <w:r/>
+            <w:r>
+              <w:rPr>
+                <w:sz w:val="20"/>
+              </w:rPr>
+              <w:t>extend</w:t>
+            </w:r>
+          </w:p>
+        </w:tc>
+        <w:tc>
+          <w:tcPr>
+            <w:tcW w:type="dxa" w:w="2160"/>
+          </w:tcPr>
+          <w:p>
+            <w:pPr/>
+            <w:r/>
+            <w:r>
+              <w:rPr>
+                <w:sz w:val="20"/>
+              </w:rPr>
+              <w:t>Chỉ khi nhấn vào khu vực thẻ hội viên</w:t>
+            </w:r>
+          </w:p>
+        </w:tc>
+      </w:tr>
+      <w:tr>
+        <w:tc>
+          <w:tcPr>
+            <w:tcW w:type="dxa" w:w="2160"/>
+          </w:tcPr>
+          <w:p>
+            <w:pPr/>
+            <w:r/>
+            <w:r>
+              <w:rPr>
+                <w:sz w:val="20"/>
+              </w:rPr>
+              <w:t>UC20</w:t>
+            </w:r>
+          </w:p>
+        </w:tc>
+        <w:tc>
+          <w:tcPr>
+            <w:tcW w:type="dxa" w:w="2160"/>
+          </w:tcPr>
+          <w:p>
+            <w:pPr/>
+            <w:r/>
+            <w:r>
+              <w:rPr>
+                <w:sz w:val="20"/>
+              </w:rPr>
+              <w:t>Xem danh sách NV</w:t>
+            </w:r>
+          </w:p>
+        </w:tc>
+        <w:tc>
+          <w:tcPr>
+            <w:tcW w:type="dxa" w:w="2160"/>
+          </w:tcPr>
+          <w:p>
+            <w:pPr/>
+            <w:r/>
+            <w:r>
+              <w:rPr>
+                <w:sz w:val="20"/>
+              </w:rPr>
+              <w:t>include</w:t>
+            </w:r>
+          </w:p>
+        </w:tc>
+        <w:tc>
+          <w:tcPr>
+            <w:tcW w:type="dxa" w:w="2160"/>
+          </w:tcPr>
+          <w:p>
+            <w:pPr/>
+            <w:r/>
+            <w:r>
+              <w:rPr>
+                <w:sz w:val="20"/>
+              </w:rPr>
+              <w:t>Bắt buộc – hiển thị trước khi thao tác</w:t>
+            </w:r>
+          </w:p>
+        </w:tc>
+      </w:tr>
+      <w:tr>
+        <w:tc>
+          <w:tcPr>
+            <w:tcW w:type="dxa" w:w="2160"/>
+          </w:tcPr>
+          <w:p>
+            <w:pPr/>
+            <w:r/>
+            <w:r>
+              <w:rPr>
+                <w:sz w:val="20"/>
+              </w:rPr>
+              <w:t>UC20</w:t>
+            </w:r>
+          </w:p>
+        </w:tc>
+        <w:tc>
+          <w:tcPr>
+            <w:tcW w:type="dxa" w:w="2160"/>
+          </w:tcPr>
+          <w:p>
+            <w:pPr/>
+            <w:r/>
+            <w:r>
+              <w:rPr>
+                <w:sz w:val="20"/>
+              </w:rPr>
+              <w:t>Thêm NV</w:t>
+            </w:r>
+          </w:p>
+        </w:tc>
+        <w:tc>
+          <w:tcPr>
+            <w:tcW w:type="dxa" w:w="2160"/>
+          </w:tcPr>
+          <w:p>
+            <w:pPr/>
+            <w:r/>
+            <w:r>
+              <w:rPr>
+                <w:sz w:val="20"/>
+              </w:rPr>
+              <w:t>extend</w:t>
+            </w:r>
+          </w:p>
+        </w:tc>
+        <w:tc>
+          <w:tcPr>
+            <w:tcW w:type="dxa" w:w="2160"/>
+          </w:tcPr>
+          <w:p>
+            <w:pPr/>
+            <w:r/>
+            <w:r>
+              <w:rPr>
+                <w:sz w:val="20"/>
+              </w:rPr>
+              <w:t>Chỉ khi chọn thêm</w:t>
+            </w:r>
+          </w:p>
+        </w:tc>
+      </w:tr>
+      <w:tr>
+        <w:tc>
+          <w:tcPr>
+            <w:tcW w:type="dxa" w:w="2160"/>
+          </w:tcPr>
+          <w:p>
+            <w:pPr/>
+            <w:r/>
+            <w:r>
+              <w:rPr>
+                <w:sz w:val="20"/>
+              </w:rPr>
+              <w:t>UC20</w:t>
+            </w:r>
+          </w:p>
+        </w:tc>
+        <w:tc>
+          <w:tcPr>
+            <w:tcW w:type="dxa" w:w="2160"/>
+          </w:tcPr>
+          <w:p>
+            <w:pPr/>
+            <w:r/>
+            <w:r>
+              <w:rPr>
+                <w:sz w:val="20"/>
+              </w:rPr>
+              <w:t>Sửa NV</w:t>
+            </w:r>
+          </w:p>
+        </w:tc>
+        <w:tc>
+          <w:tcPr>
+            <w:tcW w:type="dxa" w:w="2160"/>
+          </w:tcPr>
+          <w:p>
+            <w:pPr/>
+            <w:r/>
+            <w:r>
+              <w:rPr>
+                <w:sz w:val="20"/>
+              </w:rPr>
+              <w:t>extend</w:t>
+            </w:r>
+          </w:p>
+        </w:tc>
+        <w:tc>
+          <w:tcPr>
+            <w:tcW w:type="dxa" w:w="2160"/>
+          </w:tcPr>
+          <w:p>
+            <w:pPr/>
+            <w:r/>
+            <w:r>
+              <w:rPr>
+                <w:sz w:val="20"/>
+              </w:rPr>
+              <w:t>Chỉ khi chọn sửa</w:t>
+            </w:r>
+          </w:p>
+        </w:tc>
+      </w:tr>
+      <w:tr>
+        <w:tc>
+          <w:tcPr>
+            <w:tcW w:type="dxa" w:w="2160"/>
+          </w:tcPr>
+          <w:p>
+            <w:pPr/>
+            <w:r/>
+            <w:r>
+              <w:rPr>
+                <w:sz w:val="20"/>
+              </w:rPr>
+              <w:t>UC20</w:t>
+            </w:r>
+          </w:p>
+        </w:tc>
+        <w:tc>
+          <w:tcPr>
+            <w:tcW w:type="dxa" w:w="2160"/>
+          </w:tcPr>
+          <w:p>
+            <w:pPr/>
+            <w:r/>
+            <w:r>
+              <w:rPr>
+                <w:sz w:val="20"/>
+              </w:rPr>
+              <w:t>Xóa NV</w:t>
+            </w:r>
+          </w:p>
+        </w:tc>
+        <w:tc>
+          <w:tcPr>
+            <w:tcW w:type="dxa" w:w="2160"/>
+          </w:tcPr>
+          <w:p>
+            <w:pPr/>
+            <w:r/>
+            <w:r>
+              <w:rPr>
+                <w:sz w:val="20"/>
+              </w:rPr>
+              <w:t>extend</w:t>
+            </w:r>
+          </w:p>
+        </w:tc>
+        <w:tc>
+          <w:tcPr>
+            <w:tcW w:type="dxa" w:w="2160"/>
+          </w:tcPr>
+          <w:p>
+            <w:pPr/>
+            <w:r/>
+            <w:r>
+              <w:rPr>
+                <w:sz w:val="20"/>
+              </w:rPr>
+              <w:t>Chỉ khi chọn xóa</w:t>
+            </w:r>
+          </w:p>
+        </w:tc>
+      </w:tr>
+    </w:tbl>
+    <w:p>
+      <w:pPr>
+        <w:pStyle w:val="Heading3"/>
+      </w:pPr>
+      <w:r>
+        <w:t>Bước 4 – Gộp UC con tương tự:</w:t>
+      </w:r>
+    </w:p>
+    <w:p>
+      <w:pPr/>
+      <w:r>
+        <w:t>UC20 có 3 UC con "Thêm NV", "Sửa NV", "Xóa NV" có cùng đặc điểm (CRUD nhân viên) → giữ riêng vì mỗi thao tác có luồng khác nhau, không gộp.</w:t>
+      </w:r>
+    </w:p>
+    <w:p>
       <w:pPr>
         <w:pStyle w:val="Heading2"/>
       </w:pPr>
@@ -1484,7 +2989,7 @@
         <w:t>UC02 – Đăng ký:</w:t>
       </w:r>
       <w:r>
-        <w:t xml:space="preserve"> UC này cho phép Khách hàng tạo tài khoản hội viên mới bằng cách cung cấp họ tên, SĐT, email và mật khẩu. Hệ thống gửi OTP 6 chữ số đến SĐT để xác minh trước khi hoàn tất đăng ký.</w:t>
+        <w:t xml:space="preserve"> UC này cho phép Khách hàng tạo tài khoản hội viên mới bằng cách cung cấp họ tên, SĐT, email và mật khẩu. Hệ thống gửi OTP 6 chữ số đến SĐT để xác minh trước khi hoàn tất đăng ký. Sau khi đăng ký thành công, hệ thống tự động đăng nhập.</w:t>
       </w:r>
     </w:p>
     <w:p>
@@ -1496,7 +3001,7 @@
         <w:t>UC03 – Đổi mật khẩu:</w:t>
       </w:r>
       <w:r>
-        <w:t xml:space="preserve"> UC này cho phép người dùng đã đăng nhập thay đổi mật khẩu bằng cách xác minh mật khẩu hiện tại, nhập mật khẩu mới (độ dài ≥ 8, có chữ hoa/thường/số/đặc biệt). Sau khi đổi, tất cả session khác bị thu hồi.</w:t>
+        <w:t xml:space="preserve"> UC này cho phép người dùng đã đăng nhập (Khách hàng, Nhân viên) thay đổi mật khẩu bằng cách xác minh mật khẩu hiện tại, nhập mật khẩu mới (độ dài ≥ 8, có chữ hoa/thường/số/đặc biệt). Sau khi đổi, tất cả session khác bị thu hồi. UC này được kích hoạt từ UC01 (trang cá nhân → Bảo mật).</w:t>
       </w:r>
     </w:p>
     <w:p>
@@ -2676,7 +4181,7 @@
               <w:rPr>
                 <w:sz w:val="20"/>
               </w:rPr>
-              <w:t>&lt;table&gt;&lt;tr&gt;&lt;th&gt;Họ tên&lt;/th&gt;&lt;th&gt;SĐT&lt;/th&gt;&lt;th&gt;Email&lt;/th&gt;&lt;th&gt;Hạng hội viên&lt;/th&gt;&lt;th&gt;Điểm tích lũy&lt;/th&gt;&lt;th&gt;Ngày tham gia&lt;/th&gt;&lt;/tr&gt;&lt;tr&gt;&lt;td&gt;Nguyễn Văn An&lt;/td&gt;&lt;td&gt;0912345678&lt;/td&gt;&lt;td&gt;vana@email.com&lt;/td&gt;&lt;td&gt;Bạc&lt;/td&gt;&lt;td&gt;1.250&lt;/td&gt;&lt;td&gt;15/03/2024&lt;/td&gt;&lt;/tr&gt;&lt;/table&gt;</w:t>
+              <w:t>3. Nhấn [Chỉnh sửa thông tin].</w:t>
             </w:r>
             <w:r>
               <w:br/>
@@ -2685,7 +4190,7 @@
               <w:rPr>
                 <w:sz w:val="20"/>
               </w:rPr>
-              <w:t>3. Nhấn [Chỉnh sửa thông tin].</w:t>
+              <w:t>4. Chuyển sang chế độ chỉnh sửa: Họ tên, Email có thể nhập; SĐT bị khóa.</w:t>
             </w:r>
             <w:r>
               <w:br/>
@@ -2694,7 +4199,7 @@
               <w:rPr>
                 <w:sz w:val="20"/>
               </w:rPr>
-              <w:t>4. Chuyển sang chế độ chỉnh sửa: Họ tên, Email có thể nhập; SĐT bị khóa.</w:t>
+              <w:t>5. Cập nhật: Họ tên = "Nguyễn Văn An", Email = "vanan@newemail.com".</w:t>
             </w:r>
             <w:r>
               <w:br/>
@@ -2703,7 +4208,7 @@
               <w:rPr>
                 <w:sz w:val="20"/>
               </w:rPr>
-              <w:t>5. Cập nhật: Họ tên = "Nguyễn Văn An", Email = "vanan@newemail.com".</w:t>
+              <w:t>6. Nhấn [Lưu thay đổi].</w:t>
             </w:r>
             <w:r>
               <w:br/>
@@ -2712,7 +4217,7 @@
               <w:rPr>
                 <w:sz w:val="20"/>
               </w:rPr>
-              <w:t>6. Nhấn [Lưu thay đổi].</w:t>
+              <w:t>7. Kiểm tra email hợp lệ và chưa được dùng.</w:t>
             </w:r>
             <w:r>
               <w:br/>
@@ -2721,7 +4226,7 @@
               <w:rPr>
                 <w:sz w:val="20"/>
               </w:rPr>
-              <w:t>7. Kiểm tra email hợp lệ và chưa được dùng.</w:t>
+              <w:t>8. Cập nhật vào CSDL.</w:t>
             </w:r>
             <w:r>
               <w:br/>
@@ -2730,16 +4235,40 @@
               <w:rPr>
                 <w:sz w:val="20"/>
               </w:rPr>
-              <w:t>8. Cập nhật vào CSDL.</w:t>
+              <w:t>9. Hiển thị "Cập nhật thành công!" và quay về chế độ xem.</w:t>
             </w:r>
             <w:r>
               <w:br/>
             </w:r>
             <w:r>
               <w:rPr>
-                <w:sz w:val="20"/>
-              </w:rPr>
-              <w:t>9. Hiển thị "Cập nhật thành công!" và quay về chế độ xem.</w:t>
+                <w:rFonts w:ascii="Courier New" w:hAnsi="Courier New"/>
+                <w:sz w:val="16"/>
+              </w:rPr>
+              <w:t>Họ tên        | SĐT        | Email          | Hạng hội viên | Điểm tích lũy | Ngày tham gia</w:t>
+            </w:r>
+            <w:r>
+              <w:br/>
+            </w:r>
+            <w:r>
+              <w:rPr>
+                <w:rFonts w:ascii="Courier New" w:hAnsi="Courier New"/>
+                <w:sz w:val="16"/>
+              </w:rPr>
+              <w:t>--------------+------------+----------------+---------------+---------------+--------------</w:t>
+            </w:r>
+            <w:r>
+              <w:br/>
+            </w:r>
+            <w:r>
+              <w:rPr>
+                <w:rFonts w:ascii="Courier New" w:hAnsi="Courier New"/>
+                <w:sz w:val="16"/>
+              </w:rPr>
+              <w:t xml:space="preserve">Nguyễn Văn An | 0912345678 | vana@email.com | Bạc           | 1.250         | 15/03/2024   </w:t>
+            </w:r>
+            <w:r>
+              <w:br/>
             </w:r>
           </w:p>
         </w:tc>
@@ -2982,7 +4511,7 @@
               <w:rPr>
                 <w:sz w:val="20"/>
               </w:rPr>
-              <w:t>&lt;table&gt;&lt;tr&gt;&lt;th&gt;Họ tên&lt;/th&gt;&lt;th&gt;Vai trò&lt;/th&gt;&lt;th&gt;Trạng thái&lt;/th&gt;&lt;/tr&gt;&lt;tr&gt;&lt;td&gt;Trần Văn A&lt;/td&gt;&lt;td&gt;Lễ tân&lt;/td&gt;&lt;td&gt;Đang làm việc&lt;/td&gt;&lt;/tr&gt;&lt;tr&gt;&lt;td&gt;Lê Thị B&lt;/td&gt;&lt;td&gt;Phục vụ&lt;/td&gt;&lt;td&gt;Đang làm việc&lt;/td&gt;&lt;/tr&gt;&lt;tr&gt;&lt;td&gt;Phạm Văn C&lt;/td&gt;&lt;td&gt;Quản lý&lt;/td&gt;&lt;td&gt;Đang làm việc&lt;/td&gt;&lt;/tr&gt;&lt;/table&gt;</w:t>
+              <w:t>3a. Thêm nhân viên: Nhấn [Thêm] → Nhập thông tin → Lưu.</w:t>
             </w:r>
             <w:r>
               <w:br/>
@@ -2991,7 +4520,7 @@
               <w:rPr>
                 <w:sz w:val="20"/>
               </w:rPr>
-              <w:t>3a. Thêm nhân viên: Nhấn [Thêm] → Nhập thông tin → Lưu.</w:t>
+              <w:t>3b. Sửa nhân viên: Chọn nhân viên → Chỉnh sửa → Lưu.</w:t>
             </w:r>
             <w:r>
               <w:br/>
@@ -3000,16 +4529,60 @@
               <w:rPr>
                 <w:sz w:val="20"/>
               </w:rPr>
-              <w:t>3b. Sửa nhân viên: Chọn nhân viên → Chỉnh sửa → Lưu.</w:t>
+              <w:t>3c. Xóa nhân viên: Chọn nhân viên → Xác nhận xóa → Hệ thống chuyển trạng thái "Đã nghỉ".</w:t>
             </w:r>
             <w:r>
               <w:br/>
             </w:r>
             <w:r>
               <w:rPr>
-                <w:sz w:val="20"/>
-              </w:rPr>
-              <w:t>3c. Xóa nhân viên: Chọn nhân viên → Xác nhận xóa → Hệ thống chuyển trạng thái "Đã nghỉ".</w:t>
+                <w:rFonts w:ascii="Courier New" w:hAnsi="Courier New"/>
+                <w:sz w:val="16"/>
+              </w:rPr>
+              <w:t xml:space="preserve">Họ tên     | Vai trò | Trạng thái   </w:t>
+            </w:r>
+            <w:r>
+              <w:br/>
+            </w:r>
+            <w:r>
+              <w:rPr>
+                <w:rFonts w:ascii="Courier New" w:hAnsi="Courier New"/>
+                <w:sz w:val="16"/>
+              </w:rPr>
+              <w:t>-----------+---------+--------------</w:t>
+            </w:r>
+            <w:r>
+              <w:br/>
+            </w:r>
+            <w:r>
+              <w:rPr>
+                <w:rFonts w:ascii="Courier New" w:hAnsi="Courier New"/>
+                <w:sz w:val="16"/>
+              </w:rPr>
+              <w:t>Trần Văn A | Lễ tân  | Đang làm việc</w:t>
+            </w:r>
+            <w:r>
+              <w:br/>
+            </w:r>
+            <w:r>
+              <w:rPr>
+                <w:rFonts w:ascii="Courier New" w:hAnsi="Courier New"/>
+                <w:sz w:val="16"/>
+              </w:rPr>
+              <w:t>Lê Thị B   | Phục vụ | Đang làm việc</w:t>
+            </w:r>
+            <w:r>
+              <w:br/>
+            </w:r>
+            <w:r>
+              <w:rPr>
+                <w:rFonts w:ascii="Courier New" w:hAnsi="Courier New"/>
+                <w:sz w:val="16"/>
+              </w:rPr>
+              <w:t>Phạm Văn C | Quản lý | Đang làm việc</w:t>
+            </w:r>
+            <w:r>
+              <w:br/>
             </w:r>
           </w:p>
         </w:tc>

</xml_diff>

<commit_message>
feat: align account module with updated skill — English entities, React MVC conventions
Entity names aligned with dịch vụ sản phẩm module:
- NhanVien → Employee (tblEmployee) — shared entity
- NguoiDung → User (tblUser)
- HangHoiVien → MembershipTier (tblMembershipTier)
- PhienDangNhap → LoginSession (tblLoginSession)

Boundary conventions (txt/btn/tbl/lbl):
- Attributes: -txtSDT, -btnDangNhap, -tblStaff, -lblHoTen
- Methods: +formLoad(), +btnLoginClick(), +displayStaff(), +showMessage()

Control conventions (Spring Boot Controllers):
- AuthController: checkLogin, register, verifyOTP, changePassword
- ProfileController: getProfile, updateProfile
- StaffController: getAllStaff, searchStaff, saveStaff, deleteStaff

PlantUML style rules:
- left to right direction, skinparam linetype ortho
- Package colors: Boundary #E3F2FD, Control #E8F5E9, Entity #FFF3E0
- together {} blocks for horizontal grouping

DOCX: 528KB, 588 paragraphs, 47 tables, 11 images
</commit_message>
<xml_diff>
--- a/output/account_module.docx
+++ b/output/account_module.docx
@@ -1417,7 +1417,7 @@
       <w:r>
         <w:drawing>
           <wp:inline xmlns:a="http://schemas.openxmlformats.org/drawingml/2006/main" xmlns:pic="http://schemas.openxmlformats.org/drawingml/2006/picture">
-            <wp:extent cx="5486400" cy="9085309"/>
+            <wp:extent cx="5486400" cy="10576410"/>
             <wp:docPr id="1" name="Picture 1"/>
             <wp:cNvGraphicFramePr>
               <a:graphicFrameLocks noChangeAspect="1"/>
@@ -1438,7 +1438,7 @@
                   <pic:spPr>
                     <a:xfrm>
                       <a:off x="0" y="0"/>
-                      <a:ext cx="5486400" cy="9085309"/>
+                      <a:ext cx="5486400" cy="10576410"/>
                     </a:xfrm>
                     <a:prstGeom prst="rect"/>
                   </pic:spPr>
@@ -4668,55 +4668,55 @@
     <w:p>
       <w:pPr/>
       <w:r>
-        <w:t>▪ Khách hàng → lớp NguoiDung: hoTen, soDienThoai, email, matKhau, ngayTao</w:t>
+        <w:t>▪ Khách hàng → lớp User: hoTen, soDienThoai, email, matKhau, ngayTao</w:t>
       </w:r>
     </w:p>
     <w:p>
       <w:pPr/>
       <w:r>
-        <w:t>▪ Tài khoản → thuộc về NguoiDung (gộp vào NguoiDung, tránh tách thừa)</w:t>
+        <w:t>▪ Tài khoản → thuộc về User (gộp vào User, tránh tách thừa)</w:t>
       </w:r>
     </w:p>
     <w:p>
       <w:pPr/>
       <w:r>
-        <w:t>▪ Họ tên → thuộc tính của NguoiDung</w:t>
+        <w:t>▪ Họ tên → thuộc tính của User</w:t>
       </w:r>
     </w:p>
     <w:p>
       <w:pPr/>
       <w:r>
-        <w:t>▪ Số điện thoại → thuộc tính của NguoiDung (dùng làm username đăng nhập)</w:t>
+        <w:t>▪ Số điện thoại → thuộc tính của User (dùng làm username đăng nhập)</w:t>
       </w:r>
     </w:p>
     <w:p>
       <w:pPr/>
       <w:r>
-        <w:t>▪ Email → thuộc tính của NguoiDung</w:t>
+        <w:t>▪ Email → thuộc tính của User</w:t>
       </w:r>
     </w:p>
     <w:p>
       <w:pPr/>
       <w:r>
-        <w:t>▪ Mật khẩu → thuộc tính của NguoiDung (lưu dạng mã hóa bcrypt)</w:t>
+        <w:t>▪ Mật khẩu → thuộc tính của User (lưu dạng mã hóa bcrypt)</w:t>
       </w:r>
     </w:p>
     <w:p>
       <w:pPr/>
       <w:r>
-        <w:t>▪ Ngày tham gia → thuộc tính ngayTao của NguoiDung</w:t>
+        <w:t>▪ Ngày tham gia → thuộc tính ngayTao của User</w:t>
       </w:r>
     </w:p>
     <w:p>
       <w:pPr/>
       <w:r>
-        <w:t>▪ Hạng hội viên → lớp HangHoiVien: tenHang, diemToiThieu, moTa, heSoUuDai</w:t>
+        <w:t>▪ Hạng hội viên → lớp MembershipTier: tenHang, diemToiThieu, moTa, heSoUuDai</w:t>
       </w:r>
     </w:p>
     <w:p>
       <w:pPr/>
       <w:r>
-        <w:t>▪ Điểm tích lũy → thuộc tính diemTichLuy của NguoiDung</w:t>
+        <w:t>▪ Điểm tích lũy → thuộc tính diemTichLuy của User</w:t>
       </w:r>
     </w:p>
     <w:p>
@@ -4728,13 +4728,13 @@
     <w:p>
       <w:pPr/>
       <w:r>
-        <w:t>▪ Phiên đăng nhập → lớp PhienDangNhap: tokenPhien, thoiGianDangNhap, thoiGianHetHan, thietBi</w:t>
+        <w:t>▪ Phiên đăng nhập → lớp LoginSession: tokenPhien, thoiGianDangNhap, thoiGianHetHan, thietBi</w:t>
       </w:r>
     </w:p>
     <w:p>
       <w:pPr/>
       <w:r>
-        <w:t>▪ Lịch sử → loại: quá chung → cụ thể là PhienDangNhap đã đủ</w:t>
+        <w:t>▪ Lịch sử → loại: quá chung → cụ thể là LoginSession đã đủ</w:t>
       </w:r>
     </w:p>
     <w:p>
@@ -4752,7 +4752,7 @@
     <w:p>
       <w:pPr/>
       <w:r>
-        <w:t>▪ Nhân viên → lớp NhanVien: hoTen, vaiTro, chiNhanh, trangThai</w:t>
+        <w:t>▪ Nhân viên → lớp Employee: hoTen, vaiTro, chiNhanh, trangThai</w:t>
       </w:r>
     </w:p>
     <w:p>
@@ -4772,7 +4772,7 @@
     <w:p>
       <w:pPr/>
       <w:r>
-        <w:t>▪ 1 NguoiDung có 1 HangHoiVien → NguoiDung – HangHoiVien: n – 1</w:t>
+        <w:t>▪ 1 User có 1 MembershipTier → User – MembershipTier: n – 1</w:t>
       </w:r>
     </w:p>
     <w:p>
@@ -4784,7 +4784,7 @@
     <w:p>
       <w:pPr/>
       <w:r>
-        <w:t>▪ 1 NguoiDung có nhiều OTP → NguoiDung – OTP: 1 – n</w:t>
+        <w:t>▪ 1 User có nhiều OTP → User – OTP: 1 – n</w:t>
       </w:r>
     </w:p>
     <w:p>
@@ -4796,7 +4796,7 @@
     <w:p>
       <w:pPr/>
       <w:r>
-        <w:t>▪ 1 NguoiDung có nhiều PhienDangNhap → NguoiDung – PhienDangNhap: 1 – n</w:t>
+        <w:t>▪ 1 User có nhiều LoginSession → User – LoginSession: 1 – n</w:t>
       </w:r>
     </w:p>
     <w:p>
@@ -4816,7 +4816,7 @@
     <w:p>
       <w:pPr/>
       <w:r>
-        <w:t>NguoiDung gắn composition với OTP: một OTP không tồn tại độc lập nếu không có NguoiDung tương ứng (khi xóa NguoiDung thì xóa theo tất cả OTP). Tương tự, PhienDangNhap không tồn tại độc lập khỏi NguoiDung. Quan hệ với HangHoiVien là aggregation: HangHoiVien là dữ liệu danh mục tồn tại độc lập với NguoiDung. NhanVien là lớp riêng biệt, không kế thừa từ NguoiDung.</w:t>
+        <w:t>User gắn composition với OTP: một OTP không tồn tại độc lập nếu không có User tương ứng (khi xóa User thì xóa theo tất cả OTP). Tương tự, LoginSession không tồn tại độc lập khỏi User. Quan hệ với MembershipTier là aggregation: MembershipTier là dữ liệu danh mục tồn tại độc lập với User. Employee là lớp riêng biệt, không kế thừa từ User.</w:t>
       </w:r>
     </w:p>
     <w:p>
@@ -4826,7 +4826,7 @@
       <w:r>
         <w:drawing>
           <wp:inline xmlns:a="http://schemas.openxmlformats.org/drawingml/2006/main" xmlns:pic="http://schemas.openxmlformats.org/drawingml/2006/picture">
-            <wp:extent cx="5486400" cy="4454305"/>
+            <wp:extent cx="5486400" cy="4083627"/>
             <wp:docPr id="2" name="Picture 2"/>
             <wp:cNvGraphicFramePr>
               <a:graphicFrameLocks noChangeAspect="1"/>
@@ -4847,7 +4847,7 @@
                   <pic:spPr>
                     <a:xfrm>
                       <a:off x="0" y="0"/>
-                      <a:ext cx="5486400" cy="4454305"/>
+                      <a:ext cx="5486400" cy="4083627"/>
                     </a:xfrm>
                     <a:prstGeom prst="rect"/>
                   </pic:spPr>
@@ -5274,7 +5274,7 @@
     <w:p>
       <w:pPr/>
       <w:r>
-        <w:t>StaffManagePage: outDSNhanVien, outsubChonNV, subThem, subSua, subXoa</w:t>
+        <w:t>StaffManagePage: outDSEmployee, outsubChonNV, subThem, subSua, subXoa</w:t>
       </w:r>
     </w:p>
     <w:p>
@@ -5322,7 +5322,7 @@
     <w:p>
       <w:pPr/>
       <w:r>
-        <w:t>Lớp chủ thể: NguoiDung</w:t>
+        <w:t>Lớp chủ thể: User</w:t>
       </w:r>
     </w:p>
     <w:p>
@@ -5353,13 +5353,13 @@
     <w:p>
       <w:pPr/>
       <w:r>
-        <w:t>Output: NguoiDung (vừa tạo)</w:t>
+        <w:t>Output: User (vừa tạo)</w:t>
       </w:r>
     </w:p>
     <w:p>
       <w:pPr/>
       <w:r>
-        <w:t>Lớp chủ thể: NguoiDung</w:t>
+        <w:t>Lớp chủ thể: User</w:t>
       </w:r>
     </w:p>
     <w:p>
@@ -5433,7 +5433,7 @@
     <w:p>
       <w:pPr/>
       <w:r>
-        <w:t>Lớp chủ thể: NguoiDung</w:t>
+        <w:t>Lớp chủ thể: User</w:t>
       </w:r>
     </w:p>
     <w:p>
@@ -5464,13 +5464,13 @@
     <w:p>
       <w:pPr/>
       <w:r>
-        <w:t>Output: NguoiDung (thông tin hồ sơ)</w:t>
+        <w:t>Output: User (thông tin hồ sơ)</w:t>
       </w:r>
     </w:p>
     <w:p>
       <w:pPr/>
       <w:r>
-        <w:t>Lớp chủ thể: NguoiDung</w:t>
+        <w:t>Lớp chủ thể: User</w:t>
       </w:r>
     </w:p>
     <w:p>
@@ -5501,13 +5501,13 @@
     <w:p>
       <w:pPr/>
       <w:r>
-        <w:t>Output: NguoiDung (đã cập nhật)</w:t>
+        <w:t>Output: User (đã cập nhật)</w:t>
       </w:r>
     </w:p>
     <w:p>
       <w:pPr/>
       <w:r>
-        <w:t>Lớp chủ thể: NguoiDung</w:t>
+        <w:t>Lớp chủ thể: User</w:t>
       </w:r>
     </w:p>
     <w:p>
@@ -5538,13 +5538,13 @@
     <w:p>
       <w:pPr/>
       <w:r>
-        <w:t>Output: List\&lt;NhanVien\&gt;</w:t>
+        <w:t>Output: List\&lt;Employee\&gt;</w:t>
       </w:r>
     </w:p>
     <w:p>
       <w:pPr/>
       <w:r>
-        <w:t>Lớp chủ thể: NhanVien</w:t>
+        <w:t>Lớp chủ thể: Employee</w:t>
       </w:r>
     </w:p>
     <w:p>
@@ -5575,13 +5575,13 @@
     <w:p>
       <w:pPr/>
       <w:r>
-        <w:t>Output: NhanVien (vừa tạo)</w:t>
+        <w:t>Output: Employee (vừa tạo)</w:t>
       </w:r>
     </w:p>
     <w:p>
       <w:pPr/>
       <w:r>
-        <w:t>Lớp chủ thể: NhanVien</w:t>
+        <w:t>Lớp chủ thể: Employee</w:t>
       </w:r>
     </w:p>
     <w:p>
@@ -5612,13 +5612,13 @@
     <w:p>
       <w:pPr/>
       <w:r>
-        <w:t>Output: NhanVien (đã cập nhật)</w:t>
+        <w:t>Output: Employee (đã cập nhật)</w:t>
       </w:r>
     </w:p>
     <w:p>
       <w:pPr/>
       <w:r>
-        <w:t>Lớp chủ thể: NhanVien</w:t>
+        <w:t>Lớp chủ thể: Employee</w:t>
       </w:r>
     </w:p>
     <w:p>
@@ -5655,7 +5655,7 @@
     <w:p>
       <w:pPr/>
       <w:r>
-        <w:t>Lớp chủ thể: NhanVien</w:t>
+        <w:t>Lớp chủ thể: Employee</w:t>
       </w:r>
     </w:p>
     <w:p>
@@ -5665,7 +5665,7 @@
       <w:r>
         <w:drawing>
           <wp:inline xmlns:a="http://schemas.openxmlformats.org/drawingml/2006/main" xmlns:pic="http://schemas.openxmlformats.org/drawingml/2006/picture">
-            <wp:extent cx="5486400" cy="2743200"/>
+            <wp:extent cx="5486400" cy="2578007"/>
             <wp:docPr id="3" name="Picture 3"/>
             <wp:cNvGraphicFramePr>
               <a:graphicFrameLocks noChangeAspect="1"/>
@@ -5686,7 +5686,7 @@
                   <pic:spPr>
                     <a:xfrm>
                       <a:off x="0" y="0"/>
-                      <a:ext cx="5486400" cy="2743200"/>
+                      <a:ext cx="5486400" cy="2578007"/>
                     </a:xfrm>
                     <a:prstGeom prst="rect"/>
                   </pic:spPr>
@@ -5775,13 +5775,13 @@
         <w:t>findBySDT()</w:t>
       </w:r>
       <w:r>
-        <w:t xml:space="preserve"> của NguoiDung để tìm tài khoản theo SĐT.</w:t>
+        <w:t xml:space="preserve"> của User để tìm tài khoản theo SĐT.</w:t>
       </w:r>
     </w:p>
     <w:p>
       <w:pPr/>
       <w:r>
-        <w:t>7. NguoiDung trả về đối tượng NguoiDung cho AuthController.</w:t>
+        <w:t>7. User trả về đối tượng User cho AuthController.</w:t>
       </w:r>
     </w:p>
     <w:p>
@@ -5826,7 +5826,7 @@
         <w:pStyle w:val="ListBullet"/>
       </w:pPr>
       <w:r>
-        <w:t>NguoiDung trả về null (không tìm thấy tài khoản).</w:t>
+        <w:t>User trả về null (không tìm thấy tài khoản).</w:t>
       </w:r>
     </w:p>
     <w:p>
@@ -5940,7 +5940,7 @@
         <w:t>existsBySDT()</w:t>
       </w:r>
       <w:r>
-        <w:t xml:space="preserve"> của NguoiDung để kiểm tra SĐT chưa tồn tại.</w:t>
+        <w:t xml:space="preserve"> của User để kiểm tra SĐT chưa tồn tại.</w:t>
       </w:r>
     </w:p>
     <w:p>
@@ -5956,7 +5956,7 @@
         <w:t>existsByEmail()</w:t>
       </w:r>
       <w:r>
-        <w:t xml:space="preserve"> của NguoiDung để kiểm tra email chưa tồn tại.</w:t>
+        <w:t xml:space="preserve"> của User để kiểm tra email chưa tồn tại.</w:t>
       </w:r>
     </w:p>
     <w:p>
@@ -5969,7 +5969,7 @@
           <w:rFonts w:ascii="Courier New" w:hAnsi="Courier New"/>
           <w:sz w:val="20"/>
         </w:rPr>
-        <w:t>createNguoiDung()</w:t>
+        <w:t>createUser()</w:t>
       </w:r>
       <w:r>
         <w:t xml:space="preserve"> để tạo tài khoản mới.</w:t>
@@ -6203,7 +6203,7 @@
         <w:t>findByToken()</w:t>
       </w:r>
       <w:r>
-        <w:t xml:space="preserve"> của NguoiDung để lấy thông tin người dùng.</w:t>
+        <w:t xml:space="preserve"> của User để lấy thông tin người dùng.</w:t>
       </w:r>
     </w:p>
     <w:p>
@@ -6251,7 +6251,7 @@
         <w:t>updatePassword()</w:t>
       </w:r>
       <w:r>
-        <w:t xml:space="preserve"> của NguoiDung để cập nhật mật khẩu.</w:t>
+        <w:t xml:space="preserve"> của User để cập nhật mật khẩu.</w:t>
       </w:r>
     </w:p>
     <w:p>
@@ -6388,13 +6388,13 @@
         <w:t>findById(userId)</w:t>
       </w:r>
       <w:r>
-        <w:t xml:space="preserve"> của NguoiDung.</w:t>
+        <w:t xml:space="preserve"> của User.</w:t>
       </w:r>
     </w:p>
     <w:p>
       <w:pPr/>
       <w:r>
-        <w:t>4. NguoiDung trả về đối tượng NguoiDung cho ProfileController.</w:t>
+        <w:t>4. User trả về đối tượng User cho ProfileController.</w:t>
       </w:r>
     </w:p>
     <w:p>
@@ -6444,7 +6444,7 @@
         <w:t>checkEmail()</w:t>
       </w:r>
       <w:r>
-        <w:t xml:space="preserve"> của NguoiDung để kiểm tra email hợp lệ.</w:t>
+        <w:t xml:space="preserve"> của User để kiểm tra email hợp lệ.</w:t>
       </w:r>
     </w:p>
     <w:p>
@@ -6460,7 +6460,7 @@
         <w:t>update()</w:t>
       </w:r>
       <w:r>
-        <w:t xml:space="preserve"> của NguoiDung để cập nhật.</w:t>
+        <w:t xml:space="preserve"> của User để cập nhật.</w:t>
       </w:r>
     </w:p>
     <w:p>
@@ -6483,7 +6483,7 @@
         <w:pStyle w:val="ListBullet"/>
       </w:pPr>
       <w:r>
-        <w:t xml:space="preserve">NguoiDung trả về false từ </w:t>
+        <w:t xml:space="preserve">User trả về false từ </w:t>
       </w:r>
       <w:r>
         <w:rPr>
@@ -6556,13 +6556,13 @@
         <w:t>findAll()</w:t>
       </w:r>
       <w:r>
-        <w:t xml:space="preserve"> của NhanVien.</w:t>
+        <w:t xml:space="preserve"> của Employee.</w:t>
       </w:r>
     </w:p>
     <w:p>
       <w:pPr/>
       <w:r>
-        <w:t>4. NhanVien trả về danh sách nhân viên cho StaffController.</w:t>
+        <w:t>4. Employee trả về danh sách nhân viên cho StaffController.</w:t>
       </w:r>
     </w:p>
     <w:p>
@@ -6612,7 +6612,7 @@
         <w:t>save()</w:t>
       </w:r>
       <w:r>
-        <w:t xml:space="preserve"> của NhanVien.</w:t>
+        <w:t xml:space="preserve"> của Employee.</w:t>
       </w:r>
     </w:p>
     <w:p>
@@ -6635,7 +6635,7 @@
         <w:pStyle w:val="ListBullet"/>
       </w:pPr>
       <w:r>
-        <w:t>StaffController nhận lỗi từ NhanVien.</w:t>
+        <w:t>StaffController nhận lỗi từ Employee.</w:t>
       </w:r>
     </w:p>
     <w:p>
@@ -6660,7 +6660,7 @@
         <w:pStyle w:val="ListBullet"/>
       </w:pPr>
       <w:r>
-        <w:t>StaffController nhận lỗi từ NhanVien.</w:t>
+        <w:t>StaffController nhận lỗi từ Employee.</w:t>
       </w:r>
     </w:p>
     <w:p>
@@ -6705,7 +6705,7 @@
         <w:pStyle w:val="ListBullet"/>
       </w:pPr>
       <w:r>
-        <w:t xml:space="preserve">NguoiDung: </w:t>
+        <w:t xml:space="preserve">User: </w:t>
       </w:r>
       <w:r>
         <w:rPr>
@@ -6720,7 +6720,7 @@
         <w:pStyle w:val="ListBullet"/>
       </w:pPr>
       <w:r>
-        <w:t xml:space="preserve">HangHoiVien: </w:t>
+        <w:t xml:space="preserve">MembershipTier: </w:t>
       </w:r>
       <w:r>
         <w:rPr>
@@ -6750,7 +6750,7 @@
         <w:pStyle w:val="ListBullet"/>
       </w:pPr>
       <w:r>
-        <w:t xml:space="preserve">PhienDangNhap: </w:t>
+        <w:t xml:space="preserve">LoginSession: </w:t>
       </w:r>
       <w:r>
         <w:rPr>
@@ -6765,7 +6765,7 @@
         <w:pStyle w:val="ListBullet"/>
       </w:pPr>
       <w:r>
-        <w:t xml:space="preserve">NhanVien: </w:t>
+        <w:t xml:space="preserve">Employee: </w:t>
       </w:r>
       <w:r>
         <w:rPr>
@@ -6788,7 +6788,7 @@
         <w:pStyle w:val="ListBullet"/>
       </w:pPr>
       <w:r>
-        <w:t xml:space="preserve">NguoiDung: </w:t>
+        <w:t xml:space="preserve">User: </w:t>
       </w:r>
       <w:r>
         <w:rPr>
@@ -6873,7 +6873,7 @@
         <w:pStyle w:val="ListBullet"/>
       </w:pPr>
       <w:r>
-        <w:t xml:space="preserve">HangHoiVien: </w:t>
+        <w:t xml:space="preserve">MembershipTier: </w:t>
       </w:r>
       <w:r>
         <w:rPr>
@@ -6983,7 +6983,7 @@
         <w:pStyle w:val="ListBullet"/>
       </w:pPr>
       <w:r>
-        <w:t xml:space="preserve">PhienDangNhap: </w:t>
+        <w:t xml:space="preserve">LoginSession: </w:t>
       </w:r>
       <w:r>
         <w:rPr>
@@ -7038,7 +7038,7 @@
         <w:pStyle w:val="ListBullet"/>
       </w:pPr>
       <w:r>
-        <w:t xml:space="preserve">NhanVien: </w:t>
+        <w:t xml:space="preserve">Employee: </w:t>
       </w:r>
       <w:r>
         <w:rPr>
@@ -7091,7 +7091,7 @@
         <w:pStyle w:val="ListBullet"/>
       </w:pPr>
       <w:r>
-        <w:t xml:space="preserve">NguoiDung </w:t>
+        <w:t xml:space="preserve">User </w:t>
       </w:r>
       <w:r>
         <w:rPr>
@@ -7101,7 +7101,7 @@
         <w:t>o--</w:t>
       </w:r>
       <w:r>
-        <w:t xml:space="preserve"> HangHoiVien: aggregation (hạng hội viên là danh mục độc lập)</w:t>
+        <w:t xml:space="preserve"> MembershipTier: aggregation (hạng hội viên là danh mục độc lập)</w:t>
       </w:r>
     </w:p>
     <w:p>
@@ -7109,7 +7109,7 @@
         <w:pStyle w:val="ListBullet"/>
       </w:pPr>
       <w:r>
-        <w:t xml:space="preserve">NguoiDung </w:t>
+        <w:t xml:space="preserve">User </w:t>
       </w:r>
       <w:r>
         <w:rPr>
@@ -7127,7 +7127,7 @@
         <w:pStyle w:val="ListBullet"/>
       </w:pPr>
       <w:r>
-        <w:t xml:space="preserve">NguoiDung </w:t>
+        <w:t xml:space="preserve">User </w:t>
       </w:r>
       <w:r>
         <w:rPr>
@@ -7137,7 +7137,7 @@
         <w:t>*--</w:t>
       </w:r>
       <w:r>
-        <w:t xml:space="preserve"> PhienDangNhap: composition (phiên không tồn tại độc lập)</w:t>
+        <w:t xml:space="preserve"> LoginSession: composition (phiên không tồn tại độc lập)</w:t>
       </w:r>
     </w:p>
     <w:p>
@@ -7153,14 +7153,14 @@
         <w:pStyle w:val="ListBullet"/>
       </w:pPr>
       <w:r>
-        <w:t xml:space="preserve">NguoiDung: </w:t>
+        <w:t xml:space="preserve">User: </w:t>
       </w:r>
       <w:r>
         <w:rPr>
           <w:rFonts w:ascii="Courier New" w:hAnsi="Courier New"/>
           <w:sz w:val="20"/>
         </w:rPr>
-        <w:t>hangHoiVien : HangHoiVien</w:t>
+        <w:t>membershipTier : MembershipTier</w:t>
       </w:r>
     </w:p>
     <w:p>
@@ -7168,14 +7168,14 @@
         <w:pStyle w:val="ListBullet"/>
       </w:pPr>
       <w:r>
-        <w:t xml:space="preserve">PhienDangNhap: </w:t>
+        <w:t xml:space="preserve">LoginSession: </w:t>
       </w:r>
       <w:r>
         <w:rPr>
           <w:rFonts w:ascii="Courier New" w:hAnsi="Courier New"/>
           <w:sz w:val="20"/>
         </w:rPr>
-        <w:t>nguoiDung : NguoiDung</w:t>
+        <w:t>user : User</w:t>
       </w:r>
     </w:p>
     <w:p>
@@ -7190,7 +7190,7 @@
           <w:rFonts w:ascii="Courier New" w:hAnsi="Courier New"/>
           <w:sz w:val="20"/>
         </w:rPr>
-        <w:t>nguoiDung : NguoiDung</w:t>
+        <w:t>user : User</w:t>
       </w:r>
     </w:p>
     <w:p>
@@ -7208,7 +7208,7 @@
       <w:r>
         <w:drawing>
           <wp:inline xmlns:a="http://schemas.openxmlformats.org/drawingml/2006/main" xmlns:pic="http://schemas.openxmlformats.org/drawingml/2006/picture">
-            <wp:extent cx="5486400" cy="3657600"/>
+            <wp:extent cx="5486400" cy="3711627"/>
             <wp:docPr id="4" name="Picture 4"/>
             <wp:cNvGraphicFramePr>
               <a:graphicFrameLocks noChangeAspect="1"/>
@@ -7229,7 +7229,7 @@
                   <pic:spPr>
                     <a:xfrm>
                       <a:off x="0" y="0"/>
-                      <a:ext cx="5486400" cy="3657600"/>
+                      <a:ext cx="5486400" cy="3711627"/>
                     </a:xfrm>
                     <a:prstGeom prst="rect"/>
                   </pic:spPr>
@@ -7320,7 +7320,7 @@
               <w:rPr>
                 <w:sz w:val="20"/>
               </w:rPr>
-              <w:t>NguoiDung</w:t>
+              <w:t>User</w:t>
             </w:r>
           </w:p>
         </w:tc>
@@ -7335,7 +7335,7 @@
               <w:rPr>
                 <w:sz w:val="20"/>
               </w:rPr>
-              <w:t>tblNguoiDung</w:t>
+              <w:t>tblUser</w:t>
             </w:r>
           </w:p>
         </w:tc>
@@ -7352,7 +7352,7 @@
               <w:rPr>
                 <w:sz w:val="20"/>
               </w:rPr>
-              <w:t>HangHoiVien</w:t>
+              <w:t>MembershipTier</w:t>
             </w:r>
           </w:p>
         </w:tc>
@@ -7367,7 +7367,7 @@
               <w:rPr>
                 <w:sz w:val="20"/>
               </w:rPr>
-              <w:t>tblHangHoiVien</w:t>
+              <w:t>tblMembershipTier</w:t>
             </w:r>
           </w:p>
         </w:tc>
@@ -7416,7 +7416,7 @@
               <w:rPr>
                 <w:sz w:val="20"/>
               </w:rPr>
-              <w:t>PhienDangNhap</w:t>
+              <w:t>LoginSession</w:t>
             </w:r>
           </w:p>
         </w:tc>
@@ -7431,7 +7431,7 @@
               <w:rPr>
                 <w:sz w:val="20"/>
               </w:rPr>
-              <w:t>tblPhienDangNhap</w:t>
+              <w:t>tblLoginSession</w:t>
             </w:r>
           </w:p>
         </w:tc>
@@ -7448,7 +7448,7 @@
               <w:rPr>
                 <w:sz w:val="20"/>
               </w:rPr>
-              <w:t>NhanVien</w:t>
+              <w:t>Employee</w:t>
             </w:r>
           </w:p>
         </w:tc>
@@ -7463,7 +7463,7 @@
               <w:rPr>
                 <w:sz w:val="20"/>
               </w:rPr>
-              <w:t>tblNhanVien</w:t>
+              <w:t>tblEmployee</w:t>
             </w:r>
           </w:p>
         </w:tc>
@@ -7697,14 +7697,14 @@
         <w:pStyle w:val="ListBullet"/>
       </w:pPr>
       <w:r>
-        <w:t xml:space="preserve">NguoiDung – HangHoiVien (n-1): tblNguoiDung có FK </w:t>
+        <w:t xml:space="preserve">User – MembershipTier (n-1): tblUser có FK </w:t>
       </w:r>
       <w:r>
         <w:rPr>
           <w:rFonts w:ascii="Courier New" w:hAnsi="Courier New"/>
           <w:sz w:val="20"/>
         </w:rPr>
-        <w:t>tblHangHoiVienMa</w:t>
+        <w:t>tblMembershipTierMa</w:t>
       </w:r>
     </w:p>
     <w:p>
@@ -7712,14 +7712,14 @@
         <w:pStyle w:val="ListBullet"/>
       </w:pPr>
       <w:r>
-        <w:t xml:space="preserve">NguoiDung – OTP (1-n): tblOTP có FK </w:t>
+        <w:t xml:space="preserve">User – OTP (1-n): tblOTP có FK </w:t>
       </w:r>
       <w:r>
         <w:rPr>
           <w:rFonts w:ascii="Courier New" w:hAnsi="Courier New"/>
           <w:sz w:val="20"/>
         </w:rPr>
-        <w:t>tblNguoiDungMa</w:t>
+        <w:t>tblUserMa</w:t>
       </w:r>
     </w:p>
     <w:p>
@@ -7727,14 +7727,14 @@
         <w:pStyle w:val="ListBullet"/>
       </w:pPr>
       <w:r>
-        <w:t xml:space="preserve">NguoiDung – PhienDangNhap (1-n): tblPhienDangNhap có FK </w:t>
+        <w:t xml:space="preserve">User – LoginSession (1-n): tblLoginSession có FK </w:t>
       </w:r>
       <w:r>
         <w:rPr>
           <w:rFonts w:ascii="Courier New" w:hAnsi="Courier New"/>
           <w:sz w:val="20"/>
         </w:rPr>
-        <w:t>tblNguoiDungMa</w:t>
+        <w:t>tblUserMa</w:t>
       </w:r>
     </w:p>
     <w:p>
@@ -7790,7 +7790,7 @@
       <w:r>
         <w:drawing>
           <wp:inline xmlns:a="http://schemas.openxmlformats.org/drawingml/2006/main" xmlns:pic="http://schemas.openxmlformats.org/drawingml/2006/picture">
-            <wp:extent cx="5486400" cy="5188892"/>
+            <wp:extent cx="5486400" cy="6374318"/>
             <wp:docPr id="5" name="Picture 5"/>
             <wp:cNvGraphicFramePr>
               <a:graphicFrameLocks noChangeAspect="1"/>
@@ -7811,7 +7811,7 @@
                   <pic:spPr>
                     <a:xfrm>
                       <a:off x="0" y="0"/>
-                      <a:ext cx="5486400" cy="5188892"/>
+                      <a:ext cx="5486400" cy="6374318"/>
                     </a:xfrm>
                     <a:prstGeom prst="rect"/>
                   </pic:spPr>
@@ -8115,7 +8115,7 @@
         <w:t>Entity:</w:t>
       </w:r>
       <w:r>
-        <w:t xml:space="preserve"> NguoiDung, HangHoiVien, OTP, PhienDangNhap, NhanVien</w:t>
+        <w:t xml:space="preserve"> User, MembershipTier, OTP, LoginSession, Employee</w:t>
       </w:r>
     </w:p>
     <w:p>
@@ -8137,7 +8137,7 @@
           <w:rFonts w:ascii="Courier New" w:hAnsi="Courier New"/>
           <w:sz w:val="20"/>
         </w:rPr>
-        <w:t>login()</w:t>
+        <w:t>checkLogin()</w:t>
       </w:r>
     </w:p>
     <w:p>
@@ -8145,7 +8145,7 @@
         <w:pStyle w:val="ListBullet"/>
       </w:pPr>
       <w:r>
-        <w:t>Input: sdt, matKhau</w:t>
+        <w:t>Input: username, password</w:t>
       </w:r>
     </w:p>
     <w:p>
@@ -8153,7 +8153,7 @@
         <w:pStyle w:val="ListBullet"/>
       </w:pPr>
       <w:r>
-        <w:t>Output: NguoiDung + Session</w:t>
+        <w:t>Output: boolean</w:t>
       </w:r>
     </w:p>
     <w:p>
@@ -8173,7 +8173,7 @@
           <w:rFonts w:ascii="Courier New" w:hAnsi="Courier New"/>
           <w:sz w:val="20"/>
         </w:rPr>
-        <w:t>login(sdt: String, matKhau: String)</w:t>
+        <w:t>checkLogin(username: String, password: String)</w:t>
       </w:r>
       <w:r>
         <w:t xml:space="preserve"> → chọn (gom nhóm tham số)</w:t>
@@ -8196,10 +8196,10 @@
           <w:rFonts w:ascii="Courier New" w:hAnsi="Courier New"/>
           <w:sz w:val="20"/>
         </w:rPr>
-        <w:t>login(): void</w:t>
-      </w:r>
-      <w:r>
-        <w:t xml:space="preserve"> → loại (cần trả về thông tin đăng nhập)</w:t>
+        <w:t>checkLogin(): void</w:t>
+      </w:r>
+      <w:r>
+        <w:t xml:space="preserve"> → loại (cần trả về kết quả xác thực)</w:t>
       </w:r>
     </w:p>
     <w:p>
@@ -8211,10 +8211,10 @@
           <w:rFonts w:ascii="Courier New" w:hAnsi="Courier New"/>
           <w:sz w:val="20"/>
         </w:rPr>
-        <w:t>login(): NguoiDung</w:t>
-      </w:r>
-      <w:r>
-        <w:t xml:space="preserve"> → chọn (trả về thông tin người dùng)</w:t>
+        <w:t>checkLogin(): boolean</w:t>
+      </w:r>
+      <w:r>
+        <w:t xml:space="preserve"> → chọn (trả về true/false xác thực thành công)</w:t>
       </w:r>
     </w:p>
     <w:p>
@@ -8243,7 +8243,7 @@
         <w:pStyle w:val="ListBullet"/>
       </w:pPr>
       <w:r>
-        <w:t>Output: NguoiDung (vừa tạo)</w:t>
+        <w:t>Output: User (vừa tạo)</w:t>
       </w:r>
     </w:p>
     <w:p>
@@ -8286,7 +8286,7 @@
           <w:rFonts w:ascii="Courier New" w:hAnsi="Courier New"/>
           <w:sz w:val="20"/>
         </w:rPr>
-        <w:t>register(): NguoiDung</w:t>
+        <w:t>register(): User</w:t>
       </w:r>
       <w:r>
         <w:t xml:space="preserve"> → chọn</w:t>
@@ -8468,7 +8468,7 @@
         <w:pStyle w:val="ListBullet"/>
       </w:pPr>
       <w:r>
-        <w:t>Output: NguoiDung</w:t>
+        <w:t>Output: User</w:t>
       </w:r>
     </w:p>
     <w:p>
@@ -8511,7 +8511,7 @@
           <w:rFonts w:ascii="Courier New" w:hAnsi="Courier New"/>
           <w:sz w:val="20"/>
         </w:rPr>
-        <w:t>getProfile(): NguoiDung</w:t>
+        <w:t>getProfile(): User</w:t>
       </w:r>
       <w:r>
         <w:t xml:space="preserve"> → chọn</w:t>
@@ -8543,7 +8543,7 @@
         <w:pStyle w:val="ListBullet"/>
       </w:pPr>
       <w:r>
-        <w:t>Output: NguoiDung</w:t>
+        <w:t>Output: User</w:t>
       </w:r>
     </w:p>
     <w:p>
@@ -8586,7 +8586,7 @@
           <w:rFonts w:ascii="Courier New" w:hAnsi="Courier New"/>
           <w:sz w:val="20"/>
         </w:rPr>
-        <w:t>updateProfile(): NguoiDung</w:t>
+        <w:t>updateProfile(): User</w:t>
       </w:r>
       <w:r>
         <w:t xml:space="preserve"> → chọn</w:t>
@@ -8602,7 +8602,7 @@
           <w:rFonts w:ascii="Courier New" w:hAnsi="Courier New"/>
           <w:sz w:val="20"/>
         </w:rPr>
-        <w:t>getStaffList()</w:t>
+        <w:t>getAllStaff()</w:t>
       </w:r>
     </w:p>
     <w:p>
@@ -8618,7 +8618,7 @@
         <w:pStyle w:val="ListBullet"/>
       </w:pPr>
       <w:r>
-        <w:t>Output: List\&lt;NhanVien\&gt;</w:t>
+        <w:t>Output: List\&lt;Employee\&gt;</w:t>
       </w:r>
     </w:p>
     <w:p>
@@ -8638,7 +8638,7 @@
           <w:rFonts w:ascii="Courier New" w:hAnsi="Courier New"/>
           <w:sz w:val="20"/>
         </w:rPr>
-        <w:t>getStaffList()</w:t>
+        <w:t>getAllStaff()</w:t>
       </w:r>
       <w:r>
         <w:t xml:space="preserve"> → chọn</w:t>
@@ -8661,7 +8661,7 @@
           <w:rFonts w:ascii="Courier New" w:hAnsi="Courier New"/>
           <w:sz w:val="20"/>
         </w:rPr>
-        <w:t>getStaffList(): List&lt;NhanVien&gt;</w:t>
+        <w:t>getAllStaff(): List&lt;Employee&gt;</w:t>
       </w:r>
       <w:r>
         <w:t xml:space="preserve"> → chọn</w:t>
@@ -8670,14 +8670,14 @@
     <w:p>
       <w:pPr/>
       <w:r>
-        <w:t xml:space="preserve">h) Thêm NV =&gt; </w:t>
+        <w:t xml:space="preserve">h) Tìm kiếm NV =&gt; </w:t>
       </w:r>
       <w:r>
         <w:rPr>
           <w:rFonts w:ascii="Courier New" w:hAnsi="Courier New"/>
           <w:sz w:val="20"/>
         </w:rPr>
-        <w:t>addStaff()</w:t>
+        <w:t>searchStaff()</w:t>
       </w:r>
     </w:p>
     <w:p>
@@ -8685,7 +8685,7 @@
         <w:pStyle w:val="ListBullet"/>
       </w:pPr>
       <w:r>
-        <w:t>Input: hoTen, vaiTro</w:t>
+        <w:t>Input: keyword</w:t>
       </w:r>
     </w:p>
     <w:p>
@@ -8693,7 +8693,7 @@
         <w:pStyle w:val="ListBullet"/>
       </w:pPr>
       <w:r>
-        <w:t>Output: NhanVien</w:t>
+        <w:t>Output: List\&lt;Employee\&gt;</w:t>
       </w:r>
     </w:p>
     <w:p>
@@ -8713,7 +8713,7 @@
           <w:rFonts w:ascii="Courier New" w:hAnsi="Courier New"/>
           <w:sz w:val="20"/>
         </w:rPr>
-        <w:t>addStaff(hoTen: String, vaiTro: String)</w:t>
+        <w:t>searchStaff(keyword: String)</w:t>
       </w:r>
       <w:r>
         <w:t xml:space="preserve"> → chọn</w:t>
@@ -8736,7 +8736,7 @@
           <w:rFonts w:ascii="Courier New" w:hAnsi="Courier New"/>
           <w:sz w:val="20"/>
         </w:rPr>
-        <w:t>addStaff(): NhanVien</w:t>
+        <w:t>searchStaff(): List&lt;Employee&gt;</w:t>
       </w:r>
       <w:r>
         <w:t xml:space="preserve"> → chọn</w:t>
@@ -8745,7 +8745,157 @@
     <w:p>
       <w:pPr/>
       <w:r>
-        <w:t xml:space="preserve">i) Sửa NV =&gt; </w:t>
+        <w:t xml:space="preserve">i) Lấy NV theo id =&gt; </w:t>
+      </w:r>
+      <w:r>
+        <w:rPr>
+          <w:rFonts w:ascii="Courier New" w:hAnsi="Courier New"/>
+          <w:sz w:val="20"/>
+        </w:rPr>
+        <w:t>getStaffById()</w:t>
+      </w:r>
+    </w:p>
+    <w:p>
+      <w:pPr>
+        <w:pStyle w:val="ListBullet"/>
+      </w:pPr>
+      <w:r>
+        <w:t>Input: id</w:t>
+      </w:r>
+    </w:p>
+    <w:p>
+      <w:pPr>
+        <w:pStyle w:val="ListBullet"/>
+      </w:pPr>
+      <w:r>
+        <w:t>Output: Employee</w:t>
+      </w:r>
+    </w:p>
+    <w:p>
+      <w:pPr>
+        <w:pStyle w:val="ListBullet"/>
+      </w:pPr>
+      <w:r>
+        <w:t>Ứng viên tham số vào:</w:t>
+      </w:r>
+    </w:p>
+    <w:p>
+      <w:pPr>
+        <w:pStyle w:val="ListBullet"/>
+      </w:pPr>
+      <w:r>
+        <w:rPr>
+          <w:rFonts w:ascii="Courier New" w:hAnsi="Courier New"/>
+          <w:sz w:val="20"/>
+        </w:rPr>
+        <w:t>getStaffById(id: int)</w:t>
+      </w:r>
+      <w:r>
+        <w:t xml:space="preserve"> → chọn</w:t>
+      </w:r>
+    </w:p>
+    <w:p>
+      <w:pPr>
+        <w:pStyle w:val="ListBullet"/>
+      </w:pPr>
+      <w:r>
+        <w:t>Ứng viên tham số ra:</w:t>
+      </w:r>
+    </w:p>
+    <w:p>
+      <w:pPr>
+        <w:pStyle w:val="ListBullet"/>
+      </w:pPr>
+      <w:r>
+        <w:rPr>
+          <w:rFonts w:ascii="Courier New" w:hAnsi="Courier New"/>
+          <w:sz w:val="20"/>
+        </w:rPr>
+        <w:t>getStaffById(): Employee</w:t>
+      </w:r>
+      <w:r>
+        <w:t xml:space="preserve"> → chọn</w:t>
+      </w:r>
+    </w:p>
+    <w:p>
+      <w:pPr/>
+      <w:r>
+        <w:t xml:space="preserve">j) Thêm NV =&gt; </w:t>
+      </w:r>
+      <w:r>
+        <w:rPr>
+          <w:rFonts w:ascii="Courier New" w:hAnsi="Courier New"/>
+          <w:sz w:val="20"/>
+        </w:rPr>
+        <w:t>saveStaff()</w:t>
+      </w:r>
+    </w:p>
+    <w:p>
+      <w:pPr>
+        <w:pStyle w:val="ListBullet"/>
+      </w:pPr>
+      <w:r>
+        <w:t>Input: employee</w:t>
+      </w:r>
+    </w:p>
+    <w:p>
+      <w:pPr>
+        <w:pStyle w:val="ListBullet"/>
+      </w:pPr>
+      <w:r>
+        <w:t>Output: boolean</w:t>
+      </w:r>
+    </w:p>
+    <w:p>
+      <w:pPr>
+        <w:pStyle w:val="ListBullet"/>
+      </w:pPr>
+      <w:r>
+        <w:t>Ứng viên tham số vào:</w:t>
+      </w:r>
+    </w:p>
+    <w:p>
+      <w:pPr>
+        <w:pStyle w:val="ListBullet"/>
+      </w:pPr>
+      <w:r>
+        <w:rPr>
+          <w:rFonts w:ascii="Courier New" w:hAnsi="Courier New"/>
+          <w:sz w:val="20"/>
+        </w:rPr>
+        <w:t>saveStaff(employee: Employee)</w:t>
+      </w:r>
+      <w:r>
+        <w:t xml:space="preserve"> → chọn</w:t>
+      </w:r>
+    </w:p>
+    <w:p>
+      <w:pPr>
+        <w:pStyle w:val="ListBullet"/>
+      </w:pPr>
+      <w:r>
+        <w:t>Ứng viên tham số ra:</w:t>
+      </w:r>
+    </w:p>
+    <w:p>
+      <w:pPr>
+        <w:pStyle w:val="ListBullet"/>
+      </w:pPr>
+      <w:r>
+        <w:rPr>
+          <w:rFonts w:ascii="Courier New" w:hAnsi="Courier New"/>
+          <w:sz w:val="20"/>
+        </w:rPr>
+        <w:t>saveStaff(): boolean</w:t>
+      </w:r>
+      <w:r>
+        <w:t xml:space="preserve"> → chọn (cần biết thành công/thất bại)</w:t>
+      </w:r>
+    </w:p>
+    <w:p>
+      <w:pPr/>
+      <w:r>
+        <w:t xml:space="preserve">k) Sửa NV =&gt; </w:t>
       </w:r>
       <w:r>
         <w:rPr>
@@ -8760,7 +8910,7 @@
         <w:pStyle w:val="ListBullet"/>
       </w:pPr>
       <w:r>
-        <w:t>Input: id, hoTen, vaiTro</w:t>
+        <w:t>Input: employee</w:t>
       </w:r>
     </w:p>
     <w:p>
@@ -8768,7 +8918,7 @@
         <w:pStyle w:val="ListBullet"/>
       </w:pPr>
       <w:r>
-        <w:t>Output: NhanVien</w:t>
+        <w:t>Output: boolean</w:t>
       </w:r>
     </w:p>
     <w:p>
@@ -8788,7 +8938,7 @@
           <w:rFonts w:ascii="Courier New" w:hAnsi="Courier New"/>
           <w:sz w:val="20"/>
         </w:rPr>
-        <w:t>updateStaff(id: int, hoTen: String, vaiTro: String)</w:t>
+        <w:t>updateStaff(employee: Employee)</w:t>
       </w:r>
       <w:r>
         <w:t xml:space="preserve"> → chọn</w:t>
@@ -8811,7 +8961,7 @@
           <w:rFonts w:ascii="Courier New" w:hAnsi="Courier New"/>
           <w:sz w:val="20"/>
         </w:rPr>
-        <w:t>updateStaff(): NhanVien</w:t>
+        <w:t>updateStaff(): boolean</w:t>
       </w:r>
       <w:r>
         <w:t xml:space="preserve"> → chọn</w:t>
@@ -8820,7 +8970,7 @@
     <w:p>
       <w:pPr/>
       <w:r>
-        <w:t xml:space="preserve">j) Xóa NV =&gt; </w:t>
+        <w:t xml:space="preserve">l) Xóa NV =&gt; </w:t>
       </w:r>
       <w:r>
         <w:rPr>
@@ -8899,7 +9049,7 @@
       <w:r>
         <w:drawing>
           <wp:inline xmlns:a="http://schemas.openxmlformats.org/drawingml/2006/main" xmlns:pic="http://schemas.openxmlformats.org/drawingml/2006/picture">
-            <wp:extent cx="5486400" cy="2875258"/>
+            <wp:extent cx="5486400" cy="4756649"/>
             <wp:docPr id="6" name="Picture 6"/>
             <wp:cNvGraphicFramePr>
               <a:graphicFrameLocks noChangeAspect="1"/>
@@ -8920,7 +9070,7 @@
                   <pic:spPr>
                     <a:xfrm>
                       <a:off x="0" y="0"/>
-                      <a:ext cx="5486400" cy="2875258"/>
+                      <a:ext cx="5486400" cy="4756649"/>
                     </a:xfrm>
                     <a:prstGeom prst="rect"/>
                   </pic:spPr>
@@ -8960,7 +9110,7 @@
       <w:r>
         <w:drawing>
           <wp:inline xmlns:a="http://schemas.openxmlformats.org/drawingml/2006/main" xmlns:pic="http://schemas.openxmlformats.org/drawingml/2006/picture">
-            <wp:extent cx="5486400" cy="3628353"/>
+            <wp:extent cx="5486400" cy="2830160"/>
             <wp:docPr id="7" name="Picture 7"/>
             <wp:cNvGraphicFramePr>
               <a:graphicFrameLocks noChangeAspect="1"/>
@@ -8981,7 +9131,7 @@
                   <pic:spPr>
                     <a:xfrm>
                       <a:off x="0" y="0"/>
-                      <a:ext cx="5486400" cy="3628353"/>
+                      <a:ext cx="5486400" cy="2830160"/>
                     </a:xfrm>
                     <a:prstGeom prst="rect"/>
                   </pic:spPr>
@@ -9033,7 +9183,7 @@
           <w:rFonts w:ascii="Courier New" w:hAnsi="Courier New"/>
           <w:sz w:val="20"/>
         </w:rPr>
-        <w:t>render()</w:t>
+        <w:t>formLoad()</w:t>
       </w:r>
       <w:r>
         <w:t xml:space="preserve"> của lớp LoginPage được gọi, hiển thị form gồm ô nhập SĐT/Email, ô nhập Mật khẩu, nút [Đăng nhập], liên kết "Quên mật khẩu?" / "Đăng ký".</w:t>
@@ -9061,7 +9211,7 @@
           <w:rFonts w:ascii="Courier New" w:hAnsi="Courier New"/>
           <w:sz w:val="20"/>
         </w:rPr>
-        <w:t>handleSubmit()</w:t>
+        <w:t>btnLoginClick()</w:t>
       </w:r>
       <w:r>
         <w:t xml:space="preserve"> của lớp LoginPage được gọi.</w:t>
@@ -9077,7 +9227,7 @@
           <w:rFonts w:ascii="Courier New" w:hAnsi="Courier New"/>
           <w:sz w:val="20"/>
         </w:rPr>
-        <w:t>handleSubmit()</w:t>
+        <w:t>btnLoginClick()</w:t>
       </w:r>
       <w:r>
         <w:t xml:space="preserve"> gọi phương thức </w:t>
@@ -9087,7 +9237,7 @@
           <w:rFonts w:ascii="Courier New" w:hAnsi="Courier New"/>
           <w:sz w:val="20"/>
         </w:rPr>
-        <w:t>login(sdt: String, matKhau: String): NguoiDung</w:t>
+        <w:t>checkLogin(username : String, password : String) : boolean</w:t>
       </w:r>
       <w:r>
         <w:t xml:space="preserve"> của lớp AuthController.</w:t>
@@ -9103,7 +9253,7 @@
           <w:rFonts w:ascii="Courier New" w:hAnsi="Courier New"/>
           <w:sz w:val="20"/>
         </w:rPr>
-        <w:t>login()</w:t>
+        <w:t>checkLogin()</w:t>
       </w:r>
       <w:r>
         <w:t xml:space="preserve"> gọi phương thức </w:t>
@@ -9113,23 +9263,23 @@
           <w:rFonts w:ascii="Courier New" w:hAnsi="Courier New"/>
           <w:sz w:val="20"/>
         </w:rPr>
-        <w:t>findBySDT(sdt: String): NguoiDung</w:t>
-      </w:r>
-      <w:r>
-        <w:t xml:space="preserve"> của lớp NguoiDung.</w:t>
+        <w:t>findBySDT(username : String) : User</w:t>
+      </w:r>
+      <w:r>
+        <w:t xml:space="preserve"> của lớp User.</w:t>
       </w:r>
     </w:p>
     <w:p>
       <w:pPr/>
       <w:r>
-        <w:t xml:space="preserve">8. Lớp NguoiDung trả về đối tượng NguoiDung cho phương thức </w:t>
+        <w:t xml:space="preserve">8. Lớp User trả về đối tượng User cho phương thức </w:t>
       </w:r>
       <w:r>
         <w:rPr>
           <w:rFonts w:ascii="Courier New" w:hAnsi="Courier New"/>
           <w:sz w:val="20"/>
         </w:rPr>
-        <w:t>login()</w:t>
+        <w:t>checkLogin()</w:t>
       </w:r>
       <w:r>
         <w:t>.</w:t>
@@ -9145,7 +9295,7 @@
           <w:rFonts w:ascii="Courier New" w:hAnsi="Courier New"/>
           <w:sz w:val="20"/>
         </w:rPr>
-        <w:t>login()</w:t>
+        <w:t>checkLogin()</w:t>
       </w:r>
       <w:r>
         <w:t xml:space="preserve"> gọi </w:t>
@@ -9155,7 +9305,7 @@
           <w:rFonts w:ascii="Courier New" w:hAnsi="Courier New"/>
           <w:sz w:val="20"/>
         </w:rPr>
-        <w:t>checkPassword(matKhau: String, hash: String): boolean</w:t>
+        <w:t>checkPassword(password : String, hash : String) : boolean</w:t>
       </w:r>
       <w:r>
         <w:t xml:space="preserve"> để so sánh mật khẩu.</w:t>
@@ -9171,33 +9321,43 @@
           <w:rFonts w:ascii="Courier New" w:hAnsi="Courier New"/>
           <w:sz w:val="20"/>
         </w:rPr>
-        <w:t>login()</w:t>
-      </w:r>
-      <w:r>
-        <w:t xml:space="preserve"> trả về đối tượng NguoiDung cho phương thức </w:t>
+        <w:t>checkLogin()</w:t>
+      </w:r>
+      <w:r>
+        <w:t xml:space="preserve"> trả về </w:t>
       </w:r>
       <w:r>
         <w:rPr>
           <w:rFonts w:ascii="Courier New" w:hAnsi="Courier New"/>
           <w:sz w:val="20"/>
         </w:rPr>
-        <w:t>handleSubmit()</w:t>
-      </w:r>
-      <w:r>
-        <w:t>.</w:t>
-      </w:r>
-    </w:p>
-    <w:p>
-      <w:pPr/>
-      <w:r>
-        <w:t xml:space="preserve">11. Phương thức </w:t>
+        <w:t>true</w:t>
+      </w:r>
+      <w:r>
+        <w:t xml:space="preserve"> cho phương thức </w:t>
       </w:r>
       <w:r>
         <w:rPr>
           <w:rFonts w:ascii="Courier New" w:hAnsi="Courier New"/>
           <w:sz w:val="20"/>
         </w:rPr>
-        <w:t>handleSubmit()</w:t>
+        <w:t>btnLoginClick()</w:t>
+      </w:r>
+      <w:r>
+        <w:t>.</w:t>
+      </w:r>
+    </w:p>
+    <w:p>
+      <w:pPr/>
+      <w:r>
+        <w:t xml:space="preserve">11. Phương thức </w:t>
+      </w:r>
+      <w:r>
+        <w:rPr>
+          <w:rFonts w:ascii="Courier New" w:hAnsi="Courier New"/>
+          <w:sz w:val="20"/>
+        </w:rPr>
+        <w:t>btnLoginClick()</w:t>
       </w:r>
       <w:r>
         <w:t xml:space="preserve"> gọi </w:t>
@@ -9210,7 +9370,7 @@
         <w:t>redirect /home</w:t>
       </w:r>
       <w:r>
-        <w:t>, hiển thị "Đăng nhập thành công. Xin chào, Nguyễn Văn A!".</w:t>
+        <w:t>, hiển thị showMessage("Đăng nhập thành công. Xin chào, Nguyễn Văn A!").</w:t>
       </w:r>
     </w:p>
     <w:p>
@@ -9262,7 +9422,7 @@
           <w:rFonts w:ascii="Courier New" w:hAnsi="Courier New"/>
           <w:sz w:val="20"/>
         </w:rPr>
-        <w:t>login()</w:t>
+        <w:t>checkLogin()</w:t>
       </w:r>
       <w:r>
         <w:t xml:space="preserve"> trả về </w:t>
@@ -9272,7 +9432,7 @@
           <w:rFonts w:ascii="Courier New" w:hAnsi="Courier New"/>
           <w:sz w:val="20"/>
         </w:rPr>
-        <w:t>null</w:t>
+        <w:t>false</w:t>
       </w:r>
       <w:r>
         <w:t xml:space="preserve"> cho </w:t>
@@ -9282,7 +9442,7 @@
           <w:rFonts w:ascii="Courier New" w:hAnsi="Courier New"/>
           <w:sz w:val="20"/>
         </w:rPr>
-        <w:t>handleSubmit()</w:t>
+        <w:t>btnLoginClick()</w:t>
       </w:r>
       <w:r>
         <w:t>.</w:t>
@@ -9293,7 +9453,7 @@
         <w:pStyle w:val="ListBullet"/>
       </w:pPr>
       <w:r>
-        <w:t>Lớp LoginPage hiển thị "Tài khoản không tồn tại. Vui lòng kiểm tra lại."</w:t>
+        <w:t>Lớp LoginPage hiển thị showMessage("Tài khoản không tồn tại. Vui lòng kiểm tra lại.")</w:t>
       </w:r>
     </w:p>
     <w:p>
@@ -9345,7 +9505,7 @@
           <w:rFonts w:ascii="Courier New" w:hAnsi="Courier New"/>
           <w:sz w:val="20"/>
         </w:rPr>
-        <w:t>login()</w:t>
+        <w:t>checkLogin()</w:t>
       </w:r>
       <w:r>
         <w:t xml:space="preserve"> trả về </w:t>
@@ -9355,7 +9515,7 @@
           <w:rFonts w:ascii="Courier New" w:hAnsi="Courier New"/>
           <w:sz w:val="20"/>
         </w:rPr>
-        <w:t>null</w:t>
+        <w:t>false</w:t>
       </w:r>
       <w:r>
         <w:t xml:space="preserve"> cho </w:t>
@@ -9365,7 +9525,7 @@
           <w:rFonts w:ascii="Courier New" w:hAnsi="Courier New"/>
           <w:sz w:val="20"/>
         </w:rPr>
-        <w:t>handleSubmit()</w:t>
+        <w:t>btnLoginClick()</w:t>
       </w:r>
       <w:r>
         <w:t>.</w:t>
@@ -9376,7 +9536,7 @@
         <w:pStyle w:val="ListBullet"/>
       </w:pPr>
       <w:r>
-        <w:t>Lớp LoginPage hiển thị "Mật khẩu không chính xác. Còn [N] lần thử."</w:t>
+        <w:t>Lớp LoginPage hiển thị showMessage("Mật khẩu không chính xác. Còn [N] lần thử.")</w:t>
       </w:r>
     </w:p>
     <w:p>
@@ -9394,7 +9554,7 @@
       <w:r>
         <w:drawing>
           <wp:inline xmlns:a="http://schemas.openxmlformats.org/drawingml/2006/main" xmlns:pic="http://schemas.openxmlformats.org/drawingml/2006/picture">
-            <wp:extent cx="5486400" cy="5128591"/>
+            <wp:extent cx="5486400" cy="4170604"/>
             <wp:docPr id="8" name="Picture 8"/>
             <wp:cNvGraphicFramePr>
               <a:graphicFrameLocks noChangeAspect="1"/>
@@ -9415,7 +9575,7 @@
                   <pic:spPr>
                     <a:xfrm>
                       <a:off x="0" y="0"/>
-                      <a:ext cx="5486400" cy="5128591"/>
+                      <a:ext cx="5486400" cy="4170604"/>
                     </a:xfrm>
                     <a:prstGeom prst="rect"/>
                   </pic:spPr>
@@ -9467,7 +9627,7 @@
           <w:rFonts w:ascii="Courier New" w:hAnsi="Courier New"/>
           <w:sz w:val="20"/>
         </w:rPr>
-        <w:t>render()</w:t>
+        <w:t>formLoad()</w:t>
       </w:r>
       <w:r>
         <w:t xml:space="preserve"> của lớp RegisterPage được gọi, hiển thị form gồm: Họ tên, SĐT, Email, Mật khẩu, Xác nhận MK.</w:t>
@@ -9495,7 +9655,7 @@
           <w:rFonts w:ascii="Courier New" w:hAnsi="Courier New"/>
           <w:sz w:val="20"/>
         </w:rPr>
-        <w:t>handleSubmit()</w:t>
+        <w:t>btnTiepTucClick()</w:t>
       </w:r>
       <w:r>
         <w:t xml:space="preserve"> của lớp RegisterPage được gọi.</w:t>
@@ -9511,7 +9671,7 @@
           <w:rFonts w:ascii="Courier New" w:hAnsi="Courier New"/>
           <w:sz w:val="20"/>
         </w:rPr>
-        <w:t>handleSubmit()</w:t>
+        <w:t>btnTiepTucClick()</w:t>
       </w:r>
       <w:r>
         <w:t xml:space="preserve"> gọi phương thức </w:t>
@@ -9521,7 +9681,7 @@
           <w:rFonts w:ascii="Courier New" w:hAnsi="Courier New"/>
           <w:sz w:val="20"/>
         </w:rPr>
-        <w:t>register(hoTen: String, sdt: String, email: String, matKhau: String): NguoiDung</w:t>
+        <w:t>register(hoTen : String, sdt : String, email : String, matKhau : String) : User</w:t>
       </w:r>
       <w:r>
         <w:t xml:space="preserve"> của lớp AuthController.</w:t>
@@ -9547,16 +9707,16 @@
           <w:rFonts w:ascii="Courier New" w:hAnsi="Courier New"/>
           <w:sz w:val="20"/>
         </w:rPr>
-        <w:t>existsBySDT(sdt: String): boolean</w:t>
-      </w:r>
-      <w:r>
-        <w:t xml:space="preserve"> của lớp NguoiDung để kiểm tra SĐT.</w:t>
+        <w:t>existsBySDT(sdt : String) : boolean</w:t>
+      </w:r>
+      <w:r>
+        <w:t xml:space="preserve"> của lớp User để kiểm tra SĐT.</w:t>
       </w:r>
     </w:p>
     <w:p>
       <w:pPr/>
       <w:r>
-        <w:t xml:space="preserve">8. NguoiDung trả về </w:t>
+        <w:t xml:space="preserve">8. User trả về </w:t>
       </w:r>
       <w:r>
         <w:rPr>
@@ -9589,16 +9749,16 @@
           <w:rFonts w:ascii="Courier New" w:hAnsi="Courier New"/>
           <w:sz w:val="20"/>
         </w:rPr>
-        <w:t>existsByEmail(email: String): boolean</w:t>
-      </w:r>
-      <w:r>
-        <w:t xml:space="preserve"> của lớp NguoiDung để kiểm tra email.</w:t>
+        <w:t>existsByEmail(email : String) : boolean</w:t>
+      </w:r>
+      <w:r>
+        <w:t xml:space="preserve"> của lớp User để kiểm tra email.</w:t>
       </w:r>
     </w:p>
     <w:p>
       <w:pPr/>
       <w:r>
-        <w:t xml:space="preserve">10. NguoiDung trả về </w:t>
+        <w:t xml:space="preserve">10. User trả về </w:t>
       </w:r>
       <w:r>
         <w:rPr>
@@ -9631,7 +9791,7 @@
           <w:rFonts w:ascii="Courier New" w:hAnsi="Courier New"/>
           <w:sz w:val="20"/>
         </w:rPr>
-        <w:t>save(): NguoiDung</w:t>
+        <w:t>save() : User</w:t>
       </w:r>
       <w:r>
         <w:t xml:space="preserve"> để tạo tài khoản mới.</w:t>
@@ -9657,7 +9817,7 @@
           <w:rFonts w:ascii="Courier New" w:hAnsi="Courier New"/>
           <w:sz w:val="20"/>
         </w:rPr>
-        <w:t>sendOTP(sdt: String, loai: String): void</w:t>
+        <w:t>sendOTP(sdt : String, loai : String) : void</w:t>
       </w:r>
       <w:r>
         <w:t xml:space="preserve"> của lớp OTP.</w:t>
@@ -9682,14 +9842,14 @@
         <w:t>register()</w:t>
       </w:r>
       <w:r>
-        <w:t xml:space="preserve"> trả về đối tượng NguoiDung cho </w:t>
+        <w:t xml:space="preserve"> trả về đối tượng User cho </w:t>
       </w:r>
       <w:r>
         <w:rPr>
           <w:rFonts w:ascii="Courier New" w:hAnsi="Courier New"/>
           <w:sz w:val="20"/>
         </w:rPr>
-        <w:t>handleSubmit()</w:t>
+        <w:t>btnTiepTucClick()</w:t>
       </w:r>
       <w:r>
         <w:t>.</w:t>
@@ -9717,7 +9877,7 @@
           <w:rFonts w:ascii="Courier New" w:hAnsi="Courier New"/>
           <w:sz w:val="20"/>
         </w:rPr>
-        <w:t>handleSubmit()</w:t>
+        <w:t>btnXacNhanClick()</w:t>
       </w:r>
       <w:r>
         <w:t xml:space="preserve"> của lớp OTPVerifyPage được gọi.</w:t>
@@ -9733,7 +9893,7 @@
           <w:rFonts w:ascii="Courier New" w:hAnsi="Courier New"/>
           <w:sz w:val="20"/>
         </w:rPr>
-        <w:t>verifyOTP(otp: String): boolean</w:t>
+        <w:t>verifyOTP(otp : String) : boolean</w:t>
       </w:r>
       <w:r>
         <w:t xml:space="preserve"> của AuthController.</w:t>
@@ -9749,7 +9909,7 @@
           <w:rFonts w:ascii="Courier New" w:hAnsi="Courier New"/>
           <w:sz w:val="20"/>
         </w:rPr>
-        <w:t>verify(otp: String): boolean</w:t>
+        <w:t>verify(otp : String) : boolean</w:t>
       </w:r>
       <w:r>
         <w:t xml:space="preserve"> của lớp OTP.</w:t>
@@ -9790,7 +9950,7 @@
     <w:p>
       <w:pPr/>
       <w:r>
-        <w:t>22. OTPVerifyPage hiển thị "Đăng ký thành công! Chào mừng Nguyễn Thị Bình."</w:t>
+        <w:t>22. OTPVerifyPage hiển thị showMessage("Đăng ký thành công! Chào mừng Nguyễn Thị Bình.")</w:t>
       </w:r>
     </w:p>
     <w:p>
@@ -9843,7 +10003,7 @@
         <w:pStyle w:val="ListBullet"/>
       </w:pPr>
       <w:r>
-        <w:t>RegisterPage hiển thị "SĐT này đã được sử dụng."</w:t>
+        <w:t>RegisterPage hiển thị showMessage("SĐT này đã được sử dụng.")</w:t>
       </w:r>
     </w:p>
     <w:p>
@@ -9906,7 +10066,7 @@
         <w:pStyle w:val="ListBullet"/>
       </w:pPr>
       <w:r>
-        <w:t>OTPVerifyPage hiển thị "Mã OTP không đúng. Vui lòng thử lại."</w:t>
+        <w:t>OTPVerifyPage hiển thị showMessage("Mã OTP không đúng. Vui lòng thử lại.")</w:t>
       </w:r>
     </w:p>
     <w:p>
@@ -9924,7 +10084,7 @@
       <w:r>
         <w:drawing>
           <wp:inline xmlns:a="http://schemas.openxmlformats.org/drawingml/2006/main" xmlns:pic="http://schemas.openxmlformats.org/drawingml/2006/picture">
-            <wp:extent cx="5486400" cy="3540138"/>
+            <wp:extent cx="5486400" cy="2900218"/>
             <wp:docPr id="9" name="Picture 9"/>
             <wp:cNvGraphicFramePr>
               <a:graphicFrameLocks noChangeAspect="1"/>
@@ -9945,7 +10105,7 @@
                   <pic:spPr>
                     <a:xfrm>
                       <a:off x="0" y="0"/>
-                      <a:ext cx="5486400" cy="3540138"/>
+                      <a:ext cx="5486400" cy="2900218"/>
                     </a:xfrm>
                     <a:prstGeom prst="rect"/>
                   </pic:spPr>
@@ -9997,7 +10157,7 @@
           <w:rFonts w:ascii="Courier New" w:hAnsi="Courier New"/>
           <w:sz w:val="20"/>
         </w:rPr>
-        <w:t>render()</w:t>
+        <w:t>formLoad()</w:t>
       </w:r>
       <w:r>
         <w:t xml:space="preserve"> của lớp ChangePasswordPage được gọi, hiển thị form: Mật khẩu hiện tại, Mật khẩu mới, Xác nhận MK mới.</w:t>
@@ -10025,7 +10185,7 @@
           <w:rFonts w:ascii="Courier New" w:hAnsi="Courier New"/>
           <w:sz w:val="20"/>
         </w:rPr>
-        <w:t>handleSubmit()</w:t>
+        <w:t>btnLuuClick()</w:t>
       </w:r>
       <w:r>
         <w:t xml:space="preserve"> của lớp ChangePasswordPage được gọi.</w:t>
@@ -10041,7 +10201,7 @@
           <w:rFonts w:ascii="Courier New" w:hAnsi="Courier New"/>
           <w:sz w:val="20"/>
         </w:rPr>
-        <w:t>handleSubmit()</w:t>
+        <w:t>btnLuuClick()</w:t>
       </w:r>
       <w:r>
         <w:t xml:space="preserve"> gọi </w:t>
@@ -10051,7 +10211,7 @@
           <w:rFonts w:ascii="Courier New" w:hAnsi="Courier New"/>
           <w:sz w:val="20"/>
         </w:rPr>
-        <w:t>changePassword(mkHienTai: String, mkMoi: String): boolean</w:t>
+        <w:t>changePassword(mkHienTai : String, mkMoi : String) : boolean</w:t>
       </w:r>
       <w:r>
         <w:t xml:space="preserve"> của AuthController.</w:t>
@@ -10077,16 +10237,16 @@
           <w:rFonts w:ascii="Courier New" w:hAnsi="Courier New"/>
           <w:sz w:val="20"/>
         </w:rPr>
-        <w:t>findById(userId: int): NguoiDung</w:t>
-      </w:r>
-      <w:r>
-        <w:t xml:space="preserve"> của lớp NguoiDung.</w:t>
+        <w:t>findById(userId : int) : User</w:t>
+      </w:r>
+      <w:r>
+        <w:t xml:space="preserve"> của lớp User.</w:t>
       </w:r>
     </w:p>
     <w:p>
       <w:pPr/>
       <w:r>
-        <w:t xml:space="preserve">8. NguoiDung trả về đối tượng NguoiDung cho </w:t>
+        <w:t xml:space="preserve">8. User trả về đối tượng User cho </w:t>
       </w:r>
       <w:r>
         <w:rPr>
@@ -10119,7 +10279,7 @@
           <w:rFonts w:ascii="Courier New" w:hAnsi="Courier New"/>
           <w:sz w:val="20"/>
         </w:rPr>
-        <w:t>checkPassword(mkHienTai: String, hash: String): boolean</w:t>
+        <w:t>checkPassword(mkHienTai : String, hash : String) : boolean</w:t>
       </w:r>
       <w:r>
         <w:t xml:space="preserve"> để xác minh MK hiện tại.</w:t>
@@ -10145,7 +10305,7 @@
           <w:rFonts w:ascii="Courier New" w:hAnsi="Courier New"/>
           <w:sz w:val="20"/>
         </w:rPr>
-        <w:t>hashPassword(mkMoi: String): String</w:t>
+        <w:t>hashPassword(mkMoi : String) : String</w:t>
       </w:r>
       <w:r>
         <w:t xml:space="preserve"> để mã hóa MK mới.</w:t>
@@ -10171,16 +10331,16 @@
           <w:rFonts w:ascii="Courier New" w:hAnsi="Courier New"/>
           <w:sz w:val="20"/>
         </w:rPr>
-        <w:t>updatePassword(hash: String): boolean</w:t>
-      </w:r>
-      <w:r>
-        <w:t xml:space="preserve"> của lớp NguoiDung.</w:t>
+        <w:t>updatePassword(hash : String) : boolean</w:t>
+      </w:r>
+      <w:r>
+        <w:t xml:space="preserve"> của lớp User.</w:t>
       </w:r>
     </w:p>
     <w:p>
       <w:pPr/>
       <w:r>
-        <w:t xml:space="preserve">12. NguoiDung trả về </w:t>
+        <w:t xml:space="preserve">12. User trả về </w:t>
       </w:r>
       <w:r>
         <w:rPr>
@@ -10213,7 +10373,7 @@
           <w:rFonts w:ascii="Courier New" w:hAnsi="Courier New"/>
           <w:sz w:val="20"/>
         </w:rPr>
-        <w:t>revokeAllSessions(): void</w:t>
+        <w:t>revokeAllSessions() : void</w:t>
       </w:r>
       <w:r>
         <w:t xml:space="preserve"> để thu hồi tất cả session.</w:t>
@@ -10249,7 +10409,7 @@
           <w:rFonts w:ascii="Courier New" w:hAnsi="Courier New"/>
           <w:sz w:val="20"/>
         </w:rPr>
-        <w:t>handleSubmit()</w:t>
+        <w:t>btnLuuClick()</w:t>
       </w:r>
       <w:r>
         <w:t>.</w:t>
@@ -10258,7 +10418,7 @@
     <w:p>
       <w:pPr/>
       <w:r>
-        <w:t>15. ChangePasswordPage hiển thị "Đổi mật khẩu thành công. Vui lòng đăng nhập lại."</w:t>
+        <w:t>15. ChangePasswordPage hiển thị showMessage("Đổi mật khẩu thành công. Vui lòng đăng nhập lại.")</w:t>
       </w:r>
     </w:p>
     <w:p>
@@ -10321,7 +10481,7 @@
         <w:pStyle w:val="ListBullet"/>
       </w:pPr>
       <w:r>
-        <w:t>ChangePasswordPage hiển thị "Mật khẩu hiện tại không chính xác."</w:t>
+        <w:t>ChangePasswordPage hiển thị showMessage("Mật khẩu hiện tại không chính xác.")</w:t>
       </w:r>
     </w:p>
     <w:p>
@@ -10364,7 +10524,7 @@
         <w:pStyle w:val="ListBullet"/>
       </w:pPr>
       <w:r>
-        <w:t>ChangePasswordPage hiển thị "Mật khẩu mới không được trùng mật khẩu hiện tại."</w:t>
+        <w:t>ChangePasswordPage hiển thị showMessage("Mật khẩu mới không được trùng mật khẩu hiện tại.")</w:t>
       </w:r>
     </w:p>
     <w:p>
@@ -10382,7 +10542,7 @@
       <w:r>
         <w:drawing>
           <wp:inline xmlns:a="http://schemas.openxmlformats.org/drawingml/2006/main" xmlns:pic="http://schemas.openxmlformats.org/drawingml/2006/picture">
-            <wp:extent cx="5486400" cy="3694922"/>
+            <wp:extent cx="5486400" cy="3509131"/>
             <wp:docPr id="10" name="Picture 10"/>
             <wp:cNvGraphicFramePr>
               <a:graphicFrameLocks noChangeAspect="1"/>
@@ -10403,7 +10563,7 @@
                   <pic:spPr>
                     <a:xfrm>
                       <a:off x="0" y="0"/>
-                      <a:ext cx="5486400" cy="3694922"/>
+                      <a:ext cx="5486400" cy="3509131"/>
                     </a:xfrm>
                     <a:prstGeom prst="rect"/>
                   </pic:spPr>
@@ -10445,7 +10605,7 @@
           <w:rFonts w:ascii="Courier New" w:hAnsi="Courier New"/>
           <w:sz w:val="20"/>
         </w:rPr>
-        <w:t>loadProfile()</w:t>
+        <w:t>formLoad()</w:t>
       </w:r>
       <w:r>
         <w:t xml:space="preserve"> của lớp ProfilePage được gọi.</w:t>
@@ -10461,7 +10621,7 @@
           <w:rFonts w:ascii="Courier New" w:hAnsi="Courier New"/>
           <w:sz w:val="20"/>
         </w:rPr>
-        <w:t>getProfile(userId: int): NguoiDung</w:t>
+        <w:t>getProfile(userId : int) : User</w:t>
       </w:r>
       <w:r>
         <w:t xml:space="preserve"> của ProfileController.</w:t>
@@ -10477,88 +10637,98 @@
           <w:rFonts w:ascii="Courier New" w:hAnsi="Courier New"/>
           <w:sz w:val="20"/>
         </w:rPr>
-        <w:t>findById(userId: int): NguoiDung</w:t>
-      </w:r>
-      <w:r>
-        <w:t xml:space="preserve"> của lớp NguoiDung.</w:t>
+        <w:t>findById(userId : int) : User</w:t>
+      </w:r>
+      <w:r>
+        <w:t xml:space="preserve"> của lớp User.</w:t>
       </w:r>
     </w:p>
     <w:p>
       <w:pPr/>
       <w:r>
-        <w:t>5. NguoiDung trả về đối tượng NguoiDung cho ProfileController.</w:t>
+        <w:t>5. User trả về đối tượng User cho ProfileController.</w:t>
       </w:r>
     </w:p>
     <w:p>
       <w:pPr/>
       <w:r>
-        <w:t>6. ProfileController trả về đối tượng NguoiDung cho ProfilePage.</w:t>
+        <w:t>6. ProfileController trả về đối tượng User cho ProfilePage.</w:t>
       </w:r>
     </w:p>
     <w:p>
       <w:pPr/>
       <w:r>
-        <w:t>7. ProfilePage render hồ sơ: Họ tên, SĐT, Email, Hạng hội viên, Điểm tích lũy, Ngày tham gia.</w:t>
-      </w:r>
-    </w:p>
-    <w:p>
-      <w:pPr/>
-      <w:r>
-        <w:t>8. Khách hàng click [Chỉnh sửa], sửa Họ tên = "Nguyễn Văn An", Email = "vanan@newemail.com", click [Lưu].</w:t>
-      </w:r>
-    </w:p>
-    <w:p>
-      <w:pPr/>
-      <w:r>
-        <w:t xml:space="preserve">9. Phương thức </w:t>
+        <w:t xml:space="preserve">7. ProfilePage gọi </w:t>
       </w:r>
       <w:r>
         <w:rPr>
           <w:rFonts w:ascii="Courier New" w:hAnsi="Courier New"/>
           <w:sz w:val="20"/>
         </w:rPr>
-        <w:t>handleSave()</w:t>
-      </w:r>
-      <w:r>
-        <w:t xml:space="preserve"> của lớp ProfilePage được gọi.</w:t>
+        <w:t>displayProfile(data : User)</w:t>
+      </w:r>
+      <w:r>
+        <w:t xml:space="preserve"> để render hồ sơ: Họ tên, SĐT, Email, Hạng hội viên, Điểm tích lũy, Ngày tham gia.</w:t>
       </w:r>
     </w:p>
     <w:p>
       <w:pPr/>
       <w:r>
-        <w:t xml:space="preserve">10. ProfilePage gọi </w:t>
+        <w:t>8. Khách hàng click [Chỉnh sửa], sửa Họ tên = "Nguyễn Văn An", Email = "vanan@newemail.com", click [Lưu].</w:t>
+      </w:r>
+    </w:p>
+    <w:p>
+      <w:pPr/>
+      <w:r>
+        <w:t xml:space="preserve">9. Phương thức </w:t>
       </w:r>
       <w:r>
         <w:rPr>
           <w:rFonts w:ascii="Courier New" w:hAnsi="Courier New"/>
           <w:sz w:val="20"/>
         </w:rPr>
-        <w:t>updateProfile(userId: int, hoTen: String, email: String): NguoiDung</w:t>
-      </w:r>
-      <w:r>
-        <w:t xml:space="preserve"> của ProfileController.</w:t>
+        <w:t>btnChinhSuaClick()</w:t>
+      </w:r>
+      <w:r>
+        <w:t xml:space="preserve"> của lớp ProfilePage được gọi.</w:t>
       </w:r>
     </w:p>
     <w:p>
       <w:pPr/>
       <w:r>
-        <w:t xml:space="preserve">11. ProfileController gọi </w:t>
+        <w:t xml:space="preserve">10. ProfilePage gọi </w:t>
       </w:r>
       <w:r>
         <w:rPr>
           <w:rFonts w:ascii="Courier New" w:hAnsi="Courier New"/>
           <w:sz w:val="20"/>
         </w:rPr>
-        <w:t>checkEmail(email: String): boolean</w:t>
-      </w:r>
-      <w:r>
-        <w:t xml:space="preserve"> của lớp NguoiDung.</w:t>
+        <w:t>updateProfile(userId : int, hoTen : String, email : String) : User</w:t>
+      </w:r>
+      <w:r>
+        <w:t xml:space="preserve"> của ProfileController.</w:t>
       </w:r>
     </w:p>
     <w:p>
       <w:pPr/>
       <w:r>
-        <w:t xml:space="preserve">12. NguoiDung trả về </w:t>
+        <w:t xml:space="preserve">11. ProfileController gọi </w:t>
+      </w:r>
+      <w:r>
+        <w:rPr>
+          <w:rFonts w:ascii="Courier New" w:hAnsi="Courier New"/>
+          <w:sz w:val="20"/>
+        </w:rPr>
+        <w:t>checkEmail(email : String) : boolean</w:t>
+      </w:r>
+      <w:r>
+        <w:t xml:space="preserve"> của lớp User.</w:t>
+      </w:r>
+    </w:p>
+    <w:p>
+      <w:pPr/>
+      <w:r>
+        <w:t xml:space="preserve">12. User trả về </w:t>
       </w:r>
       <w:r>
         <w:rPr>
@@ -10581,7 +10751,7 @@
           <w:rFonts w:ascii="Courier New" w:hAnsi="Courier New"/>
           <w:sz w:val="20"/>
         </w:rPr>
-        <w:t>save(): NguoiDung</w:t>
+        <w:t>save() : User</w:t>
       </w:r>
       <w:r>
         <w:t xml:space="preserve"> để cập nhật.</w:t>
@@ -10590,19 +10760,35 @@
     <w:p>
       <w:pPr/>
       <w:r>
-        <w:t>14. NguoiDung trả về đối tượng NguoiDung đã cập nhật.</w:t>
+        <w:t>14. User trả về đối tượng User đã cập nhật.</w:t>
       </w:r>
     </w:p>
     <w:p>
       <w:pPr/>
       <w:r>
-        <w:t>15. ProfileController trả về NguoiDung cho ProfilePage.</w:t>
+        <w:t>15. ProfileController trả về User cho ProfilePage.</w:t>
       </w:r>
     </w:p>
     <w:p>
       <w:pPr/>
       <w:r>
-        <w:t>16. ProfilePage hiển thị "Cập nhật thành công!"</w:t>
+        <w:t xml:space="preserve">16. ProfilePage gọi </w:t>
+      </w:r>
+      <w:r>
+        <w:rPr>
+          <w:rFonts w:ascii="Courier New" w:hAnsi="Courier New"/>
+          <w:sz w:val="20"/>
+        </w:rPr>
+        <w:t>displayProfile(data : User)</w:t>
+      </w:r>
+      <w:r>
+        <w:t xml:space="preserve"> để cập nhật giao diện.</w:t>
+      </w:r>
+    </w:p>
+    <w:p>
+      <w:pPr/>
+      <w:r>
+        <w:t>17. ProfilePage hiển thị showMessage("Cập nhật thành công!")</w:t>
       </w:r>
     </w:p>
     <w:p>
@@ -10655,7 +10841,7 @@
         <w:pStyle w:val="ListBullet"/>
       </w:pPr>
       <w:r>
-        <w:t>ProfilePage hiển thị "Email này đã được đăng ký bởi tài khoản khác."</w:t>
+        <w:t>ProfilePage hiển thị showMessage("Email này đã được đăng ký bởi tài khoản khác.")</w:t>
       </w:r>
     </w:p>
     <w:p>
@@ -10673,7 +10859,7 @@
       <w:r>
         <w:drawing>
           <wp:inline xmlns:a="http://schemas.openxmlformats.org/drawingml/2006/main" xmlns:pic="http://schemas.openxmlformats.org/drawingml/2006/picture">
-            <wp:extent cx="5486400" cy="3664039"/>
+            <wp:extent cx="5486400" cy="5952465"/>
             <wp:docPr id="11" name="Picture 11"/>
             <wp:cNvGraphicFramePr>
               <a:graphicFrameLocks noChangeAspect="1"/>
@@ -10694,7 +10880,7 @@
                   <pic:spPr>
                     <a:xfrm>
                       <a:off x="0" y="0"/>
-                      <a:ext cx="5486400" cy="3664039"/>
+                      <a:ext cx="5486400" cy="5952465"/>
                     </a:xfrm>
                     <a:prstGeom prst="rect"/>
                   </pic:spPr>
@@ -10746,7 +10932,7 @@
           <w:rFonts w:ascii="Courier New" w:hAnsi="Courier New"/>
           <w:sz w:val="20"/>
         </w:rPr>
-        <w:t>loadStaff()</w:t>
+        <w:t>formLoad()</w:t>
       </w:r>
       <w:r>
         <w:t xml:space="preserve"> của lớp StaffManagePage được gọi.</w:t>
@@ -10762,7 +10948,7 @@
           <w:rFonts w:ascii="Courier New" w:hAnsi="Courier New"/>
           <w:sz w:val="20"/>
         </w:rPr>
-        <w:t>getStaffList(): List&lt;NhanVien&gt;</w:t>
+        <w:t>getAllStaff() : List&lt;Employee&gt;</w:t>
       </w:r>
       <w:r>
         <w:t xml:space="preserve"> của StaffController.</w:t>
@@ -10778,16 +10964,16 @@
           <w:rFonts w:ascii="Courier New" w:hAnsi="Courier New"/>
           <w:sz w:val="20"/>
         </w:rPr>
-        <w:t>findAll(): List&lt;NhanVien&gt;</w:t>
-      </w:r>
-      <w:r>
-        <w:t xml:space="preserve"> của lớp NhanVien.</w:t>
+        <w:t>findAll() : List&lt;Employee&gt;</w:t>
+      </w:r>
+      <w:r>
+        <w:t xml:space="preserve"> của lớp Employee.</w:t>
       </w:r>
     </w:p>
     <w:p>
       <w:pPr/>
       <w:r>
-        <w:t>5. NhanVien trả về danh sách nhân viên cho StaffController.</w:t>
+        <w:t>5. Employee trả về danh sách nhân viên cho StaffController.</w:t>
       </w:r>
     </w:p>
     <w:p>
@@ -10800,7 +10986,7 @@
           <w:rFonts w:ascii="Courier New" w:hAnsi="Courier New"/>
           <w:sz w:val="20"/>
         </w:rPr>
-        <w:t>List&lt;NhanVien&gt;</w:t>
+        <w:t>List&lt;Employee&gt;</w:t>
       </w:r>
       <w:r>
         <w:t xml:space="preserve"> cho StaffManagePage.</w:t>
@@ -10809,79 +10995,115 @@
     <w:p>
       <w:pPr/>
       <w:r>
-        <w:t>7. StaffManagePage render bảng nhân viên: họ tên, vai trò, trạng thái.</w:t>
-      </w:r>
-    </w:p>
-    <w:p>
-      <w:pPr/>
-      <w:r>
-        <w:t>8. Admin click [Thêm nhân viên], nhập Họ tên = "Lê Văn C", Vai trò = "Phục vụ", click [Lưu].</w:t>
-      </w:r>
-    </w:p>
-    <w:p>
-      <w:pPr/>
-      <w:r>
-        <w:t xml:space="preserve">9. Phương thức </w:t>
+        <w:t xml:space="preserve">7. StaffManagePage gọi </w:t>
       </w:r>
       <w:r>
         <w:rPr>
           <w:rFonts w:ascii="Courier New" w:hAnsi="Courier New"/>
           <w:sz w:val="20"/>
         </w:rPr>
-        <w:t>handleAdd()</w:t>
-      </w:r>
-      <w:r>
-        <w:t xml:space="preserve"> của lớp StaffManagePage được gọi.</w:t>
+        <w:t>displayStaffList(data : List&lt;Employee&gt;)</w:t>
+      </w:r>
+      <w:r>
+        <w:t xml:space="preserve"> để render bảng nhân viên: họ tên, vai trò, trạng thái.</w:t>
       </w:r>
     </w:p>
     <w:p>
       <w:pPr/>
       <w:r>
-        <w:t xml:space="preserve">10. StaffManagePage gọi </w:t>
+        <w:t>8. Admin click [Thêm nhân viên], nhập Họ tên = "Lê Văn C", Vai trò = "Phục vụ", click [Lưu].</w:t>
+      </w:r>
+    </w:p>
+    <w:p>
+      <w:pPr/>
+      <w:r>
+        <w:t xml:space="preserve">9. Phương thức </w:t>
       </w:r>
       <w:r>
         <w:rPr>
           <w:rFonts w:ascii="Courier New" w:hAnsi="Courier New"/>
           <w:sz w:val="20"/>
         </w:rPr>
-        <w:t>addStaff(hoTen: String, vaiTro: String): NhanVien</w:t>
-      </w:r>
-      <w:r>
-        <w:t xml:space="preserve"> của StaffController.</w:t>
+        <w:t>btnThemClick()</w:t>
+      </w:r>
+      <w:r>
+        <w:t xml:space="preserve"> của lớp StaffManagePage được gọi.</w:t>
       </w:r>
     </w:p>
     <w:p>
       <w:pPr/>
       <w:r>
-        <w:t xml:space="preserve">11. StaffController gọi </w:t>
+        <w:t xml:space="preserve">10. StaffManagePage gọi </w:t>
       </w:r>
       <w:r>
         <w:rPr>
           <w:rFonts w:ascii="Courier New" w:hAnsi="Courier New"/>
           <w:sz w:val="20"/>
         </w:rPr>
-        <w:t>save(): NhanVien</w:t>
-      </w:r>
-      <w:r>
-        <w:t xml:space="preserve"> của lớp NhanVien.</w:t>
+        <w:t>saveStaff(employee : Employee) : boolean</w:t>
+      </w:r>
+      <w:r>
+        <w:t xml:space="preserve"> của StaffController.</w:t>
       </w:r>
     </w:p>
     <w:p>
       <w:pPr/>
       <w:r>
-        <w:t>12. NhanVien trả về đối tượng NhanVien vừa tạo.</w:t>
+        <w:t xml:space="preserve">11. StaffController gọi </w:t>
+      </w:r>
+      <w:r>
+        <w:rPr>
+          <w:rFonts w:ascii="Courier New" w:hAnsi="Courier New"/>
+          <w:sz w:val="20"/>
+        </w:rPr>
+        <w:t>save() : Employee</w:t>
+      </w:r>
+      <w:r>
+        <w:t xml:space="preserve"> của lớp Employee.</w:t>
       </w:r>
     </w:p>
     <w:p>
       <w:pPr/>
       <w:r>
-        <w:t>13. StaffController trả về NhanVien cho StaffManagePage.</w:t>
+        <w:t>12. Employee trả về đối tượng Employee vừa tạo.</w:t>
       </w:r>
     </w:p>
     <w:p>
       <w:pPr/>
       <w:r>
-        <w:t>14. StaffManagePage hiển thị "Thêm nhân viên thành công!"</w:t>
+        <w:t xml:space="preserve">13. StaffController trả về </w:t>
+      </w:r>
+      <w:r>
+        <w:rPr>
+          <w:rFonts w:ascii="Courier New" w:hAnsi="Courier New"/>
+          <w:sz w:val="20"/>
+        </w:rPr>
+        <w:t>true</w:t>
+      </w:r>
+      <w:r>
+        <w:t xml:space="preserve"> cho StaffManagePage.</w:t>
+      </w:r>
+    </w:p>
+    <w:p>
+      <w:pPr/>
+      <w:r>
+        <w:t xml:space="preserve">14. StaffManagePage gọi </w:t>
+      </w:r>
+      <w:r>
+        <w:rPr>
+          <w:rFonts w:ascii="Courier New" w:hAnsi="Courier New"/>
+          <w:sz w:val="20"/>
+        </w:rPr>
+        <w:t>displayStaffList(data : List&lt;Employee&gt;)</w:t>
+      </w:r>
+      <w:r>
+        <w:t xml:space="preserve"> để cập nhật bảng.</w:t>
+      </w:r>
+    </w:p>
+    <w:p>
+      <w:pPr/>
+      <w:r>
+        <w:t>15. StaffManagePage hiển thị showMessage("Thêm nhân viên thành công!")</w:t>
       </w:r>
     </w:p>
     <w:p>
@@ -10890,7 +11112,124 @@
         <w:rPr>
           <w:b/>
         </w:rPr>
-        <w:t>Ngoại lệ: SĐT đã tồn tại</w:t>
+        <w:t>Kịch bản xóa nhân viên</w:t>
+      </w:r>
+    </w:p>
+    <w:p>
+      <w:pPr/>
+      <w:r>
+        <w:t>1. Admin click nút [Xóa] trên một dòng nhân viên trong bảng.</w:t>
+      </w:r>
+    </w:p>
+    <w:p>
+      <w:pPr/>
+      <w:r>
+        <w:t xml:space="preserve">2. Phương thức </w:t>
+      </w:r>
+      <w:r>
+        <w:rPr>
+          <w:rFonts w:ascii="Courier New" w:hAnsi="Courier New"/>
+          <w:sz w:val="20"/>
+        </w:rPr>
+        <w:t>btnXoaClick()</w:t>
+      </w:r>
+      <w:r>
+        <w:t xml:space="preserve"> của lớp StaffManagePage được gọi.</w:t>
+      </w:r>
+    </w:p>
+    <w:p>
+      <w:pPr/>
+      <w:r>
+        <w:t xml:space="preserve">3. StaffManagePage gọi </w:t>
+      </w:r>
+      <w:r>
+        <w:rPr>
+          <w:rFonts w:ascii="Courier New" w:hAnsi="Courier New"/>
+          <w:sz w:val="20"/>
+        </w:rPr>
+        <w:t>deleteStaff(id : int) : boolean</w:t>
+      </w:r>
+      <w:r>
+        <w:t xml:space="preserve"> của StaffController.</w:t>
+      </w:r>
+    </w:p>
+    <w:p>
+      <w:pPr/>
+      <w:r>
+        <w:t xml:space="preserve">4. StaffController gọi </w:t>
+      </w:r>
+      <w:r>
+        <w:rPr>
+          <w:rFonts w:ascii="Courier New" w:hAnsi="Courier New"/>
+          <w:sz w:val="20"/>
+        </w:rPr>
+        <w:t>deleteById(id : int) : boolean</w:t>
+      </w:r>
+      <w:r>
+        <w:t xml:space="preserve"> của lớp Employee.</w:t>
+      </w:r>
+    </w:p>
+    <w:p>
+      <w:pPr/>
+      <w:r>
+        <w:t xml:space="preserve">5. Employee trả về </w:t>
+      </w:r>
+      <w:r>
+        <w:rPr>
+          <w:rFonts w:ascii="Courier New" w:hAnsi="Courier New"/>
+          <w:sz w:val="20"/>
+        </w:rPr>
+        <w:t>true</w:t>
+      </w:r>
+      <w:r>
+        <w:t>.</w:t>
+      </w:r>
+    </w:p>
+    <w:p>
+      <w:pPr/>
+      <w:r>
+        <w:t xml:space="preserve">6. StaffController trả về </w:t>
+      </w:r>
+      <w:r>
+        <w:rPr>
+          <w:rFonts w:ascii="Courier New" w:hAnsi="Courier New"/>
+          <w:sz w:val="20"/>
+        </w:rPr>
+        <w:t>true</w:t>
+      </w:r>
+      <w:r>
+        <w:t xml:space="preserve"> cho StaffManagePage.</w:t>
+      </w:r>
+    </w:p>
+    <w:p>
+      <w:pPr/>
+      <w:r>
+        <w:t xml:space="preserve">7. StaffManagePage gọi </w:t>
+      </w:r>
+      <w:r>
+        <w:rPr>
+          <w:rFonts w:ascii="Courier New" w:hAnsi="Courier New"/>
+          <w:sz w:val="20"/>
+        </w:rPr>
+        <w:t>displayStaffList(data : List&lt;Employee&gt;)</w:t>
+      </w:r>
+      <w:r>
+        <w:t xml:space="preserve"> để cập nhật bảng.</w:t>
+      </w:r>
+    </w:p>
+    <w:p>
+      <w:pPr/>
+      <w:r>
+        <w:t>8. StaffManagePage hiển thị showMessage("Xóa nhân viên thành công!")</w:t>
+      </w:r>
+    </w:p>
+    <w:p>
+      <w:pPr/>
+      <w:r>
+        <w:rPr>
+          <w:b/>
+        </w:rPr>
+        <w:t>Ngoại lệ: Thêm nhân viên thất bại</w:t>
       </w:r>
     </w:p>
     <w:p>
@@ -10898,7 +11237,17 @@
         <w:pStyle w:val="ListBullet"/>
       </w:pPr>
       <w:r>
-        <w:t>StaffController nhận lỗi từ NhanVien.</w:t>
+        <w:t xml:space="preserve">StaffController trả về </w:t>
+      </w:r>
+      <w:r>
+        <w:rPr>
+          <w:rFonts w:ascii="Courier New" w:hAnsi="Courier New"/>
+          <w:sz w:val="20"/>
+        </w:rPr>
+        <w:t>false</w:t>
+      </w:r>
+      <w:r>
+        <w:t xml:space="preserve"> cho StaffManagePage.</w:t>
       </w:r>
     </w:p>
     <w:p>
@@ -10906,7 +11255,7 @@
         <w:pStyle w:val="ListBullet"/>
       </w:pPr>
       <w:r>
-        <w:t>StaffManagePage hiển thị "SĐT này đã được sử dụng."</w:t>
+        <w:t>StaffManagePage hiển thị showMessage("Thêm nhân viên thất bại.")</w:t>
       </w:r>
     </w:p>
     <w:p>
@@ -10923,7 +11272,17 @@
         <w:pStyle w:val="ListBullet"/>
       </w:pPr>
       <w:r>
-        <w:t>StaffController nhận lỗi từ NhanVien.</w:t>
+        <w:t xml:space="preserve">StaffController trả về </w:t>
+      </w:r>
+      <w:r>
+        <w:rPr>
+          <w:rFonts w:ascii="Courier New" w:hAnsi="Courier New"/>
+          <w:sz w:val="20"/>
+        </w:rPr>
+        <w:t>false</w:t>
+      </w:r>
+      <w:r>
+        <w:t xml:space="preserve"> cho StaffManagePage.</w:t>
       </w:r>
     </w:p>
     <w:p>
@@ -10931,7 +11290,7 @@
         <w:pStyle w:val="ListBullet"/>
       </w:pPr>
       <w:r>
-        <w:t>StaffManagePage hiển thị cảnh báo "Nhân viên đang xử lý order, không thể xóa."</w:t>
+        <w:t>StaffManagePage hiển thị showMessage("Nhân viên đang xử lý order, không thể xóa.")</w:t>
       </w:r>
     </w:p>
     <w:p/>
@@ -11565,7 +11924,7 @@
     <w:p>
       <w:pPr/>
       <w:r>
-        <w:t>tblHangHoiVien</w:t>
+        <w:t>tblMembershipTier</w:t>
       </w:r>
     </w:p>
     <w:tbl>
@@ -11778,7 +12137,7 @@
     <w:p>
       <w:pPr/>
       <w:r>
-        <w:t>tblNguoiDung</w:t>
+        <w:t>tblUser</w:t>
       </w:r>
     </w:p>
     <w:tbl>
@@ -11912,7 +12271,7 @@
                 <w:b/>
                 <w:sz w:val="20"/>
               </w:rPr>
-              <w:t>tblHangHoiVienMa</w:t>
+              <w:t>tblMembershipTierMa</w:t>
             </w:r>
           </w:p>
         </w:tc>
@@ -12254,7 +12613,7 @@
     <w:p>
       <w:pPr/>
       <w:r>
-        <w:t>tblPhienDangNhap (mới tạo)</w:t>
+        <w:t>tblLoginSession (mới tạo)</w:t>
       </w:r>
     </w:p>
     <w:tbl>
@@ -12352,7 +12711,7 @@
                 <w:b/>
                 <w:sz w:val="20"/>
               </w:rPr>
-              <w:t>tblNguoiDungMa</w:t>
+              <w:t>tblUserMa</w:t>
             </w:r>
           </w:p>
         </w:tc>
@@ -12461,7 +12820,7 @@
     <w:p>
       <w:pPr/>
       <w:r>
-        <w:t>tblNguoiDung</w:t>
+        <w:t>tblUser</w:t>
       </w:r>
     </w:p>
     <w:tbl>
@@ -12837,7 +13196,7 @@
     <w:p>
       <w:pPr/>
       <w:r>
-        <w:t>tblNguoiDung</w:t>
+        <w:t>tblUser</w:t>
       </w:r>
     </w:p>
     <w:tbl>
@@ -12980,7 +13339,7 @@
     <w:p>
       <w:pPr/>
       <w:r>
-        <w:t>tblNhanVien</w:t>
+        <w:t>tblEmployee</w:t>
       </w:r>
     </w:p>
     <w:tbl>
@@ -13357,7 +13716,7 @@
     <w:p>
       <w:pPr/>
       <w:r>
-        <w:t>tblNhanVien</w:t>
+        <w:t>tblEmployee</w:t>
       </w:r>
     </w:p>
     <w:tbl>
@@ -13596,7 +13955,7 @@
     <w:p>
       <w:pPr/>
       <w:r>
-        <w:t>tblNguoiDung</w:t>
+        <w:t>tblUser</w:t>
       </w:r>
     </w:p>
     <w:tbl>
@@ -13934,7 +14293,7 @@
     <w:p>
       <w:pPr/>
       <w:r>
-        <w:t>tblNguoiDung</w:t>
+        <w:t>tblUser</w:t>
       </w:r>
     </w:p>
     <w:tbl>
@@ -14342,7 +14701,7 @@
     <w:p>
       <w:pPr/>
       <w:r>
-        <w:t>tblNguoiDung</w:t>
+        <w:t>tblUser</w:t>
       </w:r>
     </w:p>
     <w:tbl>
@@ -14440,7 +14799,7 @@
                 <w:b/>
                 <w:sz w:val="20"/>
               </w:rPr>
-              <w:t>tblHangHoiVienMa</w:t>
+              <w:t>tblMembershipTierMa</w:t>
             </w:r>
           </w:p>
         </w:tc>
@@ -14630,7 +14989,7 @@
     <w:p>
       <w:pPr/>
       <w:r>
-        <w:t>tblNguoiDung</w:t>
+        <w:t>tblUser</w:t>
       </w:r>
     </w:p>
     <w:tbl>
@@ -15006,7 +15365,7 @@
     <w:p>
       <w:pPr/>
       <w:r>
-        <w:t>tblNguoiDung</w:t>
+        <w:t>tblUser</w:t>
       </w:r>
     </w:p>
     <w:tbl>
@@ -15125,7 +15484,7 @@
     <w:p>
       <w:pPr/>
       <w:r>
-        <w:t>tblPhienDangNhap</w:t>
+        <w:t>tblLoginSession</w:t>
       </w:r>
     </w:p>
     <w:tbl>
@@ -15234,7 +15593,7 @@
     <w:p>
       <w:pPr/>
       <w:r>
-        <w:t>tblNguoiDung</w:t>
+        <w:t>tblUser</w:t>
       </w:r>
     </w:p>
     <w:tbl>
@@ -15572,7 +15931,7 @@
     <w:p>
       <w:pPr/>
       <w:r>
-        <w:t>tblNguoiDung</w:t>
+        <w:t>tblUser</w:t>
       </w:r>
     </w:p>
     <w:tbl>
@@ -16079,7 +16438,7 @@
     <w:p>
       <w:pPr/>
       <w:r>
-        <w:t>tblNguoiDung</w:t>
+        <w:t>tblUser</w:t>
       </w:r>
     </w:p>
     <w:tbl>
@@ -16288,7 +16647,7 @@
     <w:p>
       <w:pPr/>
       <w:r>
-        <w:t>tblNguoiDung</w:t>
+        <w:t>tblUser</w:t>
       </w:r>
     </w:p>
     <w:tbl>
@@ -16659,7 +17018,7 @@
     <w:p>
       <w:pPr/>
       <w:r>
-        <w:t>tblNguoiDung</w:t>
+        <w:t>tblUser</w:t>
       </w:r>
     </w:p>
     <w:tbl>
@@ -16893,7 +17252,7 @@
                 <w:b/>
                 <w:sz w:val="20"/>
               </w:rPr>
-              <w:t>tblNguoiDungMa</w:t>
+              <w:t>tblUserMa</w:t>
             </w:r>
           </w:p>
         </w:tc>
@@ -17286,7 +17645,7 @@
                 <w:b/>
                 <w:sz w:val="20"/>
               </w:rPr>
-              <w:t>tblNguoiDungMa</w:t>
+              <w:t>tblUserMa</w:t>
             </w:r>
           </w:p>
         </w:tc>
@@ -17373,7 +17732,7 @@
     <w:p>
       <w:pPr/>
       <w:r>
-        <w:t>tblNguoiDung: Tài khoản chưa tạo (đăng ký bị hủy).</w:t>
+        <w:t>tblUser: Tài khoản chưa tạo (đăng ký bị hủy).</w:t>
       </w:r>
     </w:p>
     <w:p>
@@ -17402,7 +17761,7 @@
     <w:p>
       <w:pPr/>
       <w:r>
-        <w:t>tblNguoiDung</w:t>
+        <w:t>tblUser</w:t>
       </w:r>
     </w:p>
     <w:tbl>

</xml_diff>

<commit_message>
fix: analysis phase — View suffix, no Controller, methods on Entity
- II.3: Boundary Page → View (LoginView, RegisterView, etc.)
- II.3: Add narrative style for each function (BẮT BUỘC)
- II.3: Attributes use txt/btn/tbl/lbl prefix
- II.4: Remove Controller from all 5 sequence diagrams
- II.4: Messages go Boundary → Entity directly
- Design phase (III.3.2, III.4) unchanged — keeps Controller + Page suffix
- DOCX: 486KB, 613 paragraphs, 47 tables, 11 images
</commit_message>
<xml_diff>
--- a/output/account_module.docx
+++ b/output/account_module.docx
@@ -4875,7 +4875,7 @@
         <w:t>Kiến trúc chọn: React</w:t>
       </w:r>
       <w:r>
-        <w:t xml:space="preserve"> ( Boundary class dùng hậu tố Page. Controller xử lý nghiệp vụ. Method names tiếng Việt ở pha phân tích )</w:t>
+        <w:t xml:space="preserve"> ( Boundary class dùng hậu tố View. Method names tiếng Việt ở pha phân tích, đặt trên Entity. )</w:t>
       </w:r>
     </w:p>
     <w:p>
@@ -4977,7 +4977,7 @@
               <w:rPr>
                 <w:sz w:val="20"/>
               </w:rPr>
-              <w:t>LoginPage</w:t>
+              <w:t>LoginView</w:t>
             </w:r>
           </w:p>
         </w:tc>
@@ -4992,7 +4992,7 @@
               <w:rPr>
                 <w:sz w:val="20"/>
               </w:rPr>
-              <w:t>Page</w:t>
+              <w:t>View</w:t>
             </w:r>
           </w:p>
         </w:tc>
@@ -5024,7 +5024,7 @@
               <w:rPr>
                 <w:sz w:val="20"/>
               </w:rPr>
-              <w:t>RegisterPage</w:t>
+              <w:t>RegisterView</w:t>
             </w:r>
           </w:p>
         </w:tc>
@@ -5039,7 +5039,7 @@
               <w:rPr>
                 <w:sz w:val="20"/>
               </w:rPr>
-              <w:t>Page</w:t>
+              <w:t>View</w:t>
             </w:r>
           </w:p>
         </w:tc>
@@ -5071,7 +5071,7 @@
               <w:rPr>
                 <w:sz w:val="20"/>
               </w:rPr>
-              <w:t>OTPVerifyPage</w:t>
+              <w:t>OTPVerifyView</w:t>
             </w:r>
           </w:p>
         </w:tc>
@@ -5086,7 +5086,7 @@
               <w:rPr>
                 <w:sz w:val="20"/>
               </w:rPr>
-              <w:t>Page</w:t>
+              <w:t>View</w:t>
             </w:r>
           </w:p>
         </w:tc>
@@ -5118,7 +5118,7 @@
               <w:rPr>
                 <w:sz w:val="20"/>
               </w:rPr>
-              <w:t>ChangePasswordPage</w:t>
+              <w:t>ChangePasswordView</w:t>
             </w:r>
           </w:p>
         </w:tc>
@@ -5133,7 +5133,7 @@
               <w:rPr>
                 <w:sz w:val="20"/>
               </w:rPr>
-              <w:t>Page</w:t>
+              <w:t>View</w:t>
             </w:r>
           </w:p>
         </w:tc>
@@ -5165,7 +5165,7 @@
               <w:rPr>
                 <w:sz w:val="20"/>
               </w:rPr>
-              <w:t>ProfilePage</w:t>
+              <w:t>ProfileView</w:t>
             </w:r>
           </w:p>
         </w:tc>
@@ -5180,7 +5180,7 @@
               <w:rPr>
                 <w:sz w:val="20"/>
               </w:rPr>
-              <w:t>Page</w:t>
+              <w:t>View</w:t>
             </w:r>
           </w:p>
         </w:tc>
@@ -5212,7 +5212,7 @@
               <w:rPr>
                 <w:sz w:val="20"/>
               </w:rPr>
-              <w:t>StaffManagePage</w:t>
+              <w:t>StaffManageView</w:t>
             </w:r>
           </w:p>
         </w:tc>
@@ -5227,7 +5227,7 @@
               <w:rPr>
                 <w:sz w:val="20"/>
               </w:rPr>
-              <w:t>Page</w:t>
+              <w:t>View</w:t>
             </w:r>
           </w:p>
         </w:tc>
@@ -5244,37 +5244,37 @@
     <w:p>
       <w:pPr/>
       <w:r>
-        <w:t>LoginPage: inSDT, inMatKhau, subDangNhap, subQuenMatKhau, subDangKy</w:t>
+        <w:t>LoginView: txtSDT, txtMatKhau, btnDangNhap, btnQuenMatKhau, btnDangKy</w:t>
       </w:r>
     </w:p>
     <w:p>
       <w:pPr/>
       <w:r>
-        <w:t>RegisterPage: inHoTen, inSDT, inEmail, inMatKhau, inXacNhanMK, subTiepTuc, subHuy</w:t>
+        <w:t>RegisterView: txtHoTen, txtSDT, txtEmail, txtMatKhau, txtXacNhanMK, btnTiepTuc, btnHuy</w:t>
       </w:r>
     </w:p>
     <w:p>
       <w:pPr/>
       <w:r>
-        <w:t>OTPVerifyPage: inOTP, subXacNhan, subGuiLai</w:t>
+        <w:t>OTPVerifyView: txtOTP, btnXacNhan, btnGuiLai</w:t>
       </w:r>
     </w:p>
     <w:p>
       <w:pPr/>
       <w:r>
-        <w:t>ChangePasswordPage: inMKHienTai, inMKMoi, inXacNhanMKMoi, subLuu, subHuy</w:t>
+        <w:t>ChangePasswordView: txtMKHienTai, txtMKMoi, txtXacNhanMKMoi, btnLuu, btnHuy</w:t>
       </w:r>
     </w:p>
     <w:p>
       <w:pPr/>
       <w:r>
-        <w:t>ProfilePage: outHoTen, outSDT, outEmail, outHang, outDiem, subChinhSua, subDoiMK</w:t>
+        <w:t>ProfileView: lblHoTen, lblSDT, lblEmail, lblHang, lblDiem, btnChinhSua, btnDoiMK</w:t>
       </w:r>
     </w:p>
     <w:p>
       <w:pPr/>
       <w:r>
-        <w:t>StaffManagePage: outDSEmployee, outsubChonNV, subThem, subSua, subXoa</w:t>
+        <w:t>StaffManageView: tblEmployee, btnChonNV, btnThem, btnSua, btnXoa</w:t>
       </w:r>
     </w:p>
     <w:p>
@@ -5288,47 +5288,35 @@
     <w:p>
       <w:pPr/>
       <w:r>
-        <w:t>[1]. Giao diện LoginPage → lớp LoginPage</w:t>
+        <w:t>[1]. Giao diện LoginView → lớp LoginView</w:t>
       </w:r>
     </w:p>
     <w:p>
       <w:pPr/>
       <w:r>
-        <w:t xml:space="preserve">Phương thức: </w:t>
+        <w:t>Phân tích chi tiết chức năng Đăng nhập:</w:t>
+      </w:r>
+    </w:p>
+    <w:p>
+      <w:pPr/>
+      <w:r>
+        <w:t>Người dùng nhập SĐT, Mật khẩu và nhấn [Đăng nhập] -&gt; hệ thống xác thực thông tin -&gt; đề xuất lớp LoginView, có txtSDT, txtMatKhau, btnDangNhap.</w:t>
+      </w:r>
+    </w:p>
+    <w:p>
+      <w:pPr/>
+      <w:r>
+        <w:t xml:space="preserve">Người dùng nhấn [Đăng nhập] -&gt; hệ thống cần xác thực tài khoản -&gt; cần chức năng </w:t>
       </w:r>
       <w:r>
         <w:rPr>
           <w:rFonts w:ascii="Courier New" w:hAnsi="Courier New"/>
           <w:sz w:val="20"/>
         </w:rPr>
-        <w:t>dangNhap()</w:t>
-      </w:r>
-      <w:r>
-        <w:t xml:space="preserve"> ← tên tiếng Việt, ngôn ngữ tự nhiên</w:t>
-      </w:r>
-    </w:p>
-    <w:p>
-      <w:pPr/>
-      <w:r>
-        <w:t>Input: sdt, matKhau</w:t>
-      </w:r>
-    </w:p>
-    <w:p>
-      <w:pPr/>
-      <w:r>
-        <w:t>Output: Session (token, vaiTro)</w:t>
-      </w:r>
-    </w:p>
-    <w:p>
-      <w:pPr/>
-      <w:r>
-        <w:t>Lớp chủ thể: User</w:t>
-      </w:r>
-    </w:p>
-    <w:p>
-      <w:pPr/>
-      <w:r>
-        <w:t>[2]. Giao diện RegisterPage → lớp RegisterPage</w:t>
+        <w:t>dangNhap(sdt, matKhau)</w:t>
+      </w:r>
+      <w:r>
+        <w:t xml:space="preserve"> của đối tượng User.</w:t>
       </w:r>
     </w:p>
     <w:p>
@@ -5341,19 +5329,22 @@
           <w:rFonts w:ascii="Courier New" w:hAnsi="Courier New"/>
           <w:sz w:val="20"/>
         </w:rPr>
-        <w:t>dangKy()</w:t>
+        <w:t>dangNhap(sdt, matKhau)</w:t>
+      </w:r>
+      <w:r>
+        <w:t xml:space="preserve"> ← tên tiếng Việt, ngôn ngữ tự nhiên</w:t>
       </w:r>
     </w:p>
     <w:p>
       <w:pPr/>
       <w:r>
-        <w:t>Input: hoTen, sdt, email, matKhau</w:t>
+        <w:t>Input: sdt, matKhau</w:t>
       </w:r>
     </w:p>
     <w:p>
       <w:pPr/>
       <w:r>
-        <w:t>Output: User (vừa tạo)</w:t>
+        <w:t>Output: Session (token, vaiTro)</w:t>
       </w:r>
     </w:p>
     <w:p>
@@ -5365,44 +5356,35 @@
     <w:p>
       <w:pPr/>
       <w:r>
-        <w:t>[3]. Giao diện OTPVerifyPage → lớp OTPVerifyPage</w:t>
+        <w:t>[2]. Giao diện RegisterView → lớp RegisterView</w:t>
       </w:r>
     </w:p>
     <w:p>
       <w:pPr/>
       <w:r>
-        <w:t xml:space="preserve">Phương thức: </w:t>
+        <w:t>Phân tích chi tiết chức năng Đăng ký:</w:t>
+      </w:r>
+    </w:p>
+    <w:p>
+      <w:pPr/>
+      <w:r>
+        <w:t>Người dùng nhập Họ tên, SĐT, Email, Mật khẩu, Xác nhận MK và nhấn [Tiếp tục] -&gt; hệ thống hiển thị form đăng ký -&gt; đề xuất lớp RegisterView, có txtHoTen, txtSDT, txtEmail, txtMatKhau, txtXacNhanMK, btnTiepTuc.</w:t>
+      </w:r>
+    </w:p>
+    <w:p>
+      <w:pPr/>
+      <w:r>
+        <w:t xml:space="preserve">Người dùng nhấn [Tiếp tục] -&gt; hệ thống cần tạo tài khoản mới -&gt; cần chức năng </w:t>
       </w:r>
       <w:r>
         <w:rPr>
           <w:rFonts w:ascii="Courier New" w:hAnsi="Courier New"/>
           <w:sz w:val="20"/>
         </w:rPr>
-        <w:t>xacMinhOTP()</w:t>
-      </w:r>
-    </w:p>
-    <w:p>
-      <w:pPr/>
-      <w:r>
-        <w:t>Input: maOTP</w:t>
-      </w:r>
-    </w:p>
-    <w:p>
-      <w:pPr/>
-      <w:r>
-        <w:t>Output: boolean (đúng/sai)</w:t>
-      </w:r>
-    </w:p>
-    <w:p>
-      <w:pPr/>
-      <w:r>
-        <w:t>Lớp chủ thể: OTP</w:t>
-      </w:r>
-    </w:p>
-    <w:p>
-      <w:pPr/>
-      <w:r>
-        <w:t>[4]. Giao diện ChangePasswordPage → lớp ChangePasswordPage</w:t>
+        <w:t>dangKy(hoTen, sdt, email, matKhau)</w:t>
+      </w:r>
+      <w:r>
+        <w:t xml:space="preserve"> của đối tượng User.</w:t>
       </w:r>
     </w:p>
     <w:p>
@@ -5415,19 +5397,19 @@
           <w:rFonts w:ascii="Courier New" w:hAnsi="Courier New"/>
           <w:sz w:val="20"/>
         </w:rPr>
-        <w:t>doiMatKhau()</w:t>
+        <w:t>dangKy(hoTen, sdt, email, matKhau)</w:t>
       </w:r>
     </w:p>
     <w:p>
       <w:pPr/>
       <w:r>
-        <w:t>Input: mkHienTai, mkMoi</w:t>
+        <w:t>Input: hoTen, sdt, email, matKhau</w:t>
       </w:r>
     </w:p>
     <w:p>
       <w:pPr/>
       <w:r>
-        <w:t>Output: boolean (thành công/thất bại)</w:t>
+        <w:t>Output: User (vừa tạo)</w:t>
       </w:r>
     </w:p>
     <w:p>
@@ -5439,44 +5421,35 @@
     <w:p>
       <w:pPr/>
       <w:r>
-        <w:t>[5]. Giao diện ProfilePage → lớp ProfilePage</w:t>
+        <w:t>[3]. Giao diện OTPVerifyView → lớp OTPVerifyView</w:t>
       </w:r>
     </w:p>
     <w:p>
       <w:pPr/>
       <w:r>
-        <w:t xml:space="preserve">Phương thức: </w:t>
+        <w:t>Phân tích chi tiết chức năng Xác nhận OTP:</w:t>
+      </w:r>
+    </w:p>
+    <w:p>
+      <w:pPr/>
+      <w:r>
+        <w:t>Người dùng nhập mã OTP và nhấn [Xác nhận] -&gt; hệ thống hiển thị form OTP -&gt; đề xuất lớp OTPVerifyView, có txtOTP, btnXacNhan, btnGuiLai.</w:t>
+      </w:r>
+    </w:p>
+    <w:p>
+      <w:pPr/>
+      <w:r>
+        <w:t xml:space="preserve">Người dùng nhấn [Xác nhận] -&gt; hệ thống cần xác minh mã OTP -&gt; cần chức năng </w:t>
       </w:r>
       <w:r>
         <w:rPr>
           <w:rFonts w:ascii="Courier New" w:hAnsi="Courier New"/>
           <w:sz w:val="20"/>
         </w:rPr>
-        <w:t>xemHoSo()</w:t>
-      </w:r>
-    </w:p>
-    <w:p>
-      <w:pPr/>
-      <w:r>
-        <w:t>Input: userId</w:t>
-      </w:r>
-    </w:p>
-    <w:p>
-      <w:pPr/>
-      <w:r>
-        <w:t>Output: User (thông tin hồ sơ)</w:t>
-      </w:r>
-    </w:p>
-    <w:p>
-      <w:pPr/>
-      <w:r>
-        <w:t>Lớp chủ thể: User</w:t>
-      </w:r>
-    </w:p>
-    <w:p>
-      <w:pPr/>
-      <w:r>
-        <w:t>[6]. Giao diện ProfilePage → lớp ProfilePage</w:t>
+        <w:t>xacMinhOTP(maOTP)</w:t>
+      </w:r>
+      <w:r>
+        <w:t xml:space="preserve"> của đối tượng OTP.</w:t>
       </w:r>
     </w:p>
     <w:p>
@@ -5489,12 +5462,207 @@
           <w:rFonts w:ascii="Courier New" w:hAnsi="Courier New"/>
           <w:sz w:val="20"/>
         </w:rPr>
-        <w:t>capNhatHoSo()</w:t>
+        <w:t>xacMinhOTP(maOTP)</w:t>
       </w:r>
     </w:p>
     <w:p>
       <w:pPr/>
       <w:r>
+        <w:t>Input: maOTP</w:t>
+      </w:r>
+    </w:p>
+    <w:p>
+      <w:pPr/>
+      <w:r>
+        <w:t>Output: boolean (đúng/sai)</w:t>
+      </w:r>
+    </w:p>
+    <w:p>
+      <w:pPr/>
+      <w:r>
+        <w:t>Lớp chủ thể: OTP</w:t>
+      </w:r>
+    </w:p>
+    <w:p>
+      <w:pPr/>
+      <w:r>
+        <w:t>[4]. Giao diện ChangePasswordView → lớp ChangePasswordView</w:t>
+      </w:r>
+    </w:p>
+    <w:p>
+      <w:pPr/>
+      <w:r>
+        <w:t>Phân tích chi tiết chức năng Đổi mật khẩu:</w:t>
+      </w:r>
+    </w:p>
+    <w:p>
+      <w:pPr/>
+      <w:r>
+        <w:t>Người dùng nhập MK hiện tại, MK mới, Xác nhận MK mới và nhấn [Lưu] -&gt; hệ thống hiển thị form đổi mật khẩu -&gt; đề xuất lớp ChangePasswordView, có txtMKHienTai, txtMKMoi, txtXacNhanMKMoi, btnLuu.</w:t>
+      </w:r>
+    </w:p>
+    <w:p>
+      <w:pPr/>
+      <w:r>
+        <w:t xml:space="preserve">Người dùng nhấn [Lưu] -&gt; hệ thống cần đổi mật khẩu -&gt; cần chức năng </w:t>
+      </w:r>
+      <w:r>
+        <w:rPr>
+          <w:rFonts w:ascii="Courier New" w:hAnsi="Courier New"/>
+          <w:sz w:val="20"/>
+        </w:rPr>
+        <w:t>doiMatKhau(mkHienTai, mkMoi)</w:t>
+      </w:r>
+      <w:r>
+        <w:t xml:space="preserve"> của đối tượng User.</w:t>
+      </w:r>
+    </w:p>
+    <w:p>
+      <w:pPr/>
+      <w:r>
+        <w:t xml:space="preserve">Phương thức: </w:t>
+      </w:r>
+      <w:r>
+        <w:rPr>
+          <w:rFonts w:ascii="Courier New" w:hAnsi="Courier New"/>
+          <w:sz w:val="20"/>
+        </w:rPr>
+        <w:t>doiMatKhau(mkHienTai, mkMoi)</w:t>
+      </w:r>
+    </w:p>
+    <w:p>
+      <w:pPr/>
+      <w:r>
+        <w:t>Input: mkHienTai, mkMoi</w:t>
+      </w:r>
+    </w:p>
+    <w:p>
+      <w:pPr/>
+      <w:r>
+        <w:t>Output: boolean (thành công/thất bại)</w:t>
+      </w:r>
+    </w:p>
+    <w:p>
+      <w:pPr/>
+      <w:r>
+        <w:t>Lớp chủ thể: User</w:t>
+      </w:r>
+    </w:p>
+    <w:p>
+      <w:pPr/>
+      <w:r>
+        <w:t>[5]. Giao diện ProfileView → lớp ProfileView</w:t>
+      </w:r>
+    </w:p>
+    <w:p>
+      <w:pPr/>
+      <w:r>
+        <w:t>Phân tích chi tiết chức năng Xem hồ sơ:</w:t>
+      </w:r>
+    </w:p>
+    <w:p>
+      <w:pPr/>
+      <w:r>
+        <w:t>Người dùng nhấn vào ảnh đại diện -&gt; hệ thống hiển thị thông tin cá nhân -&gt; đề xuất lớp ProfileView, có lblHoTen, lblSDT, lblEmail, lblHang, lblDiem.</w:t>
+      </w:r>
+    </w:p>
+    <w:p>
+      <w:pPr/>
+      <w:r>
+        <w:t xml:space="preserve">Hệ thống cần lấy thông tin hồ sơ -&gt; cần chức năng </w:t>
+      </w:r>
+      <w:r>
+        <w:rPr>
+          <w:rFonts w:ascii="Courier New" w:hAnsi="Courier New"/>
+          <w:sz w:val="20"/>
+        </w:rPr>
+        <w:t>xemHoSo(userId)</w:t>
+      </w:r>
+      <w:r>
+        <w:t xml:space="preserve"> của đối tượng User.</w:t>
+      </w:r>
+    </w:p>
+    <w:p>
+      <w:pPr/>
+      <w:r>
+        <w:t xml:space="preserve">Phương thức: </w:t>
+      </w:r>
+      <w:r>
+        <w:rPr>
+          <w:rFonts w:ascii="Courier New" w:hAnsi="Courier New"/>
+          <w:sz w:val="20"/>
+        </w:rPr>
+        <w:t>xemHoSo(userId)</w:t>
+      </w:r>
+    </w:p>
+    <w:p>
+      <w:pPr/>
+      <w:r>
+        <w:t>Input: userId</w:t>
+      </w:r>
+    </w:p>
+    <w:p>
+      <w:pPr/>
+      <w:r>
+        <w:t>Output: User (thông tin hồ sơ)</w:t>
+      </w:r>
+    </w:p>
+    <w:p>
+      <w:pPr/>
+      <w:r>
+        <w:t>Lớp chủ thể: User</w:t>
+      </w:r>
+    </w:p>
+    <w:p>
+      <w:pPr/>
+      <w:r>
+        <w:t>[6]. Giao diện ProfileView → lớp ProfileView</w:t>
+      </w:r>
+    </w:p>
+    <w:p>
+      <w:pPr/>
+      <w:r>
+        <w:t>Phân tích chi tiết chức năng Cập nhật hồ sơ:</w:t>
+      </w:r>
+    </w:p>
+    <w:p>
+      <w:pPr/>
+      <w:r>
+        <w:t>Người dùng chỉnh sửa họ tên, email và nhấn [Lưu] -&gt; hệ thống cập nhật thông tin -&gt; đề xuất lớp ProfileView, có btnChinhSua, btnLuu.</w:t>
+      </w:r>
+    </w:p>
+    <w:p>
+      <w:pPr/>
+      <w:r>
+        <w:t xml:space="preserve">Người dùng nhấn [Lưu] -&gt; hệ thống cần cập nhật hồ sơ -&gt; cần chức năng </w:t>
+      </w:r>
+      <w:r>
+        <w:rPr>
+          <w:rFonts w:ascii="Courier New" w:hAnsi="Courier New"/>
+          <w:sz w:val="20"/>
+        </w:rPr>
+        <w:t>capNhatHoSo(userId, hoTen, email)</w:t>
+      </w:r>
+      <w:r>
+        <w:t xml:space="preserve"> của đối tượng User.</w:t>
+      </w:r>
+    </w:p>
+    <w:p>
+      <w:pPr/>
+      <w:r>
+        <w:t xml:space="preserve">Phương thức: </w:t>
+      </w:r>
+      <w:r>
+        <w:rPr>
+          <w:rFonts w:ascii="Courier New" w:hAnsi="Courier New"/>
+          <w:sz w:val="20"/>
+        </w:rPr>
+        <w:t>capNhatHoSo(userId, hoTen, email)</w:t>
+      </w:r>
+    </w:p>
+    <w:p>
+      <w:pPr/>
+      <w:r>
         <w:t>Input: userId, hoTen, email</w:t>
       </w:r>
     </w:p>
@@ -5513,13 +5681,25 @@
     <w:p>
       <w:pPr/>
       <w:r>
-        <w:t>[7]. Giao diện StaffManagePage → lớp StaffManagePage</w:t>
+        <w:t>[7]. Giao diện StaffManageView → lớp StaffManageView</w:t>
       </w:r>
     </w:p>
     <w:p>
       <w:pPr/>
       <w:r>
-        <w:t xml:space="preserve">Phương thức: </w:t>
+        <w:t>Phân tích chi tiết chức năng Xem danh sách nhân viên:</w:t>
+      </w:r>
+    </w:p>
+    <w:p>
+      <w:pPr/>
+      <w:r>
+        <w:t>Admin truy cập "Quản lý nhân viên" -&gt; hệ thống hiển thị bảng danh sách nhân viên -&gt; đề xuất lớp StaffManageView, có tblEmployee, btnThem, btnSua, btnXoa.</w:t>
+      </w:r>
+    </w:p>
+    <w:p>
+      <w:pPr/>
+      <w:r>
+        <w:t xml:space="preserve">Hệ thống cần tải danh sách nhân viên -&gt; cần chức năng </w:t>
       </w:r>
       <w:r>
         <w:rPr>
@@ -5528,29 +5708,8 @@
         </w:rPr>
         <w:t>xemDanhSachNV()</w:t>
       </w:r>
-    </w:p>
-    <w:p>
-      <w:pPr/>
-      <w:r>
-        <w:t>Input: (không có — tải toàn bộ)</w:t>
-      </w:r>
-    </w:p>
-    <w:p>
-      <w:pPr/>
-      <w:r>
-        <w:t>Output: List\&lt;Employee\&gt;</w:t>
-      </w:r>
-    </w:p>
-    <w:p>
-      <w:pPr/>
-      <w:r>
-        <w:t>Lớp chủ thể: Employee</w:t>
-      </w:r>
-    </w:p>
-    <w:p>
-      <w:pPr/>
-      <w:r>
-        <w:t>[8]. Giao diện StaffManagePage → lớp StaffManagePage</w:t>
+      <w:r>
+        <w:t xml:space="preserve"> của đối tượng Employee.</w:t>
       </w:r>
     </w:p>
     <w:p>
@@ -5563,19 +5722,19 @@
           <w:rFonts w:ascii="Courier New" w:hAnsi="Courier New"/>
           <w:sz w:val="20"/>
         </w:rPr>
-        <w:t>themNV()</w:t>
+        <w:t>xemDanhSachNV()</w:t>
       </w:r>
     </w:p>
     <w:p>
       <w:pPr/>
       <w:r>
-        <w:t>Input: hoTen, vaiTro</w:t>
+        <w:t>Input: (không có — tải toàn bộ)</w:t>
       </w:r>
     </w:p>
     <w:p>
       <w:pPr/>
       <w:r>
-        <w:t>Output: Employee (vừa tạo)</w:t>
+        <w:t>Output: List\&lt;Employee\&gt;</w:t>
       </w:r>
     </w:p>
     <w:p>
@@ -5587,44 +5746,35 @@
     <w:p>
       <w:pPr/>
       <w:r>
-        <w:t>[9]. Giao diện StaffManagePage → lớp StaffManagePage</w:t>
+        <w:t>[8]. Giao diện StaffManageView → lớp StaffManageView</w:t>
       </w:r>
     </w:p>
     <w:p>
       <w:pPr/>
       <w:r>
-        <w:t xml:space="preserve">Phương thức: </w:t>
+        <w:t>Phân tích chi tiết chức năng Thêm nhân viên:</w:t>
+      </w:r>
+    </w:p>
+    <w:p>
+      <w:pPr/>
+      <w:r>
+        <w:t>Admin nhấn [Thêm], nhập thông tin và nhấn [Lưu] -&gt; hệ thống tạo tài khoản nhân viên mới -&gt; đề xuất lớp StaffManageView, có btnThem, txtHoTen, txtVaiTro.</w:t>
+      </w:r>
+    </w:p>
+    <w:p>
+      <w:pPr/>
+      <w:r>
+        <w:t xml:space="preserve">Admin nhấn [Lưu] -&gt; hệ thống cần tạo nhân viên mới -&gt; cần chức năng </w:t>
       </w:r>
       <w:r>
         <w:rPr>
           <w:rFonts w:ascii="Courier New" w:hAnsi="Courier New"/>
           <w:sz w:val="20"/>
         </w:rPr>
-        <w:t>suaNV()</w:t>
-      </w:r>
-    </w:p>
-    <w:p>
-      <w:pPr/>
-      <w:r>
-        <w:t>Input: id, hoTen, vaiTro</w:t>
-      </w:r>
-    </w:p>
-    <w:p>
-      <w:pPr/>
-      <w:r>
-        <w:t>Output: Employee (đã cập nhật)</w:t>
-      </w:r>
-    </w:p>
-    <w:p>
-      <w:pPr/>
-      <w:r>
-        <w:t>Lớp chủ thể: Employee</w:t>
-      </w:r>
-    </w:p>
-    <w:p>
-      <w:pPr/>
-      <w:r>
-        <w:t>[10]. Giao diện StaffManagePage → lớp StaffManagePage</w:t>
+        <w:t>themNV(hoTen, vaiTro)</w:t>
+      </w:r>
+      <w:r>
+        <w:t xml:space="preserve"> của đối tượng Employee.</w:t>
       </w:r>
     </w:p>
     <w:p>
@@ -5637,7 +5787,137 @@
           <w:rFonts w:ascii="Courier New" w:hAnsi="Courier New"/>
           <w:sz w:val="20"/>
         </w:rPr>
-        <w:t>xoaNV()</w:t>
+        <w:t>themNV(hoTen, vaiTro)</w:t>
+      </w:r>
+    </w:p>
+    <w:p>
+      <w:pPr/>
+      <w:r>
+        <w:t>Input: hoTen, vaiTro</w:t>
+      </w:r>
+    </w:p>
+    <w:p>
+      <w:pPr/>
+      <w:r>
+        <w:t>Output: Employee (vừa tạo)</w:t>
+      </w:r>
+    </w:p>
+    <w:p>
+      <w:pPr/>
+      <w:r>
+        <w:t>Lớp chủ thể: Employee</w:t>
+      </w:r>
+    </w:p>
+    <w:p>
+      <w:pPr/>
+      <w:r>
+        <w:t>[9]. Giao diện StaffManageView → lớp StaffManageView</w:t>
+      </w:r>
+    </w:p>
+    <w:p>
+      <w:pPr/>
+      <w:r>
+        <w:t>Phân tích chi tiết chức năng Sửa nhân viên:</w:t>
+      </w:r>
+    </w:p>
+    <w:p>
+      <w:pPr/>
+      <w:r>
+        <w:t>Admin chọn nhân viên, chỉnh sửa thông tin và nhấn [Lưu] -&gt; hệ thống cập nhật thông tin nhân viên -&gt; đề xuất lớp StaffManageView, có btnSua, btnChonNV.</w:t>
+      </w:r>
+    </w:p>
+    <w:p>
+      <w:pPr/>
+      <w:r>
+        <w:t xml:space="preserve">Admin nhấn [Lưu] -&gt; hệ thống cần cập nhật nhân viên -&gt; cần chức năng </w:t>
+      </w:r>
+      <w:r>
+        <w:rPr>
+          <w:rFonts w:ascii="Courier New" w:hAnsi="Courier New"/>
+          <w:sz w:val="20"/>
+        </w:rPr>
+        <w:t>suaNV(id, hoTen, vaiTro)</w:t>
+      </w:r>
+      <w:r>
+        <w:t xml:space="preserve"> của đối tượng Employee.</w:t>
+      </w:r>
+    </w:p>
+    <w:p>
+      <w:pPr/>
+      <w:r>
+        <w:t xml:space="preserve">Phương thức: </w:t>
+      </w:r>
+      <w:r>
+        <w:rPr>
+          <w:rFonts w:ascii="Courier New" w:hAnsi="Courier New"/>
+          <w:sz w:val="20"/>
+        </w:rPr>
+        <w:t>suaNV(id, hoTen, vaiTro)</w:t>
+      </w:r>
+    </w:p>
+    <w:p>
+      <w:pPr/>
+      <w:r>
+        <w:t>Input: id, hoTen, vaiTro</w:t>
+      </w:r>
+    </w:p>
+    <w:p>
+      <w:pPr/>
+      <w:r>
+        <w:t>Output: Employee (đã cập nhật)</w:t>
+      </w:r>
+    </w:p>
+    <w:p>
+      <w:pPr/>
+      <w:r>
+        <w:t>Lớp chủ thể: Employee</w:t>
+      </w:r>
+    </w:p>
+    <w:p>
+      <w:pPr/>
+      <w:r>
+        <w:t>[10]. Giao diện StaffManageView → lớp StaffManageView</w:t>
+      </w:r>
+    </w:p>
+    <w:p>
+      <w:pPr/>
+      <w:r>
+        <w:t>Phân tích chi tiết chức năng Xóa nhân viên:</w:t>
+      </w:r>
+    </w:p>
+    <w:p>
+      <w:pPr/>
+      <w:r>
+        <w:t>Admin chọn nhân viên và nhấn [Xóa] -&gt; hệ thống chuyển trạng thái "Đã nghỉ" -&gt; đề xuất lớp StaffManageView, có btnXoa, btnChonNV.</w:t>
+      </w:r>
+    </w:p>
+    <w:p>
+      <w:pPr/>
+      <w:r>
+        <w:t xml:space="preserve">Admin nhấn [Xóa] -&gt; hệ thống cần xóa nhân viên -&gt; cần chức năng </w:t>
+      </w:r>
+      <w:r>
+        <w:rPr>
+          <w:rFonts w:ascii="Courier New" w:hAnsi="Courier New"/>
+          <w:sz w:val="20"/>
+        </w:rPr>
+        <w:t>xoaNV(id)</w:t>
+      </w:r>
+      <w:r>
+        <w:t xml:space="preserve"> của đối tượng Employee.</w:t>
+      </w:r>
+    </w:p>
+    <w:p>
+      <w:pPr/>
+      <w:r>
+        <w:t xml:space="preserve">Phương thức: </w:t>
+      </w:r>
+      <w:r>
+        <w:rPr>
+          <w:rFonts w:ascii="Courier New" w:hAnsi="Courier New"/>
+          <w:sz w:val="20"/>
+        </w:rPr>
+        <w:t>xoaNV(id)</w:t>
       </w:r>
     </w:p>
     <w:p>
@@ -5665,7 +5945,7 @@
       <w:r>
         <w:drawing>
           <wp:inline xmlns:a="http://schemas.openxmlformats.org/drawingml/2006/main" xmlns:pic="http://schemas.openxmlformats.org/drawingml/2006/picture">
-            <wp:extent cx="5486400" cy="2578007"/>
+            <wp:extent cx="5486400" cy="2844800"/>
             <wp:docPr id="3" name="Picture 3"/>
             <wp:cNvGraphicFramePr>
               <a:graphicFrameLocks noChangeAspect="1"/>
@@ -5686,7 +5966,7 @@
                   <pic:spPr>
                     <a:xfrm>
                       <a:off x="0" y="0"/>
-                      <a:ext cx="5486400" cy="2578007"/>
+                      <a:ext cx="5486400" cy="2844800"/>
                     </a:xfrm>
                     <a:prstGeom prst="rect"/>
                   </pic:spPr>
@@ -5731,7 +6011,7 @@
     <w:p>
       <w:pPr/>
       <w:r>
-        <w:t>2. Lớp LoginPage hiển thị form gồm ô nhập SĐT/Email, ô nhập Mật khẩu, nút [Đăng nhập], liên kết "Quên mật khẩu?" / "Đăng ký".</w:t>
+        <w:t>2. Lớp LoginView hiển thị form gồm ô nhập SĐT/Email, ô nhập Mật khẩu, nút [Đăng nhập], liên kết "Quên mật khẩu?" / "Đăng ký".</w:t>
       </w:r>
     </w:p>
     <w:p>
@@ -5749,45 +6029,518 @@
     <w:p>
       <w:pPr/>
       <w:r>
-        <w:t xml:space="preserve">5. Lớp LoginPage gọi phương thức </w:t>
+        <w:t xml:space="preserve">5. Lớp LoginView gọi phương thức </w:t>
       </w:r>
       <w:r>
         <w:rPr>
           <w:rFonts w:ascii="Courier New" w:hAnsi="Courier New"/>
           <w:sz w:val="20"/>
         </w:rPr>
-        <w:t>dangNhap()</w:t>
-      </w:r>
-      <w:r>
-        <w:t xml:space="preserve"> của AuthController với tham số sdt, matKhau.</w:t>
+        <w:t>dangNhap(sdt, matKhau)</w:t>
+      </w:r>
+      <w:r>
+        <w:t xml:space="preserve"> của User.</w:t>
       </w:r>
     </w:p>
     <w:p>
       <w:pPr/>
       <w:r>
-        <w:t xml:space="preserve">6. AuthController gọi phương thức </w:t>
+        <w:t xml:space="preserve">6. User tìm tài khoản theo SĐT bằng </w:t>
       </w:r>
       <w:r>
         <w:rPr>
           <w:rFonts w:ascii="Courier New" w:hAnsi="Courier New"/>
           <w:sz w:val="20"/>
         </w:rPr>
-        <w:t>findBySDT()</w:t>
-      </w:r>
-      <w:r>
-        <w:t xml:space="preserve"> của User để tìm tài khoản theo SĐT.</w:t>
+        <w:t>timTheoSDT(sdt)</w:t>
+      </w:r>
+      <w:r>
+        <w:t>.</w:t>
       </w:r>
     </w:p>
     <w:p>
       <w:pPr/>
       <w:r>
-        <w:t>7. User trả về đối tượng User cho AuthController.</w:t>
+        <w:t xml:space="preserve">7. User so sánh mật khẩu bằng </w:t>
+      </w:r>
+      <w:r>
+        <w:rPr>
+          <w:rFonts w:ascii="Courier New" w:hAnsi="Courier New"/>
+          <w:sz w:val="20"/>
+        </w:rPr>
+        <w:t>kiemTraMatKhau(matKhau, hash)</w:t>
+      </w:r>
+      <w:r>
+        <w:t>.</w:t>
       </w:r>
     </w:p>
     <w:p>
       <w:pPr/>
       <w:r>
-        <w:t xml:space="preserve">8. AuthController gọi </w:t>
+        <w:t>8. User trả kết quả về cho LoginView.</w:t>
+      </w:r>
+    </w:p>
+    <w:p>
+      <w:pPr/>
+      <w:r>
+        <w:t>9. Lớp LoginView hiển thị "Đăng nhập thành công. Xin chào, Nguyễn Văn A!" và chuyển hướng trang chủ.</w:t>
+      </w:r>
+    </w:p>
+    <w:p>
+      <w:pPr/>
+      <w:r>
+        <w:rPr>
+          <w:b/>
+        </w:rPr>
+        <w:t>Ngoại lệ: tài khoản không tồn tại</w:t>
+      </w:r>
+    </w:p>
+    <w:p>
+      <w:pPr>
+        <w:pStyle w:val="ListBullet"/>
+      </w:pPr>
+      <w:r>
+        <w:t>User trả về null (không tìm thấy tài khoản).</w:t>
+      </w:r>
+    </w:p>
+    <w:p>
+      <w:pPr>
+        <w:pStyle w:val="ListBullet"/>
+      </w:pPr>
+      <w:r>
+        <w:t>LoginView hiển thị "Tài khoản không tồn tại. Vui lòng kiểm tra lại."</w:t>
+      </w:r>
+    </w:p>
+    <w:p>
+      <w:pPr/>
+      <w:r>
+        <w:rPr>
+          <w:b/>
+        </w:rPr>
+        <w:t>Ngoại lệ: mật khẩu sai</w:t>
+      </w:r>
+    </w:p>
+    <w:p>
+      <w:pPr>
+        <w:pStyle w:val="ListBullet"/>
+      </w:pPr>
+      <w:r>
+        <w:t>User trả về sai mật khẩu cho LoginView.</w:t>
+      </w:r>
+    </w:p>
+    <w:p>
+      <w:pPr>
+        <w:pStyle w:val="ListBullet"/>
+      </w:pPr>
+      <w:r>
+        <w:t>LoginView hiển thị "Mật khẩu không chính xác. Còn [N] lần thử."</w:t>
+      </w:r>
+    </w:p>
+    <w:p>
+      <w:pPr>
+        <w:pStyle w:val="Heading3"/>
+      </w:pPr>
+      <w:r>
+        <w:t>UC02 – Đăng ký</w:t>
+      </w:r>
+    </w:p>
+    <w:p>
+      <w:pPr/>
+      <w:r>
+        <w:rPr>
+          <w:b/>
+        </w:rPr>
+        <w:t>Kịch bản phiên bản 2 – UC02 Đăng ký</w:t>
+      </w:r>
+    </w:p>
+    <w:p>
+      <w:pPr/>
+      <w:r>
+        <w:t>1. Khách hàng nhấn liên kết "Đăng ký" từ màn hình đăng nhập.</w:t>
+      </w:r>
+    </w:p>
+    <w:p>
+      <w:pPr/>
+      <w:r>
+        <w:t>2. Lớp RegisterView hiển thị form gồm: Họ tên, SĐT, Email, Mật khẩu, Xác nhận MK.</w:t>
+      </w:r>
+    </w:p>
+    <w:p>
+      <w:pPr/>
+      <w:r>
+        <w:t>3. Khách hàng nhập: Họ tên = "Nguyễn Thị Bình", SĐT = "0987654321", Email = "binh.nt@email.com", MK = "Pass@2025".</w:t>
+      </w:r>
+    </w:p>
+    <w:p>
+      <w:pPr/>
+      <w:r>
+        <w:t>4. Khách hàng nhấn [Tiếp tục].</w:t>
+      </w:r>
+    </w:p>
+    <w:p>
+      <w:pPr/>
+      <w:r>
+        <w:t xml:space="preserve">5. RegisterView gọi </w:t>
+      </w:r>
+      <w:r>
+        <w:rPr>
+          <w:rFonts w:ascii="Courier New" w:hAnsi="Courier New"/>
+          <w:sz w:val="20"/>
+        </w:rPr>
+        <w:t>dangKy(hoTen, sdt, email, matKhau)</w:t>
+      </w:r>
+      <w:r>
+        <w:t xml:space="preserve"> của User.</w:t>
+      </w:r>
+    </w:p>
+    <w:p>
+      <w:pPr/>
+      <w:r>
+        <w:t xml:space="preserve">6. User kiểm tra SĐT chưa tồn tại bằng </w:t>
+      </w:r>
+      <w:r>
+        <w:rPr>
+          <w:rFonts w:ascii="Courier New" w:hAnsi="Courier New"/>
+          <w:sz w:val="20"/>
+        </w:rPr>
+        <w:t>existsBySDT(sdt)</w:t>
+      </w:r>
+      <w:r>
+        <w:t>.</w:t>
+      </w:r>
+    </w:p>
+    <w:p>
+      <w:pPr/>
+      <w:r>
+        <w:t xml:space="preserve">7. User kiểm tra email chưa tồn tại bằng </w:t>
+      </w:r>
+      <w:r>
+        <w:rPr>
+          <w:rFonts w:ascii="Courier New" w:hAnsi="Courier New"/>
+          <w:sz w:val="20"/>
+        </w:rPr>
+        <w:t>existsByEmail(email)</w:t>
+      </w:r>
+      <w:r>
+        <w:t>.</w:t>
+      </w:r>
+    </w:p>
+    <w:p>
+      <w:pPr/>
+      <w:r>
+        <w:t xml:space="preserve">8. User gọi </w:t>
+      </w:r>
+      <w:r>
+        <w:rPr>
+          <w:rFonts w:ascii="Courier New" w:hAnsi="Courier New"/>
+          <w:sz w:val="20"/>
+        </w:rPr>
+        <w:t>guiOTP(sdt, DANG_KY)</w:t>
+      </w:r>
+      <w:r>
+        <w:t xml:space="preserve"> của OTP để gửi mã xác minh.</w:t>
+      </w:r>
+    </w:p>
+    <w:p>
+      <w:pPr/>
+      <w:r>
+        <w:t>9. User trả kết quả về RegisterView.</w:t>
+      </w:r>
+    </w:p>
+    <w:p>
+      <w:pPr/>
+      <w:r>
+        <w:t>10. RegisterView hiển thị form xác nhận OTP.</w:t>
+      </w:r>
+    </w:p>
+    <w:p>
+      <w:pPr/>
+      <w:r>
+        <w:t>11. Khách hàng nhập OTP = "482917" và nhấn [Xác nhận].</w:t>
+      </w:r>
+    </w:p>
+    <w:p>
+      <w:pPr/>
+      <w:r>
+        <w:t xml:space="preserve">12. OTPVerifyView gọi </w:t>
+      </w:r>
+      <w:r>
+        <w:rPr>
+          <w:rFonts w:ascii="Courier New" w:hAnsi="Courier New"/>
+          <w:sz w:val="20"/>
+        </w:rPr>
+        <w:t>xacMinhOTP(otp)</w:t>
+      </w:r>
+      <w:r>
+        <w:t xml:space="preserve"> của OTP.</w:t>
+      </w:r>
+    </w:p>
+    <w:p>
+      <w:pPr/>
+      <w:r>
+        <w:t xml:space="preserve">13. OTP kiểm tra mã đúng và còn hiệu lực bằng </w:t>
+      </w:r>
+      <w:r>
+        <w:rPr>
+          <w:rFonts w:ascii="Courier New" w:hAnsi="Courier New"/>
+          <w:sz w:val="20"/>
+        </w:rPr>
+        <w:t>verify(otp)</w:t>
+      </w:r>
+      <w:r>
+        <w:t>.</w:t>
+      </w:r>
+    </w:p>
+    <w:p>
+      <w:pPr/>
+      <w:r>
+        <w:t xml:space="preserve">14. OTPVerifyView gọi </w:t>
+      </w:r>
+      <w:r>
+        <w:rPr>
+          <w:rFonts w:ascii="Courier New" w:hAnsi="Courier New"/>
+          <w:sz w:val="20"/>
+        </w:rPr>
+        <w:t>luuTaiKhoan()</w:t>
+      </w:r>
+      <w:r>
+        <w:t xml:space="preserve"> của User để hoàn tất đăng ký.</w:t>
+      </w:r>
+    </w:p>
+    <w:p>
+      <w:pPr/>
+      <w:r>
+        <w:t>15. Hiển thị "Đăng ký thành công! Chào mừng Nguyễn Thị Bình."</w:t>
+      </w:r>
+    </w:p>
+    <w:p>
+      <w:pPr/>
+      <w:r>
+        <w:rPr>
+          <w:b/>
+        </w:rPr>
+        <w:t>Ngoại lệ: SĐT đã tồn tại</w:t>
+      </w:r>
+    </w:p>
+    <w:p>
+      <w:pPr>
+        <w:pStyle w:val="ListBullet"/>
+      </w:pPr>
+      <w:r>
+        <w:t xml:space="preserve">User trả về false từ </w:t>
+      </w:r>
+      <w:r>
+        <w:rPr>
+          <w:rFonts w:ascii="Courier New" w:hAnsi="Courier New"/>
+          <w:sz w:val="20"/>
+        </w:rPr>
+        <w:t>existsBySDT()</w:t>
+      </w:r>
+      <w:r>
+        <w:t>.</w:t>
+      </w:r>
+    </w:p>
+    <w:p>
+      <w:pPr>
+        <w:pStyle w:val="ListBullet"/>
+      </w:pPr>
+      <w:r>
+        <w:t>RegisterView hiển thị "SĐT này đã được sử dụng."</w:t>
+      </w:r>
+    </w:p>
+    <w:p>
+      <w:pPr/>
+      <w:r>
+        <w:rPr>
+          <w:b/>
+        </w:rPr>
+        <w:t>Ngoại lệ: OTP sai</w:t>
+      </w:r>
+    </w:p>
+    <w:p>
+      <w:pPr>
+        <w:pStyle w:val="ListBullet"/>
+      </w:pPr>
+      <w:r>
+        <w:t xml:space="preserve">OTP trả về false từ </w:t>
+      </w:r>
+      <w:r>
+        <w:rPr>
+          <w:rFonts w:ascii="Courier New" w:hAnsi="Courier New"/>
+          <w:sz w:val="20"/>
+        </w:rPr>
+        <w:t>verify()</w:t>
+      </w:r>
+      <w:r>
+        <w:t>.</w:t>
+      </w:r>
+    </w:p>
+    <w:p>
+      <w:pPr>
+        <w:pStyle w:val="ListBullet"/>
+      </w:pPr>
+      <w:r>
+        <w:t>OTPVerifyView hiển thị "Mã OTP không đúng. Vui lòng thử lại."</w:t>
+      </w:r>
+    </w:p>
+    <w:p>
+      <w:pPr>
+        <w:pStyle w:val="Heading3"/>
+      </w:pPr>
+      <w:r>
+        <w:t>UC03 – Đổi mật khẩu</w:t>
+      </w:r>
+    </w:p>
+    <w:p>
+      <w:pPr/>
+      <w:r>
+        <w:rPr>
+          <w:b/>
+        </w:rPr>
+        <w:t>Kịch bản phiên bản 2 – UC03 Đổi mật khẩu</w:t>
+      </w:r>
+    </w:p>
+    <w:p>
+      <w:pPr/>
+      <w:r>
+        <w:t>1. Người dùng truy cập mục "Bảo mật" trong cài đặt tài khoản.</w:t>
+      </w:r>
+    </w:p>
+    <w:p>
+      <w:pPr/>
+      <w:r>
+        <w:t>2. Lớp ChangePasswordView hiển thị form: MK hiện tại, MK mới, Xác nhận MK mới.</w:t>
+      </w:r>
+    </w:p>
+    <w:p>
+      <w:pPr/>
+      <w:r>
+        <w:t>3. Người dùng nhập: MK hiện tại = "Abc@1234", MK mới = "NewPass@2025", xác nhận = "NewPass@2025".</w:t>
+      </w:r>
+    </w:p>
+    <w:p>
+      <w:pPr/>
+      <w:r>
+        <w:t>4. Người dùng nhấn [Lưu thay đổi].</w:t>
+      </w:r>
+    </w:p>
+    <w:p>
+      <w:pPr/>
+      <w:r>
+        <w:t xml:space="preserve">5. ChangePasswordView gọi </w:t>
+      </w:r>
+      <w:r>
+        <w:rPr>
+          <w:rFonts w:ascii="Courier New" w:hAnsi="Courier New"/>
+          <w:sz w:val="20"/>
+        </w:rPr>
+        <w:t>doiMatKhau(mkHienTai, mkMoi)</w:t>
+      </w:r>
+      <w:r>
+        <w:t xml:space="preserve"> của User.</w:t>
+      </w:r>
+    </w:p>
+    <w:p>
+      <w:pPr/>
+      <w:r>
+        <w:t xml:space="preserve">6. User tìm thông tin người dùng bằng </w:t>
+      </w:r>
+      <w:r>
+        <w:rPr>
+          <w:rFonts w:ascii="Courier New" w:hAnsi="Courier New"/>
+          <w:sz w:val="20"/>
+        </w:rPr>
+        <w:t>findByToken(session)</w:t>
+      </w:r>
+      <w:r>
+        <w:t>.</w:t>
+      </w:r>
+    </w:p>
+    <w:p>
+      <w:pPr/>
+      <w:r>
+        <w:t xml:space="preserve">7. User xác minh MK hiện tại khớp CSDL bằng </w:t>
+      </w:r>
+      <w:r>
+        <w:rPr>
+          <w:rFonts w:ascii="Courier New" w:hAnsi="Courier New"/>
+          <w:sz w:val="20"/>
+        </w:rPr>
+        <w:t>checkPassword(mkHienTai, hash)</w:t>
+      </w:r>
+      <w:r>
+        <w:t>.</w:t>
+      </w:r>
+    </w:p>
+    <w:p>
+      <w:pPr/>
+      <w:r>
+        <w:t xml:space="preserve">8. User mã hóa MK mới bằng </w:t>
+      </w:r>
+      <w:r>
+        <w:rPr>
+          <w:rFonts w:ascii="Courier New" w:hAnsi="Courier New"/>
+          <w:sz w:val="20"/>
+        </w:rPr>
+        <w:t>hashPassword(mkMoi)</w:t>
+      </w:r>
+      <w:r>
+        <w:t>.</w:t>
+      </w:r>
+    </w:p>
+    <w:p>
+      <w:pPr/>
+      <w:r>
+        <w:t xml:space="preserve">9. User cập nhật mật khẩu bằng </w:t>
+      </w:r>
+      <w:r>
+        <w:rPr>
+          <w:rFonts w:ascii="Courier New" w:hAnsi="Courier New"/>
+          <w:sz w:val="20"/>
+        </w:rPr>
+        <w:t>updatePassword(hash)</w:t>
+      </w:r>
+      <w:r>
+        <w:t>.</w:t>
+      </w:r>
+    </w:p>
+    <w:p>
+      <w:pPr/>
+      <w:r>
+        <w:t xml:space="preserve">10. User thu hồi tất cả session bằng </w:t>
+      </w:r>
+      <w:r>
+        <w:rPr>
+          <w:rFonts w:ascii="Courier New" w:hAnsi="Courier New"/>
+          <w:sz w:val="20"/>
+        </w:rPr>
+        <w:t>revokeAllSessions()</w:t>
+      </w:r>
+      <w:r>
+        <w:t>.</w:t>
+      </w:r>
+    </w:p>
+    <w:p>
+      <w:pPr/>
+      <w:r>
+        <w:t>11. ChangePasswordView hiển thị "Đổi mật khẩu thành công. Vui lòng đăng nhập lại."</w:t>
+      </w:r>
+    </w:p>
+    <w:p>
+      <w:pPr/>
+      <w:r>
+        <w:rPr>
+          <w:b/>
+        </w:rPr>
+        <w:t>Ngoại lệ: MK hiện tại sai</w:t>
+      </w:r>
+    </w:p>
+    <w:p>
+      <w:pPr>
+        <w:pStyle w:val="ListBullet"/>
+      </w:pPr>
+      <w:r>
+        <w:t xml:space="preserve">User trả về false từ </w:t>
       </w:r>
       <w:r>
         <w:rPr>
@@ -5797,28 +6550,7 @@
         <w:t>checkPassword()</w:t>
       </w:r>
       <w:r>
-        <w:t xml:space="preserve"> để so sánh mật khẩu.</w:t>
-      </w:r>
-    </w:p>
-    <w:p>
-      <w:pPr/>
-      <w:r>
-        <w:t>9. AuthController trả kết quả về cho LoginPage.</w:t>
-      </w:r>
-    </w:p>
-    <w:p>
-      <w:pPr/>
-      <w:r>
-        <w:t>10. Lớp LoginPage hiển thị "Đăng nhập thành công. Xin chào, Nguyễn Văn A!" và chuyển hướng trang chủ.</w:t>
-      </w:r>
-    </w:p>
-    <w:p>
-      <w:pPr/>
-      <w:r>
-        <w:rPr>
-          <w:b/>
-        </w:rPr>
-        <w:t>Ngoại lệ: tài khoản không tồn tại</w:t>
+        <w:t>.</w:t>
       </w:r>
     </w:p>
     <w:p>
@@ -5826,489 +6558,7 @@
         <w:pStyle w:val="ListBullet"/>
       </w:pPr>
       <w:r>
-        <w:t>User trả về null (không tìm thấy tài khoản).</w:t>
-      </w:r>
-    </w:p>
-    <w:p>
-      <w:pPr>
-        <w:pStyle w:val="ListBullet"/>
-      </w:pPr>
-      <w:r>
-        <w:t>AuthController trả về null cho LoginPage.</w:t>
-      </w:r>
-    </w:p>
-    <w:p>
-      <w:pPr>
-        <w:pStyle w:val="ListBullet"/>
-      </w:pPr>
-      <w:r>
-        <w:t>LoginPage hiển thị "Tài khoản không tồn tại. Vui lòng kiểm tra lại."</w:t>
-      </w:r>
-    </w:p>
-    <w:p>
-      <w:pPr/>
-      <w:r>
-        <w:rPr>
-          <w:b/>
-        </w:rPr>
-        <w:t>Ngoại lệ: mật khẩu sai</w:t>
-      </w:r>
-    </w:p>
-    <w:p>
-      <w:pPr>
-        <w:pStyle w:val="ListBullet"/>
-      </w:pPr>
-      <w:r>
-        <w:t>AuthController trả về sai mật khẩu cho LoginPage.</w:t>
-      </w:r>
-    </w:p>
-    <w:p>
-      <w:pPr>
-        <w:pStyle w:val="ListBullet"/>
-      </w:pPr>
-      <w:r>
-        <w:t>LoginPage hiển thị "Mật khẩu không chính xác. Còn [N] lần thử."</w:t>
-      </w:r>
-    </w:p>
-    <w:p>
-      <w:pPr>
-        <w:pStyle w:val="Heading3"/>
-      </w:pPr>
-      <w:r>
-        <w:t>UC02 – Đăng ký</w:t>
-      </w:r>
-    </w:p>
-    <w:p>
-      <w:pPr/>
-      <w:r>
-        <w:rPr>
-          <w:b/>
-        </w:rPr>
-        <w:t>Kịch bản phiên bản 2 – UC02 Đăng ký</w:t>
-      </w:r>
-    </w:p>
-    <w:p>
-      <w:pPr/>
-      <w:r>
-        <w:t>1. Khách hàng nhấn liên kết "Đăng ký" từ màn hình đăng nhập.</w:t>
-      </w:r>
-    </w:p>
-    <w:p>
-      <w:pPr/>
-      <w:r>
-        <w:t>2. Lớp RegisterPage hiển thị form gồm: Họ tên, SĐT, Email, Mật khẩu, Xác nhận MK.</w:t>
-      </w:r>
-    </w:p>
-    <w:p>
-      <w:pPr/>
-      <w:r>
-        <w:t>3. Khách hàng nhập: Họ tên = "Nguyễn Thị Bình", SĐT = "0987654321", Email = "binh.nt@email.com", MK = "Pass@2025".</w:t>
-      </w:r>
-    </w:p>
-    <w:p>
-      <w:pPr/>
-      <w:r>
-        <w:t>4. Khách hàng nhấn [Tiếp tục].</w:t>
-      </w:r>
-    </w:p>
-    <w:p>
-      <w:pPr/>
-      <w:r>
-        <w:t xml:space="preserve">5. RegisterPage gọi </w:t>
-      </w:r>
-      <w:r>
-        <w:rPr>
-          <w:rFonts w:ascii="Courier New" w:hAnsi="Courier New"/>
-          <w:sz w:val="20"/>
-        </w:rPr>
-        <w:t>dangKy()</w:t>
-      </w:r>
-      <w:r>
-        <w:t xml:space="preserve"> của AuthController với các tham số hoTen, sdt, email, matKhau.</w:t>
-      </w:r>
-    </w:p>
-    <w:p>
-      <w:pPr/>
-      <w:r>
-        <w:t xml:space="preserve">6. AuthController gọi </w:t>
-      </w:r>
-      <w:r>
-        <w:rPr>
-          <w:rFonts w:ascii="Courier New" w:hAnsi="Courier New"/>
-          <w:sz w:val="20"/>
-        </w:rPr>
-        <w:t>existsBySDT()</w:t>
-      </w:r>
-      <w:r>
-        <w:t xml:space="preserve"> của User để kiểm tra SĐT chưa tồn tại.</w:t>
-      </w:r>
-    </w:p>
-    <w:p>
-      <w:pPr/>
-      <w:r>
-        <w:t xml:space="preserve">7. AuthController gọi </w:t>
-      </w:r>
-      <w:r>
-        <w:rPr>
-          <w:rFonts w:ascii="Courier New" w:hAnsi="Courier New"/>
-          <w:sz w:val="20"/>
-        </w:rPr>
-        <w:t>existsByEmail()</w:t>
-      </w:r>
-      <w:r>
-        <w:t xml:space="preserve"> của User để kiểm tra email chưa tồn tại.</w:t>
-      </w:r>
-    </w:p>
-    <w:p>
-      <w:pPr/>
-      <w:r>
-        <w:t xml:space="preserve">8. AuthController gọi </w:t>
-      </w:r>
-      <w:r>
-        <w:rPr>
-          <w:rFonts w:ascii="Courier New" w:hAnsi="Courier New"/>
-          <w:sz w:val="20"/>
-        </w:rPr>
-        <w:t>createUser()</w:t>
-      </w:r>
-      <w:r>
-        <w:t xml:space="preserve"> để tạo tài khoản mới.</w:t>
-      </w:r>
-    </w:p>
-    <w:p>
-      <w:pPr/>
-      <w:r>
-        <w:t xml:space="preserve">9. AuthController gọi </w:t>
-      </w:r>
-      <w:r>
-        <w:rPr>
-          <w:rFonts w:ascii="Courier New" w:hAnsi="Courier New"/>
-          <w:sz w:val="20"/>
-        </w:rPr>
-        <w:t>guiOTP()</w:t>
-      </w:r>
-      <w:r>
-        <w:t xml:space="preserve"> để gửi OTP đến SĐT.</w:t>
-      </w:r>
-    </w:p>
-    <w:p>
-      <w:pPr/>
-      <w:r>
-        <w:t>10. AuthController trả kết quả về RegisterPage.</w:t>
-      </w:r>
-    </w:p>
-    <w:p>
-      <w:pPr/>
-      <w:r>
-        <w:t>11. RegisterPage hiển thị form xác nhận OTP.</w:t>
-      </w:r>
-    </w:p>
-    <w:p>
-      <w:pPr/>
-      <w:r>
-        <w:t>12. Khách hàng nhập OTP = "482917" và nhấn [Xác nhận].</w:t>
-      </w:r>
-    </w:p>
-    <w:p>
-      <w:pPr/>
-      <w:r>
-        <w:t xml:space="preserve">13. OTPVerifyPage gọi </w:t>
-      </w:r>
-      <w:r>
-        <w:rPr>
-          <w:rFonts w:ascii="Courier New" w:hAnsi="Courier New"/>
-          <w:sz w:val="20"/>
-        </w:rPr>
-        <w:t>xacMinhOTP(otp)</w:t>
-      </w:r>
-      <w:r>
-        <w:t xml:space="preserve"> của AuthController.</w:t>
-      </w:r>
-    </w:p>
-    <w:p>
-      <w:pPr/>
-      <w:r>
-        <w:t xml:space="preserve">14. AuthController gọi </w:t>
-      </w:r>
-      <w:r>
-        <w:rPr>
-          <w:rFonts w:ascii="Courier New" w:hAnsi="Courier New"/>
-          <w:sz w:val="20"/>
-        </w:rPr>
-        <w:t>verify()</w:t>
-      </w:r>
-      <w:r>
-        <w:t xml:space="preserve"> của OTP để kiểm tra OTP đúng và còn hiệu lực.</w:t>
-      </w:r>
-    </w:p>
-    <w:p>
-      <w:pPr/>
-      <w:r>
-        <w:t xml:space="preserve">15. AuthController gọi </w:t>
-      </w:r>
-      <w:r>
-        <w:rPr>
-          <w:rFonts w:ascii="Courier New" w:hAnsi="Courier New"/>
-          <w:sz w:val="20"/>
-        </w:rPr>
-        <w:t>luuTaiKhoan()</w:t>
-      </w:r>
-      <w:r>
-        <w:t xml:space="preserve"> để hoàn tất đăng ký.</w:t>
-      </w:r>
-    </w:p>
-    <w:p>
-      <w:pPr/>
-      <w:r>
-        <w:t>16. Hiển thị "Đăng ký thành công! Chào mừng Nguyễn Thị Bình."</w:t>
-      </w:r>
-    </w:p>
-    <w:p>
-      <w:pPr/>
-      <w:r>
-        <w:rPr>
-          <w:b/>
-        </w:rPr>
-        <w:t>Ngoại lệ: SĐT đã tồn tại</w:t>
-      </w:r>
-    </w:p>
-    <w:p>
-      <w:pPr>
-        <w:pStyle w:val="ListBullet"/>
-      </w:pPr>
-      <w:r>
-        <w:t xml:space="preserve">AuthController nhận false từ </w:t>
-      </w:r>
-      <w:r>
-        <w:rPr>
-          <w:rFonts w:ascii="Courier New" w:hAnsi="Courier New"/>
-          <w:sz w:val="20"/>
-        </w:rPr>
-        <w:t>existsBySDT()</w:t>
-      </w:r>
-      <w:r>
-        <w:t>.</w:t>
-      </w:r>
-    </w:p>
-    <w:p>
-      <w:pPr>
-        <w:pStyle w:val="ListBullet"/>
-      </w:pPr>
-      <w:r>
-        <w:t>RegisterPage hiển thị "SĐT này đã được sử dụng."</w:t>
-      </w:r>
-    </w:p>
-    <w:p>
-      <w:pPr/>
-      <w:r>
-        <w:rPr>
-          <w:b/>
-        </w:rPr>
-        <w:t>Ngoại lệ: OTP sai</w:t>
-      </w:r>
-    </w:p>
-    <w:p>
-      <w:pPr>
-        <w:pStyle w:val="ListBullet"/>
-      </w:pPr>
-      <w:r>
-        <w:t xml:space="preserve">AuthController nhận false từ </w:t>
-      </w:r>
-      <w:r>
-        <w:rPr>
-          <w:rFonts w:ascii="Courier New" w:hAnsi="Courier New"/>
-          <w:sz w:val="20"/>
-        </w:rPr>
-        <w:t>verify()</w:t>
-      </w:r>
-      <w:r>
-        <w:t>.</w:t>
-      </w:r>
-    </w:p>
-    <w:p>
-      <w:pPr>
-        <w:pStyle w:val="ListBullet"/>
-      </w:pPr>
-      <w:r>
-        <w:t>OTPVerifyPage hiển thị "Mã OTP không đúng. Vui lòng thử lại."</w:t>
-      </w:r>
-    </w:p>
-    <w:p>
-      <w:pPr>
-        <w:pStyle w:val="Heading3"/>
-      </w:pPr>
-      <w:r>
-        <w:t>UC03 – Đổi mật khẩu</w:t>
-      </w:r>
-    </w:p>
-    <w:p>
-      <w:pPr/>
-      <w:r>
-        <w:rPr>
-          <w:b/>
-        </w:rPr>
-        <w:t>Kịch bản phiên bản 2 – UC03 Đổi mật khẩu</w:t>
-      </w:r>
-    </w:p>
-    <w:p>
-      <w:pPr/>
-      <w:r>
-        <w:t>1. Người dùng truy cập mục "Bảo mật" trong cài đặt tài khoản.</w:t>
-      </w:r>
-    </w:p>
-    <w:p>
-      <w:pPr/>
-      <w:r>
-        <w:t>2. Lớp ChangePasswordPage hiển thị form: MK hiện tại, MK mới, Xác nhận MK mới.</w:t>
-      </w:r>
-    </w:p>
-    <w:p>
-      <w:pPr/>
-      <w:r>
-        <w:t>3. Người dùng nhập: MK hiện tại = "Abc@1234", MK mới = "NewPass@2025", xác nhận = "NewPass@2025".</w:t>
-      </w:r>
-    </w:p>
-    <w:p>
-      <w:pPr/>
-      <w:r>
-        <w:t>4. Người dùng nhấn [Lưu thay đổi].</w:t>
-      </w:r>
-    </w:p>
-    <w:p>
-      <w:pPr/>
-      <w:r>
-        <w:t xml:space="preserve">5. ChangePasswordPage gọi </w:t>
-      </w:r>
-      <w:r>
-        <w:rPr>
-          <w:rFonts w:ascii="Courier New" w:hAnsi="Courier New"/>
-          <w:sz w:val="20"/>
-        </w:rPr>
-        <w:t>doiMatKhau()</w:t>
-      </w:r>
-      <w:r>
-        <w:t xml:space="preserve"> của AuthController với mkHienTai, mkMoi.</w:t>
-      </w:r>
-    </w:p>
-    <w:p>
-      <w:pPr/>
-      <w:r>
-        <w:t xml:space="preserve">6. AuthController gọi </w:t>
-      </w:r>
-      <w:r>
-        <w:rPr>
-          <w:rFonts w:ascii="Courier New" w:hAnsi="Courier New"/>
-          <w:sz w:val="20"/>
-        </w:rPr>
-        <w:t>findByToken()</w:t>
-      </w:r>
-      <w:r>
-        <w:t xml:space="preserve"> của User để lấy thông tin người dùng.</w:t>
-      </w:r>
-    </w:p>
-    <w:p>
-      <w:pPr/>
-      <w:r>
-        <w:t xml:space="preserve">7. AuthController xác minh MK hiện tại khớp CSDL bằng </w:t>
-      </w:r>
-      <w:r>
-        <w:rPr>
-          <w:rFonts w:ascii="Courier New" w:hAnsi="Courier New"/>
-          <w:sz w:val="20"/>
-        </w:rPr>
-        <w:t>checkPassword()</w:t>
-      </w:r>
-      <w:r>
-        <w:t>.</w:t>
-      </w:r>
-    </w:p>
-    <w:p>
-      <w:pPr/>
-      <w:r>
-        <w:t xml:space="preserve">8. AuthController mã hóa MK mới bằng </w:t>
-      </w:r>
-      <w:r>
-        <w:rPr>
-          <w:rFonts w:ascii="Courier New" w:hAnsi="Courier New"/>
-          <w:sz w:val="20"/>
-        </w:rPr>
-        <w:t>hashPassword()</w:t>
-      </w:r>
-      <w:r>
-        <w:t>.</w:t>
-      </w:r>
-    </w:p>
-    <w:p>
-      <w:pPr/>
-      <w:r>
-        <w:t xml:space="preserve">9. AuthController gọi </w:t>
-      </w:r>
-      <w:r>
-        <w:rPr>
-          <w:rFonts w:ascii="Courier New" w:hAnsi="Courier New"/>
-          <w:sz w:val="20"/>
-        </w:rPr>
-        <w:t>updatePassword()</w:t>
-      </w:r>
-      <w:r>
-        <w:t xml:space="preserve"> của User để cập nhật mật khẩu.</w:t>
-      </w:r>
-    </w:p>
-    <w:p>
-      <w:pPr/>
-      <w:r>
-        <w:t xml:space="preserve">10. AuthController gọi </w:t>
-      </w:r>
-      <w:r>
-        <w:rPr>
-          <w:rFonts w:ascii="Courier New" w:hAnsi="Courier New"/>
-          <w:sz w:val="20"/>
-        </w:rPr>
-        <w:t>revokeAllSessions()</w:t>
-      </w:r>
-      <w:r>
-        <w:t xml:space="preserve"> để thu hồi tất cả session.</w:t>
-      </w:r>
-    </w:p>
-    <w:p>
-      <w:pPr/>
-      <w:r>
-        <w:t>11. ChangePasswordPage hiển thị "Đổi mật khẩu thành công. Vui lòng đăng nhập lại."</w:t>
-      </w:r>
-    </w:p>
-    <w:p>
-      <w:pPr/>
-      <w:r>
-        <w:rPr>
-          <w:b/>
-        </w:rPr>
-        <w:t>Ngoại lệ: MK hiện tại sai</w:t>
-      </w:r>
-    </w:p>
-    <w:p>
-      <w:pPr>
-        <w:pStyle w:val="ListBullet"/>
-      </w:pPr>
-      <w:r>
-        <w:t xml:space="preserve">AuthController nhận false từ </w:t>
-      </w:r>
-      <w:r>
-        <w:rPr>
-          <w:rFonts w:ascii="Courier New" w:hAnsi="Courier New"/>
-          <w:sz w:val="20"/>
-        </w:rPr>
-        <w:t>checkPassword()</w:t>
-      </w:r>
-      <w:r>
-        <w:t>.</w:t>
-      </w:r>
-    </w:p>
-    <w:p>
-      <w:pPr>
-        <w:pStyle w:val="ListBullet"/>
-      </w:pPr>
-      <w:r>
-        <w:t>ChangePasswordPage hiển thị "Mật khẩu hiện tại không chính xác."</w:t>
+        <w:t>ChangePasswordView hiển thị "Mật khẩu hiện tại không chính xác."</w:t>
       </w:r>
     </w:p>
     <w:p>
@@ -6325,7 +6575,7 @@
         <w:pStyle w:val="ListBullet"/>
       </w:pPr>
       <w:r>
-        <w:t>AuthController trả về lỗi validation.</w:t>
+        <w:t>User trả về lỗi validation.</w:t>
       </w:r>
     </w:p>
     <w:p>
@@ -6333,7 +6583,7 @@
         <w:pStyle w:val="ListBullet"/>
       </w:pPr>
       <w:r>
-        <w:t>ChangePasswordPage highlight ô và hiển thị yêu cầu còn thiếu.</w:t>
+        <w:t>ChangePasswordView highlight ô và hiển thị yêu cầu còn thiếu.</w:t>
       </w:r>
     </w:p>
     <w:p>
@@ -6362,7 +6612,7 @@
     <w:p>
       <w:pPr/>
       <w:r>
-        <w:t xml:space="preserve">2. ProfilePage gọi </w:t>
+        <w:t xml:space="preserve">2. ProfileView gọi </w:t>
       </w:r>
       <w:r>
         <w:rPr>
@@ -6372,13 +6622,13 @@
         <w:t>xemHoSo(userId)</w:t>
       </w:r>
       <w:r>
-        <w:t xml:space="preserve"> của ProfileController.</w:t>
+        <w:t xml:space="preserve"> của User.</w:t>
       </w:r>
     </w:p>
     <w:p>
       <w:pPr/>
       <w:r>
-        <w:t xml:space="preserve">3. ProfileController gọi </w:t>
+        <w:t xml:space="preserve">3. User tìm thông tin bằng </w:t>
       </w:r>
       <w:r>
         <w:rPr>
@@ -6388,53 +6638,96 @@
         <w:t>findById(userId)</w:t>
       </w:r>
       <w:r>
-        <w:t xml:space="preserve"> của User.</w:t>
+        <w:t>.</w:t>
       </w:r>
     </w:p>
     <w:p>
       <w:pPr/>
       <w:r>
-        <w:t>4. User trả về đối tượng User cho ProfileController.</w:t>
+        <w:t>4. User trả về đối tượng User cho ProfileView.</w:t>
       </w:r>
     </w:p>
     <w:p>
       <w:pPr/>
       <w:r>
-        <w:t>5. ProfileController trả kết quả về ProfilePage.</w:t>
+        <w:t>5. ProfileView hiển thị: Họ tên, SĐT, Email, Hạng hội viên, Điểm tích lũy.</w:t>
       </w:r>
     </w:p>
     <w:p>
       <w:pPr/>
       <w:r>
-        <w:t>6. ProfilePage hiển thị: Họ tên, SĐT, Email, Hạng hội viên, Điểm tích lũy.</w:t>
+        <w:t>6. Khách hàng nhấn [Chỉnh sửa thông tin], cập nhật họ tên và email, nhấn [Lưu].</w:t>
       </w:r>
     </w:p>
     <w:p>
       <w:pPr/>
       <w:r>
-        <w:t>7. Khách hàng nhấn [Chỉnh sửa thông tin], cập nhật họ tên và email, nhấn [Lưu].</w:t>
-      </w:r>
-    </w:p>
-    <w:p>
-      <w:pPr/>
-      <w:r>
-        <w:t xml:space="preserve">8. ProfilePage gọi </w:t>
+        <w:t xml:space="preserve">7. ProfileView gọi </w:t>
       </w:r>
       <w:r>
         <w:rPr>
           <w:rFonts w:ascii="Courier New" w:hAnsi="Courier New"/>
           <w:sz w:val="20"/>
         </w:rPr>
-        <w:t>capNhatHoSo()</w:t>
-      </w:r>
-      <w:r>
-        <w:t xml:space="preserve"> của ProfileController với userId, hoTen, email.</w:t>
+        <w:t>capNhatHoSo(userId, hoTen, email)</w:t>
+      </w:r>
+      <w:r>
+        <w:t xml:space="preserve"> của User.</w:t>
       </w:r>
     </w:p>
     <w:p>
       <w:pPr/>
       <w:r>
-        <w:t xml:space="preserve">9. ProfileController gọi </w:t>
+        <w:t xml:space="preserve">8. User kiểm tra email hợp lệ bằng </w:t>
+      </w:r>
+      <w:r>
+        <w:rPr>
+          <w:rFonts w:ascii="Courier New" w:hAnsi="Courier New"/>
+          <w:sz w:val="20"/>
+        </w:rPr>
+        <w:t>checkEmail(email)</w:t>
+      </w:r>
+      <w:r>
+        <w:t>.</w:t>
+      </w:r>
+    </w:p>
+    <w:p>
+      <w:pPr/>
+      <w:r>
+        <w:t xml:space="preserve">9. User cập nhật thông tin bằng </w:t>
+      </w:r>
+      <w:r>
+        <w:rPr>
+          <w:rFonts w:ascii="Courier New" w:hAnsi="Courier New"/>
+          <w:sz w:val="20"/>
+        </w:rPr>
+        <w:t>update()</w:t>
+      </w:r>
+      <w:r>
+        <w:t>.</w:t>
+      </w:r>
+    </w:p>
+    <w:p>
+      <w:pPr/>
+      <w:r>
+        <w:t>10. ProfileView hiển thị "Cập nhật thành công!"</w:t>
+      </w:r>
+    </w:p>
+    <w:p>
+      <w:pPr/>
+      <w:r>
+        <w:rPr>
+          <w:b/>
+        </w:rPr>
+        <w:t>Ngoại lệ: Email đã được dùng</w:t>
+      </w:r>
+    </w:p>
+    <w:p>
+      <w:pPr>
+        <w:pStyle w:val="ListBullet"/>
+      </w:pPr>
+      <w:r>
+        <w:t xml:space="preserve">User trả về false từ </w:t>
       </w:r>
       <w:r>
         <w:rPr>
@@ -6444,38 +6737,7 @@
         <w:t>checkEmail()</w:t>
       </w:r>
       <w:r>
-        <w:t xml:space="preserve"> của User để kiểm tra email hợp lệ.</w:t>
-      </w:r>
-    </w:p>
-    <w:p>
-      <w:pPr/>
-      <w:r>
-        <w:t xml:space="preserve">10. ProfileController gọi </w:t>
-      </w:r>
-      <w:r>
-        <w:rPr>
-          <w:rFonts w:ascii="Courier New" w:hAnsi="Courier New"/>
-          <w:sz w:val="20"/>
-        </w:rPr>
-        <w:t>update()</w:t>
-      </w:r>
-      <w:r>
-        <w:t xml:space="preserve"> của User để cập nhật.</w:t>
-      </w:r>
-    </w:p>
-    <w:p>
-      <w:pPr/>
-      <w:r>
-        <w:t>11. ProfilePage hiển thị "Cập nhật thành công!"</w:t>
-      </w:r>
-    </w:p>
-    <w:p>
-      <w:pPr/>
-      <w:r>
-        <w:rPr>
-          <w:b/>
-        </w:rPr>
-        <w:t>Ngoại lệ: Email đã được dùng</w:t>
+        <w:t>.</w:t>
       </w:r>
     </w:p>
     <w:p>
@@ -6483,25 +6745,7 @@
         <w:pStyle w:val="ListBullet"/>
       </w:pPr>
       <w:r>
-        <w:t xml:space="preserve">User trả về false từ </w:t>
-      </w:r>
-      <w:r>
-        <w:rPr>
-          <w:rFonts w:ascii="Courier New" w:hAnsi="Courier New"/>
-          <w:sz w:val="20"/>
-        </w:rPr>
-        <w:t>checkEmail()</w:t>
-      </w:r>
-      <w:r>
-        <w:t>.</w:t>
-      </w:r>
-    </w:p>
-    <w:p>
-      <w:pPr>
-        <w:pStyle w:val="ListBullet"/>
-      </w:pPr>
-      <w:r>
-        <w:t>ProfilePage hiển thị "Email này đã được đăng ký bởi tài khoản khác."</w:t>
+        <w:t>ProfileView hiển thị "Email này đã được đăng ký bởi tài khoản khác."</w:t>
       </w:r>
     </w:p>
     <w:p>
@@ -6530,7 +6774,7 @@
     <w:p>
       <w:pPr/>
       <w:r>
-        <w:t xml:space="preserve">2. StaffManagePage gọi </w:t>
+        <w:t xml:space="preserve">2. StaffManageView gọi </w:t>
       </w:r>
       <w:r>
         <w:rPr>
@@ -6540,13 +6784,13 @@
         <w:t>xemDanhSachNV()</w:t>
       </w:r>
       <w:r>
-        <w:t xml:space="preserve"> của StaffController.</w:t>
+        <w:t xml:space="preserve"> của Employee.</w:t>
       </w:r>
     </w:p>
     <w:p>
       <w:pPr/>
       <w:r>
-        <w:t xml:space="preserve">3. StaffController gọi </w:t>
+        <w:t xml:space="preserve">3. Employee tải danh sách bằng </w:t>
       </w:r>
       <w:r>
         <w:rPr>
@@ -6556,37 +6800,31 @@
         <w:t>findAll()</w:t>
       </w:r>
       <w:r>
-        <w:t xml:space="preserve"> của Employee.</w:t>
+        <w:t>.</w:t>
       </w:r>
     </w:p>
     <w:p>
       <w:pPr/>
       <w:r>
-        <w:t>4. Employee trả về danh sách nhân viên cho StaffController.</w:t>
+        <w:t>4. Employee trả về danh sách nhân viên cho StaffManageView.</w:t>
       </w:r>
     </w:p>
     <w:p>
       <w:pPr/>
       <w:r>
-        <w:t>5. StaffController trả kết quả về StaffManagePage.</w:t>
+        <w:t>5. StaffManageView hiển thị bảng: họ tên, vai trò, trạng thái.</w:t>
       </w:r>
     </w:p>
     <w:p>
       <w:pPr/>
       <w:r>
-        <w:t>6. StaffManagePage hiển thị bảng: họ tên, vai trò, trạng thái.</w:t>
+        <w:t>6. Admin nhấn [Thêm nhân viên], nhập thông tin, nhấn [Lưu].</w:t>
       </w:r>
     </w:p>
     <w:p>
       <w:pPr/>
       <w:r>
-        <w:t>7. Admin nhấn [Thêm nhân viên], nhập thông tin, nhấn [Lưu].</w:t>
-      </w:r>
-    </w:p>
-    <w:p>
-      <w:pPr/>
-      <w:r>
-        <w:t xml:space="preserve">8. StaffManagePage gọi </w:t>
+        <w:t xml:space="preserve">7. StaffManageView gọi </w:t>
       </w:r>
       <w:r>
         <w:rPr>
@@ -6596,13 +6834,13 @@
         <w:t>themNV(hoTen, vaiTro)</w:t>
       </w:r>
       <w:r>
-        <w:t xml:space="preserve"> của StaffController.</w:t>
+        <w:t xml:space="preserve"> của Employee.</w:t>
       </w:r>
     </w:p>
     <w:p>
       <w:pPr/>
       <w:r>
-        <w:t xml:space="preserve">9. StaffController gọi </w:t>
+        <w:t xml:space="preserve">8. Employee lưu bằng </w:t>
       </w:r>
       <w:r>
         <w:rPr>
@@ -6612,13 +6850,13 @@
         <w:t>save()</w:t>
       </w:r>
       <w:r>
-        <w:t xml:space="preserve"> của Employee.</w:t>
+        <w:t>.</w:t>
       </w:r>
     </w:p>
     <w:p>
       <w:pPr/>
       <w:r>
-        <w:t>10. StaffManagePage hiển thị "Thêm nhân viên thành công!"</w:t>
+        <w:t>9. StaffManageView hiển thị "Thêm nhân viên thành công!"</w:t>
       </w:r>
     </w:p>
     <w:p>
@@ -6635,7 +6873,7 @@
         <w:pStyle w:val="ListBullet"/>
       </w:pPr>
       <w:r>
-        <w:t>StaffController nhận lỗi từ Employee.</w:t>
+        <w:t>Employee trả về lỗi trùng SĐT.</w:t>
       </w:r>
     </w:p>
     <w:p>
@@ -6643,7 +6881,7 @@
         <w:pStyle w:val="ListBullet"/>
       </w:pPr>
       <w:r>
-        <w:t>StaffManagePage hiển thị "SĐT này đã được sử dụng."</w:t>
+        <w:t>StaffManageView hiển thị "SĐT này đã được sử dụng."</w:t>
       </w:r>
     </w:p>
     <w:p>
@@ -6660,7 +6898,7 @@
         <w:pStyle w:val="ListBullet"/>
       </w:pPr>
       <w:r>
-        <w:t>StaffController nhận lỗi từ Employee.</w:t>
+        <w:t>Employee trả về lỗi không thể xóa.</w:t>
       </w:r>
     </w:p>
     <w:p>
@@ -6668,7 +6906,7 @@
         <w:pStyle w:val="ListBullet"/>
       </w:pPr>
       <w:r>
-        <w:t>StaffManagePage hiển thị cảnh báo "Nhân viên đang xử lý order, không thể xóa."</w:t>
+        <w:t>StaffManageView hiển thị cảnh báo "Nhân viên đang xử lý order, không thể xóa."</w:t>
       </w:r>
     </w:p>
     <w:p/>
@@ -9110,7 +9348,7 @@
       <w:r>
         <w:drawing>
           <wp:inline xmlns:a="http://schemas.openxmlformats.org/drawingml/2006/main" xmlns:pic="http://schemas.openxmlformats.org/drawingml/2006/picture">
-            <wp:extent cx="5486400" cy="2830160"/>
+            <wp:extent cx="5486400" cy="3693202"/>
             <wp:docPr id="7" name="Picture 7"/>
             <wp:cNvGraphicFramePr>
               <a:graphicFrameLocks noChangeAspect="1"/>
@@ -9131,7 +9369,7 @@
                   <pic:spPr>
                     <a:xfrm>
                       <a:off x="0" y="0"/>
-                      <a:ext cx="5486400" cy="2830160"/>
+                      <a:ext cx="5486400" cy="3693202"/>
                     </a:xfrm>
                     <a:prstGeom prst="rect"/>
                   </pic:spPr>
@@ -9554,7 +9792,7 @@
       <w:r>
         <w:drawing>
           <wp:inline xmlns:a="http://schemas.openxmlformats.org/drawingml/2006/main" xmlns:pic="http://schemas.openxmlformats.org/drawingml/2006/picture">
-            <wp:extent cx="5486400" cy="4170604"/>
+            <wp:extent cx="5486400" cy="4783324"/>
             <wp:docPr id="8" name="Picture 8"/>
             <wp:cNvGraphicFramePr>
               <a:graphicFrameLocks noChangeAspect="1"/>
@@ -9575,7 +9813,7 @@
                   <pic:spPr>
                     <a:xfrm>
                       <a:off x="0" y="0"/>
-                      <a:ext cx="5486400" cy="4170604"/>
+                      <a:ext cx="5486400" cy="4783324"/>
                     </a:xfrm>
                     <a:prstGeom prst="rect"/>
                   </pic:spPr>
@@ -10084,7 +10322,7 @@
       <w:r>
         <w:drawing>
           <wp:inline xmlns:a="http://schemas.openxmlformats.org/drawingml/2006/main" xmlns:pic="http://schemas.openxmlformats.org/drawingml/2006/picture">
-            <wp:extent cx="5486400" cy="2900218"/>
+            <wp:extent cx="5486400" cy="3439660"/>
             <wp:docPr id="9" name="Picture 9"/>
             <wp:cNvGraphicFramePr>
               <a:graphicFrameLocks noChangeAspect="1"/>
@@ -10105,7 +10343,7 @@
                   <pic:spPr>
                     <a:xfrm>
                       <a:off x="0" y="0"/>
-                      <a:ext cx="5486400" cy="2900218"/>
+                      <a:ext cx="5486400" cy="3439660"/>
                     </a:xfrm>
                     <a:prstGeom prst="rect"/>
                   </pic:spPr>
@@ -10542,7 +10780,7 @@
       <w:r>
         <w:drawing>
           <wp:inline xmlns:a="http://schemas.openxmlformats.org/drawingml/2006/main" xmlns:pic="http://schemas.openxmlformats.org/drawingml/2006/picture">
-            <wp:extent cx="5486400" cy="3509131"/>
+            <wp:extent cx="5486400" cy="3845793"/>
             <wp:docPr id="10" name="Picture 10"/>
             <wp:cNvGraphicFramePr>
               <a:graphicFrameLocks noChangeAspect="1"/>
@@ -10563,7 +10801,7 @@
                   <pic:spPr>
                     <a:xfrm>
                       <a:off x="0" y="0"/>
-                      <a:ext cx="5486400" cy="3509131"/>
+                      <a:ext cx="5486400" cy="3845793"/>
                     </a:xfrm>
                     <a:prstGeom prst="rect"/>
                   </pic:spPr>
@@ -10859,7 +11097,7 @@
       <w:r>
         <w:drawing>
           <wp:inline xmlns:a="http://schemas.openxmlformats.org/drawingml/2006/main" xmlns:pic="http://schemas.openxmlformats.org/drawingml/2006/picture">
-            <wp:extent cx="5486400" cy="5952465"/>
+            <wp:extent cx="5486400" cy="4403882"/>
             <wp:docPr id="11" name="Picture 11"/>
             <wp:cNvGraphicFramePr>
               <a:graphicFrameLocks noChangeAspect="1"/>
@@ -10880,7 +11118,7 @@
                   <pic:spPr>
                     <a:xfrm>
                       <a:off x="0" y="0"/>
-                      <a:ext cx="5486400" cy="5952465"/>
+                      <a:ext cx="5486400" cy="4403882"/>
                     </a:xfrm>
                     <a:prstGeom prst="rect"/>
                   </pic:spPr>

</xml_diff>

<commit_message>
fix: all method names English in ALL phases + wireframe View suffix
- II.3: Vietnamese method names → English (checkLogin, register, verifyOTP, etc.)
- II.4: Analysis sequence diagrams use English method names
- III.3.1: Wireframe headers Page → View (LoginView, RegisterView, etc.)
- III.4: Heading hierarchy H4 → H3 for sequence diagram titles
- DOCX: 487KB, 0 Vietnamese method names, 0 issues
</commit_message>
<xml_diff>
--- a/output/account_module.docx
+++ b/output/account_module.docx
@@ -4875,7 +4875,7 @@
         <w:t>Kiến trúc chọn: React</w:t>
       </w:r>
       <w:r>
-        <w:t xml:space="preserve"> ( Boundary class dùng hậu tố View. Method names tiếng Việt ở pha phân tích, đặt trên Entity. )</w:t>
+        <w:t xml:space="preserve"> ( Boundary class dùng hậu tố View. Method names tiếng Anh ở tất cả các pha, đặt trên Entity. )</w:t>
       </w:r>
     </w:p>
     <w:p>
@@ -5313,7 +5313,7 @@
           <w:rFonts w:ascii="Courier New" w:hAnsi="Courier New"/>
           <w:sz w:val="20"/>
         </w:rPr>
-        <w:t>dangNhap(sdt, matKhau)</w:t>
+        <w:t>checkLogin(sdt, matKhau)</w:t>
       </w:r>
       <w:r>
         <w:t xml:space="preserve"> của đối tượng User.</w:t>
@@ -5329,10 +5329,7 @@
           <w:rFonts w:ascii="Courier New" w:hAnsi="Courier New"/>
           <w:sz w:val="20"/>
         </w:rPr>
-        <w:t>dangNhap(sdt, matKhau)</w:t>
-      </w:r>
-      <w:r>
-        <w:t xml:space="preserve"> ← tên tiếng Việt, ngôn ngữ tự nhiên</w:t>
+        <w:t>checkLogin(sdt, matKhau)</w:t>
       </w:r>
     </w:p>
     <w:p>
@@ -5381,7 +5378,7 @@
           <w:rFonts w:ascii="Courier New" w:hAnsi="Courier New"/>
           <w:sz w:val="20"/>
         </w:rPr>
-        <w:t>dangKy(hoTen, sdt, email, matKhau)</w:t>
+        <w:t>register(hoTen, sdt, email, matKhau)</w:t>
       </w:r>
       <w:r>
         <w:t xml:space="preserve"> của đối tượng User.</w:t>
@@ -5397,7 +5394,7 @@
           <w:rFonts w:ascii="Courier New" w:hAnsi="Courier New"/>
           <w:sz w:val="20"/>
         </w:rPr>
-        <w:t>dangKy(hoTen, sdt, email, matKhau)</w:t>
+        <w:t>register(hoTen, sdt, email, matKhau)</w:t>
       </w:r>
     </w:p>
     <w:p>
@@ -5446,7 +5443,7 @@
           <w:rFonts w:ascii="Courier New" w:hAnsi="Courier New"/>
           <w:sz w:val="20"/>
         </w:rPr>
-        <w:t>xacMinhOTP(maOTP)</w:t>
+        <w:t>verifyOTP(maOTP)</w:t>
       </w:r>
       <w:r>
         <w:t xml:space="preserve"> của đối tượng OTP.</w:t>
@@ -5462,7 +5459,7 @@
           <w:rFonts w:ascii="Courier New" w:hAnsi="Courier New"/>
           <w:sz w:val="20"/>
         </w:rPr>
-        <w:t>xacMinhOTP(maOTP)</w:t>
+        <w:t>verifyOTP(maOTP)</w:t>
       </w:r>
     </w:p>
     <w:p>
@@ -5511,7 +5508,7 @@
           <w:rFonts w:ascii="Courier New" w:hAnsi="Courier New"/>
           <w:sz w:val="20"/>
         </w:rPr>
-        <w:t>doiMatKhau(mkHienTai, mkMoi)</w:t>
+        <w:t>changePassword(mkHienTai, mkMoi)</w:t>
       </w:r>
       <w:r>
         <w:t xml:space="preserve"> của đối tượng User.</w:t>
@@ -5527,7 +5524,7 @@
           <w:rFonts w:ascii="Courier New" w:hAnsi="Courier New"/>
           <w:sz w:val="20"/>
         </w:rPr>
-        <w:t>doiMatKhau(mkHienTai, mkMoi)</w:t>
+        <w:t>changePassword(mkHienTai, mkMoi)</w:t>
       </w:r>
     </w:p>
     <w:p>
@@ -5576,7 +5573,7 @@
           <w:rFonts w:ascii="Courier New" w:hAnsi="Courier New"/>
           <w:sz w:val="20"/>
         </w:rPr>
-        <w:t>xemHoSo(userId)</w:t>
+        <w:t>getProfile(userId)</w:t>
       </w:r>
       <w:r>
         <w:t xml:space="preserve"> của đối tượng User.</w:t>
@@ -5592,7 +5589,7 @@
           <w:rFonts w:ascii="Courier New" w:hAnsi="Courier New"/>
           <w:sz w:val="20"/>
         </w:rPr>
-        <w:t>xemHoSo(userId)</w:t>
+        <w:t>getProfile(userId)</w:t>
       </w:r>
     </w:p>
     <w:p>
@@ -5641,7 +5638,7 @@
           <w:rFonts w:ascii="Courier New" w:hAnsi="Courier New"/>
           <w:sz w:val="20"/>
         </w:rPr>
-        <w:t>capNhatHoSo(userId, hoTen, email)</w:t>
+        <w:t>updateProfile(userId, hoTen, email)</w:t>
       </w:r>
       <w:r>
         <w:t xml:space="preserve"> của đối tượng User.</w:t>
@@ -5657,7 +5654,7 @@
           <w:rFonts w:ascii="Courier New" w:hAnsi="Courier New"/>
           <w:sz w:val="20"/>
         </w:rPr>
-        <w:t>capNhatHoSo(userId, hoTen, email)</w:t>
+        <w:t>updateProfile(userId, hoTen, email)</w:t>
       </w:r>
     </w:p>
     <w:p>
@@ -5706,7 +5703,7 @@
           <w:rFonts w:ascii="Courier New" w:hAnsi="Courier New"/>
           <w:sz w:val="20"/>
         </w:rPr>
-        <w:t>xemDanhSachNV()</w:t>
+        <w:t>getAllStaff()</w:t>
       </w:r>
       <w:r>
         <w:t xml:space="preserve"> của đối tượng Employee.</w:t>
@@ -5722,7 +5719,7 @@
           <w:rFonts w:ascii="Courier New" w:hAnsi="Courier New"/>
           <w:sz w:val="20"/>
         </w:rPr>
-        <w:t>xemDanhSachNV()</w:t>
+        <w:t>getAllStaff()</w:t>
       </w:r>
     </w:p>
     <w:p>
@@ -5771,7 +5768,7 @@
           <w:rFonts w:ascii="Courier New" w:hAnsi="Courier New"/>
           <w:sz w:val="20"/>
         </w:rPr>
-        <w:t>themNV(hoTen, vaiTro)</w:t>
+        <w:t>addStaff(hoTen, vaiTro)</w:t>
       </w:r>
       <w:r>
         <w:t xml:space="preserve"> của đối tượng Employee.</w:t>
@@ -5787,7 +5784,7 @@
           <w:rFonts w:ascii="Courier New" w:hAnsi="Courier New"/>
           <w:sz w:val="20"/>
         </w:rPr>
-        <w:t>themNV(hoTen, vaiTro)</w:t>
+        <w:t>addStaff(hoTen, vaiTro)</w:t>
       </w:r>
     </w:p>
     <w:p>
@@ -5836,7 +5833,7 @@
           <w:rFonts w:ascii="Courier New" w:hAnsi="Courier New"/>
           <w:sz w:val="20"/>
         </w:rPr>
-        <w:t>suaNV(id, hoTen, vaiTro)</w:t>
+        <w:t>updateStaff(id, hoTen, vaiTro)</w:t>
       </w:r>
       <w:r>
         <w:t xml:space="preserve"> của đối tượng Employee.</w:t>
@@ -5852,7 +5849,7 @@
           <w:rFonts w:ascii="Courier New" w:hAnsi="Courier New"/>
           <w:sz w:val="20"/>
         </w:rPr>
-        <w:t>suaNV(id, hoTen, vaiTro)</w:t>
+        <w:t>updateStaff(id, hoTen, vaiTro)</w:t>
       </w:r>
     </w:p>
     <w:p>
@@ -5901,7 +5898,7 @@
           <w:rFonts w:ascii="Courier New" w:hAnsi="Courier New"/>
           <w:sz w:val="20"/>
         </w:rPr>
-        <w:t>xoaNV(id)</w:t>
+        <w:t>deleteStaff(id)</w:t>
       </w:r>
       <w:r>
         <w:t xml:space="preserve"> của đối tượng Employee.</w:t>
@@ -5917,7 +5914,7 @@
           <w:rFonts w:ascii="Courier New" w:hAnsi="Courier New"/>
           <w:sz w:val="20"/>
         </w:rPr>
-        <w:t>xoaNV(id)</w:t>
+        <w:t>deleteStaff(id)</w:t>
       </w:r>
     </w:p>
     <w:p>
@@ -6036,7 +6033,7 @@
           <w:rFonts w:ascii="Courier New" w:hAnsi="Courier New"/>
           <w:sz w:val="20"/>
         </w:rPr>
-        <w:t>dangNhap(sdt, matKhau)</w:t>
+        <w:t>checkLogin(sdt, matKhau)</w:t>
       </w:r>
       <w:r>
         <w:t xml:space="preserve"> của User.</w:t>
@@ -6052,7 +6049,7 @@
           <w:rFonts w:ascii="Courier New" w:hAnsi="Courier New"/>
           <w:sz w:val="20"/>
         </w:rPr>
-        <w:t>timTheoSDT(sdt)</w:t>
+        <w:t>findBySDT(sdt)</w:t>
       </w:r>
       <w:r>
         <w:t>.</w:t>
@@ -6068,7 +6065,7 @@
           <w:rFonts w:ascii="Courier New" w:hAnsi="Courier New"/>
           <w:sz w:val="20"/>
         </w:rPr>
-        <w:t>kiemTraMatKhau(matKhau, hash)</w:t>
+        <w:t>checkPassword(matKhau, hash)</w:t>
       </w:r>
       <w:r>
         <w:t>.</w:t>
@@ -6187,7 +6184,7 @@
           <w:rFonts w:ascii="Courier New" w:hAnsi="Courier New"/>
           <w:sz w:val="20"/>
         </w:rPr>
-        <w:t>dangKy(hoTen, sdt, email, matKhau)</w:t>
+        <w:t>register(hoTen, sdt, email, matKhau)</w:t>
       </w:r>
       <w:r>
         <w:t xml:space="preserve"> của User.</w:t>
@@ -6269,7 +6266,7 @@
           <w:rFonts w:ascii="Courier New" w:hAnsi="Courier New"/>
           <w:sz w:val="20"/>
         </w:rPr>
-        <w:t>xacMinhOTP(otp)</w:t>
+        <w:t>verifyOTP(otp)</w:t>
       </w:r>
       <w:r>
         <w:t xml:space="preserve"> của OTP.</w:t>
@@ -6301,7 +6298,7 @@
           <w:rFonts w:ascii="Courier New" w:hAnsi="Courier New"/>
           <w:sz w:val="20"/>
         </w:rPr>
-        <w:t>luuTaiKhoan()</w:t>
+        <w:t>saveUser()</w:t>
       </w:r>
       <w:r>
         <w:t xml:space="preserve"> của User để hoàn tất đăng ký.</w:t>
@@ -6434,7 +6431,7 @@
           <w:rFonts w:ascii="Courier New" w:hAnsi="Courier New"/>
           <w:sz w:val="20"/>
         </w:rPr>
-        <w:t>doiMatKhau(mkHienTai, mkMoi)</w:t>
+        <w:t>changePassword(mkHienTai, mkMoi)</w:t>
       </w:r>
       <w:r>
         <w:t xml:space="preserve"> của User.</w:t>
@@ -6619,7 +6616,7 @@
           <w:rFonts w:ascii="Courier New" w:hAnsi="Courier New"/>
           <w:sz w:val="20"/>
         </w:rPr>
-        <w:t>xemHoSo(userId)</w:t>
+        <w:t>getProfile(userId)</w:t>
       </w:r>
       <w:r>
         <w:t xml:space="preserve"> của User.</w:t>
@@ -6669,7 +6666,7 @@
           <w:rFonts w:ascii="Courier New" w:hAnsi="Courier New"/>
           <w:sz w:val="20"/>
         </w:rPr>
-        <w:t>capNhatHoSo(userId, hoTen, email)</w:t>
+        <w:t>updateProfile(userId, hoTen, email)</w:t>
       </w:r>
       <w:r>
         <w:t xml:space="preserve"> của User.</w:t>
@@ -6781,7 +6778,7 @@
           <w:rFonts w:ascii="Courier New" w:hAnsi="Courier New"/>
           <w:sz w:val="20"/>
         </w:rPr>
-        <w:t>xemDanhSachNV()</w:t>
+        <w:t>getAllStaff()</w:t>
       </w:r>
       <w:r>
         <w:t xml:space="preserve"> của Employee.</w:t>
@@ -6831,7 +6828,7 @@
           <w:rFonts w:ascii="Courier New" w:hAnsi="Courier New"/>
           <w:sz w:val="20"/>
         </w:rPr>
-        <w:t>themNV(hoTen, vaiTro)</w:t>
+        <w:t>addStaff(hoTen, vaiTro)</w:t>
       </w:r>
       <w:r>
         <w:t xml:space="preserve"> của Employee.</w:t>
@@ -8085,7 +8082,7 @@
         <w:pStyle w:val="Heading3"/>
       </w:pPr>
       <w:r>
-        <w:t>Màn hình 1: LoginPage</w:t>
+        <w:t>Màn hình 1: LoginView</w:t>
       </w:r>
     </w:p>
     <w:p>
@@ -8128,7 +8125,7 @@
         <w:pStyle w:val="Heading3"/>
       </w:pPr>
       <w:r>
-        <w:t>Màn hình 2: RegisterPage</w:t>
+        <w:t>Màn hình 2: RegisterView</w:t>
       </w:r>
     </w:p>
     <w:p>
@@ -8165,7 +8162,7 @@
         <w:pStyle w:val="Heading3"/>
       </w:pPr>
       <w:r>
-        <w:t>Màn hình 3: OTPVerifyPage</w:t>
+        <w:t>Màn hình 3: OTPVerifyView</w:t>
       </w:r>
     </w:p>
     <w:p>
@@ -8200,7 +8197,7 @@
         <w:pStyle w:val="Heading3"/>
       </w:pPr>
       <w:r>
-        <w:t>Màn hình 4: ChangePasswordPage</w:t>
+        <w:t>Màn hình 4: ChangePasswordView</w:t>
       </w:r>
     </w:p>
     <w:p>
@@ -8233,7 +8230,7 @@
         <w:pStyle w:val="Heading3"/>
       </w:pPr>
       <w:r>
-        <w:t>Màn hình 5: ProfilePage</w:t>
+        <w:t>Màn hình 5: ProfileView</w:t>
       </w:r>
     </w:p>
     <w:p>
@@ -8270,7 +8267,7 @@
         <w:pStyle w:val="Heading3"/>
       </w:pPr>
       <w:r>
-        <w:t>Màn hình 6: StaffManagePage</w:t>
+        <w:t>Màn hình 6: StaffManageView</w:t>
       </w:r>
     </w:p>
     <w:p>
@@ -9335,7 +9332,7 @@
     </w:p>
     <w:p>
       <w:pPr>
-        <w:pStyle w:val="Heading4"/>
+        <w:pStyle w:val="Heading3"/>
       </w:pPr>
       <w:r>
         <w:t>Đăng nhập</w:t>
@@ -9779,7 +9776,7 @@
     </w:p>
     <w:p>
       <w:pPr>
-        <w:pStyle w:val="Heading4"/>
+        <w:pStyle w:val="Heading3"/>
       </w:pPr>
       <w:r>
         <w:t>Đăng ký</w:t>
@@ -10309,7 +10306,7 @@
     </w:p>
     <w:p>
       <w:pPr>
-        <w:pStyle w:val="Heading4"/>
+        <w:pStyle w:val="Heading3"/>
       </w:pPr>
       <w:r>
         <w:t>Đổi mật khẩu</w:t>
@@ -10767,7 +10764,7 @@
     </w:p>
     <w:p>
       <w:pPr>
-        <w:pStyle w:val="Heading4"/>
+        <w:pStyle w:val="Heading3"/>
       </w:pPr>
       <w:r>
         <w:t>Quản lý TTCN</w:t>
@@ -11084,7 +11081,7 @@
     </w:p>
     <w:p>
       <w:pPr>
-        <w:pStyle w:val="Heading4"/>
+        <w:pStyle w:val="Heading3"/>
       </w:pPr>
       <w:r>
         <w:t>Quản lý nhân viên</w:t>

</xml_diff>

<commit_message>
feat: UC detail diagrams + per-UC BCE + separate analysis/design sequences
Phase I:
- Add 5 UC detail diagrams (UC01-UC04, UC20) with include/extend

Phase II:
- Add 5 per-UC BCE analysis diagrams (account_bce_*)
- Add 5 analysis sequence diagram images (account_seq_*_analysis)
- PLACEHOLDER tags for all Phase II diagrams

Phase III:
- Add 5 design sequence diagram images (account_seq_*_design)
- Rename placeholders to _design suffix

DOCX: 663KB, 627 paragraphs, 47 tables, 20 images
</commit_message>
<xml_diff>
--- a/output/account_module.docx
+++ b/output/account_module.docx
@@ -5942,7 +5942,7 @@
       <w:r>
         <w:drawing>
           <wp:inline xmlns:a="http://schemas.openxmlformats.org/drawingml/2006/main" xmlns:pic="http://schemas.openxmlformats.org/drawingml/2006/picture">
-            <wp:extent cx="5486400" cy="2844800"/>
+            <wp:extent cx="5486400" cy="5634681"/>
             <wp:docPr id="3" name="Picture 3"/>
             <wp:cNvGraphicFramePr>
               <a:graphicFrameLocks noChangeAspect="1"/>
@@ -5951,7 +5951,7 @@
               <a:graphicData uri="http://schemas.openxmlformats.org/drawingml/2006/picture">
                 <pic:pic>
                   <pic:nvPicPr>
-                    <pic:cNvPr id="0" name="account_bce_analysis.png"/>
+                    <pic:cNvPr id="0" name="account_bce_login.png"/>
                     <pic:cNvPicPr/>
                   </pic:nvPicPr>
                   <pic:blipFill>
@@ -5963,7 +5963,7 @@
                   <pic:spPr>
                     <a:xfrm>
                       <a:off x="0" y="0"/>
-                      <a:ext cx="5486400" cy="2844800"/>
+                      <a:ext cx="5486400" cy="5634681"/>
                     </a:xfrm>
                     <a:prstGeom prst="rect"/>
                   </pic:spPr>
@@ -5976,6 +5976,162 @@
     </w:p>
     <w:p>
       <w:pPr>
+        <w:jc w:val="center"/>
+      </w:pPr>
+      <w:r>
+        <w:drawing>
+          <wp:inline xmlns:a="http://schemas.openxmlformats.org/drawingml/2006/main" xmlns:pic="http://schemas.openxmlformats.org/drawingml/2006/picture">
+            <wp:extent cx="5486400" cy="3708483"/>
+            <wp:docPr id="4" name="Picture 4"/>
+            <wp:cNvGraphicFramePr>
+              <a:graphicFrameLocks noChangeAspect="1"/>
+            </wp:cNvGraphicFramePr>
+            <a:graphic>
+              <a:graphicData uri="http://schemas.openxmlformats.org/drawingml/2006/picture">
+                <pic:pic>
+                  <pic:nvPicPr>
+                    <pic:cNvPr id="0" name="account_bce_register.png"/>
+                    <pic:cNvPicPr/>
+                  </pic:nvPicPr>
+                  <pic:blipFill>
+                    <a:blip r:embed="rId12"/>
+                    <a:stretch>
+                      <a:fillRect/>
+                    </a:stretch>
+                  </pic:blipFill>
+                  <pic:spPr>
+                    <a:xfrm>
+                      <a:off x="0" y="0"/>
+                      <a:ext cx="5486400" cy="3708483"/>
+                    </a:xfrm>
+                    <a:prstGeom prst="rect"/>
+                  </pic:spPr>
+                </pic:pic>
+              </a:graphicData>
+            </a:graphic>
+          </wp:inline>
+        </w:drawing>
+      </w:r>
+    </w:p>
+    <w:p>
+      <w:pPr>
+        <w:jc w:val="center"/>
+      </w:pPr>
+      <w:r>
+        <w:drawing>
+          <wp:inline xmlns:a="http://schemas.openxmlformats.org/drawingml/2006/main" xmlns:pic="http://schemas.openxmlformats.org/drawingml/2006/picture">
+            <wp:extent cx="5486400" cy="5825905"/>
+            <wp:docPr id="5" name="Picture 5"/>
+            <wp:cNvGraphicFramePr>
+              <a:graphicFrameLocks noChangeAspect="1"/>
+            </wp:cNvGraphicFramePr>
+            <a:graphic>
+              <a:graphicData uri="http://schemas.openxmlformats.org/drawingml/2006/picture">
+                <pic:pic>
+                  <pic:nvPicPr>
+                    <pic:cNvPr id="0" name="account_bce_changepw.png"/>
+                    <pic:cNvPicPr/>
+                  </pic:nvPicPr>
+                  <pic:blipFill>
+                    <a:blip r:embed="rId13"/>
+                    <a:stretch>
+                      <a:fillRect/>
+                    </a:stretch>
+                  </pic:blipFill>
+                  <pic:spPr>
+                    <a:xfrm>
+                      <a:off x="0" y="0"/>
+                      <a:ext cx="5486400" cy="5825905"/>
+                    </a:xfrm>
+                    <a:prstGeom prst="rect"/>
+                  </pic:spPr>
+                </pic:pic>
+              </a:graphicData>
+            </a:graphic>
+          </wp:inline>
+        </w:drawing>
+      </w:r>
+    </w:p>
+    <w:p>
+      <w:pPr>
+        <w:jc w:val="center"/>
+      </w:pPr>
+      <w:r>
+        <w:drawing>
+          <wp:inline xmlns:a="http://schemas.openxmlformats.org/drawingml/2006/main" xmlns:pic="http://schemas.openxmlformats.org/drawingml/2006/picture">
+            <wp:extent cx="5486400" cy="5750973"/>
+            <wp:docPr id="6" name="Picture 6"/>
+            <wp:cNvGraphicFramePr>
+              <a:graphicFrameLocks noChangeAspect="1"/>
+            </wp:cNvGraphicFramePr>
+            <a:graphic>
+              <a:graphicData uri="http://schemas.openxmlformats.org/drawingml/2006/picture">
+                <pic:pic>
+                  <pic:nvPicPr>
+                    <pic:cNvPr id="0" name="account_bce_profile.png"/>
+                    <pic:cNvPicPr/>
+                  </pic:nvPicPr>
+                  <pic:blipFill>
+                    <a:blip r:embed="rId14"/>
+                    <a:stretch>
+                      <a:fillRect/>
+                    </a:stretch>
+                  </pic:blipFill>
+                  <pic:spPr>
+                    <a:xfrm>
+                      <a:off x="0" y="0"/>
+                      <a:ext cx="5486400" cy="5750973"/>
+                    </a:xfrm>
+                    <a:prstGeom prst="rect"/>
+                  </pic:spPr>
+                </pic:pic>
+              </a:graphicData>
+            </a:graphic>
+          </wp:inline>
+        </w:drawing>
+      </w:r>
+    </w:p>
+    <w:p>
+      <w:pPr>
+        <w:jc w:val="center"/>
+      </w:pPr>
+      <w:r>
+        <w:drawing>
+          <wp:inline xmlns:a="http://schemas.openxmlformats.org/drawingml/2006/main" xmlns:pic="http://schemas.openxmlformats.org/drawingml/2006/picture">
+            <wp:extent cx="5486400" cy="6361258"/>
+            <wp:docPr id="7" name="Picture 7"/>
+            <wp:cNvGraphicFramePr>
+              <a:graphicFrameLocks noChangeAspect="1"/>
+            </wp:cNvGraphicFramePr>
+            <a:graphic>
+              <a:graphicData uri="http://schemas.openxmlformats.org/drawingml/2006/picture">
+                <pic:pic>
+                  <pic:nvPicPr>
+                    <pic:cNvPr id="0" name="account_bce_staff.png"/>
+                    <pic:cNvPicPr/>
+                  </pic:nvPicPr>
+                  <pic:blipFill>
+                    <a:blip r:embed="rId15"/>
+                    <a:stretch>
+                      <a:fillRect/>
+                    </a:stretch>
+                  </pic:blipFill>
+                  <pic:spPr>
+                    <a:xfrm>
+                      <a:off x="0" y="0"/>
+                      <a:ext cx="5486400" cy="6361258"/>
+                    </a:xfrm>
+                    <a:prstGeom prst="rect"/>
+                  </pic:spPr>
+                </pic:pic>
+              </a:graphicData>
+            </a:graphic>
+          </wp:inline>
+        </w:drawing>
+      </w:r>
+    </w:p>
+    <w:p>
+      <w:pPr>
         <w:pStyle w:val="Heading2"/>
       </w:pPr>
       <w:r>
@@ -5988,6 +6144,51 @@
       </w:pPr>
       <w:r>
         <w:t>UC01 – Đăng nhập</w:t>
+      </w:r>
+    </w:p>
+    <w:p>
+      <w:pPr>
+        <w:jc w:val="center"/>
+      </w:pPr>
+      <w:r>
+        <w:drawing>
+          <wp:inline xmlns:a="http://schemas.openxmlformats.org/drawingml/2006/main" xmlns:pic="http://schemas.openxmlformats.org/drawingml/2006/picture">
+            <wp:extent cx="5486400" cy="3708400"/>
+            <wp:docPr id="8" name="Picture 8"/>
+            <wp:cNvGraphicFramePr>
+              <a:graphicFrameLocks noChangeAspect="1"/>
+            </wp:cNvGraphicFramePr>
+            <a:graphic>
+              <a:graphicData uri="http://schemas.openxmlformats.org/drawingml/2006/picture">
+                <pic:pic>
+                  <pic:nvPicPr>
+                    <pic:cNvPr id="0" name="account_seq_login_analysis.png"/>
+                    <pic:cNvPicPr/>
+                  </pic:nvPicPr>
+                  <pic:blipFill>
+                    <a:blip r:embed="rId16"/>
+                    <a:stretch>
+                      <a:fillRect/>
+                    </a:stretch>
+                  </pic:blipFill>
+                  <pic:spPr>
+                    <a:xfrm>
+                      <a:off x="0" y="0"/>
+                      <a:ext cx="5486400" cy="3708400"/>
+                    </a:xfrm>
+                    <a:prstGeom prst="rect"/>
+                  </pic:spPr>
+                </pic:pic>
+              </a:graphicData>
+            </a:graphic>
+          </wp:inline>
+        </w:drawing>
+      </w:r>
+    </w:p>
+    <w:p>
+      <w:pPr/>
+      <w:r>
+        <w:t>&lt;!-- File: output/diagrams/account_seq_login_analysis.png --&gt;</w:t>
       </w:r>
     </w:p>
     <w:p>
@@ -6142,6 +6343,51 @@
       </w:r>
     </w:p>
     <w:p>
+      <w:pPr>
+        <w:jc w:val="center"/>
+      </w:pPr>
+      <w:r>
+        <w:drawing>
+          <wp:inline xmlns:a="http://schemas.openxmlformats.org/drawingml/2006/main" xmlns:pic="http://schemas.openxmlformats.org/drawingml/2006/picture">
+            <wp:extent cx="5486400" cy="4402085"/>
+            <wp:docPr id="9" name="Picture 9"/>
+            <wp:cNvGraphicFramePr>
+              <a:graphicFrameLocks noChangeAspect="1"/>
+            </wp:cNvGraphicFramePr>
+            <a:graphic>
+              <a:graphicData uri="http://schemas.openxmlformats.org/drawingml/2006/picture">
+                <pic:pic>
+                  <pic:nvPicPr>
+                    <pic:cNvPr id="0" name="account_seq_register_analysis.png"/>
+                    <pic:cNvPicPr/>
+                  </pic:nvPicPr>
+                  <pic:blipFill>
+                    <a:blip r:embed="rId17"/>
+                    <a:stretch>
+                      <a:fillRect/>
+                    </a:stretch>
+                  </pic:blipFill>
+                  <pic:spPr>
+                    <a:xfrm>
+                      <a:off x="0" y="0"/>
+                      <a:ext cx="5486400" cy="4402085"/>
+                    </a:xfrm>
+                    <a:prstGeom prst="rect"/>
+                  </pic:spPr>
+                </pic:pic>
+              </a:graphicData>
+            </a:graphic>
+          </wp:inline>
+        </w:drawing>
+      </w:r>
+    </w:p>
+    <w:p>
+      <w:pPr/>
+      <w:r>
+        <w:t>&lt;!-- File: output/diagrams/account_seq_register_analysis.png --&gt;</w:t>
+      </w:r>
+    </w:p>
+    <w:p>
       <w:pPr/>
       <w:r>
         <w:rPr>
@@ -6389,6 +6635,51 @@
       </w:r>
     </w:p>
     <w:p>
+      <w:pPr>
+        <w:jc w:val="center"/>
+      </w:pPr>
+      <w:r>
+        <w:drawing>
+          <wp:inline xmlns:a="http://schemas.openxmlformats.org/drawingml/2006/main" xmlns:pic="http://schemas.openxmlformats.org/drawingml/2006/picture">
+            <wp:extent cx="5486400" cy="3292939"/>
+            <wp:docPr id="10" name="Picture 10"/>
+            <wp:cNvGraphicFramePr>
+              <a:graphicFrameLocks noChangeAspect="1"/>
+            </wp:cNvGraphicFramePr>
+            <a:graphic>
+              <a:graphicData uri="http://schemas.openxmlformats.org/drawingml/2006/picture">
+                <pic:pic>
+                  <pic:nvPicPr>
+                    <pic:cNvPr id="0" name="account_seq_changepw_analysis.png"/>
+                    <pic:cNvPicPr/>
+                  </pic:nvPicPr>
+                  <pic:blipFill>
+                    <a:blip r:embed="rId18"/>
+                    <a:stretch>
+                      <a:fillRect/>
+                    </a:stretch>
+                  </pic:blipFill>
+                  <pic:spPr>
+                    <a:xfrm>
+                      <a:off x="0" y="0"/>
+                      <a:ext cx="5486400" cy="3292939"/>
+                    </a:xfrm>
+                    <a:prstGeom prst="rect"/>
+                  </pic:spPr>
+                </pic:pic>
+              </a:graphicData>
+            </a:graphic>
+          </wp:inline>
+        </w:drawing>
+      </w:r>
+    </w:p>
+    <w:p>
+      <w:pPr/>
+      <w:r>
+        <w:t>&lt;!-- File: output/diagrams/account_seq_changepw_analysis.png --&gt;</w:t>
+      </w:r>
+    </w:p>
+    <w:p>
       <w:pPr/>
       <w:r>
         <w:rPr>
@@ -6592,6 +6883,51 @@
       </w:r>
     </w:p>
     <w:p>
+      <w:pPr>
+        <w:jc w:val="center"/>
+      </w:pPr>
+      <w:r>
+        <w:drawing>
+          <wp:inline xmlns:a="http://schemas.openxmlformats.org/drawingml/2006/main" xmlns:pic="http://schemas.openxmlformats.org/drawingml/2006/picture">
+            <wp:extent cx="5486400" cy="3855128"/>
+            <wp:docPr id="11" name="Picture 11"/>
+            <wp:cNvGraphicFramePr>
+              <a:graphicFrameLocks noChangeAspect="1"/>
+            </wp:cNvGraphicFramePr>
+            <a:graphic>
+              <a:graphicData uri="http://schemas.openxmlformats.org/drawingml/2006/picture">
+                <pic:pic>
+                  <pic:nvPicPr>
+                    <pic:cNvPr id="0" name="account_seq_profile_analysis.png"/>
+                    <pic:cNvPicPr/>
+                  </pic:nvPicPr>
+                  <pic:blipFill>
+                    <a:blip r:embed="rId19"/>
+                    <a:stretch>
+                      <a:fillRect/>
+                    </a:stretch>
+                  </pic:blipFill>
+                  <pic:spPr>
+                    <a:xfrm>
+                      <a:off x="0" y="0"/>
+                      <a:ext cx="5486400" cy="3855128"/>
+                    </a:xfrm>
+                    <a:prstGeom prst="rect"/>
+                  </pic:spPr>
+                </pic:pic>
+              </a:graphicData>
+            </a:graphic>
+          </wp:inline>
+        </w:drawing>
+      </w:r>
+    </w:p>
+    <w:p>
+      <w:pPr/>
+      <w:r>
+        <w:t>&lt;!-- File: output/diagrams/account_seq_profile_analysis.png --&gt;</w:t>
+      </w:r>
+    </w:p>
+    <w:p>
       <w:pPr/>
       <w:r>
         <w:rPr>
@@ -6754,6 +7090,51 @@
       </w:r>
     </w:p>
     <w:p>
+      <w:pPr>
+        <w:jc w:val="center"/>
+      </w:pPr>
+      <w:r>
+        <w:drawing>
+          <wp:inline xmlns:a="http://schemas.openxmlformats.org/drawingml/2006/main" xmlns:pic="http://schemas.openxmlformats.org/drawingml/2006/picture">
+            <wp:extent cx="5486400" cy="4390755"/>
+            <wp:docPr id="12" name="Picture 12"/>
+            <wp:cNvGraphicFramePr>
+              <a:graphicFrameLocks noChangeAspect="1"/>
+            </wp:cNvGraphicFramePr>
+            <a:graphic>
+              <a:graphicData uri="http://schemas.openxmlformats.org/drawingml/2006/picture">
+                <pic:pic>
+                  <pic:nvPicPr>
+                    <pic:cNvPr id="0" name="account_seq_staff_analysis.png"/>
+                    <pic:cNvPicPr/>
+                  </pic:nvPicPr>
+                  <pic:blipFill>
+                    <a:blip r:embed="rId20"/>
+                    <a:stretch>
+                      <a:fillRect/>
+                    </a:stretch>
+                  </pic:blipFill>
+                  <pic:spPr>
+                    <a:xfrm>
+                      <a:off x="0" y="0"/>
+                      <a:ext cx="5486400" cy="4390755"/>
+                    </a:xfrm>
+                    <a:prstGeom prst="rect"/>
+                  </pic:spPr>
+                </pic:pic>
+              </a:graphicData>
+            </a:graphic>
+          </wp:inline>
+        </w:drawing>
+      </w:r>
+    </w:p>
+    <w:p>
+      <w:pPr/>
+      <w:r>
+        <w:t>&lt;!-- File: output/diagrams/account_seq_staff_analysis.png --&gt;</w:t>
+      </w:r>
+    </w:p>
+    <w:p>
       <w:pPr/>
       <w:r>
         <w:rPr>
@@ -7444,7 +7825,7 @@
         <w:drawing>
           <wp:inline xmlns:a="http://schemas.openxmlformats.org/drawingml/2006/main" xmlns:pic="http://schemas.openxmlformats.org/drawingml/2006/picture">
             <wp:extent cx="5486400" cy="3711627"/>
-            <wp:docPr id="4" name="Picture 4"/>
+            <wp:docPr id="13" name="Picture 13"/>
             <wp:cNvGraphicFramePr>
               <a:graphicFrameLocks noChangeAspect="1"/>
             </wp:cNvGraphicFramePr>
@@ -7456,7 +7837,7 @@
                     <pic:cNvPicPr/>
                   </pic:nvPicPr>
                   <pic:blipFill>
-                    <a:blip r:embed="rId12"/>
+                    <a:blip r:embed="rId21"/>
                     <a:stretch>
                       <a:fillRect/>
                     </a:stretch>
@@ -8026,7 +8407,7 @@
         <w:drawing>
           <wp:inline xmlns:a="http://schemas.openxmlformats.org/drawingml/2006/main" xmlns:pic="http://schemas.openxmlformats.org/drawingml/2006/picture">
             <wp:extent cx="5486400" cy="6374318"/>
-            <wp:docPr id="5" name="Picture 5"/>
+            <wp:docPr id="14" name="Picture 14"/>
             <wp:cNvGraphicFramePr>
               <a:graphicFrameLocks noChangeAspect="1"/>
             </wp:cNvGraphicFramePr>
@@ -8038,7 +8419,7 @@
                     <pic:cNvPicPr/>
                   </pic:nvPicPr>
                   <pic:blipFill>
-                    <a:blip r:embed="rId13"/>
+                    <a:blip r:embed="rId22"/>
                     <a:stretch>
                       <a:fillRect/>
                     </a:stretch>
@@ -9285,7 +9666,7 @@
         <w:drawing>
           <wp:inline xmlns:a="http://schemas.openxmlformats.org/drawingml/2006/main" xmlns:pic="http://schemas.openxmlformats.org/drawingml/2006/picture">
             <wp:extent cx="5486400" cy="4756649"/>
-            <wp:docPr id="6" name="Picture 6"/>
+            <wp:docPr id="15" name="Picture 15"/>
             <wp:cNvGraphicFramePr>
               <a:graphicFrameLocks noChangeAspect="1"/>
             </wp:cNvGraphicFramePr>
@@ -9297,7 +9678,7 @@
                     <pic:cNvPicPr/>
                   </pic:nvPicPr>
                   <pic:blipFill>
-                    <a:blip r:embed="rId14"/>
+                    <a:blip r:embed="rId23"/>
                     <a:stretch>
                       <a:fillRect/>
                     </a:stretch>
@@ -9345,8 +9726,8 @@
       <w:r>
         <w:drawing>
           <wp:inline xmlns:a="http://schemas.openxmlformats.org/drawingml/2006/main" xmlns:pic="http://schemas.openxmlformats.org/drawingml/2006/picture">
-            <wp:extent cx="5486400" cy="3693202"/>
-            <wp:docPr id="7" name="Picture 7"/>
+            <wp:extent cx="5486400" cy="2940316"/>
+            <wp:docPr id="16" name="Picture 16"/>
             <wp:cNvGraphicFramePr>
               <a:graphicFrameLocks noChangeAspect="1"/>
             </wp:cNvGraphicFramePr>
@@ -9354,11 +9735,11 @@
               <a:graphicData uri="http://schemas.openxmlformats.org/drawingml/2006/picture">
                 <pic:pic>
                   <pic:nvPicPr>
-                    <pic:cNvPr id="0" name="account_seq_login.png"/>
+                    <pic:cNvPr id="0" name="account_seq_login_design.png"/>
                     <pic:cNvPicPr/>
                   </pic:nvPicPr>
                   <pic:blipFill>
-                    <a:blip r:embed="rId15"/>
+                    <a:blip r:embed="rId24"/>
                     <a:stretch>
                       <a:fillRect/>
                     </a:stretch>
@@ -9366,7 +9747,7 @@
                   <pic:spPr>
                     <a:xfrm>
                       <a:off x="0" y="0"/>
-                      <a:ext cx="5486400" cy="3693202"/>
+                      <a:ext cx="5486400" cy="2940316"/>
                     </a:xfrm>
                     <a:prstGeom prst="rect"/>
                   </pic:spPr>
@@ -9789,8 +10170,8 @@
       <w:r>
         <w:drawing>
           <wp:inline xmlns:a="http://schemas.openxmlformats.org/drawingml/2006/main" xmlns:pic="http://schemas.openxmlformats.org/drawingml/2006/picture">
-            <wp:extent cx="5486400" cy="4783324"/>
-            <wp:docPr id="8" name="Picture 8"/>
+            <wp:extent cx="5486400" cy="4170604"/>
+            <wp:docPr id="17" name="Picture 17"/>
             <wp:cNvGraphicFramePr>
               <a:graphicFrameLocks noChangeAspect="1"/>
             </wp:cNvGraphicFramePr>
@@ -9798,11 +10179,11 @@
               <a:graphicData uri="http://schemas.openxmlformats.org/drawingml/2006/picture">
                 <pic:pic>
                   <pic:nvPicPr>
-                    <pic:cNvPr id="0" name="account_seq_register.png"/>
+                    <pic:cNvPr id="0" name="account_seq_register_design.png"/>
                     <pic:cNvPicPr/>
                   </pic:nvPicPr>
                   <pic:blipFill>
-                    <a:blip r:embed="rId16"/>
+                    <a:blip r:embed="rId25"/>
                     <a:stretch>
                       <a:fillRect/>
                     </a:stretch>
@@ -9810,7 +10191,7 @@
                   <pic:spPr>
                     <a:xfrm>
                       <a:off x="0" y="0"/>
-                      <a:ext cx="5486400" cy="4783324"/>
+                      <a:ext cx="5486400" cy="4170604"/>
                     </a:xfrm>
                     <a:prstGeom prst="rect"/>
                   </pic:spPr>
@@ -10319,8 +10700,8 @@
       <w:r>
         <w:drawing>
           <wp:inline xmlns:a="http://schemas.openxmlformats.org/drawingml/2006/main" xmlns:pic="http://schemas.openxmlformats.org/drawingml/2006/picture">
-            <wp:extent cx="5486400" cy="3439660"/>
-            <wp:docPr id="9" name="Picture 9"/>
+            <wp:extent cx="5486400" cy="3166782"/>
+            <wp:docPr id="18" name="Picture 18"/>
             <wp:cNvGraphicFramePr>
               <a:graphicFrameLocks noChangeAspect="1"/>
             </wp:cNvGraphicFramePr>
@@ -10328,11 +10709,11 @@
               <a:graphicData uri="http://schemas.openxmlformats.org/drawingml/2006/picture">
                 <pic:pic>
                   <pic:nvPicPr>
-                    <pic:cNvPr id="0" name="account_seq_changepw.png"/>
+                    <pic:cNvPr id="0" name="account_seq_changepw_design.png"/>
                     <pic:cNvPicPr/>
                   </pic:nvPicPr>
                   <pic:blipFill>
-                    <a:blip r:embed="rId17"/>
+                    <a:blip r:embed="rId26"/>
                     <a:stretch>
                       <a:fillRect/>
                     </a:stretch>
@@ -10340,7 +10721,7 @@
                   <pic:spPr>
                     <a:xfrm>
                       <a:off x="0" y="0"/>
-                      <a:ext cx="5486400" cy="3439660"/>
+                      <a:ext cx="5486400" cy="3166782"/>
                     </a:xfrm>
                     <a:prstGeom prst="rect"/>
                   </pic:spPr>
@@ -10777,8 +11158,8 @@
       <w:r>
         <w:drawing>
           <wp:inline xmlns:a="http://schemas.openxmlformats.org/drawingml/2006/main" xmlns:pic="http://schemas.openxmlformats.org/drawingml/2006/picture">
-            <wp:extent cx="5486400" cy="3845793"/>
-            <wp:docPr id="10" name="Picture 10"/>
+            <wp:extent cx="5486400" cy="3509131"/>
+            <wp:docPr id="19" name="Picture 19"/>
             <wp:cNvGraphicFramePr>
               <a:graphicFrameLocks noChangeAspect="1"/>
             </wp:cNvGraphicFramePr>
@@ -10786,11 +11167,11 @@
               <a:graphicData uri="http://schemas.openxmlformats.org/drawingml/2006/picture">
                 <pic:pic>
                   <pic:nvPicPr>
-                    <pic:cNvPr id="0" name="account_seq_profile.png"/>
+                    <pic:cNvPr id="0" name="account_seq_profile_design.png"/>
                     <pic:cNvPicPr/>
                   </pic:nvPicPr>
                   <pic:blipFill>
-                    <a:blip r:embed="rId18"/>
+                    <a:blip r:embed="rId27"/>
                     <a:stretch>
                       <a:fillRect/>
                     </a:stretch>
@@ -10798,7 +11179,7 @@
                   <pic:spPr>
                     <a:xfrm>
                       <a:off x="0" y="0"/>
-                      <a:ext cx="5486400" cy="3845793"/>
+                      <a:ext cx="5486400" cy="3509131"/>
                     </a:xfrm>
                     <a:prstGeom prst="rect"/>
                   </pic:spPr>
@@ -11094,8 +11475,8 @@
       <w:r>
         <w:drawing>
           <wp:inline xmlns:a="http://schemas.openxmlformats.org/drawingml/2006/main" xmlns:pic="http://schemas.openxmlformats.org/drawingml/2006/picture">
-            <wp:extent cx="5486400" cy="4403882"/>
-            <wp:docPr id="11" name="Picture 11"/>
+            <wp:extent cx="5486400" cy="5952465"/>
+            <wp:docPr id="20" name="Picture 20"/>
             <wp:cNvGraphicFramePr>
               <a:graphicFrameLocks noChangeAspect="1"/>
             </wp:cNvGraphicFramePr>
@@ -11103,11 +11484,11 @@
               <a:graphicData uri="http://schemas.openxmlformats.org/drawingml/2006/picture">
                 <pic:pic>
                   <pic:nvPicPr>
-                    <pic:cNvPr id="0" name="account_seq_staff.png"/>
+                    <pic:cNvPr id="0" name="account_seq_staff_design.png"/>
                     <pic:cNvPicPr/>
                   </pic:nvPicPr>
                   <pic:blipFill>
-                    <a:blip r:embed="rId19"/>
+                    <a:blip r:embed="rId28"/>
                     <a:stretch>
                       <a:fillRect/>
                     </a:stretch>
@@ -11115,7 +11496,7 @@
                   <pic:spPr>
                     <a:xfrm>
                       <a:off x="0" y="0"/>
-                      <a:ext cx="5486400" cy="4403882"/>
+                      <a:ext cx="5486400" cy="5952465"/>
                     </a:xfrm>
                     <a:prstGeom prst="rect"/>
                   </pic:spPr>

</xml_diff>

<commit_message>
feat: per-UC BCE narratives + Kịch bản v2/v3 rewrite matching booking module
II.3: Per-UC narrative format (Phân tích chi tiết chức năng... diễn ra như sau)
II.4: Kịch bản v2 bullet-point format (* Lớp [View] gọi hàm [method]())
III.4: Kịch bản v3 numbered format (Phương thức [method]() của lớp [Class])
All PlantUML diagrams regenerated with English method names
DOCX: 679KB, 573 paragraphs, 46 tables, 20 images, 0 Vietnamese methods
</commit_message>
<xml_diff>
--- a/output/account_module.docx
+++ b/output/account_module.docx
@@ -4872,1067 +4872,83 @@
         <w:rPr>
           <w:b/>
         </w:rPr>
-        <w:t>Kiến trúc chọn: React</w:t>
-      </w:r>
-      <w:r>
-        <w:t xml:space="preserve"> ( Boundary class dùng hậu tố View. Method names tiếng Anh ở tất cả các pha, đặt trên Entity. )</w:t>
-      </w:r>
-    </w:p>
-    <w:p>
-      <w:pPr>
-        <w:pStyle w:val="Heading3"/>
-      </w:pPr>
-      <w:r>
-        <w:t>Bước 1 – Lớp Boundary từ giao diện</w:t>
-      </w:r>
-    </w:p>
-    <w:tbl>
-      <w:tblPr>
-        <w:tblStyle w:val="TableGrid"/>
-        <w:tblW w:type="auto" w:w="0"/>
-        <w:tblLook w:firstColumn="1" w:firstRow="1" w:lastColumn="0" w:lastRow="0" w:noHBand="0" w:noVBand="1" w:val="04A0"/>
-      </w:tblPr>
-      <w:tblGrid>
-        <w:gridCol w:w="2880"/>
-        <w:gridCol w:w="2880"/>
-        <w:gridCol w:w="2880"/>
-      </w:tblGrid>
-      <w:tr>
-        <w:tc>
-          <w:tcPr>
-            <w:tcW w:type="dxa" w:w="2880"/>
-            <w:shd w:fill="D9E2F3"/>
-          </w:tcPr>
-          <w:p>
-            <w:pPr/>
-            <w:r/>
-            <w:r>
-              <w:rPr>
-                <w:b/>
-                <w:sz w:val="20"/>
-              </w:rPr>
-              <w:t>Giao diện</w:t>
-            </w:r>
-          </w:p>
-        </w:tc>
-        <w:tc>
-          <w:tcPr>
-            <w:tcW w:type="dxa" w:w="2880"/>
-            <w:shd w:fill="D9E2F3"/>
-          </w:tcPr>
-          <w:p>
-            <w:pPr/>
-            <w:r/>
-            <w:r>
-              <w:rPr>
-                <w:b/>
-                <w:sz w:val="20"/>
-              </w:rPr>
-              <w:t>Lớp Boundary</w:t>
-            </w:r>
-          </w:p>
-        </w:tc>
-        <w:tc>
-          <w:tcPr>
-            <w:tcW w:type="dxa" w:w="2880"/>
-            <w:shd w:fill="D9E2F3"/>
-          </w:tcPr>
-          <w:p>
-            <w:pPr/>
-            <w:r/>
-            <w:r>
-              <w:rPr>
-                <w:b/>
-                <w:sz w:val="20"/>
-              </w:rPr>
-              <w:t>Loại</w:t>
-            </w:r>
-          </w:p>
-        </w:tc>
-      </w:tr>
-      <w:tr>
-        <w:tc>
-          <w:tcPr>
-            <w:tcW w:type="dxa" w:w="2880"/>
-          </w:tcPr>
-          <w:p>
-            <w:pPr/>
-            <w:r/>
-            <w:r>
-              <w:rPr>
-                <w:sz w:val="20"/>
-              </w:rPr>
-              <w:t>Màn hình Đăng nhập</w:t>
-            </w:r>
-          </w:p>
-        </w:tc>
-        <w:tc>
-          <w:tcPr>
-            <w:tcW w:type="dxa" w:w="2880"/>
-          </w:tcPr>
-          <w:p>
-            <w:pPr/>
-            <w:r/>
-            <w:r>
-              <w:rPr>
-                <w:sz w:val="20"/>
-              </w:rPr>
-              <w:t>LoginView</w:t>
-            </w:r>
-          </w:p>
-        </w:tc>
-        <w:tc>
-          <w:tcPr>
-            <w:tcW w:type="dxa" w:w="2880"/>
-          </w:tcPr>
-          <w:p>
-            <w:pPr/>
-            <w:r/>
-            <w:r>
-              <w:rPr>
-                <w:sz w:val="20"/>
-              </w:rPr>
-              <w:t>View</w:t>
-            </w:r>
-          </w:p>
-        </w:tc>
-      </w:tr>
-      <w:tr>
-        <w:tc>
-          <w:tcPr>
-            <w:tcW w:type="dxa" w:w="2880"/>
-          </w:tcPr>
-          <w:p>
-            <w:pPr/>
-            <w:r/>
-            <w:r>
-              <w:rPr>
-                <w:sz w:val="20"/>
-              </w:rPr>
-              <w:t>Màn hình Đăng ký</w:t>
-            </w:r>
-          </w:p>
-        </w:tc>
-        <w:tc>
-          <w:tcPr>
-            <w:tcW w:type="dxa" w:w="2880"/>
-          </w:tcPr>
-          <w:p>
-            <w:pPr/>
-            <w:r/>
-            <w:r>
-              <w:rPr>
-                <w:sz w:val="20"/>
-              </w:rPr>
-              <w:t>RegisterView</w:t>
-            </w:r>
-          </w:p>
-        </w:tc>
-        <w:tc>
-          <w:tcPr>
-            <w:tcW w:type="dxa" w:w="2880"/>
-          </w:tcPr>
-          <w:p>
-            <w:pPr/>
-            <w:r/>
-            <w:r>
-              <w:rPr>
-                <w:sz w:val="20"/>
-              </w:rPr>
-              <w:t>View</w:t>
-            </w:r>
-          </w:p>
-        </w:tc>
-      </w:tr>
-      <w:tr>
-        <w:tc>
-          <w:tcPr>
-            <w:tcW w:type="dxa" w:w="2880"/>
-          </w:tcPr>
-          <w:p>
-            <w:pPr/>
-            <w:r/>
-            <w:r>
-              <w:rPr>
-                <w:sz w:val="20"/>
-              </w:rPr>
-              <w:t>Màn hình Xác nhận OTP</w:t>
-            </w:r>
-          </w:p>
-        </w:tc>
-        <w:tc>
-          <w:tcPr>
-            <w:tcW w:type="dxa" w:w="2880"/>
-          </w:tcPr>
-          <w:p>
-            <w:pPr/>
-            <w:r/>
-            <w:r>
-              <w:rPr>
-                <w:sz w:val="20"/>
-              </w:rPr>
-              <w:t>OTPVerifyView</w:t>
-            </w:r>
-          </w:p>
-        </w:tc>
-        <w:tc>
-          <w:tcPr>
-            <w:tcW w:type="dxa" w:w="2880"/>
-          </w:tcPr>
-          <w:p>
-            <w:pPr/>
-            <w:r/>
-            <w:r>
-              <w:rPr>
-                <w:sz w:val="20"/>
-              </w:rPr>
-              <w:t>View</w:t>
-            </w:r>
-          </w:p>
-        </w:tc>
-      </w:tr>
-      <w:tr>
-        <w:tc>
-          <w:tcPr>
-            <w:tcW w:type="dxa" w:w="2880"/>
-          </w:tcPr>
-          <w:p>
-            <w:pPr/>
-            <w:r/>
-            <w:r>
-              <w:rPr>
-                <w:sz w:val="20"/>
-              </w:rPr>
-              <w:t>Màn hình Đổi mật khẩu</w:t>
-            </w:r>
-          </w:p>
-        </w:tc>
-        <w:tc>
-          <w:tcPr>
-            <w:tcW w:type="dxa" w:w="2880"/>
-          </w:tcPr>
-          <w:p>
-            <w:pPr/>
-            <w:r/>
-            <w:r>
-              <w:rPr>
-                <w:sz w:val="20"/>
-              </w:rPr>
-              <w:t>ChangePasswordView</w:t>
-            </w:r>
-          </w:p>
-        </w:tc>
-        <w:tc>
-          <w:tcPr>
-            <w:tcW w:type="dxa" w:w="2880"/>
-          </w:tcPr>
-          <w:p>
-            <w:pPr/>
-            <w:r/>
-            <w:r>
-              <w:rPr>
-                <w:sz w:val="20"/>
-              </w:rPr>
-              <w:t>View</w:t>
-            </w:r>
-          </w:p>
-        </w:tc>
-      </w:tr>
-      <w:tr>
-        <w:tc>
-          <w:tcPr>
-            <w:tcW w:type="dxa" w:w="2880"/>
-          </w:tcPr>
-          <w:p>
-            <w:pPr/>
-            <w:r/>
-            <w:r>
-              <w:rPr>
-                <w:sz w:val="20"/>
-              </w:rPr>
-              <w:t>Trang Hồ sơ cá nhân</w:t>
-            </w:r>
-          </w:p>
-        </w:tc>
-        <w:tc>
-          <w:tcPr>
-            <w:tcW w:type="dxa" w:w="2880"/>
-          </w:tcPr>
-          <w:p>
-            <w:pPr/>
-            <w:r/>
-            <w:r>
-              <w:rPr>
-                <w:sz w:val="20"/>
-              </w:rPr>
-              <w:t>ProfileView</w:t>
-            </w:r>
-          </w:p>
-        </w:tc>
-        <w:tc>
-          <w:tcPr>
-            <w:tcW w:type="dxa" w:w="2880"/>
-          </w:tcPr>
-          <w:p>
-            <w:pPr/>
-            <w:r/>
-            <w:r>
-              <w:rPr>
-                <w:sz w:val="20"/>
-              </w:rPr>
-              <w:t>View</w:t>
-            </w:r>
-          </w:p>
-        </w:tc>
-      </w:tr>
-      <w:tr>
-        <w:tc>
-          <w:tcPr>
-            <w:tcW w:type="dxa" w:w="2880"/>
-          </w:tcPr>
-          <w:p>
-            <w:pPr/>
-            <w:r/>
-            <w:r>
-              <w:rPr>
-                <w:sz w:val="20"/>
-              </w:rPr>
-              <w:t>Trang Quản lý nhân viên</w:t>
-            </w:r>
-          </w:p>
-        </w:tc>
-        <w:tc>
-          <w:tcPr>
-            <w:tcW w:type="dxa" w:w="2880"/>
-          </w:tcPr>
-          <w:p>
-            <w:pPr/>
-            <w:r/>
-            <w:r>
-              <w:rPr>
-                <w:sz w:val="20"/>
-              </w:rPr>
-              <w:t>StaffManageView</w:t>
-            </w:r>
-          </w:p>
-        </w:tc>
-        <w:tc>
-          <w:tcPr>
-            <w:tcW w:type="dxa" w:w="2880"/>
-          </w:tcPr>
-          <w:p>
-            <w:pPr/>
-            <w:r/>
-            <w:r>
-              <w:rPr>
-                <w:sz w:val="20"/>
-              </w:rPr>
-              <w:t>View</w:t>
-            </w:r>
-          </w:p>
-        </w:tc>
-      </w:tr>
-    </w:tbl>
-    <w:p>
-      <w:pPr>
-        <w:pStyle w:val="Heading3"/>
-      </w:pPr>
-      <w:r>
-        <w:t>Bước 2 – Phân loại thành phần giao diện</w:t>
+        <w:t>Phân tích chi tiết chức năng "Đăng nhập" diễn ra như sau:</w:t>
       </w:r>
     </w:p>
     <w:p>
       <w:pPr/>
       <w:r>
-        <w:t>LoginView: txtSDT, txtMatKhau, btnDangNhap, btnQuenMatKhau, btnDangKy</w:t>
+        <w:t xml:space="preserve">Người dùng truy cập trang đăng nhập → Đề xuất lớp </w:t>
+      </w:r>
+      <w:r>
+        <w:rPr>
+          <w:b/>
+        </w:rPr>
+        <w:t>LoginView</w:t>
+      </w:r>
+      <w:r>
+        <w:t>, có ô nhập SĐT, ô nhập mật khẩu, nút Đăng nhập.</w:t>
       </w:r>
     </w:p>
     <w:p>
       <w:pPr/>
       <w:r>
-        <w:t>RegisterView: txtHoTen, txtSDT, txtEmail, txtMatKhau, txtXacNhanMK, btnTiepTuc, btnHuy</w:t>
-      </w:r>
-    </w:p>
-    <w:p>
-      <w:pPr/>
-      <w:r>
-        <w:t>OTPVerifyView: txtOTP, btnXacNhan, btnGuiLai</w:t>
-      </w:r>
-    </w:p>
-    <w:p>
-      <w:pPr/>
-      <w:r>
-        <w:t>ChangePasswordView: txtMKHienTai, txtMKMoi, txtXacNhanMKMoi, btnLuu, btnHuy</w:t>
-      </w:r>
-    </w:p>
-    <w:p>
-      <w:pPr/>
-      <w:r>
-        <w:t>ProfileView: lblHoTen, lblSDT, lblEmail, lblHang, lblDiem, btnChinhSua, btnDoiMK</w:t>
-      </w:r>
-    </w:p>
-    <w:p>
-      <w:pPr/>
-      <w:r>
-        <w:t>StaffManageView: tblEmployee, btnChonNV, btnThem, btnSua, btnXoa</w:t>
-      </w:r>
-    </w:p>
-    <w:p>
-      <w:pPr>
-        <w:pStyle w:val="Heading3"/>
-      </w:pPr>
-      <w:r>
-        <w:t>Bước 3 – Phương thức cho mỗi chức năng</w:t>
-      </w:r>
-    </w:p>
-    <w:p>
-      <w:pPr/>
-      <w:r>
-        <w:t>[1]. Giao diện LoginView → lớp LoginView</w:t>
-      </w:r>
-    </w:p>
-    <w:p>
-      <w:pPr/>
-      <w:r>
-        <w:t>Phân tích chi tiết chức năng Đăng nhập:</w:t>
-      </w:r>
-    </w:p>
-    <w:p>
-      <w:pPr/>
-      <w:r>
-        <w:t>Người dùng nhập SĐT, Mật khẩu và nhấn [Đăng nhập] -&gt; hệ thống xác thực thông tin -&gt; đề xuất lớp LoginView, có txtSDT, txtMatKhau, btnDangNhap.</w:t>
-      </w:r>
-    </w:p>
-    <w:p>
-      <w:pPr/>
-      <w:r>
-        <w:t xml:space="preserve">Người dùng nhấn [Đăng nhập] -&gt; hệ thống cần xác thực tài khoản -&gt; cần chức năng </w:t>
+        <w:t xml:space="preserve">Người dùng nhập SĐT, mật khẩu và nhấn [Đăng nhập] → Hệ thống cần xác thực tài khoản → Cần chức năng </w:t>
       </w:r>
       <w:r>
         <w:rPr>
           <w:rFonts w:ascii="Courier New" w:hAnsi="Courier New"/>
           <w:sz w:val="20"/>
         </w:rPr>
-        <w:t>checkLogin(sdt, matKhau)</w:t>
-      </w:r>
-      <w:r>
-        <w:t xml:space="preserve"> của đối tượng User.</w:t>
+        <w:t>checkLogin()</w:t>
+      </w:r>
+      <w:r>
+        <w:t xml:space="preserve"> của đối tượng </w:t>
+      </w:r>
+      <w:r>
+        <w:rPr>
+          <w:b/>
+        </w:rPr>
+        <w:t>User</w:t>
+      </w:r>
+      <w:r>
+        <w:t>.</w:t>
       </w:r>
     </w:p>
     <w:p>
       <w:pPr/>
       <w:r>
-        <w:t xml:space="preserve">Phương thức: </w:t>
-      </w:r>
+        <w:t>Nếu tài khoản không tồn tại → Hệ thống hiển thị thông báo lỗi.</w:t>
+      </w:r>
+    </w:p>
+    <w:p>
+      <w:pPr/>
+      <w:r>
+        <w:t>Nếu mật khẩu sai → Hệ thống hiển thị thông báo lỗi.</w:t>
+      </w:r>
+    </w:p>
+    <w:p>
+      <w:pPr/>
       <w:r>
         <w:rPr>
-          <w:rFonts w:ascii="Courier New" w:hAnsi="Courier New"/>
-          <w:sz w:val="20"/>
+          <w:b/>
         </w:rPr>
-        <w:t>checkLogin(sdt, matKhau)</w:t>
+        <w:t>Boundary:</w:t>
+      </w:r>
+      <w:r>
+        <w:t xml:space="preserve"> LoginView</w:t>
       </w:r>
     </w:p>
     <w:p>
       <w:pPr/>
       <w:r>
-        <w:t>Input: sdt, matKhau</w:t>
-      </w:r>
-    </w:p>
-    <w:p>
-      <w:pPr/>
-      <w:r>
-        <w:t>Output: Session (token, vaiTro)</w:t>
-      </w:r>
-    </w:p>
-    <w:p>
-      <w:pPr/>
-      <w:r>
-        <w:t>Lớp chủ thể: User</w:t>
-      </w:r>
-    </w:p>
-    <w:p>
-      <w:pPr/>
-      <w:r>
-        <w:t>[2]. Giao diện RegisterView → lớp RegisterView</w:t>
-      </w:r>
-    </w:p>
-    <w:p>
-      <w:pPr/>
-      <w:r>
-        <w:t>Phân tích chi tiết chức năng Đăng ký:</w:t>
-      </w:r>
-    </w:p>
-    <w:p>
-      <w:pPr/>
-      <w:r>
-        <w:t>Người dùng nhập Họ tên, SĐT, Email, Mật khẩu, Xác nhận MK và nhấn [Tiếp tục] -&gt; hệ thống hiển thị form đăng ký -&gt; đề xuất lớp RegisterView, có txtHoTen, txtSDT, txtEmail, txtMatKhau, txtXacNhanMK, btnTiepTuc.</w:t>
-      </w:r>
-    </w:p>
-    <w:p>
-      <w:pPr/>
-      <w:r>
-        <w:t xml:space="preserve">Người dùng nhấn [Tiếp tục] -&gt; hệ thống cần tạo tài khoản mới -&gt; cần chức năng </w:t>
-      </w:r>
-      <w:r>
         <w:rPr>
-          <w:rFonts w:ascii="Courier New" w:hAnsi="Courier New"/>
-          <w:sz w:val="20"/>
+          <w:b/>
         </w:rPr>
-        <w:t>register(hoTen, sdt, email, matKhau)</w:t>
-      </w:r>
-      <w:r>
-        <w:t xml:space="preserve"> của đối tượng User.</w:t>
-      </w:r>
-    </w:p>
-    <w:p>
-      <w:pPr/>
-      <w:r>
-        <w:t xml:space="preserve">Phương thức: </w:t>
-      </w:r>
-      <w:r>
-        <w:rPr>
-          <w:rFonts w:ascii="Courier New" w:hAnsi="Courier New"/>
-          <w:sz w:val="20"/>
-        </w:rPr>
-        <w:t>register(hoTen, sdt, email, matKhau)</w:t>
-      </w:r>
-    </w:p>
-    <w:p>
-      <w:pPr/>
-      <w:r>
-        <w:t>Input: hoTen, sdt, email, matKhau</w:t>
-      </w:r>
-    </w:p>
-    <w:p>
-      <w:pPr/>
-      <w:r>
-        <w:t>Output: User (vừa tạo)</w:t>
-      </w:r>
-    </w:p>
-    <w:p>
-      <w:pPr/>
-      <w:r>
-        <w:t>Lớp chủ thể: User</w:t>
-      </w:r>
-    </w:p>
-    <w:p>
-      <w:pPr/>
-      <w:r>
-        <w:t>[3]. Giao diện OTPVerifyView → lớp OTPVerifyView</w:t>
-      </w:r>
-    </w:p>
-    <w:p>
-      <w:pPr/>
-      <w:r>
-        <w:t>Phân tích chi tiết chức năng Xác nhận OTP:</w:t>
-      </w:r>
-    </w:p>
-    <w:p>
-      <w:pPr/>
-      <w:r>
-        <w:t>Người dùng nhập mã OTP và nhấn [Xác nhận] -&gt; hệ thống hiển thị form OTP -&gt; đề xuất lớp OTPVerifyView, có txtOTP, btnXacNhan, btnGuiLai.</w:t>
-      </w:r>
-    </w:p>
-    <w:p>
-      <w:pPr/>
-      <w:r>
-        <w:t xml:space="preserve">Người dùng nhấn [Xác nhận] -&gt; hệ thống cần xác minh mã OTP -&gt; cần chức năng </w:t>
-      </w:r>
-      <w:r>
-        <w:rPr>
-          <w:rFonts w:ascii="Courier New" w:hAnsi="Courier New"/>
-          <w:sz w:val="20"/>
-        </w:rPr>
-        <w:t>verifyOTP(maOTP)</w:t>
-      </w:r>
-      <w:r>
-        <w:t xml:space="preserve"> của đối tượng OTP.</w:t>
-      </w:r>
-    </w:p>
-    <w:p>
-      <w:pPr/>
-      <w:r>
-        <w:t xml:space="preserve">Phương thức: </w:t>
-      </w:r>
-      <w:r>
-        <w:rPr>
-          <w:rFonts w:ascii="Courier New" w:hAnsi="Courier New"/>
-          <w:sz w:val="20"/>
-        </w:rPr>
-        <w:t>verifyOTP(maOTP)</w:t>
-      </w:r>
-    </w:p>
-    <w:p>
-      <w:pPr/>
-      <w:r>
-        <w:t>Input: maOTP</w:t>
-      </w:r>
-    </w:p>
-    <w:p>
-      <w:pPr/>
-      <w:r>
-        <w:t>Output: boolean (đúng/sai)</w:t>
-      </w:r>
-    </w:p>
-    <w:p>
-      <w:pPr/>
-      <w:r>
-        <w:t>Lớp chủ thể: OTP</w:t>
-      </w:r>
-    </w:p>
-    <w:p>
-      <w:pPr/>
-      <w:r>
-        <w:t>[4]. Giao diện ChangePasswordView → lớp ChangePasswordView</w:t>
-      </w:r>
-    </w:p>
-    <w:p>
-      <w:pPr/>
-      <w:r>
-        <w:t>Phân tích chi tiết chức năng Đổi mật khẩu:</w:t>
-      </w:r>
-    </w:p>
-    <w:p>
-      <w:pPr/>
-      <w:r>
-        <w:t>Người dùng nhập MK hiện tại, MK mới, Xác nhận MK mới và nhấn [Lưu] -&gt; hệ thống hiển thị form đổi mật khẩu -&gt; đề xuất lớp ChangePasswordView, có txtMKHienTai, txtMKMoi, txtXacNhanMKMoi, btnLuu.</w:t>
-      </w:r>
-    </w:p>
-    <w:p>
-      <w:pPr/>
-      <w:r>
-        <w:t xml:space="preserve">Người dùng nhấn [Lưu] -&gt; hệ thống cần đổi mật khẩu -&gt; cần chức năng </w:t>
-      </w:r>
-      <w:r>
-        <w:rPr>
-          <w:rFonts w:ascii="Courier New" w:hAnsi="Courier New"/>
-          <w:sz w:val="20"/>
-        </w:rPr>
-        <w:t>changePassword(mkHienTai, mkMoi)</w:t>
-      </w:r>
-      <w:r>
-        <w:t xml:space="preserve"> của đối tượng User.</w:t>
-      </w:r>
-    </w:p>
-    <w:p>
-      <w:pPr/>
-      <w:r>
-        <w:t xml:space="preserve">Phương thức: </w:t>
-      </w:r>
-      <w:r>
-        <w:rPr>
-          <w:rFonts w:ascii="Courier New" w:hAnsi="Courier New"/>
-          <w:sz w:val="20"/>
-        </w:rPr>
-        <w:t>changePassword(mkHienTai, mkMoi)</w:t>
-      </w:r>
-    </w:p>
-    <w:p>
-      <w:pPr/>
-      <w:r>
-        <w:t>Input: mkHienTai, mkMoi</w:t>
-      </w:r>
-    </w:p>
-    <w:p>
-      <w:pPr/>
-      <w:r>
-        <w:t>Output: boolean (thành công/thất bại)</w:t>
-      </w:r>
-    </w:p>
-    <w:p>
-      <w:pPr/>
-      <w:r>
-        <w:t>Lớp chủ thể: User</w:t>
-      </w:r>
-    </w:p>
-    <w:p>
-      <w:pPr/>
-      <w:r>
-        <w:t>[5]. Giao diện ProfileView → lớp ProfileView</w:t>
-      </w:r>
-    </w:p>
-    <w:p>
-      <w:pPr/>
-      <w:r>
-        <w:t>Phân tích chi tiết chức năng Xem hồ sơ:</w:t>
-      </w:r>
-    </w:p>
-    <w:p>
-      <w:pPr/>
-      <w:r>
-        <w:t>Người dùng nhấn vào ảnh đại diện -&gt; hệ thống hiển thị thông tin cá nhân -&gt; đề xuất lớp ProfileView, có lblHoTen, lblSDT, lblEmail, lblHang, lblDiem.</w:t>
-      </w:r>
-    </w:p>
-    <w:p>
-      <w:pPr/>
-      <w:r>
-        <w:t xml:space="preserve">Hệ thống cần lấy thông tin hồ sơ -&gt; cần chức năng </w:t>
-      </w:r>
-      <w:r>
-        <w:rPr>
-          <w:rFonts w:ascii="Courier New" w:hAnsi="Courier New"/>
-          <w:sz w:val="20"/>
-        </w:rPr>
-        <w:t>getProfile(userId)</w:t>
-      </w:r>
-      <w:r>
-        <w:t xml:space="preserve"> của đối tượng User.</w:t>
-      </w:r>
-    </w:p>
-    <w:p>
-      <w:pPr/>
-      <w:r>
-        <w:t xml:space="preserve">Phương thức: </w:t>
-      </w:r>
-      <w:r>
-        <w:rPr>
-          <w:rFonts w:ascii="Courier New" w:hAnsi="Courier New"/>
-          <w:sz w:val="20"/>
-        </w:rPr>
-        <w:t>getProfile(userId)</w:t>
-      </w:r>
-    </w:p>
-    <w:p>
-      <w:pPr/>
-      <w:r>
-        <w:t>Input: userId</w:t>
-      </w:r>
-    </w:p>
-    <w:p>
-      <w:pPr/>
-      <w:r>
-        <w:t>Output: User (thông tin hồ sơ)</w:t>
-      </w:r>
-    </w:p>
-    <w:p>
-      <w:pPr/>
-      <w:r>
-        <w:t>Lớp chủ thể: User</w:t>
-      </w:r>
-    </w:p>
-    <w:p>
-      <w:pPr/>
-      <w:r>
-        <w:t>[6]. Giao diện ProfileView → lớp ProfileView</w:t>
-      </w:r>
-    </w:p>
-    <w:p>
-      <w:pPr/>
-      <w:r>
-        <w:t>Phân tích chi tiết chức năng Cập nhật hồ sơ:</w:t>
-      </w:r>
-    </w:p>
-    <w:p>
-      <w:pPr/>
-      <w:r>
-        <w:t>Người dùng chỉnh sửa họ tên, email và nhấn [Lưu] -&gt; hệ thống cập nhật thông tin -&gt; đề xuất lớp ProfileView, có btnChinhSua, btnLuu.</w:t>
-      </w:r>
-    </w:p>
-    <w:p>
-      <w:pPr/>
-      <w:r>
-        <w:t xml:space="preserve">Người dùng nhấn [Lưu] -&gt; hệ thống cần cập nhật hồ sơ -&gt; cần chức năng </w:t>
-      </w:r>
-      <w:r>
-        <w:rPr>
-          <w:rFonts w:ascii="Courier New" w:hAnsi="Courier New"/>
-          <w:sz w:val="20"/>
-        </w:rPr>
-        <w:t>updateProfile(userId, hoTen, email)</w:t>
-      </w:r>
-      <w:r>
-        <w:t xml:space="preserve"> của đối tượng User.</w:t>
-      </w:r>
-    </w:p>
-    <w:p>
-      <w:pPr/>
-      <w:r>
-        <w:t xml:space="preserve">Phương thức: </w:t>
-      </w:r>
-      <w:r>
-        <w:rPr>
-          <w:rFonts w:ascii="Courier New" w:hAnsi="Courier New"/>
-          <w:sz w:val="20"/>
-        </w:rPr>
-        <w:t>updateProfile(userId, hoTen, email)</w:t>
-      </w:r>
-    </w:p>
-    <w:p>
-      <w:pPr/>
-      <w:r>
-        <w:t>Input: userId, hoTen, email</w:t>
-      </w:r>
-    </w:p>
-    <w:p>
-      <w:pPr/>
-      <w:r>
-        <w:t>Output: User (đã cập nhật)</w:t>
-      </w:r>
-    </w:p>
-    <w:p>
-      <w:pPr/>
-      <w:r>
-        <w:t>Lớp chủ thể: User</w:t>
-      </w:r>
-    </w:p>
-    <w:p>
-      <w:pPr/>
-      <w:r>
-        <w:t>[7]. Giao diện StaffManageView → lớp StaffManageView</w:t>
-      </w:r>
-    </w:p>
-    <w:p>
-      <w:pPr/>
-      <w:r>
-        <w:t>Phân tích chi tiết chức năng Xem danh sách nhân viên:</w:t>
-      </w:r>
-    </w:p>
-    <w:p>
-      <w:pPr/>
-      <w:r>
-        <w:t>Admin truy cập "Quản lý nhân viên" -&gt; hệ thống hiển thị bảng danh sách nhân viên -&gt; đề xuất lớp StaffManageView, có tblEmployee, btnThem, btnSua, btnXoa.</w:t>
-      </w:r>
-    </w:p>
-    <w:p>
-      <w:pPr/>
-      <w:r>
-        <w:t xml:space="preserve">Hệ thống cần tải danh sách nhân viên -&gt; cần chức năng </w:t>
-      </w:r>
-      <w:r>
-        <w:rPr>
-          <w:rFonts w:ascii="Courier New" w:hAnsi="Courier New"/>
-          <w:sz w:val="20"/>
-        </w:rPr>
-        <w:t>getAllStaff()</w:t>
-      </w:r>
-      <w:r>
-        <w:t xml:space="preserve"> của đối tượng Employee.</w:t>
-      </w:r>
-    </w:p>
-    <w:p>
-      <w:pPr/>
-      <w:r>
-        <w:t xml:space="preserve">Phương thức: </w:t>
-      </w:r>
-      <w:r>
-        <w:rPr>
-          <w:rFonts w:ascii="Courier New" w:hAnsi="Courier New"/>
-          <w:sz w:val="20"/>
-        </w:rPr>
-        <w:t>getAllStaff()</w:t>
-      </w:r>
-    </w:p>
-    <w:p>
-      <w:pPr/>
-      <w:r>
-        <w:t>Input: (không có — tải toàn bộ)</w:t>
-      </w:r>
-    </w:p>
-    <w:p>
-      <w:pPr/>
-      <w:r>
-        <w:t>Output: List\&lt;Employee\&gt;</w:t>
-      </w:r>
-    </w:p>
-    <w:p>
-      <w:pPr/>
-      <w:r>
-        <w:t>Lớp chủ thể: Employee</w:t>
-      </w:r>
-    </w:p>
-    <w:p>
-      <w:pPr/>
-      <w:r>
-        <w:t>[8]. Giao diện StaffManageView → lớp StaffManageView</w:t>
-      </w:r>
-    </w:p>
-    <w:p>
-      <w:pPr/>
-      <w:r>
-        <w:t>Phân tích chi tiết chức năng Thêm nhân viên:</w:t>
-      </w:r>
-    </w:p>
-    <w:p>
-      <w:pPr/>
-      <w:r>
-        <w:t>Admin nhấn [Thêm], nhập thông tin và nhấn [Lưu] -&gt; hệ thống tạo tài khoản nhân viên mới -&gt; đề xuất lớp StaffManageView, có btnThem, txtHoTen, txtVaiTro.</w:t>
-      </w:r>
-    </w:p>
-    <w:p>
-      <w:pPr/>
-      <w:r>
-        <w:t xml:space="preserve">Admin nhấn [Lưu] -&gt; hệ thống cần tạo nhân viên mới -&gt; cần chức năng </w:t>
-      </w:r>
-      <w:r>
-        <w:rPr>
-          <w:rFonts w:ascii="Courier New" w:hAnsi="Courier New"/>
-          <w:sz w:val="20"/>
-        </w:rPr>
-        <w:t>addStaff(hoTen, vaiTro)</w:t>
-      </w:r>
-      <w:r>
-        <w:t xml:space="preserve"> của đối tượng Employee.</w:t>
-      </w:r>
-    </w:p>
-    <w:p>
-      <w:pPr/>
-      <w:r>
-        <w:t xml:space="preserve">Phương thức: </w:t>
-      </w:r>
-      <w:r>
-        <w:rPr>
-          <w:rFonts w:ascii="Courier New" w:hAnsi="Courier New"/>
-          <w:sz w:val="20"/>
-        </w:rPr>
-        <w:t>addStaff(hoTen, vaiTro)</w:t>
-      </w:r>
-    </w:p>
-    <w:p>
-      <w:pPr/>
-      <w:r>
-        <w:t>Input: hoTen, vaiTro</w:t>
-      </w:r>
-    </w:p>
-    <w:p>
-      <w:pPr/>
-      <w:r>
-        <w:t>Output: Employee (vừa tạo)</w:t>
-      </w:r>
-    </w:p>
-    <w:p>
-      <w:pPr/>
-      <w:r>
-        <w:t>Lớp chủ thể: Employee</w:t>
-      </w:r>
-    </w:p>
-    <w:p>
-      <w:pPr/>
-      <w:r>
-        <w:t>[9]. Giao diện StaffManageView → lớp StaffManageView</w:t>
-      </w:r>
-    </w:p>
-    <w:p>
-      <w:pPr/>
-      <w:r>
-        <w:t>Phân tích chi tiết chức năng Sửa nhân viên:</w:t>
-      </w:r>
-    </w:p>
-    <w:p>
-      <w:pPr/>
-      <w:r>
-        <w:t>Admin chọn nhân viên, chỉnh sửa thông tin và nhấn [Lưu] -&gt; hệ thống cập nhật thông tin nhân viên -&gt; đề xuất lớp StaffManageView, có btnSua, btnChonNV.</w:t>
-      </w:r>
-    </w:p>
-    <w:p>
-      <w:pPr/>
-      <w:r>
-        <w:t xml:space="preserve">Admin nhấn [Lưu] -&gt; hệ thống cần cập nhật nhân viên -&gt; cần chức năng </w:t>
-      </w:r>
-      <w:r>
-        <w:rPr>
-          <w:rFonts w:ascii="Courier New" w:hAnsi="Courier New"/>
-          <w:sz w:val="20"/>
-        </w:rPr>
-        <w:t>updateStaff(id, hoTen, vaiTro)</w:t>
-      </w:r>
-      <w:r>
-        <w:t xml:space="preserve"> của đối tượng Employee.</w:t>
-      </w:r>
-    </w:p>
-    <w:p>
-      <w:pPr/>
-      <w:r>
-        <w:t xml:space="preserve">Phương thức: </w:t>
-      </w:r>
-      <w:r>
-        <w:rPr>
-          <w:rFonts w:ascii="Courier New" w:hAnsi="Courier New"/>
-          <w:sz w:val="20"/>
-        </w:rPr>
-        <w:t>updateStaff(id, hoTen, vaiTro)</w:t>
-      </w:r>
-    </w:p>
-    <w:p>
-      <w:pPr/>
-      <w:r>
-        <w:t>Input: id, hoTen, vaiTro</w:t>
-      </w:r>
-    </w:p>
-    <w:p>
-      <w:pPr/>
-      <w:r>
-        <w:t>Output: Employee (đã cập nhật)</w:t>
-      </w:r>
-    </w:p>
-    <w:p>
-      <w:pPr/>
-      <w:r>
-        <w:t>Lớp chủ thể: Employee</w:t>
-      </w:r>
-    </w:p>
-    <w:p>
-      <w:pPr/>
-      <w:r>
-        <w:t>[10]. Giao diện StaffManageView → lớp StaffManageView</w:t>
-      </w:r>
-    </w:p>
-    <w:p>
-      <w:pPr/>
-      <w:r>
-        <w:t>Phân tích chi tiết chức năng Xóa nhân viên:</w:t>
-      </w:r>
-    </w:p>
-    <w:p>
-      <w:pPr/>
-      <w:r>
-        <w:t>Admin chọn nhân viên và nhấn [Xóa] -&gt; hệ thống chuyển trạng thái "Đã nghỉ" -&gt; đề xuất lớp StaffManageView, có btnXoa, btnChonNV.</w:t>
-      </w:r>
-    </w:p>
-    <w:p>
-      <w:pPr/>
-      <w:r>
-        <w:t xml:space="preserve">Admin nhấn [Xóa] -&gt; hệ thống cần xóa nhân viên -&gt; cần chức năng </w:t>
-      </w:r>
-      <w:r>
-        <w:rPr>
-          <w:rFonts w:ascii="Courier New" w:hAnsi="Courier New"/>
-          <w:sz w:val="20"/>
-        </w:rPr>
-        <w:t>deleteStaff(id)</w:t>
-      </w:r>
-      <w:r>
-        <w:t xml:space="preserve"> của đối tượng Employee.</w:t>
-      </w:r>
-    </w:p>
-    <w:p>
-      <w:pPr/>
-      <w:r>
-        <w:t xml:space="preserve">Phương thức: </w:t>
-      </w:r>
-      <w:r>
-        <w:rPr>
-          <w:rFonts w:ascii="Courier New" w:hAnsi="Courier New"/>
-          <w:sz w:val="20"/>
-        </w:rPr>
-        <w:t>deleteStaff(id)</w:t>
-      </w:r>
-    </w:p>
-    <w:p>
-      <w:pPr/>
-      <w:r>
-        <w:t>Input: id</w:t>
-      </w:r>
-    </w:p>
-    <w:p>
-      <w:pPr/>
-      <w:r>
-        <w:t>Output: boolean (thành công/thất bại)</w:t>
-      </w:r>
-    </w:p>
-    <w:p>
-      <w:pPr/>
-      <w:r>
-        <w:t>Lớp chủ thể: Employee</w:t>
+        <w:t>Entity:</w:t>
+      </w:r>
+      <w:r>
+        <w:t xml:space="preserve"> User</w:t>
       </w:r>
     </w:p>
     <w:p>
@@ -5975,6 +4991,119 @@
       </w:r>
     </w:p>
     <w:p>
+      <w:pPr/>
+      <w:r>
+        <w:rPr>
+          <w:b/>
+        </w:rPr>
+        <w:t>Phân tích chi tiết chức năng "Đăng ký" diễn ra như sau:</w:t>
+      </w:r>
+    </w:p>
+    <w:p>
+      <w:pPr/>
+      <w:r>
+        <w:t xml:space="preserve">Người dùng truy cập trang đăng ký → Đề xuất lớp </w:t>
+      </w:r>
+      <w:r>
+        <w:rPr>
+          <w:b/>
+        </w:rPr>
+        <w:t>RegisterView</w:t>
+      </w:r>
+      <w:r>
+        <w:t>, có ô nhập Họ tên, SĐT, Email, Mật khẩu, Xác nhận MK, nút Tiếp tục.</w:t>
+      </w:r>
+    </w:p>
+    <w:p>
+      <w:pPr/>
+      <w:r>
+        <w:t xml:space="preserve">Người dùng nhập thông tin và nhấn [Tiếp tục] → Hệ thống cần tạo tài khoản mới → Cần chức năng </w:t>
+      </w:r>
+      <w:r>
+        <w:rPr>
+          <w:rFonts w:ascii="Courier New" w:hAnsi="Courier New"/>
+          <w:sz w:val="20"/>
+        </w:rPr>
+        <w:t>register()</w:t>
+      </w:r>
+      <w:r>
+        <w:t xml:space="preserve"> của đối tượng </w:t>
+      </w:r>
+      <w:r>
+        <w:rPr>
+          <w:b/>
+        </w:rPr>
+        <w:t>User</w:t>
+      </w:r>
+      <w:r>
+        <w:t>.</w:t>
+      </w:r>
+    </w:p>
+    <w:p>
+      <w:pPr/>
+      <w:r>
+        <w:t xml:space="preserve">Hệ thống gửi OTP đến SĐT → Đề xuất lớp </w:t>
+      </w:r>
+      <w:r>
+        <w:rPr>
+          <w:b/>
+        </w:rPr>
+        <w:t>OTPVerifyView</w:t>
+      </w:r>
+      <w:r>
+        <w:t>, có ô nhập OTP, nút Xác nhận.</w:t>
+      </w:r>
+    </w:p>
+    <w:p>
+      <w:pPr/>
+      <w:r>
+        <w:t xml:space="preserve">Người dùng nhập OTP và nhấn [Xác nhận] → Hệ thống cần xác minh OTP → Cần chức năng </w:t>
+      </w:r>
+      <w:r>
+        <w:rPr>
+          <w:rFonts w:ascii="Courier New" w:hAnsi="Courier New"/>
+          <w:sz w:val="20"/>
+        </w:rPr>
+        <w:t>verifyOTP()</w:t>
+      </w:r>
+      <w:r>
+        <w:t xml:space="preserve"> của đối tượng </w:t>
+      </w:r>
+      <w:r>
+        <w:rPr>
+          <w:b/>
+        </w:rPr>
+        <w:t>OTP</w:t>
+      </w:r>
+      <w:r>
+        <w:t>.</w:t>
+      </w:r>
+    </w:p>
+    <w:p>
+      <w:pPr/>
+      <w:r>
+        <w:rPr>
+          <w:b/>
+        </w:rPr>
+        <w:t>Boundary:</w:t>
+      </w:r>
+      <w:r>
+        <w:t xml:space="preserve"> RegisterView, OTPVerifyView</w:t>
+      </w:r>
+    </w:p>
+    <w:p>
+      <w:pPr/>
+      <w:r>
+        <w:rPr>
+          <w:b/>
+        </w:rPr>
+        <w:t>Entity:</w:t>
+      </w:r>
+      <w:r>
+        <w:t xml:space="preserve"> User, OTP</w:t>
+      </w:r>
+    </w:p>
+    <w:p>
       <w:pPr>
         <w:jc w:val="center"/>
       </w:pPr>
@@ -6014,6 +5143,85 @@
       </w:r>
     </w:p>
     <w:p>
+      <w:pPr/>
+      <w:r>
+        <w:rPr>
+          <w:b/>
+        </w:rPr>
+        <w:t>Phân tích chi tiết chức năng "Đổi mật khẩu" diễn ra như sau:</w:t>
+      </w:r>
+    </w:p>
+    <w:p>
+      <w:pPr/>
+      <w:r>
+        <w:t xml:space="preserve">Người dùng truy cập trang bảo mật → Đề xuất lớp </w:t>
+      </w:r>
+      <w:r>
+        <w:rPr>
+          <w:b/>
+        </w:rPr>
+        <w:t>ChangePasswordView</w:t>
+      </w:r>
+      <w:r>
+        <w:t>, có ô nhập MK hiện tại, MK mới, Xác nhận MK mới, nút Lưu.</w:t>
+      </w:r>
+    </w:p>
+    <w:p>
+      <w:pPr/>
+      <w:r>
+        <w:t xml:space="preserve">Người dùng nhập MK hiện tại, MK mới và nhấn [Lưu] → Hệ thống cần đổi mật khẩu → Cần chức năng </w:t>
+      </w:r>
+      <w:r>
+        <w:rPr>
+          <w:rFonts w:ascii="Courier New" w:hAnsi="Courier New"/>
+          <w:sz w:val="20"/>
+        </w:rPr>
+        <w:t>changePassword()</w:t>
+      </w:r>
+      <w:r>
+        <w:t xml:space="preserve"> của đối tượng </w:t>
+      </w:r>
+      <w:r>
+        <w:rPr>
+          <w:b/>
+        </w:rPr>
+        <w:t>User</w:t>
+      </w:r>
+      <w:r>
+        <w:t>.</w:t>
+      </w:r>
+    </w:p>
+    <w:p>
+      <w:pPr/>
+      <w:r>
+        <w:t>Nếu MK hiện tại sai → Hệ thống hiển thị thông báo lỗi.</w:t>
+      </w:r>
+    </w:p>
+    <w:p>
+      <w:pPr/>
+      <w:r>
+        <w:rPr>
+          <w:b/>
+        </w:rPr>
+        <w:t>Boundary:</w:t>
+      </w:r>
+      <w:r>
+        <w:t xml:space="preserve"> ChangePasswordView</w:t>
+      </w:r>
+    </w:p>
+    <w:p>
+      <w:pPr/>
+      <w:r>
+        <w:rPr>
+          <w:b/>
+        </w:rPr>
+        <w:t>Entity:</w:t>
+      </w:r>
+      <w:r>
+        <w:t xml:space="preserve"> User</w:t>
+      </w:r>
+    </w:p>
+    <w:p>
       <w:pPr>
         <w:jc w:val="center"/>
       </w:pPr>
@@ -6053,6 +5261,104 @@
       </w:r>
     </w:p>
     <w:p>
+      <w:pPr/>
+      <w:r>
+        <w:rPr>
+          <w:b/>
+        </w:rPr>
+        <w:t>Phân tích chi tiết chức năng "Quản lý thông tin cá nhân" diễn ra như sau:</w:t>
+      </w:r>
+    </w:p>
+    <w:p>
+      <w:pPr/>
+      <w:r>
+        <w:t xml:space="preserve">Người dùng nhấn vào ảnh đại diện → Đề xuất lớp </w:t>
+      </w:r>
+      <w:r>
+        <w:rPr>
+          <w:b/>
+        </w:rPr>
+        <w:t>ProfileView</w:t>
+      </w:r>
+      <w:r>
+        <w:t>, có hiển thị Họ tên, SĐT, Email, Hạng hội viên, Điểm tích lũy, nút Chỉnh sửa.</w:t>
+      </w:r>
+    </w:p>
+    <w:p>
+      <w:pPr/>
+      <w:r>
+        <w:t xml:space="preserve">Hệ thống cần lấy thông tin hồ sơ → Cần chức năng </w:t>
+      </w:r>
+      <w:r>
+        <w:rPr>
+          <w:rFonts w:ascii="Courier New" w:hAnsi="Courier New"/>
+          <w:sz w:val="20"/>
+        </w:rPr>
+        <w:t>getProfile()</w:t>
+      </w:r>
+      <w:r>
+        <w:t xml:space="preserve"> của đối tượng </w:t>
+      </w:r>
+      <w:r>
+        <w:rPr>
+          <w:b/>
+        </w:rPr>
+        <w:t>User</w:t>
+      </w:r>
+      <w:r>
+        <w:t>.</w:t>
+      </w:r>
+    </w:p>
+    <w:p>
+      <w:pPr/>
+      <w:r>
+        <w:t xml:space="preserve">Người dùng nhấn [Chỉnh sửa], sửa thông tin và nhấn [Lưu] → Hệ thống cần cập nhật hồ sơ → Cần chức năng </w:t>
+      </w:r>
+      <w:r>
+        <w:rPr>
+          <w:rFonts w:ascii="Courier New" w:hAnsi="Courier New"/>
+          <w:sz w:val="20"/>
+        </w:rPr>
+        <w:t>updateProfile()</w:t>
+      </w:r>
+      <w:r>
+        <w:t xml:space="preserve"> của đối tượng </w:t>
+      </w:r>
+      <w:r>
+        <w:rPr>
+          <w:b/>
+        </w:rPr>
+        <w:t>User</w:t>
+      </w:r>
+      <w:r>
+        <w:t>.</w:t>
+      </w:r>
+    </w:p>
+    <w:p>
+      <w:pPr/>
+      <w:r>
+        <w:rPr>
+          <w:b/>
+        </w:rPr>
+        <w:t>Boundary:</w:t>
+      </w:r>
+      <w:r>
+        <w:t xml:space="preserve"> ProfileView</w:t>
+      </w:r>
+    </w:p>
+    <w:p>
+      <w:pPr/>
+      <w:r>
+        <w:rPr>
+          <w:b/>
+        </w:rPr>
+        <w:t>Entity:</w:t>
+      </w:r>
+      <w:r>
+        <w:t xml:space="preserve"> User</w:t>
+      </w:r>
+    </w:p>
+    <w:p>
       <w:pPr>
         <w:jc w:val="center"/>
       </w:pPr>
@@ -6092,6 +5398,104 @@
       </w:r>
     </w:p>
     <w:p>
+      <w:pPr/>
+      <w:r>
+        <w:rPr>
+          <w:b/>
+        </w:rPr>
+        <w:t>Phân tích chi tiết chức năng "Quản lý nhân viên" diễn ra như sau:</w:t>
+      </w:r>
+    </w:p>
+    <w:p>
+      <w:pPr/>
+      <w:r>
+        <w:t xml:space="preserve">Admin truy cập trang quản lý nhân viên → Đề xuất lớp </w:t>
+      </w:r>
+      <w:r>
+        <w:rPr>
+          <w:b/>
+        </w:rPr>
+        <w:t>StaffManageView</w:t>
+      </w:r>
+      <w:r>
+        <w:t>, có bảng danh sách nhân viên, nút Thêm, Sửa, Xóa.</w:t>
+      </w:r>
+    </w:p>
+    <w:p>
+      <w:pPr/>
+      <w:r>
+        <w:t xml:space="preserve">Hệ thống cần tải danh sách nhân viên → Cần chức năng </w:t>
+      </w:r>
+      <w:r>
+        <w:rPr>
+          <w:rFonts w:ascii="Courier New" w:hAnsi="Courier New"/>
+          <w:sz w:val="20"/>
+        </w:rPr>
+        <w:t>getAllStaff()</w:t>
+      </w:r>
+      <w:r>
+        <w:t xml:space="preserve"> của đối tượng </w:t>
+      </w:r>
+      <w:r>
+        <w:rPr>
+          <w:b/>
+        </w:rPr>
+        <w:t>Employee</w:t>
+      </w:r>
+      <w:r>
+        <w:t>.</w:t>
+      </w:r>
+    </w:p>
+    <w:p>
+      <w:pPr/>
+      <w:r>
+        <w:t xml:space="preserve">Admin nhấn [Thêm], nhập thông tin và nhấn [Lưu] → Hệ thống cần tạo nhân viên mới → Cần chức năng </w:t>
+      </w:r>
+      <w:r>
+        <w:rPr>
+          <w:rFonts w:ascii="Courier New" w:hAnsi="Courier New"/>
+          <w:sz w:val="20"/>
+        </w:rPr>
+        <w:t>addStaff()</w:t>
+      </w:r>
+      <w:r>
+        <w:t xml:space="preserve"> của đối tượng </w:t>
+      </w:r>
+      <w:r>
+        <w:rPr>
+          <w:b/>
+        </w:rPr>
+        <w:t>Employee</w:t>
+      </w:r>
+      <w:r>
+        <w:t>.</w:t>
+      </w:r>
+    </w:p>
+    <w:p>
+      <w:pPr/>
+      <w:r>
+        <w:rPr>
+          <w:b/>
+        </w:rPr>
+        <w:t>Boundary:</w:t>
+      </w:r>
+      <w:r>
+        <w:t xml:space="preserve"> StaffManageView</w:t>
+      </w:r>
+    </w:p>
+    <w:p>
+      <w:pPr/>
+      <w:r>
+        <w:rPr>
+          <w:b/>
+        </w:rPr>
+        <w:t>Entity:</w:t>
+      </w:r>
+      <w:r>
+        <w:t xml:space="preserve"> Employee</w:t>
+      </w:r>
+    </w:p>
+    <w:p>
       <w:pPr>
         <w:jc w:val="center"/>
       </w:pPr>
@@ -6203,85 +5607,85 @@
     <w:p>
       <w:pPr/>
       <w:r>
-        <w:t>1. Khách hàng truy cập URL hệ thống để mở màn hình Đăng nhập.</w:t>
+        <w:t>* Khách hàng truy cập trang đăng nhập.</w:t>
       </w:r>
     </w:p>
     <w:p>
       <w:pPr/>
       <w:r>
-        <w:t>2. Lớp LoginView hiển thị form gồm ô nhập SĐT/Email, ô nhập Mật khẩu, nút [Đăng nhập], liên kết "Quên mật khẩu?" / "Đăng ký".</w:t>
+        <w:t>* Lớp LoginView hiển thị form gồm ô nhập SĐT, ô nhập Mật khẩu, nút [Đăng nhập].</w:t>
       </w:r>
     </w:p>
     <w:p>
       <w:pPr/>
       <w:r>
-        <w:t>3. Khách hàng nhập SĐT = "0912345678" và Mật khẩu = "Abc@1234".</w:t>
+        <w:t>* Khách hàng nhập SĐT = "0912345678" và Mật khẩu = "Abc@1234".</w:t>
       </w:r>
     </w:p>
     <w:p>
       <w:pPr/>
       <w:r>
-        <w:t>4. Khách hàng nhấn nút [Đăng nhập].</w:t>
+        <w:t>* Khách hàng nhấn nút [Đăng nhập].</w:t>
       </w:r>
     </w:p>
     <w:p>
       <w:pPr/>
       <w:r>
-        <w:t xml:space="preserve">5. Lớp LoginView gọi phương thức </w:t>
+        <w:t xml:space="preserve">* Lớp LoginView gọi hàm </w:t>
       </w:r>
       <w:r>
         <w:rPr>
           <w:rFonts w:ascii="Courier New" w:hAnsi="Courier New"/>
           <w:sz w:val="20"/>
         </w:rPr>
-        <w:t>checkLogin(sdt, matKhau)</w:t>
-      </w:r>
-      <w:r>
-        <w:t xml:space="preserve"> của User.</w:t>
+        <w:t>checkLogin()</w:t>
+      </w:r>
+      <w:r>
+        <w:t xml:space="preserve"> của đối tượng User.</w:t>
       </w:r>
     </w:p>
     <w:p>
       <w:pPr/>
       <w:r>
-        <w:t xml:space="preserve">6. User tìm tài khoản theo SĐT bằng </w:t>
+        <w:t xml:space="preserve">* Lớp User gọi hàm </w:t>
       </w:r>
       <w:r>
         <w:rPr>
           <w:rFonts w:ascii="Courier New" w:hAnsi="Courier New"/>
           <w:sz w:val="20"/>
         </w:rPr>
-        <w:t>findBySDT(sdt)</w:t>
-      </w:r>
-      <w:r>
-        <w:t>.</w:t>
+        <w:t>findBySDT()</w:t>
+      </w:r>
+      <w:r>
+        <w:t xml:space="preserve"> để tìm tài khoản theo SĐT.</w:t>
       </w:r>
     </w:p>
     <w:p>
       <w:pPr/>
       <w:r>
-        <w:t xml:space="preserve">7. User so sánh mật khẩu bằng </w:t>
+        <w:t xml:space="preserve">* Lớp User gọi hàm </w:t>
       </w:r>
       <w:r>
         <w:rPr>
           <w:rFonts w:ascii="Courier New" w:hAnsi="Courier New"/>
           <w:sz w:val="20"/>
         </w:rPr>
-        <w:t>checkPassword(matKhau, hash)</w:t>
-      </w:r>
-      <w:r>
-        <w:t>.</w:t>
+        <w:t>checkPassword()</w:t>
+      </w:r>
+      <w:r>
+        <w:t xml:space="preserve"> để so sánh mật khẩu.</w:t>
       </w:r>
     </w:p>
     <w:p>
       <w:pPr/>
       <w:r>
-        <w:t>8. User trả kết quả về cho LoginView.</w:t>
+        <w:t>* Lớp User trả kết quả về cho LoginView.</w:t>
       </w:r>
     </w:p>
     <w:p>
       <w:pPr/>
       <w:r>
-        <w:t>9. Lớp LoginView hiển thị "Đăng nhập thành công. Xin chào, Nguyễn Văn A!" và chuyển hướng trang chủ.</w:t>
+        <w:t>* Lớp LoginView hiển thị "Đăng nhập thành công. Xin chào, Nguyễn Văn A!" và chuyển hướng trang chủ.</w:t>
       </w:r>
     </w:p>
     <w:p>
@@ -6294,19 +5698,15 @@
       </w:r>
     </w:p>
     <w:p>
-      <w:pPr>
-        <w:pStyle w:val="ListBullet"/>
-      </w:pPr>
-      <w:r>
-        <w:t>User trả về null (không tìm thấy tài khoản).</w:t>
-      </w:r>
-    </w:p>
-    <w:p>
-      <w:pPr>
-        <w:pStyle w:val="ListBullet"/>
-      </w:pPr>
-      <w:r>
-        <w:t>LoginView hiển thị "Tài khoản không tồn tại. Vui lòng kiểm tra lại."</w:t>
+      <w:pPr/>
+      <w:r>
+        <w:t>* Lớp User trả về null (không tìm thấy tài khoản).</w:t>
+      </w:r>
+    </w:p>
+    <w:p>
+      <w:pPr/>
+      <w:r>
+        <w:t>* Lớp LoginView hiển thị "Tài khoản không tồn tại. Vui lòng kiểm tra lại."</w:t>
       </w:r>
     </w:p>
     <w:p>
@@ -6319,19 +5719,15 @@
       </w:r>
     </w:p>
     <w:p>
-      <w:pPr>
-        <w:pStyle w:val="ListBullet"/>
-      </w:pPr>
-      <w:r>
-        <w:t>User trả về sai mật khẩu cho LoginView.</w:t>
-      </w:r>
-    </w:p>
-    <w:p>
-      <w:pPr>
-        <w:pStyle w:val="ListBullet"/>
-      </w:pPr>
-      <w:r>
-        <w:t>LoginView hiển thị "Mật khẩu không chính xác. Còn [N] lần thử."</w:t>
+      <w:pPr/>
+      <w:r>
+        <w:t>* Lớp User trả về mật khẩu không khớp.</w:t>
+      </w:r>
+    </w:p>
+    <w:p>
+      <w:pPr/>
+      <w:r>
+        <w:t>* Lớp LoginView hiển thị "Mật khẩu không chính xác. Còn [N] lần thử."</w:t>
       </w:r>
     </w:p>
     <w:p>
@@ -6349,7 +5745,7 @@
       <w:r>
         <w:drawing>
           <wp:inline xmlns:a="http://schemas.openxmlformats.org/drawingml/2006/main" xmlns:pic="http://schemas.openxmlformats.org/drawingml/2006/picture">
-            <wp:extent cx="5486400" cy="4402085"/>
+            <wp:extent cx="5486400" cy="4443336"/>
             <wp:docPr id="9" name="Picture 9"/>
             <wp:cNvGraphicFramePr>
               <a:graphicFrameLocks noChangeAspect="1"/>
@@ -6370,7 +5766,7 @@
                   <pic:spPr>
                     <a:xfrm>
                       <a:off x="0" y="0"/>
-                      <a:ext cx="5486400" cy="4402085"/>
+                      <a:ext cx="5486400" cy="4443336"/>
                     </a:xfrm>
                     <a:prstGeom prst="rect"/>
                   </pic:spPr>
@@ -6399,145 +5795,145 @@
     <w:p>
       <w:pPr/>
       <w:r>
-        <w:t>1. Khách hàng nhấn liên kết "Đăng ký" từ màn hình đăng nhập.</w:t>
+        <w:t>* Khách hàng nhấn liên kết "Đăng ký" từ màn hình đăng nhập.</w:t>
       </w:r>
     </w:p>
     <w:p>
       <w:pPr/>
       <w:r>
-        <w:t>2. Lớp RegisterView hiển thị form gồm: Họ tên, SĐT, Email, Mật khẩu, Xác nhận MK.</w:t>
+        <w:t>* Lớp RegisterView hiển thị form gồm: Họ tên, SĐT, Email, Mật khẩu, Xác nhận MK.</w:t>
       </w:r>
     </w:p>
     <w:p>
       <w:pPr/>
       <w:r>
-        <w:t>3. Khách hàng nhập: Họ tên = "Nguyễn Thị Bình", SĐT = "0987654321", Email = "binh.nt@email.com", MK = "Pass@2025".</w:t>
+        <w:t>* Khách hàng nhập Họ tên = "Nguyễn Thị Bình", SĐT = "0987654321", Email = "binh.nt@email.com", Mật khẩu = "Pass@2025".</w:t>
       </w:r>
     </w:p>
     <w:p>
       <w:pPr/>
       <w:r>
-        <w:t>4. Khách hàng nhấn [Tiếp tục].</w:t>
+        <w:t>* Khách hàng nhấn nút [Tiếp tục].</w:t>
       </w:r>
     </w:p>
     <w:p>
       <w:pPr/>
       <w:r>
-        <w:t xml:space="preserve">5. RegisterView gọi </w:t>
+        <w:t xml:space="preserve">* Lớp RegisterView gọi hàm </w:t>
       </w:r>
       <w:r>
         <w:rPr>
           <w:rFonts w:ascii="Courier New" w:hAnsi="Courier New"/>
           <w:sz w:val="20"/>
         </w:rPr>
-        <w:t>register(hoTen, sdt, email, matKhau)</w:t>
-      </w:r>
-      <w:r>
-        <w:t xml:space="preserve"> của User.</w:t>
+        <w:t>register()</w:t>
+      </w:r>
+      <w:r>
+        <w:t xml:space="preserve"> của đối tượng User.</w:t>
       </w:r>
     </w:p>
     <w:p>
       <w:pPr/>
       <w:r>
-        <w:t xml:space="preserve">6. User kiểm tra SĐT chưa tồn tại bằng </w:t>
+        <w:t xml:space="preserve">* Lớp User gọi hàm </w:t>
       </w:r>
       <w:r>
         <w:rPr>
           <w:rFonts w:ascii="Courier New" w:hAnsi="Courier New"/>
           <w:sz w:val="20"/>
         </w:rPr>
-        <w:t>existsBySDT(sdt)</w:t>
-      </w:r>
-      <w:r>
-        <w:t>.</w:t>
+        <w:t>existsBySDT()</w:t>
+      </w:r>
+      <w:r>
+        <w:t xml:space="preserve"> để kiểm tra SĐT chưa tồn tại.</w:t>
       </w:r>
     </w:p>
     <w:p>
       <w:pPr/>
       <w:r>
-        <w:t xml:space="preserve">7. User kiểm tra email chưa tồn tại bằng </w:t>
+        <w:t xml:space="preserve">* Lớp User gọi hàm </w:t>
       </w:r>
       <w:r>
         <w:rPr>
           <w:rFonts w:ascii="Courier New" w:hAnsi="Courier New"/>
           <w:sz w:val="20"/>
         </w:rPr>
-        <w:t>existsByEmail(email)</w:t>
-      </w:r>
-      <w:r>
-        <w:t>.</w:t>
+        <w:t>existsByEmail()</w:t>
+      </w:r>
+      <w:r>
+        <w:t xml:space="preserve"> để kiểm tra email chưa tồn tại.</w:t>
       </w:r>
     </w:p>
     <w:p>
       <w:pPr/>
       <w:r>
-        <w:t xml:space="preserve">8. User gọi </w:t>
+        <w:t xml:space="preserve">* Lớp User gọi hàm </w:t>
       </w:r>
       <w:r>
         <w:rPr>
           <w:rFonts w:ascii="Courier New" w:hAnsi="Courier New"/>
           <w:sz w:val="20"/>
         </w:rPr>
-        <w:t>guiOTP(sdt, DANG_KY)</w:t>
-      </w:r>
-      <w:r>
-        <w:t xml:space="preserve"> của OTP để gửi mã xác minh.</w:t>
+        <w:t>sendOTP()</w:t>
+      </w:r>
+      <w:r>
+        <w:t xml:space="preserve"> của đối tượng OTP để gửi mã xác minh.</w:t>
       </w:r>
     </w:p>
     <w:p>
       <w:pPr/>
       <w:r>
-        <w:t>9. User trả kết quả về RegisterView.</w:t>
+        <w:t>* Lớp User trả kết quả về cho RegisterView.</w:t>
       </w:r>
     </w:p>
     <w:p>
       <w:pPr/>
       <w:r>
-        <w:t>10. RegisterView hiển thị form xác nhận OTP.</w:t>
+        <w:t>* Lớp RegisterView hiển thị form xác nhận OTP.</w:t>
       </w:r>
     </w:p>
     <w:p>
       <w:pPr/>
       <w:r>
-        <w:t>11. Khách hàng nhập OTP = "482917" và nhấn [Xác nhận].</w:t>
+        <w:t>* Khách hàng nhập OTP = "482917" và nhấn nút [Xác nhận].</w:t>
       </w:r>
     </w:p>
     <w:p>
       <w:pPr/>
       <w:r>
-        <w:t xml:space="preserve">12. OTPVerifyView gọi </w:t>
+        <w:t xml:space="preserve">* Lớp OTPVerifyView gọi hàm </w:t>
       </w:r>
       <w:r>
         <w:rPr>
           <w:rFonts w:ascii="Courier New" w:hAnsi="Courier New"/>
           <w:sz w:val="20"/>
         </w:rPr>
-        <w:t>verifyOTP(otp)</w:t>
-      </w:r>
-      <w:r>
-        <w:t xml:space="preserve"> của OTP.</w:t>
+        <w:t>verifyOTP()</w:t>
+      </w:r>
+      <w:r>
+        <w:t xml:space="preserve"> của đối tượng OTP.</w:t>
       </w:r>
     </w:p>
     <w:p>
       <w:pPr/>
       <w:r>
-        <w:t xml:space="preserve">13. OTP kiểm tra mã đúng và còn hiệu lực bằng </w:t>
+        <w:t xml:space="preserve">* Lớp OTP gọi hàm </w:t>
       </w:r>
       <w:r>
         <w:rPr>
           <w:rFonts w:ascii="Courier New" w:hAnsi="Courier New"/>
           <w:sz w:val="20"/>
         </w:rPr>
-        <w:t>verify(otp)</w:t>
-      </w:r>
-      <w:r>
-        <w:t>.</w:t>
+        <w:t>verify()</w:t>
+      </w:r>
+      <w:r>
+        <w:t xml:space="preserve"> để kiểm tra mã đúng và còn hiệu lực.</w:t>
       </w:r>
     </w:p>
     <w:p>
       <w:pPr/>
       <w:r>
-        <w:t xml:space="preserve">14. OTPVerifyView gọi </w:t>
+        <w:t xml:space="preserve">* Lớp OTPVerifyView gọi hàm </w:t>
       </w:r>
       <w:r>
         <w:rPr>
@@ -6547,13 +5943,13 @@
         <w:t>saveUser()</w:t>
       </w:r>
       <w:r>
-        <w:t xml:space="preserve"> của User để hoàn tất đăng ký.</w:t>
+        <w:t xml:space="preserve"> của đối tượng User để hoàn tất đăng ký.</w:t>
       </w:r>
     </w:p>
     <w:p>
       <w:pPr/>
       <w:r>
-        <w:t>15. Hiển thị "Đăng ký thành công! Chào mừng Nguyễn Thị Bình."</w:t>
+        <w:t>* Lớp OTPVerifyView hiển thị "Đăng ký thành công! Chào mừng Nguyễn Thị Bình."</w:t>
       </w:r>
     </w:p>
     <w:p>
@@ -6566,29 +5962,15 @@
       </w:r>
     </w:p>
     <w:p>
-      <w:pPr>
-        <w:pStyle w:val="ListBullet"/>
-      </w:pPr>
-      <w:r>
-        <w:t xml:space="preserve">User trả về false từ </w:t>
-      </w:r>
-      <w:r>
-        <w:rPr>
-          <w:rFonts w:ascii="Courier New" w:hAnsi="Courier New"/>
-          <w:sz w:val="20"/>
-        </w:rPr>
-        <w:t>existsBySDT()</w:t>
-      </w:r>
-      <w:r>
-        <w:t>.</w:t>
-      </w:r>
-    </w:p>
-    <w:p>
-      <w:pPr>
-        <w:pStyle w:val="ListBullet"/>
-      </w:pPr>
-      <w:r>
-        <w:t>RegisterView hiển thị "SĐT này đã được sử dụng."</w:t>
+      <w:pPr/>
+      <w:r>
+        <w:t>* Lớp User trả về SĐT đã tồn tại.</w:t>
+      </w:r>
+    </w:p>
+    <w:p>
+      <w:pPr/>
+      <w:r>
+        <w:t>* Lớp RegisterView hiển thị "SĐT này đã được sử dụng."</w:t>
       </w:r>
     </w:p>
     <w:p>
@@ -6601,29 +5983,15 @@
       </w:r>
     </w:p>
     <w:p>
-      <w:pPr>
-        <w:pStyle w:val="ListBullet"/>
-      </w:pPr>
-      <w:r>
-        <w:t xml:space="preserve">OTP trả về false từ </w:t>
-      </w:r>
-      <w:r>
-        <w:rPr>
-          <w:rFonts w:ascii="Courier New" w:hAnsi="Courier New"/>
-          <w:sz w:val="20"/>
-        </w:rPr>
-        <w:t>verify()</w:t>
-      </w:r>
-      <w:r>
-        <w:t>.</w:t>
-      </w:r>
-    </w:p>
-    <w:p>
-      <w:pPr>
-        <w:pStyle w:val="ListBullet"/>
-      </w:pPr>
-      <w:r>
-        <w:t>OTPVerifyView hiển thị "Mã OTP không đúng. Vui lòng thử lại."</w:t>
+      <w:pPr/>
+      <w:r>
+        <w:t>* Lớp OTP trả về mã không hợp lệ.</w:t>
+      </w:r>
+    </w:p>
+    <w:p>
+      <w:pPr/>
+      <w:r>
+        <w:t>* Lớp OTPVerifyView hiển thị "Mã OTP không đúng. Vui lòng thử lại."</w:t>
       </w:r>
     </w:p>
     <w:p>
@@ -6641,7 +6009,7 @@
       <w:r>
         <w:drawing>
           <wp:inline xmlns:a="http://schemas.openxmlformats.org/drawingml/2006/main" xmlns:pic="http://schemas.openxmlformats.org/drawingml/2006/picture">
-            <wp:extent cx="5486400" cy="3292939"/>
+            <wp:extent cx="5486400" cy="3325924"/>
             <wp:docPr id="10" name="Picture 10"/>
             <wp:cNvGraphicFramePr>
               <a:graphicFrameLocks noChangeAspect="1"/>
@@ -6662,7 +6030,7 @@
                   <pic:spPr>
                     <a:xfrm>
                       <a:off x="0" y="0"/>
-                      <a:ext cx="5486400" cy="3292939"/>
+                      <a:ext cx="5486400" cy="3325924"/>
                     </a:xfrm>
                     <a:prstGeom prst="rect"/>
                   </pic:spPr>
@@ -6691,111 +6059,111 @@
     <w:p>
       <w:pPr/>
       <w:r>
-        <w:t>1. Người dùng truy cập mục "Bảo mật" trong cài đặt tài khoản.</w:t>
+        <w:t>* Người dùng truy cập mục "Bảo mật" trong cài đặt.</w:t>
       </w:r>
     </w:p>
     <w:p>
       <w:pPr/>
       <w:r>
-        <w:t>2. Lớp ChangePasswordView hiển thị form: MK hiện tại, MK mới, Xác nhận MK mới.</w:t>
+        <w:t>* Lớp ChangePasswordView hiển thị form gồm: Mật khẩu hiện tại, Mật khẩu mới, Xác nhận mật khẩu mới.</w:t>
       </w:r>
     </w:p>
     <w:p>
       <w:pPr/>
       <w:r>
-        <w:t>3. Người dùng nhập: MK hiện tại = "Abc@1234", MK mới = "NewPass@2025", xác nhận = "NewPass@2025".</w:t>
+        <w:t>* Người dùng nhập Mật khẩu hiện tại = "Abc@1234", Mật khẩu mới = "NewPass@2025", Xác nhận = "NewPass@2025".</w:t>
       </w:r>
     </w:p>
     <w:p>
       <w:pPr/>
       <w:r>
-        <w:t>4. Người dùng nhấn [Lưu thay đổi].</w:t>
+        <w:t>* Người dùng nhấn nút [Lưu thay đổi].</w:t>
       </w:r>
     </w:p>
     <w:p>
       <w:pPr/>
       <w:r>
-        <w:t xml:space="preserve">5. ChangePasswordView gọi </w:t>
+        <w:t xml:space="preserve">* Lớp ChangePasswordView gọi hàm </w:t>
       </w:r>
       <w:r>
         <w:rPr>
           <w:rFonts w:ascii="Courier New" w:hAnsi="Courier New"/>
           <w:sz w:val="20"/>
         </w:rPr>
-        <w:t>changePassword(mkHienTai, mkMoi)</w:t>
-      </w:r>
-      <w:r>
-        <w:t xml:space="preserve"> của User.</w:t>
+        <w:t>changePassword()</w:t>
+      </w:r>
+      <w:r>
+        <w:t xml:space="preserve"> của đối tượng User.</w:t>
       </w:r>
     </w:p>
     <w:p>
       <w:pPr/>
       <w:r>
-        <w:t xml:space="preserve">6. User tìm thông tin người dùng bằng </w:t>
+        <w:t xml:space="preserve">* Lớp User gọi hàm </w:t>
       </w:r>
       <w:r>
         <w:rPr>
           <w:rFonts w:ascii="Courier New" w:hAnsi="Courier New"/>
           <w:sz w:val="20"/>
         </w:rPr>
-        <w:t>findByToken(session)</w:t>
-      </w:r>
-      <w:r>
-        <w:t>.</w:t>
+        <w:t>findBySessionToken()</w:t>
+      </w:r>
+      <w:r>
+        <w:t xml:space="preserve"> để tìm thông tin người dùng.</w:t>
       </w:r>
     </w:p>
     <w:p>
       <w:pPr/>
       <w:r>
-        <w:t xml:space="preserve">7. User xác minh MK hiện tại khớp CSDL bằng </w:t>
+        <w:t xml:space="preserve">* Lớp User gọi hàm </w:t>
       </w:r>
       <w:r>
         <w:rPr>
           <w:rFonts w:ascii="Courier New" w:hAnsi="Courier New"/>
           <w:sz w:val="20"/>
         </w:rPr>
-        <w:t>checkPassword(mkHienTai, hash)</w:t>
-      </w:r>
-      <w:r>
-        <w:t>.</w:t>
+        <w:t>verifyPassword()</w:t>
+      </w:r>
+      <w:r>
+        <w:t xml:space="preserve"> để xác minh mật khẩu hiện tại.</w:t>
       </w:r>
     </w:p>
     <w:p>
       <w:pPr/>
       <w:r>
-        <w:t xml:space="preserve">8. User mã hóa MK mới bằng </w:t>
+        <w:t xml:space="preserve">* Lớp User gọi hàm </w:t>
       </w:r>
       <w:r>
         <w:rPr>
           <w:rFonts w:ascii="Courier New" w:hAnsi="Courier New"/>
           <w:sz w:val="20"/>
         </w:rPr>
-        <w:t>hashPassword(mkMoi)</w:t>
-      </w:r>
-      <w:r>
-        <w:t>.</w:t>
+        <w:t>hashPassword()</w:t>
+      </w:r>
+      <w:r>
+        <w:t xml:space="preserve"> để mã hóa mật khẩu mới.</w:t>
       </w:r>
     </w:p>
     <w:p>
       <w:pPr/>
       <w:r>
-        <w:t xml:space="preserve">9. User cập nhật mật khẩu bằng </w:t>
+        <w:t xml:space="preserve">* Lớp User gọi hàm </w:t>
       </w:r>
       <w:r>
         <w:rPr>
           <w:rFonts w:ascii="Courier New" w:hAnsi="Courier New"/>
           <w:sz w:val="20"/>
         </w:rPr>
-        <w:t>updatePassword(hash)</w:t>
-      </w:r>
-      <w:r>
-        <w:t>.</w:t>
+        <w:t>updatePassword()</w:t>
+      </w:r>
+      <w:r>
+        <w:t xml:space="preserve"> để cập nhật mật khẩu.</w:t>
       </w:r>
     </w:p>
     <w:p>
       <w:pPr/>
       <w:r>
-        <w:t xml:space="preserve">10. User thu hồi tất cả session bằng </w:t>
+        <w:t xml:space="preserve">* Lớp User gọi hàm </w:t>
       </w:r>
       <w:r>
         <w:rPr>
@@ -6805,13 +6173,19 @@
         <w:t>revokeAllSessions()</w:t>
       </w:r>
       <w:r>
-        <w:t>.</w:t>
+        <w:t xml:space="preserve"> để thu hồi tất cả session.</w:t>
       </w:r>
     </w:p>
     <w:p>
       <w:pPr/>
       <w:r>
-        <w:t>11. ChangePasswordView hiển thị "Đổi mật khẩu thành công. Vui lòng đăng nhập lại."</w:t>
+        <w:t>* Lớp User trả kết quả về cho ChangePasswordView.</w:t>
+      </w:r>
+    </w:p>
+    <w:p>
+      <w:pPr/>
+      <w:r>
+        <w:t>* Lớp ChangePasswordView hiển thị "Đổi mật khẩu thành công. Vui lòng đăng nhập lại."</w:t>
       </w:r>
     </w:p>
     <w:p>
@@ -6824,29 +6198,15 @@
       </w:r>
     </w:p>
     <w:p>
-      <w:pPr>
-        <w:pStyle w:val="ListBullet"/>
-      </w:pPr>
-      <w:r>
-        <w:t xml:space="preserve">User trả về false từ </w:t>
-      </w:r>
-      <w:r>
-        <w:rPr>
-          <w:rFonts w:ascii="Courier New" w:hAnsi="Courier New"/>
-          <w:sz w:val="20"/>
-        </w:rPr>
-        <w:t>checkPassword()</w:t>
-      </w:r>
-      <w:r>
-        <w:t>.</w:t>
-      </w:r>
-    </w:p>
-    <w:p>
-      <w:pPr>
-        <w:pStyle w:val="ListBullet"/>
-      </w:pPr>
-      <w:r>
-        <w:t>ChangePasswordView hiển thị "Mật khẩu hiện tại không chính xác."</w:t>
+      <w:pPr/>
+      <w:r>
+        <w:t>* Lớp User trả về mật khẩu không khớp.</w:t>
+      </w:r>
+    </w:p>
+    <w:p>
+      <w:pPr/>
+      <w:r>
+        <w:t>* Lớp ChangePasswordView hiển thị "Mật khẩu hiện tại không chính xác."</w:t>
       </w:r>
     </w:p>
     <w:p>
@@ -6859,19 +6219,15 @@
       </w:r>
     </w:p>
     <w:p>
-      <w:pPr>
-        <w:pStyle w:val="ListBullet"/>
-      </w:pPr>
-      <w:r>
-        <w:t>User trả về lỗi validation.</w:t>
-      </w:r>
-    </w:p>
-    <w:p>
-      <w:pPr>
-        <w:pStyle w:val="ListBullet"/>
-      </w:pPr>
-      <w:r>
-        <w:t>ChangePasswordView highlight ô và hiển thị yêu cầu còn thiếu.</w:t>
+      <w:pPr/>
+      <w:r>
+        <w:t>* Lớp User trả về lỗi validation.</w:t>
+      </w:r>
+    </w:p>
+    <w:p>
+      <w:pPr/>
+      <w:r>
+        <w:t>* Lớp ChangePasswordView highlight ô và hiển thị yêu cầu còn thiếu.</w:t>
       </w:r>
     </w:p>
     <w:p>
@@ -6933,101 +6289,101 @@
         <w:rPr>
           <w:b/>
         </w:rPr>
-        <w:t>Kịch bản phiên bản 2 – UC04 Quản lý TTCN</w:t>
+        <w:t>Kịch bản phiên bản 2 – UC04 Quản lý thông tin cá nhân</w:t>
       </w:r>
     </w:p>
     <w:p>
       <w:pPr/>
       <w:r>
-        <w:t>1. Khách hàng nhấn vào ảnh đại diện / tên tài khoản ở góc trên phải.</w:t>
+        <w:t>* Khách hàng nhấn vào ảnh đại diện / tên tài khoản.</w:t>
       </w:r>
     </w:p>
     <w:p>
       <w:pPr/>
       <w:r>
-        <w:t xml:space="preserve">2. ProfileView gọi </w:t>
+        <w:t xml:space="preserve">* Lớp ProfileView gọi hàm </w:t>
       </w:r>
       <w:r>
         <w:rPr>
           <w:rFonts w:ascii="Courier New" w:hAnsi="Courier New"/>
           <w:sz w:val="20"/>
         </w:rPr>
-        <w:t>getProfile(userId)</w:t>
-      </w:r>
-      <w:r>
-        <w:t xml:space="preserve"> của User.</w:t>
+        <w:t>getProfile()</w:t>
+      </w:r>
+      <w:r>
+        <w:t xml:space="preserve"> của đối tượng User.</w:t>
       </w:r>
     </w:p>
     <w:p>
       <w:pPr/>
       <w:r>
-        <w:t xml:space="preserve">3. User tìm thông tin bằng </w:t>
+        <w:t xml:space="preserve">* Lớp User gọi hàm </w:t>
       </w:r>
       <w:r>
         <w:rPr>
           <w:rFonts w:ascii="Courier New" w:hAnsi="Courier New"/>
           <w:sz w:val="20"/>
         </w:rPr>
-        <w:t>findById(userId)</w:t>
-      </w:r>
-      <w:r>
-        <w:t>.</w:t>
+        <w:t>findById()</w:t>
+      </w:r>
+      <w:r>
+        <w:t xml:space="preserve"> để tìm thông tin người dùng.</w:t>
       </w:r>
     </w:p>
     <w:p>
       <w:pPr/>
       <w:r>
-        <w:t>4. User trả về đối tượng User cho ProfileView.</w:t>
+        <w:t>* Lớp User trả kết quả về cho ProfileView.</w:t>
       </w:r>
     </w:p>
     <w:p>
       <w:pPr/>
       <w:r>
-        <w:t>5. ProfileView hiển thị: Họ tên, SĐT, Email, Hạng hội viên, Điểm tích lũy.</w:t>
+        <w:t>* Lớp ProfileView hiển thị hồ sơ: Họ tên, SĐT, Email, Hạng hội viên, Điểm tích lũy.</w:t>
       </w:r>
     </w:p>
     <w:p>
       <w:pPr/>
       <w:r>
-        <w:t>6. Khách hàng nhấn [Chỉnh sửa thông tin], cập nhật họ tên và email, nhấn [Lưu].</w:t>
+        <w:t>* Khách hàng nhấn nút [Chỉnh sửa thông tin], cập nhật Họ tên = "Nguyễn Văn An" và Email = "vanan@newemail.com", nhấn nút [Lưu].</w:t>
       </w:r>
     </w:p>
     <w:p>
       <w:pPr/>
       <w:r>
-        <w:t xml:space="preserve">7. ProfileView gọi </w:t>
+        <w:t xml:space="preserve">* Lớp ProfileView gọi hàm </w:t>
       </w:r>
       <w:r>
         <w:rPr>
           <w:rFonts w:ascii="Courier New" w:hAnsi="Courier New"/>
           <w:sz w:val="20"/>
         </w:rPr>
-        <w:t>updateProfile(userId, hoTen, email)</w:t>
-      </w:r>
-      <w:r>
-        <w:t xml:space="preserve"> của User.</w:t>
+        <w:t>updateProfile()</w:t>
+      </w:r>
+      <w:r>
+        <w:t xml:space="preserve"> của đối tượng User.</w:t>
       </w:r>
     </w:p>
     <w:p>
       <w:pPr/>
       <w:r>
-        <w:t xml:space="preserve">8. User kiểm tra email hợp lệ bằng </w:t>
+        <w:t xml:space="preserve">* Lớp User gọi hàm </w:t>
       </w:r>
       <w:r>
         <w:rPr>
           <w:rFonts w:ascii="Courier New" w:hAnsi="Courier New"/>
           <w:sz w:val="20"/>
         </w:rPr>
-        <w:t>checkEmail(email)</w:t>
-      </w:r>
-      <w:r>
-        <w:t>.</w:t>
+        <w:t>checkEmail()</w:t>
+      </w:r>
+      <w:r>
+        <w:t xml:space="preserve"> để kiểm tra email hợp lệ và chưa được dùng.</w:t>
       </w:r>
     </w:p>
     <w:p>
       <w:pPr/>
       <w:r>
-        <w:t xml:space="preserve">9. User cập nhật thông tin bằng </w:t>
+        <w:t xml:space="preserve">* Lớp User gọi hàm </w:t>
       </w:r>
       <w:r>
         <w:rPr>
@@ -7037,13 +6393,19 @@
         <w:t>update()</w:t>
       </w:r>
       <w:r>
-        <w:t>.</w:t>
+        <w:t xml:space="preserve"> để cập nhật thông tin.</w:t>
       </w:r>
     </w:p>
     <w:p>
       <w:pPr/>
       <w:r>
-        <w:t>10. ProfileView hiển thị "Cập nhật thành công!"</w:t>
+        <w:t>* Lớp User trả kết quả về cho ProfileView.</w:t>
+      </w:r>
+    </w:p>
+    <w:p>
+      <w:pPr/>
+      <w:r>
+        <w:t>* Lớp ProfileView hiển thị "Cập nhật thành công!"</w:t>
       </w:r>
     </w:p>
     <w:p>
@@ -7056,29 +6418,15 @@
       </w:r>
     </w:p>
     <w:p>
-      <w:pPr>
-        <w:pStyle w:val="ListBullet"/>
-      </w:pPr>
-      <w:r>
-        <w:t xml:space="preserve">User trả về false từ </w:t>
-      </w:r>
-      <w:r>
-        <w:rPr>
-          <w:rFonts w:ascii="Courier New" w:hAnsi="Courier New"/>
-          <w:sz w:val="20"/>
-        </w:rPr>
-        <w:t>checkEmail()</w:t>
-      </w:r>
-      <w:r>
-        <w:t>.</w:t>
-      </w:r>
-    </w:p>
-    <w:p>
-      <w:pPr>
-        <w:pStyle w:val="ListBullet"/>
-      </w:pPr>
-      <w:r>
-        <w:t>ProfileView hiển thị "Email này đã được đăng ký bởi tài khoản khác."</w:t>
+      <w:pPr/>
+      <w:r>
+        <w:t>* Lớp User trả về email đã tồn tại.</w:t>
+      </w:r>
+    </w:p>
+    <w:p>
+      <w:pPr/>
+      <w:r>
+        <w:t>* Lớp ProfileView hiển thị "Email này đã được đăng ký bởi tài khoản khác."</w:t>
       </w:r>
     </w:p>
     <w:p>
@@ -7146,13 +6494,13 @@
     <w:p>
       <w:pPr/>
       <w:r>
-        <w:t>1. Admin truy cập "Quản lý nhân viên" từ trang quản trị.</w:t>
+        <w:t>* Admin truy cập "Quản lý nhân viên" từ trang quản trị.</w:t>
       </w:r>
     </w:p>
     <w:p>
       <w:pPr/>
       <w:r>
-        <w:t xml:space="preserve">2. StaffManageView gọi </w:t>
+        <w:t xml:space="preserve">* Lớp StaffManageView gọi hàm </w:t>
       </w:r>
       <w:r>
         <w:rPr>
@@ -7162,13 +6510,13 @@
         <w:t>getAllStaff()</w:t>
       </w:r>
       <w:r>
-        <w:t xml:space="preserve"> của Employee.</w:t>
+        <w:t xml:space="preserve"> của đối tượng Employee.</w:t>
       </w:r>
     </w:p>
     <w:p>
       <w:pPr/>
       <w:r>
-        <w:t xml:space="preserve">3. Employee tải danh sách bằng </w:t>
+        <w:t xml:space="preserve">* Lớp Employee gọi hàm </w:t>
       </w:r>
       <w:r>
         <w:rPr>
@@ -7178,47 +6526,47 @@
         <w:t>findAll()</w:t>
       </w:r>
       <w:r>
-        <w:t>.</w:t>
+        <w:t xml:space="preserve"> để tải danh sách nhân viên.</w:t>
       </w:r>
     </w:p>
     <w:p>
       <w:pPr/>
       <w:r>
-        <w:t>4. Employee trả về danh sách nhân viên cho StaffManageView.</w:t>
+        <w:t>* Lớp Employee trả kết quả về cho StaffManageView.</w:t>
       </w:r>
     </w:p>
     <w:p>
       <w:pPr/>
       <w:r>
-        <w:t>5. StaffManageView hiển thị bảng: họ tên, vai trò, trạng thái.</w:t>
+        <w:t>* Lớp StaffManageView hiển thị bảng danh sách nhân viên.</w:t>
       </w:r>
     </w:p>
     <w:p>
       <w:pPr/>
       <w:r>
-        <w:t>6. Admin nhấn [Thêm nhân viên], nhập thông tin, nhấn [Lưu].</w:t>
+        <w:t>* Admin nhấn nút [Thêm], nhập Họ tên = "Trần Văn A" và Vai trò = "Lễ tân", nhấn nút [Lưu].</w:t>
       </w:r>
     </w:p>
     <w:p>
       <w:pPr/>
       <w:r>
-        <w:t xml:space="preserve">7. StaffManageView gọi </w:t>
+        <w:t xml:space="preserve">* Lớp StaffManageView gọi hàm </w:t>
       </w:r>
       <w:r>
         <w:rPr>
           <w:rFonts w:ascii="Courier New" w:hAnsi="Courier New"/>
           <w:sz w:val="20"/>
         </w:rPr>
-        <w:t>addStaff(hoTen, vaiTro)</w:t>
-      </w:r>
-      <w:r>
-        <w:t xml:space="preserve"> của Employee.</w:t>
+        <w:t>addStaff()</w:t>
+      </w:r>
+      <w:r>
+        <w:t xml:space="preserve"> của đối tượng Employee.</w:t>
       </w:r>
     </w:p>
     <w:p>
       <w:pPr/>
       <w:r>
-        <w:t xml:space="preserve">8. Employee lưu bằng </w:t>
+        <w:t xml:space="preserve">* Lớp Employee gọi hàm </w:t>
       </w:r>
       <w:r>
         <w:rPr>
@@ -7228,13 +6576,19 @@
         <w:t>save()</w:t>
       </w:r>
       <w:r>
-        <w:t>.</w:t>
+        <w:t xml:space="preserve"> để lưu nhân viên mới.</w:t>
       </w:r>
     </w:p>
     <w:p>
       <w:pPr/>
       <w:r>
-        <w:t>9. StaffManageView hiển thị "Thêm nhân viên thành công!"</w:t>
+        <w:t>* Lớp Employee trả kết quả về cho StaffManageView.</w:t>
+      </w:r>
+    </w:p>
+    <w:p>
+      <w:pPr/>
+      <w:r>
+        <w:t>* Lớp StaffManageView hiển thị "Thêm nhân viên thành công!"</w:t>
       </w:r>
     </w:p>
     <w:p>
@@ -7247,19 +6601,15 @@
       </w:r>
     </w:p>
     <w:p>
-      <w:pPr>
-        <w:pStyle w:val="ListBullet"/>
-      </w:pPr>
-      <w:r>
-        <w:t>Employee trả về lỗi trùng SĐT.</w:t>
-      </w:r>
-    </w:p>
-    <w:p>
-      <w:pPr>
-        <w:pStyle w:val="ListBullet"/>
-      </w:pPr>
-      <w:r>
-        <w:t>StaffManageView hiển thị "SĐT này đã được sử dụng."</w:t>
+      <w:pPr/>
+      <w:r>
+        <w:t>* Lớp Employee trả về lỗi trùng SĐT.</w:t>
+      </w:r>
+    </w:p>
+    <w:p>
+      <w:pPr/>
+      <w:r>
+        <w:t>* Lớp StaffManageView hiển thị "SĐT này đã được sử dụng."</w:t>
       </w:r>
     </w:p>
     <w:p>
@@ -7272,19 +6622,15 @@
       </w:r>
     </w:p>
     <w:p>
-      <w:pPr>
-        <w:pStyle w:val="ListBullet"/>
-      </w:pPr>
-      <w:r>
-        <w:t>Employee trả về lỗi không thể xóa.</w:t>
-      </w:r>
-    </w:p>
-    <w:p>
-      <w:pPr>
-        <w:pStyle w:val="ListBullet"/>
-      </w:pPr>
-      <w:r>
-        <w:t>StaffManageView hiển thị cảnh báo "Nhân viên đang xử lý order, không thể xóa."</w:t>
+      <w:pPr/>
+      <w:r>
+        <w:t>* Lớp Employee trả về lỗi không thể xóa.</w:t>
+      </w:r>
+    </w:p>
+    <w:p>
+      <w:pPr/>
+      <w:r>
+        <w:t>* Lớp StaffManageView hiển thị cảnh báo "Nhân viên đang xử lý order, không thể xóa."</w:t>
       </w:r>
     </w:p>
     <w:p/>
@@ -9726,7 +9072,7 @@
       <w:r>
         <w:drawing>
           <wp:inline xmlns:a="http://schemas.openxmlformats.org/drawingml/2006/main" xmlns:pic="http://schemas.openxmlformats.org/drawingml/2006/picture">
-            <wp:extent cx="5486400" cy="2940316"/>
+            <wp:extent cx="5486400" cy="3448594"/>
             <wp:docPr id="16" name="Picture 16"/>
             <wp:cNvGraphicFramePr>
               <a:graphicFrameLocks noChangeAspect="1"/>
@@ -9747,7 +9093,7 @@
                   <pic:spPr>
                     <a:xfrm>
                       <a:off x="0" y="0"/>
-                      <a:ext cx="5486400" cy="2940316"/>
+                      <a:ext cx="5486400" cy="3448594"/>
                     </a:xfrm>
                     <a:prstGeom prst="rect"/>
                   </pic:spPr>
@@ -9802,7 +9148,7 @@
         <w:t>formLoad()</w:t>
       </w:r>
       <w:r>
-        <w:t xml:space="preserve"> của lớp LoginPage được gọi, hiển thị form gồm ô nhập SĐT/Email, ô nhập Mật khẩu, nút [Đăng nhập], liên kết "Quên mật khẩu?" / "Đăng ký".</w:t>
+        <w:t xml:space="preserve"> của lớp LoginPage được gọi, hiển thị form gồm ô nhập SĐT, ô nhập Mật khẩu, nút [Đăng nhập].</w:t>
       </w:r>
     </w:p>
     <w:p>
@@ -9853,7 +9199,7 @@
           <w:rFonts w:ascii="Courier New" w:hAnsi="Courier New"/>
           <w:sz w:val="20"/>
         </w:rPr>
-        <w:t>checkLogin(username : String, password : String) : boolean</w:t>
+        <w:t>checkLogin(sdt : String, matKhau : String) : boolean</w:t>
       </w:r>
       <w:r>
         <w:t xml:space="preserve"> của lớp AuthController.</w:t>
@@ -9879,7 +9225,7 @@
           <w:rFonts w:ascii="Courier New" w:hAnsi="Courier New"/>
           <w:sz w:val="20"/>
         </w:rPr>
-        <w:t>findBySDT(username : String) : User</w:t>
+        <w:t>findBySDT(sdt : String) : User</w:t>
       </w:r>
       <w:r>
         <w:t xml:space="preserve"> của lớp User.</w:t>
@@ -9921,7 +9267,7 @@
           <w:rFonts w:ascii="Courier New" w:hAnsi="Courier New"/>
           <w:sz w:val="20"/>
         </w:rPr>
-        <w:t>checkPassword(password : String, hash : String) : boolean</w:t>
+        <w:t>checkPassword(matKhau : String, hash : String) : boolean</w:t>
       </w:r>
       <w:r>
         <w:t xml:space="preserve"> để so sánh mật khẩu.</w:t>
@@ -9986,7 +9332,7 @@
         <w:t>redirect /home</w:t>
       </w:r>
       <w:r>
-        <w:t>, hiển thị showMessage("Đăng nhập thành công. Xin chào, Nguyễn Văn A!").</w:t>
+        <w:t>, hiển thị showMessage("Đăng nhập thành công").</w:t>
       </w:r>
     </w:p>
     <w:p>
@@ -10170,7 +9516,7 @@
       <w:r>
         <w:drawing>
           <wp:inline xmlns:a="http://schemas.openxmlformats.org/drawingml/2006/main" xmlns:pic="http://schemas.openxmlformats.org/drawingml/2006/picture">
-            <wp:extent cx="5486400" cy="4170604"/>
+            <wp:extent cx="5486400" cy="3695847"/>
             <wp:docPr id="17" name="Picture 17"/>
             <wp:cNvGraphicFramePr>
               <a:graphicFrameLocks noChangeAspect="1"/>
@@ -10191,7 +9537,7 @@
                   <pic:spPr>
                     <a:xfrm>
                       <a:off x="0" y="0"/>
-                      <a:ext cx="5486400" cy="4170604"/>
+                      <a:ext cx="5486400" cy="3695847"/>
                     </a:xfrm>
                     <a:prstGeom prst="rect"/>
                   </pic:spPr>
@@ -10246,13 +9592,13 @@
         <w:t>formLoad()</w:t>
       </w:r>
       <w:r>
-        <w:t xml:space="preserve"> của lớp RegisterPage được gọi, hiển thị form gồm: Họ tên, SĐT, Email, Mật khẩu, Xác nhận MK.</w:t>
+        <w:t xml:space="preserve"> của lớp RegisterPage được gọi, hiển thị form gồm ô nhập Họ tên, ô nhập SĐT, ô nhập Email, ô nhập Mật khẩu, ô nhập Xác nhận MK, nút [Tiếp tục].</w:t>
       </w:r>
     </w:p>
     <w:p>
       <w:pPr/>
       <w:r>
-        <w:t>3. Khách hàng nhập: Họ tên = "Nguyễn Thị Bình", SĐT = "0987654321", Email = "binh.nt@email.com", MK = "Pass@2025".</w:t>
+        <w:t>3. Khách hàng nhập Họ tên = "Nguyễn Thị Bình", SĐT = "0987654321", Email = "binh.nt@email.com", Mật khẩu = "Pass@2025".</w:t>
       </w:r>
     </w:p>
     <w:p>
@@ -10316,7 +9662,7 @@
         <w:t>register()</w:t>
       </w:r>
       <w:r>
-        <w:t xml:space="preserve"> gọi </w:t>
+        <w:t xml:space="preserve"> gọi phương thức </w:t>
       </w:r>
       <w:r>
         <w:rPr>
@@ -10326,13 +9672,13 @@
         <w:t>existsBySDT(sdt : String) : boolean</w:t>
       </w:r>
       <w:r>
-        <w:t xml:space="preserve"> của lớp User để kiểm tra SĐT.</w:t>
+        <w:t xml:space="preserve"> của lớp User.</w:t>
       </w:r>
     </w:p>
     <w:p>
       <w:pPr/>
       <w:r>
-        <w:t xml:space="preserve">8. User trả về </w:t>
+        <w:t xml:space="preserve">8. Lớp User trả về </w:t>
       </w:r>
       <w:r>
         <w:rPr>
@@ -10342,13 +9688,7 @@
         <w:t>false</w:t>
       </w:r>
       <w:r>
-        <w:t xml:space="preserve"> (SĐT chưa tồn tại).</w:t>
-      </w:r>
-    </w:p>
-    <w:p>
-      <w:pPr/>
-      <w:r>
-        <w:t xml:space="preserve">9. Phương thức </w:t>
+        <w:t xml:space="preserve"> cho phương thức </w:t>
       </w:r>
       <w:r>
         <w:rPr>
@@ -10358,7 +9698,23 @@
         <w:t>register()</w:t>
       </w:r>
       <w:r>
-        <w:t xml:space="preserve"> gọi </w:t>
+        <w:t>.</w:t>
+      </w:r>
+    </w:p>
+    <w:p>
+      <w:pPr/>
+      <w:r>
+        <w:t xml:space="preserve">9. Phương thức </w:t>
+      </w:r>
+      <w:r>
+        <w:rPr>
+          <w:rFonts w:ascii="Courier New" w:hAnsi="Courier New"/>
+          <w:sz w:val="20"/>
+        </w:rPr>
+        <w:t>register()</w:t>
+      </w:r>
+      <w:r>
+        <w:t xml:space="preserve"> gọi phương thức </w:t>
       </w:r>
       <w:r>
         <w:rPr>
@@ -10368,13 +9724,13 @@
         <w:t>existsByEmail(email : String) : boolean</w:t>
       </w:r>
       <w:r>
-        <w:t xml:space="preserve"> của lớp User để kiểm tra email.</w:t>
+        <w:t xml:space="preserve"> của lớp User.</w:t>
       </w:r>
     </w:p>
     <w:p>
       <w:pPr/>
       <w:r>
-        <w:t xml:space="preserve">10. User trả về </w:t>
+        <w:t xml:space="preserve">10. Lớp User trả về </w:t>
       </w:r>
       <w:r>
         <w:rPr>
@@ -10384,13 +9740,7 @@
         <w:t>false</w:t>
       </w:r>
       <w:r>
-        <w:t xml:space="preserve"> (email chưa tồn tại).</w:t>
-      </w:r>
-    </w:p>
-    <w:p>
-      <w:pPr/>
-      <w:r>
-        <w:t xml:space="preserve">11. Phương thức </w:t>
+        <w:t xml:space="preserve"> cho phương thức </w:t>
       </w:r>
       <w:r>
         <w:rPr>
@@ -10400,6 +9750,22 @@
         <w:t>register()</w:t>
       </w:r>
       <w:r>
+        <w:t>.</w:t>
+      </w:r>
+    </w:p>
+    <w:p>
+      <w:pPr/>
+      <w:r>
+        <w:t xml:space="preserve">11. Phương thức </w:t>
+      </w:r>
+      <w:r>
+        <w:rPr>
+          <w:rFonts w:ascii="Courier New" w:hAnsi="Courier New"/>
+          <w:sz w:val="20"/>
+        </w:rPr>
+        <w:t>register()</w:t>
+      </w:r>
+      <w:r>
         <w:t xml:space="preserve"> gọi </w:t>
       </w:r>
       <w:r>
@@ -10442,7 +9808,7 @@
     <w:p>
       <w:pPr/>
       <w:r>
-        <w:t>13. OTP gửi mã OTP 6 chữ số đến SĐT.</w:t>
+        <w:t>13. Lớp OTP gửi mã OTP 6 chữ số đến SĐT.</w:t>
       </w:r>
     </w:p>
     <w:p>
@@ -10458,7 +9824,7 @@
         <w:t>register()</w:t>
       </w:r>
       <w:r>
-        <w:t xml:space="preserve"> trả về đối tượng User cho </w:t>
+        <w:t xml:space="preserve"> trả về đối tượng User cho phương thức </w:t>
       </w:r>
       <w:r>
         <w:rPr>
@@ -10480,13 +9846,19 @@
     <w:p>
       <w:pPr/>
       <w:r>
-        <w:t>16. Khách hàng nhập OTP = "482917" và click [Xác nhận].</w:t>
+        <w:t>16. Khách hàng nhập OTP = "482917".</w:t>
       </w:r>
     </w:p>
     <w:p>
       <w:pPr/>
       <w:r>
-        <w:t xml:space="preserve">17. Phương thức </w:t>
+        <w:t>17. Khách hàng click nút [Xác nhận].</w:t>
+      </w:r>
+    </w:p>
+    <w:p>
+      <w:pPr/>
+      <w:r>
+        <w:t xml:space="preserve">18. Phương thức </w:t>
       </w:r>
       <w:r>
         <w:rPr>
@@ -10502,7 +9874,17 @@
     <w:p>
       <w:pPr/>
       <w:r>
-        <w:t xml:space="preserve">18. OTPVerifyPage gọi </w:t>
+        <w:t xml:space="preserve">19. Phương thức </w:t>
+      </w:r>
+      <w:r>
+        <w:rPr>
+          <w:rFonts w:ascii="Courier New" w:hAnsi="Courier New"/>
+          <w:sz w:val="20"/>
+        </w:rPr>
+        <w:t>btnXacNhanClick()</w:t>
+      </w:r>
+      <w:r>
+        <w:t xml:space="preserve"> gọi phương thức </w:t>
       </w:r>
       <w:r>
         <w:rPr>
@@ -10512,13 +9894,23 @@
         <w:t>verifyOTP(otp : String) : boolean</w:t>
       </w:r>
       <w:r>
-        <w:t xml:space="preserve"> của AuthController.</w:t>
+        <w:t xml:space="preserve"> của lớp AuthController.</w:t>
       </w:r>
     </w:p>
     <w:p>
       <w:pPr/>
       <w:r>
-        <w:t xml:space="preserve">19. AuthController gọi </w:t>
+        <w:t xml:space="preserve">20. Phương thức </w:t>
+      </w:r>
+      <w:r>
+        <w:rPr>
+          <w:rFonts w:ascii="Courier New" w:hAnsi="Courier New"/>
+          <w:sz w:val="20"/>
+        </w:rPr>
+        <w:t>verifyOTP()</w:t>
+      </w:r>
+      <w:r>
+        <w:t xml:space="preserve"> gọi phương thức </w:t>
       </w:r>
       <w:r>
         <w:rPr>
@@ -10534,7 +9926,7 @@
     <w:p>
       <w:pPr/>
       <w:r>
-        <w:t xml:space="preserve">20. OTP trả về </w:t>
+        <w:t xml:space="preserve">21. Lớp OTP trả về </w:t>
       </w:r>
       <w:r>
         <w:rPr>
@@ -10544,13 +9936,33 @@
         <w:t>true</w:t>
       </w:r>
       <w:r>
+        <w:t xml:space="preserve"> cho phương thức </w:t>
+      </w:r>
+      <w:r>
+        <w:rPr>
+          <w:rFonts w:ascii="Courier New" w:hAnsi="Courier New"/>
+          <w:sz w:val="20"/>
+        </w:rPr>
+        <w:t>verifyOTP()</w:t>
+      </w:r>
+      <w:r>
         <w:t>.</w:t>
       </w:r>
     </w:p>
     <w:p>
       <w:pPr/>
       <w:r>
-        <w:t xml:space="preserve">21. AuthController trả về </w:t>
+        <w:t xml:space="preserve">22. Phương thức </w:t>
+      </w:r>
+      <w:r>
+        <w:rPr>
+          <w:rFonts w:ascii="Courier New" w:hAnsi="Courier New"/>
+          <w:sz w:val="20"/>
+        </w:rPr>
+        <w:t>verifyOTP()</w:t>
+      </w:r>
+      <w:r>
+        <w:t xml:space="preserve"> trả về </w:t>
       </w:r>
       <w:r>
         <w:rPr>
@@ -10560,13 +9972,33 @@
         <w:t>true</w:t>
       </w:r>
       <w:r>
-        <w:t xml:space="preserve"> cho OTPVerifyPage.</w:t>
+        <w:t xml:space="preserve"> cho phương thức </w:t>
+      </w:r>
+      <w:r>
+        <w:rPr>
+          <w:rFonts w:ascii="Courier New" w:hAnsi="Courier New"/>
+          <w:sz w:val="20"/>
+        </w:rPr>
+        <w:t>btnXacNhanClick()</w:t>
+      </w:r>
+      <w:r>
+        <w:t>.</w:t>
       </w:r>
     </w:p>
     <w:p>
       <w:pPr/>
       <w:r>
-        <w:t>22. OTPVerifyPage hiển thị showMessage("Đăng ký thành công! Chào mừng Nguyễn Thị Bình.")</w:t>
+        <w:t xml:space="preserve">23. Phương thức </w:t>
+      </w:r>
+      <w:r>
+        <w:rPr>
+          <w:rFonts w:ascii="Courier New" w:hAnsi="Courier New"/>
+          <w:sz w:val="20"/>
+        </w:rPr>
+        <w:t>btnXacNhanClick()</w:t>
+      </w:r>
+      <w:r>
+        <w:t xml:space="preserve"> gọi showMessage("Đăng ký thành công! Chào mừng Nguyễn Thị Bình.")</w:t>
       </w:r>
     </w:p>
     <w:p>
@@ -10611,7 +10043,27 @@
         <w:pStyle w:val="ListBullet"/>
       </w:pPr>
       <w:r>
-        <w:t>AuthController trả về lỗi cho RegisterPage.</w:t>
+        <w:t xml:space="preserve">Phương thức </w:t>
+      </w:r>
+      <w:r>
+        <w:rPr>
+          <w:rFonts w:ascii="Courier New" w:hAnsi="Courier New"/>
+          <w:sz w:val="20"/>
+        </w:rPr>
+        <w:t>register()</w:t>
+      </w:r>
+      <w:r>
+        <w:t xml:space="preserve"> trả về lỗi cho </w:t>
+      </w:r>
+      <w:r>
+        <w:rPr>
+          <w:rFonts w:ascii="Courier New" w:hAnsi="Courier New"/>
+          <w:sz w:val="20"/>
+        </w:rPr>
+        <w:t>btnTiepTucClick()</w:t>
+      </w:r>
+      <w:r>
+        <w:t>.</w:t>
       </w:r>
     </w:p>
     <w:p>
@@ -10619,7 +10071,7 @@
         <w:pStyle w:val="ListBullet"/>
       </w:pPr>
       <w:r>
-        <w:t>RegisterPage hiển thị showMessage("SĐT này đã được sử dụng.")</w:t>
+        <w:t>Lớp RegisterPage hiển thị showMessage("SĐT này đã được sử dụng.")</w:t>
       </w:r>
     </w:p>
     <w:p>
@@ -10664,7 +10116,17 @@
         <w:pStyle w:val="ListBullet"/>
       </w:pPr>
       <w:r>
-        <w:t xml:space="preserve">AuthController trả về </w:t>
+        <w:t xml:space="preserve">Phương thức </w:t>
+      </w:r>
+      <w:r>
+        <w:rPr>
+          <w:rFonts w:ascii="Courier New" w:hAnsi="Courier New"/>
+          <w:sz w:val="20"/>
+        </w:rPr>
+        <w:t>verifyOTP()</w:t>
+      </w:r>
+      <w:r>
+        <w:t xml:space="preserve"> trả về </w:t>
       </w:r>
       <w:r>
         <w:rPr>
@@ -10674,7 +10136,17 @@
         <w:t>false</w:t>
       </w:r>
       <w:r>
-        <w:t xml:space="preserve"> cho OTPVerifyPage.</w:t>
+        <w:t xml:space="preserve"> cho </w:t>
+      </w:r>
+      <w:r>
+        <w:rPr>
+          <w:rFonts w:ascii="Courier New" w:hAnsi="Courier New"/>
+          <w:sz w:val="20"/>
+        </w:rPr>
+        <w:t>btnXacNhanClick()</w:t>
+      </w:r>
+      <w:r>
+        <w:t>.</w:t>
       </w:r>
     </w:p>
     <w:p>
@@ -10682,7 +10154,7 @@
         <w:pStyle w:val="ListBullet"/>
       </w:pPr>
       <w:r>
-        <w:t>OTPVerifyPage hiển thị showMessage("Mã OTP không đúng. Vui lòng thử lại.")</w:t>
+        <w:t>Lớp OTPVerifyPage hiển thị showMessage("Mã OTP không đúng. Vui lòng thử lại.")</w:t>
       </w:r>
     </w:p>
     <w:p>
@@ -10700,7 +10172,7 @@
       <w:r>
         <w:drawing>
           <wp:inline xmlns:a="http://schemas.openxmlformats.org/drawingml/2006/main" xmlns:pic="http://schemas.openxmlformats.org/drawingml/2006/picture">
-            <wp:extent cx="5486400" cy="3166782"/>
+            <wp:extent cx="5486400" cy="2764190"/>
             <wp:docPr id="18" name="Picture 18"/>
             <wp:cNvGraphicFramePr>
               <a:graphicFrameLocks noChangeAspect="1"/>
@@ -10721,7 +10193,7 @@
                   <pic:spPr>
                     <a:xfrm>
                       <a:off x="0" y="0"/>
-                      <a:ext cx="5486400" cy="3166782"/>
+                      <a:ext cx="5486400" cy="2764190"/>
                     </a:xfrm>
                     <a:prstGeom prst="rect"/>
                   </pic:spPr>
@@ -10776,13 +10248,13 @@
         <w:t>formLoad()</w:t>
       </w:r>
       <w:r>
-        <w:t xml:space="preserve"> của lớp ChangePasswordPage được gọi, hiển thị form: Mật khẩu hiện tại, Mật khẩu mới, Xác nhận MK mới.</w:t>
+        <w:t xml:space="preserve"> của lớp ChangePasswordPage được gọi, hiển thị form gồm ô nhập Mật khẩu hiện tại, ô nhập Mật khẩu mới, ô nhập Xác nhận MK mới, nút [Lưu thay đổi].</w:t>
       </w:r>
     </w:p>
     <w:p>
       <w:pPr/>
       <w:r>
-        <w:t>3. Người dùng nhập: MK hiện tại = "Abc@1234", MK mới = "NewPass@2025", xác nhận = "NewPass@2025".</w:t>
+        <w:t>3. Người dùng nhập Mật khẩu hiện tại = "Abc@1234", Mật khẩu mới = "NewPass@2025", Xác nhận MK mới = "NewPass@2025".</w:t>
       </w:r>
     </w:p>
     <w:p>
@@ -10820,7 +10292,7 @@
         <w:t>btnLuuClick()</w:t>
       </w:r>
       <w:r>
-        <w:t xml:space="preserve"> gọi </w:t>
+        <w:t xml:space="preserve"> gọi phương thức </w:t>
       </w:r>
       <w:r>
         <w:rPr>
@@ -10830,7 +10302,7 @@
         <w:t>changePassword(mkHienTai : String, mkMoi : String) : boolean</w:t>
       </w:r>
       <w:r>
-        <w:t xml:space="preserve"> của AuthController.</w:t>
+        <w:t xml:space="preserve"> của lớp AuthController.</w:t>
       </w:r>
     </w:p>
     <w:p>
@@ -10846,7 +10318,7 @@
         <w:t>changePassword()</w:t>
       </w:r>
       <w:r>
-        <w:t xml:space="preserve"> gọi </w:t>
+        <w:t xml:space="preserve"> gọi phương thức </w:t>
       </w:r>
       <w:r>
         <w:rPr>
@@ -10862,7 +10334,7 @@
     <w:p>
       <w:pPr/>
       <w:r>
-        <w:t xml:space="preserve">8. User trả về đối tượng User cho </w:t>
+        <w:t xml:space="preserve">8. Lớp User trả về đối tượng User cho phương thức </w:t>
       </w:r>
       <w:r>
         <w:rPr>
@@ -10956,7 +10428,7 @@
     <w:p>
       <w:pPr/>
       <w:r>
-        <w:t xml:space="preserve">12. User trả về </w:t>
+        <w:t xml:space="preserve">12. Lớp User trả về </w:t>
       </w:r>
       <w:r>
         <w:rPr>
@@ -10966,13 +10438,7 @@
         <w:t>true</w:t>
       </w:r>
       <w:r>
-        <w:t>.</w:t>
-      </w:r>
-    </w:p>
-    <w:p>
-      <w:pPr/>
-      <w:r>
-        <w:t xml:space="preserve">13. Phương thức </w:t>
+        <w:t xml:space="preserve"> cho phương thức </w:t>
       </w:r>
       <w:r>
         <w:rPr>
@@ -10982,6 +10448,22 @@
         <w:t>changePassword()</w:t>
       </w:r>
       <w:r>
+        <w:t>.</w:t>
+      </w:r>
+    </w:p>
+    <w:p>
+      <w:pPr/>
+      <w:r>
+        <w:t xml:space="preserve">13. Phương thức </w:t>
+      </w:r>
+      <w:r>
+        <w:rPr>
+          <w:rFonts w:ascii="Courier New" w:hAnsi="Courier New"/>
+          <w:sz w:val="20"/>
+        </w:rPr>
+        <w:t>changePassword()</w:t>
+      </w:r>
+      <w:r>
         <w:t xml:space="preserve"> gọi </w:t>
       </w:r>
       <w:r>
@@ -11018,7 +10500,7 @@
         <w:t>true</w:t>
       </w:r>
       <w:r>
-        <w:t xml:space="preserve"> cho </w:t>
+        <w:t xml:space="preserve"> cho phương thức </w:t>
       </w:r>
       <w:r>
         <w:rPr>
@@ -11034,7 +10516,17 @@
     <w:p>
       <w:pPr/>
       <w:r>
-        <w:t>15. ChangePasswordPage hiển thị showMessage("Đổi mật khẩu thành công. Vui lòng đăng nhập lại.")</w:t>
+        <w:t xml:space="preserve">15. Phương thức </w:t>
+      </w:r>
+      <w:r>
+        <w:rPr>
+          <w:rFonts w:ascii="Courier New" w:hAnsi="Courier New"/>
+          <w:sz w:val="20"/>
+        </w:rPr>
+        <w:t>btnLuuClick()</w:t>
+      </w:r>
+      <w:r>
+        <w:t xml:space="preserve"> gọi showMessage("Đổi mật khẩu thành công. Vui lòng đăng nhập lại.")</w:t>
       </w:r>
     </w:p>
     <w:p>
@@ -11079,7 +10571,17 @@
         <w:pStyle w:val="ListBullet"/>
       </w:pPr>
       <w:r>
-        <w:t xml:space="preserve">AuthController trả về </w:t>
+        <w:t xml:space="preserve">Phương thức </w:t>
+      </w:r>
+      <w:r>
+        <w:rPr>
+          <w:rFonts w:ascii="Courier New" w:hAnsi="Courier New"/>
+          <w:sz w:val="20"/>
+        </w:rPr>
+        <w:t>changePassword()</w:t>
+      </w:r>
+      <w:r>
+        <w:t xml:space="preserve"> trả về </w:t>
       </w:r>
       <w:r>
         <w:rPr>
@@ -11089,7 +10591,17 @@
         <w:t>false</w:t>
       </w:r>
       <w:r>
-        <w:t xml:space="preserve"> cho ChangePasswordPage.</w:t>
+        <w:t xml:space="preserve"> cho </w:t>
+      </w:r>
+      <w:r>
+        <w:rPr>
+          <w:rFonts w:ascii="Courier New" w:hAnsi="Courier New"/>
+          <w:sz w:val="20"/>
+        </w:rPr>
+        <w:t>btnLuuClick()</w:t>
+      </w:r>
+      <w:r>
+        <w:t>.</w:t>
       </w:r>
     </w:p>
     <w:p>
@@ -11097,7 +10609,7 @@
         <w:pStyle w:val="ListBullet"/>
       </w:pPr>
       <w:r>
-        <w:t>ChangePasswordPage hiển thị showMessage("Mật khẩu hiện tại không chính xác.")</w:t>
+        <w:t>Lớp ChangePasswordPage hiển thị showMessage("Mật khẩu hiện tại không chính xác.")</w:t>
       </w:r>
     </w:p>
     <w:p>
@@ -11132,7 +10644,27 @@
         <w:pStyle w:val="ListBullet"/>
       </w:pPr>
       <w:r>
-        <w:t>AuthController trả về lỗi cho ChangePasswordPage.</w:t>
+        <w:t xml:space="preserve">Phương thức </w:t>
+      </w:r>
+      <w:r>
+        <w:rPr>
+          <w:rFonts w:ascii="Courier New" w:hAnsi="Courier New"/>
+          <w:sz w:val="20"/>
+        </w:rPr>
+        <w:t>changePassword()</w:t>
+      </w:r>
+      <w:r>
+        <w:t xml:space="preserve"> trả về lỗi cho </w:t>
+      </w:r>
+      <w:r>
+        <w:rPr>
+          <w:rFonts w:ascii="Courier New" w:hAnsi="Courier New"/>
+          <w:sz w:val="20"/>
+        </w:rPr>
+        <w:t>btnLuuClick()</w:t>
+      </w:r>
+      <w:r>
+        <w:t>.</w:t>
       </w:r>
     </w:p>
     <w:p>
@@ -11140,7 +10672,7 @@
         <w:pStyle w:val="ListBullet"/>
       </w:pPr>
       <w:r>
-        <w:t>ChangePasswordPage hiển thị showMessage("Mật khẩu mới không được trùng mật khẩu hiện tại.")</w:t>
+        <w:t>Lớp ChangePasswordPage hiển thị showMessage("Mật khẩu mới không được trùng mật khẩu hiện tại.")</w:t>
       </w:r>
     </w:p>
     <w:p>
@@ -11230,7 +10762,17 @@
     <w:p>
       <w:pPr/>
       <w:r>
-        <w:t xml:space="preserve">3. ProfilePage gọi </w:t>
+        <w:t xml:space="preserve">3. Phương thức </w:t>
+      </w:r>
+      <w:r>
+        <w:rPr>
+          <w:rFonts w:ascii="Courier New" w:hAnsi="Courier New"/>
+          <w:sz w:val="20"/>
+        </w:rPr>
+        <w:t>formLoad()</w:t>
+      </w:r>
+      <w:r>
+        <w:t xml:space="preserve"> gọi phương thức </w:t>
       </w:r>
       <w:r>
         <w:rPr>
@@ -11240,13 +10782,23 @@
         <w:t>getProfile(userId : int) : User</w:t>
       </w:r>
       <w:r>
-        <w:t xml:space="preserve"> của ProfileController.</w:t>
+        <w:t xml:space="preserve"> của lớp ProfileController.</w:t>
       </w:r>
     </w:p>
     <w:p>
       <w:pPr/>
       <w:r>
-        <w:t xml:space="preserve">4. ProfileController gọi </w:t>
+        <w:t xml:space="preserve">4. Phương thức </w:t>
+      </w:r>
+      <w:r>
+        <w:rPr>
+          <w:rFonts w:ascii="Courier New" w:hAnsi="Courier New"/>
+          <w:sz w:val="20"/>
+        </w:rPr>
+        <w:t>getProfile()</w:t>
+      </w:r>
+      <w:r>
+        <w:t xml:space="preserve"> gọi phương thức </w:t>
       </w:r>
       <w:r>
         <w:rPr>
@@ -11262,19 +10814,59 @@
     <w:p>
       <w:pPr/>
       <w:r>
-        <w:t>5. User trả về đối tượng User cho ProfileController.</w:t>
+        <w:t xml:space="preserve">5. Lớp User trả về đối tượng User cho phương thức </w:t>
+      </w:r>
+      <w:r>
+        <w:rPr>
+          <w:rFonts w:ascii="Courier New" w:hAnsi="Courier New"/>
+          <w:sz w:val="20"/>
+        </w:rPr>
+        <w:t>getProfile()</w:t>
+      </w:r>
+      <w:r>
+        <w:t>.</w:t>
       </w:r>
     </w:p>
     <w:p>
       <w:pPr/>
       <w:r>
-        <w:t>6. ProfileController trả về đối tượng User cho ProfilePage.</w:t>
+        <w:t xml:space="preserve">6. Phương thức </w:t>
+      </w:r>
+      <w:r>
+        <w:rPr>
+          <w:rFonts w:ascii="Courier New" w:hAnsi="Courier New"/>
+          <w:sz w:val="20"/>
+        </w:rPr>
+        <w:t>getProfile()</w:t>
+      </w:r>
+      <w:r>
+        <w:t xml:space="preserve"> trả về đối tượng User cho phương thức </w:t>
+      </w:r>
+      <w:r>
+        <w:rPr>
+          <w:rFonts w:ascii="Courier New" w:hAnsi="Courier New"/>
+          <w:sz w:val="20"/>
+        </w:rPr>
+        <w:t>formLoad()</w:t>
+      </w:r>
+      <w:r>
+        <w:t>.</w:t>
       </w:r>
     </w:p>
     <w:p>
       <w:pPr/>
       <w:r>
-        <w:t xml:space="preserve">7. ProfilePage gọi </w:t>
+        <w:t xml:space="preserve">7. Phương thức </w:t>
+      </w:r>
+      <w:r>
+        <w:rPr>
+          <w:rFonts w:ascii="Courier New" w:hAnsi="Courier New"/>
+          <w:sz w:val="20"/>
+        </w:rPr>
+        <w:t>formLoad()</w:t>
+      </w:r>
+      <w:r>
+        <w:t xml:space="preserve"> gọi </w:t>
       </w:r>
       <w:r>
         <w:rPr>
@@ -11284,19 +10876,31 @@
         <w:t>displayProfile(data : User)</w:t>
       </w:r>
       <w:r>
-        <w:t xml:space="preserve"> để render hồ sơ: Họ tên, SĐT, Email, Hạng hội viên, Điểm tích lũy, Ngày tham gia.</w:t>
+        <w:t xml:space="preserve"> để hiển thị hồ sơ: Họ tên, SĐT, Email, Hạng hội viên, Điểm tích lũy.</w:t>
       </w:r>
     </w:p>
     <w:p>
       <w:pPr/>
       <w:r>
-        <w:t>8. Khách hàng click [Chỉnh sửa], sửa Họ tên = "Nguyễn Văn An", Email = "vanan@newemail.com", click [Lưu].</w:t>
+        <w:t>8. Khách hàng click nút [Chỉnh sửa].</w:t>
       </w:r>
     </w:p>
     <w:p>
       <w:pPr/>
       <w:r>
-        <w:t xml:space="preserve">9. Phương thức </w:t>
+        <w:t>9. Khách hàng sửa Họ tên = "Nguyễn Văn An", Email = "vanan@newemail.com".</w:t>
+      </w:r>
+    </w:p>
+    <w:p>
+      <w:pPr/>
+      <w:r>
+        <w:t>10. Khách hàng click nút [Lưu].</w:t>
+      </w:r>
+    </w:p>
+    <w:p>
+      <w:pPr/>
+      <w:r>
+        <w:t xml:space="preserve">11. Phương thức </w:t>
       </w:r>
       <w:r>
         <w:rPr>
@@ -11312,7 +10916,17 @@
     <w:p>
       <w:pPr/>
       <w:r>
-        <w:t xml:space="preserve">10. ProfilePage gọi </w:t>
+        <w:t xml:space="preserve">12. Phương thức </w:t>
+      </w:r>
+      <w:r>
+        <w:rPr>
+          <w:rFonts w:ascii="Courier New" w:hAnsi="Courier New"/>
+          <w:sz w:val="20"/>
+        </w:rPr>
+        <w:t>btnChinhSuaClick()</w:t>
+      </w:r>
+      <w:r>
+        <w:t xml:space="preserve"> gọi phương thức </w:t>
       </w:r>
       <w:r>
         <w:rPr>
@@ -11322,13 +10936,23 @@
         <w:t>updateProfile(userId : int, hoTen : String, email : String) : User</w:t>
       </w:r>
       <w:r>
-        <w:t xml:space="preserve"> của ProfileController.</w:t>
+        <w:t xml:space="preserve"> của lớp ProfileController.</w:t>
       </w:r>
     </w:p>
     <w:p>
       <w:pPr/>
       <w:r>
-        <w:t xml:space="preserve">11. ProfileController gọi </w:t>
+        <w:t xml:space="preserve">13. Phương thức </w:t>
+      </w:r>
+      <w:r>
+        <w:rPr>
+          <w:rFonts w:ascii="Courier New" w:hAnsi="Courier New"/>
+          <w:sz w:val="20"/>
+        </w:rPr>
+        <w:t>updateProfile()</w:t>
+      </w:r>
+      <w:r>
+        <w:t xml:space="preserve"> gọi phương thức </w:t>
       </w:r>
       <w:r>
         <w:rPr>
@@ -11344,7 +10968,7 @@
     <w:p>
       <w:pPr/>
       <w:r>
-        <w:t xml:space="preserve">12. User trả về </w:t>
+        <w:t xml:space="preserve">14. Lớp User trả về </w:t>
       </w:r>
       <w:r>
         <w:rPr>
@@ -11354,13 +10978,33 @@
         <w:t>true</w:t>
       </w:r>
       <w:r>
-        <w:t xml:space="preserve"> (email hợp lệ).</w:t>
+        <w:t xml:space="preserve"> cho phương thức </w:t>
+      </w:r>
+      <w:r>
+        <w:rPr>
+          <w:rFonts w:ascii="Courier New" w:hAnsi="Courier New"/>
+          <w:sz w:val="20"/>
+        </w:rPr>
+        <w:t>updateProfile()</w:t>
+      </w:r>
+      <w:r>
+        <w:t>.</w:t>
       </w:r>
     </w:p>
     <w:p>
       <w:pPr/>
       <w:r>
-        <w:t xml:space="preserve">13. ProfileController gọi </w:t>
+        <w:t xml:space="preserve">15. Phương thức </w:t>
+      </w:r>
+      <w:r>
+        <w:rPr>
+          <w:rFonts w:ascii="Courier New" w:hAnsi="Courier New"/>
+          <w:sz w:val="20"/>
+        </w:rPr>
+        <w:t>updateProfile()</w:t>
+      </w:r>
+      <w:r>
+        <w:t xml:space="preserve"> gọi </w:t>
       </w:r>
       <w:r>
         <w:rPr>
@@ -11370,25 +11014,65 @@
         <w:t>save() : User</w:t>
       </w:r>
       <w:r>
-        <w:t xml:space="preserve"> để cập nhật.</w:t>
+        <w:t xml:space="preserve"> để cập nhật hồ sơ.</w:t>
       </w:r>
     </w:p>
     <w:p>
       <w:pPr/>
       <w:r>
-        <w:t>14. User trả về đối tượng User đã cập nhật.</w:t>
+        <w:t xml:space="preserve">16. Lớp User trả về đối tượng User đã cập nhật cho phương thức </w:t>
+      </w:r>
+      <w:r>
+        <w:rPr>
+          <w:rFonts w:ascii="Courier New" w:hAnsi="Courier New"/>
+          <w:sz w:val="20"/>
+        </w:rPr>
+        <w:t>updateProfile()</w:t>
+      </w:r>
+      <w:r>
+        <w:t>.</w:t>
       </w:r>
     </w:p>
     <w:p>
       <w:pPr/>
       <w:r>
-        <w:t>15. ProfileController trả về User cho ProfilePage.</w:t>
+        <w:t xml:space="preserve">17. Phương thức </w:t>
+      </w:r>
+      <w:r>
+        <w:rPr>
+          <w:rFonts w:ascii="Courier New" w:hAnsi="Courier New"/>
+          <w:sz w:val="20"/>
+        </w:rPr>
+        <w:t>updateProfile()</w:t>
+      </w:r>
+      <w:r>
+        <w:t xml:space="preserve"> trả về đối tượng User cho phương thức </w:t>
+      </w:r>
+      <w:r>
+        <w:rPr>
+          <w:rFonts w:ascii="Courier New" w:hAnsi="Courier New"/>
+          <w:sz w:val="20"/>
+        </w:rPr>
+        <w:t>btnChinhSuaClick()</w:t>
+      </w:r>
+      <w:r>
+        <w:t>.</w:t>
       </w:r>
     </w:p>
     <w:p>
       <w:pPr/>
       <w:r>
-        <w:t xml:space="preserve">16. ProfilePage gọi </w:t>
+        <w:t xml:space="preserve">18. Phương thức </w:t>
+      </w:r>
+      <w:r>
+        <w:rPr>
+          <w:rFonts w:ascii="Courier New" w:hAnsi="Courier New"/>
+          <w:sz w:val="20"/>
+        </w:rPr>
+        <w:t>btnChinhSuaClick()</w:t>
+      </w:r>
+      <w:r>
+        <w:t xml:space="preserve"> gọi </w:t>
       </w:r>
       <w:r>
         <w:rPr>
@@ -11398,13 +11082,7 @@
         <w:t>displayProfile(data : User)</w:t>
       </w:r>
       <w:r>
-        <w:t xml:space="preserve"> để cập nhật giao diện.</w:t>
-      </w:r>
-    </w:p>
-    <w:p>
-      <w:pPr/>
-      <w:r>
-        <w:t>17. ProfilePage hiển thị showMessage("Cập nhật thành công!")</w:t>
+        <w:t>, hiển thị showMessage("Cập nhật thành công!")</w:t>
       </w:r>
     </w:p>
     <w:p>
@@ -11449,7 +11127,27 @@
         <w:pStyle w:val="ListBullet"/>
       </w:pPr>
       <w:r>
-        <w:t>ProfileController trả về lỗi cho ProfilePage.</w:t>
+        <w:t xml:space="preserve">Phương thức </w:t>
+      </w:r>
+      <w:r>
+        <w:rPr>
+          <w:rFonts w:ascii="Courier New" w:hAnsi="Courier New"/>
+          <w:sz w:val="20"/>
+        </w:rPr>
+        <w:t>updateProfile()</w:t>
+      </w:r>
+      <w:r>
+        <w:t xml:space="preserve"> trả về lỗi cho </w:t>
+      </w:r>
+      <w:r>
+        <w:rPr>
+          <w:rFonts w:ascii="Courier New" w:hAnsi="Courier New"/>
+          <w:sz w:val="20"/>
+        </w:rPr>
+        <w:t>btnChinhSuaClick()</w:t>
+      </w:r>
+      <w:r>
+        <w:t>.</w:t>
       </w:r>
     </w:p>
     <w:p>
@@ -11457,7 +11155,7 @@
         <w:pStyle w:val="ListBullet"/>
       </w:pPr>
       <w:r>
-        <w:t>ProfilePage hiển thị showMessage("Email này đã được đăng ký bởi tài khoản khác.")</w:t>
+        <w:t>Lớp ProfilePage hiển thị showMessage("Email này đã được đăng ký bởi tài khoản khác.")</w:t>
       </w:r>
     </w:p>
     <w:p>
@@ -11557,7 +11255,17 @@
     <w:p>
       <w:pPr/>
       <w:r>
-        <w:t xml:space="preserve">3. StaffManagePage gọi </w:t>
+        <w:t xml:space="preserve">3. Phương thức </w:t>
+      </w:r>
+      <w:r>
+        <w:rPr>
+          <w:rFonts w:ascii="Courier New" w:hAnsi="Courier New"/>
+          <w:sz w:val="20"/>
+        </w:rPr>
+        <w:t>formLoad()</w:t>
+      </w:r>
+      <w:r>
+        <w:t xml:space="preserve"> gọi phương thức </w:t>
       </w:r>
       <w:r>
         <w:rPr>
@@ -11567,13 +11275,23 @@
         <w:t>getAllStaff() : List&lt;Employee&gt;</w:t>
       </w:r>
       <w:r>
-        <w:t xml:space="preserve"> của StaffController.</w:t>
+        <w:t xml:space="preserve"> của lớp StaffController.</w:t>
       </w:r>
     </w:p>
     <w:p>
       <w:pPr/>
       <w:r>
-        <w:t xml:space="preserve">4. StaffController gọi </w:t>
+        <w:t xml:space="preserve">4. Phương thức </w:t>
+      </w:r>
+      <w:r>
+        <w:rPr>
+          <w:rFonts w:ascii="Courier New" w:hAnsi="Courier New"/>
+          <w:sz w:val="20"/>
+        </w:rPr>
+        <w:t>getAllStaff()</w:t>
+      </w:r>
+      <w:r>
+        <w:t xml:space="preserve"> gọi phương thức </w:t>
       </w:r>
       <w:r>
         <w:rPr>
@@ -11589,13 +11307,33 @@
     <w:p>
       <w:pPr/>
       <w:r>
-        <w:t>5. Employee trả về danh sách nhân viên cho StaffController.</w:t>
+        <w:t xml:space="preserve">5. Lớp Employee trả về danh sách nhân viên cho phương thức </w:t>
+      </w:r>
+      <w:r>
+        <w:rPr>
+          <w:rFonts w:ascii="Courier New" w:hAnsi="Courier New"/>
+          <w:sz w:val="20"/>
+        </w:rPr>
+        <w:t>getAllStaff()</w:t>
+      </w:r>
+      <w:r>
+        <w:t>.</w:t>
       </w:r>
     </w:p>
     <w:p>
       <w:pPr/>
       <w:r>
-        <w:t xml:space="preserve">6. StaffController trả về </w:t>
+        <w:t xml:space="preserve">6. Phương thức </w:t>
+      </w:r>
+      <w:r>
+        <w:rPr>
+          <w:rFonts w:ascii="Courier New" w:hAnsi="Courier New"/>
+          <w:sz w:val="20"/>
+        </w:rPr>
+        <w:t>getAllStaff()</w:t>
+      </w:r>
+      <w:r>
+        <w:t xml:space="preserve"> trả về </w:t>
       </w:r>
       <w:r>
         <w:rPr>
@@ -11605,13 +11343,33 @@
         <w:t>List&lt;Employee&gt;</w:t>
       </w:r>
       <w:r>
-        <w:t xml:space="preserve"> cho StaffManagePage.</w:t>
+        <w:t xml:space="preserve"> cho phương thức </w:t>
+      </w:r>
+      <w:r>
+        <w:rPr>
+          <w:rFonts w:ascii="Courier New" w:hAnsi="Courier New"/>
+          <w:sz w:val="20"/>
+        </w:rPr>
+        <w:t>formLoad()</w:t>
+      </w:r>
+      <w:r>
+        <w:t>.</w:t>
       </w:r>
     </w:p>
     <w:p>
       <w:pPr/>
       <w:r>
-        <w:t xml:space="preserve">7. StaffManagePage gọi </w:t>
+        <w:t xml:space="preserve">7. Phương thức </w:t>
+      </w:r>
+      <w:r>
+        <w:rPr>
+          <w:rFonts w:ascii="Courier New" w:hAnsi="Courier New"/>
+          <w:sz w:val="20"/>
+        </w:rPr>
+        <w:t>formLoad()</w:t>
+      </w:r>
+      <w:r>
+        <w:t xml:space="preserve"> gọi </w:t>
       </w:r>
       <w:r>
         <w:rPr>
@@ -11621,19 +11379,31 @@
         <w:t>displayStaffList(data : List&lt;Employee&gt;)</w:t>
       </w:r>
       <w:r>
-        <w:t xml:space="preserve"> để render bảng nhân viên: họ tên, vai trò, trạng thái.</w:t>
+        <w:t xml:space="preserve"> để hiển thị bảng nhân viên.</w:t>
       </w:r>
     </w:p>
     <w:p>
       <w:pPr/>
       <w:r>
-        <w:t>8. Admin click [Thêm nhân viên], nhập Họ tên = "Lê Văn C", Vai trò = "Phục vụ", click [Lưu].</w:t>
+        <w:t>8. Admin click nút [Thêm nhân viên].</w:t>
       </w:r>
     </w:p>
     <w:p>
       <w:pPr/>
       <w:r>
-        <w:t xml:space="preserve">9. Phương thức </w:t>
+        <w:t>9. Admin nhập Họ tên = "Lê Văn C", Vai trò = "Phục vụ".</w:t>
+      </w:r>
+    </w:p>
+    <w:p>
+      <w:pPr/>
+      <w:r>
+        <w:t>10. Admin click nút [Lưu].</w:t>
+      </w:r>
+    </w:p>
+    <w:p>
+      <w:pPr/>
+      <w:r>
+        <w:t xml:space="preserve">11. Phương thức </w:t>
       </w:r>
       <w:r>
         <w:rPr>
@@ -11649,7 +11419,17 @@
     <w:p>
       <w:pPr/>
       <w:r>
-        <w:t xml:space="preserve">10. StaffManagePage gọi </w:t>
+        <w:t xml:space="preserve">12. Phương thức </w:t>
+      </w:r>
+      <w:r>
+        <w:rPr>
+          <w:rFonts w:ascii="Courier New" w:hAnsi="Courier New"/>
+          <w:sz w:val="20"/>
+        </w:rPr>
+        <w:t>btnThemClick()</w:t>
+      </w:r>
+      <w:r>
+        <w:t xml:space="preserve"> gọi phương thức </w:t>
       </w:r>
       <w:r>
         <w:rPr>
@@ -11659,13 +11439,23 @@
         <w:t>saveStaff(employee : Employee) : boolean</w:t>
       </w:r>
       <w:r>
-        <w:t xml:space="preserve"> của StaffController.</w:t>
+        <w:t xml:space="preserve"> của lớp StaffController.</w:t>
       </w:r>
     </w:p>
     <w:p>
       <w:pPr/>
       <w:r>
-        <w:t xml:space="preserve">11. StaffController gọi </w:t>
+        <w:t xml:space="preserve">13. Phương thức </w:t>
+      </w:r>
+      <w:r>
+        <w:rPr>
+          <w:rFonts w:ascii="Courier New" w:hAnsi="Courier New"/>
+          <w:sz w:val="20"/>
+        </w:rPr>
+        <w:t>saveStaff()</w:t>
+      </w:r>
+      <w:r>
+        <w:t xml:space="preserve"> gọi </w:t>
       </w:r>
       <w:r>
         <w:rPr>
@@ -11681,13 +11471,33 @@
     <w:p>
       <w:pPr/>
       <w:r>
-        <w:t>12. Employee trả về đối tượng Employee vừa tạo.</w:t>
+        <w:t xml:space="preserve">14. Lớp Employee trả về đối tượng Employee vừa tạo cho phương thức </w:t>
+      </w:r>
+      <w:r>
+        <w:rPr>
+          <w:rFonts w:ascii="Courier New" w:hAnsi="Courier New"/>
+          <w:sz w:val="20"/>
+        </w:rPr>
+        <w:t>saveStaff()</w:t>
+      </w:r>
+      <w:r>
+        <w:t>.</w:t>
       </w:r>
     </w:p>
     <w:p>
       <w:pPr/>
       <w:r>
-        <w:t xml:space="preserve">13. StaffController trả về </w:t>
+        <w:t xml:space="preserve">15. Phương thức </w:t>
+      </w:r>
+      <w:r>
+        <w:rPr>
+          <w:rFonts w:ascii="Courier New" w:hAnsi="Courier New"/>
+          <w:sz w:val="20"/>
+        </w:rPr>
+        <w:t>saveStaff()</w:t>
+      </w:r>
+      <w:r>
+        <w:t xml:space="preserve"> trả về </w:t>
       </w:r>
       <w:r>
         <w:rPr>
@@ -11697,13 +11507,33 @@
         <w:t>true</w:t>
       </w:r>
       <w:r>
-        <w:t xml:space="preserve"> cho StaffManagePage.</w:t>
+        <w:t xml:space="preserve"> cho phương thức </w:t>
+      </w:r>
+      <w:r>
+        <w:rPr>
+          <w:rFonts w:ascii="Courier New" w:hAnsi="Courier New"/>
+          <w:sz w:val="20"/>
+        </w:rPr>
+        <w:t>btnThemClick()</w:t>
+      </w:r>
+      <w:r>
+        <w:t>.</w:t>
       </w:r>
     </w:p>
     <w:p>
       <w:pPr/>
       <w:r>
-        <w:t xml:space="preserve">14. StaffManagePage gọi </w:t>
+        <w:t xml:space="preserve">16. Phương thức </w:t>
+      </w:r>
+      <w:r>
+        <w:rPr>
+          <w:rFonts w:ascii="Courier New" w:hAnsi="Courier New"/>
+          <w:sz w:val="20"/>
+        </w:rPr>
+        <w:t>btnThemClick()</w:t>
+      </w:r>
+      <w:r>
+        <w:t xml:space="preserve"> gọi </w:t>
       </w:r>
       <w:r>
         <w:rPr>
@@ -11713,34 +11543,19 @@
         <w:t>displayStaffList(data : List&lt;Employee&gt;)</w:t>
       </w:r>
       <w:r>
-        <w:t xml:space="preserve"> để cập nhật bảng.</w:t>
+        <w:t>, hiển thị showMessage("Thêm nhân viên thành công!")</w:t>
       </w:r>
     </w:p>
     <w:p>
       <w:pPr/>
       <w:r>
-        <w:t>15. StaffManagePage hiển thị showMessage("Thêm nhân viên thành công!")</w:t>
+        <w:t>17. Admin click nút [Xóa] trên một dòng nhân viên trong bảng.</w:t>
       </w:r>
     </w:p>
     <w:p>
       <w:pPr/>
       <w:r>
-        <w:rPr>
-          <w:b/>
-        </w:rPr>
-        <w:t>Kịch bản xóa nhân viên</w:t>
-      </w:r>
-    </w:p>
-    <w:p>
-      <w:pPr/>
-      <w:r>
-        <w:t>1. Admin click nút [Xóa] trên một dòng nhân viên trong bảng.</w:t>
-      </w:r>
-    </w:p>
-    <w:p>
-      <w:pPr/>
-      <w:r>
-        <w:t xml:space="preserve">2. Phương thức </w:t>
+        <w:t xml:space="preserve">18. Phương thức </w:t>
       </w:r>
       <w:r>
         <w:rPr>
@@ -11756,7 +11571,17 @@
     <w:p>
       <w:pPr/>
       <w:r>
-        <w:t xml:space="preserve">3. StaffManagePage gọi </w:t>
+        <w:t xml:space="preserve">19. Phương thức </w:t>
+      </w:r>
+      <w:r>
+        <w:rPr>
+          <w:rFonts w:ascii="Courier New" w:hAnsi="Courier New"/>
+          <w:sz w:val="20"/>
+        </w:rPr>
+        <w:t>btnXoaClick()</w:t>
+      </w:r>
+      <w:r>
+        <w:t xml:space="preserve"> gọi phương thức </w:t>
       </w:r>
       <w:r>
         <w:rPr>
@@ -11766,13 +11591,23 @@
         <w:t>deleteStaff(id : int) : boolean</w:t>
       </w:r>
       <w:r>
-        <w:t xml:space="preserve"> của StaffController.</w:t>
+        <w:t xml:space="preserve"> của lớp StaffController.</w:t>
       </w:r>
     </w:p>
     <w:p>
       <w:pPr/>
       <w:r>
-        <w:t xml:space="preserve">4. StaffController gọi </w:t>
+        <w:t xml:space="preserve">20. Phương thức </w:t>
+      </w:r>
+      <w:r>
+        <w:rPr>
+          <w:rFonts w:ascii="Courier New" w:hAnsi="Courier New"/>
+          <w:sz w:val="20"/>
+        </w:rPr>
+        <w:t>deleteStaff()</w:t>
+      </w:r>
+      <w:r>
+        <w:t xml:space="preserve"> gọi </w:t>
       </w:r>
       <w:r>
         <w:rPr>
@@ -11788,7 +11623,7 @@
     <w:p>
       <w:pPr/>
       <w:r>
-        <w:t xml:space="preserve">5. Employee trả về </w:t>
+        <w:t xml:space="preserve">21. Lớp Employee trả về </w:t>
       </w:r>
       <w:r>
         <w:rPr>
@@ -11798,13 +11633,33 @@
         <w:t>true</w:t>
       </w:r>
       <w:r>
+        <w:t xml:space="preserve"> cho phương thức </w:t>
+      </w:r>
+      <w:r>
+        <w:rPr>
+          <w:rFonts w:ascii="Courier New" w:hAnsi="Courier New"/>
+          <w:sz w:val="20"/>
+        </w:rPr>
+        <w:t>deleteStaff()</w:t>
+      </w:r>
+      <w:r>
         <w:t>.</w:t>
       </w:r>
     </w:p>
     <w:p>
       <w:pPr/>
       <w:r>
-        <w:t xml:space="preserve">6. StaffController trả về </w:t>
+        <w:t xml:space="preserve">22. Phương thức </w:t>
+      </w:r>
+      <w:r>
+        <w:rPr>
+          <w:rFonts w:ascii="Courier New" w:hAnsi="Courier New"/>
+          <w:sz w:val="20"/>
+        </w:rPr>
+        <w:t>deleteStaff()</w:t>
+      </w:r>
+      <w:r>
+        <w:t xml:space="preserve"> trả về </w:t>
       </w:r>
       <w:r>
         <w:rPr>
@@ -11814,13 +11669,33 @@
         <w:t>true</w:t>
       </w:r>
       <w:r>
-        <w:t xml:space="preserve"> cho StaffManagePage.</w:t>
+        <w:t xml:space="preserve"> cho phương thức </w:t>
+      </w:r>
+      <w:r>
+        <w:rPr>
+          <w:rFonts w:ascii="Courier New" w:hAnsi="Courier New"/>
+          <w:sz w:val="20"/>
+        </w:rPr>
+        <w:t>btnXoaClick()</w:t>
+      </w:r>
+      <w:r>
+        <w:t>.</w:t>
       </w:r>
     </w:p>
     <w:p>
       <w:pPr/>
       <w:r>
-        <w:t xml:space="preserve">7. StaffManagePage gọi </w:t>
+        <w:t xml:space="preserve">23. Phương thức </w:t>
+      </w:r>
+      <w:r>
+        <w:rPr>
+          <w:rFonts w:ascii="Courier New" w:hAnsi="Courier New"/>
+          <w:sz w:val="20"/>
+        </w:rPr>
+        <w:t>btnXoaClick()</w:t>
+      </w:r>
+      <w:r>
+        <w:t xml:space="preserve"> gọi </w:t>
       </w:r>
       <w:r>
         <w:rPr>
@@ -11830,13 +11705,7 @@
         <w:t>displayStaffList(data : List&lt;Employee&gt;)</w:t>
       </w:r>
       <w:r>
-        <w:t xml:space="preserve"> để cập nhật bảng.</w:t>
-      </w:r>
-    </w:p>
-    <w:p>
-      <w:pPr/>
-      <w:r>
-        <w:t>8. StaffManagePage hiển thị showMessage("Xóa nhân viên thành công!")</w:t>
+        <w:t>, hiển thị showMessage("Xóa nhân viên thành công!")</w:t>
       </w:r>
     </w:p>
     <w:p>
@@ -11845,7 +11714,7 @@
         <w:rPr>
           <w:b/>
         </w:rPr>
-        <w:t>Ngoại lệ: Thêm nhân viên thất bại</w:t>
+        <w:t>Ngoại lệ: thêm nhân viên thất bại</w:t>
       </w:r>
     </w:p>
     <w:p>
@@ -11853,7 +11722,17 @@
         <w:pStyle w:val="ListBullet"/>
       </w:pPr>
       <w:r>
-        <w:t xml:space="preserve">StaffController trả về </w:t>
+        <w:t xml:space="preserve">Phương thức </w:t>
+      </w:r>
+      <w:r>
+        <w:rPr>
+          <w:rFonts w:ascii="Courier New" w:hAnsi="Courier New"/>
+          <w:sz w:val="20"/>
+        </w:rPr>
+        <w:t>saveStaff()</w:t>
+      </w:r>
+      <w:r>
+        <w:t xml:space="preserve"> trả về </w:t>
       </w:r>
       <w:r>
         <w:rPr>
@@ -11863,7 +11742,17 @@
         <w:t>false</w:t>
       </w:r>
       <w:r>
-        <w:t xml:space="preserve"> cho StaffManagePage.</w:t>
+        <w:t xml:space="preserve"> cho </w:t>
+      </w:r>
+      <w:r>
+        <w:rPr>
+          <w:rFonts w:ascii="Courier New" w:hAnsi="Courier New"/>
+          <w:sz w:val="20"/>
+        </w:rPr>
+        <w:t>btnThemClick()</w:t>
+      </w:r>
+      <w:r>
+        <w:t>.</w:t>
       </w:r>
     </w:p>
     <w:p>
@@ -11871,7 +11760,7 @@
         <w:pStyle w:val="ListBullet"/>
       </w:pPr>
       <w:r>
-        <w:t>StaffManagePage hiển thị showMessage("Thêm nhân viên thất bại.")</w:t>
+        <w:t>Lớp StaffManagePage hiển thị showMessage("Thêm nhân viên thất bại.")</w:t>
       </w:r>
     </w:p>
     <w:p>
@@ -11880,7 +11769,7 @@
         <w:rPr>
           <w:b/>
         </w:rPr>
-        <w:t>Ngoại lệ: Nhân viên đang xử lý order</w:t>
+        <w:t>Ngoại lệ: nhân viên đang xử lý order</w:t>
       </w:r>
     </w:p>
     <w:p>
@@ -11888,7 +11777,17 @@
         <w:pStyle w:val="ListBullet"/>
       </w:pPr>
       <w:r>
-        <w:t xml:space="preserve">StaffController trả về </w:t>
+        <w:t xml:space="preserve">Phương thức </w:t>
+      </w:r>
+      <w:r>
+        <w:rPr>
+          <w:rFonts w:ascii="Courier New" w:hAnsi="Courier New"/>
+          <w:sz w:val="20"/>
+        </w:rPr>
+        <w:t>deleteStaff()</w:t>
+      </w:r>
+      <w:r>
+        <w:t xml:space="preserve"> trả về </w:t>
       </w:r>
       <w:r>
         <w:rPr>
@@ -11898,7 +11797,17 @@
         <w:t>false</w:t>
       </w:r>
       <w:r>
-        <w:t xml:space="preserve"> cho StaffManagePage.</w:t>
+        <w:t xml:space="preserve"> cho </w:t>
+      </w:r>
+      <w:r>
+        <w:rPr>
+          <w:rFonts w:ascii="Courier New" w:hAnsi="Courier New"/>
+          <w:sz w:val="20"/>
+        </w:rPr>
+        <w:t>btnXoaClick()</w:t>
+      </w:r>
+      <w:r>
+        <w:t>.</w:t>
       </w:r>
     </w:p>
     <w:p>
@@ -11906,7 +11815,7 @@
         <w:pStyle w:val="ListBullet"/>
       </w:pPr>
       <w:r>
-        <w:t>StaffManagePage hiển thị showMessage("Nhân viên đang xử lý order, không thể xóa.")</w:t>
+        <w:t>Lớp StaffManagePage hiển thị showMessage("Nhân viên đang xử lý order, không thể xóa.")</w:t>
       </w:r>
     </w:p>
     <w:p/>

</xml_diff>

<commit_message>
fix: remove real data from scenarios, simple method names in v3
- II.4: Remove real data values from Kịch bản v2 narratives and PlantUML
- III.4: Simplify method names (remove parameter types), remove real data
- Wireframe sample data kept (UI mockup needs realistic data)
- DOCX: 653KB, 593 paragraphs, 63 tables, 20 images
</commit_message>
<xml_diff>
--- a/output/account_module.docx
+++ b/output/account_module.docx
@@ -3533,7 +3533,7 @@
               <w:rPr>
                 <w:sz w:val="20"/>
               </w:rPr>
-              <w:t>3. Người dùng điền: Họ tên = "Nguyễn Thị Bình", SĐT = "0987654321", Email = "binh.nt@email.com", MK = "Pass@2025".</w:t>
+              <w:t>3. Người dùng điền: Họ tên, SĐT, Email, Mật khẩu.</w:t>
             </w:r>
             <w:r>
               <w:br/>
@@ -3578,7 +3578,7 @@
               <w:rPr>
                 <w:sz w:val="20"/>
               </w:rPr>
-              <w:t>8. Người dùng nhập OTP = "482917" và nhấn [Xác nhận].</w:t>
+              <w:t>8. Người dùng nhập mã OTP và nhấn [Xác nhận].</w:t>
             </w:r>
             <w:r>
               <w:br/>
@@ -4199,7 +4199,7 @@
               <w:rPr>
                 <w:sz w:val="20"/>
               </w:rPr>
-              <w:t>5. Cập nhật: Họ tên = "Nguyễn Văn An", Email = "vanan@newemail.com".</w:t>
+              <w:t>5. Cập nhật: thông tin.</w:t>
             </w:r>
             <w:r>
               <w:br/>
@@ -8137,6 +8137,9 @@
         </w:rPr>
         <w:t>checkLogin()</w:t>
       </w:r>
+      <w:r>
+        <w:t>`</w:t>
+      </w:r>
     </w:p>
     <w:p>
       <w:pPr>
@@ -8171,10 +8174,10 @@
           <w:rFonts w:ascii="Courier New" w:hAnsi="Courier New"/>
           <w:sz w:val="20"/>
         </w:rPr>
-        <w:t>checkLogin(username: String, password: String)</w:t>
-      </w:r>
-      <w:r>
-        <w:t xml:space="preserve"> → chọn (gom nhóm tham số)</w:t>
+        <w:t>checkLogin()</w:t>
+      </w:r>
+      <w:r>
+        <w:t>` → chọn (gom nhóm tham số)</w:t>
       </w:r>
     </w:p>
     <w:p>
@@ -8194,10 +8197,13 @@
           <w:rFonts w:ascii="Courier New" w:hAnsi="Courier New"/>
           <w:sz w:val="20"/>
         </w:rPr>
-        <w:t>checkLogin(): void</w:t>
-      </w:r>
-      <w:r>
-        <w:t xml:space="preserve"> → loại (cần trả về kết quả xác thực)</w:t>
+        <w:t>checkLogin()</w:t>
+      </w:r>
+      <w:r>
+        <w:t>: void</w:t>
+      </w:r>
+      <w:r>
+        <w:t>` → loại (cần trả về kết quả xác thực)</w:t>
       </w:r>
     </w:p>
     <w:p>
@@ -8209,10 +8215,13 @@
           <w:rFonts w:ascii="Courier New" w:hAnsi="Courier New"/>
           <w:sz w:val="20"/>
         </w:rPr>
-        <w:t>checkLogin(): boolean</w:t>
-      </w:r>
-      <w:r>
-        <w:t xml:space="preserve"> → chọn (trả về true/false xác thực thành công)</w:t>
+        <w:t>checkLogin()</w:t>
+      </w:r>
+      <w:r>
+        <w:t>: boolean</w:t>
+      </w:r>
+      <w:r>
+        <w:t>` → chọn (trả về true/false xác thực thành công)</w:t>
       </w:r>
     </w:p>
     <w:p>
@@ -8227,6 +8236,9 @@
         </w:rPr>
         <w:t>register()</w:t>
       </w:r>
+      <w:r>
+        <w:t>`</w:t>
+      </w:r>
     </w:p>
     <w:p>
       <w:pPr>
@@ -8261,10 +8273,10 @@
           <w:rFonts w:ascii="Courier New" w:hAnsi="Courier New"/>
           <w:sz w:val="20"/>
         </w:rPr>
-        <w:t>register(hoTen: String, sdt: String, email: String, matKhau: String)</w:t>
-      </w:r>
-      <w:r>
-        <w:t xml:space="preserve"> → chọn</w:t>
+        <w:t>register()</w:t>
+      </w:r>
+      <w:r>
+        <w:t>` → chọn</w:t>
       </w:r>
     </w:p>
     <w:p>
@@ -8284,10 +8296,13 @@
           <w:rFonts w:ascii="Courier New" w:hAnsi="Courier New"/>
           <w:sz w:val="20"/>
         </w:rPr>
-        <w:t>register(): User</w:t>
-      </w:r>
-      <w:r>
-        <w:t xml:space="preserve"> → chọn</w:t>
+        <w:t>register()</w:t>
+      </w:r>
+      <w:r>
+        <w:t>: User</w:t>
+      </w:r>
+      <w:r>
+        <w:t>` → chọn</w:t>
       </w:r>
     </w:p>
     <w:p>
@@ -8302,6 +8317,9 @@
         </w:rPr>
         <w:t>verifyOTP()</w:t>
       </w:r>
+      <w:r>
+        <w:t>`</w:t>
+      </w:r>
     </w:p>
     <w:p>
       <w:pPr>
@@ -8336,10 +8354,10 @@
           <w:rFonts w:ascii="Courier New" w:hAnsi="Courier New"/>
           <w:sz w:val="20"/>
         </w:rPr>
-        <w:t>verifyOTP(otp: String)</w:t>
-      </w:r>
-      <w:r>
-        <w:t xml:space="preserve"> → chọn</w:t>
+        <w:t>verifyOTP()</w:t>
+      </w:r>
+      <w:r>
+        <w:t>` → chọn</w:t>
       </w:r>
     </w:p>
     <w:p>
@@ -8359,10 +8377,13 @@
           <w:rFonts w:ascii="Courier New" w:hAnsi="Courier New"/>
           <w:sz w:val="20"/>
         </w:rPr>
-        <w:t>verifyOTP(): boolean</w:t>
-      </w:r>
-      <w:r>
-        <w:t xml:space="preserve"> → chọn (cần biết đúng/sai)</w:t>
+        <w:t>verifyOTP()</w:t>
+      </w:r>
+      <w:r>
+        <w:t>: boolean</w:t>
+      </w:r>
+      <w:r>
+        <w:t>` → chọn (cần biết đúng/sai)</w:t>
       </w:r>
     </w:p>
     <w:p>
@@ -8377,6 +8398,9 @@
         </w:rPr>
         <w:t>changePassword()</w:t>
       </w:r>
+      <w:r>
+        <w:t>`</w:t>
+      </w:r>
     </w:p>
     <w:p>
       <w:pPr>
@@ -8411,10 +8435,10 @@
           <w:rFonts w:ascii="Courier New" w:hAnsi="Courier New"/>
           <w:sz w:val="20"/>
         </w:rPr>
-        <w:t>changePassword(mkHienTai: String, mkMoi: String)</w:t>
-      </w:r>
-      <w:r>
-        <w:t xml:space="preserve"> → chọn</w:t>
+        <w:t>changePassword()</w:t>
+      </w:r>
+      <w:r>
+        <w:t>` → chọn</w:t>
       </w:r>
     </w:p>
     <w:p>
@@ -8434,10 +8458,13 @@
           <w:rFonts w:ascii="Courier New" w:hAnsi="Courier New"/>
           <w:sz w:val="20"/>
         </w:rPr>
-        <w:t>changePassword(): boolean</w:t>
-      </w:r>
-      <w:r>
-        <w:t xml:space="preserve"> → chọn</w:t>
+        <w:t>changePassword()</w:t>
+      </w:r>
+      <w:r>
+        <w:t>: boolean</w:t>
+      </w:r>
+      <w:r>
+        <w:t>` → chọn</w:t>
       </w:r>
     </w:p>
     <w:p>
@@ -8452,6 +8479,9 @@
         </w:rPr>
         <w:t>getProfile()</w:t>
       </w:r>
+      <w:r>
+        <w:t>`</w:t>
+      </w:r>
     </w:p>
     <w:p>
       <w:pPr>
@@ -8486,10 +8516,10 @@
           <w:rFonts w:ascii="Courier New" w:hAnsi="Courier New"/>
           <w:sz w:val="20"/>
         </w:rPr>
-        <w:t>getProfile(userId: int)</w:t>
-      </w:r>
-      <w:r>
-        <w:t xml:space="preserve"> → chọn</w:t>
+        <w:t>getProfile()</w:t>
+      </w:r>
+      <w:r>
+        <w:t>` → chọn</w:t>
       </w:r>
     </w:p>
     <w:p>
@@ -8509,10 +8539,13 @@
           <w:rFonts w:ascii="Courier New" w:hAnsi="Courier New"/>
           <w:sz w:val="20"/>
         </w:rPr>
-        <w:t>getProfile(): User</w:t>
-      </w:r>
-      <w:r>
-        <w:t xml:space="preserve"> → chọn</w:t>
+        <w:t>getProfile()</w:t>
+      </w:r>
+      <w:r>
+        <w:t>: User</w:t>
+      </w:r>
+      <w:r>
+        <w:t>` → chọn</w:t>
       </w:r>
     </w:p>
     <w:p>
@@ -8527,6 +8560,9 @@
         </w:rPr>
         <w:t>updateProfile()</w:t>
       </w:r>
+      <w:r>
+        <w:t>`</w:t>
+      </w:r>
     </w:p>
     <w:p>
       <w:pPr>
@@ -8561,10 +8597,10 @@
           <w:rFonts w:ascii="Courier New" w:hAnsi="Courier New"/>
           <w:sz w:val="20"/>
         </w:rPr>
-        <w:t>updateProfile(userId: int, hoTen: String, email: String)</w:t>
-      </w:r>
-      <w:r>
-        <w:t xml:space="preserve"> → chọn</w:t>
+        <w:t>updateProfile()</w:t>
+      </w:r>
+      <w:r>
+        <w:t>` → chọn</w:t>
       </w:r>
     </w:p>
     <w:p>
@@ -8584,10 +8620,13 @@
           <w:rFonts w:ascii="Courier New" w:hAnsi="Courier New"/>
           <w:sz w:val="20"/>
         </w:rPr>
-        <w:t>updateProfile(): User</w:t>
-      </w:r>
-      <w:r>
-        <w:t xml:space="preserve"> → chọn</w:t>
+        <w:t>updateProfile()</w:t>
+      </w:r>
+      <w:r>
+        <w:t>: User</w:t>
+      </w:r>
+      <w:r>
+        <w:t>` → chọn</w:t>
       </w:r>
     </w:p>
     <w:p>
@@ -8602,6 +8641,9 @@
         </w:rPr>
         <w:t>getAllStaff()</w:t>
       </w:r>
+      <w:r>
+        <w:t>`</w:t>
+      </w:r>
     </w:p>
     <w:p>
       <w:pPr>
@@ -8639,7 +8681,7 @@
         <w:t>getAllStaff()</w:t>
       </w:r>
       <w:r>
-        <w:t xml:space="preserve"> → chọn</w:t>
+        <w:t>` → chọn</w:t>
       </w:r>
     </w:p>
     <w:p>
@@ -8659,10 +8701,13 @@
           <w:rFonts w:ascii="Courier New" w:hAnsi="Courier New"/>
           <w:sz w:val="20"/>
         </w:rPr>
-        <w:t>getAllStaff(): List&lt;Employee&gt;</w:t>
-      </w:r>
-      <w:r>
-        <w:t xml:space="preserve"> → chọn</w:t>
+        <w:t>getAllStaff()</w:t>
+      </w:r>
+      <w:r>
+        <w:t>: List&lt;Employee&gt;</w:t>
+      </w:r>
+      <w:r>
+        <w:t>` → chọn</w:t>
       </w:r>
     </w:p>
     <w:p>
@@ -8902,6 +8947,9 @@
         </w:rPr>
         <w:t>updateStaff()</w:t>
       </w:r>
+      <w:r>
+        <w:t>`</w:t>
+      </w:r>
     </w:p>
     <w:p>
       <w:pPr>
@@ -8936,10 +8984,10 @@
           <w:rFonts w:ascii="Courier New" w:hAnsi="Courier New"/>
           <w:sz w:val="20"/>
         </w:rPr>
-        <w:t>updateStaff(employee: Employee)</w:t>
-      </w:r>
-      <w:r>
-        <w:t xml:space="preserve"> → chọn</w:t>
+        <w:t>updateStaff()</w:t>
+      </w:r>
+      <w:r>
+        <w:t>` → chọn</w:t>
       </w:r>
     </w:p>
     <w:p>
@@ -8959,10 +9007,13 @@
           <w:rFonts w:ascii="Courier New" w:hAnsi="Courier New"/>
           <w:sz w:val="20"/>
         </w:rPr>
-        <w:t>updateStaff(): boolean</w:t>
-      </w:r>
-      <w:r>
-        <w:t xml:space="preserve"> → chọn</w:t>
+        <w:t>updateStaff()</w:t>
+      </w:r>
+      <w:r>
+        <w:t>: boolean</w:t>
+      </w:r>
+      <w:r>
+        <w:t>` → chọn</w:t>
       </w:r>
     </w:p>
     <w:p>
@@ -8977,6 +9028,9 @@
         </w:rPr>
         <w:t>deleteStaff()</w:t>
       </w:r>
+      <w:r>
+        <w:t>`</w:t>
+      </w:r>
     </w:p>
     <w:p>
       <w:pPr>
@@ -9011,10 +9065,10 @@
           <w:rFonts w:ascii="Courier New" w:hAnsi="Courier New"/>
           <w:sz w:val="20"/>
         </w:rPr>
-        <w:t>deleteStaff(id: int)</w:t>
-      </w:r>
-      <w:r>
-        <w:t xml:space="preserve"> → chọn</w:t>
+        <w:t>deleteStaff()</w:t>
+      </w:r>
+      <w:r>
+        <w:t>` → chọn</w:t>
       </w:r>
     </w:p>
     <w:p>
@@ -9034,10 +9088,13 @@
           <w:rFonts w:ascii="Courier New" w:hAnsi="Courier New"/>
           <w:sz w:val="20"/>
         </w:rPr>
-        <w:t>deleteStaff(): boolean</w:t>
-      </w:r>
-      <w:r>
-        <w:t xml:space="preserve"> → chọn (cần biết thành công/thất bại)</w:t>
+        <w:t>deleteStaff()</w:t>
+      </w:r>
+      <w:r>
+        <w:t>: boolean</w:t>
+      </w:r>
+      <w:r>
+        <w:t>` → chọn (cần biết thành công/thất bại)</w:t>
       </w:r>
     </w:p>
     <w:p>
@@ -9238,7 +9295,7 @@
         <w:t>checkLogin()</w:t>
       </w:r>
       <w:r>
-        <w:t xml:space="preserve"> của lớp AuthController.</w:t>
+        <w:t>` của lớp AuthController.</w:t>
       </w:r>
     </w:p>
     <w:p>
@@ -9254,7 +9311,150 @@
         <w:t>checkLogin()</w:t>
       </w:r>
       <w:r>
+        <w:rPr>
+          <w:rFonts w:ascii="Courier New" w:hAnsi="Courier New"/>
+          <w:sz w:val="20"/>
+        </w:rPr>
         <w:t xml:space="preserve"> gọi phương thức </w:t>
+      </w:r>
+      <w:r>
+        <w:t>findBySDT()</w:t>
+      </w:r>
+      <w:r>
+        <w:rPr>
+          <w:rFonts w:ascii="Courier New" w:hAnsi="Courier New"/>
+          <w:sz w:val="20"/>
+        </w:rPr>
+      </w:r>
+      <w:r>
+        <w:t xml:space="preserve"> của lớp User.</w:t>
+      </w:r>
+    </w:p>
+    <w:p>
+      <w:pPr/>
+      <w:r>
+        <w:t xml:space="preserve">8. Lớp User trả về đối tượng User cho phương thức </w:t>
+      </w:r>
+      <w:r>
+        <w:rPr>
+          <w:rFonts w:ascii="Courier New" w:hAnsi="Courier New"/>
+          <w:sz w:val="20"/>
+        </w:rPr>
+        <w:t>checkLogin()</w:t>
+      </w:r>
+      <w:r>
+        <w:t>`.</w:t>
+      </w:r>
+    </w:p>
+    <w:p>
+      <w:pPr/>
+      <w:r>
+        <w:t xml:space="preserve">9. Phương thức </w:t>
+      </w:r>
+      <w:r>
+        <w:rPr>
+          <w:rFonts w:ascii="Courier New" w:hAnsi="Courier New"/>
+          <w:sz w:val="20"/>
+        </w:rPr>
+        <w:t>checkLogin()</w:t>
+      </w:r>
+      <w:r>
+        <w:rPr>
+          <w:rFonts w:ascii="Courier New" w:hAnsi="Courier New"/>
+          <w:sz w:val="20"/>
+        </w:rPr>
+        <w:t xml:space="preserve"> gọi </w:t>
+      </w:r>
+      <w:r>
+        <w:t>checkPassword()</w:t>
+      </w:r>
+      <w:r>
+        <w:rPr>
+          <w:rFonts w:ascii="Courier New" w:hAnsi="Courier New"/>
+          <w:sz w:val="20"/>
+        </w:rPr>
+      </w:r>
+      <w:r>
+        <w:t xml:space="preserve"> để so sánh mật khẩu.</w:t>
+      </w:r>
+    </w:p>
+    <w:p>
+      <w:pPr/>
+      <w:r>
+        <w:t xml:space="preserve">10. Phương thức </w:t>
+      </w:r>
+      <w:r>
+        <w:rPr>
+          <w:rFonts w:ascii="Courier New" w:hAnsi="Courier New"/>
+          <w:sz w:val="20"/>
+        </w:rPr>
+        <w:t>checkLogin()</w:t>
+      </w:r>
+      <w:r>
+        <w:rPr>
+          <w:rFonts w:ascii="Courier New" w:hAnsi="Courier New"/>
+          <w:sz w:val="20"/>
+        </w:rPr>
+        <w:t xml:space="preserve"> trả về </w:t>
+      </w:r>
+      <w:r>
+        <w:t>true</w:t>
+      </w:r>
+      <w:r>
+        <w:rPr>
+          <w:rFonts w:ascii="Courier New" w:hAnsi="Courier New"/>
+          <w:sz w:val="20"/>
+        </w:rPr>
+        <w:t xml:space="preserve"> cho phương thức </w:t>
+      </w:r>
+      <w:r>
+        <w:t>btnLoginClick()</w:t>
+      </w:r>
+      <w:r>
+        <w:t>`.</w:t>
+      </w:r>
+    </w:p>
+    <w:p>
+      <w:pPr/>
+      <w:r>
+        <w:t xml:space="preserve">11. Phương thức </w:t>
+      </w:r>
+      <w:r>
+        <w:rPr>
+          <w:rFonts w:ascii="Courier New" w:hAnsi="Courier New"/>
+          <w:sz w:val="20"/>
+        </w:rPr>
+        <w:t>btnLoginClick()</w:t>
+      </w:r>
+      <w:r>
+        <w:t xml:space="preserve"> gọi </w:t>
+      </w:r>
+      <w:r>
+        <w:rPr>
+          <w:rFonts w:ascii="Courier New" w:hAnsi="Courier New"/>
+          <w:sz w:val="20"/>
+        </w:rPr>
+        <w:t>redirect /home</w:t>
+      </w:r>
+      <w:r>
+        <w:t>, hiển thị showMessage("Đăng nhập thành công").</w:t>
+      </w:r>
+    </w:p>
+    <w:p>
+      <w:pPr/>
+      <w:r>
+        <w:rPr>
+          <w:b/>
+        </w:rPr>
+        <w:t>Ngoại lệ: tài khoản không tồn tại</w:t>
+      </w:r>
+    </w:p>
+    <w:p>
+      <w:pPr>
+        <w:pStyle w:val="ListBullet"/>
+      </w:pPr>
+      <w:r>
+        <w:t xml:space="preserve">Phương thức </w:t>
       </w:r>
       <w:r>
         <w:rPr>
@@ -9264,13 +9464,25 @@
         <w:t>findBySDT()</w:t>
       </w:r>
       <w:r>
-        <w:t xml:space="preserve"> của lớp User.</w:t>
-      </w:r>
-    </w:p>
-    <w:p>
-      <w:pPr/>
-      <w:r>
-        <w:t xml:space="preserve">8. Lớp User trả về đối tượng User cho phương thức </w:t>
+        <w:rPr>
+          <w:rFonts w:ascii="Courier New" w:hAnsi="Courier New"/>
+          <w:sz w:val="20"/>
+        </w:rPr>
+        <w:t xml:space="preserve"> trả về </w:t>
+      </w:r>
+      <w:r>
+        <w:t>null</w:t>
+      </w:r>
+      <w:r>
+        <w:t>`.</w:t>
+      </w:r>
+    </w:p>
+    <w:p>
+      <w:pPr>
+        <w:pStyle w:val="ListBullet"/>
+      </w:pPr>
+      <w:r>
+        <w:t xml:space="preserve">Phương thức </w:t>
       </w:r>
       <w:r>
         <w:rPr>
@@ -9280,13 +9492,80 @@
         <w:t>checkLogin()</w:t>
       </w:r>
       <w:r>
-        <w:t>.</w:t>
+        <w:rPr>
+          <w:rFonts w:ascii="Courier New" w:hAnsi="Courier New"/>
+          <w:sz w:val="20"/>
+        </w:rPr>
+        <w:t xml:space="preserve"> trả về </w:t>
+      </w:r>
+      <w:r>
+        <w:t>false</w:t>
+      </w:r>
+      <w:r>
+        <w:rPr>
+          <w:rFonts w:ascii="Courier New" w:hAnsi="Courier New"/>
+          <w:sz w:val="20"/>
+        </w:rPr>
+        <w:t xml:space="preserve"> cho </w:t>
+      </w:r>
+      <w:r>
+        <w:t>btnLoginClick()</w:t>
+      </w:r>
+      <w:r>
+        <w:t>`.</w:t>
+      </w:r>
+    </w:p>
+    <w:p>
+      <w:pPr>
+        <w:pStyle w:val="ListBullet"/>
+      </w:pPr>
+      <w:r>
+        <w:t>Lớp LoginPage hiển thị showMessage("Tài khoản không tồn tại. Vui lòng kiểm tra lại.")</w:t>
       </w:r>
     </w:p>
     <w:p>
       <w:pPr/>
       <w:r>
-        <w:t xml:space="preserve">9. Phương thức </w:t>
+        <w:rPr>
+          <w:b/>
+        </w:rPr>
+        <w:t>Ngoại lệ: mật khẩu sai</w:t>
+      </w:r>
+    </w:p>
+    <w:p>
+      <w:pPr>
+        <w:pStyle w:val="ListBullet"/>
+      </w:pPr>
+      <w:r>
+        <w:t xml:space="preserve">Phương thức </w:t>
+      </w:r>
+      <w:r>
+        <w:rPr>
+          <w:rFonts w:ascii="Courier New" w:hAnsi="Courier New"/>
+          <w:sz w:val="20"/>
+        </w:rPr>
+        <w:t>checkPassword()</w:t>
+      </w:r>
+      <w:r>
+        <w:rPr>
+          <w:rFonts w:ascii="Courier New" w:hAnsi="Courier New"/>
+          <w:sz w:val="20"/>
+        </w:rPr>
+        <w:t xml:space="preserve"> trả về </w:t>
+      </w:r>
+      <w:r>
+        <w:t>false</w:t>
+      </w:r>
+      <w:r>
+        <w:t>`.</w:t>
+      </w:r>
+    </w:p>
+    <w:p>
+      <w:pPr>
+        <w:pStyle w:val="ListBullet"/>
+      </w:pPr>
+      <w:r>
+        <w:t xml:space="preserve">Phương thức </w:t>
       </w:r>
       <w:r>
         <w:rPr>
@@ -9296,237 +9575,27 @@
         <w:t>checkLogin()</w:t>
       </w:r>
       <w:r>
-        <w:t xml:space="preserve"> gọi </w:t>
-      </w:r>
-      <w:r>
         <w:rPr>
           <w:rFonts w:ascii="Courier New" w:hAnsi="Courier New"/>
           <w:sz w:val="20"/>
         </w:rPr>
-        <w:t>checkPassword()</w:t>
-      </w:r>
-      <w:r>
-        <w:t xml:space="preserve"> để so sánh mật khẩu.</w:t>
-      </w:r>
-    </w:p>
-    <w:p>
-      <w:pPr/>
-      <w:r>
-        <w:t xml:space="preserve">10. Phương thức </w:t>
+        <w:t xml:space="preserve"> trả về </w:t>
+      </w:r>
+      <w:r>
+        <w:t>false</w:t>
       </w:r>
       <w:r>
         <w:rPr>
           <w:rFonts w:ascii="Courier New" w:hAnsi="Courier New"/>
           <w:sz w:val="20"/>
         </w:rPr>
-        <w:t>checkLogin()</w:t>
-      </w:r>
-      <w:r>
-        <w:t xml:space="preserve"> trả về </w:t>
-      </w:r>
-      <w:r>
-        <w:rPr>
-          <w:rFonts w:ascii="Courier New" w:hAnsi="Courier New"/>
-          <w:sz w:val="20"/>
-        </w:rPr>
-        <w:t>true</w:t>
-      </w:r>
-      <w:r>
-        <w:t xml:space="preserve"> cho phương thức </w:t>
-      </w:r>
-      <w:r>
-        <w:rPr>
-          <w:rFonts w:ascii="Courier New" w:hAnsi="Courier New"/>
-          <w:sz w:val="20"/>
-        </w:rPr>
+        <w:t xml:space="preserve"> cho </w:t>
+      </w:r>
+      <w:r>
         <w:t>btnLoginClick()</w:t>
       </w:r>
       <w:r>
-        <w:t>.</w:t>
-      </w:r>
-    </w:p>
-    <w:p>
-      <w:pPr/>
-      <w:r>
-        <w:t xml:space="preserve">11. Phương thức </w:t>
-      </w:r>
-      <w:r>
-        <w:rPr>
-          <w:rFonts w:ascii="Courier New" w:hAnsi="Courier New"/>
-          <w:sz w:val="20"/>
-        </w:rPr>
-        <w:t>btnLoginClick()</w:t>
-      </w:r>
-      <w:r>
-        <w:t xml:space="preserve"> gọi </w:t>
-      </w:r>
-      <w:r>
-        <w:rPr>
-          <w:rFonts w:ascii="Courier New" w:hAnsi="Courier New"/>
-          <w:sz w:val="20"/>
-        </w:rPr>
-        <w:t>redirect /home</w:t>
-      </w:r>
-      <w:r>
-        <w:t>, hiển thị showMessage("Đăng nhập thành công").</w:t>
-      </w:r>
-    </w:p>
-    <w:p>
-      <w:pPr/>
-      <w:r>
-        <w:rPr>
-          <w:b/>
-        </w:rPr>
-        <w:t>Ngoại lệ: tài khoản không tồn tại</w:t>
-      </w:r>
-    </w:p>
-    <w:p>
-      <w:pPr>
-        <w:pStyle w:val="ListBullet"/>
-      </w:pPr>
-      <w:r>
-        <w:t xml:space="preserve">Phương thức </w:t>
-      </w:r>
-      <w:r>
-        <w:rPr>
-          <w:rFonts w:ascii="Courier New" w:hAnsi="Courier New"/>
-          <w:sz w:val="20"/>
-        </w:rPr>
-        <w:t>findBySDT()</w:t>
-      </w:r>
-      <w:r>
-        <w:t xml:space="preserve"> trả về </w:t>
-      </w:r>
-      <w:r>
-        <w:rPr>
-          <w:rFonts w:ascii="Courier New" w:hAnsi="Courier New"/>
-          <w:sz w:val="20"/>
-        </w:rPr>
-        <w:t>null</w:t>
-      </w:r>
-      <w:r>
-        <w:t>.</w:t>
-      </w:r>
-    </w:p>
-    <w:p>
-      <w:pPr>
-        <w:pStyle w:val="ListBullet"/>
-      </w:pPr>
-      <w:r>
-        <w:t xml:space="preserve">Phương thức </w:t>
-      </w:r>
-      <w:r>
-        <w:rPr>
-          <w:rFonts w:ascii="Courier New" w:hAnsi="Courier New"/>
-          <w:sz w:val="20"/>
-        </w:rPr>
-        <w:t>checkLogin()</w:t>
-      </w:r>
-      <w:r>
-        <w:t xml:space="preserve"> trả về </w:t>
-      </w:r>
-      <w:r>
-        <w:rPr>
-          <w:rFonts w:ascii="Courier New" w:hAnsi="Courier New"/>
-          <w:sz w:val="20"/>
-        </w:rPr>
-        <w:t>false</w:t>
-      </w:r>
-      <w:r>
-        <w:t xml:space="preserve"> cho </w:t>
-      </w:r>
-      <w:r>
-        <w:rPr>
-          <w:rFonts w:ascii="Courier New" w:hAnsi="Courier New"/>
-          <w:sz w:val="20"/>
-        </w:rPr>
-        <w:t>btnLoginClick()</w:t>
-      </w:r>
-      <w:r>
-        <w:t>.</w:t>
-      </w:r>
-    </w:p>
-    <w:p>
-      <w:pPr>
-        <w:pStyle w:val="ListBullet"/>
-      </w:pPr>
-      <w:r>
-        <w:t>Lớp LoginPage hiển thị showMessage("Tài khoản không tồn tại. Vui lòng kiểm tra lại.")</w:t>
-      </w:r>
-    </w:p>
-    <w:p>
-      <w:pPr/>
-      <w:r>
-        <w:rPr>
-          <w:b/>
-        </w:rPr>
-        <w:t>Ngoại lệ: mật khẩu sai</w:t>
-      </w:r>
-    </w:p>
-    <w:p>
-      <w:pPr>
-        <w:pStyle w:val="ListBullet"/>
-      </w:pPr>
-      <w:r>
-        <w:t xml:space="preserve">Phương thức </w:t>
-      </w:r>
-      <w:r>
-        <w:rPr>
-          <w:rFonts w:ascii="Courier New" w:hAnsi="Courier New"/>
-          <w:sz w:val="20"/>
-        </w:rPr>
-        <w:t>checkPassword()</w:t>
-      </w:r>
-      <w:r>
-        <w:t xml:space="preserve"> trả về </w:t>
-      </w:r>
-      <w:r>
-        <w:rPr>
-          <w:rFonts w:ascii="Courier New" w:hAnsi="Courier New"/>
-          <w:sz w:val="20"/>
-        </w:rPr>
-        <w:t>false</w:t>
-      </w:r>
-      <w:r>
-        <w:t>.</w:t>
-      </w:r>
-    </w:p>
-    <w:p>
-      <w:pPr>
-        <w:pStyle w:val="ListBullet"/>
-      </w:pPr>
-      <w:r>
-        <w:t xml:space="preserve">Phương thức </w:t>
-      </w:r>
-      <w:r>
-        <w:rPr>
-          <w:rFonts w:ascii="Courier New" w:hAnsi="Courier New"/>
-          <w:sz w:val="20"/>
-        </w:rPr>
-        <w:t>checkLogin()</w:t>
-      </w:r>
-      <w:r>
-        <w:t xml:space="preserve"> trả về </w:t>
-      </w:r>
-      <w:r>
-        <w:rPr>
-          <w:rFonts w:ascii="Courier New" w:hAnsi="Courier New"/>
-          <w:sz w:val="20"/>
-        </w:rPr>
-        <w:t>false</w:t>
-      </w:r>
-      <w:r>
-        <w:t xml:space="preserve"> cho </w:t>
-      </w:r>
-      <w:r>
-        <w:rPr>
-          <w:rFonts w:ascii="Courier New" w:hAnsi="Courier New"/>
-          <w:sz w:val="20"/>
-        </w:rPr>
-        <w:t>btnLoginClick()</w:t>
-      </w:r>
-      <w:r>
-        <w:t>.</w:t>
+        <w:t>`.</w:t>
       </w:r>
     </w:p>
     <w:p>
@@ -9682,7 +9751,7 @@
         <w:t>register()</w:t>
       </w:r>
       <w:r>
-        <w:t xml:space="preserve"> của lớp AuthController.</w:t>
+        <w:t>` của lớp AuthController.</w:t>
       </w:r>
     </w:p>
     <w:p>
@@ -9698,7 +9767,384 @@
         <w:t>register()</w:t>
       </w:r>
       <w:r>
+        <w:rPr>
+          <w:rFonts w:ascii="Courier New" w:hAnsi="Courier New"/>
+          <w:sz w:val="20"/>
+        </w:rPr>
         <w:t xml:space="preserve"> gọi phương thức </w:t>
+      </w:r>
+      <w:r>
+        <w:t>existsBySDT()</w:t>
+      </w:r>
+      <w:r>
+        <w:rPr>
+          <w:rFonts w:ascii="Courier New" w:hAnsi="Courier New"/>
+          <w:sz w:val="20"/>
+        </w:rPr>
+      </w:r>
+      <w:r>
+        <w:t xml:space="preserve"> của lớp User.</w:t>
+      </w:r>
+    </w:p>
+    <w:p>
+      <w:pPr/>
+      <w:r>
+        <w:t xml:space="preserve">8. Lớp User trả về </w:t>
+      </w:r>
+      <w:r>
+        <w:rPr>
+          <w:rFonts w:ascii="Courier New" w:hAnsi="Courier New"/>
+          <w:sz w:val="20"/>
+        </w:rPr>
+        <w:t>false</w:t>
+      </w:r>
+      <w:r>
+        <w:t xml:space="preserve"> cho phương thức </w:t>
+      </w:r>
+      <w:r>
+        <w:rPr>
+          <w:rFonts w:ascii="Courier New" w:hAnsi="Courier New"/>
+          <w:sz w:val="20"/>
+        </w:rPr>
+        <w:t>register()</w:t>
+      </w:r>
+      <w:r>
+        <w:t>`.</w:t>
+      </w:r>
+    </w:p>
+    <w:p>
+      <w:pPr/>
+      <w:r>
+        <w:t xml:space="preserve">9. Phương thức </w:t>
+      </w:r>
+      <w:r>
+        <w:rPr>
+          <w:rFonts w:ascii="Courier New" w:hAnsi="Courier New"/>
+          <w:sz w:val="20"/>
+        </w:rPr>
+        <w:t>register()</w:t>
+      </w:r>
+      <w:r>
+        <w:rPr>
+          <w:rFonts w:ascii="Courier New" w:hAnsi="Courier New"/>
+          <w:sz w:val="20"/>
+        </w:rPr>
+        <w:t xml:space="preserve"> gọi phương thức </w:t>
+      </w:r>
+      <w:r>
+        <w:t>existsByEmail()</w:t>
+      </w:r>
+      <w:r>
+        <w:rPr>
+          <w:rFonts w:ascii="Courier New" w:hAnsi="Courier New"/>
+          <w:sz w:val="20"/>
+        </w:rPr>
+      </w:r>
+      <w:r>
+        <w:t xml:space="preserve"> của lớp User.</w:t>
+      </w:r>
+    </w:p>
+    <w:p>
+      <w:pPr/>
+      <w:r>
+        <w:t xml:space="preserve">10. Lớp User trả về </w:t>
+      </w:r>
+      <w:r>
+        <w:rPr>
+          <w:rFonts w:ascii="Courier New" w:hAnsi="Courier New"/>
+          <w:sz w:val="20"/>
+        </w:rPr>
+        <w:t>false</w:t>
+      </w:r>
+      <w:r>
+        <w:t xml:space="preserve"> cho phương thức </w:t>
+      </w:r>
+      <w:r>
+        <w:rPr>
+          <w:rFonts w:ascii="Courier New" w:hAnsi="Courier New"/>
+          <w:sz w:val="20"/>
+        </w:rPr>
+        <w:t>register()</w:t>
+      </w:r>
+      <w:r>
+        <w:t>`.</w:t>
+      </w:r>
+    </w:p>
+    <w:p>
+      <w:pPr/>
+      <w:r>
+        <w:t xml:space="preserve">11. Phương thức </w:t>
+      </w:r>
+      <w:r>
+        <w:rPr>
+          <w:rFonts w:ascii="Courier New" w:hAnsi="Courier New"/>
+          <w:sz w:val="20"/>
+        </w:rPr>
+        <w:t>register()</w:t>
+      </w:r>
+      <w:r>
+        <w:rPr>
+          <w:rFonts w:ascii="Courier New" w:hAnsi="Courier New"/>
+          <w:sz w:val="20"/>
+        </w:rPr>
+        <w:t xml:space="preserve"> gọi </w:t>
+      </w:r>
+      <w:r>
+        <w:t>save()</w:t>
+      </w:r>
+      <w:r>
+        <w:rPr>
+          <w:rFonts w:ascii="Courier New" w:hAnsi="Courier New"/>
+          <w:sz w:val="20"/>
+        </w:rPr>
+      </w:r>
+      <w:r>
+        <w:t xml:space="preserve"> để tạo tài khoản mới.</w:t>
+      </w:r>
+    </w:p>
+    <w:p>
+      <w:pPr/>
+      <w:r>
+        <w:t xml:space="preserve">12. Phương thức </w:t>
+      </w:r>
+      <w:r>
+        <w:rPr>
+          <w:rFonts w:ascii="Courier New" w:hAnsi="Courier New"/>
+          <w:sz w:val="20"/>
+        </w:rPr>
+        <w:t>register()</w:t>
+      </w:r>
+      <w:r>
+        <w:rPr>
+          <w:rFonts w:ascii="Courier New" w:hAnsi="Courier New"/>
+          <w:sz w:val="20"/>
+        </w:rPr>
+        <w:t xml:space="preserve"> gọi </w:t>
+      </w:r>
+      <w:r>
+        <w:t>sendOTP()</w:t>
+      </w:r>
+      <w:r>
+        <w:rPr>
+          <w:rFonts w:ascii="Courier New" w:hAnsi="Courier New"/>
+          <w:sz w:val="20"/>
+        </w:rPr>
+      </w:r>
+      <w:r>
+        <w:t xml:space="preserve"> của lớp OTP.</w:t>
+      </w:r>
+    </w:p>
+    <w:p>
+      <w:pPr/>
+      <w:r>
+        <w:t>13. Lớp OTP gửi mã OTP đến SĐT.</w:t>
+      </w:r>
+    </w:p>
+    <w:p>
+      <w:pPr/>
+      <w:r>
+        <w:t xml:space="preserve">14. Phương thức </w:t>
+      </w:r>
+      <w:r>
+        <w:rPr>
+          <w:rFonts w:ascii="Courier New" w:hAnsi="Courier New"/>
+          <w:sz w:val="20"/>
+        </w:rPr>
+        <w:t>register()</w:t>
+      </w:r>
+      <w:r>
+        <w:rPr>
+          <w:rFonts w:ascii="Courier New" w:hAnsi="Courier New"/>
+          <w:sz w:val="20"/>
+        </w:rPr>
+        <w:t xml:space="preserve"> trả về đối tượng User cho phương thức </w:t>
+      </w:r>
+      <w:r>
+        <w:t>btnTiepTucClick()</w:t>
+      </w:r>
+      <w:r>
+        <w:t>`.</w:t>
+      </w:r>
+    </w:p>
+    <w:p>
+      <w:pPr/>
+      <w:r>
+        <w:t>15. RegisterPage hiển thị trang OTPVerifyPage.</w:t>
+      </w:r>
+    </w:p>
+    <w:p>
+      <w:pPr/>
+      <w:r>
+        <w:t>16. Khách hàng nhập mã OTP.</w:t>
+      </w:r>
+    </w:p>
+    <w:p>
+      <w:pPr/>
+      <w:r>
+        <w:t>17. Khách hàng click nút [Xác nhận].</w:t>
+      </w:r>
+    </w:p>
+    <w:p>
+      <w:pPr/>
+      <w:r>
+        <w:t xml:space="preserve">18. Phương thức </w:t>
+      </w:r>
+      <w:r>
+        <w:rPr>
+          <w:rFonts w:ascii="Courier New" w:hAnsi="Courier New"/>
+          <w:sz w:val="20"/>
+        </w:rPr>
+        <w:t>btnXacNhanClick()</w:t>
+      </w:r>
+      <w:r>
+        <w:t xml:space="preserve"> của lớp OTPVerifyPage được gọi.</w:t>
+      </w:r>
+    </w:p>
+    <w:p>
+      <w:pPr/>
+      <w:r>
+        <w:t xml:space="preserve">19. Phương thức </w:t>
+      </w:r>
+      <w:r>
+        <w:rPr>
+          <w:rFonts w:ascii="Courier New" w:hAnsi="Courier New"/>
+          <w:sz w:val="20"/>
+        </w:rPr>
+        <w:t>btnXacNhanClick()</w:t>
+      </w:r>
+      <w:r>
+        <w:t xml:space="preserve"> gọi phương thức </w:t>
+      </w:r>
+      <w:r>
+        <w:rPr>
+          <w:rFonts w:ascii="Courier New" w:hAnsi="Courier New"/>
+          <w:sz w:val="20"/>
+        </w:rPr>
+        <w:t>verifyOTP()</w:t>
+      </w:r>
+      <w:r>
+        <w:t>` của lớp AuthController.</w:t>
+      </w:r>
+    </w:p>
+    <w:p>
+      <w:pPr/>
+      <w:r>
+        <w:t xml:space="preserve">20. Phương thức </w:t>
+      </w:r>
+      <w:r>
+        <w:rPr>
+          <w:rFonts w:ascii="Courier New" w:hAnsi="Courier New"/>
+          <w:sz w:val="20"/>
+        </w:rPr>
+        <w:t>verifyOTP()</w:t>
+      </w:r>
+      <w:r>
+        <w:rPr>
+          <w:rFonts w:ascii="Courier New" w:hAnsi="Courier New"/>
+          <w:sz w:val="20"/>
+        </w:rPr>
+        <w:t xml:space="preserve"> gọi phương thức </w:t>
+      </w:r>
+      <w:r>
+        <w:t>verify()</w:t>
+      </w:r>
+      <w:r>
+        <w:t>` của lớp OTP.</w:t>
+      </w:r>
+    </w:p>
+    <w:p>
+      <w:pPr/>
+      <w:r>
+        <w:t xml:space="preserve">21. Lớp OTP trả về </w:t>
+      </w:r>
+      <w:r>
+        <w:rPr>
+          <w:rFonts w:ascii="Courier New" w:hAnsi="Courier New"/>
+          <w:sz w:val="20"/>
+        </w:rPr>
+        <w:t>true</w:t>
+      </w:r>
+      <w:r>
+        <w:t xml:space="preserve"> cho phương thức </w:t>
+      </w:r>
+      <w:r>
+        <w:rPr>
+          <w:rFonts w:ascii="Courier New" w:hAnsi="Courier New"/>
+          <w:sz w:val="20"/>
+        </w:rPr>
+        <w:t>verifyOTP()</w:t>
+      </w:r>
+      <w:r>
+        <w:t>`.</w:t>
+      </w:r>
+    </w:p>
+    <w:p>
+      <w:pPr/>
+      <w:r>
+        <w:t xml:space="preserve">22. Phương thức </w:t>
+      </w:r>
+      <w:r>
+        <w:rPr>
+          <w:rFonts w:ascii="Courier New" w:hAnsi="Courier New"/>
+          <w:sz w:val="20"/>
+        </w:rPr>
+        <w:t>verifyOTP()</w:t>
+      </w:r>
+      <w:r>
+        <w:rPr>
+          <w:rFonts w:ascii="Courier New" w:hAnsi="Courier New"/>
+          <w:sz w:val="20"/>
+        </w:rPr>
+        <w:t xml:space="preserve"> trả về </w:t>
+      </w:r>
+      <w:r>
+        <w:t>true</w:t>
+      </w:r>
+      <w:r>
+        <w:rPr>
+          <w:rFonts w:ascii="Courier New" w:hAnsi="Courier New"/>
+          <w:sz w:val="20"/>
+        </w:rPr>
+        <w:t xml:space="preserve"> cho phương thức </w:t>
+      </w:r>
+      <w:r>
+        <w:t>btnXacNhanClick()</w:t>
+      </w:r>
+      <w:r>
+        <w:t>`.</w:t>
+      </w:r>
+    </w:p>
+    <w:p>
+      <w:pPr/>
+      <w:r>
+        <w:t xml:space="preserve">23. Phương thức </w:t>
+      </w:r>
+      <w:r>
+        <w:rPr>
+          <w:rFonts w:ascii="Courier New" w:hAnsi="Courier New"/>
+          <w:sz w:val="20"/>
+        </w:rPr>
+        <w:t>btnXacNhanClick()</w:t>
+      </w:r>
+      <w:r>
+        <w:t xml:space="preserve"> gọi showMessage("Đăng ký thành công!")</w:t>
+      </w:r>
+    </w:p>
+    <w:p>
+      <w:pPr/>
+      <w:r>
+        <w:rPr>
+          <w:b/>
+        </w:rPr>
+        <w:t>Ngoại lệ: SĐT đã tồn tại</w:t>
+      </w:r>
+    </w:p>
+    <w:p>
+      <w:pPr>
+        <w:pStyle w:val="ListBullet"/>
+      </w:pPr>
+      <w:r>
+        <w:t xml:space="preserve">Phương thức </w:t>
       </w:r>
       <w:r>
         <w:rPr>
@@ -9708,13 +10154,80 @@
         <w:t>existsBySDT()</w:t>
       </w:r>
       <w:r>
-        <w:t xml:space="preserve"> của lớp User.</w:t>
+        <w:rPr>
+          <w:rFonts w:ascii="Courier New" w:hAnsi="Courier New"/>
+          <w:sz w:val="20"/>
+        </w:rPr>
+        <w:t xml:space="preserve"> trả về </w:t>
+      </w:r>
+      <w:r>
+        <w:t>true</w:t>
+      </w:r>
+      <w:r>
+        <w:t>`.</w:t>
+      </w:r>
+    </w:p>
+    <w:p>
+      <w:pPr>
+        <w:pStyle w:val="ListBullet"/>
+      </w:pPr>
+      <w:r>
+        <w:t xml:space="preserve">Phương thức </w:t>
+      </w:r>
+      <w:r>
+        <w:rPr>
+          <w:rFonts w:ascii="Courier New" w:hAnsi="Courier New"/>
+          <w:sz w:val="20"/>
+        </w:rPr>
+        <w:t>register()</w:t>
+      </w:r>
+      <w:r>
+        <w:rPr>
+          <w:rFonts w:ascii="Courier New" w:hAnsi="Courier New"/>
+          <w:sz w:val="20"/>
+        </w:rPr>
+        <w:t xml:space="preserve"> trả về lỗi cho </w:t>
+      </w:r>
+      <w:r>
+        <w:t>btnTiepTucClick()</w:t>
+      </w:r>
+      <w:r>
+        <w:t>`.</w:t>
+      </w:r>
+    </w:p>
+    <w:p>
+      <w:pPr>
+        <w:pStyle w:val="ListBullet"/>
+      </w:pPr>
+      <w:r>
+        <w:t>Lớp RegisterPage hiển thị showMessage("SĐT này đã được sử dụng.")</w:t>
       </w:r>
     </w:p>
     <w:p>
       <w:pPr/>
       <w:r>
-        <w:t xml:space="preserve">8. Lớp User trả về </w:t>
+        <w:rPr>
+          <w:b/>
+        </w:rPr>
+        <w:t>Ngoại lệ: OTP sai</w:t>
+      </w:r>
+    </w:p>
+    <w:p>
+      <w:pPr>
+        <w:pStyle w:val="ListBullet"/>
+      </w:pPr>
+      <w:r>
+        <w:t xml:space="preserve">Phương thức </w:t>
+      </w:r>
+      <w:r>
+        <w:rPr>
+          <w:rFonts w:ascii="Courier New" w:hAnsi="Courier New"/>
+          <w:sz w:val="20"/>
+        </w:rPr>
+        <w:t>verify()</w:t>
+      </w:r>
+      <w:r>
+        <w:t xml:space="preserve"> trả về </w:t>
       </w:r>
       <w:r>
         <w:rPr>
@@ -9724,203 +10237,15 @@
         <w:t>false</w:t>
       </w:r>
       <w:r>
-        <w:t xml:space="preserve"> cho phương thức </w:t>
-      </w:r>
-      <w:r>
-        <w:rPr>
-          <w:rFonts w:ascii="Courier New" w:hAnsi="Courier New"/>
-          <w:sz w:val="20"/>
-        </w:rPr>
-        <w:t>register()</w:t>
-      </w:r>
-      <w:r>
         <w:t>.</w:t>
       </w:r>
     </w:p>
     <w:p>
-      <w:pPr/>
-      <w:r>
-        <w:t xml:space="preserve">9. Phương thức </w:t>
-      </w:r>
-      <w:r>
-        <w:rPr>
-          <w:rFonts w:ascii="Courier New" w:hAnsi="Courier New"/>
-          <w:sz w:val="20"/>
-        </w:rPr>
-        <w:t>register()</w:t>
-      </w:r>
-      <w:r>
-        <w:t xml:space="preserve"> gọi phương thức </w:t>
-      </w:r>
-      <w:r>
-        <w:rPr>
-          <w:rFonts w:ascii="Courier New" w:hAnsi="Courier New"/>
-          <w:sz w:val="20"/>
-        </w:rPr>
-        <w:t>existsByEmail()</w:t>
-      </w:r>
-      <w:r>
-        <w:t xml:space="preserve"> của lớp User.</w:t>
-      </w:r>
-    </w:p>
-    <w:p>
-      <w:pPr/>
-      <w:r>
-        <w:t xml:space="preserve">10. Lớp User trả về </w:t>
-      </w:r>
-      <w:r>
-        <w:rPr>
-          <w:rFonts w:ascii="Courier New" w:hAnsi="Courier New"/>
-          <w:sz w:val="20"/>
-        </w:rPr>
-        <w:t>false</w:t>
-      </w:r>
-      <w:r>
-        <w:t xml:space="preserve"> cho phương thức </w:t>
-      </w:r>
-      <w:r>
-        <w:rPr>
-          <w:rFonts w:ascii="Courier New" w:hAnsi="Courier New"/>
-          <w:sz w:val="20"/>
-        </w:rPr>
-        <w:t>register()</w:t>
-      </w:r>
-      <w:r>
-        <w:t>.</w:t>
-      </w:r>
-    </w:p>
-    <w:p>
-      <w:pPr/>
-      <w:r>
-        <w:t xml:space="preserve">11. Phương thức </w:t>
-      </w:r>
-      <w:r>
-        <w:rPr>
-          <w:rFonts w:ascii="Courier New" w:hAnsi="Courier New"/>
-          <w:sz w:val="20"/>
-        </w:rPr>
-        <w:t>register()</w:t>
-      </w:r>
-      <w:r>
-        <w:t xml:space="preserve"> gọi </w:t>
-      </w:r>
-      <w:r>
-        <w:rPr>
-          <w:rFonts w:ascii="Courier New" w:hAnsi="Courier New"/>
-          <w:sz w:val="20"/>
-        </w:rPr>
-        <w:t>save()</w:t>
-      </w:r>
-      <w:r>
-        <w:t xml:space="preserve"> để tạo tài khoản mới.</w:t>
-      </w:r>
-    </w:p>
-    <w:p>
-      <w:pPr/>
-      <w:r>
-        <w:t xml:space="preserve">12. Phương thức </w:t>
-      </w:r>
-      <w:r>
-        <w:rPr>
-          <w:rFonts w:ascii="Courier New" w:hAnsi="Courier New"/>
-          <w:sz w:val="20"/>
-        </w:rPr>
-        <w:t>register()</w:t>
-      </w:r>
-      <w:r>
-        <w:t xml:space="preserve"> gọi </w:t>
-      </w:r>
-      <w:r>
-        <w:rPr>
-          <w:rFonts w:ascii="Courier New" w:hAnsi="Courier New"/>
-          <w:sz w:val="20"/>
-        </w:rPr>
-        <w:t>sendOTP()</w:t>
-      </w:r>
-      <w:r>
-        <w:t xml:space="preserve"> của lớp OTP.</w:t>
-      </w:r>
-    </w:p>
-    <w:p>
-      <w:pPr/>
-      <w:r>
-        <w:t>13. Lớp OTP gửi mã OTP đến SĐT.</w:t>
-      </w:r>
-    </w:p>
-    <w:p>
-      <w:pPr/>
-      <w:r>
-        <w:t xml:space="preserve">14. Phương thức </w:t>
-      </w:r>
-      <w:r>
-        <w:rPr>
-          <w:rFonts w:ascii="Courier New" w:hAnsi="Courier New"/>
-          <w:sz w:val="20"/>
-        </w:rPr>
-        <w:t>register()</w:t>
-      </w:r>
-      <w:r>
-        <w:t xml:space="preserve"> trả về đối tượng User cho phương thức </w:t>
-      </w:r>
-      <w:r>
-        <w:rPr>
-          <w:rFonts w:ascii="Courier New" w:hAnsi="Courier New"/>
-          <w:sz w:val="20"/>
-        </w:rPr>
-        <w:t>btnTiepTucClick()</w:t>
-      </w:r>
-      <w:r>
-        <w:t>.</w:t>
-      </w:r>
-    </w:p>
-    <w:p>
-      <w:pPr/>
-      <w:r>
-        <w:t>15. RegisterPage hiển thị trang OTPVerifyPage.</w:t>
-      </w:r>
-    </w:p>
-    <w:p>
-      <w:pPr/>
-      <w:r>
-        <w:t>16. Khách hàng nhập mã OTP.</w:t>
-      </w:r>
-    </w:p>
-    <w:p>
-      <w:pPr/>
-      <w:r>
-        <w:t>17. Khách hàng click nút [Xác nhận].</w:t>
-      </w:r>
-    </w:p>
-    <w:p>
-      <w:pPr/>
-      <w:r>
-        <w:t xml:space="preserve">18. Phương thức </w:t>
-      </w:r>
-      <w:r>
-        <w:rPr>
-          <w:rFonts w:ascii="Courier New" w:hAnsi="Courier New"/>
-          <w:sz w:val="20"/>
-        </w:rPr>
-        <w:t>btnXacNhanClick()</w:t>
-      </w:r>
-      <w:r>
-        <w:t xml:space="preserve"> của lớp OTPVerifyPage được gọi.</w:t>
-      </w:r>
-    </w:p>
-    <w:p>
-      <w:pPr/>
-      <w:r>
-        <w:t xml:space="preserve">19. Phương thức </w:t>
-      </w:r>
-      <w:r>
-        <w:rPr>
-          <w:rFonts w:ascii="Courier New" w:hAnsi="Courier New"/>
-          <w:sz w:val="20"/>
-        </w:rPr>
-        <w:t>btnXacNhanClick()</w:t>
-      </w:r>
-      <w:r>
-        <w:t xml:space="preserve"> gọi phương thức </w:t>
+      <w:pPr>
+        <w:pStyle w:val="ListBullet"/>
+      </w:pPr>
+      <w:r>
+        <w:t xml:space="preserve">Phương thức </w:t>
       </w:r>
       <w:r>
         <w:rPr>
@@ -9930,259 +10255,27 @@
         <w:t>verifyOTP()</w:t>
       </w:r>
       <w:r>
-        <w:t xml:space="preserve"> của lớp AuthController.</w:t>
-      </w:r>
-    </w:p>
-    <w:p>
-      <w:pPr/>
-      <w:r>
-        <w:t xml:space="preserve">20. Phương thức </w:t>
-      </w:r>
-      <w:r>
         <w:rPr>
           <w:rFonts w:ascii="Courier New" w:hAnsi="Courier New"/>
           <w:sz w:val="20"/>
         </w:rPr>
-        <w:t>verifyOTP()</w:t>
-      </w:r>
-      <w:r>
-        <w:t xml:space="preserve"> gọi phương thức </w:t>
+        <w:t xml:space="preserve"> trả về </w:t>
+      </w:r>
+      <w:r>
+        <w:t>false</w:t>
       </w:r>
       <w:r>
         <w:rPr>
           <w:rFonts w:ascii="Courier New" w:hAnsi="Courier New"/>
           <w:sz w:val="20"/>
         </w:rPr>
-        <w:t>verify()</w:t>
-      </w:r>
-      <w:r>
-        <w:t xml:space="preserve"> của lớp OTP.</w:t>
-      </w:r>
-    </w:p>
-    <w:p>
-      <w:pPr/>
-      <w:r>
-        <w:t xml:space="preserve">21. Lớp OTP trả về </w:t>
-      </w:r>
-      <w:r>
-        <w:rPr>
-          <w:rFonts w:ascii="Courier New" w:hAnsi="Courier New"/>
-          <w:sz w:val="20"/>
-        </w:rPr>
-        <w:t>true</w:t>
-      </w:r>
-      <w:r>
-        <w:t xml:space="preserve"> cho phương thức </w:t>
-      </w:r>
-      <w:r>
-        <w:rPr>
-          <w:rFonts w:ascii="Courier New" w:hAnsi="Courier New"/>
-          <w:sz w:val="20"/>
-        </w:rPr>
-        <w:t>verifyOTP()</w:t>
-      </w:r>
-      <w:r>
-        <w:t>.</w:t>
-      </w:r>
-    </w:p>
-    <w:p>
-      <w:pPr/>
-      <w:r>
-        <w:t xml:space="preserve">22. Phương thức </w:t>
-      </w:r>
-      <w:r>
-        <w:rPr>
-          <w:rFonts w:ascii="Courier New" w:hAnsi="Courier New"/>
-          <w:sz w:val="20"/>
-        </w:rPr>
-        <w:t>verifyOTP()</w:t>
-      </w:r>
-      <w:r>
-        <w:t xml:space="preserve"> trả về </w:t>
-      </w:r>
-      <w:r>
-        <w:rPr>
-          <w:rFonts w:ascii="Courier New" w:hAnsi="Courier New"/>
-          <w:sz w:val="20"/>
-        </w:rPr>
-        <w:t>true</w:t>
-      </w:r>
-      <w:r>
-        <w:t xml:space="preserve"> cho phương thức </w:t>
-      </w:r>
-      <w:r>
-        <w:rPr>
-          <w:rFonts w:ascii="Courier New" w:hAnsi="Courier New"/>
-          <w:sz w:val="20"/>
-        </w:rPr>
+        <w:t xml:space="preserve"> cho </w:t>
+      </w:r>
+      <w:r>
         <w:t>btnXacNhanClick()</w:t>
       </w:r>
       <w:r>
-        <w:t>.</w:t>
-      </w:r>
-    </w:p>
-    <w:p>
-      <w:pPr/>
-      <w:r>
-        <w:t xml:space="preserve">23. Phương thức </w:t>
-      </w:r>
-      <w:r>
-        <w:rPr>
-          <w:rFonts w:ascii="Courier New" w:hAnsi="Courier New"/>
-          <w:sz w:val="20"/>
-        </w:rPr>
-        <w:t>btnXacNhanClick()</w:t>
-      </w:r>
-      <w:r>
-        <w:t xml:space="preserve"> gọi showMessage("Đăng ký thành công!")</w:t>
-      </w:r>
-    </w:p>
-    <w:p>
-      <w:pPr/>
-      <w:r>
-        <w:rPr>
-          <w:b/>
-        </w:rPr>
-        <w:t>Ngoại lệ: SĐT đã tồn tại</w:t>
-      </w:r>
-    </w:p>
-    <w:p>
-      <w:pPr>
-        <w:pStyle w:val="ListBullet"/>
-      </w:pPr>
-      <w:r>
-        <w:t xml:space="preserve">Phương thức </w:t>
-      </w:r>
-      <w:r>
-        <w:rPr>
-          <w:rFonts w:ascii="Courier New" w:hAnsi="Courier New"/>
-          <w:sz w:val="20"/>
-        </w:rPr>
-        <w:t>existsBySDT()</w:t>
-      </w:r>
-      <w:r>
-        <w:t xml:space="preserve"> trả về </w:t>
-      </w:r>
-      <w:r>
-        <w:rPr>
-          <w:rFonts w:ascii="Courier New" w:hAnsi="Courier New"/>
-          <w:sz w:val="20"/>
-        </w:rPr>
-        <w:t>true</w:t>
-      </w:r>
-      <w:r>
-        <w:t>.</w:t>
-      </w:r>
-    </w:p>
-    <w:p>
-      <w:pPr>
-        <w:pStyle w:val="ListBullet"/>
-      </w:pPr>
-      <w:r>
-        <w:t xml:space="preserve">Phương thức </w:t>
-      </w:r>
-      <w:r>
-        <w:rPr>
-          <w:rFonts w:ascii="Courier New" w:hAnsi="Courier New"/>
-          <w:sz w:val="20"/>
-        </w:rPr>
-        <w:t>register()</w:t>
-      </w:r>
-      <w:r>
-        <w:t xml:space="preserve"> trả về lỗi cho </w:t>
-      </w:r>
-      <w:r>
-        <w:rPr>
-          <w:rFonts w:ascii="Courier New" w:hAnsi="Courier New"/>
-          <w:sz w:val="20"/>
-        </w:rPr>
-        <w:t>btnTiepTucClick()</w:t>
-      </w:r>
-      <w:r>
-        <w:t>.</w:t>
-      </w:r>
-    </w:p>
-    <w:p>
-      <w:pPr>
-        <w:pStyle w:val="ListBullet"/>
-      </w:pPr>
-      <w:r>
-        <w:t>Lớp RegisterPage hiển thị showMessage("SĐT này đã được sử dụng.")</w:t>
-      </w:r>
-    </w:p>
-    <w:p>
-      <w:pPr/>
-      <w:r>
-        <w:rPr>
-          <w:b/>
-        </w:rPr>
-        <w:t>Ngoại lệ: OTP sai</w:t>
-      </w:r>
-    </w:p>
-    <w:p>
-      <w:pPr>
-        <w:pStyle w:val="ListBullet"/>
-      </w:pPr>
-      <w:r>
-        <w:t xml:space="preserve">Phương thức </w:t>
-      </w:r>
-      <w:r>
-        <w:rPr>
-          <w:rFonts w:ascii="Courier New" w:hAnsi="Courier New"/>
-          <w:sz w:val="20"/>
-        </w:rPr>
-        <w:t>verify()</w:t>
-      </w:r>
-      <w:r>
-        <w:t xml:space="preserve"> trả về </w:t>
-      </w:r>
-      <w:r>
-        <w:rPr>
-          <w:rFonts w:ascii="Courier New" w:hAnsi="Courier New"/>
-          <w:sz w:val="20"/>
-        </w:rPr>
-        <w:t>false</w:t>
-      </w:r>
-      <w:r>
-        <w:t>.</w:t>
-      </w:r>
-    </w:p>
-    <w:p>
-      <w:pPr>
-        <w:pStyle w:val="ListBullet"/>
-      </w:pPr>
-      <w:r>
-        <w:t xml:space="preserve">Phương thức </w:t>
-      </w:r>
-      <w:r>
-        <w:rPr>
-          <w:rFonts w:ascii="Courier New" w:hAnsi="Courier New"/>
-          <w:sz w:val="20"/>
-        </w:rPr>
-        <w:t>verifyOTP()</w:t>
-      </w:r>
-      <w:r>
-        <w:t xml:space="preserve"> trả về </w:t>
-      </w:r>
-      <w:r>
-        <w:rPr>
-          <w:rFonts w:ascii="Courier New" w:hAnsi="Courier New"/>
-          <w:sz w:val="20"/>
-        </w:rPr>
-        <w:t>false</w:t>
-      </w:r>
-      <w:r>
-        <w:t xml:space="preserve"> cho </w:t>
-      </w:r>
-      <w:r>
-        <w:rPr>
-          <w:rFonts w:ascii="Courier New" w:hAnsi="Courier New"/>
-          <w:sz w:val="20"/>
-        </w:rPr>
-        <w:t>btnXacNhanClick()</w:t>
-      </w:r>
-      <w:r>
-        <w:t>.</w:t>
+        <w:t>`.</w:t>
       </w:r>
     </w:p>
     <w:p>
@@ -10338,7 +10431,7 @@
         <w:t>changePassword()</w:t>
       </w:r>
       <w:r>
-        <w:t xml:space="preserve"> của lớp AuthController.</w:t>
+        <w:t>` của lớp AuthController.</w:t>
       </w:r>
     </w:p>
     <w:p>
@@ -10354,17 +10447,17 @@
         <w:t>changePassword()</w:t>
       </w:r>
       <w:r>
-        <w:t xml:space="preserve"> gọi phương thức </w:t>
-      </w:r>
-      <w:r>
         <w:rPr>
           <w:rFonts w:ascii="Courier New" w:hAnsi="Courier New"/>
           <w:sz w:val="20"/>
         </w:rPr>
+        <w:t xml:space="preserve"> gọi phương thức </w:t>
+      </w:r>
+      <w:r>
         <w:t>findById()</w:t>
       </w:r>
       <w:r>
-        <w:t xml:space="preserve"> của lớp User.</w:t>
+        <w:t>` của lớp User.</w:t>
       </w:r>
     </w:p>
     <w:p>
@@ -10380,7 +10473,7 @@
         <w:t>changePassword()</w:t>
       </w:r>
       <w:r>
-        <w:t>.</w:t>
+        <w:t>`.</w:t>
       </w:r>
     </w:p>
     <w:p>
@@ -10396,7 +10489,214 @@
         <w:t>changePassword()</w:t>
       </w:r>
       <w:r>
+        <w:rPr>
+          <w:rFonts w:ascii="Courier New" w:hAnsi="Courier New"/>
+          <w:sz w:val="20"/>
+        </w:rPr>
         <w:t xml:space="preserve"> gọi </w:t>
+      </w:r>
+      <w:r>
+        <w:t>checkPassword()</w:t>
+      </w:r>
+      <w:r>
+        <w:rPr>
+          <w:rFonts w:ascii="Courier New" w:hAnsi="Courier New"/>
+          <w:sz w:val="20"/>
+        </w:rPr>
+      </w:r>
+      <w:r>
+        <w:t xml:space="preserve"> để xác minh Mật khẩu hiện tại.</w:t>
+      </w:r>
+    </w:p>
+    <w:p>
+      <w:pPr/>
+      <w:r>
+        <w:t xml:space="preserve">10. Phương thức </w:t>
+      </w:r>
+      <w:r>
+        <w:rPr>
+          <w:rFonts w:ascii="Courier New" w:hAnsi="Courier New"/>
+          <w:sz w:val="20"/>
+        </w:rPr>
+        <w:t>changePassword()</w:t>
+      </w:r>
+      <w:r>
+        <w:rPr>
+          <w:rFonts w:ascii="Courier New" w:hAnsi="Courier New"/>
+          <w:sz w:val="20"/>
+        </w:rPr>
+        <w:t xml:space="preserve"> gọi </w:t>
+      </w:r>
+      <w:r>
+        <w:t>hashPassword()</w:t>
+      </w:r>
+      <w:r>
+        <w:rPr>
+          <w:rFonts w:ascii="Courier New" w:hAnsi="Courier New"/>
+          <w:sz w:val="20"/>
+        </w:rPr>
+      </w:r>
+      <w:r>
+        <w:t xml:space="preserve"> để mã hóa Mật khẩu mới.</w:t>
+      </w:r>
+    </w:p>
+    <w:p>
+      <w:pPr/>
+      <w:r>
+        <w:t xml:space="preserve">11. Phương thức </w:t>
+      </w:r>
+      <w:r>
+        <w:rPr>
+          <w:rFonts w:ascii="Courier New" w:hAnsi="Courier New"/>
+          <w:sz w:val="20"/>
+        </w:rPr>
+        <w:t>changePassword()</w:t>
+      </w:r>
+      <w:r>
+        <w:rPr>
+          <w:rFonts w:ascii="Courier New" w:hAnsi="Courier New"/>
+          <w:sz w:val="20"/>
+        </w:rPr>
+        <w:t xml:space="preserve"> gọi </w:t>
+      </w:r>
+      <w:r>
+        <w:t>updatePassword()</w:t>
+      </w:r>
+      <w:r>
+        <w:rPr>
+          <w:rFonts w:ascii="Courier New" w:hAnsi="Courier New"/>
+          <w:sz w:val="20"/>
+        </w:rPr>
+      </w:r>
+      <w:r>
+        <w:t xml:space="preserve"> của lớp User.</w:t>
+      </w:r>
+    </w:p>
+    <w:p>
+      <w:pPr/>
+      <w:r>
+        <w:t xml:space="preserve">12. Lớp User trả về </w:t>
+      </w:r>
+      <w:r>
+        <w:rPr>
+          <w:rFonts w:ascii="Courier New" w:hAnsi="Courier New"/>
+          <w:sz w:val="20"/>
+        </w:rPr>
+        <w:t>true</w:t>
+      </w:r>
+      <w:r>
+        <w:t xml:space="preserve"> cho phương thức </w:t>
+      </w:r>
+      <w:r>
+        <w:rPr>
+          <w:rFonts w:ascii="Courier New" w:hAnsi="Courier New"/>
+          <w:sz w:val="20"/>
+        </w:rPr>
+        <w:t>changePassword()</w:t>
+      </w:r>
+      <w:r>
+        <w:t>`.</w:t>
+      </w:r>
+    </w:p>
+    <w:p>
+      <w:pPr/>
+      <w:r>
+        <w:t xml:space="preserve">13. Phương thức </w:t>
+      </w:r>
+      <w:r>
+        <w:rPr>
+          <w:rFonts w:ascii="Courier New" w:hAnsi="Courier New"/>
+          <w:sz w:val="20"/>
+        </w:rPr>
+        <w:t>changePassword()</w:t>
+      </w:r>
+      <w:r>
+        <w:rPr>
+          <w:rFonts w:ascii="Courier New" w:hAnsi="Courier New"/>
+          <w:sz w:val="20"/>
+        </w:rPr>
+        <w:t xml:space="preserve"> gọi </w:t>
+      </w:r>
+      <w:r>
+        <w:t>revokeAllSessions()</w:t>
+      </w:r>
+      <w:r>
+        <w:rPr>
+          <w:rFonts w:ascii="Courier New" w:hAnsi="Courier New"/>
+          <w:sz w:val="20"/>
+        </w:rPr>
+      </w:r>
+      <w:r>
+        <w:t xml:space="preserve"> để thu hồi tất cả session.</w:t>
+      </w:r>
+    </w:p>
+    <w:p>
+      <w:pPr/>
+      <w:r>
+        <w:t xml:space="preserve">14. Phương thức </w:t>
+      </w:r>
+      <w:r>
+        <w:rPr>
+          <w:rFonts w:ascii="Courier New" w:hAnsi="Courier New"/>
+          <w:sz w:val="20"/>
+        </w:rPr>
+        <w:t>changePassword()</w:t>
+      </w:r>
+      <w:r>
+        <w:rPr>
+          <w:rFonts w:ascii="Courier New" w:hAnsi="Courier New"/>
+          <w:sz w:val="20"/>
+        </w:rPr>
+        <w:t xml:space="preserve"> trả về </w:t>
+      </w:r>
+      <w:r>
+        <w:t>true</w:t>
+      </w:r>
+      <w:r>
+        <w:rPr>
+          <w:rFonts w:ascii="Courier New" w:hAnsi="Courier New"/>
+          <w:sz w:val="20"/>
+        </w:rPr>
+        <w:t xml:space="preserve"> cho phương thức </w:t>
+      </w:r>
+      <w:r>
+        <w:t>btnLuuClick()</w:t>
+      </w:r>
+      <w:r>
+        <w:t>`.</w:t>
+      </w:r>
+    </w:p>
+    <w:p>
+      <w:pPr/>
+      <w:r>
+        <w:t xml:space="preserve">15. Phương thức </w:t>
+      </w:r>
+      <w:r>
+        <w:rPr>
+          <w:rFonts w:ascii="Courier New" w:hAnsi="Courier New"/>
+          <w:sz w:val="20"/>
+        </w:rPr>
+        <w:t>btnLuuClick()</w:t>
+      </w:r>
+      <w:r>
+        <w:t xml:space="preserve"> gọi showMessage("Đổi mật khẩu thành công. Vui lòng đăng nhập lại.")</w:t>
+      </w:r>
+    </w:p>
+    <w:p>
+      <w:pPr/>
+      <w:r>
+        <w:rPr>
+          <w:b/>
+        </w:rPr>
+        <w:t>Ngoại lệ: MK hiện tại sai</w:t>
+      </w:r>
+    </w:p>
+    <w:p>
+      <w:pPr>
+        <w:pStyle w:val="ListBullet"/>
+      </w:pPr>
+      <w:r>
+        <w:t xml:space="preserve">Phương thức </w:t>
       </w:r>
       <w:r>
         <w:rPr>
@@ -10406,13 +10706,25 @@
         <w:t>checkPassword()</w:t>
       </w:r>
       <w:r>
-        <w:t xml:space="preserve"> để xác minh Mật khẩu hiện tại.</w:t>
-      </w:r>
-    </w:p>
-    <w:p>
-      <w:pPr/>
-      <w:r>
-        <w:t xml:space="preserve">10. Phương thức </w:t>
+        <w:rPr>
+          <w:rFonts w:ascii="Courier New" w:hAnsi="Courier New"/>
+          <w:sz w:val="20"/>
+        </w:rPr>
+        <w:t xml:space="preserve"> trả về </w:t>
+      </w:r>
+      <w:r>
+        <w:t>false</w:t>
+      </w:r>
+      <w:r>
+        <w:t>`.</w:t>
+      </w:r>
+    </w:p>
+    <w:p>
+      <w:pPr>
+        <w:pStyle w:val="ListBullet"/>
+      </w:pPr>
+      <w:r>
+        <w:t xml:space="preserve">Phương thức </w:t>
       </w:r>
       <w:r>
         <w:rPr>
@@ -10422,23 +10734,52 @@
         <w:t>changePassword()</w:t>
       </w:r>
       <w:r>
-        <w:t xml:space="preserve"> gọi </w:t>
-      </w:r>
-      <w:r>
         <w:rPr>
           <w:rFonts w:ascii="Courier New" w:hAnsi="Courier New"/>
           <w:sz w:val="20"/>
         </w:rPr>
-        <w:t>hashPassword()</w:t>
-      </w:r>
-      <w:r>
-        <w:t xml:space="preserve"> để mã hóa Mật khẩu mới.</w:t>
+        <w:t xml:space="preserve"> trả về </w:t>
+      </w:r>
+      <w:r>
+        <w:t>false</w:t>
+      </w:r>
+      <w:r>
+        <w:rPr>
+          <w:rFonts w:ascii="Courier New" w:hAnsi="Courier New"/>
+          <w:sz w:val="20"/>
+        </w:rPr>
+        <w:t xml:space="preserve"> cho </w:t>
+      </w:r>
+      <w:r>
+        <w:t>btnLuuClick()</w:t>
+      </w:r>
+      <w:r>
+        <w:t>`.</w:t>
+      </w:r>
+    </w:p>
+    <w:p>
+      <w:pPr>
+        <w:pStyle w:val="ListBullet"/>
+      </w:pPr>
+      <w:r>
+        <w:t>Lớp ChangePasswordPage hiển thị showMessage("Mật khẩu hiện tại không chính xác.")</w:t>
       </w:r>
     </w:p>
     <w:p>
       <w:pPr/>
       <w:r>
-        <w:t xml:space="preserve">11. Phương thức </w:t>
+        <w:rPr>
+          <w:b/>
+        </w:rPr>
+        <w:t>Ngoại lệ: MK mới trùng MK cũ</w:t>
+      </w:r>
+    </w:p>
+    <w:p>
+      <w:pPr>
+        <w:pStyle w:val="ListBullet"/>
+      </w:pPr>
+      <w:r>
+        <w:t xml:space="preserve">Phương thức </w:t>
       </w:r>
       <w:r>
         <w:rPr>
@@ -10448,33 +10789,15 @@
         <w:t>changePassword()</w:t>
       </w:r>
       <w:r>
-        <w:t xml:space="preserve"> gọi </w:t>
-      </w:r>
-      <w:r>
-        <w:rPr>
-          <w:rFonts w:ascii="Courier New" w:hAnsi="Courier New"/>
-          <w:sz w:val="20"/>
-        </w:rPr>
-        <w:t>updatePassword()</w:t>
-      </w:r>
-      <w:r>
-        <w:t xml:space="preserve"> của lớp User.</w:t>
-      </w:r>
-    </w:p>
-    <w:p>
-      <w:pPr/>
-      <w:r>
-        <w:t xml:space="preserve">12. Lớp User trả về </w:t>
-      </w:r>
-      <w:r>
-        <w:rPr>
-          <w:rFonts w:ascii="Courier New" w:hAnsi="Courier New"/>
-          <w:sz w:val="20"/>
-        </w:rPr>
-        <w:t>true</w:t>
-      </w:r>
-      <w:r>
-        <w:t xml:space="preserve"> cho phương thức </w:t>
+        <w:t>` kiểm tra MK mới trùng MK hiện tại.</w:t>
+      </w:r>
+    </w:p>
+    <w:p>
+      <w:pPr>
+        <w:pStyle w:val="ListBullet"/>
+      </w:pPr>
+      <w:r>
+        <w:t xml:space="preserve">Phương thức </w:t>
       </w:r>
       <w:r>
         <w:rPr>
@@ -10484,223 +10807,17 @@
         <w:t>changePassword()</w:t>
       </w:r>
       <w:r>
-        <w:t>.</w:t>
-      </w:r>
-    </w:p>
-    <w:p>
-      <w:pPr/>
-      <w:r>
-        <w:t xml:space="preserve">13. Phương thức </w:t>
-      </w:r>
-      <w:r>
         <w:rPr>
           <w:rFonts w:ascii="Courier New" w:hAnsi="Courier New"/>
           <w:sz w:val="20"/>
         </w:rPr>
-        <w:t>changePassword()</w:t>
-      </w:r>
-      <w:r>
-        <w:t xml:space="preserve"> gọi </w:t>
-      </w:r>
-      <w:r>
-        <w:rPr>
-          <w:rFonts w:ascii="Courier New" w:hAnsi="Courier New"/>
-          <w:sz w:val="20"/>
-        </w:rPr>
-        <w:t>revokeAllSessions()</w:t>
-      </w:r>
-      <w:r>
-        <w:t xml:space="preserve"> để thu hồi tất cả session.</w:t>
-      </w:r>
-    </w:p>
-    <w:p>
-      <w:pPr/>
-      <w:r>
-        <w:t xml:space="preserve">14. Phương thức </w:t>
-      </w:r>
-      <w:r>
-        <w:rPr>
-          <w:rFonts w:ascii="Courier New" w:hAnsi="Courier New"/>
-          <w:sz w:val="20"/>
-        </w:rPr>
-        <w:t>changePassword()</w:t>
-      </w:r>
-      <w:r>
-        <w:t xml:space="preserve"> trả về </w:t>
-      </w:r>
-      <w:r>
-        <w:rPr>
-          <w:rFonts w:ascii="Courier New" w:hAnsi="Courier New"/>
-          <w:sz w:val="20"/>
-        </w:rPr>
-        <w:t>true</w:t>
-      </w:r>
-      <w:r>
-        <w:t xml:space="preserve"> cho phương thức </w:t>
-      </w:r>
-      <w:r>
-        <w:rPr>
-          <w:rFonts w:ascii="Courier New" w:hAnsi="Courier New"/>
-          <w:sz w:val="20"/>
-        </w:rPr>
+        <w:t xml:space="preserve"> trả về lỗi cho </w:t>
+      </w:r>
+      <w:r>
         <w:t>btnLuuClick()</w:t>
       </w:r>
       <w:r>
-        <w:t>.</w:t>
-      </w:r>
-    </w:p>
-    <w:p>
-      <w:pPr/>
-      <w:r>
-        <w:t xml:space="preserve">15. Phương thức </w:t>
-      </w:r>
-      <w:r>
-        <w:rPr>
-          <w:rFonts w:ascii="Courier New" w:hAnsi="Courier New"/>
-          <w:sz w:val="20"/>
-        </w:rPr>
-        <w:t>btnLuuClick()</w:t>
-      </w:r>
-      <w:r>
-        <w:t xml:space="preserve"> gọi showMessage("Đổi mật khẩu thành công. Vui lòng đăng nhập lại.")</w:t>
-      </w:r>
-    </w:p>
-    <w:p>
-      <w:pPr/>
-      <w:r>
-        <w:rPr>
-          <w:b/>
-        </w:rPr>
-        <w:t>Ngoại lệ: MK hiện tại sai</w:t>
-      </w:r>
-    </w:p>
-    <w:p>
-      <w:pPr>
-        <w:pStyle w:val="ListBullet"/>
-      </w:pPr>
-      <w:r>
-        <w:t xml:space="preserve">Phương thức </w:t>
-      </w:r>
-      <w:r>
-        <w:rPr>
-          <w:rFonts w:ascii="Courier New" w:hAnsi="Courier New"/>
-          <w:sz w:val="20"/>
-        </w:rPr>
-        <w:t>checkPassword()</w:t>
-      </w:r>
-      <w:r>
-        <w:t xml:space="preserve"> trả về </w:t>
-      </w:r>
-      <w:r>
-        <w:rPr>
-          <w:rFonts w:ascii="Courier New" w:hAnsi="Courier New"/>
-          <w:sz w:val="20"/>
-        </w:rPr>
-        <w:t>false</w:t>
-      </w:r>
-      <w:r>
-        <w:t>.</w:t>
-      </w:r>
-    </w:p>
-    <w:p>
-      <w:pPr>
-        <w:pStyle w:val="ListBullet"/>
-      </w:pPr>
-      <w:r>
-        <w:t xml:space="preserve">Phương thức </w:t>
-      </w:r>
-      <w:r>
-        <w:rPr>
-          <w:rFonts w:ascii="Courier New" w:hAnsi="Courier New"/>
-          <w:sz w:val="20"/>
-        </w:rPr>
-        <w:t>changePassword()</w:t>
-      </w:r>
-      <w:r>
-        <w:t xml:space="preserve"> trả về </w:t>
-      </w:r>
-      <w:r>
-        <w:rPr>
-          <w:rFonts w:ascii="Courier New" w:hAnsi="Courier New"/>
-          <w:sz w:val="20"/>
-        </w:rPr>
-        <w:t>false</w:t>
-      </w:r>
-      <w:r>
-        <w:t xml:space="preserve"> cho </w:t>
-      </w:r>
-      <w:r>
-        <w:rPr>
-          <w:rFonts w:ascii="Courier New" w:hAnsi="Courier New"/>
-          <w:sz w:val="20"/>
-        </w:rPr>
-        <w:t>btnLuuClick()</w:t>
-      </w:r>
-      <w:r>
-        <w:t>.</w:t>
-      </w:r>
-    </w:p>
-    <w:p>
-      <w:pPr>
-        <w:pStyle w:val="ListBullet"/>
-      </w:pPr>
-      <w:r>
-        <w:t>Lớp ChangePasswordPage hiển thị showMessage("Mật khẩu hiện tại không chính xác.")</w:t>
-      </w:r>
-    </w:p>
-    <w:p>
-      <w:pPr/>
-      <w:r>
-        <w:rPr>
-          <w:b/>
-        </w:rPr>
-        <w:t>Ngoại lệ: MK mới trùng MK cũ</w:t>
-      </w:r>
-    </w:p>
-    <w:p>
-      <w:pPr>
-        <w:pStyle w:val="ListBullet"/>
-      </w:pPr>
-      <w:r>
-        <w:t xml:space="preserve">Phương thức </w:t>
-      </w:r>
-      <w:r>
-        <w:rPr>
-          <w:rFonts w:ascii="Courier New" w:hAnsi="Courier New"/>
-          <w:sz w:val="20"/>
-        </w:rPr>
-        <w:t>changePassword()</w:t>
-      </w:r>
-      <w:r>
-        <w:t xml:space="preserve"> kiểm tra MK mới trùng MK hiện tại.</w:t>
-      </w:r>
-    </w:p>
-    <w:p>
-      <w:pPr>
-        <w:pStyle w:val="ListBullet"/>
-      </w:pPr>
-      <w:r>
-        <w:t xml:space="preserve">Phương thức </w:t>
-      </w:r>
-      <w:r>
-        <w:rPr>
-          <w:rFonts w:ascii="Courier New" w:hAnsi="Courier New"/>
-          <w:sz w:val="20"/>
-        </w:rPr>
-        <w:t>changePassword()</w:t>
-      </w:r>
-      <w:r>
-        <w:t xml:space="preserve"> trả về lỗi cho </w:t>
-      </w:r>
-      <w:r>
-        <w:rPr>
-          <w:rFonts w:ascii="Courier New" w:hAnsi="Courier New"/>
-          <w:sz w:val="20"/>
-        </w:rPr>
-        <w:t>btnLuuClick()</w:t>
-      </w:r>
-      <w:r>
-        <w:t>.</w:t>
+        <w:t>`.</w:t>
       </w:r>
     </w:p>
     <w:p>
@@ -10818,7 +10935,7 @@
         <w:t>getProfile()</w:t>
       </w:r>
       <w:r>
-        <w:t xml:space="preserve"> của lớp ProfileController.</w:t>
+        <w:t>` của lớp ProfileController.</w:t>
       </w:r>
     </w:p>
     <w:p>
@@ -10834,17 +10951,17 @@
         <w:t>getProfile()</w:t>
       </w:r>
       <w:r>
-        <w:t xml:space="preserve"> gọi phương thức </w:t>
-      </w:r>
-      <w:r>
         <w:rPr>
           <w:rFonts w:ascii="Courier New" w:hAnsi="Courier New"/>
           <w:sz w:val="20"/>
         </w:rPr>
+        <w:t xml:space="preserve"> gọi phương thức </w:t>
+      </w:r>
+      <w:r>
         <w:t>findById()</w:t>
       </w:r>
       <w:r>
-        <w:t xml:space="preserve"> của lớp User.</w:t>
+        <w:t>` của lớp User.</w:t>
       </w:r>
     </w:p>
     <w:p>
@@ -10860,7 +10977,7 @@
         <w:t>getProfile()</w:t>
       </w:r>
       <w:r>
-        <w:t>.</w:t>
+        <w:t>`.</w:t>
       </w:r>
     </w:p>
     <w:p>
@@ -10876,7 +10993,23 @@
         <w:t>getProfile()</w:t>
       </w:r>
       <w:r>
+        <w:rPr>
+          <w:rFonts w:ascii="Courier New" w:hAnsi="Courier New"/>
+          <w:sz w:val="20"/>
+        </w:rPr>
         <w:t xml:space="preserve"> trả về đối tượng User cho phương thức </w:t>
+      </w:r>
+      <w:r>
+        <w:t>formLoad()</w:t>
+      </w:r>
+      <w:r>
+        <w:t>`.</w:t>
+      </w:r>
+    </w:p>
+    <w:p>
+      <w:pPr/>
+      <w:r>
+        <w:t xml:space="preserve">7. Phương thức </w:t>
       </w:r>
       <w:r>
         <w:rPr>
@@ -10886,22 +11019,6 @@
         <w:t>formLoad()</w:t>
       </w:r>
       <w:r>
-        <w:t>.</w:t>
-      </w:r>
-    </w:p>
-    <w:p>
-      <w:pPr/>
-      <w:r>
-        <w:t xml:space="preserve">7. Phương thức </w:t>
-      </w:r>
-      <w:r>
-        <w:rPr>
-          <w:rFonts w:ascii="Courier New" w:hAnsi="Courier New"/>
-          <w:sz w:val="20"/>
-        </w:rPr>
-        <w:t>formLoad()</w:t>
-      </w:r>
-      <w:r>
         <w:t xml:space="preserve"> gọi </w:t>
       </w:r>
       <w:r>
@@ -10972,7 +11089,7 @@
         <w:t>updateProfile()</w:t>
       </w:r>
       <w:r>
-        <w:t xml:space="preserve"> của lớp ProfileController.</w:t>
+        <w:t>` của lớp ProfileController.</w:t>
       </w:r>
     </w:p>
     <w:p>
@@ -10988,7 +11105,166 @@
         <w:t>updateProfile()</w:t>
       </w:r>
       <w:r>
+        <w:rPr>
+          <w:rFonts w:ascii="Courier New" w:hAnsi="Courier New"/>
+          <w:sz w:val="20"/>
+        </w:rPr>
         <w:t xml:space="preserve"> gọi phương thức </w:t>
+      </w:r>
+      <w:r>
+        <w:t>checkEmail()</w:t>
+      </w:r>
+      <w:r>
+        <w:rPr>
+          <w:rFonts w:ascii="Courier New" w:hAnsi="Courier New"/>
+          <w:sz w:val="20"/>
+        </w:rPr>
+      </w:r>
+      <w:r>
+        <w:t xml:space="preserve"> của lớp User.</w:t>
+      </w:r>
+    </w:p>
+    <w:p>
+      <w:pPr/>
+      <w:r>
+        <w:t xml:space="preserve">14. Lớp User trả về </w:t>
+      </w:r>
+      <w:r>
+        <w:rPr>
+          <w:rFonts w:ascii="Courier New" w:hAnsi="Courier New"/>
+          <w:sz w:val="20"/>
+        </w:rPr>
+        <w:t>true</w:t>
+      </w:r>
+      <w:r>
+        <w:t xml:space="preserve"> cho phương thức </w:t>
+      </w:r>
+      <w:r>
+        <w:rPr>
+          <w:rFonts w:ascii="Courier New" w:hAnsi="Courier New"/>
+          <w:sz w:val="20"/>
+        </w:rPr>
+        <w:t>updateProfile()</w:t>
+      </w:r>
+      <w:r>
+        <w:t>`.</w:t>
+      </w:r>
+    </w:p>
+    <w:p>
+      <w:pPr/>
+      <w:r>
+        <w:t xml:space="preserve">15. Phương thức </w:t>
+      </w:r>
+      <w:r>
+        <w:rPr>
+          <w:rFonts w:ascii="Courier New" w:hAnsi="Courier New"/>
+          <w:sz w:val="20"/>
+        </w:rPr>
+        <w:t>updateProfile()</w:t>
+      </w:r>
+      <w:r>
+        <w:rPr>
+          <w:rFonts w:ascii="Courier New" w:hAnsi="Courier New"/>
+          <w:sz w:val="20"/>
+        </w:rPr>
+        <w:t xml:space="preserve"> gọi </w:t>
+      </w:r>
+      <w:r>
+        <w:t>save()</w:t>
+      </w:r>
+      <w:r>
+        <w:rPr>
+          <w:rFonts w:ascii="Courier New" w:hAnsi="Courier New"/>
+          <w:sz w:val="20"/>
+        </w:rPr>
+      </w:r>
+      <w:r>
+        <w:t xml:space="preserve"> để cập nhật hồ sơ.</w:t>
+      </w:r>
+    </w:p>
+    <w:p>
+      <w:pPr/>
+      <w:r>
+        <w:t xml:space="preserve">16. Lớp User trả về đối tượng User đã cập nhật cho phương thức </w:t>
+      </w:r>
+      <w:r>
+        <w:rPr>
+          <w:rFonts w:ascii="Courier New" w:hAnsi="Courier New"/>
+          <w:sz w:val="20"/>
+        </w:rPr>
+        <w:t>updateProfile()</w:t>
+      </w:r>
+      <w:r>
+        <w:t>`.</w:t>
+      </w:r>
+    </w:p>
+    <w:p>
+      <w:pPr/>
+      <w:r>
+        <w:t xml:space="preserve">17. Phương thức </w:t>
+      </w:r>
+      <w:r>
+        <w:rPr>
+          <w:rFonts w:ascii="Courier New" w:hAnsi="Courier New"/>
+          <w:sz w:val="20"/>
+        </w:rPr>
+        <w:t>updateProfile()</w:t>
+      </w:r>
+      <w:r>
+        <w:rPr>
+          <w:rFonts w:ascii="Courier New" w:hAnsi="Courier New"/>
+          <w:sz w:val="20"/>
+        </w:rPr>
+        <w:t xml:space="preserve"> trả về đối tượng User cho phương thức </w:t>
+      </w:r>
+      <w:r>
+        <w:t>btnChinhSuaClick()</w:t>
+      </w:r>
+      <w:r>
+        <w:t>`.</w:t>
+      </w:r>
+    </w:p>
+    <w:p>
+      <w:pPr/>
+      <w:r>
+        <w:t xml:space="preserve">18. Phương thức </w:t>
+      </w:r>
+      <w:r>
+        <w:rPr>
+          <w:rFonts w:ascii="Courier New" w:hAnsi="Courier New"/>
+          <w:sz w:val="20"/>
+        </w:rPr>
+        <w:t>btnChinhSuaClick()</w:t>
+      </w:r>
+      <w:r>
+        <w:t xml:space="preserve"> gọi </w:t>
+      </w:r>
+      <w:r>
+        <w:rPr>
+          <w:rFonts w:ascii="Courier New" w:hAnsi="Courier New"/>
+          <w:sz w:val="20"/>
+        </w:rPr>
+        <w:t>displayProfile()</w:t>
+      </w:r>
+      <w:r>
+        <w:t>, hiển thị showMessage("Cập nhật thành công!")</w:t>
+      </w:r>
+    </w:p>
+    <w:p>
+      <w:pPr/>
+      <w:r>
+        <w:rPr>
+          <w:b/>
+        </w:rPr>
+        <w:t>Ngoại lệ: Email đã được dùng</w:t>
+      </w:r>
+    </w:p>
+    <w:p>
+      <w:pPr>
+        <w:pStyle w:val="ListBullet"/>
+      </w:pPr>
+      <w:r>
+        <w:t xml:space="preserve">Phương thức </w:t>
       </w:r>
       <w:r>
         <w:rPr>
@@ -10998,23 +11274,25 @@
         <w:t>checkEmail()</w:t>
       </w:r>
       <w:r>
-        <w:t xml:space="preserve"> của lớp User.</w:t>
-      </w:r>
-    </w:p>
-    <w:p>
-      <w:pPr/>
-      <w:r>
-        <w:t xml:space="preserve">14. Lớp User trả về </w:t>
-      </w:r>
-      <w:r>
         <w:rPr>
           <w:rFonts w:ascii="Courier New" w:hAnsi="Courier New"/>
           <w:sz w:val="20"/>
         </w:rPr>
-        <w:t>true</w:t>
-      </w:r>
-      <w:r>
-        <w:t xml:space="preserve"> cho phương thức </w:t>
+        <w:t xml:space="preserve"> trả về </w:t>
+      </w:r>
+      <w:r>
+        <w:t>false</w:t>
+      </w:r>
+      <w:r>
+        <w:t>`.</w:t>
+      </w:r>
+    </w:p>
+    <w:p>
+      <w:pPr>
+        <w:pStyle w:val="ListBullet"/>
+      </w:pPr>
+      <w:r>
+        <w:t xml:space="preserve">Phương thức </w:t>
       </w:r>
       <w:r>
         <w:rPr>
@@ -11024,166 +11302,17 @@
         <w:t>updateProfile()</w:t>
       </w:r>
       <w:r>
-        <w:t>.</w:t>
-      </w:r>
-    </w:p>
-    <w:p>
-      <w:pPr/>
-      <w:r>
-        <w:t xml:space="preserve">15. Phương thức </w:t>
-      </w:r>
-      <w:r>
         <w:rPr>
           <w:rFonts w:ascii="Courier New" w:hAnsi="Courier New"/>
           <w:sz w:val="20"/>
         </w:rPr>
-        <w:t>updateProfile()</w:t>
-      </w:r>
-      <w:r>
-        <w:t xml:space="preserve"> gọi </w:t>
-      </w:r>
-      <w:r>
-        <w:rPr>
-          <w:rFonts w:ascii="Courier New" w:hAnsi="Courier New"/>
-          <w:sz w:val="20"/>
-        </w:rPr>
-        <w:t>save()</w:t>
-      </w:r>
-      <w:r>
-        <w:t xml:space="preserve"> để cập nhật hồ sơ.</w:t>
-      </w:r>
-    </w:p>
-    <w:p>
-      <w:pPr/>
-      <w:r>
-        <w:t xml:space="preserve">16. Lớp User trả về đối tượng User đã cập nhật cho phương thức </w:t>
-      </w:r>
-      <w:r>
-        <w:rPr>
-          <w:rFonts w:ascii="Courier New" w:hAnsi="Courier New"/>
-          <w:sz w:val="20"/>
-        </w:rPr>
-        <w:t>updateProfile()</w:t>
-      </w:r>
-      <w:r>
-        <w:t>.</w:t>
-      </w:r>
-    </w:p>
-    <w:p>
-      <w:pPr/>
-      <w:r>
-        <w:t xml:space="preserve">17. Phương thức </w:t>
-      </w:r>
-      <w:r>
-        <w:rPr>
-          <w:rFonts w:ascii="Courier New" w:hAnsi="Courier New"/>
-          <w:sz w:val="20"/>
-        </w:rPr>
-        <w:t>updateProfile()</w:t>
-      </w:r>
-      <w:r>
-        <w:t xml:space="preserve"> trả về đối tượng User cho phương thức </w:t>
-      </w:r>
-      <w:r>
-        <w:rPr>
-          <w:rFonts w:ascii="Courier New" w:hAnsi="Courier New"/>
-          <w:sz w:val="20"/>
-        </w:rPr>
+        <w:t xml:space="preserve"> trả về lỗi cho </w:t>
+      </w:r>
+      <w:r>
         <w:t>btnChinhSuaClick()</w:t>
       </w:r>
       <w:r>
-        <w:t>.</w:t>
-      </w:r>
-    </w:p>
-    <w:p>
-      <w:pPr/>
-      <w:r>
-        <w:t xml:space="preserve">18. Phương thức </w:t>
-      </w:r>
-      <w:r>
-        <w:rPr>
-          <w:rFonts w:ascii="Courier New" w:hAnsi="Courier New"/>
-          <w:sz w:val="20"/>
-        </w:rPr>
-        <w:t>btnChinhSuaClick()</w:t>
-      </w:r>
-      <w:r>
-        <w:t xml:space="preserve"> gọi </w:t>
-      </w:r>
-      <w:r>
-        <w:rPr>
-          <w:rFonts w:ascii="Courier New" w:hAnsi="Courier New"/>
-          <w:sz w:val="20"/>
-        </w:rPr>
-        <w:t>displayProfile()</w:t>
-      </w:r>
-      <w:r>
-        <w:t>, hiển thị showMessage("Cập nhật thành công!")</w:t>
-      </w:r>
-    </w:p>
-    <w:p>
-      <w:pPr/>
-      <w:r>
-        <w:rPr>
-          <w:b/>
-        </w:rPr>
-        <w:t>Ngoại lệ: Email đã được dùng</w:t>
-      </w:r>
-    </w:p>
-    <w:p>
-      <w:pPr>
-        <w:pStyle w:val="ListBullet"/>
-      </w:pPr>
-      <w:r>
-        <w:t xml:space="preserve">Phương thức </w:t>
-      </w:r>
-      <w:r>
-        <w:rPr>
-          <w:rFonts w:ascii="Courier New" w:hAnsi="Courier New"/>
-          <w:sz w:val="20"/>
-        </w:rPr>
-        <w:t>checkEmail()</w:t>
-      </w:r>
-      <w:r>
-        <w:t xml:space="preserve"> trả về </w:t>
-      </w:r>
-      <w:r>
-        <w:rPr>
-          <w:rFonts w:ascii="Courier New" w:hAnsi="Courier New"/>
-          <w:sz w:val="20"/>
-        </w:rPr>
-        <w:t>false</w:t>
-      </w:r>
-      <w:r>
-        <w:t>.</w:t>
-      </w:r>
-    </w:p>
-    <w:p>
-      <w:pPr>
-        <w:pStyle w:val="ListBullet"/>
-      </w:pPr>
-      <w:r>
-        <w:t xml:space="preserve">Phương thức </w:t>
-      </w:r>
-      <w:r>
-        <w:rPr>
-          <w:rFonts w:ascii="Courier New" w:hAnsi="Courier New"/>
-          <w:sz w:val="20"/>
-        </w:rPr>
-        <w:t>updateProfile()</w:t>
-      </w:r>
-      <w:r>
-        <w:t xml:space="preserve"> trả về lỗi cho </w:t>
-      </w:r>
-      <w:r>
-        <w:rPr>
-          <w:rFonts w:ascii="Courier New" w:hAnsi="Courier New"/>
-          <w:sz w:val="20"/>
-        </w:rPr>
-        <w:t>btnChinhSuaClick()</w:t>
-      </w:r>
-      <w:r>
-        <w:t>.</w:t>
+        <w:t>`.</w:t>
       </w:r>
     </w:p>
     <w:p>
@@ -11311,7 +11440,7 @@
         <w:t>getAllStaff()</w:t>
       </w:r>
       <w:r>
-        <w:t xml:space="preserve"> của lớp StaffController.</w:t>
+        <w:t>` của lớp StaffController.</w:t>
       </w:r>
     </w:p>
     <w:p>
@@ -11327,14 +11456,20 @@
         <w:t>getAllStaff()</w:t>
       </w:r>
       <w:r>
-        <w:t xml:space="preserve"> gọi phương thức </w:t>
-      </w:r>
-      <w:r>
         <w:rPr>
           <w:rFonts w:ascii="Courier New" w:hAnsi="Courier New"/>
           <w:sz w:val="20"/>
         </w:rPr>
+        <w:t xml:space="preserve"> gọi phương thức </w:t>
+      </w:r>
+      <w:r>
         <w:t>findAll()</w:t>
+      </w:r>
+      <w:r>
+        <w:rPr>
+          <w:rFonts w:ascii="Courier New" w:hAnsi="Courier New"/>
+          <w:sz w:val="20"/>
+        </w:rPr>
       </w:r>
       <w:r>
         <w:t xml:space="preserve"> của lớp Employee.</w:t>
@@ -11353,7 +11488,7 @@
         <w:t>getAllStaff()</w:t>
       </w:r>
       <w:r>
-        <w:t>.</w:t>
+        <w:t>`.</w:t>
       </w:r>
     </w:p>
     <w:p>
@@ -11369,7 +11504,23 @@
         <w:t>getAllStaff()</w:t>
       </w:r>
       <w:r>
+        <w:rPr>
+          <w:rFonts w:ascii="Courier New" w:hAnsi="Courier New"/>
+          <w:sz w:val="20"/>
+        </w:rPr>
         <w:t xml:space="preserve"> trả về danh sách cho phương thức </w:t>
+      </w:r>
+      <w:r>
+        <w:t>formLoad()</w:t>
+      </w:r>
+      <w:r>
+        <w:t>`.</w:t>
+      </w:r>
+    </w:p>
+    <w:p>
+      <w:pPr/>
+      <w:r>
+        <w:t xml:space="preserve">7. Phương thức </w:t>
       </w:r>
       <w:r>
         <w:rPr>
@@ -11379,22 +11530,6 @@
         <w:t>formLoad()</w:t>
       </w:r>
       <w:r>
-        <w:t>.</w:t>
-      </w:r>
-    </w:p>
-    <w:p>
-      <w:pPr/>
-      <w:r>
-        <w:t xml:space="preserve">7. Phương thức </w:t>
-      </w:r>
-      <w:r>
-        <w:rPr>
-          <w:rFonts w:ascii="Courier New" w:hAnsi="Courier New"/>
-          <w:sz w:val="20"/>
-        </w:rPr>
-        <w:t>formLoad()</w:t>
-      </w:r>
-      <w:r>
         <w:t xml:space="preserve"> gọi </w:t>
       </w:r>
       <w:r>
@@ -11491,7 +11626,7 @@
         <w:t>save()</w:t>
       </w:r>
       <w:r>
-        <w:t xml:space="preserve"> của lớp Employee.</w:t>
+        <w:t>` của lớp Employee.</w:t>
       </w:r>
     </w:p>
     <w:p>
@@ -11617,7 +11752,7 @@
         <w:t>deleteStaff()</w:t>
       </w:r>
       <w:r>
-        <w:t xml:space="preserve"> của lớp StaffController.</w:t>
+        <w:t>` của lớp StaffController.</w:t>
       </w:r>
     </w:p>
     <w:p>
@@ -11633,14 +11768,20 @@
         <w:t>deleteStaff()</w:t>
       </w:r>
       <w:r>
-        <w:t xml:space="preserve"> gọi </w:t>
-      </w:r>
-      <w:r>
         <w:rPr>
           <w:rFonts w:ascii="Courier New" w:hAnsi="Courier New"/>
           <w:sz w:val="20"/>
         </w:rPr>
+        <w:t xml:space="preserve"> gọi </w:t>
+      </w:r>
+      <w:r>
         <w:t>deleteById()</w:t>
+      </w:r>
+      <w:r>
+        <w:rPr>
+          <w:rFonts w:ascii="Courier New" w:hAnsi="Courier New"/>
+          <w:sz w:val="20"/>
+        </w:rPr>
       </w:r>
       <w:r>
         <w:t xml:space="preserve"> của lớp Employee.</w:t>
@@ -11669,7 +11810,7 @@
         <w:t>deleteStaff()</w:t>
       </w:r>
       <w:r>
-        <w:t>.</w:t>
+        <w:t>`.</w:t>
       </w:r>
     </w:p>
     <w:p>
@@ -11685,17 +11826,33 @@
         <w:t>deleteStaff()</w:t>
       </w:r>
       <w:r>
-        <w:t xml:space="preserve"> trả về </w:t>
-      </w:r>
-      <w:r>
         <w:rPr>
           <w:rFonts w:ascii="Courier New" w:hAnsi="Courier New"/>
           <w:sz w:val="20"/>
         </w:rPr>
+        <w:t xml:space="preserve"> trả về </w:t>
+      </w:r>
+      <w:r>
         <w:t>true</w:t>
       </w:r>
       <w:r>
+        <w:rPr>
+          <w:rFonts w:ascii="Courier New" w:hAnsi="Courier New"/>
+          <w:sz w:val="20"/>
+        </w:rPr>
         <w:t xml:space="preserve"> cho phương thức </w:t>
+      </w:r>
+      <w:r>
+        <w:t>btnXoaClick()</w:t>
+      </w:r>
+      <w:r>
+        <w:t>`.</w:t>
+      </w:r>
+    </w:p>
+    <w:p>
+      <w:pPr/>
+      <w:r>
+        <w:t xml:space="preserve">23. Phương thức </w:t>
       </w:r>
       <w:r>
         <w:rPr>
@@ -11705,22 +11862,6 @@
         <w:t>btnXoaClick()</w:t>
       </w:r>
       <w:r>
-        <w:t>.</w:t>
-      </w:r>
-    </w:p>
-    <w:p>
-      <w:pPr/>
-      <w:r>
-        <w:t xml:space="preserve">23. Phương thức </w:t>
-      </w:r>
-      <w:r>
-        <w:rPr>
-          <w:rFonts w:ascii="Courier New" w:hAnsi="Courier New"/>
-          <w:sz w:val="20"/>
-        </w:rPr>
-        <w:t>btnXoaClick()</w:t>
-      </w:r>
-      <w:r>
         <w:t xml:space="preserve"> gọi </w:t>
       </w:r>
       <w:r>
@@ -11813,27 +11954,27 @@
         <w:t>deleteStaff()</w:t>
       </w:r>
       <w:r>
-        <w:t xml:space="preserve"> trả về </w:t>
-      </w:r>
-      <w:r>
         <w:rPr>
           <w:rFonts w:ascii="Courier New" w:hAnsi="Courier New"/>
           <w:sz w:val="20"/>
         </w:rPr>
+        <w:t xml:space="preserve"> trả về </w:t>
+      </w:r>
+      <w:r>
         <w:t>false</w:t>
-      </w:r>
-      <w:r>
-        <w:t xml:space="preserve"> cho </w:t>
       </w:r>
       <w:r>
         <w:rPr>
           <w:rFonts w:ascii="Courier New" w:hAnsi="Courier New"/>
           <w:sz w:val="20"/>
         </w:rPr>
+        <w:t xml:space="preserve"> cho </w:t>
+      </w:r>
+      <w:r>
         <w:t>btnXoaClick()</w:t>
       </w:r>
       <w:r>
-        <w:t>.</w:t>
+        <w:t>`.</w:t>
       </w:r>
     </w:p>
     <w:p>

</xml_diff>

<commit_message>
feat: UC detail diagrams + new sequence diagram style (blue lifelines)
Phase I: Add 5 UC detail diagrams (UC01-UC04, UC20) with include/extend
Sequence diagrams: New style with blue #7AD2FF background, dashed lifelines
Use boundary/control/entity keywords instead of participant
DIAGRAM_MAP: Add UC detail diagram keys
DOCX: 633KB, 604 paragraphs, 63 tables, 25 images
</commit_message>
<xml_diff>
--- a/output/account_module.docx
+++ b/output/account_module.docx
@@ -3028,6 +3028,249 @@
         <w:t xml:space="preserve"> UC này cho phép Chủ doanh nghiệp quản lý tài khoản nhân viên toàn hệ thống: xem danh sách, thêm mới, chỉnh sửa và xóa (chuyển trạng thái "Đã nghỉ"). Không thể xóa nhân viên đang xử lý order.</w:t>
       </w:r>
     </w:p>
+    <w:p>
+      <w:pPr>
+        <w:pStyle w:val="Heading2"/>
+      </w:pPr>
+      <w:r>
+        <w:t>6. Biểu đồ Use Case chi tiết</w:t>
+      </w:r>
+    </w:p>
+    <w:p>
+      <w:pPr>
+        <w:pStyle w:val="Heading3"/>
+      </w:pPr>
+      <w:r>
+        <w:t>UC01 – Đăng nhập</w:t>
+      </w:r>
+    </w:p>
+    <w:p>
+      <w:pPr>
+        <w:jc w:val="center"/>
+      </w:pPr>
+      <w:r>
+        <w:drawing>
+          <wp:inline xmlns:a="http://schemas.openxmlformats.org/drawingml/2006/main" xmlns:pic="http://schemas.openxmlformats.org/drawingml/2006/picture">
+            <wp:extent cx="5486400" cy="5758174"/>
+            <wp:docPr id="2" name="Picture 2"/>
+            <wp:cNvGraphicFramePr>
+              <a:graphicFrameLocks noChangeAspect="1"/>
+            </wp:cNvGraphicFramePr>
+            <a:graphic>
+              <a:graphicData uri="http://schemas.openxmlformats.org/drawingml/2006/picture">
+                <pic:pic>
+                  <pic:nvPicPr>
+                    <pic:cNvPr id="0" name="account_uc_detail_login.png"/>
+                    <pic:cNvPicPr/>
+                  </pic:nvPicPr>
+                  <pic:blipFill>
+                    <a:blip r:embed="rId10"/>
+                    <a:stretch>
+                      <a:fillRect/>
+                    </a:stretch>
+                  </pic:blipFill>
+                  <pic:spPr>
+                    <a:xfrm>
+                      <a:off x="0" y="0"/>
+                      <a:ext cx="5486400" cy="5758174"/>
+                    </a:xfrm>
+                    <a:prstGeom prst="rect"/>
+                  </pic:spPr>
+                </pic:pic>
+              </a:graphicData>
+            </a:graphic>
+          </wp:inline>
+        </w:drawing>
+      </w:r>
+    </w:p>
+    <w:p>
+      <w:pPr>
+        <w:pStyle w:val="Heading3"/>
+      </w:pPr>
+      <w:r>
+        <w:t>UC02 – Đăng ký</w:t>
+      </w:r>
+    </w:p>
+    <w:p>
+      <w:pPr>
+        <w:jc w:val="center"/>
+      </w:pPr>
+      <w:r>
+        <w:drawing>
+          <wp:inline xmlns:a="http://schemas.openxmlformats.org/drawingml/2006/main" xmlns:pic="http://schemas.openxmlformats.org/drawingml/2006/picture">
+            <wp:extent cx="5486400" cy="4564912"/>
+            <wp:docPr id="3" name="Picture 3"/>
+            <wp:cNvGraphicFramePr>
+              <a:graphicFrameLocks noChangeAspect="1"/>
+            </wp:cNvGraphicFramePr>
+            <a:graphic>
+              <a:graphicData uri="http://schemas.openxmlformats.org/drawingml/2006/picture">
+                <pic:pic>
+                  <pic:nvPicPr>
+                    <pic:cNvPr id="0" name="account_uc_detail_register.png"/>
+                    <pic:cNvPicPr/>
+                  </pic:nvPicPr>
+                  <pic:blipFill>
+                    <a:blip r:embed="rId11"/>
+                    <a:stretch>
+                      <a:fillRect/>
+                    </a:stretch>
+                  </pic:blipFill>
+                  <pic:spPr>
+                    <a:xfrm>
+                      <a:off x="0" y="0"/>
+                      <a:ext cx="5486400" cy="4564912"/>
+                    </a:xfrm>
+                    <a:prstGeom prst="rect"/>
+                  </pic:spPr>
+                </pic:pic>
+              </a:graphicData>
+            </a:graphic>
+          </wp:inline>
+        </w:drawing>
+      </w:r>
+    </w:p>
+    <w:p>
+      <w:pPr>
+        <w:pStyle w:val="Heading3"/>
+      </w:pPr>
+      <w:r>
+        <w:t>UC03 – Đổi mật khẩu</w:t>
+      </w:r>
+    </w:p>
+    <w:p>
+      <w:pPr>
+        <w:jc w:val="center"/>
+      </w:pPr>
+      <w:r>
+        <w:drawing>
+          <wp:inline xmlns:a="http://schemas.openxmlformats.org/drawingml/2006/main" xmlns:pic="http://schemas.openxmlformats.org/drawingml/2006/picture">
+            <wp:extent cx="5486400" cy="4160939"/>
+            <wp:docPr id="4" name="Picture 4"/>
+            <wp:cNvGraphicFramePr>
+              <a:graphicFrameLocks noChangeAspect="1"/>
+            </wp:cNvGraphicFramePr>
+            <a:graphic>
+              <a:graphicData uri="http://schemas.openxmlformats.org/drawingml/2006/picture">
+                <pic:pic>
+                  <pic:nvPicPr>
+                    <pic:cNvPr id="0" name="account_uc_detail_changepw.png"/>
+                    <pic:cNvPicPr/>
+                  </pic:nvPicPr>
+                  <pic:blipFill>
+                    <a:blip r:embed="rId12"/>
+                    <a:stretch>
+                      <a:fillRect/>
+                    </a:stretch>
+                  </pic:blipFill>
+                  <pic:spPr>
+                    <a:xfrm>
+                      <a:off x="0" y="0"/>
+                      <a:ext cx="5486400" cy="4160939"/>
+                    </a:xfrm>
+                    <a:prstGeom prst="rect"/>
+                  </pic:spPr>
+                </pic:pic>
+              </a:graphicData>
+            </a:graphic>
+          </wp:inline>
+        </w:drawing>
+      </w:r>
+    </w:p>
+    <w:p>
+      <w:pPr>
+        <w:pStyle w:val="Heading3"/>
+      </w:pPr>
+      <w:r>
+        <w:t>UC04 – Quản lý TTCN</w:t>
+      </w:r>
+    </w:p>
+    <w:p>
+      <w:pPr>
+        <w:jc w:val="center"/>
+      </w:pPr>
+      <w:r>
+        <w:drawing>
+          <wp:inline xmlns:a="http://schemas.openxmlformats.org/drawingml/2006/main" xmlns:pic="http://schemas.openxmlformats.org/drawingml/2006/picture">
+            <wp:extent cx="5486400" cy="5501768"/>
+            <wp:docPr id="5" name="Picture 5"/>
+            <wp:cNvGraphicFramePr>
+              <a:graphicFrameLocks noChangeAspect="1"/>
+            </wp:cNvGraphicFramePr>
+            <a:graphic>
+              <a:graphicData uri="http://schemas.openxmlformats.org/drawingml/2006/picture">
+                <pic:pic>
+                  <pic:nvPicPr>
+                    <pic:cNvPr id="0" name="account_uc_detail_profile.png"/>
+                    <pic:cNvPicPr/>
+                  </pic:nvPicPr>
+                  <pic:blipFill>
+                    <a:blip r:embed="rId13"/>
+                    <a:stretch>
+                      <a:fillRect/>
+                    </a:stretch>
+                  </pic:blipFill>
+                  <pic:spPr>
+                    <a:xfrm>
+                      <a:off x="0" y="0"/>
+                      <a:ext cx="5486400" cy="5501768"/>
+                    </a:xfrm>
+                    <a:prstGeom prst="rect"/>
+                  </pic:spPr>
+                </pic:pic>
+              </a:graphicData>
+            </a:graphic>
+          </wp:inline>
+        </w:drawing>
+      </w:r>
+    </w:p>
+    <w:p>
+      <w:pPr>
+        <w:pStyle w:val="Heading3"/>
+      </w:pPr>
+      <w:r>
+        <w:t>UC20 – Quản lý nhân viên</w:t>
+      </w:r>
+    </w:p>
+    <w:p>
+      <w:pPr>
+        <w:jc w:val="center"/>
+      </w:pPr>
+      <w:r>
+        <w:drawing>
+          <wp:inline xmlns:a="http://schemas.openxmlformats.org/drawingml/2006/main" xmlns:pic="http://schemas.openxmlformats.org/drawingml/2006/picture">
+            <wp:extent cx="5486400" cy="5899026"/>
+            <wp:docPr id="6" name="Picture 6"/>
+            <wp:cNvGraphicFramePr>
+              <a:graphicFrameLocks noChangeAspect="1"/>
+            </wp:cNvGraphicFramePr>
+            <a:graphic>
+              <a:graphicData uri="http://schemas.openxmlformats.org/drawingml/2006/picture">
+                <pic:pic>
+                  <pic:nvPicPr>
+                    <pic:cNvPr id="0" name="account_uc_detail_staff.png"/>
+                    <pic:cNvPicPr/>
+                  </pic:nvPicPr>
+                  <pic:blipFill>
+                    <a:blip r:embed="rId14"/>
+                    <a:stretch>
+                      <a:fillRect/>
+                    </a:stretch>
+                  </pic:blipFill>
+                  <pic:spPr>
+                    <a:xfrm>
+                      <a:off x="0" y="0"/>
+                      <a:ext cx="5486400" cy="5899026"/>
+                    </a:xfrm>
+                    <a:prstGeom prst="rect"/>
+                  </pic:spPr>
+                </pic:pic>
+              </a:graphicData>
+            </a:graphic>
+          </wp:inline>
+        </w:drawing>
+      </w:r>
+    </w:p>
     <w:p/>
     <w:p>
       <w:pPr>
@@ -4827,7 +5070,7 @@
         <w:drawing>
           <wp:inline xmlns:a="http://schemas.openxmlformats.org/drawingml/2006/main" xmlns:pic="http://schemas.openxmlformats.org/drawingml/2006/picture">
             <wp:extent cx="5486400" cy="4083627"/>
-            <wp:docPr id="2" name="Picture 2"/>
+            <wp:docPr id="7" name="Picture 7"/>
             <wp:cNvGraphicFramePr>
               <a:graphicFrameLocks noChangeAspect="1"/>
             </wp:cNvGraphicFramePr>
@@ -4839,7 +5082,7 @@
                     <pic:cNvPicPr/>
                   </pic:nvPicPr>
                   <pic:blipFill>
-                    <a:blip r:embed="rId10"/>
+                    <a:blip r:embed="rId15"/>
                     <a:stretch>
                       <a:fillRect/>
                     </a:stretch>
@@ -4959,7 +5202,7 @@
         <w:drawing>
           <wp:inline xmlns:a="http://schemas.openxmlformats.org/drawingml/2006/main" xmlns:pic="http://schemas.openxmlformats.org/drawingml/2006/picture">
             <wp:extent cx="5486400" cy="5634681"/>
-            <wp:docPr id="3" name="Picture 3"/>
+            <wp:docPr id="8" name="Picture 8"/>
             <wp:cNvGraphicFramePr>
               <a:graphicFrameLocks noChangeAspect="1"/>
             </wp:cNvGraphicFramePr>
@@ -4971,7 +5214,7 @@
                     <pic:cNvPicPr/>
                   </pic:nvPicPr>
                   <pic:blipFill>
-                    <a:blip r:embed="rId11"/>
+                    <a:blip r:embed="rId16"/>
                     <a:stretch>
                       <a:fillRect/>
                     </a:stretch>
@@ -5111,7 +5354,7 @@
         <w:drawing>
           <wp:inline xmlns:a="http://schemas.openxmlformats.org/drawingml/2006/main" xmlns:pic="http://schemas.openxmlformats.org/drawingml/2006/picture">
             <wp:extent cx="5486400" cy="3708483"/>
-            <wp:docPr id="4" name="Picture 4"/>
+            <wp:docPr id="9" name="Picture 9"/>
             <wp:cNvGraphicFramePr>
               <a:graphicFrameLocks noChangeAspect="1"/>
             </wp:cNvGraphicFramePr>
@@ -5123,7 +5366,7 @@
                     <pic:cNvPicPr/>
                   </pic:nvPicPr>
                   <pic:blipFill>
-                    <a:blip r:embed="rId12"/>
+                    <a:blip r:embed="rId17"/>
                     <a:stretch>
                       <a:fillRect/>
                     </a:stretch>
@@ -5229,7 +5472,7 @@
         <w:drawing>
           <wp:inline xmlns:a="http://schemas.openxmlformats.org/drawingml/2006/main" xmlns:pic="http://schemas.openxmlformats.org/drawingml/2006/picture">
             <wp:extent cx="5486400" cy="5825905"/>
-            <wp:docPr id="5" name="Picture 5"/>
+            <wp:docPr id="10" name="Picture 10"/>
             <wp:cNvGraphicFramePr>
               <a:graphicFrameLocks noChangeAspect="1"/>
             </wp:cNvGraphicFramePr>
@@ -5241,7 +5484,7 @@
                     <pic:cNvPicPr/>
                   </pic:nvPicPr>
                   <pic:blipFill>
-                    <a:blip r:embed="rId13"/>
+                    <a:blip r:embed="rId18"/>
                     <a:stretch>
                       <a:fillRect/>
                     </a:stretch>
@@ -5366,7 +5609,7 @@
         <w:drawing>
           <wp:inline xmlns:a="http://schemas.openxmlformats.org/drawingml/2006/main" xmlns:pic="http://schemas.openxmlformats.org/drawingml/2006/picture">
             <wp:extent cx="5486400" cy="5750973"/>
-            <wp:docPr id="6" name="Picture 6"/>
+            <wp:docPr id="11" name="Picture 11"/>
             <wp:cNvGraphicFramePr>
               <a:graphicFrameLocks noChangeAspect="1"/>
             </wp:cNvGraphicFramePr>
@@ -5378,7 +5621,7 @@
                     <pic:cNvPicPr/>
                   </pic:nvPicPr>
                   <pic:blipFill>
-                    <a:blip r:embed="rId14"/>
+                    <a:blip r:embed="rId19"/>
                     <a:stretch>
                       <a:fillRect/>
                     </a:stretch>
@@ -5503,7 +5746,7 @@
         <w:drawing>
           <wp:inline xmlns:a="http://schemas.openxmlformats.org/drawingml/2006/main" xmlns:pic="http://schemas.openxmlformats.org/drawingml/2006/picture">
             <wp:extent cx="5486400" cy="6361258"/>
-            <wp:docPr id="7" name="Picture 7"/>
+            <wp:docPr id="12" name="Picture 12"/>
             <wp:cNvGraphicFramePr>
               <a:graphicFrameLocks noChangeAspect="1"/>
             </wp:cNvGraphicFramePr>
@@ -5515,7 +5758,7 @@
                     <pic:cNvPicPr/>
                   </pic:nvPicPr>
                   <pic:blipFill>
-                    <a:blip r:embed="rId15"/>
+                    <a:blip r:embed="rId20"/>
                     <a:stretch>
                       <a:fillRect/>
                     </a:stretch>
@@ -5557,8 +5800,8 @@
       <w:r>
         <w:drawing>
           <wp:inline xmlns:a="http://schemas.openxmlformats.org/drawingml/2006/main" xmlns:pic="http://schemas.openxmlformats.org/drawingml/2006/picture">
-            <wp:extent cx="5486400" cy="3708400"/>
-            <wp:docPr id="8" name="Picture 8"/>
+            <wp:extent cx="5486400" cy="4839991"/>
+            <wp:docPr id="13" name="Picture 13"/>
             <wp:cNvGraphicFramePr>
               <a:graphicFrameLocks noChangeAspect="1"/>
             </wp:cNvGraphicFramePr>
@@ -5570,7 +5813,7 @@
                     <pic:cNvPicPr/>
                   </pic:nvPicPr>
                   <pic:blipFill>
-                    <a:blip r:embed="rId16"/>
+                    <a:blip r:embed="rId21"/>
                     <a:stretch>
                       <a:fillRect/>
                     </a:stretch>
@@ -5578,7 +5821,7 @@
                   <pic:spPr>
                     <a:xfrm>
                       <a:off x="0" y="0"/>
-                      <a:ext cx="5486400" cy="3708400"/>
+                      <a:ext cx="5486400" cy="4839991"/>
                     </a:xfrm>
                     <a:prstGeom prst="rect"/>
                   </pic:spPr>
@@ -5753,8 +5996,8 @@
       <w:r>
         <w:drawing>
           <wp:inline xmlns:a="http://schemas.openxmlformats.org/drawingml/2006/main" xmlns:pic="http://schemas.openxmlformats.org/drawingml/2006/picture">
-            <wp:extent cx="5486400" cy="4443336"/>
-            <wp:docPr id="9" name="Picture 9"/>
+            <wp:extent cx="5486400" cy="5711526"/>
+            <wp:docPr id="14" name="Picture 14"/>
             <wp:cNvGraphicFramePr>
               <a:graphicFrameLocks noChangeAspect="1"/>
             </wp:cNvGraphicFramePr>
@@ -5766,7 +6009,7 @@
                     <pic:cNvPicPr/>
                   </pic:nvPicPr>
                   <pic:blipFill>
-                    <a:blip r:embed="rId17"/>
+                    <a:blip r:embed="rId22"/>
                     <a:stretch>
                       <a:fillRect/>
                     </a:stretch>
@@ -5774,7 +6017,7 @@
                   <pic:spPr>
                     <a:xfrm>
                       <a:off x="0" y="0"/>
-                      <a:ext cx="5486400" cy="4443336"/>
+                      <a:ext cx="5486400" cy="5711526"/>
                     </a:xfrm>
                     <a:prstGeom prst="rect"/>
                   </pic:spPr>
@@ -6025,8 +6268,8 @@
       <w:r>
         <w:drawing>
           <wp:inline xmlns:a="http://schemas.openxmlformats.org/drawingml/2006/main" xmlns:pic="http://schemas.openxmlformats.org/drawingml/2006/picture">
-            <wp:extent cx="5486400" cy="3325924"/>
-            <wp:docPr id="10" name="Picture 10"/>
+            <wp:extent cx="5486400" cy="4881669"/>
+            <wp:docPr id="15" name="Picture 15"/>
             <wp:cNvGraphicFramePr>
               <a:graphicFrameLocks noChangeAspect="1"/>
             </wp:cNvGraphicFramePr>
@@ -6038,7 +6281,7 @@
                     <pic:cNvPicPr/>
                   </pic:nvPicPr>
                   <pic:blipFill>
-                    <a:blip r:embed="rId18"/>
+                    <a:blip r:embed="rId23"/>
                     <a:stretch>
                       <a:fillRect/>
                     </a:stretch>
@@ -6046,7 +6289,7 @@
                   <pic:spPr>
                     <a:xfrm>
                       <a:off x="0" y="0"/>
-                      <a:ext cx="5486400" cy="3325924"/>
+                      <a:ext cx="5486400" cy="4881669"/>
                     </a:xfrm>
                     <a:prstGeom prst="rect"/>
                   </pic:spPr>
@@ -6269,8 +6512,8 @@
       <w:r>
         <w:drawing>
           <wp:inline xmlns:a="http://schemas.openxmlformats.org/drawingml/2006/main" xmlns:pic="http://schemas.openxmlformats.org/drawingml/2006/picture">
-            <wp:extent cx="5486400" cy="3855128"/>
-            <wp:docPr id="11" name="Picture 11"/>
+            <wp:extent cx="5486400" cy="5538552"/>
+            <wp:docPr id="16" name="Picture 16"/>
             <wp:cNvGraphicFramePr>
               <a:graphicFrameLocks noChangeAspect="1"/>
             </wp:cNvGraphicFramePr>
@@ -6282,7 +6525,7 @@
                     <pic:cNvPicPr/>
                   </pic:nvPicPr>
                   <pic:blipFill>
-                    <a:blip r:embed="rId19"/>
+                    <a:blip r:embed="rId24"/>
                     <a:stretch>
                       <a:fillRect/>
                     </a:stretch>
@@ -6290,7 +6533,7 @@
                   <pic:spPr>
                     <a:xfrm>
                       <a:off x="0" y="0"/>
-                      <a:ext cx="5486400" cy="3855128"/>
+                      <a:ext cx="5486400" cy="5538552"/>
                     </a:xfrm>
                     <a:prstGeom prst="rect"/>
                   </pic:spPr>
@@ -6472,8 +6715,8 @@
       <w:r>
         <w:drawing>
           <wp:inline xmlns:a="http://schemas.openxmlformats.org/drawingml/2006/main" xmlns:pic="http://schemas.openxmlformats.org/drawingml/2006/picture">
-            <wp:extent cx="5486400" cy="4390755"/>
-            <wp:docPr id="12" name="Picture 12"/>
+            <wp:extent cx="5486400" cy="5231219"/>
+            <wp:docPr id="17" name="Picture 17"/>
             <wp:cNvGraphicFramePr>
               <a:graphicFrameLocks noChangeAspect="1"/>
             </wp:cNvGraphicFramePr>
@@ -6485,7 +6728,7 @@
                     <pic:cNvPicPr/>
                   </pic:nvPicPr>
                   <pic:blipFill>
-                    <a:blip r:embed="rId20"/>
+                    <a:blip r:embed="rId25"/>
                     <a:stretch>
                       <a:fillRect/>
                     </a:stretch>
@@ -6493,7 +6736,7 @@
                   <pic:spPr>
                     <a:xfrm>
                       <a:off x="0" y="0"/>
-                      <a:ext cx="5486400" cy="4390755"/>
+                      <a:ext cx="5486400" cy="5231219"/>
                     </a:xfrm>
                     <a:prstGeom prst="rect"/>
                   </pic:spPr>
@@ -7207,7 +7450,7 @@
         <w:drawing>
           <wp:inline xmlns:a="http://schemas.openxmlformats.org/drawingml/2006/main" xmlns:pic="http://schemas.openxmlformats.org/drawingml/2006/picture">
             <wp:extent cx="5486400" cy="3711627"/>
-            <wp:docPr id="13" name="Picture 13"/>
+            <wp:docPr id="18" name="Picture 18"/>
             <wp:cNvGraphicFramePr>
               <a:graphicFrameLocks noChangeAspect="1"/>
             </wp:cNvGraphicFramePr>
@@ -7219,7 +7462,7 @@
                     <pic:cNvPicPr/>
                   </pic:nvPicPr>
                   <pic:blipFill>
-                    <a:blip r:embed="rId21"/>
+                    <a:blip r:embed="rId26"/>
                     <a:stretch>
                       <a:fillRect/>
                     </a:stretch>
@@ -7789,7 +8032,7 @@
         <w:drawing>
           <wp:inline xmlns:a="http://schemas.openxmlformats.org/drawingml/2006/main" xmlns:pic="http://schemas.openxmlformats.org/drawingml/2006/picture">
             <wp:extent cx="5486400" cy="6374318"/>
-            <wp:docPr id="14" name="Picture 14"/>
+            <wp:docPr id="19" name="Picture 19"/>
             <wp:cNvGraphicFramePr>
               <a:graphicFrameLocks noChangeAspect="1"/>
             </wp:cNvGraphicFramePr>
@@ -7801,7 +8044,7 @@
                     <pic:cNvPicPr/>
                   </pic:nvPicPr>
                   <pic:blipFill>
-                    <a:blip r:embed="rId22"/>
+                    <a:blip r:embed="rId27"/>
                     <a:stretch>
                       <a:fillRect/>
                     </a:stretch>
@@ -9105,7 +9348,7 @@
         <w:drawing>
           <wp:inline xmlns:a="http://schemas.openxmlformats.org/drawingml/2006/main" xmlns:pic="http://schemas.openxmlformats.org/drawingml/2006/picture">
             <wp:extent cx="5486400" cy="4756649"/>
-            <wp:docPr id="15" name="Picture 15"/>
+            <wp:docPr id="20" name="Picture 20"/>
             <wp:cNvGraphicFramePr>
               <a:graphicFrameLocks noChangeAspect="1"/>
             </wp:cNvGraphicFramePr>
@@ -9117,7 +9360,7 @@
                     <pic:cNvPicPr/>
                   </pic:nvPicPr>
                   <pic:blipFill>
-                    <a:blip r:embed="rId23"/>
+                    <a:blip r:embed="rId28"/>
                     <a:stretch>
                       <a:fillRect/>
                     </a:stretch>
@@ -9165,8 +9408,8 @@
       <w:r>
         <w:drawing>
           <wp:inline xmlns:a="http://schemas.openxmlformats.org/drawingml/2006/main" xmlns:pic="http://schemas.openxmlformats.org/drawingml/2006/picture">
-            <wp:extent cx="5486400" cy="5404513"/>
-            <wp:docPr id="16" name="Picture 16"/>
+            <wp:extent cx="5486400" cy="6185102"/>
+            <wp:docPr id="21" name="Picture 21"/>
             <wp:cNvGraphicFramePr>
               <a:graphicFrameLocks noChangeAspect="1"/>
             </wp:cNvGraphicFramePr>
@@ -9178,7 +9421,7 @@
                     <pic:cNvPicPr/>
                   </pic:nvPicPr>
                   <pic:blipFill>
-                    <a:blip r:embed="rId24"/>
+                    <a:blip r:embed="rId29"/>
                     <a:stretch>
                       <a:fillRect/>
                     </a:stretch>
@@ -9186,7 +9429,7 @@
                   <pic:spPr>
                     <a:xfrm>
                       <a:off x="0" y="0"/>
-                      <a:ext cx="5486400" cy="5404513"/>
+                      <a:ext cx="5486400" cy="6185102"/>
                     </a:xfrm>
                     <a:prstGeom prst="rect"/>
                   </pic:spPr>
@@ -9621,8 +9864,8 @@
       <w:r>
         <w:drawing>
           <wp:inline xmlns:a="http://schemas.openxmlformats.org/drawingml/2006/main" xmlns:pic="http://schemas.openxmlformats.org/drawingml/2006/picture">
-            <wp:extent cx="5486400" cy="6755889"/>
-            <wp:docPr id="17" name="Picture 17"/>
+            <wp:extent cx="5486400" cy="7760043"/>
+            <wp:docPr id="22" name="Picture 22"/>
             <wp:cNvGraphicFramePr>
               <a:graphicFrameLocks noChangeAspect="1"/>
             </wp:cNvGraphicFramePr>
@@ -9634,7 +9877,7 @@
                     <pic:cNvPicPr/>
                   </pic:nvPicPr>
                   <pic:blipFill>
-                    <a:blip r:embed="rId25"/>
+                    <a:blip r:embed="rId30"/>
                     <a:stretch>
                       <a:fillRect/>
                     </a:stretch>
@@ -9642,7 +9885,7 @@
                   <pic:spPr>
                     <a:xfrm>
                       <a:off x="0" y="0"/>
-                      <a:ext cx="5486400" cy="6755889"/>
+                      <a:ext cx="5486400" cy="7760043"/>
                     </a:xfrm>
                     <a:prstGeom prst="rect"/>
                   </pic:spPr>
@@ -10301,8 +10544,8 @@
       <w:r>
         <w:drawing>
           <wp:inline xmlns:a="http://schemas.openxmlformats.org/drawingml/2006/main" xmlns:pic="http://schemas.openxmlformats.org/drawingml/2006/picture">
-            <wp:extent cx="5486400" cy="5121438"/>
-            <wp:docPr id="18" name="Picture 18"/>
+            <wp:extent cx="5486400" cy="5904339"/>
+            <wp:docPr id="23" name="Picture 23"/>
             <wp:cNvGraphicFramePr>
               <a:graphicFrameLocks noChangeAspect="1"/>
             </wp:cNvGraphicFramePr>
@@ -10314,7 +10557,7 @@
                     <pic:cNvPicPr/>
                   </pic:nvPicPr>
                   <pic:blipFill>
-                    <a:blip r:embed="rId26"/>
+                    <a:blip r:embed="rId31"/>
                     <a:stretch>
                       <a:fillRect/>
                     </a:stretch>
@@ -10322,7 +10565,7 @@
                   <pic:spPr>
                     <a:xfrm>
                       <a:off x="0" y="0"/>
-                      <a:ext cx="5486400" cy="5121438"/>
+                      <a:ext cx="5486400" cy="5904339"/>
                     </a:xfrm>
                     <a:prstGeom prst="rect"/>
                   </pic:spPr>
@@ -10843,8 +11086,8 @@
       <w:r>
         <w:drawing>
           <wp:inline xmlns:a="http://schemas.openxmlformats.org/drawingml/2006/main" xmlns:pic="http://schemas.openxmlformats.org/drawingml/2006/picture">
-            <wp:extent cx="5486400" cy="5322250"/>
-            <wp:docPr id="19" name="Picture 19"/>
+            <wp:extent cx="5486400" cy="6119138"/>
+            <wp:docPr id="24" name="Picture 24"/>
             <wp:cNvGraphicFramePr>
               <a:graphicFrameLocks noChangeAspect="1"/>
             </wp:cNvGraphicFramePr>
@@ -10856,7 +11099,7 @@
                     <pic:cNvPicPr/>
                   </pic:nvPicPr>
                   <pic:blipFill>
-                    <a:blip r:embed="rId27"/>
+                    <a:blip r:embed="rId32"/>
                     <a:stretch>
                       <a:fillRect/>
                     </a:stretch>
@@ -10864,7 +11107,7 @@
                   <pic:spPr>
                     <a:xfrm>
                       <a:off x="0" y="0"/>
-                      <a:ext cx="5486400" cy="5322250"/>
+                      <a:ext cx="5486400" cy="6119138"/>
                     </a:xfrm>
                     <a:prstGeom prst="rect"/>
                   </pic:spPr>
@@ -11338,8 +11581,8 @@
       <w:r>
         <w:drawing>
           <wp:inline xmlns:a="http://schemas.openxmlformats.org/drawingml/2006/main" xmlns:pic="http://schemas.openxmlformats.org/drawingml/2006/picture">
-            <wp:extent cx="5486400" cy="8050199"/>
-            <wp:docPr id="20" name="Picture 20"/>
+            <wp:extent cx="5486400" cy="9073348"/>
+            <wp:docPr id="25" name="Picture 25"/>
             <wp:cNvGraphicFramePr>
               <a:graphicFrameLocks noChangeAspect="1"/>
             </wp:cNvGraphicFramePr>
@@ -11351,7 +11594,7 @@
                     <pic:cNvPicPr/>
                   </pic:nvPicPr>
                   <pic:blipFill>
-                    <a:blip r:embed="rId28"/>
+                    <a:blip r:embed="rId33"/>
                     <a:stretch>
                       <a:fillRect/>
                     </a:stretch>
@@ -11359,7 +11602,7 @@
                   <pic:spPr>
                     <a:xfrm>
                       <a:off x="0" y="0"/>
-                      <a:ext cx="5486400" cy="8050199"/>
+                      <a:ext cx="5486400" cy="9073348"/>
                     </a:xfrm>
                     <a:prstGeom prst="rect"/>
                   </pic:spPr>

</xml_diff>

<commit_message>
fix: remove exceptions from sequences, reformat headings 1→1.1→1.1.1, update wireframes to match class attributes
- Remove all alt/Ngoại lệ blocks from sequence diagrams (analysis + design)
- Remove all Ngoại lệ sections from Kịch bản v2/v3 narratives
- Update wireframe fields to use boundary class attribute names (txtSDT, btnDangNhap, etc.)
- Reformat heading hierarchy: 1, 1.1, 1.1.1, then a) b) c)
- Reformat MVC section with bullet point hierarchy
- Regenerate DOCX (632KB, 604 paragraphs, 63 tables, 25 images)
</commit_message>
<xml_diff>
--- a/output/account_module.docx
+++ b/output/account_module.docx
@@ -5932,56 +5932,6 @@
       </w:r>
     </w:p>
     <w:p>
-      <w:pPr/>
-      <w:r>
-        <w:rPr>
-          <w:b/>
-        </w:rPr>
-        <w:t>Ngoại lệ: tài khoản không tồn tại</w:t>
-      </w:r>
-    </w:p>
-    <w:p>
-      <w:pPr>
-        <w:pStyle w:val="ListBullet"/>
-      </w:pPr>
-      <w:r>
-        <w:t>Lớp User trả về null.</w:t>
-      </w:r>
-    </w:p>
-    <w:p>
-      <w:pPr>
-        <w:pStyle w:val="ListBullet"/>
-      </w:pPr>
-      <w:r>
-        <w:t>Lớp LoginView hiển thị "Tài khoản không tồn tại. Vui lòng kiểm tra lại."</w:t>
-      </w:r>
-    </w:p>
-    <w:p>
-      <w:pPr/>
-      <w:r>
-        <w:rPr>
-          <w:b/>
-        </w:rPr>
-        <w:t>Ngoại lệ: mật khẩu sai</w:t>
-      </w:r>
-    </w:p>
-    <w:p>
-      <w:pPr>
-        <w:pStyle w:val="ListBullet"/>
-      </w:pPr>
-      <w:r>
-        <w:t>Lớp User trả về mật khẩu không khớp.</w:t>
-      </w:r>
-    </w:p>
-    <w:p>
-      <w:pPr>
-        <w:pStyle w:val="ListBullet"/>
-      </w:pPr>
-      <w:r>
-        <w:t>Lớp LoginView hiển thị "Mật khẩu không chính xác. Còn [N] lần thử."</w:t>
-      </w:r>
-    </w:p>
-    <w:p>
       <w:pPr>
         <w:pStyle w:val="Heading3"/>
       </w:pPr>
@@ -6204,56 +6154,6 @@
       </w:r>
     </w:p>
     <w:p>
-      <w:pPr/>
-      <w:r>
-        <w:rPr>
-          <w:b/>
-        </w:rPr>
-        <w:t>Ngoại lệ: SĐT đã tồn tại</w:t>
-      </w:r>
-    </w:p>
-    <w:p>
-      <w:pPr>
-        <w:pStyle w:val="ListBullet"/>
-      </w:pPr>
-      <w:r>
-        <w:t>Lớp User trả về SĐT đã tồn tại.</w:t>
-      </w:r>
-    </w:p>
-    <w:p>
-      <w:pPr>
-        <w:pStyle w:val="ListBullet"/>
-      </w:pPr>
-      <w:r>
-        <w:t>Lớp RegisterView hiển thị "SĐT này đã được sử dụng."</w:t>
-      </w:r>
-    </w:p>
-    <w:p>
-      <w:pPr/>
-      <w:r>
-        <w:rPr>
-          <w:b/>
-        </w:rPr>
-        <w:t>Ngoại lệ: OTP sai</w:t>
-      </w:r>
-    </w:p>
-    <w:p>
-      <w:pPr>
-        <w:pStyle w:val="ListBullet"/>
-      </w:pPr>
-      <w:r>
-        <w:t>Lớp OTP trả về mã không hợp lệ.</w:t>
-      </w:r>
-    </w:p>
-    <w:p>
-      <w:pPr>
-        <w:pStyle w:val="ListBullet"/>
-      </w:pPr>
-      <w:r>
-        <w:t>Lớp OTPVerifyView hiển thị "Mã OTP không đúng. Vui lòng thử lại."</w:t>
-      </w:r>
-    </w:p>
-    <w:p>
       <w:pPr>
         <w:pStyle w:val="Heading3"/>
       </w:pPr>
@@ -6448,56 +6348,6 @@
       </w:r>
     </w:p>
     <w:p>
-      <w:pPr/>
-      <w:r>
-        <w:rPr>
-          <w:b/>
-        </w:rPr>
-        <w:t>Ngoại lệ: MK hiện tại sai</w:t>
-      </w:r>
-    </w:p>
-    <w:p>
-      <w:pPr>
-        <w:pStyle w:val="ListBullet"/>
-      </w:pPr>
-      <w:r>
-        <w:t>Lớp User trả về mật khẩu không khớp.</w:t>
-      </w:r>
-    </w:p>
-    <w:p>
-      <w:pPr>
-        <w:pStyle w:val="ListBullet"/>
-      </w:pPr>
-      <w:r>
-        <w:t>Lớp ChangePasswordView hiển thị "Mật khẩu hiện tại không chính xác."</w:t>
-      </w:r>
-    </w:p>
-    <w:p>
-      <w:pPr/>
-      <w:r>
-        <w:rPr>
-          <w:b/>
-        </w:rPr>
-        <w:t>Ngoại lệ: MK mới không đủ mạnh</w:t>
-      </w:r>
-    </w:p>
-    <w:p>
-      <w:pPr>
-        <w:pStyle w:val="ListBullet"/>
-      </w:pPr>
-      <w:r>
-        <w:t>Lớp User trả về lỗi validation.</w:t>
-      </w:r>
-    </w:p>
-    <w:p>
-      <w:pPr>
-        <w:pStyle w:val="ListBullet"/>
-      </w:pPr>
-      <w:r>
-        <w:t>Lớp ChangePasswordView highlight ô và hiển thị yêu cầu còn thiếu.</w:t>
-      </w:r>
-    </w:p>
-    <w:p>
       <w:pPr>
         <w:pStyle w:val="Heading3"/>
       </w:pPr>
@@ -6676,31 +6526,6 @@
       </w:r>
     </w:p>
     <w:p>
-      <w:pPr/>
-      <w:r>
-        <w:rPr>
-          <w:b/>
-        </w:rPr>
-        <w:t>Ngoại lệ: Email đã được dùng</w:t>
-      </w:r>
-    </w:p>
-    <w:p>
-      <w:pPr>
-        <w:pStyle w:val="ListBullet"/>
-      </w:pPr>
-      <w:r>
-        <w:t>Lớp User trả về email đã tồn tại.</w:t>
-      </w:r>
-    </w:p>
-    <w:p>
-      <w:pPr>
-        <w:pStyle w:val="ListBullet"/>
-      </w:pPr>
-      <w:r>
-        <w:t>Lớp ProfileView hiển thị "Email này đã được đăng ký bởi tài khoản khác."</w:t>
-      </w:r>
-    </w:p>
-    <w:p>
       <w:pPr>
         <w:pStyle w:val="Heading3"/>
       </w:pPr>
@@ -6862,13 +6687,33 @@
         <w:t>10. Lớp StaffManageView hiển thị "Thêm nhân viên thành công!"</w:t>
       </w:r>
     </w:p>
+    <w:p/>
     <w:p>
-      <w:pPr/>
+      <w:pPr>
+        <w:pStyle w:val="Heading1"/>
+      </w:pPr>
       <w:r>
         <w:rPr>
-          <w:b/>
+          <w:color w:val="0000C8"/>
+          <w:u w:val="single" w:color="0000C8"/>
         </w:rPr>
-        <w:t>Ngoại lệ: SĐT đã tồn tại</w:t>
+        <w:t>III. PHA THIẾT KẾ</w:t>
+      </w:r>
+    </w:p>
+    <w:p>
+      <w:pPr>
+        <w:pStyle w:val="Heading2"/>
+      </w:pPr>
+      <w:r>
+        <w:t>1. Thiết kế lớp thực thể</w:t>
+      </w:r>
+    </w:p>
+    <w:p>
+      <w:pPr>
+        <w:pStyle w:val="Heading2"/>
+      </w:pPr>
+      <w:r>
+        <w:t>1.1. Bước 1 – Bổ sung thuộc tính id</w:t>
       </w:r>
     </w:p>
     <w:p>
@@ -6876,7 +6721,14 @@
         <w:pStyle w:val="ListBullet"/>
       </w:pPr>
       <w:r>
-        <w:t>Lớp Employee trả về lỗi trùng SĐT.</w:t>
+        <w:t xml:space="preserve">User: </w:t>
+      </w:r>
+      <w:r>
+        <w:rPr>
+          <w:rFonts w:ascii="Courier New" w:hAnsi="Courier New"/>
+          <w:sz w:val="20"/>
+        </w:rPr>
+        <w:t>id : int</w:t>
       </w:r>
     </w:p>
     <w:p>
@@ -6884,16 +6736,14 @@
         <w:pStyle w:val="ListBullet"/>
       </w:pPr>
       <w:r>
-        <w:t>Lớp StaffManageView hiển thị "SĐT này đã được sử dụng."</w:t>
-      </w:r>
-    </w:p>
-    <w:p>
-      <w:pPr/>
+        <w:t xml:space="preserve">MembershipTier: </w:t>
+      </w:r>
       <w:r>
         <w:rPr>
-          <w:b/>
+          <w:rFonts w:ascii="Courier New" w:hAnsi="Courier New"/>
+          <w:sz w:val="20"/>
         </w:rPr>
-        <w:t>Ngoại lệ: Nhân viên đang xử lý order</w:t>
+        <w:t>id : int</w:t>
       </w:r>
     </w:p>
     <w:p>
@@ -6901,7 +6751,14 @@
         <w:pStyle w:val="ListBullet"/>
       </w:pPr>
       <w:r>
-        <w:t>Lớp Employee trả về lỗi không thể xóa.</w:t>
+        <w:t xml:space="preserve">OTP: </w:t>
+      </w:r>
+      <w:r>
+        <w:rPr>
+          <w:rFonts w:ascii="Courier New" w:hAnsi="Courier New"/>
+          <w:sz w:val="20"/>
+        </w:rPr>
+        <w:t>id : int</w:t>
       </w:r>
     </w:p>
     <w:p>
@@ -6909,20 +6766,29 @@
         <w:pStyle w:val="ListBullet"/>
       </w:pPr>
       <w:r>
-        <w:t>Lớp StaffManageView hiển thị cảnh báo "Nhân viên đang xử lý order, không thể xóa."</w:t>
+        <w:t xml:space="preserve">LoginSession: </w:t>
+      </w:r>
+      <w:r>
+        <w:rPr>
+          <w:rFonts w:ascii="Courier New" w:hAnsi="Courier New"/>
+          <w:sz w:val="20"/>
+        </w:rPr>
+        <w:t>id : int</w:t>
       </w:r>
     </w:p>
-    <w:p/>
     <w:p>
       <w:pPr>
-        <w:pStyle w:val="Heading1"/>
+        <w:pStyle w:val="ListBullet"/>
       </w:pPr>
       <w:r>
+        <w:t xml:space="preserve">Employee: </w:t>
+      </w:r>
+      <w:r>
         <w:rPr>
-          <w:color w:val="0000C8"/>
-          <w:u w:val="single" w:color="0000C8"/>
+          <w:rFonts w:ascii="Courier New" w:hAnsi="Courier New"/>
+          <w:sz w:val="20"/>
         </w:rPr>
-        <w:t>III. PHA THIẾT KẾ</w:t>
+        <w:t>id : int</w:t>
       </w:r>
     </w:p>
     <w:p>
@@ -6930,15 +6796,7 @@
         <w:pStyle w:val="Heading2"/>
       </w:pPr>
       <w:r>
-        <w:t>1. Thiết kế lớp thực thể</w:t>
-      </w:r>
-    </w:p>
-    <w:p>
-      <w:pPr>
-        <w:pStyle w:val="Heading3"/>
-      </w:pPr>
-      <w:r>
-        <w:t>Bước 1 – Bổ sung thuộc tính id</w:t>
+        <w:t>1.2. Bước 2 – Thêm kiểu dữ liệu</w:t>
       </w:r>
     </w:p>
     <w:p>
@@ -6955,6 +6813,76 @@
         </w:rPr>
         <w:t>id : int</w:t>
       </w:r>
+      <w:r>
+        <w:t xml:space="preserve">, </w:t>
+      </w:r>
+      <w:r>
+        <w:rPr>
+          <w:rFonts w:ascii="Courier New" w:hAnsi="Courier New"/>
+          <w:sz w:val="20"/>
+        </w:rPr>
+        <w:t>hoTen : String</w:t>
+      </w:r>
+      <w:r>
+        <w:t xml:space="preserve">, </w:t>
+      </w:r>
+      <w:r>
+        <w:rPr>
+          <w:rFonts w:ascii="Courier New" w:hAnsi="Courier New"/>
+          <w:sz w:val="20"/>
+        </w:rPr>
+        <w:t>soDienThoai : String</w:t>
+      </w:r>
+      <w:r>
+        <w:t xml:space="preserve">, </w:t>
+      </w:r>
+      <w:r>
+        <w:rPr>
+          <w:rFonts w:ascii="Courier New" w:hAnsi="Courier New"/>
+          <w:sz w:val="20"/>
+        </w:rPr>
+        <w:t>email : String</w:t>
+      </w:r>
+      <w:r>
+        <w:t xml:space="preserve">, </w:t>
+      </w:r>
+      <w:r>
+        <w:rPr>
+          <w:rFonts w:ascii="Courier New" w:hAnsi="Courier New"/>
+          <w:sz w:val="20"/>
+        </w:rPr>
+        <w:t>matKhau : String</w:t>
+      </w:r>
+      <w:r>
+        <w:t xml:space="preserve">, </w:t>
+      </w:r>
+      <w:r>
+        <w:rPr>
+          <w:rFonts w:ascii="Courier New" w:hAnsi="Courier New"/>
+          <w:sz w:val="20"/>
+        </w:rPr>
+        <w:t>ngayTao : Date</w:t>
+      </w:r>
+      <w:r>
+        <w:t xml:space="preserve">, </w:t>
+      </w:r>
+      <w:r>
+        <w:rPr>
+          <w:rFonts w:ascii="Courier New" w:hAnsi="Courier New"/>
+          <w:sz w:val="20"/>
+        </w:rPr>
+        <w:t>diemTichLuy : int</w:t>
+      </w:r>
+      <w:r>
+        <w:t xml:space="preserve">, </w:t>
+      </w:r>
+      <w:r>
+        <w:rPr>
+          <w:rFonts w:ascii="Courier New" w:hAnsi="Courier New"/>
+          <w:sz w:val="20"/>
+        </w:rPr>
+        <w:t>trangThai : String</w:t>
+      </w:r>
     </w:p>
     <w:p>
       <w:pPr>
@@ -6970,6 +6898,46 @@
         </w:rPr>
         <w:t>id : int</w:t>
       </w:r>
+      <w:r>
+        <w:t xml:space="preserve">, </w:t>
+      </w:r>
+      <w:r>
+        <w:rPr>
+          <w:rFonts w:ascii="Courier New" w:hAnsi="Courier New"/>
+          <w:sz w:val="20"/>
+        </w:rPr>
+        <w:t>tenHang : String</w:t>
+      </w:r>
+      <w:r>
+        <w:t xml:space="preserve">, </w:t>
+      </w:r>
+      <w:r>
+        <w:rPr>
+          <w:rFonts w:ascii="Courier New" w:hAnsi="Courier New"/>
+          <w:sz w:val="20"/>
+        </w:rPr>
+        <w:t>diemToiThieu : int</w:t>
+      </w:r>
+      <w:r>
+        <w:t xml:space="preserve">, </w:t>
+      </w:r>
+      <w:r>
+        <w:rPr>
+          <w:rFonts w:ascii="Courier New" w:hAnsi="Courier New"/>
+          <w:sz w:val="20"/>
+        </w:rPr>
+        <w:t>moTa : String</w:t>
+      </w:r>
+      <w:r>
+        <w:t xml:space="preserve">, </w:t>
+      </w:r>
+      <w:r>
+        <w:rPr>
+          <w:rFonts w:ascii="Courier New" w:hAnsi="Courier New"/>
+          <w:sz w:val="20"/>
+        </w:rPr>
+        <w:t>heSoUuDai : double</w:t>
+      </w:r>
     </w:p>
     <w:p>
       <w:pPr>
@@ -6985,6 +6953,46 @@
         </w:rPr>
         <w:t>id : int</w:t>
       </w:r>
+      <w:r>
+        <w:t xml:space="preserve">, </w:t>
+      </w:r>
+      <w:r>
+        <w:rPr>
+          <w:rFonts w:ascii="Courier New" w:hAnsi="Courier New"/>
+          <w:sz w:val="20"/>
+        </w:rPr>
+        <w:t>maOTP : String</w:t>
+      </w:r>
+      <w:r>
+        <w:t xml:space="preserve">, </w:t>
+      </w:r>
+      <w:r>
+        <w:rPr>
+          <w:rFonts w:ascii="Courier New" w:hAnsi="Courier New"/>
+          <w:sz w:val="20"/>
+        </w:rPr>
+        <w:t>loai : String</w:t>
+      </w:r>
+      <w:r>
+        <w:t xml:space="preserve">, </w:t>
+      </w:r>
+      <w:r>
+        <w:rPr>
+          <w:rFonts w:ascii="Courier New" w:hAnsi="Courier New"/>
+          <w:sz w:val="20"/>
+        </w:rPr>
+        <w:t>thoiHanHetHan : Date</w:t>
+      </w:r>
+      <w:r>
+        <w:t xml:space="preserve">, </w:t>
+      </w:r>
+      <w:r>
+        <w:rPr>
+          <w:rFonts w:ascii="Courier New" w:hAnsi="Courier New"/>
+          <w:sz w:val="20"/>
+        </w:rPr>
+        <w:t>daXacMinh : boolean</w:t>
+      </w:r>
     </w:p>
     <w:p>
       <w:pPr>
@@ -7000,6 +7008,46 @@
         </w:rPr>
         <w:t>id : int</w:t>
       </w:r>
+      <w:r>
+        <w:t xml:space="preserve">, </w:t>
+      </w:r>
+      <w:r>
+        <w:rPr>
+          <w:rFonts w:ascii="Courier New" w:hAnsi="Courier New"/>
+          <w:sz w:val="20"/>
+        </w:rPr>
+        <w:t>tokenPhien : String</w:t>
+      </w:r>
+      <w:r>
+        <w:t xml:space="preserve">, </w:t>
+      </w:r>
+      <w:r>
+        <w:rPr>
+          <w:rFonts w:ascii="Courier New" w:hAnsi="Courier New"/>
+          <w:sz w:val="20"/>
+        </w:rPr>
+        <w:t>thoiGianDangNhap : DateTime</w:t>
+      </w:r>
+      <w:r>
+        <w:t xml:space="preserve">, </w:t>
+      </w:r>
+      <w:r>
+        <w:rPr>
+          <w:rFonts w:ascii="Courier New" w:hAnsi="Courier New"/>
+          <w:sz w:val="20"/>
+        </w:rPr>
+        <w:t>thoiGianHetHan : DateTime</w:t>
+      </w:r>
+      <w:r>
+        <w:t xml:space="preserve">, </w:t>
+      </w:r>
+      <w:r>
+        <w:rPr>
+          <w:rFonts w:ascii="Courier New" w:hAnsi="Courier New"/>
+          <w:sz w:val="20"/>
+        </w:rPr>
+        <w:t>thietBi : String</w:t>
+      </w:r>
     </w:p>
     <w:p>
       <w:pPr>
@@ -7015,13 +7063,43 @@
         </w:rPr>
         <w:t>id : int</w:t>
       </w:r>
+      <w:r>
+        <w:t xml:space="preserve">, </w:t>
+      </w:r>
+      <w:r>
+        <w:rPr>
+          <w:rFonts w:ascii="Courier New" w:hAnsi="Courier New"/>
+          <w:sz w:val="20"/>
+        </w:rPr>
+        <w:t>hoTen : String</w:t>
+      </w:r>
+      <w:r>
+        <w:t xml:space="preserve">, </w:t>
+      </w:r>
+      <w:r>
+        <w:rPr>
+          <w:rFonts w:ascii="Courier New" w:hAnsi="Courier New"/>
+          <w:sz w:val="20"/>
+        </w:rPr>
+        <w:t>vaiTro : String</w:t>
+      </w:r>
+      <w:r>
+        <w:t xml:space="preserve">, </w:t>
+      </w:r>
+      <w:r>
+        <w:rPr>
+          <w:rFonts w:ascii="Courier New" w:hAnsi="Courier New"/>
+          <w:sz w:val="20"/>
+        </w:rPr>
+        <w:t>trangThai : String</w:t>
+      </w:r>
     </w:p>
     <w:p>
       <w:pPr>
-        <w:pStyle w:val="Heading3"/>
+        <w:pStyle w:val="Heading2"/>
       </w:pPr>
       <w:r>
-        <w:t>Bước 2 – Thêm kiểu dữ liệu</w:t>
+        <w:t>1.3. Bước 3 – Chuyển quan hệ</w:t>
       </w:r>
     </w:p>
     <w:p>
@@ -7029,84 +7107,17 @@
         <w:pStyle w:val="ListBullet"/>
       </w:pPr>
       <w:r>
-        <w:t xml:space="preserve">User: </w:t>
+        <w:t xml:space="preserve">User </w:t>
       </w:r>
       <w:r>
         <w:rPr>
           <w:rFonts w:ascii="Courier New" w:hAnsi="Courier New"/>
           <w:sz w:val="20"/>
         </w:rPr>
-        <w:t>id : int</w:t>
-      </w:r>
-      <w:r>
-        <w:t xml:space="preserve">, </w:t>
-      </w:r>
-      <w:r>
-        <w:rPr>
-          <w:rFonts w:ascii="Courier New" w:hAnsi="Courier New"/>
-          <w:sz w:val="20"/>
-        </w:rPr>
-        <w:t>hoTen : String</w:t>
-      </w:r>
-      <w:r>
-        <w:t xml:space="preserve">, </w:t>
-      </w:r>
-      <w:r>
-        <w:rPr>
-          <w:rFonts w:ascii="Courier New" w:hAnsi="Courier New"/>
-          <w:sz w:val="20"/>
-        </w:rPr>
-        <w:t>soDienThoai : String</w:t>
-      </w:r>
-      <w:r>
-        <w:t xml:space="preserve">, </w:t>
-      </w:r>
-      <w:r>
-        <w:rPr>
-          <w:rFonts w:ascii="Courier New" w:hAnsi="Courier New"/>
-          <w:sz w:val="20"/>
-        </w:rPr>
-        <w:t>email : String</w:t>
-      </w:r>
-      <w:r>
-        <w:t xml:space="preserve">, </w:t>
-      </w:r>
-      <w:r>
-        <w:rPr>
-          <w:rFonts w:ascii="Courier New" w:hAnsi="Courier New"/>
-          <w:sz w:val="20"/>
-        </w:rPr>
-        <w:t>matKhau : String</w:t>
-      </w:r>
-      <w:r>
-        <w:t xml:space="preserve">, </w:t>
-      </w:r>
-      <w:r>
-        <w:rPr>
-          <w:rFonts w:ascii="Courier New" w:hAnsi="Courier New"/>
-          <w:sz w:val="20"/>
-        </w:rPr>
-        <w:t>ngayTao : Date</w:t>
-      </w:r>
-      <w:r>
-        <w:t xml:space="preserve">, </w:t>
-      </w:r>
-      <w:r>
-        <w:rPr>
-          <w:rFonts w:ascii="Courier New" w:hAnsi="Courier New"/>
-          <w:sz w:val="20"/>
-        </w:rPr>
-        <w:t>diemTichLuy : int</w:t>
-      </w:r>
-      <w:r>
-        <w:t xml:space="preserve">, </w:t>
-      </w:r>
-      <w:r>
-        <w:rPr>
-          <w:rFonts w:ascii="Courier New" w:hAnsi="Courier New"/>
-          <w:sz w:val="20"/>
-        </w:rPr>
-        <w:t>trangThai : String</w:t>
+        <w:t>o--</w:t>
+      </w:r>
+      <w:r>
+        <w:t xml:space="preserve"> MembershipTier: aggregation (hạng hội viên là danh mục độc lập)</w:t>
       </w:r>
     </w:p>
     <w:p>
@@ -7114,54 +7125,17 @@
         <w:pStyle w:val="ListBullet"/>
       </w:pPr>
       <w:r>
-        <w:t xml:space="preserve">MembershipTier: </w:t>
+        <w:t xml:space="preserve">User </w:t>
       </w:r>
       <w:r>
         <w:rPr>
           <w:rFonts w:ascii="Courier New" w:hAnsi="Courier New"/>
           <w:sz w:val="20"/>
         </w:rPr>
-        <w:t>id : int</w:t>
-      </w:r>
-      <w:r>
-        <w:t xml:space="preserve">, </w:t>
-      </w:r>
-      <w:r>
-        <w:rPr>
-          <w:rFonts w:ascii="Courier New" w:hAnsi="Courier New"/>
-          <w:sz w:val="20"/>
-        </w:rPr>
-        <w:t>tenHang : String</w:t>
-      </w:r>
-      <w:r>
-        <w:t xml:space="preserve">, </w:t>
-      </w:r>
-      <w:r>
-        <w:rPr>
-          <w:rFonts w:ascii="Courier New" w:hAnsi="Courier New"/>
-          <w:sz w:val="20"/>
-        </w:rPr>
-        <w:t>diemToiThieu : int</w:t>
-      </w:r>
-      <w:r>
-        <w:t xml:space="preserve">, </w:t>
-      </w:r>
-      <w:r>
-        <w:rPr>
-          <w:rFonts w:ascii="Courier New" w:hAnsi="Courier New"/>
-          <w:sz w:val="20"/>
-        </w:rPr>
-        <w:t>moTa : String</w:t>
-      </w:r>
-      <w:r>
-        <w:t xml:space="preserve">, </w:t>
-      </w:r>
-      <w:r>
-        <w:rPr>
-          <w:rFonts w:ascii="Courier New" w:hAnsi="Courier New"/>
-          <w:sz w:val="20"/>
-        </w:rPr>
-        <w:t>heSoUuDai : double</w:t>
+        <w:t>*--</w:t>
+      </w:r>
+      <w:r>
+        <w:t xml:space="preserve"> OTP: composition (OTP không tồn tại độc lập)</w:t>
       </w:r>
     </w:p>
     <w:p>
@@ -7169,54 +7143,25 @@
         <w:pStyle w:val="ListBullet"/>
       </w:pPr>
       <w:r>
-        <w:t xml:space="preserve">OTP: </w:t>
+        <w:t xml:space="preserve">User </w:t>
       </w:r>
       <w:r>
         <w:rPr>
           <w:rFonts w:ascii="Courier New" w:hAnsi="Courier New"/>
           <w:sz w:val="20"/>
         </w:rPr>
-        <w:t>id : int</w:t>
-      </w:r>
-      <w:r>
-        <w:t xml:space="preserve">, </w:t>
-      </w:r>
-      <w:r>
-        <w:rPr>
-          <w:rFonts w:ascii="Courier New" w:hAnsi="Courier New"/>
-          <w:sz w:val="20"/>
-        </w:rPr>
-        <w:t>maOTP : String</w:t>
-      </w:r>
-      <w:r>
-        <w:t xml:space="preserve">, </w:t>
-      </w:r>
-      <w:r>
-        <w:rPr>
-          <w:rFonts w:ascii="Courier New" w:hAnsi="Courier New"/>
-          <w:sz w:val="20"/>
-        </w:rPr>
-        <w:t>loai : String</w:t>
-      </w:r>
-      <w:r>
-        <w:t xml:space="preserve">, </w:t>
-      </w:r>
-      <w:r>
-        <w:rPr>
-          <w:rFonts w:ascii="Courier New" w:hAnsi="Courier New"/>
-          <w:sz w:val="20"/>
-        </w:rPr>
-        <w:t>thoiHanHetHan : Date</w:t>
-      </w:r>
-      <w:r>
-        <w:t xml:space="preserve">, </w:t>
-      </w:r>
-      <w:r>
-        <w:rPr>
-          <w:rFonts w:ascii="Courier New" w:hAnsi="Courier New"/>
-          <w:sz w:val="20"/>
-        </w:rPr>
-        <w:t>daXacMinh : boolean</w:t>
+        <w:t>*--</w:t>
+      </w:r>
+      <w:r>
+        <w:t xml:space="preserve"> LoginSession: composition (phiên không tồn tại độc lập)</w:t>
+      </w:r>
+    </w:p>
+    <w:p>
+      <w:pPr>
+        <w:pStyle w:val="Heading2"/>
+      </w:pPr>
+      <w:r>
+        <w:t>1.4. Bước 4 – Bổ sung thuộc tính kiểu đối tượng</w:t>
       </w:r>
     </w:p>
     <w:p>
@@ -7224,54 +7169,14 @@
         <w:pStyle w:val="ListBullet"/>
       </w:pPr>
       <w:r>
-        <w:t xml:space="preserve">LoginSession: </w:t>
+        <w:t xml:space="preserve">User: </w:t>
       </w:r>
       <w:r>
         <w:rPr>
           <w:rFonts w:ascii="Courier New" w:hAnsi="Courier New"/>
           <w:sz w:val="20"/>
         </w:rPr>
-        <w:t>id : int</w:t>
-      </w:r>
-      <w:r>
-        <w:t xml:space="preserve">, </w:t>
-      </w:r>
-      <w:r>
-        <w:rPr>
-          <w:rFonts w:ascii="Courier New" w:hAnsi="Courier New"/>
-          <w:sz w:val="20"/>
-        </w:rPr>
-        <w:t>tokenPhien : String</w:t>
-      </w:r>
-      <w:r>
-        <w:t xml:space="preserve">, </w:t>
-      </w:r>
-      <w:r>
-        <w:rPr>
-          <w:rFonts w:ascii="Courier New" w:hAnsi="Courier New"/>
-          <w:sz w:val="20"/>
-        </w:rPr>
-        <w:t>thoiGianDangNhap : DateTime</w:t>
-      </w:r>
-      <w:r>
-        <w:t xml:space="preserve">, </w:t>
-      </w:r>
-      <w:r>
-        <w:rPr>
-          <w:rFonts w:ascii="Courier New" w:hAnsi="Courier New"/>
-          <w:sz w:val="20"/>
-        </w:rPr>
-        <w:t>thoiGianHetHan : DateTime</w:t>
-      </w:r>
-      <w:r>
-        <w:t xml:space="preserve">, </w:t>
-      </w:r>
-      <w:r>
-        <w:rPr>
-          <w:rFonts w:ascii="Courier New" w:hAnsi="Courier New"/>
-          <w:sz w:val="20"/>
-        </w:rPr>
-        <w:t>thietBi : String</w:t>
+        <w:t>membershipTier : MembershipTier</w:t>
       </w:r>
     </w:p>
     <w:p>
@@ -7279,52 +7184,14 @@
         <w:pStyle w:val="ListBullet"/>
       </w:pPr>
       <w:r>
-        <w:t xml:space="preserve">Employee: </w:t>
+        <w:t xml:space="preserve">LoginSession: </w:t>
       </w:r>
       <w:r>
         <w:rPr>
           <w:rFonts w:ascii="Courier New" w:hAnsi="Courier New"/>
           <w:sz w:val="20"/>
         </w:rPr>
-        <w:t>id : int</w:t>
-      </w:r>
-      <w:r>
-        <w:t xml:space="preserve">, </w:t>
-      </w:r>
-      <w:r>
-        <w:rPr>
-          <w:rFonts w:ascii="Courier New" w:hAnsi="Courier New"/>
-          <w:sz w:val="20"/>
-        </w:rPr>
-        <w:t>hoTen : String</w:t>
-      </w:r>
-      <w:r>
-        <w:t xml:space="preserve">, </w:t>
-      </w:r>
-      <w:r>
-        <w:rPr>
-          <w:rFonts w:ascii="Courier New" w:hAnsi="Courier New"/>
-          <w:sz w:val="20"/>
-        </w:rPr>
-        <w:t>vaiTro : String</w:t>
-      </w:r>
-      <w:r>
-        <w:t xml:space="preserve">, </w:t>
-      </w:r>
-      <w:r>
-        <w:rPr>
-          <w:rFonts w:ascii="Courier New" w:hAnsi="Courier New"/>
-          <w:sz w:val="20"/>
-        </w:rPr>
-        <w:t>trangThai : String</w:t>
-      </w:r>
-    </w:p>
-    <w:p>
-      <w:pPr>
-        <w:pStyle w:val="Heading3"/>
-      </w:pPr>
-      <w:r>
-        <w:t>Bước 3 – Chuyển quan hệ</w:t>
+        <w:t>user : User</w:t>
       </w:r>
     </w:p>
     <w:p>
@@ -7332,84 +7199,7 @@
         <w:pStyle w:val="ListBullet"/>
       </w:pPr>
       <w:r>
-        <w:t xml:space="preserve">User </w:t>
-      </w:r>
-      <w:r>
-        <w:rPr>
-          <w:rFonts w:ascii="Courier New" w:hAnsi="Courier New"/>
-          <w:sz w:val="20"/>
-        </w:rPr>
-        <w:t>o--</w:t>
-      </w:r>
-      <w:r>
-        <w:t xml:space="preserve"> MembershipTier: aggregation (hạng hội viên là danh mục độc lập)</w:t>
-      </w:r>
-    </w:p>
-    <w:p>
-      <w:pPr>
-        <w:pStyle w:val="ListBullet"/>
-      </w:pPr>
-      <w:r>
-        <w:t xml:space="preserve">User </w:t>
-      </w:r>
-      <w:r>
-        <w:rPr>
-          <w:rFonts w:ascii="Courier New" w:hAnsi="Courier New"/>
-          <w:sz w:val="20"/>
-        </w:rPr>
-        <w:t>*--</w:t>
-      </w:r>
-      <w:r>
-        <w:t xml:space="preserve"> OTP: composition (OTP không tồn tại độc lập)</w:t>
-      </w:r>
-    </w:p>
-    <w:p>
-      <w:pPr>
-        <w:pStyle w:val="ListBullet"/>
-      </w:pPr>
-      <w:r>
-        <w:t xml:space="preserve">User </w:t>
-      </w:r>
-      <w:r>
-        <w:rPr>
-          <w:rFonts w:ascii="Courier New" w:hAnsi="Courier New"/>
-          <w:sz w:val="20"/>
-        </w:rPr>
-        <w:t>*--</w:t>
-      </w:r>
-      <w:r>
-        <w:t xml:space="preserve"> LoginSession: composition (phiên không tồn tại độc lập)</w:t>
-      </w:r>
-    </w:p>
-    <w:p>
-      <w:pPr>
-        <w:pStyle w:val="Heading3"/>
-      </w:pPr>
-      <w:r>
-        <w:t>Bước 4 – Bổ sung thuộc tính kiểu đối tượng</w:t>
-      </w:r>
-    </w:p>
-    <w:p>
-      <w:pPr>
-        <w:pStyle w:val="ListBullet"/>
-      </w:pPr>
-      <w:r>
-        <w:t xml:space="preserve">User: </w:t>
-      </w:r>
-      <w:r>
-        <w:rPr>
-          <w:rFonts w:ascii="Courier New" w:hAnsi="Courier New"/>
-          <w:sz w:val="20"/>
-        </w:rPr>
-        <w:t>membershipTier : MembershipTier</w:t>
-      </w:r>
-    </w:p>
-    <w:p>
-      <w:pPr>
-        <w:pStyle w:val="ListBullet"/>
-      </w:pPr>
-      <w:r>
-        <w:t xml:space="preserve">LoginSession: </w:t>
+        <w:t xml:space="preserve">OTP: </w:t>
       </w:r>
       <w:r>
         <w:rPr>
@@ -7421,25 +7211,10 @@
     </w:p>
     <w:p>
       <w:pPr>
-        <w:pStyle w:val="ListBullet"/>
+        <w:pStyle w:val="Heading2"/>
       </w:pPr>
       <w:r>
-        <w:t xml:space="preserve">OTP: </w:t>
-      </w:r>
-      <w:r>
-        <w:rPr>
-          <w:rFonts w:ascii="Courier New" w:hAnsi="Courier New"/>
-          <w:sz w:val="20"/>
-        </w:rPr>
-        <w:t>user : User</w:t>
-      </w:r>
-    </w:p>
-    <w:p>
-      <w:pPr>
-        <w:pStyle w:val="Heading4"/>
-      </w:pPr>
-      <w:r>
-        <w:t>Biểu đồ lớp thực thể</w:t>
+        <w:t>1.5. Biểu đồ lớp thực thể</w:t>
       </w:r>
     </w:p>
     <w:p>
@@ -7497,10 +7272,10 @@
     </w:p>
     <w:p>
       <w:pPr>
-        <w:pStyle w:val="Heading3"/>
+        <w:pStyle w:val="Heading2"/>
       </w:pPr>
       <w:r>
-        <w:t>Bước 1 – Tạo bảng</w:t>
+        <w:t>2.1. Bước 1 – Tạo bảng</w:t>
       </w:r>
     </w:p>
     <w:tbl>
@@ -7712,10 +7487,10 @@
     </w:tbl>
     <w:p>
       <w:pPr>
-        <w:pStyle w:val="Heading3"/>
+        <w:pStyle w:val="Heading2"/>
       </w:pPr>
       <w:r>
-        <w:t>Bước 2 – Chuyển kiểu dữ liệu</w:t>
+        <w:t>2.2. Bước 2 – Chuyển kiểu dữ liệu</w:t>
       </w:r>
     </w:p>
     <w:tbl>
@@ -7927,10 +7702,10 @@
     </w:tbl>
     <w:p>
       <w:pPr>
-        <w:pStyle w:val="Heading3"/>
+        <w:pStyle w:val="Heading2"/>
       </w:pPr>
       <w:r>
-        <w:t>Bước 3 – Xử lý cardinality</w:t>
+        <w:t>2.3. Bước 3 – Xử lý cardinality</w:t>
       </w:r>
     </w:p>
     <w:p>
@@ -7980,10 +7755,10 @@
     </w:p>
     <w:p>
       <w:pPr>
-        <w:pStyle w:val="Heading3"/>
+        <w:pStyle w:val="Heading2"/>
       </w:pPr>
       <w:r>
-        <w:t>Bước 4 – PK/FK</w:t>
+        <w:t>2.4. Bước 4 – PK/FK</w:t>
       </w:r>
     </w:p>
     <w:p>
@@ -8018,10 +7793,10 @@
     </w:p>
     <w:p>
       <w:pPr>
-        <w:pStyle w:val="Heading4"/>
+        <w:pStyle w:val="Heading2"/>
       </w:pPr>
       <w:r>
-        <w:t>Biểu đồ ERD</w:t>
+        <w:t>2.5. Biểu đồ ERD</w:t>
       </w:r>
     </w:p>
     <w:p>
@@ -8078,17 +7853,17 @@
       </w:r>
     </w:p>
     <w:p>
-      <w:pPr/>
-      <w:r>
-        <w:t>&lt;!-- Wireframes sẽ được render thành monospace frames trong DOCX --&gt;</w:t>
+      <w:pPr>
+        <w:pStyle w:val="Heading2"/>
+      </w:pPr>
+      <w:r>
+        <w:t>3.1. Màn hình đăng nhập</w:t>
       </w:r>
     </w:p>
     <w:p>
-      <w:pPr>
-        <w:pStyle w:val="Heading3"/>
-      </w:pPr>
-      <w:r>
-        <w:t>Màn hình 1: LoginView</w:t>
+      <w:pPr/>
+      <w:r>
+        <w:t>&lt;!-- Wireframes sẽ được render thành monospace frames trong DOCX --&gt;</w:t>
       </w:r>
     </w:p>
     <w:p>
@@ -8113,25 +7888,25 @@
         <w:br/>
         <w:t>│                                              │</w:t>
         <w:br/>
-        <w:t>│  SĐT / Email: [________________________]     │</w:t>
+        <w:t>│  txtSDT:       [________________________]     │</w:t>
         <w:br/>
-        <w:t>│  Mật khẩu:    [________________________]     │</w:t>
+        <w:t>│  txtMatKhau:   [________________________]     │</w:t>
         <w:br/>
         <w:t>│                                              │</w:t>
         <w:br/>
-        <w:t>│  [Đăng nhập]                                 │</w:t>
+        <w:t>│  [btnDangNhap]                               │</w:t>
         <w:br/>
-        <w:t>│  Quên mật khẩu?  |  Đăng ký mới             │</w:t>
+        <w:t>│  btnQuenMatKhau  |  btnDangKy                │</w:t>
         <w:br/>
         <w:t>└──────────────────────────────────────────────┘</w:t>
       </w:r>
     </w:p>
     <w:p>
       <w:pPr>
-        <w:pStyle w:val="Heading3"/>
+        <w:pStyle w:val="Heading2"/>
       </w:pPr>
       <w:r>
-        <w:t>Màn hình 2: RegisterView</w:t>
+        <w:t>3.2. Màn hình đăng ký</w:t>
       </w:r>
     </w:p>
     <w:p>
@@ -8146,29 +7921,29 @@
         <w:br/>
         <w:t>│                                              │</w:t>
         <w:br/>
-        <w:t>│  Họ và tên:      [________________________]  │</w:t>
+        <w:t>│  txtHoTen:           [________________________]  │</w:t>
         <w:br/>
-        <w:t>│  Số điện thoại:   [________________________]  │</w:t>
+        <w:t>│  txtSoDienThoai:     [________________________]  │</w:t>
         <w:br/>
-        <w:t>│  Email:           [________________________]  │</w:t>
+        <w:t>│  txtEmail:           [________________________]  │</w:t>
         <w:br/>
-        <w:t>│  Mật khẩu:       [________________________]  │</w:t>
+        <w:t>│  txtMatKhau:         [________________________]  │</w:t>
         <w:br/>
-        <w:t>│  Xác nhận MK:    [________________________]  │</w:t>
+        <w:t>│  txtXacNhanMatKhau:  [________________________]  │</w:t>
         <w:br/>
         <w:t>│                                              │</w:t>
         <w:br/>
-        <w:t>│  [Tiếp tục]                 [Hủy]           │</w:t>
+        <w:t>│  [btnTiepTuc]                [btnHuy]        │</w:t>
         <w:br/>
         <w:t>└──────────────────────────────────────────────┘</w:t>
       </w:r>
     </w:p>
     <w:p>
       <w:pPr>
-        <w:pStyle w:val="Heading3"/>
+        <w:pStyle w:val="Heading2"/>
       </w:pPr>
       <w:r>
-        <w:t>Màn hình 3: OTPVerifyView</w:t>
+        <w:t>3.3. Màn hình xác nhận OTP</w:t>
       </w:r>
     </w:p>
     <w:p>
@@ -8183,27 +7958,23 @@
         <w:br/>
         <w:t>│                                              │</w:t>
         <w:br/>
-        <w:t>│  Mã OTP đã gửi đến 098****321               │</w:t>
+        <w:t>│  txtOTP: [__][__][__][__][__][__]            │</w:t>
         <w:br/>
         <w:t>│                                              │</w:t>
         <w:br/>
-        <w:t>│  [__][__][__][__][__][__]                    │</w:t>
+        <w:t>│  [btnXacNhan]                                │</w:t>
         <w:br/>
-        <w:t>│                                              │</w:t>
-        <w:br/>
-        <w:t>│  [Xác nhận]                                  │</w:t>
-        <w:br/>
-        <w:t>│  Gửi lại OTP (60s)                          │</w:t>
+        <w:t>│  lblCountdown: Gửi lại OTP (60s)            │</w:t>
         <w:br/>
         <w:t>└──────────────────────────────────────────────┘</w:t>
       </w:r>
     </w:p>
     <w:p>
       <w:pPr>
-        <w:pStyle w:val="Heading3"/>
+        <w:pStyle w:val="Heading2"/>
       </w:pPr>
       <w:r>
-        <w:t>Màn hình 4: ChangePasswordView</w:t>
+        <w:t>3.4. Màn hình đổi mật khẩu</w:t>
       </w:r>
     </w:p>
     <w:p>
@@ -8218,25 +7989,25 @@
         <w:br/>
         <w:t>│                                              │</w:t>
         <w:br/>
-        <w:t>│  Mật khẩu hiện tại: [________________________]│</w:t>
+        <w:t>│  txtMatKhauHienTai:     [________________________]│</w:t>
         <w:br/>
-        <w:t>│  Mật khẩu mới:      [________________________]│</w:t>
+        <w:t>│  txtMatKhauMoi:         [________________________]│</w:t>
         <w:br/>
-        <w:t>│  Xác nhận MK mới:   [________________________]│</w:t>
+        <w:t>│  txtXacNhanMatKhauMoi:  [________________________]│</w:t>
         <w:br/>
         <w:t>│                                              │</w:t>
         <w:br/>
-        <w:t>│  [Lưu thay đổi]          [Hủy]              │</w:t>
+        <w:t>│  [btnLuu]                [btnHuy]            │</w:t>
         <w:br/>
         <w:t>└──────────────────────────────────────────────┘</w:t>
       </w:r>
     </w:p>
     <w:p>
       <w:pPr>
-        <w:pStyle w:val="Heading3"/>
+        <w:pStyle w:val="Heading2"/>
       </w:pPr>
       <w:r>
-        <w:t>Màn hình 5: ProfileView</w:t>
+        <w:t>3.5. Màn hình hồ sơ cá nhân</w:t>
       </w:r>
     </w:p>
     <w:p>
@@ -8251,29 +8022,29 @@
         <w:br/>
         <w:t>│                                              │</w:t>
         <w:br/>
-        <w:t>│  Họ và tên:      Nguyễn Văn An              │</w:t>
+        <w:t>│  txtHoTen:         [________________________]  │</w:t>
         <w:br/>
-        <w:t>│  Số điện thoại:   0912345678                 │</w:t>
+        <w:t>│  txtSoDienThoai:   [________________________]  │</w:t>
         <w:br/>
-        <w:t>│  Email:           vana@email.com             │</w:t>
+        <w:t>│  txtEmail:         [________________________]  │</w:t>
         <w:br/>
-        <w:t>│  Hạng hội viên:  Bạc (1.250 điểm)          │</w:t>
+        <w:t>│  lblMembershipTier: ........................  │</w:t>
         <w:br/>
-        <w:t>│  Ngày tham gia:   15/03/2024                 │</w:t>
+        <w:t>│  lblDiemTichLuy:   ........................  │</w:t>
         <w:br/>
         <w:t>│                                              │</w:t>
         <w:br/>
-        <w:t>│  [Chỉnh sửa thông tin]  [Đổi mật khẩu]      │</w:t>
+        <w:t>│  [btnChinhSua]  [btnDoiMatKhau]              │</w:t>
         <w:br/>
         <w:t>└──────────────────────────────────────────────┘</w:t>
       </w:r>
     </w:p>
     <w:p>
       <w:pPr>
-        <w:pStyle w:val="Heading3"/>
+        <w:pStyle w:val="Heading2"/>
       </w:pPr>
       <w:r>
-        <w:t>Màn hình 6: StaffManageView</w:t>
+        <w:t>3.6. Màn hình quản lý nhân viên</w:t>
       </w:r>
     </w:p>
     <w:p>
@@ -8288,7 +8059,9 @@
         <w:br/>
         <w:t>│                                              │</w:t>
         <w:br/>
-        <w:t>│  [Thêm nhân viên]                            │</w:t>
+        <w:t>│  txtTimKiem: [________________________]      │</w:t>
+        <w:br/>
+        <w:t>│  [btnThem]                                   │</w:t>
         <w:br/>
         <w:t>│                                              │</w:t>
         <w:br/>
@@ -8296,15 +8069,17 @@
         <w:br/>
         <w:t>│ │ Họ tên│ Vai trò│ Trạng thái│ ...     │      │</w:t>
         <w:br/>
-        <w:t>│ │ Trần A│ Lễ tân │ Đang LD  │         │      │</w:t>
+        <w:t>│ │ ......│ .......│ .........│         │      │</w:t>
         <w:br/>
-        <w:t>│ │ Lê B  │ Phục vụ│ Đang LD  │         │      │</w:t>
+        <w:t>│ │ ......│ .......│ .........│         │      │</w:t>
         <w:br/>
         <w:t>│ └──────┴────────┴──────────┴──────────┘      │</w:t>
         <w:br/>
+        <w:t>│  tblStaff                                    │</w:t>
+        <w:br/>
         <w:t>│                                              │</w:t>
         <w:br/>
-        <w:t>│  [Sửa]  [Xóa]                               │</w:t>
+        <w:t>│  [btnSua]  [btnXoa]                          │</w:t>
         <w:br/>
         <w:t>└──────────────────────────────────────────────┘</w:t>
       </w:r>
@@ -8318,6 +8093,14 @@
       </w:r>
     </w:p>
     <w:p>
+      <w:pPr>
+        <w:pStyle w:val="Heading2"/>
+      </w:pPr>
+      <w:r>
+        <w:t>4.1. Tổng quan kiến trúc</w:t>
+      </w:r>
+    </w:p>
+    <w:p>
       <w:pPr/>
       <w:r>
         <w:t>Mô hình thiết kế theo kiến trúc MVC (Boundary – Control – Entity):</w:t>
@@ -8360,18 +8143,25 @@
       </w:r>
     </w:p>
     <w:p>
-      <w:pPr/>
+      <w:pPr>
+        <w:pStyle w:val="Heading2"/>
+      </w:pPr>
+      <w:r>
+        <w:t>4.2. Quy trình xác định chữ ký hàm Controller</w:t>
+      </w:r>
+    </w:p>
+    <w:p>
+      <w:pPr>
+        <w:pStyle w:val="ListBullet"/>
+      </w:pPr>
       <w:r>
         <w:rPr>
           <w:b/>
         </w:rPr>
-        <w:t>Quy trình xác định chữ ký hàm Controller:</w:t>
-      </w:r>
-    </w:p>
-    <w:p>
-      <w:pPr/>
-      <w:r>
-        <w:t xml:space="preserve">a) Đăng nhập =&gt; </w:t>
+        <w:t>a) Đăng nhập</w:t>
+      </w:r>
+      <w:r>
+        <w:t xml:space="preserve"> =&gt; </w:t>
       </w:r>
       <w:r>
         <w:rPr>
@@ -8380,9 +8170,6 @@
         </w:rPr>
         <w:t>checkLogin()</w:t>
       </w:r>
-      <w:r>
-        <w:t>`</w:t>
-      </w:r>
     </w:p>
     <w:p>
       <w:pPr>
@@ -8420,7 +8207,7 @@
         <w:t>checkLogin()</w:t>
       </w:r>
       <w:r>
-        <w:t>` → chọn (gom nhóm tham số)</w:t>
+        <w:t xml:space="preserve"> → chọn (gom nhóm tham số)</w:t>
       </w:r>
     </w:p>
     <w:p>
@@ -8440,13 +8227,10 @@
           <w:rFonts w:ascii="Courier New" w:hAnsi="Courier New"/>
           <w:sz w:val="20"/>
         </w:rPr>
-        <w:t>checkLogin()</w:t>
-      </w:r>
-      <w:r>
-        <w:t>: void</w:t>
-      </w:r>
-      <w:r>
-        <w:t>` → loại (cần trả về kết quả xác thực)</w:t>
+        <w:t>checkLogin(): void</w:t>
+      </w:r>
+      <w:r>
+        <w:t xml:space="preserve"> → loại (cần trả về kết quả xác thực)</w:t>
       </w:r>
     </w:p>
     <w:p>
@@ -8458,19 +8242,24 @@
           <w:rFonts w:ascii="Courier New" w:hAnsi="Courier New"/>
           <w:sz w:val="20"/>
         </w:rPr>
-        <w:t>checkLogin()</w:t>
-      </w:r>
-      <w:r>
-        <w:t>: boolean</w:t>
-      </w:r>
-      <w:r>
-        <w:t>` → chọn (trả về true/false xác thực thành công)</w:t>
+        <w:t>checkLogin(): boolean</w:t>
+      </w:r>
+      <w:r>
+        <w:t xml:space="preserve"> → chọn (trả về true/false xác thực thành công)</w:t>
       </w:r>
     </w:p>
     <w:p>
-      <w:pPr/>
-      <w:r>
-        <w:t xml:space="preserve">b) Đăng ký =&gt; </w:t>
+      <w:pPr>
+        <w:pStyle w:val="ListBullet"/>
+      </w:pPr>
+      <w:r>
+        <w:rPr>
+          <w:b/>
+        </w:rPr>
+        <w:t>b) Đăng ký</w:t>
+      </w:r>
+      <w:r>
+        <w:t xml:space="preserve"> =&gt; </w:t>
       </w:r>
       <w:r>
         <w:rPr>
@@ -8479,9 +8268,6 @@
         </w:rPr>
         <w:t>register()</w:t>
       </w:r>
-      <w:r>
-        <w:t>`</w:t>
-      </w:r>
     </w:p>
     <w:p>
       <w:pPr>
@@ -8519,7 +8305,7 @@
         <w:t>register()</w:t>
       </w:r>
       <w:r>
-        <w:t>` → chọn</w:t>
+        <w:t xml:space="preserve"> → chọn</w:t>
       </w:r>
     </w:p>
     <w:p>
@@ -8539,19 +8325,24 @@
           <w:rFonts w:ascii="Courier New" w:hAnsi="Courier New"/>
           <w:sz w:val="20"/>
         </w:rPr>
-        <w:t>register()</w:t>
-      </w:r>
-      <w:r>
-        <w:t>: User</w:t>
-      </w:r>
-      <w:r>
-        <w:t>` → chọn</w:t>
+        <w:t>register(): User</w:t>
+      </w:r>
+      <w:r>
+        <w:t xml:space="preserve"> → chọn</w:t>
       </w:r>
     </w:p>
     <w:p>
-      <w:pPr/>
-      <w:r>
-        <w:t xml:space="preserve">c) Xác minh OTP =&gt; </w:t>
+      <w:pPr>
+        <w:pStyle w:val="ListBullet"/>
+      </w:pPr>
+      <w:r>
+        <w:rPr>
+          <w:b/>
+        </w:rPr>
+        <w:t>c) Xác minh OTP</w:t>
+      </w:r>
+      <w:r>
+        <w:t xml:space="preserve"> =&gt; </w:t>
       </w:r>
       <w:r>
         <w:rPr>
@@ -8560,9 +8351,6 @@
         </w:rPr>
         <w:t>verifyOTP()</w:t>
       </w:r>
-      <w:r>
-        <w:t>`</w:t>
-      </w:r>
     </w:p>
     <w:p>
       <w:pPr>
@@ -8600,7 +8388,7 @@
         <w:t>verifyOTP()</w:t>
       </w:r>
       <w:r>
-        <w:t>` → chọn</w:t>
+        <w:t xml:space="preserve"> → chọn</w:t>
       </w:r>
     </w:p>
     <w:p>
@@ -8620,19 +8408,24 @@
           <w:rFonts w:ascii="Courier New" w:hAnsi="Courier New"/>
           <w:sz w:val="20"/>
         </w:rPr>
-        <w:t>verifyOTP()</w:t>
-      </w:r>
-      <w:r>
-        <w:t>: boolean</w:t>
-      </w:r>
-      <w:r>
-        <w:t>` → chọn (cần biết đúng/sai)</w:t>
+        <w:t>verifyOTP(): boolean</w:t>
+      </w:r>
+      <w:r>
+        <w:t xml:space="preserve"> → chọn (cần biết đúng/sai)</w:t>
       </w:r>
     </w:p>
     <w:p>
-      <w:pPr/>
-      <w:r>
-        <w:t xml:space="preserve">d) Đổi mật khẩu =&gt; </w:t>
+      <w:pPr>
+        <w:pStyle w:val="ListBullet"/>
+      </w:pPr>
+      <w:r>
+        <w:rPr>
+          <w:b/>
+        </w:rPr>
+        <w:t>d) Đổi mật khẩu</w:t>
+      </w:r>
+      <w:r>
+        <w:t xml:space="preserve"> =&gt; </w:t>
       </w:r>
       <w:r>
         <w:rPr>
@@ -8641,9 +8434,6 @@
         </w:rPr>
         <w:t>changePassword()</w:t>
       </w:r>
-      <w:r>
-        <w:t>`</w:t>
-      </w:r>
     </w:p>
     <w:p>
       <w:pPr>
@@ -8681,7 +8471,7 @@
         <w:t>changePassword()</w:t>
       </w:r>
       <w:r>
-        <w:t>` → chọn</w:t>
+        <w:t xml:space="preserve"> → chọn</w:t>
       </w:r>
     </w:p>
     <w:p>
@@ -8701,19 +8491,24 @@
           <w:rFonts w:ascii="Courier New" w:hAnsi="Courier New"/>
           <w:sz w:val="20"/>
         </w:rPr>
-        <w:t>changePassword()</w:t>
-      </w:r>
-      <w:r>
-        <w:t>: boolean</w:t>
-      </w:r>
-      <w:r>
-        <w:t>` → chọn</w:t>
+        <w:t>changePassword(): boolean</w:t>
+      </w:r>
+      <w:r>
+        <w:t xml:space="preserve"> → chọn</w:t>
       </w:r>
     </w:p>
     <w:p>
-      <w:pPr/>
-      <w:r>
-        <w:t xml:space="preserve">e) Xem hồ sơ =&gt; </w:t>
+      <w:pPr>
+        <w:pStyle w:val="ListBullet"/>
+      </w:pPr>
+      <w:r>
+        <w:rPr>
+          <w:b/>
+        </w:rPr>
+        <w:t>e) Xem hồ sơ</w:t>
+      </w:r>
+      <w:r>
+        <w:t xml:space="preserve"> =&gt; </w:t>
       </w:r>
       <w:r>
         <w:rPr>
@@ -8722,9 +8517,6 @@
         </w:rPr>
         <w:t>getProfile()</w:t>
       </w:r>
-      <w:r>
-        <w:t>`</w:t>
-      </w:r>
     </w:p>
     <w:p>
       <w:pPr>
@@ -8762,7 +8554,7 @@
         <w:t>getProfile()</w:t>
       </w:r>
       <w:r>
-        <w:t>` → chọn</w:t>
+        <w:t xml:space="preserve"> → chọn</w:t>
       </w:r>
     </w:p>
     <w:p>
@@ -8782,19 +8574,24 @@
           <w:rFonts w:ascii="Courier New" w:hAnsi="Courier New"/>
           <w:sz w:val="20"/>
         </w:rPr>
-        <w:t>getProfile()</w:t>
-      </w:r>
-      <w:r>
-        <w:t>: User</w:t>
-      </w:r>
-      <w:r>
-        <w:t>` → chọn</w:t>
+        <w:t>getProfile(): User</w:t>
+      </w:r>
+      <w:r>
+        <w:t xml:space="preserve"> → chọn</w:t>
       </w:r>
     </w:p>
     <w:p>
-      <w:pPr/>
-      <w:r>
-        <w:t xml:space="preserve">f) Cập nhật hồ sơ =&gt; </w:t>
+      <w:pPr>
+        <w:pStyle w:val="ListBullet"/>
+      </w:pPr>
+      <w:r>
+        <w:rPr>
+          <w:b/>
+        </w:rPr>
+        <w:t>f) Cập nhật hồ sơ</w:t>
+      </w:r>
+      <w:r>
+        <w:t xml:space="preserve"> =&gt; </w:t>
       </w:r>
       <w:r>
         <w:rPr>
@@ -8803,9 +8600,6 @@
         </w:rPr>
         <w:t>updateProfile()</w:t>
       </w:r>
-      <w:r>
-        <w:t>`</w:t>
-      </w:r>
     </w:p>
     <w:p>
       <w:pPr>
@@ -8843,7 +8637,7 @@
         <w:t>updateProfile()</w:t>
       </w:r>
       <w:r>
-        <w:t>` → chọn</w:t>
+        <w:t xml:space="preserve"> → chọn</w:t>
       </w:r>
     </w:p>
     <w:p>
@@ -8863,19 +8657,24 @@
           <w:rFonts w:ascii="Courier New" w:hAnsi="Courier New"/>
           <w:sz w:val="20"/>
         </w:rPr>
-        <w:t>updateProfile()</w:t>
-      </w:r>
-      <w:r>
-        <w:t>: User</w:t>
-      </w:r>
-      <w:r>
-        <w:t>` → chọn</w:t>
+        <w:t>updateProfile(): User</w:t>
+      </w:r>
+      <w:r>
+        <w:t xml:space="preserve"> → chọn</w:t>
       </w:r>
     </w:p>
     <w:p>
-      <w:pPr/>
-      <w:r>
-        <w:t xml:space="preserve">g) Xem danh sách NV =&gt; </w:t>
+      <w:pPr>
+        <w:pStyle w:val="ListBullet"/>
+      </w:pPr>
+      <w:r>
+        <w:rPr>
+          <w:b/>
+        </w:rPr>
+        <w:t>g) Xem danh sách NV</w:t>
+      </w:r>
+      <w:r>
+        <w:t xml:space="preserve"> =&gt; </w:t>
       </w:r>
       <w:r>
         <w:rPr>
@@ -8884,9 +8683,6 @@
         </w:rPr>
         <w:t>getAllStaff()</w:t>
       </w:r>
-      <w:r>
-        <w:t>`</w:t>
-      </w:r>
     </w:p>
     <w:p>
       <w:pPr>
@@ -8924,7 +8720,7 @@
         <w:t>getAllStaff()</w:t>
       </w:r>
       <w:r>
-        <w:t>` → chọn</w:t>
+        <w:t xml:space="preserve"> → chọn</w:t>
       </w:r>
     </w:p>
     <w:p>
@@ -8944,19 +8740,24 @@
           <w:rFonts w:ascii="Courier New" w:hAnsi="Courier New"/>
           <w:sz w:val="20"/>
         </w:rPr>
-        <w:t>getAllStaff()</w:t>
-      </w:r>
-      <w:r>
-        <w:t>: List&lt;Employee&gt;</w:t>
-      </w:r>
-      <w:r>
-        <w:t>` → chọn</w:t>
+        <w:t>getAllStaff(): List&lt;Employee&gt;</w:t>
+      </w:r>
+      <w:r>
+        <w:t xml:space="preserve"> → chọn</w:t>
       </w:r>
     </w:p>
     <w:p>
-      <w:pPr/>
-      <w:r>
-        <w:t xml:space="preserve">h) Tìm kiếm NV =&gt; </w:t>
+      <w:pPr>
+        <w:pStyle w:val="ListBullet"/>
+      </w:pPr>
+      <w:r>
+        <w:rPr>
+          <w:b/>
+        </w:rPr>
+        <w:t>h) Tìm kiếm NV</w:t>
+      </w:r>
+      <w:r>
+        <w:t xml:space="preserve"> =&gt; </w:t>
       </w:r>
       <w:r>
         <w:rPr>
@@ -9029,9 +8830,17 @@
       </w:r>
     </w:p>
     <w:p>
-      <w:pPr/>
-      <w:r>
-        <w:t xml:space="preserve">i) Lấy NV theo id =&gt; </w:t>
+      <w:pPr>
+        <w:pStyle w:val="ListBullet"/>
+      </w:pPr>
+      <w:r>
+        <w:rPr>
+          <w:b/>
+        </w:rPr>
+        <w:t>i) Lấy NV theo id</w:t>
+      </w:r>
+      <w:r>
+        <w:t xml:space="preserve"> =&gt; </w:t>
       </w:r>
       <w:r>
         <w:rPr>
@@ -9104,9 +8913,17 @@
       </w:r>
     </w:p>
     <w:p>
-      <w:pPr/>
-      <w:r>
-        <w:t xml:space="preserve">j) Thêm NV =&gt; </w:t>
+      <w:pPr>
+        <w:pStyle w:val="ListBullet"/>
+      </w:pPr>
+      <w:r>
+        <w:rPr>
+          <w:b/>
+        </w:rPr>
+        <w:t>j) Thêm NV</w:t>
+      </w:r>
+      <w:r>
+        <w:t xml:space="preserve"> =&gt; </w:t>
       </w:r>
       <w:r>
         <w:rPr>
@@ -9179,9 +8996,17 @@
       </w:r>
     </w:p>
     <w:p>
-      <w:pPr/>
-      <w:r>
-        <w:t xml:space="preserve">k) Sửa NV =&gt; </w:t>
+      <w:pPr>
+        <w:pStyle w:val="ListBullet"/>
+      </w:pPr>
+      <w:r>
+        <w:rPr>
+          <w:b/>
+        </w:rPr>
+        <w:t>k) Sửa NV</w:t>
+      </w:r>
+      <w:r>
+        <w:t xml:space="preserve"> =&gt; </w:t>
       </w:r>
       <w:r>
         <w:rPr>
@@ -9190,9 +9015,6 @@
         </w:rPr>
         <w:t>updateStaff()</w:t>
       </w:r>
-      <w:r>
-        <w:t>`</w:t>
-      </w:r>
     </w:p>
     <w:p>
       <w:pPr>
@@ -9230,7 +9052,7 @@
         <w:t>updateStaff()</w:t>
       </w:r>
       <w:r>
-        <w:t>` → chọn</w:t>
+        <w:t xml:space="preserve"> → chọn</w:t>
       </w:r>
     </w:p>
     <w:p>
@@ -9250,19 +9072,24 @@
           <w:rFonts w:ascii="Courier New" w:hAnsi="Courier New"/>
           <w:sz w:val="20"/>
         </w:rPr>
-        <w:t>updateStaff()</w:t>
-      </w:r>
-      <w:r>
-        <w:t>: boolean</w:t>
-      </w:r>
-      <w:r>
-        <w:t>` → chọn</w:t>
+        <w:t>updateStaff(): boolean</w:t>
+      </w:r>
+      <w:r>
+        <w:t xml:space="preserve"> → chọn</w:t>
       </w:r>
     </w:p>
     <w:p>
-      <w:pPr/>
-      <w:r>
-        <w:t xml:space="preserve">l) Xóa NV =&gt; </w:t>
+      <w:pPr>
+        <w:pStyle w:val="ListBullet"/>
+      </w:pPr>
+      <w:r>
+        <w:rPr>
+          <w:b/>
+        </w:rPr>
+        <w:t>l) Xóa NV</w:t>
+      </w:r>
+      <w:r>
+        <w:t xml:space="preserve"> =&gt; </w:t>
       </w:r>
       <w:r>
         <w:rPr>
@@ -9271,9 +9098,6 @@
         </w:rPr>
         <w:t>deleteStaff()</w:t>
       </w:r>
-      <w:r>
-        <w:t>`</w:t>
-      </w:r>
     </w:p>
     <w:p>
       <w:pPr>
@@ -9311,7 +9135,7 @@
         <w:t>deleteStaff()</w:t>
       </w:r>
       <w:r>
-        <w:t>` → chọn</w:t>
+        <w:t xml:space="preserve"> → chọn</w:t>
       </w:r>
     </w:p>
     <w:p>
@@ -9331,13 +9155,10 @@
           <w:rFonts w:ascii="Courier New" w:hAnsi="Courier New"/>
           <w:sz w:val="20"/>
         </w:rPr>
-        <w:t>deleteStaff()</w:t>
-      </w:r>
-      <w:r>
-        <w:t>: boolean</w:t>
-      </w:r>
-      <w:r>
-        <w:t>` → chọn (cần biết thành công/thất bại)</w:t>
+        <w:t>deleteStaff(): boolean</w:t>
+      </w:r>
+      <w:r>
+        <w:t xml:space="preserve"> → chọn (cần biết thành công/thất bại)</w:t>
       </w:r>
     </w:p>
     <w:p>
@@ -9395,10 +9216,10 @@
     </w:p>
     <w:p>
       <w:pPr>
-        <w:pStyle w:val="Heading3"/>
+        <w:pStyle w:val="Heading2"/>
       </w:pPr>
       <w:r>
-        <w:t>Đăng nhập</w:t>
+        <w:t>5.1. Đăng nhập</w:t>
       </w:r>
     </w:p>
     <w:p>
@@ -9684,177 +9505,11 @@
       </w:r>
     </w:p>
     <w:p>
-      <w:pPr/>
-      <w:r>
-        <w:rPr>
-          <w:b/>
-        </w:rPr>
-        <w:t>Ngoại lệ: tài khoản không tồn tại</w:t>
-      </w:r>
-    </w:p>
-    <w:p>
       <w:pPr>
-        <w:pStyle w:val="ListBullet"/>
+        <w:pStyle w:val="Heading2"/>
       </w:pPr>
       <w:r>
-        <w:t xml:space="preserve">Phương thức </w:t>
-      </w:r>
-      <w:r>
-        <w:rPr>
-          <w:rFonts w:ascii="Courier New" w:hAnsi="Courier New"/>
-          <w:sz w:val="20"/>
-        </w:rPr>
-        <w:t>findBySDT()</w:t>
-      </w:r>
-      <w:r>
-        <w:rPr>
-          <w:rFonts w:ascii="Courier New" w:hAnsi="Courier New"/>
-          <w:sz w:val="20"/>
-        </w:rPr>
-        <w:t xml:space="preserve"> trả về </w:t>
-      </w:r>
-      <w:r>
-        <w:t>null</w:t>
-      </w:r>
-      <w:r>
-        <w:t>`.</w:t>
-      </w:r>
-    </w:p>
-    <w:p>
-      <w:pPr>
-        <w:pStyle w:val="ListBullet"/>
-      </w:pPr>
-      <w:r>
-        <w:t xml:space="preserve">Phương thức </w:t>
-      </w:r>
-      <w:r>
-        <w:rPr>
-          <w:rFonts w:ascii="Courier New" w:hAnsi="Courier New"/>
-          <w:sz w:val="20"/>
-        </w:rPr>
-        <w:t>checkLogin()</w:t>
-      </w:r>
-      <w:r>
-        <w:rPr>
-          <w:rFonts w:ascii="Courier New" w:hAnsi="Courier New"/>
-          <w:sz w:val="20"/>
-        </w:rPr>
-        <w:t xml:space="preserve"> trả về </w:t>
-      </w:r>
-      <w:r>
-        <w:t>false</w:t>
-      </w:r>
-      <w:r>
-        <w:rPr>
-          <w:rFonts w:ascii="Courier New" w:hAnsi="Courier New"/>
-          <w:sz w:val="20"/>
-        </w:rPr>
-        <w:t xml:space="preserve"> cho </w:t>
-      </w:r>
-      <w:r>
-        <w:t>btnLoginClick()</w:t>
-      </w:r>
-      <w:r>
-        <w:t>`.</w:t>
-      </w:r>
-    </w:p>
-    <w:p>
-      <w:pPr>
-        <w:pStyle w:val="ListBullet"/>
-      </w:pPr>
-      <w:r>
-        <w:t>Lớp LoginPage hiển thị showMessage("Tài khoản không tồn tại. Vui lòng kiểm tra lại.")</w:t>
-      </w:r>
-    </w:p>
-    <w:p>
-      <w:pPr/>
-      <w:r>
-        <w:rPr>
-          <w:b/>
-        </w:rPr>
-        <w:t>Ngoại lệ: mật khẩu sai</w:t>
-      </w:r>
-    </w:p>
-    <w:p>
-      <w:pPr>
-        <w:pStyle w:val="ListBullet"/>
-      </w:pPr>
-      <w:r>
-        <w:t xml:space="preserve">Phương thức </w:t>
-      </w:r>
-      <w:r>
-        <w:rPr>
-          <w:rFonts w:ascii="Courier New" w:hAnsi="Courier New"/>
-          <w:sz w:val="20"/>
-        </w:rPr>
-        <w:t>checkPassword()</w:t>
-      </w:r>
-      <w:r>
-        <w:rPr>
-          <w:rFonts w:ascii="Courier New" w:hAnsi="Courier New"/>
-          <w:sz w:val="20"/>
-        </w:rPr>
-        <w:t xml:space="preserve"> trả về </w:t>
-      </w:r>
-      <w:r>
-        <w:t>false</w:t>
-      </w:r>
-      <w:r>
-        <w:t>`.</w:t>
-      </w:r>
-    </w:p>
-    <w:p>
-      <w:pPr>
-        <w:pStyle w:val="ListBullet"/>
-      </w:pPr>
-      <w:r>
-        <w:t xml:space="preserve">Phương thức </w:t>
-      </w:r>
-      <w:r>
-        <w:rPr>
-          <w:rFonts w:ascii="Courier New" w:hAnsi="Courier New"/>
-          <w:sz w:val="20"/>
-        </w:rPr>
-        <w:t>checkLogin()</w:t>
-      </w:r>
-      <w:r>
-        <w:rPr>
-          <w:rFonts w:ascii="Courier New" w:hAnsi="Courier New"/>
-          <w:sz w:val="20"/>
-        </w:rPr>
-        <w:t xml:space="preserve"> trả về </w:t>
-      </w:r>
-      <w:r>
-        <w:t>false</w:t>
-      </w:r>
-      <w:r>
-        <w:rPr>
-          <w:rFonts w:ascii="Courier New" w:hAnsi="Courier New"/>
-          <w:sz w:val="20"/>
-        </w:rPr>
-        <w:t xml:space="preserve"> cho </w:t>
-      </w:r>
-      <w:r>
-        <w:t>btnLoginClick()</w:t>
-      </w:r>
-      <w:r>
-        <w:t>`.</w:t>
-      </w:r>
-    </w:p>
-    <w:p>
-      <w:pPr>
-        <w:pStyle w:val="ListBullet"/>
-      </w:pPr>
-      <w:r>
-        <w:t>Lớp LoginPage hiển thị showMessage("Mật khẩu không chính xác. Còn [N] lần thử.")</w:t>
-      </w:r>
-    </w:p>
-    <w:p>
-      <w:pPr>
-        <w:pStyle w:val="Heading3"/>
-      </w:pPr>
-      <w:r>
-        <w:t>Đăng ký</w:t>
+        <w:t>5.2. Đăng ký</w:t>
       </w:r>
     </w:p>
     <w:p>
@@ -10374,167 +10029,11 @@
       </w:r>
     </w:p>
     <w:p>
-      <w:pPr/>
-      <w:r>
-        <w:rPr>
-          <w:b/>
-        </w:rPr>
-        <w:t>Ngoại lệ: SĐT đã tồn tại</w:t>
-      </w:r>
-    </w:p>
-    <w:p>
       <w:pPr>
-        <w:pStyle w:val="ListBullet"/>
+        <w:pStyle w:val="Heading2"/>
       </w:pPr>
       <w:r>
-        <w:t xml:space="preserve">Phương thức </w:t>
-      </w:r>
-      <w:r>
-        <w:rPr>
-          <w:rFonts w:ascii="Courier New" w:hAnsi="Courier New"/>
-          <w:sz w:val="20"/>
-        </w:rPr>
-        <w:t>existsBySDT()</w:t>
-      </w:r>
-      <w:r>
-        <w:rPr>
-          <w:rFonts w:ascii="Courier New" w:hAnsi="Courier New"/>
-          <w:sz w:val="20"/>
-        </w:rPr>
-        <w:t xml:space="preserve"> trả về </w:t>
-      </w:r>
-      <w:r>
-        <w:t>true</w:t>
-      </w:r>
-      <w:r>
-        <w:t>`.</w:t>
-      </w:r>
-    </w:p>
-    <w:p>
-      <w:pPr>
-        <w:pStyle w:val="ListBullet"/>
-      </w:pPr>
-      <w:r>
-        <w:t xml:space="preserve">Phương thức </w:t>
-      </w:r>
-      <w:r>
-        <w:rPr>
-          <w:rFonts w:ascii="Courier New" w:hAnsi="Courier New"/>
-          <w:sz w:val="20"/>
-        </w:rPr>
-        <w:t>register()</w:t>
-      </w:r>
-      <w:r>
-        <w:rPr>
-          <w:rFonts w:ascii="Courier New" w:hAnsi="Courier New"/>
-          <w:sz w:val="20"/>
-        </w:rPr>
-        <w:t xml:space="preserve"> trả về lỗi cho </w:t>
-      </w:r>
-      <w:r>
-        <w:t>btnTiepTucClick()</w:t>
-      </w:r>
-      <w:r>
-        <w:t>`.</w:t>
-      </w:r>
-    </w:p>
-    <w:p>
-      <w:pPr>
-        <w:pStyle w:val="ListBullet"/>
-      </w:pPr>
-      <w:r>
-        <w:t>Lớp RegisterPage hiển thị showMessage("SĐT này đã được sử dụng.")</w:t>
-      </w:r>
-    </w:p>
-    <w:p>
-      <w:pPr/>
-      <w:r>
-        <w:rPr>
-          <w:b/>
-        </w:rPr>
-        <w:t>Ngoại lệ: OTP sai</w:t>
-      </w:r>
-    </w:p>
-    <w:p>
-      <w:pPr>
-        <w:pStyle w:val="ListBullet"/>
-      </w:pPr>
-      <w:r>
-        <w:t xml:space="preserve">Phương thức </w:t>
-      </w:r>
-      <w:r>
-        <w:rPr>
-          <w:rFonts w:ascii="Courier New" w:hAnsi="Courier New"/>
-          <w:sz w:val="20"/>
-        </w:rPr>
-        <w:t>verify()</w:t>
-      </w:r>
-      <w:r>
-        <w:t xml:space="preserve"> trả về </w:t>
-      </w:r>
-      <w:r>
-        <w:rPr>
-          <w:rFonts w:ascii="Courier New" w:hAnsi="Courier New"/>
-          <w:sz w:val="20"/>
-        </w:rPr>
-        <w:t>false</w:t>
-      </w:r>
-      <w:r>
-        <w:t>.</w:t>
-      </w:r>
-    </w:p>
-    <w:p>
-      <w:pPr>
-        <w:pStyle w:val="ListBullet"/>
-      </w:pPr>
-      <w:r>
-        <w:t xml:space="preserve">Phương thức </w:t>
-      </w:r>
-      <w:r>
-        <w:rPr>
-          <w:rFonts w:ascii="Courier New" w:hAnsi="Courier New"/>
-          <w:sz w:val="20"/>
-        </w:rPr>
-        <w:t>verifyOTP()</w:t>
-      </w:r>
-      <w:r>
-        <w:rPr>
-          <w:rFonts w:ascii="Courier New" w:hAnsi="Courier New"/>
-          <w:sz w:val="20"/>
-        </w:rPr>
-        <w:t xml:space="preserve"> trả về </w:t>
-      </w:r>
-      <w:r>
-        <w:t>false</w:t>
-      </w:r>
-      <w:r>
-        <w:rPr>
-          <w:rFonts w:ascii="Courier New" w:hAnsi="Courier New"/>
-          <w:sz w:val="20"/>
-        </w:rPr>
-        <w:t xml:space="preserve"> cho </w:t>
-      </w:r>
-      <w:r>
-        <w:t>btnXacNhanClick()</w:t>
-      </w:r>
-      <w:r>
-        <w:t>`.</w:t>
-      </w:r>
-    </w:p>
-    <w:p>
-      <w:pPr>
-        <w:pStyle w:val="ListBullet"/>
-      </w:pPr>
-      <w:r>
-        <w:t>Lớp OTPVerifyPage hiển thị showMessage("Mã OTP không đúng. Vui lòng thử lại.")</w:t>
-      </w:r>
-    </w:p>
-    <w:p>
-      <w:pPr>
-        <w:pStyle w:val="Heading3"/>
-      </w:pPr>
-      <w:r>
-        <w:t>Đổi mật khẩu</w:t>
+        <w:t>5.3. Đổi mật khẩu</w:t>
       </w:r>
     </w:p>
     <w:p>
@@ -10926,157 +10425,11 @@
       </w:r>
     </w:p>
     <w:p>
-      <w:pPr/>
-      <w:r>
-        <w:rPr>
-          <w:b/>
-        </w:rPr>
-        <w:t>Ngoại lệ: MK hiện tại sai</w:t>
-      </w:r>
-    </w:p>
-    <w:p>
       <w:pPr>
-        <w:pStyle w:val="ListBullet"/>
+        <w:pStyle w:val="Heading2"/>
       </w:pPr>
       <w:r>
-        <w:t xml:space="preserve">Phương thức </w:t>
-      </w:r>
-      <w:r>
-        <w:rPr>
-          <w:rFonts w:ascii="Courier New" w:hAnsi="Courier New"/>
-          <w:sz w:val="20"/>
-        </w:rPr>
-        <w:t>checkPassword()</w:t>
-      </w:r>
-      <w:r>
-        <w:rPr>
-          <w:rFonts w:ascii="Courier New" w:hAnsi="Courier New"/>
-          <w:sz w:val="20"/>
-        </w:rPr>
-        <w:t xml:space="preserve"> trả về </w:t>
-      </w:r>
-      <w:r>
-        <w:t>false</w:t>
-      </w:r>
-      <w:r>
-        <w:t>`.</w:t>
-      </w:r>
-    </w:p>
-    <w:p>
-      <w:pPr>
-        <w:pStyle w:val="ListBullet"/>
-      </w:pPr>
-      <w:r>
-        <w:t xml:space="preserve">Phương thức </w:t>
-      </w:r>
-      <w:r>
-        <w:rPr>
-          <w:rFonts w:ascii="Courier New" w:hAnsi="Courier New"/>
-          <w:sz w:val="20"/>
-        </w:rPr>
-        <w:t>changePassword()</w:t>
-      </w:r>
-      <w:r>
-        <w:rPr>
-          <w:rFonts w:ascii="Courier New" w:hAnsi="Courier New"/>
-          <w:sz w:val="20"/>
-        </w:rPr>
-        <w:t xml:space="preserve"> trả về </w:t>
-      </w:r>
-      <w:r>
-        <w:t>false</w:t>
-      </w:r>
-      <w:r>
-        <w:rPr>
-          <w:rFonts w:ascii="Courier New" w:hAnsi="Courier New"/>
-          <w:sz w:val="20"/>
-        </w:rPr>
-        <w:t xml:space="preserve"> cho </w:t>
-      </w:r>
-      <w:r>
-        <w:t>btnLuuClick()</w:t>
-      </w:r>
-      <w:r>
-        <w:t>`.</w:t>
-      </w:r>
-    </w:p>
-    <w:p>
-      <w:pPr>
-        <w:pStyle w:val="ListBullet"/>
-      </w:pPr>
-      <w:r>
-        <w:t>Lớp ChangePasswordPage hiển thị showMessage("Mật khẩu hiện tại không chính xác.")</w:t>
-      </w:r>
-    </w:p>
-    <w:p>
-      <w:pPr/>
-      <w:r>
-        <w:rPr>
-          <w:b/>
-        </w:rPr>
-        <w:t>Ngoại lệ: MK mới trùng MK cũ</w:t>
-      </w:r>
-    </w:p>
-    <w:p>
-      <w:pPr>
-        <w:pStyle w:val="ListBullet"/>
-      </w:pPr>
-      <w:r>
-        <w:t xml:space="preserve">Phương thức </w:t>
-      </w:r>
-      <w:r>
-        <w:rPr>
-          <w:rFonts w:ascii="Courier New" w:hAnsi="Courier New"/>
-          <w:sz w:val="20"/>
-        </w:rPr>
-        <w:t>changePassword()</w:t>
-      </w:r>
-      <w:r>
-        <w:t>` kiểm tra MK mới trùng MK hiện tại.</w:t>
-      </w:r>
-    </w:p>
-    <w:p>
-      <w:pPr>
-        <w:pStyle w:val="ListBullet"/>
-      </w:pPr>
-      <w:r>
-        <w:t xml:space="preserve">Phương thức </w:t>
-      </w:r>
-      <w:r>
-        <w:rPr>
-          <w:rFonts w:ascii="Courier New" w:hAnsi="Courier New"/>
-          <w:sz w:val="20"/>
-        </w:rPr>
-        <w:t>changePassword()</w:t>
-      </w:r>
-      <w:r>
-        <w:rPr>
-          <w:rFonts w:ascii="Courier New" w:hAnsi="Courier New"/>
-          <w:sz w:val="20"/>
-        </w:rPr>
-        <w:t xml:space="preserve"> trả về lỗi cho </w:t>
-      </w:r>
-      <w:r>
-        <w:t>btnLuuClick()</w:t>
-      </w:r>
-      <w:r>
-        <w:t>`.</w:t>
-      </w:r>
-    </w:p>
-    <w:p>
-      <w:pPr>
-        <w:pStyle w:val="ListBullet"/>
-      </w:pPr>
-      <w:r>
-        <w:t>Lớp ChangePasswordPage hiển thị showMessage("Mật khẩu mới không được trùng mật khẩu hiện tại.")</w:t>
-      </w:r>
-    </w:p>
-    <w:p>
-      <w:pPr>
-        <w:pStyle w:val="Heading3"/>
-      </w:pPr>
-      <w:r>
-        <w:t>Quản lý TTCN</w:t>
+        <w:t>5.4. Quản lý TTCN</w:t>
       </w:r>
     </w:p>
     <w:p>
@@ -11494,84 +10847,11 @@
       </w:r>
     </w:p>
     <w:p>
-      <w:pPr/>
-      <w:r>
-        <w:rPr>
-          <w:b/>
-        </w:rPr>
-        <w:t>Ngoại lệ: Email đã được dùng</w:t>
-      </w:r>
-    </w:p>
-    <w:p>
       <w:pPr>
-        <w:pStyle w:val="ListBullet"/>
+        <w:pStyle w:val="Heading2"/>
       </w:pPr>
       <w:r>
-        <w:t xml:space="preserve">Phương thức </w:t>
-      </w:r>
-      <w:r>
-        <w:rPr>
-          <w:rFonts w:ascii="Courier New" w:hAnsi="Courier New"/>
-          <w:sz w:val="20"/>
-        </w:rPr>
-        <w:t>checkEmail()</w:t>
-      </w:r>
-      <w:r>
-        <w:rPr>
-          <w:rFonts w:ascii="Courier New" w:hAnsi="Courier New"/>
-          <w:sz w:val="20"/>
-        </w:rPr>
-        <w:t xml:space="preserve"> trả về </w:t>
-      </w:r>
-      <w:r>
-        <w:t>false</w:t>
-      </w:r>
-      <w:r>
-        <w:t>`.</w:t>
-      </w:r>
-    </w:p>
-    <w:p>
-      <w:pPr>
-        <w:pStyle w:val="ListBullet"/>
-      </w:pPr>
-      <w:r>
-        <w:t xml:space="preserve">Phương thức </w:t>
-      </w:r>
-      <w:r>
-        <w:rPr>
-          <w:rFonts w:ascii="Courier New" w:hAnsi="Courier New"/>
-          <w:sz w:val="20"/>
-        </w:rPr>
-        <w:t>updateProfile()</w:t>
-      </w:r>
-      <w:r>
-        <w:rPr>
-          <w:rFonts w:ascii="Courier New" w:hAnsi="Courier New"/>
-          <w:sz w:val="20"/>
-        </w:rPr>
-        <w:t xml:space="preserve"> trả về lỗi cho </w:t>
-      </w:r>
-      <w:r>
-        <w:t>btnChinhSuaClick()</w:t>
-      </w:r>
-      <w:r>
-        <w:t>`.</w:t>
-      </w:r>
-    </w:p>
-    <w:p>
-      <w:pPr>
-        <w:pStyle w:val="ListBullet"/>
-      </w:pPr>
-      <w:r>
-        <w:t>Lớp ProfilePage hiển thị showMessage("Email này đã được đăng ký bởi tài khoản khác.")</w:t>
-      </w:r>
-    </w:p>
-    <w:p>
-      <w:pPr>
-        <w:pStyle w:val="Heading3"/>
-      </w:pPr>
-      <w:r>
-        <w:t>Quản lý nhân viên</w:t>
+        <w:t>5.5. Quản lý nhân viên</w:t>
       </w:r>
     </w:p>
     <w:p>
@@ -12116,116 +11396,6 @@
       </w:r>
       <w:r>
         <w:t>, hiển thị showMessage("Xóa nhân viên thành công!")</w:t>
-      </w:r>
-    </w:p>
-    <w:p>
-      <w:pPr/>
-      <w:r>
-        <w:rPr>
-          <w:b/>
-        </w:rPr>
-        <w:t>Ngoại lệ: thêm nhân viên thất bại</w:t>
-      </w:r>
-    </w:p>
-    <w:p>
-      <w:pPr>
-        <w:pStyle w:val="ListBullet"/>
-      </w:pPr>
-      <w:r>
-        <w:t xml:space="preserve">Phương thức </w:t>
-      </w:r>
-      <w:r>
-        <w:rPr>
-          <w:rFonts w:ascii="Courier New" w:hAnsi="Courier New"/>
-          <w:sz w:val="20"/>
-        </w:rPr>
-        <w:t>saveStaff()</w:t>
-      </w:r>
-      <w:r>
-        <w:t xml:space="preserve"> trả về </w:t>
-      </w:r>
-      <w:r>
-        <w:rPr>
-          <w:rFonts w:ascii="Courier New" w:hAnsi="Courier New"/>
-          <w:sz w:val="20"/>
-        </w:rPr>
-        <w:t>false</w:t>
-      </w:r>
-      <w:r>
-        <w:t xml:space="preserve"> cho </w:t>
-      </w:r>
-      <w:r>
-        <w:rPr>
-          <w:rFonts w:ascii="Courier New" w:hAnsi="Courier New"/>
-          <w:sz w:val="20"/>
-        </w:rPr>
-        <w:t>btnThemClick()</w:t>
-      </w:r>
-      <w:r>
-        <w:t>.</w:t>
-      </w:r>
-    </w:p>
-    <w:p>
-      <w:pPr>
-        <w:pStyle w:val="ListBullet"/>
-      </w:pPr>
-      <w:r>
-        <w:t>Lớp StaffManagePage hiển thị showMessage("Thêm nhân viên thất bại.")</w:t>
-      </w:r>
-    </w:p>
-    <w:p>
-      <w:pPr/>
-      <w:r>
-        <w:rPr>
-          <w:b/>
-        </w:rPr>
-        <w:t>Ngoại lệ: nhân viên đang xử lý order</w:t>
-      </w:r>
-    </w:p>
-    <w:p>
-      <w:pPr>
-        <w:pStyle w:val="ListBullet"/>
-      </w:pPr>
-      <w:r>
-        <w:t xml:space="preserve">Phương thức </w:t>
-      </w:r>
-      <w:r>
-        <w:rPr>
-          <w:rFonts w:ascii="Courier New" w:hAnsi="Courier New"/>
-          <w:sz w:val="20"/>
-        </w:rPr>
-        <w:t>deleteStaff()</w:t>
-      </w:r>
-      <w:r>
-        <w:rPr>
-          <w:rFonts w:ascii="Courier New" w:hAnsi="Courier New"/>
-          <w:sz w:val="20"/>
-        </w:rPr>
-        <w:t xml:space="preserve"> trả về </w:t>
-      </w:r>
-      <w:r>
-        <w:t>false</w:t>
-      </w:r>
-      <w:r>
-        <w:rPr>
-          <w:rFonts w:ascii="Courier New" w:hAnsi="Courier New"/>
-          <w:sz w:val="20"/>
-        </w:rPr>
-        <w:t xml:space="preserve"> cho </w:t>
-      </w:r>
-      <w:r>
-        <w:t>btnXoaClick()</w:t>
-      </w:r>
-      <w:r>
-        <w:t>`.</w:t>
-      </w:r>
-    </w:p>
-    <w:p>
-      <w:pPr>
-        <w:pStyle w:val="ListBullet"/>
-      </w:pPr>
-      <w:r>
-        <w:t>Lớp StaffManagePage hiển thị showMessage("Nhân viên đang xử lý order, không thể xóa.")</w:t>
       </w:r>
     </w:p>
     <w:p/>

</xml_diff>

<commit_message>
feat: add business processes section 2.4 format with arrow notation
- Add section 6 'Quy trình nghiệp vụ từng chức năng' following skill format
- 11 business processes using → arrow notation:
  - Đăng nhập, Quên mật khẩu, Đăng ký, Đổi mật khẩu
  - Xem hồ sơ, Chỉnh sửa thông tin, Đổi SĐT
  - Xem danh sách NV, Thêm NV, Sửa NV, Xóa NV
- Renumber section 6→7 for UC detail diagrams
- Regenerate DOCX (633KB)
</commit_message>
<xml_diff>
--- a/output/account_module.docx
+++ b/output/account_module.docx
@@ -3033,7 +3033,147 @@
         <w:pStyle w:val="Heading2"/>
       </w:pPr>
       <w:r>
-        <w:t>6. Biểu đồ Use Case chi tiết</w:t>
+        <w:t>6. Quy trình nghiệp vụ từng chức năng</w:t>
+      </w:r>
+    </w:p>
+    <w:p>
+      <w:pPr/>
+      <w:r>
+        <w:t>Chức năng "Đăng nhập":</w:t>
+      </w:r>
+    </w:p>
+    <w:p>
+      <w:pPr/>
+      <w:r>
+        <w:t>Truy cập trang đăng nhập → Hiển thị form gồm ô SĐT/Email, ô Mật khẩu, nút [Đăng nhập] → Người dùng nhập SĐT và Mật khẩu → Nhấn [Đăng nhập] → Hệ thống kiểm tra định dạng đầu vào → Hệ thống truy vấn CSDL tìm tài khoản theo SĐT/Email → So sánh mật khẩu đã mã hóa → Xác thực thành công → Tạo session → Chuyển hướng đến trang chủ tương ứng vai trò</w:t>
+      </w:r>
+    </w:p>
+    <w:p>
+      <w:pPr/>
+      <w:r>
+        <w:t>Chức năng "Quên mật khẩu":</w:t>
+      </w:r>
+    </w:p>
+    <w:p>
+      <w:pPr/>
+      <w:r>
+        <w:t>Nhấn liên kết "Quên mật khẩu?" → Hiển thị form nhập SĐT → Người dùng nhập SĐT → Hệ thống kiểm tra SĐT tồn tại → Gửi OTP 6 chữ số đến SĐT → Hiển thị form xác nhận OTP → Người dùng nhập mã OTP → Hệ thống xác minh OTP đúng và còn hiệu lực → Hiển thị form nhập mật khẩu mới → Người dùng nhập mật khẩu mới → Hệ thống mã hóa và cập nhật → Thông báo "Đổi mật khẩu thành công" → Chuyển hướng về trang đăng nhập</w:t>
+      </w:r>
+    </w:p>
+    <w:p>
+      <w:pPr/>
+      <w:r>
+        <w:t>Chức năng "Đăng ký":</w:t>
+      </w:r>
+    </w:p>
+    <w:p>
+      <w:pPr/>
+      <w:r>
+        <w:t>Nhấn "Đăng ký" từ trang đăng nhập → Hiển thị form gồm Họ tên, SĐT, Email, Mật khẩu, Xác nhận MK → Người dùng nhập thông tin → Nhấn [Tiếp tục] → Hệ thống kiểm tra định dạng → Kiểm tra SĐT chưa tồn tại → Kiểm tra email chưa tồn tại → Gửi OTP 6 chữ số đến SĐT → Hiển thị form xác nhận OTP → Người dùng nhập mã OTP → Hệ thống xác minh OTP đúng và còn hiệu lực (≤ 5 phút) → Tạo tài khoản mới, hạng "Thường", điểm = 0 → Đăng nhập tự động → Thông báo "Đăng ký thành công!"</w:t>
+      </w:r>
+    </w:p>
+    <w:p>
+      <w:pPr/>
+      <w:r>
+        <w:t>Chức năng "Đổi mật khẩu":</w:t>
+      </w:r>
+    </w:p>
+    <w:p>
+      <w:pPr/>
+      <w:r>
+        <w:t>Truy cập mục "Bảo mật" trong cài đặt → Hiển thị form gồm MK hiện tại, MK mới, Xác nhận MK mới → Người dùng nhập thông tin → Nhấn [Lưu thay đổi] → Hệ thống xác minh MK hiện tại khớp CSDL → Kiểm tra MK mới: độ dài ≥ 8, có chữ hoa/thường/số/đặc biệt → Kiểm tra MK mới ≠ MK hiện tại → Mã hóa (bcrypt) và cập nhật → Thu hồi tất cả session khác → Thông báo "Đổi mật khẩu thành công. Vui lòng đăng nhập lại." → Chuyển hướng về trang đăng nhập</w:t>
+      </w:r>
+    </w:p>
+    <w:p>
+      <w:pPr/>
+      <w:r>
+        <w:t>Chức năng "Xem hồ sơ cá nhân":</w:t>
+      </w:r>
+    </w:p>
+    <w:p>
+      <w:pPr/>
+      <w:r>
+        <w:t>Nhấn vào ảnh đại diện / tên tài khoản → Hệ thống truy vấn CSDL lấy thông tin người dùng → Hiển thị "Hồ sơ cá nhân": Họ tên, SĐT, Email, Hạng hội viên, Điểm tích lũy, Ngày tham gia</w:t>
+      </w:r>
+    </w:p>
+    <w:p>
+      <w:pPr/>
+      <w:r>
+        <w:t>Chức năng "Chỉnh sửa thông tin cá nhân":</w:t>
+      </w:r>
+    </w:p>
+    <w:p>
+      <w:pPr/>
+      <w:r>
+        <w:t>Nhấn [Chỉnh sửa thông tin] → Chuyển sang chế độ chỉnh sửa: Họ tên, Email có thể nhập; SĐT bị khóa → Người dùng cập nhật thông tin → Nhấn [Lưu thay đổi] → Hệ thống kiểm tra email hợp lệ và chưa được dùng → Cập nhật vào CSDL → Thông báo "Cập nhật thành công!" → Quay về chế độ xem</w:t>
+      </w:r>
+    </w:p>
+    <w:p>
+      <w:pPr/>
+      <w:r>
+        <w:t>Chức năng "Đổi SĐT" (từ UC04):</w:t>
+      </w:r>
+    </w:p>
+    <w:p>
+      <w:pPr/>
+      <w:r>
+        <w:t>Nhấn "Thay đổi SĐT" → Hiển thị form nhập SĐT mới → Người dùng nhập SĐT mới → Hệ thống gửi OTP đến SĐT hiện tại → Người dùng nhập OTP → Hệ thống xác minh OTP → Gửi OTP mới đến SĐT mới → Người dùng nhập OTP mới → Hệ thống xác minh → Cập nhật SĐT trong CSDL</w:t>
+      </w:r>
+    </w:p>
+    <w:p>
+      <w:pPr/>
+      <w:r>
+        <w:t>Chức năng "Xem danh sách nhân viên":</w:t>
+      </w:r>
+    </w:p>
+    <w:p>
+      <w:pPr/>
+      <w:r>
+        <w:t>Truy cập "Quản lý nhân viên" → Hệ thống truy vấn CSDL lấy danh sách nhân viên → Hiển thị bảng danh sách: Họ tên, Vai trò, Trạng thái → Có ô tìm kiếm để lọc</w:t>
+      </w:r>
+    </w:p>
+    <w:p>
+      <w:pPr/>
+      <w:r>
+        <w:t>Chức năng "Thêm nhân viên":</w:t>
+      </w:r>
+    </w:p>
+    <w:p>
+      <w:pPr/>
+      <w:r>
+        <w:t>Nhấn [Thêm nhân viên] → Hiển thị form nhập Họ tên, Vai trò → Admin nhập thông tin → Nhấn [Lưu] → Hệ thống kiểm tra SĐT chưa tồn tại → Tạo tài khoản nhân viên trong CSDL → Thông báo "Thêm nhân viên thành công!" → Cập nhật bảng danh sách</w:t>
+      </w:r>
+    </w:p>
+    <w:p>
+      <w:pPr/>
+      <w:r>
+        <w:t>Chức năng "Sửa nhân viên":</w:t>
+      </w:r>
+    </w:p>
+    <w:p>
+      <w:pPr/>
+      <w:r>
+        <w:t>Nhấn [Sửa] trên một dòng nhân viên → Hiển thị form chỉnh sửa thông tin → Admin sửa thông tin → Nhấn [Lưu] → Hệ thống cập nhật vào CSDL → Thông báo "Cập nhật thành công!" → Cập nhật bảng danh sách</w:t>
+      </w:r>
+    </w:p>
+    <w:p>
+      <w:pPr/>
+      <w:r>
+        <w:t>Chức năng "Xóa nhân viên":</w:t>
+      </w:r>
+    </w:p>
+    <w:p>
+      <w:pPr/>
+      <w:r>
+        <w:t>Nhấn [Xóa] trên một dòng nhân viên → Hiển thị xác nhận "Bạn có chắc muốn xóa?" → Admin xác nhận → Hệ thống kiểm tra nhân viên không đang xử lý order → Chuyển trạng thái "Đã nghỉ" trong CSDL → Thông báo "Xóa nhân viên thành công!" → Cập nhật bảng danh sách</w:t>
+      </w:r>
+    </w:p>
+    <w:p>
+      <w:pPr>
+        <w:pStyle w:val="Heading2"/>
+      </w:pPr>
+      <w:r>
+        <w:t>7. Biểu đồ Use Case chi tiết</w:t>
       </w:r>
     </w:p>
     <w:p>

</xml_diff>

<commit_message>
fix: rewrite business processes with actor + action + system response format
- Focus on observable behavior: actor does X → system shows Y
- Remove deep business logic details
- Consistent pattern: Actor + hành vi → Hệ thống phản hồi → Actor thấy kết quả
</commit_message>
<xml_diff>
--- a/output/account_module.docx
+++ b/output/account_module.docx
@@ -3045,7 +3045,7 @@
     <w:p>
       <w:pPr/>
       <w:r>
-        <w:t>Truy cập trang đăng nhập → Hiển thị form gồm ô SĐT/Email, ô Mật khẩu, nút [Đăng nhập] → Người dùng nhập SĐT và Mật khẩu → Nhấn [Đăng nhập] → Hệ thống kiểm tra định dạng đầu vào → Hệ thống truy vấn CSDL tìm tài khoản theo SĐT/Email → So sánh mật khẩu đã mã hóa → Xác thực thành công → Tạo session → Chuyển hướng đến trang chủ tương ứng vai trò</w:t>
+        <w:t>Khách hàng truy cập trang /login → Hệ thống hiển thị form đăng nhập gồm ô SĐT/Email, ô Mật khẩu, nút [Đăng nhập] → Khách hàng nhập SĐT và mật khẩu, nhấn [Đăng nhập] → Hệ thống kiểm tra tài khoản tồn tại và mật khẩu khớp → Hệ thống tạo phiên đăng nhập, chuyển hướng đến trang chủ → Khách hàng thấy thông báo "Đăng nhập thành công"</w:t>
       </w:r>
     </w:p>
     <w:p>
@@ -3057,7 +3057,7 @@
     <w:p>
       <w:pPr/>
       <w:r>
-        <w:t>Nhấn liên kết "Quên mật khẩu?" → Hiển thị form nhập SĐT → Người dùng nhập SĐT → Hệ thống kiểm tra SĐT tồn tại → Gửi OTP 6 chữ số đến SĐT → Hiển thị form xác nhận OTP → Người dùng nhập mã OTP → Hệ thống xác minh OTP đúng và còn hiệu lực → Hiển thị form nhập mật khẩu mới → Người dùng nhập mật khẩu mới → Hệ thống mã hóa và cập nhật → Thông báo "Đổi mật khẩu thành công" → Chuyển hướng về trang đăng nhập</w:t>
+        <w:t>Khách hàng nhấn liên kết "Quên mật khẩu?" → Hệ thống hiển thị form nhập SĐT → Khách hàng nhập SĐT, nhấn [Gửi OTP] → Hệ thống gửi mã OTP 6 số đến SĐT, hiển thị form xác nhận OTP → Khách hàng nhập mã OTP, nhấn [Xác nhận] → Hệ thống xác minh OTP, hiển thị form nhập mật khẩu mới → Khách hàng nhập mật khẩu mới, nhấn [Lưu] → Hệ thống cập nhật mật khẩu, thông báo "Đổi mật khẩu thành công" → Khách hàng được chuyển về trang đăng nhập</w:t>
       </w:r>
     </w:p>
     <w:p>
@@ -3069,7 +3069,7 @@
     <w:p>
       <w:pPr/>
       <w:r>
-        <w:t>Nhấn "Đăng ký" từ trang đăng nhập → Hiển thị form gồm Họ tên, SĐT, Email, Mật khẩu, Xác nhận MK → Người dùng nhập thông tin → Nhấn [Tiếp tục] → Hệ thống kiểm tra định dạng → Kiểm tra SĐT chưa tồn tại → Kiểm tra email chưa tồn tại → Gửi OTP 6 chữ số đến SĐT → Hiển thị form xác nhận OTP → Người dùng nhập mã OTP → Hệ thống xác minh OTP đúng và còn hiệu lực (≤ 5 phút) → Tạo tài khoản mới, hạng "Thường", điểm = 0 → Đăng nhập tự động → Thông báo "Đăng ký thành công!"</w:t>
+        <w:t>Khách hàng nhấn "Đăng ký" từ trang đăng nhập → Hệ thống hiển thị form gồm Họ tên, SĐT, Email, Mật khẩu, Xác nhận MK → Khách hàng nhập đầy đủ thông tin, nhấn [Tiếp tục] → Hệ thống kiểm tra SĐT và email chưa tồn tại, gửi OTP đến SĐT → Hệ thống hiển thị form xác nhận OTP → Khách hàng nhập mã OTP, nhấn [Xác nhận] → Hệ thống tạo tài khoản hạng "Thường", tự động đăng nhập → Khách hàng thấy thông báo "Đăng ký thành công!"</w:t>
       </w:r>
     </w:p>
     <w:p>
@@ -3081,7 +3081,7 @@
     <w:p>
       <w:pPr/>
       <w:r>
-        <w:t>Truy cập mục "Bảo mật" trong cài đặt → Hiển thị form gồm MK hiện tại, MK mới, Xác nhận MK mới → Người dùng nhập thông tin → Nhấn [Lưu thay đổi] → Hệ thống xác minh MK hiện tại khớp CSDL → Kiểm tra MK mới: độ dài ≥ 8, có chữ hoa/thường/số/đặc biệt → Kiểm tra MK mới ≠ MK hiện tại → Mã hóa (bcrypt) và cập nhật → Thu hồi tất cả session khác → Thông báo "Đổi mật khẩu thành công. Vui lòng đăng nhập lại." → Chuyển hướng về trang đăng nhập</w:t>
+        <w:t>Người dùng truy cập mục "Bảo mật" → Hệ thống hiển thị form gồm MK hiện tại, MK mới, Xác nhận MK mới → Người dùng nhập đầy đủ, nhấn [Lưu thay đổi] → Hệ thống xác minh MK hiện tại đúng, kiểm tra MK mới hợp lệ → Hệ thống cập nhật mật khẩu, thu hồi các session khác → Người dùng thấy thông báo "Đổi mật khẩu thành công. Vui lòng đăng nhập lại." → Hệ thống chuyển về trang đăng nhập</w:t>
       </w:r>
     </w:p>
     <w:p>
@@ -3093,7 +3093,7 @@
     <w:p>
       <w:pPr/>
       <w:r>
-        <w:t>Nhấn vào ảnh đại diện / tên tài khoản → Hệ thống truy vấn CSDL lấy thông tin người dùng → Hiển thị "Hồ sơ cá nhân": Họ tên, SĐT, Email, Hạng hội viên, Điểm tích lũy, Ngày tham gia</w:t>
+        <w:t>Khách hàng nhấn vào ảnh đại diện / tên tài khoản → Hệ thống truy xuất thông tin, hiển thị trang hồ sơ gồm Họ tên, SĐT, Email, Hạng hội viên, Điểm tích lũy, Ngày tham gia → Khách hàng xem thông tin cá nhân</w:t>
       </w:r>
     </w:p>
     <w:p>
@@ -3105,19 +3105,19 @@
     <w:p>
       <w:pPr/>
       <w:r>
-        <w:t>Nhấn [Chỉnh sửa thông tin] → Chuyển sang chế độ chỉnh sửa: Họ tên, Email có thể nhập; SĐT bị khóa → Người dùng cập nhật thông tin → Nhấn [Lưu thay đổi] → Hệ thống kiểm tra email hợp lệ và chưa được dùng → Cập nhật vào CSDL → Thông báo "Cập nhật thành công!" → Quay về chế độ xem</w:t>
+        <w:t>Khách hàng nhấn [Chỉnh sửa thông tin] → Hệ thống chuyển sang chế độ chỉnh sửa, Họ tên và Email cho phép sửa, SĐT bị khóa → Khách hàng sửa thông tin, nhấn [Lưu] → Hệ thống kiểm tra email hợp lệ và chưa trùng → Hệ thống cập nhật hồ sơ → Khách hàng thấy thông báo "Cập nhật thành công!"</w:t>
       </w:r>
     </w:p>
     <w:p>
       <w:pPr/>
       <w:r>
-        <w:t>Chức năng "Đổi SĐT" (từ UC04):</w:t>
+        <w:t>Chức năng "Đổi SĐT":</w:t>
       </w:r>
     </w:p>
     <w:p>
       <w:pPr/>
       <w:r>
-        <w:t>Nhấn "Thay đổi SĐT" → Hiển thị form nhập SĐT mới → Người dùng nhập SĐT mới → Hệ thống gửi OTP đến SĐT hiện tại → Người dùng nhập OTP → Hệ thống xác minh OTP → Gửi OTP mới đến SĐT mới → Người dùng nhập OTP mới → Hệ thống xác minh → Cập nhật SĐT trong CSDL</w:t>
+        <w:t>Khách hàng nhấn "Thay đổi SĐT" → Hệ thống hiển thị form nhập SĐT mới → Khách hàng nhập SĐT mới → Hệ thống gửi OTP đến SĐT hiện tại → Khách hàng nhập OTP, nhấn [Xác nhận] → Hệ thống xác minh OTP, gửi OTP mới đến SĐT mới → Khách hàng nhập OTP mới → Hệ thống xác minh và cập nhật SĐT → Khách hàng thấy thông báo "Đổi SĐT thành công"</w:t>
       </w:r>
     </w:p>
     <w:p>
@@ -3129,7 +3129,7 @@
     <w:p>
       <w:pPr/>
       <w:r>
-        <w:t>Truy cập "Quản lý nhân viên" → Hệ thống truy vấn CSDL lấy danh sách nhân viên → Hiển thị bảng danh sách: Họ tên, Vai trò, Trạng thái → Có ô tìm kiếm để lọc</w:t>
+        <w:t>Admin truy cập trang "Quản lý nhân viên" → Hệ thống hiển thị bảng danh sách nhân viên gồm Họ tên, Vai trò, Trạng thái, kèm ô tìm kiếm → Admin xem danh sách, nhập từ khóa để lọc nếu cần</w:t>
       </w:r>
     </w:p>
     <w:p>
@@ -3141,7 +3141,7 @@
     <w:p>
       <w:pPr/>
       <w:r>
-        <w:t>Nhấn [Thêm nhân viên] → Hiển thị form nhập Họ tên, Vai trò → Admin nhập thông tin → Nhấn [Lưu] → Hệ thống kiểm tra SĐT chưa tồn tại → Tạo tài khoản nhân viên trong CSDL → Thông báo "Thêm nhân viên thành công!" → Cập nhật bảng danh sách</w:t>
+        <w:t>Admin nhấn [Thêm nhân viên] → Hệ thống hiển thị form nhập Họ tên, SĐT, Vai trò → Admin nhập thông tin, nhấn [Lưu] → Hệ thống kiểm tra SĐT chưa tồn tại, tạo tài khoản nhân viên → Admin thấy thông báo "Thêm nhân viên thành công!", bảng danh sách tự cập nhật</w:t>
       </w:r>
     </w:p>
     <w:p>
@@ -3153,7 +3153,7 @@
     <w:p>
       <w:pPr/>
       <w:r>
-        <w:t>Nhấn [Sửa] trên một dòng nhân viên → Hiển thị form chỉnh sửa thông tin → Admin sửa thông tin → Nhấn [Lưu] → Hệ thống cập nhật vào CSDL → Thông báo "Cập nhật thành công!" → Cập nhật bảng danh sách</w:t>
+        <w:t>Admin nhấn [Sửa] trên một dòng nhân viên → Hệ thống hiển thị form điền sẵn thông tin nhân viên → Admin sửa thông tin, nhấn [Lưu] → Hệ thống cập nhật vào CSDL → Admin thấy thông báo "Cập nhật thành công!", bảng danh sách tự cập nhật</w:t>
       </w:r>
     </w:p>
     <w:p>
@@ -3165,7 +3165,7 @@
     <w:p>
       <w:pPr/>
       <w:r>
-        <w:t>Nhấn [Xóa] trên một dòng nhân viên → Hiển thị xác nhận "Bạn có chắc muốn xóa?" → Admin xác nhận → Hệ thống kiểm tra nhân viên không đang xử lý order → Chuyển trạng thái "Đã nghỉ" trong CSDL → Thông báo "Xóa nhân viên thành công!" → Cập nhật bảng danh sách</w:t>
+        <w:t>Admin nhấn [Xóa] trên một dòng nhân viên → Hệ thống hiển thị hộp thoại xác nhận → Admin nhấn [Xác nhận] → Hệ thống kiểm tra nhân viên không đang xử lý order, chuyển trạng thái "Đã nghỉ" → Admin thấy thông báo "Xóa nhân viên thành công!", bảng danh sách tự cập nhật</w:t>
       </w:r>
     </w:p>
     <w:p>

</xml_diff>

<commit_message>
fix: simplify business processes to 5 main UCs, continuous flow
</commit_message>
<xml_diff>
--- a/output/account_module.docx
+++ b/output/account_module.docx
@@ -3045,127 +3045,55 @@
     <w:p>
       <w:pPr/>
       <w:r>
-        <w:t>Khách hàng truy cập trang /login → Hệ thống hiển thị form đăng nhập gồm ô SĐT/Email, ô Mật khẩu, nút [Đăng nhập] → Khách hàng nhập SĐT và mật khẩu, nhấn [Đăng nhập] → Hệ thống kiểm tra tài khoản tồn tại và mật khẩu khớp → Hệ thống tạo phiên đăng nhập, chuyển hướng đến trang chủ → Khách hàng thấy thông báo "Đăng nhập thành công"</w:t>
+        <w:t>Khách hàng truy cập trang /login → Hệ thống hiển thị form đăng nhập → Khách hàng nhập SĐT/Email và mật khẩu, nhấn [Đăng nhập] → Hệ thống kiểm tra tài khoản và mật khẩu → Hệ thống tạo phiên đăng nhập, chuyển hướng đến trang chủ → Khách hàng thấy thông báo "Đăng nhập thành công"</w:t>
       </w:r>
     </w:p>
     <w:p>
       <w:pPr/>
       <w:r>
-        <w:t>Chức năng "Quên mật khẩu":</w:t>
+        <w:t>Chức năng "Đăng ký":</w:t>
       </w:r>
     </w:p>
     <w:p>
       <w:pPr/>
       <w:r>
-        <w:t>Khách hàng nhấn liên kết "Quên mật khẩu?" → Hệ thống hiển thị form nhập SĐT → Khách hàng nhập SĐT, nhấn [Gửi OTP] → Hệ thống gửi mã OTP 6 số đến SĐT, hiển thị form xác nhận OTP → Khách hàng nhập mã OTP, nhấn [Xác nhận] → Hệ thống xác minh OTP, hiển thị form nhập mật khẩu mới → Khách hàng nhập mật khẩu mới, nhấn [Lưu] → Hệ thống cập nhật mật khẩu, thông báo "Đổi mật khẩu thành công" → Khách hàng được chuyển về trang đăng nhập</w:t>
+        <w:t>Khách hàng nhấn "Đăng ký" từ trang đăng nhập → Hệ thống hiển thị form đăng ký → Khách hàng nhập Họ tên, SĐT, Email, Mật khẩu, nhấn [Tiếp tục] → Hệ thống kiểm tra SĐT và email chưa tồn tại, gửi OTP đến SĐT → Hệ thống hiển thị form xác nhận OTP → Khách hàng nhập mã OTP, nhấn [Xác nhận] → Hệ thống tạo tài khoản hạng "Thường", tự động đăng nhập → Khách hàng thấy thông báo "Đăng ký thành công!"</w:t>
       </w:r>
     </w:p>
     <w:p>
       <w:pPr/>
       <w:r>
-        <w:t>Chức năng "Đăng ký":</w:t>
+        <w:t>Chức năng "Đổi mật khẩu":</w:t>
       </w:r>
     </w:p>
     <w:p>
       <w:pPr/>
       <w:r>
-        <w:t>Khách hàng nhấn "Đăng ký" từ trang đăng nhập → Hệ thống hiển thị form gồm Họ tên, SĐT, Email, Mật khẩu, Xác nhận MK → Khách hàng nhập đầy đủ thông tin, nhấn [Tiếp tục] → Hệ thống kiểm tra SĐT và email chưa tồn tại, gửi OTP đến SĐT → Hệ thống hiển thị form xác nhận OTP → Khách hàng nhập mã OTP, nhấn [Xác nhận] → Hệ thống tạo tài khoản hạng "Thường", tự động đăng nhập → Khách hàng thấy thông báo "Đăng ký thành công!"</w:t>
+        <w:t>Người dùng truy cập mục "Bảo mật" → Hệ thống hiển thị form đổi mật khẩu → Người dùng nhập MK hiện tại, MK mới, Xác nhận MK mới, nhấn [Lưu thay đổi] → Hệ thống xác minh MK hiện tại, kiểm tra MK mới hợp lệ → Hệ thống cập nhật mật khẩu, thu hồi các session khác → Người dùng thấy thông báo "Đổi mật khẩu thành công. Vui lòng đăng nhập lại." → Hệ thống chuyển về trang đăng nhập</w:t>
       </w:r>
     </w:p>
     <w:p>
       <w:pPr/>
       <w:r>
-        <w:t>Chức năng "Đổi mật khẩu":</w:t>
+        <w:t>Chức năng "Quản lý thông tin cá nhân":</w:t>
       </w:r>
     </w:p>
     <w:p>
       <w:pPr/>
       <w:r>
-        <w:t>Người dùng truy cập mục "Bảo mật" → Hệ thống hiển thị form gồm MK hiện tại, MK mới, Xác nhận MK mới → Người dùng nhập đầy đủ, nhấn [Lưu thay đổi] → Hệ thống xác minh MK hiện tại đúng, kiểm tra MK mới hợp lệ → Hệ thống cập nhật mật khẩu, thu hồi các session khác → Người dùng thấy thông báo "Đổi mật khẩu thành công. Vui lòng đăng nhập lại." → Hệ thống chuyển về trang đăng nhập</w:t>
+        <w:t>Khách hàng nhấn vào ảnh đại diện → Hệ thống hiển thị trang hồ sơ cá nhân → Khách hàng xem thông tin Họ tên, SĐT, Email, Hạng hội viên, Điểm tích lũy → Khách hàng nhấn [Chỉnh sửa thông tin], sửa Họ tên và Email, nhấn [Lưu] → Hệ thống kiểm tra email hợp lệ, cập nhật hồ sơ → Khách hàng thấy thông báo "Cập nhật thành công!"</w:t>
       </w:r>
     </w:p>
     <w:p>
       <w:pPr/>
       <w:r>
-        <w:t>Chức năng "Xem hồ sơ cá nhân":</w:t>
+        <w:t>Chức năng "Quản lý tài khoản nhân viên":</w:t>
       </w:r>
     </w:p>
     <w:p>
       <w:pPr/>
       <w:r>
-        <w:t>Khách hàng nhấn vào ảnh đại diện / tên tài khoản → Hệ thống truy xuất thông tin, hiển thị trang hồ sơ gồm Họ tên, SĐT, Email, Hạng hội viên, Điểm tích lũy, Ngày tham gia → Khách hàng xem thông tin cá nhân</w:t>
-      </w:r>
-    </w:p>
-    <w:p>
-      <w:pPr/>
-      <w:r>
-        <w:t>Chức năng "Chỉnh sửa thông tin cá nhân":</w:t>
-      </w:r>
-    </w:p>
-    <w:p>
-      <w:pPr/>
-      <w:r>
-        <w:t>Khách hàng nhấn [Chỉnh sửa thông tin] → Hệ thống chuyển sang chế độ chỉnh sửa, Họ tên và Email cho phép sửa, SĐT bị khóa → Khách hàng sửa thông tin, nhấn [Lưu] → Hệ thống kiểm tra email hợp lệ và chưa trùng → Hệ thống cập nhật hồ sơ → Khách hàng thấy thông báo "Cập nhật thành công!"</w:t>
-      </w:r>
-    </w:p>
-    <w:p>
-      <w:pPr/>
-      <w:r>
-        <w:t>Chức năng "Đổi SĐT":</w:t>
-      </w:r>
-    </w:p>
-    <w:p>
-      <w:pPr/>
-      <w:r>
-        <w:t>Khách hàng nhấn "Thay đổi SĐT" → Hệ thống hiển thị form nhập SĐT mới → Khách hàng nhập SĐT mới → Hệ thống gửi OTP đến SĐT hiện tại → Khách hàng nhập OTP, nhấn [Xác nhận] → Hệ thống xác minh OTP, gửi OTP mới đến SĐT mới → Khách hàng nhập OTP mới → Hệ thống xác minh và cập nhật SĐT → Khách hàng thấy thông báo "Đổi SĐT thành công"</w:t>
-      </w:r>
-    </w:p>
-    <w:p>
-      <w:pPr/>
-      <w:r>
-        <w:t>Chức năng "Xem danh sách nhân viên":</w:t>
-      </w:r>
-    </w:p>
-    <w:p>
-      <w:pPr/>
-      <w:r>
-        <w:t>Admin truy cập trang "Quản lý nhân viên" → Hệ thống hiển thị bảng danh sách nhân viên gồm Họ tên, Vai trò, Trạng thái, kèm ô tìm kiếm → Admin xem danh sách, nhập từ khóa để lọc nếu cần</w:t>
-      </w:r>
-    </w:p>
-    <w:p>
-      <w:pPr/>
-      <w:r>
-        <w:t>Chức năng "Thêm nhân viên":</w:t>
-      </w:r>
-    </w:p>
-    <w:p>
-      <w:pPr/>
-      <w:r>
-        <w:t>Admin nhấn [Thêm nhân viên] → Hệ thống hiển thị form nhập Họ tên, SĐT, Vai trò → Admin nhập thông tin, nhấn [Lưu] → Hệ thống kiểm tra SĐT chưa tồn tại, tạo tài khoản nhân viên → Admin thấy thông báo "Thêm nhân viên thành công!", bảng danh sách tự cập nhật</w:t>
-      </w:r>
-    </w:p>
-    <w:p>
-      <w:pPr/>
-      <w:r>
-        <w:t>Chức năng "Sửa nhân viên":</w:t>
-      </w:r>
-    </w:p>
-    <w:p>
-      <w:pPr/>
-      <w:r>
-        <w:t>Admin nhấn [Sửa] trên một dòng nhân viên → Hệ thống hiển thị form điền sẵn thông tin nhân viên → Admin sửa thông tin, nhấn [Lưu] → Hệ thống cập nhật vào CSDL → Admin thấy thông báo "Cập nhật thành công!", bảng danh sách tự cập nhật</w:t>
-      </w:r>
-    </w:p>
-    <w:p>
-      <w:pPr/>
-      <w:r>
-        <w:t>Chức năng "Xóa nhân viên":</w:t>
-      </w:r>
-    </w:p>
-    <w:p>
-      <w:pPr/>
-      <w:r>
-        <w:t>Admin nhấn [Xóa] trên một dòng nhân viên → Hệ thống hiển thị hộp thoại xác nhận → Admin nhấn [Xác nhận] → Hệ thống kiểm tra nhân viên không đang xử lý order, chuyển trạng thái "Đã nghỉ" → Admin thấy thông báo "Xóa nhân viên thành công!", bảng danh sách tự cập nhật</w:t>
+        <w:t>Admin truy cập trang "Quản lý nhân viên" → Hệ thống hiển thị bảng danh sách nhân viên → Admin nhấn [Thêm nhân viên], nhập Họ tên, SĐT, Vai trò, nhấn [Lưu] → Hệ thống tạo tài khoản nhân viên → Admin thấy thông báo "Thêm nhân viên thành công!" → Admin nhấn [Sửa] trên một dòng, sửa thông tin, nhấn [Lưu] → Hệ thống cập nhật, thông báo "Cập nhật thành công!" → Admin nhấn [Xóa] trên một dòng, xác nhận → Hệ thống chuyển trạng thái "Đã nghỉ" → Admin thấy thông báo "Xóa nhân viên thành công!"</w:t>
       </w:r>
     </w:p>
     <w:p>

</xml_diff>

<commit_message>
fix: simplify business processes to pure functional language, no UI details
</commit_message>
<xml_diff>
--- a/output/account_module.docx
+++ b/output/account_module.docx
@@ -3045,7 +3045,7 @@
     <w:p>
       <w:pPr/>
       <w:r>
-        <w:t>Khách hàng truy cập trang /login → Hệ thống hiển thị form đăng nhập → Khách hàng nhập SĐT/Email và mật khẩu, nhấn [Đăng nhập] → Hệ thống kiểm tra tài khoản và mật khẩu → Hệ thống tạo phiên đăng nhập, chuyển hướng đến trang chủ → Khách hàng thấy thông báo "Đăng nhập thành công"</w:t>
+        <w:t>Người dùng cung cấp SĐT/Email và mật khẩu → Hệ thống xác thực thông tin đăng nhập → Hệ thống tạo phiên đăng nhập và chuyển người dùng đến trang chủ tương ứng vai trò</w:t>
       </w:r>
     </w:p>
     <w:p>
@@ -3057,7 +3057,7 @@
     <w:p>
       <w:pPr/>
       <w:r>
-        <w:t>Khách hàng nhấn "Đăng ký" từ trang đăng nhập → Hệ thống hiển thị form đăng ký → Khách hàng nhập Họ tên, SĐT, Email, Mật khẩu, nhấn [Tiếp tục] → Hệ thống kiểm tra SĐT và email chưa tồn tại, gửi OTP đến SĐT → Hệ thống hiển thị form xác nhận OTP → Khách hàng nhập mã OTP, nhấn [Xác nhận] → Hệ thống tạo tài khoản hạng "Thường", tự động đăng nhập → Khách hàng thấy thông báo "Đăng ký thành công!"</w:t>
+        <w:t>Khách hàng cung cấp Họ tên, SĐT, Email, Mật khẩu → Hệ thống kiểm tra SĐT và email chưa tồn tại → Hệ thống gửi mã OTP đến SĐT để xác minh → Khách hàng cung cấp mã OTP → Hệ thống tạo tài khoản hạng "Thường" và tự động đăng nhập</w:t>
       </w:r>
     </w:p>
     <w:p>
@@ -3069,7 +3069,7 @@
     <w:p>
       <w:pPr/>
       <w:r>
-        <w:t>Người dùng truy cập mục "Bảo mật" → Hệ thống hiển thị form đổi mật khẩu → Người dùng nhập MK hiện tại, MK mới, Xác nhận MK mới, nhấn [Lưu thay đổi] → Hệ thống xác minh MK hiện tại, kiểm tra MK mới hợp lệ → Hệ thống cập nhật mật khẩu, thu hồi các session khác → Người dùng thấy thông báo "Đổi mật khẩu thành công. Vui lòng đăng nhập lại." → Hệ thống chuyển về trang đăng nhập</w:t>
+        <w:t>Người dùng cung cấp mật khẩu hiện tại và mật khẩu mới → Hệ thống xác minh mật khẩu hiện tại → Hệ thống kiểm tra mật khẩu mới hợp lệ → Hệ thống cập nhật mật khẩu và thu hồi tất cả phiên đăng nhập khác</w:t>
       </w:r>
     </w:p>
     <w:p>
@@ -3081,7 +3081,7 @@
     <w:p>
       <w:pPr/>
       <w:r>
-        <w:t>Khách hàng nhấn vào ảnh đại diện → Hệ thống hiển thị trang hồ sơ cá nhân → Khách hàng xem thông tin Họ tên, SĐT, Email, Hạng hội viên, Điểm tích lũy → Khách hàng nhấn [Chỉnh sửa thông tin], sửa Họ tên và Email, nhấn [Lưu] → Hệ thống kiểm tra email hợp lệ, cập nhật hồ sơ → Khách hàng thấy thông báo "Cập nhật thành công!"</w:t>
+        <w:t>Khách hàng xem thông tin hồ sơ cá nhân (Họ tên, SĐT, Email, Hạng hội viên, Điểm tích lũy) → Khách hàng cập nhật Họ tên và Email → Hệ thống kiểm tra email hợp lệ → Hệ thống cập nhật hồ sơ</w:t>
       </w:r>
     </w:p>
     <w:p>
@@ -3093,7 +3093,7 @@
     <w:p>
       <w:pPr/>
       <w:r>
-        <w:t>Admin truy cập trang "Quản lý nhân viên" → Hệ thống hiển thị bảng danh sách nhân viên → Admin nhấn [Thêm nhân viên], nhập Họ tên, SĐT, Vai trò, nhấn [Lưu] → Hệ thống tạo tài khoản nhân viên → Admin thấy thông báo "Thêm nhân viên thành công!" → Admin nhấn [Sửa] trên một dòng, sửa thông tin, nhấn [Lưu] → Hệ thống cập nhật, thông báo "Cập nhật thành công!" → Admin nhấn [Xóa] trên một dòng, xác nhận → Hệ thống chuyển trạng thái "Đã nghỉ" → Admin thấy thông báo "Xóa nhân viên thành công!"</w:t>
+        <w:t>Admin xem danh sách nhân viên → Admin thêm nhân viên mới (Họ tên, SĐT, Vai trò) → Hệ thống tạo tài khoản nhân viên → Admin sửa thông tin nhân viên → Hệ thống cập nhật → Admin xóa nhân viên → Hệ thống chuyển trạng thái "Đã nghỉ"</w:t>
       </w:r>
     </w:p>
     <w:p>

</xml_diff>

<commit_message>
feat: deep audit Pha I+II - fix sub-UCs, remove exceptions, update business processes
Pha I:
- UC02: Remove 'Nhập mã OTP' (merged into 'Xác nhận OTP')
- UC03: Add 'Xác minh mật khẩu cũ' (include), keep 'Nhập thông tin đổi mật khẩu' (include)
- UC04: Remove 'Xem hạng hội viên' (not a separate UC)
- Update UC overview diagram + 5 UC detail diagrams
- Rewrite business processes with more detail (Actor + action → System response)

Pha II:
- Remove all real data from scenarios (SĐT, tên, etc.)
- Remove all exception sections from scenarios
- Standardize Actor/System phrasing in kịch bản chính

Regenerate DOCX (632KB)
</commit_message>
<xml_diff>
--- a/output/account_module.docx
+++ b/output/account_module.docx
@@ -808,7 +808,7 @@
               <w:rPr>
                 <w:sz w:val="20"/>
               </w:rPr>
-              <w:t>Xác thực thông tin</w:t>
+              <w:t>Xác thực tài khoản</w:t>
             </w:r>
           </w:p>
         </w:tc>
@@ -932,7 +932,7 @@
               <w:rPr>
                 <w:sz w:val="20"/>
               </w:rPr>
-              <w:t>Điền thông tin</w:t>
+              <w:t>Điền thông tin đăng ký</w:t>
             </w:r>
           </w:p>
         </w:tc>
@@ -1103,7 +1103,7 @@
               <w:rPr>
                 <w:sz w:val="20"/>
               </w:rPr>
-              <w:t>UC04 – Quản lý TTCN</w:t>
+              <w:t>UC03 – Đổi mật khẩu</w:t>
             </w:r>
           </w:p>
         </w:tc>
@@ -1118,7 +1118,7 @@
               <w:rPr>
                 <w:sz w:val="20"/>
               </w:rPr>
-              <w:t>Xem hồ sơ cá nhân</w:t>
+              <w:t>Nhập thông tin đổi mật khẩu</w:t>
             </w:r>
           </w:p>
         </w:tc>
@@ -1148,7 +1148,7 @@
               <w:rPr>
                 <w:sz w:val="20"/>
               </w:rPr>
-              <w:t>Bắt buộc – hiển thị hồ sơ khi vào trang</w:t>
+              <w:t>Bắt buộc – phải nhập MK mới và xác nhận</w:t>
             </w:r>
           </w:p>
         </w:tc>
@@ -1180,7 +1180,7 @@
               <w:rPr>
                 <w:sz w:val="20"/>
               </w:rPr>
-              <w:t>Chỉnh sửa thông tin</w:t>
+              <w:t>Xem hồ sơ cá nhân</w:t>
             </w:r>
           </w:p>
         </w:tc>
@@ -1195,7 +1195,7 @@
               <w:rPr>
                 <w:sz w:val="20"/>
               </w:rPr>
-              <w:t>extend</w:t>
+              <w:t>include</w:t>
             </w:r>
           </w:p>
         </w:tc>
@@ -1210,7 +1210,7 @@
               <w:rPr>
                 <w:sz w:val="20"/>
               </w:rPr>
-              <w:t>Chỉ khi người dùng chọn chỉnh sửa</w:t>
+              <w:t>Bắt buộc – hiển thị hồ sơ khi vào trang</w:t>
             </w:r>
           </w:p>
         </w:tc>
@@ -1242,7 +1242,7 @@
               <w:rPr>
                 <w:sz w:val="20"/>
               </w:rPr>
-              <w:t>Xem hạng hội viên</w:t>
+              <w:t>Chỉnh sửa thông tin</w:t>
             </w:r>
           </w:p>
         </w:tc>
@@ -1272,7 +1272,7 @@
               <w:rPr>
                 <w:sz w:val="20"/>
               </w:rPr>
-              <w:t>Khi người dùng nhấn vào khu vực thẻ hội viên</w:t>
+              <w:t>Chỉ khi người dùng chọn chỉnh sửa</w:t>
             </w:r>
           </w:p>
         </w:tc>
@@ -1366,7 +1366,7 @@
               <w:rPr>
                 <w:sz w:val="20"/>
               </w:rPr>
-              <w:t>Thêm/sửa/xóa nhân viên</w:t>
+              <w:t>Thêm nhân viên</w:t>
             </w:r>
           </w:p>
         </w:tc>
@@ -1396,7 +1396,131 @@
               <w:rPr>
                 <w:sz w:val="20"/>
               </w:rPr>
-              <w:t>Chỉ khi quản lý chọn thao tác</w:t>
+              <w:t>Chỉ khi quản lý chọn thêm</w:t>
+            </w:r>
+          </w:p>
+        </w:tc>
+      </w:tr>
+      <w:tr>
+        <w:tc>
+          <w:tcPr>
+            <w:tcW w:type="dxa" w:w="2160"/>
+          </w:tcPr>
+          <w:p>
+            <w:pPr/>
+            <w:r/>
+            <w:r>
+              <w:rPr>
+                <w:sz w:val="20"/>
+              </w:rPr>
+              <w:t>UC20 – Quản lý NV</w:t>
+            </w:r>
+          </w:p>
+        </w:tc>
+        <w:tc>
+          <w:tcPr>
+            <w:tcW w:type="dxa" w:w="2160"/>
+          </w:tcPr>
+          <w:p>
+            <w:pPr/>
+            <w:r/>
+            <w:r>
+              <w:rPr>
+                <w:sz w:val="20"/>
+              </w:rPr>
+              <w:t>Sửa nhân viên</w:t>
+            </w:r>
+          </w:p>
+        </w:tc>
+        <w:tc>
+          <w:tcPr>
+            <w:tcW w:type="dxa" w:w="2160"/>
+          </w:tcPr>
+          <w:p>
+            <w:pPr/>
+            <w:r/>
+            <w:r>
+              <w:rPr>
+                <w:sz w:val="20"/>
+              </w:rPr>
+              <w:t>extend</w:t>
+            </w:r>
+          </w:p>
+        </w:tc>
+        <w:tc>
+          <w:tcPr>
+            <w:tcW w:type="dxa" w:w="2160"/>
+          </w:tcPr>
+          <w:p>
+            <w:pPr/>
+            <w:r/>
+            <w:r>
+              <w:rPr>
+                <w:sz w:val="20"/>
+              </w:rPr>
+              <w:t>Chỉ khi quản lý chọn sửa</w:t>
+            </w:r>
+          </w:p>
+        </w:tc>
+      </w:tr>
+      <w:tr>
+        <w:tc>
+          <w:tcPr>
+            <w:tcW w:type="dxa" w:w="2160"/>
+          </w:tcPr>
+          <w:p>
+            <w:pPr/>
+            <w:r/>
+            <w:r>
+              <w:rPr>
+                <w:sz w:val="20"/>
+              </w:rPr>
+              <w:t>UC20 – Quản lý NV</w:t>
+            </w:r>
+          </w:p>
+        </w:tc>
+        <w:tc>
+          <w:tcPr>
+            <w:tcW w:type="dxa" w:w="2160"/>
+          </w:tcPr>
+          <w:p>
+            <w:pPr/>
+            <w:r/>
+            <w:r>
+              <w:rPr>
+                <w:sz w:val="20"/>
+              </w:rPr>
+              <w:t>Xóa nhân viên</w:t>
+            </w:r>
+          </w:p>
+        </w:tc>
+        <w:tc>
+          <w:tcPr>
+            <w:tcW w:type="dxa" w:w="2160"/>
+          </w:tcPr>
+          <w:p>
+            <w:pPr/>
+            <w:r/>
+            <w:r>
+              <w:rPr>
+                <w:sz w:val="20"/>
+              </w:rPr>
+              <w:t>extend</w:t>
+            </w:r>
+          </w:p>
+        </w:tc>
+        <w:tc>
+          <w:tcPr>
+            <w:tcW w:type="dxa" w:w="2160"/>
+          </w:tcPr>
+          <w:p>
+            <w:pPr/>
+            <w:r/>
+            <w:r>
+              <w:rPr>
+                <w:sz w:val="20"/>
+              </w:rPr>
+              <w:t>Chỉ khi quản lý chọn xóa</w:t>
             </w:r>
           </w:p>
         </w:tc>
@@ -1853,7 +1977,7 @@
               <w:rPr>
                 <w:sz w:val="20"/>
               </w:rPr>
-              <w:t>Form đăng nhập → Nhập thông tin đăng nhập; Xác thực tài khoản</w:t>
+              <w:t>Form đăng nhập → Nhập thông tin đăng nhập; Xác thực tài khoản; Quên mật khẩu</w:t>
             </w:r>
           </w:p>
         </w:tc>
@@ -1885,7 +2009,7 @@
               <w:rPr>
                 <w:sz w:val="20"/>
               </w:rPr>
-              <w:t>Form đăng ký → Điền thông tin đăng ký; Nhập mã OTP; Xác nhận OTP</w:t>
+              <w:t>Form đăng ký → Điền thông tin đăng ký; Xác nhận OTP</w:t>
             </w:r>
           </w:p>
         </w:tc>
@@ -1917,7 +2041,7 @@
               <w:rPr>
                 <w:sz w:val="20"/>
               </w:rPr>
-              <w:t>Form đổi MK → Nhập thông tin đổi MK</w:t>
+              <w:t>Form đổi MK → Xác minh mật khẩu cũ; Nhập thông tin đổi mật khẩu</w:t>
             </w:r>
           </w:p>
         </w:tc>
@@ -1949,7 +2073,7 @@
               <w:rPr>
                 <w:sz w:val="20"/>
               </w:rPr>
-              <w:t>Trang hồ sơ → Xem hồ sơ; Chỉnh sửa thông tin; Xem hạng hội viên</w:t>
+              <w:t>Trang hồ sơ → Xem hồ sơ cá nhân; Chỉnh sửa thông tin</w:t>
             </w:r>
           </w:p>
         </w:tc>
@@ -2352,7 +2476,7 @@
               <w:rPr>
                 <w:sz w:val="20"/>
               </w:rPr>
-              <w:t>Nhập mã OTP</w:t>
+              <w:t>Xác nhận OTP</w:t>
             </w:r>
           </w:p>
         </w:tc>
@@ -2382,7 +2506,7 @@
               <w:rPr>
                 <w:sz w:val="20"/>
               </w:rPr>
-              <w:t>Bắt buộc – hệ thống luôn gửi OTP</w:t>
+              <w:t>Bắt buộc – phải xác minh SĐT</w:t>
             </w:r>
           </w:p>
         </w:tc>
@@ -2399,7 +2523,7 @@
               <w:rPr>
                 <w:sz w:val="20"/>
               </w:rPr>
-              <w:t>UC02</w:t>
+              <w:t>UC03</w:t>
             </w:r>
           </w:p>
         </w:tc>
@@ -2414,7 +2538,7 @@
               <w:rPr>
                 <w:sz w:val="20"/>
               </w:rPr>
-              <w:t>Xác nhận OTP</w:t>
+              <w:t>Xác minh mật khẩu cũ</w:t>
             </w:r>
           </w:p>
         </w:tc>
@@ -2444,7 +2568,7 @@
               <w:rPr>
                 <w:sz w:val="20"/>
               </w:rPr>
-              <w:t>Bắt buộc – phải xác minh SĐT</w:t>
+              <w:t>Bắt buộc – phải verify MK cũ trước khi đổi</w:t>
             </w:r>
           </w:p>
         </w:tc>
@@ -2476,7 +2600,7 @@
               <w:rPr>
                 <w:sz w:val="20"/>
               </w:rPr>
-              <w:t>Nhập thông tin đổi MK</w:t>
+              <w:t>Nhập thông tin đổi mật khẩu</w:t>
             </w:r>
           </w:p>
         </w:tc>
@@ -2506,7 +2630,7 @@
               <w:rPr>
                 <w:sz w:val="20"/>
               </w:rPr>
-              <w:t>Bắt buộc – phải nhập MK cũ + MK mới</w:t>
+              <w:t>Bắt buộc – phải nhập MK mới + xác nhận</w:t>
             </w:r>
           </w:p>
         </w:tc>
@@ -2538,7 +2662,7 @@
               <w:rPr>
                 <w:sz w:val="20"/>
               </w:rPr>
-              <w:t>Xem hồ sơ</w:t>
+              <w:t>Xem hồ sơ cá nhân</w:t>
             </w:r>
           </w:p>
         </w:tc>
@@ -2631,68 +2755,6 @@
                 <w:sz w:val="20"/>
               </w:rPr>
               <w:t>Chỉ khi chọn chỉnh sửa</w:t>
-            </w:r>
-          </w:p>
-        </w:tc>
-      </w:tr>
-      <w:tr>
-        <w:tc>
-          <w:tcPr>
-            <w:tcW w:type="dxa" w:w="2160"/>
-          </w:tcPr>
-          <w:p>
-            <w:pPr/>
-            <w:r/>
-            <w:r>
-              <w:rPr>
-                <w:sz w:val="20"/>
-              </w:rPr>
-              <w:t>UC04</w:t>
-            </w:r>
-          </w:p>
-        </w:tc>
-        <w:tc>
-          <w:tcPr>
-            <w:tcW w:type="dxa" w:w="2160"/>
-          </w:tcPr>
-          <w:p>
-            <w:pPr/>
-            <w:r/>
-            <w:r>
-              <w:rPr>
-                <w:sz w:val="20"/>
-              </w:rPr>
-              <w:t>Xem hạng hội viên</w:t>
-            </w:r>
-          </w:p>
-        </w:tc>
-        <w:tc>
-          <w:tcPr>
-            <w:tcW w:type="dxa" w:w="2160"/>
-          </w:tcPr>
-          <w:p>
-            <w:pPr/>
-            <w:r/>
-            <w:r>
-              <w:rPr>
-                <w:sz w:val="20"/>
-              </w:rPr>
-              <w:t>extend</w:t>
-            </w:r>
-          </w:p>
-        </w:tc>
-        <w:tc>
-          <w:tcPr>
-            <w:tcW w:type="dxa" w:w="2160"/>
-          </w:tcPr>
-          <w:p>
-            <w:pPr/>
-            <w:r/>
-            <w:r>
-              <w:rPr>
-                <w:sz w:val="20"/>
-              </w:rPr>
-              <w:t>Chỉ khi nhấn vào khu vực thẻ hội viên</w:t>
             </w:r>
           </w:p>
         </w:tc>
@@ -3045,55 +3107,67 @@
     <w:p>
       <w:pPr/>
       <w:r>
-        <w:t>Người dùng cung cấp SĐT/Email và mật khẩu → Hệ thống xác thực thông tin đăng nhập → Hệ thống tạo phiên đăng nhập và chuyển người dùng đến trang chủ tương ứng vai trò</w:t>
+        <w:t>Người dùng mở trang đăng nhập → Hệ thống hiển thị form nhập SĐT/Email và Mật khẩu → Người dùng nhập thông tin và nhấn Đăng nhập → Hệ thống kiểm tra tài khoản tồn tại trong CSDL → Hệ thống so sánh mật khẩu đã mã hóa → Hệ thống tạo phiên đăng nhập, chuyển người dùng đến trang chủ tương ứng vai trò</w:t>
       </w:r>
     </w:p>
     <w:p>
       <w:pPr/>
       <w:r>
-        <w:t>Chức năng "Đăng ký":</w:t>
+        <w:t>Chức năng "Quên mật khẩu":</w:t>
       </w:r>
     </w:p>
     <w:p>
       <w:pPr/>
       <w:r>
-        <w:t>Khách hàng cung cấp Họ tên, SĐT, Email, Mật khẩu → Hệ thống kiểm tra SĐT và email chưa tồn tại → Hệ thống gửi mã OTP đến SĐT để xác minh → Khách hàng cung cấp mã OTP → Hệ thống tạo tài khoản hạng "Thường" và tự động đăng nhập</w:t>
+        <w:t>Người dùng nhấn liên kết "Quên mật khẩu?" → Hệ thống hiển thị form nhập SĐT → Người dùng nhập SĐT → Hệ thống kiểm tra SĐT tồn tại → Hệ thống gửi mã OTP 6 chữ số đến SĐT → Người dùng nhập mã OTP → Hệ thống xác minh OTP đúng và còn hiệu lực → Hệ thống hiển thị form nhập mật khẩu mới → Người dùng nhập mật khẩu mới → Hệ thống mã hóa và cập nhật mật khẩu → Hệ thống thông báo đổi mật khẩu thành công</w:t>
       </w:r>
     </w:p>
     <w:p>
       <w:pPr/>
       <w:r>
-        <w:t>Chức năng "Đổi mật khẩu":</w:t>
+        <w:t>Chức năng "Đăng ký":</w:t>
       </w:r>
     </w:p>
     <w:p>
       <w:pPr/>
       <w:r>
-        <w:t>Người dùng cung cấp mật khẩu hiện tại và mật khẩu mới → Hệ thống xác minh mật khẩu hiện tại → Hệ thống kiểm tra mật khẩu mới hợp lệ → Hệ thống cập nhật mật khẩu và thu hồi tất cả phiên đăng nhập khác</w:t>
+        <w:t>Khách hàng mở trang đăng ký → Hệ thống hiển thị form nhập Họ tên, SĐT, Email, Mật khẩu, Xác nhận MK → Khách hàng nhập đầy đủ thông tin → Hệ thống kiểm tra SĐT và email chưa tồn tại trong CSDL → Hệ thống gửi mã OTP 6 chữ số đến SĐT → Khách hàng nhập mã OTP → Hệ thống xác minh OTP đúng và còn hiệu lực → Hệ thống tạo tài khoản mới hạng "Thường", điểm tích lũy = 0 → Hệ thống tự động đăng nhập cho khách hàng</w:t>
       </w:r>
     </w:p>
     <w:p>
       <w:pPr/>
       <w:r>
-        <w:t>Chức năng "Quản lý thông tin cá nhân":</w:t>
+        <w:t>Chức năng "Đổi mật khẩu":</w:t>
       </w:r>
     </w:p>
     <w:p>
       <w:pPr/>
       <w:r>
-        <w:t>Khách hàng xem thông tin hồ sơ cá nhân (Họ tên, SĐT, Email, Hạng hội viên, Điểm tích lũy) → Khách hàng cập nhật Họ tên và Email → Hệ thống kiểm tra email hợp lệ → Hệ thống cập nhật hồ sơ</w:t>
+        <w:t>Người dùng mở trang bảo mật → Hệ thống hiển thị form nhập Mật khẩu hiện tại, Mật khẩu mới, Xác nhận MK mới → Người dùng nhập đầy đủ thông tin → Hệ thống xác minh mật khẩu hiện tại khớp CSDL → Hệ thống kiểm tra mật khẩu mới hợp lệ (độ dài ≥ 8, có chữ hoa/thường/số/đặc biệt) → Hệ thống mã hóa mật khẩu mới và cập nhật → Hệ thống thu hồi tất cả phiên đăng nhập khác → Hệ thống thông báo đổi mật khẩu thành công</w:t>
       </w:r>
     </w:p>
     <w:p>
       <w:pPr/>
       <w:r>
-        <w:t>Chức năng "Quản lý tài khoản nhân viên":</w:t>
+        <w:t>Chức năng "Quản lý thông tin cá nhân":</w:t>
       </w:r>
     </w:p>
     <w:p>
       <w:pPr/>
       <w:r>
-        <w:t>Admin xem danh sách nhân viên → Admin thêm nhân viên mới (Họ tên, SĐT, Vai trò) → Hệ thống tạo tài khoản nhân viên → Admin sửa thông tin nhân viên → Hệ thống cập nhật → Admin xóa nhân viên → Hệ thống chuyển trạng thái "Đã nghỉ"</w:t>
+        <w:t>Khách hàng mở trang hồ sơ cá nhân → Hệ thống truy xuất thông tin từ CSDL và hiển thị: Họ tên, SĐT, Email, Hạng hội viên, Điểm tích lũy, Ngày tham gia → Khách hàng nhấn chỉnh sửa, cập nhật Họ tên và Email → Hệ thống kiểm tra email hợp lệ và chưa được dùng → Hệ thống cập nhật hồ sơ vào CSDL → Hệ thống thông báo cập nhật thành công</w:t>
+      </w:r>
+    </w:p>
+    <w:p>
+      <w:pPr/>
+      <w:r>
+        <w:t>Chức năng "Quản lý tài khoản nhân viên":</w:t>
+      </w:r>
+    </w:p>
+    <w:p>
+      <w:pPr/>
+      <w:r>
+        <w:t>Admin mở trang quản lý nhân viên → Hệ thống hiển thị danh sách nhân viên với Họ tên, Vai trò, Trạng thái → Admin nhấn thêm nhân viên, nhập Họ tên, SĐT, Vai trò → Hệ thống kiểm tra SĐT chưa tồn tại, tạo tài khoản nhân viên → Admin nhấn sửa trên một dòng nhân viên, cập nhật thông tin → Hệ thống lưu thay đổi vào CSDL → Admin nhấn xóa trên một dòng nhân viên → Hệ thống kiểm tra nhân viên không đang xử lý order → Hệ thống chuyển trạng thái "Đã nghỉ"</w:t>
       </w:r>
     </w:p>
     <w:p>
@@ -3556,7 +3630,7 @@
               <w:rPr>
                 <w:sz w:val="20"/>
               </w:rPr>
-              <w:t>3. Người dùng nhập thông tin: SĐT = "0912345678", Mật khẩu = "Abc@1234".</w:t>
+              <w:t>3. Người dùng nhập SĐT/Email và Mật khẩu.</w:t>
             </w:r>
             <w:r>
               <w:br/>
@@ -3583,7 +3657,7 @@
               <w:rPr>
                 <w:sz w:val="20"/>
               </w:rPr>
-              <w:t>6. Hệ thống truy vấn CSDL: tìm tài khoản, so sánh mật khẩu đã mã hóa.</w:t>
+              <w:t>6. Hệ thống truy vấn CSDL: tìm tài khoản theo SĐT/Email, so sánh mật khẩu đã mã hóa.</w:t>
             </w:r>
             <w:r>
               <w:br/>
@@ -3592,7 +3666,7 @@
               <w:rPr>
                 <w:sz w:val="20"/>
               </w:rPr>
-              <w:t>7. Xác thực thành công, tạo session với vai trò "Khách hàng".</w:t>
+              <w:t>7. Xác thực thành công, hệ thống tạo session với vai trò tương ứng.</w:t>
             </w:r>
             <w:r>
               <w:br/>
@@ -3601,48 +3675,7 @@
               <w:rPr>
                 <w:sz w:val="20"/>
               </w:rPr>
-              <w:t>8. Chuyển hướng đến trang chủ, hiển thị "Đăng nhập thành công. Xin chào, Nguyễn Văn A!".</w:t>
-            </w:r>
-          </w:p>
-        </w:tc>
-      </w:tr>
-      <w:tr>
-        <w:tc>
-          <w:tcPr>
-            <w:tcW w:type="dxa" w:w="2835"/>
-          </w:tcPr>
-          <w:p>
-            <w:pPr/>
-            <w:r/>
-            <w:r>
-              <w:rPr>
-                <w:sz w:val="20"/>
-              </w:rPr>
-              <w:t>Ngoại lệ</w:t>
-            </w:r>
-          </w:p>
-        </w:tc>
-        <w:tc>
-          <w:tcPr>
-            <w:tcW w:type="dxa" w:w="6803"/>
-          </w:tcPr>
-          <w:p>
-            <w:pPr/>
-            <w:r/>
-            <w:r>
-              <w:rPr>
-                <w:sz w:val="20"/>
-              </w:rPr>
-              <w:t>6.1. Tài khoản không tồn tại: Hiển thị "Tài khoản không tồn tại. Vui lòng kiểm tra lại."</w:t>
-            </w:r>
-            <w:r>
-              <w:br/>
-            </w:r>
-            <w:r>
-              <w:rPr>
-                <w:sz w:val="20"/>
-              </w:rPr>
-              <w:t>6.2. Mật khẩu không khớp: Hiển thị "Mật khẩu không chính xác. Còn [N] lần thử." Sau 5 lần sai → khóa 15 phút.</w:t>
+              <w:t>8. Hệ thống chuyển hướng đến trang chủ, hiển thị thông báo "Đăng nhập thành công".</w:t>
             </w:r>
           </w:p>
         </w:tc>
@@ -3844,7 +3877,7 @@
               <w:rPr>
                 <w:sz w:val="20"/>
               </w:rPr>
-              <w:t>3. Người dùng điền: Họ tên, SĐT, Email, Mật khẩu.</w:t>
+              <w:t>3. Người dùng nhập Họ tên, SĐT, Email, Mật khẩu.</w:t>
             </w:r>
             <w:r>
               <w:br/>
@@ -3862,7 +3895,7 @@
               <w:rPr>
                 <w:sz w:val="20"/>
               </w:rPr>
-              <w:t>5. Hệ thống kiểm tra định dạng, SĐT và email chưa tồn tại.</w:t>
+              <w:t>5. Hệ thống kiểm tra định dạng, SĐT và email chưa tồn tại trong CSDL.</w:t>
             </w:r>
             <w:r>
               <w:br/>
@@ -3880,7 +3913,7 @@
               <w:rPr>
                 <w:sz w:val="20"/>
               </w:rPr>
-              <w:t>7. Hiển thị màn hình "Xác nhận OTP".</w:t>
+              <w:t>7. Hệ thống hiển thị màn hình "Xác nhận OTP".</w:t>
             </w:r>
             <w:r>
               <w:br/>
@@ -3898,7 +3931,7 @@
               <w:rPr>
                 <w:sz w:val="20"/>
               </w:rPr>
-              <w:t>9. Hệ thống xác minh OTP đúng và còn hiệu lực (≤ 5 phút).</w:t>
+              <w:t>9. Hệ thống xác minh OTP đúng và còn hiệu lực.</w:t>
             </w:r>
             <w:r>
               <w:br/>
@@ -3907,7 +3940,7 @@
               <w:rPr>
                 <w:sz w:val="20"/>
               </w:rPr>
-              <w:t>10. Tạo tài khoản mới, hạng "Thường", điểm = 0.</w:t>
+              <w:t>10. Hệ thống tạo tài khoản mới, hạng "Thường", điểm tích lũy = 0.</w:t>
             </w:r>
             <w:r>
               <w:br/>
@@ -3916,66 +3949,7 @@
               <w:rPr>
                 <w:sz w:val="20"/>
               </w:rPr>
-              <w:t>11. Đăng nhập tự động, hiển thị "Đăng ký thành công! Chào mừng Nguyễn Thị Bình."</w:t>
-            </w:r>
-          </w:p>
-        </w:tc>
-      </w:tr>
-      <w:tr>
-        <w:tc>
-          <w:tcPr>
-            <w:tcW w:type="dxa" w:w="2835"/>
-          </w:tcPr>
-          <w:p>
-            <w:pPr/>
-            <w:r/>
-            <w:r>
-              <w:rPr>
-                <w:sz w:val="20"/>
-              </w:rPr>
-              <w:t>Ngoại lệ</w:t>
-            </w:r>
-          </w:p>
-        </w:tc>
-        <w:tc>
-          <w:tcPr>
-            <w:tcW w:type="dxa" w:w="6803"/>
-          </w:tcPr>
-          <w:p>
-            <w:pPr/>
-            <w:r/>
-            <w:r>
-              <w:rPr>
-                <w:sz w:val="20"/>
-              </w:rPr>
-              <w:t>5.1. SĐT đã tồn tại: "SĐT này đã được sử dụng."</w:t>
-            </w:r>
-            <w:r>
-              <w:br/>
-            </w:r>
-            <w:r>
-              <w:rPr>
-                <w:sz w:val="20"/>
-              </w:rPr>
-              <w:t>5.2. MK không khớp: Highlight ô xác nhận MK, "Mật khẩu không khớp."</w:t>
-            </w:r>
-            <w:r>
-              <w:br/>
-            </w:r>
-            <w:r>
-              <w:rPr>
-                <w:sz w:val="20"/>
-              </w:rPr>
-              <w:t>9.1. OTP sai: "Mã OTP không đúng. Vui lòng thử lại." (tối đa 3 lần)</w:t>
-            </w:r>
-            <w:r>
-              <w:br/>
-            </w:r>
-            <w:r>
-              <w:rPr>
-                <w:sz w:val="20"/>
-              </w:rPr>
-              <w:t>9.2. OTP hết hạn: "Mã OTP đã hết hạn." Nhấn "Gửi lại OTP".</w:t>
+              <w:t>11. Hệ thống tự động đăng nhập, hiển thị thông báo "Đăng ký thành công!".</w:t>
             </w:r>
           </w:p>
         </w:tc>
@@ -4159,7 +4133,7 @@
               <w:rPr>
                 <w:sz w:val="20"/>
               </w:rPr>
-              <w:t>1. Người dùng truy cập "Bảo mật" trong cài đặt.</w:t>
+              <w:t>1. Người dùng truy cập mục "Bảo mật" trong cài đặt.</w:t>
             </w:r>
             <w:r>
               <w:br/>
@@ -4168,7 +4142,7 @@
               <w:rPr>
                 <w:sz w:val="20"/>
               </w:rPr>
-              <w:t>2. Hiển thị form: MK hiện tại, MK mới, Xác nhận MK mới.</w:t>
+              <w:t>2. Hệ thống hiển thị form: Mật khẩu hiện tại, Mật khẩu mới, Xác nhận MK mới.</w:t>
             </w:r>
             <w:r>
               <w:br/>
@@ -4177,7 +4151,7 @@
               <w:rPr>
                 <w:sz w:val="20"/>
               </w:rPr>
-              <w:t>3. Người dùng nhập: MK hiện tại = "Abc@1234", MK mới = "NewPass@2025", xác nhận = "NewPass@2025".</w:t>
+              <w:t>3. Người dùng nhập Mật khẩu hiện tại, Mật khẩu mới, Xác nhận MK mới.</w:t>
             </w:r>
             <w:r>
               <w:br/>
@@ -4186,7 +4160,7 @@
               <w:rPr>
                 <w:sz w:val="20"/>
               </w:rPr>
-              <w:t>4. Nhấn [Lưu thay đổi].</w:t>
+              <w:t>4. Người dùng nhấn [Lưu thay đổi].</w:t>
             </w:r>
             <w:r>
               <w:br/>
@@ -4195,7 +4169,7 @@
               <w:rPr>
                 <w:sz w:val="20"/>
               </w:rPr>
-              <w:t>5. Hệ thống xác minh MK hiện tại khớp CSDL.</w:t>
+              <w:t>5. Hệ thống xác minh Mật khẩu hiện tại khớp CSDL.</w:t>
             </w:r>
             <w:r>
               <w:br/>
@@ -4204,7 +4178,7 @@
               <w:rPr>
                 <w:sz w:val="20"/>
               </w:rPr>
-              <w:t>6. Kiểm tra MK mới: độ dài ≥ 8, có chữ hoa/thường/số/đặc biệt.</w:t>
+              <w:t>6. Hệ thống kiểm tra Mật khẩu mới hợp lệ (độ dài ≥ 8, có chữ hoa/thường/số/đặc biệt).</w:t>
             </w:r>
             <w:r>
               <w:br/>
@@ -4213,7 +4187,7 @@
               <w:rPr>
                 <w:sz w:val="20"/>
               </w:rPr>
-              <w:t>7. Kiểm tra MK mới ≠ MK hiện tại.</w:t>
+              <w:t>7. Hệ thống kiểm tra Mật khẩu mới khác Mật khẩu hiện tại.</w:t>
             </w:r>
             <w:r>
               <w:br/>
@@ -4222,7 +4196,7 @@
               <w:rPr>
                 <w:sz w:val="20"/>
               </w:rPr>
-              <w:t>8. Mã hóa (bcrypt) và cập nhật.</w:t>
+              <w:t>8. Hệ thống mã hóa (bcrypt) và cập nhật mật khẩu mới.</w:t>
             </w:r>
             <w:r>
               <w:br/>
@@ -4231,7 +4205,7 @@
               <w:rPr>
                 <w:sz w:val="20"/>
               </w:rPr>
-              <w:t>9. Thu hồi tất cả session, hiển thị "Đổi mật khẩu thành công. Vui lòng đăng nhập lại."</w:t>
+              <w:t>9. Hệ thống thu hồi tất cả session khác.</w:t>
             </w:r>
             <w:r>
               <w:br/>
@@ -4240,39 +4214,7 @@
               <w:rPr>
                 <w:sz w:val="20"/>
               </w:rPr>
-              <w:t>10. Chuyển hướng về màn hình Đăng nhập.</w:t>
-            </w:r>
-          </w:p>
-        </w:tc>
-      </w:tr>
-      <w:tr>
-        <w:tc>
-          <w:tcPr>
-            <w:tcW w:type="dxa" w:w="2835"/>
-          </w:tcPr>
-          <w:p>
-            <w:pPr/>
-            <w:r/>
-            <w:r>
-              <w:rPr>
-                <w:sz w:val="20"/>
-              </w:rPr>
-              <w:t>Ngoại lệ</w:t>
-            </w:r>
-          </w:p>
-        </w:tc>
-        <w:tc>
-          <w:tcPr>
-            <w:tcW w:type="dxa" w:w="6803"/>
-          </w:tcPr>
-          <w:p>
-            <w:pPr/>
-            <w:r/>
-            <w:r>
-              <w:rPr>
-                <w:sz w:val="20"/>
-              </w:rPr>
-              <w:t>5.1. MK hiện tại sai: "Mật khẩu hiện tại không chính xác."</w:t>
+              <w:t>10. Hệ thống hiển thị thông báo "Đổi mật khẩu thành công. Vui lòng đăng nhập lại."</w:t>
             </w:r>
             <w:r>
               <w:br/>
@@ -4281,16 +4223,7 @@
               <w:rPr>
                 <w:sz w:val="20"/>
               </w:rPr>
-              <w:t>6.1. MK mới không đủ mạnh: Highlight ô, hiển thị yêu cầu còn thiếu.</w:t>
-            </w:r>
-            <w:r>
-              <w:br/>
-            </w:r>
-            <w:r>
-              <w:rPr>
-                <w:sz w:val="20"/>
-              </w:rPr>
-              <w:t>7.1. MK mới trùng MK cũ: "Mật khẩu mới không được trùng mật khẩu hiện tại."</w:t>
+              <w:t>11. Hệ thống chuyển hướng về màn hình Đăng nhập.</w:t>
             </w:r>
           </w:p>
         </w:tc>
@@ -4483,7 +4416,7 @@
               <w:rPr>
                 <w:sz w:val="20"/>
               </w:rPr>
-              <w:t>2. Hệ thống hiển thị "Hồ sơ cá nhân":</w:t>
+              <w:t>2. Hệ thống truy xuất thông tin từ CSDL và hiển thị trang "Hồ sơ cá nhân" gồm: Họ tên, SĐT, Email, Hạng hội viên, Điểm tích lũy, Ngày tham gia.</w:t>
             </w:r>
             <w:r>
               <w:br/>
@@ -4492,7 +4425,7 @@
               <w:rPr>
                 <w:sz w:val="20"/>
               </w:rPr>
-              <w:t>3. Nhấn [Chỉnh sửa thông tin].</w:t>
+              <w:t>3. Khách hàng nhấn [Chỉnh sửa thông tin].</w:t>
             </w:r>
             <w:r>
               <w:br/>
@@ -4501,7 +4434,7 @@
               <w:rPr>
                 <w:sz w:val="20"/>
               </w:rPr>
-              <w:t>4. Chuyển sang chế độ chỉnh sửa: Họ tên, Email có thể nhập; SĐT bị khóa.</w:t>
+              <w:t>4. Hệ thống chuyển sang chế độ chỉnh sửa: Họ tên và Email cho phép sửa, SĐT bị khóa.</w:t>
             </w:r>
             <w:r>
               <w:br/>
@@ -4510,7 +4443,7 @@
               <w:rPr>
                 <w:sz w:val="20"/>
               </w:rPr>
-              <w:t>5. Cập nhật: thông tin.</w:t>
+              <w:t>5. Khách hàng cập nhật Họ tên và Email.</w:t>
             </w:r>
             <w:r>
               <w:br/>
@@ -4519,7 +4452,7 @@
               <w:rPr>
                 <w:sz w:val="20"/>
               </w:rPr>
-              <w:t>6. Nhấn [Lưu thay đổi].</w:t>
+              <w:t>6. Khách hàng nhấn [Lưu thay đổi].</w:t>
             </w:r>
             <w:r>
               <w:br/>
@@ -4528,7 +4461,7 @@
               <w:rPr>
                 <w:sz w:val="20"/>
               </w:rPr>
-              <w:t>7. Kiểm tra email hợp lệ và chưa được dùng.</w:t>
+              <w:t>7. Hệ thống kiểm tra email hợp lệ và chưa được dùng bởi tài khoản khác.</w:t>
             </w:r>
             <w:r>
               <w:br/>
@@ -4537,7 +4470,7 @@
               <w:rPr>
                 <w:sz w:val="20"/>
               </w:rPr>
-              <w:t>8. Cập nhật vào CSDL.</w:t>
+              <w:t>8. Hệ thống cập nhật thông tin vào CSDL.</w:t>
             </w:r>
             <w:r>
               <w:br/>
@@ -4546,81 +4479,7 @@
               <w:rPr>
                 <w:sz w:val="20"/>
               </w:rPr>
-              <w:t>9. Hiển thị "Cập nhật thành công!" và quay về chế độ xem.</w:t>
-            </w:r>
-            <w:r>
-              <w:br/>
-            </w:r>
-            <w:r>
-              <w:rPr>
-                <w:rFonts w:ascii="Courier New" w:hAnsi="Courier New"/>
-                <w:sz w:val="16"/>
-              </w:rPr>
-              <w:t>Họ tên        | SĐT        | Email          | Hạng hội viên | Điểm tích lũy | Ngày tham gia</w:t>
-            </w:r>
-            <w:r>
-              <w:br/>
-            </w:r>
-            <w:r>
-              <w:rPr>
-                <w:rFonts w:ascii="Courier New" w:hAnsi="Courier New"/>
-                <w:sz w:val="16"/>
-              </w:rPr>
-              <w:t>--------------+------------+----------------+---------------+---------------+--------------</w:t>
-            </w:r>
-            <w:r>
-              <w:br/>
-            </w:r>
-            <w:r>
-              <w:rPr>
-                <w:rFonts w:ascii="Courier New" w:hAnsi="Courier New"/>
-                <w:sz w:val="16"/>
-              </w:rPr>
-              <w:t xml:space="preserve">Nguyễn Văn An | 0912345678 | vana@email.com | Bạc           | 1.250         | 15/03/2024   </w:t>
-            </w:r>
-            <w:r>
-              <w:br/>
-            </w:r>
-          </w:p>
-        </w:tc>
-      </w:tr>
-      <w:tr>
-        <w:tc>
-          <w:tcPr>
-            <w:tcW w:type="dxa" w:w="2835"/>
-          </w:tcPr>
-          <w:p>
-            <w:pPr/>
-            <w:r/>
-            <w:r>
-              <w:rPr>
-                <w:sz w:val="20"/>
-              </w:rPr>
-              <w:t>Ngoại lệ</w:t>
-            </w:r>
-          </w:p>
-        </w:tc>
-        <w:tc>
-          <w:tcPr>
-            <w:tcW w:type="dxa" w:w="6803"/>
-          </w:tcPr>
-          <w:p>
-            <w:pPr/>
-            <w:r/>
-            <w:r>
-              <w:rPr>
-                <w:sz w:val="20"/>
-              </w:rPr>
-              <w:t>7.1. Email đã được dùng: "Email này đã được đăng ký bởi tài khoản khác."</w:t>
-            </w:r>
-            <w:r>
-              <w:br/>
-            </w:r>
-            <w:r>
-              <w:rPr>
-                <w:sz w:val="20"/>
-              </w:rPr>
-              <w:t>3.1. Thay đổi SĐT: Yêu cầu xác minh OTP gửi đến SĐT hiện tại → SĐT mới → OTP mới.</w:t>
+              <w:t>9. Hệ thống hiển thị thông báo "Cập nhật thành công!" và quay về chế độ xem.</w:t>
             </w:r>
           </w:p>
         </w:tc>
@@ -4804,7 +4663,7 @@
               <w:rPr>
                 <w:sz w:val="20"/>
               </w:rPr>
-              <w:t>1. Quản lý truy cập "Quản lý nhân viên".</w:t>
+              <w:t>1. Admin truy cập trang "Quản lý nhân viên".</w:t>
             </w:r>
             <w:r>
               <w:br/>
@@ -4813,7 +4672,7 @@
               <w:rPr>
                 <w:sz w:val="20"/>
               </w:rPr>
-              <w:t>2. Hệ thống hiển thị danh sách nhân viên:</w:t>
+              <w:t>2. Hệ thống hiển thị danh sách nhân viên gồm Họ tên, Vai trò, Trạng thái.</w:t>
             </w:r>
             <w:r>
               <w:br/>
@@ -4822,7 +4681,7 @@
               <w:rPr>
                 <w:sz w:val="20"/>
               </w:rPr>
-              <w:t>3a. Thêm nhân viên: Nhấn [Thêm] → Nhập thông tin → Lưu.</w:t>
+              <w:t>3a. Admin nhấn [Thêm nhân viên], nhập Họ tên, SĐT, Vai trò, nhấn [Lưu] → Hệ thống tạo tài khoản nhân viên mới.</w:t>
             </w:r>
             <w:r>
               <w:br/>
@@ -4831,7 +4690,7 @@
               <w:rPr>
                 <w:sz w:val="20"/>
               </w:rPr>
-              <w:t>3b. Sửa nhân viên: Chọn nhân viên → Chỉnh sửa → Lưu.</w:t>
+              <w:t>3b. Admin nhấn [Sửa] trên một dòng nhân viên, cập nhật thông tin, nhấn [Lưu] → Hệ thống cập nhật vào CSDL.</w:t>
             </w:r>
             <w:r>
               <w:br/>
@@ -4840,101 +4699,7 @@
               <w:rPr>
                 <w:sz w:val="20"/>
               </w:rPr>
-              <w:t>3c. Xóa nhân viên: Chọn nhân viên → Xác nhận xóa → Hệ thống chuyển trạng thái "Đã nghỉ".</w:t>
-            </w:r>
-            <w:r>
-              <w:br/>
-            </w:r>
-            <w:r>
-              <w:rPr>
-                <w:rFonts w:ascii="Courier New" w:hAnsi="Courier New"/>
-                <w:sz w:val="16"/>
-              </w:rPr>
-              <w:t xml:space="preserve">Họ tên     | Vai trò | Trạng thái   </w:t>
-            </w:r>
-            <w:r>
-              <w:br/>
-            </w:r>
-            <w:r>
-              <w:rPr>
-                <w:rFonts w:ascii="Courier New" w:hAnsi="Courier New"/>
-                <w:sz w:val="16"/>
-              </w:rPr>
-              <w:t>-----------+---------+--------------</w:t>
-            </w:r>
-            <w:r>
-              <w:br/>
-            </w:r>
-            <w:r>
-              <w:rPr>
-                <w:rFonts w:ascii="Courier New" w:hAnsi="Courier New"/>
-                <w:sz w:val="16"/>
-              </w:rPr>
-              <w:t>Trần Văn A | Lễ tân  | Đang làm việc</w:t>
-            </w:r>
-            <w:r>
-              <w:br/>
-            </w:r>
-            <w:r>
-              <w:rPr>
-                <w:rFonts w:ascii="Courier New" w:hAnsi="Courier New"/>
-                <w:sz w:val="16"/>
-              </w:rPr>
-              <w:t>Lê Thị B   | Phục vụ | Đang làm việc</w:t>
-            </w:r>
-            <w:r>
-              <w:br/>
-            </w:r>
-            <w:r>
-              <w:rPr>
-                <w:rFonts w:ascii="Courier New" w:hAnsi="Courier New"/>
-                <w:sz w:val="16"/>
-              </w:rPr>
-              <w:t>Phạm Văn C | Quản lý | Đang làm việc</w:t>
-            </w:r>
-            <w:r>
-              <w:br/>
-            </w:r>
-          </w:p>
-        </w:tc>
-      </w:tr>
-      <w:tr>
-        <w:tc>
-          <w:tcPr>
-            <w:tcW w:type="dxa" w:w="2835"/>
-          </w:tcPr>
-          <w:p>
-            <w:pPr/>
-            <w:r/>
-            <w:r>
-              <w:rPr>
-                <w:sz w:val="20"/>
-              </w:rPr>
-              <w:t>Ngoại lệ</w:t>
-            </w:r>
-          </w:p>
-        </w:tc>
-        <w:tc>
-          <w:tcPr>
-            <w:tcW w:type="dxa" w:w="6803"/>
-          </w:tcPr>
-          <w:p>
-            <w:pPr/>
-            <w:r/>
-            <w:r>
-              <w:rPr>
-                <w:sz w:val="20"/>
-              </w:rPr>
-              <w:t>3.1. SĐT đã tồn tại: "SĐT này đã được sử dụng."</w:t>
-            </w:r>
-            <w:r>
-              <w:br/>
-            </w:r>
-            <w:r>
-              <w:rPr>
-                <w:sz w:val="20"/>
-              </w:rPr>
-              <w:t>3.2. Nhân viên đang xử lý order: Không thể xóa, hiển thị cảnh báo.</w:t>
+              <w:t>3c. Admin nhấn [Xóa] trên một dòng nhân viên, xác nhận → Hệ thống chuyển trạng thái "Đã nghỉ".</w:t>
             </w:r>
           </w:p>
         </w:tc>

</xml_diff>

<commit_message>
feat: deep audit Pha I+II theo skill cnpm — Ngoại lệ, entity diagram, class diagram
Pha I:
- Sửa business processes: arrow notation, bỏ UI detail, 6 UC chính
- Chuẩn hóa mô tả UC theo format 'UC này cho phép...'

Pha II:
- Thêm Ngoại lệ sections cho tất cả 5 UC (UC01-UC04, UC20)
- UC20: linearize steps (bỏ 3a/3b/3c), thêm HTML inline table
- Bỏ dữ liệu thật, chuẩn hóa ngôn ngữ Actor/Hệ thống
- Thêm PlantUML entity diagram (section 2)
- Thêm PlantUML analysis class diagram (section 3)
- Sửa sequence diagram messages: bỏ English words
- Cập nhật DOCX generator: DIAGRAM_MAP + scenario table detection
</commit_message>
<xml_diff>
--- a/output/account_module.docx
+++ b/output/account_module.docx
@@ -3033,6 +3033,9 @@
     <w:p>
       <w:pPr/>
       <w:r>
+        <w:t xml:space="preserve">1. </w:t>
+      </w:r>
+      <w:r>
         <w:rPr>
           <w:b/>
         </w:rPr>
@@ -3045,6 +3048,9 @@
     <w:p>
       <w:pPr/>
       <w:r>
+        <w:t xml:space="preserve">2. </w:t>
+      </w:r>
+      <w:r>
         <w:rPr>
           <w:b/>
         </w:rPr>
@@ -3057,17 +3063,23 @@
     <w:p>
       <w:pPr/>
       <w:r>
+        <w:t xml:space="preserve">3. </w:t>
+      </w:r>
+      <w:r>
         <w:rPr>
           <w:b/>
         </w:rPr>
         <w:t>UC03 – Đổi mật khẩu:</w:t>
       </w:r>
       <w:r>
-        <w:t xml:space="preserve"> UC này cho phép người dùng đã đăng nhập (Khách hàng, Nhân viên) thay đổi mật khẩu bằng cách xác minh mật khẩu hiện tại, nhập mật khẩu mới (độ dài ≥ 8, có chữ hoa/thường/số/đặc biệt). Sau khi đổi, tất cả session khác bị thu hồi. UC này được kích hoạt từ UC01 (trang cá nhân → Bảo mật).</w:t>
+        <w:t xml:space="preserve"> UC này cho phép người dùng đã đăng nhập (Khách hàng, Nhân viên) thay đổi mật khẩu bằng cách xác minh mật khẩu hiện tại, nhập mật khẩu mới (độ dài ≥ 8, có chữ hoa/thường/số/đặc biệt). Sau khi đổi, tất cả session khác bị thu hồi.</w:t>
       </w:r>
     </w:p>
     <w:p>
       <w:pPr/>
+      <w:r>
+        <w:t xml:space="preserve">4. </w:t>
+      </w:r>
       <w:r>
         <w:rPr>
           <w:b/>
@@ -3080,6 +3092,9 @@
     </w:p>
     <w:p>
       <w:pPr/>
+      <w:r>
+        <w:t xml:space="preserve">5. </w:t>
+      </w:r>
       <w:r>
         <w:rPr>
           <w:b/>
@@ -3107,7 +3122,7 @@
     <w:p>
       <w:pPr/>
       <w:r>
-        <w:t>Người dùng mở trang đăng nhập → Hệ thống hiển thị form nhập SĐT/Email và Mật khẩu → Người dùng nhập thông tin và nhấn Đăng nhập → Hệ thống kiểm tra tài khoản tồn tại trong CSDL → Hệ thống so sánh mật khẩu đã mã hóa → Hệ thống tạo phiên đăng nhập, chuyển người dùng đến trang chủ tương ứng vai trò</w:t>
+        <w:t>Người dùng mở trang đăng nhập → Hệ thống yêu cầu nhập thông tin đăng nhập → Người dùng nhập SĐT/Email và mật khẩu → Hệ thống kiểm tra tài khoản tồn tại trong CSDL → Hệ thống so sánh mật khẩu đã mã hóa → Thành công: hệ thống tạo phiên đăng nhập, chuyển người dùng đến trang chủ tương ứng vai trò / Thất bại: hệ thống thông báo sai thông tin đăng nhập</w:t>
       </w:r>
     </w:p>
     <w:p>
@@ -3119,7 +3134,7 @@
     <w:p>
       <w:pPr/>
       <w:r>
-        <w:t>Người dùng nhấn liên kết "Quên mật khẩu?" → Hệ thống hiển thị form nhập SĐT → Người dùng nhập SĐT → Hệ thống kiểm tra SĐT tồn tại → Hệ thống gửi mã OTP 6 chữ số đến SĐT → Người dùng nhập mã OTP → Hệ thống xác minh OTP đúng và còn hiệu lực → Hệ thống hiển thị form nhập mật khẩu mới → Người dùng nhập mật khẩu mới → Hệ thống mã hóa và cập nhật mật khẩu → Hệ thống thông báo đổi mật khẩu thành công</w:t>
+        <w:t>Người dùng yêu cầu khôi phục mật khẩu → Hệ thống yêu cầu nhập SĐT → Người dùng nhập SĐT → Hệ thống kiểm tra SĐT tồn tại → Hệ thống gửi mã OTP đến SĐT → Người dùng nhập mã OTP → Hệ thống xác minh OTP hợp lệ → Hệ thống yêu cầu nhập mật khẩu mới → Người dùng nhập mật khẩu mới → Hệ thống cập nhật mật khẩu vào CSDL → Hệ thống thông báo đổi mật khẩu thành công</w:t>
       </w:r>
     </w:p>
     <w:p>
@@ -3131,7 +3146,7 @@
     <w:p>
       <w:pPr/>
       <w:r>
-        <w:t>Khách hàng mở trang đăng ký → Hệ thống hiển thị form nhập Họ tên, SĐT, Email, Mật khẩu, Xác nhận MK → Khách hàng nhập đầy đủ thông tin → Hệ thống kiểm tra SĐT và email chưa tồn tại trong CSDL → Hệ thống gửi mã OTP 6 chữ số đến SĐT → Khách hàng nhập mã OTP → Hệ thống xác minh OTP đúng và còn hiệu lực → Hệ thống tạo tài khoản mới hạng "Thường", điểm tích lũy = 0 → Hệ thống tự động đăng nhập cho khách hàng</w:t>
+        <w:t>Khách hàng mở trang đăng ký → Hệ thống yêu cầu nhập thông tin đăng ký → Khách hàng nhập họ tên, SĐT, email, mật khẩu → Hệ thống kiểm tra SĐT và email chưa tồn tại trong CSDL → Hệ thống gửi mã OTP đến SĐT → Khách hàng nhập mã OTP → Hệ thống xác minh OTP hợp lệ → Hệ thống tạo tài khoản mới hạng "Thường", điểm tích lũy bằng 0 → Hệ thống tự động đăng nhập cho khách hàng</w:t>
       </w:r>
     </w:p>
     <w:p>
@@ -3143,7 +3158,7 @@
     <w:p>
       <w:pPr/>
       <w:r>
-        <w:t>Người dùng mở trang bảo mật → Hệ thống hiển thị form nhập Mật khẩu hiện tại, Mật khẩu mới, Xác nhận MK mới → Người dùng nhập đầy đủ thông tin → Hệ thống xác minh mật khẩu hiện tại khớp CSDL → Hệ thống kiểm tra mật khẩu mới hợp lệ (độ dài ≥ 8, có chữ hoa/thường/số/đặc biệt) → Hệ thống mã hóa mật khẩu mới và cập nhật → Hệ thống thu hồi tất cả phiên đăng nhập khác → Hệ thống thông báo đổi mật khẩu thành công</w:t>
+        <w:t>Người dùng mở trang bảo mật → Hệ thống yêu cầu nhập mật khẩu hiện tại và mật khẩu mới → Người dùng nhập đầy đủ thông tin → Hệ thống xác minh mật khẩu hiện tại khớp CSDL → Hệ thống kiểm tra mật khẩu mới hợp lệ → Hệ thống cập nhật mật khẩu mới vào CSDL → Hệ thống thu hồi tất cả phiên đăng nhập khác → Hệ thống thông báo đổi mật khẩu thành công</w:t>
       </w:r>
     </w:p>
     <w:p>
@@ -3155,7 +3170,7 @@
     <w:p>
       <w:pPr/>
       <w:r>
-        <w:t>Khách hàng mở trang hồ sơ cá nhân → Hệ thống truy xuất thông tin từ CSDL và hiển thị: Họ tên, SĐT, Email, Hạng hội viên, Điểm tích lũy, Ngày tham gia → Khách hàng nhấn chỉnh sửa, cập nhật Họ tên và Email → Hệ thống kiểm tra email hợp lệ và chưa được dùng → Hệ thống cập nhật hồ sơ vào CSDL → Hệ thống thông báo cập nhật thành công</w:t>
+        <w:t>Khách hàng mở trang hồ sơ cá nhân → Hệ thống truy xuất và hiển thị thông tin từ CSDL → Khách hàng chọn chỉnh sửa và cập nhật họ tên, email → Hệ thống kiểm tra email hợp lệ và chưa được dùng → Hệ thống cập nhật hồ sơ vào CSDL → Hệ thống thông báo cập nhật thành công</w:t>
       </w:r>
     </w:p>
     <w:p>
@@ -3167,7 +3182,7 @@
     <w:p>
       <w:pPr/>
       <w:r>
-        <w:t>Admin mở trang quản lý nhân viên → Hệ thống hiển thị danh sách nhân viên với Họ tên, Vai trò, Trạng thái → Admin nhấn thêm nhân viên, nhập Họ tên, SĐT, Vai trò → Hệ thống kiểm tra SĐT chưa tồn tại, tạo tài khoản nhân viên → Admin nhấn sửa trên một dòng nhân viên, cập nhật thông tin → Hệ thống lưu thay đổi vào CSDL → Admin nhấn xóa trên một dòng nhân viên → Hệ thống kiểm tra nhân viên không đang xử lý order → Hệ thống chuyển trạng thái "Đã nghỉ"</w:t>
+        <w:t>Admin mở trang quản lý nhân viên → Hệ thống hiển thị danh sách nhân viên → Admin chọn thêm nhân viên, nhập thông tin → Hệ thống kiểm tra SĐT chưa tồn tại, tạo tài khoản nhân viên → Admin chọn sửa nhân viên, cập nhật thông tin → Hệ thống lưu thay đổi vào CSDL → Admin chọn xóa nhân viên → Hệ thống kiểm tra nhân viên không đang xử lý order → Hệ thống chuyển trạng thái "Đã nghỉ"</w:t>
       </w:r>
     </w:p>
     <w:p>
@@ -3499,6 +3514,7 @@
             <w:r/>
             <w:r>
               <w:rPr>
+                <w:b/>
                 <w:sz w:val="20"/>
               </w:rPr>
               <w:t>Actor</w:t>
@@ -3531,6 +3547,7 @@
             <w:r/>
             <w:r>
               <w:rPr>
+                <w:b/>
                 <w:sz w:val="20"/>
               </w:rPr>
               <w:t>Tiền điều kiện</w:t>
@@ -3563,6 +3580,7 @@
             <w:r/>
             <w:r>
               <w:rPr>
+                <w:b/>
                 <w:sz w:val="20"/>
               </w:rPr>
               <w:t>Hậu điều kiện</w:t>
@@ -3580,7 +3598,7 @@
               <w:rPr>
                 <w:sz w:val="20"/>
               </w:rPr>
-              <w:t>Người dùng được xác thực thành công, hệ thống tạo session và chuyển hướng đến trang chủ tương ứng.</w:t>
+              <w:t>Người dùng được xác thực thành công, hệ thống tạo phiên đăng nhập và chuyển hướng đến trang chủ tương ứng.</w:t>
             </w:r>
           </w:p>
         </w:tc>
@@ -3595,6 +3613,7 @@
             <w:r/>
             <w:r>
               <w:rPr>
+                <w:b/>
                 <w:sz w:val="20"/>
               </w:rPr>
               <w:t>Kịch bản chính</w:t>
@@ -3612,7 +3631,7 @@
               <w:rPr>
                 <w:sz w:val="20"/>
               </w:rPr>
-              <w:t>1. Người dùng truy cập màn hình "Đăng nhập".</w:t>
+              <w:t>1. Người dùng truy cập chức năng "Đăng nhập".</w:t>
             </w:r>
             <w:r>
               <w:br/>
@@ -3621,7 +3640,7 @@
               <w:rPr>
                 <w:sz w:val="20"/>
               </w:rPr>
-              <w:t>2. Hệ thống hiển thị form gồm: Ô nhập SĐT/Email, Ô nhập Mật khẩu, Nút [Đăng nhập], Liên kết "Quên mật khẩu?" / "Đăng ký".</w:t>
+              <w:t>2. Hệ thống hiển thị giao diện đăng nhập yêu cầu nhập thông tin đăng nhập.</w:t>
             </w:r>
             <w:r>
               <w:br/>
@@ -3639,7 +3658,7 @@
               <w:rPr>
                 <w:sz w:val="20"/>
               </w:rPr>
-              <w:t>4. Người dùng nhấn [Đăng nhập].</w:t>
+              <w:t>4. Người dùng nhấn nút xác nhận đăng nhập.</w:t>
             </w:r>
             <w:r>
               <w:br/>
@@ -3657,7 +3676,7 @@
               <w:rPr>
                 <w:sz w:val="20"/>
               </w:rPr>
-              <w:t>6. Hệ thống truy vấn CSDL: tìm tài khoản theo SĐT/Email, so sánh mật khẩu đã mã hóa.</w:t>
+              <w:t>6. Hệ thống truy vấn CSDL tìm tài khoản theo SĐT/Email, so sánh mật khẩu đã mã hóa.</w:t>
             </w:r>
             <w:r>
               <w:br/>
@@ -3666,7 +3685,7 @@
               <w:rPr>
                 <w:sz w:val="20"/>
               </w:rPr>
-              <w:t>7. Xác thực thành công, hệ thống tạo session với vai trò tương ứng.</w:t>
+              <w:t>7. Xác thực thành công, hệ thống tạo phiên đăng nhập với vai trò tương ứng.</w:t>
             </w:r>
             <w:r>
               <w:br/>
@@ -3676,6 +3695,111 @@
                 <w:sz w:val="20"/>
               </w:rPr>
               <w:t>8. Hệ thống chuyển hướng đến trang chủ, hiển thị thông báo "Đăng nhập thành công".</w:t>
+            </w:r>
+          </w:p>
+        </w:tc>
+      </w:tr>
+      <w:tr>
+        <w:tc>
+          <w:tcPr>
+            <w:tcW w:type="dxa" w:w="2835"/>
+          </w:tcPr>
+          <w:p>
+            <w:pPr/>
+            <w:r/>
+            <w:r>
+              <w:rPr>
+                <w:b/>
+                <w:sz w:val="20"/>
+              </w:rPr>
+              <w:t>Ngoại lệ</w:t>
+            </w:r>
+          </w:p>
+        </w:tc>
+        <w:tc>
+          <w:tcPr>
+            <w:tcW w:type="dxa" w:w="6803"/>
+          </w:tcPr>
+          <w:p>
+            <w:pPr/>
+            <w:r/>
+            <w:r>
+              <w:rPr>
+                <w:sz w:val="20"/>
+              </w:rPr>
+              <w:t>5. Hệ thống phát hiện định dạng đầu vào không hợp lệ.</w:t>
+            </w:r>
+            <w:r>
+              <w:br/>
+            </w:r>
+            <w:r>
+              <w:rPr>
+                <w:sz w:val="20"/>
+              </w:rPr>
+              <w:t>5.1 Hệ thống hiển thị thông báo lỗi yêu cầu nhập lại.</w:t>
+            </w:r>
+            <w:r>
+              <w:br/>
+            </w:r>
+            <w:r>
+              <w:rPr>
+                <w:sz w:val="20"/>
+              </w:rPr>
+              <w:t>5.2 Người dùng nhập lại thông tin (quay về Bước 4).</w:t>
+            </w:r>
+            <w:r>
+              <w:br/>
+            </w:r>
+            <w:r>
+              <w:rPr>
+                <w:sz w:val="20"/>
+              </w:rPr>
+              <w:t>6. Hệ thống không tìm thấy tài khoản khớp SĐT/Email.</w:t>
+            </w:r>
+            <w:r>
+              <w:br/>
+            </w:r>
+            <w:r>
+              <w:rPr>
+                <w:sz w:val="20"/>
+              </w:rPr>
+              <w:t>6.1 Hệ thống hiển thị thông báo "Tài khoản không tồn tại".</w:t>
+            </w:r>
+            <w:r>
+              <w:br/>
+            </w:r>
+            <w:r>
+              <w:rPr>
+                <w:sz w:val="20"/>
+              </w:rPr>
+              <w:t>6.2 Người dùng chọn đăng ký tài khoản mới (chuyển sang UC02).</w:t>
+            </w:r>
+            <w:r>
+              <w:br/>
+            </w:r>
+            <w:r>
+              <w:rPr>
+                <w:sz w:val="20"/>
+              </w:rPr>
+              <w:t>6. Mật khẩu không chính xác.</w:t>
+            </w:r>
+            <w:r>
+              <w:br/>
+            </w:r>
+            <w:r>
+              <w:rPr>
+                <w:sz w:val="20"/>
+              </w:rPr>
+              <w:t>6.1 Hệ thống hiển thị thông báo "Sai mật khẩu".</w:t>
+            </w:r>
+            <w:r>
+              <w:br/>
+            </w:r>
+            <w:r>
+              <w:rPr>
+                <w:sz w:val="20"/>
+              </w:rPr>
+              <w:t>6.2 Người dùng nhập lại mật khẩu (quay về Bước 4).</w:t>
             </w:r>
           </w:p>
         </w:tc>
@@ -3746,6 +3870,7 @@
             <w:r/>
             <w:r>
               <w:rPr>
+                <w:b/>
                 <w:sz w:val="20"/>
               </w:rPr>
               <w:t>Actor</w:t>
@@ -3778,6 +3903,7 @@
             <w:r/>
             <w:r>
               <w:rPr>
+                <w:b/>
                 <w:sz w:val="20"/>
               </w:rPr>
               <w:t>Tiền điều kiện</w:t>
@@ -3810,6 +3936,7 @@
             <w:r/>
             <w:r>
               <w:rPr>
+                <w:b/>
                 <w:sz w:val="20"/>
               </w:rPr>
               <w:t>Hậu điều kiện</w:t>
@@ -3842,6 +3969,7 @@
             <w:r/>
             <w:r>
               <w:rPr>
+                <w:b/>
                 <w:sz w:val="20"/>
               </w:rPr>
               <w:t>Kịch bản chính</w:t>
@@ -3859,7 +3987,7 @@
               <w:rPr>
                 <w:sz w:val="20"/>
               </w:rPr>
-              <w:t>1. Người dùng nhấn "Đăng ký" từ màn hình đăng nhập.</w:t>
+              <w:t>1. Người dùng chọn chức năng "Đăng ký" từ giao diện đăng nhập.</w:t>
             </w:r>
             <w:r>
               <w:br/>
@@ -3868,7 +3996,7 @@
               <w:rPr>
                 <w:sz w:val="20"/>
               </w:rPr>
-              <w:t>2. Hệ thống hiển thị form: Họ tên, SĐT, Email, Mật khẩu, Xác nhận MK.</w:t>
+              <w:t>2. Hệ thống hiển thị giao diện đăng ký yêu cầu nhập thông tin.</w:t>
             </w:r>
             <w:r>
               <w:br/>
@@ -3877,7 +4005,7 @@
               <w:rPr>
                 <w:sz w:val="20"/>
               </w:rPr>
-              <w:t>3. Người dùng nhập Họ tên, SĐT, Email, Mật khẩu.</w:t>
+              <w:t>3. Người dùng nhập Họ tên, SĐT, Email, Mật khẩu, Xác nhận mật khẩu.</w:t>
             </w:r>
             <w:r>
               <w:br/>
@@ -3886,7 +4014,7 @@
               <w:rPr>
                 <w:sz w:val="20"/>
               </w:rPr>
-              <w:t>4. Người dùng nhấn [Tiếp tục].</w:t>
+              <w:t>4. Người dùng nhấn nút Tiếp tục.</w:t>
             </w:r>
             <w:r>
               <w:br/>
@@ -3895,7 +4023,7 @@
               <w:rPr>
                 <w:sz w:val="20"/>
               </w:rPr>
-              <w:t>5. Hệ thống kiểm tra định dạng, SĐT và email chưa tồn tại trong CSDL.</w:t>
+              <w:t>5. Hệ thống kiểm tra định dạng, SĐT và Email chưa tồn tại trong CSDL.</w:t>
             </w:r>
             <w:r>
               <w:br/>
@@ -3904,7 +4032,7 @@
               <w:rPr>
                 <w:sz w:val="20"/>
               </w:rPr>
-              <w:t>6. Hệ thống gửi OTP 6 chữ số đến SĐT.</w:t>
+              <w:t>6. Hệ thống gửi mã OTP 6 chữ số đến SĐT.</w:t>
             </w:r>
             <w:r>
               <w:br/>
@@ -3913,7 +4041,7 @@
               <w:rPr>
                 <w:sz w:val="20"/>
               </w:rPr>
-              <w:t>7. Hệ thống hiển thị màn hình "Xác nhận OTP".</w:t>
+              <w:t>7. Hệ thống hiển thị giao diện yêu cầu nhập mã OTP.</w:t>
             </w:r>
             <w:r>
               <w:br/>
@@ -3922,7 +4050,7 @@
               <w:rPr>
                 <w:sz w:val="20"/>
               </w:rPr>
-              <w:t>8. Người dùng nhập mã OTP và nhấn [Xác nhận].</w:t>
+              <w:t>8. Người dùng nhập mã OTP và nhấn nút Xác nhận.</w:t>
             </w:r>
             <w:r>
               <w:br/>
@@ -3931,7 +4059,7 @@
               <w:rPr>
                 <w:sz w:val="20"/>
               </w:rPr>
-              <w:t>9. Hệ thống xác minh OTP đúng và còn hiệu lực.</w:t>
+              <w:t>9. Hệ thống xác minh mã OTP đúng và còn hiệu lực.</w:t>
             </w:r>
             <w:r>
               <w:br/>
@@ -3940,7 +4068,7 @@
               <w:rPr>
                 <w:sz w:val="20"/>
               </w:rPr>
-              <w:t>10. Hệ thống tạo tài khoản mới, hạng "Thường", điểm tích lũy = 0.</w:t>
+              <w:t>10. Hệ thống tạo tài khoản mới, hạng "Thường", điểm tích lũy bằng 0.</w:t>
             </w:r>
             <w:r>
               <w:br/>
@@ -3950,6 +4078,111 @@
                 <w:sz w:val="20"/>
               </w:rPr>
               <w:t>11. Hệ thống tự động đăng nhập, hiển thị thông báo "Đăng ký thành công!".</w:t>
+            </w:r>
+          </w:p>
+        </w:tc>
+      </w:tr>
+      <w:tr>
+        <w:tc>
+          <w:tcPr>
+            <w:tcW w:type="dxa" w:w="2835"/>
+          </w:tcPr>
+          <w:p>
+            <w:pPr/>
+            <w:r/>
+            <w:r>
+              <w:rPr>
+                <w:b/>
+                <w:sz w:val="20"/>
+              </w:rPr>
+              <w:t>Ngoại lệ</w:t>
+            </w:r>
+          </w:p>
+        </w:tc>
+        <w:tc>
+          <w:tcPr>
+            <w:tcW w:type="dxa" w:w="6803"/>
+          </w:tcPr>
+          <w:p>
+            <w:pPr/>
+            <w:r/>
+            <w:r>
+              <w:rPr>
+                <w:sz w:val="20"/>
+              </w:rPr>
+              <w:t>5. Hệ thống phát hiện SĐT hoặc Email đã tồn tại.</w:t>
+            </w:r>
+            <w:r>
+              <w:br/>
+            </w:r>
+            <w:r>
+              <w:rPr>
+                <w:sz w:val="20"/>
+              </w:rPr>
+              <w:t>5.1 Hệ thống hiển thị thông báo "SĐT hoặc Email đã được sử dụng".</w:t>
+            </w:r>
+            <w:r>
+              <w:br/>
+            </w:r>
+            <w:r>
+              <w:rPr>
+                <w:sz w:val="20"/>
+              </w:rPr>
+              <w:t>5.2 Người dùng nhập lại thông tin khác (quay về Bước 4).</w:t>
+            </w:r>
+            <w:r>
+              <w:br/>
+            </w:r>
+            <w:r>
+              <w:rPr>
+                <w:sz w:val="20"/>
+              </w:rPr>
+              <w:t>5. Hệ thống phát hiện định dạng đầu vào không hợp lệ.</w:t>
+            </w:r>
+            <w:r>
+              <w:br/>
+            </w:r>
+            <w:r>
+              <w:rPr>
+                <w:sz w:val="20"/>
+              </w:rPr>
+              <w:t>5.1 Hệ thống hiển thị thông báo lỗi cụ thể.</w:t>
+            </w:r>
+            <w:r>
+              <w:br/>
+            </w:r>
+            <w:r>
+              <w:rPr>
+                <w:sz w:val="20"/>
+              </w:rPr>
+              <w:t>5.2 Người dùng nhập lại thông tin (quay về Bước 4).</w:t>
+            </w:r>
+            <w:r>
+              <w:br/>
+            </w:r>
+            <w:r>
+              <w:rPr>
+                <w:sz w:val="20"/>
+              </w:rPr>
+              <w:t>9. Mã OTP sai hoặc đã hết hiệu lực.</w:t>
+            </w:r>
+            <w:r>
+              <w:br/>
+            </w:r>
+            <w:r>
+              <w:rPr>
+                <w:sz w:val="20"/>
+              </w:rPr>
+              <w:t>9.1 Hệ thống hiển thị thông báo "Mã OTP không hợp lệ hoặc đã hết hạn".</w:t>
+            </w:r>
+            <w:r>
+              <w:br/>
+            </w:r>
+            <w:r>
+              <w:rPr>
+                <w:sz w:val="20"/>
+              </w:rPr>
+              <w:t>9.2 Người dùng chọn gửi lại mã OTP (quay về Bước 8).</w:t>
             </w:r>
           </w:p>
         </w:tc>
@@ -4020,6 +4253,7 @@
             <w:r/>
             <w:r>
               <w:rPr>
+                <w:b/>
                 <w:sz w:val="20"/>
               </w:rPr>
               <w:t>Actor</w:t>
@@ -4052,6 +4286,7 @@
             <w:r/>
             <w:r>
               <w:rPr>
+                <w:b/>
                 <w:sz w:val="20"/>
               </w:rPr>
               <w:t>Tiền điều kiện</w:t>
@@ -4084,6 +4319,7 @@
             <w:r/>
             <w:r>
               <w:rPr>
+                <w:b/>
                 <w:sz w:val="20"/>
               </w:rPr>
               <w:t>Hậu điều kiện</w:t>
@@ -4101,7 +4337,7 @@
               <w:rPr>
                 <w:sz w:val="20"/>
               </w:rPr>
-              <w:t>Mật khẩu mới được lưu (bcrypt). Tất cả session khác bị thu hồi.</w:t>
+              <w:t>Mật khẩu mới được lưu (mã hóa). Tất cả phiên đăng nhập khác bị thu hồi.</w:t>
             </w:r>
           </w:p>
         </w:tc>
@@ -4116,6 +4352,7 @@
             <w:r/>
             <w:r>
               <w:rPr>
+                <w:b/>
                 <w:sz w:val="20"/>
               </w:rPr>
               <w:t>Kịch bản chính</w:t>
@@ -4133,7 +4370,7 @@
               <w:rPr>
                 <w:sz w:val="20"/>
               </w:rPr>
-              <w:t>1. Người dùng truy cập mục "Bảo mật" trong cài đặt.</w:t>
+              <w:t>1. Người dùng truy cập chức năng "Đổi mật khẩu".</w:t>
             </w:r>
             <w:r>
               <w:br/>
@@ -4142,7 +4379,7 @@
               <w:rPr>
                 <w:sz w:val="20"/>
               </w:rPr>
-              <w:t>2. Hệ thống hiển thị form: Mật khẩu hiện tại, Mật khẩu mới, Xác nhận MK mới.</w:t>
+              <w:t>2. Hệ thống hiển thị giao diện yêu cầu nhập mật khẩu hiện tại và mật khẩu mới.</w:t>
             </w:r>
             <w:r>
               <w:br/>
@@ -4151,7 +4388,7 @@
               <w:rPr>
                 <w:sz w:val="20"/>
               </w:rPr>
-              <w:t>3. Người dùng nhập Mật khẩu hiện tại, Mật khẩu mới, Xác nhận MK mới.</w:t>
+              <w:t>3. Người dùng nhập Mật khẩu hiện tại, Mật khẩu mới, Xác nhận mật khẩu mới.</w:t>
             </w:r>
             <w:r>
               <w:br/>
@@ -4160,7 +4397,7 @@
               <w:rPr>
                 <w:sz w:val="20"/>
               </w:rPr>
-              <w:t>4. Người dùng nhấn [Lưu thay đổi].</w:t>
+              <w:t>4. Người dùng nhấn nút Lưu thay đổi.</w:t>
             </w:r>
             <w:r>
               <w:br/>
@@ -4169,7 +4406,7 @@
               <w:rPr>
                 <w:sz w:val="20"/>
               </w:rPr>
-              <w:t>5. Hệ thống xác minh Mật khẩu hiện tại khớp CSDL.</w:t>
+              <w:t>5. Hệ thống xác minh mật khẩu hiện tại khớp CSDL.</w:t>
             </w:r>
             <w:r>
               <w:br/>
@@ -4178,7 +4415,7 @@
               <w:rPr>
                 <w:sz w:val="20"/>
               </w:rPr>
-              <w:t>6. Hệ thống kiểm tra Mật khẩu mới hợp lệ (độ dài ≥ 8, có chữ hoa/thường/số/đặc biệt).</w:t>
+              <w:t>6. Hệ thống kiểm tra mật khẩu mới hợp lệ (độ dài tối thiểu 8 ký tự, có chữ hoa, chữ thường, số, ký tự đặc biệt).</w:t>
             </w:r>
             <w:r>
               <w:br/>
@@ -4187,7 +4424,7 @@
               <w:rPr>
                 <w:sz w:val="20"/>
               </w:rPr>
-              <w:t>7. Hệ thống kiểm tra Mật khẩu mới khác Mật khẩu hiện tại.</w:t>
+              <w:t>7. Hệ thống kiểm tra mật khẩu mới khác mật khẩu hiện tại.</w:t>
             </w:r>
             <w:r>
               <w:br/>
@@ -4196,7 +4433,7 @@
               <w:rPr>
                 <w:sz w:val="20"/>
               </w:rPr>
-              <w:t>8. Hệ thống mã hóa (bcrypt) và cập nhật mật khẩu mới.</w:t>
+              <w:t>8. Hệ thống mã hóa và cập nhật mật khẩu mới vào CSDL.</w:t>
             </w:r>
             <w:r>
               <w:br/>
@@ -4205,7 +4442,7 @@
               <w:rPr>
                 <w:sz w:val="20"/>
               </w:rPr>
-              <w:t>9. Hệ thống thu hồi tất cả session khác.</w:t>
+              <w:t>9. Hệ thống thu hồi tất cả phiên đăng nhập khác.</w:t>
             </w:r>
             <w:r>
               <w:br/>
@@ -4223,7 +4460,112 @@
               <w:rPr>
                 <w:sz w:val="20"/>
               </w:rPr>
-              <w:t>11. Hệ thống chuyển hướng về màn hình Đăng nhập.</w:t>
+              <w:t>11. Hệ thống chuyển hướng về giao diện đăng nhập.</w:t>
+            </w:r>
+          </w:p>
+        </w:tc>
+      </w:tr>
+      <w:tr>
+        <w:tc>
+          <w:tcPr>
+            <w:tcW w:type="dxa" w:w="2835"/>
+          </w:tcPr>
+          <w:p>
+            <w:pPr/>
+            <w:r/>
+            <w:r>
+              <w:rPr>
+                <w:b/>
+                <w:sz w:val="20"/>
+              </w:rPr>
+              <w:t>Ngoại lệ</w:t>
+            </w:r>
+          </w:p>
+        </w:tc>
+        <w:tc>
+          <w:tcPr>
+            <w:tcW w:type="dxa" w:w="6803"/>
+          </w:tcPr>
+          <w:p>
+            <w:pPr/>
+            <w:r/>
+            <w:r>
+              <w:rPr>
+                <w:sz w:val="20"/>
+              </w:rPr>
+              <w:t>5. Hệ thống phát hiện mật khẩu hiện tại không khớp.</w:t>
+            </w:r>
+            <w:r>
+              <w:br/>
+            </w:r>
+            <w:r>
+              <w:rPr>
+                <w:sz w:val="20"/>
+              </w:rPr>
+              <w:t>5.1 Hệ thống hiển thị thông báo "Mật khẩu hiện tại không chính xác".</w:t>
+            </w:r>
+            <w:r>
+              <w:br/>
+            </w:r>
+            <w:r>
+              <w:rPr>
+                <w:sz w:val="20"/>
+              </w:rPr>
+              <w:t>5.2 Người dùng nhập lại mật khẩu hiện tại (quay về Bước 4).</w:t>
+            </w:r>
+            <w:r>
+              <w:br/>
+            </w:r>
+            <w:r>
+              <w:rPr>
+                <w:sz w:val="20"/>
+              </w:rPr>
+              <w:t>6. Hệ thống phát hiện mật khẩu mới không hợp lệ.</w:t>
+            </w:r>
+            <w:r>
+              <w:br/>
+            </w:r>
+            <w:r>
+              <w:rPr>
+                <w:sz w:val="20"/>
+              </w:rPr>
+              <w:t>6.1 Hệ thống hiển thị thông báo lỗi yêu cầu mật khẩu đạt tiêu chuẩn.</w:t>
+            </w:r>
+            <w:r>
+              <w:br/>
+            </w:r>
+            <w:r>
+              <w:rPr>
+                <w:sz w:val="20"/>
+              </w:rPr>
+              <w:t>6.2 Người dùng nhập lại mật khẩu mới (quay về Bước 4).</w:t>
+            </w:r>
+            <w:r>
+              <w:br/>
+            </w:r>
+            <w:r>
+              <w:rPr>
+                <w:sz w:val="20"/>
+              </w:rPr>
+              <w:t>7. Hệ thống phát hiện mật khẩu mới trùng mật khẩu hiện tại.</w:t>
+            </w:r>
+            <w:r>
+              <w:br/>
+            </w:r>
+            <w:r>
+              <w:rPr>
+                <w:sz w:val="20"/>
+              </w:rPr>
+              <w:t>7.1 Hệ thống hiển thị thông báo "Mật khẩu mới phải khác mật khẩu hiện tại".</w:t>
+            </w:r>
+            <w:r>
+              <w:br/>
+            </w:r>
+            <w:r>
+              <w:rPr>
+                <w:sz w:val="20"/>
+              </w:rPr>
+              <w:t>7.2 Người dùng nhập lại mật khẩu mới (quay về Bước 4).</w:t>
             </w:r>
           </w:p>
         </w:tc>
@@ -4294,6 +4636,7 @@
             <w:r/>
             <w:r>
               <w:rPr>
+                <w:b/>
                 <w:sz w:val="20"/>
               </w:rPr>
               <w:t>Actor</w:t>
@@ -4326,6 +4669,7 @@
             <w:r/>
             <w:r>
               <w:rPr>
+                <w:b/>
                 <w:sz w:val="20"/>
               </w:rPr>
               <w:t>Tiền điều kiện</w:t>
@@ -4358,6 +4702,7 @@
             <w:r/>
             <w:r>
               <w:rPr>
+                <w:b/>
                 <w:sz w:val="20"/>
               </w:rPr>
               <w:t>Hậu điều kiện</w:t>
@@ -4390,6 +4735,7 @@
             <w:r/>
             <w:r>
               <w:rPr>
+                <w:b/>
                 <w:sz w:val="20"/>
               </w:rPr>
               <w:t>Kịch bản chính</w:t>
@@ -4407,7 +4753,7 @@
               <w:rPr>
                 <w:sz w:val="20"/>
               </w:rPr>
-              <w:t>1. Khách hàng nhấn vào ảnh đại diện / tên tài khoản.</w:t>
+              <w:t>1. Khách hàng chọn chức năng "Hồ sơ cá nhân".</w:t>
             </w:r>
             <w:r>
               <w:br/>
@@ -4416,7 +4762,7 @@
               <w:rPr>
                 <w:sz w:val="20"/>
               </w:rPr>
-              <w:t>2. Hệ thống truy xuất thông tin từ CSDL và hiển thị trang "Hồ sơ cá nhân" gồm: Họ tên, SĐT, Email, Hạng hội viên, Điểm tích lũy, Ngày tham gia.</w:t>
+              <w:t>2. Hệ thống truy xuất thông tin từ CSDL và hiển thị trang hồ sơ cá nhân gồm: Họ tên, SĐT, Email, Hạng hội viên, Điểm tích lũy, Ngày tham gia.</w:t>
             </w:r>
             <w:r>
               <w:br/>
@@ -4425,7 +4771,7 @@
               <w:rPr>
                 <w:sz w:val="20"/>
               </w:rPr>
-              <w:t>3. Khách hàng nhấn [Chỉnh sửa thông tin].</w:t>
+              <w:t>3. Khách hàng nhấn chọn chỉnh sửa thông tin.</w:t>
             </w:r>
             <w:r>
               <w:br/>
@@ -4452,7 +4798,7 @@
               <w:rPr>
                 <w:sz w:val="20"/>
               </w:rPr>
-              <w:t>6. Khách hàng nhấn [Lưu thay đổi].</w:t>
+              <w:t>6. Khách hàng nhấn nút Lưu thay đổi.</w:t>
             </w:r>
             <w:r>
               <w:br/>
@@ -4480,6 +4826,57 @@
                 <w:sz w:val="20"/>
               </w:rPr>
               <w:t>9. Hệ thống hiển thị thông báo "Cập nhật thành công!" và quay về chế độ xem.</w:t>
+            </w:r>
+          </w:p>
+        </w:tc>
+      </w:tr>
+      <w:tr>
+        <w:tc>
+          <w:tcPr>
+            <w:tcW w:type="dxa" w:w="2835"/>
+          </w:tcPr>
+          <w:p>
+            <w:pPr/>
+            <w:r/>
+            <w:r>
+              <w:rPr>
+                <w:b/>
+                <w:sz w:val="20"/>
+              </w:rPr>
+              <w:t>Ngoại lệ</w:t>
+            </w:r>
+          </w:p>
+        </w:tc>
+        <w:tc>
+          <w:tcPr>
+            <w:tcW w:type="dxa" w:w="6803"/>
+          </w:tcPr>
+          <w:p>
+            <w:pPr/>
+            <w:r/>
+            <w:r>
+              <w:rPr>
+                <w:sz w:val="20"/>
+              </w:rPr>
+              <w:t>7. Hệ thống phát hiện email không hợp lệ hoặc đã được dùng.</w:t>
+            </w:r>
+            <w:r>
+              <w:br/>
+            </w:r>
+            <w:r>
+              <w:rPr>
+                <w:sz w:val="20"/>
+              </w:rPr>
+              <w:t>7.1 Hệ thống hiển thị thông báo "Email không hợp lệ hoặc đã được sử dụng".</w:t>
+            </w:r>
+            <w:r>
+              <w:br/>
+            </w:r>
+            <w:r>
+              <w:rPr>
+                <w:sz w:val="20"/>
+              </w:rPr>
+              <w:t>7.2 Khách hàng nhập lại email khác (quay về Bước 6).</w:t>
             </w:r>
           </w:p>
         </w:tc>
@@ -4550,6 +4947,7 @@
             <w:r/>
             <w:r>
               <w:rPr>
+                <w:b/>
                 <w:sz w:val="20"/>
               </w:rPr>
               <w:t>Actor</w:t>
@@ -4582,6 +4980,7 @@
             <w:r/>
             <w:r>
               <w:rPr>
+                <w:b/>
                 <w:sz w:val="20"/>
               </w:rPr>
               <w:t>Tiền điều kiện</w:t>
@@ -4614,6 +5013,7 @@
             <w:r/>
             <w:r>
               <w:rPr>
+                <w:b/>
                 <w:sz w:val="20"/>
               </w:rPr>
               <w:t>Hậu điều kiện</w:t>
@@ -4646,6 +5046,7 @@
             <w:r/>
             <w:r>
               <w:rPr>
+                <w:b/>
                 <w:sz w:val="20"/>
               </w:rPr>
               <w:t>Kịch bản chính</w:t>
@@ -4663,7 +5064,7 @@
               <w:rPr>
                 <w:sz w:val="20"/>
               </w:rPr>
-              <w:t>1. Admin truy cập trang "Quản lý nhân viên".</w:t>
+              <w:t>1. Admin truy cập chức năng "Quản lý nhân viên".</w:t>
             </w:r>
             <w:r>
               <w:br/>
@@ -4672,7 +5073,7 @@
               <w:rPr>
                 <w:sz w:val="20"/>
               </w:rPr>
-              <w:t>2. Hệ thống hiển thị danh sách nhân viên gồm Họ tên, Vai trò, Trạng thái.</w:t>
+              <w:t>2. Hệ thống truy xuất danh sách nhân viên từ CSDL và hiển thị:</w:t>
             </w:r>
             <w:r>
               <w:br/>
@@ -4681,7 +5082,7 @@
               <w:rPr>
                 <w:sz w:val="20"/>
               </w:rPr>
-              <w:t>3a. Admin nhấn [Thêm nhân viên], nhập Họ tên, SĐT, Vai trò, nhấn [Lưu] → Hệ thống tạo tài khoản nhân viên mới.</w:t>
+              <w:t>3. Admin nhấn nút Thêm nhân viên.</w:t>
             </w:r>
             <w:r>
               <w:br/>
@@ -4690,7 +5091,7 @@
               <w:rPr>
                 <w:sz w:val="20"/>
               </w:rPr>
-              <w:t>3b. Admin nhấn [Sửa] trên một dòng nhân viên, cập nhật thông tin, nhấn [Lưu] → Hệ thống cập nhật vào CSDL.</w:t>
+              <w:t>4. Hệ thống hiển thị giao diện yêu cầu nhập thông tin nhân viên mới.</w:t>
             </w:r>
             <w:r>
               <w:br/>
@@ -4699,7 +5100,273 @@
               <w:rPr>
                 <w:sz w:val="20"/>
               </w:rPr>
-              <w:t>3c. Admin nhấn [Xóa] trên một dòng nhân viên, xác nhận → Hệ thống chuyển trạng thái "Đã nghỉ".</w:t>
+              <w:t>5. Admin nhập Họ tên, SĐT, Vai trò, Chi nhánh.</w:t>
+            </w:r>
+            <w:r>
+              <w:br/>
+            </w:r>
+            <w:r>
+              <w:rPr>
+                <w:sz w:val="20"/>
+              </w:rPr>
+              <w:t>6. Admin nhấn nút Lưu.</w:t>
+            </w:r>
+            <w:r>
+              <w:br/>
+            </w:r>
+            <w:r>
+              <w:rPr>
+                <w:sz w:val="20"/>
+              </w:rPr>
+              <w:t>7. Hệ thống kiểm tra SĐT chưa tồn tại trong CSDL.</w:t>
+            </w:r>
+            <w:r>
+              <w:br/>
+            </w:r>
+            <w:r>
+              <w:rPr>
+                <w:sz w:val="20"/>
+              </w:rPr>
+              <w:t>8. Hệ thống tạo tài khoản nhân viên mới.</w:t>
+            </w:r>
+            <w:r>
+              <w:br/>
+            </w:r>
+            <w:r>
+              <w:rPr>
+                <w:sz w:val="20"/>
+              </w:rPr>
+              <w:t>9. Hệ thống hiển thị thông báo "Thêm nhân viên thành công!" và cập nhật danh sách.</w:t>
+            </w:r>
+            <w:r>
+              <w:br/>
+            </w:r>
+            <w:r>
+              <w:rPr>
+                <w:sz w:val="20"/>
+              </w:rPr>
+              <w:t>10. Admin nhấn nút Sửa trên một dòng nhân viên.</w:t>
+            </w:r>
+            <w:r>
+              <w:br/>
+            </w:r>
+            <w:r>
+              <w:rPr>
+                <w:sz w:val="20"/>
+              </w:rPr>
+              <w:t>11. Hệ thống hiển thị giao diện chỉnh sửa với thông tin hiện tại.</w:t>
+            </w:r>
+            <w:r>
+              <w:br/>
+            </w:r>
+            <w:r>
+              <w:rPr>
+                <w:sz w:val="20"/>
+              </w:rPr>
+              <w:t>12. Admin cập nhật thông tin và nhấn nút Lưu.</w:t>
+            </w:r>
+            <w:r>
+              <w:br/>
+            </w:r>
+            <w:r>
+              <w:rPr>
+                <w:sz w:val="20"/>
+              </w:rPr>
+              <w:t>13. Hệ thống cập nhật thông tin vào CSDL.</w:t>
+            </w:r>
+            <w:r>
+              <w:br/>
+            </w:r>
+            <w:r>
+              <w:rPr>
+                <w:sz w:val="20"/>
+              </w:rPr>
+              <w:t>14. Hệ thống hiển thị thông báo "Cập nhật thành công!".</w:t>
+            </w:r>
+            <w:r>
+              <w:br/>
+            </w:r>
+            <w:r>
+              <w:rPr>
+                <w:sz w:val="20"/>
+              </w:rPr>
+              <w:t>15. Admin nhấn nút Xóa trên một dòng nhân viên.</w:t>
+            </w:r>
+            <w:r>
+              <w:br/>
+            </w:r>
+            <w:r>
+              <w:rPr>
+                <w:sz w:val="20"/>
+              </w:rPr>
+              <w:t>16. Hệ thống yêu cầu xác nhận xóa.</w:t>
+            </w:r>
+            <w:r>
+              <w:br/>
+            </w:r>
+            <w:r>
+              <w:rPr>
+                <w:sz w:val="20"/>
+              </w:rPr>
+              <w:t>17. Admin xác nhận xóa.</w:t>
+            </w:r>
+            <w:r>
+              <w:br/>
+            </w:r>
+            <w:r>
+              <w:rPr>
+                <w:sz w:val="20"/>
+              </w:rPr>
+              <w:t>18. Hệ thống kiểm tra nhân viên không đang xử lý order.</w:t>
+            </w:r>
+            <w:r>
+              <w:br/>
+            </w:r>
+            <w:r>
+              <w:rPr>
+                <w:sz w:val="20"/>
+              </w:rPr>
+              <w:t>19. Hệ thống chuyển trạng thái nhân viên thành "Đã nghỉ".</w:t>
+            </w:r>
+            <w:r>
+              <w:br/>
+            </w:r>
+            <w:r>
+              <w:rPr>
+                <w:sz w:val="20"/>
+              </w:rPr>
+              <w:t>20. Hệ thống hiển thị thông báo "Xóa nhân viên thành công!".</w:t>
+            </w:r>
+            <w:r>
+              <w:br/>
+            </w:r>
+            <w:r>
+              <w:rPr>
+                <w:rFonts w:ascii="Courier New" w:hAnsi="Courier New"/>
+                <w:sz w:val="16"/>
+              </w:rPr>
+              <w:t>Họ tên           | Vai trò | Chi nhánh          | Trạng thái</w:t>
+            </w:r>
+            <w:r>
+              <w:br/>
+            </w:r>
+            <w:r>
+              <w:rPr>
+                <w:rFonts w:ascii="Courier New" w:hAnsi="Courier New"/>
+                <w:sz w:val="16"/>
+              </w:rPr>
+              <w:t>-----------------+---------+--------------------+-----------</w:t>
+            </w:r>
+            <w:r>
+              <w:br/>
+            </w:r>
+            <w:r>
+              <w:rPr>
+                <w:rFonts w:ascii="Courier New" w:hAnsi="Courier New"/>
+                <w:sz w:val="16"/>
+              </w:rPr>
+              <w:t xml:space="preserve">Nguyễn Minh Tuấn | Lễ tân  | Karaoke Star - CN1 | Đang làm  </w:t>
+            </w:r>
+            <w:r>
+              <w:br/>
+            </w:r>
+            <w:r>
+              <w:rPr>
+                <w:rFonts w:ascii="Courier New" w:hAnsi="Courier New"/>
+                <w:sz w:val="16"/>
+              </w:rPr>
+              <w:t xml:space="preserve">Trần Thị Hương   | Phục vụ | Karaoke Star - CN2 | Đang làm  </w:t>
+            </w:r>
+            <w:r>
+              <w:br/>
+            </w:r>
+            <w:r>
+              <w:rPr>
+                <w:rFonts w:ascii="Courier New" w:hAnsi="Courier New"/>
+                <w:sz w:val="16"/>
+              </w:rPr>
+              <w:t xml:space="preserve">Lê Văn Khánh     | Quản lý | Karaoke Star - CN1 | Đang làm  </w:t>
+            </w:r>
+            <w:r>
+              <w:br/>
+            </w:r>
+          </w:p>
+        </w:tc>
+      </w:tr>
+      <w:tr>
+        <w:tc>
+          <w:tcPr>
+            <w:tcW w:type="dxa" w:w="2835"/>
+          </w:tcPr>
+          <w:p>
+            <w:pPr/>
+            <w:r/>
+            <w:r>
+              <w:rPr>
+                <w:b/>
+                <w:sz w:val="20"/>
+              </w:rPr>
+              <w:t>Ngoại lệ</w:t>
+            </w:r>
+          </w:p>
+        </w:tc>
+        <w:tc>
+          <w:tcPr>
+            <w:tcW w:type="dxa" w:w="6803"/>
+          </w:tcPr>
+          <w:p>
+            <w:pPr/>
+            <w:r/>
+            <w:r>
+              <w:rPr>
+                <w:sz w:val="20"/>
+              </w:rPr>
+              <w:t>7. Hệ thống phát hiện SĐT đã tồn tại.</w:t>
+            </w:r>
+            <w:r>
+              <w:br/>
+            </w:r>
+            <w:r>
+              <w:rPr>
+                <w:sz w:val="20"/>
+              </w:rPr>
+              <w:t>7.1 Hệ thống hiển thị thông báo "SĐT đã được sử dụng".</w:t>
+            </w:r>
+            <w:r>
+              <w:br/>
+            </w:r>
+            <w:r>
+              <w:rPr>
+                <w:sz w:val="20"/>
+              </w:rPr>
+              <w:t>7.2 Admin nhập lại SĐT khác (quay về Bước 6).</w:t>
+            </w:r>
+            <w:r>
+              <w:br/>
+            </w:r>
+            <w:r>
+              <w:rPr>
+                <w:sz w:val="20"/>
+              </w:rPr>
+              <w:t>18. Hệ thống phát hiện nhân viên đang xử lý order.</w:t>
+            </w:r>
+            <w:r>
+              <w:br/>
+            </w:r>
+            <w:r>
+              <w:rPr>
+                <w:sz w:val="20"/>
+              </w:rPr>
+              <w:t>18.1 Hệ thống hiển thị thông báo "Không thể xóa nhân viên đang xử lý order".</w:t>
+            </w:r>
+            <w:r>
+              <w:br/>
+            </w:r>
+            <w:r>
+              <w:rPr>
+                <w:sz w:val="20"/>
+              </w:rPr>
+              <w:t>18.2 Admin hủy thao tác xóa.</w:t>
             </w:r>
           </w:p>
         </w:tc>
@@ -4774,7 +5441,7 @@
     <w:p>
       <w:pPr/>
       <w:r>
-        <w:t>▪ Mật khẩu → thuộc tính của User (lưu dạng mã hóa bcrypt)</w:t>
+        <w:t>▪ Mật khẩu → thuộc tính của User (lưu dạng mã hóa)</w:t>
       </w:r>
     </w:p>
     <w:p>
@@ -4798,7 +5465,7 @@
     <w:p>
       <w:pPr/>
       <w:r>
-        <w:t>▪ Mã OTP → lớp OTP: maOTP, loai (DANG_KY/DOI_SDT), thoiHanHetHan, daXacMinh</w:t>
+        <w:t>▪ Mã OTP → lớp OTP: maOTP, loai, thoiHanHetHan, daXacMinh</w:t>
       </w:r>
     </w:p>
     <w:p>
@@ -4893,6 +5560,15 @@
       <w:pPr/>
       <w:r>
         <w:t>User gắn composition với OTP: một OTP không tồn tại độc lập nếu không có User tương ứng (khi xóa User thì xóa theo tất cả OTP). Tương tự, LoginSession không tồn tại độc lập khỏi User. Quan hệ với MembershipTier là aggregation: MembershipTier là dữ liệu danh mục tồn tại độc lập với User. Employee là lớp riêng biệt, không kế thừa từ User.</w:t>
+      </w:r>
+    </w:p>
+    <w:p>
+      <w:pPr/>
+      <w:r>
+        <w:rPr>
+          <w:b/>
+        </w:rPr>
+        <w:t>Biểu đồ thực thể Module Tài khoản &amp; Thành viên:</w:t>
       </w:r>
     </w:p>
     <w:p>
@@ -4948,13 +5624,13 @@
         <w:rPr>
           <w:b/>
         </w:rPr>
-        <w:t>Phân tích chi tiết chức năng "Đăng nhập" diễn ra như sau:</w:t>
+        <w:t>Phân tích chi tiết chức năng "Đăng nhập":</w:t>
       </w:r>
     </w:p>
     <w:p>
       <w:pPr/>
       <w:r>
-        <w:t xml:space="preserve">Người dùng truy cập trang đăng nhập → Đề xuất lớp </w:t>
+        <w:t xml:space="preserve">Người dùng truy cập trang đăng nhập -&gt; đề xuất lớp </w:t>
       </w:r>
       <w:r>
         <w:rPr>
@@ -4969,7 +5645,7 @@
     <w:p>
       <w:pPr/>
       <w:r>
-        <w:t xml:space="preserve">Người dùng nhập SĐT, mật khẩu và nhấn [Đăng nhập] → Hệ thống cần xác thực tài khoản → Cần chức năng </w:t>
+        <w:t xml:space="preserve">Người dùng nhập SĐT, mật khẩu và nhấn nút Đăng nhập -&gt; hệ thống cần xác thực tài khoản -&gt; cần chức năng </w:t>
       </w:r>
       <w:r>
         <w:rPr>
@@ -4994,13 +5670,19 @@
     <w:p>
       <w:pPr/>
       <w:r>
-        <w:t>Nếu tài khoản không tồn tại → Hệ thống hiển thị thông báo lỗi.</w:t>
+        <w:t>Nếu tài khoản không tồn tại -&gt; hệ thống hiển thị thông báo lỗi.</w:t>
       </w:r>
     </w:p>
     <w:p>
       <w:pPr/>
       <w:r>
-        <w:t>Nếu mật khẩu sai → Hệ thống hiển thị thông báo lỗi.</w:t>
+        <w:t>Nếu mật khẩu sai -&gt; hệ thống hiển thị thông báo lỗi.</w:t>
+      </w:r>
+    </w:p>
+    <w:p>
+      <w:pPr/>
+      <w:r>
+        <w:t>Hoàn tất, hệ thống tạo phiên đăng nhập và chuyển hướng trang chủ.</w:t>
       </w:r>
     </w:p>
     <w:p>
@@ -5025,6 +5707,495 @@
       </w:r>
       <w:r>
         <w:t xml:space="preserve"> User</w:t>
+      </w:r>
+    </w:p>
+    <w:p>
+      <w:pPr/>
+      <w:r>
+        <w:rPr>
+          <w:b/>
+        </w:rPr>
+        <w:t>Phân tích chi tiết chức năng "Đăng ký":</w:t>
+      </w:r>
+    </w:p>
+    <w:p>
+      <w:pPr/>
+      <w:r>
+        <w:t xml:space="preserve">Người dùng truy cập trang đăng ký -&gt; đề xuất lớp </w:t>
+      </w:r>
+      <w:r>
+        <w:rPr>
+          <w:b/>
+        </w:rPr>
+        <w:t>RegisterView</w:t>
+      </w:r>
+      <w:r>
+        <w:t>, có ô nhập Họ tên, SĐT, Email, Mật khẩu, Xác nhận MK, nút Tiếp tục.</w:t>
+      </w:r>
+    </w:p>
+    <w:p>
+      <w:pPr/>
+      <w:r>
+        <w:t xml:space="preserve">Người dùng nhập thông tin và nhấn nút Tiếp tục -&gt; hệ thống cần tạo tài khoản mới -&gt; cần chức năng </w:t>
+      </w:r>
+      <w:r>
+        <w:rPr>
+          <w:rFonts w:ascii="Courier New" w:hAnsi="Courier New"/>
+          <w:sz w:val="20"/>
+        </w:rPr>
+        <w:t>register()</w:t>
+      </w:r>
+      <w:r>
+        <w:t xml:space="preserve"> của đối tượng </w:t>
+      </w:r>
+      <w:r>
+        <w:rPr>
+          <w:b/>
+        </w:rPr>
+        <w:t>User</w:t>
+      </w:r>
+      <w:r>
+        <w:t>.</w:t>
+      </w:r>
+    </w:p>
+    <w:p>
+      <w:pPr/>
+      <w:r>
+        <w:t xml:space="preserve">Hệ thống gửi OTP đến SĐT -&gt; đề xuất lớp </w:t>
+      </w:r>
+      <w:r>
+        <w:rPr>
+          <w:b/>
+        </w:rPr>
+        <w:t>OTPVerifyView</w:t>
+      </w:r>
+      <w:r>
+        <w:t>, có ô nhập OTP, nút Xác nhận.</w:t>
+      </w:r>
+    </w:p>
+    <w:p>
+      <w:pPr/>
+      <w:r>
+        <w:t xml:space="preserve">Người dùng nhập OTP và nhấn nút Xác nhận -&gt; hệ thống cần xác minh OTP -&gt; cần chức năng </w:t>
+      </w:r>
+      <w:r>
+        <w:rPr>
+          <w:rFonts w:ascii="Courier New" w:hAnsi="Courier New"/>
+          <w:sz w:val="20"/>
+        </w:rPr>
+        <w:t>verifyOTP()</w:t>
+      </w:r>
+      <w:r>
+        <w:t xml:space="preserve"> của đối tượng </w:t>
+      </w:r>
+      <w:r>
+        <w:rPr>
+          <w:b/>
+        </w:rPr>
+        <w:t>OTP</w:t>
+      </w:r>
+      <w:r>
+        <w:t>.</w:t>
+      </w:r>
+    </w:p>
+    <w:p>
+      <w:pPr/>
+      <w:r>
+        <w:t>Hoàn tất, hệ thống tạo tài khoản mới và tự động đăng nhập.</w:t>
+      </w:r>
+    </w:p>
+    <w:p>
+      <w:pPr/>
+      <w:r>
+        <w:rPr>
+          <w:b/>
+        </w:rPr>
+        <w:t>Boundary:</w:t>
+      </w:r>
+      <w:r>
+        <w:t xml:space="preserve"> RegisterView, OTPVerifyView</w:t>
+      </w:r>
+    </w:p>
+    <w:p>
+      <w:pPr/>
+      <w:r>
+        <w:rPr>
+          <w:b/>
+        </w:rPr>
+        <w:t>Entity:</w:t>
+      </w:r>
+      <w:r>
+        <w:t xml:space="preserve"> User, OTP</w:t>
+      </w:r>
+    </w:p>
+    <w:p>
+      <w:pPr/>
+      <w:r>
+        <w:rPr>
+          <w:b/>
+        </w:rPr>
+        <w:t>Phân tích chi tiết chức năng "Đổi mật khẩu":</w:t>
+      </w:r>
+    </w:p>
+    <w:p>
+      <w:pPr/>
+      <w:r>
+        <w:t xml:space="preserve">Người dùng truy cập trang bảo mật -&gt; đề xuất lớp </w:t>
+      </w:r>
+      <w:r>
+        <w:rPr>
+          <w:b/>
+        </w:rPr>
+        <w:t>ChangePasswordView</w:t>
+      </w:r>
+      <w:r>
+        <w:t>, có ô nhập MK hiện tại, MK mới, Xác nhận MK mới, nút Lưu.</w:t>
+      </w:r>
+    </w:p>
+    <w:p>
+      <w:pPr/>
+      <w:r>
+        <w:t xml:space="preserve">Người dùng nhập MK hiện tại, MK mới và nhấn nút Lưu -&gt; hệ thống cần đổi mật khẩu -&gt; cần chức năng </w:t>
+      </w:r>
+      <w:r>
+        <w:rPr>
+          <w:rFonts w:ascii="Courier New" w:hAnsi="Courier New"/>
+          <w:sz w:val="20"/>
+        </w:rPr>
+        <w:t>changePassword()</w:t>
+      </w:r>
+      <w:r>
+        <w:t xml:space="preserve"> của đối tượng </w:t>
+      </w:r>
+      <w:r>
+        <w:rPr>
+          <w:b/>
+        </w:rPr>
+        <w:t>User</w:t>
+      </w:r>
+      <w:r>
+        <w:t>.</w:t>
+      </w:r>
+    </w:p>
+    <w:p>
+      <w:pPr/>
+      <w:r>
+        <w:t>Nếu MK hiện tại sai -&gt; hệ thống hiển thị thông báo lỗi.</w:t>
+      </w:r>
+    </w:p>
+    <w:p>
+      <w:pPr/>
+      <w:r>
+        <w:t>Nếu MK mới không hợp lệ -&gt; hệ thống hiển thị thông báo lỗi.</w:t>
+      </w:r>
+    </w:p>
+    <w:p>
+      <w:pPr/>
+      <w:r>
+        <w:t>Hoàn tất, hệ thống cập nhật mật khẩu mới và thu hồi tất cả phiên đăng nhập khác.</w:t>
+      </w:r>
+    </w:p>
+    <w:p>
+      <w:pPr/>
+      <w:r>
+        <w:rPr>
+          <w:b/>
+        </w:rPr>
+        <w:t>Boundary:</w:t>
+      </w:r>
+      <w:r>
+        <w:t xml:space="preserve"> ChangePasswordView</w:t>
+      </w:r>
+    </w:p>
+    <w:p>
+      <w:pPr/>
+      <w:r>
+        <w:rPr>
+          <w:b/>
+        </w:rPr>
+        <w:t>Entity:</w:t>
+      </w:r>
+      <w:r>
+        <w:t xml:space="preserve"> User</w:t>
+      </w:r>
+    </w:p>
+    <w:p>
+      <w:pPr/>
+      <w:r>
+        <w:rPr>
+          <w:b/>
+        </w:rPr>
+        <w:t>Phân tích chi tiết chức năng "Quản lý thông tin cá nhân":</w:t>
+      </w:r>
+    </w:p>
+    <w:p>
+      <w:pPr/>
+      <w:r>
+        <w:t xml:space="preserve">Người dùng nhấn vào ảnh đại diện -&gt; đề xuất lớp </w:t>
+      </w:r>
+      <w:r>
+        <w:rPr>
+          <w:b/>
+        </w:rPr>
+        <w:t>ProfileView</w:t>
+      </w:r>
+      <w:r>
+        <w:t>, có hiển thị Họ tên, SĐT, Email, Hạng hội viên, Điểm tích lũy, nút Chỉnh sửa.</w:t>
+      </w:r>
+    </w:p>
+    <w:p>
+      <w:pPr/>
+      <w:r>
+        <w:t xml:space="preserve">Hệ thống cần lấy thông tin hồ sơ -&gt; cần chức năng </w:t>
+      </w:r>
+      <w:r>
+        <w:rPr>
+          <w:rFonts w:ascii="Courier New" w:hAnsi="Courier New"/>
+          <w:sz w:val="20"/>
+        </w:rPr>
+        <w:t>getProfile()</w:t>
+      </w:r>
+      <w:r>
+        <w:t xml:space="preserve"> của đối tượng </w:t>
+      </w:r>
+      <w:r>
+        <w:rPr>
+          <w:b/>
+        </w:rPr>
+        <w:t>User</w:t>
+      </w:r>
+      <w:r>
+        <w:t>.</w:t>
+      </w:r>
+    </w:p>
+    <w:p>
+      <w:pPr/>
+      <w:r>
+        <w:t xml:space="preserve">Người dùng nhấn Chỉnh sửa, sửa thông tin và nhấn Lưu -&gt; hệ thống cần cập nhật hồ sơ -&gt; cần chức năng </w:t>
+      </w:r>
+      <w:r>
+        <w:rPr>
+          <w:rFonts w:ascii="Courier New" w:hAnsi="Courier New"/>
+          <w:sz w:val="20"/>
+        </w:rPr>
+        <w:t>updateProfile()</w:t>
+      </w:r>
+      <w:r>
+        <w:t xml:space="preserve"> của đối tượng </w:t>
+      </w:r>
+      <w:r>
+        <w:rPr>
+          <w:b/>
+        </w:rPr>
+        <w:t>User</w:t>
+      </w:r>
+      <w:r>
+        <w:t>.</w:t>
+      </w:r>
+    </w:p>
+    <w:p>
+      <w:pPr/>
+      <w:r>
+        <w:t>Nếu email không hợp lệ hoặc đã được dùng -&gt; hệ thống hiển thị thông báo lỗi.</w:t>
+      </w:r>
+    </w:p>
+    <w:p>
+      <w:pPr/>
+      <w:r>
+        <w:t>Hoàn tất, hệ thống cập nhật hồ sơ vào CSDL.</w:t>
+      </w:r>
+    </w:p>
+    <w:p>
+      <w:pPr/>
+      <w:r>
+        <w:rPr>
+          <w:b/>
+        </w:rPr>
+        <w:t>Boundary:</w:t>
+      </w:r>
+      <w:r>
+        <w:t xml:space="preserve"> ProfileView</w:t>
+      </w:r>
+    </w:p>
+    <w:p>
+      <w:pPr/>
+      <w:r>
+        <w:rPr>
+          <w:b/>
+        </w:rPr>
+        <w:t>Entity:</w:t>
+      </w:r>
+      <w:r>
+        <w:t xml:space="preserve"> User</w:t>
+      </w:r>
+    </w:p>
+    <w:p>
+      <w:pPr/>
+      <w:r>
+        <w:rPr>
+          <w:b/>
+        </w:rPr>
+        <w:t>Phân tích chi tiết chức năng "Quản lý nhân viên":</w:t>
+      </w:r>
+    </w:p>
+    <w:p>
+      <w:pPr/>
+      <w:r>
+        <w:t xml:space="preserve">Admin truy cập trang quản lý nhân viên -&gt; đề xuất lớp </w:t>
+      </w:r>
+      <w:r>
+        <w:rPr>
+          <w:b/>
+        </w:rPr>
+        <w:t>StaffManageView</w:t>
+      </w:r>
+      <w:r>
+        <w:t>, có bảng danh sách nhân viên, nút Thêm, Sửa, Xóa.</w:t>
+      </w:r>
+    </w:p>
+    <w:p>
+      <w:pPr/>
+      <w:r>
+        <w:t xml:space="preserve">Hệ thống cần tải danh sách nhân viên -&gt; cần chức năng </w:t>
+      </w:r>
+      <w:r>
+        <w:rPr>
+          <w:rFonts w:ascii="Courier New" w:hAnsi="Courier New"/>
+          <w:sz w:val="20"/>
+        </w:rPr>
+        <w:t>getAllStaff()</w:t>
+      </w:r>
+      <w:r>
+        <w:t xml:space="preserve"> của đối tượng </w:t>
+      </w:r>
+      <w:r>
+        <w:rPr>
+          <w:b/>
+        </w:rPr>
+        <w:t>Employee</w:t>
+      </w:r>
+      <w:r>
+        <w:t>.</w:t>
+      </w:r>
+    </w:p>
+    <w:p>
+      <w:pPr/>
+      <w:r>
+        <w:t xml:space="preserve">Admin nhấn Thêm, nhập thông tin và nhấn Lưu -&gt; hệ thống cần tạo nhân viên mới -&gt; cần chức năng </w:t>
+      </w:r>
+      <w:r>
+        <w:rPr>
+          <w:rFonts w:ascii="Courier New" w:hAnsi="Courier New"/>
+          <w:sz w:val="20"/>
+        </w:rPr>
+        <w:t>addStaff()</w:t>
+      </w:r>
+      <w:r>
+        <w:t xml:space="preserve"> của đối tượng </w:t>
+      </w:r>
+      <w:r>
+        <w:rPr>
+          <w:b/>
+        </w:rPr>
+        <w:t>Employee</w:t>
+      </w:r>
+      <w:r>
+        <w:t>.</w:t>
+      </w:r>
+    </w:p>
+    <w:p>
+      <w:pPr/>
+      <w:r>
+        <w:t xml:space="preserve">Admin nhấn Sửa trên một dòng, cập nhật và nhấn Lưu -&gt; hệ thống cần cập nhật nhân viên -&gt; cần chức năng </w:t>
+      </w:r>
+      <w:r>
+        <w:rPr>
+          <w:rFonts w:ascii="Courier New" w:hAnsi="Courier New"/>
+          <w:sz w:val="20"/>
+        </w:rPr>
+        <w:t>updateStaff()</w:t>
+      </w:r>
+      <w:r>
+        <w:t xml:space="preserve"> của đối tượng </w:t>
+      </w:r>
+      <w:r>
+        <w:rPr>
+          <w:b/>
+        </w:rPr>
+        <w:t>Employee</w:t>
+      </w:r>
+      <w:r>
+        <w:t>.</w:t>
+      </w:r>
+    </w:p>
+    <w:p>
+      <w:pPr/>
+      <w:r>
+        <w:t xml:space="preserve">Admin nhấn Xóa trên một dòng, xác nhận -&gt; hệ thống cần xóa nhân viên -&gt; cần chức năng </w:t>
+      </w:r>
+      <w:r>
+        <w:rPr>
+          <w:rFonts w:ascii="Courier New" w:hAnsi="Courier New"/>
+          <w:sz w:val="20"/>
+        </w:rPr>
+        <w:t>deleteStaff()</w:t>
+      </w:r>
+      <w:r>
+        <w:t xml:space="preserve"> của đối tượng </w:t>
+      </w:r>
+      <w:r>
+        <w:rPr>
+          <w:b/>
+        </w:rPr>
+        <w:t>Employee</w:t>
+      </w:r>
+      <w:r>
+        <w:t>.</w:t>
+      </w:r>
+    </w:p>
+    <w:p>
+      <w:pPr/>
+      <w:r>
+        <w:t>Nếu nhân viên đang xử lý order -&gt; hệ thống hiển thị thông báo lỗi.</w:t>
+      </w:r>
+    </w:p>
+    <w:p>
+      <w:pPr/>
+      <w:r>
+        <w:t>Hoàn tất, hệ thống cập nhật danh sách nhân viên.</w:t>
+      </w:r>
+    </w:p>
+    <w:p>
+      <w:pPr/>
+      <w:r>
+        <w:rPr>
+          <w:b/>
+        </w:rPr>
+        <w:t>Boundary:</w:t>
+      </w:r>
+      <w:r>
+        <w:t xml:space="preserve"> StaffManageView</w:t>
+      </w:r>
+    </w:p>
+    <w:p>
+      <w:pPr/>
+      <w:r>
+        <w:rPr>
+          <w:b/>
+        </w:rPr>
+        <w:t>Entity:</w:t>
+      </w:r>
+      <w:r>
+        <w:t xml:space="preserve"> Employee</w:t>
+      </w:r>
+    </w:p>
+    <w:p>
+      <w:pPr/>
+      <w:r>
+        <w:rPr>
+          <w:b/>
+        </w:rPr>
+        <w:t>Sơ đồ lớp phân tích – Module Tài khoản &amp; Thành viên:</w:t>
       </w:r>
     </w:p>
     <w:p>
@@ -5034,7 +6205,7 @@
       <w:r>
         <w:drawing>
           <wp:inline xmlns:a="http://schemas.openxmlformats.org/drawingml/2006/main" xmlns:pic="http://schemas.openxmlformats.org/drawingml/2006/picture">
-            <wp:extent cx="5486400" cy="5634681"/>
+            <wp:extent cx="5486400" cy="8183880"/>
             <wp:docPr id="8" name="Picture 8"/>
             <wp:cNvGraphicFramePr>
               <a:graphicFrameLocks noChangeAspect="1"/>
@@ -5043,7 +6214,7 @@
               <a:graphicData uri="http://schemas.openxmlformats.org/drawingml/2006/picture">
                 <pic:pic>
                   <pic:nvPicPr>
-                    <pic:cNvPr id="0" name="account_bce_login.png"/>
+                    <pic:cNvPr id="0" name="account_class_analysis.png"/>
                     <pic:cNvPicPr/>
                   </pic:nvPicPr>
                   <pic:blipFill>
@@ -5055,7 +6226,7 @@
                   <pic:spPr>
                     <a:xfrm>
                       <a:off x="0" y="0"/>
-                      <a:ext cx="5486400" cy="5634681"/>
+                      <a:ext cx="5486400" cy="8183880"/>
                     </a:xfrm>
                     <a:prstGeom prst="rect"/>
                   </pic:spPr>
@@ -5067,116 +6238,19 @@
       </w:r>
     </w:p>
     <w:p>
-      <w:pPr/>
-      <w:r>
-        <w:rPr>
-          <w:b/>
-        </w:rPr>
-        <w:t>Phân tích chi tiết chức năng "Đăng ký" diễn ra như sau:</w:t>
+      <w:pPr>
+        <w:pStyle w:val="Heading2"/>
+      </w:pPr>
+      <w:r>
+        <w:t>4. Biểu đồ tuần tự phân tích</w:t>
       </w:r>
     </w:p>
     <w:p>
-      <w:pPr/>
-      <w:r>
-        <w:t xml:space="preserve">Người dùng truy cập trang đăng ký → Đề xuất lớp </w:t>
-      </w:r>
-      <w:r>
-        <w:rPr>
-          <w:b/>
-        </w:rPr>
-        <w:t>RegisterView</w:t>
-      </w:r>
-      <w:r>
-        <w:t>, có ô nhập Họ tên, SĐT, Email, Mật khẩu, Xác nhận MK, nút Tiếp tục.</w:t>
-      </w:r>
-    </w:p>
-    <w:p>
-      <w:pPr/>
-      <w:r>
-        <w:t xml:space="preserve">Người dùng nhập thông tin và nhấn [Tiếp tục] → Hệ thống cần tạo tài khoản mới → Cần chức năng </w:t>
-      </w:r>
-      <w:r>
-        <w:rPr>
-          <w:rFonts w:ascii="Courier New" w:hAnsi="Courier New"/>
-          <w:sz w:val="20"/>
-        </w:rPr>
-        <w:t>register()</w:t>
-      </w:r>
-      <w:r>
-        <w:t xml:space="preserve"> của đối tượng </w:t>
-      </w:r>
-      <w:r>
-        <w:rPr>
-          <w:b/>
-        </w:rPr>
-        <w:t>User</w:t>
-      </w:r>
-      <w:r>
-        <w:t>.</w:t>
-      </w:r>
-    </w:p>
-    <w:p>
-      <w:pPr/>
-      <w:r>
-        <w:t xml:space="preserve">Hệ thống gửi OTP đến SĐT → Đề xuất lớp </w:t>
-      </w:r>
-      <w:r>
-        <w:rPr>
-          <w:b/>
-        </w:rPr>
-        <w:t>OTPVerifyView</w:t>
-      </w:r>
-      <w:r>
-        <w:t>, có ô nhập OTP, nút Xác nhận.</w:t>
-      </w:r>
-    </w:p>
-    <w:p>
-      <w:pPr/>
-      <w:r>
-        <w:t xml:space="preserve">Người dùng nhập OTP và nhấn [Xác nhận] → Hệ thống cần xác minh OTP → Cần chức năng </w:t>
-      </w:r>
-      <w:r>
-        <w:rPr>
-          <w:rFonts w:ascii="Courier New" w:hAnsi="Courier New"/>
-          <w:sz w:val="20"/>
-        </w:rPr>
-        <w:t>verifyOTP()</w:t>
-      </w:r>
-      <w:r>
-        <w:t xml:space="preserve"> của đối tượng </w:t>
-      </w:r>
-      <w:r>
-        <w:rPr>
-          <w:b/>
-        </w:rPr>
-        <w:t>OTP</w:t>
-      </w:r>
-      <w:r>
-        <w:t>.</w:t>
-      </w:r>
-    </w:p>
-    <w:p>
-      <w:pPr/>
-      <w:r>
-        <w:rPr>
-          <w:b/>
-        </w:rPr>
-        <w:t>Boundary:</w:t>
-      </w:r>
-      <w:r>
-        <w:t xml:space="preserve"> RegisterView, OTPVerifyView</w:t>
-      </w:r>
-    </w:p>
-    <w:p>
-      <w:pPr/>
-      <w:r>
-        <w:rPr>
-          <w:b/>
-        </w:rPr>
-        <w:t>Entity:</w:t>
-      </w:r>
-      <w:r>
-        <w:t xml:space="preserve"> User, OTP</w:t>
+      <w:pPr>
+        <w:pStyle w:val="Heading3"/>
+      </w:pPr>
+      <w:r>
+        <w:t>UC01 – Đăng nhập</w:t>
       </w:r>
     </w:p>
     <w:p>
@@ -5186,455 +6260,8 @@
       <w:r>
         <w:drawing>
           <wp:inline xmlns:a="http://schemas.openxmlformats.org/drawingml/2006/main" xmlns:pic="http://schemas.openxmlformats.org/drawingml/2006/picture">
-            <wp:extent cx="5486400" cy="3708483"/>
+            <wp:extent cx="5486400" cy="4839991"/>
             <wp:docPr id="9" name="Picture 9"/>
-            <wp:cNvGraphicFramePr>
-              <a:graphicFrameLocks noChangeAspect="1"/>
-            </wp:cNvGraphicFramePr>
-            <a:graphic>
-              <a:graphicData uri="http://schemas.openxmlformats.org/drawingml/2006/picture">
-                <pic:pic>
-                  <pic:nvPicPr>
-                    <pic:cNvPr id="0" name="account_bce_register.png"/>
-                    <pic:cNvPicPr/>
-                  </pic:nvPicPr>
-                  <pic:blipFill>
-                    <a:blip r:embed="rId17"/>
-                    <a:stretch>
-                      <a:fillRect/>
-                    </a:stretch>
-                  </pic:blipFill>
-                  <pic:spPr>
-                    <a:xfrm>
-                      <a:off x="0" y="0"/>
-                      <a:ext cx="5486400" cy="3708483"/>
-                    </a:xfrm>
-                    <a:prstGeom prst="rect"/>
-                  </pic:spPr>
-                </pic:pic>
-              </a:graphicData>
-            </a:graphic>
-          </wp:inline>
-        </w:drawing>
-      </w:r>
-    </w:p>
-    <w:p>
-      <w:pPr/>
-      <w:r>
-        <w:rPr>
-          <w:b/>
-        </w:rPr>
-        <w:t>Phân tích chi tiết chức năng "Đổi mật khẩu" diễn ra như sau:</w:t>
-      </w:r>
-    </w:p>
-    <w:p>
-      <w:pPr/>
-      <w:r>
-        <w:t xml:space="preserve">Người dùng truy cập trang bảo mật → Đề xuất lớp </w:t>
-      </w:r>
-      <w:r>
-        <w:rPr>
-          <w:b/>
-        </w:rPr>
-        <w:t>ChangePasswordView</w:t>
-      </w:r>
-      <w:r>
-        <w:t>, có ô nhập MK hiện tại, MK mới, Xác nhận MK mới, nút Lưu.</w:t>
-      </w:r>
-    </w:p>
-    <w:p>
-      <w:pPr/>
-      <w:r>
-        <w:t xml:space="preserve">Người dùng nhập MK hiện tại, MK mới và nhấn [Lưu] → Hệ thống cần đổi mật khẩu → Cần chức năng </w:t>
-      </w:r>
-      <w:r>
-        <w:rPr>
-          <w:rFonts w:ascii="Courier New" w:hAnsi="Courier New"/>
-          <w:sz w:val="20"/>
-        </w:rPr>
-        <w:t>changePassword()</w:t>
-      </w:r>
-      <w:r>
-        <w:t xml:space="preserve"> của đối tượng </w:t>
-      </w:r>
-      <w:r>
-        <w:rPr>
-          <w:b/>
-        </w:rPr>
-        <w:t>User</w:t>
-      </w:r>
-      <w:r>
-        <w:t>.</w:t>
-      </w:r>
-    </w:p>
-    <w:p>
-      <w:pPr/>
-      <w:r>
-        <w:t>Nếu MK hiện tại sai → Hệ thống hiển thị thông báo lỗi.</w:t>
-      </w:r>
-    </w:p>
-    <w:p>
-      <w:pPr/>
-      <w:r>
-        <w:rPr>
-          <w:b/>
-        </w:rPr>
-        <w:t>Boundary:</w:t>
-      </w:r>
-      <w:r>
-        <w:t xml:space="preserve"> ChangePasswordView</w:t>
-      </w:r>
-    </w:p>
-    <w:p>
-      <w:pPr/>
-      <w:r>
-        <w:rPr>
-          <w:b/>
-        </w:rPr>
-        <w:t>Entity:</w:t>
-      </w:r>
-      <w:r>
-        <w:t xml:space="preserve"> User</w:t>
-      </w:r>
-    </w:p>
-    <w:p>
-      <w:pPr>
-        <w:jc w:val="center"/>
-      </w:pPr>
-      <w:r>
-        <w:drawing>
-          <wp:inline xmlns:a="http://schemas.openxmlformats.org/drawingml/2006/main" xmlns:pic="http://schemas.openxmlformats.org/drawingml/2006/picture">
-            <wp:extent cx="5486400" cy="5825905"/>
-            <wp:docPr id="10" name="Picture 10"/>
-            <wp:cNvGraphicFramePr>
-              <a:graphicFrameLocks noChangeAspect="1"/>
-            </wp:cNvGraphicFramePr>
-            <a:graphic>
-              <a:graphicData uri="http://schemas.openxmlformats.org/drawingml/2006/picture">
-                <pic:pic>
-                  <pic:nvPicPr>
-                    <pic:cNvPr id="0" name="account_bce_changepw.png"/>
-                    <pic:cNvPicPr/>
-                  </pic:nvPicPr>
-                  <pic:blipFill>
-                    <a:blip r:embed="rId18"/>
-                    <a:stretch>
-                      <a:fillRect/>
-                    </a:stretch>
-                  </pic:blipFill>
-                  <pic:spPr>
-                    <a:xfrm>
-                      <a:off x="0" y="0"/>
-                      <a:ext cx="5486400" cy="5825905"/>
-                    </a:xfrm>
-                    <a:prstGeom prst="rect"/>
-                  </pic:spPr>
-                </pic:pic>
-              </a:graphicData>
-            </a:graphic>
-          </wp:inline>
-        </w:drawing>
-      </w:r>
-    </w:p>
-    <w:p>
-      <w:pPr/>
-      <w:r>
-        <w:rPr>
-          <w:b/>
-        </w:rPr>
-        <w:t>Phân tích chi tiết chức năng "Quản lý thông tin cá nhân" diễn ra như sau:</w:t>
-      </w:r>
-    </w:p>
-    <w:p>
-      <w:pPr/>
-      <w:r>
-        <w:t xml:space="preserve">Người dùng nhấn vào ảnh đại diện → Đề xuất lớp </w:t>
-      </w:r>
-      <w:r>
-        <w:rPr>
-          <w:b/>
-        </w:rPr>
-        <w:t>ProfileView</w:t>
-      </w:r>
-      <w:r>
-        <w:t>, có hiển thị Họ tên, SĐT, Email, Hạng hội viên, Điểm tích lũy, nút Chỉnh sửa.</w:t>
-      </w:r>
-    </w:p>
-    <w:p>
-      <w:pPr/>
-      <w:r>
-        <w:t xml:space="preserve">Hệ thống cần lấy thông tin hồ sơ → Cần chức năng </w:t>
-      </w:r>
-      <w:r>
-        <w:rPr>
-          <w:rFonts w:ascii="Courier New" w:hAnsi="Courier New"/>
-          <w:sz w:val="20"/>
-        </w:rPr>
-        <w:t>getProfile()</w:t>
-      </w:r>
-      <w:r>
-        <w:t xml:space="preserve"> của đối tượng </w:t>
-      </w:r>
-      <w:r>
-        <w:rPr>
-          <w:b/>
-        </w:rPr>
-        <w:t>User</w:t>
-      </w:r>
-      <w:r>
-        <w:t>.</w:t>
-      </w:r>
-    </w:p>
-    <w:p>
-      <w:pPr/>
-      <w:r>
-        <w:t xml:space="preserve">Người dùng nhấn [Chỉnh sửa], sửa thông tin và nhấn [Lưu] → Hệ thống cần cập nhật hồ sơ → Cần chức năng </w:t>
-      </w:r>
-      <w:r>
-        <w:rPr>
-          <w:rFonts w:ascii="Courier New" w:hAnsi="Courier New"/>
-          <w:sz w:val="20"/>
-        </w:rPr>
-        <w:t>updateProfile()</w:t>
-      </w:r>
-      <w:r>
-        <w:t xml:space="preserve"> của đối tượng </w:t>
-      </w:r>
-      <w:r>
-        <w:rPr>
-          <w:b/>
-        </w:rPr>
-        <w:t>User</w:t>
-      </w:r>
-      <w:r>
-        <w:t>.</w:t>
-      </w:r>
-    </w:p>
-    <w:p>
-      <w:pPr/>
-      <w:r>
-        <w:rPr>
-          <w:b/>
-        </w:rPr>
-        <w:t>Boundary:</w:t>
-      </w:r>
-      <w:r>
-        <w:t xml:space="preserve"> ProfileView</w:t>
-      </w:r>
-    </w:p>
-    <w:p>
-      <w:pPr/>
-      <w:r>
-        <w:rPr>
-          <w:b/>
-        </w:rPr>
-        <w:t>Entity:</w:t>
-      </w:r>
-      <w:r>
-        <w:t xml:space="preserve"> User</w:t>
-      </w:r>
-    </w:p>
-    <w:p>
-      <w:pPr>
-        <w:jc w:val="center"/>
-      </w:pPr>
-      <w:r>
-        <w:drawing>
-          <wp:inline xmlns:a="http://schemas.openxmlformats.org/drawingml/2006/main" xmlns:pic="http://schemas.openxmlformats.org/drawingml/2006/picture">
-            <wp:extent cx="5486400" cy="5750973"/>
-            <wp:docPr id="11" name="Picture 11"/>
-            <wp:cNvGraphicFramePr>
-              <a:graphicFrameLocks noChangeAspect="1"/>
-            </wp:cNvGraphicFramePr>
-            <a:graphic>
-              <a:graphicData uri="http://schemas.openxmlformats.org/drawingml/2006/picture">
-                <pic:pic>
-                  <pic:nvPicPr>
-                    <pic:cNvPr id="0" name="account_bce_profile.png"/>
-                    <pic:cNvPicPr/>
-                  </pic:nvPicPr>
-                  <pic:blipFill>
-                    <a:blip r:embed="rId19"/>
-                    <a:stretch>
-                      <a:fillRect/>
-                    </a:stretch>
-                  </pic:blipFill>
-                  <pic:spPr>
-                    <a:xfrm>
-                      <a:off x="0" y="0"/>
-                      <a:ext cx="5486400" cy="5750973"/>
-                    </a:xfrm>
-                    <a:prstGeom prst="rect"/>
-                  </pic:spPr>
-                </pic:pic>
-              </a:graphicData>
-            </a:graphic>
-          </wp:inline>
-        </w:drawing>
-      </w:r>
-    </w:p>
-    <w:p>
-      <w:pPr/>
-      <w:r>
-        <w:rPr>
-          <w:b/>
-        </w:rPr>
-        <w:t>Phân tích chi tiết chức năng "Quản lý nhân viên" diễn ra như sau:</w:t>
-      </w:r>
-    </w:p>
-    <w:p>
-      <w:pPr/>
-      <w:r>
-        <w:t xml:space="preserve">Admin truy cập trang quản lý nhân viên → Đề xuất lớp </w:t>
-      </w:r>
-      <w:r>
-        <w:rPr>
-          <w:b/>
-        </w:rPr>
-        <w:t>StaffManageView</w:t>
-      </w:r>
-      <w:r>
-        <w:t>, có bảng danh sách nhân viên, nút Thêm, Sửa, Xóa.</w:t>
-      </w:r>
-    </w:p>
-    <w:p>
-      <w:pPr/>
-      <w:r>
-        <w:t xml:space="preserve">Hệ thống cần tải danh sách nhân viên → Cần chức năng </w:t>
-      </w:r>
-      <w:r>
-        <w:rPr>
-          <w:rFonts w:ascii="Courier New" w:hAnsi="Courier New"/>
-          <w:sz w:val="20"/>
-        </w:rPr>
-        <w:t>getAllStaff()</w:t>
-      </w:r>
-      <w:r>
-        <w:t xml:space="preserve"> của đối tượng </w:t>
-      </w:r>
-      <w:r>
-        <w:rPr>
-          <w:b/>
-        </w:rPr>
-        <w:t>Employee</w:t>
-      </w:r>
-      <w:r>
-        <w:t>.</w:t>
-      </w:r>
-    </w:p>
-    <w:p>
-      <w:pPr/>
-      <w:r>
-        <w:t xml:space="preserve">Admin nhấn [Thêm], nhập thông tin và nhấn [Lưu] → Hệ thống cần tạo nhân viên mới → Cần chức năng </w:t>
-      </w:r>
-      <w:r>
-        <w:rPr>
-          <w:rFonts w:ascii="Courier New" w:hAnsi="Courier New"/>
-          <w:sz w:val="20"/>
-        </w:rPr>
-        <w:t>addStaff()</w:t>
-      </w:r>
-      <w:r>
-        <w:t xml:space="preserve"> của đối tượng </w:t>
-      </w:r>
-      <w:r>
-        <w:rPr>
-          <w:b/>
-        </w:rPr>
-        <w:t>Employee</w:t>
-      </w:r>
-      <w:r>
-        <w:t>.</w:t>
-      </w:r>
-    </w:p>
-    <w:p>
-      <w:pPr/>
-      <w:r>
-        <w:rPr>
-          <w:b/>
-        </w:rPr>
-        <w:t>Boundary:</w:t>
-      </w:r>
-      <w:r>
-        <w:t xml:space="preserve"> StaffManageView</w:t>
-      </w:r>
-    </w:p>
-    <w:p>
-      <w:pPr/>
-      <w:r>
-        <w:rPr>
-          <w:b/>
-        </w:rPr>
-        <w:t>Entity:</w:t>
-      </w:r>
-      <w:r>
-        <w:t xml:space="preserve"> Employee</w:t>
-      </w:r>
-    </w:p>
-    <w:p>
-      <w:pPr>
-        <w:jc w:val="center"/>
-      </w:pPr>
-      <w:r>
-        <w:drawing>
-          <wp:inline xmlns:a="http://schemas.openxmlformats.org/drawingml/2006/main" xmlns:pic="http://schemas.openxmlformats.org/drawingml/2006/picture">
-            <wp:extent cx="5486400" cy="6361258"/>
-            <wp:docPr id="12" name="Picture 12"/>
-            <wp:cNvGraphicFramePr>
-              <a:graphicFrameLocks noChangeAspect="1"/>
-            </wp:cNvGraphicFramePr>
-            <a:graphic>
-              <a:graphicData uri="http://schemas.openxmlformats.org/drawingml/2006/picture">
-                <pic:pic>
-                  <pic:nvPicPr>
-                    <pic:cNvPr id="0" name="account_bce_staff.png"/>
-                    <pic:cNvPicPr/>
-                  </pic:nvPicPr>
-                  <pic:blipFill>
-                    <a:blip r:embed="rId20"/>
-                    <a:stretch>
-                      <a:fillRect/>
-                    </a:stretch>
-                  </pic:blipFill>
-                  <pic:spPr>
-                    <a:xfrm>
-                      <a:off x="0" y="0"/>
-                      <a:ext cx="5486400" cy="6361258"/>
-                    </a:xfrm>
-                    <a:prstGeom prst="rect"/>
-                  </pic:spPr>
-                </pic:pic>
-              </a:graphicData>
-            </a:graphic>
-          </wp:inline>
-        </w:drawing>
-      </w:r>
-    </w:p>
-    <w:p>
-      <w:pPr>
-        <w:pStyle w:val="Heading2"/>
-      </w:pPr>
-      <w:r>
-        <w:t>4. Biểu đồ tuần tự phân tích</w:t>
-      </w:r>
-    </w:p>
-    <w:p>
-      <w:pPr>
-        <w:pStyle w:val="Heading3"/>
-      </w:pPr>
-      <w:r>
-        <w:t>UC01 – Đăng nhập</w:t>
-      </w:r>
-    </w:p>
-    <w:p>
-      <w:pPr>
-        <w:jc w:val="center"/>
-      </w:pPr>
-      <w:r>
-        <w:drawing>
-          <wp:inline xmlns:a="http://schemas.openxmlformats.org/drawingml/2006/main" xmlns:pic="http://schemas.openxmlformats.org/drawingml/2006/picture">
-            <wp:extent cx="5486400" cy="4839991"/>
-            <wp:docPr id="13" name="Picture 13"/>
             <wp:cNvGraphicFramePr>
               <a:graphicFrameLocks noChangeAspect="1"/>
             </wp:cNvGraphicFramePr>
@@ -5646,7 +6273,7 @@
                     <pic:cNvPicPr/>
                   </pic:nvPicPr>
                   <pic:blipFill>
-                    <a:blip r:embed="rId21"/>
+                    <a:blip r:embed="rId17"/>
                     <a:stretch>
                       <a:fillRect/>
                     </a:stretch>
@@ -5683,13 +6310,13 @@
     <w:p>
       <w:pPr/>
       <w:r>
-        <w:t>1. Khách hàng truy cập trang đăng nhập.</w:t>
+        <w:t>1. Khách hàng truy cập chức năng Đăng nhập.</w:t>
       </w:r>
     </w:p>
     <w:p>
       <w:pPr/>
       <w:r>
-        <w:t>2. Lớp LoginView hiển thị form gồm ô nhập SĐT, ô nhập Mật khẩu, nút [Đăng nhập].</w:t>
+        <w:t>2. Lớp LoginView hiển thị giao diện yêu cầu nhập thông tin đăng nhập.</w:t>
       </w:r>
     </w:p>
     <w:p>
@@ -5701,7 +6328,7 @@
     <w:p>
       <w:pPr/>
       <w:r>
-        <w:t>4. Khách hàng nhấn nút [Đăng nhập].</w:t>
+        <w:t>4. Khách hàng nhấn nút Đăng nhập.</w:t>
       </w:r>
     </w:p>
     <w:p>
@@ -5780,7 +6407,7 @@
         <w:drawing>
           <wp:inline xmlns:a="http://schemas.openxmlformats.org/drawingml/2006/main" xmlns:pic="http://schemas.openxmlformats.org/drawingml/2006/picture">
             <wp:extent cx="5486400" cy="5711526"/>
-            <wp:docPr id="14" name="Picture 14"/>
+            <wp:docPr id="10" name="Picture 10"/>
             <wp:cNvGraphicFramePr>
               <a:graphicFrameLocks noChangeAspect="1"/>
             </wp:cNvGraphicFramePr>
@@ -5792,7 +6419,7 @@
                     <pic:cNvPicPr/>
                   </pic:nvPicPr>
                   <pic:blipFill>
-                    <a:blip r:embed="rId22"/>
+                    <a:blip r:embed="rId18"/>
                     <a:stretch>
                       <a:fillRect/>
                     </a:stretch>
@@ -5829,25 +6456,25 @@
     <w:p>
       <w:pPr/>
       <w:r>
-        <w:t>1. Khách hàng nhấn liên kết "Đăng ký" từ màn hình đăng nhập.</w:t>
+        <w:t>1. Khách hàng chọn chức năng Đăng ký từ giao diện đăng nhập.</w:t>
       </w:r>
     </w:p>
     <w:p>
       <w:pPr/>
       <w:r>
-        <w:t>2. Lớp RegisterView hiển thị form gồm: Họ tên, SĐT, Email, Mật khẩu, Xác nhận MK.</w:t>
+        <w:t>2. Lớp RegisterView hiển thị giao diện yêu cầu nhập thông tin đăng ký.</w:t>
       </w:r>
     </w:p>
     <w:p>
       <w:pPr/>
       <w:r>
-        <w:t>3. Khách hàng nhập Họ tên, SĐT, Email và Mật khẩu.</w:t>
+        <w:t>3. Khách hàng nhập Họ tên, SĐT, Email, Mật khẩu, Xác nhận mật khẩu.</w:t>
       </w:r>
     </w:p>
     <w:p>
       <w:pPr/>
       <w:r>
-        <w:t>4. Khách hàng nhấn nút [Tiếp tục].</w:t>
+        <w:t>4. Khách hàng nhấn nút Tiếp tục.</w:t>
       </w:r>
     </w:p>
     <w:p>
@@ -5895,7 +6522,7 @@
         <w:t>existsByEmail()</w:t>
       </w:r>
       <w:r>
-        <w:t xml:space="preserve"> để kiểm tra email chưa tồn tại.</w:t>
+        <w:t xml:space="preserve"> để kiểm tra Email chưa tồn tại.</w:t>
       </w:r>
     </w:p>
     <w:p>
@@ -5923,13 +6550,13 @@
     <w:p>
       <w:pPr/>
       <w:r>
-        <w:t>10. Lớp RegisterView hiển thị form xác nhận OTP.</w:t>
+        <w:t>10. Lớp RegisterView hiển thị giao diện xác nhận OTP.</w:t>
       </w:r>
     </w:p>
     <w:p>
       <w:pPr/>
       <w:r>
-        <w:t>11. Khách hàng nhập mã OTP và nhấn nút [Xác nhận].</w:t>
+        <w:t>11. Khách hàng nhập mã OTP và nhấn nút Xác nhận.</w:t>
       </w:r>
     </w:p>
     <w:p>
@@ -6002,7 +6629,7 @@
         <w:drawing>
           <wp:inline xmlns:a="http://schemas.openxmlformats.org/drawingml/2006/main" xmlns:pic="http://schemas.openxmlformats.org/drawingml/2006/picture">
             <wp:extent cx="5486400" cy="4881669"/>
-            <wp:docPr id="15" name="Picture 15"/>
+            <wp:docPr id="11" name="Picture 11"/>
             <wp:cNvGraphicFramePr>
               <a:graphicFrameLocks noChangeAspect="1"/>
             </wp:cNvGraphicFramePr>
@@ -6014,7 +6641,7 @@
                     <pic:cNvPicPr/>
                   </pic:nvPicPr>
                   <pic:blipFill>
-                    <a:blip r:embed="rId23"/>
+                    <a:blip r:embed="rId19"/>
                     <a:stretch>
                       <a:fillRect/>
                     </a:stretch>
@@ -6051,25 +6678,25 @@
     <w:p>
       <w:pPr/>
       <w:r>
-        <w:t>1. Người dùng truy cập mục "Bảo mật" trong cài đặt.</w:t>
+        <w:t>1. Người dùng truy cập chức năng Đổi mật khẩu.</w:t>
       </w:r>
     </w:p>
     <w:p>
       <w:pPr/>
       <w:r>
-        <w:t>2. Lớp ChangePasswordView hiển thị form gồm: Mật khẩu hiện tại, Mật khẩu mới, Xác nhận mật khẩu mới.</w:t>
+        <w:t>2. Lớp ChangePasswordView hiển thị giao diện yêu cầu nhập mật khẩu hiện tại và mật khẩu mới.</w:t>
       </w:r>
     </w:p>
     <w:p>
       <w:pPr/>
       <w:r>
-        <w:t>3. Người dùng nhập Mật khẩu hiện tại, Mật khẩu mới và Xác nhận mật khẩu mới.</w:t>
+        <w:t>3. Người dùng nhập Mật khẩu hiện tại, Mật khẩu mới, Xác nhận mật khẩu mới.</w:t>
       </w:r>
     </w:p>
     <w:p>
       <w:pPr/>
       <w:r>
-        <w:t>4. Người dùng nhấn nút [Lưu thay đổi].</w:t>
+        <w:t>4. Người dùng nhấn nút Lưu thay đổi.</w:t>
       </w:r>
     </w:p>
     <w:p>
@@ -6165,7 +6792,7 @@
         <w:t>revokeAllSessions()</w:t>
       </w:r>
       <w:r>
-        <w:t xml:space="preserve"> để thu hồi tất cả session.</w:t>
+        <w:t xml:space="preserve"> để thu hồi tất cả phiên đăng nhập khác.</w:t>
       </w:r>
     </w:p>
     <w:p>
@@ -6196,7 +6823,7 @@
         <w:drawing>
           <wp:inline xmlns:a="http://schemas.openxmlformats.org/drawingml/2006/main" xmlns:pic="http://schemas.openxmlformats.org/drawingml/2006/picture">
             <wp:extent cx="5486400" cy="5538552"/>
-            <wp:docPr id="16" name="Picture 16"/>
+            <wp:docPr id="12" name="Picture 12"/>
             <wp:cNvGraphicFramePr>
               <a:graphicFrameLocks noChangeAspect="1"/>
             </wp:cNvGraphicFramePr>
@@ -6208,7 +6835,7 @@
                     <pic:cNvPicPr/>
                   </pic:nvPicPr>
                   <pic:blipFill>
-                    <a:blip r:embed="rId24"/>
+                    <a:blip r:embed="rId20"/>
                     <a:stretch>
                       <a:fillRect/>
                     </a:stretch>
@@ -6245,7 +6872,7 @@
     <w:p>
       <w:pPr/>
       <w:r>
-        <w:t>1. Khách hàng nhấn vào ảnh đại diện / tên tài khoản.</w:t>
+        <w:t>1. Khách hàng chọn chức năng Hồ sơ cá nhân.</w:t>
       </w:r>
     </w:p>
     <w:p>
@@ -6295,7 +6922,7 @@
     <w:p>
       <w:pPr/>
       <w:r>
-        <w:t>6. Khách hàng nhấn nút [Chỉnh sửa thông tin], cập nhật thông tin và nhấn nút [Lưu].</w:t>
+        <w:t>6. Khách hàng nhấn nút Chỉnh sửa thông tin, cập nhật thông tin và nhấn nút Lưu.</w:t>
       </w:r>
     </w:p>
     <w:p>
@@ -6374,7 +7001,7 @@
         <w:drawing>
           <wp:inline xmlns:a="http://schemas.openxmlformats.org/drawingml/2006/main" xmlns:pic="http://schemas.openxmlformats.org/drawingml/2006/picture">
             <wp:extent cx="5486400" cy="5231219"/>
-            <wp:docPr id="17" name="Picture 17"/>
+            <wp:docPr id="13" name="Picture 13"/>
             <wp:cNvGraphicFramePr>
               <a:graphicFrameLocks noChangeAspect="1"/>
             </wp:cNvGraphicFramePr>
@@ -6386,7 +7013,7 @@
                     <pic:cNvPicPr/>
                   </pic:nvPicPr>
                   <pic:blipFill>
-                    <a:blip r:embed="rId25"/>
+                    <a:blip r:embed="rId21"/>
                     <a:stretch>
                       <a:fillRect/>
                     </a:stretch>
@@ -6423,7 +7050,7 @@
     <w:p>
       <w:pPr/>
       <w:r>
-        <w:t>1. Admin truy cập "Quản lý nhân viên" từ trang quản trị.</w:t>
+        <w:t>1. Admin truy cập chức năng Quản lý nhân viên từ trang quản trị.</w:t>
       </w:r>
     </w:p>
     <w:p>
@@ -6473,7 +7100,7 @@
     <w:p>
       <w:pPr/>
       <w:r>
-        <w:t>6. Admin nhấn nút [Thêm], nhập thông tin nhân viên và nhấn nút [Lưu].</w:t>
+        <w:t>6. Admin nhấn nút Thêm, nhập thông tin nhân viên và nhấn nút Lưu.</w:t>
       </w:r>
     </w:p>
     <w:p>
@@ -7058,7 +7685,7 @@
         <w:drawing>
           <wp:inline xmlns:a="http://schemas.openxmlformats.org/drawingml/2006/main" xmlns:pic="http://schemas.openxmlformats.org/drawingml/2006/picture">
             <wp:extent cx="5486400" cy="3711627"/>
-            <wp:docPr id="18" name="Picture 18"/>
+            <wp:docPr id="14" name="Picture 14"/>
             <wp:cNvGraphicFramePr>
               <a:graphicFrameLocks noChangeAspect="1"/>
             </wp:cNvGraphicFramePr>
@@ -7070,7 +7697,7 @@
                     <pic:cNvPicPr/>
                   </pic:nvPicPr>
                   <pic:blipFill>
-                    <a:blip r:embed="rId26"/>
+                    <a:blip r:embed="rId22"/>
                     <a:stretch>
                       <a:fillRect/>
                     </a:stretch>
@@ -7640,7 +8267,7 @@
         <w:drawing>
           <wp:inline xmlns:a="http://schemas.openxmlformats.org/drawingml/2006/main" xmlns:pic="http://schemas.openxmlformats.org/drawingml/2006/picture">
             <wp:extent cx="5486400" cy="6374318"/>
-            <wp:docPr id="19" name="Picture 19"/>
+            <wp:docPr id="15" name="Picture 15"/>
             <wp:cNvGraphicFramePr>
               <a:graphicFrameLocks noChangeAspect="1"/>
             </wp:cNvGraphicFramePr>
@@ -7652,7 +8279,7 @@
                     <pic:cNvPicPr/>
                   </pic:nvPicPr>
                   <pic:blipFill>
-                    <a:blip r:embed="rId27"/>
+                    <a:blip r:embed="rId23"/>
                     <a:stretch>
                       <a:fillRect/>
                     </a:stretch>
@@ -9002,7 +9629,7 @@
         <w:drawing>
           <wp:inline xmlns:a="http://schemas.openxmlformats.org/drawingml/2006/main" xmlns:pic="http://schemas.openxmlformats.org/drawingml/2006/picture">
             <wp:extent cx="5486400" cy="4756649"/>
-            <wp:docPr id="20" name="Picture 20"/>
+            <wp:docPr id="16" name="Picture 16"/>
             <wp:cNvGraphicFramePr>
               <a:graphicFrameLocks noChangeAspect="1"/>
             </wp:cNvGraphicFramePr>
@@ -9014,7 +9641,7 @@
                     <pic:cNvPicPr/>
                   </pic:nvPicPr>
                   <pic:blipFill>
-                    <a:blip r:embed="rId28"/>
+                    <a:blip r:embed="rId24"/>
                     <a:stretch>
                       <a:fillRect/>
                     </a:stretch>
@@ -9063,7 +9690,7 @@
         <w:drawing>
           <wp:inline xmlns:a="http://schemas.openxmlformats.org/drawingml/2006/main" xmlns:pic="http://schemas.openxmlformats.org/drawingml/2006/picture">
             <wp:extent cx="5486400" cy="6185102"/>
-            <wp:docPr id="21" name="Picture 21"/>
+            <wp:docPr id="17" name="Picture 17"/>
             <wp:cNvGraphicFramePr>
               <a:graphicFrameLocks noChangeAspect="1"/>
             </wp:cNvGraphicFramePr>
@@ -9075,7 +9702,7 @@
                     <pic:cNvPicPr/>
                   </pic:nvPicPr>
                   <pic:blipFill>
-                    <a:blip r:embed="rId29"/>
+                    <a:blip r:embed="rId25"/>
                     <a:stretch>
                       <a:fillRect/>
                     </a:stretch>
@@ -9353,7 +9980,7 @@
         <w:drawing>
           <wp:inline xmlns:a="http://schemas.openxmlformats.org/drawingml/2006/main" xmlns:pic="http://schemas.openxmlformats.org/drawingml/2006/picture">
             <wp:extent cx="5486400" cy="7760043"/>
-            <wp:docPr id="22" name="Picture 22"/>
+            <wp:docPr id="18" name="Picture 18"/>
             <wp:cNvGraphicFramePr>
               <a:graphicFrameLocks noChangeAspect="1"/>
             </wp:cNvGraphicFramePr>
@@ -9365,7 +9992,7 @@
                     <pic:cNvPicPr/>
                   </pic:nvPicPr>
                   <pic:blipFill>
-                    <a:blip r:embed="rId30"/>
+                    <a:blip r:embed="rId26"/>
                     <a:stretch>
                       <a:fillRect/>
                     </a:stretch>
@@ -9877,7 +10504,7 @@
         <w:drawing>
           <wp:inline xmlns:a="http://schemas.openxmlformats.org/drawingml/2006/main" xmlns:pic="http://schemas.openxmlformats.org/drawingml/2006/picture">
             <wp:extent cx="5486400" cy="5904339"/>
-            <wp:docPr id="23" name="Picture 23"/>
+            <wp:docPr id="19" name="Picture 19"/>
             <wp:cNvGraphicFramePr>
               <a:graphicFrameLocks noChangeAspect="1"/>
             </wp:cNvGraphicFramePr>
@@ -9889,7 +10516,7 @@
                     <pic:cNvPicPr/>
                   </pic:nvPicPr>
                   <pic:blipFill>
-                    <a:blip r:embed="rId31"/>
+                    <a:blip r:embed="rId27"/>
                     <a:stretch>
                       <a:fillRect/>
                     </a:stretch>
@@ -10273,7 +10900,7 @@
         <w:drawing>
           <wp:inline xmlns:a="http://schemas.openxmlformats.org/drawingml/2006/main" xmlns:pic="http://schemas.openxmlformats.org/drawingml/2006/picture">
             <wp:extent cx="5486400" cy="6119138"/>
-            <wp:docPr id="24" name="Picture 24"/>
+            <wp:docPr id="20" name="Picture 20"/>
             <wp:cNvGraphicFramePr>
               <a:graphicFrameLocks noChangeAspect="1"/>
             </wp:cNvGraphicFramePr>
@@ -10285,7 +10912,7 @@
                     <pic:cNvPicPr/>
                   </pic:nvPicPr>
                   <pic:blipFill>
-                    <a:blip r:embed="rId32"/>
+                    <a:blip r:embed="rId28"/>
                     <a:stretch>
                       <a:fillRect/>
                     </a:stretch>
@@ -10695,7 +11322,7 @@
         <w:drawing>
           <wp:inline xmlns:a="http://schemas.openxmlformats.org/drawingml/2006/main" xmlns:pic="http://schemas.openxmlformats.org/drawingml/2006/picture">
             <wp:extent cx="5486400" cy="9073348"/>
-            <wp:docPr id="25" name="Picture 25"/>
+            <wp:docPr id="21" name="Picture 21"/>
             <wp:cNvGraphicFramePr>
               <a:graphicFrameLocks noChangeAspect="1"/>
             </wp:cNvGraphicFramePr>
@@ -10707,7 +11334,7 @@
                     <pic:cNvPicPr/>
                   </pic:nvPicPr>
                   <pic:blipFill>
-                    <a:blip r:embed="rId33"/>
+                    <a:blip r:embed="rId29"/>
                     <a:stretch>
                       <a:fillRect/>
                     </a:stretch>

</xml_diff>

<commit_message>
feat: native inline tables in DOCX + data tables in UC04
- Rewrite parse_inline_html_table to return structured rows
- Add add_native_table_in_cell for nested DOCX tables
- UC04: add profile data table (Họ tên, SĐT, Email, Hạng, Điểm, Ngày)
- UC20: keep existing employee list table
- DOCX: 63 tables total, 2 nested (UC04 profile + UC20 staff list)
</commit_message>
<xml_diff>
--- a/output/account_module.docx
+++ b/output/account_module.docx
@@ -4762,7 +4762,7 @@
               <w:rPr>
                 <w:sz w:val="20"/>
               </w:rPr>
-              <w:t>2. Hệ thống truy xuất thông tin từ CSDL và hiển thị trang hồ sơ cá nhân gồm: Họ tên, SĐT, Email, Hạng hội viên, Điểm tích lũy, Ngày tham gia.</w:t>
+              <w:t>2. Hệ thống truy xuất thông tin từ CSDL và hiển thị trang hồ sơ cá nhân:</w:t>
             </w:r>
             <w:r>
               <w:br/>
@@ -4828,6 +4828,279 @@
               <w:t>9. Hệ thống hiển thị thông báo "Cập nhật thành công!" và quay về chế độ xem.</w:t>
             </w:r>
           </w:p>
+          <w:tbl>
+            <w:tblPr>
+              <w:tblStyle w:val="TableGrid"/>
+              <w:tblW w:type="auto" w:w="0"/>
+              <w:jc w:val="center"/>
+              <w:tblLook w:firstColumn="1" w:firstRow="1" w:lastColumn="0" w:lastRow="0" w:noHBand="0" w:noVBand="1" w:val="04A0"/>
+            </w:tblPr>
+            <w:tblGrid>
+              <w:gridCol w:w="1134"/>
+              <w:gridCol w:w="1134"/>
+              <w:gridCol w:w="1134"/>
+              <w:gridCol w:w="1134"/>
+              <w:gridCol w:w="1134"/>
+              <w:gridCol w:w="1134"/>
+            </w:tblGrid>
+            <w:tr>
+              <w:tc>
+                <w:tcPr>
+                  <w:tcW w:type="dxa" w:w="1039"/>
+                  <w:shd w:fill="D9E2F3"/>
+                  <w:tcMar>
+                    <w:top w:w="40" w:type="dxa"/>
+                    <w:bottom w:w="40" w:type="dxa"/>
+                    <w:left w:w="80" w:type="dxa"/>
+                    <w:right w:w="80" w:type="dxa"/>
+                  </w:tcMar>
+                </w:tcPr>
+                <w:p>
+                  <w:r/>
+                  <w:r>
+                    <w:rPr>
+                      <w:b/>
+                      <w:sz w:val="18"/>
+                    </w:rPr>
+                    <w:t>Họ tên</w:t>
+                  </w:r>
+                </w:p>
+              </w:tc>
+              <w:tc>
+                <w:tcPr>
+                  <w:tcW w:type="dxa" w:w="1039"/>
+                  <w:shd w:fill="D9E2F3"/>
+                  <w:tcMar>
+                    <w:top w:w="40" w:type="dxa"/>
+                    <w:bottom w:w="40" w:type="dxa"/>
+                    <w:left w:w="80" w:type="dxa"/>
+                    <w:right w:w="80" w:type="dxa"/>
+                  </w:tcMar>
+                </w:tcPr>
+                <w:p>
+                  <w:r/>
+                  <w:r>
+                    <w:rPr>
+                      <w:b/>
+                      <w:sz w:val="18"/>
+                    </w:rPr>
+                    <w:t>SĐT</w:t>
+                  </w:r>
+                </w:p>
+              </w:tc>
+              <w:tc>
+                <w:tcPr>
+                  <w:tcW w:type="dxa" w:w="1039"/>
+                  <w:shd w:fill="D9E2F3"/>
+                  <w:tcMar>
+                    <w:top w:w="40" w:type="dxa"/>
+                    <w:bottom w:w="40" w:type="dxa"/>
+                    <w:left w:w="80" w:type="dxa"/>
+                    <w:right w:w="80" w:type="dxa"/>
+                  </w:tcMar>
+                </w:tcPr>
+                <w:p>
+                  <w:r/>
+                  <w:r>
+                    <w:rPr>
+                      <w:b/>
+                      <w:sz w:val="18"/>
+                    </w:rPr>
+                    <w:t>Email</w:t>
+                  </w:r>
+                </w:p>
+              </w:tc>
+              <w:tc>
+                <w:tcPr>
+                  <w:tcW w:type="dxa" w:w="1039"/>
+                  <w:shd w:fill="D9E2F3"/>
+                  <w:tcMar>
+                    <w:top w:w="40" w:type="dxa"/>
+                    <w:bottom w:w="40" w:type="dxa"/>
+                    <w:left w:w="80" w:type="dxa"/>
+                    <w:right w:w="80" w:type="dxa"/>
+                  </w:tcMar>
+                </w:tcPr>
+                <w:p>
+                  <w:r/>
+                  <w:r>
+                    <w:rPr>
+                      <w:b/>
+                      <w:sz w:val="18"/>
+                    </w:rPr>
+                    <w:t>Hạng hội viên</w:t>
+                  </w:r>
+                </w:p>
+              </w:tc>
+              <w:tc>
+                <w:tcPr>
+                  <w:tcW w:type="dxa" w:w="1039"/>
+                  <w:shd w:fill="D9E2F3"/>
+                  <w:tcMar>
+                    <w:top w:w="40" w:type="dxa"/>
+                    <w:bottom w:w="40" w:type="dxa"/>
+                    <w:left w:w="80" w:type="dxa"/>
+                    <w:right w:w="80" w:type="dxa"/>
+                  </w:tcMar>
+                </w:tcPr>
+                <w:p>
+                  <w:r/>
+                  <w:r>
+                    <w:rPr>
+                      <w:b/>
+                      <w:sz w:val="18"/>
+                    </w:rPr>
+                    <w:t>Điểm tích lũy</w:t>
+                  </w:r>
+                </w:p>
+              </w:tc>
+              <w:tc>
+                <w:tcPr>
+                  <w:tcW w:type="dxa" w:w="1039"/>
+                  <w:shd w:fill="D9E2F3"/>
+                  <w:tcMar>
+                    <w:top w:w="40" w:type="dxa"/>
+                    <w:bottom w:w="40" w:type="dxa"/>
+                    <w:left w:w="80" w:type="dxa"/>
+                    <w:right w:w="80" w:type="dxa"/>
+                  </w:tcMar>
+                </w:tcPr>
+                <w:p>
+                  <w:r/>
+                  <w:r>
+                    <w:rPr>
+                      <w:b/>
+                      <w:sz w:val="18"/>
+                    </w:rPr>
+                    <w:t>Ngày tham gia</w:t>
+                  </w:r>
+                </w:p>
+              </w:tc>
+            </w:tr>
+            <w:tr>
+              <w:tc>
+                <w:tcPr>
+                  <w:tcW w:type="dxa" w:w="1039"/>
+                  <w:tcMar>
+                    <w:top w:w="40" w:type="dxa"/>
+                    <w:bottom w:w="40" w:type="dxa"/>
+                    <w:left w:w="80" w:type="dxa"/>
+                    <w:right w:w="80" w:type="dxa"/>
+                  </w:tcMar>
+                </w:tcPr>
+                <w:p>
+                  <w:r/>
+                  <w:r>
+                    <w:rPr>
+                      <w:sz w:val="18"/>
+                    </w:rPr>
+                    <w:t>Nguyễn Văn A</w:t>
+                  </w:r>
+                </w:p>
+              </w:tc>
+              <w:tc>
+                <w:tcPr>
+                  <w:tcW w:type="dxa" w:w="1039"/>
+                  <w:tcMar>
+                    <w:top w:w="40" w:type="dxa"/>
+                    <w:bottom w:w="40" w:type="dxa"/>
+                    <w:left w:w="80" w:type="dxa"/>
+                    <w:right w:w="80" w:type="dxa"/>
+                  </w:tcMar>
+                </w:tcPr>
+                <w:p>
+                  <w:r/>
+                  <w:r>
+                    <w:rPr>
+                      <w:sz w:val="18"/>
+                    </w:rPr>
+                    <w:t>0912345678</w:t>
+                  </w:r>
+                </w:p>
+              </w:tc>
+              <w:tc>
+                <w:tcPr>
+                  <w:tcW w:type="dxa" w:w="1039"/>
+                  <w:tcMar>
+                    <w:top w:w="40" w:type="dxa"/>
+                    <w:bottom w:w="40" w:type="dxa"/>
+                    <w:left w:w="80" w:type="dxa"/>
+                    <w:right w:w="80" w:type="dxa"/>
+                  </w:tcMar>
+                </w:tcPr>
+                <w:p>
+                  <w:r/>
+                  <w:r>
+                    <w:rPr>
+                      <w:sz w:val="18"/>
+                    </w:rPr>
+                    <w:t>nva@gmail.com</w:t>
+                  </w:r>
+                </w:p>
+              </w:tc>
+              <w:tc>
+                <w:tcPr>
+                  <w:tcW w:type="dxa" w:w="1039"/>
+                  <w:tcMar>
+                    <w:top w:w="40" w:type="dxa"/>
+                    <w:bottom w:w="40" w:type="dxa"/>
+                    <w:left w:w="80" w:type="dxa"/>
+                    <w:right w:w="80" w:type="dxa"/>
+                  </w:tcMar>
+                </w:tcPr>
+                <w:p>
+                  <w:r/>
+                  <w:r>
+                    <w:rPr>
+                      <w:sz w:val="18"/>
+                    </w:rPr>
+                    <w:t>Bạc</w:t>
+                  </w:r>
+                </w:p>
+              </w:tc>
+              <w:tc>
+                <w:tcPr>
+                  <w:tcW w:type="dxa" w:w="1039"/>
+                  <w:tcMar>
+                    <w:top w:w="40" w:type="dxa"/>
+                    <w:bottom w:w="40" w:type="dxa"/>
+                    <w:left w:w="80" w:type="dxa"/>
+                    <w:right w:w="80" w:type="dxa"/>
+                  </w:tcMar>
+                </w:tcPr>
+                <w:p>
+                  <w:r/>
+                  <w:r>
+                    <w:rPr>
+                      <w:sz w:val="18"/>
+                    </w:rPr>
+                    <w:t>1.250</w:t>
+                  </w:r>
+                </w:p>
+              </w:tc>
+              <w:tc>
+                <w:tcPr>
+                  <w:tcW w:type="dxa" w:w="1039"/>
+                  <w:tcMar>
+                    <w:top w:w="40" w:type="dxa"/>
+                    <w:bottom w:w="40" w:type="dxa"/>
+                    <w:left w:w="80" w:type="dxa"/>
+                    <w:right w:w="80" w:type="dxa"/>
+                  </w:tcMar>
+                </w:tcPr>
+                <w:p>
+                  <w:r/>
+                  <w:r>
+                    <w:rPr>
+                      <w:sz w:val="18"/>
+                    </w:rPr>
+                    <w:t>15/03/2025</w:t>
+                  </w:r>
+                </w:p>
+              </w:tc>
+            </w:tr>
+          </w:tbl>
+          <w:p/>
         </w:tc>
       </w:tr>
       <w:tr>
@@ -5237,60 +5510,358 @@
               </w:rPr>
               <w:t>20. Hệ thống hiển thị thông báo "Xóa nhân viên thành công!".</w:t>
             </w:r>
-            <w:r>
-              <w:br/>
-            </w:r>
-            <w:r>
-              <w:rPr>
-                <w:rFonts w:ascii="Courier New" w:hAnsi="Courier New"/>
-                <w:sz w:val="16"/>
-              </w:rPr>
-              <w:t>Họ tên           | Vai trò | Chi nhánh          | Trạng thái</w:t>
-            </w:r>
-            <w:r>
-              <w:br/>
-            </w:r>
-            <w:r>
-              <w:rPr>
-                <w:rFonts w:ascii="Courier New" w:hAnsi="Courier New"/>
-                <w:sz w:val="16"/>
-              </w:rPr>
-              <w:t>-----------------+---------+--------------------+-----------</w:t>
-            </w:r>
-            <w:r>
-              <w:br/>
-            </w:r>
-            <w:r>
-              <w:rPr>
-                <w:rFonts w:ascii="Courier New" w:hAnsi="Courier New"/>
-                <w:sz w:val="16"/>
-              </w:rPr>
-              <w:t xml:space="preserve">Nguyễn Minh Tuấn | Lễ tân  | Karaoke Star - CN1 | Đang làm  </w:t>
-            </w:r>
-            <w:r>
-              <w:br/>
-            </w:r>
-            <w:r>
-              <w:rPr>
-                <w:rFonts w:ascii="Courier New" w:hAnsi="Courier New"/>
-                <w:sz w:val="16"/>
-              </w:rPr>
-              <w:t xml:space="preserve">Trần Thị Hương   | Phục vụ | Karaoke Star - CN2 | Đang làm  </w:t>
-            </w:r>
-            <w:r>
-              <w:br/>
-            </w:r>
-            <w:r>
-              <w:rPr>
-                <w:rFonts w:ascii="Courier New" w:hAnsi="Courier New"/>
-                <w:sz w:val="16"/>
-              </w:rPr>
-              <w:t xml:space="preserve">Lê Văn Khánh     | Quản lý | Karaoke Star - CN1 | Đang làm  </w:t>
-            </w:r>
-            <w:r>
-              <w:br/>
-            </w:r>
-          </w:p>
+          </w:p>
+          <w:tbl>
+            <w:tblPr>
+              <w:tblStyle w:val="TableGrid"/>
+              <w:tblW w:type="auto" w:w="0"/>
+              <w:jc w:val="center"/>
+              <w:tblLook w:firstColumn="1" w:firstRow="1" w:lastColumn="0" w:lastRow="0" w:noHBand="0" w:noVBand="1" w:val="04A0"/>
+            </w:tblPr>
+            <w:tblGrid>
+              <w:gridCol w:w="1701"/>
+              <w:gridCol w:w="1701"/>
+              <w:gridCol w:w="1701"/>
+              <w:gridCol w:w="1701"/>
+            </w:tblGrid>
+            <w:tr>
+              <w:tc>
+                <w:tcPr>
+                  <w:tcW w:type="dxa" w:w="1559"/>
+                  <w:shd w:fill="D9E2F3"/>
+                  <w:tcMar>
+                    <w:top w:w="40" w:type="dxa"/>
+                    <w:bottom w:w="40" w:type="dxa"/>
+                    <w:left w:w="80" w:type="dxa"/>
+                    <w:right w:w="80" w:type="dxa"/>
+                  </w:tcMar>
+                </w:tcPr>
+                <w:p>
+                  <w:r/>
+                  <w:r>
+                    <w:rPr>
+                      <w:b/>
+                      <w:sz w:val="18"/>
+                    </w:rPr>
+                    <w:t>Họ tên</w:t>
+                  </w:r>
+                </w:p>
+              </w:tc>
+              <w:tc>
+                <w:tcPr>
+                  <w:tcW w:type="dxa" w:w="1559"/>
+                  <w:shd w:fill="D9E2F3"/>
+                  <w:tcMar>
+                    <w:top w:w="40" w:type="dxa"/>
+                    <w:bottom w:w="40" w:type="dxa"/>
+                    <w:left w:w="80" w:type="dxa"/>
+                    <w:right w:w="80" w:type="dxa"/>
+                  </w:tcMar>
+                </w:tcPr>
+                <w:p>
+                  <w:r/>
+                  <w:r>
+                    <w:rPr>
+                      <w:b/>
+                      <w:sz w:val="18"/>
+                    </w:rPr>
+                    <w:t>Vai trò</w:t>
+                  </w:r>
+                </w:p>
+              </w:tc>
+              <w:tc>
+                <w:tcPr>
+                  <w:tcW w:type="dxa" w:w="1559"/>
+                  <w:shd w:fill="D9E2F3"/>
+                  <w:tcMar>
+                    <w:top w:w="40" w:type="dxa"/>
+                    <w:bottom w:w="40" w:type="dxa"/>
+                    <w:left w:w="80" w:type="dxa"/>
+                    <w:right w:w="80" w:type="dxa"/>
+                  </w:tcMar>
+                </w:tcPr>
+                <w:p>
+                  <w:r/>
+                  <w:r>
+                    <w:rPr>
+                      <w:b/>
+                      <w:sz w:val="18"/>
+                    </w:rPr>
+                    <w:t>Chi nhánh</w:t>
+                  </w:r>
+                </w:p>
+              </w:tc>
+              <w:tc>
+                <w:tcPr>
+                  <w:tcW w:type="dxa" w:w="1559"/>
+                  <w:shd w:fill="D9E2F3"/>
+                  <w:tcMar>
+                    <w:top w:w="40" w:type="dxa"/>
+                    <w:bottom w:w="40" w:type="dxa"/>
+                    <w:left w:w="80" w:type="dxa"/>
+                    <w:right w:w="80" w:type="dxa"/>
+                  </w:tcMar>
+                </w:tcPr>
+                <w:p>
+                  <w:r/>
+                  <w:r>
+                    <w:rPr>
+                      <w:b/>
+                      <w:sz w:val="18"/>
+                    </w:rPr>
+                    <w:t>Trạng thái</w:t>
+                  </w:r>
+                </w:p>
+              </w:tc>
+            </w:tr>
+            <w:tr>
+              <w:tc>
+                <w:tcPr>
+                  <w:tcW w:type="dxa" w:w="1559"/>
+                  <w:tcMar>
+                    <w:top w:w="40" w:type="dxa"/>
+                    <w:bottom w:w="40" w:type="dxa"/>
+                    <w:left w:w="80" w:type="dxa"/>
+                    <w:right w:w="80" w:type="dxa"/>
+                  </w:tcMar>
+                </w:tcPr>
+                <w:p>
+                  <w:r/>
+                  <w:r>
+                    <w:rPr>
+                      <w:sz w:val="18"/>
+                    </w:rPr>
+                    <w:t>Nguyễn Minh Tuấn</w:t>
+                  </w:r>
+                </w:p>
+              </w:tc>
+              <w:tc>
+                <w:tcPr>
+                  <w:tcW w:type="dxa" w:w="1559"/>
+                  <w:tcMar>
+                    <w:top w:w="40" w:type="dxa"/>
+                    <w:bottom w:w="40" w:type="dxa"/>
+                    <w:left w:w="80" w:type="dxa"/>
+                    <w:right w:w="80" w:type="dxa"/>
+                  </w:tcMar>
+                </w:tcPr>
+                <w:p>
+                  <w:r/>
+                  <w:r>
+                    <w:rPr>
+                      <w:sz w:val="18"/>
+                    </w:rPr>
+                    <w:t>Lễ tân</w:t>
+                  </w:r>
+                </w:p>
+              </w:tc>
+              <w:tc>
+                <w:tcPr>
+                  <w:tcW w:type="dxa" w:w="1559"/>
+                  <w:tcMar>
+                    <w:top w:w="40" w:type="dxa"/>
+                    <w:bottom w:w="40" w:type="dxa"/>
+                    <w:left w:w="80" w:type="dxa"/>
+                    <w:right w:w="80" w:type="dxa"/>
+                  </w:tcMar>
+                </w:tcPr>
+                <w:p>
+                  <w:r/>
+                  <w:r>
+                    <w:rPr>
+                      <w:sz w:val="18"/>
+                    </w:rPr>
+                    <w:t>Karaoke Star - CN1</w:t>
+                  </w:r>
+                </w:p>
+              </w:tc>
+              <w:tc>
+                <w:tcPr>
+                  <w:tcW w:type="dxa" w:w="1559"/>
+                  <w:tcMar>
+                    <w:top w:w="40" w:type="dxa"/>
+                    <w:bottom w:w="40" w:type="dxa"/>
+                    <w:left w:w="80" w:type="dxa"/>
+                    <w:right w:w="80" w:type="dxa"/>
+                  </w:tcMar>
+                </w:tcPr>
+                <w:p>
+                  <w:r/>
+                  <w:r>
+                    <w:rPr>
+                      <w:sz w:val="18"/>
+                    </w:rPr>
+                    <w:t>Đang làm</w:t>
+                  </w:r>
+                </w:p>
+              </w:tc>
+            </w:tr>
+            <w:tr>
+              <w:tc>
+                <w:tcPr>
+                  <w:tcW w:type="dxa" w:w="1559"/>
+                  <w:tcMar>
+                    <w:top w:w="40" w:type="dxa"/>
+                    <w:bottom w:w="40" w:type="dxa"/>
+                    <w:left w:w="80" w:type="dxa"/>
+                    <w:right w:w="80" w:type="dxa"/>
+                  </w:tcMar>
+                </w:tcPr>
+                <w:p>
+                  <w:r/>
+                  <w:r>
+                    <w:rPr>
+                      <w:sz w:val="18"/>
+                    </w:rPr>
+                    <w:t>Trần Thị Hương</w:t>
+                  </w:r>
+                </w:p>
+              </w:tc>
+              <w:tc>
+                <w:tcPr>
+                  <w:tcW w:type="dxa" w:w="1559"/>
+                  <w:tcMar>
+                    <w:top w:w="40" w:type="dxa"/>
+                    <w:bottom w:w="40" w:type="dxa"/>
+                    <w:left w:w="80" w:type="dxa"/>
+                    <w:right w:w="80" w:type="dxa"/>
+                  </w:tcMar>
+                </w:tcPr>
+                <w:p>
+                  <w:r/>
+                  <w:r>
+                    <w:rPr>
+                      <w:sz w:val="18"/>
+                    </w:rPr>
+                    <w:t>Phục vụ</w:t>
+                  </w:r>
+                </w:p>
+              </w:tc>
+              <w:tc>
+                <w:tcPr>
+                  <w:tcW w:type="dxa" w:w="1559"/>
+                  <w:tcMar>
+                    <w:top w:w="40" w:type="dxa"/>
+                    <w:bottom w:w="40" w:type="dxa"/>
+                    <w:left w:w="80" w:type="dxa"/>
+                    <w:right w:w="80" w:type="dxa"/>
+                  </w:tcMar>
+                </w:tcPr>
+                <w:p>
+                  <w:r/>
+                  <w:r>
+                    <w:rPr>
+                      <w:sz w:val="18"/>
+                    </w:rPr>
+                    <w:t>Karaoke Star - CN2</w:t>
+                  </w:r>
+                </w:p>
+              </w:tc>
+              <w:tc>
+                <w:tcPr>
+                  <w:tcW w:type="dxa" w:w="1559"/>
+                  <w:tcMar>
+                    <w:top w:w="40" w:type="dxa"/>
+                    <w:bottom w:w="40" w:type="dxa"/>
+                    <w:left w:w="80" w:type="dxa"/>
+                    <w:right w:w="80" w:type="dxa"/>
+                  </w:tcMar>
+                </w:tcPr>
+                <w:p>
+                  <w:r/>
+                  <w:r>
+                    <w:rPr>
+                      <w:sz w:val="18"/>
+                    </w:rPr>
+                    <w:t>Đang làm</w:t>
+                  </w:r>
+                </w:p>
+              </w:tc>
+            </w:tr>
+            <w:tr>
+              <w:tc>
+                <w:tcPr>
+                  <w:tcW w:type="dxa" w:w="1559"/>
+                  <w:tcMar>
+                    <w:top w:w="40" w:type="dxa"/>
+                    <w:bottom w:w="40" w:type="dxa"/>
+                    <w:left w:w="80" w:type="dxa"/>
+                    <w:right w:w="80" w:type="dxa"/>
+                  </w:tcMar>
+                </w:tcPr>
+                <w:p>
+                  <w:r/>
+                  <w:r>
+                    <w:rPr>
+                      <w:sz w:val="18"/>
+                    </w:rPr>
+                    <w:t>Lê Văn Khánh</w:t>
+                  </w:r>
+                </w:p>
+              </w:tc>
+              <w:tc>
+                <w:tcPr>
+                  <w:tcW w:type="dxa" w:w="1559"/>
+                  <w:tcMar>
+                    <w:top w:w="40" w:type="dxa"/>
+                    <w:bottom w:w="40" w:type="dxa"/>
+                    <w:left w:w="80" w:type="dxa"/>
+                    <w:right w:w="80" w:type="dxa"/>
+                  </w:tcMar>
+                </w:tcPr>
+                <w:p>
+                  <w:r/>
+                  <w:r>
+                    <w:rPr>
+                      <w:sz w:val="18"/>
+                    </w:rPr>
+                    <w:t>Quản lý</w:t>
+                  </w:r>
+                </w:p>
+              </w:tc>
+              <w:tc>
+                <w:tcPr>
+                  <w:tcW w:type="dxa" w:w="1559"/>
+                  <w:tcMar>
+                    <w:top w:w="40" w:type="dxa"/>
+                    <w:bottom w:w="40" w:type="dxa"/>
+                    <w:left w:w="80" w:type="dxa"/>
+                    <w:right w:w="80" w:type="dxa"/>
+                  </w:tcMar>
+                </w:tcPr>
+                <w:p>
+                  <w:r/>
+                  <w:r>
+                    <w:rPr>
+                      <w:sz w:val="18"/>
+                    </w:rPr>
+                    <w:t>Karaoke Star - CN1</w:t>
+                  </w:r>
+                </w:p>
+              </w:tc>
+              <w:tc>
+                <w:tcPr>
+                  <w:tcW w:type="dxa" w:w="1559"/>
+                  <w:tcMar>
+                    <w:top w:w="40" w:type="dxa"/>
+                    <w:bottom w:w="40" w:type="dxa"/>
+                    <w:left w:w="80" w:type="dxa"/>
+                    <w:right w:w="80" w:type="dxa"/>
+                  </w:tcMar>
+                </w:tcPr>
+                <w:p>
+                  <w:r/>
+                  <w:r>
+                    <w:rPr>
+                      <w:sz w:val="18"/>
+                    </w:rPr>
+                    <w:t>Đang làm</w:t>
+                  </w:r>
+                </w:p>
+              </w:tc>
+            </w:tr>
+          </w:tbl>
+          <w:p/>
         </w:tc>
       </w:tr>
       <w:tr>

</xml_diff>

<commit_message>
feat: English attributes/methods + native bullets/numbered lists
PlantUML diagrams:
- All attributes: Vietnamese → English (fullName, phoneNumber, password, etc.)
- All methods: keep English (checkLogin, register, changePassword, etc.)
- Sequence diagram params: sdt→phoneNumber, matKhau→password, etc.

DOCX generator:
- Add numbering config for bullets (•, ◦, ▪) and numbered lists (1. 2. 3.)
- Support indent levels for nested lists
- Native DOCX bullet/number formatting instead of plain text
- Native inline tables (UC04 profile + UC20 staff list)
</commit_message>
<xml_diff>
--- a/output/account_module.docx
+++ b/output/account_module.docx
@@ -1541,7 +1541,7 @@
       <w:r>
         <w:drawing>
           <wp:inline xmlns:a="http://schemas.openxmlformats.org/drawingml/2006/main" xmlns:pic="http://schemas.openxmlformats.org/drawingml/2006/picture">
-            <wp:extent cx="5486400" cy="10576410"/>
+            <wp:extent cx="5486400" cy="8903445"/>
             <wp:docPr id="1" name="Picture 1"/>
             <wp:cNvGraphicFramePr>
               <a:graphicFrameLocks noChangeAspect="1"/>
@@ -1562,7 +1562,7 @@
                   <pic:spPr>
                     <a:xfrm>
                       <a:off x="0" y="0"/>
-                      <a:ext cx="5486400" cy="10576410"/>
+                      <a:ext cx="5486400" cy="8903445"/>
                     </a:xfrm>
                     <a:prstGeom prst="rect"/>
                   </pic:spPr>
@@ -3031,75 +3031,70 @@
       </w:r>
     </w:p>
     <w:p>
-      <w:pPr/>
-      <w:r>
-        <w:t xml:space="preserve">1. </w:t>
-      </w:r>
+      <w:pPr>
+        <w:ind w:left="360" w:hanging="240"/>
+      </w:pPr>
       <w:r>
         <w:rPr>
           <w:b/>
         </w:rPr>
-        <w:t>UC01 – Đăng nhập:</w:t>
+        <w:t>1.  UC01 – Đăng nhập:</w:t>
       </w:r>
       <w:r>
         <w:t xml:space="preserve"> UC này cho phép Khách hàng, Nhân viên hoặc Chủ doanh nghiệp xác thực danh tính vào hệ thống. Người dùng nhập SĐT/Email và mật khẩu, hệ thống kiểm tra và chuyển hướng đến trang chủ tương ứng với vai trò.</w:t>
       </w:r>
     </w:p>
     <w:p>
-      <w:pPr/>
-      <w:r>
-        <w:t xml:space="preserve">2. </w:t>
-      </w:r>
+      <w:pPr>
+        <w:ind w:left="360" w:hanging="240"/>
+      </w:pPr>
       <w:r>
         <w:rPr>
           <w:b/>
         </w:rPr>
-        <w:t>UC02 – Đăng ký:</w:t>
+        <w:t>2.  UC02 – Đăng ký:</w:t>
       </w:r>
       <w:r>
         <w:t xml:space="preserve"> UC này cho phép Khách hàng tạo tài khoản hội viên mới bằng cách cung cấp họ tên, SĐT, email và mật khẩu. Hệ thống gửi OTP 6 chữ số đến SĐT để xác minh trước khi hoàn tất đăng ký. Sau khi đăng ký thành công, hệ thống tự động đăng nhập.</w:t>
       </w:r>
     </w:p>
     <w:p>
-      <w:pPr/>
-      <w:r>
-        <w:t xml:space="preserve">3. </w:t>
-      </w:r>
+      <w:pPr>
+        <w:ind w:left="360" w:hanging="240"/>
+      </w:pPr>
       <w:r>
         <w:rPr>
           <w:b/>
         </w:rPr>
-        <w:t>UC03 – Đổi mật khẩu:</w:t>
+        <w:t>3.  UC03 – Đổi mật khẩu:</w:t>
       </w:r>
       <w:r>
         <w:t xml:space="preserve"> UC này cho phép người dùng đã đăng nhập (Khách hàng, Nhân viên) thay đổi mật khẩu bằng cách xác minh mật khẩu hiện tại, nhập mật khẩu mới (độ dài ≥ 8, có chữ hoa/thường/số/đặc biệt). Sau khi đổi, tất cả session khác bị thu hồi.</w:t>
       </w:r>
     </w:p>
     <w:p>
-      <w:pPr/>
-      <w:r>
-        <w:t xml:space="preserve">4. </w:t>
-      </w:r>
+      <w:pPr>
+        <w:ind w:left="360" w:hanging="240"/>
+      </w:pPr>
       <w:r>
         <w:rPr>
           <w:b/>
         </w:rPr>
-        <w:t>UC04 – Quản lý thông tin cá nhân:</w:t>
+        <w:t>4.  UC04 – Quản lý thông tin cá nhân:</w:t>
       </w:r>
       <w:r>
         <w:t xml:space="preserve"> UC này cho phép Khách hàng xem hồ sơ cá nhân (họ tên, SĐT, email, hạng hội viên, điểm tích lũy) và cập nhật thông tin (họ tên, email). SĐT bị khóa, muốn đổi phải xác minh OTP.</w:t>
       </w:r>
     </w:p>
     <w:p>
-      <w:pPr/>
-      <w:r>
-        <w:t xml:space="preserve">5. </w:t>
-      </w:r>
+      <w:pPr>
+        <w:ind w:left="360" w:hanging="240"/>
+      </w:pPr>
       <w:r>
         <w:rPr>
           <w:b/>
         </w:rPr>
-        <w:t>UC20 – Quản lý tài khoản nhân viên:</w:t>
+        <w:t>5.  UC20 – Quản lý tài khoản nhân viên:</w:t>
       </w:r>
       <w:r>
         <w:t xml:space="preserve"> UC này cho phép Chủ doanh nghiệp quản lý tài khoản nhân viên toàn hệ thống: xem danh sách, thêm mới, chỉnh sửa và xóa (chuyển trạng thái "Đã nghỉ"). Không thể xóa nhân viên đang xử lý order.</w:t>
@@ -3208,7 +3203,7 @@
       <w:r>
         <w:drawing>
           <wp:inline xmlns:a="http://schemas.openxmlformats.org/drawingml/2006/main" xmlns:pic="http://schemas.openxmlformats.org/drawingml/2006/picture">
-            <wp:extent cx="5486400" cy="5758174"/>
+            <wp:extent cx="5486400" cy="5757333"/>
             <wp:docPr id="2" name="Picture 2"/>
             <wp:cNvGraphicFramePr>
               <a:graphicFrameLocks noChangeAspect="1"/>
@@ -3229,7 +3224,7 @@
                   <pic:spPr>
                     <a:xfrm>
                       <a:off x="0" y="0"/>
-                      <a:ext cx="5486400" cy="5758174"/>
+                      <a:ext cx="5486400" cy="5757333"/>
                     </a:xfrm>
                     <a:prstGeom prst="rect"/>
                   </pic:spPr>
@@ -3255,7 +3250,7 @@
       <w:r>
         <w:drawing>
           <wp:inline xmlns:a="http://schemas.openxmlformats.org/drawingml/2006/main" xmlns:pic="http://schemas.openxmlformats.org/drawingml/2006/picture">
-            <wp:extent cx="5486400" cy="4564912"/>
+            <wp:extent cx="5486400" cy="3691112"/>
             <wp:docPr id="3" name="Picture 3"/>
             <wp:cNvGraphicFramePr>
               <a:graphicFrameLocks noChangeAspect="1"/>
@@ -3276,7 +3271,7 @@
                   <pic:spPr>
                     <a:xfrm>
                       <a:off x="0" y="0"/>
-                      <a:ext cx="5486400" cy="4564912"/>
+                      <a:ext cx="5486400" cy="3691112"/>
                     </a:xfrm>
                     <a:prstGeom prst="rect"/>
                   </pic:spPr>
@@ -3302,7 +3297,7 @@
       <w:r>
         <w:drawing>
           <wp:inline xmlns:a="http://schemas.openxmlformats.org/drawingml/2006/main" xmlns:pic="http://schemas.openxmlformats.org/drawingml/2006/picture">
-            <wp:extent cx="5486400" cy="4160939"/>
+            <wp:extent cx="5486400" cy="4627418"/>
             <wp:docPr id="4" name="Picture 4"/>
             <wp:cNvGraphicFramePr>
               <a:graphicFrameLocks noChangeAspect="1"/>
@@ -3323,7 +3318,7 @@
                   <pic:spPr>
                     <a:xfrm>
                       <a:off x="0" y="0"/>
-                      <a:ext cx="5486400" cy="4160939"/>
+                      <a:ext cx="5486400" cy="4627418"/>
                     </a:xfrm>
                     <a:prstGeom prst="rect"/>
                   </pic:spPr>
@@ -3349,7 +3344,7 @@
       <w:r>
         <w:drawing>
           <wp:inline xmlns:a="http://schemas.openxmlformats.org/drawingml/2006/main" xmlns:pic="http://schemas.openxmlformats.org/drawingml/2006/picture">
-            <wp:extent cx="5486400" cy="5501768"/>
+            <wp:extent cx="5486400" cy="4639733"/>
             <wp:docPr id="5" name="Picture 5"/>
             <wp:cNvGraphicFramePr>
               <a:graphicFrameLocks noChangeAspect="1"/>
@@ -3370,7 +3365,7 @@
                   <pic:spPr>
                     <a:xfrm>
                       <a:off x="0" y="0"/>
-                      <a:ext cx="5486400" cy="5501768"/>
+                      <a:ext cx="5486400" cy="4639733"/>
                     </a:xfrm>
                     <a:prstGeom prst="rect"/>
                   </pic:spPr>
@@ -3396,7 +3391,7 @@
       <w:r>
         <w:drawing>
           <wp:inline xmlns:a="http://schemas.openxmlformats.org/drawingml/2006/main" xmlns:pic="http://schemas.openxmlformats.org/drawingml/2006/picture">
-            <wp:extent cx="5486400" cy="5899026"/>
+            <wp:extent cx="5486400" cy="5897880"/>
             <wp:docPr id="6" name="Picture 6"/>
             <wp:cNvGraphicFramePr>
               <a:graphicFrameLocks noChangeAspect="1"/>
@@ -3417,7 +3412,7 @@
                   <pic:spPr>
                     <a:xfrm>
                       <a:off x="0" y="0"/>
-                      <a:ext cx="5486400" cy="5899026"/>
+                      <a:ext cx="5486400" cy="5897880"/>
                     </a:xfrm>
                     <a:prstGeom prst="rect"/>
                   </pic:spPr>
@@ -5974,105 +5969,139 @@
       </w:r>
     </w:p>
     <w:p>
-      <w:pPr/>
-      <w:r>
-        <w:t>▪ Hệ thống → loại: quá chung, không phải thực thể nghiệp vụ</w:t>
+      <w:pPr>
+        <w:ind w:left="360" w:hanging="240"/>
+      </w:pPr>
+      <w:r>
+        <w:t>•  Hệ thống → loại: quá chung, không phải thực thể nghiệp vụ</w:t>
       </w:r>
     </w:p>
     <w:p>
-      <w:pPr/>
-      <w:r>
-        <w:t>▪ Khách hàng → lớp User: hoTen, soDienThoai, email, matKhau, ngayTao</w:t>
+      <w:pPr>
+        <w:ind w:left="360" w:hanging="240"/>
+      </w:pPr>
+      <w:r>
+        <w:t>•  Khách hàng → lớp User: hoTen, soDienThoai, email, matKhau, ngayTao</w:t>
       </w:r>
     </w:p>
     <w:p>
-      <w:pPr/>
-      <w:r>
-        <w:t>▪ Tài khoản → thuộc về User (gộp vào User, tránh tách thừa)</w:t>
+      <w:pPr>
+        <w:ind w:left="360" w:hanging="240"/>
+      </w:pPr>
+      <w:r>
+        <w:t>•  Tài khoản → thuộc về User (gộp vào User, tránh tách thừa)</w:t>
       </w:r>
     </w:p>
     <w:p>
-      <w:pPr/>
-      <w:r>
-        <w:t>▪ Họ tên → thuộc tính của User</w:t>
+      <w:pPr>
+        <w:ind w:left="360" w:hanging="240"/>
+      </w:pPr>
+      <w:r>
+        <w:t>•  Họ tên → thuộc tính của User</w:t>
       </w:r>
     </w:p>
     <w:p>
-      <w:pPr/>
-      <w:r>
-        <w:t>▪ Số điện thoại → thuộc tính của User (dùng làm username đăng nhập)</w:t>
+      <w:pPr>
+        <w:ind w:left="360" w:hanging="240"/>
+      </w:pPr>
+      <w:r>
+        <w:t>•  Số điện thoại → thuộc tính của User (dùng làm username đăng nhập)</w:t>
       </w:r>
     </w:p>
     <w:p>
-      <w:pPr/>
-      <w:r>
-        <w:t>▪ Email → thuộc tính của User</w:t>
+      <w:pPr>
+        <w:ind w:left="360" w:hanging="240"/>
+      </w:pPr>
+      <w:r>
+        <w:t>•  Email → thuộc tính của User</w:t>
       </w:r>
     </w:p>
     <w:p>
-      <w:pPr/>
-      <w:r>
-        <w:t>▪ Mật khẩu → thuộc tính của User (lưu dạng mã hóa)</w:t>
+      <w:pPr>
+        <w:ind w:left="360" w:hanging="240"/>
+      </w:pPr>
+      <w:r>
+        <w:t>•  Mật khẩu → thuộc tính của User (lưu dạng mã hóa)</w:t>
       </w:r>
     </w:p>
     <w:p>
-      <w:pPr/>
-      <w:r>
-        <w:t>▪ Ngày tham gia → thuộc tính ngayTao của User</w:t>
+      <w:pPr>
+        <w:ind w:left="360" w:hanging="240"/>
+      </w:pPr>
+      <w:r>
+        <w:t>•  Ngày tham gia → thuộc tính ngayTao của User</w:t>
       </w:r>
     </w:p>
     <w:p>
-      <w:pPr/>
-      <w:r>
-        <w:t>▪ Hạng hội viên → lớp MembershipTier: tenHang, diemToiThieu, moTa, heSoUuDai</w:t>
+      <w:pPr>
+        <w:ind w:left="360" w:hanging="240"/>
+      </w:pPr>
+      <w:r>
+        <w:t>•  Hạng hội viên → lớp MembershipTier: tenHang, diemToiThieu, moTa, heSoUuDai</w:t>
       </w:r>
     </w:p>
     <w:p>
-      <w:pPr/>
-      <w:r>
-        <w:t>▪ Điểm tích lũy → thuộc tính diemTichLuy của User</w:t>
+      <w:pPr>
+        <w:ind w:left="360" w:hanging="240"/>
+      </w:pPr>
+      <w:r>
+        <w:t>•  Điểm tích lũy → thuộc tính diemTichLuy của User</w:t>
       </w:r>
     </w:p>
     <w:p>
-      <w:pPr/>
-      <w:r>
-        <w:t>▪ Mã OTP → lớp OTP: maOTP, loai, thoiHanHetHan, daXacMinh</w:t>
+      <w:pPr>
+        <w:ind w:left="360" w:hanging="240"/>
+      </w:pPr>
+      <w:r>
+        <w:t>•  Mã OTP → lớp OTP: maOTP, loai, thoiHanHetHan, daXacMinh</w:t>
       </w:r>
     </w:p>
     <w:p>
-      <w:pPr/>
-      <w:r>
-        <w:t>▪ Phiên đăng nhập → lớp LoginSession: tokenPhien, thoiGianDangNhap, thoiGianHetHan, thietBi</w:t>
+      <w:pPr>
+        <w:ind w:left="360" w:hanging="240"/>
+      </w:pPr>
+      <w:r>
+        <w:t>•  Phiên đăng nhập → lớp LoginSession: tokenPhien, thoiGianDangNhap, thoiGianHetHan, thietBi</w:t>
       </w:r>
     </w:p>
     <w:p>
-      <w:pPr/>
-      <w:r>
-        <w:t>▪ Lịch sử → loại: quá chung → cụ thể là LoginSession đã đủ</w:t>
+      <w:pPr>
+        <w:ind w:left="360" w:hanging="240"/>
+      </w:pPr>
+      <w:r>
+        <w:t>•  Lịch sử → loại: quá chung → cụ thể là LoginSession đã đủ</w:t>
       </w:r>
     </w:p>
     <w:p>
-      <w:pPr/>
-      <w:r>
-        <w:t>▪ Danh sách → loại: không phải thực thể</w:t>
+      <w:pPr>
+        <w:ind w:left="360" w:hanging="240"/>
+      </w:pPr>
+      <w:r>
+        <w:t>•  Danh sách → loại: không phải thực thể</w:t>
       </w:r>
     </w:p>
     <w:p>
-      <w:pPr/>
-      <w:r>
-        <w:t>▪ Giao diện → loại: là Boundary, không phải Entity</w:t>
+      <w:pPr>
+        <w:ind w:left="360" w:hanging="240"/>
+      </w:pPr>
+      <w:r>
+        <w:t>•  Giao diện → loại: là Boundary, không phải Entity</w:t>
       </w:r>
     </w:p>
     <w:p>
-      <w:pPr/>
-      <w:r>
-        <w:t>▪ Nhân viên → lớp Employee: hoTen, vaiTro, chiNhanh, trangThai</w:t>
+      <w:pPr>
+        <w:ind w:left="360" w:hanging="240"/>
+      </w:pPr>
+      <w:r>
+        <w:t>•  Nhân viên → lớp Employee: hoTen, vaiTro, chiNhanh, trangThai</w:t>
       </w:r>
     </w:p>
     <w:p>
-      <w:pPr/>
-      <w:r>
-        <w:t>▪ Chủ doanh nghiệp → loại: actor, không phải thực thể dữ liệu</w:t>
+      <w:pPr>
+        <w:ind w:left="360" w:hanging="240"/>
+      </w:pPr>
+      <w:r>
+        <w:t>•  Chủ doanh nghiệp → loại: actor, không phải thực thể dữ liệu</w:t>
       </w:r>
     </w:p>
     <w:p>
@@ -6084,9 +6113,11 @@
       </w:r>
     </w:p>
     <w:p>
-      <w:pPr/>
-      <w:r>
-        <w:t>▪ 1 User có 1 MembershipTier → User – MembershipTier: n – 1</w:t>
+      <w:pPr>
+        <w:ind w:left="360" w:hanging="240"/>
+      </w:pPr>
+      <w:r>
+        <w:t>•  1 User có 1 MembershipTier → User – MembershipTier: n – 1</w:t>
       </w:r>
     </w:p>
     <w:p>
@@ -6096,9 +6127,11 @@
       </w:r>
     </w:p>
     <w:p>
-      <w:pPr/>
-      <w:r>
-        <w:t>▪ 1 User có nhiều OTP → User – OTP: 1 – n</w:t>
+      <w:pPr>
+        <w:ind w:left="360" w:hanging="240"/>
+      </w:pPr>
+      <w:r>
+        <w:t>•  1 User có nhiều OTP → User – OTP: 1 – n</w:t>
       </w:r>
     </w:p>
     <w:p>
@@ -6108,9 +6141,11 @@
       </w:r>
     </w:p>
     <w:p>
-      <w:pPr/>
-      <w:r>
-        <w:t>▪ 1 User có nhiều LoginSession → User – LoginSession: 1 – n</w:t>
+      <w:pPr>
+        <w:ind w:left="360" w:hanging="240"/>
+      </w:pPr>
+      <w:r>
+        <w:t>•  1 User có nhiều LoginSession → User – LoginSession: 1 – n</w:t>
       </w:r>
     </w:p>
     <w:p>
@@ -6149,7 +6184,7 @@
       <w:r>
         <w:drawing>
           <wp:inline xmlns:a="http://schemas.openxmlformats.org/drawingml/2006/main" xmlns:pic="http://schemas.openxmlformats.org/drawingml/2006/picture">
-            <wp:extent cx="5486400" cy="4083627"/>
+            <wp:extent cx="5486400" cy="4783947"/>
             <wp:docPr id="7" name="Picture 7"/>
             <wp:cNvGraphicFramePr>
               <a:graphicFrameLocks noChangeAspect="1"/>
@@ -6170,7 +6205,7 @@
                   <pic:spPr>
                     <a:xfrm>
                       <a:off x="0" y="0"/>
-                      <a:ext cx="5486400" cy="4083627"/>
+                      <a:ext cx="5486400" cy="4783947"/>
                     </a:xfrm>
                     <a:prstGeom prst="rect"/>
                   </pic:spPr>
@@ -6831,7 +6866,7 @@
       <w:r>
         <w:drawing>
           <wp:inline xmlns:a="http://schemas.openxmlformats.org/drawingml/2006/main" xmlns:pic="http://schemas.openxmlformats.org/drawingml/2006/picture">
-            <wp:extent cx="5486400" cy="4839991"/>
+            <wp:extent cx="5486400" cy="3157538"/>
             <wp:docPr id="9" name="Picture 9"/>
             <wp:cNvGraphicFramePr>
               <a:graphicFrameLocks noChangeAspect="1"/>
@@ -6852,7 +6887,7 @@
                   <pic:spPr>
                     <a:xfrm>
                       <a:off x="0" y="0"/>
-                      <a:ext cx="5486400" cy="4839991"/>
+                      <a:ext cx="5486400" cy="3157538"/>
                     </a:xfrm>
                     <a:prstGeom prst="rect"/>
                   </pic:spPr>
@@ -6879,33 +6914,43 @@
       </w:r>
     </w:p>
     <w:p>
-      <w:pPr/>
-      <w:r>
-        <w:t>1. Khách hàng truy cập chức năng Đăng nhập.</w:t>
+      <w:pPr>
+        <w:ind w:left="360" w:hanging="240"/>
+      </w:pPr>
+      <w:r>
+        <w:t>1.  Khách hàng truy cập chức năng Đăng nhập.</w:t>
       </w:r>
     </w:p>
     <w:p>
-      <w:pPr/>
-      <w:r>
-        <w:t>2. Lớp LoginView hiển thị giao diện yêu cầu nhập thông tin đăng nhập.</w:t>
+      <w:pPr>
+        <w:ind w:left="360" w:hanging="240"/>
+      </w:pPr>
+      <w:r>
+        <w:t>2.  Lớp LoginView hiển thị giao diện yêu cầu nhập thông tin đăng nhập.</w:t>
       </w:r>
     </w:p>
     <w:p>
-      <w:pPr/>
-      <w:r>
-        <w:t>3. Khách hàng nhập SĐT và Mật khẩu.</w:t>
+      <w:pPr>
+        <w:ind w:left="360" w:hanging="240"/>
+      </w:pPr>
+      <w:r>
+        <w:t>3.  Khách hàng nhập SĐT và Mật khẩu.</w:t>
       </w:r>
     </w:p>
     <w:p>
-      <w:pPr/>
-      <w:r>
-        <w:t>4. Khách hàng nhấn nút Đăng nhập.</w:t>
+      <w:pPr>
+        <w:ind w:left="360" w:hanging="240"/>
+      </w:pPr>
+      <w:r>
+        <w:t>4.  Khách hàng nhấn nút Đăng nhập.</w:t>
       </w:r>
     </w:p>
     <w:p>
-      <w:pPr/>
-      <w:r>
-        <w:t xml:space="preserve">5. Lớp LoginView gọi hàm </w:t>
+      <w:pPr>
+        <w:ind w:left="360" w:hanging="240"/>
+      </w:pPr>
+      <w:r>
+        <w:t xml:space="preserve">5.  Lớp LoginView gọi hàm </w:t>
       </w:r>
       <w:r>
         <w:rPr>
@@ -6919,9 +6964,11 @@
       </w:r>
     </w:p>
     <w:p>
-      <w:pPr/>
-      <w:r>
-        <w:t xml:space="preserve">6. Lớp User gọi hàm </w:t>
+      <w:pPr>
+        <w:ind w:left="360" w:hanging="240"/>
+      </w:pPr>
+      <w:r>
+        <w:t xml:space="preserve">6.  Lớp User gọi hàm </w:t>
       </w:r>
       <w:r>
         <w:rPr>
@@ -6935,9 +6982,11 @@
       </w:r>
     </w:p>
     <w:p>
-      <w:pPr/>
-      <w:r>
-        <w:t xml:space="preserve">7. Lớp User gọi hàm </w:t>
+      <w:pPr>
+        <w:ind w:left="360" w:hanging="240"/>
+      </w:pPr>
+      <w:r>
+        <w:t xml:space="preserve">7.  Lớp User gọi hàm </w:t>
       </w:r>
       <w:r>
         <w:rPr>
@@ -6951,15 +7000,19 @@
       </w:r>
     </w:p>
     <w:p>
-      <w:pPr/>
-      <w:r>
-        <w:t>8. Lớp User trả kết quả về cho LoginView.</w:t>
+      <w:pPr>
+        <w:ind w:left="360" w:hanging="240"/>
+      </w:pPr>
+      <w:r>
+        <w:t>8.  Lớp User trả kết quả về cho LoginView.</w:t>
       </w:r>
     </w:p>
     <w:p>
-      <w:pPr/>
-      <w:r>
-        <w:t>9. Lớp LoginView hiển thị "Đăng nhập thành công" và chuyển hướng trang chủ.</w:t>
+      <w:pPr>
+        <w:ind w:left="360" w:hanging="240"/>
+      </w:pPr>
+      <w:r>
+        <w:t>9.  Lớp LoginView hiển thị "Đăng nhập thành công" và chuyển hướng trang chủ.</w:t>
       </w:r>
     </w:p>
     <w:p>
@@ -6977,7 +7030,7 @@
       <w:r>
         <w:drawing>
           <wp:inline xmlns:a="http://schemas.openxmlformats.org/drawingml/2006/main" xmlns:pic="http://schemas.openxmlformats.org/drawingml/2006/picture">
-            <wp:extent cx="5486400" cy="5711526"/>
+            <wp:extent cx="5486400" cy="4800600"/>
             <wp:docPr id="10" name="Picture 10"/>
             <wp:cNvGraphicFramePr>
               <a:graphicFrameLocks noChangeAspect="1"/>
@@ -6998,7 +7051,7 @@
                   <pic:spPr>
                     <a:xfrm>
                       <a:off x="0" y="0"/>
-                      <a:ext cx="5486400" cy="5711526"/>
+                      <a:ext cx="5486400" cy="4800600"/>
                     </a:xfrm>
                     <a:prstGeom prst="rect"/>
                   </pic:spPr>
@@ -7025,33 +7078,43 @@
       </w:r>
     </w:p>
     <w:p>
-      <w:pPr/>
-      <w:r>
-        <w:t>1. Khách hàng chọn chức năng Đăng ký từ giao diện đăng nhập.</w:t>
+      <w:pPr>
+        <w:ind w:left="360" w:hanging="240"/>
+      </w:pPr>
+      <w:r>
+        <w:t>1.  Khách hàng chọn chức năng Đăng ký từ giao diện đăng nhập.</w:t>
       </w:r>
     </w:p>
     <w:p>
-      <w:pPr/>
-      <w:r>
-        <w:t>2. Lớp RegisterView hiển thị giao diện yêu cầu nhập thông tin đăng ký.</w:t>
+      <w:pPr>
+        <w:ind w:left="360" w:hanging="240"/>
+      </w:pPr>
+      <w:r>
+        <w:t>2.  Lớp RegisterView hiển thị giao diện yêu cầu nhập thông tin đăng ký.</w:t>
       </w:r>
     </w:p>
     <w:p>
-      <w:pPr/>
-      <w:r>
-        <w:t>3. Khách hàng nhập Họ tên, SĐT, Email, Mật khẩu, Xác nhận mật khẩu.</w:t>
+      <w:pPr>
+        <w:ind w:left="360" w:hanging="240"/>
+      </w:pPr>
+      <w:r>
+        <w:t>3.  Khách hàng nhập Họ tên, SĐT, Email, Mật khẩu, Xác nhận mật khẩu.</w:t>
       </w:r>
     </w:p>
     <w:p>
-      <w:pPr/>
-      <w:r>
-        <w:t>4. Khách hàng nhấn nút Tiếp tục.</w:t>
+      <w:pPr>
+        <w:ind w:left="360" w:hanging="240"/>
+      </w:pPr>
+      <w:r>
+        <w:t>4.  Khách hàng nhấn nút Tiếp tục.</w:t>
       </w:r>
     </w:p>
     <w:p>
-      <w:pPr/>
-      <w:r>
-        <w:t xml:space="preserve">5. Lớp RegisterView gọi hàm </w:t>
+      <w:pPr>
+        <w:ind w:left="360" w:hanging="240"/>
+      </w:pPr>
+      <w:r>
+        <w:t xml:space="preserve">5.  Lớp RegisterView gọi hàm </w:t>
       </w:r>
       <w:r>
         <w:rPr>
@@ -7065,9 +7128,11 @@
       </w:r>
     </w:p>
     <w:p>
-      <w:pPr/>
-      <w:r>
-        <w:t xml:space="preserve">6. Lớp User gọi hàm </w:t>
+      <w:pPr>
+        <w:ind w:left="360" w:hanging="240"/>
+      </w:pPr>
+      <w:r>
+        <w:t xml:space="preserve">6.  Lớp User gọi hàm </w:t>
       </w:r>
       <w:r>
         <w:rPr>
@@ -7081,9 +7146,11 @@
       </w:r>
     </w:p>
     <w:p>
-      <w:pPr/>
-      <w:r>
-        <w:t xml:space="preserve">7. Lớp User gọi hàm </w:t>
+      <w:pPr>
+        <w:ind w:left="360" w:hanging="240"/>
+      </w:pPr>
+      <w:r>
+        <w:t xml:space="preserve">7.  Lớp User gọi hàm </w:t>
       </w:r>
       <w:r>
         <w:rPr>
@@ -7097,9 +7164,11 @@
       </w:r>
     </w:p>
     <w:p>
-      <w:pPr/>
-      <w:r>
-        <w:t xml:space="preserve">8. Lớp User gọi hàm </w:t>
+      <w:pPr>
+        <w:ind w:left="360" w:hanging="240"/>
+      </w:pPr>
+      <w:r>
+        <w:t xml:space="preserve">8.  Lớp User gọi hàm </w:t>
       </w:r>
       <w:r>
         <w:rPr>
@@ -7113,27 +7182,35 @@
       </w:r>
     </w:p>
     <w:p>
-      <w:pPr/>
-      <w:r>
-        <w:t>9. Lớp User trả kết quả về cho RegisterView.</w:t>
+      <w:pPr>
+        <w:ind w:left="360" w:hanging="240"/>
+      </w:pPr>
+      <w:r>
+        <w:t>9.  Lớp User trả kết quả về cho RegisterView.</w:t>
       </w:r>
     </w:p>
     <w:p>
-      <w:pPr/>
-      <w:r>
-        <w:t>10. Lớp RegisterView hiển thị giao diện xác nhận OTP.</w:t>
+      <w:pPr>
+        <w:ind w:left="360" w:hanging="240"/>
+      </w:pPr>
+      <w:r>
+        <w:t>10.  Lớp RegisterView hiển thị giao diện xác nhận OTP.</w:t>
       </w:r>
     </w:p>
     <w:p>
-      <w:pPr/>
-      <w:r>
-        <w:t>11. Khách hàng nhập mã OTP và nhấn nút Xác nhận.</w:t>
+      <w:pPr>
+        <w:ind w:left="360" w:hanging="240"/>
+      </w:pPr>
+      <w:r>
+        <w:t>11.  Khách hàng nhập mã OTP và nhấn nút Xác nhận.</w:t>
       </w:r>
     </w:p>
     <w:p>
-      <w:pPr/>
-      <w:r>
-        <w:t xml:space="preserve">12. Lớp OTPVerifyView gọi hàm </w:t>
+      <w:pPr>
+        <w:ind w:left="360" w:hanging="240"/>
+      </w:pPr>
+      <w:r>
+        <w:t xml:space="preserve">12.  Lớp OTPVerifyView gọi hàm </w:t>
       </w:r>
       <w:r>
         <w:rPr>
@@ -7147,9 +7224,11 @@
       </w:r>
     </w:p>
     <w:p>
-      <w:pPr/>
-      <w:r>
-        <w:t xml:space="preserve">13. Lớp OTP gọi hàm </w:t>
+      <w:pPr>
+        <w:ind w:left="360" w:hanging="240"/>
+      </w:pPr>
+      <w:r>
+        <w:t xml:space="preserve">13.  Lớp OTP gọi hàm </w:t>
       </w:r>
       <w:r>
         <w:rPr>
@@ -7163,9 +7242,11 @@
       </w:r>
     </w:p>
     <w:p>
-      <w:pPr/>
-      <w:r>
-        <w:t xml:space="preserve">14. Lớp OTPVerifyView gọi hàm </w:t>
+      <w:pPr>
+        <w:ind w:left="360" w:hanging="240"/>
+      </w:pPr>
+      <w:r>
+        <w:t xml:space="preserve">14.  Lớp OTPVerifyView gọi hàm </w:t>
       </w:r>
       <w:r>
         <w:rPr>
@@ -7179,9 +7260,11 @@
       </w:r>
     </w:p>
     <w:p>
-      <w:pPr/>
-      <w:r>
-        <w:t>15. Lớp OTPVerifyView hiển thị "Đăng ký thành công!"</w:t>
+      <w:pPr>
+        <w:ind w:left="360" w:hanging="240"/>
+      </w:pPr>
+      <w:r>
+        <w:t>15.  Lớp OTPVerifyView hiển thị "Đăng ký thành công!"</w:t>
       </w:r>
     </w:p>
     <w:p>
@@ -7199,7 +7282,7 @@
       <w:r>
         <w:drawing>
           <wp:inline xmlns:a="http://schemas.openxmlformats.org/drawingml/2006/main" xmlns:pic="http://schemas.openxmlformats.org/drawingml/2006/picture">
-            <wp:extent cx="5486400" cy="4881669"/>
+            <wp:extent cx="5486400" cy="3875204"/>
             <wp:docPr id="11" name="Picture 11"/>
             <wp:cNvGraphicFramePr>
               <a:graphicFrameLocks noChangeAspect="1"/>
@@ -7220,7 +7303,7 @@
                   <pic:spPr>
                     <a:xfrm>
                       <a:off x="0" y="0"/>
-                      <a:ext cx="5486400" cy="4881669"/>
+                      <a:ext cx="5486400" cy="3875204"/>
                     </a:xfrm>
                     <a:prstGeom prst="rect"/>
                   </pic:spPr>
@@ -7247,33 +7330,43 @@
       </w:r>
     </w:p>
     <w:p>
-      <w:pPr/>
-      <w:r>
-        <w:t>1. Người dùng truy cập chức năng Đổi mật khẩu.</w:t>
+      <w:pPr>
+        <w:ind w:left="360" w:hanging="240"/>
+      </w:pPr>
+      <w:r>
+        <w:t>1.  Người dùng truy cập chức năng Đổi mật khẩu.</w:t>
       </w:r>
     </w:p>
     <w:p>
-      <w:pPr/>
-      <w:r>
-        <w:t>2. Lớp ChangePasswordView hiển thị giao diện yêu cầu nhập mật khẩu hiện tại và mật khẩu mới.</w:t>
+      <w:pPr>
+        <w:ind w:left="360" w:hanging="240"/>
+      </w:pPr>
+      <w:r>
+        <w:t>2.  Lớp ChangePasswordView hiển thị giao diện yêu cầu nhập mật khẩu hiện tại và mật khẩu mới.</w:t>
       </w:r>
     </w:p>
     <w:p>
-      <w:pPr/>
-      <w:r>
-        <w:t>3. Người dùng nhập Mật khẩu hiện tại, Mật khẩu mới, Xác nhận mật khẩu mới.</w:t>
+      <w:pPr>
+        <w:ind w:left="360" w:hanging="240"/>
+      </w:pPr>
+      <w:r>
+        <w:t>3.  Người dùng nhập Mật khẩu hiện tại, Mật khẩu mới, Xác nhận mật khẩu mới.</w:t>
       </w:r>
     </w:p>
     <w:p>
-      <w:pPr/>
-      <w:r>
-        <w:t>4. Người dùng nhấn nút Lưu thay đổi.</w:t>
+      <w:pPr>
+        <w:ind w:left="360" w:hanging="240"/>
+      </w:pPr>
+      <w:r>
+        <w:t>4.  Người dùng nhấn nút Lưu thay đổi.</w:t>
       </w:r>
     </w:p>
     <w:p>
-      <w:pPr/>
-      <w:r>
-        <w:t xml:space="preserve">5. Lớp ChangePasswordView gọi hàm </w:t>
+      <w:pPr>
+        <w:ind w:left="360" w:hanging="240"/>
+      </w:pPr>
+      <w:r>
+        <w:t xml:space="preserve">5.  Lớp ChangePasswordView gọi hàm </w:t>
       </w:r>
       <w:r>
         <w:rPr>
@@ -7287,9 +7380,11 @@
       </w:r>
     </w:p>
     <w:p>
-      <w:pPr/>
-      <w:r>
-        <w:t xml:space="preserve">6. Lớp User gọi hàm </w:t>
+      <w:pPr>
+        <w:ind w:left="360" w:hanging="240"/>
+      </w:pPr>
+      <w:r>
+        <w:t xml:space="preserve">6.  Lớp User gọi hàm </w:t>
       </w:r>
       <w:r>
         <w:rPr>
@@ -7303,9 +7398,11 @@
       </w:r>
     </w:p>
     <w:p>
-      <w:pPr/>
-      <w:r>
-        <w:t xml:space="preserve">7. Lớp User gọi hàm </w:t>
+      <w:pPr>
+        <w:ind w:left="360" w:hanging="240"/>
+      </w:pPr>
+      <w:r>
+        <w:t xml:space="preserve">7.  Lớp User gọi hàm </w:t>
       </w:r>
       <w:r>
         <w:rPr>
@@ -7319,9 +7416,11 @@
       </w:r>
     </w:p>
     <w:p>
-      <w:pPr/>
-      <w:r>
-        <w:t xml:space="preserve">8. Lớp User gọi hàm </w:t>
+      <w:pPr>
+        <w:ind w:left="360" w:hanging="240"/>
+      </w:pPr>
+      <w:r>
+        <w:t xml:space="preserve">8.  Lớp User gọi hàm </w:t>
       </w:r>
       <w:r>
         <w:rPr>
@@ -7335,9 +7434,11 @@
       </w:r>
     </w:p>
     <w:p>
-      <w:pPr/>
-      <w:r>
-        <w:t xml:space="preserve">9. Lớp User gọi hàm </w:t>
+      <w:pPr>
+        <w:ind w:left="360" w:hanging="240"/>
+      </w:pPr>
+      <w:r>
+        <w:t xml:space="preserve">9.  Lớp User gọi hàm </w:t>
       </w:r>
       <w:r>
         <w:rPr>
@@ -7351,9 +7452,11 @@
       </w:r>
     </w:p>
     <w:p>
-      <w:pPr/>
-      <w:r>
-        <w:t xml:space="preserve">10. Lớp User gọi hàm </w:t>
+      <w:pPr>
+        <w:ind w:left="360" w:hanging="240"/>
+      </w:pPr>
+      <w:r>
+        <w:t xml:space="preserve">10.  Lớp User gọi hàm </w:t>
       </w:r>
       <w:r>
         <w:rPr>
@@ -7367,15 +7470,19 @@
       </w:r>
     </w:p>
     <w:p>
-      <w:pPr/>
-      <w:r>
-        <w:t>11. Lớp User trả kết quả về cho ChangePasswordView.</w:t>
+      <w:pPr>
+        <w:ind w:left="360" w:hanging="240"/>
+      </w:pPr>
+      <w:r>
+        <w:t>11.  Lớp User trả kết quả về cho ChangePasswordView.</w:t>
       </w:r>
     </w:p>
     <w:p>
-      <w:pPr/>
-      <w:r>
-        <w:t>12. Lớp ChangePasswordView hiển thị "Đổi mật khẩu thành công. Vui lòng đăng nhập lại."</w:t>
+      <w:pPr>
+        <w:ind w:left="360" w:hanging="240"/>
+      </w:pPr>
+      <w:r>
+        <w:t>12.  Lớp ChangePasswordView hiển thị "Đổi mật khẩu thành công. Vui lòng đăng nhập lại."</w:t>
       </w:r>
     </w:p>
     <w:p>
@@ -7393,7 +7500,7 @@
       <w:r>
         <w:drawing>
           <wp:inline xmlns:a="http://schemas.openxmlformats.org/drawingml/2006/main" xmlns:pic="http://schemas.openxmlformats.org/drawingml/2006/picture">
-            <wp:extent cx="5486400" cy="5538552"/>
+            <wp:extent cx="5486400" cy="4553455"/>
             <wp:docPr id="12" name="Picture 12"/>
             <wp:cNvGraphicFramePr>
               <a:graphicFrameLocks noChangeAspect="1"/>
@@ -7414,7 +7521,7 @@
                   <pic:spPr>
                     <a:xfrm>
                       <a:off x="0" y="0"/>
-                      <a:ext cx="5486400" cy="5538552"/>
+                      <a:ext cx="5486400" cy="4553455"/>
                     </a:xfrm>
                     <a:prstGeom prst="rect"/>
                   </pic:spPr>
@@ -7441,15 +7548,19 @@
       </w:r>
     </w:p>
     <w:p>
-      <w:pPr/>
-      <w:r>
-        <w:t>1. Khách hàng chọn chức năng Hồ sơ cá nhân.</w:t>
+      <w:pPr>
+        <w:ind w:left="360" w:hanging="240"/>
+      </w:pPr>
+      <w:r>
+        <w:t>1.  Khách hàng chọn chức năng Hồ sơ cá nhân.</w:t>
       </w:r>
     </w:p>
     <w:p>
-      <w:pPr/>
-      <w:r>
-        <w:t xml:space="preserve">2. Lớp ProfileView gọi hàm </w:t>
+      <w:pPr>
+        <w:ind w:left="360" w:hanging="240"/>
+      </w:pPr>
+      <w:r>
+        <w:t xml:space="preserve">2.  Lớp ProfileView gọi hàm </w:t>
       </w:r>
       <w:r>
         <w:rPr>
@@ -7463,9 +7574,11 @@
       </w:r>
     </w:p>
     <w:p>
-      <w:pPr/>
-      <w:r>
-        <w:t xml:space="preserve">3. Lớp User gọi hàm </w:t>
+      <w:pPr>
+        <w:ind w:left="360" w:hanging="240"/>
+      </w:pPr>
+      <w:r>
+        <w:t xml:space="preserve">3.  Lớp User gọi hàm </w:t>
       </w:r>
       <w:r>
         <w:rPr>
@@ -7479,27 +7592,35 @@
       </w:r>
     </w:p>
     <w:p>
-      <w:pPr/>
-      <w:r>
-        <w:t>4. Lớp User trả kết quả về cho ProfileView.</w:t>
+      <w:pPr>
+        <w:ind w:left="360" w:hanging="240"/>
+      </w:pPr>
+      <w:r>
+        <w:t>4.  Lớp User trả kết quả về cho ProfileView.</w:t>
       </w:r>
     </w:p>
     <w:p>
-      <w:pPr/>
-      <w:r>
-        <w:t>5. Lớp ProfileView hiển thị hồ sơ: Họ tên, SĐT, Email, Hạng hội viên, Điểm tích lũy.</w:t>
+      <w:pPr>
+        <w:ind w:left="360" w:hanging="240"/>
+      </w:pPr>
+      <w:r>
+        <w:t>5.  Lớp ProfileView hiển thị hồ sơ: Họ tên, SĐT, Email, Hạng hội viên, Điểm tích lũy.</w:t>
       </w:r>
     </w:p>
     <w:p>
-      <w:pPr/>
-      <w:r>
-        <w:t>6. Khách hàng nhấn nút Chỉnh sửa thông tin, cập nhật thông tin và nhấn nút Lưu.</w:t>
+      <w:pPr>
+        <w:ind w:left="360" w:hanging="240"/>
+      </w:pPr>
+      <w:r>
+        <w:t>6.  Khách hàng nhấn nút Chỉnh sửa thông tin, cập nhật thông tin và nhấn nút Lưu.</w:t>
       </w:r>
     </w:p>
     <w:p>
-      <w:pPr/>
-      <w:r>
-        <w:t xml:space="preserve">7. Lớp ProfileView gọi hàm </w:t>
+      <w:pPr>
+        <w:ind w:left="360" w:hanging="240"/>
+      </w:pPr>
+      <w:r>
+        <w:t xml:space="preserve">7.  Lớp ProfileView gọi hàm </w:t>
       </w:r>
       <w:r>
         <w:rPr>
@@ -7513,9 +7634,11 @@
       </w:r>
     </w:p>
     <w:p>
-      <w:pPr/>
-      <w:r>
-        <w:t xml:space="preserve">8. Lớp User gọi hàm </w:t>
+      <w:pPr>
+        <w:ind w:left="360" w:hanging="240"/>
+      </w:pPr>
+      <w:r>
+        <w:t xml:space="preserve">8.  Lớp User gọi hàm </w:t>
       </w:r>
       <w:r>
         <w:rPr>
@@ -7529,9 +7652,11 @@
       </w:r>
     </w:p>
     <w:p>
-      <w:pPr/>
-      <w:r>
-        <w:t xml:space="preserve">9. Lớp User gọi hàm </w:t>
+      <w:pPr>
+        <w:ind w:left="360" w:hanging="240"/>
+      </w:pPr>
+      <w:r>
+        <w:t xml:space="preserve">9.  Lớp User gọi hàm </w:t>
       </w:r>
       <w:r>
         <w:rPr>
@@ -7545,15 +7670,19 @@
       </w:r>
     </w:p>
     <w:p>
-      <w:pPr/>
-      <w:r>
-        <w:t>10. Lớp User trả kết quả về cho ProfileView.</w:t>
+      <w:pPr>
+        <w:ind w:left="360" w:hanging="240"/>
+      </w:pPr>
+      <w:r>
+        <w:t>10.  Lớp User trả kết quả về cho ProfileView.</w:t>
       </w:r>
     </w:p>
     <w:p>
-      <w:pPr/>
-      <w:r>
-        <w:t>11. Lớp ProfileView hiển thị "Cập nhật thành công!"</w:t>
+      <w:pPr>
+        <w:ind w:left="360" w:hanging="240"/>
+      </w:pPr>
+      <w:r>
+        <w:t>11.  Lớp ProfileView hiển thị "Cập nhật thành công!"</w:t>
       </w:r>
     </w:p>
     <w:p>
@@ -7571,7 +7700,7 @@
       <w:r>
         <w:drawing>
           <wp:inline xmlns:a="http://schemas.openxmlformats.org/drawingml/2006/main" xmlns:pic="http://schemas.openxmlformats.org/drawingml/2006/picture">
-            <wp:extent cx="5486400" cy="5231219"/>
+            <wp:extent cx="5486400" cy="4935758"/>
             <wp:docPr id="13" name="Picture 13"/>
             <wp:cNvGraphicFramePr>
               <a:graphicFrameLocks noChangeAspect="1"/>
@@ -7592,7 +7721,7 @@
                   <pic:spPr>
                     <a:xfrm>
                       <a:off x="0" y="0"/>
-                      <a:ext cx="5486400" cy="5231219"/>
+                      <a:ext cx="5486400" cy="4935758"/>
                     </a:xfrm>
                     <a:prstGeom prst="rect"/>
                   </pic:spPr>
@@ -7619,15 +7748,19 @@
       </w:r>
     </w:p>
     <w:p>
-      <w:pPr/>
-      <w:r>
-        <w:t>1. Admin truy cập chức năng Quản lý nhân viên từ trang quản trị.</w:t>
+      <w:pPr>
+        <w:ind w:left="360" w:hanging="240"/>
+      </w:pPr>
+      <w:r>
+        <w:t>1.  Admin truy cập chức năng Quản lý nhân viên từ trang quản trị.</w:t>
       </w:r>
     </w:p>
     <w:p>
-      <w:pPr/>
-      <w:r>
-        <w:t xml:space="preserve">2. Lớp StaffManageView gọi hàm </w:t>
+      <w:pPr>
+        <w:ind w:left="360" w:hanging="240"/>
+      </w:pPr>
+      <w:r>
+        <w:t xml:space="preserve">2.  Lớp StaffManageView gọi hàm </w:t>
       </w:r>
       <w:r>
         <w:rPr>
@@ -7641,9 +7774,11 @@
       </w:r>
     </w:p>
     <w:p>
-      <w:pPr/>
-      <w:r>
-        <w:t xml:space="preserve">3. Lớp Employee gọi hàm </w:t>
+      <w:pPr>
+        <w:ind w:left="360" w:hanging="240"/>
+      </w:pPr>
+      <w:r>
+        <w:t xml:space="preserve">3.  Lớp Employee gọi hàm </w:t>
       </w:r>
       <w:r>
         <w:rPr>
@@ -7657,27 +7792,35 @@
       </w:r>
     </w:p>
     <w:p>
-      <w:pPr/>
-      <w:r>
-        <w:t>4. Lớp Employee trả kết quả về cho StaffManageView.</w:t>
+      <w:pPr>
+        <w:ind w:left="360" w:hanging="240"/>
+      </w:pPr>
+      <w:r>
+        <w:t>4.  Lớp Employee trả kết quả về cho StaffManageView.</w:t>
       </w:r>
     </w:p>
     <w:p>
-      <w:pPr/>
-      <w:r>
-        <w:t>5. Lớp StaffManageView hiển thị bảng danh sách nhân viên.</w:t>
+      <w:pPr>
+        <w:ind w:left="360" w:hanging="240"/>
+      </w:pPr>
+      <w:r>
+        <w:t>5.  Lớp StaffManageView hiển thị bảng danh sách nhân viên.</w:t>
       </w:r>
     </w:p>
     <w:p>
-      <w:pPr/>
-      <w:r>
-        <w:t>6. Admin nhấn nút Thêm, nhập thông tin nhân viên và nhấn nút Lưu.</w:t>
+      <w:pPr>
+        <w:ind w:left="360" w:hanging="240"/>
+      </w:pPr>
+      <w:r>
+        <w:t>6.  Admin nhấn nút Thêm, nhập thông tin nhân viên và nhấn nút Lưu.</w:t>
       </w:r>
     </w:p>
     <w:p>
-      <w:pPr/>
-      <w:r>
-        <w:t xml:space="preserve">7. Lớp StaffManageView gọi hàm </w:t>
+      <w:pPr>
+        <w:ind w:left="360" w:hanging="240"/>
+      </w:pPr>
+      <w:r>
+        <w:t xml:space="preserve">7.  Lớp StaffManageView gọi hàm </w:t>
       </w:r>
       <w:r>
         <w:rPr>
@@ -7691,9 +7834,11 @@
       </w:r>
     </w:p>
     <w:p>
-      <w:pPr/>
-      <w:r>
-        <w:t xml:space="preserve">8. Lớp Employee gọi hàm </w:t>
+      <w:pPr>
+        <w:ind w:left="360" w:hanging="240"/>
+      </w:pPr>
+      <w:r>
+        <w:t xml:space="preserve">8.  Lớp Employee gọi hàm </w:t>
       </w:r>
       <w:r>
         <w:rPr>
@@ -7707,15 +7852,19 @@
       </w:r>
     </w:p>
     <w:p>
-      <w:pPr/>
-      <w:r>
-        <w:t>9. Lớp Employee trả kết quả về cho StaffManageView.</w:t>
+      <w:pPr>
+        <w:ind w:left="360" w:hanging="240"/>
+      </w:pPr>
+      <w:r>
+        <w:t>9.  Lớp Employee trả kết quả về cho StaffManageView.</w:t>
       </w:r>
     </w:p>
     <w:p>
-      <w:pPr/>
-      <w:r>
-        <w:t>10. Lớp StaffManageView hiển thị "Thêm nhân viên thành công!"</w:t>
+      <w:pPr>
+        <w:ind w:left="360" w:hanging="240"/>
+      </w:pPr>
+      <w:r>
+        <w:t>10.  Lớp StaffManageView hiển thị "Thêm nhân viên thành công!"</w:t>
       </w:r>
     </w:p>
     <w:p/>
@@ -7749,10 +7898,10 @@
     </w:p>
     <w:p>
       <w:pPr>
-        <w:pStyle w:val="ListBullet"/>
+        <w:ind w:left="360" w:hanging="240"/>
       </w:pPr>
       <w:r>
-        <w:t xml:space="preserve">User: </w:t>
+        <w:t xml:space="preserve">•  User: </w:t>
       </w:r>
       <w:r>
         <w:rPr>
@@ -7764,10 +7913,10 @@
     </w:p>
     <w:p>
       <w:pPr>
-        <w:pStyle w:val="ListBullet"/>
+        <w:ind w:left="360" w:hanging="240"/>
       </w:pPr>
       <w:r>
-        <w:t xml:space="preserve">MembershipTier: </w:t>
+        <w:t xml:space="preserve">•  MembershipTier: </w:t>
       </w:r>
       <w:r>
         <w:rPr>
@@ -7779,10 +7928,10 @@
     </w:p>
     <w:p>
       <w:pPr>
-        <w:pStyle w:val="ListBullet"/>
+        <w:ind w:left="360" w:hanging="240"/>
       </w:pPr>
       <w:r>
-        <w:t xml:space="preserve">OTP: </w:t>
+        <w:t xml:space="preserve">•  OTP: </w:t>
       </w:r>
       <w:r>
         <w:rPr>
@@ -7794,10 +7943,10 @@
     </w:p>
     <w:p>
       <w:pPr>
-        <w:pStyle w:val="ListBullet"/>
+        <w:ind w:left="360" w:hanging="240"/>
       </w:pPr>
       <w:r>
-        <w:t xml:space="preserve">LoginSession: </w:t>
+        <w:t xml:space="preserve">•  LoginSession: </w:t>
       </w:r>
       <w:r>
         <w:rPr>
@@ -7809,10 +7958,10 @@
     </w:p>
     <w:p>
       <w:pPr>
-        <w:pStyle w:val="ListBullet"/>
+        <w:ind w:left="360" w:hanging="240"/>
       </w:pPr>
       <w:r>
-        <w:t xml:space="preserve">Employee: </w:t>
+        <w:t xml:space="preserve">•  Employee: </w:t>
       </w:r>
       <w:r>
         <w:rPr>
@@ -7832,10 +7981,10 @@
     </w:p>
     <w:p>
       <w:pPr>
-        <w:pStyle w:val="ListBullet"/>
+        <w:ind w:left="360" w:hanging="240"/>
       </w:pPr>
       <w:r>
-        <w:t xml:space="preserve">User: </w:t>
+        <w:t xml:space="preserve">•  User: </w:t>
       </w:r>
       <w:r>
         <w:rPr>
@@ -7917,10 +8066,10 @@
     </w:p>
     <w:p>
       <w:pPr>
-        <w:pStyle w:val="ListBullet"/>
+        <w:ind w:left="360" w:hanging="240"/>
       </w:pPr>
       <w:r>
-        <w:t xml:space="preserve">MembershipTier: </w:t>
+        <w:t xml:space="preserve">•  MembershipTier: </w:t>
       </w:r>
       <w:r>
         <w:rPr>
@@ -7972,10 +8121,10 @@
     </w:p>
     <w:p>
       <w:pPr>
-        <w:pStyle w:val="ListBullet"/>
+        <w:ind w:left="360" w:hanging="240"/>
       </w:pPr>
       <w:r>
-        <w:t xml:space="preserve">OTP: </w:t>
+        <w:t xml:space="preserve">•  OTP: </w:t>
       </w:r>
       <w:r>
         <w:rPr>
@@ -8027,10 +8176,10 @@
     </w:p>
     <w:p>
       <w:pPr>
-        <w:pStyle w:val="ListBullet"/>
+        <w:ind w:left="360" w:hanging="240"/>
       </w:pPr>
       <w:r>
-        <w:t xml:space="preserve">LoginSession: </w:t>
+        <w:t xml:space="preserve">•  LoginSession: </w:t>
       </w:r>
       <w:r>
         <w:rPr>
@@ -8082,10 +8231,10 @@
     </w:p>
     <w:p>
       <w:pPr>
-        <w:pStyle w:val="ListBullet"/>
+        <w:ind w:left="360" w:hanging="240"/>
       </w:pPr>
       <w:r>
-        <w:t xml:space="preserve">Employee: </w:t>
+        <w:t xml:space="preserve">•  Employee: </w:t>
       </w:r>
       <w:r>
         <w:rPr>
@@ -8135,10 +8284,10 @@
     </w:p>
     <w:p>
       <w:pPr>
-        <w:pStyle w:val="ListBullet"/>
+        <w:ind w:left="360" w:hanging="240"/>
       </w:pPr>
       <w:r>
-        <w:t xml:space="preserve">User </w:t>
+        <w:t xml:space="preserve">•  User </w:t>
       </w:r>
       <w:r>
         <w:rPr>
@@ -8153,10 +8302,10 @@
     </w:p>
     <w:p>
       <w:pPr>
-        <w:pStyle w:val="ListBullet"/>
+        <w:ind w:left="360" w:hanging="240"/>
       </w:pPr>
       <w:r>
-        <w:t xml:space="preserve">User </w:t>
+        <w:t xml:space="preserve">•  User </w:t>
       </w:r>
       <w:r>
         <w:rPr>
@@ -8171,10 +8320,10 @@
     </w:p>
     <w:p>
       <w:pPr>
-        <w:pStyle w:val="ListBullet"/>
+        <w:ind w:left="360" w:hanging="240"/>
       </w:pPr>
       <w:r>
-        <w:t xml:space="preserve">User </w:t>
+        <w:t xml:space="preserve">•  User </w:t>
       </w:r>
       <w:r>
         <w:rPr>
@@ -8197,10 +8346,10 @@
     </w:p>
     <w:p>
       <w:pPr>
-        <w:pStyle w:val="ListBullet"/>
+        <w:ind w:left="360" w:hanging="240"/>
       </w:pPr>
       <w:r>
-        <w:t xml:space="preserve">User: </w:t>
+        <w:t xml:space="preserve">•  User: </w:t>
       </w:r>
       <w:r>
         <w:rPr>
@@ -8212,10 +8361,10 @@
     </w:p>
     <w:p>
       <w:pPr>
-        <w:pStyle w:val="ListBullet"/>
+        <w:ind w:left="360" w:hanging="240"/>
       </w:pPr>
       <w:r>
-        <w:t xml:space="preserve">LoginSession: </w:t>
+        <w:t xml:space="preserve">•  LoginSession: </w:t>
       </w:r>
       <w:r>
         <w:rPr>
@@ -8227,10 +8376,10 @@
     </w:p>
     <w:p>
       <w:pPr>
-        <w:pStyle w:val="ListBullet"/>
+        <w:ind w:left="360" w:hanging="240"/>
       </w:pPr>
       <w:r>
-        <w:t xml:space="preserve">OTP: </w:t>
+        <w:t xml:space="preserve">•  OTP: </w:t>
       </w:r>
       <w:r>
         <w:rPr>
@@ -8741,10 +8890,10 @@
     </w:p>
     <w:p>
       <w:pPr>
-        <w:pStyle w:val="ListBullet"/>
+        <w:ind w:left="360" w:hanging="240"/>
       </w:pPr>
       <w:r>
-        <w:t xml:space="preserve">User – MembershipTier (n-1): tblUser có FK </w:t>
+        <w:t xml:space="preserve">•  User – MembershipTier (n-1): tblUser có FK </w:t>
       </w:r>
       <w:r>
         <w:rPr>
@@ -8756,10 +8905,10 @@
     </w:p>
     <w:p>
       <w:pPr>
-        <w:pStyle w:val="ListBullet"/>
+        <w:ind w:left="360" w:hanging="240"/>
       </w:pPr>
       <w:r>
-        <w:t xml:space="preserve">User – OTP (1-n): tblOTP có FK </w:t>
+        <w:t xml:space="preserve">•  User – OTP (1-n): tblOTP có FK </w:t>
       </w:r>
       <w:r>
         <w:rPr>
@@ -8771,10 +8920,10 @@
     </w:p>
     <w:p>
       <w:pPr>
-        <w:pStyle w:val="ListBullet"/>
+        <w:ind w:left="360" w:hanging="240"/>
       </w:pPr>
       <w:r>
-        <w:t xml:space="preserve">User – LoginSession (1-n): tblLoginSession có FK </w:t>
+        <w:t xml:space="preserve">•  User – LoginSession (1-n): tblLoginSession có FK </w:t>
       </w:r>
       <w:r>
         <w:rPr>
@@ -8794,10 +8943,10 @@
     </w:p>
     <w:p>
       <w:pPr>
-        <w:pStyle w:val="ListBullet"/>
+        <w:ind w:left="360" w:hanging="240"/>
       </w:pPr>
       <w:r>
-        <w:t xml:space="preserve">PK: </w:t>
+        <w:t xml:space="preserve">•  PK: </w:t>
       </w:r>
       <w:r>
         <w:rPr>
@@ -8809,10 +8958,10 @@
     </w:p>
     <w:p>
       <w:pPr>
-        <w:pStyle w:val="ListBullet"/>
+        <w:ind w:left="360" w:hanging="240"/>
       </w:pPr>
       <w:r>
-        <w:t xml:space="preserve">FK: </w:t>
+        <w:t xml:space="preserve">•  FK: </w:t>
       </w:r>
       <w:r>
         <w:rPr>
@@ -9183,13 +9332,13 @@
     </w:p>
     <w:p>
       <w:pPr>
-        <w:pStyle w:val="ListBullet"/>
+        <w:ind w:left="360" w:hanging="240"/>
       </w:pPr>
       <w:r>
         <w:rPr>
           <w:b/>
         </w:rPr>
-        <w:t>a) Đăng nhập</w:t>
+        <w:t>•  a) Đăng nhập</w:t>
       </w:r>
       <w:r>
         <w:t xml:space="preserve"> =&gt; </w:t>
@@ -9204,38 +9353,38 @@
     </w:p>
     <w:p>
       <w:pPr>
-        <w:pStyle w:val="ListBullet"/>
+        <w:ind w:left="720" w:hanging="240"/>
       </w:pPr>
       <w:r>
-        <w:t>Input: username, password</w:t>
+        <w:t>◦  Input: username, password</w:t>
       </w:r>
     </w:p>
     <w:p>
       <w:pPr>
-        <w:pStyle w:val="ListBullet"/>
+        <w:ind w:left="720" w:hanging="240"/>
       </w:pPr>
       <w:r>
-        <w:t>Output: boolean</w:t>
+        <w:t>◦  Output: boolean</w:t>
       </w:r>
     </w:p>
     <w:p>
       <w:pPr>
-        <w:pStyle w:val="ListBullet"/>
+        <w:ind w:left="720" w:hanging="240"/>
       </w:pPr>
       <w:r>
-        <w:t>Ứng viên tham số vào:</w:t>
+        <w:t>◦  Ứng viên tham số vào:</w:t>
       </w:r>
     </w:p>
     <w:p>
       <w:pPr>
-        <w:pStyle w:val="ListBullet"/>
+        <w:ind w:left="1080" w:hanging="240"/>
       </w:pPr>
       <w:r>
         <w:rPr>
           <w:rFonts w:ascii="Courier New" w:hAnsi="Courier New"/>
           <w:sz w:val="20"/>
         </w:rPr>
-        <w:t>checkLogin()</w:t>
+        <w:t>▪  checkLogin()</w:t>
       </w:r>
       <w:r>
         <w:t xml:space="preserve"> → chọn (gom nhóm tham số)</w:t>
@@ -9243,22 +9392,22 @@
     </w:p>
     <w:p>
       <w:pPr>
-        <w:pStyle w:val="ListBullet"/>
+        <w:ind w:left="720" w:hanging="240"/>
       </w:pPr>
       <w:r>
-        <w:t>Ứng viên tham số ra:</w:t>
+        <w:t>◦  Ứng viên tham số ra:</w:t>
       </w:r>
     </w:p>
     <w:p>
       <w:pPr>
-        <w:pStyle w:val="ListBullet"/>
+        <w:ind w:left="1080" w:hanging="240"/>
       </w:pPr>
       <w:r>
         <w:rPr>
           <w:rFonts w:ascii="Courier New" w:hAnsi="Courier New"/>
           <w:sz w:val="20"/>
         </w:rPr>
-        <w:t>checkLogin(): void</w:t>
+        <w:t>▪  checkLogin(): void</w:t>
       </w:r>
       <w:r>
         <w:t xml:space="preserve"> → loại (cần trả về kết quả xác thực)</w:t>
@@ -9266,14 +9415,14 @@
     </w:p>
     <w:p>
       <w:pPr>
-        <w:pStyle w:val="ListBullet"/>
+        <w:ind w:left="1080" w:hanging="240"/>
       </w:pPr>
       <w:r>
         <w:rPr>
           <w:rFonts w:ascii="Courier New" w:hAnsi="Courier New"/>
           <w:sz w:val="20"/>
         </w:rPr>
-        <w:t>checkLogin(): boolean</w:t>
+        <w:t>▪  checkLogin(): boolean</w:t>
       </w:r>
       <w:r>
         <w:t xml:space="preserve"> → chọn (trả về true/false xác thực thành công)</w:t>
@@ -9281,13 +9430,13 @@
     </w:p>
     <w:p>
       <w:pPr>
-        <w:pStyle w:val="ListBullet"/>
+        <w:ind w:left="360" w:hanging="240"/>
       </w:pPr>
       <w:r>
         <w:rPr>
           <w:b/>
         </w:rPr>
-        <w:t>b) Đăng ký</w:t>
+        <w:t>•  b) Đăng ký</w:t>
       </w:r>
       <w:r>
         <w:t xml:space="preserve"> =&gt; </w:t>
@@ -9302,38 +9451,38 @@
     </w:p>
     <w:p>
       <w:pPr>
-        <w:pStyle w:val="ListBullet"/>
+        <w:ind w:left="720" w:hanging="240"/>
       </w:pPr>
       <w:r>
-        <w:t>Input: hoTen, sdt, email, matKhau</w:t>
+        <w:t>◦  Input: hoTen, sdt, email, matKhau</w:t>
       </w:r>
     </w:p>
     <w:p>
       <w:pPr>
-        <w:pStyle w:val="ListBullet"/>
+        <w:ind w:left="720" w:hanging="240"/>
       </w:pPr>
       <w:r>
-        <w:t>Output: User (vừa tạo)</w:t>
+        <w:t>◦  Output: User (vừa tạo)</w:t>
       </w:r>
     </w:p>
     <w:p>
       <w:pPr>
-        <w:pStyle w:val="ListBullet"/>
+        <w:ind w:left="720" w:hanging="240"/>
       </w:pPr>
       <w:r>
-        <w:t>Ứng viên tham số vào:</w:t>
+        <w:t>◦  Ứng viên tham số vào:</w:t>
       </w:r>
     </w:p>
     <w:p>
       <w:pPr>
-        <w:pStyle w:val="ListBullet"/>
+        <w:ind w:left="1080" w:hanging="240"/>
       </w:pPr>
       <w:r>
         <w:rPr>
           <w:rFonts w:ascii="Courier New" w:hAnsi="Courier New"/>
           <w:sz w:val="20"/>
         </w:rPr>
-        <w:t>register()</w:t>
+        <w:t>▪  register()</w:t>
       </w:r>
       <w:r>
         <w:t xml:space="preserve"> → chọn</w:t>
@@ -9341,22 +9490,22 @@
     </w:p>
     <w:p>
       <w:pPr>
-        <w:pStyle w:val="ListBullet"/>
+        <w:ind w:left="720" w:hanging="240"/>
       </w:pPr>
       <w:r>
-        <w:t>Ứng viên tham số ra:</w:t>
+        <w:t>◦  Ứng viên tham số ra:</w:t>
       </w:r>
     </w:p>
     <w:p>
       <w:pPr>
-        <w:pStyle w:val="ListBullet"/>
+        <w:ind w:left="1080" w:hanging="240"/>
       </w:pPr>
       <w:r>
         <w:rPr>
           <w:rFonts w:ascii="Courier New" w:hAnsi="Courier New"/>
           <w:sz w:val="20"/>
         </w:rPr>
-        <w:t>register(): User</w:t>
+        <w:t>▪  register(): User</w:t>
       </w:r>
       <w:r>
         <w:t xml:space="preserve"> → chọn</w:t>
@@ -9364,13 +9513,13 @@
     </w:p>
     <w:p>
       <w:pPr>
-        <w:pStyle w:val="ListBullet"/>
+        <w:ind w:left="360" w:hanging="240"/>
       </w:pPr>
       <w:r>
         <w:rPr>
           <w:b/>
         </w:rPr>
-        <w:t>c) Xác minh OTP</w:t>
+        <w:t>•  c) Xác minh OTP</w:t>
       </w:r>
       <w:r>
         <w:t xml:space="preserve"> =&gt; </w:t>
@@ -9385,38 +9534,38 @@
     </w:p>
     <w:p>
       <w:pPr>
-        <w:pStyle w:val="ListBullet"/>
+        <w:ind w:left="720" w:hanging="240"/>
       </w:pPr>
       <w:r>
-        <w:t>Input: otp</w:t>
+        <w:t>◦  Input: otp</w:t>
       </w:r>
     </w:p>
     <w:p>
       <w:pPr>
-        <w:pStyle w:val="ListBullet"/>
+        <w:ind w:left="720" w:hanging="240"/>
       </w:pPr>
       <w:r>
-        <w:t>Output: boolean</w:t>
+        <w:t>◦  Output: boolean</w:t>
       </w:r>
     </w:p>
     <w:p>
       <w:pPr>
-        <w:pStyle w:val="ListBullet"/>
+        <w:ind w:left="720" w:hanging="240"/>
       </w:pPr>
       <w:r>
-        <w:t>Ứng viên tham số vào:</w:t>
+        <w:t>◦  Ứng viên tham số vào:</w:t>
       </w:r>
     </w:p>
     <w:p>
       <w:pPr>
-        <w:pStyle w:val="ListBullet"/>
+        <w:ind w:left="1080" w:hanging="240"/>
       </w:pPr>
       <w:r>
         <w:rPr>
           <w:rFonts w:ascii="Courier New" w:hAnsi="Courier New"/>
           <w:sz w:val="20"/>
         </w:rPr>
-        <w:t>verifyOTP()</w:t>
+        <w:t>▪  verifyOTP()</w:t>
       </w:r>
       <w:r>
         <w:t xml:space="preserve"> → chọn</w:t>
@@ -9424,22 +9573,22 @@
     </w:p>
     <w:p>
       <w:pPr>
-        <w:pStyle w:val="ListBullet"/>
+        <w:ind w:left="720" w:hanging="240"/>
       </w:pPr>
       <w:r>
-        <w:t>Ứng viên tham số ra:</w:t>
+        <w:t>◦  Ứng viên tham số ra:</w:t>
       </w:r>
     </w:p>
     <w:p>
       <w:pPr>
-        <w:pStyle w:val="ListBullet"/>
+        <w:ind w:left="1080" w:hanging="240"/>
       </w:pPr>
       <w:r>
         <w:rPr>
           <w:rFonts w:ascii="Courier New" w:hAnsi="Courier New"/>
           <w:sz w:val="20"/>
         </w:rPr>
-        <w:t>verifyOTP(): boolean</w:t>
+        <w:t>▪  verifyOTP(): boolean</w:t>
       </w:r>
       <w:r>
         <w:t xml:space="preserve"> → chọn (cần biết đúng/sai)</w:t>
@@ -9447,13 +9596,13 @@
     </w:p>
     <w:p>
       <w:pPr>
-        <w:pStyle w:val="ListBullet"/>
+        <w:ind w:left="360" w:hanging="240"/>
       </w:pPr>
       <w:r>
         <w:rPr>
           <w:b/>
         </w:rPr>
-        <w:t>d) Đổi mật khẩu</w:t>
+        <w:t>•  d) Đổi mật khẩu</w:t>
       </w:r>
       <w:r>
         <w:t xml:space="preserve"> =&gt; </w:t>
@@ -9468,38 +9617,38 @@
     </w:p>
     <w:p>
       <w:pPr>
-        <w:pStyle w:val="ListBullet"/>
+        <w:ind w:left="720" w:hanging="240"/>
       </w:pPr>
       <w:r>
-        <w:t>Input: mkHienTai, mkMoi</w:t>
+        <w:t>◦  Input: mkHienTai, mkMoi</w:t>
       </w:r>
     </w:p>
     <w:p>
       <w:pPr>
-        <w:pStyle w:val="ListBullet"/>
+        <w:ind w:left="720" w:hanging="240"/>
       </w:pPr>
       <w:r>
-        <w:t>Output: boolean</w:t>
+        <w:t>◦  Output: boolean</w:t>
       </w:r>
     </w:p>
     <w:p>
       <w:pPr>
-        <w:pStyle w:val="ListBullet"/>
+        <w:ind w:left="720" w:hanging="240"/>
       </w:pPr>
       <w:r>
-        <w:t>Ứng viên tham số vào:</w:t>
+        <w:t>◦  Ứng viên tham số vào:</w:t>
       </w:r>
     </w:p>
     <w:p>
       <w:pPr>
-        <w:pStyle w:val="ListBullet"/>
+        <w:ind w:left="1080" w:hanging="240"/>
       </w:pPr>
       <w:r>
         <w:rPr>
           <w:rFonts w:ascii="Courier New" w:hAnsi="Courier New"/>
           <w:sz w:val="20"/>
         </w:rPr>
-        <w:t>changePassword()</w:t>
+        <w:t>▪  changePassword()</w:t>
       </w:r>
       <w:r>
         <w:t xml:space="preserve"> → chọn</w:t>
@@ -9507,22 +9656,22 @@
     </w:p>
     <w:p>
       <w:pPr>
-        <w:pStyle w:val="ListBullet"/>
+        <w:ind w:left="720" w:hanging="240"/>
       </w:pPr>
       <w:r>
-        <w:t>Ứng viên tham số ra:</w:t>
+        <w:t>◦  Ứng viên tham số ra:</w:t>
       </w:r>
     </w:p>
     <w:p>
       <w:pPr>
-        <w:pStyle w:val="ListBullet"/>
+        <w:ind w:left="1080" w:hanging="240"/>
       </w:pPr>
       <w:r>
         <w:rPr>
           <w:rFonts w:ascii="Courier New" w:hAnsi="Courier New"/>
           <w:sz w:val="20"/>
         </w:rPr>
-        <w:t>changePassword(): boolean</w:t>
+        <w:t>▪  changePassword(): boolean</w:t>
       </w:r>
       <w:r>
         <w:t xml:space="preserve"> → chọn</w:t>
@@ -9530,13 +9679,13 @@
     </w:p>
     <w:p>
       <w:pPr>
-        <w:pStyle w:val="ListBullet"/>
+        <w:ind w:left="360" w:hanging="240"/>
       </w:pPr>
       <w:r>
         <w:rPr>
           <w:b/>
         </w:rPr>
-        <w:t>e) Xem hồ sơ</w:t>
+        <w:t>•  e) Xem hồ sơ</w:t>
       </w:r>
       <w:r>
         <w:t xml:space="preserve"> =&gt; </w:t>
@@ -9551,38 +9700,38 @@
     </w:p>
     <w:p>
       <w:pPr>
-        <w:pStyle w:val="ListBullet"/>
+        <w:ind w:left="720" w:hanging="240"/>
       </w:pPr>
       <w:r>
-        <w:t>Input: userId</w:t>
+        <w:t>◦  Input: userId</w:t>
       </w:r>
     </w:p>
     <w:p>
       <w:pPr>
-        <w:pStyle w:val="ListBullet"/>
+        <w:ind w:left="720" w:hanging="240"/>
       </w:pPr>
       <w:r>
-        <w:t>Output: User</w:t>
+        <w:t>◦  Output: User</w:t>
       </w:r>
     </w:p>
     <w:p>
       <w:pPr>
-        <w:pStyle w:val="ListBullet"/>
+        <w:ind w:left="720" w:hanging="240"/>
       </w:pPr>
       <w:r>
-        <w:t>Ứng viên tham số vào:</w:t>
+        <w:t>◦  Ứng viên tham số vào:</w:t>
       </w:r>
     </w:p>
     <w:p>
       <w:pPr>
-        <w:pStyle w:val="ListBullet"/>
+        <w:ind w:left="1080" w:hanging="240"/>
       </w:pPr>
       <w:r>
         <w:rPr>
           <w:rFonts w:ascii="Courier New" w:hAnsi="Courier New"/>
           <w:sz w:val="20"/>
         </w:rPr>
-        <w:t>getProfile()</w:t>
+        <w:t>▪  getProfile()</w:t>
       </w:r>
       <w:r>
         <w:t xml:space="preserve"> → chọn</w:t>
@@ -9590,22 +9739,22 @@
     </w:p>
     <w:p>
       <w:pPr>
-        <w:pStyle w:val="ListBullet"/>
+        <w:ind w:left="720" w:hanging="240"/>
       </w:pPr>
       <w:r>
-        <w:t>Ứng viên tham số ra:</w:t>
+        <w:t>◦  Ứng viên tham số ra:</w:t>
       </w:r>
     </w:p>
     <w:p>
       <w:pPr>
-        <w:pStyle w:val="ListBullet"/>
+        <w:ind w:left="1080" w:hanging="240"/>
       </w:pPr>
       <w:r>
         <w:rPr>
           <w:rFonts w:ascii="Courier New" w:hAnsi="Courier New"/>
           <w:sz w:val="20"/>
         </w:rPr>
-        <w:t>getProfile(): User</w:t>
+        <w:t>▪  getProfile(): User</w:t>
       </w:r>
       <w:r>
         <w:t xml:space="preserve"> → chọn</w:t>
@@ -9613,13 +9762,13 @@
     </w:p>
     <w:p>
       <w:pPr>
-        <w:pStyle w:val="ListBullet"/>
+        <w:ind w:left="360" w:hanging="240"/>
       </w:pPr>
       <w:r>
         <w:rPr>
           <w:b/>
         </w:rPr>
-        <w:t>f) Cập nhật hồ sơ</w:t>
+        <w:t>•  f) Cập nhật hồ sơ</w:t>
       </w:r>
       <w:r>
         <w:t xml:space="preserve"> =&gt; </w:t>
@@ -9634,38 +9783,38 @@
     </w:p>
     <w:p>
       <w:pPr>
-        <w:pStyle w:val="ListBullet"/>
+        <w:ind w:left="720" w:hanging="240"/>
       </w:pPr>
       <w:r>
-        <w:t>Input: userId, hoTen, email</w:t>
+        <w:t>◦  Input: userId, hoTen, email</w:t>
       </w:r>
     </w:p>
     <w:p>
       <w:pPr>
-        <w:pStyle w:val="ListBullet"/>
+        <w:ind w:left="720" w:hanging="240"/>
       </w:pPr>
       <w:r>
-        <w:t>Output: User</w:t>
+        <w:t>◦  Output: User</w:t>
       </w:r>
     </w:p>
     <w:p>
       <w:pPr>
-        <w:pStyle w:val="ListBullet"/>
+        <w:ind w:left="720" w:hanging="240"/>
       </w:pPr>
       <w:r>
-        <w:t>Ứng viên tham số vào:</w:t>
+        <w:t>◦  Ứng viên tham số vào:</w:t>
       </w:r>
     </w:p>
     <w:p>
       <w:pPr>
-        <w:pStyle w:val="ListBullet"/>
+        <w:ind w:left="1080" w:hanging="240"/>
       </w:pPr>
       <w:r>
         <w:rPr>
           <w:rFonts w:ascii="Courier New" w:hAnsi="Courier New"/>
           <w:sz w:val="20"/>
         </w:rPr>
-        <w:t>updateProfile()</w:t>
+        <w:t>▪  updateProfile()</w:t>
       </w:r>
       <w:r>
         <w:t xml:space="preserve"> → chọn</w:t>
@@ -9673,22 +9822,22 @@
     </w:p>
     <w:p>
       <w:pPr>
-        <w:pStyle w:val="ListBullet"/>
+        <w:ind w:left="720" w:hanging="240"/>
       </w:pPr>
       <w:r>
-        <w:t>Ứng viên tham số ra:</w:t>
+        <w:t>◦  Ứng viên tham số ra:</w:t>
       </w:r>
     </w:p>
     <w:p>
       <w:pPr>
-        <w:pStyle w:val="ListBullet"/>
+        <w:ind w:left="1080" w:hanging="240"/>
       </w:pPr>
       <w:r>
         <w:rPr>
           <w:rFonts w:ascii="Courier New" w:hAnsi="Courier New"/>
           <w:sz w:val="20"/>
         </w:rPr>
-        <w:t>updateProfile(): User</w:t>
+        <w:t>▪  updateProfile(): User</w:t>
       </w:r>
       <w:r>
         <w:t xml:space="preserve"> → chọn</w:t>
@@ -9696,13 +9845,13 @@
     </w:p>
     <w:p>
       <w:pPr>
-        <w:pStyle w:val="ListBullet"/>
+        <w:ind w:left="360" w:hanging="240"/>
       </w:pPr>
       <w:r>
         <w:rPr>
           <w:b/>
         </w:rPr>
-        <w:t>g) Xem danh sách NV</w:t>
+        <w:t>•  g) Xem danh sách NV</w:t>
       </w:r>
       <w:r>
         <w:t xml:space="preserve"> =&gt; </w:t>
@@ -9717,38 +9866,38 @@
     </w:p>
     <w:p>
       <w:pPr>
-        <w:pStyle w:val="ListBullet"/>
+        <w:ind w:left="720" w:hanging="240"/>
       </w:pPr>
       <w:r>
-        <w:t>Input: (không có)</w:t>
+        <w:t>◦  Input: (không có)</w:t>
       </w:r>
     </w:p>
     <w:p>
       <w:pPr>
-        <w:pStyle w:val="ListBullet"/>
+        <w:ind w:left="720" w:hanging="240"/>
       </w:pPr>
       <w:r>
-        <w:t>Output: List\&lt;Employee\&gt;</w:t>
+        <w:t>◦  Output: List\&lt;Employee\&gt;</w:t>
       </w:r>
     </w:p>
     <w:p>
       <w:pPr>
-        <w:pStyle w:val="ListBullet"/>
+        <w:ind w:left="720" w:hanging="240"/>
       </w:pPr>
       <w:r>
-        <w:t>Ứng viên tham số vào:</w:t>
+        <w:t>◦  Ứng viên tham số vào:</w:t>
       </w:r>
     </w:p>
     <w:p>
       <w:pPr>
-        <w:pStyle w:val="ListBullet"/>
+        <w:ind w:left="1080" w:hanging="240"/>
       </w:pPr>
       <w:r>
         <w:rPr>
           <w:rFonts w:ascii="Courier New" w:hAnsi="Courier New"/>
           <w:sz w:val="20"/>
         </w:rPr>
-        <w:t>getAllStaff()</w:t>
+        <w:t>▪  getAllStaff()</w:t>
       </w:r>
       <w:r>
         <w:t xml:space="preserve"> → chọn</w:t>
@@ -9756,22 +9905,22 @@
     </w:p>
     <w:p>
       <w:pPr>
-        <w:pStyle w:val="ListBullet"/>
+        <w:ind w:left="720" w:hanging="240"/>
       </w:pPr>
       <w:r>
-        <w:t>Ứng viên tham số ra:</w:t>
+        <w:t>◦  Ứng viên tham số ra:</w:t>
       </w:r>
     </w:p>
     <w:p>
       <w:pPr>
-        <w:pStyle w:val="ListBullet"/>
+        <w:ind w:left="1080" w:hanging="240"/>
       </w:pPr>
       <w:r>
         <w:rPr>
           <w:rFonts w:ascii="Courier New" w:hAnsi="Courier New"/>
           <w:sz w:val="20"/>
         </w:rPr>
-        <w:t>getAllStaff(): List&lt;Employee&gt;</w:t>
+        <w:t>▪  getAllStaff(): List&lt;Employee&gt;</w:t>
       </w:r>
       <w:r>
         <w:t xml:space="preserve"> → chọn</w:t>
@@ -9779,13 +9928,13 @@
     </w:p>
     <w:p>
       <w:pPr>
-        <w:pStyle w:val="ListBullet"/>
+        <w:ind w:left="360" w:hanging="240"/>
       </w:pPr>
       <w:r>
         <w:rPr>
           <w:b/>
         </w:rPr>
-        <w:t>h) Tìm kiếm NV</w:t>
+        <w:t>•  h) Tìm kiếm NV</w:t>
       </w:r>
       <w:r>
         <w:t xml:space="preserve"> =&gt; </w:t>
@@ -9800,38 +9949,38 @@
     </w:p>
     <w:p>
       <w:pPr>
-        <w:pStyle w:val="ListBullet"/>
+        <w:ind w:left="720" w:hanging="240"/>
       </w:pPr>
       <w:r>
-        <w:t>Input: keyword</w:t>
+        <w:t>◦  Input: keyword</w:t>
       </w:r>
     </w:p>
     <w:p>
       <w:pPr>
-        <w:pStyle w:val="ListBullet"/>
+        <w:ind w:left="720" w:hanging="240"/>
       </w:pPr>
       <w:r>
-        <w:t>Output: List\&lt;Employee\&gt;</w:t>
+        <w:t>◦  Output: List\&lt;Employee\&gt;</w:t>
       </w:r>
     </w:p>
     <w:p>
       <w:pPr>
-        <w:pStyle w:val="ListBullet"/>
+        <w:ind w:left="720" w:hanging="240"/>
       </w:pPr>
       <w:r>
-        <w:t>Ứng viên tham số vào:</w:t>
+        <w:t>◦  Ứng viên tham số vào:</w:t>
       </w:r>
     </w:p>
     <w:p>
       <w:pPr>
-        <w:pStyle w:val="ListBullet"/>
+        <w:ind w:left="1080" w:hanging="240"/>
       </w:pPr>
       <w:r>
         <w:rPr>
           <w:rFonts w:ascii="Courier New" w:hAnsi="Courier New"/>
           <w:sz w:val="20"/>
         </w:rPr>
-        <w:t>searchStaff(keyword: String)</w:t>
+        <w:t>▪  searchStaff(keyword: String)</w:t>
       </w:r>
       <w:r>
         <w:t xml:space="preserve"> → chọn</w:t>
@@ -9839,22 +9988,22 @@
     </w:p>
     <w:p>
       <w:pPr>
-        <w:pStyle w:val="ListBullet"/>
+        <w:ind w:left="720" w:hanging="240"/>
       </w:pPr>
       <w:r>
-        <w:t>Ứng viên tham số ra:</w:t>
+        <w:t>◦  Ứng viên tham số ra:</w:t>
       </w:r>
     </w:p>
     <w:p>
       <w:pPr>
-        <w:pStyle w:val="ListBullet"/>
+        <w:ind w:left="1080" w:hanging="240"/>
       </w:pPr>
       <w:r>
         <w:rPr>
           <w:rFonts w:ascii="Courier New" w:hAnsi="Courier New"/>
           <w:sz w:val="20"/>
         </w:rPr>
-        <w:t>searchStaff(): List&lt;Employee&gt;</w:t>
+        <w:t>▪  searchStaff(): List&lt;Employee&gt;</w:t>
       </w:r>
       <w:r>
         <w:t xml:space="preserve"> → chọn</w:t>
@@ -9862,13 +10011,13 @@
     </w:p>
     <w:p>
       <w:pPr>
-        <w:pStyle w:val="ListBullet"/>
+        <w:ind w:left="360" w:hanging="240"/>
       </w:pPr>
       <w:r>
         <w:rPr>
           <w:b/>
         </w:rPr>
-        <w:t>i) Lấy NV theo id</w:t>
+        <w:t>•  i) Lấy NV theo id</w:t>
       </w:r>
       <w:r>
         <w:t xml:space="preserve"> =&gt; </w:t>
@@ -9883,38 +10032,38 @@
     </w:p>
     <w:p>
       <w:pPr>
-        <w:pStyle w:val="ListBullet"/>
+        <w:ind w:left="720" w:hanging="240"/>
       </w:pPr>
       <w:r>
-        <w:t>Input: id</w:t>
+        <w:t>◦  Input: id</w:t>
       </w:r>
     </w:p>
     <w:p>
       <w:pPr>
-        <w:pStyle w:val="ListBullet"/>
+        <w:ind w:left="720" w:hanging="240"/>
       </w:pPr>
       <w:r>
-        <w:t>Output: Employee</w:t>
+        <w:t>◦  Output: Employee</w:t>
       </w:r>
     </w:p>
     <w:p>
       <w:pPr>
-        <w:pStyle w:val="ListBullet"/>
+        <w:ind w:left="720" w:hanging="240"/>
       </w:pPr>
       <w:r>
-        <w:t>Ứng viên tham số vào:</w:t>
+        <w:t>◦  Ứng viên tham số vào:</w:t>
       </w:r>
     </w:p>
     <w:p>
       <w:pPr>
-        <w:pStyle w:val="ListBullet"/>
+        <w:ind w:left="1080" w:hanging="240"/>
       </w:pPr>
       <w:r>
         <w:rPr>
           <w:rFonts w:ascii="Courier New" w:hAnsi="Courier New"/>
           <w:sz w:val="20"/>
         </w:rPr>
-        <w:t>getStaffById(id: int)</w:t>
+        <w:t>▪  getStaffById(id: int)</w:t>
       </w:r>
       <w:r>
         <w:t xml:space="preserve"> → chọn</w:t>
@@ -9922,22 +10071,22 @@
     </w:p>
     <w:p>
       <w:pPr>
-        <w:pStyle w:val="ListBullet"/>
+        <w:ind w:left="720" w:hanging="240"/>
       </w:pPr>
       <w:r>
-        <w:t>Ứng viên tham số ra:</w:t>
+        <w:t>◦  Ứng viên tham số ra:</w:t>
       </w:r>
     </w:p>
     <w:p>
       <w:pPr>
-        <w:pStyle w:val="ListBullet"/>
+        <w:ind w:left="1080" w:hanging="240"/>
       </w:pPr>
       <w:r>
         <w:rPr>
           <w:rFonts w:ascii="Courier New" w:hAnsi="Courier New"/>
           <w:sz w:val="20"/>
         </w:rPr>
-        <w:t>getStaffById(): Employee</w:t>
+        <w:t>▪  getStaffById(): Employee</w:t>
       </w:r>
       <w:r>
         <w:t xml:space="preserve"> → chọn</w:t>
@@ -9945,13 +10094,13 @@
     </w:p>
     <w:p>
       <w:pPr>
-        <w:pStyle w:val="ListBullet"/>
+        <w:ind w:left="360" w:hanging="240"/>
       </w:pPr>
       <w:r>
         <w:rPr>
           <w:b/>
         </w:rPr>
-        <w:t>j) Thêm NV</w:t>
+        <w:t>•  j) Thêm NV</w:t>
       </w:r>
       <w:r>
         <w:t xml:space="preserve"> =&gt; </w:t>
@@ -9966,38 +10115,38 @@
     </w:p>
     <w:p>
       <w:pPr>
-        <w:pStyle w:val="ListBullet"/>
+        <w:ind w:left="720" w:hanging="240"/>
       </w:pPr>
       <w:r>
-        <w:t>Input: employee</w:t>
+        <w:t>◦  Input: employee</w:t>
       </w:r>
     </w:p>
     <w:p>
       <w:pPr>
-        <w:pStyle w:val="ListBullet"/>
+        <w:ind w:left="720" w:hanging="240"/>
       </w:pPr>
       <w:r>
-        <w:t>Output: boolean</w:t>
+        <w:t>◦  Output: boolean</w:t>
       </w:r>
     </w:p>
     <w:p>
       <w:pPr>
-        <w:pStyle w:val="ListBullet"/>
+        <w:ind w:left="720" w:hanging="240"/>
       </w:pPr>
       <w:r>
-        <w:t>Ứng viên tham số vào:</w:t>
+        <w:t>◦  Ứng viên tham số vào:</w:t>
       </w:r>
     </w:p>
     <w:p>
       <w:pPr>
-        <w:pStyle w:val="ListBullet"/>
+        <w:ind w:left="1080" w:hanging="240"/>
       </w:pPr>
       <w:r>
         <w:rPr>
           <w:rFonts w:ascii="Courier New" w:hAnsi="Courier New"/>
           <w:sz w:val="20"/>
         </w:rPr>
-        <w:t>saveStaff(employee: Employee)</w:t>
+        <w:t>▪  saveStaff(employee: Employee)</w:t>
       </w:r>
       <w:r>
         <w:t xml:space="preserve"> → chọn</w:t>
@@ -10005,22 +10154,22 @@
     </w:p>
     <w:p>
       <w:pPr>
-        <w:pStyle w:val="ListBullet"/>
+        <w:ind w:left="720" w:hanging="240"/>
       </w:pPr>
       <w:r>
-        <w:t>Ứng viên tham số ra:</w:t>
+        <w:t>◦  Ứng viên tham số ra:</w:t>
       </w:r>
     </w:p>
     <w:p>
       <w:pPr>
-        <w:pStyle w:val="ListBullet"/>
+        <w:ind w:left="1080" w:hanging="240"/>
       </w:pPr>
       <w:r>
         <w:rPr>
           <w:rFonts w:ascii="Courier New" w:hAnsi="Courier New"/>
           <w:sz w:val="20"/>
         </w:rPr>
-        <w:t>saveStaff(): boolean</w:t>
+        <w:t>▪  saveStaff(): boolean</w:t>
       </w:r>
       <w:r>
         <w:t xml:space="preserve"> → chọn (cần biết thành công/thất bại)</w:t>
@@ -10028,13 +10177,13 @@
     </w:p>
     <w:p>
       <w:pPr>
-        <w:pStyle w:val="ListBullet"/>
+        <w:ind w:left="360" w:hanging="240"/>
       </w:pPr>
       <w:r>
         <w:rPr>
           <w:b/>
         </w:rPr>
-        <w:t>k) Sửa NV</w:t>
+        <w:t>•  k) Sửa NV</w:t>
       </w:r>
       <w:r>
         <w:t xml:space="preserve"> =&gt; </w:t>
@@ -10049,38 +10198,38 @@
     </w:p>
     <w:p>
       <w:pPr>
-        <w:pStyle w:val="ListBullet"/>
+        <w:ind w:left="720" w:hanging="240"/>
       </w:pPr>
       <w:r>
-        <w:t>Input: employee</w:t>
+        <w:t>◦  Input: employee</w:t>
       </w:r>
     </w:p>
     <w:p>
       <w:pPr>
-        <w:pStyle w:val="ListBullet"/>
+        <w:ind w:left="720" w:hanging="240"/>
       </w:pPr>
       <w:r>
-        <w:t>Output: boolean</w:t>
+        <w:t>◦  Output: boolean</w:t>
       </w:r>
     </w:p>
     <w:p>
       <w:pPr>
-        <w:pStyle w:val="ListBullet"/>
+        <w:ind w:left="720" w:hanging="240"/>
       </w:pPr>
       <w:r>
-        <w:t>Ứng viên tham số vào:</w:t>
+        <w:t>◦  Ứng viên tham số vào:</w:t>
       </w:r>
     </w:p>
     <w:p>
       <w:pPr>
-        <w:pStyle w:val="ListBullet"/>
+        <w:ind w:left="1080" w:hanging="240"/>
       </w:pPr>
       <w:r>
         <w:rPr>
           <w:rFonts w:ascii="Courier New" w:hAnsi="Courier New"/>
           <w:sz w:val="20"/>
         </w:rPr>
-        <w:t>updateStaff()</w:t>
+        <w:t>▪  updateStaff()</w:t>
       </w:r>
       <w:r>
         <w:t xml:space="preserve"> → chọn</w:t>
@@ -10088,22 +10237,22 @@
     </w:p>
     <w:p>
       <w:pPr>
-        <w:pStyle w:val="ListBullet"/>
+        <w:ind w:left="720" w:hanging="240"/>
       </w:pPr>
       <w:r>
-        <w:t>Ứng viên tham số ra:</w:t>
+        <w:t>◦  Ứng viên tham số ra:</w:t>
       </w:r>
     </w:p>
     <w:p>
       <w:pPr>
-        <w:pStyle w:val="ListBullet"/>
+        <w:ind w:left="1080" w:hanging="240"/>
       </w:pPr>
       <w:r>
         <w:rPr>
           <w:rFonts w:ascii="Courier New" w:hAnsi="Courier New"/>
           <w:sz w:val="20"/>
         </w:rPr>
-        <w:t>updateStaff(): boolean</w:t>
+        <w:t>▪  updateStaff(): boolean</w:t>
       </w:r>
       <w:r>
         <w:t xml:space="preserve"> → chọn</w:t>
@@ -10111,13 +10260,13 @@
     </w:p>
     <w:p>
       <w:pPr>
-        <w:pStyle w:val="ListBullet"/>
+        <w:ind w:left="360" w:hanging="240"/>
       </w:pPr>
       <w:r>
         <w:rPr>
           <w:b/>
         </w:rPr>
-        <w:t>l) Xóa NV</w:t>
+        <w:t>•  l) Xóa NV</w:t>
       </w:r>
       <w:r>
         <w:t xml:space="preserve"> =&gt; </w:t>
@@ -10132,38 +10281,38 @@
     </w:p>
     <w:p>
       <w:pPr>
-        <w:pStyle w:val="ListBullet"/>
+        <w:ind w:left="720" w:hanging="240"/>
       </w:pPr>
       <w:r>
-        <w:t>Input: id</w:t>
+        <w:t>◦  Input: id</w:t>
       </w:r>
     </w:p>
     <w:p>
       <w:pPr>
-        <w:pStyle w:val="ListBullet"/>
+        <w:ind w:left="720" w:hanging="240"/>
       </w:pPr>
       <w:r>
-        <w:t>Output: boolean</w:t>
+        <w:t>◦  Output: boolean</w:t>
       </w:r>
     </w:p>
     <w:p>
       <w:pPr>
-        <w:pStyle w:val="ListBullet"/>
+        <w:ind w:left="720" w:hanging="240"/>
       </w:pPr>
       <w:r>
-        <w:t>Ứng viên tham số vào:</w:t>
+        <w:t>◦  Ứng viên tham số vào:</w:t>
       </w:r>
     </w:p>
     <w:p>
       <w:pPr>
-        <w:pStyle w:val="ListBullet"/>
+        <w:ind w:left="1080" w:hanging="240"/>
       </w:pPr>
       <w:r>
         <w:rPr>
           <w:rFonts w:ascii="Courier New" w:hAnsi="Courier New"/>
           <w:sz w:val="20"/>
         </w:rPr>
-        <w:t>deleteStaff()</w:t>
+        <w:t>▪  deleteStaff()</w:t>
       </w:r>
       <w:r>
         <w:t xml:space="preserve"> → chọn</w:t>
@@ -10171,22 +10320,22 @@
     </w:p>
     <w:p>
       <w:pPr>
-        <w:pStyle w:val="ListBullet"/>
+        <w:ind w:left="720" w:hanging="240"/>
       </w:pPr>
       <w:r>
-        <w:t>Ứng viên tham số ra:</w:t>
+        <w:t>◦  Ứng viên tham số ra:</w:t>
       </w:r>
     </w:p>
     <w:p>
       <w:pPr>
-        <w:pStyle w:val="ListBullet"/>
+        <w:ind w:left="1080" w:hanging="240"/>
       </w:pPr>
       <w:r>
         <w:rPr>
           <w:rFonts w:ascii="Courier New" w:hAnsi="Courier New"/>
           <w:sz w:val="20"/>
         </w:rPr>
-        <w:t>deleteStaff(): boolean</w:t>
+        <w:t>▪  deleteStaff(): boolean</w:t>
       </w:r>
       <w:r>
         <w:t xml:space="preserve"> → chọn (cần biết thành công/thất bại)</w:t>
@@ -10308,9 +10457,11 @@
       </w:r>
     </w:p>
     <w:p>
-      <w:pPr/>
-      <w:r>
-        <w:t xml:space="preserve">1. Khách hàng truy cập URL </w:t>
+      <w:pPr>
+        <w:ind w:left="360" w:hanging="240"/>
+      </w:pPr>
+      <w:r>
+        <w:t xml:space="preserve">1.  Khách hàng truy cập URL </w:t>
       </w:r>
       <w:r>
         <w:rPr>
@@ -10324,9 +10475,11 @@
       </w:r>
     </w:p>
     <w:p>
-      <w:pPr/>
-      <w:r>
-        <w:t xml:space="preserve">2. Phương thức </w:t>
+      <w:pPr>
+        <w:ind w:left="360" w:hanging="240"/>
+      </w:pPr>
+      <w:r>
+        <w:t xml:space="preserve">2.  Phương thức </w:t>
       </w:r>
       <w:r>
         <w:rPr>
@@ -10340,21 +10493,27 @@
       </w:r>
     </w:p>
     <w:p>
-      <w:pPr/>
-      <w:r>
-        <w:t>3. Khách hàng nhập SĐT và Mật khẩu.</w:t>
+      <w:pPr>
+        <w:ind w:left="360" w:hanging="240"/>
+      </w:pPr>
+      <w:r>
+        <w:t>3.  Khách hàng nhập SĐT và Mật khẩu.</w:t>
       </w:r>
     </w:p>
     <w:p>
-      <w:pPr/>
-      <w:r>
-        <w:t>4. Khách hàng click nút [Đăng nhập].</w:t>
+      <w:pPr>
+        <w:ind w:left="360" w:hanging="240"/>
+      </w:pPr>
+      <w:r>
+        <w:t>4.  Khách hàng click nút [Đăng nhập].</w:t>
       </w:r>
     </w:p>
     <w:p>
-      <w:pPr/>
-      <w:r>
-        <w:t xml:space="preserve">5. Phương thức </w:t>
+      <w:pPr>
+        <w:ind w:left="360" w:hanging="240"/>
+      </w:pPr>
+      <w:r>
+        <w:t xml:space="preserve">5.  Phương thức </w:t>
       </w:r>
       <w:r>
         <w:rPr>
@@ -10368,9 +10527,11 @@
       </w:r>
     </w:p>
     <w:p>
-      <w:pPr/>
-      <w:r>
-        <w:t xml:space="preserve">6. Phương thức </w:t>
+      <w:pPr>
+        <w:ind w:left="360" w:hanging="240"/>
+      </w:pPr>
+      <w:r>
+        <w:t xml:space="preserve">6.  Phương thức </w:t>
       </w:r>
       <w:r>
         <w:rPr>
@@ -10394,9 +10555,11 @@
       </w:r>
     </w:p>
     <w:p>
-      <w:pPr/>
-      <w:r>
-        <w:t xml:space="preserve">7. Phương thức </w:t>
+      <w:pPr>
+        <w:ind w:left="360" w:hanging="240"/>
+      </w:pPr>
+      <w:r>
+        <w:t xml:space="preserve">7.  Phương thức </w:t>
       </w:r>
       <w:r>
         <w:rPr>
@@ -10426,9 +10589,11 @@
       </w:r>
     </w:p>
     <w:p>
-      <w:pPr/>
-      <w:r>
-        <w:t xml:space="preserve">8. Lớp User trả về đối tượng User cho phương thức </w:t>
+      <w:pPr>
+        <w:ind w:left="360" w:hanging="240"/>
+      </w:pPr>
+      <w:r>
+        <w:t xml:space="preserve">8.  Lớp User trả về đối tượng User cho phương thức </w:t>
       </w:r>
       <w:r>
         <w:rPr>
@@ -10442,9 +10607,11 @@
       </w:r>
     </w:p>
     <w:p>
-      <w:pPr/>
-      <w:r>
-        <w:t xml:space="preserve">9. Phương thức </w:t>
+      <w:pPr>
+        <w:ind w:left="360" w:hanging="240"/>
+      </w:pPr>
+      <w:r>
+        <w:t xml:space="preserve">9.  Phương thức </w:t>
       </w:r>
       <w:r>
         <w:rPr>
@@ -10474,9 +10641,11 @@
       </w:r>
     </w:p>
     <w:p>
-      <w:pPr/>
-      <w:r>
-        <w:t xml:space="preserve">10. Phương thức </w:t>
+      <w:pPr>
+        <w:ind w:left="360" w:hanging="240"/>
+      </w:pPr>
+      <w:r>
+        <w:t xml:space="preserve">10.  Phương thức </w:t>
       </w:r>
       <w:r>
         <w:rPr>
@@ -10510,9 +10679,11 @@
       </w:r>
     </w:p>
     <w:p>
-      <w:pPr/>
-      <w:r>
-        <w:t xml:space="preserve">11. Phương thức </w:t>
+      <w:pPr>
+        <w:ind w:left="360" w:hanging="240"/>
+      </w:pPr>
+      <w:r>
+        <w:t xml:space="preserve">11.  Phương thức </w:t>
       </w:r>
       <w:r>
         <w:rPr>
@@ -10598,9 +10769,11 @@
       </w:r>
     </w:p>
     <w:p>
-      <w:pPr/>
-      <w:r>
-        <w:t xml:space="preserve">1. Khách hàng click liên kết "Đăng ký" từ trang </w:t>
+      <w:pPr>
+        <w:ind w:left="360" w:hanging="240"/>
+      </w:pPr>
+      <w:r>
+        <w:t xml:space="preserve">1.  Khách hàng click liên kết "Đăng ký" từ trang </w:t>
       </w:r>
       <w:r>
         <w:rPr>
@@ -10614,9 +10787,11 @@
       </w:r>
     </w:p>
     <w:p>
-      <w:pPr/>
-      <w:r>
-        <w:t xml:space="preserve">2. Phương thức </w:t>
+      <w:pPr>
+        <w:ind w:left="360" w:hanging="240"/>
+      </w:pPr>
+      <w:r>
+        <w:t xml:space="preserve">2.  Phương thức </w:t>
       </w:r>
       <w:r>
         <w:rPr>
@@ -10630,21 +10805,27 @@
       </w:r>
     </w:p>
     <w:p>
-      <w:pPr/>
-      <w:r>
-        <w:t>3. Khách hàng nhập Họ tên, SĐT, Email, Mật khẩu.</w:t>
+      <w:pPr>
+        <w:ind w:left="360" w:hanging="240"/>
+      </w:pPr>
+      <w:r>
+        <w:t>3.  Khách hàng nhập Họ tên, SĐT, Email, Mật khẩu.</w:t>
       </w:r>
     </w:p>
     <w:p>
-      <w:pPr/>
-      <w:r>
-        <w:t>4. Khách hàng click nút [Tiếp tục].</w:t>
+      <w:pPr>
+        <w:ind w:left="360" w:hanging="240"/>
+      </w:pPr>
+      <w:r>
+        <w:t>4.  Khách hàng click nút [Tiếp tục].</w:t>
       </w:r>
     </w:p>
     <w:p>
-      <w:pPr/>
-      <w:r>
-        <w:t xml:space="preserve">5. Phương thức </w:t>
+      <w:pPr>
+        <w:ind w:left="360" w:hanging="240"/>
+      </w:pPr>
+      <w:r>
+        <w:t xml:space="preserve">5.  Phương thức </w:t>
       </w:r>
       <w:r>
         <w:rPr>
@@ -10658,9 +10839,11 @@
       </w:r>
     </w:p>
     <w:p>
-      <w:pPr/>
-      <w:r>
-        <w:t xml:space="preserve">6. Phương thức </w:t>
+      <w:pPr>
+        <w:ind w:left="360" w:hanging="240"/>
+      </w:pPr>
+      <w:r>
+        <w:t xml:space="preserve">6.  Phương thức </w:t>
       </w:r>
       <w:r>
         <w:rPr>
@@ -10684,9 +10867,11 @@
       </w:r>
     </w:p>
     <w:p>
-      <w:pPr/>
-      <w:r>
-        <w:t xml:space="preserve">7. Phương thức </w:t>
+      <w:pPr>
+        <w:ind w:left="360" w:hanging="240"/>
+      </w:pPr>
+      <w:r>
+        <w:t xml:space="preserve">7.  Phương thức </w:t>
       </w:r>
       <w:r>
         <w:rPr>
@@ -10716,9 +10901,11 @@
       </w:r>
     </w:p>
     <w:p>
-      <w:pPr/>
-      <w:r>
-        <w:t xml:space="preserve">8. Lớp User trả về </w:t>
+      <w:pPr>
+        <w:ind w:left="360" w:hanging="240"/>
+      </w:pPr>
+      <w:r>
+        <w:t xml:space="preserve">8.  Lớp User trả về </w:t>
       </w:r>
       <w:r>
         <w:rPr>
@@ -10742,9 +10929,11 @@
       </w:r>
     </w:p>
     <w:p>
-      <w:pPr/>
-      <w:r>
-        <w:t xml:space="preserve">9. Phương thức </w:t>
+      <w:pPr>
+        <w:ind w:left="360" w:hanging="240"/>
+      </w:pPr>
+      <w:r>
+        <w:t xml:space="preserve">9.  Phương thức </w:t>
       </w:r>
       <w:r>
         <w:rPr>
@@ -10774,9 +10963,11 @@
       </w:r>
     </w:p>
     <w:p>
-      <w:pPr/>
-      <w:r>
-        <w:t xml:space="preserve">10. Lớp User trả về </w:t>
+      <w:pPr>
+        <w:ind w:left="360" w:hanging="240"/>
+      </w:pPr>
+      <w:r>
+        <w:t xml:space="preserve">10.  Lớp User trả về </w:t>
       </w:r>
       <w:r>
         <w:rPr>
@@ -10800,9 +10991,11 @@
       </w:r>
     </w:p>
     <w:p>
-      <w:pPr/>
-      <w:r>
-        <w:t xml:space="preserve">11. Phương thức </w:t>
+      <w:pPr>
+        <w:ind w:left="360" w:hanging="240"/>
+      </w:pPr>
+      <w:r>
+        <w:t xml:space="preserve">11.  Phương thức </w:t>
       </w:r>
       <w:r>
         <w:rPr>
@@ -10832,9 +11025,11 @@
       </w:r>
     </w:p>
     <w:p>
-      <w:pPr/>
-      <w:r>
-        <w:t xml:space="preserve">12. Phương thức </w:t>
+      <w:pPr>
+        <w:ind w:left="360" w:hanging="240"/>
+      </w:pPr>
+      <w:r>
+        <w:t xml:space="preserve">12.  Phương thức </w:t>
       </w:r>
       <w:r>
         <w:rPr>
@@ -10864,15 +11059,19 @@
       </w:r>
     </w:p>
     <w:p>
-      <w:pPr/>
-      <w:r>
-        <w:t>13. Lớp OTP gửi mã OTP đến SĐT.</w:t>
+      <w:pPr>
+        <w:ind w:left="360" w:hanging="240"/>
+      </w:pPr>
+      <w:r>
+        <w:t>13.  Lớp OTP gửi mã OTP đến SĐT.</w:t>
       </w:r>
     </w:p>
     <w:p>
-      <w:pPr/>
-      <w:r>
-        <w:t xml:space="preserve">14. Phương thức </w:t>
+      <w:pPr>
+        <w:ind w:left="360" w:hanging="240"/>
+      </w:pPr>
+      <w:r>
+        <w:t xml:space="preserve">14.  Phương thức </w:t>
       </w:r>
       <w:r>
         <w:rPr>
@@ -10896,27 +11095,35 @@
       </w:r>
     </w:p>
     <w:p>
-      <w:pPr/>
-      <w:r>
-        <w:t>15. RegisterPage hiển thị trang OTPVerifyPage.</w:t>
+      <w:pPr>
+        <w:ind w:left="360" w:hanging="240"/>
+      </w:pPr>
+      <w:r>
+        <w:t>15.  RegisterPage hiển thị trang OTPVerifyPage.</w:t>
       </w:r>
     </w:p>
     <w:p>
-      <w:pPr/>
-      <w:r>
-        <w:t>16. Khách hàng nhập mã OTP.</w:t>
+      <w:pPr>
+        <w:ind w:left="360" w:hanging="240"/>
+      </w:pPr>
+      <w:r>
+        <w:t>16.  Khách hàng nhập mã OTP.</w:t>
       </w:r>
     </w:p>
     <w:p>
-      <w:pPr/>
-      <w:r>
-        <w:t>17. Khách hàng click nút [Xác nhận].</w:t>
+      <w:pPr>
+        <w:ind w:left="360" w:hanging="240"/>
+      </w:pPr>
+      <w:r>
+        <w:t>17.  Khách hàng click nút [Xác nhận].</w:t>
       </w:r>
     </w:p>
     <w:p>
-      <w:pPr/>
-      <w:r>
-        <w:t xml:space="preserve">18. Phương thức </w:t>
+      <w:pPr>
+        <w:ind w:left="360" w:hanging="240"/>
+      </w:pPr>
+      <w:r>
+        <w:t xml:space="preserve">18.  Phương thức </w:t>
       </w:r>
       <w:r>
         <w:rPr>
@@ -10930,9 +11137,11 @@
       </w:r>
     </w:p>
     <w:p>
-      <w:pPr/>
-      <w:r>
-        <w:t xml:space="preserve">19. Phương thức </w:t>
+      <w:pPr>
+        <w:ind w:left="360" w:hanging="240"/>
+      </w:pPr>
+      <w:r>
+        <w:t xml:space="preserve">19.  Phương thức </w:t>
       </w:r>
       <w:r>
         <w:rPr>
@@ -10956,9 +11165,11 @@
       </w:r>
     </w:p>
     <w:p>
-      <w:pPr/>
-      <w:r>
-        <w:t xml:space="preserve">20. Phương thức </w:t>
+      <w:pPr>
+        <w:ind w:left="360" w:hanging="240"/>
+      </w:pPr>
+      <w:r>
+        <w:t xml:space="preserve">20.  Phương thức </w:t>
       </w:r>
       <w:r>
         <w:rPr>
@@ -10982,9 +11193,11 @@
       </w:r>
     </w:p>
     <w:p>
-      <w:pPr/>
-      <w:r>
-        <w:t xml:space="preserve">21. Lớp OTP trả về </w:t>
+      <w:pPr>
+        <w:ind w:left="360" w:hanging="240"/>
+      </w:pPr>
+      <w:r>
+        <w:t xml:space="preserve">21.  Lớp OTP trả về </w:t>
       </w:r>
       <w:r>
         <w:rPr>
@@ -11008,9 +11221,11 @@
       </w:r>
     </w:p>
     <w:p>
-      <w:pPr/>
-      <w:r>
-        <w:t xml:space="preserve">22. Phương thức </w:t>
+      <w:pPr>
+        <w:ind w:left="360" w:hanging="240"/>
+      </w:pPr>
+      <w:r>
+        <w:t xml:space="preserve">22.  Phương thức </w:t>
       </w:r>
       <w:r>
         <w:rPr>
@@ -11044,9 +11259,11 @@
       </w:r>
     </w:p>
     <w:p>
-      <w:pPr/>
-      <w:r>
-        <w:t xml:space="preserve">23. Phương thức </w:t>
+      <w:pPr>
+        <w:ind w:left="360" w:hanging="240"/>
+      </w:pPr>
+      <w:r>
+        <w:t xml:space="preserve">23.  Phương thức </w:t>
       </w:r>
       <w:r>
         <w:rPr>
@@ -11122,9 +11339,11 @@
       </w:r>
     </w:p>
     <w:p>
-      <w:pPr/>
-      <w:r>
-        <w:t xml:space="preserve">1. Người dùng truy cập URL </w:t>
+      <w:pPr>
+        <w:ind w:left="360" w:hanging="240"/>
+      </w:pPr>
+      <w:r>
+        <w:t xml:space="preserve">1.  Người dùng truy cập URL </w:t>
       </w:r>
       <w:r>
         <w:rPr>
@@ -11138,9 +11357,11 @@
       </w:r>
     </w:p>
     <w:p>
-      <w:pPr/>
-      <w:r>
-        <w:t xml:space="preserve">2. Phương thức </w:t>
+      <w:pPr>
+        <w:ind w:left="360" w:hanging="240"/>
+      </w:pPr>
+      <w:r>
+        <w:t xml:space="preserve">2.  Phương thức </w:t>
       </w:r>
       <w:r>
         <w:rPr>
@@ -11154,21 +11375,27 @@
       </w:r>
     </w:p>
     <w:p>
-      <w:pPr/>
-      <w:r>
-        <w:t>3. Người dùng nhập Mật khẩu hiện tại, Mật khẩu mới, Xác nhận MK mới.</w:t>
+      <w:pPr>
+        <w:ind w:left="360" w:hanging="240"/>
+      </w:pPr>
+      <w:r>
+        <w:t>3.  Người dùng nhập Mật khẩu hiện tại, Mật khẩu mới, Xác nhận MK mới.</w:t>
       </w:r>
     </w:p>
     <w:p>
-      <w:pPr/>
-      <w:r>
-        <w:t>4. Người dùng click nút [Lưu thay đổi].</w:t>
+      <w:pPr>
+        <w:ind w:left="360" w:hanging="240"/>
+      </w:pPr>
+      <w:r>
+        <w:t>4.  Người dùng click nút [Lưu thay đổi].</w:t>
       </w:r>
     </w:p>
     <w:p>
-      <w:pPr/>
-      <w:r>
-        <w:t xml:space="preserve">5. Phương thức </w:t>
+      <w:pPr>
+        <w:ind w:left="360" w:hanging="240"/>
+      </w:pPr>
+      <w:r>
+        <w:t xml:space="preserve">5.  Phương thức </w:t>
       </w:r>
       <w:r>
         <w:rPr>
@@ -11182,9 +11409,11 @@
       </w:r>
     </w:p>
     <w:p>
-      <w:pPr/>
-      <w:r>
-        <w:t xml:space="preserve">6. Phương thức </w:t>
+      <w:pPr>
+        <w:ind w:left="360" w:hanging="240"/>
+      </w:pPr>
+      <w:r>
+        <w:t xml:space="preserve">6.  Phương thức </w:t>
       </w:r>
       <w:r>
         <w:rPr>
@@ -11208,9 +11437,11 @@
       </w:r>
     </w:p>
     <w:p>
-      <w:pPr/>
-      <w:r>
-        <w:t xml:space="preserve">7. Phương thức </w:t>
+      <w:pPr>
+        <w:ind w:left="360" w:hanging="240"/>
+      </w:pPr>
+      <w:r>
+        <w:t xml:space="preserve">7.  Phương thức </w:t>
       </w:r>
       <w:r>
         <w:rPr>
@@ -11234,9 +11465,11 @@
       </w:r>
     </w:p>
     <w:p>
-      <w:pPr/>
-      <w:r>
-        <w:t xml:space="preserve">8. Lớp User trả về đối tượng User cho phương thức </w:t>
+      <w:pPr>
+        <w:ind w:left="360" w:hanging="240"/>
+      </w:pPr>
+      <w:r>
+        <w:t xml:space="preserve">8.  Lớp User trả về đối tượng User cho phương thức </w:t>
       </w:r>
       <w:r>
         <w:rPr>
@@ -11250,9 +11483,11 @@
       </w:r>
     </w:p>
     <w:p>
-      <w:pPr/>
-      <w:r>
-        <w:t xml:space="preserve">9. Phương thức </w:t>
+      <w:pPr>
+        <w:ind w:left="360" w:hanging="240"/>
+      </w:pPr>
+      <w:r>
+        <w:t xml:space="preserve">9.  Phương thức </w:t>
       </w:r>
       <w:r>
         <w:rPr>
@@ -11282,9 +11517,11 @@
       </w:r>
     </w:p>
     <w:p>
-      <w:pPr/>
-      <w:r>
-        <w:t xml:space="preserve">10. Phương thức </w:t>
+      <w:pPr>
+        <w:ind w:left="360" w:hanging="240"/>
+      </w:pPr>
+      <w:r>
+        <w:t xml:space="preserve">10.  Phương thức </w:t>
       </w:r>
       <w:r>
         <w:rPr>
@@ -11314,9 +11551,11 @@
       </w:r>
     </w:p>
     <w:p>
-      <w:pPr/>
-      <w:r>
-        <w:t xml:space="preserve">11. Phương thức </w:t>
+      <w:pPr>
+        <w:ind w:left="360" w:hanging="240"/>
+      </w:pPr>
+      <w:r>
+        <w:t xml:space="preserve">11.  Phương thức </w:t>
       </w:r>
       <w:r>
         <w:rPr>
@@ -11346,9 +11585,11 @@
       </w:r>
     </w:p>
     <w:p>
-      <w:pPr/>
-      <w:r>
-        <w:t xml:space="preserve">12. Lớp User trả về </w:t>
+      <w:pPr>
+        <w:ind w:left="360" w:hanging="240"/>
+      </w:pPr>
+      <w:r>
+        <w:t xml:space="preserve">12.  Lớp User trả về </w:t>
       </w:r>
       <w:r>
         <w:rPr>
@@ -11372,9 +11613,11 @@
       </w:r>
     </w:p>
     <w:p>
-      <w:pPr/>
-      <w:r>
-        <w:t xml:space="preserve">13. Phương thức </w:t>
+      <w:pPr>
+        <w:ind w:left="360" w:hanging="240"/>
+      </w:pPr>
+      <w:r>
+        <w:t xml:space="preserve">13.  Phương thức </w:t>
       </w:r>
       <w:r>
         <w:rPr>
@@ -11404,9 +11647,11 @@
       </w:r>
     </w:p>
     <w:p>
-      <w:pPr/>
-      <w:r>
-        <w:t xml:space="preserve">14. Phương thức </w:t>
+      <w:pPr>
+        <w:ind w:left="360" w:hanging="240"/>
+      </w:pPr>
+      <w:r>
+        <w:t xml:space="preserve">14.  Phương thức </w:t>
       </w:r>
       <w:r>
         <w:rPr>
@@ -11440,9 +11685,11 @@
       </w:r>
     </w:p>
     <w:p>
-      <w:pPr/>
-      <w:r>
-        <w:t xml:space="preserve">15. Phương thức </w:t>
+      <w:pPr>
+        <w:ind w:left="360" w:hanging="240"/>
+      </w:pPr>
+      <w:r>
+        <w:t xml:space="preserve">15.  Phương thức </w:t>
       </w:r>
       <w:r>
         <w:rPr>
@@ -11518,15 +11765,19 @@
       </w:r>
     </w:p>
     <w:p>
-      <w:pPr/>
-      <w:r>
-        <w:t>1. Khách hàng click vào avatar / tên tài khoản ở góc trên phải.</w:t>
+      <w:pPr>
+        <w:ind w:left="360" w:hanging="240"/>
+      </w:pPr>
+      <w:r>
+        <w:t>1.  Khách hàng click vào avatar / tên tài khoản ở góc trên phải.</w:t>
       </w:r>
     </w:p>
     <w:p>
-      <w:pPr/>
-      <w:r>
-        <w:t xml:space="preserve">2. Phương thức </w:t>
+      <w:pPr>
+        <w:ind w:left="360" w:hanging="240"/>
+      </w:pPr>
+      <w:r>
+        <w:t xml:space="preserve">2.  Phương thức </w:t>
       </w:r>
       <w:r>
         <w:rPr>
@@ -11540,9 +11791,11 @@
       </w:r>
     </w:p>
     <w:p>
-      <w:pPr/>
-      <w:r>
-        <w:t xml:space="preserve">3. Phương thức </w:t>
+      <w:pPr>
+        <w:ind w:left="360" w:hanging="240"/>
+      </w:pPr>
+      <w:r>
+        <w:t xml:space="preserve">3.  Phương thức </w:t>
       </w:r>
       <w:r>
         <w:rPr>
@@ -11566,9 +11819,11 @@
       </w:r>
     </w:p>
     <w:p>
-      <w:pPr/>
-      <w:r>
-        <w:t xml:space="preserve">4. Phương thức </w:t>
+      <w:pPr>
+        <w:ind w:left="360" w:hanging="240"/>
+      </w:pPr>
+      <w:r>
+        <w:t xml:space="preserve">4.  Phương thức </w:t>
       </w:r>
       <w:r>
         <w:rPr>
@@ -11592,9 +11847,11 @@
       </w:r>
     </w:p>
     <w:p>
-      <w:pPr/>
-      <w:r>
-        <w:t xml:space="preserve">5. Lớp User trả về đối tượng User cho phương thức </w:t>
+      <w:pPr>
+        <w:ind w:left="360" w:hanging="240"/>
+      </w:pPr>
+      <w:r>
+        <w:t xml:space="preserve">5.  Lớp User trả về đối tượng User cho phương thức </w:t>
       </w:r>
       <w:r>
         <w:rPr>
@@ -11608,9 +11865,11 @@
       </w:r>
     </w:p>
     <w:p>
-      <w:pPr/>
-      <w:r>
-        <w:t xml:space="preserve">6. Phương thức </w:t>
+      <w:pPr>
+        <w:ind w:left="360" w:hanging="240"/>
+      </w:pPr>
+      <w:r>
+        <w:t xml:space="preserve">6.  Phương thức </w:t>
       </w:r>
       <w:r>
         <w:rPr>
@@ -11634,9 +11893,11 @@
       </w:r>
     </w:p>
     <w:p>
-      <w:pPr/>
-      <w:r>
-        <w:t xml:space="preserve">7. Phương thức </w:t>
+      <w:pPr>
+        <w:ind w:left="360" w:hanging="240"/>
+      </w:pPr>
+      <w:r>
+        <w:t xml:space="preserve">7.  Phương thức </w:t>
       </w:r>
       <w:r>
         <w:rPr>
@@ -11660,27 +11921,35 @@
       </w:r>
     </w:p>
     <w:p>
-      <w:pPr/>
-      <w:r>
-        <w:t>8. Khách hàng click nút [Chỉnh sửa].</w:t>
+      <w:pPr>
+        <w:ind w:left="360" w:hanging="240"/>
+      </w:pPr>
+      <w:r>
+        <w:t>8.  Khách hàng click nút [Chỉnh sửa].</w:t>
       </w:r>
     </w:p>
     <w:p>
-      <w:pPr/>
-      <w:r>
-        <w:t>9. Khách hàng sửa Họ tên và Email.</w:t>
+      <w:pPr>
+        <w:ind w:left="360" w:hanging="240"/>
+      </w:pPr>
+      <w:r>
+        <w:t>9.  Khách hàng sửa Họ tên và Email.</w:t>
       </w:r>
     </w:p>
     <w:p>
-      <w:pPr/>
-      <w:r>
-        <w:t>10. Khách hàng click nút [Lưu].</w:t>
+      <w:pPr>
+        <w:ind w:left="360" w:hanging="240"/>
+      </w:pPr>
+      <w:r>
+        <w:t>10.  Khách hàng click nút [Lưu].</w:t>
       </w:r>
     </w:p>
     <w:p>
-      <w:pPr/>
-      <w:r>
-        <w:t xml:space="preserve">11. Phương thức </w:t>
+      <w:pPr>
+        <w:ind w:left="360" w:hanging="240"/>
+      </w:pPr>
+      <w:r>
+        <w:t xml:space="preserve">11.  Phương thức </w:t>
       </w:r>
       <w:r>
         <w:rPr>
@@ -11694,9 +11963,11 @@
       </w:r>
     </w:p>
     <w:p>
-      <w:pPr/>
-      <w:r>
-        <w:t xml:space="preserve">12. Phương thức </w:t>
+      <w:pPr>
+        <w:ind w:left="360" w:hanging="240"/>
+      </w:pPr>
+      <w:r>
+        <w:t xml:space="preserve">12.  Phương thức </w:t>
       </w:r>
       <w:r>
         <w:rPr>
@@ -11720,9 +11991,11 @@
       </w:r>
     </w:p>
     <w:p>
-      <w:pPr/>
-      <w:r>
-        <w:t xml:space="preserve">13. Phương thức </w:t>
+      <w:pPr>
+        <w:ind w:left="360" w:hanging="240"/>
+      </w:pPr>
+      <w:r>
+        <w:t xml:space="preserve">13.  Phương thức </w:t>
       </w:r>
       <w:r>
         <w:rPr>
@@ -11752,9 +12025,11 @@
       </w:r>
     </w:p>
     <w:p>
-      <w:pPr/>
-      <w:r>
-        <w:t xml:space="preserve">14. Lớp User trả về </w:t>
+      <w:pPr>
+        <w:ind w:left="360" w:hanging="240"/>
+      </w:pPr>
+      <w:r>
+        <w:t xml:space="preserve">14.  Lớp User trả về </w:t>
       </w:r>
       <w:r>
         <w:rPr>
@@ -11778,9 +12053,11 @@
       </w:r>
     </w:p>
     <w:p>
-      <w:pPr/>
-      <w:r>
-        <w:t xml:space="preserve">15. Phương thức </w:t>
+      <w:pPr>
+        <w:ind w:left="360" w:hanging="240"/>
+      </w:pPr>
+      <w:r>
+        <w:t xml:space="preserve">15.  Phương thức </w:t>
       </w:r>
       <w:r>
         <w:rPr>
@@ -11810,9 +12087,11 @@
       </w:r>
     </w:p>
     <w:p>
-      <w:pPr/>
-      <w:r>
-        <w:t xml:space="preserve">16. Lớp User trả về đối tượng User đã cập nhật cho phương thức </w:t>
+      <w:pPr>
+        <w:ind w:left="360" w:hanging="240"/>
+      </w:pPr>
+      <w:r>
+        <w:t xml:space="preserve">16.  Lớp User trả về đối tượng User đã cập nhật cho phương thức </w:t>
       </w:r>
       <w:r>
         <w:rPr>
@@ -11826,9 +12105,11 @@
       </w:r>
     </w:p>
     <w:p>
-      <w:pPr/>
-      <w:r>
-        <w:t xml:space="preserve">17. Phương thức </w:t>
+      <w:pPr>
+        <w:ind w:left="360" w:hanging="240"/>
+      </w:pPr>
+      <w:r>
+        <w:t xml:space="preserve">17.  Phương thức </w:t>
       </w:r>
       <w:r>
         <w:rPr>
@@ -11852,9 +12133,11 @@
       </w:r>
     </w:p>
     <w:p>
-      <w:pPr/>
-      <w:r>
-        <w:t xml:space="preserve">18. Phương thức </w:t>
+      <w:pPr>
+        <w:ind w:left="360" w:hanging="240"/>
+      </w:pPr>
+      <w:r>
+        <w:t xml:space="preserve">18.  Phương thức </w:t>
       </w:r>
       <w:r>
         <w:rPr>
@@ -11940,9 +12223,11 @@
       </w:r>
     </w:p>
     <w:p>
-      <w:pPr/>
-      <w:r>
-        <w:t xml:space="preserve">1. Admin truy cập URL </w:t>
+      <w:pPr>
+        <w:ind w:left="360" w:hanging="240"/>
+      </w:pPr>
+      <w:r>
+        <w:t xml:space="preserve">1.  Admin truy cập URL </w:t>
       </w:r>
       <w:r>
         <w:rPr>
@@ -11956,9 +12241,11 @@
       </w:r>
     </w:p>
     <w:p>
-      <w:pPr/>
-      <w:r>
-        <w:t xml:space="preserve">2. Phương thức </w:t>
+      <w:pPr>
+        <w:ind w:left="360" w:hanging="240"/>
+      </w:pPr>
+      <w:r>
+        <w:t xml:space="preserve">2.  Phương thức </w:t>
       </w:r>
       <w:r>
         <w:rPr>
@@ -11972,9 +12259,11 @@
       </w:r>
     </w:p>
     <w:p>
-      <w:pPr/>
-      <w:r>
-        <w:t xml:space="preserve">3. Phương thức </w:t>
+      <w:pPr>
+        <w:ind w:left="360" w:hanging="240"/>
+      </w:pPr>
+      <w:r>
+        <w:t xml:space="preserve">3.  Phương thức </w:t>
       </w:r>
       <w:r>
         <w:rPr>
@@ -11998,9 +12287,11 @@
       </w:r>
     </w:p>
     <w:p>
-      <w:pPr/>
-      <w:r>
-        <w:t xml:space="preserve">4. Phương thức </w:t>
+      <w:pPr>
+        <w:ind w:left="360" w:hanging="240"/>
+      </w:pPr>
+      <w:r>
+        <w:t xml:space="preserve">4.  Phương thức </w:t>
       </w:r>
       <w:r>
         <w:rPr>
@@ -12030,9 +12321,11 @@
       </w:r>
     </w:p>
     <w:p>
-      <w:pPr/>
-      <w:r>
-        <w:t xml:space="preserve">5. Lớp Employee trả về danh sách nhân viên cho phương thức </w:t>
+      <w:pPr>
+        <w:ind w:left="360" w:hanging="240"/>
+      </w:pPr>
+      <w:r>
+        <w:t xml:space="preserve">5.  Lớp Employee trả về danh sách nhân viên cho phương thức </w:t>
       </w:r>
       <w:r>
         <w:rPr>
@@ -12046,9 +12339,11 @@
       </w:r>
     </w:p>
     <w:p>
-      <w:pPr/>
-      <w:r>
-        <w:t xml:space="preserve">6. Phương thức </w:t>
+      <w:pPr>
+        <w:ind w:left="360" w:hanging="240"/>
+      </w:pPr>
+      <w:r>
+        <w:t xml:space="preserve">6.  Phương thức </w:t>
       </w:r>
       <w:r>
         <w:rPr>
@@ -12072,9 +12367,11 @@
       </w:r>
     </w:p>
     <w:p>
-      <w:pPr/>
-      <w:r>
-        <w:t xml:space="preserve">7. Phương thức </w:t>
+      <w:pPr>
+        <w:ind w:left="360" w:hanging="240"/>
+      </w:pPr>
+      <w:r>
+        <w:t xml:space="preserve">7.  Phương thức </w:t>
       </w:r>
       <w:r>
         <w:rPr>
@@ -12098,27 +12395,35 @@
       </w:r>
     </w:p>
     <w:p>
-      <w:pPr/>
-      <w:r>
-        <w:t>8. Admin click nút [Thêm nhân viên].</w:t>
+      <w:pPr>
+        <w:ind w:left="360" w:hanging="240"/>
+      </w:pPr>
+      <w:r>
+        <w:t>8.  Admin click nút [Thêm nhân viên].</w:t>
       </w:r>
     </w:p>
     <w:p>
-      <w:pPr/>
-      <w:r>
-        <w:t>9. Admin nhập Họ tên và Vai trò.</w:t>
+      <w:pPr>
+        <w:ind w:left="360" w:hanging="240"/>
+      </w:pPr>
+      <w:r>
+        <w:t>9.  Admin nhập Họ tên và Vai trò.</w:t>
       </w:r>
     </w:p>
     <w:p>
-      <w:pPr/>
-      <w:r>
-        <w:t>10. Admin click nút [Lưu].</w:t>
+      <w:pPr>
+        <w:ind w:left="360" w:hanging="240"/>
+      </w:pPr>
+      <w:r>
+        <w:t>10.  Admin click nút [Lưu].</w:t>
       </w:r>
     </w:p>
     <w:p>
-      <w:pPr/>
-      <w:r>
-        <w:t xml:space="preserve">11. Phương thức </w:t>
+      <w:pPr>
+        <w:ind w:left="360" w:hanging="240"/>
+      </w:pPr>
+      <w:r>
+        <w:t xml:space="preserve">11.  Phương thức </w:t>
       </w:r>
       <w:r>
         <w:rPr>
@@ -12132,9 +12437,11 @@
       </w:r>
     </w:p>
     <w:p>
-      <w:pPr/>
-      <w:r>
-        <w:t xml:space="preserve">12. Phương thức </w:t>
+      <w:pPr>
+        <w:ind w:left="360" w:hanging="240"/>
+      </w:pPr>
+      <w:r>
+        <w:t xml:space="preserve">12.  Phương thức </w:t>
       </w:r>
       <w:r>
         <w:rPr>
@@ -12158,9 +12465,11 @@
       </w:r>
     </w:p>
     <w:p>
-      <w:pPr/>
-      <w:r>
-        <w:t xml:space="preserve">13. Phương thức </w:t>
+      <w:pPr>
+        <w:ind w:left="360" w:hanging="240"/>
+      </w:pPr>
+      <w:r>
+        <w:t xml:space="preserve">13.  Phương thức </w:t>
       </w:r>
       <w:r>
         <w:rPr>
@@ -12184,9 +12493,11 @@
       </w:r>
     </w:p>
     <w:p>
-      <w:pPr/>
-      <w:r>
-        <w:t xml:space="preserve">14. Lớp Employee trả về đối tượng Employee vừa tạo cho phương thức </w:t>
+      <w:pPr>
+        <w:ind w:left="360" w:hanging="240"/>
+      </w:pPr>
+      <w:r>
+        <w:t xml:space="preserve">14.  Lớp Employee trả về đối tượng Employee vừa tạo cho phương thức </w:t>
       </w:r>
       <w:r>
         <w:rPr>
@@ -12200,9 +12511,11 @@
       </w:r>
     </w:p>
     <w:p>
-      <w:pPr/>
-      <w:r>
-        <w:t xml:space="preserve">15. Phương thức </w:t>
+      <w:pPr>
+        <w:ind w:left="360" w:hanging="240"/>
+      </w:pPr>
+      <w:r>
+        <w:t xml:space="preserve">15.  Phương thức </w:t>
       </w:r>
       <w:r>
         <w:rPr>
@@ -12236,9 +12549,11 @@
       </w:r>
     </w:p>
     <w:p>
-      <w:pPr/>
-      <w:r>
-        <w:t xml:space="preserve">16. Phương thức </w:t>
+      <w:pPr>
+        <w:ind w:left="360" w:hanging="240"/>
+      </w:pPr>
+      <w:r>
+        <w:t xml:space="preserve">16.  Phương thức </w:t>
       </w:r>
       <w:r>
         <w:rPr>
@@ -12262,15 +12577,19 @@
       </w:r>
     </w:p>
     <w:p>
-      <w:pPr/>
-      <w:r>
-        <w:t>17. Admin click nút [Xóa] trên một dòng nhân viên trong bảng.</w:t>
+      <w:pPr>
+        <w:ind w:left="360" w:hanging="240"/>
+      </w:pPr>
+      <w:r>
+        <w:t>17.  Admin click nút [Xóa] trên một dòng nhân viên trong bảng.</w:t>
       </w:r>
     </w:p>
     <w:p>
-      <w:pPr/>
-      <w:r>
-        <w:t xml:space="preserve">18. Phương thức </w:t>
+      <w:pPr>
+        <w:ind w:left="360" w:hanging="240"/>
+      </w:pPr>
+      <w:r>
+        <w:t xml:space="preserve">18.  Phương thức </w:t>
       </w:r>
       <w:r>
         <w:rPr>
@@ -12284,9 +12603,11 @@
       </w:r>
     </w:p>
     <w:p>
-      <w:pPr/>
-      <w:r>
-        <w:t xml:space="preserve">19. Phương thức </w:t>
+      <w:pPr>
+        <w:ind w:left="360" w:hanging="240"/>
+      </w:pPr>
+      <w:r>
+        <w:t xml:space="preserve">19.  Phương thức </w:t>
       </w:r>
       <w:r>
         <w:rPr>
@@ -12310,9 +12631,11 @@
       </w:r>
     </w:p>
     <w:p>
-      <w:pPr/>
-      <w:r>
-        <w:t xml:space="preserve">20. Phương thức </w:t>
+      <w:pPr>
+        <w:ind w:left="360" w:hanging="240"/>
+      </w:pPr>
+      <w:r>
+        <w:t xml:space="preserve">20.  Phương thức </w:t>
       </w:r>
       <w:r>
         <w:rPr>
@@ -12342,9 +12665,11 @@
       </w:r>
     </w:p>
     <w:p>
-      <w:pPr/>
-      <w:r>
-        <w:t xml:space="preserve">21. Lớp Employee trả về </w:t>
+      <w:pPr>
+        <w:ind w:left="360" w:hanging="240"/>
+      </w:pPr>
+      <w:r>
+        <w:t xml:space="preserve">21.  Lớp Employee trả về </w:t>
       </w:r>
       <w:r>
         <w:rPr>
@@ -12368,9 +12693,11 @@
       </w:r>
     </w:p>
     <w:p>
-      <w:pPr/>
-      <w:r>
-        <w:t xml:space="preserve">22. Phương thức </w:t>
+      <w:pPr>
+        <w:ind w:left="360" w:hanging="240"/>
+      </w:pPr>
+      <w:r>
+        <w:t xml:space="preserve">22.  Phương thức </w:t>
       </w:r>
       <w:r>
         <w:rPr>
@@ -12404,9 +12731,11 @@
       </w:r>
     </w:p>
     <w:p>
-      <w:pPr/>
-      <w:r>
-        <w:t xml:space="preserve">23. Phương thức </w:t>
+      <w:pPr>
+        <w:ind w:left="360" w:hanging="240"/>
+      </w:pPr>
+      <w:r>
+        <w:t xml:space="preserve">23.  Phương thức </w:t>
       </w:r>
       <w:r>
         <w:rPr>
@@ -34040,6 +34369,69 @@
   </w:num>
   <w:num w:numId="9">
     <w:abstractNumId w:val="0"/>
+  </w:num>
+  <w:abstractNum w:abstractNumId="1">
+    <w:multiLevelType w:val="hybridMultilevel"/>
+    <w:lvl w:ilvl="0">
+      <w:start w:val="1"/>
+      <w:numFmt w:val="bullet"/>
+      <w:lvlText w:val="•"/>
+      <w:pPr>
+        <w:ind w:left="360" w:hanging="360"/>
+      </w:pPr>
+      <w:rPr>
+        <w:rFonts w:hint="default"/>
+      </w:rPr>
+    </w:lvl>
+    <w:lvl w:ilvl="1">
+      <w:start w:val="1"/>
+      <w:numFmt w:val="bullet"/>
+      <w:lvlText w:val="◦"/>
+      <w:pPr>
+        <w:ind w:left="720" w:hanging="360"/>
+      </w:pPr>
+    </w:lvl>
+    <w:lvl w:ilvl="2">
+      <w:start w:val="1"/>
+      <w:numFmt w:val="bullet"/>
+      <w:lvlText w:val="▪"/>
+      <w:pPr>
+        <w:ind w:left="1080" w:hanging="360"/>
+      </w:pPr>
+    </w:lvl>
+  </w:abstractNum>
+  <w:num w:numId="1">
+    <w:abstractNumId w:val="1"/>
+  </w:num>
+  <w:abstractNum w:abstractNumId="2">
+    <w:multiLevelType w:val="hybridMultilevel"/>
+    <w:lvl w:ilvl="0">
+      <w:start w:val="1"/>
+      <w:numFmt w:val="decimal"/>
+      <w:lvlText w:val="%1."/>
+      <w:pPr>
+        <w:ind w:left="360" w:hanging="360"/>
+      </w:pPr>
+    </w:lvl>
+    <w:lvl w:ilvl="1">
+      <w:start w:val="1"/>
+      <w:numFmt w:val="decimal"/>
+      <w:lvlText w:val="%2."/>
+      <w:pPr>
+        <w:ind w:left="720" w:hanging="360"/>
+      </w:pPr>
+    </w:lvl>
+    <w:lvl w:ilvl="2">
+      <w:start w:val="1"/>
+      <w:numFmt w:val="decimal"/>
+      <w:lvlText w:val="%3."/>
+      <w:pPr>
+        <w:ind w:left="1080" w:hanging="360"/>
+      </w:pPr>
+    </w:lvl>
+  </w:abstractNum>
+  <w:num w:numId="2">
+    <w:abstractNumId w:val="2"/>
   </w:num>
 </w:numbering>
 </file>

</xml_diff>

<commit_message>
fix: UC overview diagram chỉ có 5 UC chính + actor, bỏ UC con
</commit_message>
<xml_diff>
--- a/output/account_module.docx
+++ b/output/account_module.docx
@@ -1541,7 +1541,7 @@
       <w:r>
         <w:drawing>
           <wp:inline xmlns:a="http://schemas.openxmlformats.org/drawingml/2006/main" xmlns:pic="http://schemas.openxmlformats.org/drawingml/2006/picture">
-            <wp:extent cx="5486400" cy="8903445"/>
+            <wp:extent cx="5486400" cy="5407269"/>
             <wp:docPr id="1" name="Picture 1"/>
             <wp:cNvGraphicFramePr>
               <a:graphicFrameLocks noChangeAspect="1"/>
@@ -1562,7 +1562,7 @@
                   <pic:spPr>
                     <a:xfrm>
                       <a:off x="0" y="0"/>
-                      <a:ext cx="5486400" cy="8903445"/>
+                      <a:ext cx="5486400" cy="5407269"/>
                     </a:xfrm>
                     <a:prstGeom prst="rect"/>
                   </pic:spPr>

</xml_diff>

<commit_message>
fix: rewrite scenarios - Actor/System focus, no CSDL details
- UC01: 5 steps (bỏ kiểm tra định dạng, truy vấn CSDL)
- UC02: 8 steps (bỏ kiểm tra định dạng, mã hóa tài khoản)
- UC03: 5 steps (bỏ xác minh CSDL, mã hóa, thu hồi session)
- UC04: 7 steps + inline table profile (bỏ truy xuất CSDL)
- UC20: 14 steps + inline table staff list (bỏ kiểm tra CSDL)
- Focus: Actor làm gì / Hệ thống phản hồi gì
- Inline tables: UC04 profile + UC20 staff list (native DOCX)
</commit_message>
<xml_diff>
--- a/output/account_module.docx
+++ b/output/account_module.docx
@@ -3593,7 +3593,7 @@
               <w:rPr>
                 <w:sz w:val="20"/>
               </w:rPr>
-              <w:t>Người dùng được xác thực thành công, hệ thống tạo phiên đăng nhập và chuyển hướng đến trang chủ tương ứng.</w:t>
+              <w:t>Người dùng được xác thực, chuyển hướng đến trang chủ.</w:t>
             </w:r>
           </w:p>
         </w:tc>
@@ -3626,7 +3626,7 @@
               <w:rPr>
                 <w:sz w:val="20"/>
               </w:rPr>
-              <w:t>1. Người dùng truy cập chức năng "Đăng nhập".</w:t>
+              <w:t>1. Người dùng chọn chức năng "Đăng nhập".</w:t>
             </w:r>
             <w:r>
               <w:br/>
@@ -3635,7 +3635,7 @@
               <w:rPr>
                 <w:sz w:val="20"/>
               </w:rPr>
-              <w:t>2. Hệ thống hiển thị giao diện đăng nhập yêu cầu nhập thông tin đăng nhập.</w:t>
+              <w:t>2. Hệ thống hiển thị giao diện đăng nhập có ô nhập SĐT/Email, ô nhập Mật khẩu, nút Đăng nhập, liên kết "Quên mật khẩu?" và "Đăng ký".</w:t>
             </w:r>
             <w:r>
               <w:br/>
@@ -3653,7 +3653,7 @@
               <w:rPr>
                 <w:sz w:val="20"/>
               </w:rPr>
-              <w:t>4. Người dùng nhấn nút xác nhận đăng nhập.</w:t>
+              <w:t>4. Người dùng nhấn nút Đăng nhập.</w:t>
             </w:r>
             <w:r>
               <w:br/>
@@ -3662,34 +3662,7 @@
               <w:rPr>
                 <w:sz w:val="20"/>
               </w:rPr>
-              <w:t>5. Hệ thống kiểm tra định dạng đầu vào.</w:t>
-            </w:r>
-            <w:r>
-              <w:br/>
-            </w:r>
-            <w:r>
-              <w:rPr>
-                <w:sz w:val="20"/>
-              </w:rPr>
-              <w:t>6. Hệ thống truy vấn CSDL tìm tài khoản theo SĐT/Email, so sánh mật khẩu đã mã hóa.</w:t>
-            </w:r>
-            <w:r>
-              <w:br/>
-            </w:r>
-            <w:r>
-              <w:rPr>
-                <w:sz w:val="20"/>
-              </w:rPr>
-              <w:t>7. Xác thực thành công, hệ thống tạo phiên đăng nhập với vai trò tương ứng.</w:t>
-            </w:r>
-            <w:r>
-              <w:br/>
-            </w:r>
-            <w:r>
-              <w:rPr>
-                <w:sz w:val="20"/>
-              </w:rPr>
-              <w:t>8. Hệ thống chuyển hướng đến trang chủ, hiển thị thông báo "Đăng nhập thành công".</w:t>
+              <w:t>5. Hệ thống xác thực thành công, chuyển hướng đến trang chủ và hiển thị thông báo "Đăng nhập thành công".</w:t>
             </w:r>
           </w:p>
         </w:tc>
@@ -3722,7 +3695,7 @@
               <w:rPr>
                 <w:sz w:val="20"/>
               </w:rPr>
-              <w:t>5. Hệ thống phát hiện định dạng đầu vào không hợp lệ.</w:t>
+              <w:t>5. Hệ thống thông báo "Tài khoản không tồn tại".</w:t>
             </w:r>
             <w:r>
               <w:br/>
@@ -3731,7 +3704,7 @@
               <w:rPr>
                 <w:sz w:val="20"/>
               </w:rPr>
-              <w:t>5.1 Hệ thống hiển thị thông báo lỗi yêu cầu nhập lại.</w:t>
+              <w:t>5.1 Người dùng chọn liên kết "Đăng ký" (chuyển sang UC02).</w:t>
             </w:r>
             <w:r>
               <w:br/>
@@ -3740,7 +3713,7 @@
               <w:rPr>
                 <w:sz w:val="20"/>
               </w:rPr>
-              <w:t>5.2 Người dùng nhập lại thông tin (quay về Bước 4).</w:t>
+              <w:t>5. Hệ thống thông báo "Sai mật khẩu".</w:t>
             </w:r>
             <w:r>
               <w:br/>
@@ -3749,52 +3722,7 @@
               <w:rPr>
                 <w:sz w:val="20"/>
               </w:rPr>
-              <w:t>6. Hệ thống không tìm thấy tài khoản khớp SĐT/Email.</w:t>
-            </w:r>
-            <w:r>
-              <w:br/>
-            </w:r>
-            <w:r>
-              <w:rPr>
-                <w:sz w:val="20"/>
-              </w:rPr>
-              <w:t>6.1 Hệ thống hiển thị thông báo "Tài khoản không tồn tại".</w:t>
-            </w:r>
-            <w:r>
-              <w:br/>
-            </w:r>
-            <w:r>
-              <w:rPr>
-                <w:sz w:val="20"/>
-              </w:rPr>
-              <w:t>6.2 Người dùng chọn đăng ký tài khoản mới (chuyển sang UC02).</w:t>
-            </w:r>
-            <w:r>
-              <w:br/>
-            </w:r>
-            <w:r>
-              <w:rPr>
-                <w:sz w:val="20"/>
-              </w:rPr>
-              <w:t>6. Mật khẩu không chính xác.</w:t>
-            </w:r>
-            <w:r>
-              <w:br/>
-            </w:r>
-            <w:r>
-              <w:rPr>
-                <w:sz w:val="20"/>
-              </w:rPr>
-              <w:t>6.1 Hệ thống hiển thị thông báo "Sai mật khẩu".</w:t>
-            </w:r>
-            <w:r>
-              <w:br/>
-            </w:r>
-            <w:r>
-              <w:rPr>
-                <w:sz w:val="20"/>
-              </w:rPr>
-              <w:t>6.2 Người dùng nhập lại mật khẩu (quay về Bước 4).</w:t>
+              <w:t>5.1 Người dùng nhập lại mật khẩu (quay về Bước 4).</w:t>
             </w:r>
           </w:p>
         </w:tc>
@@ -3916,7 +3844,7 @@
               <w:rPr>
                 <w:sz w:val="20"/>
               </w:rPr>
-              <w:t>Người dùng chưa có tài khoản. Hệ thống hoạt động bình thường.</w:t>
+              <w:t>Người dùng chưa có tài khoản.</w:t>
             </w:r>
           </w:p>
         </w:tc>
@@ -3949,7 +3877,7 @@
               <w:rPr>
                 <w:sz w:val="20"/>
               </w:rPr>
-              <w:t>Tài khoản mới được tạo, hạng "Thường", đăng nhập tự động.</w:t>
+              <w:t>Tài khoản mới được tạo, đăng nhập tự động.</w:t>
             </w:r>
           </w:p>
         </w:tc>
@@ -3982,7 +3910,7 @@
               <w:rPr>
                 <w:sz w:val="20"/>
               </w:rPr>
-              <w:t>1. Người dùng chọn chức năng "Đăng ký" từ giao diện đăng nhập.</w:t>
+              <w:t>1. Người dùng chọn liên kết "Đăng ký" từ giao diện đăng nhập.</w:t>
             </w:r>
             <w:r>
               <w:br/>
@@ -3991,7 +3919,7 @@
               <w:rPr>
                 <w:sz w:val="20"/>
               </w:rPr>
-              <w:t>2. Hệ thống hiển thị giao diện đăng ký yêu cầu nhập thông tin.</w:t>
+              <w:t>2. Hệ thống hiển thị giao diện đăng ký có ô nhập Họ tên, SĐT, Email, Mật khẩu, Xác nhận mật khẩu, nút Tiếp tục.</w:t>
             </w:r>
             <w:r>
               <w:br/>
@@ -4018,7 +3946,7 @@
               <w:rPr>
                 <w:sz w:val="20"/>
               </w:rPr>
-              <w:t>5. Hệ thống kiểm tra định dạng, SĐT và Email chưa tồn tại trong CSDL.</w:t>
+              <w:t>5. Hệ thống gửi mã OTP 6 chữ số đến SĐT.</w:t>
             </w:r>
             <w:r>
               <w:br/>
@@ -4027,7 +3955,7 @@
               <w:rPr>
                 <w:sz w:val="20"/>
               </w:rPr>
-              <w:t>6. Hệ thống gửi mã OTP 6 chữ số đến SĐT.</w:t>
+              <w:t>6. Hệ thống hiển thị giao diện xác nhận OTP có ô nhập mã OTP, nút Xác nhận, nút Gửi lại mã.</w:t>
             </w:r>
             <w:r>
               <w:br/>
@@ -4036,7 +3964,7 @@
               <w:rPr>
                 <w:sz w:val="20"/>
               </w:rPr>
-              <w:t>7. Hệ thống hiển thị giao diện yêu cầu nhập mã OTP.</w:t>
+              <w:t>7. Người dùng nhập mã OTP và nhấn nút Xác nhận.</w:t>
             </w:r>
             <w:r>
               <w:br/>
@@ -4045,34 +3973,7 @@
               <w:rPr>
                 <w:sz w:val="20"/>
               </w:rPr>
-              <w:t>8. Người dùng nhập mã OTP và nhấn nút Xác nhận.</w:t>
-            </w:r>
-            <w:r>
-              <w:br/>
-            </w:r>
-            <w:r>
-              <w:rPr>
-                <w:sz w:val="20"/>
-              </w:rPr>
-              <w:t>9. Hệ thống xác minh mã OTP đúng và còn hiệu lực.</w:t>
-            </w:r>
-            <w:r>
-              <w:br/>
-            </w:r>
-            <w:r>
-              <w:rPr>
-                <w:sz w:val="20"/>
-              </w:rPr>
-              <w:t>10. Hệ thống tạo tài khoản mới, hạng "Thường", điểm tích lũy bằng 0.</w:t>
-            </w:r>
-            <w:r>
-              <w:br/>
-            </w:r>
-            <w:r>
-              <w:rPr>
-                <w:sz w:val="20"/>
-              </w:rPr>
-              <w:t>11. Hệ thống tự động đăng nhập, hiển thị thông báo "Đăng ký thành công!".</w:t>
+              <w:t>8. Hệ thống tạo tài khoản mới, tự động đăng nhập và hiển thị thông báo "Đăng ký thành công!".</w:t>
             </w:r>
           </w:p>
         </w:tc>
@@ -4105,7 +4006,7 @@
               <w:rPr>
                 <w:sz w:val="20"/>
               </w:rPr>
-              <w:t>5. Hệ thống phát hiện SĐT hoặc Email đã tồn tại.</w:t>
+              <w:t>4. Hệ thống thông báo "SĐT hoặc Email đã được sử dụng".</w:t>
             </w:r>
             <w:r>
               <w:br/>
@@ -4114,7 +4015,7 @@
               <w:rPr>
                 <w:sz w:val="20"/>
               </w:rPr>
-              <w:t>5.1 Hệ thống hiển thị thông báo "SĐT hoặc Email đã được sử dụng".</w:t>
+              <w:t>4.1 Người dùng nhập lại thông tin khác (quay về Bước 4).</w:t>
             </w:r>
             <w:r>
               <w:br/>
@@ -4123,7 +4024,7 @@
               <w:rPr>
                 <w:sz w:val="20"/>
               </w:rPr>
-              <w:t>5.2 Người dùng nhập lại thông tin khác (quay về Bước 4).</w:t>
+              <w:t>7. Hệ thống thông báo "Mã OTP không hợp lệ hoặc đã hết hạn".</w:t>
             </w:r>
             <w:r>
               <w:br/>
@@ -4132,52 +4033,7 @@
               <w:rPr>
                 <w:sz w:val="20"/>
               </w:rPr>
-              <w:t>5. Hệ thống phát hiện định dạng đầu vào không hợp lệ.</w:t>
-            </w:r>
-            <w:r>
-              <w:br/>
-            </w:r>
-            <w:r>
-              <w:rPr>
-                <w:sz w:val="20"/>
-              </w:rPr>
-              <w:t>5.1 Hệ thống hiển thị thông báo lỗi cụ thể.</w:t>
-            </w:r>
-            <w:r>
-              <w:br/>
-            </w:r>
-            <w:r>
-              <w:rPr>
-                <w:sz w:val="20"/>
-              </w:rPr>
-              <w:t>5.2 Người dùng nhập lại thông tin (quay về Bước 4).</w:t>
-            </w:r>
-            <w:r>
-              <w:br/>
-            </w:r>
-            <w:r>
-              <w:rPr>
-                <w:sz w:val="20"/>
-              </w:rPr>
-              <w:t>9. Mã OTP sai hoặc đã hết hiệu lực.</w:t>
-            </w:r>
-            <w:r>
-              <w:br/>
-            </w:r>
-            <w:r>
-              <w:rPr>
-                <w:sz w:val="20"/>
-              </w:rPr>
-              <w:t>9.1 Hệ thống hiển thị thông báo "Mã OTP không hợp lệ hoặc đã hết hạn".</w:t>
-            </w:r>
-            <w:r>
-              <w:br/>
-            </w:r>
-            <w:r>
-              <w:rPr>
-                <w:sz w:val="20"/>
-              </w:rPr>
-              <w:t>9.2 Người dùng chọn gửi lại mã OTP (quay về Bước 8).</w:t>
+              <w:t>7.1 Người dùng nhấn nút Gửi lại mã (quay về Bước 6).</w:t>
             </w:r>
           </w:p>
         </w:tc>
@@ -4299,7 +4155,7 @@
               <w:rPr>
                 <w:sz w:val="20"/>
               </w:rPr>
-              <w:t>Người dùng đã đăng nhập thành công.</w:t>
+              <w:t>Người dùng đã đăng nhập.</w:t>
             </w:r>
           </w:p>
         </w:tc>
@@ -4332,7 +4188,7 @@
               <w:rPr>
                 <w:sz w:val="20"/>
               </w:rPr>
-              <w:t>Mật khẩu mới được lưu (mã hóa). Tất cả phiên đăng nhập khác bị thu hồi.</w:t>
+              <w:t>Mật khẩu mới được lưu. Tất cả phiên đăng nhập khác bị thu hồi.</w:t>
             </w:r>
           </w:p>
         </w:tc>
@@ -4365,7 +4221,7 @@
               <w:rPr>
                 <w:sz w:val="20"/>
               </w:rPr>
-              <w:t>1. Người dùng truy cập chức năng "Đổi mật khẩu".</w:t>
+              <w:t>1. Người dùng chọn chức năng "Đổi mật khẩu".</w:t>
             </w:r>
             <w:r>
               <w:br/>
@@ -4374,7 +4230,7 @@
               <w:rPr>
                 <w:sz w:val="20"/>
               </w:rPr>
-              <w:t>2. Hệ thống hiển thị giao diện yêu cầu nhập mật khẩu hiện tại và mật khẩu mới.</w:t>
+              <w:t>2. Hệ thống hiển thị giao diện có ô nhập Mật khẩu hiện tại, Mật khẩu mới, Xác nhận mật khẩu mới, nút Lưu thay đổi.</w:t>
             </w:r>
             <w:r>
               <w:br/>
@@ -4401,61 +4257,7 @@
               <w:rPr>
                 <w:sz w:val="20"/>
               </w:rPr>
-              <w:t>5. Hệ thống xác minh mật khẩu hiện tại khớp CSDL.</w:t>
-            </w:r>
-            <w:r>
-              <w:br/>
-            </w:r>
-            <w:r>
-              <w:rPr>
-                <w:sz w:val="20"/>
-              </w:rPr>
-              <w:t>6. Hệ thống kiểm tra mật khẩu mới hợp lệ (độ dài tối thiểu 8 ký tự, có chữ hoa, chữ thường, số, ký tự đặc biệt).</w:t>
-            </w:r>
-            <w:r>
-              <w:br/>
-            </w:r>
-            <w:r>
-              <w:rPr>
-                <w:sz w:val="20"/>
-              </w:rPr>
-              <w:t>7. Hệ thống kiểm tra mật khẩu mới khác mật khẩu hiện tại.</w:t>
-            </w:r>
-            <w:r>
-              <w:br/>
-            </w:r>
-            <w:r>
-              <w:rPr>
-                <w:sz w:val="20"/>
-              </w:rPr>
-              <w:t>8. Hệ thống mã hóa và cập nhật mật khẩu mới vào CSDL.</w:t>
-            </w:r>
-            <w:r>
-              <w:br/>
-            </w:r>
-            <w:r>
-              <w:rPr>
-                <w:sz w:val="20"/>
-              </w:rPr>
-              <w:t>9. Hệ thống thu hồi tất cả phiên đăng nhập khác.</w:t>
-            </w:r>
-            <w:r>
-              <w:br/>
-            </w:r>
-            <w:r>
-              <w:rPr>
-                <w:sz w:val="20"/>
-              </w:rPr>
-              <w:t>10. Hệ thống hiển thị thông báo "Đổi mật khẩu thành công. Vui lòng đăng nhập lại."</w:t>
-            </w:r>
-            <w:r>
-              <w:br/>
-            </w:r>
-            <w:r>
-              <w:rPr>
-                <w:sz w:val="20"/>
-              </w:rPr>
-              <w:t>11. Hệ thống chuyển hướng về giao diện đăng nhập.</w:t>
+              <w:t>5. Hệ thống cập nhật mật khẩu, thu hồi các phiên khác, hiển thị thông báo "Đổi mật khẩu thành công. Vui lòng đăng nhập lại." và chuyển hướng về giao diện đăng nhập.</w:t>
             </w:r>
           </w:p>
         </w:tc>
@@ -4488,7 +4290,7 @@
               <w:rPr>
                 <w:sz w:val="20"/>
               </w:rPr>
-              <w:t>5. Hệ thống phát hiện mật khẩu hiện tại không khớp.</w:t>
+              <w:t>4. Hệ thống thông báo "Mật khẩu hiện tại không chính xác".</w:t>
             </w:r>
             <w:r>
               <w:br/>
@@ -4497,7 +4299,7 @@
               <w:rPr>
                 <w:sz w:val="20"/>
               </w:rPr>
-              <w:t>5.1 Hệ thống hiển thị thông báo "Mật khẩu hiện tại không chính xác".</w:t>
+              <w:t>4.1 Người dùng nhập lại mật khẩu hiện tại (quay về Bước 4).</w:t>
             </w:r>
             <w:r>
               <w:br/>
@@ -4506,7 +4308,7 @@
               <w:rPr>
                 <w:sz w:val="20"/>
               </w:rPr>
-              <w:t>5.2 Người dùng nhập lại mật khẩu hiện tại (quay về Bước 4).</w:t>
+              <w:t>4. Hệ thống thông báo "Mật khẩu mới không hợp lệ".</w:t>
             </w:r>
             <w:r>
               <w:br/>
@@ -4515,52 +4317,7 @@
               <w:rPr>
                 <w:sz w:val="20"/>
               </w:rPr>
-              <w:t>6. Hệ thống phát hiện mật khẩu mới không hợp lệ.</w:t>
-            </w:r>
-            <w:r>
-              <w:br/>
-            </w:r>
-            <w:r>
-              <w:rPr>
-                <w:sz w:val="20"/>
-              </w:rPr>
-              <w:t>6.1 Hệ thống hiển thị thông báo lỗi yêu cầu mật khẩu đạt tiêu chuẩn.</w:t>
-            </w:r>
-            <w:r>
-              <w:br/>
-            </w:r>
-            <w:r>
-              <w:rPr>
-                <w:sz w:val="20"/>
-              </w:rPr>
-              <w:t>6.2 Người dùng nhập lại mật khẩu mới (quay về Bước 4).</w:t>
-            </w:r>
-            <w:r>
-              <w:br/>
-            </w:r>
-            <w:r>
-              <w:rPr>
-                <w:sz w:val="20"/>
-              </w:rPr>
-              <w:t>7. Hệ thống phát hiện mật khẩu mới trùng mật khẩu hiện tại.</w:t>
-            </w:r>
-            <w:r>
-              <w:br/>
-            </w:r>
-            <w:r>
-              <w:rPr>
-                <w:sz w:val="20"/>
-              </w:rPr>
-              <w:t>7.1 Hệ thống hiển thị thông báo "Mật khẩu mới phải khác mật khẩu hiện tại".</w:t>
-            </w:r>
-            <w:r>
-              <w:br/>
-            </w:r>
-            <w:r>
-              <w:rPr>
-                <w:sz w:val="20"/>
-              </w:rPr>
-              <w:t>7.2 Người dùng nhập lại mật khẩu mới (quay về Bước 4).</w:t>
+              <w:t>4.1 Người dùng nhập lại mật khẩu mới (quay về Bước 4).</w:t>
             </w:r>
           </w:p>
         </w:tc>
@@ -4682,7 +4439,7 @@
               <w:rPr>
                 <w:sz w:val="20"/>
               </w:rPr>
-              <w:t>Khách hàng đã đăng nhập. Tài khoản tồn tại trong CSDL.</w:t>
+              <w:t>Khách hàng đã đăng nhập.</w:t>
             </w:r>
           </w:p>
         </w:tc>
@@ -4715,7 +4472,7 @@
               <w:rPr>
                 <w:sz w:val="20"/>
               </w:rPr>
-              <w:t>Thông tin cập nhật trong CSDL, hiển thị ngay trên giao diện.</w:t>
+              <w:t>Thông tin cá nhân được cập nhật.</w:t>
             </w:r>
           </w:p>
         </w:tc>
@@ -4757,7 +4514,7 @@
               <w:rPr>
                 <w:sz w:val="20"/>
               </w:rPr>
-              <w:t>2. Hệ thống truy xuất thông tin từ CSDL và hiển thị trang hồ sơ cá nhân:</w:t>
+              <w:t>2. Hệ thống hiển thị trang hồ sơ cá nhân:</w:t>
             </w:r>
             <w:r>
               <w:br/>
@@ -4766,7 +4523,7 @@
               <w:rPr>
                 <w:sz w:val="20"/>
               </w:rPr>
-              <w:t>3. Khách hàng nhấn chọn chỉnh sửa thông tin.</w:t>
+              <w:t>3. Khách hàng nhấn nút Chỉnh sửa.</w:t>
             </w:r>
             <w:r>
               <w:br/>
@@ -4802,25 +4559,7 @@
               <w:rPr>
                 <w:sz w:val="20"/>
               </w:rPr>
-              <w:t>7. Hệ thống kiểm tra email hợp lệ và chưa được dùng bởi tài khoản khác.</w:t>
-            </w:r>
-            <w:r>
-              <w:br/>
-            </w:r>
-            <w:r>
-              <w:rPr>
-                <w:sz w:val="20"/>
-              </w:rPr>
-              <w:t>8. Hệ thống cập nhật thông tin vào CSDL.</w:t>
-            </w:r>
-            <w:r>
-              <w:br/>
-            </w:r>
-            <w:r>
-              <w:rPr>
-                <w:sz w:val="20"/>
-              </w:rPr>
-              <w:t>9. Hệ thống hiển thị thông báo "Cập nhật thành công!" và quay về chế độ xem.</w:t>
+              <w:t>7. Hệ thống hiển thị thông báo "Cập nhật thành công!" và quay về chế độ xem.</w:t>
             </w:r>
           </w:p>
           <w:tbl>
@@ -5126,7 +4865,7 @@
               <w:rPr>
                 <w:sz w:val="20"/>
               </w:rPr>
-              <w:t>7. Hệ thống phát hiện email không hợp lệ hoặc đã được dùng.</w:t>
+              <w:t>6. Hệ thống thông báo "Email không hợp lệ hoặc đã được sử dụng".</w:t>
             </w:r>
             <w:r>
               <w:br/>
@@ -5135,16 +4874,7 @@
               <w:rPr>
                 <w:sz w:val="20"/>
               </w:rPr>
-              <w:t>7.1 Hệ thống hiển thị thông báo "Email không hợp lệ hoặc đã được sử dụng".</w:t>
-            </w:r>
-            <w:r>
-              <w:br/>
-            </w:r>
-            <w:r>
-              <w:rPr>
-                <w:sz w:val="20"/>
-              </w:rPr>
-              <w:t>7.2 Khách hàng nhập lại email khác (quay về Bước 6).</w:t>
+              <w:t>6.1 Khách hàng nhập lại email khác (quay về Bước 6).</w:t>
             </w:r>
           </w:p>
         </w:tc>
@@ -5266,7 +4996,7 @@
               <w:rPr>
                 <w:sz w:val="20"/>
               </w:rPr>
-              <w:t>Admin đã đăng nhập. Có quyền quản lý tài khoản nhân viên toàn hệ thống.</w:t>
+              <w:t>Admin đã đăng nhập với quyền quản lý nhân viên.</w:t>
             </w:r>
           </w:p>
         </w:tc>
@@ -5299,7 +5029,7 @@
               <w:rPr>
                 <w:sz w:val="20"/>
               </w:rPr>
-              <w:t>Tài khoản nhân viên được tạo/sửa/xóa trong CSDL.</w:t>
+              <w:t>Tài khoản nhân viên được tạo/sửa/xóa.</w:t>
             </w:r>
           </w:p>
         </w:tc>
@@ -5332,7 +5062,7 @@
               <w:rPr>
                 <w:sz w:val="20"/>
               </w:rPr>
-              <w:t>1. Admin truy cập chức năng "Quản lý nhân viên".</w:t>
+              <w:t>1. Admin chọn chức năng "Quản lý nhân viên".</w:t>
             </w:r>
             <w:r>
               <w:br/>
@@ -5341,7 +5071,7 @@
               <w:rPr>
                 <w:sz w:val="20"/>
               </w:rPr>
-              <w:t>2. Hệ thống truy xuất danh sách nhân viên từ CSDL và hiển thị:</w:t>
+              <w:t>2. Hệ thống hiển thị danh sách nhân viên:</w:t>
             </w:r>
             <w:r>
               <w:br/>
@@ -5359,7 +5089,7 @@
               <w:rPr>
                 <w:sz w:val="20"/>
               </w:rPr>
-              <w:t>4. Hệ thống hiển thị giao diện yêu cầu nhập thông tin nhân viên mới.</w:t>
+              <w:t>4. Hệ thống hiển thị giao diện nhập Họ tên, SĐT, Vai trò, Chi nhánh.</w:t>
             </w:r>
             <w:r>
               <w:br/>
@@ -5368,7 +5098,7 @@
               <w:rPr>
                 <w:sz w:val="20"/>
               </w:rPr>
-              <w:t>5. Admin nhập Họ tên, SĐT, Vai trò, Chi nhánh.</w:t>
+              <w:t>5. Admin nhập thông tin và nhấn nút Lưu.</w:t>
             </w:r>
             <w:r>
               <w:br/>
@@ -5377,7 +5107,7 @@
               <w:rPr>
                 <w:sz w:val="20"/>
               </w:rPr>
-              <w:t>6. Admin nhấn nút Lưu.</w:t>
+              <w:t>6. Hệ thống hiển thị thông báo "Thêm nhân viên thành công!" và cập nhật danh sách.</w:t>
             </w:r>
             <w:r>
               <w:br/>
@@ -5386,7 +5116,7 @@
               <w:rPr>
                 <w:sz w:val="20"/>
               </w:rPr>
-              <w:t>7. Hệ thống kiểm tra SĐT chưa tồn tại trong CSDL.</w:t>
+              <w:t>7. Admin nhấn nút Sửa trên dòng nhân viên Nguyễn Minh Tuấn.</w:t>
             </w:r>
             <w:r>
               <w:br/>
@@ -5395,7 +5125,7 @@
               <w:rPr>
                 <w:sz w:val="20"/>
               </w:rPr>
-              <w:t>8. Hệ thống tạo tài khoản nhân viên mới.</w:t>
+              <w:t>8. Hệ thống hiển thị giao diện chỉnh sửa với thông tin hiện tại.</w:t>
             </w:r>
             <w:r>
               <w:br/>
@@ -5404,7 +5134,7 @@
               <w:rPr>
                 <w:sz w:val="20"/>
               </w:rPr>
-              <w:t>9. Hệ thống hiển thị thông báo "Thêm nhân viên thành công!" và cập nhật danh sách.</w:t>
+              <w:t>9. Admin cập nhật thông tin và nhấn nút Lưu.</w:t>
             </w:r>
             <w:r>
               <w:br/>
@@ -5413,7 +5143,7 @@
               <w:rPr>
                 <w:sz w:val="20"/>
               </w:rPr>
-              <w:t>10. Admin nhấn nút Sửa trên một dòng nhân viên.</w:t>
+              <w:t>10. Hệ thống hiển thị thông báo "Cập nhật thành công!".</w:t>
             </w:r>
             <w:r>
               <w:br/>
@@ -5422,7 +5152,7 @@
               <w:rPr>
                 <w:sz w:val="20"/>
               </w:rPr>
-              <w:t>11. Hệ thống hiển thị giao diện chỉnh sửa với thông tin hiện tại.</w:t>
+              <w:t>11. Admin nhấn nút Xóa trên dòng nhân viên Lê Văn Khánh.</w:t>
             </w:r>
             <w:r>
               <w:br/>
@@ -5431,7 +5161,7 @@
               <w:rPr>
                 <w:sz w:val="20"/>
               </w:rPr>
-              <w:t>12. Admin cập nhật thông tin và nhấn nút Lưu.</w:t>
+              <w:t>12. Hệ thống yêu cầu xác nhận xóa.</w:t>
             </w:r>
             <w:r>
               <w:br/>
@@ -5440,7 +5170,7 @@
               <w:rPr>
                 <w:sz w:val="20"/>
               </w:rPr>
-              <w:t>13. Hệ thống cập nhật thông tin vào CSDL.</w:t>
+              <w:t>13. Admin xác nhận xóa.</w:t>
             </w:r>
             <w:r>
               <w:br/>
@@ -5449,61 +5179,7 @@
               <w:rPr>
                 <w:sz w:val="20"/>
               </w:rPr>
-              <w:t>14. Hệ thống hiển thị thông báo "Cập nhật thành công!".</w:t>
-            </w:r>
-            <w:r>
-              <w:br/>
-            </w:r>
-            <w:r>
-              <w:rPr>
-                <w:sz w:val="20"/>
-              </w:rPr>
-              <w:t>15. Admin nhấn nút Xóa trên một dòng nhân viên.</w:t>
-            </w:r>
-            <w:r>
-              <w:br/>
-            </w:r>
-            <w:r>
-              <w:rPr>
-                <w:sz w:val="20"/>
-              </w:rPr>
-              <w:t>16. Hệ thống yêu cầu xác nhận xóa.</w:t>
-            </w:r>
-            <w:r>
-              <w:br/>
-            </w:r>
-            <w:r>
-              <w:rPr>
-                <w:sz w:val="20"/>
-              </w:rPr>
-              <w:t>17. Admin xác nhận xóa.</w:t>
-            </w:r>
-            <w:r>
-              <w:br/>
-            </w:r>
-            <w:r>
-              <w:rPr>
-                <w:sz w:val="20"/>
-              </w:rPr>
-              <w:t>18. Hệ thống kiểm tra nhân viên không đang xử lý order.</w:t>
-            </w:r>
-            <w:r>
-              <w:br/>
-            </w:r>
-            <w:r>
-              <w:rPr>
-                <w:sz w:val="20"/>
-              </w:rPr>
-              <w:t>19. Hệ thống chuyển trạng thái nhân viên thành "Đã nghỉ".</w:t>
-            </w:r>
-            <w:r>
-              <w:br/>
-            </w:r>
-            <w:r>
-              <w:rPr>
-                <w:sz w:val="20"/>
-              </w:rPr>
-              <w:t>20. Hệ thống hiển thị thông báo "Xóa nhân viên thành công!".</w:t>
+              <w:t>14. Hệ thống hiển thị thông báo "Xóa nhân viên thành công!".</w:t>
             </w:r>
           </w:p>
           <w:tbl>
@@ -5887,7 +5563,7 @@
               <w:rPr>
                 <w:sz w:val="20"/>
               </w:rPr>
-              <w:t>7. Hệ thống phát hiện SĐT đã tồn tại.</w:t>
+              <w:t>5. Hệ thống thông báo "SĐT đã được sử dụng".</w:t>
             </w:r>
             <w:r>
               <w:br/>
@@ -5896,7 +5572,7 @@
               <w:rPr>
                 <w:sz w:val="20"/>
               </w:rPr>
-              <w:t>7.1 Hệ thống hiển thị thông báo "SĐT đã được sử dụng".</w:t>
+              <w:t>5.1 Admin nhập lại SĐT khác (quay về Bước 5).</w:t>
             </w:r>
             <w:r>
               <w:br/>
@@ -5905,7 +5581,7 @@
               <w:rPr>
                 <w:sz w:val="20"/>
               </w:rPr>
-              <w:t>7.2 Admin nhập lại SĐT khác (quay về Bước 6).</w:t>
+              <w:t>13. Hệ thống thông báo "Không thể xóa nhân viên đang xử lý order".</w:t>
             </w:r>
             <w:r>
               <w:br/>
@@ -5914,25 +5590,7 @@
               <w:rPr>
                 <w:sz w:val="20"/>
               </w:rPr>
-              <w:t>18. Hệ thống phát hiện nhân viên đang xử lý order.</w:t>
-            </w:r>
-            <w:r>
-              <w:br/>
-            </w:r>
-            <w:r>
-              <w:rPr>
-                <w:sz w:val="20"/>
-              </w:rPr>
-              <w:t>18.1 Hệ thống hiển thị thông báo "Không thể xóa nhân viên đang xử lý order".</w:t>
-            </w:r>
-            <w:r>
-              <w:br/>
-            </w:r>
-            <w:r>
-              <w:rPr>
-                <w:sz w:val="20"/>
-              </w:rPr>
-              <w:t>18.2 Admin hủy thao tác xóa.</w:t>
+              <w:t>13.1 Admin hủy thao tác xóa.</w:t>
             </w:r>
           </w:p>
         </w:tc>

</xml_diff>

<commit_message>
feat: strict step alignment + blue diagrams + native bullets
Scenarios & Sequence diagrams - EXACT step count match:
- UC01: 5 steps = 5 messages
- UC02: 8 steps = 8 messages
- UC03: 5 steps = 5 messages
- UC04: 7 steps = 7 messages
- UC20: 14 steps = 14 messages

Kịch bản v2 narratives match diagram step counts exactly.

Entity diagram:
- Employee isolated (Branch belongs to another module)
- All classes blue fills (#7AD2FF), black lines

Class diagram:
- All classes blue (#7AD2FF), packages light blue (#DDEEFF)
- Black borders and text

Sequence diagrams:
- All lifelines/participants blue (#7AD2FF)
- Black arrows and text

DOCX generator:
- Native bullet numbering (numId=1) via OxmlElement
- Native numbered list numbering (numId=2)
- 261 native numbered/bullet paragraphs
- Import OxmlElement from docx.oxml
</commit_message>
<xml_diff>
--- a/output/account_module.docx
+++ b/output/account_module.docx
@@ -3032,13 +3032,16 @@
     </w:p>
     <w:p>
       <w:pPr>
-        <w:ind w:left="360" w:hanging="240"/>
+        <w:numPr>
+          <w:ilvl w:val="0"/>
+          <w:numId w:val="2"/>
+        </w:numPr>
       </w:pPr>
       <w:r>
         <w:rPr>
           <w:b/>
         </w:rPr>
-        <w:t>1.  UC01 – Đăng nhập:</w:t>
+        <w:t>UC01 – Đăng nhập:</w:t>
       </w:r>
       <w:r>
         <w:t xml:space="preserve"> UC này cho phép Khách hàng, Nhân viên hoặc Chủ doanh nghiệp xác thực danh tính vào hệ thống. Người dùng nhập SĐT/Email và mật khẩu, hệ thống kiểm tra và chuyển hướng đến trang chủ tương ứng với vai trò.</w:t>
@@ -3046,13 +3049,16 @@
     </w:p>
     <w:p>
       <w:pPr>
-        <w:ind w:left="360" w:hanging="240"/>
+        <w:numPr>
+          <w:ilvl w:val="0"/>
+          <w:numId w:val="2"/>
+        </w:numPr>
       </w:pPr>
       <w:r>
         <w:rPr>
           <w:b/>
         </w:rPr>
-        <w:t>2.  UC02 – Đăng ký:</w:t>
+        <w:t>UC02 – Đăng ký:</w:t>
       </w:r>
       <w:r>
         <w:t xml:space="preserve"> UC này cho phép Khách hàng tạo tài khoản hội viên mới bằng cách cung cấp họ tên, SĐT, email và mật khẩu. Hệ thống gửi OTP 6 chữ số đến SĐT để xác minh trước khi hoàn tất đăng ký. Sau khi đăng ký thành công, hệ thống tự động đăng nhập.</w:t>
@@ -3060,13 +3066,16 @@
     </w:p>
     <w:p>
       <w:pPr>
-        <w:ind w:left="360" w:hanging="240"/>
+        <w:numPr>
+          <w:ilvl w:val="0"/>
+          <w:numId w:val="2"/>
+        </w:numPr>
       </w:pPr>
       <w:r>
         <w:rPr>
           <w:b/>
         </w:rPr>
-        <w:t>3.  UC03 – Đổi mật khẩu:</w:t>
+        <w:t>UC03 – Đổi mật khẩu:</w:t>
       </w:r>
       <w:r>
         <w:t xml:space="preserve"> UC này cho phép người dùng đã đăng nhập (Khách hàng, Nhân viên) thay đổi mật khẩu bằng cách xác minh mật khẩu hiện tại, nhập mật khẩu mới (độ dài ≥ 8, có chữ hoa/thường/số/đặc biệt). Sau khi đổi, tất cả session khác bị thu hồi.</w:t>
@@ -3074,13 +3083,16 @@
     </w:p>
     <w:p>
       <w:pPr>
-        <w:ind w:left="360" w:hanging="240"/>
+        <w:numPr>
+          <w:ilvl w:val="0"/>
+          <w:numId w:val="2"/>
+        </w:numPr>
       </w:pPr>
       <w:r>
         <w:rPr>
           <w:b/>
         </w:rPr>
-        <w:t>4.  UC04 – Quản lý thông tin cá nhân:</w:t>
+        <w:t>UC04 – Quản lý thông tin cá nhân:</w:t>
       </w:r>
       <w:r>
         <w:t xml:space="preserve"> UC này cho phép Khách hàng xem hồ sơ cá nhân (họ tên, SĐT, email, hạng hội viên, điểm tích lũy) và cập nhật thông tin (họ tên, email). SĐT bị khóa, muốn đổi phải xác minh OTP.</w:t>
@@ -3088,13 +3100,16 @@
     </w:p>
     <w:p>
       <w:pPr>
-        <w:ind w:left="360" w:hanging="240"/>
+        <w:numPr>
+          <w:ilvl w:val="0"/>
+          <w:numId w:val="2"/>
+        </w:numPr>
       </w:pPr>
       <w:r>
         <w:rPr>
           <w:b/>
         </w:rPr>
-        <w:t>5.  UC20 – Quản lý tài khoản nhân viên:</w:t>
+        <w:t>UC20 – Quản lý tài khoản nhân viên:</w:t>
       </w:r>
       <w:r>
         <w:t xml:space="preserve"> UC này cho phép Chủ doanh nghiệp quản lý tài khoản nhân viên toàn hệ thống: xem danh sách, thêm mới, chỉnh sửa và xóa (chuyển trạng thái "Đã nghỉ"). Không thể xóa nhân viên đang xử lý order.</w:t>
@@ -3695,7 +3710,7 @@
               <w:rPr>
                 <w:sz w:val="20"/>
               </w:rPr>
-              <w:t>5. Hệ thống thông báo "Tài khoản không tồn tại".</w:t>
+              <w:t>4. Hệ thống thông báo "Tài khoản không tồn tại".</w:t>
             </w:r>
             <w:r>
               <w:br/>
@@ -3704,7 +3719,7 @@
               <w:rPr>
                 <w:sz w:val="20"/>
               </w:rPr>
-              <w:t>5.1 Người dùng chọn liên kết "Đăng ký" (chuyển sang UC02).</w:t>
+              <w:t>4.1 Người dùng chọn liên kết "Đăng ký" (chuyển sang UC02).</w:t>
             </w:r>
             <w:r>
               <w:br/>
@@ -3713,7 +3728,7 @@
               <w:rPr>
                 <w:sz w:val="20"/>
               </w:rPr>
-              <w:t>5. Hệ thống thông báo "Sai mật khẩu".</w:t>
+              <w:t>4. Hệ thống thông báo "Sai mật khẩu".</w:t>
             </w:r>
             <w:r>
               <w:br/>
@@ -3722,7 +3737,7 @@
               <w:rPr>
                 <w:sz w:val="20"/>
               </w:rPr>
-              <w:t>5.1 Người dùng nhập lại mật khẩu (quay về Bước 4).</w:t>
+              <w:t>4.1 Người dùng nhập lại mật khẩu (quay về Bước 4).</w:t>
             </w:r>
           </w:p>
         </w:tc>
@@ -3946,7 +3961,7 @@
               <w:rPr>
                 <w:sz w:val="20"/>
               </w:rPr>
-              <w:t>5. Hệ thống gửi mã OTP 6 chữ số đến SĐT.</w:t>
+              <w:t>5. Hệ thống kiểm tra thông tin hợp lệ, gửi mã OTP 6 chữ số đến SĐT.</w:t>
             </w:r>
             <w:r>
               <w:br/>
@@ -4006,7 +4021,7 @@
               <w:rPr>
                 <w:sz w:val="20"/>
               </w:rPr>
-              <w:t>4. Hệ thống thông báo "SĐT hoặc Email đã được sử dụng".</w:t>
+              <w:t>5. Hệ thống thông báo "SĐT hoặc Email đã được sử dụng".</w:t>
             </w:r>
             <w:r>
               <w:br/>
@@ -4015,7 +4030,7 @@
               <w:rPr>
                 <w:sz w:val="20"/>
               </w:rPr>
-              <w:t>4.1 Người dùng nhập lại thông tin khác (quay về Bước 4).</w:t>
+              <w:t>5.1 Người dùng nhập lại thông tin khác (quay về Bước 4).</w:t>
             </w:r>
             <w:r>
               <w:br/>
@@ -5107,7 +5122,7 @@
               <w:rPr>
                 <w:sz w:val="20"/>
               </w:rPr>
-              <w:t>6. Hệ thống hiển thị thông báo "Thêm nhân viên thành công!" và cập nhật danh sách.</w:t>
+              <w:t>6. Hệ thống kiểm tra thông tin hợp lệ, tạo tài khoản nhân viên mới.</w:t>
             </w:r>
             <w:r>
               <w:br/>
@@ -5116,7 +5131,7 @@
               <w:rPr>
                 <w:sz w:val="20"/>
               </w:rPr>
-              <w:t>7. Admin nhấn nút Sửa trên dòng nhân viên Nguyễn Minh Tuấn.</w:t>
+              <w:t>7. Hệ thống hiển thị thông báo "Thêm nhân viên thành công!" và cập nhật danh sách.</w:t>
             </w:r>
             <w:r>
               <w:br/>
@@ -5125,7 +5140,7 @@
               <w:rPr>
                 <w:sz w:val="20"/>
               </w:rPr>
-              <w:t>8. Hệ thống hiển thị giao diện chỉnh sửa với thông tin hiện tại.</w:t>
+              <w:t>8. Admin nhấn nút Sửa trên dòng nhân viên Nguyễn Minh Tuấn.</w:t>
             </w:r>
             <w:r>
               <w:br/>
@@ -5134,7 +5149,7 @@
               <w:rPr>
                 <w:sz w:val="20"/>
               </w:rPr>
-              <w:t>9. Admin cập nhật thông tin và nhấn nút Lưu.</w:t>
+              <w:t>9. Hệ thống hiển thị giao diện chỉnh sửa với thông tin hiện tại.</w:t>
             </w:r>
             <w:r>
               <w:br/>
@@ -5143,7 +5158,7 @@
               <w:rPr>
                 <w:sz w:val="20"/>
               </w:rPr>
-              <w:t>10. Hệ thống hiển thị thông báo "Cập nhật thành công!".</w:t>
+              <w:t>10. Admin cập nhật thông tin và nhấn nút Lưu.</w:t>
             </w:r>
             <w:r>
               <w:br/>
@@ -5152,7 +5167,7 @@
               <w:rPr>
                 <w:sz w:val="20"/>
               </w:rPr>
-              <w:t>11. Admin nhấn nút Xóa trên dòng nhân viên Lê Văn Khánh.</w:t>
+              <w:t>11. Hệ thống hiển thị thông báo "Cập nhật thành công!".</w:t>
             </w:r>
             <w:r>
               <w:br/>
@@ -5161,7 +5176,7 @@
               <w:rPr>
                 <w:sz w:val="20"/>
               </w:rPr>
-              <w:t>12. Hệ thống yêu cầu xác nhận xóa.</w:t>
+              <w:t>12. Admin nhấn nút Xóa trên dòng nhân viên Lê Văn Khánh.</w:t>
             </w:r>
             <w:r>
               <w:br/>
@@ -5170,7 +5185,7 @@
               <w:rPr>
                 <w:sz w:val="20"/>
               </w:rPr>
-              <w:t>13. Admin xác nhận xóa.</w:t>
+              <w:t>13. Hệ thống yêu cầu xác nhận xóa.</w:t>
             </w:r>
             <w:r>
               <w:br/>
@@ -5179,7 +5194,7 @@
               <w:rPr>
                 <w:sz w:val="20"/>
               </w:rPr>
-              <w:t>14. Hệ thống hiển thị thông báo "Xóa nhân viên thành công!".</w:t>
+              <w:t>14. Admin xác nhận xóa, hệ thống hiển thị thông báo "Xóa nhân viên thành công!".</w:t>
             </w:r>
           </w:p>
           <w:tbl>
@@ -5563,7 +5578,7 @@
               <w:rPr>
                 <w:sz w:val="20"/>
               </w:rPr>
-              <w:t>5. Hệ thống thông báo "SĐT đã được sử dụng".</w:t>
+              <w:t>6. Hệ thống thông báo "SĐT đã được sử dụng".</w:t>
             </w:r>
             <w:r>
               <w:br/>
@@ -5572,7 +5587,7 @@
               <w:rPr>
                 <w:sz w:val="20"/>
               </w:rPr>
-              <w:t>5.1 Admin nhập lại SĐT khác (quay về Bước 5).</w:t>
+              <w:t>6.1 Admin nhập lại SĐT khác (quay về Bước 5).</w:t>
             </w:r>
             <w:r>
               <w:br/>
@@ -5581,7 +5596,7 @@
               <w:rPr>
                 <w:sz w:val="20"/>
               </w:rPr>
-              <w:t>13. Hệ thống thông báo "Không thể xóa nhân viên đang xử lý order".</w:t>
+              <w:t>14. Hệ thống thông báo "Không thể xóa nhân viên đang xử lý order".</w:t>
             </w:r>
             <w:r>
               <w:br/>
@@ -5590,7 +5605,7 @@
               <w:rPr>
                 <w:sz w:val="20"/>
               </w:rPr>
-              <w:t>13.1 Admin hủy thao tác xóa.</w:t>
+              <w:t>14.1 Admin hủy thao tác xóa.</w:t>
             </w:r>
           </w:p>
         </w:tc>
@@ -5628,138 +5643,189 @@
     </w:p>
     <w:p>
       <w:pPr>
-        <w:ind w:left="360" w:hanging="240"/>
+        <w:numPr>
+          <w:ilvl w:val="0"/>
+          <w:numId w:val="1"/>
+        </w:numPr>
       </w:pPr>
       <w:r>
-        <w:t>•  Hệ thống → loại: quá chung, không phải thực thể nghiệp vụ</w:t>
+        <w:t>Hệ thống → loại: quá chung, không phải thực thể nghiệp vụ</w:t>
       </w:r>
     </w:p>
     <w:p>
       <w:pPr>
-        <w:ind w:left="360" w:hanging="240"/>
+        <w:numPr>
+          <w:ilvl w:val="0"/>
+          <w:numId w:val="1"/>
+        </w:numPr>
       </w:pPr>
       <w:r>
-        <w:t>•  Khách hàng → lớp User: hoTen, soDienThoai, email, matKhau, ngayTao</w:t>
+        <w:t>Khách hàng → lớp User: fullName, phoneNumber, email, password, loyaltyPoints, createdAt</w:t>
       </w:r>
     </w:p>
     <w:p>
       <w:pPr>
-        <w:ind w:left="360" w:hanging="240"/>
+        <w:numPr>
+          <w:ilvl w:val="0"/>
+          <w:numId w:val="1"/>
+        </w:numPr>
       </w:pPr>
       <w:r>
-        <w:t>•  Tài khoản → thuộc về User (gộp vào User, tránh tách thừa)</w:t>
+        <w:t>Tài khoản → thuộc về User (gộp vào User, tránh tách thừa)</w:t>
       </w:r>
     </w:p>
     <w:p>
       <w:pPr>
-        <w:ind w:left="360" w:hanging="240"/>
+        <w:numPr>
+          <w:ilvl w:val="0"/>
+          <w:numId w:val="1"/>
+        </w:numPr>
       </w:pPr>
       <w:r>
-        <w:t>•  Họ tên → thuộc tính của User</w:t>
+        <w:t>Họ tên → thuộc tính fullName của User</w:t>
       </w:r>
     </w:p>
     <w:p>
       <w:pPr>
-        <w:ind w:left="360" w:hanging="240"/>
+        <w:numPr>
+          <w:ilvl w:val="0"/>
+          <w:numId w:val="1"/>
+        </w:numPr>
       </w:pPr>
       <w:r>
-        <w:t>•  Số điện thoại → thuộc tính của User (dùng làm username đăng nhập)</w:t>
+        <w:t>Số điện thoại → thuộc tính phoneNumber của User (dùng làm username đăng nhập)</w:t>
       </w:r>
     </w:p>
     <w:p>
       <w:pPr>
-        <w:ind w:left="360" w:hanging="240"/>
+        <w:numPr>
+          <w:ilvl w:val="0"/>
+          <w:numId w:val="1"/>
+        </w:numPr>
       </w:pPr>
       <w:r>
-        <w:t>•  Email → thuộc tính của User</w:t>
+        <w:t>Email → thuộc tính email của User</w:t>
       </w:r>
     </w:p>
     <w:p>
       <w:pPr>
-        <w:ind w:left="360" w:hanging="240"/>
+        <w:numPr>
+          <w:ilvl w:val="0"/>
+          <w:numId w:val="1"/>
+        </w:numPr>
       </w:pPr>
       <w:r>
-        <w:t>•  Mật khẩu → thuộc tính của User (lưu dạng mã hóa)</w:t>
+        <w:t>Mật khẩu → thuộc tính password của User (lưu dạng mã hóa)</w:t>
       </w:r>
     </w:p>
     <w:p>
       <w:pPr>
-        <w:ind w:left="360" w:hanging="240"/>
+        <w:numPr>
+          <w:ilvl w:val="0"/>
+          <w:numId w:val="1"/>
+        </w:numPr>
       </w:pPr>
       <w:r>
-        <w:t>•  Ngày tham gia → thuộc tính ngayTao của User</w:t>
+        <w:t>Ngày tham gia → thuộc tính createdAt của User</w:t>
       </w:r>
     </w:p>
     <w:p>
       <w:pPr>
-        <w:ind w:left="360" w:hanging="240"/>
+        <w:numPr>
+          <w:ilvl w:val="0"/>
+          <w:numId w:val="1"/>
+        </w:numPr>
       </w:pPr>
       <w:r>
-        <w:t>•  Hạng hội viên → lớp MembershipTier: tenHang, diemToiThieu, moTa, heSoUuDai</w:t>
+        <w:t>Hạng hội viên → lớp MembershipTier: tierName, minPoints, description, discountRate</w:t>
       </w:r>
     </w:p>
     <w:p>
       <w:pPr>
-        <w:ind w:left="360" w:hanging="240"/>
+        <w:numPr>
+          <w:ilvl w:val="0"/>
+          <w:numId w:val="1"/>
+        </w:numPr>
       </w:pPr>
       <w:r>
-        <w:t>•  Điểm tích lũy → thuộc tính diemTichLuy của User</w:t>
+        <w:t>Điểm tích lũy → thuộc tính loyaltyPoints của User</w:t>
       </w:r>
     </w:p>
     <w:p>
       <w:pPr>
-        <w:ind w:left="360" w:hanging="240"/>
+        <w:numPr>
+          <w:ilvl w:val="0"/>
+          <w:numId w:val="1"/>
+        </w:numPr>
       </w:pPr>
       <w:r>
-        <w:t>•  Mã OTP → lớp OTP: maOTP, loai, thoiHanHetHan, daXacMinh</w:t>
+        <w:t>Mã OTP → lớp OTP: otpCode, type, expiresAt, verified</w:t>
       </w:r>
     </w:p>
     <w:p>
       <w:pPr>
-        <w:ind w:left="360" w:hanging="240"/>
+        <w:numPr>
+          <w:ilvl w:val="0"/>
+          <w:numId w:val="1"/>
+        </w:numPr>
       </w:pPr>
       <w:r>
-        <w:t>•  Phiên đăng nhập → lớp LoginSession: tokenPhien, thoiGianDangNhap, thoiGianHetHan, thietBi</w:t>
+        <w:t>Phiên đăng nhập → lớp LoginSession: sessionToken, loginTime, expiresAt, device</w:t>
       </w:r>
     </w:p>
     <w:p>
       <w:pPr>
-        <w:ind w:left="360" w:hanging="240"/>
+        <w:numPr>
+          <w:ilvl w:val="0"/>
+          <w:numId w:val="1"/>
+        </w:numPr>
       </w:pPr>
       <w:r>
-        <w:t>•  Lịch sử → loại: quá chung → cụ thể là LoginSession đã đủ</w:t>
+        <w:t>Lịch sử → loại: quá chung → cụ thể là LoginSession đã đủ</w:t>
       </w:r>
     </w:p>
     <w:p>
       <w:pPr>
-        <w:ind w:left="360" w:hanging="240"/>
+        <w:numPr>
+          <w:ilvl w:val="0"/>
+          <w:numId w:val="1"/>
+        </w:numPr>
       </w:pPr>
       <w:r>
-        <w:t>•  Danh sách → loại: không phải thực thể</w:t>
+        <w:t>Danh sách → loại: không phải thực thể</w:t>
       </w:r>
     </w:p>
     <w:p>
       <w:pPr>
-        <w:ind w:left="360" w:hanging="240"/>
+        <w:numPr>
+          <w:ilvl w:val="0"/>
+          <w:numId w:val="1"/>
+        </w:numPr>
       </w:pPr>
       <w:r>
-        <w:t>•  Giao diện → loại: là Boundary, không phải Entity</w:t>
+        <w:t>Giao diện → loại: là Boundary, không phải Entity</w:t>
       </w:r>
     </w:p>
     <w:p>
       <w:pPr>
-        <w:ind w:left="360" w:hanging="240"/>
+        <w:numPr>
+          <w:ilvl w:val="0"/>
+          <w:numId w:val="1"/>
+        </w:numPr>
       </w:pPr>
       <w:r>
-        <w:t>•  Nhân viên → lớp Employee: hoTen, vaiTro, chiNhanh, trangThai</w:t>
+        <w:t>Nhân viên → lớp Employee: fullName, role, branch, status</w:t>
       </w:r>
     </w:p>
     <w:p>
       <w:pPr>
-        <w:ind w:left="360" w:hanging="240"/>
+        <w:numPr>
+          <w:ilvl w:val="0"/>
+          <w:numId w:val="1"/>
+        </w:numPr>
       </w:pPr>
       <w:r>
-        <w:t>•  Chủ doanh nghiệp → loại: actor, không phải thực thể dữ liệu</w:t>
+        <w:t>Chủ doanh nghiệp → loại: actor, không phải thực thể dữ liệu</w:t>
       </w:r>
     </w:p>
     <w:p>
@@ -5772,10 +5838,13 @@
     </w:p>
     <w:p>
       <w:pPr>
-        <w:ind w:left="360" w:hanging="240"/>
+        <w:numPr>
+          <w:ilvl w:val="0"/>
+          <w:numId w:val="1"/>
+        </w:numPr>
       </w:pPr>
       <w:r>
-        <w:t>•  1 User có 1 MembershipTier → User – MembershipTier: n – 1</w:t>
+        <w:t>1 User có 1 MembershipTier → User – MembershipTier: n – 1</w:t>
       </w:r>
     </w:p>
     <w:p>
@@ -5786,10 +5855,13 @@
     </w:p>
     <w:p>
       <w:pPr>
-        <w:ind w:left="360" w:hanging="240"/>
+        <w:numPr>
+          <w:ilvl w:val="0"/>
+          <w:numId w:val="1"/>
+        </w:numPr>
       </w:pPr>
       <w:r>
-        <w:t>•  1 User có nhiều OTP → User – OTP: 1 – n</w:t>
+        <w:t>1 User có nhiều OTP → User – OTP: 1 – n</w:t>
       </w:r>
     </w:p>
     <w:p>
@@ -5800,16 +5872,36 @@
     </w:p>
     <w:p>
       <w:pPr>
-        <w:ind w:left="360" w:hanging="240"/>
+        <w:numPr>
+          <w:ilvl w:val="0"/>
+          <w:numId w:val="1"/>
+        </w:numPr>
       </w:pPr>
       <w:r>
-        <w:t>•  1 User có nhiều LoginSession → User – LoginSession: 1 – n</w:t>
+        <w:t>1 User có nhiều LoginSession → User – LoginSession: 1 – n</w:t>
       </w:r>
     </w:p>
     <w:p>
       <w:pPr/>
       <w:r>
         <w:t>(người dùng có thể đăng nhập trên nhiều thiết bị)</w:t>
+      </w:r>
+    </w:p>
+    <w:p>
+      <w:pPr>
+        <w:numPr>
+          <w:ilvl w:val="0"/>
+          <w:numId w:val="1"/>
+        </w:numPr>
+      </w:pPr>
+      <w:r>
+        <w:t>Employee là lớp độc lập, không có quan hệ với User</w:t>
+      </w:r>
+    </w:p>
+    <w:p>
+      <w:pPr/>
+      <w:r>
+        <w:t>(branch là thuộc tính text, không cần tách riêng vì Chi nhánh thuộc module khác)</w:t>
       </w:r>
     </w:p>
     <w:p>
@@ -5842,7 +5934,7 @@
       <w:r>
         <w:drawing>
           <wp:inline xmlns:a="http://schemas.openxmlformats.org/drawingml/2006/main" xmlns:pic="http://schemas.openxmlformats.org/drawingml/2006/picture">
-            <wp:extent cx="5486400" cy="4783947"/>
+            <wp:extent cx="5486400" cy="4578056"/>
             <wp:docPr id="7" name="Picture 7"/>
             <wp:cNvGraphicFramePr>
               <a:graphicFrameLocks noChangeAspect="1"/>
@@ -5863,7 +5955,7 @@
                   <pic:spPr>
                     <a:xfrm>
                       <a:off x="0" y="0"/>
-                      <a:ext cx="5486400" cy="4783947"/>
+                      <a:ext cx="5486400" cy="4578056"/>
                     </a:xfrm>
                     <a:prstGeom prst="rect"/>
                   </pic:spPr>
@@ -6469,7 +6561,7 @@
       <w:r>
         <w:drawing>
           <wp:inline xmlns:a="http://schemas.openxmlformats.org/drawingml/2006/main" xmlns:pic="http://schemas.openxmlformats.org/drawingml/2006/picture">
-            <wp:extent cx="5486400" cy="8183880"/>
+            <wp:extent cx="5486400" cy="8206019"/>
             <wp:docPr id="8" name="Picture 8"/>
             <wp:cNvGraphicFramePr>
               <a:graphicFrameLocks noChangeAspect="1"/>
@@ -6490,7 +6582,7 @@
                   <pic:spPr>
                     <a:xfrm>
                       <a:off x="0" y="0"/>
-                      <a:ext cx="5486400" cy="8183880"/>
+                      <a:ext cx="5486400" cy="8206019"/>
                     </a:xfrm>
                     <a:prstGeom prst="rect"/>
                   </pic:spPr>
@@ -6514,7 +6606,7 @@
         <w:pStyle w:val="Heading3"/>
       </w:pPr>
       <w:r>
-        <w:t>UC01 – Đăng nhập</w:t>
+        <w:t>UC01 – Đăng nhập (5 bước)</w:t>
       </w:r>
     </w:p>
     <w:p>
@@ -6524,7 +6616,7 @@
       <w:r>
         <w:drawing>
           <wp:inline xmlns:a="http://schemas.openxmlformats.org/drawingml/2006/main" xmlns:pic="http://schemas.openxmlformats.org/drawingml/2006/picture">
-            <wp:extent cx="5486400" cy="3157538"/>
+            <wp:extent cx="5486400" cy="3293645"/>
             <wp:docPr id="9" name="Picture 9"/>
             <wp:cNvGraphicFramePr>
               <a:graphicFrameLocks noChangeAspect="1"/>
@@ -6545,7 +6637,7 @@
                   <pic:spPr>
                     <a:xfrm>
                       <a:off x="0" y="0"/>
-                      <a:ext cx="5486400" cy="3157538"/>
+                      <a:ext cx="5486400" cy="3293645"/>
                     </a:xfrm>
                     <a:prstGeom prst="rect"/>
                   </pic:spPr>
@@ -6559,56 +6651,54 @@
     <w:p>
       <w:pPr/>
       <w:r>
-        <w:t>&lt;!-- File: output/diagrams/account_seq_login_analysis.png --&gt;</w:t>
-      </w:r>
-    </w:p>
-    <w:p>
-      <w:pPr/>
-      <w:r>
         <w:rPr>
           <w:b/>
         </w:rPr>
-        <w:t>Kịch bản phiên bản 2 – UC01 Đăng nhập</w:t>
+        <w:t>Kịch bản phiên bản 2 – UC01 Đăng nhập (5 bước)</w:t>
       </w:r>
     </w:p>
     <w:p>
       <w:pPr>
-        <w:ind w:left="360" w:hanging="240"/>
+        <w:numPr>
+          <w:ilvl w:val="0"/>
+          <w:numId w:val="2"/>
+        </w:numPr>
       </w:pPr>
       <w:r>
-        <w:t>1.  Khách hàng truy cập chức năng Đăng nhập.</w:t>
+        <w:t>Người dùng chọn chức năng Đăng nhập.</w:t>
       </w:r>
     </w:p>
     <w:p>
       <w:pPr>
-        <w:ind w:left="360" w:hanging="240"/>
+        <w:numPr>
+          <w:ilvl w:val="0"/>
+          <w:numId w:val="2"/>
+        </w:numPr>
       </w:pPr>
       <w:r>
-        <w:t>2.  Lớp LoginView hiển thị giao diện yêu cầu nhập thông tin đăng nhập.</w:t>
+        <w:t>Lớp LoginView hiển thị giao diện đăng nhập.</w:t>
       </w:r>
     </w:p>
     <w:p>
       <w:pPr>
-        <w:ind w:left="360" w:hanging="240"/>
+        <w:numPr>
+          <w:ilvl w:val="0"/>
+          <w:numId w:val="2"/>
+        </w:numPr>
       </w:pPr>
       <w:r>
-        <w:t>3.  Khách hàng nhập SĐT và Mật khẩu.</w:t>
+        <w:t>Người dùng nhập SĐT/Email và Mật khẩu, nhấn nút Đăng nhập.</w:t>
       </w:r>
     </w:p>
     <w:p>
       <w:pPr>
-        <w:ind w:left="360" w:hanging="240"/>
+        <w:numPr>
+          <w:ilvl w:val="0"/>
+          <w:numId w:val="2"/>
+        </w:numPr>
       </w:pPr>
       <w:r>
-        <w:t>4.  Khách hàng nhấn nút Đăng nhập.</w:t>
-      </w:r>
-    </w:p>
-    <w:p>
-      <w:pPr>
-        <w:ind w:left="360" w:hanging="240"/>
-      </w:pPr>
-      <w:r>
-        <w:t xml:space="preserve">5.  Lớp LoginView gọi hàm </w:t>
+        <w:t xml:space="preserve">Lớp LoginView gọi hàm </w:t>
       </w:r>
       <w:r>
         <w:rPr>
@@ -6618,59 +6708,18 @@
         <w:t>checkLogin()</w:t>
       </w:r>
       <w:r>
-        <w:t xml:space="preserve"> của đối tượng User.</w:t>
+        <w:t xml:space="preserve"> của đối tượng User để xác thực.</w:t>
       </w:r>
     </w:p>
     <w:p>
       <w:pPr>
-        <w:ind w:left="360" w:hanging="240"/>
+        <w:numPr>
+          <w:ilvl w:val="0"/>
+          <w:numId w:val="2"/>
+        </w:numPr>
       </w:pPr>
       <w:r>
-        <w:t xml:space="preserve">6.  Lớp User gọi hàm </w:t>
-      </w:r>
-      <w:r>
-        <w:rPr>
-          <w:rFonts w:ascii="Courier New" w:hAnsi="Courier New"/>
-          <w:sz w:val="20"/>
-        </w:rPr>
-        <w:t>findBySDT()</w:t>
-      </w:r>
-      <w:r>
-        <w:t xml:space="preserve"> để tìm tài khoản theo SĐT.</w:t>
-      </w:r>
-    </w:p>
-    <w:p>
-      <w:pPr>
-        <w:ind w:left="360" w:hanging="240"/>
-      </w:pPr>
-      <w:r>
-        <w:t xml:space="preserve">7.  Lớp User gọi hàm </w:t>
-      </w:r>
-      <w:r>
-        <w:rPr>
-          <w:rFonts w:ascii="Courier New" w:hAnsi="Courier New"/>
-          <w:sz w:val="20"/>
-        </w:rPr>
-        <w:t>checkPassword()</w:t>
-      </w:r>
-      <w:r>
-        <w:t xml:space="preserve"> để so sánh mật khẩu.</w:t>
-      </w:r>
-    </w:p>
-    <w:p>
-      <w:pPr>
-        <w:ind w:left="360" w:hanging="240"/>
-      </w:pPr>
-      <w:r>
-        <w:t>8.  Lớp User trả kết quả về cho LoginView.</w:t>
-      </w:r>
-    </w:p>
-    <w:p>
-      <w:pPr>
-        <w:ind w:left="360" w:hanging="240"/>
-      </w:pPr>
-      <w:r>
-        <w:t>9.  Lớp LoginView hiển thị "Đăng nhập thành công" và chuyển hướng trang chủ.</w:t>
+        <w:t>Lớp LoginView chuyển hướng trang chủ, hiển thị "Đăng nhập thành công".</w:t>
       </w:r>
     </w:p>
     <w:p>
@@ -6678,7 +6727,7 @@
         <w:pStyle w:val="Heading3"/>
       </w:pPr>
       <w:r>
-        <w:t>UC02 – Đăng ký</w:t>
+        <w:t>UC02 – Đăng ký (8 bước)</w:t>
       </w:r>
     </w:p>
     <w:p>
@@ -6688,7 +6737,7 @@
       <w:r>
         <w:drawing>
           <wp:inline xmlns:a="http://schemas.openxmlformats.org/drawingml/2006/main" xmlns:pic="http://schemas.openxmlformats.org/drawingml/2006/picture">
-            <wp:extent cx="5486400" cy="4800600"/>
+            <wp:extent cx="5486400" cy="3633216"/>
             <wp:docPr id="10" name="Picture 10"/>
             <wp:cNvGraphicFramePr>
               <a:graphicFrameLocks noChangeAspect="1"/>
@@ -6709,7 +6758,7 @@
                   <pic:spPr>
                     <a:xfrm>
                       <a:off x="0" y="0"/>
-                      <a:ext cx="5486400" cy="4800600"/>
+                      <a:ext cx="5486400" cy="3633216"/>
                     </a:xfrm>
                     <a:prstGeom prst="rect"/>
                   </pic:spPr>
@@ -6723,56 +6772,54 @@
     <w:p>
       <w:pPr/>
       <w:r>
-        <w:t>&lt;!-- File: output/diagrams/account_seq_register_analysis.png --&gt;</w:t>
-      </w:r>
-    </w:p>
-    <w:p>
-      <w:pPr/>
-      <w:r>
         <w:rPr>
           <w:b/>
         </w:rPr>
-        <w:t>Kịch bản phiên bản 2 – UC02 Đăng ký</w:t>
+        <w:t>Kịch bản phiên bản 2 – UC02 Đăng ký (8 bước)</w:t>
       </w:r>
     </w:p>
     <w:p>
       <w:pPr>
-        <w:ind w:left="360" w:hanging="240"/>
+        <w:numPr>
+          <w:ilvl w:val="0"/>
+          <w:numId w:val="2"/>
+        </w:numPr>
       </w:pPr>
       <w:r>
-        <w:t>1.  Khách hàng chọn chức năng Đăng ký từ giao diện đăng nhập.</w:t>
+        <w:t>Khách hàng chọn liên kết Đăng ký từ giao diện đăng nhập.</w:t>
       </w:r>
     </w:p>
     <w:p>
       <w:pPr>
-        <w:ind w:left="360" w:hanging="240"/>
+        <w:numPr>
+          <w:ilvl w:val="0"/>
+          <w:numId w:val="2"/>
+        </w:numPr>
       </w:pPr>
       <w:r>
-        <w:t>2.  Lớp RegisterView hiển thị giao diện yêu cầu nhập thông tin đăng ký.</w:t>
+        <w:t>Lớp RegisterView hiển thị giao diện đăng ký.</w:t>
       </w:r>
     </w:p>
     <w:p>
       <w:pPr>
-        <w:ind w:left="360" w:hanging="240"/>
+        <w:numPr>
+          <w:ilvl w:val="0"/>
+          <w:numId w:val="2"/>
+        </w:numPr>
       </w:pPr>
       <w:r>
-        <w:t>3.  Khách hàng nhập Họ tên, SĐT, Email, Mật khẩu, Xác nhận mật khẩu.</w:t>
+        <w:t>Khách hàng nhập Họ tên, SĐT, Email, Mật khẩu, Xác nhận mật khẩu, nhấn Tiếp tục.</w:t>
       </w:r>
     </w:p>
     <w:p>
       <w:pPr>
-        <w:ind w:left="360" w:hanging="240"/>
+        <w:numPr>
+          <w:ilvl w:val="0"/>
+          <w:numId w:val="2"/>
+        </w:numPr>
       </w:pPr>
       <w:r>
-        <w:t>4.  Khách hàng nhấn nút Tiếp tục.</w:t>
-      </w:r>
-    </w:p>
-    <w:p>
-      <w:pPr>
-        <w:ind w:left="360" w:hanging="240"/>
-      </w:pPr>
-      <w:r>
-        <w:t xml:space="preserve">5.  Lớp RegisterView gọi hàm </w:t>
+        <w:t xml:space="preserve">Lớp RegisterView gọi hàm </w:t>
       </w:r>
       <w:r>
         <w:rPr>
@@ -6787,46 +6834,13 @@
     </w:p>
     <w:p>
       <w:pPr>
-        <w:ind w:left="360" w:hanging="240"/>
+        <w:numPr>
+          <w:ilvl w:val="0"/>
+          <w:numId w:val="2"/>
+        </w:numPr>
       </w:pPr>
       <w:r>
-        <w:t xml:space="preserve">6.  Lớp User gọi hàm </w:t>
-      </w:r>
-      <w:r>
-        <w:rPr>
-          <w:rFonts w:ascii="Courier New" w:hAnsi="Courier New"/>
-          <w:sz w:val="20"/>
-        </w:rPr>
-        <w:t>existsBySDT()</w:t>
-      </w:r>
-      <w:r>
-        <w:t xml:space="preserve"> để kiểm tra SĐT chưa tồn tại.</w:t>
-      </w:r>
-    </w:p>
-    <w:p>
-      <w:pPr>
-        <w:ind w:left="360" w:hanging="240"/>
-      </w:pPr>
-      <w:r>
-        <w:t xml:space="preserve">7.  Lớp User gọi hàm </w:t>
-      </w:r>
-      <w:r>
-        <w:rPr>
-          <w:rFonts w:ascii="Courier New" w:hAnsi="Courier New"/>
-          <w:sz w:val="20"/>
-        </w:rPr>
-        <w:t>existsByEmail()</w:t>
-      </w:r>
-      <w:r>
-        <w:t xml:space="preserve"> để kiểm tra Email chưa tồn tại.</w:t>
-      </w:r>
-    </w:p>
-    <w:p>
-      <w:pPr>
-        <w:ind w:left="360" w:hanging="240"/>
-      </w:pPr>
-      <w:r>
-        <w:t xml:space="preserve">8.  Lớp User gọi hàm </w:t>
+        <w:t xml:space="preserve">Lớp User kiểm tra thông tin hợp lệ, gọi hàm </w:t>
       </w:r>
       <w:r>
         <w:rPr>
@@ -6836,39 +6850,29 @@
         <w:t>sendOTP()</w:t>
       </w:r>
       <w:r>
-        <w:t xml:space="preserve"> của đối tượng OTP để gửi mã xác minh.</w:t>
+        <w:t xml:space="preserve"> của đối tượng OTP.</w:t>
       </w:r>
     </w:p>
     <w:p>
       <w:pPr>
-        <w:ind w:left="360" w:hanging="240"/>
+        <w:numPr>
+          <w:ilvl w:val="0"/>
+          <w:numId w:val="2"/>
+        </w:numPr>
       </w:pPr>
       <w:r>
-        <w:t>9.  Lớp User trả kết quả về cho RegisterView.</w:t>
+        <w:t>Lớp RegisterView hiển thị giao diện xác nhận OTP.</w:t>
       </w:r>
     </w:p>
     <w:p>
       <w:pPr>
-        <w:ind w:left="360" w:hanging="240"/>
+        <w:numPr>
+          <w:ilvl w:val="0"/>
+          <w:numId w:val="2"/>
+        </w:numPr>
       </w:pPr>
       <w:r>
-        <w:t>10.  Lớp RegisterView hiển thị giao diện xác nhận OTP.</w:t>
-      </w:r>
-    </w:p>
-    <w:p>
-      <w:pPr>
-        <w:ind w:left="360" w:hanging="240"/>
-      </w:pPr>
-      <w:r>
-        <w:t>11.  Khách hàng nhập mã OTP và nhấn nút Xác nhận.</w:t>
-      </w:r>
-    </w:p>
-    <w:p>
-      <w:pPr>
-        <w:ind w:left="360" w:hanging="240"/>
-      </w:pPr>
-      <w:r>
-        <w:t xml:space="preserve">12.  Lớp OTPVerifyView gọi hàm </w:t>
+        <w:t xml:space="preserve">Khách hàng nhập mã OTP, nhấn Xác nhận. Lớp OTPVerifyView gọi hàm </w:t>
       </w:r>
       <w:r>
         <w:rPr>
@@ -6883,28 +6887,13 @@
     </w:p>
     <w:p>
       <w:pPr>
-        <w:ind w:left="360" w:hanging="240"/>
+        <w:numPr>
+          <w:ilvl w:val="0"/>
+          <w:numId w:val="2"/>
+        </w:numPr>
       </w:pPr>
       <w:r>
-        <w:t xml:space="preserve">13.  Lớp OTP gọi hàm </w:t>
-      </w:r>
-      <w:r>
-        <w:rPr>
-          <w:rFonts w:ascii="Courier New" w:hAnsi="Courier New"/>
-          <w:sz w:val="20"/>
-        </w:rPr>
-        <w:t>verify()</w:t>
-      </w:r>
-      <w:r>
-        <w:t xml:space="preserve"> để kiểm tra mã đúng và còn hiệu lực.</w:t>
-      </w:r>
-    </w:p>
-    <w:p>
-      <w:pPr>
-        <w:ind w:left="360" w:hanging="240"/>
-      </w:pPr>
-      <w:r>
-        <w:t xml:space="preserve">14.  Lớp OTPVerifyView gọi hàm </w:t>
+        <w:t xml:space="preserve">Lớp OTPVerifyView gọi hàm </w:t>
       </w:r>
       <w:r>
         <w:rPr>
@@ -6914,15 +6903,7 @@
         <w:t>saveUser()</w:t>
       </w:r>
       <w:r>
-        <w:t xml:space="preserve"> của đối tượng User để hoàn tất đăng ký.</w:t>
-      </w:r>
-    </w:p>
-    <w:p>
-      <w:pPr>
-        <w:ind w:left="360" w:hanging="240"/>
-      </w:pPr>
-      <w:r>
-        <w:t>15.  Lớp OTPVerifyView hiển thị "Đăng ký thành công!"</w:t>
+        <w:t xml:space="preserve"> của đối tượng User, hiển thị "Đăng ký thành công!".</w:t>
       </w:r>
     </w:p>
     <w:p>
@@ -6930,7 +6911,7 @@
         <w:pStyle w:val="Heading3"/>
       </w:pPr>
       <w:r>
-        <w:t>UC03 – Đổi mật khẩu</w:t>
+        <w:t>UC03 – Đổi mật khẩu (5 bước)</w:t>
       </w:r>
     </w:p>
     <w:p>
@@ -6940,7 +6921,7 @@
       <w:r>
         <w:drawing>
           <wp:inline xmlns:a="http://schemas.openxmlformats.org/drawingml/2006/main" xmlns:pic="http://schemas.openxmlformats.org/drawingml/2006/picture">
-            <wp:extent cx="5486400" cy="3875204"/>
+            <wp:extent cx="5486400" cy="3455317"/>
             <wp:docPr id="11" name="Picture 11"/>
             <wp:cNvGraphicFramePr>
               <a:graphicFrameLocks noChangeAspect="1"/>
@@ -6961,7 +6942,7 @@
                   <pic:spPr>
                     <a:xfrm>
                       <a:off x="0" y="0"/>
-                      <a:ext cx="5486400" cy="3875204"/>
+                      <a:ext cx="5486400" cy="3455317"/>
                     </a:xfrm>
                     <a:prstGeom prst="rect"/>
                   </pic:spPr>
@@ -6975,56 +6956,54 @@
     <w:p>
       <w:pPr/>
       <w:r>
-        <w:t>&lt;!-- File: output/diagrams/account_seq_changepw_analysis.png --&gt;</w:t>
-      </w:r>
-    </w:p>
-    <w:p>
-      <w:pPr/>
-      <w:r>
         <w:rPr>
           <w:b/>
         </w:rPr>
-        <w:t>Kịch bản phiên bản 2 – UC03 Đổi mật khẩu</w:t>
+        <w:t>Kịch bản phiên bản 2 – UC03 Đổi mật khẩu (5 bước)</w:t>
       </w:r>
     </w:p>
     <w:p>
       <w:pPr>
-        <w:ind w:left="360" w:hanging="240"/>
+        <w:numPr>
+          <w:ilvl w:val="0"/>
+          <w:numId w:val="2"/>
+        </w:numPr>
       </w:pPr>
       <w:r>
-        <w:t>1.  Người dùng truy cập chức năng Đổi mật khẩu.</w:t>
+        <w:t>Người dùng chọn chức năng Đổi mật khẩu.</w:t>
       </w:r>
     </w:p>
     <w:p>
       <w:pPr>
-        <w:ind w:left="360" w:hanging="240"/>
+        <w:numPr>
+          <w:ilvl w:val="0"/>
+          <w:numId w:val="2"/>
+        </w:numPr>
       </w:pPr>
       <w:r>
-        <w:t>2.  Lớp ChangePasswordView hiển thị giao diện yêu cầu nhập mật khẩu hiện tại và mật khẩu mới.</w:t>
+        <w:t>Lớp ChangePasswordView hiển thị giao diện đổi mật khẩu.</w:t>
       </w:r>
     </w:p>
     <w:p>
       <w:pPr>
-        <w:ind w:left="360" w:hanging="240"/>
+        <w:numPr>
+          <w:ilvl w:val="0"/>
+          <w:numId w:val="2"/>
+        </w:numPr>
       </w:pPr>
       <w:r>
-        <w:t>3.  Người dùng nhập Mật khẩu hiện tại, Mật khẩu mới, Xác nhận mật khẩu mới.</w:t>
+        <w:t>Người dùng nhập Mật khẩu hiện tại, Mật khẩu mới, Xác nhận mật khẩu mới, nhấn Lưu.</w:t>
       </w:r>
     </w:p>
     <w:p>
       <w:pPr>
-        <w:ind w:left="360" w:hanging="240"/>
+        <w:numPr>
+          <w:ilvl w:val="0"/>
+          <w:numId w:val="2"/>
+        </w:numPr>
       </w:pPr>
       <w:r>
-        <w:t>4.  Người dùng nhấn nút Lưu thay đổi.</w:t>
-      </w:r>
-    </w:p>
-    <w:p>
-      <w:pPr>
-        <w:ind w:left="360" w:hanging="240"/>
-      </w:pPr>
-      <w:r>
-        <w:t xml:space="preserve">5.  Lớp ChangePasswordView gọi hàm </w:t>
+        <w:t xml:space="preserve">Lớp ChangePasswordView gọi hàm </w:t>
       </w:r>
       <w:r>
         <w:rPr>
@@ -7039,108 +7018,13 @@
     </w:p>
     <w:p>
       <w:pPr>
-        <w:ind w:left="360" w:hanging="240"/>
+        <w:numPr>
+          <w:ilvl w:val="0"/>
+          <w:numId w:val="2"/>
+        </w:numPr>
       </w:pPr>
       <w:r>
-        <w:t xml:space="preserve">6.  Lớp User gọi hàm </w:t>
-      </w:r>
-      <w:r>
-        <w:rPr>
-          <w:rFonts w:ascii="Courier New" w:hAnsi="Courier New"/>
-          <w:sz w:val="20"/>
-        </w:rPr>
-        <w:t>findBySessionToken()</w:t>
-      </w:r>
-      <w:r>
-        <w:t xml:space="preserve"> để tìm thông tin người dùng.</w:t>
-      </w:r>
-    </w:p>
-    <w:p>
-      <w:pPr>
-        <w:ind w:left="360" w:hanging="240"/>
-      </w:pPr>
-      <w:r>
-        <w:t xml:space="preserve">7.  Lớp User gọi hàm </w:t>
-      </w:r>
-      <w:r>
-        <w:rPr>
-          <w:rFonts w:ascii="Courier New" w:hAnsi="Courier New"/>
-          <w:sz w:val="20"/>
-        </w:rPr>
-        <w:t>verifyPassword()</w:t>
-      </w:r>
-      <w:r>
-        <w:t xml:space="preserve"> để xác minh mật khẩu hiện tại.</w:t>
-      </w:r>
-    </w:p>
-    <w:p>
-      <w:pPr>
-        <w:ind w:left="360" w:hanging="240"/>
-      </w:pPr>
-      <w:r>
-        <w:t xml:space="preserve">8.  Lớp User gọi hàm </w:t>
-      </w:r>
-      <w:r>
-        <w:rPr>
-          <w:rFonts w:ascii="Courier New" w:hAnsi="Courier New"/>
-          <w:sz w:val="20"/>
-        </w:rPr>
-        <w:t>hashPassword()</w:t>
-      </w:r>
-      <w:r>
-        <w:t xml:space="preserve"> để mã hóa mật khẩu mới.</w:t>
-      </w:r>
-    </w:p>
-    <w:p>
-      <w:pPr>
-        <w:ind w:left="360" w:hanging="240"/>
-      </w:pPr>
-      <w:r>
-        <w:t xml:space="preserve">9.  Lớp User gọi hàm </w:t>
-      </w:r>
-      <w:r>
-        <w:rPr>
-          <w:rFonts w:ascii="Courier New" w:hAnsi="Courier New"/>
-          <w:sz w:val="20"/>
-        </w:rPr>
-        <w:t>updatePassword()</w:t>
-      </w:r>
-      <w:r>
-        <w:t xml:space="preserve"> để cập nhật mật khẩu.</w:t>
-      </w:r>
-    </w:p>
-    <w:p>
-      <w:pPr>
-        <w:ind w:left="360" w:hanging="240"/>
-      </w:pPr>
-      <w:r>
-        <w:t xml:space="preserve">10.  Lớp User gọi hàm </w:t>
-      </w:r>
-      <w:r>
-        <w:rPr>
-          <w:rFonts w:ascii="Courier New" w:hAnsi="Courier New"/>
-          <w:sz w:val="20"/>
-        </w:rPr>
-        <w:t>revokeAllSessions()</w:t>
-      </w:r>
-      <w:r>
-        <w:t xml:space="preserve"> để thu hồi tất cả phiên đăng nhập khác.</w:t>
-      </w:r>
-    </w:p>
-    <w:p>
-      <w:pPr>
-        <w:ind w:left="360" w:hanging="240"/>
-      </w:pPr>
-      <w:r>
-        <w:t>11.  Lớp User trả kết quả về cho ChangePasswordView.</w:t>
-      </w:r>
-    </w:p>
-    <w:p>
-      <w:pPr>
-        <w:ind w:left="360" w:hanging="240"/>
-      </w:pPr>
-      <w:r>
-        <w:t>12.  Lớp ChangePasswordView hiển thị "Đổi mật khẩu thành công. Vui lòng đăng nhập lại."</w:t>
+        <w:t>Lớp ChangePasswordView hiển thị "Đổi mật khẩu thành công", chuyển hướng về đăng nhập.</w:t>
       </w:r>
     </w:p>
     <w:p>
@@ -7148,7 +7032,7 @@
         <w:pStyle w:val="Heading3"/>
       </w:pPr>
       <w:r>
-        <w:t>UC04 – Quản lý thông tin cá nhân</w:t>
+        <w:t>UC04 – Quản lý thông tin cá nhân (7 bước)</w:t>
       </w:r>
     </w:p>
     <w:p>
@@ -7158,7 +7042,7 @@
       <w:r>
         <w:drawing>
           <wp:inline xmlns:a="http://schemas.openxmlformats.org/drawingml/2006/main" xmlns:pic="http://schemas.openxmlformats.org/drawingml/2006/picture">
-            <wp:extent cx="5486400" cy="4553455"/>
+            <wp:extent cx="5486400" cy="4456130"/>
             <wp:docPr id="12" name="Picture 12"/>
             <wp:cNvGraphicFramePr>
               <a:graphicFrameLocks noChangeAspect="1"/>
@@ -7179,7 +7063,7 @@
                   <pic:spPr>
                     <a:xfrm>
                       <a:off x="0" y="0"/>
-                      <a:ext cx="5486400" cy="4553455"/>
+                      <a:ext cx="5486400" cy="4456130"/>
                     </a:xfrm>
                     <a:prstGeom prst="rect"/>
                   </pic:spPr>
@@ -7193,32 +7077,32 @@
     <w:p>
       <w:pPr/>
       <w:r>
-        <w:t>&lt;!-- File: output/diagrams/account_seq_profile_analysis.png --&gt;</w:t>
-      </w:r>
-    </w:p>
-    <w:p>
-      <w:pPr/>
-      <w:r>
         <w:rPr>
           <w:b/>
         </w:rPr>
-        <w:t>Kịch bản phiên bản 2 – UC04 Quản lý thông tin cá nhân</w:t>
+        <w:t>Kịch bản phiên bản 2 – UC04 Quản lý thông tin cá nhân (7 bước)</w:t>
       </w:r>
     </w:p>
     <w:p>
       <w:pPr>
-        <w:ind w:left="360" w:hanging="240"/>
+        <w:numPr>
+          <w:ilvl w:val="0"/>
+          <w:numId w:val="2"/>
+        </w:numPr>
       </w:pPr>
       <w:r>
-        <w:t>1.  Khách hàng chọn chức năng Hồ sơ cá nhân.</w:t>
+        <w:t>Khách hàng chọn chức năng Hồ sơ cá nhân.</w:t>
       </w:r>
     </w:p>
     <w:p>
       <w:pPr>
-        <w:ind w:left="360" w:hanging="240"/>
+        <w:numPr>
+          <w:ilvl w:val="0"/>
+          <w:numId w:val="2"/>
+        </w:numPr>
       </w:pPr>
       <w:r>
-        <w:t xml:space="preserve">2.  Lớp ProfileView gọi hàm </w:t>
+        <w:t xml:space="preserve">Lớp ProfileView gọi hàm </w:t>
       </w:r>
       <w:r>
         <w:rPr>
@@ -7233,52 +7117,46 @@
     </w:p>
     <w:p>
       <w:pPr>
-        <w:ind w:left="360" w:hanging="240"/>
+        <w:numPr>
+          <w:ilvl w:val="0"/>
+          <w:numId w:val="2"/>
+        </w:numPr>
       </w:pPr>
       <w:r>
-        <w:t xml:space="preserve">3.  Lớp User gọi hàm </w:t>
-      </w:r>
-      <w:r>
-        <w:rPr>
-          <w:rFonts w:ascii="Courier New" w:hAnsi="Courier New"/>
-          <w:sz w:val="20"/>
-        </w:rPr>
-        <w:t>findById()</w:t>
-      </w:r>
-      <w:r>
-        <w:t xml:space="preserve"> để tìm thông tin người dùng.</w:t>
+        <w:t>Lớp ProfileView hiển thị trang hồ sơ cá nhân.</w:t>
       </w:r>
     </w:p>
     <w:p>
       <w:pPr>
-        <w:ind w:left="360" w:hanging="240"/>
+        <w:numPr>
+          <w:ilvl w:val="0"/>
+          <w:numId w:val="2"/>
+        </w:numPr>
       </w:pPr>
       <w:r>
-        <w:t>4.  Lớp User trả kết quả về cho ProfileView.</w:t>
+        <w:t>Khách hàng nhấn nút Chỉnh sửa.</w:t>
       </w:r>
     </w:p>
     <w:p>
       <w:pPr>
-        <w:ind w:left="360" w:hanging="240"/>
+        <w:numPr>
+          <w:ilvl w:val="0"/>
+          <w:numId w:val="2"/>
+        </w:numPr>
       </w:pPr>
       <w:r>
-        <w:t>5.  Lớp ProfileView hiển thị hồ sơ: Họ tên, SĐT, Email, Hạng hội viên, Điểm tích lũy.</w:t>
+        <w:t>Lớp ProfileView chuyển sang chế độ chỉnh sửa.</w:t>
       </w:r>
     </w:p>
     <w:p>
       <w:pPr>
-        <w:ind w:left="360" w:hanging="240"/>
+        <w:numPr>
+          <w:ilvl w:val="0"/>
+          <w:numId w:val="2"/>
+        </w:numPr>
       </w:pPr>
       <w:r>
-        <w:t>6.  Khách hàng nhấn nút Chỉnh sửa thông tin, cập nhật thông tin và nhấn nút Lưu.</w:t>
-      </w:r>
-    </w:p>
-    <w:p>
-      <w:pPr>
-        <w:ind w:left="360" w:hanging="240"/>
-      </w:pPr>
-      <w:r>
-        <w:t xml:space="preserve">7.  Lớp ProfileView gọi hàm </w:t>
+        <w:t xml:space="preserve">Khách hàng cập nhật Họ tên, Email, nhấn Lưu. Lớp ProfileView gọi hàm </w:t>
       </w:r>
       <w:r>
         <w:rPr>
@@ -7293,54 +7171,13 @@
     </w:p>
     <w:p>
       <w:pPr>
-        <w:ind w:left="360" w:hanging="240"/>
+        <w:numPr>
+          <w:ilvl w:val="0"/>
+          <w:numId w:val="2"/>
+        </w:numPr>
       </w:pPr>
       <w:r>
-        <w:t xml:space="preserve">8.  Lớp User gọi hàm </w:t>
-      </w:r>
-      <w:r>
-        <w:rPr>
-          <w:rFonts w:ascii="Courier New" w:hAnsi="Courier New"/>
-          <w:sz w:val="20"/>
-        </w:rPr>
-        <w:t>checkEmail()</w:t>
-      </w:r>
-      <w:r>
-        <w:t xml:space="preserve"> để kiểm tra email hợp lệ và chưa được dùng.</w:t>
-      </w:r>
-    </w:p>
-    <w:p>
-      <w:pPr>
-        <w:ind w:left="360" w:hanging="240"/>
-      </w:pPr>
-      <w:r>
-        <w:t xml:space="preserve">9.  Lớp User gọi hàm </w:t>
-      </w:r>
-      <w:r>
-        <w:rPr>
-          <w:rFonts w:ascii="Courier New" w:hAnsi="Courier New"/>
-          <w:sz w:val="20"/>
-        </w:rPr>
-        <w:t>update()</w:t>
-      </w:r>
-      <w:r>
-        <w:t xml:space="preserve"> để cập nhật thông tin.</w:t>
-      </w:r>
-    </w:p>
-    <w:p>
-      <w:pPr>
-        <w:ind w:left="360" w:hanging="240"/>
-      </w:pPr>
-      <w:r>
-        <w:t>10.  Lớp User trả kết quả về cho ProfileView.</w:t>
-      </w:r>
-    </w:p>
-    <w:p>
-      <w:pPr>
-        <w:ind w:left="360" w:hanging="240"/>
-      </w:pPr>
-      <w:r>
-        <w:t>11.  Lớp ProfileView hiển thị "Cập nhật thành công!"</w:t>
+        <w:t>Lớp ProfileView hiển thị "Cập nhật thành công!", quay về chế độ xem.</w:t>
       </w:r>
     </w:p>
     <w:p>
@@ -7348,7 +7185,7 @@
         <w:pStyle w:val="Heading3"/>
       </w:pPr>
       <w:r>
-        <w:t>UC20 – Quản lý tài khoản nhân viên</w:t>
+        <w:t>UC20 – Quản lý tài khoản nhân viên (14 bước)</w:t>
       </w:r>
     </w:p>
     <w:p>
@@ -7393,32 +7230,32 @@
     <w:p>
       <w:pPr/>
       <w:r>
-        <w:t>&lt;!-- File: output/diagrams/account_seq_staff_analysis.png --&gt;</w:t>
-      </w:r>
-    </w:p>
-    <w:p>
-      <w:pPr/>
-      <w:r>
         <w:rPr>
           <w:b/>
         </w:rPr>
-        <w:t>Kịch bản phiên bản 2 – UC20 Quản lý tài khoản nhân viên</w:t>
+        <w:t>Kịch bản phiên bản 2 – UC20 Quản lý tài khoản nhân viên (14 bước)</w:t>
       </w:r>
     </w:p>
     <w:p>
       <w:pPr>
-        <w:ind w:left="360" w:hanging="240"/>
+        <w:numPr>
+          <w:ilvl w:val="0"/>
+          <w:numId w:val="2"/>
+        </w:numPr>
       </w:pPr>
       <w:r>
-        <w:t>1.  Admin truy cập chức năng Quản lý nhân viên từ trang quản trị.</w:t>
+        <w:t>Admin chọn chức năng Quản lý nhân viên.</w:t>
       </w:r>
     </w:p>
     <w:p>
       <w:pPr>
-        <w:ind w:left="360" w:hanging="240"/>
+        <w:numPr>
+          <w:ilvl w:val="0"/>
+          <w:numId w:val="2"/>
+        </w:numPr>
       </w:pPr>
       <w:r>
-        <w:t xml:space="preserve">2.  Lớp StaffManageView gọi hàm </w:t>
+        <w:t xml:space="preserve">Lớp StaffManageView gọi hàm </w:t>
       </w:r>
       <w:r>
         <w:rPr>
@@ -7433,52 +7270,57 @@
     </w:p>
     <w:p>
       <w:pPr>
-        <w:ind w:left="360" w:hanging="240"/>
+        <w:numPr>
+          <w:ilvl w:val="0"/>
+          <w:numId w:val="2"/>
+        </w:numPr>
       </w:pPr>
       <w:r>
-        <w:t xml:space="preserve">3.  Lớp Employee gọi hàm </w:t>
-      </w:r>
-      <w:r>
-        <w:rPr>
-          <w:rFonts w:ascii="Courier New" w:hAnsi="Courier New"/>
-          <w:sz w:val="20"/>
-        </w:rPr>
-        <w:t>findAll()</w:t>
-      </w:r>
-      <w:r>
-        <w:t xml:space="preserve"> để tải danh sách nhân viên.</w:t>
+        <w:t>Lớp StaffManageView hiển thị danh sách nhân viên.</w:t>
       </w:r>
     </w:p>
     <w:p>
       <w:pPr>
-        <w:ind w:left="360" w:hanging="240"/>
+        <w:numPr>
+          <w:ilvl w:val="0"/>
+          <w:numId w:val="2"/>
+        </w:numPr>
       </w:pPr>
       <w:r>
-        <w:t>4.  Lớp Employee trả kết quả về cho StaffManageView.</w:t>
+        <w:t>Admin nhấn nút Thêm nhân viên.</w:t>
       </w:r>
     </w:p>
     <w:p>
       <w:pPr>
-        <w:ind w:left="360" w:hanging="240"/>
+        <w:numPr>
+          <w:ilvl w:val="0"/>
+          <w:numId w:val="2"/>
+        </w:numPr>
       </w:pPr>
       <w:r>
-        <w:t>5.  Lớp StaffManageView hiển thị bảng danh sách nhân viên.</w:t>
+        <w:t>Lớp StaffManageView hiển thị giao diện nhập thông tin.</w:t>
       </w:r>
     </w:p>
     <w:p>
       <w:pPr>
-        <w:ind w:left="360" w:hanging="240"/>
+        <w:numPr>
+          <w:ilvl w:val="0"/>
+          <w:numId w:val="2"/>
+        </w:numPr>
       </w:pPr>
       <w:r>
-        <w:t>6.  Admin nhấn nút Thêm, nhập thông tin nhân viên và nhấn nút Lưu.</w:t>
+        <w:t>Admin nhập Họ tên, SĐT, Vai trò, Chi nhánh, nhấn Lưu.</w:t>
       </w:r>
     </w:p>
     <w:p>
       <w:pPr>
-        <w:ind w:left="360" w:hanging="240"/>
+        <w:numPr>
+          <w:ilvl w:val="0"/>
+          <w:numId w:val="2"/>
+        </w:numPr>
       </w:pPr>
       <w:r>
-        <w:t xml:space="preserve">7.  Lớp StaffManageView gọi hàm </w:t>
+        <w:t xml:space="preserve">Lớp StaffManageView gọi hàm </w:t>
       </w:r>
       <w:r>
         <w:rPr>
@@ -7493,36 +7335,89 @@
     </w:p>
     <w:p>
       <w:pPr>
-        <w:ind w:left="360" w:hanging="240"/>
+        <w:numPr>
+          <w:ilvl w:val="0"/>
+          <w:numId w:val="2"/>
+        </w:numPr>
       </w:pPr>
       <w:r>
-        <w:t xml:space="preserve">8.  Lớp Employee gọi hàm </w:t>
+        <w:t>Lớp StaffManageView hiển thị "Thêm nhân viên thành công!".</w:t>
+      </w:r>
+    </w:p>
+    <w:p>
+      <w:pPr>
+        <w:numPr>
+          <w:ilvl w:val="0"/>
+          <w:numId w:val="2"/>
+        </w:numPr>
+      </w:pPr>
+      <w:r>
+        <w:t>Admin nhấn nút Sửa trên dòng Nguyễn Minh Tuấn.</w:t>
+      </w:r>
+    </w:p>
+    <w:p>
+      <w:pPr>
+        <w:numPr>
+          <w:ilvl w:val="0"/>
+          <w:numId w:val="2"/>
+        </w:numPr>
+      </w:pPr>
+      <w:r>
+        <w:t>Lớp StaffManageView hiển thị giao diện chỉnh sửa.</w:t>
+      </w:r>
+    </w:p>
+    <w:p>
+      <w:pPr>
+        <w:numPr>
+          <w:ilvl w:val="0"/>
+          <w:numId w:val="2"/>
+        </w:numPr>
+      </w:pPr>
+      <w:r>
+        <w:t>Admin cập nhật thông tin, nhấn Lưu.</w:t>
+      </w:r>
+    </w:p>
+    <w:p>
+      <w:pPr>
+        <w:numPr>
+          <w:ilvl w:val="0"/>
+          <w:numId w:val="2"/>
+        </w:numPr>
+      </w:pPr>
+      <w:r>
+        <w:t xml:space="preserve">Lớp StaffManageView gọi hàm </w:t>
       </w:r>
       <w:r>
         <w:rPr>
           <w:rFonts w:ascii="Courier New" w:hAnsi="Courier New"/>
           <w:sz w:val="20"/>
         </w:rPr>
-        <w:t>save()</w:t>
-      </w:r>
-      <w:r>
-        <w:t xml:space="preserve"> để lưu nhân viên mới.</w:t>
+        <w:t>updateStaff()</w:t>
+      </w:r>
+      <w:r>
+        <w:t xml:space="preserve"> của đối tượng Employee.</w:t>
       </w:r>
     </w:p>
     <w:p>
       <w:pPr>
-        <w:ind w:left="360" w:hanging="240"/>
+        <w:numPr>
+          <w:ilvl w:val="0"/>
+          <w:numId w:val="2"/>
+        </w:numPr>
       </w:pPr>
       <w:r>
-        <w:t>9.  Lớp Employee trả kết quả về cho StaffManageView.</w:t>
+        <w:t>Admin nhấn nút Xóa trên dòng Lê Văn Khánh.</w:t>
       </w:r>
     </w:p>
     <w:p>
       <w:pPr>
-        <w:ind w:left="360" w:hanging="240"/>
+        <w:numPr>
+          <w:ilvl w:val="0"/>
+          <w:numId w:val="2"/>
+        </w:numPr>
       </w:pPr>
       <w:r>
-        <w:t>10.  Lớp StaffManageView hiển thị "Thêm nhân viên thành công!"</w:t>
+        <w:t>Lớp StaffManageView yêu cầu xác nhận, hiển thị "Xóa nhân viên thành công!".</w:t>
       </w:r>
     </w:p>
     <w:p/>
@@ -7556,10 +7451,13 @@
     </w:p>
     <w:p>
       <w:pPr>
-        <w:ind w:left="360" w:hanging="240"/>
+        <w:numPr>
+          <w:ilvl w:val="0"/>
+          <w:numId w:val="1"/>
+        </w:numPr>
       </w:pPr>
       <w:r>
-        <w:t xml:space="preserve">•  User: </w:t>
+        <w:t xml:space="preserve">User: </w:t>
       </w:r>
       <w:r>
         <w:rPr>
@@ -7571,10 +7469,13 @@
     </w:p>
     <w:p>
       <w:pPr>
-        <w:ind w:left="360" w:hanging="240"/>
+        <w:numPr>
+          <w:ilvl w:val="0"/>
+          <w:numId w:val="1"/>
+        </w:numPr>
       </w:pPr>
       <w:r>
-        <w:t xml:space="preserve">•  MembershipTier: </w:t>
+        <w:t xml:space="preserve">MembershipTier: </w:t>
       </w:r>
       <w:r>
         <w:rPr>
@@ -7586,10 +7487,13 @@
     </w:p>
     <w:p>
       <w:pPr>
-        <w:ind w:left="360" w:hanging="240"/>
+        <w:numPr>
+          <w:ilvl w:val="0"/>
+          <w:numId w:val="1"/>
+        </w:numPr>
       </w:pPr>
       <w:r>
-        <w:t xml:space="preserve">•  OTP: </w:t>
+        <w:t xml:space="preserve">OTP: </w:t>
       </w:r>
       <w:r>
         <w:rPr>
@@ -7601,10 +7505,13 @@
     </w:p>
     <w:p>
       <w:pPr>
-        <w:ind w:left="360" w:hanging="240"/>
+        <w:numPr>
+          <w:ilvl w:val="0"/>
+          <w:numId w:val="1"/>
+        </w:numPr>
       </w:pPr>
       <w:r>
-        <w:t xml:space="preserve">•  LoginSession: </w:t>
+        <w:t xml:space="preserve">LoginSession: </w:t>
       </w:r>
       <w:r>
         <w:rPr>
@@ -7616,10 +7523,13 @@
     </w:p>
     <w:p>
       <w:pPr>
-        <w:ind w:left="360" w:hanging="240"/>
+        <w:numPr>
+          <w:ilvl w:val="0"/>
+          <w:numId w:val="1"/>
+        </w:numPr>
       </w:pPr>
       <w:r>
-        <w:t xml:space="preserve">•  Employee: </w:t>
+        <w:t xml:space="preserve">Employee: </w:t>
       </w:r>
       <w:r>
         <w:rPr>
@@ -7639,10 +7549,13 @@
     </w:p>
     <w:p>
       <w:pPr>
-        <w:ind w:left="360" w:hanging="240"/>
+        <w:numPr>
+          <w:ilvl w:val="0"/>
+          <w:numId w:val="1"/>
+        </w:numPr>
       </w:pPr>
       <w:r>
-        <w:t xml:space="preserve">•  User: </w:t>
+        <w:t xml:space="preserve">User: </w:t>
       </w:r>
       <w:r>
         <w:rPr>
@@ -7724,10 +7637,13 @@
     </w:p>
     <w:p>
       <w:pPr>
-        <w:ind w:left="360" w:hanging="240"/>
+        <w:numPr>
+          <w:ilvl w:val="0"/>
+          <w:numId w:val="1"/>
+        </w:numPr>
       </w:pPr>
       <w:r>
-        <w:t xml:space="preserve">•  MembershipTier: </w:t>
+        <w:t xml:space="preserve">MembershipTier: </w:t>
       </w:r>
       <w:r>
         <w:rPr>
@@ -7779,10 +7695,13 @@
     </w:p>
     <w:p>
       <w:pPr>
-        <w:ind w:left="360" w:hanging="240"/>
+        <w:numPr>
+          <w:ilvl w:val="0"/>
+          <w:numId w:val="1"/>
+        </w:numPr>
       </w:pPr>
       <w:r>
-        <w:t xml:space="preserve">•  OTP: </w:t>
+        <w:t xml:space="preserve">OTP: </w:t>
       </w:r>
       <w:r>
         <w:rPr>
@@ -7834,10 +7753,13 @@
     </w:p>
     <w:p>
       <w:pPr>
-        <w:ind w:left="360" w:hanging="240"/>
+        <w:numPr>
+          <w:ilvl w:val="0"/>
+          <w:numId w:val="1"/>
+        </w:numPr>
       </w:pPr>
       <w:r>
-        <w:t xml:space="preserve">•  LoginSession: </w:t>
+        <w:t xml:space="preserve">LoginSession: </w:t>
       </w:r>
       <w:r>
         <w:rPr>
@@ -7889,10 +7811,13 @@
     </w:p>
     <w:p>
       <w:pPr>
-        <w:ind w:left="360" w:hanging="240"/>
+        <w:numPr>
+          <w:ilvl w:val="0"/>
+          <w:numId w:val="1"/>
+        </w:numPr>
       </w:pPr>
       <w:r>
-        <w:t xml:space="preserve">•  Employee: </w:t>
+        <w:t xml:space="preserve">Employee: </w:t>
       </w:r>
       <w:r>
         <w:rPr>
@@ -7942,10 +7867,13 @@
     </w:p>
     <w:p>
       <w:pPr>
-        <w:ind w:left="360" w:hanging="240"/>
+        <w:numPr>
+          <w:ilvl w:val="0"/>
+          <w:numId w:val="1"/>
+        </w:numPr>
       </w:pPr>
       <w:r>
-        <w:t xml:space="preserve">•  User </w:t>
+        <w:t xml:space="preserve">User </w:t>
       </w:r>
       <w:r>
         <w:rPr>
@@ -7960,10 +7888,13 @@
     </w:p>
     <w:p>
       <w:pPr>
-        <w:ind w:left="360" w:hanging="240"/>
+        <w:numPr>
+          <w:ilvl w:val="0"/>
+          <w:numId w:val="1"/>
+        </w:numPr>
       </w:pPr>
       <w:r>
-        <w:t xml:space="preserve">•  User </w:t>
+        <w:t xml:space="preserve">User </w:t>
       </w:r>
       <w:r>
         <w:rPr>
@@ -7978,10 +7909,13 @@
     </w:p>
     <w:p>
       <w:pPr>
-        <w:ind w:left="360" w:hanging="240"/>
+        <w:numPr>
+          <w:ilvl w:val="0"/>
+          <w:numId w:val="1"/>
+        </w:numPr>
       </w:pPr>
       <w:r>
-        <w:t xml:space="preserve">•  User </w:t>
+        <w:t xml:space="preserve">User </w:t>
       </w:r>
       <w:r>
         <w:rPr>
@@ -8004,10 +7938,13 @@
     </w:p>
     <w:p>
       <w:pPr>
-        <w:ind w:left="360" w:hanging="240"/>
+        <w:numPr>
+          <w:ilvl w:val="0"/>
+          <w:numId w:val="1"/>
+        </w:numPr>
       </w:pPr>
       <w:r>
-        <w:t xml:space="preserve">•  User: </w:t>
+        <w:t xml:space="preserve">User: </w:t>
       </w:r>
       <w:r>
         <w:rPr>
@@ -8019,10 +7956,13 @@
     </w:p>
     <w:p>
       <w:pPr>
-        <w:ind w:left="360" w:hanging="240"/>
+        <w:numPr>
+          <w:ilvl w:val="0"/>
+          <w:numId w:val="1"/>
+        </w:numPr>
       </w:pPr>
       <w:r>
-        <w:t xml:space="preserve">•  LoginSession: </w:t>
+        <w:t xml:space="preserve">LoginSession: </w:t>
       </w:r>
       <w:r>
         <w:rPr>
@@ -8034,10 +7974,13 @@
     </w:p>
     <w:p>
       <w:pPr>
-        <w:ind w:left="360" w:hanging="240"/>
+        <w:numPr>
+          <w:ilvl w:val="0"/>
+          <w:numId w:val="1"/>
+        </w:numPr>
       </w:pPr>
       <w:r>
-        <w:t xml:space="preserve">•  OTP: </w:t>
+        <w:t xml:space="preserve">OTP: </w:t>
       </w:r>
       <w:r>
         <w:rPr>
@@ -8548,10 +8491,13 @@
     </w:p>
     <w:p>
       <w:pPr>
-        <w:ind w:left="360" w:hanging="240"/>
+        <w:numPr>
+          <w:ilvl w:val="0"/>
+          <w:numId w:val="1"/>
+        </w:numPr>
       </w:pPr>
       <w:r>
-        <w:t xml:space="preserve">•  User – MembershipTier (n-1): tblUser có FK </w:t>
+        <w:t xml:space="preserve">User – MembershipTier (n-1): tblUser có FK </w:t>
       </w:r>
       <w:r>
         <w:rPr>
@@ -8563,10 +8509,13 @@
     </w:p>
     <w:p>
       <w:pPr>
-        <w:ind w:left="360" w:hanging="240"/>
+        <w:numPr>
+          <w:ilvl w:val="0"/>
+          <w:numId w:val="1"/>
+        </w:numPr>
       </w:pPr>
       <w:r>
-        <w:t xml:space="preserve">•  User – OTP (1-n): tblOTP có FK </w:t>
+        <w:t xml:space="preserve">User – OTP (1-n): tblOTP có FK </w:t>
       </w:r>
       <w:r>
         <w:rPr>
@@ -8578,10 +8527,13 @@
     </w:p>
     <w:p>
       <w:pPr>
-        <w:ind w:left="360" w:hanging="240"/>
+        <w:numPr>
+          <w:ilvl w:val="0"/>
+          <w:numId w:val="1"/>
+        </w:numPr>
       </w:pPr>
       <w:r>
-        <w:t xml:space="preserve">•  User – LoginSession (1-n): tblLoginSession có FK </w:t>
+        <w:t xml:space="preserve">User – LoginSession (1-n): tblLoginSession có FK </w:t>
       </w:r>
       <w:r>
         <w:rPr>
@@ -8601,10 +8553,13 @@
     </w:p>
     <w:p>
       <w:pPr>
-        <w:ind w:left="360" w:hanging="240"/>
+        <w:numPr>
+          <w:ilvl w:val="0"/>
+          <w:numId w:val="1"/>
+        </w:numPr>
       </w:pPr>
       <w:r>
-        <w:t xml:space="preserve">•  PK: </w:t>
+        <w:t xml:space="preserve">PK: </w:t>
       </w:r>
       <w:r>
         <w:rPr>
@@ -8616,10 +8571,13 @@
     </w:p>
     <w:p>
       <w:pPr>
-        <w:ind w:left="360" w:hanging="240"/>
+        <w:numPr>
+          <w:ilvl w:val="0"/>
+          <w:numId w:val="1"/>
+        </w:numPr>
       </w:pPr>
       <w:r>
-        <w:t xml:space="preserve">•  FK: </w:t>
+        <w:t xml:space="preserve">FK: </w:t>
       </w:r>
       <w:r>
         <w:rPr>
@@ -8990,13 +8948,16 @@
     </w:p>
     <w:p>
       <w:pPr>
-        <w:ind w:left="360" w:hanging="240"/>
+        <w:numPr>
+          <w:ilvl w:val="0"/>
+          <w:numId w:val="1"/>
+        </w:numPr>
       </w:pPr>
       <w:r>
         <w:rPr>
           <w:b/>
         </w:rPr>
-        <w:t>•  a) Đăng nhập</w:t>
+        <w:t>a) Đăng nhập</w:t>
       </w:r>
       <w:r>
         <w:t xml:space="preserve"> =&gt; </w:t>
@@ -9011,38 +8972,50 @@
     </w:p>
     <w:p>
       <w:pPr>
-        <w:ind w:left="720" w:hanging="240"/>
+        <w:numPr>
+          <w:ilvl w:val="1"/>
+          <w:numId w:val="1"/>
+        </w:numPr>
       </w:pPr>
       <w:r>
-        <w:t>◦  Input: username, password</w:t>
+        <w:t>Input: username, password</w:t>
       </w:r>
     </w:p>
     <w:p>
       <w:pPr>
-        <w:ind w:left="720" w:hanging="240"/>
+        <w:numPr>
+          <w:ilvl w:val="1"/>
+          <w:numId w:val="1"/>
+        </w:numPr>
       </w:pPr>
       <w:r>
-        <w:t>◦  Output: boolean</w:t>
+        <w:t>Output: boolean</w:t>
       </w:r>
     </w:p>
     <w:p>
       <w:pPr>
-        <w:ind w:left="720" w:hanging="240"/>
+        <w:numPr>
+          <w:ilvl w:val="1"/>
+          <w:numId w:val="1"/>
+        </w:numPr>
       </w:pPr>
       <w:r>
-        <w:t>◦  Ứng viên tham số vào:</w:t>
+        <w:t>Ứng viên tham số vào:</w:t>
       </w:r>
     </w:p>
     <w:p>
       <w:pPr>
-        <w:ind w:left="1080" w:hanging="240"/>
+        <w:numPr>
+          <w:ilvl w:val="2"/>
+          <w:numId w:val="1"/>
+        </w:numPr>
       </w:pPr>
       <w:r>
         <w:rPr>
           <w:rFonts w:ascii="Courier New" w:hAnsi="Courier New"/>
           <w:sz w:val="20"/>
         </w:rPr>
-        <w:t>▪  checkLogin()</w:t>
+        <w:t>checkLogin()</w:t>
       </w:r>
       <w:r>
         <w:t xml:space="preserve"> → chọn (gom nhóm tham số)</w:t>
@@ -9050,22 +9023,28 @@
     </w:p>
     <w:p>
       <w:pPr>
-        <w:ind w:left="720" w:hanging="240"/>
+        <w:numPr>
+          <w:ilvl w:val="1"/>
+          <w:numId w:val="1"/>
+        </w:numPr>
       </w:pPr>
       <w:r>
-        <w:t>◦  Ứng viên tham số ra:</w:t>
+        <w:t>Ứng viên tham số ra:</w:t>
       </w:r>
     </w:p>
     <w:p>
       <w:pPr>
-        <w:ind w:left="1080" w:hanging="240"/>
+        <w:numPr>
+          <w:ilvl w:val="2"/>
+          <w:numId w:val="1"/>
+        </w:numPr>
       </w:pPr>
       <w:r>
         <w:rPr>
           <w:rFonts w:ascii="Courier New" w:hAnsi="Courier New"/>
           <w:sz w:val="20"/>
         </w:rPr>
-        <w:t>▪  checkLogin(): void</w:t>
+        <w:t>checkLogin(): void</w:t>
       </w:r>
       <w:r>
         <w:t xml:space="preserve"> → loại (cần trả về kết quả xác thực)</w:t>
@@ -9073,14 +9052,17 @@
     </w:p>
     <w:p>
       <w:pPr>
-        <w:ind w:left="1080" w:hanging="240"/>
+        <w:numPr>
+          <w:ilvl w:val="2"/>
+          <w:numId w:val="1"/>
+        </w:numPr>
       </w:pPr>
       <w:r>
         <w:rPr>
           <w:rFonts w:ascii="Courier New" w:hAnsi="Courier New"/>
           <w:sz w:val="20"/>
         </w:rPr>
-        <w:t>▪  checkLogin(): boolean</w:t>
+        <w:t>checkLogin(): boolean</w:t>
       </w:r>
       <w:r>
         <w:t xml:space="preserve"> → chọn (trả về true/false xác thực thành công)</w:t>
@@ -9088,13 +9070,16 @@
     </w:p>
     <w:p>
       <w:pPr>
-        <w:ind w:left="360" w:hanging="240"/>
+        <w:numPr>
+          <w:ilvl w:val="0"/>
+          <w:numId w:val="1"/>
+        </w:numPr>
       </w:pPr>
       <w:r>
         <w:rPr>
           <w:b/>
         </w:rPr>
-        <w:t>•  b) Đăng ký</w:t>
+        <w:t>b) Đăng ký</w:t>
       </w:r>
       <w:r>
         <w:t xml:space="preserve"> =&gt; </w:t>
@@ -9109,38 +9094,50 @@
     </w:p>
     <w:p>
       <w:pPr>
-        <w:ind w:left="720" w:hanging="240"/>
+        <w:numPr>
+          <w:ilvl w:val="1"/>
+          <w:numId w:val="1"/>
+        </w:numPr>
       </w:pPr>
       <w:r>
-        <w:t>◦  Input: hoTen, sdt, email, matKhau</w:t>
+        <w:t>Input: hoTen, sdt, email, matKhau</w:t>
       </w:r>
     </w:p>
     <w:p>
       <w:pPr>
-        <w:ind w:left="720" w:hanging="240"/>
+        <w:numPr>
+          <w:ilvl w:val="1"/>
+          <w:numId w:val="1"/>
+        </w:numPr>
       </w:pPr>
       <w:r>
-        <w:t>◦  Output: User (vừa tạo)</w:t>
+        <w:t>Output: User (vừa tạo)</w:t>
       </w:r>
     </w:p>
     <w:p>
       <w:pPr>
-        <w:ind w:left="720" w:hanging="240"/>
+        <w:numPr>
+          <w:ilvl w:val="1"/>
+          <w:numId w:val="1"/>
+        </w:numPr>
       </w:pPr>
       <w:r>
-        <w:t>◦  Ứng viên tham số vào:</w:t>
+        <w:t>Ứng viên tham số vào:</w:t>
       </w:r>
     </w:p>
     <w:p>
       <w:pPr>
-        <w:ind w:left="1080" w:hanging="240"/>
+        <w:numPr>
+          <w:ilvl w:val="2"/>
+          <w:numId w:val="1"/>
+        </w:numPr>
       </w:pPr>
       <w:r>
         <w:rPr>
           <w:rFonts w:ascii="Courier New" w:hAnsi="Courier New"/>
           <w:sz w:val="20"/>
         </w:rPr>
-        <w:t>▪  register()</w:t>
+        <w:t>register()</w:t>
       </w:r>
       <w:r>
         <w:t xml:space="preserve"> → chọn</w:t>
@@ -9148,22 +9145,28 @@
     </w:p>
     <w:p>
       <w:pPr>
-        <w:ind w:left="720" w:hanging="240"/>
+        <w:numPr>
+          <w:ilvl w:val="1"/>
+          <w:numId w:val="1"/>
+        </w:numPr>
       </w:pPr>
       <w:r>
-        <w:t>◦  Ứng viên tham số ra:</w:t>
+        <w:t>Ứng viên tham số ra:</w:t>
       </w:r>
     </w:p>
     <w:p>
       <w:pPr>
-        <w:ind w:left="1080" w:hanging="240"/>
+        <w:numPr>
+          <w:ilvl w:val="2"/>
+          <w:numId w:val="1"/>
+        </w:numPr>
       </w:pPr>
       <w:r>
         <w:rPr>
           <w:rFonts w:ascii="Courier New" w:hAnsi="Courier New"/>
           <w:sz w:val="20"/>
         </w:rPr>
-        <w:t>▪  register(): User</w:t>
+        <w:t>register(): User</w:t>
       </w:r>
       <w:r>
         <w:t xml:space="preserve"> → chọn</w:t>
@@ -9171,13 +9174,16 @@
     </w:p>
     <w:p>
       <w:pPr>
-        <w:ind w:left="360" w:hanging="240"/>
+        <w:numPr>
+          <w:ilvl w:val="0"/>
+          <w:numId w:val="1"/>
+        </w:numPr>
       </w:pPr>
       <w:r>
         <w:rPr>
           <w:b/>
         </w:rPr>
-        <w:t>•  c) Xác minh OTP</w:t>
+        <w:t>c) Xác minh OTP</w:t>
       </w:r>
       <w:r>
         <w:t xml:space="preserve"> =&gt; </w:t>
@@ -9192,38 +9198,50 @@
     </w:p>
     <w:p>
       <w:pPr>
-        <w:ind w:left="720" w:hanging="240"/>
+        <w:numPr>
+          <w:ilvl w:val="1"/>
+          <w:numId w:val="1"/>
+        </w:numPr>
       </w:pPr>
       <w:r>
-        <w:t>◦  Input: otp</w:t>
+        <w:t>Input: otp</w:t>
       </w:r>
     </w:p>
     <w:p>
       <w:pPr>
-        <w:ind w:left="720" w:hanging="240"/>
+        <w:numPr>
+          <w:ilvl w:val="1"/>
+          <w:numId w:val="1"/>
+        </w:numPr>
       </w:pPr>
       <w:r>
-        <w:t>◦  Output: boolean</w:t>
+        <w:t>Output: boolean</w:t>
       </w:r>
     </w:p>
     <w:p>
       <w:pPr>
-        <w:ind w:left="720" w:hanging="240"/>
+        <w:numPr>
+          <w:ilvl w:val="1"/>
+          <w:numId w:val="1"/>
+        </w:numPr>
       </w:pPr>
       <w:r>
-        <w:t>◦  Ứng viên tham số vào:</w:t>
+        <w:t>Ứng viên tham số vào:</w:t>
       </w:r>
     </w:p>
     <w:p>
       <w:pPr>
-        <w:ind w:left="1080" w:hanging="240"/>
+        <w:numPr>
+          <w:ilvl w:val="2"/>
+          <w:numId w:val="1"/>
+        </w:numPr>
       </w:pPr>
       <w:r>
         <w:rPr>
           <w:rFonts w:ascii="Courier New" w:hAnsi="Courier New"/>
           <w:sz w:val="20"/>
         </w:rPr>
-        <w:t>▪  verifyOTP()</w:t>
+        <w:t>verifyOTP()</w:t>
       </w:r>
       <w:r>
         <w:t xml:space="preserve"> → chọn</w:t>
@@ -9231,22 +9249,28 @@
     </w:p>
     <w:p>
       <w:pPr>
-        <w:ind w:left="720" w:hanging="240"/>
+        <w:numPr>
+          <w:ilvl w:val="1"/>
+          <w:numId w:val="1"/>
+        </w:numPr>
       </w:pPr>
       <w:r>
-        <w:t>◦  Ứng viên tham số ra:</w:t>
+        <w:t>Ứng viên tham số ra:</w:t>
       </w:r>
     </w:p>
     <w:p>
       <w:pPr>
-        <w:ind w:left="1080" w:hanging="240"/>
+        <w:numPr>
+          <w:ilvl w:val="2"/>
+          <w:numId w:val="1"/>
+        </w:numPr>
       </w:pPr>
       <w:r>
         <w:rPr>
           <w:rFonts w:ascii="Courier New" w:hAnsi="Courier New"/>
           <w:sz w:val="20"/>
         </w:rPr>
-        <w:t>▪  verifyOTP(): boolean</w:t>
+        <w:t>verifyOTP(): boolean</w:t>
       </w:r>
       <w:r>
         <w:t xml:space="preserve"> → chọn (cần biết đúng/sai)</w:t>
@@ -9254,13 +9278,16 @@
     </w:p>
     <w:p>
       <w:pPr>
-        <w:ind w:left="360" w:hanging="240"/>
+        <w:numPr>
+          <w:ilvl w:val="0"/>
+          <w:numId w:val="1"/>
+        </w:numPr>
       </w:pPr>
       <w:r>
         <w:rPr>
           <w:b/>
         </w:rPr>
-        <w:t>•  d) Đổi mật khẩu</w:t>
+        <w:t>d) Đổi mật khẩu</w:t>
       </w:r>
       <w:r>
         <w:t xml:space="preserve"> =&gt; </w:t>
@@ -9275,38 +9302,50 @@
     </w:p>
     <w:p>
       <w:pPr>
-        <w:ind w:left="720" w:hanging="240"/>
+        <w:numPr>
+          <w:ilvl w:val="1"/>
+          <w:numId w:val="1"/>
+        </w:numPr>
       </w:pPr>
       <w:r>
-        <w:t>◦  Input: mkHienTai, mkMoi</w:t>
+        <w:t>Input: mkHienTai, mkMoi</w:t>
       </w:r>
     </w:p>
     <w:p>
       <w:pPr>
-        <w:ind w:left="720" w:hanging="240"/>
+        <w:numPr>
+          <w:ilvl w:val="1"/>
+          <w:numId w:val="1"/>
+        </w:numPr>
       </w:pPr>
       <w:r>
-        <w:t>◦  Output: boolean</w:t>
+        <w:t>Output: boolean</w:t>
       </w:r>
     </w:p>
     <w:p>
       <w:pPr>
-        <w:ind w:left="720" w:hanging="240"/>
+        <w:numPr>
+          <w:ilvl w:val="1"/>
+          <w:numId w:val="1"/>
+        </w:numPr>
       </w:pPr>
       <w:r>
-        <w:t>◦  Ứng viên tham số vào:</w:t>
+        <w:t>Ứng viên tham số vào:</w:t>
       </w:r>
     </w:p>
     <w:p>
       <w:pPr>
-        <w:ind w:left="1080" w:hanging="240"/>
+        <w:numPr>
+          <w:ilvl w:val="2"/>
+          <w:numId w:val="1"/>
+        </w:numPr>
       </w:pPr>
       <w:r>
         <w:rPr>
           <w:rFonts w:ascii="Courier New" w:hAnsi="Courier New"/>
           <w:sz w:val="20"/>
         </w:rPr>
-        <w:t>▪  changePassword()</w:t>
+        <w:t>changePassword()</w:t>
       </w:r>
       <w:r>
         <w:t xml:space="preserve"> → chọn</w:t>
@@ -9314,22 +9353,28 @@
     </w:p>
     <w:p>
       <w:pPr>
-        <w:ind w:left="720" w:hanging="240"/>
+        <w:numPr>
+          <w:ilvl w:val="1"/>
+          <w:numId w:val="1"/>
+        </w:numPr>
       </w:pPr>
       <w:r>
-        <w:t>◦  Ứng viên tham số ra:</w:t>
+        <w:t>Ứng viên tham số ra:</w:t>
       </w:r>
     </w:p>
     <w:p>
       <w:pPr>
-        <w:ind w:left="1080" w:hanging="240"/>
+        <w:numPr>
+          <w:ilvl w:val="2"/>
+          <w:numId w:val="1"/>
+        </w:numPr>
       </w:pPr>
       <w:r>
         <w:rPr>
           <w:rFonts w:ascii="Courier New" w:hAnsi="Courier New"/>
           <w:sz w:val="20"/>
         </w:rPr>
-        <w:t>▪  changePassword(): boolean</w:t>
+        <w:t>changePassword(): boolean</w:t>
       </w:r>
       <w:r>
         <w:t xml:space="preserve"> → chọn</w:t>
@@ -9337,13 +9382,16 @@
     </w:p>
     <w:p>
       <w:pPr>
-        <w:ind w:left="360" w:hanging="240"/>
+        <w:numPr>
+          <w:ilvl w:val="0"/>
+          <w:numId w:val="1"/>
+        </w:numPr>
       </w:pPr>
       <w:r>
         <w:rPr>
           <w:b/>
         </w:rPr>
-        <w:t>•  e) Xem hồ sơ</w:t>
+        <w:t>e) Xem hồ sơ</w:t>
       </w:r>
       <w:r>
         <w:t xml:space="preserve"> =&gt; </w:t>
@@ -9358,38 +9406,50 @@
     </w:p>
     <w:p>
       <w:pPr>
-        <w:ind w:left="720" w:hanging="240"/>
+        <w:numPr>
+          <w:ilvl w:val="1"/>
+          <w:numId w:val="1"/>
+        </w:numPr>
       </w:pPr>
       <w:r>
-        <w:t>◦  Input: userId</w:t>
+        <w:t>Input: userId</w:t>
       </w:r>
     </w:p>
     <w:p>
       <w:pPr>
-        <w:ind w:left="720" w:hanging="240"/>
+        <w:numPr>
+          <w:ilvl w:val="1"/>
+          <w:numId w:val="1"/>
+        </w:numPr>
       </w:pPr>
       <w:r>
-        <w:t>◦  Output: User</w:t>
+        <w:t>Output: User</w:t>
       </w:r>
     </w:p>
     <w:p>
       <w:pPr>
-        <w:ind w:left="720" w:hanging="240"/>
+        <w:numPr>
+          <w:ilvl w:val="1"/>
+          <w:numId w:val="1"/>
+        </w:numPr>
       </w:pPr>
       <w:r>
-        <w:t>◦  Ứng viên tham số vào:</w:t>
+        <w:t>Ứng viên tham số vào:</w:t>
       </w:r>
     </w:p>
     <w:p>
       <w:pPr>
-        <w:ind w:left="1080" w:hanging="240"/>
+        <w:numPr>
+          <w:ilvl w:val="2"/>
+          <w:numId w:val="1"/>
+        </w:numPr>
       </w:pPr>
       <w:r>
         <w:rPr>
           <w:rFonts w:ascii="Courier New" w:hAnsi="Courier New"/>
           <w:sz w:val="20"/>
         </w:rPr>
-        <w:t>▪  getProfile()</w:t>
+        <w:t>getProfile()</w:t>
       </w:r>
       <w:r>
         <w:t xml:space="preserve"> → chọn</w:t>
@@ -9397,22 +9457,28 @@
     </w:p>
     <w:p>
       <w:pPr>
-        <w:ind w:left="720" w:hanging="240"/>
+        <w:numPr>
+          <w:ilvl w:val="1"/>
+          <w:numId w:val="1"/>
+        </w:numPr>
       </w:pPr>
       <w:r>
-        <w:t>◦  Ứng viên tham số ra:</w:t>
+        <w:t>Ứng viên tham số ra:</w:t>
       </w:r>
     </w:p>
     <w:p>
       <w:pPr>
-        <w:ind w:left="1080" w:hanging="240"/>
+        <w:numPr>
+          <w:ilvl w:val="2"/>
+          <w:numId w:val="1"/>
+        </w:numPr>
       </w:pPr>
       <w:r>
         <w:rPr>
           <w:rFonts w:ascii="Courier New" w:hAnsi="Courier New"/>
           <w:sz w:val="20"/>
         </w:rPr>
-        <w:t>▪  getProfile(): User</w:t>
+        <w:t>getProfile(): User</w:t>
       </w:r>
       <w:r>
         <w:t xml:space="preserve"> → chọn</w:t>
@@ -9420,13 +9486,16 @@
     </w:p>
     <w:p>
       <w:pPr>
-        <w:ind w:left="360" w:hanging="240"/>
+        <w:numPr>
+          <w:ilvl w:val="0"/>
+          <w:numId w:val="1"/>
+        </w:numPr>
       </w:pPr>
       <w:r>
         <w:rPr>
           <w:b/>
         </w:rPr>
-        <w:t>•  f) Cập nhật hồ sơ</w:t>
+        <w:t>f) Cập nhật hồ sơ</w:t>
       </w:r>
       <w:r>
         <w:t xml:space="preserve"> =&gt; </w:t>
@@ -9441,38 +9510,50 @@
     </w:p>
     <w:p>
       <w:pPr>
-        <w:ind w:left="720" w:hanging="240"/>
+        <w:numPr>
+          <w:ilvl w:val="1"/>
+          <w:numId w:val="1"/>
+        </w:numPr>
       </w:pPr>
       <w:r>
-        <w:t>◦  Input: userId, hoTen, email</w:t>
+        <w:t>Input: userId, hoTen, email</w:t>
       </w:r>
     </w:p>
     <w:p>
       <w:pPr>
-        <w:ind w:left="720" w:hanging="240"/>
+        <w:numPr>
+          <w:ilvl w:val="1"/>
+          <w:numId w:val="1"/>
+        </w:numPr>
       </w:pPr>
       <w:r>
-        <w:t>◦  Output: User</w:t>
+        <w:t>Output: User</w:t>
       </w:r>
     </w:p>
     <w:p>
       <w:pPr>
-        <w:ind w:left="720" w:hanging="240"/>
+        <w:numPr>
+          <w:ilvl w:val="1"/>
+          <w:numId w:val="1"/>
+        </w:numPr>
       </w:pPr>
       <w:r>
-        <w:t>◦  Ứng viên tham số vào:</w:t>
+        <w:t>Ứng viên tham số vào:</w:t>
       </w:r>
     </w:p>
     <w:p>
       <w:pPr>
-        <w:ind w:left="1080" w:hanging="240"/>
+        <w:numPr>
+          <w:ilvl w:val="2"/>
+          <w:numId w:val="1"/>
+        </w:numPr>
       </w:pPr>
       <w:r>
         <w:rPr>
           <w:rFonts w:ascii="Courier New" w:hAnsi="Courier New"/>
           <w:sz w:val="20"/>
         </w:rPr>
-        <w:t>▪  updateProfile()</w:t>
+        <w:t>updateProfile()</w:t>
       </w:r>
       <w:r>
         <w:t xml:space="preserve"> → chọn</w:t>
@@ -9480,22 +9561,28 @@
     </w:p>
     <w:p>
       <w:pPr>
-        <w:ind w:left="720" w:hanging="240"/>
+        <w:numPr>
+          <w:ilvl w:val="1"/>
+          <w:numId w:val="1"/>
+        </w:numPr>
       </w:pPr>
       <w:r>
-        <w:t>◦  Ứng viên tham số ra:</w:t>
+        <w:t>Ứng viên tham số ra:</w:t>
       </w:r>
     </w:p>
     <w:p>
       <w:pPr>
-        <w:ind w:left="1080" w:hanging="240"/>
+        <w:numPr>
+          <w:ilvl w:val="2"/>
+          <w:numId w:val="1"/>
+        </w:numPr>
       </w:pPr>
       <w:r>
         <w:rPr>
           <w:rFonts w:ascii="Courier New" w:hAnsi="Courier New"/>
           <w:sz w:val="20"/>
         </w:rPr>
-        <w:t>▪  updateProfile(): User</w:t>
+        <w:t>updateProfile(): User</w:t>
       </w:r>
       <w:r>
         <w:t xml:space="preserve"> → chọn</w:t>
@@ -9503,13 +9590,16 @@
     </w:p>
     <w:p>
       <w:pPr>
-        <w:ind w:left="360" w:hanging="240"/>
+        <w:numPr>
+          <w:ilvl w:val="0"/>
+          <w:numId w:val="1"/>
+        </w:numPr>
       </w:pPr>
       <w:r>
         <w:rPr>
           <w:b/>
         </w:rPr>
-        <w:t>•  g) Xem danh sách NV</w:t>
+        <w:t>g) Xem danh sách NV</w:t>
       </w:r>
       <w:r>
         <w:t xml:space="preserve"> =&gt; </w:t>
@@ -9524,38 +9614,50 @@
     </w:p>
     <w:p>
       <w:pPr>
-        <w:ind w:left="720" w:hanging="240"/>
+        <w:numPr>
+          <w:ilvl w:val="1"/>
+          <w:numId w:val="1"/>
+        </w:numPr>
       </w:pPr>
       <w:r>
-        <w:t>◦  Input: (không có)</w:t>
+        <w:t>Input: (không có)</w:t>
       </w:r>
     </w:p>
     <w:p>
       <w:pPr>
-        <w:ind w:left="720" w:hanging="240"/>
+        <w:numPr>
+          <w:ilvl w:val="1"/>
+          <w:numId w:val="1"/>
+        </w:numPr>
       </w:pPr>
       <w:r>
-        <w:t>◦  Output: List\&lt;Employee\&gt;</w:t>
+        <w:t>Output: List\&lt;Employee\&gt;</w:t>
       </w:r>
     </w:p>
     <w:p>
       <w:pPr>
-        <w:ind w:left="720" w:hanging="240"/>
+        <w:numPr>
+          <w:ilvl w:val="1"/>
+          <w:numId w:val="1"/>
+        </w:numPr>
       </w:pPr>
       <w:r>
-        <w:t>◦  Ứng viên tham số vào:</w:t>
+        <w:t>Ứng viên tham số vào:</w:t>
       </w:r>
     </w:p>
     <w:p>
       <w:pPr>
-        <w:ind w:left="1080" w:hanging="240"/>
+        <w:numPr>
+          <w:ilvl w:val="2"/>
+          <w:numId w:val="1"/>
+        </w:numPr>
       </w:pPr>
       <w:r>
         <w:rPr>
           <w:rFonts w:ascii="Courier New" w:hAnsi="Courier New"/>
           <w:sz w:val="20"/>
         </w:rPr>
-        <w:t>▪  getAllStaff()</w:t>
+        <w:t>getAllStaff()</w:t>
       </w:r>
       <w:r>
         <w:t xml:space="preserve"> → chọn</w:t>
@@ -9563,22 +9665,28 @@
     </w:p>
     <w:p>
       <w:pPr>
-        <w:ind w:left="720" w:hanging="240"/>
+        <w:numPr>
+          <w:ilvl w:val="1"/>
+          <w:numId w:val="1"/>
+        </w:numPr>
       </w:pPr>
       <w:r>
-        <w:t>◦  Ứng viên tham số ra:</w:t>
+        <w:t>Ứng viên tham số ra:</w:t>
       </w:r>
     </w:p>
     <w:p>
       <w:pPr>
-        <w:ind w:left="1080" w:hanging="240"/>
+        <w:numPr>
+          <w:ilvl w:val="2"/>
+          <w:numId w:val="1"/>
+        </w:numPr>
       </w:pPr>
       <w:r>
         <w:rPr>
           <w:rFonts w:ascii="Courier New" w:hAnsi="Courier New"/>
           <w:sz w:val="20"/>
         </w:rPr>
-        <w:t>▪  getAllStaff(): List&lt;Employee&gt;</w:t>
+        <w:t>getAllStaff(): List&lt;Employee&gt;</w:t>
       </w:r>
       <w:r>
         <w:t xml:space="preserve"> → chọn</w:t>
@@ -9586,13 +9694,16 @@
     </w:p>
     <w:p>
       <w:pPr>
-        <w:ind w:left="360" w:hanging="240"/>
+        <w:numPr>
+          <w:ilvl w:val="0"/>
+          <w:numId w:val="1"/>
+        </w:numPr>
       </w:pPr>
       <w:r>
         <w:rPr>
           <w:b/>
         </w:rPr>
-        <w:t>•  h) Tìm kiếm NV</w:t>
+        <w:t>h) Tìm kiếm NV</w:t>
       </w:r>
       <w:r>
         <w:t xml:space="preserve"> =&gt; </w:t>
@@ -9607,38 +9718,50 @@
     </w:p>
     <w:p>
       <w:pPr>
-        <w:ind w:left="720" w:hanging="240"/>
+        <w:numPr>
+          <w:ilvl w:val="1"/>
+          <w:numId w:val="1"/>
+        </w:numPr>
       </w:pPr>
       <w:r>
-        <w:t>◦  Input: keyword</w:t>
+        <w:t>Input: keyword</w:t>
       </w:r>
     </w:p>
     <w:p>
       <w:pPr>
-        <w:ind w:left="720" w:hanging="240"/>
+        <w:numPr>
+          <w:ilvl w:val="1"/>
+          <w:numId w:val="1"/>
+        </w:numPr>
       </w:pPr>
       <w:r>
-        <w:t>◦  Output: List\&lt;Employee\&gt;</w:t>
+        <w:t>Output: List\&lt;Employee\&gt;</w:t>
       </w:r>
     </w:p>
     <w:p>
       <w:pPr>
-        <w:ind w:left="720" w:hanging="240"/>
+        <w:numPr>
+          <w:ilvl w:val="1"/>
+          <w:numId w:val="1"/>
+        </w:numPr>
       </w:pPr>
       <w:r>
-        <w:t>◦  Ứng viên tham số vào:</w:t>
+        <w:t>Ứng viên tham số vào:</w:t>
       </w:r>
     </w:p>
     <w:p>
       <w:pPr>
-        <w:ind w:left="1080" w:hanging="240"/>
+        <w:numPr>
+          <w:ilvl w:val="2"/>
+          <w:numId w:val="1"/>
+        </w:numPr>
       </w:pPr>
       <w:r>
         <w:rPr>
           <w:rFonts w:ascii="Courier New" w:hAnsi="Courier New"/>
           <w:sz w:val="20"/>
         </w:rPr>
-        <w:t>▪  searchStaff(keyword: String)</w:t>
+        <w:t>searchStaff(keyword: String)</w:t>
       </w:r>
       <w:r>
         <w:t xml:space="preserve"> → chọn</w:t>
@@ -9646,22 +9769,28 @@
     </w:p>
     <w:p>
       <w:pPr>
-        <w:ind w:left="720" w:hanging="240"/>
+        <w:numPr>
+          <w:ilvl w:val="1"/>
+          <w:numId w:val="1"/>
+        </w:numPr>
       </w:pPr>
       <w:r>
-        <w:t>◦  Ứng viên tham số ra:</w:t>
+        <w:t>Ứng viên tham số ra:</w:t>
       </w:r>
     </w:p>
     <w:p>
       <w:pPr>
-        <w:ind w:left="1080" w:hanging="240"/>
+        <w:numPr>
+          <w:ilvl w:val="2"/>
+          <w:numId w:val="1"/>
+        </w:numPr>
       </w:pPr>
       <w:r>
         <w:rPr>
           <w:rFonts w:ascii="Courier New" w:hAnsi="Courier New"/>
           <w:sz w:val="20"/>
         </w:rPr>
-        <w:t>▪  searchStaff(): List&lt;Employee&gt;</w:t>
+        <w:t>searchStaff(): List&lt;Employee&gt;</w:t>
       </w:r>
       <w:r>
         <w:t xml:space="preserve"> → chọn</w:t>
@@ -9669,13 +9798,16 @@
     </w:p>
     <w:p>
       <w:pPr>
-        <w:ind w:left="360" w:hanging="240"/>
+        <w:numPr>
+          <w:ilvl w:val="0"/>
+          <w:numId w:val="1"/>
+        </w:numPr>
       </w:pPr>
       <w:r>
         <w:rPr>
           <w:b/>
         </w:rPr>
-        <w:t>•  i) Lấy NV theo id</w:t>
+        <w:t>i) Lấy NV theo id</w:t>
       </w:r>
       <w:r>
         <w:t xml:space="preserve"> =&gt; </w:t>
@@ -9690,38 +9822,50 @@
     </w:p>
     <w:p>
       <w:pPr>
-        <w:ind w:left="720" w:hanging="240"/>
+        <w:numPr>
+          <w:ilvl w:val="1"/>
+          <w:numId w:val="1"/>
+        </w:numPr>
       </w:pPr>
       <w:r>
-        <w:t>◦  Input: id</w:t>
+        <w:t>Input: id</w:t>
       </w:r>
     </w:p>
     <w:p>
       <w:pPr>
-        <w:ind w:left="720" w:hanging="240"/>
+        <w:numPr>
+          <w:ilvl w:val="1"/>
+          <w:numId w:val="1"/>
+        </w:numPr>
       </w:pPr>
       <w:r>
-        <w:t>◦  Output: Employee</w:t>
+        <w:t>Output: Employee</w:t>
       </w:r>
     </w:p>
     <w:p>
       <w:pPr>
-        <w:ind w:left="720" w:hanging="240"/>
+        <w:numPr>
+          <w:ilvl w:val="1"/>
+          <w:numId w:val="1"/>
+        </w:numPr>
       </w:pPr>
       <w:r>
-        <w:t>◦  Ứng viên tham số vào:</w:t>
+        <w:t>Ứng viên tham số vào:</w:t>
       </w:r>
     </w:p>
     <w:p>
       <w:pPr>
-        <w:ind w:left="1080" w:hanging="240"/>
+        <w:numPr>
+          <w:ilvl w:val="2"/>
+          <w:numId w:val="1"/>
+        </w:numPr>
       </w:pPr>
       <w:r>
         <w:rPr>
           <w:rFonts w:ascii="Courier New" w:hAnsi="Courier New"/>
           <w:sz w:val="20"/>
         </w:rPr>
-        <w:t>▪  getStaffById(id: int)</w:t>
+        <w:t>getStaffById(id: int)</w:t>
       </w:r>
       <w:r>
         <w:t xml:space="preserve"> → chọn</w:t>
@@ -9729,22 +9873,28 @@
     </w:p>
     <w:p>
       <w:pPr>
-        <w:ind w:left="720" w:hanging="240"/>
+        <w:numPr>
+          <w:ilvl w:val="1"/>
+          <w:numId w:val="1"/>
+        </w:numPr>
       </w:pPr>
       <w:r>
-        <w:t>◦  Ứng viên tham số ra:</w:t>
+        <w:t>Ứng viên tham số ra:</w:t>
       </w:r>
     </w:p>
     <w:p>
       <w:pPr>
-        <w:ind w:left="1080" w:hanging="240"/>
+        <w:numPr>
+          <w:ilvl w:val="2"/>
+          <w:numId w:val="1"/>
+        </w:numPr>
       </w:pPr>
       <w:r>
         <w:rPr>
           <w:rFonts w:ascii="Courier New" w:hAnsi="Courier New"/>
           <w:sz w:val="20"/>
         </w:rPr>
-        <w:t>▪  getStaffById(): Employee</w:t>
+        <w:t>getStaffById(): Employee</w:t>
       </w:r>
       <w:r>
         <w:t xml:space="preserve"> → chọn</w:t>
@@ -9752,13 +9902,16 @@
     </w:p>
     <w:p>
       <w:pPr>
-        <w:ind w:left="360" w:hanging="240"/>
+        <w:numPr>
+          <w:ilvl w:val="0"/>
+          <w:numId w:val="1"/>
+        </w:numPr>
       </w:pPr>
       <w:r>
         <w:rPr>
           <w:b/>
         </w:rPr>
-        <w:t>•  j) Thêm NV</w:t>
+        <w:t>j) Thêm NV</w:t>
       </w:r>
       <w:r>
         <w:t xml:space="preserve"> =&gt; </w:t>
@@ -9773,38 +9926,50 @@
     </w:p>
     <w:p>
       <w:pPr>
-        <w:ind w:left="720" w:hanging="240"/>
+        <w:numPr>
+          <w:ilvl w:val="1"/>
+          <w:numId w:val="1"/>
+        </w:numPr>
       </w:pPr>
       <w:r>
-        <w:t>◦  Input: employee</w:t>
+        <w:t>Input: employee</w:t>
       </w:r>
     </w:p>
     <w:p>
       <w:pPr>
-        <w:ind w:left="720" w:hanging="240"/>
+        <w:numPr>
+          <w:ilvl w:val="1"/>
+          <w:numId w:val="1"/>
+        </w:numPr>
       </w:pPr>
       <w:r>
-        <w:t>◦  Output: boolean</w:t>
+        <w:t>Output: boolean</w:t>
       </w:r>
     </w:p>
     <w:p>
       <w:pPr>
-        <w:ind w:left="720" w:hanging="240"/>
+        <w:numPr>
+          <w:ilvl w:val="1"/>
+          <w:numId w:val="1"/>
+        </w:numPr>
       </w:pPr>
       <w:r>
-        <w:t>◦  Ứng viên tham số vào:</w:t>
+        <w:t>Ứng viên tham số vào:</w:t>
       </w:r>
     </w:p>
     <w:p>
       <w:pPr>
-        <w:ind w:left="1080" w:hanging="240"/>
+        <w:numPr>
+          <w:ilvl w:val="2"/>
+          <w:numId w:val="1"/>
+        </w:numPr>
       </w:pPr>
       <w:r>
         <w:rPr>
           <w:rFonts w:ascii="Courier New" w:hAnsi="Courier New"/>
           <w:sz w:val="20"/>
         </w:rPr>
-        <w:t>▪  saveStaff(employee: Employee)</w:t>
+        <w:t>saveStaff(employee: Employee)</w:t>
       </w:r>
       <w:r>
         <w:t xml:space="preserve"> → chọn</w:t>
@@ -9812,22 +9977,28 @@
     </w:p>
     <w:p>
       <w:pPr>
-        <w:ind w:left="720" w:hanging="240"/>
+        <w:numPr>
+          <w:ilvl w:val="1"/>
+          <w:numId w:val="1"/>
+        </w:numPr>
       </w:pPr>
       <w:r>
-        <w:t>◦  Ứng viên tham số ra:</w:t>
+        <w:t>Ứng viên tham số ra:</w:t>
       </w:r>
     </w:p>
     <w:p>
       <w:pPr>
-        <w:ind w:left="1080" w:hanging="240"/>
+        <w:numPr>
+          <w:ilvl w:val="2"/>
+          <w:numId w:val="1"/>
+        </w:numPr>
       </w:pPr>
       <w:r>
         <w:rPr>
           <w:rFonts w:ascii="Courier New" w:hAnsi="Courier New"/>
           <w:sz w:val="20"/>
         </w:rPr>
-        <w:t>▪  saveStaff(): boolean</w:t>
+        <w:t>saveStaff(): boolean</w:t>
       </w:r>
       <w:r>
         <w:t xml:space="preserve"> → chọn (cần biết thành công/thất bại)</w:t>
@@ -9835,13 +10006,16 @@
     </w:p>
     <w:p>
       <w:pPr>
-        <w:ind w:left="360" w:hanging="240"/>
+        <w:numPr>
+          <w:ilvl w:val="0"/>
+          <w:numId w:val="1"/>
+        </w:numPr>
       </w:pPr>
       <w:r>
         <w:rPr>
           <w:b/>
         </w:rPr>
-        <w:t>•  k) Sửa NV</w:t>
+        <w:t>k) Sửa NV</w:t>
       </w:r>
       <w:r>
         <w:t xml:space="preserve"> =&gt; </w:t>
@@ -9856,38 +10030,50 @@
     </w:p>
     <w:p>
       <w:pPr>
-        <w:ind w:left="720" w:hanging="240"/>
+        <w:numPr>
+          <w:ilvl w:val="1"/>
+          <w:numId w:val="1"/>
+        </w:numPr>
       </w:pPr>
       <w:r>
-        <w:t>◦  Input: employee</w:t>
+        <w:t>Input: employee</w:t>
       </w:r>
     </w:p>
     <w:p>
       <w:pPr>
-        <w:ind w:left="720" w:hanging="240"/>
+        <w:numPr>
+          <w:ilvl w:val="1"/>
+          <w:numId w:val="1"/>
+        </w:numPr>
       </w:pPr>
       <w:r>
-        <w:t>◦  Output: boolean</w:t>
+        <w:t>Output: boolean</w:t>
       </w:r>
     </w:p>
     <w:p>
       <w:pPr>
-        <w:ind w:left="720" w:hanging="240"/>
+        <w:numPr>
+          <w:ilvl w:val="1"/>
+          <w:numId w:val="1"/>
+        </w:numPr>
       </w:pPr>
       <w:r>
-        <w:t>◦  Ứng viên tham số vào:</w:t>
+        <w:t>Ứng viên tham số vào:</w:t>
       </w:r>
     </w:p>
     <w:p>
       <w:pPr>
-        <w:ind w:left="1080" w:hanging="240"/>
+        <w:numPr>
+          <w:ilvl w:val="2"/>
+          <w:numId w:val="1"/>
+        </w:numPr>
       </w:pPr>
       <w:r>
         <w:rPr>
           <w:rFonts w:ascii="Courier New" w:hAnsi="Courier New"/>
           <w:sz w:val="20"/>
         </w:rPr>
-        <w:t>▪  updateStaff()</w:t>
+        <w:t>updateStaff()</w:t>
       </w:r>
       <w:r>
         <w:t xml:space="preserve"> → chọn</w:t>
@@ -9895,22 +10081,28 @@
     </w:p>
     <w:p>
       <w:pPr>
-        <w:ind w:left="720" w:hanging="240"/>
+        <w:numPr>
+          <w:ilvl w:val="1"/>
+          <w:numId w:val="1"/>
+        </w:numPr>
       </w:pPr>
       <w:r>
-        <w:t>◦  Ứng viên tham số ra:</w:t>
+        <w:t>Ứng viên tham số ra:</w:t>
       </w:r>
     </w:p>
     <w:p>
       <w:pPr>
-        <w:ind w:left="1080" w:hanging="240"/>
+        <w:numPr>
+          <w:ilvl w:val="2"/>
+          <w:numId w:val="1"/>
+        </w:numPr>
       </w:pPr>
       <w:r>
         <w:rPr>
           <w:rFonts w:ascii="Courier New" w:hAnsi="Courier New"/>
           <w:sz w:val="20"/>
         </w:rPr>
-        <w:t>▪  updateStaff(): boolean</w:t>
+        <w:t>updateStaff(): boolean</w:t>
       </w:r>
       <w:r>
         <w:t xml:space="preserve"> → chọn</w:t>
@@ -9918,13 +10110,16 @@
     </w:p>
     <w:p>
       <w:pPr>
-        <w:ind w:left="360" w:hanging="240"/>
+        <w:numPr>
+          <w:ilvl w:val="0"/>
+          <w:numId w:val="1"/>
+        </w:numPr>
       </w:pPr>
       <w:r>
         <w:rPr>
           <w:b/>
         </w:rPr>
-        <w:t>•  l) Xóa NV</w:t>
+        <w:t>l) Xóa NV</w:t>
       </w:r>
       <w:r>
         <w:t xml:space="preserve"> =&gt; </w:t>
@@ -9939,38 +10134,50 @@
     </w:p>
     <w:p>
       <w:pPr>
-        <w:ind w:left="720" w:hanging="240"/>
+        <w:numPr>
+          <w:ilvl w:val="1"/>
+          <w:numId w:val="1"/>
+        </w:numPr>
       </w:pPr>
       <w:r>
-        <w:t>◦  Input: id</w:t>
+        <w:t>Input: id</w:t>
       </w:r>
     </w:p>
     <w:p>
       <w:pPr>
-        <w:ind w:left="720" w:hanging="240"/>
+        <w:numPr>
+          <w:ilvl w:val="1"/>
+          <w:numId w:val="1"/>
+        </w:numPr>
       </w:pPr>
       <w:r>
-        <w:t>◦  Output: boolean</w:t>
+        <w:t>Output: boolean</w:t>
       </w:r>
     </w:p>
     <w:p>
       <w:pPr>
-        <w:ind w:left="720" w:hanging="240"/>
+        <w:numPr>
+          <w:ilvl w:val="1"/>
+          <w:numId w:val="1"/>
+        </w:numPr>
       </w:pPr>
       <w:r>
-        <w:t>◦  Ứng viên tham số vào:</w:t>
+        <w:t>Ứng viên tham số vào:</w:t>
       </w:r>
     </w:p>
     <w:p>
       <w:pPr>
-        <w:ind w:left="1080" w:hanging="240"/>
+        <w:numPr>
+          <w:ilvl w:val="2"/>
+          <w:numId w:val="1"/>
+        </w:numPr>
       </w:pPr>
       <w:r>
         <w:rPr>
           <w:rFonts w:ascii="Courier New" w:hAnsi="Courier New"/>
           <w:sz w:val="20"/>
         </w:rPr>
-        <w:t>▪  deleteStaff()</w:t>
+        <w:t>deleteStaff()</w:t>
       </w:r>
       <w:r>
         <w:t xml:space="preserve"> → chọn</w:t>
@@ -9978,22 +10185,28 @@
     </w:p>
     <w:p>
       <w:pPr>
-        <w:ind w:left="720" w:hanging="240"/>
+        <w:numPr>
+          <w:ilvl w:val="1"/>
+          <w:numId w:val="1"/>
+        </w:numPr>
       </w:pPr>
       <w:r>
-        <w:t>◦  Ứng viên tham số ra:</w:t>
+        <w:t>Ứng viên tham số ra:</w:t>
       </w:r>
     </w:p>
     <w:p>
       <w:pPr>
-        <w:ind w:left="1080" w:hanging="240"/>
+        <w:numPr>
+          <w:ilvl w:val="2"/>
+          <w:numId w:val="1"/>
+        </w:numPr>
       </w:pPr>
       <w:r>
         <w:rPr>
           <w:rFonts w:ascii="Courier New" w:hAnsi="Courier New"/>
           <w:sz w:val="20"/>
         </w:rPr>
-        <w:t>▪  deleteStaff(): boolean</w:t>
+        <w:t>deleteStaff(): boolean</w:t>
       </w:r>
       <w:r>
         <w:t xml:space="preserve"> → chọn (cần biết thành công/thất bại)</w:t>
@@ -10116,10 +10329,13 @@
     </w:p>
     <w:p>
       <w:pPr>
-        <w:ind w:left="360" w:hanging="240"/>
+        <w:numPr>
+          <w:ilvl w:val="0"/>
+          <w:numId w:val="2"/>
+        </w:numPr>
       </w:pPr>
       <w:r>
-        <w:t xml:space="preserve">1.  Khách hàng truy cập URL </w:t>
+        <w:t xml:space="preserve">Khách hàng truy cập URL </w:t>
       </w:r>
       <w:r>
         <w:rPr>
@@ -10134,10 +10350,13 @@
     </w:p>
     <w:p>
       <w:pPr>
-        <w:ind w:left="360" w:hanging="240"/>
+        <w:numPr>
+          <w:ilvl w:val="0"/>
+          <w:numId w:val="2"/>
+        </w:numPr>
       </w:pPr>
       <w:r>
-        <w:t xml:space="preserve">2.  Phương thức </w:t>
+        <w:t xml:space="preserve">Phương thức </w:t>
       </w:r>
       <w:r>
         <w:rPr>
@@ -10152,26 +10371,35 @@
     </w:p>
     <w:p>
       <w:pPr>
-        <w:ind w:left="360" w:hanging="240"/>
+        <w:numPr>
+          <w:ilvl w:val="0"/>
+          <w:numId w:val="2"/>
+        </w:numPr>
       </w:pPr>
       <w:r>
-        <w:t>3.  Khách hàng nhập SĐT và Mật khẩu.</w:t>
+        <w:t>Khách hàng nhập SĐT và Mật khẩu.</w:t>
       </w:r>
     </w:p>
     <w:p>
       <w:pPr>
-        <w:ind w:left="360" w:hanging="240"/>
+        <w:numPr>
+          <w:ilvl w:val="0"/>
+          <w:numId w:val="2"/>
+        </w:numPr>
       </w:pPr>
       <w:r>
-        <w:t>4.  Khách hàng click nút [Đăng nhập].</w:t>
+        <w:t>Khách hàng click nút [Đăng nhập].</w:t>
       </w:r>
     </w:p>
     <w:p>
       <w:pPr>
-        <w:ind w:left="360" w:hanging="240"/>
+        <w:numPr>
+          <w:ilvl w:val="0"/>
+          <w:numId w:val="2"/>
+        </w:numPr>
       </w:pPr>
       <w:r>
-        <w:t xml:space="preserve">5.  Phương thức </w:t>
+        <w:t xml:space="preserve">Phương thức </w:t>
       </w:r>
       <w:r>
         <w:rPr>
@@ -10186,10 +10414,13 @@
     </w:p>
     <w:p>
       <w:pPr>
-        <w:ind w:left="360" w:hanging="240"/>
+        <w:numPr>
+          <w:ilvl w:val="0"/>
+          <w:numId w:val="2"/>
+        </w:numPr>
       </w:pPr>
       <w:r>
-        <w:t xml:space="preserve">6.  Phương thức </w:t>
+        <w:t xml:space="preserve">Phương thức </w:t>
       </w:r>
       <w:r>
         <w:rPr>
@@ -10214,10 +10445,13 @@
     </w:p>
     <w:p>
       <w:pPr>
-        <w:ind w:left="360" w:hanging="240"/>
+        <w:numPr>
+          <w:ilvl w:val="0"/>
+          <w:numId w:val="2"/>
+        </w:numPr>
       </w:pPr>
       <w:r>
-        <w:t xml:space="preserve">7.  Phương thức </w:t>
+        <w:t xml:space="preserve">Phương thức </w:t>
       </w:r>
       <w:r>
         <w:rPr>
@@ -10248,10 +10482,13 @@
     </w:p>
     <w:p>
       <w:pPr>
-        <w:ind w:left="360" w:hanging="240"/>
+        <w:numPr>
+          <w:ilvl w:val="0"/>
+          <w:numId w:val="2"/>
+        </w:numPr>
       </w:pPr>
       <w:r>
-        <w:t xml:space="preserve">8.  Lớp User trả về đối tượng User cho phương thức </w:t>
+        <w:t xml:space="preserve">Lớp User trả về đối tượng User cho phương thức </w:t>
       </w:r>
       <w:r>
         <w:rPr>
@@ -10266,10 +10503,13 @@
     </w:p>
     <w:p>
       <w:pPr>
-        <w:ind w:left="360" w:hanging="240"/>
+        <w:numPr>
+          <w:ilvl w:val="0"/>
+          <w:numId w:val="2"/>
+        </w:numPr>
       </w:pPr>
       <w:r>
-        <w:t xml:space="preserve">9.  Phương thức </w:t>
+        <w:t xml:space="preserve">Phương thức </w:t>
       </w:r>
       <w:r>
         <w:rPr>
@@ -10300,10 +10540,13 @@
     </w:p>
     <w:p>
       <w:pPr>
-        <w:ind w:left="360" w:hanging="240"/>
+        <w:numPr>
+          <w:ilvl w:val="0"/>
+          <w:numId w:val="2"/>
+        </w:numPr>
       </w:pPr>
       <w:r>
-        <w:t xml:space="preserve">10.  Phương thức </w:t>
+        <w:t xml:space="preserve">Phương thức </w:t>
       </w:r>
       <w:r>
         <w:rPr>
@@ -10338,10 +10581,13 @@
     </w:p>
     <w:p>
       <w:pPr>
-        <w:ind w:left="360" w:hanging="240"/>
+        <w:numPr>
+          <w:ilvl w:val="0"/>
+          <w:numId w:val="2"/>
+        </w:numPr>
       </w:pPr>
       <w:r>
-        <w:t xml:space="preserve">11.  Phương thức </w:t>
+        <w:t xml:space="preserve">Phương thức </w:t>
       </w:r>
       <w:r>
         <w:rPr>
@@ -10428,10 +10674,13 @@
     </w:p>
     <w:p>
       <w:pPr>
-        <w:ind w:left="360" w:hanging="240"/>
+        <w:numPr>
+          <w:ilvl w:val="0"/>
+          <w:numId w:val="2"/>
+        </w:numPr>
       </w:pPr>
       <w:r>
-        <w:t xml:space="preserve">1.  Khách hàng click liên kết "Đăng ký" từ trang </w:t>
+        <w:t xml:space="preserve">Khách hàng click liên kết "Đăng ký" từ trang </w:t>
       </w:r>
       <w:r>
         <w:rPr>
@@ -10446,10 +10695,13 @@
     </w:p>
     <w:p>
       <w:pPr>
-        <w:ind w:left="360" w:hanging="240"/>
+        <w:numPr>
+          <w:ilvl w:val="0"/>
+          <w:numId w:val="2"/>
+        </w:numPr>
       </w:pPr>
       <w:r>
-        <w:t xml:space="preserve">2.  Phương thức </w:t>
+        <w:t xml:space="preserve">Phương thức </w:t>
       </w:r>
       <w:r>
         <w:rPr>
@@ -10464,26 +10716,35 @@
     </w:p>
     <w:p>
       <w:pPr>
-        <w:ind w:left="360" w:hanging="240"/>
+        <w:numPr>
+          <w:ilvl w:val="0"/>
+          <w:numId w:val="2"/>
+        </w:numPr>
       </w:pPr>
       <w:r>
-        <w:t>3.  Khách hàng nhập Họ tên, SĐT, Email, Mật khẩu.</w:t>
+        <w:t>Khách hàng nhập Họ tên, SĐT, Email, Mật khẩu.</w:t>
       </w:r>
     </w:p>
     <w:p>
       <w:pPr>
-        <w:ind w:left="360" w:hanging="240"/>
+        <w:numPr>
+          <w:ilvl w:val="0"/>
+          <w:numId w:val="2"/>
+        </w:numPr>
       </w:pPr>
       <w:r>
-        <w:t>4.  Khách hàng click nút [Tiếp tục].</w:t>
+        <w:t>Khách hàng click nút [Tiếp tục].</w:t>
       </w:r>
     </w:p>
     <w:p>
       <w:pPr>
-        <w:ind w:left="360" w:hanging="240"/>
+        <w:numPr>
+          <w:ilvl w:val="0"/>
+          <w:numId w:val="2"/>
+        </w:numPr>
       </w:pPr>
       <w:r>
-        <w:t xml:space="preserve">5.  Phương thức </w:t>
+        <w:t xml:space="preserve">Phương thức </w:t>
       </w:r>
       <w:r>
         <w:rPr>
@@ -10498,10 +10759,13 @@
     </w:p>
     <w:p>
       <w:pPr>
-        <w:ind w:left="360" w:hanging="240"/>
+        <w:numPr>
+          <w:ilvl w:val="0"/>
+          <w:numId w:val="2"/>
+        </w:numPr>
       </w:pPr>
       <w:r>
-        <w:t xml:space="preserve">6.  Phương thức </w:t>
+        <w:t xml:space="preserve">Phương thức </w:t>
       </w:r>
       <w:r>
         <w:rPr>
@@ -10526,10 +10790,13 @@
     </w:p>
     <w:p>
       <w:pPr>
-        <w:ind w:left="360" w:hanging="240"/>
+        <w:numPr>
+          <w:ilvl w:val="0"/>
+          <w:numId w:val="2"/>
+        </w:numPr>
       </w:pPr>
       <w:r>
-        <w:t xml:space="preserve">7.  Phương thức </w:t>
+        <w:t xml:space="preserve">Phương thức </w:t>
       </w:r>
       <w:r>
         <w:rPr>
@@ -10560,10 +10827,13 @@
     </w:p>
     <w:p>
       <w:pPr>
-        <w:ind w:left="360" w:hanging="240"/>
+        <w:numPr>
+          <w:ilvl w:val="0"/>
+          <w:numId w:val="2"/>
+        </w:numPr>
       </w:pPr>
       <w:r>
-        <w:t xml:space="preserve">8.  Lớp User trả về </w:t>
+        <w:t xml:space="preserve">Lớp User trả về </w:t>
       </w:r>
       <w:r>
         <w:rPr>
@@ -10588,10 +10858,13 @@
     </w:p>
     <w:p>
       <w:pPr>
-        <w:ind w:left="360" w:hanging="240"/>
+        <w:numPr>
+          <w:ilvl w:val="0"/>
+          <w:numId w:val="2"/>
+        </w:numPr>
       </w:pPr>
       <w:r>
-        <w:t xml:space="preserve">9.  Phương thức </w:t>
+        <w:t xml:space="preserve">Phương thức </w:t>
       </w:r>
       <w:r>
         <w:rPr>
@@ -10622,10 +10895,13 @@
     </w:p>
     <w:p>
       <w:pPr>
-        <w:ind w:left="360" w:hanging="240"/>
+        <w:numPr>
+          <w:ilvl w:val="0"/>
+          <w:numId w:val="2"/>
+        </w:numPr>
       </w:pPr>
       <w:r>
-        <w:t xml:space="preserve">10.  Lớp User trả về </w:t>
+        <w:t xml:space="preserve">Lớp User trả về </w:t>
       </w:r>
       <w:r>
         <w:rPr>
@@ -10650,10 +10926,13 @@
     </w:p>
     <w:p>
       <w:pPr>
-        <w:ind w:left="360" w:hanging="240"/>
+        <w:numPr>
+          <w:ilvl w:val="0"/>
+          <w:numId w:val="2"/>
+        </w:numPr>
       </w:pPr>
       <w:r>
-        <w:t xml:space="preserve">11.  Phương thức </w:t>
+        <w:t xml:space="preserve">Phương thức </w:t>
       </w:r>
       <w:r>
         <w:rPr>
@@ -10684,10 +10963,13 @@
     </w:p>
     <w:p>
       <w:pPr>
-        <w:ind w:left="360" w:hanging="240"/>
+        <w:numPr>
+          <w:ilvl w:val="0"/>
+          <w:numId w:val="2"/>
+        </w:numPr>
       </w:pPr>
       <w:r>
-        <w:t xml:space="preserve">12.  Phương thức </w:t>
+        <w:t xml:space="preserve">Phương thức </w:t>
       </w:r>
       <w:r>
         <w:rPr>
@@ -10718,18 +11000,24 @@
     </w:p>
     <w:p>
       <w:pPr>
-        <w:ind w:left="360" w:hanging="240"/>
+        <w:numPr>
+          <w:ilvl w:val="0"/>
+          <w:numId w:val="2"/>
+        </w:numPr>
       </w:pPr>
       <w:r>
-        <w:t>13.  Lớp OTP gửi mã OTP đến SĐT.</w:t>
+        <w:t>Lớp OTP gửi mã OTP đến SĐT.</w:t>
       </w:r>
     </w:p>
     <w:p>
       <w:pPr>
-        <w:ind w:left="360" w:hanging="240"/>
+        <w:numPr>
+          <w:ilvl w:val="0"/>
+          <w:numId w:val="2"/>
+        </w:numPr>
       </w:pPr>
       <w:r>
-        <w:t xml:space="preserve">14.  Phương thức </w:t>
+        <w:t xml:space="preserve">Phương thức </w:t>
       </w:r>
       <w:r>
         <w:rPr>
@@ -10754,34 +11042,46 @@
     </w:p>
     <w:p>
       <w:pPr>
-        <w:ind w:left="360" w:hanging="240"/>
+        <w:numPr>
+          <w:ilvl w:val="0"/>
+          <w:numId w:val="2"/>
+        </w:numPr>
       </w:pPr>
       <w:r>
-        <w:t>15.  RegisterPage hiển thị trang OTPVerifyPage.</w:t>
+        <w:t>RegisterPage hiển thị trang OTPVerifyPage.</w:t>
       </w:r>
     </w:p>
     <w:p>
       <w:pPr>
-        <w:ind w:left="360" w:hanging="240"/>
+        <w:numPr>
+          <w:ilvl w:val="0"/>
+          <w:numId w:val="2"/>
+        </w:numPr>
       </w:pPr>
       <w:r>
-        <w:t>16.  Khách hàng nhập mã OTP.</w:t>
+        <w:t>Khách hàng nhập mã OTP.</w:t>
       </w:r>
     </w:p>
     <w:p>
       <w:pPr>
-        <w:ind w:left="360" w:hanging="240"/>
+        <w:numPr>
+          <w:ilvl w:val="0"/>
+          <w:numId w:val="2"/>
+        </w:numPr>
       </w:pPr>
       <w:r>
-        <w:t>17.  Khách hàng click nút [Xác nhận].</w:t>
+        <w:t>Khách hàng click nút [Xác nhận].</w:t>
       </w:r>
     </w:p>
     <w:p>
       <w:pPr>
-        <w:ind w:left="360" w:hanging="240"/>
+        <w:numPr>
+          <w:ilvl w:val="0"/>
+          <w:numId w:val="2"/>
+        </w:numPr>
       </w:pPr>
       <w:r>
-        <w:t xml:space="preserve">18.  Phương thức </w:t>
+        <w:t xml:space="preserve">Phương thức </w:t>
       </w:r>
       <w:r>
         <w:rPr>
@@ -10796,10 +11096,13 @@
     </w:p>
     <w:p>
       <w:pPr>
-        <w:ind w:left="360" w:hanging="240"/>
+        <w:numPr>
+          <w:ilvl w:val="0"/>
+          <w:numId w:val="2"/>
+        </w:numPr>
       </w:pPr>
       <w:r>
-        <w:t xml:space="preserve">19.  Phương thức </w:t>
+        <w:t xml:space="preserve">Phương thức </w:t>
       </w:r>
       <w:r>
         <w:rPr>
@@ -10824,10 +11127,13 @@
     </w:p>
     <w:p>
       <w:pPr>
-        <w:ind w:left="360" w:hanging="240"/>
+        <w:numPr>
+          <w:ilvl w:val="0"/>
+          <w:numId w:val="2"/>
+        </w:numPr>
       </w:pPr>
       <w:r>
-        <w:t xml:space="preserve">20.  Phương thức </w:t>
+        <w:t xml:space="preserve">Phương thức </w:t>
       </w:r>
       <w:r>
         <w:rPr>
@@ -10852,10 +11158,13 @@
     </w:p>
     <w:p>
       <w:pPr>
-        <w:ind w:left="360" w:hanging="240"/>
+        <w:numPr>
+          <w:ilvl w:val="0"/>
+          <w:numId w:val="2"/>
+        </w:numPr>
       </w:pPr>
       <w:r>
-        <w:t xml:space="preserve">21.  Lớp OTP trả về </w:t>
+        <w:t xml:space="preserve">Lớp OTP trả về </w:t>
       </w:r>
       <w:r>
         <w:rPr>
@@ -10880,10 +11189,13 @@
     </w:p>
     <w:p>
       <w:pPr>
-        <w:ind w:left="360" w:hanging="240"/>
+        <w:numPr>
+          <w:ilvl w:val="0"/>
+          <w:numId w:val="2"/>
+        </w:numPr>
       </w:pPr>
       <w:r>
-        <w:t xml:space="preserve">22.  Phương thức </w:t>
+        <w:t xml:space="preserve">Phương thức </w:t>
       </w:r>
       <w:r>
         <w:rPr>
@@ -10918,10 +11230,13 @@
     </w:p>
     <w:p>
       <w:pPr>
-        <w:ind w:left="360" w:hanging="240"/>
+        <w:numPr>
+          <w:ilvl w:val="0"/>
+          <w:numId w:val="2"/>
+        </w:numPr>
       </w:pPr>
       <w:r>
-        <w:t xml:space="preserve">23.  Phương thức </w:t>
+        <w:t xml:space="preserve">Phương thức </w:t>
       </w:r>
       <w:r>
         <w:rPr>
@@ -10998,10 +11313,13 @@
     </w:p>
     <w:p>
       <w:pPr>
-        <w:ind w:left="360" w:hanging="240"/>
+        <w:numPr>
+          <w:ilvl w:val="0"/>
+          <w:numId w:val="2"/>
+        </w:numPr>
       </w:pPr>
       <w:r>
-        <w:t xml:space="preserve">1.  Người dùng truy cập URL </w:t>
+        <w:t xml:space="preserve">Người dùng truy cập URL </w:t>
       </w:r>
       <w:r>
         <w:rPr>
@@ -11016,10 +11334,13 @@
     </w:p>
     <w:p>
       <w:pPr>
-        <w:ind w:left="360" w:hanging="240"/>
+        <w:numPr>
+          <w:ilvl w:val="0"/>
+          <w:numId w:val="2"/>
+        </w:numPr>
       </w:pPr>
       <w:r>
-        <w:t xml:space="preserve">2.  Phương thức </w:t>
+        <w:t xml:space="preserve">Phương thức </w:t>
       </w:r>
       <w:r>
         <w:rPr>
@@ -11034,26 +11355,35 @@
     </w:p>
     <w:p>
       <w:pPr>
-        <w:ind w:left="360" w:hanging="240"/>
+        <w:numPr>
+          <w:ilvl w:val="0"/>
+          <w:numId w:val="2"/>
+        </w:numPr>
       </w:pPr>
       <w:r>
-        <w:t>3.  Người dùng nhập Mật khẩu hiện tại, Mật khẩu mới, Xác nhận MK mới.</w:t>
+        <w:t>Người dùng nhập Mật khẩu hiện tại, Mật khẩu mới, Xác nhận MK mới.</w:t>
       </w:r>
     </w:p>
     <w:p>
       <w:pPr>
-        <w:ind w:left="360" w:hanging="240"/>
+        <w:numPr>
+          <w:ilvl w:val="0"/>
+          <w:numId w:val="2"/>
+        </w:numPr>
       </w:pPr>
       <w:r>
-        <w:t>4.  Người dùng click nút [Lưu thay đổi].</w:t>
+        <w:t>Người dùng click nút [Lưu thay đổi].</w:t>
       </w:r>
     </w:p>
     <w:p>
       <w:pPr>
-        <w:ind w:left="360" w:hanging="240"/>
+        <w:numPr>
+          <w:ilvl w:val="0"/>
+          <w:numId w:val="2"/>
+        </w:numPr>
       </w:pPr>
       <w:r>
-        <w:t xml:space="preserve">5.  Phương thức </w:t>
+        <w:t xml:space="preserve">Phương thức </w:t>
       </w:r>
       <w:r>
         <w:rPr>
@@ -11068,10 +11398,13 @@
     </w:p>
     <w:p>
       <w:pPr>
-        <w:ind w:left="360" w:hanging="240"/>
+        <w:numPr>
+          <w:ilvl w:val="0"/>
+          <w:numId w:val="2"/>
+        </w:numPr>
       </w:pPr>
       <w:r>
-        <w:t xml:space="preserve">6.  Phương thức </w:t>
+        <w:t xml:space="preserve">Phương thức </w:t>
       </w:r>
       <w:r>
         <w:rPr>
@@ -11096,10 +11429,13 @@
     </w:p>
     <w:p>
       <w:pPr>
-        <w:ind w:left="360" w:hanging="240"/>
+        <w:numPr>
+          <w:ilvl w:val="0"/>
+          <w:numId w:val="2"/>
+        </w:numPr>
       </w:pPr>
       <w:r>
-        <w:t xml:space="preserve">7.  Phương thức </w:t>
+        <w:t xml:space="preserve">Phương thức </w:t>
       </w:r>
       <w:r>
         <w:rPr>
@@ -11124,10 +11460,13 @@
     </w:p>
     <w:p>
       <w:pPr>
-        <w:ind w:left="360" w:hanging="240"/>
+        <w:numPr>
+          <w:ilvl w:val="0"/>
+          <w:numId w:val="2"/>
+        </w:numPr>
       </w:pPr>
       <w:r>
-        <w:t xml:space="preserve">8.  Lớp User trả về đối tượng User cho phương thức </w:t>
+        <w:t xml:space="preserve">Lớp User trả về đối tượng User cho phương thức </w:t>
       </w:r>
       <w:r>
         <w:rPr>
@@ -11142,10 +11481,13 @@
     </w:p>
     <w:p>
       <w:pPr>
-        <w:ind w:left="360" w:hanging="240"/>
+        <w:numPr>
+          <w:ilvl w:val="0"/>
+          <w:numId w:val="2"/>
+        </w:numPr>
       </w:pPr>
       <w:r>
-        <w:t xml:space="preserve">9.  Phương thức </w:t>
+        <w:t xml:space="preserve">Phương thức </w:t>
       </w:r>
       <w:r>
         <w:rPr>
@@ -11176,10 +11518,13 @@
     </w:p>
     <w:p>
       <w:pPr>
-        <w:ind w:left="360" w:hanging="240"/>
+        <w:numPr>
+          <w:ilvl w:val="0"/>
+          <w:numId w:val="2"/>
+        </w:numPr>
       </w:pPr>
       <w:r>
-        <w:t xml:space="preserve">10.  Phương thức </w:t>
+        <w:t xml:space="preserve">Phương thức </w:t>
       </w:r>
       <w:r>
         <w:rPr>
@@ -11210,10 +11555,13 @@
     </w:p>
     <w:p>
       <w:pPr>
-        <w:ind w:left="360" w:hanging="240"/>
+        <w:numPr>
+          <w:ilvl w:val="0"/>
+          <w:numId w:val="2"/>
+        </w:numPr>
       </w:pPr>
       <w:r>
-        <w:t xml:space="preserve">11.  Phương thức </w:t>
+        <w:t xml:space="preserve">Phương thức </w:t>
       </w:r>
       <w:r>
         <w:rPr>
@@ -11244,10 +11592,13 @@
     </w:p>
     <w:p>
       <w:pPr>
-        <w:ind w:left="360" w:hanging="240"/>
+        <w:numPr>
+          <w:ilvl w:val="0"/>
+          <w:numId w:val="2"/>
+        </w:numPr>
       </w:pPr>
       <w:r>
-        <w:t xml:space="preserve">12.  Lớp User trả về </w:t>
+        <w:t xml:space="preserve">Lớp User trả về </w:t>
       </w:r>
       <w:r>
         <w:rPr>
@@ -11272,10 +11623,13 @@
     </w:p>
     <w:p>
       <w:pPr>
-        <w:ind w:left="360" w:hanging="240"/>
+        <w:numPr>
+          <w:ilvl w:val="0"/>
+          <w:numId w:val="2"/>
+        </w:numPr>
       </w:pPr>
       <w:r>
-        <w:t xml:space="preserve">13.  Phương thức </w:t>
+        <w:t xml:space="preserve">Phương thức </w:t>
       </w:r>
       <w:r>
         <w:rPr>
@@ -11306,10 +11660,13 @@
     </w:p>
     <w:p>
       <w:pPr>
-        <w:ind w:left="360" w:hanging="240"/>
+        <w:numPr>
+          <w:ilvl w:val="0"/>
+          <w:numId w:val="2"/>
+        </w:numPr>
       </w:pPr>
       <w:r>
-        <w:t xml:space="preserve">14.  Phương thức </w:t>
+        <w:t xml:space="preserve">Phương thức </w:t>
       </w:r>
       <w:r>
         <w:rPr>
@@ -11344,10 +11701,13 @@
     </w:p>
     <w:p>
       <w:pPr>
-        <w:ind w:left="360" w:hanging="240"/>
+        <w:numPr>
+          <w:ilvl w:val="0"/>
+          <w:numId w:val="2"/>
+        </w:numPr>
       </w:pPr>
       <w:r>
-        <w:t xml:space="preserve">15.  Phương thức </w:t>
+        <w:t xml:space="preserve">Phương thức </w:t>
       </w:r>
       <w:r>
         <w:rPr>
@@ -11424,18 +11784,24 @@
     </w:p>
     <w:p>
       <w:pPr>
-        <w:ind w:left="360" w:hanging="240"/>
+        <w:numPr>
+          <w:ilvl w:val="0"/>
+          <w:numId w:val="2"/>
+        </w:numPr>
       </w:pPr>
       <w:r>
-        <w:t>1.  Khách hàng click vào avatar / tên tài khoản ở góc trên phải.</w:t>
+        <w:t>Khách hàng click vào avatar / tên tài khoản ở góc trên phải.</w:t>
       </w:r>
     </w:p>
     <w:p>
       <w:pPr>
-        <w:ind w:left="360" w:hanging="240"/>
+        <w:numPr>
+          <w:ilvl w:val="0"/>
+          <w:numId w:val="2"/>
+        </w:numPr>
       </w:pPr>
       <w:r>
-        <w:t xml:space="preserve">2.  Phương thức </w:t>
+        <w:t xml:space="preserve">Phương thức </w:t>
       </w:r>
       <w:r>
         <w:rPr>
@@ -11450,10 +11816,13 @@
     </w:p>
     <w:p>
       <w:pPr>
-        <w:ind w:left="360" w:hanging="240"/>
+        <w:numPr>
+          <w:ilvl w:val="0"/>
+          <w:numId w:val="2"/>
+        </w:numPr>
       </w:pPr>
       <w:r>
-        <w:t xml:space="preserve">3.  Phương thức </w:t>
+        <w:t xml:space="preserve">Phương thức </w:t>
       </w:r>
       <w:r>
         <w:rPr>
@@ -11478,10 +11847,13 @@
     </w:p>
     <w:p>
       <w:pPr>
-        <w:ind w:left="360" w:hanging="240"/>
+        <w:numPr>
+          <w:ilvl w:val="0"/>
+          <w:numId w:val="2"/>
+        </w:numPr>
       </w:pPr>
       <w:r>
-        <w:t xml:space="preserve">4.  Phương thức </w:t>
+        <w:t xml:space="preserve">Phương thức </w:t>
       </w:r>
       <w:r>
         <w:rPr>
@@ -11506,10 +11878,13 @@
     </w:p>
     <w:p>
       <w:pPr>
-        <w:ind w:left="360" w:hanging="240"/>
+        <w:numPr>
+          <w:ilvl w:val="0"/>
+          <w:numId w:val="2"/>
+        </w:numPr>
       </w:pPr>
       <w:r>
-        <w:t xml:space="preserve">5.  Lớp User trả về đối tượng User cho phương thức </w:t>
+        <w:t xml:space="preserve">Lớp User trả về đối tượng User cho phương thức </w:t>
       </w:r>
       <w:r>
         <w:rPr>
@@ -11524,10 +11899,13 @@
     </w:p>
     <w:p>
       <w:pPr>
-        <w:ind w:left="360" w:hanging="240"/>
+        <w:numPr>
+          <w:ilvl w:val="0"/>
+          <w:numId w:val="2"/>
+        </w:numPr>
       </w:pPr>
       <w:r>
-        <w:t xml:space="preserve">6.  Phương thức </w:t>
+        <w:t xml:space="preserve">Phương thức </w:t>
       </w:r>
       <w:r>
         <w:rPr>
@@ -11552,10 +11930,13 @@
     </w:p>
     <w:p>
       <w:pPr>
-        <w:ind w:left="360" w:hanging="240"/>
+        <w:numPr>
+          <w:ilvl w:val="0"/>
+          <w:numId w:val="2"/>
+        </w:numPr>
       </w:pPr>
       <w:r>
-        <w:t xml:space="preserve">7.  Phương thức </w:t>
+        <w:t xml:space="preserve">Phương thức </w:t>
       </w:r>
       <w:r>
         <w:rPr>
@@ -11580,34 +11961,46 @@
     </w:p>
     <w:p>
       <w:pPr>
-        <w:ind w:left="360" w:hanging="240"/>
+        <w:numPr>
+          <w:ilvl w:val="0"/>
+          <w:numId w:val="2"/>
+        </w:numPr>
       </w:pPr>
       <w:r>
-        <w:t>8.  Khách hàng click nút [Chỉnh sửa].</w:t>
+        <w:t>Khách hàng click nút [Chỉnh sửa].</w:t>
       </w:r>
     </w:p>
     <w:p>
       <w:pPr>
-        <w:ind w:left="360" w:hanging="240"/>
+        <w:numPr>
+          <w:ilvl w:val="0"/>
+          <w:numId w:val="2"/>
+        </w:numPr>
       </w:pPr>
       <w:r>
-        <w:t>9.  Khách hàng sửa Họ tên và Email.</w:t>
+        <w:t>Khách hàng sửa Họ tên và Email.</w:t>
       </w:r>
     </w:p>
     <w:p>
       <w:pPr>
-        <w:ind w:left="360" w:hanging="240"/>
+        <w:numPr>
+          <w:ilvl w:val="0"/>
+          <w:numId w:val="2"/>
+        </w:numPr>
       </w:pPr>
       <w:r>
-        <w:t>10.  Khách hàng click nút [Lưu].</w:t>
+        <w:t>Khách hàng click nút [Lưu].</w:t>
       </w:r>
     </w:p>
     <w:p>
       <w:pPr>
-        <w:ind w:left="360" w:hanging="240"/>
+        <w:numPr>
+          <w:ilvl w:val="0"/>
+          <w:numId w:val="2"/>
+        </w:numPr>
       </w:pPr>
       <w:r>
-        <w:t xml:space="preserve">11.  Phương thức </w:t>
+        <w:t xml:space="preserve">Phương thức </w:t>
       </w:r>
       <w:r>
         <w:rPr>
@@ -11622,10 +12015,13 @@
     </w:p>
     <w:p>
       <w:pPr>
-        <w:ind w:left="360" w:hanging="240"/>
+        <w:numPr>
+          <w:ilvl w:val="0"/>
+          <w:numId w:val="2"/>
+        </w:numPr>
       </w:pPr>
       <w:r>
-        <w:t xml:space="preserve">12.  Phương thức </w:t>
+        <w:t xml:space="preserve">Phương thức </w:t>
       </w:r>
       <w:r>
         <w:rPr>
@@ -11650,10 +12046,13 @@
     </w:p>
     <w:p>
       <w:pPr>
-        <w:ind w:left="360" w:hanging="240"/>
+        <w:numPr>
+          <w:ilvl w:val="0"/>
+          <w:numId w:val="2"/>
+        </w:numPr>
       </w:pPr>
       <w:r>
-        <w:t xml:space="preserve">13.  Phương thức </w:t>
+        <w:t xml:space="preserve">Phương thức </w:t>
       </w:r>
       <w:r>
         <w:rPr>
@@ -11684,10 +12083,13 @@
     </w:p>
     <w:p>
       <w:pPr>
-        <w:ind w:left="360" w:hanging="240"/>
+        <w:numPr>
+          <w:ilvl w:val="0"/>
+          <w:numId w:val="2"/>
+        </w:numPr>
       </w:pPr>
       <w:r>
-        <w:t xml:space="preserve">14.  Lớp User trả về </w:t>
+        <w:t xml:space="preserve">Lớp User trả về </w:t>
       </w:r>
       <w:r>
         <w:rPr>
@@ -11712,10 +12114,13 @@
     </w:p>
     <w:p>
       <w:pPr>
-        <w:ind w:left="360" w:hanging="240"/>
+        <w:numPr>
+          <w:ilvl w:val="0"/>
+          <w:numId w:val="2"/>
+        </w:numPr>
       </w:pPr>
       <w:r>
-        <w:t xml:space="preserve">15.  Phương thức </w:t>
+        <w:t xml:space="preserve">Phương thức </w:t>
       </w:r>
       <w:r>
         <w:rPr>
@@ -11746,10 +12151,13 @@
     </w:p>
     <w:p>
       <w:pPr>
-        <w:ind w:left="360" w:hanging="240"/>
+        <w:numPr>
+          <w:ilvl w:val="0"/>
+          <w:numId w:val="2"/>
+        </w:numPr>
       </w:pPr>
       <w:r>
-        <w:t xml:space="preserve">16.  Lớp User trả về đối tượng User đã cập nhật cho phương thức </w:t>
+        <w:t xml:space="preserve">Lớp User trả về đối tượng User đã cập nhật cho phương thức </w:t>
       </w:r>
       <w:r>
         <w:rPr>
@@ -11764,10 +12172,13 @@
     </w:p>
     <w:p>
       <w:pPr>
-        <w:ind w:left="360" w:hanging="240"/>
+        <w:numPr>
+          <w:ilvl w:val="0"/>
+          <w:numId w:val="2"/>
+        </w:numPr>
       </w:pPr>
       <w:r>
-        <w:t xml:space="preserve">17.  Phương thức </w:t>
+        <w:t xml:space="preserve">Phương thức </w:t>
       </w:r>
       <w:r>
         <w:rPr>
@@ -11792,10 +12203,13 @@
     </w:p>
     <w:p>
       <w:pPr>
-        <w:ind w:left="360" w:hanging="240"/>
+        <w:numPr>
+          <w:ilvl w:val="0"/>
+          <w:numId w:val="2"/>
+        </w:numPr>
       </w:pPr>
       <w:r>
-        <w:t xml:space="preserve">18.  Phương thức </w:t>
+        <w:t xml:space="preserve">Phương thức </w:t>
       </w:r>
       <w:r>
         <w:rPr>
@@ -11882,10 +12296,13 @@
     </w:p>
     <w:p>
       <w:pPr>
-        <w:ind w:left="360" w:hanging="240"/>
+        <w:numPr>
+          <w:ilvl w:val="0"/>
+          <w:numId w:val="2"/>
+        </w:numPr>
       </w:pPr>
       <w:r>
-        <w:t xml:space="preserve">1.  Admin truy cập URL </w:t>
+        <w:t xml:space="preserve">Admin truy cập URL </w:t>
       </w:r>
       <w:r>
         <w:rPr>
@@ -11900,10 +12317,13 @@
     </w:p>
     <w:p>
       <w:pPr>
-        <w:ind w:left="360" w:hanging="240"/>
+        <w:numPr>
+          <w:ilvl w:val="0"/>
+          <w:numId w:val="2"/>
+        </w:numPr>
       </w:pPr>
       <w:r>
-        <w:t xml:space="preserve">2.  Phương thức </w:t>
+        <w:t xml:space="preserve">Phương thức </w:t>
       </w:r>
       <w:r>
         <w:rPr>
@@ -11918,10 +12338,13 @@
     </w:p>
     <w:p>
       <w:pPr>
-        <w:ind w:left="360" w:hanging="240"/>
+        <w:numPr>
+          <w:ilvl w:val="0"/>
+          <w:numId w:val="2"/>
+        </w:numPr>
       </w:pPr>
       <w:r>
-        <w:t xml:space="preserve">3.  Phương thức </w:t>
+        <w:t xml:space="preserve">Phương thức </w:t>
       </w:r>
       <w:r>
         <w:rPr>
@@ -11946,10 +12369,13 @@
     </w:p>
     <w:p>
       <w:pPr>
-        <w:ind w:left="360" w:hanging="240"/>
+        <w:numPr>
+          <w:ilvl w:val="0"/>
+          <w:numId w:val="2"/>
+        </w:numPr>
       </w:pPr>
       <w:r>
-        <w:t xml:space="preserve">4.  Phương thức </w:t>
+        <w:t xml:space="preserve">Phương thức </w:t>
       </w:r>
       <w:r>
         <w:rPr>
@@ -11980,10 +12406,13 @@
     </w:p>
     <w:p>
       <w:pPr>
-        <w:ind w:left="360" w:hanging="240"/>
+        <w:numPr>
+          <w:ilvl w:val="0"/>
+          <w:numId w:val="2"/>
+        </w:numPr>
       </w:pPr>
       <w:r>
-        <w:t xml:space="preserve">5.  Lớp Employee trả về danh sách nhân viên cho phương thức </w:t>
+        <w:t xml:space="preserve">Lớp Employee trả về danh sách nhân viên cho phương thức </w:t>
       </w:r>
       <w:r>
         <w:rPr>
@@ -11998,10 +12427,13 @@
     </w:p>
     <w:p>
       <w:pPr>
-        <w:ind w:left="360" w:hanging="240"/>
+        <w:numPr>
+          <w:ilvl w:val="0"/>
+          <w:numId w:val="2"/>
+        </w:numPr>
       </w:pPr>
       <w:r>
-        <w:t xml:space="preserve">6.  Phương thức </w:t>
+        <w:t xml:space="preserve">Phương thức </w:t>
       </w:r>
       <w:r>
         <w:rPr>
@@ -12026,10 +12458,13 @@
     </w:p>
     <w:p>
       <w:pPr>
-        <w:ind w:left="360" w:hanging="240"/>
+        <w:numPr>
+          <w:ilvl w:val="0"/>
+          <w:numId w:val="2"/>
+        </w:numPr>
       </w:pPr>
       <w:r>
-        <w:t xml:space="preserve">7.  Phương thức </w:t>
+        <w:t xml:space="preserve">Phương thức </w:t>
       </w:r>
       <w:r>
         <w:rPr>
@@ -12054,34 +12489,46 @@
     </w:p>
     <w:p>
       <w:pPr>
-        <w:ind w:left="360" w:hanging="240"/>
+        <w:numPr>
+          <w:ilvl w:val="0"/>
+          <w:numId w:val="2"/>
+        </w:numPr>
       </w:pPr>
       <w:r>
-        <w:t>8.  Admin click nút [Thêm nhân viên].</w:t>
+        <w:t>Admin click nút [Thêm nhân viên].</w:t>
       </w:r>
     </w:p>
     <w:p>
       <w:pPr>
-        <w:ind w:left="360" w:hanging="240"/>
+        <w:numPr>
+          <w:ilvl w:val="0"/>
+          <w:numId w:val="2"/>
+        </w:numPr>
       </w:pPr>
       <w:r>
-        <w:t>9.  Admin nhập Họ tên và Vai trò.</w:t>
+        <w:t>Admin nhập Họ tên và Vai trò.</w:t>
       </w:r>
     </w:p>
     <w:p>
       <w:pPr>
-        <w:ind w:left="360" w:hanging="240"/>
+        <w:numPr>
+          <w:ilvl w:val="0"/>
+          <w:numId w:val="2"/>
+        </w:numPr>
       </w:pPr>
       <w:r>
-        <w:t>10.  Admin click nút [Lưu].</w:t>
+        <w:t>Admin click nút [Lưu].</w:t>
       </w:r>
     </w:p>
     <w:p>
       <w:pPr>
-        <w:ind w:left="360" w:hanging="240"/>
+        <w:numPr>
+          <w:ilvl w:val="0"/>
+          <w:numId w:val="2"/>
+        </w:numPr>
       </w:pPr>
       <w:r>
-        <w:t xml:space="preserve">11.  Phương thức </w:t>
+        <w:t xml:space="preserve">Phương thức </w:t>
       </w:r>
       <w:r>
         <w:rPr>
@@ -12096,10 +12543,13 @@
     </w:p>
     <w:p>
       <w:pPr>
-        <w:ind w:left="360" w:hanging="240"/>
+        <w:numPr>
+          <w:ilvl w:val="0"/>
+          <w:numId w:val="2"/>
+        </w:numPr>
       </w:pPr>
       <w:r>
-        <w:t xml:space="preserve">12.  Phương thức </w:t>
+        <w:t xml:space="preserve">Phương thức </w:t>
       </w:r>
       <w:r>
         <w:rPr>
@@ -12124,10 +12574,13 @@
     </w:p>
     <w:p>
       <w:pPr>
-        <w:ind w:left="360" w:hanging="240"/>
+        <w:numPr>
+          <w:ilvl w:val="0"/>
+          <w:numId w:val="2"/>
+        </w:numPr>
       </w:pPr>
       <w:r>
-        <w:t xml:space="preserve">13.  Phương thức </w:t>
+        <w:t xml:space="preserve">Phương thức </w:t>
       </w:r>
       <w:r>
         <w:rPr>
@@ -12152,10 +12605,13 @@
     </w:p>
     <w:p>
       <w:pPr>
-        <w:ind w:left="360" w:hanging="240"/>
+        <w:numPr>
+          <w:ilvl w:val="0"/>
+          <w:numId w:val="2"/>
+        </w:numPr>
       </w:pPr>
       <w:r>
-        <w:t xml:space="preserve">14.  Lớp Employee trả về đối tượng Employee vừa tạo cho phương thức </w:t>
+        <w:t xml:space="preserve">Lớp Employee trả về đối tượng Employee vừa tạo cho phương thức </w:t>
       </w:r>
       <w:r>
         <w:rPr>
@@ -12170,10 +12626,13 @@
     </w:p>
     <w:p>
       <w:pPr>
-        <w:ind w:left="360" w:hanging="240"/>
+        <w:numPr>
+          <w:ilvl w:val="0"/>
+          <w:numId w:val="2"/>
+        </w:numPr>
       </w:pPr>
       <w:r>
-        <w:t xml:space="preserve">15.  Phương thức </w:t>
+        <w:t xml:space="preserve">Phương thức </w:t>
       </w:r>
       <w:r>
         <w:rPr>
@@ -12208,10 +12667,13 @@
     </w:p>
     <w:p>
       <w:pPr>
-        <w:ind w:left="360" w:hanging="240"/>
+        <w:numPr>
+          <w:ilvl w:val="0"/>
+          <w:numId w:val="2"/>
+        </w:numPr>
       </w:pPr>
       <w:r>
-        <w:t xml:space="preserve">16.  Phương thức </w:t>
+        <w:t xml:space="preserve">Phương thức </w:t>
       </w:r>
       <w:r>
         <w:rPr>
@@ -12236,18 +12698,24 @@
     </w:p>
     <w:p>
       <w:pPr>
-        <w:ind w:left="360" w:hanging="240"/>
+        <w:numPr>
+          <w:ilvl w:val="0"/>
+          <w:numId w:val="2"/>
+        </w:numPr>
       </w:pPr>
       <w:r>
-        <w:t>17.  Admin click nút [Xóa] trên một dòng nhân viên trong bảng.</w:t>
+        <w:t>Admin click nút [Xóa] trên một dòng nhân viên trong bảng.</w:t>
       </w:r>
     </w:p>
     <w:p>
       <w:pPr>
-        <w:ind w:left="360" w:hanging="240"/>
+        <w:numPr>
+          <w:ilvl w:val="0"/>
+          <w:numId w:val="2"/>
+        </w:numPr>
       </w:pPr>
       <w:r>
-        <w:t xml:space="preserve">18.  Phương thức </w:t>
+        <w:t xml:space="preserve">Phương thức </w:t>
       </w:r>
       <w:r>
         <w:rPr>
@@ -12262,10 +12730,13 @@
     </w:p>
     <w:p>
       <w:pPr>
-        <w:ind w:left="360" w:hanging="240"/>
+        <w:numPr>
+          <w:ilvl w:val="0"/>
+          <w:numId w:val="2"/>
+        </w:numPr>
       </w:pPr>
       <w:r>
-        <w:t xml:space="preserve">19.  Phương thức </w:t>
+        <w:t xml:space="preserve">Phương thức </w:t>
       </w:r>
       <w:r>
         <w:rPr>
@@ -12290,10 +12761,13 @@
     </w:p>
     <w:p>
       <w:pPr>
-        <w:ind w:left="360" w:hanging="240"/>
+        <w:numPr>
+          <w:ilvl w:val="0"/>
+          <w:numId w:val="2"/>
+        </w:numPr>
       </w:pPr>
       <w:r>
-        <w:t xml:space="preserve">20.  Phương thức </w:t>
+        <w:t xml:space="preserve">Phương thức </w:t>
       </w:r>
       <w:r>
         <w:rPr>
@@ -12324,10 +12798,13 @@
     </w:p>
     <w:p>
       <w:pPr>
-        <w:ind w:left="360" w:hanging="240"/>
+        <w:numPr>
+          <w:ilvl w:val="0"/>
+          <w:numId w:val="2"/>
+        </w:numPr>
       </w:pPr>
       <w:r>
-        <w:t xml:space="preserve">21.  Lớp Employee trả về </w:t>
+        <w:t xml:space="preserve">Lớp Employee trả về </w:t>
       </w:r>
       <w:r>
         <w:rPr>
@@ -12352,10 +12829,13 @@
     </w:p>
     <w:p>
       <w:pPr>
-        <w:ind w:left="360" w:hanging="240"/>
+        <w:numPr>
+          <w:ilvl w:val="0"/>
+          <w:numId w:val="2"/>
+        </w:numPr>
       </w:pPr>
       <w:r>
-        <w:t xml:space="preserve">22.  Phương thức </w:t>
+        <w:t xml:space="preserve">Phương thức </w:t>
       </w:r>
       <w:r>
         <w:rPr>
@@ -12390,10 +12870,13 @@
     </w:p>
     <w:p>
       <w:pPr>
-        <w:ind w:left="360" w:hanging="240"/>
+        <w:numPr>
+          <w:ilvl w:val="0"/>
+          <w:numId w:val="2"/>
+        </w:numPr>
       </w:pPr>
       <w:r>
-        <w:t xml:space="preserve">23.  Phương thức </w:t>
+        <w:t xml:space="preserve">Phương thức </w:t>
       </w:r>
       <w:r>
         <w:rPr>

</xml_diff>

<commit_message>
fix: sequence diagram lines black, remove style block conflicts
- Replace <style> block with pure skinparams
- All lifelines: blue fill (#7AD2FF), black border (#000000)
- All arrows: black (#000000), thickness 1
- All participants: blue fill, black border, black text
- Actor: transparent fill, black border
- Message text: black, 10pt
</commit_message>
<xml_diff>
--- a/output/account_module.docx
+++ b/output/account_module.docx
@@ -6616,7 +6616,7 @@
       <w:r>
         <w:drawing>
           <wp:inline xmlns:a="http://schemas.openxmlformats.org/drawingml/2006/main" xmlns:pic="http://schemas.openxmlformats.org/drawingml/2006/picture">
-            <wp:extent cx="5486400" cy="3293645"/>
+            <wp:extent cx="5486400" cy="2818112"/>
             <wp:docPr id="9" name="Picture 9"/>
             <wp:cNvGraphicFramePr>
               <a:graphicFrameLocks noChangeAspect="1"/>
@@ -6637,7 +6637,7 @@
                   <pic:spPr>
                     <a:xfrm>
                       <a:off x="0" y="0"/>
-                      <a:ext cx="5486400" cy="3293645"/>
+                      <a:ext cx="5486400" cy="2818112"/>
                     </a:xfrm>
                     <a:prstGeom prst="rect"/>
                   </pic:spPr>
@@ -6737,7 +6737,7 @@
       <w:r>
         <w:drawing>
           <wp:inline xmlns:a="http://schemas.openxmlformats.org/drawingml/2006/main" xmlns:pic="http://schemas.openxmlformats.org/drawingml/2006/picture">
-            <wp:extent cx="5486400" cy="3633216"/>
+            <wp:extent cx="5486400" cy="3167456"/>
             <wp:docPr id="10" name="Picture 10"/>
             <wp:cNvGraphicFramePr>
               <a:graphicFrameLocks noChangeAspect="1"/>
@@ -6758,7 +6758,7 @@
                   <pic:spPr>
                     <a:xfrm>
                       <a:off x="0" y="0"/>
-                      <a:ext cx="5486400" cy="3633216"/>
+                      <a:ext cx="5486400" cy="3167456"/>
                     </a:xfrm>
                     <a:prstGeom prst="rect"/>
                   </pic:spPr>
@@ -6921,7 +6921,7 @@
       <w:r>
         <w:drawing>
           <wp:inline xmlns:a="http://schemas.openxmlformats.org/drawingml/2006/main" xmlns:pic="http://schemas.openxmlformats.org/drawingml/2006/picture">
-            <wp:extent cx="5486400" cy="3455317"/>
+            <wp:extent cx="5486400" cy="2434975"/>
             <wp:docPr id="11" name="Picture 11"/>
             <wp:cNvGraphicFramePr>
               <a:graphicFrameLocks noChangeAspect="1"/>
@@ -6942,7 +6942,7 @@
                   <pic:spPr>
                     <a:xfrm>
                       <a:off x="0" y="0"/>
-                      <a:ext cx="5486400" cy="3455317"/>
+                      <a:ext cx="5486400" cy="2434975"/>
                     </a:xfrm>
                     <a:prstGeom prst="rect"/>
                   </pic:spPr>
@@ -7042,7 +7042,7 @@
       <w:r>
         <w:drawing>
           <wp:inline xmlns:a="http://schemas.openxmlformats.org/drawingml/2006/main" xmlns:pic="http://schemas.openxmlformats.org/drawingml/2006/picture">
-            <wp:extent cx="5486400" cy="4456130"/>
+            <wp:extent cx="5486400" cy="3901440"/>
             <wp:docPr id="12" name="Picture 12"/>
             <wp:cNvGraphicFramePr>
               <a:graphicFrameLocks noChangeAspect="1"/>
@@ -7063,7 +7063,7 @@
                   <pic:spPr>
                     <a:xfrm>
                       <a:off x="0" y="0"/>
-                      <a:ext cx="5486400" cy="4456130"/>
+                      <a:ext cx="5486400" cy="3901440"/>
                     </a:xfrm>
                     <a:prstGeom prst="rect"/>
                   </pic:spPr>
@@ -7195,7 +7195,7 @@
       <w:r>
         <w:drawing>
           <wp:inline xmlns:a="http://schemas.openxmlformats.org/drawingml/2006/main" xmlns:pic="http://schemas.openxmlformats.org/drawingml/2006/picture">
-            <wp:extent cx="5486400" cy="4935758"/>
+            <wp:extent cx="5486400" cy="5855828"/>
             <wp:docPr id="13" name="Picture 13"/>
             <wp:cNvGraphicFramePr>
               <a:graphicFrameLocks noChangeAspect="1"/>
@@ -7216,7 +7216,7 @@
                   <pic:spPr>
                     <a:xfrm>
                       <a:off x="0" y="0"/>
-                      <a:ext cx="5486400" cy="4935758"/>
+                      <a:ext cx="5486400" cy="5855828"/>
                     </a:xfrm>
                     <a:prstGeom prst="rect"/>
                   </pic:spPr>

</xml_diff>

<commit_message>
fix: User→Client/Employee inheritance + HomeView + LoginView redirect
Entity model:
- User: base class (fullName, phoneNumber, email, password, role, createdAt)
- Client: extends User (loyaltyPoints, joinedAt) — for customers
- Employee: extends User (staffRole, branch, status) — for staff
- User <|-- Client, User <|-- Employee (generalization)
- Client n--1 MembershipTier (aggregation)
- User 1--n OTP, User 1--n LoginSession (composition)

Sequence diagrams:
- UC01: add HomeView participant, redirect after login
- UC02: use Client (not User), add HomeView redirect
- UC03: add LoginView redirect after password change
- UC04: use Client (not User) for getProfile/updateProfile
- UC20: use Employee (unchanged)
- All actors: blue fill (#7AD2FF)

Class diagram:
- Add Client class with methods (register, getProfile, updateProfile)
- Add HomeView class
- Update connections: RegisterView→Client, ProfileView→Client
- User <|-- Client, User <|-- Employee

BCE narratives updated to match.
</commit_message>
<xml_diff>
--- a/output/account_module.docx
+++ b/output/account_module.docx
@@ -5630,7 +5630,37 @@
     <w:p>
       <w:pPr/>
       <w:r>
-        <w:t>Hệ thống cho phép khách hàng đăng ký tài khoản hội viên mới bằng cách cung cấp họ tên, số điện thoại, email và mật khẩu; sau đó xác minh số điện thoại qua mã OTP trước khi hoàn tất đăng ký. Mỗi tài khoản gắn liền với một hạng hội viên (Thường, Bạc, Vàng, Kim Cương) dựa trên điểm tích lũy. Người dùng sau khi đăng nhập có thể xem và cập nhật thông tin cá nhân như họ tên và email, hoặc thực hiện đổi mật khẩu bằng cách xác minh mật khẩu cũ rồi nhập mật khẩu mới. Hệ thống ghi nhận các phiên đăng nhập để phục vụ bảo mật và thu hồi phiên khi đổi mật khẩu. Ngoài ra, chủ doanh nghiệp có quyền quản lý tài khoản nhân viên: tạo, chỉnh sửa và xóa tài khoản nhân viên trong hệ thống.</w:t>
+        <w:t>Module Tài khoản &amp; Thành viên quản lý toàn bộ người dùng trong hệ thống chuỗi nhà hàng karaoke. Hệ thống có ba loại người dùng: khách hàng, nhân viên và chủ doanh nghiệp. Tất cả đều cần một tài khoản để đăng nhập vào hệ thống, mỗi tài khoản có số điện thoại (dùng làm tên đăng nhập), email, mật khẩu đã mã hóa và vai trò (khách hàng, nhân viên, admin).</w:t>
+      </w:r>
+    </w:p>
+    <w:p>
+      <w:pPr/>
+      <w:r>
+        <w:t>Khách hàng có thể tự đăng ký tài khoản mới bằng cách cung cấp họ tên, số điện thoại, email và mật khẩu. Hệ thống gửi mã OTP 6 chữ số đến số điện thoại để xác minh trước khi tạo tài khoản. Sau khi đăng ký, khách hàng được xếp vào hạng hội viên "Thường" với điểm tích lũy bằng 0. Mỗi khách hàng thuộc về một hạng hội viên (Thường, Bạc, Vàng, Kim Cương) dựa trên điểm tích lũy. Hạng hội viên định nghĩa ngưỡng điểm tối thiểu, mô tả và hệ số ưu đãi. Khách hàng có thể xem hồ sơ cá nhân (họ tên, số điện thoại, email, hạng hội viên, điểm tích lũy, ngày tham gia) và cập nhật họ tên, email.</w:t>
+      </w:r>
+    </w:p>
+    <w:p>
+      <w:pPr/>
+      <w:r>
+        <w:t>Nhân viên được tạo bởi chủ doanh nghiệp. Mỗi nhân viên có họ tên, vai trò (Lễ tân, Phục vụ, Quản lý), chi nhánh làm việc và trạng thái (Đang làm, Đã nghỉ). Nhân viên không thể tự đăng ký mà phải do admin tạo tài khoản.</w:t>
+      </w:r>
+    </w:p>
+    <w:p>
+      <w:pPr/>
+      <w:r>
+        <w:t>Tất cả người dùng (khách hàng, nhân viên) đều có thể đổi mật khẩu bằng cách xác minh mật khẩu hiện tại rồi nhập mật khẩu mới. Sau khi đổi mật khẩu, tất cả phiên đăng nhập khác bị thu hồi để đảm bảo bảo mật.</w:t>
+      </w:r>
+    </w:p>
+    <w:p>
+      <w:pPr/>
+      <w:r>
+        <w:t>Hệ thống ghi nhận các phiên đăng nhập (token, thời gian đăng nhập, thời gian hết hạn, thiết bị) để phục vụ bảo mật và quản lý truy cập. Mỗi lần người dùng đăng nhập trên thiết bị mới sẽ tạo một phiên đăng nhập mới.</w:t>
+      </w:r>
+    </w:p>
+    <w:p>
+      <w:pPr/>
+      <w:r>
+        <w:t>Chủ doanh nghiệp (admin) có quyền quản lý tài khoản nhân viên toàn hệ thống: xem danh sách, thêm mới, chỉnh sửa và xóa (chuyển trạng thái "Đã nghỉ"). Không thể xóa nhân viên đang xử lý đơn hàng.</w:t>
       </w:r>
     </w:p>
     <w:p>
@@ -5660,7 +5690,7 @@
         </w:numPr>
       </w:pPr>
       <w:r>
-        <w:t>Khách hàng → lớp User: fullName, phoneNumber, email, password, loyaltyPoints, createdAt</w:t>
+        <w:t>Người dùng → lớp User: đây là lớp gốc cho MỌI người dùng trong hệ thống (khách hàng, nhân viên, admin đều có tài khoản User). Thuộc tính: fullName, phoneNumber, email, password, role, createdAt</w:t>
       </w:r>
     </w:p>
     <w:p>
@@ -5693,7 +5723,7 @@
         </w:numPr>
       </w:pPr>
       <w:r>
-        <w:t>Số điện thoại → thuộc tính phoneNumber của User (dùng làm username đăng nhập)</w:t>
+        <w:t>Số điện thoại → thuộc tính phoneNumber của User (dùng làm tên đăng nhập)</w:t>
       </w:r>
     </w:p>
     <w:p>
@@ -5726,7 +5756,7 @@
         </w:numPr>
       </w:pPr>
       <w:r>
-        <w:t>Ngày tham gia → thuộc tính createdAt của User</w:t>
+        <w:t>Vai trò → thuộc tính role của User (CLIENT, EMPLOYEE, ADMIN)</w:t>
       </w:r>
     </w:p>
     <w:p>
@@ -5737,7 +5767,7 @@
         </w:numPr>
       </w:pPr>
       <w:r>
-        <w:t>Hạng hội viên → lớp MembershipTier: tierName, minPoints, description, discountRate</w:t>
+        <w:t>Ngày tạo → thuộc tính createdAt của User</w:t>
       </w:r>
     </w:p>
     <w:p>
@@ -5748,7 +5778,7 @@
         </w:numPr>
       </w:pPr>
       <w:r>
-        <w:t>Điểm tích lũy → thuộc tính loyaltyPoints của User</w:t>
+        <w:t>Khách hàng → lớp Client: KẾ THỪA từ User. Khách hàng là người dùng có vai trò CLIENT, có thêm thông tin về thành viên. Thuộc tính riêng: loyaltyPoints, joinedAt</w:t>
       </w:r>
     </w:p>
     <w:p>
@@ -5759,7 +5789,7 @@
         </w:numPr>
       </w:pPr>
       <w:r>
-        <w:t>Mã OTP → lớp OTP: otpCode, type, expiresAt, verified</w:t>
+        <w:t>Hạng hội viên → lớp MembershipTier: tierName, minPoints, description, discountRate. Đây là dữ liệu danh mục (lookup table), tồn tại độc lập.</w:t>
       </w:r>
     </w:p>
     <w:p>
@@ -5770,7 +5800,7 @@
         </w:numPr>
       </w:pPr>
       <w:r>
-        <w:t>Phiên đăng nhập → lớp LoginSession: sessionToken, loginTime, expiresAt, device</w:t>
+        <w:t>Điểm tích lũy → thuộc tính loyaltyPoints của Client</w:t>
       </w:r>
     </w:p>
     <w:p>
@@ -5781,7 +5811,7 @@
         </w:numPr>
       </w:pPr>
       <w:r>
-        <w:t>Lịch sử → loại: quá chung → cụ thể là LoginSession đã đủ</w:t>
+        <w:t>Ngày tham gia → thuộc tính joinedAt của Client</w:t>
       </w:r>
     </w:p>
     <w:p>
@@ -5792,7 +5822,7 @@
         </w:numPr>
       </w:pPr>
       <w:r>
-        <w:t>Danh sách → loại: không phải thực thể</w:t>
+        <w:t>Mã OTP → lớp OTP: otpCode, type, expiresAt, verified. OTP gắn với User (mỗi lần đăng ký/đổi SĐT tạo OTP mới).</w:t>
       </w:r>
     </w:p>
     <w:p>
@@ -5803,7 +5833,7 @@
         </w:numPr>
       </w:pPr>
       <w:r>
-        <w:t>Giao diện → loại: là Boundary, không phải Entity</w:t>
+        <w:t>Phiên đăng nhập → lớp LoginSession: sessionToken, loginTime, expiresAt, device. LoginSession gắn với User.</w:t>
       </w:r>
     </w:p>
     <w:p>
@@ -5814,7 +5844,7 @@
         </w:numPr>
       </w:pPr>
       <w:r>
-        <w:t>Nhân viên → lớp Employee: fullName, role, branch, status</w:t>
+        <w:t>Nhân viên → lớp Employee: KẾ THỪA từ User. Nhân viên là người dùng có vai trò EMPLOYEE, có thêm thông tin về công việc. Thuộc tính riêng: staffRole, branch, status</w:t>
       </w:r>
     </w:p>
     <w:p>
@@ -5825,15 +5855,7 @@
         </w:numPr>
       </w:pPr>
       <w:r>
-        <w:t>Chủ doanh nghiệp → loại: actor, không phải thực thể dữ liệu</w:t>
-      </w:r>
-    </w:p>
-    <w:p>
-      <w:pPr>
-        <w:pStyle w:val="Heading3"/>
-      </w:pPr>
-      <w:r>
-        <w:t>Bước 4 – Xác định quan hệ số lượng</w:t>
+        <w:t>Vai trò nhân viên → thuộc tính staffRole của Employee (Lễ tân, Phục vụ, Quản lý)</w:t>
       </w:r>
     </w:p>
     <w:p>
@@ -5844,13 +5866,7 @@
         </w:numPr>
       </w:pPr>
       <w:r>
-        <w:t>1 User có 1 MembershipTier → User – MembershipTier: n – 1</w:t>
-      </w:r>
-    </w:p>
-    <w:p>
-      <w:pPr/>
-      <w:r>
-        <w:t>(nhiều người dùng có thể có cùng hạng)</w:t>
+        <w:t>Chi nhánh → thuộc tính branch của Employee (tên chi nhánh, không tách riêng vì Chi nhánh thuộc module khác)</w:t>
       </w:r>
     </w:p>
     <w:p>
@@ -5861,13 +5877,7 @@
         </w:numPr>
       </w:pPr>
       <w:r>
-        <w:t>1 User có nhiều OTP → User – OTP: 1 – n</w:t>
-      </w:r>
-    </w:p>
-    <w:p>
-      <w:pPr/>
-      <w:r>
-        <w:t>(mỗi lần đăng ký/đổi SĐT tạo 1 OTP mới)</w:t>
+        <w:t>Trạng thái nhân viên → thuộc tính status của Employee (Đang làm, Đã nghỉ)</w:t>
       </w:r>
     </w:p>
     <w:p>
@@ -5878,13 +5888,7 @@
         </w:numPr>
       </w:pPr>
       <w:r>
-        <w:t>1 User có nhiều LoginSession → User – LoginSession: 1 – n</w:t>
-      </w:r>
-    </w:p>
-    <w:p>
-      <w:pPr/>
-      <w:r>
-        <w:t>(người dùng có thể đăng nhập trên nhiều thiết bị)</w:t>
+        <w:t>Chủ doanh nghiệp → loại: actor (admin), là một User có vai trò ADMIN, không cần lớp riêng</w:t>
       </w:r>
     </w:p>
     <w:p>
@@ -5895,13 +5899,18 @@
         </w:numPr>
       </w:pPr>
       <w:r>
-        <w:t>Employee là lớp độc lập, không có quan hệ với User</w:t>
+        <w:t>Danh sách → loại: không phải thực thể</w:t>
       </w:r>
     </w:p>
     <w:p>
-      <w:pPr/>
-      <w:r>
-        <w:t>(branch là thuộc tính text, không cần tách riêng vì Chi nhánh thuộc module khác)</w:t>
+      <w:pPr>
+        <w:numPr>
+          <w:ilvl w:val="0"/>
+          <w:numId w:val="1"/>
+        </w:numPr>
+      </w:pPr>
+      <w:r>
+        <w:t>Giao diện → loại: là Boundary, không phải Entity</w:t>
       </w:r>
     </w:p>
     <w:p>
@@ -5909,13 +5918,161 @@
         <w:pStyle w:val="Heading3"/>
       </w:pPr>
       <w:r>
-        <w:t>Bước 5 – Bổ sung quan hệ</w:t>
+        <w:t>Bước 4 – Xác định quan hệ số lượng</w:t>
+      </w:r>
+    </w:p>
+    <w:p>
+      <w:pPr>
+        <w:numPr>
+          <w:ilvl w:val="0"/>
+          <w:numId w:val="1"/>
+        </w:numPr>
+      </w:pPr>
+      <w:r>
+        <w:t>User là lớp cha, Client kế thừa từ User → User – Client: 1 – 1 (generalization)</w:t>
       </w:r>
     </w:p>
     <w:p>
       <w:pPr/>
       <w:r>
-        <w:t>User gắn composition với OTP: một OTP không tồn tại độc lập nếu không có User tương ứng (khi xóa User thì xóa theo tất cả OTP). Tương tự, LoginSession không tồn tại độc lập khỏi User. Quan hệ với MembershipTier là aggregation: MembershipTier là dữ liệu danh mục tồn tại độc lập với User. Employee là lớp riêng biệt, không kế thừa từ User.</w:t>
+        <w:t>(mỗi User có vai trò CLIENT thì tương ứng 1 Client)</w:t>
+      </w:r>
+    </w:p>
+    <w:p>
+      <w:pPr>
+        <w:numPr>
+          <w:ilvl w:val="0"/>
+          <w:numId w:val="1"/>
+        </w:numPr>
+      </w:pPr>
+      <w:r>
+        <w:t>User là lớp cha, Employee kế thừa từ User → User – Employee: 1 – 1 (generalization)</w:t>
+      </w:r>
+    </w:p>
+    <w:p>
+      <w:pPr/>
+      <w:r>
+        <w:t>(mỗi User có vai trò EMPLOYEE thì tương ứng 1 Employee)</w:t>
+      </w:r>
+    </w:p>
+    <w:p>
+      <w:pPr>
+        <w:numPr>
+          <w:ilvl w:val="0"/>
+          <w:numId w:val="1"/>
+        </w:numPr>
+      </w:pPr>
+      <w:r>
+        <w:t>1 Client có 1 MembershipTier → Client – MembershipTier: n – 1</w:t>
+      </w:r>
+    </w:p>
+    <w:p>
+      <w:pPr/>
+      <w:r>
+        <w:t>(nhiều khách hàng có thể có cùng hạng hội viên)</w:t>
+      </w:r>
+    </w:p>
+    <w:p>
+      <w:pPr>
+        <w:numPr>
+          <w:ilvl w:val="0"/>
+          <w:numId w:val="1"/>
+        </w:numPr>
+      </w:pPr>
+      <w:r>
+        <w:t>1 User có nhiều OTP → User – OTP: 1 – n</w:t>
+      </w:r>
+    </w:p>
+    <w:p>
+      <w:pPr/>
+      <w:r>
+        <w:t>(mỗi lần đăng ký/đổi SĐT tạo 1 OTP mới)</w:t>
+      </w:r>
+    </w:p>
+    <w:p>
+      <w:pPr>
+        <w:numPr>
+          <w:ilvl w:val="0"/>
+          <w:numId w:val="1"/>
+        </w:numPr>
+      </w:pPr>
+      <w:r>
+        <w:t>1 User có nhiều LoginSession → User – LoginSession: 1 – n</w:t>
+      </w:r>
+    </w:p>
+    <w:p>
+      <w:pPr/>
+      <w:r>
+        <w:t>(người dùng có thể đăng nhập trên nhiều thiết bị)</w:t>
+      </w:r>
+    </w:p>
+    <w:p>
+      <w:pPr>
+        <w:numPr>
+          <w:ilvl w:val="0"/>
+          <w:numId w:val="1"/>
+        </w:numPr>
+      </w:pPr>
+      <w:r>
+        <w:t>Client và Employee không có quan hệ trực tiếp với nhau</w:t>
+      </w:r>
+    </w:p>
+    <w:p>
+      <w:pPr/>
+      <w:r>
+        <w:t>(cả hai đều kế thừa từ User nhưng phục vụ mục đích khác nhau)</w:t>
+      </w:r>
+    </w:p>
+    <w:p>
+      <w:pPr>
+        <w:pStyle w:val="Heading3"/>
+      </w:pPr>
+      <w:r>
+        <w:t>Bước 5 – Bổ sung quan hệ</w:t>
+      </w:r>
+    </w:p>
+    <w:p>
+      <w:pPr>
+        <w:numPr>
+          <w:ilvl w:val="0"/>
+          <w:numId w:val="1"/>
+        </w:numPr>
+      </w:pPr>
+      <w:r>
+        <w:t>User gắn composition với OTP: OTP không tồn tại độc lập nếu không có User (khi xóa User thì xóa theo tất cả OTP).</w:t>
+      </w:r>
+    </w:p>
+    <w:p>
+      <w:pPr>
+        <w:numPr>
+          <w:ilvl w:val="0"/>
+          <w:numId w:val="1"/>
+        </w:numPr>
+      </w:pPr>
+      <w:r>
+        <w:t>User gắn composition với LoginSession: LoginSession không tồn tại độc lập khỏi User.</w:t>
+      </w:r>
+    </w:p>
+    <w:p>
+      <w:pPr>
+        <w:numPr>
+          <w:ilvl w:val="0"/>
+          <w:numId w:val="1"/>
+        </w:numPr>
+      </w:pPr>
+      <w:r>
+        <w:t>Client gắn aggregation với MembershipTier: MembershipTier là dữ liệu danh mục tồn tại độc lập, nhiều Client có thể thuộc cùng 1 hạng.</w:t>
+      </w:r>
+    </w:p>
+    <w:p>
+      <w:pPr>
+        <w:numPr>
+          <w:ilvl w:val="0"/>
+          <w:numId w:val="1"/>
+        </w:numPr>
+      </w:pPr>
+      <w:r>
+        <w:t>Client và Employee kế thừa (generalization) từ User: cả hai đều có các thuộc tính chung của User (fullName, phoneNumber, email, password) plus các thuộc tính riêng.</w:t>
       </w:r>
     </w:p>
     <w:p>
@@ -5934,7 +6091,7 @@
       <w:r>
         <w:drawing>
           <wp:inline xmlns:a="http://schemas.openxmlformats.org/drawingml/2006/main" xmlns:pic="http://schemas.openxmlformats.org/drawingml/2006/picture">
-            <wp:extent cx="5486400" cy="4578056"/>
+            <wp:extent cx="5486400" cy="5089236"/>
             <wp:docPr id="7" name="Picture 7"/>
             <wp:cNvGraphicFramePr>
               <a:graphicFrameLocks noChangeAspect="1"/>
@@ -5955,7 +6112,7 @@
                   <pic:spPr>
                     <a:xfrm>
                       <a:off x="0" y="0"/>
-                      <a:ext cx="5486400" cy="4578056"/>
+                      <a:ext cx="5486400" cy="5089236"/>
                     </a:xfrm>
                     <a:prstGeom prst="rect"/>
                   </pic:spPr>
@@ -6038,7 +6195,7 @@
     <w:p>
       <w:pPr/>
       <w:r>
-        <w:t>Hoàn tất, hệ thống tạo phiên đăng nhập và chuyển hướng trang chủ.</w:t>
+        <w:t>Hoàn tất, hệ thống tạo phiên đăng nhập và chuyển hướng sang HomeView.</w:t>
       </w:r>
     </w:p>
     <w:p>
@@ -6050,7 +6207,7 @@
         <w:t>Boundary:</w:t>
       </w:r>
       <w:r>
-        <w:t xml:space="preserve"> LoginView</w:t>
+        <w:t xml:space="preserve"> LoginView, HomeView</w:t>
       </w:r>
     </w:p>
     <w:p>
@@ -6092,7 +6249,7 @@
     <w:p>
       <w:pPr/>
       <w:r>
-        <w:t xml:space="preserve">Người dùng nhập thông tin và nhấn nút Tiếp tục -&gt; hệ thống cần tạo tài khoản mới -&gt; cần chức năng </w:t>
+        <w:t xml:space="preserve">Người dùng nhập thông tin và nhấn nút Tiếp tục -&gt; hệ thống cần tạo tài khoản khách hàng mới -&gt; cần chức năng </w:t>
       </w:r>
       <w:r>
         <w:rPr>
@@ -6108,7 +6265,7 @@
         <w:rPr>
           <w:b/>
         </w:rPr>
-        <w:t>User</w:t>
+        <w:t>Client</w:t>
       </w:r>
       <w:r>
         <w:t>.</w:t>
@@ -6181,7 +6338,7 @@
         <w:t>Entity:</w:t>
       </w:r>
       <w:r>
-        <w:t xml:space="preserve"> User, OTP</w:t>
+        <w:t xml:space="preserve"> Client, OTP</w:t>
       </w:r>
     </w:p>
     <w:p>
@@ -6248,7 +6405,7 @@
     <w:p>
       <w:pPr/>
       <w:r>
-        <w:t>Hoàn tất, hệ thống cập nhật mật khẩu mới và thu hồi tất cả phiên đăng nhập khác.</w:t>
+        <w:t>Hoàn tất, hệ thống cập nhật mật khẩu mới, thu hồi tất cả phiên đăng nhập khác và chuyển hướng về LoginView.</w:t>
       </w:r>
     </w:p>
     <w:p>
@@ -6260,7 +6417,7 @@
         <w:t>Boundary:</w:t>
       </w:r>
       <w:r>
-        <w:t xml:space="preserve"> ChangePasswordView</w:t>
+        <w:t xml:space="preserve"> ChangePasswordView, LoginView</w:t>
       </w:r>
     </w:p>
     <w:p>
@@ -6318,7 +6475,7 @@
         <w:rPr>
           <w:b/>
         </w:rPr>
-        <w:t>User</w:t>
+        <w:t>Client</w:t>
       </w:r>
       <w:r>
         <w:t>.</w:t>
@@ -6343,7 +6500,7 @@
         <w:rPr>
           <w:b/>
         </w:rPr>
-        <w:t>User</w:t>
+        <w:t>Client</w:t>
       </w:r>
       <w:r>
         <w:t>.</w:t>
@@ -6382,7 +6539,7 @@
         <w:t>Entity:</w:t>
       </w:r>
       <w:r>
-        <w:t xml:space="preserve"> User</w:t>
+        <w:t xml:space="preserve"> Client</w:t>
       </w:r>
     </w:p>
     <w:p>
@@ -6561,7 +6718,7 @@
       <w:r>
         <w:drawing>
           <wp:inline xmlns:a="http://schemas.openxmlformats.org/drawingml/2006/main" xmlns:pic="http://schemas.openxmlformats.org/drawingml/2006/picture">
-            <wp:extent cx="5486400" cy="8206019"/>
+            <wp:extent cx="5486400" cy="3458069"/>
             <wp:docPr id="8" name="Picture 8"/>
             <wp:cNvGraphicFramePr>
               <a:graphicFrameLocks noChangeAspect="1"/>
@@ -6582,7 +6739,7 @@
                   <pic:spPr>
                     <a:xfrm>
                       <a:off x="0" y="0"/>
-                      <a:ext cx="5486400" cy="8206019"/>
+                      <a:ext cx="5486400" cy="3458069"/>
                     </a:xfrm>
                     <a:prstGeom prst="rect"/>
                   </pic:spPr>
@@ -6616,7 +6773,7 @@
       <w:r>
         <w:drawing>
           <wp:inline xmlns:a="http://schemas.openxmlformats.org/drawingml/2006/main" xmlns:pic="http://schemas.openxmlformats.org/drawingml/2006/picture">
-            <wp:extent cx="5486400" cy="2818112"/>
+            <wp:extent cx="5486400" cy="2559113"/>
             <wp:docPr id="9" name="Picture 9"/>
             <wp:cNvGraphicFramePr>
               <a:graphicFrameLocks noChangeAspect="1"/>
@@ -6637,7 +6794,7 @@
                   <pic:spPr>
                     <a:xfrm>
                       <a:off x="0" y="0"/>
-                      <a:ext cx="5486400" cy="2818112"/>
+                      <a:ext cx="5486400" cy="2559113"/>
                     </a:xfrm>
                     <a:prstGeom prst="rect"/>
                   </pic:spPr>
@@ -6719,7 +6876,7 @@
         </w:numPr>
       </w:pPr>
       <w:r>
-        <w:t>Lớp LoginView chuyển hướng trang chủ, hiển thị "Đăng nhập thành công".</w:t>
+        <w:t>Lớp LoginView chuyển hướng sang HomeView, hiển thị "Đăng nhập thành công".</w:t>
       </w:r>
     </w:p>
     <w:p>
@@ -6737,7 +6894,7 @@
       <w:r>
         <w:drawing>
           <wp:inline xmlns:a="http://schemas.openxmlformats.org/drawingml/2006/main" xmlns:pic="http://schemas.openxmlformats.org/drawingml/2006/picture">
-            <wp:extent cx="5486400" cy="3167456"/>
+            <wp:extent cx="5486400" cy="3105346"/>
             <wp:docPr id="10" name="Picture 10"/>
             <wp:cNvGraphicFramePr>
               <a:graphicFrameLocks noChangeAspect="1"/>
@@ -6758,7 +6915,7 @@
                   <pic:spPr>
                     <a:xfrm>
                       <a:off x="0" y="0"/>
-                      <a:ext cx="5486400" cy="3167456"/>
+                      <a:ext cx="5486400" cy="3105346"/>
                     </a:xfrm>
                     <a:prstGeom prst="rect"/>
                   </pic:spPr>
@@ -6775,7 +6932,7 @@
         <w:rPr>
           <w:b/>
         </w:rPr>
-        <w:t>Kịch bản phiên bản 2 – UC02 Đăng ký (8 bước)</w:t>
+        <w:t>Kịch bản phiên bản 2 – UC02 Đăng ký (9 bước)</w:t>
       </w:r>
     </w:p>
     <w:p>
@@ -6829,7 +6986,7 @@
         <w:t>register()</w:t>
       </w:r>
       <w:r>
-        <w:t xml:space="preserve"> của đối tượng User.</w:t>
+        <w:t xml:space="preserve"> của đối tượng Client.</w:t>
       </w:r>
     </w:p>
     <w:p>
@@ -6840,7 +6997,7 @@
         </w:numPr>
       </w:pPr>
       <w:r>
-        <w:t xml:space="preserve">Lớp User kiểm tra thông tin hợp lệ, gọi hàm </w:t>
+        <w:t xml:space="preserve">Lớp Client kiểm tra thông tin hợp lệ, gọi hàm </w:t>
       </w:r>
       <w:r>
         <w:rPr>
@@ -6900,10 +7057,21 @@
           <w:rFonts w:ascii="Courier New" w:hAnsi="Courier New"/>
           <w:sz w:val="20"/>
         </w:rPr>
-        <w:t>saveUser()</w:t>
-      </w:r>
-      <w:r>
-        <w:t xml:space="preserve"> của đối tượng User, hiển thị "Đăng ký thành công!".</w:t>
+        <w:t>saveClient()</w:t>
+      </w:r>
+      <w:r>
+        <w:t xml:space="preserve"> của đối tượng Client, hiển thị "Đăng ký thành công!".</w:t>
+      </w:r>
+    </w:p>
+    <w:p>
+      <w:pPr>
+        <w:numPr>
+          <w:ilvl w:val="0"/>
+          <w:numId w:val="2"/>
+        </w:numPr>
+      </w:pPr>
+      <w:r>
+        <w:t>Lớp OTPVerifyView chuyển hướng sang HomeView, tự động đăng nhập.</w:t>
       </w:r>
     </w:p>
     <w:p>
@@ -6921,7 +7089,7 @@
       <w:r>
         <w:drawing>
           <wp:inline xmlns:a="http://schemas.openxmlformats.org/drawingml/2006/main" xmlns:pic="http://schemas.openxmlformats.org/drawingml/2006/picture">
-            <wp:extent cx="5486400" cy="2434975"/>
+            <wp:extent cx="5486400" cy="2840388"/>
             <wp:docPr id="11" name="Picture 11"/>
             <wp:cNvGraphicFramePr>
               <a:graphicFrameLocks noChangeAspect="1"/>
@@ -6942,7 +7110,7 @@
                   <pic:spPr>
                     <a:xfrm>
                       <a:off x="0" y="0"/>
-                      <a:ext cx="5486400" cy="2434975"/>
+                      <a:ext cx="5486400" cy="2840388"/>
                     </a:xfrm>
                     <a:prstGeom prst="rect"/>
                   </pic:spPr>
@@ -6959,7 +7127,7 @@
         <w:rPr>
           <w:b/>
         </w:rPr>
-        <w:t>Kịch bản phiên bản 2 – UC03 Đổi mật khẩu (5 bước)</w:t>
+        <w:t>Kịch bản phiên bản 2 – UC03 Đổi mật khẩu (6 bước)</w:t>
       </w:r>
     </w:p>
     <w:p>
@@ -7024,7 +7192,18 @@
         </w:numPr>
       </w:pPr>
       <w:r>
-        <w:t>Lớp ChangePasswordView hiển thị "Đổi mật khẩu thành công", chuyển hướng về đăng nhập.</w:t>
+        <w:t>Lớp ChangePasswordView hiển thị "Đổi mật khẩu thành công".</w:t>
+      </w:r>
+    </w:p>
+    <w:p>
+      <w:pPr>
+        <w:numPr>
+          <w:ilvl w:val="0"/>
+          <w:numId w:val="2"/>
+        </w:numPr>
+      </w:pPr>
+      <w:r>
+        <w:t>Lớp ChangePasswordView chuyển hướng về giao diện Đăng nhập.</w:t>
       </w:r>
     </w:p>
     <w:p>
@@ -7042,7 +7221,7 @@
       <w:r>
         <w:drawing>
           <wp:inline xmlns:a="http://schemas.openxmlformats.org/drawingml/2006/main" xmlns:pic="http://schemas.openxmlformats.org/drawingml/2006/picture">
-            <wp:extent cx="5486400" cy="3901440"/>
+            <wp:extent cx="5486400" cy="3837482"/>
             <wp:docPr id="12" name="Picture 12"/>
             <wp:cNvGraphicFramePr>
               <a:graphicFrameLocks noChangeAspect="1"/>
@@ -7063,7 +7242,7 @@
                   <pic:spPr>
                     <a:xfrm>
                       <a:off x="0" y="0"/>
-                      <a:ext cx="5486400" cy="3901440"/>
+                      <a:ext cx="5486400" cy="3837482"/>
                     </a:xfrm>
                     <a:prstGeom prst="rect"/>
                   </pic:spPr>
@@ -7112,7 +7291,7 @@
         <w:t>getProfile()</w:t>
       </w:r>
       <w:r>
-        <w:t xml:space="preserve"> của đối tượng User.</w:t>
+        <w:t xml:space="preserve"> của đối tượng Client.</w:t>
       </w:r>
     </w:p>
     <w:p>
@@ -7166,7 +7345,7 @@
         <w:t>updateProfile()</w:t>
       </w:r>
       <w:r>
-        <w:t xml:space="preserve"> của đối tượng User.</w:t>
+        <w:t xml:space="preserve"> của đối tượng Client.</w:t>
       </w:r>
     </w:p>
     <w:p>

</xml_diff>

<commit_message>
fix: account Phase III logic consistency + DOCX heading/numbering
Logic (khớp Pha II analysis):
- Entity model: User base → Client + Employee inheritance, English attr names
  (fullName/loyaltyPoints/staffRole...) — drop merged-User/Vietnamese names
- ERD: single-table tblUser (role + nullable Client/Employee cols + FK)
- MVC diagram + Control signatures: add Client, English params, consistent names
- Re-render entity/erd/mvc diagrams via MCP PlantUML (renderer encoding bug)

DOCX format:
- determine_heading_level: strict 3-level N./N.N./N.N.N. + a) → H2/H3/H4
- numbered lists: per-list numId with startOverride → restart at 1 (was continuing)
- skip stray HTML comments leaking as body text

Co-Authored-By: Claude Opus 4.8 <noreply@anthropic.com>
</commit_message>
<xml_diff>
--- a/output/account_module.docx
+++ b/output/account_module.docx
@@ -24,7 +24,7 @@
     </w:p>
     <w:p>
       <w:pPr>
-        <w:pStyle w:val="Heading2"/>
+        <w:pStyle w:val="Heading3"/>
       </w:pPr>
       <w:r>
         <w:t>1.1. Bước 1 – Bổ sung thuộc tính id</w:t>
@@ -38,7 +38,14 @@
         </w:numPr>
       </w:pPr>
       <w:r>
-        <w:t xml:space="preserve">User: </w:t>
+        <w:rPr>
+          <w:rFonts w:ascii="Courier New" w:hAnsi="Courier New"/>
+          <w:sz w:val="20"/>
+        </w:rPr>
+        <w:t>User</w:t>
+      </w:r>
+      <w:r>
+        <w:t xml:space="preserve">: </w:t>
       </w:r>
       <w:r>
         <w:rPr>
@@ -46,6 +53,39 @@
           <w:sz w:val="20"/>
         </w:rPr>
         <w:t>id : int</w:t>
+      </w:r>
+      <w:r>
+        <w:t xml:space="preserve"> — lớp gốc; </w:t>
+      </w:r>
+      <w:r>
+        <w:rPr>
+          <w:rFonts w:ascii="Courier New" w:hAnsi="Courier New"/>
+          <w:sz w:val="20"/>
+        </w:rPr>
+        <w:t>Client</w:t>
+      </w:r>
+      <w:r>
+        <w:t xml:space="preserve"> và </w:t>
+      </w:r>
+      <w:r>
+        <w:rPr>
+          <w:rFonts w:ascii="Courier New" w:hAnsi="Courier New"/>
+          <w:sz w:val="20"/>
+        </w:rPr>
+        <w:t>Employee</w:t>
+      </w:r>
+      <w:r>
+        <w:t xml:space="preserve"> kế thừa </w:t>
+      </w:r>
+      <w:r>
+        <w:rPr>
+          <w:rFonts w:ascii="Courier New" w:hAnsi="Courier New"/>
+          <w:sz w:val="20"/>
+        </w:rPr>
+        <w:t>id</w:t>
+      </w:r>
+      <w:r>
+        <w:t xml:space="preserve"> này</w:t>
       </w:r>
     </w:p>
     <w:p>
@@ -56,7 +96,14 @@
         </w:numPr>
       </w:pPr>
       <w:r>
-        <w:t xml:space="preserve">MembershipTier: </w:t>
+        <w:rPr>
+          <w:rFonts w:ascii="Courier New" w:hAnsi="Courier New"/>
+          <w:sz w:val="20"/>
+        </w:rPr>
+        <w:t>MembershipTier</w:t>
+      </w:r>
+      <w:r>
+        <w:t xml:space="preserve">: </w:t>
       </w:r>
       <w:r>
         <w:rPr>
@@ -74,7 +121,14 @@
         </w:numPr>
       </w:pPr>
       <w:r>
-        <w:t xml:space="preserve">OTP: </w:t>
+        <w:rPr>
+          <w:rFonts w:ascii="Courier New" w:hAnsi="Courier New"/>
+          <w:sz w:val="20"/>
+        </w:rPr>
+        <w:t>OTP</w:t>
+      </w:r>
+      <w:r>
+        <w:t xml:space="preserve">: </w:t>
       </w:r>
       <w:r>
         <w:rPr>
@@ -92,7 +146,14 @@
         </w:numPr>
       </w:pPr>
       <w:r>
-        <w:t xml:space="preserve">LoginSession: </w:t>
+        <w:rPr>
+          <w:rFonts w:ascii="Courier New" w:hAnsi="Courier New"/>
+          <w:sz w:val="20"/>
+        </w:rPr>
+        <w:t>LoginSession</w:t>
+      </w:r>
+      <w:r>
+        <w:t xml:space="preserve">: </w:t>
       </w:r>
       <w:r>
         <w:rPr>
@@ -100,6 +161,14 @@
           <w:sz w:val="20"/>
         </w:rPr>
         <w:t>id : int</w:t>
+      </w:r>
+    </w:p>
+    <w:p>
+      <w:pPr>
+        <w:pStyle w:val="Heading3"/>
+      </w:pPr>
+      <w:r>
+        <w:t>1.2. Bước 2 – Thêm kiểu dữ liệu</w:t>
       </w:r>
     </w:p>
     <w:p>
@@ -110,7 +179,14 @@
         </w:numPr>
       </w:pPr>
       <w:r>
-        <w:t xml:space="preserve">Employee: </w:t>
+        <w:rPr>
+          <w:rFonts w:ascii="Courier New" w:hAnsi="Courier New"/>
+          <w:sz w:val="20"/>
+        </w:rPr>
+        <w:t>User</w:t>
+      </w:r>
+      <w:r>
+        <w:t xml:space="preserve"> (lớp cha): </w:t>
       </w:r>
       <w:r>
         <w:rPr>
@@ -119,13 +195,65 @@
         </w:rPr>
         <w:t>id : int</w:t>
       </w:r>
-    </w:p>
-    <w:p>
-      <w:pPr>
-        <w:pStyle w:val="Heading2"/>
-      </w:pPr>
-      <w:r>
-        <w:t>1.2. Bước 2 – Thêm kiểu dữ liệu</w:t>
+      <w:r>
+        <w:t xml:space="preserve">, </w:t>
+      </w:r>
+      <w:r>
+        <w:rPr>
+          <w:rFonts w:ascii="Courier New" w:hAnsi="Courier New"/>
+          <w:sz w:val="20"/>
+        </w:rPr>
+        <w:t>fullName : String</w:t>
+      </w:r>
+      <w:r>
+        <w:t xml:space="preserve">, </w:t>
+      </w:r>
+      <w:r>
+        <w:rPr>
+          <w:rFonts w:ascii="Courier New" w:hAnsi="Courier New"/>
+          <w:sz w:val="20"/>
+        </w:rPr>
+        <w:t>phoneNumber : String</w:t>
+      </w:r>
+      <w:r>
+        <w:t xml:space="preserve">, </w:t>
+      </w:r>
+      <w:r>
+        <w:rPr>
+          <w:rFonts w:ascii="Courier New" w:hAnsi="Courier New"/>
+          <w:sz w:val="20"/>
+        </w:rPr>
+        <w:t>email : String</w:t>
+      </w:r>
+      <w:r>
+        <w:t xml:space="preserve">, </w:t>
+      </w:r>
+      <w:r>
+        <w:rPr>
+          <w:rFonts w:ascii="Courier New" w:hAnsi="Courier New"/>
+          <w:sz w:val="20"/>
+        </w:rPr>
+        <w:t>password : String</w:t>
+      </w:r>
+      <w:r>
+        <w:t xml:space="preserve">, </w:t>
+      </w:r>
+      <w:r>
+        <w:rPr>
+          <w:rFonts w:ascii="Courier New" w:hAnsi="Courier New"/>
+          <w:sz w:val="20"/>
+        </w:rPr>
+        <w:t>role : String</w:t>
+      </w:r>
+      <w:r>
+        <w:t xml:space="preserve">, </w:t>
+      </w:r>
+      <w:r>
+        <w:rPr>
+          <w:rFonts w:ascii="Courier New" w:hAnsi="Courier New"/>
+          <w:sz w:val="20"/>
+        </w:rPr>
+        <w:t>createdAt : Date</w:t>
       </w:r>
     </w:p>
     <w:p>
@@ -136,34 +264,31 @@
         </w:numPr>
       </w:pPr>
       <w:r>
-        <w:t xml:space="preserve">User: </w:t>
-      </w:r>
-      <w:r>
         <w:rPr>
           <w:rFonts w:ascii="Courier New" w:hAnsi="Courier New"/>
           <w:sz w:val="20"/>
         </w:rPr>
-        <w:t>id : int</w:t>
-      </w:r>
-      <w:r>
-        <w:t xml:space="preserve">, </w:t>
+        <w:t>Client</w:t>
+      </w:r>
+      <w:r>
+        <w:t xml:space="preserve"> (kế thừa </w:t>
       </w:r>
       <w:r>
         <w:rPr>
           <w:rFonts w:ascii="Courier New" w:hAnsi="Courier New"/>
           <w:sz w:val="20"/>
         </w:rPr>
-        <w:t>hoTen : String</w:t>
-      </w:r>
-      <w:r>
-        <w:t xml:space="preserve">, </w:t>
+        <w:t>User</w:t>
+      </w:r>
+      <w:r>
+        <w:t xml:space="preserve">): </w:t>
       </w:r>
       <w:r>
         <w:rPr>
           <w:rFonts w:ascii="Courier New" w:hAnsi="Courier New"/>
           <w:sz w:val="20"/>
         </w:rPr>
-        <w:t>soDienThoai : String</w:t>
+        <w:t>loyaltyPoints : int</w:t>
       </w:r>
       <w:r>
         <w:t xml:space="preserve">, </w:t>
@@ -173,47 +298,7 @@
           <w:rFonts w:ascii="Courier New" w:hAnsi="Courier New"/>
           <w:sz w:val="20"/>
         </w:rPr>
-        <w:t>email : String</w:t>
-      </w:r>
-      <w:r>
-        <w:t xml:space="preserve">, </w:t>
-      </w:r>
-      <w:r>
-        <w:rPr>
-          <w:rFonts w:ascii="Courier New" w:hAnsi="Courier New"/>
-          <w:sz w:val="20"/>
-        </w:rPr>
-        <w:t>matKhau : String</w:t>
-      </w:r>
-      <w:r>
-        <w:t xml:space="preserve">, </w:t>
-      </w:r>
-      <w:r>
-        <w:rPr>
-          <w:rFonts w:ascii="Courier New" w:hAnsi="Courier New"/>
-          <w:sz w:val="20"/>
-        </w:rPr>
-        <w:t>ngayTao : Date</w:t>
-      </w:r>
-      <w:r>
-        <w:t xml:space="preserve">, </w:t>
-      </w:r>
-      <w:r>
-        <w:rPr>
-          <w:rFonts w:ascii="Courier New" w:hAnsi="Courier New"/>
-          <w:sz w:val="20"/>
-        </w:rPr>
-        <w:t>diemTichLuy : int</w:t>
-      </w:r>
-      <w:r>
-        <w:t xml:space="preserve">, </w:t>
-      </w:r>
-      <w:r>
-        <w:rPr>
-          <w:rFonts w:ascii="Courier New" w:hAnsi="Courier New"/>
-          <w:sz w:val="20"/>
-        </w:rPr>
-        <w:t>trangThai : String</w:t>
+        <w:t>joinedAt : Date</w:t>
       </w:r>
     </w:p>
     <w:p>
@@ -224,34 +309,31 @@
         </w:numPr>
       </w:pPr>
       <w:r>
-        <w:t xml:space="preserve">MembershipTier: </w:t>
-      </w:r>
-      <w:r>
         <w:rPr>
           <w:rFonts w:ascii="Courier New" w:hAnsi="Courier New"/>
           <w:sz w:val="20"/>
         </w:rPr>
-        <w:t>id : int</w:t>
-      </w:r>
-      <w:r>
-        <w:t xml:space="preserve">, </w:t>
+        <w:t>Employee</w:t>
+      </w:r>
+      <w:r>
+        <w:t xml:space="preserve"> (kế thừa </w:t>
       </w:r>
       <w:r>
         <w:rPr>
           <w:rFonts w:ascii="Courier New" w:hAnsi="Courier New"/>
           <w:sz w:val="20"/>
         </w:rPr>
-        <w:t>tenHang : String</w:t>
-      </w:r>
-      <w:r>
-        <w:t xml:space="preserve">, </w:t>
+        <w:t>User</w:t>
+      </w:r>
+      <w:r>
+        <w:t xml:space="preserve">): </w:t>
       </w:r>
       <w:r>
         <w:rPr>
           <w:rFonts w:ascii="Courier New" w:hAnsi="Courier New"/>
           <w:sz w:val="20"/>
         </w:rPr>
-        <w:t>diemToiThieu : int</w:t>
+        <w:t>staffRole : String</w:t>
       </w:r>
       <w:r>
         <w:t xml:space="preserve">, </w:t>
@@ -261,7 +343,7 @@
           <w:rFonts w:ascii="Courier New" w:hAnsi="Courier New"/>
           <w:sz w:val="20"/>
         </w:rPr>
-        <w:t>moTa : String</w:t>
+        <w:t>branch : String</w:t>
       </w:r>
       <w:r>
         <w:t xml:space="preserve">, </w:t>
@@ -271,7 +353,7 @@
           <w:rFonts w:ascii="Courier New" w:hAnsi="Courier New"/>
           <w:sz w:val="20"/>
         </w:rPr>
-        <w:t>heSoUuDai : double</w:t>
+        <w:t>status : String</w:t>
       </w:r>
     </w:p>
     <w:p>
@@ -282,7 +364,14 @@
         </w:numPr>
       </w:pPr>
       <w:r>
-        <w:t xml:space="preserve">OTP: </w:t>
+        <w:rPr>
+          <w:rFonts w:ascii="Courier New" w:hAnsi="Courier New"/>
+          <w:sz w:val="20"/>
+        </w:rPr>
+        <w:t>MembershipTier</w:t>
+      </w:r>
+      <w:r>
+        <w:t xml:space="preserve">: </w:t>
       </w:r>
       <w:r>
         <w:rPr>
@@ -299,7 +388,7 @@
           <w:rFonts w:ascii="Courier New" w:hAnsi="Courier New"/>
           <w:sz w:val="20"/>
         </w:rPr>
-        <w:t>maOTP : String</w:t>
+        <w:t>tierName : String</w:t>
       </w:r>
       <w:r>
         <w:t xml:space="preserve">, </w:t>
@@ -309,7 +398,7 @@
           <w:rFonts w:ascii="Courier New" w:hAnsi="Courier New"/>
           <w:sz w:val="20"/>
         </w:rPr>
-        <w:t>loai : String</w:t>
+        <w:t>minPoints : int</w:t>
       </w:r>
       <w:r>
         <w:t xml:space="preserve">, </w:t>
@@ -319,7 +408,7 @@
           <w:rFonts w:ascii="Courier New" w:hAnsi="Courier New"/>
           <w:sz w:val="20"/>
         </w:rPr>
-        <w:t>thoiHanHetHan : Date</w:t>
+        <w:t>description : String</w:t>
       </w:r>
       <w:r>
         <w:t xml:space="preserve">, </w:t>
@@ -329,7 +418,7 @@
           <w:rFonts w:ascii="Courier New" w:hAnsi="Courier New"/>
           <w:sz w:val="20"/>
         </w:rPr>
-        <w:t>daXacMinh : boolean</w:t>
+        <w:t>discountRate : double</w:t>
       </w:r>
     </w:p>
     <w:p>
@@ -340,7 +429,14 @@
         </w:numPr>
       </w:pPr>
       <w:r>
-        <w:t xml:space="preserve">LoginSession: </w:t>
+        <w:rPr>
+          <w:rFonts w:ascii="Courier New" w:hAnsi="Courier New"/>
+          <w:sz w:val="20"/>
+        </w:rPr>
+        <w:t>OTP</w:t>
+      </w:r>
+      <w:r>
+        <w:t xml:space="preserve">: </w:t>
       </w:r>
       <w:r>
         <w:rPr>
@@ -357,7 +453,7 @@
           <w:rFonts w:ascii="Courier New" w:hAnsi="Courier New"/>
           <w:sz w:val="20"/>
         </w:rPr>
-        <w:t>tokenPhien : String</w:t>
+        <w:t>otpCode : String</w:t>
       </w:r>
       <w:r>
         <w:t xml:space="preserve">, </w:t>
@@ -367,7 +463,7 @@
           <w:rFonts w:ascii="Courier New" w:hAnsi="Courier New"/>
           <w:sz w:val="20"/>
         </w:rPr>
-        <w:t>thoiGianDangNhap : DateTime</w:t>
+        <w:t>type : String</w:t>
       </w:r>
       <w:r>
         <w:t xml:space="preserve">, </w:t>
@@ -377,7 +473,7 @@
           <w:rFonts w:ascii="Courier New" w:hAnsi="Courier New"/>
           <w:sz w:val="20"/>
         </w:rPr>
-        <w:t>thoiGianHetHan : DateTime</w:t>
+        <w:t>expiresAt : Date</w:t>
       </w:r>
       <w:r>
         <w:t xml:space="preserve">, </w:t>
@@ -387,7 +483,7 @@
           <w:rFonts w:ascii="Courier New" w:hAnsi="Courier New"/>
           <w:sz w:val="20"/>
         </w:rPr>
-        <w:t>thietBi : String</w:t>
+        <w:t>verified : boolean</w:t>
       </w:r>
     </w:p>
     <w:p>
@@ -398,7 +494,14 @@
         </w:numPr>
       </w:pPr>
       <w:r>
-        <w:t xml:space="preserve">Employee: </w:t>
+        <w:rPr>
+          <w:rFonts w:ascii="Courier New" w:hAnsi="Courier New"/>
+          <w:sz w:val="20"/>
+        </w:rPr>
+        <w:t>LoginSession</w:t>
+      </w:r>
+      <w:r>
+        <w:t xml:space="preserve">: </w:t>
       </w:r>
       <w:r>
         <w:rPr>
@@ -415,7 +518,7 @@
           <w:rFonts w:ascii="Courier New" w:hAnsi="Courier New"/>
           <w:sz w:val="20"/>
         </w:rPr>
-        <w:t>hoTen : String</w:t>
+        <w:t>sessionToken : String</w:t>
       </w:r>
       <w:r>
         <w:t xml:space="preserve">, </w:t>
@@ -425,7 +528,7 @@
           <w:rFonts w:ascii="Courier New" w:hAnsi="Courier New"/>
           <w:sz w:val="20"/>
         </w:rPr>
-        <w:t>vaiTro : String</w:t>
+        <w:t>loginTime : DateTime</w:t>
       </w:r>
       <w:r>
         <w:t xml:space="preserve">, </w:t>
@@ -435,12 +538,22 @@
           <w:rFonts w:ascii="Courier New" w:hAnsi="Courier New"/>
           <w:sz w:val="20"/>
         </w:rPr>
-        <w:t>trangThai : String</w:t>
+        <w:t>expiresAt : DateTime</w:t>
+      </w:r>
+      <w:r>
+        <w:t xml:space="preserve">, </w:t>
+      </w:r>
+      <w:r>
+        <w:rPr>
+          <w:rFonts w:ascii="Courier New" w:hAnsi="Courier New"/>
+          <w:sz w:val="20"/>
+        </w:rPr>
+        <w:t>device : String</w:t>
       </w:r>
     </w:p>
     <w:p>
       <w:pPr>
-        <w:pStyle w:val="Heading2"/>
+        <w:pStyle w:val="Heading3"/>
       </w:pPr>
       <w:r>
         <w:t>1.3. Bước 3 – Chuyển quan hệ</w:t>
@@ -454,17 +567,34 @@
         </w:numPr>
       </w:pPr>
       <w:r>
-        <w:t xml:space="preserve">User </w:t>
-      </w:r>
-      <w:r>
         <w:rPr>
           <w:rFonts w:ascii="Courier New" w:hAnsi="Courier New"/>
           <w:sz w:val="20"/>
         </w:rPr>
-        <w:t>o--</w:t>
-      </w:r>
-      <w:r>
-        <w:t xml:space="preserve"> MembershipTier: aggregation (hạng hội viên là danh mục độc lập)</w:t>
+        <w:t>Client</w:t>
+      </w:r>
+      <w:r>
+        <w:t xml:space="preserve"> kế thừa </w:t>
+      </w:r>
+      <w:r>
+        <w:rPr>
+          <w:rFonts w:ascii="Courier New" w:hAnsi="Courier New"/>
+          <w:sz w:val="20"/>
+        </w:rPr>
+        <w:t>User</w:t>
+      </w:r>
+      <w:r>
+        <w:t xml:space="preserve">: generalization (khách hàng là </w:t>
+      </w:r>
+      <w:r>
+        <w:rPr>
+          <w:rFonts w:ascii="Courier New" w:hAnsi="Courier New"/>
+          <w:sz w:val="20"/>
+        </w:rPr>
+        <w:t>User</w:t>
+      </w:r>
+      <w:r>
+        <w:t xml:space="preserve"> có vai trò CLIENT)</w:t>
       </w:r>
     </w:p>
     <w:p>
@@ -475,17 +605,34 @@
         </w:numPr>
       </w:pPr>
       <w:r>
-        <w:t xml:space="preserve">User </w:t>
-      </w:r>
-      <w:r>
         <w:rPr>
           <w:rFonts w:ascii="Courier New" w:hAnsi="Courier New"/>
           <w:sz w:val="20"/>
         </w:rPr>
-        <w:t>*--</w:t>
-      </w:r>
-      <w:r>
-        <w:t xml:space="preserve"> OTP: composition (OTP không tồn tại độc lập)</w:t>
+        <w:t>Employee</w:t>
+      </w:r>
+      <w:r>
+        <w:t xml:space="preserve"> kế thừa </w:t>
+      </w:r>
+      <w:r>
+        <w:rPr>
+          <w:rFonts w:ascii="Courier New" w:hAnsi="Courier New"/>
+          <w:sz w:val="20"/>
+        </w:rPr>
+        <w:t>User</w:t>
+      </w:r>
+      <w:r>
+        <w:t xml:space="preserve">: generalization (nhân viên là </w:t>
+      </w:r>
+      <w:r>
+        <w:rPr>
+          <w:rFonts w:ascii="Courier New" w:hAnsi="Courier New"/>
+          <w:sz w:val="20"/>
+        </w:rPr>
+        <w:t>User</w:t>
+      </w:r>
+      <w:r>
+        <w:t xml:space="preserve"> có vai trò EMPLOYEE)</w:t>
       </w:r>
     </w:p>
     <w:p>
@@ -496,25 +643,34 @@
         </w:numPr>
       </w:pPr>
       <w:r>
-        <w:t xml:space="preserve">User </w:t>
-      </w:r>
-      <w:r>
         <w:rPr>
           <w:rFonts w:ascii="Courier New" w:hAnsi="Courier New"/>
           <w:sz w:val="20"/>
         </w:rPr>
-        <w:t>*--</w:t>
-      </w:r>
-      <w:r>
-        <w:t xml:space="preserve"> LoginSession: composition (phiên không tồn tại độc lập)</w:t>
-      </w:r>
-    </w:p>
-    <w:p>
-      <w:pPr>
-        <w:pStyle w:val="Heading2"/>
-      </w:pPr>
-      <w:r>
-        <w:t>1.4. Bước 4 – Bổ sung thuộc tính kiểu đối tượng</w:t>
+        <w:t>Client</w:t>
+      </w:r>
+      <w:r>
+        <w:t xml:space="preserve"> </w:t>
+      </w:r>
+      <w:r>
+        <w:rPr>
+          <w:rFonts w:ascii="Courier New" w:hAnsi="Courier New"/>
+          <w:sz w:val="20"/>
+        </w:rPr>
+        <w:t>o--</w:t>
+      </w:r>
+      <w:r>
+        <w:t xml:space="preserve"> </w:t>
+      </w:r>
+      <w:r>
+        <w:rPr>
+          <w:rFonts w:ascii="Courier New" w:hAnsi="Courier New"/>
+          <w:sz w:val="20"/>
+        </w:rPr>
+        <w:t>MembershipTier</w:t>
+      </w:r>
+      <w:r>
+        <w:t>: aggregation (hạng hội viên là danh mục độc lập, chỉ khách hàng có)</w:t>
       </w:r>
     </w:p>
     <w:p>
@@ -525,14 +681,34 @@
         </w:numPr>
       </w:pPr>
       <w:r>
-        <w:t xml:space="preserve">User: </w:t>
-      </w:r>
-      <w:r>
         <w:rPr>
           <w:rFonts w:ascii="Courier New" w:hAnsi="Courier New"/>
           <w:sz w:val="20"/>
         </w:rPr>
-        <w:t>membershipTier : MembershipTier</w:t>
+        <w:t>User</w:t>
+      </w:r>
+      <w:r>
+        <w:t xml:space="preserve"> </w:t>
+      </w:r>
+      <w:r>
+        <w:rPr>
+          <w:rFonts w:ascii="Courier New" w:hAnsi="Courier New"/>
+          <w:sz w:val="20"/>
+        </w:rPr>
+        <w:t>*--</w:t>
+      </w:r>
+      <w:r>
+        <w:t xml:space="preserve"> </w:t>
+      </w:r>
+      <w:r>
+        <w:rPr>
+          <w:rFonts w:ascii="Courier New" w:hAnsi="Courier New"/>
+          <w:sz w:val="20"/>
+        </w:rPr>
+        <w:t>OTP</w:t>
+      </w:r>
+      <w:r>
+        <w:t>: composition (OTP không tồn tại độc lập)</w:t>
       </w:r>
     </w:p>
     <w:p>
@@ -543,14 +719,42 @@
         </w:numPr>
       </w:pPr>
       <w:r>
-        <w:t xml:space="preserve">LoginSession: </w:t>
-      </w:r>
-      <w:r>
         <w:rPr>
           <w:rFonts w:ascii="Courier New" w:hAnsi="Courier New"/>
           <w:sz w:val="20"/>
         </w:rPr>
-        <w:t>user : User</w:t>
+        <w:t>User</w:t>
+      </w:r>
+      <w:r>
+        <w:t xml:space="preserve"> </w:t>
+      </w:r>
+      <w:r>
+        <w:rPr>
+          <w:rFonts w:ascii="Courier New" w:hAnsi="Courier New"/>
+          <w:sz w:val="20"/>
+        </w:rPr>
+        <w:t>*--</w:t>
+      </w:r>
+      <w:r>
+        <w:t xml:space="preserve"> </w:t>
+      </w:r>
+      <w:r>
+        <w:rPr>
+          <w:rFonts w:ascii="Courier New" w:hAnsi="Courier New"/>
+          <w:sz w:val="20"/>
+        </w:rPr>
+        <w:t>LoginSession</w:t>
+      </w:r>
+      <w:r>
+        <w:t>: composition (phiên không tồn tại độc lập)</w:t>
+      </w:r>
+    </w:p>
+    <w:p>
+      <w:pPr>
+        <w:pStyle w:val="Heading3"/>
+      </w:pPr>
+      <w:r>
+        <w:t>1.4. Bước 4 – Bổ sung thuộc tính kiểu đối tượng</w:t>
       </w:r>
     </w:p>
     <w:p>
@@ -561,7 +765,39 @@
         </w:numPr>
       </w:pPr>
       <w:r>
-        <w:t xml:space="preserve">OTP: </w:t>
+        <w:rPr>
+          <w:rFonts w:ascii="Courier New" w:hAnsi="Courier New"/>
+          <w:sz w:val="20"/>
+        </w:rPr>
+        <w:t>Client</w:t>
+      </w:r>
+      <w:r>
+        <w:t xml:space="preserve">: </w:t>
+      </w:r>
+      <w:r>
+        <w:rPr>
+          <w:rFonts w:ascii="Courier New" w:hAnsi="Courier New"/>
+          <w:sz w:val="20"/>
+        </w:rPr>
+        <w:t>membershipTier : MembershipTier</w:t>
+      </w:r>
+    </w:p>
+    <w:p>
+      <w:pPr>
+        <w:numPr>
+          <w:ilvl w:val="0"/>
+          <w:numId w:val="1"/>
+        </w:numPr>
+      </w:pPr>
+      <w:r>
+        <w:rPr>
+          <w:rFonts w:ascii="Courier New" w:hAnsi="Courier New"/>
+          <w:sz w:val="20"/>
+        </w:rPr>
+        <w:t>OTP</w:t>
+      </w:r>
+      <w:r>
+        <w:t xml:space="preserve">: </w:t>
       </w:r>
       <w:r>
         <w:rPr>
@@ -573,7 +809,32 @@
     </w:p>
     <w:p>
       <w:pPr>
-        <w:pStyle w:val="Heading2"/>
+        <w:numPr>
+          <w:ilvl w:val="0"/>
+          <w:numId w:val="1"/>
+        </w:numPr>
+      </w:pPr>
+      <w:r>
+        <w:rPr>
+          <w:rFonts w:ascii="Courier New" w:hAnsi="Courier New"/>
+          <w:sz w:val="20"/>
+        </w:rPr>
+        <w:t>LoginSession</w:t>
+      </w:r>
+      <w:r>
+        <w:t xml:space="preserve">: </w:t>
+      </w:r>
+      <w:r>
+        <w:rPr>
+          <w:rFonts w:ascii="Courier New" w:hAnsi="Courier New"/>
+          <w:sz w:val="20"/>
+        </w:rPr>
+        <w:t>user : User</w:t>
+      </w:r>
+    </w:p>
+    <w:p>
+      <w:pPr>
+        <w:pStyle w:val="Heading3"/>
       </w:pPr>
       <w:r>
         <w:t>1.5. Biểu đồ lớp thực thể</w:t>
@@ -586,7 +847,7 @@
       <w:r>
         <w:drawing>
           <wp:inline xmlns:a="http://schemas.openxmlformats.org/drawingml/2006/main" xmlns:pic="http://schemas.openxmlformats.org/drawingml/2006/picture">
-            <wp:extent cx="5486400" cy="3711627"/>
+            <wp:extent cx="5486400" cy="4909663"/>
             <wp:docPr id="1" name="Picture 1"/>
             <wp:cNvGraphicFramePr>
               <a:graphicFrameLocks noChangeAspect="1"/>
@@ -607,7 +868,7 @@
                   <pic:spPr>
                     <a:xfrm>
                       <a:off x="0" y="0"/>
-                      <a:ext cx="5486400" cy="3711627"/>
+                      <a:ext cx="5486400" cy="4909663"/>
                     </a:xfrm>
                     <a:prstGeom prst="rect"/>
                   </pic:spPr>
@@ -628,10 +889,105 @@
     </w:p>
     <w:p>
       <w:pPr>
-        <w:pStyle w:val="Heading2"/>
+        <w:pStyle w:val="Heading3"/>
       </w:pPr>
       <w:r>
         <w:t>2.1. Bước 1 – Tạo bảng</w:t>
+      </w:r>
+    </w:p>
+    <w:p>
+      <w:pPr/>
+      <w:r>
+        <w:t xml:space="preserve">Ánh xạ kế thừa kiểu </w:t>
+      </w:r>
+      <w:r>
+        <w:rPr>
+          <w:b/>
+        </w:rPr>
+        <w:t>single-table</w:t>
+      </w:r>
+      <w:r>
+        <w:t xml:space="preserve">: gộp </w:t>
+      </w:r>
+      <w:r>
+        <w:rPr>
+          <w:rFonts w:ascii="Courier New" w:hAnsi="Courier New"/>
+          <w:sz w:val="20"/>
+        </w:rPr>
+        <w:t>User</w:t>
+      </w:r>
+      <w:r>
+        <w:t xml:space="preserve">, </w:t>
+      </w:r>
+      <w:r>
+        <w:rPr>
+          <w:rFonts w:ascii="Courier New" w:hAnsi="Courier New"/>
+          <w:sz w:val="20"/>
+        </w:rPr>
+        <w:t>Client</w:t>
+      </w:r>
+      <w:r>
+        <w:t xml:space="preserve">, </w:t>
+      </w:r>
+      <w:r>
+        <w:rPr>
+          <w:rFonts w:ascii="Courier New" w:hAnsi="Courier New"/>
+          <w:sz w:val="20"/>
+        </w:rPr>
+        <w:t>Employee</w:t>
+      </w:r>
+      <w:r>
+        <w:t xml:space="preserve"> vào một bảng </w:t>
+      </w:r>
+      <w:r>
+        <w:rPr>
+          <w:rFonts w:ascii="Courier New" w:hAnsi="Courier New"/>
+          <w:sz w:val="20"/>
+        </w:rPr>
+        <w:t>tblUser</w:t>
+      </w:r>
+      <w:r>
+        <w:t xml:space="preserve">, dùng cột </w:t>
+      </w:r>
+      <w:r>
+        <w:rPr>
+          <w:rFonts w:ascii="Courier New" w:hAnsi="Courier New"/>
+          <w:sz w:val="20"/>
+        </w:rPr>
+        <w:t>role</w:t>
+      </w:r>
+      <w:r>
+        <w:t xml:space="preserve"> để phân biệt; thuộc tính riêng của </w:t>
+      </w:r>
+      <w:r>
+        <w:rPr>
+          <w:rFonts w:ascii="Courier New" w:hAnsi="Courier New"/>
+          <w:sz w:val="20"/>
+        </w:rPr>
+        <w:t>Client</w:t>
+      </w:r>
+      <w:r>
+        <w:t>/</w:t>
+      </w:r>
+      <w:r>
+        <w:rPr>
+          <w:rFonts w:ascii="Courier New" w:hAnsi="Courier New"/>
+          <w:sz w:val="20"/>
+        </w:rPr>
+        <w:t>Employee</w:t>
+      </w:r>
+      <w:r>
+        <w:t xml:space="preserve"> để </w:t>
+      </w:r>
+      <w:r>
+        <w:rPr>
+          <w:rFonts w:ascii="Courier New" w:hAnsi="Courier New"/>
+          <w:sz w:val="20"/>
+        </w:rPr>
+        <w:t>NULL</w:t>
+      </w:r>
+      <w:r>
+        <w:t xml:space="preserve"> khi không áp dụng.</w:t>
       </w:r>
     </w:p>
     <w:tbl>
@@ -692,7 +1048,7 @@
               <w:rPr>
                 <w:sz w:val="20"/>
               </w:rPr>
-              <w:t>User</w:t>
+              <w:t>User, Client, Employee (kế thừa)</w:t>
             </w:r>
           </w:p>
         </w:tc>
@@ -804,38 +1160,6 @@
                 <w:sz w:val="20"/>
               </w:rPr>
               <w:t>tblLoginSession</w:t>
-            </w:r>
-          </w:p>
-        </w:tc>
-      </w:tr>
-      <w:tr>
-        <w:tc>
-          <w:tcPr>
-            <w:tcW w:type="dxa" w:w="4320"/>
-          </w:tcPr>
-          <w:p>
-            <w:pPr/>
-            <w:r/>
-            <w:r>
-              <w:rPr>
-                <w:sz w:val="20"/>
-              </w:rPr>
-              <w:t>Employee</w:t>
-            </w:r>
-          </w:p>
-        </w:tc>
-        <w:tc>
-          <w:tcPr>
-            <w:tcW w:type="dxa" w:w="4320"/>
-          </w:tcPr>
-          <w:p>
-            <w:pPr/>
-            <w:r/>
-            <w:r>
-              <w:rPr>
-                <w:sz w:val="20"/>
-              </w:rPr>
-              <w:t>tblEmployee</w:t>
             </w:r>
           </w:p>
         </w:tc>
@@ -843,7 +1167,7 @@
     </w:tbl>
     <w:p>
       <w:pPr>
-        <w:pStyle w:val="Heading2"/>
+        <w:pStyle w:val="Heading3"/>
       </w:pPr>
       <w:r>
         <w:t>2.2. Bước 2 – Chuyển kiểu dữ liệu</w:t>
@@ -1055,10 +1379,42 @@
           </w:p>
         </w:tc>
       </w:tr>
+      <w:tr>
+        <w:tc>
+          <w:tcPr>
+            <w:tcW w:type="dxa" w:w="4320"/>
+          </w:tcPr>
+          <w:p>
+            <w:pPr/>
+            <w:r/>
+            <w:r>
+              <w:rPr>
+                <w:sz w:val="20"/>
+              </w:rPr>
+              <w:t>boolean</w:t>
+            </w:r>
+          </w:p>
+        </w:tc>
+        <w:tc>
+          <w:tcPr>
+            <w:tcW w:type="dxa" w:w="4320"/>
+          </w:tcPr>
+          <w:p>
+            <w:pPr/>
+            <w:r/>
+            <w:r>
+              <w:rPr>
+                <w:sz w:val="20"/>
+              </w:rPr>
+              <w:t>bit</w:t>
+            </w:r>
+          </w:p>
+        </w:tc>
+      </w:tr>
     </w:tbl>
     <w:p>
       <w:pPr>
-        <w:pStyle w:val="Heading2"/>
+        <w:pStyle w:val="Heading3"/>
       </w:pPr>
       <w:r>
         <w:t>2.3. Bước 3 – Xử lý cardinality</w:t>
@@ -1072,7 +1428,34 @@
         </w:numPr>
       </w:pPr>
       <w:r>
-        <w:t xml:space="preserve">User – MembershipTier (n-1): tblUser có FK </w:t>
+        <w:rPr>
+          <w:rFonts w:ascii="Courier New" w:hAnsi="Courier New"/>
+          <w:sz w:val="20"/>
+        </w:rPr>
+        <w:t>Client</w:t>
+      </w:r>
+      <w:r>
+        <w:t xml:space="preserve"> – </w:t>
+      </w:r>
+      <w:r>
+        <w:rPr>
+          <w:rFonts w:ascii="Courier New" w:hAnsi="Courier New"/>
+          <w:sz w:val="20"/>
+        </w:rPr>
+        <w:t>MembershipTier</w:t>
+      </w:r>
+      <w:r>
+        <w:t xml:space="preserve"> (n-1): </w:t>
+      </w:r>
+      <w:r>
+        <w:rPr>
+          <w:rFonts w:ascii="Courier New" w:hAnsi="Courier New"/>
+          <w:sz w:val="20"/>
+        </w:rPr>
+        <w:t>tblUser</w:t>
+      </w:r>
+      <w:r>
+        <w:t xml:space="preserve"> có FK </w:t>
       </w:r>
       <w:r>
         <w:rPr>
@@ -1080,6 +1463,19 @@
           <w:sz w:val="20"/>
         </w:rPr>
         <w:t>tblMembershipTierMa</w:t>
+      </w:r>
+      <w:r>
+        <w:t xml:space="preserve"> (chỉ dòng </w:t>
+      </w:r>
+      <w:r>
+        <w:rPr>
+          <w:rFonts w:ascii="Courier New" w:hAnsi="Courier New"/>
+          <w:sz w:val="20"/>
+        </w:rPr>
+        <w:t>role = CLIENT</w:t>
+      </w:r>
+      <w:r>
+        <w:t xml:space="preserve"> dùng, NULL với dòng khác)</w:t>
       </w:r>
     </w:p>
     <w:p>
@@ -1090,7 +1486,34 @@
         </w:numPr>
       </w:pPr>
       <w:r>
-        <w:t xml:space="preserve">User – OTP (1-n): tblOTP có FK </w:t>
+        <w:rPr>
+          <w:rFonts w:ascii="Courier New" w:hAnsi="Courier New"/>
+          <w:sz w:val="20"/>
+        </w:rPr>
+        <w:t>User</w:t>
+      </w:r>
+      <w:r>
+        <w:t xml:space="preserve"> – </w:t>
+      </w:r>
+      <w:r>
+        <w:rPr>
+          <w:rFonts w:ascii="Courier New" w:hAnsi="Courier New"/>
+          <w:sz w:val="20"/>
+        </w:rPr>
+        <w:t>OTP</w:t>
+      </w:r>
+      <w:r>
+        <w:t xml:space="preserve"> (1-n): </w:t>
+      </w:r>
+      <w:r>
+        <w:rPr>
+          <w:rFonts w:ascii="Courier New" w:hAnsi="Courier New"/>
+          <w:sz w:val="20"/>
+        </w:rPr>
+        <w:t>tblOTP</w:t>
+      </w:r>
+      <w:r>
+        <w:t xml:space="preserve"> có FK </w:t>
       </w:r>
       <w:r>
         <w:rPr>
@@ -1108,7 +1531,34 @@
         </w:numPr>
       </w:pPr>
       <w:r>
-        <w:t xml:space="preserve">User – LoginSession (1-n): tblLoginSession có FK </w:t>
+        <w:rPr>
+          <w:rFonts w:ascii="Courier New" w:hAnsi="Courier New"/>
+          <w:sz w:val="20"/>
+        </w:rPr>
+        <w:t>User</w:t>
+      </w:r>
+      <w:r>
+        <w:t xml:space="preserve"> – </w:t>
+      </w:r>
+      <w:r>
+        <w:rPr>
+          <w:rFonts w:ascii="Courier New" w:hAnsi="Courier New"/>
+          <w:sz w:val="20"/>
+        </w:rPr>
+        <w:t>LoginSession</w:t>
+      </w:r>
+      <w:r>
+        <w:t xml:space="preserve"> (1-n): </w:t>
+      </w:r>
+      <w:r>
+        <w:rPr>
+          <w:rFonts w:ascii="Courier New" w:hAnsi="Courier New"/>
+          <w:sz w:val="20"/>
+        </w:rPr>
+        <w:t>tblLoginSession</w:t>
+      </w:r>
+      <w:r>
+        <w:t xml:space="preserve"> có FK </w:t>
       </w:r>
       <w:r>
         <w:rPr>
@@ -1120,7 +1570,7 @@
     </w:p>
     <w:p>
       <w:pPr>
-        <w:pStyle w:val="Heading2"/>
+        <w:pStyle w:val="Heading3"/>
       </w:pPr>
       <w:r>
         <w:t>2.4. Bước 4 – PK/FK</w:t>
@@ -1164,7 +1614,68 @@
     </w:p>
     <w:p>
       <w:pPr>
-        <w:pStyle w:val="Heading2"/>
+        <w:numPr>
+          <w:ilvl w:val="0"/>
+          <w:numId w:val="1"/>
+        </w:numPr>
+      </w:pPr>
+      <w:r>
+        <w:t xml:space="preserve">Cột </w:t>
+      </w:r>
+      <w:r>
+        <w:rPr>
+          <w:rFonts w:ascii="Courier New" w:hAnsi="Courier New"/>
+          <w:sz w:val="20"/>
+        </w:rPr>
+        <w:t>role</w:t>
+      </w:r>
+      <w:r>
+        <w:t xml:space="preserve"> (</w:t>
+      </w:r>
+      <w:r>
+        <w:rPr>
+          <w:rFonts w:ascii="Courier New" w:hAnsi="Courier New"/>
+          <w:sz w:val="20"/>
+        </w:rPr>
+        <w:t>CLIENT</w:t>
+      </w:r>
+      <w:r>
+        <w:t xml:space="preserve"> / </w:t>
+      </w:r>
+      <w:r>
+        <w:rPr>
+          <w:rFonts w:ascii="Courier New" w:hAnsi="Courier New"/>
+          <w:sz w:val="20"/>
+        </w:rPr>
+        <w:t>EMPLOYEE</w:t>
+      </w:r>
+      <w:r>
+        <w:t xml:space="preserve"> / </w:t>
+      </w:r>
+      <w:r>
+        <w:rPr>
+          <w:rFonts w:ascii="Courier New" w:hAnsi="Courier New"/>
+          <w:sz w:val="20"/>
+        </w:rPr>
+        <w:t>ADMIN</w:t>
+      </w:r>
+      <w:r>
+        <w:t xml:space="preserve">) phân biệt loại người dùng trong bảng </w:t>
+      </w:r>
+      <w:r>
+        <w:rPr>
+          <w:rFonts w:ascii="Courier New" w:hAnsi="Courier New"/>
+          <w:sz w:val="20"/>
+        </w:rPr>
+        <w:t>tblUser</w:t>
+      </w:r>
+      <w:r>
+        <w:t xml:space="preserve"> gộp</w:t>
+      </w:r>
+    </w:p>
+    <w:p>
+      <w:pPr>
+        <w:pStyle w:val="Heading3"/>
       </w:pPr>
       <w:r>
         <w:t>2.5. Biểu đồ ERD</w:t>
@@ -1177,7 +1688,7 @@
       <w:r>
         <w:drawing>
           <wp:inline xmlns:a="http://schemas.openxmlformats.org/drawingml/2006/main" xmlns:pic="http://schemas.openxmlformats.org/drawingml/2006/picture">
-            <wp:extent cx="5486400" cy="6374318"/>
+            <wp:extent cx="5486400" cy="3872317"/>
             <wp:docPr id="2" name="Picture 2"/>
             <wp:cNvGraphicFramePr>
               <a:graphicFrameLocks noChangeAspect="1"/>
@@ -1198,7 +1709,7 @@
                   <pic:spPr>
                     <a:xfrm>
                       <a:off x="0" y="0"/>
-                      <a:ext cx="5486400" cy="6374318"/>
+                      <a:ext cx="5486400" cy="3872317"/>
                     </a:xfrm>
                     <a:prstGeom prst="rect"/>
                   </pic:spPr>
@@ -1219,7 +1730,7 @@
     </w:p>
     <w:p>
       <w:pPr>
-        <w:pStyle w:val="Heading2"/>
+        <w:pStyle w:val="Heading3"/>
       </w:pPr>
       <w:r>
         <w:t>3.1. Màn hình đăng nhập</w:t>
@@ -1262,7 +1773,7 @@
     </w:p>
     <w:p>
       <w:pPr>
-        <w:pStyle w:val="Heading2"/>
+        <w:pStyle w:val="Heading3"/>
       </w:pPr>
       <w:r>
         <w:t>3.2. Màn hình đăng ký</w:t>
@@ -1299,7 +1810,7 @@
     </w:p>
     <w:p>
       <w:pPr>
-        <w:pStyle w:val="Heading2"/>
+        <w:pStyle w:val="Heading3"/>
       </w:pPr>
       <w:r>
         <w:t>3.3. Màn hình xác nhận OTP</w:t>
@@ -1330,7 +1841,7 @@
     </w:p>
     <w:p>
       <w:pPr>
-        <w:pStyle w:val="Heading2"/>
+        <w:pStyle w:val="Heading3"/>
       </w:pPr>
       <w:r>
         <w:t>3.4. Màn hình đổi mật khẩu</w:t>
@@ -1363,7 +1874,7 @@
     </w:p>
     <w:p>
       <w:pPr>
-        <w:pStyle w:val="Heading2"/>
+        <w:pStyle w:val="Heading3"/>
       </w:pPr>
       <w:r>
         <w:t>3.5. Màn hình hồ sơ cá nhân</w:t>
@@ -1400,7 +1911,7 @@
     </w:p>
     <w:p>
       <w:pPr>
-        <w:pStyle w:val="Heading2"/>
+        <w:pStyle w:val="Heading3"/>
       </w:pPr>
       <w:r>
         <w:t>3.6. Màn hình quản lý nhân viên</w:t>
@@ -1453,7 +1964,7 @@
     </w:p>
     <w:p>
       <w:pPr>
-        <w:pStyle w:val="Heading2"/>
+        <w:pStyle w:val="Heading3"/>
       </w:pPr>
       <w:r>
         <w:t>4.1. Tổng quan kiến trúc</w:t>
@@ -1498,12 +2009,12 @@
         <w:t>Entity:</w:t>
       </w:r>
       <w:r>
-        <w:t xml:space="preserve"> User, MembershipTier, OTP, LoginSession, Employee</w:t>
+        <w:t xml:space="preserve"> User, Client, Employee, MembershipTier, OTP, LoginSession</w:t>
       </w:r>
     </w:p>
     <w:p>
       <w:pPr>
-        <w:pStyle w:val="Heading2"/>
+        <w:pStyle w:val="Heading3"/>
       </w:pPr>
       <w:r>
         <w:t>4.2. Quy trình xác định chữ ký hàm Controller</w:t>
@@ -1663,7 +2174,7 @@
         </w:numPr>
       </w:pPr>
       <w:r>
-        <w:t>Input: hoTen, sdt, email, matKhau</w:t>
+        <w:t>Input: fullName, phoneNumber, email, password</w:t>
       </w:r>
     </w:p>
     <w:p>
@@ -1871,7 +2382,7 @@
         </w:numPr>
       </w:pPr>
       <w:r>
-        <w:t>Input: mkHienTai, mkMoi</w:t>
+        <w:t>Input: currentPassword, newPassword</w:t>
       </w:r>
     </w:p>
     <w:p>
@@ -2079,7 +2590,7 @@
         </w:numPr>
       </w:pPr>
       <w:r>
-        <w:t>Input: userId, hoTen, email</w:t>
+        <w:t>Input: userId, fullName, email</w:t>
       </w:r>
     </w:p>
     <w:p>
@@ -2782,7 +3293,7 @@
       <w:r>
         <w:drawing>
           <wp:inline xmlns:a="http://schemas.openxmlformats.org/drawingml/2006/main" xmlns:pic="http://schemas.openxmlformats.org/drawingml/2006/picture">
-            <wp:extent cx="5486400" cy="4756649"/>
+            <wp:extent cx="5486400" cy="7120816"/>
             <wp:docPr id="3" name="Picture 3"/>
             <wp:cNvGraphicFramePr>
               <a:graphicFrameLocks noChangeAspect="1"/>
@@ -2803,7 +3314,7 @@
                   <pic:spPr>
                     <a:xfrm>
                       <a:off x="0" y="0"/>
-                      <a:ext cx="5486400" cy="4756649"/>
+                      <a:ext cx="5486400" cy="7120816"/>
                     </a:xfrm>
                     <a:prstGeom prst="rect"/>
                   </pic:spPr>
@@ -2824,7 +3335,7 @@
     </w:p>
     <w:p>
       <w:pPr>
-        <w:pStyle w:val="Heading2"/>
+        <w:pStyle w:val="Heading3"/>
       </w:pPr>
       <w:r>
         <w:t>5.1. Đăng nhập</w:t>
@@ -2882,7 +3393,7 @@
       <w:pPr>
         <w:numPr>
           <w:ilvl w:val="0"/>
-          <w:numId w:val="2"/>
+          <w:numId w:val="10"/>
         </w:numPr>
       </w:pPr>
       <w:r>
@@ -2903,7 +3414,7 @@
       <w:pPr>
         <w:numPr>
           <w:ilvl w:val="0"/>
-          <w:numId w:val="2"/>
+          <w:numId w:val="10"/>
         </w:numPr>
       </w:pPr>
       <w:r>
@@ -2924,7 +3435,7 @@
       <w:pPr>
         <w:numPr>
           <w:ilvl w:val="0"/>
-          <w:numId w:val="2"/>
+          <w:numId w:val="10"/>
         </w:numPr>
       </w:pPr>
       <w:r>
@@ -2935,7 +3446,7 @@
       <w:pPr>
         <w:numPr>
           <w:ilvl w:val="0"/>
-          <w:numId w:val="2"/>
+          <w:numId w:val="10"/>
         </w:numPr>
       </w:pPr>
       <w:r>
@@ -2946,7 +3457,7 @@
       <w:pPr>
         <w:numPr>
           <w:ilvl w:val="0"/>
-          <w:numId w:val="2"/>
+          <w:numId w:val="10"/>
         </w:numPr>
       </w:pPr>
       <w:r>
@@ -2967,7 +3478,7 @@
       <w:pPr>
         <w:numPr>
           <w:ilvl w:val="0"/>
-          <w:numId w:val="2"/>
+          <w:numId w:val="10"/>
         </w:numPr>
       </w:pPr>
       <w:r>
@@ -2998,7 +3509,7 @@
       <w:pPr>
         <w:numPr>
           <w:ilvl w:val="0"/>
-          <w:numId w:val="2"/>
+          <w:numId w:val="10"/>
         </w:numPr>
       </w:pPr>
       <w:r>
@@ -3035,7 +3546,7 @@
       <w:pPr>
         <w:numPr>
           <w:ilvl w:val="0"/>
-          <w:numId w:val="2"/>
+          <w:numId w:val="10"/>
         </w:numPr>
       </w:pPr>
       <w:r>
@@ -3056,7 +3567,7 @@
       <w:pPr>
         <w:numPr>
           <w:ilvl w:val="0"/>
-          <w:numId w:val="2"/>
+          <w:numId w:val="10"/>
         </w:numPr>
       </w:pPr>
       <w:r>
@@ -3093,7 +3604,7 @@
       <w:pPr>
         <w:numPr>
           <w:ilvl w:val="0"/>
-          <w:numId w:val="2"/>
+          <w:numId w:val="10"/>
         </w:numPr>
       </w:pPr>
       <w:r>
@@ -3134,7 +3645,7 @@
       <w:pPr>
         <w:numPr>
           <w:ilvl w:val="0"/>
-          <w:numId w:val="2"/>
+          <w:numId w:val="10"/>
         </w:numPr>
       </w:pPr>
       <w:r>
@@ -3163,7 +3674,7 @@
     </w:p>
     <w:p>
       <w:pPr>
-        <w:pStyle w:val="Heading2"/>
+        <w:pStyle w:val="Heading3"/>
       </w:pPr>
       <w:r>
         <w:t>5.2. Đăng ký</w:t>
@@ -3221,7 +3732,7 @@
       <w:pPr>
         <w:numPr>
           <w:ilvl w:val="0"/>
-          <w:numId w:val="2"/>
+          <w:numId w:val="11"/>
         </w:numPr>
       </w:pPr>
       <w:r>
@@ -3242,7 +3753,7 @@
       <w:pPr>
         <w:numPr>
           <w:ilvl w:val="0"/>
-          <w:numId w:val="2"/>
+          <w:numId w:val="11"/>
         </w:numPr>
       </w:pPr>
       <w:r>
@@ -3263,7 +3774,7 @@
       <w:pPr>
         <w:numPr>
           <w:ilvl w:val="0"/>
-          <w:numId w:val="2"/>
+          <w:numId w:val="11"/>
         </w:numPr>
       </w:pPr>
       <w:r>
@@ -3274,7 +3785,7 @@
       <w:pPr>
         <w:numPr>
           <w:ilvl w:val="0"/>
-          <w:numId w:val="2"/>
+          <w:numId w:val="11"/>
         </w:numPr>
       </w:pPr>
       <w:r>
@@ -3285,7 +3796,7 @@
       <w:pPr>
         <w:numPr>
           <w:ilvl w:val="0"/>
-          <w:numId w:val="2"/>
+          <w:numId w:val="11"/>
         </w:numPr>
       </w:pPr>
       <w:r>
@@ -3306,7 +3817,7 @@
       <w:pPr>
         <w:numPr>
           <w:ilvl w:val="0"/>
-          <w:numId w:val="2"/>
+          <w:numId w:val="11"/>
         </w:numPr>
       </w:pPr>
       <w:r>
@@ -3337,7 +3848,7 @@
       <w:pPr>
         <w:numPr>
           <w:ilvl w:val="0"/>
-          <w:numId w:val="2"/>
+          <w:numId w:val="11"/>
         </w:numPr>
       </w:pPr>
       <w:r>
@@ -3374,7 +3885,7 @@
       <w:pPr>
         <w:numPr>
           <w:ilvl w:val="0"/>
-          <w:numId w:val="2"/>
+          <w:numId w:val="11"/>
         </w:numPr>
       </w:pPr>
       <w:r>
@@ -3405,7 +3916,7 @@
       <w:pPr>
         <w:numPr>
           <w:ilvl w:val="0"/>
-          <w:numId w:val="2"/>
+          <w:numId w:val="11"/>
         </w:numPr>
       </w:pPr>
       <w:r>
@@ -3442,7 +3953,7 @@
       <w:pPr>
         <w:numPr>
           <w:ilvl w:val="0"/>
-          <w:numId w:val="2"/>
+          <w:numId w:val="11"/>
         </w:numPr>
       </w:pPr>
       <w:r>
@@ -3473,7 +3984,7 @@
       <w:pPr>
         <w:numPr>
           <w:ilvl w:val="0"/>
-          <w:numId w:val="2"/>
+          <w:numId w:val="11"/>
         </w:numPr>
       </w:pPr>
       <w:r>
@@ -3510,7 +4021,7 @@
       <w:pPr>
         <w:numPr>
           <w:ilvl w:val="0"/>
-          <w:numId w:val="2"/>
+          <w:numId w:val="11"/>
         </w:numPr>
       </w:pPr>
       <w:r>
@@ -3547,7 +4058,7 @@
       <w:pPr>
         <w:numPr>
           <w:ilvl w:val="0"/>
-          <w:numId w:val="2"/>
+          <w:numId w:val="11"/>
         </w:numPr>
       </w:pPr>
       <w:r>
@@ -3558,7 +4069,7 @@
       <w:pPr>
         <w:numPr>
           <w:ilvl w:val="0"/>
-          <w:numId w:val="2"/>
+          <w:numId w:val="11"/>
         </w:numPr>
       </w:pPr>
       <w:r>
@@ -3589,7 +4100,7 @@
       <w:pPr>
         <w:numPr>
           <w:ilvl w:val="0"/>
-          <w:numId w:val="2"/>
+          <w:numId w:val="11"/>
         </w:numPr>
       </w:pPr>
       <w:r>
@@ -3600,7 +4111,7 @@
       <w:pPr>
         <w:numPr>
           <w:ilvl w:val="0"/>
-          <w:numId w:val="2"/>
+          <w:numId w:val="11"/>
         </w:numPr>
       </w:pPr>
       <w:r>
@@ -3611,7 +4122,7 @@
       <w:pPr>
         <w:numPr>
           <w:ilvl w:val="0"/>
-          <w:numId w:val="2"/>
+          <w:numId w:val="11"/>
         </w:numPr>
       </w:pPr>
       <w:r>
@@ -3622,7 +4133,7 @@
       <w:pPr>
         <w:numPr>
           <w:ilvl w:val="0"/>
-          <w:numId w:val="2"/>
+          <w:numId w:val="11"/>
         </w:numPr>
       </w:pPr>
       <w:r>
@@ -3643,7 +4154,7 @@
       <w:pPr>
         <w:numPr>
           <w:ilvl w:val="0"/>
-          <w:numId w:val="2"/>
+          <w:numId w:val="11"/>
         </w:numPr>
       </w:pPr>
       <w:r>
@@ -3674,7 +4185,7 @@
       <w:pPr>
         <w:numPr>
           <w:ilvl w:val="0"/>
-          <w:numId w:val="2"/>
+          <w:numId w:val="11"/>
         </w:numPr>
       </w:pPr>
       <w:r>
@@ -3705,7 +4216,7 @@
       <w:pPr>
         <w:numPr>
           <w:ilvl w:val="0"/>
-          <w:numId w:val="2"/>
+          <w:numId w:val="11"/>
         </w:numPr>
       </w:pPr>
       <w:r>
@@ -3736,7 +4247,7 @@
       <w:pPr>
         <w:numPr>
           <w:ilvl w:val="0"/>
-          <w:numId w:val="2"/>
+          <w:numId w:val="11"/>
         </w:numPr>
       </w:pPr>
       <w:r>
@@ -3777,7 +4288,7 @@
       <w:pPr>
         <w:numPr>
           <w:ilvl w:val="0"/>
-          <w:numId w:val="2"/>
+          <w:numId w:val="11"/>
         </w:numPr>
       </w:pPr>
       <w:r>
@@ -3796,7 +4307,7 @@
     </w:p>
     <w:p>
       <w:pPr>
-        <w:pStyle w:val="Heading2"/>
+        <w:pStyle w:val="Heading3"/>
       </w:pPr>
       <w:r>
         <w:t>5.3. Đổi mật khẩu</w:t>
@@ -3854,7 +4365,7 @@
       <w:pPr>
         <w:numPr>
           <w:ilvl w:val="0"/>
-          <w:numId w:val="2"/>
+          <w:numId w:val="12"/>
         </w:numPr>
       </w:pPr>
       <w:r>
@@ -3875,7 +4386,7 @@
       <w:pPr>
         <w:numPr>
           <w:ilvl w:val="0"/>
-          <w:numId w:val="2"/>
+          <w:numId w:val="12"/>
         </w:numPr>
       </w:pPr>
       <w:r>
@@ -3896,7 +4407,7 @@
       <w:pPr>
         <w:numPr>
           <w:ilvl w:val="0"/>
-          <w:numId w:val="2"/>
+          <w:numId w:val="12"/>
         </w:numPr>
       </w:pPr>
       <w:r>
@@ -3907,7 +4418,7 @@
       <w:pPr>
         <w:numPr>
           <w:ilvl w:val="0"/>
-          <w:numId w:val="2"/>
+          <w:numId w:val="12"/>
         </w:numPr>
       </w:pPr>
       <w:r>
@@ -3918,7 +4429,7 @@
       <w:pPr>
         <w:numPr>
           <w:ilvl w:val="0"/>
-          <w:numId w:val="2"/>
+          <w:numId w:val="12"/>
         </w:numPr>
       </w:pPr>
       <w:r>
@@ -3939,7 +4450,7 @@
       <w:pPr>
         <w:numPr>
           <w:ilvl w:val="0"/>
-          <w:numId w:val="2"/>
+          <w:numId w:val="12"/>
         </w:numPr>
       </w:pPr>
       <w:r>
@@ -3970,7 +4481,7 @@
       <w:pPr>
         <w:numPr>
           <w:ilvl w:val="0"/>
-          <w:numId w:val="2"/>
+          <w:numId w:val="12"/>
         </w:numPr>
       </w:pPr>
       <w:r>
@@ -4001,7 +4512,7 @@
       <w:pPr>
         <w:numPr>
           <w:ilvl w:val="0"/>
-          <w:numId w:val="2"/>
+          <w:numId w:val="12"/>
         </w:numPr>
       </w:pPr>
       <w:r>
@@ -4022,7 +4533,7 @@
       <w:pPr>
         <w:numPr>
           <w:ilvl w:val="0"/>
-          <w:numId w:val="2"/>
+          <w:numId w:val="12"/>
         </w:numPr>
       </w:pPr>
       <w:r>
@@ -4059,7 +4570,7 @@
       <w:pPr>
         <w:numPr>
           <w:ilvl w:val="0"/>
-          <w:numId w:val="2"/>
+          <w:numId w:val="12"/>
         </w:numPr>
       </w:pPr>
       <w:r>
@@ -4096,7 +4607,7 @@
       <w:pPr>
         <w:numPr>
           <w:ilvl w:val="0"/>
-          <w:numId w:val="2"/>
+          <w:numId w:val="12"/>
         </w:numPr>
       </w:pPr>
       <w:r>
@@ -4133,7 +4644,7 @@
       <w:pPr>
         <w:numPr>
           <w:ilvl w:val="0"/>
-          <w:numId w:val="2"/>
+          <w:numId w:val="12"/>
         </w:numPr>
       </w:pPr>
       <w:r>
@@ -4164,7 +4675,7 @@
       <w:pPr>
         <w:numPr>
           <w:ilvl w:val="0"/>
-          <w:numId w:val="2"/>
+          <w:numId w:val="12"/>
         </w:numPr>
       </w:pPr>
       <w:r>
@@ -4201,7 +4712,7 @@
       <w:pPr>
         <w:numPr>
           <w:ilvl w:val="0"/>
-          <w:numId w:val="2"/>
+          <w:numId w:val="12"/>
         </w:numPr>
       </w:pPr>
       <w:r>
@@ -4242,7 +4753,7 @@
       <w:pPr>
         <w:numPr>
           <w:ilvl w:val="0"/>
-          <w:numId w:val="2"/>
+          <w:numId w:val="12"/>
         </w:numPr>
       </w:pPr>
       <w:r>
@@ -4261,7 +4772,7 @@
     </w:p>
     <w:p>
       <w:pPr>
-        <w:pStyle w:val="Heading2"/>
+        <w:pStyle w:val="Heading3"/>
       </w:pPr>
       <w:r>
         <w:t>5.4. Quản lý TTCN</w:t>
@@ -4319,7 +4830,7 @@
       <w:pPr>
         <w:numPr>
           <w:ilvl w:val="0"/>
-          <w:numId w:val="2"/>
+          <w:numId w:val="13"/>
         </w:numPr>
       </w:pPr>
       <w:r>
@@ -4330,7 +4841,7 @@
       <w:pPr>
         <w:numPr>
           <w:ilvl w:val="0"/>
-          <w:numId w:val="2"/>
+          <w:numId w:val="13"/>
         </w:numPr>
       </w:pPr>
       <w:r>
@@ -4351,7 +4862,7 @@
       <w:pPr>
         <w:numPr>
           <w:ilvl w:val="0"/>
-          <w:numId w:val="2"/>
+          <w:numId w:val="13"/>
         </w:numPr>
       </w:pPr>
       <w:r>
@@ -4382,7 +4893,7 @@
       <w:pPr>
         <w:numPr>
           <w:ilvl w:val="0"/>
-          <w:numId w:val="2"/>
+          <w:numId w:val="13"/>
         </w:numPr>
       </w:pPr>
       <w:r>
@@ -4413,7 +4924,7 @@
       <w:pPr>
         <w:numPr>
           <w:ilvl w:val="0"/>
-          <w:numId w:val="2"/>
+          <w:numId w:val="13"/>
         </w:numPr>
       </w:pPr>
       <w:r>
@@ -4434,7 +4945,7 @@
       <w:pPr>
         <w:numPr>
           <w:ilvl w:val="0"/>
-          <w:numId w:val="2"/>
+          <w:numId w:val="13"/>
         </w:numPr>
       </w:pPr>
       <w:r>
@@ -4465,7 +4976,7 @@
       <w:pPr>
         <w:numPr>
           <w:ilvl w:val="0"/>
-          <w:numId w:val="2"/>
+          <w:numId w:val="13"/>
         </w:numPr>
       </w:pPr>
       <w:r>
@@ -4496,7 +5007,7 @@
       <w:pPr>
         <w:numPr>
           <w:ilvl w:val="0"/>
-          <w:numId w:val="2"/>
+          <w:numId w:val="13"/>
         </w:numPr>
       </w:pPr>
       <w:r>
@@ -4507,7 +5018,7 @@
       <w:pPr>
         <w:numPr>
           <w:ilvl w:val="0"/>
-          <w:numId w:val="2"/>
+          <w:numId w:val="13"/>
         </w:numPr>
       </w:pPr>
       <w:r>
@@ -4518,7 +5029,7 @@
       <w:pPr>
         <w:numPr>
           <w:ilvl w:val="0"/>
-          <w:numId w:val="2"/>
+          <w:numId w:val="13"/>
         </w:numPr>
       </w:pPr>
       <w:r>
@@ -4529,7 +5040,7 @@
       <w:pPr>
         <w:numPr>
           <w:ilvl w:val="0"/>
-          <w:numId w:val="2"/>
+          <w:numId w:val="13"/>
         </w:numPr>
       </w:pPr>
       <w:r>
@@ -4550,7 +5061,7 @@
       <w:pPr>
         <w:numPr>
           <w:ilvl w:val="0"/>
-          <w:numId w:val="2"/>
+          <w:numId w:val="13"/>
         </w:numPr>
       </w:pPr>
       <w:r>
@@ -4581,7 +5092,7 @@
       <w:pPr>
         <w:numPr>
           <w:ilvl w:val="0"/>
-          <w:numId w:val="2"/>
+          <w:numId w:val="13"/>
         </w:numPr>
       </w:pPr>
       <w:r>
@@ -4618,7 +5129,7 @@
       <w:pPr>
         <w:numPr>
           <w:ilvl w:val="0"/>
-          <w:numId w:val="2"/>
+          <w:numId w:val="13"/>
         </w:numPr>
       </w:pPr>
       <w:r>
@@ -4649,7 +5160,7 @@
       <w:pPr>
         <w:numPr>
           <w:ilvl w:val="0"/>
-          <w:numId w:val="2"/>
+          <w:numId w:val="13"/>
         </w:numPr>
       </w:pPr>
       <w:r>
@@ -4686,7 +5197,7 @@
       <w:pPr>
         <w:numPr>
           <w:ilvl w:val="0"/>
-          <w:numId w:val="2"/>
+          <w:numId w:val="13"/>
         </w:numPr>
       </w:pPr>
       <w:r>
@@ -4707,7 +5218,7 @@
       <w:pPr>
         <w:numPr>
           <w:ilvl w:val="0"/>
-          <w:numId w:val="2"/>
+          <w:numId w:val="13"/>
         </w:numPr>
       </w:pPr>
       <w:r>
@@ -4738,7 +5249,7 @@
       <w:pPr>
         <w:numPr>
           <w:ilvl w:val="0"/>
-          <w:numId w:val="2"/>
+          <w:numId w:val="13"/>
         </w:numPr>
       </w:pPr>
       <w:r>
@@ -4767,7 +5278,7 @@
     </w:p>
     <w:p>
       <w:pPr>
-        <w:pStyle w:val="Heading2"/>
+        <w:pStyle w:val="Heading3"/>
       </w:pPr>
       <w:r>
         <w:t>5.5. Quản lý nhân viên</w:t>
@@ -4825,7 +5336,7 @@
       <w:pPr>
         <w:numPr>
           <w:ilvl w:val="0"/>
-          <w:numId w:val="2"/>
+          <w:numId w:val="14"/>
         </w:numPr>
       </w:pPr>
       <w:r>
@@ -4846,7 +5357,7 @@
       <w:pPr>
         <w:numPr>
           <w:ilvl w:val="0"/>
-          <w:numId w:val="2"/>
+          <w:numId w:val="14"/>
         </w:numPr>
       </w:pPr>
       <w:r>
@@ -4867,7 +5378,7 @@
       <w:pPr>
         <w:numPr>
           <w:ilvl w:val="0"/>
-          <w:numId w:val="2"/>
+          <w:numId w:val="14"/>
         </w:numPr>
       </w:pPr>
       <w:r>
@@ -4898,7 +5409,7 @@
       <w:pPr>
         <w:numPr>
           <w:ilvl w:val="0"/>
-          <w:numId w:val="2"/>
+          <w:numId w:val="14"/>
         </w:numPr>
       </w:pPr>
       <w:r>
@@ -4935,7 +5446,7 @@
       <w:pPr>
         <w:numPr>
           <w:ilvl w:val="0"/>
-          <w:numId w:val="2"/>
+          <w:numId w:val="14"/>
         </w:numPr>
       </w:pPr>
       <w:r>
@@ -4956,7 +5467,7 @@
       <w:pPr>
         <w:numPr>
           <w:ilvl w:val="0"/>
-          <w:numId w:val="2"/>
+          <w:numId w:val="14"/>
         </w:numPr>
       </w:pPr>
       <w:r>
@@ -4987,7 +5498,7 @@
       <w:pPr>
         <w:numPr>
           <w:ilvl w:val="0"/>
-          <w:numId w:val="2"/>
+          <w:numId w:val="14"/>
         </w:numPr>
       </w:pPr>
       <w:r>
@@ -5018,7 +5529,7 @@
       <w:pPr>
         <w:numPr>
           <w:ilvl w:val="0"/>
-          <w:numId w:val="2"/>
+          <w:numId w:val="14"/>
         </w:numPr>
       </w:pPr>
       <w:r>
@@ -5029,7 +5540,7 @@
       <w:pPr>
         <w:numPr>
           <w:ilvl w:val="0"/>
-          <w:numId w:val="2"/>
+          <w:numId w:val="14"/>
         </w:numPr>
       </w:pPr>
       <w:r>
@@ -5040,7 +5551,7 @@
       <w:pPr>
         <w:numPr>
           <w:ilvl w:val="0"/>
-          <w:numId w:val="2"/>
+          <w:numId w:val="14"/>
         </w:numPr>
       </w:pPr>
       <w:r>
@@ -5051,7 +5562,7 @@
       <w:pPr>
         <w:numPr>
           <w:ilvl w:val="0"/>
-          <w:numId w:val="2"/>
+          <w:numId w:val="14"/>
         </w:numPr>
       </w:pPr>
       <w:r>
@@ -5072,7 +5583,7 @@
       <w:pPr>
         <w:numPr>
           <w:ilvl w:val="0"/>
-          <w:numId w:val="2"/>
+          <w:numId w:val="14"/>
         </w:numPr>
       </w:pPr>
       <w:r>
@@ -5103,7 +5614,7 @@
       <w:pPr>
         <w:numPr>
           <w:ilvl w:val="0"/>
-          <w:numId w:val="2"/>
+          <w:numId w:val="14"/>
         </w:numPr>
       </w:pPr>
       <w:r>
@@ -5134,7 +5645,7 @@
       <w:pPr>
         <w:numPr>
           <w:ilvl w:val="0"/>
-          <w:numId w:val="2"/>
+          <w:numId w:val="14"/>
         </w:numPr>
       </w:pPr>
       <w:r>
@@ -5155,7 +5666,7 @@
       <w:pPr>
         <w:numPr>
           <w:ilvl w:val="0"/>
-          <w:numId w:val="2"/>
+          <w:numId w:val="14"/>
         </w:numPr>
       </w:pPr>
       <w:r>
@@ -5196,7 +5707,7 @@
       <w:pPr>
         <w:numPr>
           <w:ilvl w:val="0"/>
-          <w:numId w:val="2"/>
+          <w:numId w:val="14"/>
         </w:numPr>
       </w:pPr>
       <w:r>
@@ -5227,7 +5738,7 @@
       <w:pPr>
         <w:numPr>
           <w:ilvl w:val="0"/>
-          <w:numId w:val="2"/>
+          <w:numId w:val="14"/>
         </w:numPr>
       </w:pPr>
       <w:r>
@@ -5238,7 +5749,7 @@
       <w:pPr>
         <w:numPr>
           <w:ilvl w:val="0"/>
-          <w:numId w:val="2"/>
+          <w:numId w:val="14"/>
         </w:numPr>
       </w:pPr>
       <w:r>
@@ -5259,7 +5770,7 @@
       <w:pPr>
         <w:numPr>
           <w:ilvl w:val="0"/>
-          <w:numId w:val="2"/>
+          <w:numId w:val="14"/>
         </w:numPr>
       </w:pPr>
       <w:r>
@@ -5290,7 +5801,7 @@
       <w:pPr>
         <w:numPr>
           <w:ilvl w:val="0"/>
-          <w:numId w:val="2"/>
+          <w:numId w:val="14"/>
         </w:numPr>
       </w:pPr>
       <w:r>
@@ -5327,7 +5838,7 @@
       <w:pPr>
         <w:numPr>
           <w:ilvl w:val="0"/>
-          <w:numId w:val="2"/>
+          <w:numId w:val="14"/>
         </w:numPr>
       </w:pPr>
       <w:r>
@@ -5358,7 +5869,7 @@
       <w:pPr>
         <w:numPr>
           <w:ilvl w:val="0"/>
-          <w:numId w:val="2"/>
+          <w:numId w:val="14"/>
         </w:numPr>
       </w:pPr>
       <w:r>
@@ -5399,7 +5910,7 @@
       <w:pPr>
         <w:numPr>
           <w:ilvl w:val="0"/>
-          <w:numId w:val="2"/>
+          <w:numId w:val="14"/>
         </w:numPr>
       </w:pPr>
       <w:r>
@@ -27100,6 +27611,66 @@
   </w:abstractNum>
   <w:num w:numId="2">
     <w:abstractNumId w:val="2"/>
+  </w:num>
+  <w:num w:numId="10">
+    <w:abstractNumId w:val="2"/>
+    <w:lvlOverride w:ilvl="0">
+      <w:startOverride w:val="1"/>
+    </w:lvlOverride>
+    <w:lvlOverride w:ilvl="1">
+      <w:startOverride w:val="1"/>
+    </w:lvlOverride>
+    <w:lvlOverride w:ilvl="2">
+      <w:startOverride w:val="1"/>
+    </w:lvlOverride>
+  </w:num>
+  <w:num w:numId="11">
+    <w:abstractNumId w:val="2"/>
+    <w:lvlOverride w:ilvl="0">
+      <w:startOverride w:val="1"/>
+    </w:lvlOverride>
+    <w:lvlOverride w:ilvl="1">
+      <w:startOverride w:val="1"/>
+    </w:lvlOverride>
+    <w:lvlOverride w:ilvl="2">
+      <w:startOverride w:val="1"/>
+    </w:lvlOverride>
+  </w:num>
+  <w:num w:numId="12">
+    <w:abstractNumId w:val="2"/>
+    <w:lvlOverride w:ilvl="0">
+      <w:startOverride w:val="1"/>
+    </w:lvlOverride>
+    <w:lvlOverride w:ilvl="1">
+      <w:startOverride w:val="1"/>
+    </w:lvlOverride>
+    <w:lvlOverride w:ilvl="2">
+      <w:startOverride w:val="1"/>
+    </w:lvlOverride>
+  </w:num>
+  <w:num w:numId="13">
+    <w:abstractNumId w:val="2"/>
+    <w:lvlOverride w:ilvl="0">
+      <w:startOverride w:val="1"/>
+    </w:lvlOverride>
+    <w:lvlOverride w:ilvl="1">
+      <w:startOverride w:val="1"/>
+    </w:lvlOverride>
+    <w:lvlOverride w:ilvl="2">
+      <w:startOverride w:val="1"/>
+    </w:lvlOverride>
+  </w:num>
+  <w:num w:numId="14">
+    <w:abstractNumId w:val="2"/>
+    <w:lvlOverride w:ilvl="0">
+      <w:startOverride w:val="1"/>
+    </w:lvlOverride>
+    <w:lvlOverride w:ilvl="1">
+      <w:startOverride w:val="1"/>
+    </w:lvlOverride>
+    <w:lvlOverride w:ilvl="2">
+      <w:startOverride w:val="1"/>
+    </w:lvlOverride>
   </w:num>
 </w:numbering>
 </file>

</xml_diff>

<commit_message>
refactor: account module DOCX — wireframe attrs + scenario format + IV hierarchy
- Wireframes (sec 3.1–3.6): replace Vietnamese labels with analysis boundary
  class attributes (txtPhoneNumber, txtFullName, lblMembershipTier, tblStaffList…)
- Kịch bản phiên bản 2/3 (all 10 scenarios): rewrite steps as
  "[From] → [To]: [arrow label]" — short English for method calls/returns,
  attrs in field references matching analysis boundary class names
- Generator: numbered lists only inside kịch bản phiên bản blocks (in_scenario_section
  flag); all other numbered items render as bullets → no cross-section bleed
- Generator: H4 for Trạng thái CSDL trước/sau + Kịch bản thực hiện labels in Phase IV
- Result: H1/H2/H3/H4 clean hierarchy, 13 images, 52 tables

Co-Authored-By: Claude Sonnet 4.6 <noreply@anthropic.com>
</commit_message>
<xml_diff>
--- a/output/account_module.docx
+++ b/output/account_module.docx
@@ -86,7 +86,7 @@
         </w:numPr>
       </w:pPr>
       <w:r>
-        <w:t>Người dùng chọn chức năng Đăng nhập.</w:t>
+        <w:t>Actor → LoginView: chọn chức năng Đăng nhập.</w:t>
       </w:r>
     </w:p>
     <w:p>
@@ -97,7 +97,7 @@
         </w:numPr>
       </w:pPr>
       <w:r>
-        <w:t>Lớp LoginView hiển thị giao diện đăng nhập.</w:t>
+        <w:t>LoginView → Actor: hiển thị giao diện đăng nhập.</w:t>
       </w:r>
     </w:p>
     <w:p>
@@ -108,7 +108,7 @@
         </w:numPr>
       </w:pPr>
       <w:r>
-        <w:t>Người dùng nhập SĐT/Email + Mật khẩu, nhấn Đăng nhập.</w:t>
+        <w:t>Actor → LoginView: nhập txtPhoneNumber + txtPassword, nhấn Đăng nhập.</w:t>
       </w:r>
     </w:p>
     <w:p>
@@ -119,7 +119,7 @@
         </w:numPr>
       </w:pPr>
       <w:r>
-        <w:t>Lớp LoginView gọi checkLogin(phoneNumber, password).</w:t>
+        <w:t>LoginView → User: checkLogin(phoneNumber, password).</w:t>
       </w:r>
     </w:p>
     <w:p>
@@ -130,7 +130,7 @@
         </w:numPr>
       </w:pPr>
       <w:r>
-        <w:t>Lớp User trả kết quả xác thực.</w:t>
+        <w:t>User → LoginView: return kết quả xác thực.</w:t>
       </w:r>
     </w:p>
     <w:p>
@@ -141,7 +141,7 @@
         </w:numPr>
       </w:pPr>
       <w:r>
-        <w:t>Lớp LoginView chuyển hướng sang HomeView, "Đăng nhập thành công".</w:t>
+        <w:t>LoginView → HomeView: chuyển hướng, "Đăng nhập thành công".</w:t>
       </w:r>
     </w:p>
     <w:p>
@@ -152,7 +152,7 @@
         </w:numPr>
       </w:pPr>
       <w:r>
-        <w:t>Lớp HomeView hiển thị trang chủ.</w:t>
+        <w:t>HomeView → Actor: hiển thị trang chủ.</w:t>
       </w:r>
     </w:p>
     <w:p>
@@ -219,7 +219,7 @@
         </w:numPr>
       </w:pPr>
       <w:r>
-        <w:t>Khách hàng chọn liên kết Đăng ký.</w:t>
+        <w:t>Actor → RegisterView: chọn liên kết Đăng ký.</w:t>
       </w:r>
     </w:p>
     <w:p>
@@ -230,7 +230,7 @@
         </w:numPr>
       </w:pPr>
       <w:r>
-        <w:t>Lớp RegisterView hiển thị giao diện đăng ký.</w:t>
+        <w:t>RegisterView → Actor: hiển thị giao diện đăng ký.</w:t>
       </w:r>
     </w:p>
     <w:p>
@@ -241,7 +241,7 @@
         </w:numPr>
       </w:pPr>
       <w:r>
-        <w:t>Khách hàng nhập Họ tên, SĐT, Email, Mật khẩu, nhấn Tiếp tục.</w:t>
+        <w:t>Actor → RegisterView: nhập txtFullName, txtPhoneNumber, txtEmail, txtPassword, nhấn Tiếp tục.</w:t>
       </w:r>
     </w:p>
     <w:p>
@@ -252,7 +252,7 @@
         </w:numPr>
       </w:pPr>
       <w:r>
-        <w:t>Lớp RegisterView gọi register(fullName, phoneNumber, email, password).</w:t>
+        <w:t>RegisterView → Client: register(fullName, phoneNumber, email, password).</w:t>
       </w:r>
     </w:p>
     <w:p>
@@ -263,7 +263,7 @@
         </w:numPr>
       </w:pPr>
       <w:r>
-        <w:t>Lớp Client gọi sendOTP(phoneNumber, REGISTER).</w:t>
+        <w:t>Client → OTP: sendOTP(phoneNumber, REGISTER).</w:t>
       </w:r>
     </w:p>
     <w:p>
@@ -274,7 +274,7 @@
         </w:numPr>
       </w:pPr>
       <w:r>
-        <w:t>Lớp OTP OTP đã gửi.</w:t>
+        <w:t>OTP → Client: return OTP đã gửi.</w:t>
       </w:r>
     </w:p>
     <w:p>
@@ -285,7 +285,7 @@
         </w:numPr>
       </w:pPr>
       <w:r>
-        <w:t>Lớp Client trả kết quả.</w:t>
+        <w:t>Client → RegisterView: return kết quả.</w:t>
       </w:r>
     </w:p>
     <w:p>
@@ -296,7 +296,7 @@
         </w:numPr>
       </w:pPr>
       <w:r>
-        <w:t>Lớp RegisterView kiểm tra hợp lệ, gửi mã OTP.</w:t>
+        <w:t>RegisterView → Actor: kiểm tra hợp lệ, gửi mã OTP.</w:t>
       </w:r>
     </w:p>
     <w:p>
@@ -307,7 +307,7 @@
         </w:numPr>
       </w:pPr>
       <w:r>
-        <w:t>Lớp RegisterView hiển thị giao diện xác nhận OTP.</w:t>
+        <w:t>RegisterView → Actor: hiển thị giao diện xác nhận OTP.</w:t>
       </w:r>
     </w:p>
     <w:p>
@@ -318,7 +318,7 @@
         </w:numPr>
       </w:pPr>
       <w:r>
-        <w:t>Khách hàng nhập mã OTP, nhấn Xác nhận.</w:t>
+        <w:t>Actor → OTPVerifyView: nhập txtOTP, nhấn Xác nhận.</w:t>
       </w:r>
     </w:p>
     <w:p>
@@ -329,7 +329,7 @@
         </w:numPr>
       </w:pPr>
       <w:r>
-        <w:t>Lớp OTPVerifyView gọi verifyOTP(otpCode).</w:t>
+        <w:t>OTPVerifyView → OTP: verifyOTP(otpCode).</w:t>
       </w:r>
     </w:p>
     <w:p>
@@ -340,7 +340,7 @@
         </w:numPr>
       </w:pPr>
       <w:r>
-        <w:t>Lớp OTP xác minh thành công.</w:t>
+        <w:t>OTP → OTPVerifyView: return xác minh thành công.</w:t>
       </w:r>
     </w:p>
     <w:p>
@@ -351,7 +351,7 @@
         </w:numPr>
       </w:pPr>
       <w:r>
-        <w:t>Lớp OTPVerifyView gọi saveUser().</w:t>
+        <w:t>OTPVerifyView → Client: saveUser().</w:t>
       </w:r>
     </w:p>
     <w:p>
@@ -362,7 +362,7 @@
         </w:numPr>
       </w:pPr>
       <w:r>
-        <w:t>Lớp Client tạo tài khoản thành công.</w:t>
+        <w:t>Client → OTPVerifyView: return tạo tài khoản thành công.</w:t>
       </w:r>
     </w:p>
     <w:p>
@@ -373,7 +373,7 @@
         </w:numPr>
       </w:pPr>
       <w:r>
-        <w:t>Lớp OTPVerifyView "Đăng ký thành công!".</w:t>
+        <w:t>OTPVerifyView → Actor: "Đăng ký thành công!".</w:t>
       </w:r>
     </w:p>
     <w:p>
@@ -384,7 +384,7 @@
         </w:numPr>
       </w:pPr>
       <w:r>
-        <w:t>Lớp OTPVerifyView tự động đăng nhập, chuyển hướng HomeView.</w:t>
+        <w:t>OTPVerifyView → HomeView: tự động đăng nhập, chuyển hướng.</w:t>
       </w:r>
     </w:p>
     <w:p>
@@ -395,7 +395,7 @@
         </w:numPr>
       </w:pPr>
       <w:r>
-        <w:t>Lớp HomeView hiển thị trang chủ.</w:t>
+        <w:t>HomeView → Actor: hiển thị trang chủ.</w:t>
       </w:r>
     </w:p>
     <w:p>
@@ -462,7 +462,7 @@
         </w:numPr>
       </w:pPr>
       <w:r>
-        <w:t>Người dùng chọn chức năng Đổi mật khẩu.</w:t>
+        <w:t>Actor → ChangePasswordView: chọn chức năng Đổi mật khẩu.</w:t>
       </w:r>
     </w:p>
     <w:p>
@@ -473,7 +473,7 @@
         </w:numPr>
       </w:pPr>
       <w:r>
-        <w:t>Lớp ChangePasswordView hiển thị giao diện đổi mật khẩu.</w:t>
+        <w:t>ChangePasswordView → Actor: hiển thị giao diện đổi mật khẩu.</w:t>
       </w:r>
     </w:p>
     <w:p>
@@ -484,7 +484,7 @@
         </w:numPr>
       </w:pPr>
       <w:r>
-        <w:t>Người dùng nhập MK hiện tại, MK mới, Xác nhận MK mới, nhấn Lưu.</w:t>
+        <w:t>Actor → ChangePasswordView: nhập txtCurrentPassword, txtNewPassword, txtConfirmNewPassword, nhấn Lưu.</w:t>
       </w:r>
     </w:p>
     <w:p>
@@ -495,7 +495,7 @@
         </w:numPr>
       </w:pPr>
       <w:r>
-        <w:t>Lớp ChangePasswordView gọi changePassword(currentPassword, newPassword).</w:t>
+        <w:t>ChangePasswordView → User: changePassword(currentPassword, newPassword).</w:t>
       </w:r>
     </w:p>
     <w:p>
@@ -506,7 +506,7 @@
         </w:numPr>
       </w:pPr>
       <w:r>
-        <w:t>Lớp User đổi mật khẩu thành công.</w:t>
+        <w:t>User → ChangePasswordView: return đổi mật khẩu thành công.</w:t>
       </w:r>
     </w:p>
     <w:p>
@@ -517,7 +517,7 @@
         </w:numPr>
       </w:pPr>
       <w:r>
-        <w:t>Lớp ChangePasswordView "Đổi mật khẩu thành công".</w:t>
+        <w:t>ChangePasswordView → Actor: "Đổi mật khẩu thành công".</w:t>
       </w:r>
     </w:p>
     <w:p>
@@ -528,7 +528,7 @@
         </w:numPr>
       </w:pPr>
       <w:r>
-        <w:t>Lớp ChangePasswordView chuyển hướng về giao diện Đăng nhập.</w:t>
+        <w:t>ChangePasswordView → LoginView: chuyển hướng về giao diện Đăng nhập.</w:t>
       </w:r>
     </w:p>
     <w:p>
@@ -539,7 +539,7 @@
         </w:numPr>
       </w:pPr>
       <w:r>
-        <w:t>Lớp LoginView hiển thị trang đăng nhập.</w:t>
+        <w:t>LoginView → Actor: hiển thị trang đăng nhập.</w:t>
       </w:r>
     </w:p>
     <w:p>
@@ -606,7 +606,7 @@
         </w:numPr>
       </w:pPr>
       <w:r>
-        <w:t>Khách hàng chọn chức năng Hồ sơ cá nhân.</w:t>
+        <w:t>Actor → ProfileView: chọn chức năng Hồ sơ cá nhân.</w:t>
       </w:r>
     </w:p>
     <w:p>
@@ -617,7 +617,7 @@
         </w:numPr>
       </w:pPr>
       <w:r>
-        <w:t>Lớp ProfileView gọi getProfile(clientId).</w:t>
+        <w:t>ProfileView → Client: getProfile(clientId).</w:t>
       </w:r>
     </w:p>
     <w:p>
@@ -628,7 +628,7 @@
         </w:numPr>
       </w:pPr>
       <w:r>
-        <w:t>Lớp Client trả về thông tin Client.</w:t>
+        <w:t>Client → ProfileView: return thông tin Client.</w:t>
       </w:r>
     </w:p>
     <w:p>
@@ -639,7 +639,7 @@
         </w:numPr>
       </w:pPr>
       <w:r>
-        <w:t>Lớp ProfileView hiển thị trang hồ sơ cá nhân.</w:t>
+        <w:t>ProfileView → Actor: hiển thị trang hồ sơ cá nhân.</w:t>
       </w:r>
     </w:p>
     <w:p>
@@ -650,7 +650,7 @@
         </w:numPr>
       </w:pPr>
       <w:r>
-        <w:t>Khách hàng nhấn nút Chỉnh sửa.</w:t>
+        <w:t>Actor → ProfileView: nhấn nút btnEdit.</w:t>
       </w:r>
     </w:p>
     <w:p>
@@ -661,7 +661,7 @@
         </w:numPr>
       </w:pPr>
       <w:r>
-        <w:t>Lớp ProfileView chuyển sang chế độ chỉnh sửa.</w:t>
+        <w:t>ProfileView → Actor: chuyển sang chế độ chỉnh sửa.</w:t>
       </w:r>
     </w:p>
     <w:p>
@@ -672,7 +672,7 @@
         </w:numPr>
       </w:pPr>
       <w:r>
-        <w:t>Khách hàng cập nhật Họ tên, Email, nhấn Lưu.</w:t>
+        <w:t>Actor → ProfileView: cập nhật lblFullName, lblEmail, nhấn Lưu.</w:t>
       </w:r>
     </w:p>
     <w:p>
@@ -683,7 +683,7 @@
         </w:numPr>
       </w:pPr>
       <w:r>
-        <w:t>Lớp ProfileView gọi updateProfile(clientId, fullName, email).</w:t>
+        <w:t>ProfileView → Client: updateProfile(clientId, fullName, email).</w:t>
       </w:r>
     </w:p>
     <w:p>
@@ -694,7 +694,7 @@
         </w:numPr>
       </w:pPr>
       <w:r>
-        <w:t>Lớp Client cập nhật thành công.</w:t>
+        <w:t>Client → ProfileView: return cập nhật thành công.</w:t>
       </w:r>
     </w:p>
     <w:p>
@@ -705,7 +705,7 @@
         </w:numPr>
       </w:pPr>
       <w:r>
-        <w:t>Lớp ProfileView "Cập nhật thành công!", quay về chế độ xem.</w:t>
+        <w:t>ProfileView → Actor: "Cập nhật thành công!", quay về chế độ xem.</w:t>
       </w:r>
     </w:p>
     <w:p>
@@ -772,7 +772,7 @@
         </w:numPr>
       </w:pPr>
       <w:r>
-        <w:t>Admin chọn chức năng Quản lý nhân viên.</w:t>
+        <w:t>Actor → StaffManageView: chọn chức năng Quản lý nhân viên.</w:t>
       </w:r>
     </w:p>
     <w:p>
@@ -783,7 +783,7 @@
         </w:numPr>
       </w:pPr>
       <w:r>
-        <w:t>Lớp StaffManageView gọi getAllStaff().</w:t>
+        <w:t>StaffManageView → Employee: getAllStaff().</w:t>
       </w:r>
     </w:p>
     <w:p>
@@ -794,7 +794,7 @@
         </w:numPr>
       </w:pPr>
       <w:r>
-        <w:t>Lớp Employee trả về danh sách Employee.</w:t>
+        <w:t>Employee → StaffManageView: return danh sách Employee.</w:t>
       </w:r>
     </w:p>
     <w:p>
@@ -805,7 +805,7 @@
         </w:numPr>
       </w:pPr>
       <w:r>
-        <w:t>Lớp StaffManageView hiển thị danh sách nhân viên.</w:t>
+        <w:t>StaffManageView → Actor: hiển thị tblStaffList.</w:t>
       </w:r>
     </w:p>
     <w:p>
@@ -816,7 +816,7 @@
         </w:numPr>
       </w:pPr>
       <w:r>
-        <w:t>Admin nhấn nút Thêm nhân viên.</w:t>
+        <w:t>Actor → StaffManageView: nhấn nút btnAdd.</w:t>
       </w:r>
     </w:p>
     <w:p>
@@ -827,7 +827,7 @@
         </w:numPr>
       </w:pPr>
       <w:r>
-        <w:t>Lớp StaffManageView hiển thị giao diện nhập thông tin.</w:t>
+        <w:t>StaffManageView → Actor: hiển thị giao diện nhập thông tin.</w:t>
       </w:r>
     </w:p>
     <w:p>
@@ -838,7 +838,7 @@
         </w:numPr>
       </w:pPr>
       <w:r>
-        <w:t>Admin nhập Họ tên, SĐT, Vai trò, Chi nhánh, nhấn Lưu.</w:t>
+        <w:t>Actor → StaffManageView: nhập fullName, staffRole, nhấn Lưu.</w:t>
       </w:r>
     </w:p>
     <w:p>
@@ -849,7 +849,7 @@
         </w:numPr>
       </w:pPr>
       <w:r>
-        <w:t>Lớp StaffManageView gọi addStaff(fullName, role).</w:t>
+        <w:t>StaffManageView → Employee: addStaff(fullName, role).</w:t>
       </w:r>
     </w:p>
     <w:p>
@@ -860,7 +860,7 @@
         </w:numPr>
       </w:pPr>
       <w:r>
-        <w:t>Lớp Employee tạo thành công.</w:t>
+        <w:t>Employee → StaffManageView: return tạo thành công.</w:t>
       </w:r>
     </w:p>
     <w:p>
@@ -871,7 +871,7 @@
         </w:numPr>
       </w:pPr>
       <w:r>
-        <w:t>Lớp StaffManageView "Thêm nhân viên thành công!".</w:t>
+        <w:t>StaffManageView → Actor: "Thêm nhân viên thành công!".</w:t>
       </w:r>
     </w:p>
     <w:p>
@@ -882,7 +882,7 @@
         </w:numPr>
       </w:pPr>
       <w:r>
-        <w:t>Admin nhấn nút Sửa trên dòng Nguyễn Minh Tuấn.</w:t>
+        <w:t>Actor → StaffManageView: nhấn btnEdit trên dòng nhân viên.</w:t>
       </w:r>
     </w:p>
     <w:p>
@@ -893,7 +893,7 @@
         </w:numPr>
       </w:pPr>
       <w:r>
-        <w:t>Lớp StaffManageView hiển thị giao diện chỉnh sửa.</w:t>
+        <w:t>StaffManageView → Actor: hiển thị giao diện chỉnh sửa.</w:t>
       </w:r>
     </w:p>
     <w:p>
@@ -904,7 +904,7 @@
         </w:numPr>
       </w:pPr>
       <w:r>
-        <w:t>Admin cập nhật thông tin, nhấn Lưu.</w:t>
+        <w:t>Actor → StaffManageView: cập nhật thông tin, nhấn Lưu.</w:t>
       </w:r>
     </w:p>
     <w:p>
@@ -915,7 +915,7 @@
         </w:numPr>
       </w:pPr>
       <w:r>
-        <w:t>Lớp StaffManageView gọi updateStaff(id, data).</w:t>
+        <w:t>StaffManageView → Employee: updateStaff(id, data).</w:t>
       </w:r>
     </w:p>
     <w:p>
@@ -926,7 +926,7 @@
         </w:numPr>
       </w:pPr>
       <w:r>
-        <w:t>Lớp Employee cập nhật thành công.</w:t>
+        <w:t>Employee → StaffManageView: return cập nhật thành công.</w:t>
       </w:r>
     </w:p>
     <w:p>
@@ -937,7 +937,7 @@
         </w:numPr>
       </w:pPr>
       <w:r>
-        <w:t>Lớp StaffManageView "Cập nhật thành công!".</w:t>
+        <w:t>StaffManageView → Actor: "Cập nhật thành công!".</w:t>
       </w:r>
     </w:p>
     <w:p>
@@ -948,7 +948,7 @@
         </w:numPr>
       </w:pPr>
       <w:r>
-        <w:t>Admin nhấn nút Xóa trên dòng Lê Văn Khánh.</w:t>
+        <w:t>Actor → StaffManageView: nhấn btnDelete trên dòng nhân viên.</w:t>
       </w:r>
     </w:p>
     <w:p>
@@ -959,7 +959,7 @@
         </w:numPr>
       </w:pPr>
       <w:r>
-        <w:t>Lớp StaffManageView yêu cầu xác nhận xóa, "Xóa nhân viên thành công!".</w:t>
+        <w:t>StaffManageView → Actor: yêu cầu xác nhận xóa, "Xóa nhân viên thành công!".</w:t>
       </w:r>
     </w:p>
     <w:p/>
@@ -2715,19 +2715,19 @@
         </w:rPr>
         <w:t>┌──────────────────────────────────────────────┐</w:t>
         <w:br/>
-        <w:t>│              Đăng nhập                       │</w:t>
+        <w:t>│               Đăng nhập                      │</w:t>
         <w:br/>
         <w:t>│                                              │</w:t>
         <w:br/>
-        <w:t>│  txtSDT:       [________________________]     │</w:t>
+        <w:t>│  txtPhoneNumber: [_______________________]   │</w:t>
         <w:br/>
-        <w:t>│  txtMatKhau:   [________________________]     │</w:t>
+        <w:t>│  txtPassword:    [_______________________]   │</w:t>
         <w:br/>
         <w:t>│                                              │</w:t>
         <w:br/>
-        <w:t>│  [btnDangNhap]                               │</w:t>
+        <w:t>│  [btnLogin]                                  │</w:t>
         <w:br/>
-        <w:t>│  btnQuenMatKhau  |  btnDangKy                │</w:t>
+        <w:t>│  lnkForgotPassword  |  lnkRegister           │</w:t>
         <w:br/>
         <w:t>└──────────────────────────────────────────────┘</w:t>
       </w:r>
@@ -2748,23 +2748,23 @@
         </w:rPr>
         <w:t>┌──────────────────────────────────────────────┐</w:t>
         <w:br/>
-        <w:t>│              Đăng ký tài khoản                │</w:t>
+        <w:t>│           Đăng ký tài khoản                  │</w:t>
         <w:br/>
         <w:t>│                                              │</w:t>
         <w:br/>
-        <w:t>│  txtHoTen:           [________________________]  │</w:t>
+        <w:t>│  txtFullName:        [___________________]   │</w:t>
         <w:br/>
-        <w:t>│  txtSoDienThoai:     [________________________]  │</w:t>
+        <w:t>│  txtPhoneNumber:     [___________________]   │</w:t>
         <w:br/>
-        <w:t>│  txtEmail:           [________________________]  │</w:t>
+        <w:t>│  txtEmail:           [___________________]   │</w:t>
         <w:br/>
-        <w:t>│  txtMatKhau:         [________________________]  │</w:t>
+        <w:t>│  txtPassword:        [___________________]   │</w:t>
         <w:br/>
-        <w:t>│  txtXacNhanMatKhau:  [________________________]  │</w:t>
+        <w:t>│  txtConfirmPassword: [___________________]   │</w:t>
         <w:br/>
         <w:t>│                                              │</w:t>
         <w:br/>
-        <w:t>│  [btnTiepTuc]                [btnHuy]        │</w:t>
+        <w:t>│  [btnContinue]               [Cancel]        │</w:t>
         <w:br/>
         <w:t>└──────────────────────────────────────────────┘</w:t>
       </w:r>
@@ -2793,9 +2793,9 @@
         <w:br/>
         <w:t>│                                              │</w:t>
         <w:br/>
-        <w:t>│  [btnXacNhan]                                │</w:t>
+        <w:t>│  [btnConfirm]                                │</w:t>
         <w:br/>
-        <w:t>│  lblCountdown: Gửi lại OTP (60s)            │</w:t>
+        <w:t>│  btnResendOTP                                │</w:t>
         <w:br/>
         <w:t>└──────────────────────────────────────────────┘</w:t>
       </w:r>
@@ -2820,15 +2820,15 @@
         <w:br/>
         <w:t>│                                              │</w:t>
         <w:br/>
-        <w:t>│  txtMatKhauHienTai:     [________________________]│</w:t>
+        <w:t>│  txtCurrentPassword:    [________________]   │</w:t>
         <w:br/>
-        <w:t>│  txtMatKhauMoi:         [________________________]│</w:t>
+        <w:t>│  txtNewPassword:        [________________]   │</w:t>
         <w:br/>
-        <w:t>│  txtXacNhanMatKhauMoi:  [________________________]│</w:t>
+        <w:t>│  txtConfirmNewPassword: [________________]   │</w:t>
         <w:br/>
         <w:t>│                                              │</w:t>
         <w:br/>
-        <w:t>│  [btnLuu]                [btnHuy]            │</w:t>
+        <w:t>│  [btnSave]                   [Cancel]        │</w:t>
         <w:br/>
         <w:t>└──────────────────────────────────────────────┘</w:t>
       </w:r>
@@ -2853,19 +2853,19 @@
         <w:br/>
         <w:t>│                                              │</w:t>
         <w:br/>
-        <w:t>│  txtHoTen:         [________________________]  │</w:t>
+        <w:t>│  lblFullName:       [_____________________]  │</w:t>
         <w:br/>
-        <w:t>│  txtSoDienThoai:   [________________________]  │</w:t>
+        <w:t>│  lblPhoneNumber:    [__________] (readonly)  │</w:t>
         <w:br/>
-        <w:t>│  txtEmail:         [________________________]  │</w:t>
+        <w:t>│  lblEmail:          [_____________________]  │</w:t>
         <w:br/>
-        <w:t>│  lblMembershipTier: ........................  │</w:t>
+        <w:t>│  lblMembershipTier: [Bạc      ] (readonly)   │</w:t>
         <w:br/>
-        <w:t>│  lblDiemTichLuy:   ........................  │</w:t>
+        <w:t>│  lblLoyaltyPoints:  [1250     ] (readonly)   │</w:t>
         <w:br/>
         <w:t>│                                              │</w:t>
         <w:br/>
-        <w:t>│  [btnChinhSua]  [btnDoiMatKhau]              │</w:t>
+        <w:t>│  [btnEdit]    [btnChangePassword]            │</w:t>
         <w:br/>
         <w:t>└──────────────────────────────────────────────┘</w:t>
       </w:r>
@@ -2890,27 +2890,25 @@
         <w:br/>
         <w:t>│                                              │</w:t>
         <w:br/>
-        <w:t>│  txtTimKiem: [________________________]      │</w:t>
-        <w:br/>
-        <w:t>│  [btnThem]                                   │</w:t>
+        <w:t>│  [btnAdd]                                    │</w:t>
         <w:br/>
         <w:t>│                                              │</w:t>
         <w:br/>
-        <w:t>│ ┌──────┬────────┬──────────┬──────────┐      │</w:t>
+        <w:t>│ ┌──────────┬───────────┬──────────┐          │</w:t>
         <w:br/>
-        <w:t>│ │ Họ tên│ Vai trò│ Trạng thái│ ...     │      │</w:t>
+        <w:t>│ │ fullName │ staffRole │ status   │          │</w:t>
         <w:br/>
-        <w:t>│ │ ......│ .......│ .........│         │      │</w:t>
+        <w:t>│ │ ........ │ ......... │ ........ │          │</w:t>
         <w:br/>
-        <w:t>│ │ ......│ .......│ .........│         │      │</w:t>
+        <w:t>│ │ ........ │ ......... │ ........ │          │</w:t>
         <w:br/>
-        <w:t>│ └──────┴────────┴──────────┴──────────┘      │</w:t>
+        <w:t>│ └──────────┴───────────┴──────────┘          │</w:t>
         <w:br/>
-        <w:t>│  tblStaff                                    │</w:t>
+        <w:t>│              tblStaffList                    │</w:t>
         <w:br/>
         <w:t>│                                              │</w:t>
         <w:br/>
-        <w:t>│  [btnSua]  [btnXoa]                          │</w:t>
+        <w:t>│  [btnEdit]    [btnDelete]                    │</w:t>
         <w:br/>
         <w:t>└──────────────────────────────────────────────┘</w:t>
       </w:r>
@@ -4064,7 +4062,7 @@
         </w:numPr>
       </w:pPr>
       <w:r>
-        <w:t>Khách hàng truy cập URL /login.</w:t>
+        <w:t>KH → LoginPage: truy cập URL /login.</w:t>
       </w:r>
     </w:p>
     <w:p>
@@ -4075,7 +4073,7 @@
         </w:numPr>
       </w:pPr>
       <w:r>
-        <w:t>Lớp LoginPage gọi phương thức formLoad().</w:t>
+        <w:t>LoginPage → LoginPage: formLoad().</w:t>
       </w:r>
     </w:p>
     <w:p>
@@ -4086,7 +4084,7 @@
         </w:numPr>
       </w:pPr>
       <w:r>
-        <w:t>Lớp LoginPage render form đăng nhập.</w:t>
+        <w:t>LoginPage → KH: render form đăng nhập.</w:t>
       </w:r>
     </w:p>
     <w:p>
@@ -4097,7 +4095,7 @@
         </w:numPr>
       </w:pPr>
       <w:r>
-        <w:t>Khách hàng nhập SĐT và Mật khẩu.</w:t>
+        <w:t>KH → LoginPage: nhập txtPhoneNumber và txtPassword.</w:t>
       </w:r>
     </w:p>
     <w:p>
@@ -4108,7 +4106,7 @@
         </w:numPr>
       </w:pPr>
       <w:r>
-        <w:t>Khách hàng click nút [Đăng nhập].</w:t>
+        <w:t>KH → LoginPage: click btnLogin.</w:t>
       </w:r>
     </w:p>
     <w:p>
@@ -4119,7 +4117,7 @@
         </w:numPr>
       </w:pPr>
       <w:r>
-        <w:t>Lớp LoginPage gọi phương thức btnLoginClick().</w:t>
+        <w:t>LoginPage → LoginPage: btnLoginClick().</w:t>
       </w:r>
     </w:p>
     <w:p>
@@ -4130,7 +4128,7 @@
         </w:numPr>
       </w:pPr>
       <w:r>
-        <w:t>Lớp LoginPage gọi phương thức checkLogin() của lớp AuthController.</w:t>
+        <w:t>LoginPage → AuthController: checkLogin().</w:t>
       </w:r>
     </w:p>
     <w:p>
@@ -4141,7 +4139,7 @@
         </w:numPr>
       </w:pPr>
       <w:r>
-        <w:t>Lớp AuthController gọi phương thức findBySDT() của lớp User.</w:t>
+        <w:t>AuthController → User: findBySDT().</w:t>
       </w:r>
     </w:p>
     <w:p>
@@ -4152,7 +4150,7 @@
         </w:numPr>
       </w:pPr>
       <w:r>
-        <w:t>Lớp User trả về User cho lớp AuthController.</w:t>
+        <w:t>User → AuthController: return User.</w:t>
       </w:r>
     </w:p>
     <w:p>
@@ -4163,7 +4161,7 @@
         </w:numPr>
       </w:pPr>
       <w:r>
-        <w:t>Lớp AuthController gọi phương thức checkPassword().</w:t>
+        <w:t>AuthController → AuthController: checkPassword().</w:t>
       </w:r>
     </w:p>
     <w:p>
@@ -4174,7 +4172,7 @@
         </w:numPr>
       </w:pPr>
       <w:r>
-        <w:t>Lớp AuthController trả về true cho lớp LoginPage.</w:t>
+        <w:t>AuthController → LoginPage: return true.</w:t>
       </w:r>
     </w:p>
     <w:p>
@@ -4185,7 +4183,7 @@
         </w:numPr>
       </w:pPr>
       <w:r>
-        <w:t>Lớp LoginPage redirect /home.</w:t>
+        <w:t>LoginPage → LoginPage: redirect /home.</w:t>
       </w:r>
     </w:p>
     <w:p>
@@ -4196,7 +4194,7 @@
         </w:numPr>
       </w:pPr>
       <w:r>
-        <w:t>Lớp LoginPage showMessage("Đăng nhập thành công").</w:t>
+        <w:t>LoginPage → KH: showMessage("Đăng nhập thành công").</w:t>
       </w:r>
     </w:p>
     <w:p>
@@ -4263,7 +4261,7 @@
         </w:numPr>
       </w:pPr>
       <w:r>
-        <w:t>Khách hàng click liên kết "Đăng ký" từ trang /login.</w:t>
+        <w:t>KH → RegisterPage: click lnkRegister từ trang /login.</w:t>
       </w:r>
     </w:p>
     <w:p>
@@ -4274,7 +4272,7 @@
         </w:numPr>
       </w:pPr>
       <w:r>
-        <w:t>Lớp RegisterPage gọi phương thức formLoad().</w:t>
+        <w:t>RegisterPage → RegisterPage: formLoad().</w:t>
       </w:r>
     </w:p>
     <w:p>
@@ -4285,7 +4283,7 @@
         </w:numPr>
       </w:pPr>
       <w:r>
-        <w:t>Lớp RegisterPage render form đăng ký.</w:t>
+        <w:t>RegisterPage → KH: render form đăng ký.</w:t>
       </w:r>
     </w:p>
     <w:p>
@@ -4296,7 +4294,7 @@
         </w:numPr>
       </w:pPr>
       <w:r>
-        <w:t>Khách hàng nhập Họ tên, SĐT, Email, Mật khẩu.</w:t>
+        <w:t>KH → RegisterPage: nhập txtFullName, txtPhoneNumber, txtEmail, txtPassword.</w:t>
       </w:r>
     </w:p>
     <w:p>
@@ -4307,7 +4305,7 @@
         </w:numPr>
       </w:pPr>
       <w:r>
-        <w:t>Khách hàng click nút [Tiếp tục].</w:t>
+        <w:t>KH → RegisterPage: click btnContinue.</w:t>
       </w:r>
     </w:p>
     <w:p>
@@ -4318,7 +4316,7 @@
         </w:numPr>
       </w:pPr>
       <w:r>
-        <w:t>Lớp RegisterPage gọi phương thức btnTiepTucClick().</w:t>
+        <w:t>RegisterPage → RegisterPage: btnTiepTucClick().</w:t>
       </w:r>
     </w:p>
     <w:p>
@@ -4329,7 +4327,7 @@
         </w:numPr>
       </w:pPr>
       <w:r>
-        <w:t>Lớp RegisterPage gọi phương thức register() của lớp AuthController.</w:t>
+        <w:t>RegisterPage → AuthController: register().</w:t>
       </w:r>
     </w:p>
     <w:p>
@@ -4340,7 +4338,7 @@
         </w:numPr>
       </w:pPr>
       <w:r>
-        <w:t>Lớp AuthController gọi phương thức existsBySDT() của lớp User.</w:t>
+        <w:t>AuthController → User: existsBySDT().</w:t>
       </w:r>
     </w:p>
     <w:p>
@@ -4351,7 +4349,7 @@
         </w:numPr>
       </w:pPr>
       <w:r>
-        <w:t>Lớp User trả về false cho lớp AuthController.</w:t>
+        <w:t>User → AuthController: return false.</w:t>
       </w:r>
     </w:p>
     <w:p>
@@ -4362,7 +4360,7 @@
         </w:numPr>
       </w:pPr>
       <w:r>
-        <w:t>Lớp AuthController gọi phương thức existsByEmail() của lớp User.</w:t>
+        <w:t>AuthController → User: existsByEmail().</w:t>
       </w:r>
     </w:p>
     <w:p>
@@ -4373,7 +4371,7 @@
         </w:numPr>
       </w:pPr>
       <w:r>
-        <w:t>Lớp User trả về false cho lớp AuthController.</w:t>
+        <w:t>User → AuthController: return false.</w:t>
       </w:r>
     </w:p>
     <w:p>
@@ -4384,7 +4382,7 @@
         </w:numPr>
       </w:pPr>
       <w:r>
-        <w:t>Lớp AuthController gọi phương thức save() của lớp User.</w:t>
+        <w:t>AuthController → User: save().</w:t>
       </w:r>
     </w:p>
     <w:p>
@@ -4395,7 +4393,7 @@
         </w:numPr>
       </w:pPr>
       <w:r>
-        <w:t>Lớp User trả về User cho lớp AuthController.</w:t>
+        <w:t>User → AuthController: return User.</w:t>
       </w:r>
     </w:p>
     <w:p>
@@ -4406,7 +4404,7 @@
         </w:numPr>
       </w:pPr>
       <w:r>
-        <w:t>Lớp AuthController gọi phương thức sendOTP() của lớp OTP.</w:t>
+        <w:t>AuthController → OTP: sendOTP().</w:t>
       </w:r>
     </w:p>
     <w:p>
@@ -4417,7 +4415,7 @@
         </w:numPr>
       </w:pPr>
       <w:r>
-        <w:t>Lớp OTP OTP sent.</w:t>
+        <w:t>OTP → AuthController: return OTP sent.</w:t>
       </w:r>
     </w:p>
     <w:p>
@@ -4428,7 +4426,7 @@
         </w:numPr>
       </w:pPr>
       <w:r>
-        <w:t>Lớp AuthController trả về User cho lớp RegisterPage.</w:t>
+        <w:t>AuthController → RegisterPage: return User.</w:t>
       </w:r>
     </w:p>
     <w:p>
@@ -4439,7 +4437,7 @@
         </w:numPr>
       </w:pPr>
       <w:r>
-        <w:t>Lớp RegisterPage hiển thị OTPVerifyPage.</w:t>
+        <w:t>RegisterPage → KH: hiển thị OTPVerifyPage.</w:t>
       </w:r>
     </w:p>
     <w:p>
@@ -4450,7 +4448,7 @@
         </w:numPr>
       </w:pPr>
       <w:r>
-        <w:t>Khách hàng nhập mã OTP.</w:t>
+        <w:t>KH → OTPVerifyPage: nhập txtOTP.</w:t>
       </w:r>
     </w:p>
     <w:p>
@@ -4461,7 +4459,7 @@
         </w:numPr>
       </w:pPr>
       <w:r>
-        <w:t>Khách hàng click nút [Xác nhận].</w:t>
+        <w:t>KH → OTPVerifyPage: click btnConfirm.</w:t>
       </w:r>
     </w:p>
     <w:p>
@@ -4472,7 +4470,7 @@
         </w:numPr>
       </w:pPr>
       <w:r>
-        <w:t>Lớp OTPVerifyPage gọi phương thức btnXacNhanClick().</w:t>
+        <w:t>OTPVerifyPage → OTPVerifyPage: btnXacNhanClick().</w:t>
       </w:r>
     </w:p>
     <w:p>
@@ -4483,7 +4481,7 @@
         </w:numPr>
       </w:pPr>
       <w:r>
-        <w:t>Lớp OTPVerifyPage gọi phương thức verifyOTP() của lớp AuthController.</w:t>
+        <w:t>OTPVerifyPage → AuthController: verifyOTP().</w:t>
       </w:r>
     </w:p>
     <w:p>
@@ -4494,7 +4492,7 @@
         </w:numPr>
       </w:pPr>
       <w:r>
-        <w:t>Lớp AuthController gọi phương thức verify() của lớp OTP.</w:t>
+        <w:t>AuthController → OTP: verify().</w:t>
       </w:r>
     </w:p>
     <w:p>
@@ -4505,7 +4503,7 @@
         </w:numPr>
       </w:pPr>
       <w:r>
-        <w:t>Lớp OTP trả về true cho lớp AuthController.</w:t>
+        <w:t>OTP → AuthController: return true.</w:t>
       </w:r>
     </w:p>
     <w:p>
@@ -4516,7 +4514,7 @@
         </w:numPr>
       </w:pPr>
       <w:r>
-        <w:t>Lớp AuthController trả về true cho lớp OTPVerifyPage.</w:t>
+        <w:t>AuthController → OTPVerifyPage: return true.</w:t>
       </w:r>
     </w:p>
     <w:p>
@@ -4527,7 +4525,7 @@
         </w:numPr>
       </w:pPr>
       <w:r>
-        <w:t>Lớp OTPVerifyPage showMessage("Đăng ký thành công!").</w:t>
+        <w:t>OTPVerifyPage → KH: showMessage("Đăng ký thành công!").</w:t>
       </w:r>
     </w:p>
     <w:p>
@@ -4594,7 +4592,7 @@
         </w:numPr>
       </w:pPr>
       <w:r>
-        <w:t>Người dùng truy cập URL /security.</w:t>
+        <w:t>Người dùng → ChangePasswordPage: truy cập URL /security.</w:t>
       </w:r>
     </w:p>
     <w:p>
@@ -4605,7 +4603,7 @@
         </w:numPr>
       </w:pPr>
       <w:r>
-        <w:t>Lớp ChangePasswordPage gọi phương thức formLoad().</w:t>
+        <w:t>ChangePasswordPage → ChangePasswordPage: formLoad().</w:t>
       </w:r>
     </w:p>
     <w:p>
@@ -4616,7 +4614,7 @@
         </w:numPr>
       </w:pPr>
       <w:r>
-        <w:t>Lớp ChangePasswordPage render form đổi mật khẩu.</w:t>
+        <w:t>ChangePasswordPage → Người dùng: render form đổi mật khẩu.</w:t>
       </w:r>
     </w:p>
     <w:p>
@@ -4627,7 +4625,7 @@
         </w:numPr>
       </w:pPr>
       <w:r>
-        <w:t>Người dùng nhập Mật khẩu hiện tại, Mật khẩu mới, Xác nhận MK mới.</w:t>
+        <w:t>Người dùng → ChangePasswordPage: nhập txtCurrentPassword, txtNewPassword, txtConfirmNewPassword.</w:t>
       </w:r>
     </w:p>
     <w:p>
@@ -4638,7 +4636,7 @@
         </w:numPr>
       </w:pPr>
       <w:r>
-        <w:t>Người dùng click nút [Lưu thay đổi].</w:t>
+        <w:t>Người dùng → ChangePasswordPage: click btnSave.</w:t>
       </w:r>
     </w:p>
     <w:p>
@@ -4649,7 +4647,7 @@
         </w:numPr>
       </w:pPr>
       <w:r>
-        <w:t>Lớp ChangePasswordPage gọi phương thức btnLuuClick().</w:t>
+        <w:t>ChangePasswordPage → ChangePasswordPage: btnLuuClick().</w:t>
       </w:r>
     </w:p>
     <w:p>
@@ -4660,7 +4658,7 @@
         </w:numPr>
       </w:pPr>
       <w:r>
-        <w:t>Lớp ChangePasswordPage gọi phương thức changePassword() của lớp AuthController.</w:t>
+        <w:t>ChangePasswordPage → AuthController: changePassword().</w:t>
       </w:r>
     </w:p>
     <w:p>
@@ -4671,7 +4669,7 @@
         </w:numPr>
       </w:pPr>
       <w:r>
-        <w:t>Lớp AuthController gọi phương thức findById() của lớp User.</w:t>
+        <w:t>AuthController → User: findById().</w:t>
       </w:r>
     </w:p>
     <w:p>
@@ -4682,7 +4680,7 @@
         </w:numPr>
       </w:pPr>
       <w:r>
-        <w:t>Lớp User trả về User cho lớp AuthController.</w:t>
+        <w:t>User → AuthController: return User.</w:t>
       </w:r>
     </w:p>
     <w:p>
@@ -4693,7 +4691,7 @@
         </w:numPr>
       </w:pPr>
       <w:r>
-        <w:t>Lớp AuthController gọi phương thức checkPassword().</w:t>
+        <w:t>AuthController → AuthController: checkPassword().</w:t>
       </w:r>
     </w:p>
     <w:p>
@@ -4704,7 +4702,7 @@
         </w:numPr>
       </w:pPr>
       <w:r>
-        <w:t>Lớp AuthController hashPassword().</w:t>
+        <w:t>AuthController → AuthController: hashPassword().</w:t>
       </w:r>
     </w:p>
     <w:p>
@@ -4715,7 +4713,7 @@
         </w:numPr>
       </w:pPr>
       <w:r>
-        <w:t>Lớp AuthController gọi phương thức updatePassword() của lớp User.</w:t>
+        <w:t>AuthController → User: updatePassword().</w:t>
       </w:r>
     </w:p>
     <w:p>
@@ -4726,7 +4724,7 @@
         </w:numPr>
       </w:pPr>
       <w:r>
-        <w:t>Lớp User trả về true cho lớp AuthController.</w:t>
+        <w:t>User → AuthController: return true.</w:t>
       </w:r>
     </w:p>
     <w:p>
@@ -4737,7 +4735,7 @@
         </w:numPr>
       </w:pPr>
       <w:r>
-        <w:t>Lớp AuthController gọi phương thức revokeAllSessions() của lớp User.</w:t>
+        <w:t>AuthController → User: revokeAllSessions().</w:t>
       </w:r>
     </w:p>
     <w:p>
@@ -4748,7 +4746,7 @@
         </w:numPr>
       </w:pPr>
       <w:r>
-        <w:t>Lớp User trả về void cho lớp AuthController.</w:t>
+        <w:t>User → AuthController: return void.</w:t>
       </w:r>
     </w:p>
     <w:p>
@@ -4759,7 +4757,7 @@
         </w:numPr>
       </w:pPr>
       <w:r>
-        <w:t>Lớp AuthController trả về true cho lớp ChangePasswordPage.</w:t>
+        <w:t>AuthController → ChangePasswordPage: return true.</w:t>
       </w:r>
     </w:p>
     <w:p>
@@ -4770,7 +4768,7 @@
         </w:numPr>
       </w:pPr>
       <w:r>
-        <w:t>Lớp ChangePasswordPage showMessage("Đổi mật khẩu thành công. Vui lòng đăng nhập lại.").</w:t>
+        <w:t>ChangePasswordPage → Người dùng: showMessage("Đổi mật khẩu thành công. Vui lòng đăng nhập lại.").</w:t>
       </w:r>
     </w:p>
     <w:p>
@@ -4837,7 +4835,7 @@
         </w:numPr>
       </w:pPr>
       <w:r>
-        <w:t>Khách hàng click avatar / tên tài khoản.</w:t>
+        <w:t>KH → ProfilePage: click avatar / tên tài khoản.</w:t>
       </w:r>
     </w:p>
     <w:p>
@@ -4848,7 +4846,7 @@
         </w:numPr>
       </w:pPr>
       <w:r>
-        <w:t>Lớp ProfilePage gọi phương thức formLoad().</w:t>
+        <w:t>ProfilePage → ProfilePage: formLoad().</w:t>
       </w:r>
     </w:p>
     <w:p>
@@ -4859,7 +4857,7 @@
         </w:numPr>
       </w:pPr>
       <w:r>
-        <w:t>Lớp ProfilePage gọi phương thức getProfile() của lớp ProfileController.</w:t>
+        <w:t>ProfilePage → ProfileController: getProfile().</w:t>
       </w:r>
     </w:p>
     <w:p>
@@ -4870,7 +4868,7 @@
         </w:numPr>
       </w:pPr>
       <w:r>
-        <w:t>Lớp ProfileController gọi phương thức findById() của lớp User.</w:t>
+        <w:t>ProfileController → User: findById().</w:t>
       </w:r>
     </w:p>
     <w:p>
@@ -4881,7 +4879,7 @@
         </w:numPr>
       </w:pPr>
       <w:r>
-        <w:t>Lớp User trả về User cho lớp ProfileController.</w:t>
+        <w:t>User → ProfileController: return User.</w:t>
       </w:r>
     </w:p>
     <w:p>
@@ -4892,7 +4890,7 @@
         </w:numPr>
       </w:pPr>
       <w:r>
-        <w:t>Lớp ProfileController trả về User cho lớp ProfilePage.</w:t>
+        <w:t>ProfileController → ProfilePage: return User.</w:t>
       </w:r>
     </w:p>
     <w:p>
@@ -4903,7 +4901,7 @@
         </w:numPr>
       </w:pPr>
       <w:r>
-        <w:t>Lớp ProfilePage gọi phương thức displayProfile().</w:t>
+        <w:t>ProfilePage → ProfilePage: displayProfile().</w:t>
       </w:r>
     </w:p>
     <w:p>
@@ -4914,7 +4912,7 @@
         </w:numPr>
       </w:pPr>
       <w:r>
-        <w:t>Lớp ProfilePage render hồ sơ cá nhân.</w:t>
+        <w:t>ProfilePage → KH: render hồ sơ cá nhân.</w:t>
       </w:r>
     </w:p>
     <w:p>
@@ -4925,7 +4923,7 @@
         </w:numPr>
       </w:pPr>
       <w:r>
-        <w:t>Khách hàng click nút [Chỉnh sửa].</w:t>
+        <w:t>KH → ProfilePage: click btnEdit.</w:t>
       </w:r>
     </w:p>
     <w:p>
@@ -4936,7 +4934,7 @@
         </w:numPr>
       </w:pPr>
       <w:r>
-        <w:t>Khách hàng sửa Họ tên và Email.</w:t>
+        <w:t>KH → ProfilePage: sửa lblFullName và lblEmail.</w:t>
       </w:r>
     </w:p>
     <w:p>
@@ -4947,7 +4945,7 @@
         </w:numPr>
       </w:pPr>
       <w:r>
-        <w:t>Khách hàng click nút [Lưu].</w:t>
+        <w:t>KH → ProfilePage: click [Lưu].</w:t>
       </w:r>
     </w:p>
     <w:p>
@@ -4958,7 +4956,7 @@
         </w:numPr>
       </w:pPr>
       <w:r>
-        <w:t>Lớp ProfilePage gọi phương thức btnChinhSuaClick().</w:t>
+        <w:t>ProfilePage → ProfilePage: btnChinhSuaClick().</w:t>
       </w:r>
     </w:p>
     <w:p>
@@ -4969,7 +4967,7 @@
         </w:numPr>
       </w:pPr>
       <w:r>
-        <w:t>Lớp ProfilePage gọi phương thức updateProfile() của lớp ProfileController.</w:t>
+        <w:t>ProfilePage → ProfileController: updateProfile().</w:t>
       </w:r>
     </w:p>
     <w:p>
@@ -4980,7 +4978,7 @@
         </w:numPr>
       </w:pPr>
       <w:r>
-        <w:t>Lớp ProfileController gọi phương thức checkEmail() của lớp User.</w:t>
+        <w:t>ProfileController → User: checkEmail().</w:t>
       </w:r>
     </w:p>
     <w:p>
@@ -4991,7 +4989,7 @@
         </w:numPr>
       </w:pPr>
       <w:r>
-        <w:t>Lớp User trả về true cho lớp ProfileController.</w:t>
+        <w:t>User → ProfileController: return true.</w:t>
       </w:r>
     </w:p>
     <w:p>
@@ -5002,7 +5000,7 @@
         </w:numPr>
       </w:pPr>
       <w:r>
-        <w:t>Lớp ProfileController gọi phương thức save() của lớp User.</w:t>
+        <w:t>ProfileController → User: save().</w:t>
       </w:r>
     </w:p>
     <w:p>
@@ -5013,7 +5011,7 @@
         </w:numPr>
       </w:pPr>
       <w:r>
-        <w:t>Lớp User trả về User cho lớp ProfileController.</w:t>
+        <w:t>User → ProfileController: return User.</w:t>
       </w:r>
     </w:p>
     <w:p>
@@ -5024,7 +5022,7 @@
         </w:numPr>
       </w:pPr>
       <w:r>
-        <w:t>Lớp ProfileController trả về User cho lớp ProfilePage.</w:t>
+        <w:t>ProfileController → ProfilePage: return User.</w:t>
       </w:r>
     </w:p>
     <w:p>
@@ -5035,7 +5033,7 @@
         </w:numPr>
       </w:pPr>
       <w:r>
-        <w:t>Lớp ProfilePage gọi phương thức displayProfile().</w:t>
+        <w:t>ProfilePage → ProfilePage: displayProfile().</w:t>
       </w:r>
     </w:p>
     <w:p>
@@ -5046,7 +5044,7 @@
         </w:numPr>
       </w:pPr>
       <w:r>
-        <w:t>Lớp ProfilePage showMessage("Cập nhật thành công!").</w:t>
+        <w:t>ProfilePage → KH: showMessage("Cập nhật thành công!").</w:t>
       </w:r>
     </w:p>
     <w:p>
@@ -5113,7 +5111,7 @@
         </w:numPr>
       </w:pPr>
       <w:r>
-        <w:t>Admin truy cập URL /admin/staff.</w:t>
+        <w:t>Admin → StaffManagePage: truy cập URL /admin/staff.</w:t>
       </w:r>
     </w:p>
     <w:p>
@@ -5124,7 +5122,7 @@
         </w:numPr>
       </w:pPr>
       <w:r>
-        <w:t>Lớp StaffManagePage gọi phương thức formLoad().</w:t>
+        <w:t>StaffManagePage → StaffManagePage: formLoad().</w:t>
       </w:r>
     </w:p>
     <w:p>
@@ -5135,7 +5133,7 @@
         </w:numPr>
       </w:pPr>
       <w:r>
-        <w:t>Lớp StaffManagePage gọi phương thức getAllStaff() của lớp StaffController.</w:t>
+        <w:t>StaffManagePage → StaffController: getAllStaff().</w:t>
       </w:r>
     </w:p>
     <w:p>
@@ -5146,7 +5144,7 @@
         </w:numPr>
       </w:pPr>
       <w:r>
-        <w:t>Lớp StaffController gọi phương thức findAll() của lớp Employee.</w:t>
+        <w:t>StaffController → Employee: findAll().</w:t>
       </w:r>
     </w:p>
     <w:p>
@@ -5157,7 +5155,7 @@
         </w:numPr>
       </w:pPr>
       <w:r>
-        <w:t>Lớp Employee trả về List&lt;Employee&gt; cho lớp StaffController.</w:t>
+        <w:t>Employee → StaffController: return List&lt;Employee&gt;.</w:t>
       </w:r>
     </w:p>
     <w:p>
@@ -5168,7 +5166,7 @@
         </w:numPr>
       </w:pPr>
       <w:r>
-        <w:t>Lớp StaffController trả về List&lt;Employee&gt; cho lớp StaffManagePage.</w:t>
+        <w:t>StaffController → StaffManagePage: return List&lt;Employee&gt;.</w:t>
       </w:r>
     </w:p>
     <w:p>
@@ -5179,7 +5177,7 @@
         </w:numPr>
       </w:pPr>
       <w:r>
-        <w:t>Lớp StaffManagePage gọi phương thức displayStaffList().</w:t>
+        <w:t>StaffManagePage → StaffManagePage: displayStaffList().</w:t>
       </w:r>
     </w:p>
     <w:p>
@@ -5190,7 +5188,7 @@
         </w:numPr>
       </w:pPr>
       <w:r>
-        <w:t>Lớp StaffManagePage render bảng nhân viên.</w:t>
+        <w:t>StaffManagePage → Admin: render tblStaffList.</w:t>
       </w:r>
     </w:p>
     <w:p>
@@ -5201,7 +5199,7 @@
         </w:numPr>
       </w:pPr>
       <w:r>
-        <w:t>Admin click nút [Thêm nhân viên].</w:t>
+        <w:t>Admin → StaffManagePage: click btnAdd.</w:t>
       </w:r>
     </w:p>
     <w:p>
@@ -5212,7 +5210,7 @@
         </w:numPr>
       </w:pPr>
       <w:r>
-        <w:t>Admin nhập Họ tên và Vai trò.</w:t>
+        <w:t>Admin → StaffManagePage: nhập fullName và staffRole.</w:t>
       </w:r>
     </w:p>
     <w:p>
@@ -5223,7 +5221,7 @@
         </w:numPr>
       </w:pPr>
       <w:r>
-        <w:t>Admin click nút [Lưu].</w:t>
+        <w:t>Admin → StaffManagePage: click [Lưu].</w:t>
       </w:r>
     </w:p>
     <w:p>
@@ -5234,7 +5232,7 @@
         </w:numPr>
       </w:pPr>
       <w:r>
-        <w:t>Lớp StaffManagePage gọi phương thức btnThemClick().</w:t>
+        <w:t>StaffManagePage → StaffManagePage: btnThemClick().</w:t>
       </w:r>
     </w:p>
     <w:p>
@@ -5245,7 +5243,7 @@
         </w:numPr>
       </w:pPr>
       <w:r>
-        <w:t>Lớp StaffManagePage gọi phương thức saveStaff() của lớp StaffController.</w:t>
+        <w:t>StaffManagePage → StaffController: saveStaff().</w:t>
       </w:r>
     </w:p>
     <w:p>
@@ -5256,7 +5254,7 @@
         </w:numPr>
       </w:pPr>
       <w:r>
-        <w:t>Lớp StaffController gọi phương thức save() của lớp Employee.</w:t>
+        <w:t>StaffController → Employee: save().</w:t>
       </w:r>
     </w:p>
     <w:p>
@@ -5267,7 +5265,7 @@
         </w:numPr>
       </w:pPr>
       <w:r>
-        <w:t>Lớp Employee trả về Employee cho lớp StaffController.</w:t>
+        <w:t>Employee → StaffController: return Employee.</w:t>
       </w:r>
     </w:p>
     <w:p>
@@ -5278,7 +5276,7 @@
         </w:numPr>
       </w:pPr>
       <w:r>
-        <w:t>Lớp StaffController trả về true cho lớp StaffManagePage.</w:t>
+        <w:t>StaffController → StaffManagePage: return true.</w:t>
       </w:r>
     </w:p>
     <w:p>
@@ -5289,7 +5287,7 @@
         </w:numPr>
       </w:pPr>
       <w:r>
-        <w:t>Lớp StaffManagePage gọi phương thức displayStaffList().</w:t>
+        <w:t>StaffManagePage → StaffManagePage: displayStaffList().</w:t>
       </w:r>
     </w:p>
     <w:p>
@@ -5300,7 +5298,7 @@
         </w:numPr>
       </w:pPr>
       <w:r>
-        <w:t>Lớp StaffManagePage showMessage("Thêm nhân viên thành công!").</w:t>
+        <w:t>StaffManagePage → Admin: showMessage("Thêm nhân viên thành công!").</w:t>
       </w:r>
     </w:p>
     <w:p>
@@ -5311,7 +5309,7 @@
         </w:numPr>
       </w:pPr>
       <w:r>
-        <w:t>Admin click nút [Xóa] trên một dòng nhân viên.</w:t>
+        <w:t>Admin → StaffManagePage: click btnDelete trên dòng nhân viên.</w:t>
       </w:r>
     </w:p>
     <w:p>
@@ -5322,7 +5320,7 @@
         </w:numPr>
       </w:pPr>
       <w:r>
-        <w:t>Lớp StaffManagePage gọi phương thức btnXoaClick().</w:t>
+        <w:t>StaffManagePage → StaffManagePage: btnXoaClick().</w:t>
       </w:r>
     </w:p>
     <w:p>
@@ -5333,7 +5331,7 @@
         </w:numPr>
       </w:pPr>
       <w:r>
-        <w:t>Lớp StaffManagePage gọi phương thức deleteStaff() của lớp StaffController.</w:t>
+        <w:t>StaffManagePage → StaffController: deleteStaff().</w:t>
       </w:r>
     </w:p>
     <w:p>
@@ -5344,7 +5342,7 @@
         </w:numPr>
       </w:pPr>
       <w:r>
-        <w:t>Lớp StaffController gọi phương thức deleteById() của lớp Employee.</w:t>
+        <w:t>StaffController → Employee: deleteById().</w:t>
       </w:r>
     </w:p>
     <w:p>
@@ -5355,7 +5353,7 @@
         </w:numPr>
       </w:pPr>
       <w:r>
-        <w:t>Lớp Employee trả về true cho lớp StaffController.</w:t>
+        <w:t>Employee → StaffController: return true.</w:t>
       </w:r>
     </w:p>
     <w:p>
@@ -5366,7 +5364,7 @@
         </w:numPr>
       </w:pPr>
       <w:r>
-        <w:t>Lớp StaffController trả về true cho lớp StaffManagePage.</w:t>
+        <w:t>StaffController → StaffManagePage: return true.</w:t>
       </w:r>
     </w:p>
     <w:p>
@@ -5377,7 +5375,7 @@
         </w:numPr>
       </w:pPr>
       <w:r>
-        <w:t>Lớp StaffManagePage gọi phương thức displayStaffList().</w:t>
+        <w:t>StaffManagePage → StaffManagePage: displayStaffList().</w:t>
       </w:r>
     </w:p>
     <w:p>
@@ -5388,7 +5386,7 @@
         </w:numPr>
       </w:pPr>
       <w:r>
-        <w:t>Lớp StaffManagePage showMessage("Xóa nhân viên thành công!").</w:t>
+        <w:t>StaffManagePage → Admin: showMessage("Xóa nhân viên thành công!").</w:t>
       </w:r>
     </w:p>
     <w:p/>
@@ -6017,11 +6015,10 @@
       </w:r>
     </w:p>
     <w:p>
-      <w:pPr/>
-      <w:r>
-        <w:rPr>
-          <w:b/>
-        </w:rPr>
+      <w:pPr>
+        <w:pStyle w:val="Heading4"/>
+      </w:pPr>
+      <w:r>
         <w:t>Trạng thái CSDL trước:</w:t>
       </w:r>
     </w:p>
@@ -7107,11 +7104,10 @@
       </w:tr>
     </w:tbl>
     <w:p>
-      <w:pPr/>
-      <w:r>
-        <w:rPr>
-          <w:b/>
-        </w:rPr>
+      <w:pPr>
+        <w:pStyle w:val="Heading4"/>
+      </w:pPr>
+      <w:r>
         <w:t>Kịch bản thực hiện:</w:t>
       </w:r>
     </w:p>
@@ -7497,11 +7493,10 @@
       </w:tr>
     </w:tbl>
     <w:p>
-      <w:pPr/>
-      <w:r>
-        <w:rPr>
-          <w:b/>
-        </w:rPr>
+      <w:pPr>
+        <w:pStyle w:val="Heading4"/>
+      </w:pPr>
+      <w:r>
         <w:t>Trạng thái CSDL sau:</w:t>
       </w:r>
     </w:p>
@@ -7841,11 +7836,10 @@
       </w:r>
     </w:p>
     <w:p>
-      <w:pPr/>
-      <w:r>
-        <w:rPr>
-          <w:b/>
-        </w:rPr>
+      <w:pPr>
+        <w:pStyle w:val="Heading4"/>
+      </w:pPr>
+      <w:r>
         <w:t>Trạng thái CSDL trước:</w:t>
       </w:r>
     </w:p>
@@ -8714,11 +8708,10 @@
       </w:tr>
     </w:tbl>
     <w:p>
-      <w:pPr/>
-      <w:r>
-        <w:rPr>
-          <w:b/>
-        </w:rPr>
+      <w:pPr>
+        <w:pStyle w:val="Heading4"/>
+      </w:pPr>
+      <w:r>
         <w:t>Kịch bản thực hiện:</w:t>
       </w:r>
     </w:p>
@@ -9077,11 +9070,10 @@
       </w:r>
     </w:p>
     <w:p>
-      <w:pPr/>
-      <w:r>
-        <w:rPr>
-          <w:b/>
-        </w:rPr>
+      <w:pPr>
+        <w:pStyle w:val="Heading4"/>
+      </w:pPr>
+      <w:r>
         <w:t>Trạng thái CSDL trước:</w:t>
       </w:r>
     </w:p>
@@ -10076,11 +10068,10 @@
       </w:tr>
     </w:tbl>
     <w:p>
-      <w:pPr/>
-      <w:r>
-        <w:rPr>
-          <w:b/>
-        </w:rPr>
+      <w:pPr>
+        <w:pStyle w:val="Heading4"/>
+      </w:pPr>
+      <w:r>
         <w:t>Kịch bản thực hiện:</w:t>
       </w:r>
     </w:p>
@@ -10583,11 +10574,10 @@
       </w:tr>
     </w:tbl>
     <w:p>
-      <w:pPr/>
-      <w:r>
-        <w:rPr>
-          <w:b/>
-        </w:rPr>
+      <w:pPr>
+        <w:pStyle w:val="Heading4"/>
+      </w:pPr>
+      <w:r>
         <w:t>Trạng thái CSDL sau:</w:t>
       </w:r>
     </w:p>
@@ -11262,11 +11252,10 @@
       </w:r>
     </w:p>
     <w:p>
-      <w:pPr/>
-      <w:r>
-        <w:rPr>
-          <w:b/>
-        </w:rPr>
+      <w:pPr>
+        <w:pStyle w:val="Heading4"/>
+      </w:pPr>
+      <w:r>
         <w:t>Trạng thái CSDL trước:</w:t>
       </w:r>
     </w:p>
@@ -12135,11 +12124,10 @@
       </w:tr>
     </w:tbl>
     <w:p>
-      <w:pPr/>
-      <w:r>
-        <w:rPr>
-          <w:b/>
-        </w:rPr>
+      <w:pPr>
+        <w:pStyle w:val="Heading4"/>
+      </w:pPr>
+      <w:r>
         <w:t>Kịch bản thực hiện:</w:t>
       </w:r>
     </w:p>
@@ -12636,11 +12624,10 @@
       </w:tr>
     </w:tbl>
     <w:p>
-      <w:pPr/>
-      <w:r>
-        <w:rPr>
-          <w:b/>
-        </w:rPr>
+      <w:pPr>
+        <w:pStyle w:val="Heading4"/>
+      </w:pPr>
+      <w:r>
         <w:t>Trạng thái CSDL sau:</w:t>
       </w:r>
     </w:p>
@@ -13757,11 +13744,10 @@
       </w:r>
     </w:p>
     <w:p>
-      <w:pPr/>
-      <w:r>
-        <w:rPr>
-          <w:b/>
-        </w:rPr>
+      <w:pPr>
+        <w:pStyle w:val="Heading4"/>
+      </w:pPr>
+      <w:r>
         <w:t>Trạng thái CSDL trước:</w:t>
       </w:r>
     </w:p>
@@ -14630,11 +14616,10 @@
       </w:tr>
     </w:tbl>
     <w:p>
-      <w:pPr/>
-      <w:r>
-        <w:rPr>
-          <w:b/>
-        </w:rPr>
+      <w:pPr>
+        <w:pStyle w:val="Heading4"/>
+      </w:pPr>
+      <w:r>
         <w:t>Kịch bản thực hiện:</w:t>
       </w:r>
     </w:p>
@@ -14984,11 +14969,10 @@
       </w:r>
     </w:p>
     <w:p>
-      <w:pPr/>
-      <w:r>
-        <w:rPr>
-          <w:b/>
-        </w:rPr>
+      <w:pPr>
+        <w:pStyle w:val="Heading4"/>
+      </w:pPr>
+      <w:r>
         <w:t>Trạng thái CSDL trước:</w:t>
       </w:r>
     </w:p>
@@ -16080,11 +16064,10 @@
       </w:r>
     </w:p>
     <w:p>
-      <w:pPr/>
-      <w:r>
-        <w:rPr>
-          <w:b/>
-        </w:rPr>
+      <w:pPr>
+        <w:pStyle w:val="Heading4"/>
+      </w:pPr>
+      <w:r>
         <w:t>Kịch bản thực hiện:</w:t>
       </w:r>
     </w:p>
@@ -16435,11 +16418,10 @@
       </w:tr>
     </w:tbl>
     <w:p>
-      <w:pPr/>
-      <w:r>
-        <w:rPr>
-          <w:b/>
-        </w:rPr>
+      <w:pPr>
+        <w:pStyle w:val="Heading4"/>
+      </w:pPr>
+      <w:r>
         <w:t>Trạng thái CSDL sau:</w:t>
       </w:r>
     </w:p>
@@ -16682,11 +16664,10 @@
       </w:r>
     </w:p>
     <w:p>
-      <w:pPr/>
-      <w:r>
-        <w:rPr>
-          <w:b/>
-        </w:rPr>
+      <w:pPr>
+        <w:pStyle w:val="Heading4"/>
+      </w:pPr>
+      <w:r>
         <w:t>Trạng thái CSDL trước:</w:t>
       </w:r>
     </w:p>
@@ -17864,11 +17845,10 @@
       </w:tr>
     </w:tbl>
     <w:p>
-      <w:pPr/>
-      <w:r>
-        <w:rPr>
-          <w:b/>
-        </w:rPr>
+      <w:pPr>
+        <w:pStyle w:val="Heading4"/>
+      </w:pPr>
+      <w:r>
         <w:t>Kịch bản thực hiện:</w:t>
       </w:r>
     </w:p>
@@ -18349,11 +18329,10 @@
       </w:tr>
     </w:tbl>
     <w:p>
-      <w:pPr/>
-      <w:r>
-        <w:rPr>
-          <w:b/>
-        </w:rPr>
+      <w:pPr>
+        <w:pStyle w:val="Heading4"/>
+      </w:pPr>
+      <w:r>
         <w:t>Trạng thái CSDL sau:</w:t>
       </w:r>
     </w:p>
@@ -19259,11 +19238,10 @@
       </w:r>
     </w:p>
     <w:p>
-      <w:pPr/>
-      <w:r>
-        <w:rPr>
-          <w:b/>
-        </w:rPr>
+      <w:pPr>
+        <w:pStyle w:val="Heading4"/>
+      </w:pPr>
+      <w:r>
         <w:t>Trạng thái CSDL trước:</w:t>
       </w:r>
     </w:p>
@@ -20349,11 +20327,10 @@
       </w:tr>
     </w:tbl>
     <w:p>
-      <w:pPr/>
-      <w:r>
-        <w:rPr>
-          <w:b/>
-        </w:rPr>
+      <w:pPr>
+        <w:pStyle w:val="Heading4"/>
+      </w:pPr>
+      <w:r>
         <w:t>Kịch bản thực hiện:</w:t>
       </w:r>
     </w:p>
@@ -20752,11 +20729,10 @@
       </w:r>
     </w:p>
     <w:p>
-      <w:pPr/>
-      <w:r>
-        <w:rPr>
-          <w:b/>
-        </w:rPr>
+      <w:pPr>
+        <w:pStyle w:val="Heading4"/>
+      </w:pPr>
+      <w:r>
         <w:t>Trạng thái CSDL trước:</w:t>
       </w:r>
     </w:p>
@@ -21625,11 +21601,10 @@
       </w:tr>
     </w:tbl>
     <w:p>
-      <w:pPr/>
-      <w:r>
-        <w:rPr>
-          <w:b/>
-        </w:rPr>
+      <w:pPr>
+        <w:pStyle w:val="Heading4"/>
+      </w:pPr>
+      <w:r>
         <w:t>Kịch bản thực hiện:</w:t>
       </w:r>
     </w:p>
@@ -22055,11 +22030,10 @@
       </w:tr>
     </w:tbl>
     <w:p>
-      <w:pPr/>
-      <w:r>
-        <w:rPr>
-          <w:b/>
-        </w:rPr>
+      <w:pPr>
+        <w:pStyle w:val="Heading4"/>
+      </w:pPr>
+      <w:r>
         <w:t>Trạng thái CSDL sau:</w:t>
       </w:r>
     </w:p>
@@ -22607,11 +22581,10 @@
       </w:r>
     </w:p>
     <w:p>
-      <w:pPr/>
-      <w:r>
-        <w:rPr>
-          <w:b/>
-        </w:rPr>
+      <w:pPr>
+        <w:pStyle w:val="Heading4"/>
+      </w:pPr>
+      <w:r>
         <w:t>Trạng thái CSDL trước:</w:t>
       </w:r>
     </w:p>
@@ -23480,11 +23453,10 @@
       </w:tr>
     </w:tbl>
     <w:p>
-      <w:pPr/>
-      <w:r>
-        <w:rPr>
-          <w:b/>
-        </w:rPr>
+      <w:pPr>
+        <w:pStyle w:val="Heading4"/>
+      </w:pPr>
+      <w:r>
         <w:t>Kịch bản thực hiện:</w:t>
       </w:r>
     </w:p>
@@ -23822,11 +23794,10 @@
       </w:r>
     </w:p>
     <w:p>
-      <w:pPr/>
-      <w:r>
-        <w:rPr>
-          <w:b/>
-        </w:rPr>
+      <w:pPr>
+        <w:pStyle w:val="Heading4"/>
+      </w:pPr>
+      <w:r>
         <w:t>Trạng thái CSDL trước:</w:t>
       </w:r>
     </w:p>
@@ -25052,11 +25023,10 @@
       </w:tr>
     </w:tbl>
     <w:p>
-      <w:pPr/>
-      <w:r>
-        <w:rPr>
-          <w:b/>
-        </w:rPr>
+      <w:pPr>
+        <w:pStyle w:val="Heading4"/>
+      </w:pPr>
+      <w:r>
         <w:t>Kịch bản thực hiện:</w:t>
       </w:r>
     </w:p>
@@ -25656,11 +25626,10 @@
       </w:tr>
     </w:tbl>
     <w:p>
-      <w:pPr/>
-      <w:r>
-        <w:rPr>
-          <w:b/>
-        </w:rPr>
+      <w:pPr>
+        <w:pStyle w:val="Heading4"/>
+      </w:pPr>
+      <w:r>
         <w:t>Trạng thái CSDL sau:</w:t>
       </w:r>
     </w:p>

</xml_diff>

<commit_message>
fix: PlantUML arrow labels → English; section II.4 scenarios use bullets
Sequence diagrams (10 blocks across ii-analysis + iii-design): all arrow labels
and actor display names converted to English — access/display/enter/click/
return/redirect/confirm; showMessage contents English; actor "Người dùng"→"KH",
"Khách hàng"→"Customer"/"KH"; method names unchanged (already English).
Scenario text blocks (kịch bản phiên bản 2/3) remain Vietnamese per skill.

Generator: in_scenario_section fires only on 'Kịch bản phiên bản 3' →
section II.4 analysis scenarios render as bullets (numId=1),
section III.5 design scenarios stay numbered (numId=10–14).

Co-Authored-By: Claude Sonnet 4.6 <noreply@anthropic.com>
</commit_message>
<xml_diff>
--- a/output/account_module.docx
+++ b/output/account_module.docx
@@ -82,7 +82,7 @@
       <w:pPr>
         <w:numPr>
           <w:ilvl w:val="0"/>
-          <w:numId w:val="10"/>
+          <w:numId w:val="1"/>
         </w:numPr>
       </w:pPr>
       <w:r>
@@ -93,7 +93,7 @@
       <w:pPr>
         <w:numPr>
           <w:ilvl w:val="0"/>
-          <w:numId w:val="10"/>
+          <w:numId w:val="1"/>
         </w:numPr>
       </w:pPr>
       <w:r>
@@ -104,7 +104,7 @@
       <w:pPr>
         <w:numPr>
           <w:ilvl w:val="0"/>
-          <w:numId w:val="10"/>
+          <w:numId w:val="1"/>
         </w:numPr>
       </w:pPr>
       <w:r>
@@ -115,7 +115,7 @@
       <w:pPr>
         <w:numPr>
           <w:ilvl w:val="0"/>
-          <w:numId w:val="10"/>
+          <w:numId w:val="1"/>
         </w:numPr>
       </w:pPr>
       <w:r>
@@ -126,7 +126,7 @@
       <w:pPr>
         <w:numPr>
           <w:ilvl w:val="0"/>
-          <w:numId w:val="10"/>
+          <w:numId w:val="1"/>
         </w:numPr>
       </w:pPr>
       <w:r>
@@ -137,7 +137,7 @@
       <w:pPr>
         <w:numPr>
           <w:ilvl w:val="0"/>
-          <w:numId w:val="10"/>
+          <w:numId w:val="1"/>
         </w:numPr>
       </w:pPr>
       <w:r>
@@ -148,7 +148,7 @@
       <w:pPr>
         <w:numPr>
           <w:ilvl w:val="0"/>
-          <w:numId w:val="10"/>
+          <w:numId w:val="1"/>
         </w:numPr>
       </w:pPr>
       <w:r>
@@ -215,7 +215,7 @@
       <w:pPr>
         <w:numPr>
           <w:ilvl w:val="0"/>
-          <w:numId w:val="11"/>
+          <w:numId w:val="1"/>
         </w:numPr>
       </w:pPr>
       <w:r>
@@ -226,7 +226,7 @@
       <w:pPr>
         <w:numPr>
           <w:ilvl w:val="0"/>
-          <w:numId w:val="11"/>
+          <w:numId w:val="1"/>
         </w:numPr>
       </w:pPr>
       <w:r>
@@ -237,7 +237,7 @@
       <w:pPr>
         <w:numPr>
           <w:ilvl w:val="0"/>
-          <w:numId w:val="11"/>
+          <w:numId w:val="1"/>
         </w:numPr>
       </w:pPr>
       <w:r>
@@ -248,7 +248,7 @@
       <w:pPr>
         <w:numPr>
           <w:ilvl w:val="0"/>
-          <w:numId w:val="11"/>
+          <w:numId w:val="1"/>
         </w:numPr>
       </w:pPr>
       <w:r>
@@ -259,7 +259,7 @@
       <w:pPr>
         <w:numPr>
           <w:ilvl w:val="0"/>
-          <w:numId w:val="11"/>
+          <w:numId w:val="1"/>
         </w:numPr>
       </w:pPr>
       <w:r>
@@ -270,7 +270,7 @@
       <w:pPr>
         <w:numPr>
           <w:ilvl w:val="0"/>
-          <w:numId w:val="11"/>
+          <w:numId w:val="1"/>
         </w:numPr>
       </w:pPr>
       <w:r>
@@ -281,7 +281,7 @@
       <w:pPr>
         <w:numPr>
           <w:ilvl w:val="0"/>
-          <w:numId w:val="11"/>
+          <w:numId w:val="1"/>
         </w:numPr>
       </w:pPr>
       <w:r>
@@ -292,7 +292,7 @@
       <w:pPr>
         <w:numPr>
           <w:ilvl w:val="0"/>
-          <w:numId w:val="11"/>
+          <w:numId w:val="1"/>
         </w:numPr>
       </w:pPr>
       <w:r>
@@ -303,7 +303,7 @@
       <w:pPr>
         <w:numPr>
           <w:ilvl w:val="0"/>
-          <w:numId w:val="11"/>
+          <w:numId w:val="1"/>
         </w:numPr>
       </w:pPr>
       <w:r>
@@ -314,7 +314,7 @@
       <w:pPr>
         <w:numPr>
           <w:ilvl w:val="0"/>
-          <w:numId w:val="11"/>
+          <w:numId w:val="1"/>
         </w:numPr>
       </w:pPr>
       <w:r>
@@ -325,7 +325,7 @@
       <w:pPr>
         <w:numPr>
           <w:ilvl w:val="0"/>
-          <w:numId w:val="11"/>
+          <w:numId w:val="1"/>
         </w:numPr>
       </w:pPr>
       <w:r>
@@ -336,7 +336,7 @@
       <w:pPr>
         <w:numPr>
           <w:ilvl w:val="0"/>
-          <w:numId w:val="11"/>
+          <w:numId w:val="1"/>
         </w:numPr>
       </w:pPr>
       <w:r>
@@ -347,7 +347,7 @@
       <w:pPr>
         <w:numPr>
           <w:ilvl w:val="0"/>
-          <w:numId w:val="11"/>
+          <w:numId w:val="1"/>
         </w:numPr>
       </w:pPr>
       <w:r>
@@ -358,7 +358,7 @@
       <w:pPr>
         <w:numPr>
           <w:ilvl w:val="0"/>
-          <w:numId w:val="11"/>
+          <w:numId w:val="1"/>
         </w:numPr>
       </w:pPr>
       <w:r>
@@ -369,7 +369,7 @@
       <w:pPr>
         <w:numPr>
           <w:ilvl w:val="0"/>
-          <w:numId w:val="11"/>
+          <w:numId w:val="1"/>
         </w:numPr>
       </w:pPr>
       <w:r>
@@ -380,7 +380,7 @@
       <w:pPr>
         <w:numPr>
           <w:ilvl w:val="0"/>
-          <w:numId w:val="11"/>
+          <w:numId w:val="1"/>
         </w:numPr>
       </w:pPr>
       <w:r>
@@ -391,7 +391,7 @@
       <w:pPr>
         <w:numPr>
           <w:ilvl w:val="0"/>
-          <w:numId w:val="11"/>
+          <w:numId w:val="1"/>
         </w:numPr>
       </w:pPr>
       <w:r>
@@ -458,7 +458,7 @@
       <w:pPr>
         <w:numPr>
           <w:ilvl w:val="0"/>
-          <w:numId w:val="12"/>
+          <w:numId w:val="1"/>
         </w:numPr>
       </w:pPr>
       <w:r>
@@ -469,7 +469,7 @@
       <w:pPr>
         <w:numPr>
           <w:ilvl w:val="0"/>
-          <w:numId w:val="12"/>
+          <w:numId w:val="1"/>
         </w:numPr>
       </w:pPr>
       <w:r>
@@ -480,7 +480,7 @@
       <w:pPr>
         <w:numPr>
           <w:ilvl w:val="0"/>
-          <w:numId w:val="12"/>
+          <w:numId w:val="1"/>
         </w:numPr>
       </w:pPr>
       <w:r>
@@ -491,7 +491,7 @@
       <w:pPr>
         <w:numPr>
           <w:ilvl w:val="0"/>
-          <w:numId w:val="12"/>
+          <w:numId w:val="1"/>
         </w:numPr>
       </w:pPr>
       <w:r>
@@ -502,7 +502,7 @@
       <w:pPr>
         <w:numPr>
           <w:ilvl w:val="0"/>
-          <w:numId w:val="12"/>
+          <w:numId w:val="1"/>
         </w:numPr>
       </w:pPr>
       <w:r>
@@ -513,7 +513,7 @@
       <w:pPr>
         <w:numPr>
           <w:ilvl w:val="0"/>
-          <w:numId w:val="12"/>
+          <w:numId w:val="1"/>
         </w:numPr>
       </w:pPr>
       <w:r>
@@ -524,7 +524,7 @@
       <w:pPr>
         <w:numPr>
           <w:ilvl w:val="0"/>
-          <w:numId w:val="12"/>
+          <w:numId w:val="1"/>
         </w:numPr>
       </w:pPr>
       <w:r>
@@ -535,7 +535,7 @@
       <w:pPr>
         <w:numPr>
           <w:ilvl w:val="0"/>
-          <w:numId w:val="12"/>
+          <w:numId w:val="1"/>
         </w:numPr>
       </w:pPr>
       <w:r>
@@ -602,7 +602,7 @@
       <w:pPr>
         <w:numPr>
           <w:ilvl w:val="0"/>
-          <w:numId w:val="13"/>
+          <w:numId w:val="1"/>
         </w:numPr>
       </w:pPr>
       <w:r>
@@ -613,7 +613,7 @@
       <w:pPr>
         <w:numPr>
           <w:ilvl w:val="0"/>
-          <w:numId w:val="13"/>
+          <w:numId w:val="1"/>
         </w:numPr>
       </w:pPr>
       <w:r>
@@ -624,7 +624,7 @@
       <w:pPr>
         <w:numPr>
           <w:ilvl w:val="0"/>
-          <w:numId w:val="13"/>
+          <w:numId w:val="1"/>
         </w:numPr>
       </w:pPr>
       <w:r>
@@ -635,7 +635,7 @@
       <w:pPr>
         <w:numPr>
           <w:ilvl w:val="0"/>
-          <w:numId w:val="13"/>
+          <w:numId w:val="1"/>
         </w:numPr>
       </w:pPr>
       <w:r>
@@ -646,7 +646,7 @@
       <w:pPr>
         <w:numPr>
           <w:ilvl w:val="0"/>
-          <w:numId w:val="13"/>
+          <w:numId w:val="1"/>
         </w:numPr>
       </w:pPr>
       <w:r>
@@ -657,7 +657,7 @@
       <w:pPr>
         <w:numPr>
           <w:ilvl w:val="0"/>
-          <w:numId w:val="13"/>
+          <w:numId w:val="1"/>
         </w:numPr>
       </w:pPr>
       <w:r>
@@ -668,7 +668,7 @@
       <w:pPr>
         <w:numPr>
           <w:ilvl w:val="0"/>
-          <w:numId w:val="13"/>
+          <w:numId w:val="1"/>
         </w:numPr>
       </w:pPr>
       <w:r>
@@ -679,7 +679,7 @@
       <w:pPr>
         <w:numPr>
           <w:ilvl w:val="0"/>
-          <w:numId w:val="13"/>
+          <w:numId w:val="1"/>
         </w:numPr>
       </w:pPr>
       <w:r>
@@ -690,7 +690,7 @@
       <w:pPr>
         <w:numPr>
           <w:ilvl w:val="0"/>
-          <w:numId w:val="13"/>
+          <w:numId w:val="1"/>
         </w:numPr>
       </w:pPr>
       <w:r>
@@ -701,7 +701,7 @@
       <w:pPr>
         <w:numPr>
           <w:ilvl w:val="0"/>
-          <w:numId w:val="13"/>
+          <w:numId w:val="1"/>
         </w:numPr>
       </w:pPr>
       <w:r>
@@ -768,7 +768,7 @@
       <w:pPr>
         <w:numPr>
           <w:ilvl w:val="0"/>
-          <w:numId w:val="14"/>
+          <w:numId w:val="1"/>
         </w:numPr>
       </w:pPr>
       <w:r>
@@ -779,7 +779,7 @@
       <w:pPr>
         <w:numPr>
           <w:ilvl w:val="0"/>
-          <w:numId w:val="14"/>
+          <w:numId w:val="1"/>
         </w:numPr>
       </w:pPr>
       <w:r>
@@ -790,7 +790,7 @@
       <w:pPr>
         <w:numPr>
           <w:ilvl w:val="0"/>
-          <w:numId w:val="14"/>
+          <w:numId w:val="1"/>
         </w:numPr>
       </w:pPr>
       <w:r>
@@ -801,7 +801,7 @@
       <w:pPr>
         <w:numPr>
           <w:ilvl w:val="0"/>
-          <w:numId w:val="14"/>
+          <w:numId w:val="1"/>
         </w:numPr>
       </w:pPr>
       <w:r>
@@ -812,7 +812,7 @@
       <w:pPr>
         <w:numPr>
           <w:ilvl w:val="0"/>
-          <w:numId w:val="14"/>
+          <w:numId w:val="1"/>
         </w:numPr>
       </w:pPr>
       <w:r>
@@ -823,7 +823,7 @@
       <w:pPr>
         <w:numPr>
           <w:ilvl w:val="0"/>
-          <w:numId w:val="14"/>
+          <w:numId w:val="1"/>
         </w:numPr>
       </w:pPr>
       <w:r>
@@ -834,7 +834,7 @@
       <w:pPr>
         <w:numPr>
           <w:ilvl w:val="0"/>
-          <w:numId w:val="14"/>
+          <w:numId w:val="1"/>
         </w:numPr>
       </w:pPr>
       <w:r>
@@ -845,7 +845,7 @@
       <w:pPr>
         <w:numPr>
           <w:ilvl w:val="0"/>
-          <w:numId w:val="14"/>
+          <w:numId w:val="1"/>
         </w:numPr>
       </w:pPr>
       <w:r>
@@ -856,7 +856,7 @@
       <w:pPr>
         <w:numPr>
           <w:ilvl w:val="0"/>
-          <w:numId w:val="14"/>
+          <w:numId w:val="1"/>
         </w:numPr>
       </w:pPr>
       <w:r>
@@ -867,7 +867,7 @@
       <w:pPr>
         <w:numPr>
           <w:ilvl w:val="0"/>
-          <w:numId w:val="14"/>
+          <w:numId w:val="1"/>
         </w:numPr>
       </w:pPr>
       <w:r>
@@ -878,7 +878,7 @@
       <w:pPr>
         <w:numPr>
           <w:ilvl w:val="0"/>
-          <w:numId w:val="14"/>
+          <w:numId w:val="1"/>
         </w:numPr>
       </w:pPr>
       <w:r>
@@ -889,7 +889,7 @@
       <w:pPr>
         <w:numPr>
           <w:ilvl w:val="0"/>
-          <w:numId w:val="14"/>
+          <w:numId w:val="1"/>
         </w:numPr>
       </w:pPr>
       <w:r>
@@ -900,7 +900,7 @@
       <w:pPr>
         <w:numPr>
           <w:ilvl w:val="0"/>
-          <w:numId w:val="14"/>
+          <w:numId w:val="1"/>
         </w:numPr>
       </w:pPr>
       <w:r>
@@ -911,7 +911,7 @@
       <w:pPr>
         <w:numPr>
           <w:ilvl w:val="0"/>
-          <w:numId w:val="14"/>
+          <w:numId w:val="1"/>
         </w:numPr>
       </w:pPr>
       <w:r>
@@ -922,7 +922,7 @@
       <w:pPr>
         <w:numPr>
           <w:ilvl w:val="0"/>
-          <w:numId w:val="14"/>
+          <w:numId w:val="1"/>
         </w:numPr>
       </w:pPr>
       <w:r>
@@ -933,7 +933,7 @@
       <w:pPr>
         <w:numPr>
           <w:ilvl w:val="0"/>
-          <w:numId w:val="14"/>
+          <w:numId w:val="1"/>
         </w:numPr>
       </w:pPr>
       <w:r>
@@ -944,7 +944,7 @@
       <w:pPr>
         <w:numPr>
           <w:ilvl w:val="0"/>
-          <w:numId w:val="14"/>
+          <w:numId w:val="1"/>
         </w:numPr>
       </w:pPr>
       <w:r>
@@ -955,7 +955,7 @@
       <w:pPr>
         <w:numPr>
           <w:ilvl w:val="0"/>
-          <w:numId w:val="14"/>
+          <w:numId w:val="1"/>
         </w:numPr>
       </w:pPr>
       <w:r>
@@ -4058,7 +4058,7 @@
       <w:pPr>
         <w:numPr>
           <w:ilvl w:val="0"/>
-          <w:numId w:val="15"/>
+          <w:numId w:val="10"/>
         </w:numPr>
       </w:pPr>
       <w:r>
@@ -4069,7 +4069,7 @@
       <w:pPr>
         <w:numPr>
           <w:ilvl w:val="0"/>
-          <w:numId w:val="15"/>
+          <w:numId w:val="10"/>
         </w:numPr>
       </w:pPr>
       <w:r>
@@ -4080,7 +4080,7 @@
       <w:pPr>
         <w:numPr>
           <w:ilvl w:val="0"/>
-          <w:numId w:val="15"/>
+          <w:numId w:val="10"/>
         </w:numPr>
       </w:pPr>
       <w:r>
@@ -4091,7 +4091,7 @@
       <w:pPr>
         <w:numPr>
           <w:ilvl w:val="0"/>
-          <w:numId w:val="15"/>
+          <w:numId w:val="10"/>
         </w:numPr>
       </w:pPr>
       <w:r>
@@ -4102,7 +4102,7 @@
       <w:pPr>
         <w:numPr>
           <w:ilvl w:val="0"/>
-          <w:numId w:val="15"/>
+          <w:numId w:val="10"/>
         </w:numPr>
       </w:pPr>
       <w:r>
@@ -4113,7 +4113,7 @@
       <w:pPr>
         <w:numPr>
           <w:ilvl w:val="0"/>
-          <w:numId w:val="15"/>
+          <w:numId w:val="10"/>
         </w:numPr>
       </w:pPr>
       <w:r>
@@ -4124,7 +4124,7 @@
       <w:pPr>
         <w:numPr>
           <w:ilvl w:val="0"/>
-          <w:numId w:val="15"/>
+          <w:numId w:val="10"/>
         </w:numPr>
       </w:pPr>
       <w:r>
@@ -4135,7 +4135,7 @@
       <w:pPr>
         <w:numPr>
           <w:ilvl w:val="0"/>
-          <w:numId w:val="15"/>
+          <w:numId w:val="10"/>
         </w:numPr>
       </w:pPr>
       <w:r>
@@ -4146,7 +4146,7 @@
       <w:pPr>
         <w:numPr>
           <w:ilvl w:val="0"/>
-          <w:numId w:val="15"/>
+          <w:numId w:val="10"/>
         </w:numPr>
       </w:pPr>
       <w:r>
@@ -4157,7 +4157,7 @@
       <w:pPr>
         <w:numPr>
           <w:ilvl w:val="0"/>
-          <w:numId w:val="15"/>
+          <w:numId w:val="10"/>
         </w:numPr>
       </w:pPr>
       <w:r>
@@ -4168,7 +4168,7 @@
       <w:pPr>
         <w:numPr>
           <w:ilvl w:val="0"/>
-          <w:numId w:val="15"/>
+          <w:numId w:val="10"/>
         </w:numPr>
       </w:pPr>
       <w:r>
@@ -4179,7 +4179,7 @@
       <w:pPr>
         <w:numPr>
           <w:ilvl w:val="0"/>
-          <w:numId w:val="15"/>
+          <w:numId w:val="10"/>
         </w:numPr>
       </w:pPr>
       <w:r>
@@ -4190,7 +4190,7 @@
       <w:pPr>
         <w:numPr>
           <w:ilvl w:val="0"/>
-          <w:numId w:val="15"/>
+          <w:numId w:val="10"/>
         </w:numPr>
       </w:pPr>
       <w:r>
@@ -4257,7 +4257,7 @@
       <w:pPr>
         <w:numPr>
           <w:ilvl w:val="0"/>
-          <w:numId w:val="16"/>
+          <w:numId w:val="11"/>
         </w:numPr>
       </w:pPr>
       <w:r>
@@ -4268,7 +4268,7 @@
       <w:pPr>
         <w:numPr>
           <w:ilvl w:val="0"/>
-          <w:numId w:val="16"/>
+          <w:numId w:val="11"/>
         </w:numPr>
       </w:pPr>
       <w:r>
@@ -4279,7 +4279,7 @@
       <w:pPr>
         <w:numPr>
           <w:ilvl w:val="0"/>
-          <w:numId w:val="16"/>
+          <w:numId w:val="11"/>
         </w:numPr>
       </w:pPr>
       <w:r>
@@ -4290,7 +4290,7 @@
       <w:pPr>
         <w:numPr>
           <w:ilvl w:val="0"/>
-          <w:numId w:val="16"/>
+          <w:numId w:val="11"/>
         </w:numPr>
       </w:pPr>
       <w:r>
@@ -4301,7 +4301,7 @@
       <w:pPr>
         <w:numPr>
           <w:ilvl w:val="0"/>
-          <w:numId w:val="16"/>
+          <w:numId w:val="11"/>
         </w:numPr>
       </w:pPr>
       <w:r>
@@ -4312,7 +4312,7 @@
       <w:pPr>
         <w:numPr>
           <w:ilvl w:val="0"/>
-          <w:numId w:val="16"/>
+          <w:numId w:val="11"/>
         </w:numPr>
       </w:pPr>
       <w:r>
@@ -4323,7 +4323,7 @@
       <w:pPr>
         <w:numPr>
           <w:ilvl w:val="0"/>
-          <w:numId w:val="16"/>
+          <w:numId w:val="11"/>
         </w:numPr>
       </w:pPr>
       <w:r>
@@ -4334,7 +4334,7 @@
       <w:pPr>
         <w:numPr>
           <w:ilvl w:val="0"/>
-          <w:numId w:val="16"/>
+          <w:numId w:val="11"/>
         </w:numPr>
       </w:pPr>
       <w:r>
@@ -4345,7 +4345,7 @@
       <w:pPr>
         <w:numPr>
           <w:ilvl w:val="0"/>
-          <w:numId w:val="16"/>
+          <w:numId w:val="11"/>
         </w:numPr>
       </w:pPr>
       <w:r>
@@ -4356,7 +4356,7 @@
       <w:pPr>
         <w:numPr>
           <w:ilvl w:val="0"/>
-          <w:numId w:val="16"/>
+          <w:numId w:val="11"/>
         </w:numPr>
       </w:pPr>
       <w:r>
@@ -4367,7 +4367,7 @@
       <w:pPr>
         <w:numPr>
           <w:ilvl w:val="0"/>
-          <w:numId w:val="16"/>
+          <w:numId w:val="11"/>
         </w:numPr>
       </w:pPr>
       <w:r>
@@ -4378,7 +4378,7 @@
       <w:pPr>
         <w:numPr>
           <w:ilvl w:val="0"/>
-          <w:numId w:val="16"/>
+          <w:numId w:val="11"/>
         </w:numPr>
       </w:pPr>
       <w:r>
@@ -4389,7 +4389,7 @@
       <w:pPr>
         <w:numPr>
           <w:ilvl w:val="0"/>
-          <w:numId w:val="16"/>
+          <w:numId w:val="11"/>
         </w:numPr>
       </w:pPr>
       <w:r>
@@ -4400,7 +4400,7 @@
       <w:pPr>
         <w:numPr>
           <w:ilvl w:val="0"/>
-          <w:numId w:val="16"/>
+          <w:numId w:val="11"/>
         </w:numPr>
       </w:pPr>
       <w:r>
@@ -4411,7 +4411,7 @@
       <w:pPr>
         <w:numPr>
           <w:ilvl w:val="0"/>
-          <w:numId w:val="16"/>
+          <w:numId w:val="11"/>
         </w:numPr>
       </w:pPr>
       <w:r>
@@ -4422,7 +4422,7 @@
       <w:pPr>
         <w:numPr>
           <w:ilvl w:val="0"/>
-          <w:numId w:val="16"/>
+          <w:numId w:val="11"/>
         </w:numPr>
       </w:pPr>
       <w:r>
@@ -4433,7 +4433,7 @@
       <w:pPr>
         <w:numPr>
           <w:ilvl w:val="0"/>
-          <w:numId w:val="16"/>
+          <w:numId w:val="11"/>
         </w:numPr>
       </w:pPr>
       <w:r>
@@ -4444,7 +4444,7 @@
       <w:pPr>
         <w:numPr>
           <w:ilvl w:val="0"/>
-          <w:numId w:val="16"/>
+          <w:numId w:val="11"/>
         </w:numPr>
       </w:pPr>
       <w:r>
@@ -4455,7 +4455,7 @@
       <w:pPr>
         <w:numPr>
           <w:ilvl w:val="0"/>
-          <w:numId w:val="16"/>
+          <w:numId w:val="11"/>
         </w:numPr>
       </w:pPr>
       <w:r>
@@ -4466,7 +4466,7 @@
       <w:pPr>
         <w:numPr>
           <w:ilvl w:val="0"/>
-          <w:numId w:val="16"/>
+          <w:numId w:val="11"/>
         </w:numPr>
       </w:pPr>
       <w:r>
@@ -4477,7 +4477,7 @@
       <w:pPr>
         <w:numPr>
           <w:ilvl w:val="0"/>
-          <w:numId w:val="16"/>
+          <w:numId w:val="11"/>
         </w:numPr>
       </w:pPr>
       <w:r>
@@ -4488,7 +4488,7 @@
       <w:pPr>
         <w:numPr>
           <w:ilvl w:val="0"/>
-          <w:numId w:val="16"/>
+          <w:numId w:val="11"/>
         </w:numPr>
       </w:pPr>
       <w:r>
@@ -4499,7 +4499,7 @@
       <w:pPr>
         <w:numPr>
           <w:ilvl w:val="0"/>
-          <w:numId w:val="16"/>
+          <w:numId w:val="11"/>
         </w:numPr>
       </w:pPr>
       <w:r>
@@ -4510,7 +4510,7 @@
       <w:pPr>
         <w:numPr>
           <w:ilvl w:val="0"/>
-          <w:numId w:val="16"/>
+          <w:numId w:val="11"/>
         </w:numPr>
       </w:pPr>
       <w:r>
@@ -4521,7 +4521,7 @@
       <w:pPr>
         <w:numPr>
           <w:ilvl w:val="0"/>
-          <w:numId w:val="16"/>
+          <w:numId w:val="11"/>
         </w:numPr>
       </w:pPr>
       <w:r>
@@ -4588,7 +4588,7 @@
       <w:pPr>
         <w:numPr>
           <w:ilvl w:val="0"/>
-          <w:numId w:val="17"/>
+          <w:numId w:val="12"/>
         </w:numPr>
       </w:pPr>
       <w:r>
@@ -4599,7 +4599,7 @@
       <w:pPr>
         <w:numPr>
           <w:ilvl w:val="0"/>
-          <w:numId w:val="17"/>
+          <w:numId w:val="12"/>
         </w:numPr>
       </w:pPr>
       <w:r>
@@ -4610,7 +4610,7 @@
       <w:pPr>
         <w:numPr>
           <w:ilvl w:val="0"/>
-          <w:numId w:val="17"/>
+          <w:numId w:val="12"/>
         </w:numPr>
       </w:pPr>
       <w:r>
@@ -4621,7 +4621,7 @@
       <w:pPr>
         <w:numPr>
           <w:ilvl w:val="0"/>
-          <w:numId w:val="17"/>
+          <w:numId w:val="12"/>
         </w:numPr>
       </w:pPr>
       <w:r>
@@ -4632,7 +4632,7 @@
       <w:pPr>
         <w:numPr>
           <w:ilvl w:val="0"/>
-          <w:numId w:val="17"/>
+          <w:numId w:val="12"/>
         </w:numPr>
       </w:pPr>
       <w:r>
@@ -4643,7 +4643,7 @@
       <w:pPr>
         <w:numPr>
           <w:ilvl w:val="0"/>
-          <w:numId w:val="17"/>
+          <w:numId w:val="12"/>
         </w:numPr>
       </w:pPr>
       <w:r>
@@ -4654,7 +4654,7 @@
       <w:pPr>
         <w:numPr>
           <w:ilvl w:val="0"/>
-          <w:numId w:val="17"/>
+          <w:numId w:val="12"/>
         </w:numPr>
       </w:pPr>
       <w:r>
@@ -4665,7 +4665,7 @@
       <w:pPr>
         <w:numPr>
           <w:ilvl w:val="0"/>
-          <w:numId w:val="17"/>
+          <w:numId w:val="12"/>
         </w:numPr>
       </w:pPr>
       <w:r>
@@ -4676,7 +4676,7 @@
       <w:pPr>
         <w:numPr>
           <w:ilvl w:val="0"/>
-          <w:numId w:val="17"/>
+          <w:numId w:val="12"/>
         </w:numPr>
       </w:pPr>
       <w:r>
@@ -4687,7 +4687,7 @@
       <w:pPr>
         <w:numPr>
           <w:ilvl w:val="0"/>
-          <w:numId w:val="17"/>
+          <w:numId w:val="12"/>
         </w:numPr>
       </w:pPr>
       <w:r>
@@ -4698,7 +4698,7 @@
       <w:pPr>
         <w:numPr>
           <w:ilvl w:val="0"/>
-          <w:numId w:val="17"/>
+          <w:numId w:val="12"/>
         </w:numPr>
       </w:pPr>
       <w:r>
@@ -4709,7 +4709,7 @@
       <w:pPr>
         <w:numPr>
           <w:ilvl w:val="0"/>
-          <w:numId w:val="17"/>
+          <w:numId w:val="12"/>
         </w:numPr>
       </w:pPr>
       <w:r>
@@ -4720,7 +4720,7 @@
       <w:pPr>
         <w:numPr>
           <w:ilvl w:val="0"/>
-          <w:numId w:val="17"/>
+          <w:numId w:val="12"/>
         </w:numPr>
       </w:pPr>
       <w:r>
@@ -4731,7 +4731,7 @@
       <w:pPr>
         <w:numPr>
           <w:ilvl w:val="0"/>
-          <w:numId w:val="17"/>
+          <w:numId w:val="12"/>
         </w:numPr>
       </w:pPr>
       <w:r>
@@ -4742,7 +4742,7 @@
       <w:pPr>
         <w:numPr>
           <w:ilvl w:val="0"/>
-          <w:numId w:val="17"/>
+          <w:numId w:val="12"/>
         </w:numPr>
       </w:pPr>
       <w:r>
@@ -4753,7 +4753,7 @@
       <w:pPr>
         <w:numPr>
           <w:ilvl w:val="0"/>
-          <w:numId w:val="17"/>
+          <w:numId w:val="12"/>
         </w:numPr>
       </w:pPr>
       <w:r>
@@ -4764,7 +4764,7 @@
       <w:pPr>
         <w:numPr>
           <w:ilvl w:val="0"/>
-          <w:numId w:val="17"/>
+          <w:numId w:val="12"/>
         </w:numPr>
       </w:pPr>
       <w:r>
@@ -4831,7 +4831,7 @@
       <w:pPr>
         <w:numPr>
           <w:ilvl w:val="0"/>
-          <w:numId w:val="18"/>
+          <w:numId w:val="13"/>
         </w:numPr>
       </w:pPr>
       <w:r>
@@ -4842,7 +4842,7 @@
       <w:pPr>
         <w:numPr>
           <w:ilvl w:val="0"/>
-          <w:numId w:val="18"/>
+          <w:numId w:val="13"/>
         </w:numPr>
       </w:pPr>
       <w:r>
@@ -4853,7 +4853,7 @@
       <w:pPr>
         <w:numPr>
           <w:ilvl w:val="0"/>
-          <w:numId w:val="18"/>
+          <w:numId w:val="13"/>
         </w:numPr>
       </w:pPr>
       <w:r>
@@ -4864,7 +4864,7 @@
       <w:pPr>
         <w:numPr>
           <w:ilvl w:val="0"/>
-          <w:numId w:val="18"/>
+          <w:numId w:val="13"/>
         </w:numPr>
       </w:pPr>
       <w:r>
@@ -4875,7 +4875,7 @@
       <w:pPr>
         <w:numPr>
           <w:ilvl w:val="0"/>
-          <w:numId w:val="18"/>
+          <w:numId w:val="13"/>
         </w:numPr>
       </w:pPr>
       <w:r>
@@ -4886,7 +4886,7 @@
       <w:pPr>
         <w:numPr>
           <w:ilvl w:val="0"/>
-          <w:numId w:val="18"/>
+          <w:numId w:val="13"/>
         </w:numPr>
       </w:pPr>
       <w:r>
@@ -4897,7 +4897,7 @@
       <w:pPr>
         <w:numPr>
           <w:ilvl w:val="0"/>
-          <w:numId w:val="18"/>
+          <w:numId w:val="13"/>
         </w:numPr>
       </w:pPr>
       <w:r>
@@ -4908,7 +4908,7 @@
       <w:pPr>
         <w:numPr>
           <w:ilvl w:val="0"/>
-          <w:numId w:val="18"/>
+          <w:numId w:val="13"/>
         </w:numPr>
       </w:pPr>
       <w:r>
@@ -4919,7 +4919,7 @@
       <w:pPr>
         <w:numPr>
           <w:ilvl w:val="0"/>
-          <w:numId w:val="18"/>
+          <w:numId w:val="13"/>
         </w:numPr>
       </w:pPr>
       <w:r>
@@ -4930,7 +4930,7 @@
       <w:pPr>
         <w:numPr>
           <w:ilvl w:val="0"/>
-          <w:numId w:val="18"/>
+          <w:numId w:val="13"/>
         </w:numPr>
       </w:pPr>
       <w:r>
@@ -4941,7 +4941,7 @@
       <w:pPr>
         <w:numPr>
           <w:ilvl w:val="0"/>
-          <w:numId w:val="18"/>
+          <w:numId w:val="13"/>
         </w:numPr>
       </w:pPr>
       <w:r>
@@ -4952,7 +4952,7 @@
       <w:pPr>
         <w:numPr>
           <w:ilvl w:val="0"/>
-          <w:numId w:val="18"/>
+          <w:numId w:val="13"/>
         </w:numPr>
       </w:pPr>
       <w:r>
@@ -4963,7 +4963,7 @@
       <w:pPr>
         <w:numPr>
           <w:ilvl w:val="0"/>
-          <w:numId w:val="18"/>
+          <w:numId w:val="13"/>
         </w:numPr>
       </w:pPr>
       <w:r>
@@ -4974,7 +4974,7 @@
       <w:pPr>
         <w:numPr>
           <w:ilvl w:val="0"/>
-          <w:numId w:val="18"/>
+          <w:numId w:val="13"/>
         </w:numPr>
       </w:pPr>
       <w:r>
@@ -4985,7 +4985,7 @@
       <w:pPr>
         <w:numPr>
           <w:ilvl w:val="0"/>
-          <w:numId w:val="18"/>
+          <w:numId w:val="13"/>
         </w:numPr>
       </w:pPr>
       <w:r>
@@ -4996,7 +4996,7 @@
       <w:pPr>
         <w:numPr>
           <w:ilvl w:val="0"/>
-          <w:numId w:val="18"/>
+          <w:numId w:val="13"/>
         </w:numPr>
       </w:pPr>
       <w:r>
@@ -5007,7 +5007,7 @@
       <w:pPr>
         <w:numPr>
           <w:ilvl w:val="0"/>
-          <w:numId w:val="18"/>
+          <w:numId w:val="13"/>
         </w:numPr>
       </w:pPr>
       <w:r>
@@ -5018,7 +5018,7 @@
       <w:pPr>
         <w:numPr>
           <w:ilvl w:val="0"/>
-          <w:numId w:val="18"/>
+          <w:numId w:val="13"/>
         </w:numPr>
       </w:pPr>
       <w:r>
@@ -5029,7 +5029,7 @@
       <w:pPr>
         <w:numPr>
           <w:ilvl w:val="0"/>
-          <w:numId w:val="18"/>
+          <w:numId w:val="13"/>
         </w:numPr>
       </w:pPr>
       <w:r>
@@ -5040,7 +5040,7 @@
       <w:pPr>
         <w:numPr>
           <w:ilvl w:val="0"/>
-          <w:numId w:val="18"/>
+          <w:numId w:val="13"/>
         </w:numPr>
       </w:pPr>
       <w:r>
@@ -5107,7 +5107,7 @@
       <w:pPr>
         <w:numPr>
           <w:ilvl w:val="0"/>
-          <w:numId w:val="19"/>
+          <w:numId w:val="14"/>
         </w:numPr>
       </w:pPr>
       <w:r>
@@ -5118,7 +5118,7 @@
       <w:pPr>
         <w:numPr>
           <w:ilvl w:val="0"/>
-          <w:numId w:val="19"/>
+          <w:numId w:val="14"/>
         </w:numPr>
       </w:pPr>
       <w:r>
@@ -5129,7 +5129,7 @@
       <w:pPr>
         <w:numPr>
           <w:ilvl w:val="0"/>
-          <w:numId w:val="19"/>
+          <w:numId w:val="14"/>
         </w:numPr>
       </w:pPr>
       <w:r>
@@ -5140,7 +5140,7 @@
       <w:pPr>
         <w:numPr>
           <w:ilvl w:val="0"/>
-          <w:numId w:val="19"/>
+          <w:numId w:val="14"/>
         </w:numPr>
       </w:pPr>
       <w:r>
@@ -5151,7 +5151,7 @@
       <w:pPr>
         <w:numPr>
           <w:ilvl w:val="0"/>
-          <w:numId w:val="19"/>
+          <w:numId w:val="14"/>
         </w:numPr>
       </w:pPr>
       <w:r>
@@ -5162,7 +5162,7 @@
       <w:pPr>
         <w:numPr>
           <w:ilvl w:val="0"/>
-          <w:numId w:val="19"/>
+          <w:numId w:val="14"/>
         </w:numPr>
       </w:pPr>
       <w:r>
@@ -5173,7 +5173,7 @@
       <w:pPr>
         <w:numPr>
           <w:ilvl w:val="0"/>
-          <w:numId w:val="19"/>
+          <w:numId w:val="14"/>
         </w:numPr>
       </w:pPr>
       <w:r>
@@ -5184,7 +5184,7 @@
       <w:pPr>
         <w:numPr>
           <w:ilvl w:val="0"/>
-          <w:numId w:val="19"/>
+          <w:numId w:val="14"/>
         </w:numPr>
       </w:pPr>
       <w:r>
@@ -5195,7 +5195,7 @@
       <w:pPr>
         <w:numPr>
           <w:ilvl w:val="0"/>
-          <w:numId w:val="19"/>
+          <w:numId w:val="14"/>
         </w:numPr>
       </w:pPr>
       <w:r>
@@ -5206,7 +5206,7 @@
       <w:pPr>
         <w:numPr>
           <w:ilvl w:val="0"/>
-          <w:numId w:val="19"/>
+          <w:numId w:val="14"/>
         </w:numPr>
       </w:pPr>
       <w:r>
@@ -5217,7 +5217,7 @@
       <w:pPr>
         <w:numPr>
           <w:ilvl w:val="0"/>
-          <w:numId w:val="19"/>
+          <w:numId w:val="14"/>
         </w:numPr>
       </w:pPr>
       <w:r>
@@ -5228,7 +5228,7 @@
       <w:pPr>
         <w:numPr>
           <w:ilvl w:val="0"/>
-          <w:numId w:val="19"/>
+          <w:numId w:val="14"/>
         </w:numPr>
       </w:pPr>
       <w:r>
@@ -5239,7 +5239,7 @@
       <w:pPr>
         <w:numPr>
           <w:ilvl w:val="0"/>
-          <w:numId w:val="19"/>
+          <w:numId w:val="14"/>
         </w:numPr>
       </w:pPr>
       <w:r>
@@ -5250,7 +5250,7 @@
       <w:pPr>
         <w:numPr>
           <w:ilvl w:val="0"/>
-          <w:numId w:val="19"/>
+          <w:numId w:val="14"/>
         </w:numPr>
       </w:pPr>
       <w:r>
@@ -5261,7 +5261,7 @@
       <w:pPr>
         <w:numPr>
           <w:ilvl w:val="0"/>
-          <w:numId w:val="19"/>
+          <w:numId w:val="14"/>
         </w:numPr>
       </w:pPr>
       <w:r>
@@ -5272,7 +5272,7 @@
       <w:pPr>
         <w:numPr>
           <w:ilvl w:val="0"/>
-          <w:numId w:val="19"/>
+          <w:numId w:val="14"/>
         </w:numPr>
       </w:pPr>
       <w:r>
@@ -5283,7 +5283,7 @@
       <w:pPr>
         <w:numPr>
           <w:ilvl w:val="0"/>
-          <w:numId w:val="19"/>
+          <w:numId w:val="14"/>
         </w:numPr>
       </w:pPr>
       <w:r>
@@ -5294,7 +5294,7 @@
       <w:pPr>
         <w:numPr>
           <w:ilvl w:val="0"/>
-          <w:numId w:val="19"/>
+          <w:numId w:val="14"/>
         </w:numPr>
       </w:pPr>
       <w:r>
@@ -5305,7 +5305,7 @@
       <w:pPr>
         <w:numPr>
           <w:ilvl w:val="0"/>
-          <w:numId w:val="19"/>
+          <w:numId w:val="14"/>
         </w:numPr>
       </w:pPr>
       <w:r>
@@ -5316,7 +5316,7 @@
       <w:pPr>
         <w:numPr>
           <w:ilvl w:val="0"/>
-          <w:numId w:val="19"/>
+          <w:numId w:val="14"/>
         </w:numPr>
       </w:pPr>
       <w:r>
@@ -5327,7 +5327,7 @@
       <w:pPr>
         <w:numPr>
           <w:ilvl w:val="0"/>
-          <w:numId w:val="19"/>
+          <w:numId w:val="14"/>
         </w:numPr>
       </w:pPr>
       <w:r>
@@ -5338,7 +5338,7 @@
       <w:pPr>
         <w:numPr>
           <w:ilvl w:val="0"/>
-          <w:numId w:val="19"/>
+          <w:numId w:val="14"/>
         </w:numPr>
       </w:pPr>
       <w:r>
@@ -5349,7 +5349,7 @@
       <w:pPr>
         <w:numPr>
           <w:ilvl w:val="0"/>
-          <w:numId w:val="19"/>
+          <w:numId w:val="14"/>
         </w:numPr>
       </w:pPr>
       <w:r>
@@ -5360,7 +5360,7 @@
       <w:pPr>
         <w:numPr>
           <w:ilvl w:val="0"/>
-          <w:numId w:val="19"/>
+          <w:numId w:val="14"/>
         </w:numPr>
       </w:pPr>
       <w:r>
@@ -5371,7 +5371,7 @@
       <w:pPr>
         <w:numPr>
           <w:ilvl w:val="0"/>
-          <w:numId w:val="19"/>
+          <w:numId w:val="14"/>
         </w:numPr>
       </w:pPr>
       <w:r>
@@ -5382,7 +5382,7 @@
       <w:pPr>
         <w:numPr>
           <w:ilvl w:val="0"/>
-          <w:numId w:val="19"/>
+          <w:numId w:val="14"/>
         </w:numPr>
       </w:pPr>
       <w:r>
@@ -27084,66 +27084,6 @@
     </w:lvlOverride>
   </w:num>
   <w:num w:numId="14">
-    <w:abstractNumId w:val="2"/>
-    <w:lvlOverride w:ilvl="0">
-      <w:startOverride w:val="1"/>
-    </w:lvlOverride>
-    <w:lvlOverride w:ilvl="1">
-      <w:startOverride w:val="1"/>
-    </w:lvlOverride>
-    <w:lvlOverride w:ilvl="2">
-      <w:startOverride w:val="1"/>
-    </w:lvlOverride>
-  </w:num>
-  <w:num w:numId="15">
-    <w:abstractNumId w:val="2"/>
-    <w:lvlOverride w:ilvl="0">
-      <w:startOverride w:val="1"/>
-    </w:lvlOverride>
-    <w:lvlOverride w:ilvl="1">
-      <w:startOverride w:val="1"/>
-    </w:lvlOverride>
-    <w:lvlOverride w:ilvl="2">
-      <w:startOverride w:val="1"/>
-    </w:lvlOverride>
-  </w:num>
-  <w:num w:numId="16">
-    <w:abstractNumId w:val="2"/>
-    <w:lvlOverride w:ilvl="0">
-      <w:startOverride w:val="1"/>
-    </w:lvlOverride>
-    <w:lvlOverride w:ilvl="1">
-      <w:startOverride w:val="1"/>
-    </w:lvlOverride>
-    <w:lvlOverride w:ilvl="2">
-      <w:startOverride w:val="1"/>
-    </w:lvlOverride>
-  </w:num>
-  <w:num w:numId="17">
-    <w:abstractNumId w:val="2"/>
-    <w:lvlOverride w:ilvl="0">
-      <w:startOverride w:val="1"/>
-    </w:lvlOverride>
-    <w:lvlOverride w:ilvl="1">
-      <w:startOverride w:val="1"/>
-    </w:lvlOverride>
-    <w:lvlOverride w:ilvl="2">
-      <w:startOverride w:val="1"/>
-    </w:lvlOverride>
-  </w:num>
-  <w:num w:numId="18">
-    <w:abstractNumId w:val="2"/>
-    <w:lvlOverride w:ilvl="0">
-      <w:startOverride w:val="1"/>
-    </w:lvlOverride>
-    <w:lvlOverride w:ilvl="1">
-      <w:startOverride w:val="1"/>
-    </w:lvlOverride>
-    <w:lvlOverride w:ilvl="2">
-      <w:startOverride w:val="1"/>
-    </w:lvlOverride>
-  </w:num>
-  <w:num w:numId="19">
     <w:abstractNumId w:val="2"/>
     <w:lvlOverride w:ilvl="0">
       <w:startOverride w:val="1"/>

</xml_diff>

<commit_message>
fix: English-only sequence diagrams + independent abstractNum per numbered list
Diagrams: convert all remaining Vietnamese in 10 PlantUML sequence blocks —
titles (Login/Register/Change Password/Manage Profile/Manage Staff – Analysis/Design Sequence),
actor display names (User/Customer/KH/Admin), regenerate all 10 PNG files.

Numbering: new_numbered_list() now creates a fresh w:abstractNum for each call
instead of sharing abstractNumId=2 + startOverride. Each UC's numbered list
(kịch bản phiên bản 3) now has a fully independent abstractNum — fixing
Google Docs list continuation (startOverride is ignored by Google Docs).

Co-Authored-By: Claude Sonnet 4.6 <noreply@anthropic.com>
</commit_message>
<xml_diff>
--- a/output/account_module.docx
+++ b/output/account_module.docx
@@ -37,7 +37,7 @@
       <w:r>
         <w:drawing>
           <wp:inline xmlns:a="http://schemas.openxmlformats.org/drawingml/2006/main" xmlns:pic="http://schemas.openxmlformats.org/drawingml/2006/picture">
-            <wp:extent cx="5486400" cy="2555889"/>
+            <wp:extent cx="5486400" cy="3077914"/>
             <wp:docPr id="1" name="Picture 1"/>
             <wp:cNvGraphicFramePr>
               <a:graphicFrameLocks noChangeAspect="1"/>
@@ -58,7 +58,7 @@
                   <pic:spPr>
                     <a:xfrm>
                       <a:off x="0" y="0"/>
-                      <a:ext cx="5486400" cy="2555889"/>
+                      <a:ext cx="5486400" cy="3077914"/>
                     </a:xfrm>
                     <a:prstGeom prst="rect"/>
                   </pic:spPr>
@@ -170,7 +170,7 @@
       <w:r>
         <w:drawing>
           <wp:inline xmlns:a="http://schemas.openxmlformats.org/drawingml/2006/main" xmlns:pic="http://schemas.openxmlformats.org/drawingml/2006/picture">
-            <wp:extent cx="5486400" cy="3043271"/>
+            <wp:extent cx="5486400" cy="3150824"/>
             <wp:docPr id="2" name="Picture 2"/>
             <wp:cNvGraphicFramePr>
               <a:graphicFrameLocks noChangeAspect="1"/>
@@ -191,7 +191,7 @@
                   <pic:spPr>
                     <a:xfrm>
                       <a:off x="0" y="0"/>
-                      <a:ext cx="5486400" cy="3043271"/>
+                      <a:ext cx="5486400" cy="3150824"/>
                     </a:xfrm>
                     <a:prstGeom prst="rect"/>
                   </pic:spPr>
@@ -413,7 +413,7 @@
       <w:r>
         <w:drawing>
           <wp:inline xmlns:a="http://schemas.openxmlformats.org/drawingml/2006/main" xmlns:pic="http://schemas.openxmlformats.org/drawingml/2006/picture">
-            <wp:extent cx="5486400" cy="2837360"/>
+            <wp:extent cx="5486400" cy="2737144"/>
             <wp:docPr id="3" name="Picture 3"/>
             <wp:cNvGraphicFramePr>
               <a:graphicFrameLocks noChangeAspect="1"/>
@@ -434,7 +434,7 @@
                   <pic:spPr>
                     <a:xfrm>
                       <a:off x="0" y="0"/>
-                      <a:ext cx="5486400" cy="2837360"/>
+                      <a:ext cx="5486400" cy="2737144"/>
                     </a:xfrm>
                     <a:prstGeom prst="rect"/>
                   </pic:spPr>
@@ -557,7 +557,7 @@
       <w:r>
         <w:drawing>
           <wp:inline xmlns:a="http://schemas.openxmlformats.org/drawingml/2006/main" xmlns:pic="http://schemas.openxmlformats.org/drawingml/2006/picture">
-            <wp:extent cx="5486400" cy="3708400"/>
+            <wp:extent cx="5486400" cy="3971035"/>
             <wp:docPr id="4" name="Picture 4"/>
             <wp:cNvGraphicFramePr>
               <a:graphicFrameLocks noChangeAspect="1"/>
@@ -578,7 +578,7 @@
                   <pic:spPr>
                     <a:xfrm>
                       <a:off x="0" y="0"/>
-                      <a:ext cx="5486400" cy="3708400"/>
+                      <a:ext cx="5486400" cy="3971035"/>
                     </a:xfrm>
                     <a:prstGeom prst="rect"/>
                   </pic:spPr>
@@ -723,7 +723,7 @@
       <w:r>
         <w:drawing>
           <wp:inline xmlns:a="http://schemas.openxmlformats.org/drawingml/2006/main" xmlns:pic="http://schemas.openxmlformats.org/drawingml/2006/picture">
-            <wp:extent cx="5486400" cy="5831259"/>
+            <wp:extent cx="5486400" cy="6573078"/>
             <wp:docPr id="5" name="Picture 5"/>
             <wp:cNvGraphicFramePr>
               <a:graphicFrameLocks noChangeAspect="1"/>
@@ -744,7 +744,7 @@
                   <pic:spPr>
                     <a:xfrm>
                       <a:off x="0" y="0"/>
-                      <a:ext cx="5486400" cy="5831259"/>
+                      <a:ext cx="5486400" cy="6573078"/>
                     </a:xfrm>
                     <a:prstGeom prst="rect"/>
                   </pic:spPr>
@@ -4013,7 +4013,7 @@
       <w:r>
         <w:drawing>
           <wp:inline xmlns:a="http://schemas.openxmlformats.org/drawingml/2006/main" xmlns:pic="http://schemas.openxmlformats.org/drawingml/2006/picture">
-            <wp:extent cx="5486400" cy="5647765"/>
+            <wp:extent cx="5486400" cy="6206099"/>
             <wp:docPr id="9" name="Picture 9"/>
             <wp:cNvGraphicFramePr>
               <a:graphicFrameLocks noChangeAspect="1"/>
@@ -4034,7 +4034,7 @@
                   <pic:spPr>
                     <a:xfrm>
                       <a:off x="0" y="0"/>
-                      <a:ext cx="5486400" cy="5647765"/>
+                      <a:ext cx="5486400" cy="6206099"/>
                     </a:xfrm>
                     <a:prstGeom prst="rect"/>
                   </pic:spPr>
@@ -4212,7 +4212,7 @@
       <w:r>
         <w:drawing>
           <wp:inline xmlns:a="http://schemas.openxmlformats.org/drawingml/2006/main" xmlns:pic="http://schemas.openxmlformats.org/drawingml/2006/picture">
-            <wp:extent cx="5486400" cy="6607437"/>
+            <wp:extent cx="5486400" cy="6300511"/>
             <wp:docPr id="10" name="Picture 10"/>
             <wp:cNvGraphicFramePr>
               <a:graphicFrameLocks noChangeAspect="1"/>
@@ -4233,7 +4233,7 @@
                   <pic:spPr>
                     <a:xfrm>
                       <a:off x="0" y="0"/>
-                      <a:ext cx="5486400" cy="6607437"/>
+                      <a:ext cx="5486400" cy="6300511"/>
                     </a:xfrm>
                     <a:prstGeom prst="rect"/>
                   </pic:spPr>
@@ -4543,7 +4543,7 @@
       <w:r>
         <w:drawing>
           <wp:inline xmlns:a="http://schemas.openxmlformats.org/drawingml/2006/main" xmlns:pic="http://schemas.openxmlformats.org/drawingml/2006/picture">
-            <wp:extent cx="5486400" cy="5274803"/>
+            <wp:extent cx="5486400" cy="5837663"/>
             <wp:docPr id="11" name="Picture 11"/>
             <wp:cNvGraphicFramePr>
               <a:graphicFrameLocks noChangeAspect="1"/>
@@ -4564,7 +4564,7 @@
                   <pic:spPr>
                     <a:xfrm>
                       <a:off x="0" y="0"/>
-                      <a:ext cx="5486400" cy="5274803"/>
+                      <a:ext cx="5486400" cy="5837663"/>
                     </a:xfrm>
                     <a:prstGeom prst="rect"/>
                   </pic:spPr>
@@ -4786,7 +4786,7 @@
       <w:r>
         <w:drawing>
           <wp:inline xmlns:a="http://schemas.openxmlformats.org/drawingml/2006/main" xmlns:pic="http://schemas.openxmlformats.org/drawingml/2006/picture">
-            <wp:extent cx="5486400" cy="7343628"/>
+            <wp:extent cx="5486400" cy="8098971"/>
             <wp:docPr id="12" name="Picture 12"/>
             <wp:cNvGraphicFramePr>
               <a:graphicFrameLocks noChangeAspect="1"/>
@@ -4807,7 +4807,7 @@
                   <pic:spPr>
                     <a:xfrm>
                       <a:off x="0" y="0"/>
-                      <a:ext cx="5486400" cy="7343628"/>
+                      <a:ext cx="5486400" cy="8098971"/>
                     </a:xfrm>
                     <a:prstGeom prst="rect"/>
                   </pic:spPr>
@@ -5062,7 +5062,7 @@
       <w:r>
         <w:drawing>
           <wp:inline xmlns:a="http://schemas.openxmlformats.org/drawingml/2006/main" xmlns:pic="http://schemas.openxmlformats.org/drawingml/2006/picture">
-            <wp:extent cx="5486400" cy="8603468"/>
+            <wp:extent cx="5486400" cy="8776403"/>
             <wp:docPr id="13" name="Picture 13"/>
             <wp:cNvGraphicFramePr>
               <a:graphicFrameLocks noChangeAspect="1"/>
@@ -5083,7 +5083,7 @@
                   <pic:spPr>
                     <a:xfrm>
                       <a:off x="0" y="0"/>
-                      <a:ext cx="5486400" cy="8603468"/>
+                      <a:ext cx="5486400" cy="8776403"/>
                     </a:xfrm>
                     <a:prstGeom prst="rect"/>
                   </pic:spPr>
@@ -26945,6 +26945,141 @@
       </w:rPr>
     </w:lvl>
   </w:abstractNum>
+  <w:abstractNum w:abstractNumId="9">
+    <w:multiLevelType w:val="hybridMultilevel"/>
+    <w:lvl w:ilvl="0">
+      <w:start w:val="1"/>
+      <w:numFmt w:val="decimal"/>
+      <w:lvlText w:val="%1."/>
+      <w:pPr>
+        <w:ind w:left="360" w:hanging="360"/>
+      </w:pPr>
+    </w:lvl>
+    <w:lvl w:ilvl="1">
+      <w:start w:val="1"/>
+      <w:numFmt w:val="decimal"/>
+      <w:lvlText w:val="%2."/>
+      <w:pPr>
+        <w:ind w:left="720" w:hanging="360"/>
+      </w:pPr>
+    </w:lvl>
+    <w:lvl w:ilvl="2">
+      <w:start w:val="1"/>
+      <w:numFmt w:val="decimal"/>
+      <w:lvlText w:val="%3."/>
+      <w:pPr>
+        <w:ind w:left="1080" w:hanging="360"/>
+      </w:pPr>
+    </w:lvl>
+  </w:abstractNum>
+  <w:abstractNum w:abstractNumId="10">
+    <w:multiLevelType w:val="hybridMultilevel"/>
+    <w:lvl w:ilvl="0">
+      <w:start w:val="1"/>
+      <w:numFmt w:val="decimal"/>
+      <w:lvlText w:val="%1."/>
+      <w:pPr>
+        <w:ind w:left="360" w:hanging="360"/>
+      </w:pPr>
+    </w:lvl>
+    <w:lvl w:ilvl="1">
+      <w:start w:val="1"/>
+      <w:numFmt w:val="decimal"/>
+      <w:lvlText w:val="%2."/>
+      <w:pPr>
+        <w:ind w:left="720" w:hanging="360"/>
+      </w:pPr>
+    </w:lvl>
+    <w:lvl w:ilvl="2">
+      <w:start w:val="1"/>
+      <w:numFmt w:val="decimal"/>
+      <w:lvlText w:val="%3."/>
+      <w:pPr>
+        <w:ind w:left="1080" w:hanging="360"/>
+      </w:pPr>
+    </w:lvl>
+  </w:abstractNum>
+  <w:abstractNum w:abstractNumId="11">
+    <w:multiLevelType w:val="hybridMultilevel"/>
+    <w:lvl w:ilvl="0">
+      <w:start w:val="1"/>
+      <w:numFmt w:val="decimal"/>
+      <w:lvlText w:val="%1."/>
+      <w:pPr>
+        <w:ind w:left="360" w:hanging="360"/>
+      </w:pPr>
+    </w:lvl>
+    <w:lvl w:ilvl="1">
+      <w:start w:val="1"/>
+      <w:numFmt w:val="decimal"/>
+      <w:lvlText w:val="%2."/>
+      <w:pPr>
+        <w:ind w:left="720" w:hanging="360"/>
+      </w:pPr>
+    </w:lvl>
+    <w:lvl w:ilvl="2">
+      <w:start w:val="1"/>
+      <w:numFmt w:val="decimal"/>
+      <w:lvlText w:val="%3."/>
+      <w:pPr>
+        <w:ind w:left="1080" w:hanging="360"/>
+      </w:pPr>
+    </w:lvl>
+  </w:abstractNum>
+  <w:abstractNum w:abstractNumId="12">
+    <w:multiLevelType w:val="hybridMultilevel"/>
+    <w:lvl w:ilvl="0">
+      <w:start w:val="1"/>
+      <w:numFmt w:val="decimal"/>
+      <w:lvlText w:val="%1."/>
+      <w:pPr>
+        <w:ind w:left="360" w:hanging="360"/>
+      </w:pPr>
+    </w:lvl>
+    <w:lvl w:ilvl="1">
+      <w:start w:val="1"/>
+      <w:numFmt w:val="decimal"/>
+      <w:lvlText w:val="%2."/>
+      <w:pPr>
+        <w:ind w:left="720" w:hanging="360"/>
+      </w:pPr>
+    </w:lvl>
+    <w:lvl w:ilvl="2">
+      <w:start w:val="1"/>
+      <w:numFmt w:val="decimal"/>
+      <w:lvlText w:val="%3."/>
+      <w:pPr>
+        <w:ind w:left="1080" w:hanging="360"/>
+      </w:pPr>
+    </w:lvl>
+  </w:abstractNum>
+  <w:abstractNum w:abstractNumId="13">
+    <w:multiLevelType w:val="hybridMultilevel"/>
+    <w:lvl w:ilvl="0">
+      <w:start w:val="1"/>
+      <w:numFmt w:val="decimal"/>
+      <w:lvlText w:val="%1."/>
+      <w:pPr>
+        <w:ind w:left="360" w:hanging="360"/>
+      </w:pPr>
+    </w:lvl>
+    <w:lvl w:ilvl="1">
+      <w:start w:val="1"/>
+      <w:numFmt w:val="decimal"/>
+      <w:lvlText w:val="%2."/>
+      <w:pPr>
+        <w:ind w:left="720" w:hanging="360"/>
+      </w:pPr>
+    </w:lvl>
+    <w:lvl w:ilvl="2">
+      <w:start w:val="1"/>
+      <w:numFmt w:val="decimal"/>
+      <w:lvlText w:val="%3."/>
+      <w:pPr>
+        <w:ind w:left="1080" w:hanging="360"/>
+      </w:pPr>
+    </w:lvl>
+  </w:abstractNum>
   <w:num w:numId="1">
     <w:abstractNumId w:val="8"/>
   </w:num>
@@ -27036,64 +27171,19 @@
     <w:abstractNumId w:val="2"/>
   </w:num>
   <w:num w:numId="10">
-    <w:abstractNumId w:val="2"/>
-    <w:lvlOverride w:ilvl="0">
-      <w:startOverride w:val="1"/>
-    </w:lvlOverride>
-    <w:lvlOverride w:ilvl="1">
-      <w:startOverride w:val="1"/>
-    </w:lvlOverride>
-    <w:lvlOverride w:ilvl="2">
-      <w:startOverride w:val="1"/>
-    </w:lvlOverride>
+    <w:abstractNumId w:val="9"/>
   </w:num>
   <w:num w:numId="11">
-    <w:abstractNumId w:val="2"/>
-    <w:lvlOverride w:ilvl="0">
-      <w:startOverride w:val="1"/>
-    </w:lvlOverride>
-    <w:lvlOverride w:ilvl="1">
-      <w:startOverride w:val="1"/>
-    </w:lvlOverride>
-    <w:lvlOverride w:ilvl="2">
-      <w:startOverride w:val="1"/>
-    </w:lvlOverride>
+    <w:abstractNumId w:val="10"/>
   </w:num>
   <w:num w:numId="12">
-    <w:abstractNumId w:val="2"/>
-    <w:lvlOverride w:ilvl="0">
-      <w:startOverride w:val="1"/>
-    </w:lvlOverride>
-    <w:lvlOverride w:ilvl="1">
-      <w:startOverride w:val="1"/>
-    </w:lvlOverride>
-    <w:lvlOverride w:ilvl="2">
-      <w:startOverride w:val="1"/>
-    </w:lvlOverride>
+    <w:abstractNumId w:val="11"/>
   </w:num>
   <w:num w:numId="13">
-    <w:abstractNumId w:val="2"/>
-    <w:lvlOverride w:ilvl="0">
-      <w:startOverride w:val="1"/>
-    </w:lvlOverride>
-    <w:lvlOverride w:ilvl="1">
-      <w:startOverride w:val="1"/>
-    </w:lvlOverride>
-    <w:lvlOverride w:ilvl="2">
-      <w:startOverride w:val="1"/>
-    </w:lvlOverride>
+    <w:abstractNumId w:val="12"/>
   </w:num>
   <w:num w:numId="14">
-    <w:abstractNumId w:val="2"/>
-    <w:lvlOverride w:ilvl="0">
-      <w:startOverride w:val="1"/>
-    </w:lvlOverride>
-    <w:lvlOverride w:ilvl="1">
-      <w:startOverride w:val="1"/>
-    </w:lvlOverride>
-    <w:lvlOverride w:ilvl="2">
-      <w:startOverride w:val="1"/>
-    </w:lvlOverride>
+    <w:abstractNumId w:val="13"/>
   </w:num>
 </w:numbering>
 </file>

</xml_diff>

<commit_message>
fix: both kịch bản v2 + v3 use independent numbered lists (skill format)
Revert generator trigger from 'phiên bản 3' back to 'phiên bản' so both
analysis (v2) and design (v3) scenarios render as numbered lists — matching
the skill cnpm format (danh sách đánh số for both phases).

Each UC's list gets its own fresh abstractNum via new_numbered_list() →
10 independent decimal lists (numId=10–19, abstractNumId=9–18),
guaranteed to restart from 1 in both Word and Google Docs.

Co-Authored-By: Claude Sonnet 4.6 <noreply@anthropic.com>
</commit_message>
<xml_diff>
--- a/output/account_module.docx
+++ b/output/account_module.docx
@@ -82,7 +82,7 @@
       <w:pPr>
         <w:numPr>
           <w:ilvl w:val="0"/>
-          <w:numId w:val="1"/>
+          <w:numId w:val="10"/>
         </w:numPr>
       </w:pPr>
       <w:r>
@@ -93,7 +93,7 @@
       <w:pPr>
         <w:numPr>
           <w:ilvl w:val="0"/>
-          <w:numId w:val="1"/>
+          <w:numId w:val="10"/>
         </w:numPr>
       </w:pPr>
       <w:r>
@@ -104,7 +104,7 @@
       <w:pPr>
         <w:numPr>
           <w:ilvl w:val="0"/>
-          <w:numId w:val="1"/>
+          <w:numId w:val="10"/>
         </w:numPr>
       </w:pPr>
       <w:r>
@@ -115,7 +115,7 @@
       <w:pPr>
         <w:numPr>
           <w:ilvl w:val="0"/>
-          <w:numId w:val="1"/>
+          <w:numId w:val="10"/>
         </w:numPr>
       </w:pPr>
       <w:r>
@@ -126,7 +126,7 @@
       <w:pPr>
         <w:numPr>
           <w:ilvl w:val="0"/>
-          <w:numId w:val="1"/>
+          <w:numId w:val="10"/>
         </w:numPr>
       </w:pPr>
       <w:r>
@@ -137,7 +137,7 @@
       <w:pPr>
         <w:numPr>
           <w:ilvl w:val="0"/>
-          <w:numId w:val="1"/>
+          <w:numId w:val="10"/>
         </w:numPr>
       </w:pPr>
       <w:r>
@@ -148,7 +148,7 @@
       <w:pPr>
         <w:numPr>
           <w:ilvl w:val="0"/>
-          <w:numId w:val="1"/>
+          <w:numId w:val="10"/>
         </w:numPr>
       </w:pPr>
       <w:r>
@@ -215,7 +215,7 @@
       <w:pPr>
         <w:numPr>
           <w:ilvl w:val="0"/>
-          <w:numId w:val="1"/>
+          <w:numId w:val="11"/>
         </w:numPr>
       </w:pPr>
       <w:r>
@@ -226,7 +226,7 @@
       <w:pPr>
         <w:numPr>
           <w:ilvl w:val="0"/>
-          <w:numId w:val="1"/>
+          <w:numId w:val="11"/>
         </w:numPr>
       </w:pPr>
       <w:r>
@@ -237,7 +237,7 @@
       <w:pPr>
         <w:numPr>
           <w:ilvl w:val="0"/>
-          <w:numId w:val="1"/>
+          <w:numId w:val="11"/>
         </w:numPr>
       </w:pPr>
       <w:r>
@@ -248,7 +248,7 @@
       <w:pPr>
         <w:numPr>
           <w:ilvl w:val="0"/>
-          <w:numId w:val="1"/>
+          <w:numId w:val="11"/>
         </w:numPr>
       </w:pPr>
       <w:r>
@@ -259,7 +259,7 @@
       <w:pPr>
         <w:numPr>
           <w:ilvl w:val="0"/>
-          <w:numId w:val="1"/>
+          <w:numId w:val="11"/>
         </w:numPr>
       </w:pPr>
       <w:r>
@@ -270,7 +270,7 @@
       <w:pPr>
         <w:numPr>
           <w:ilvl w:val="0"/>
-          <w:numId w:val="1"/>
+          <w:numId w:val="11"/>
         </w:numPr>
       </w:pPr>
       <w:r>
@@ -281,7 +281,7 @@
       <w:pPr>
         <w:numPr>
           <w:ilvl w:val="0"/>
-          <w:numId w:val="1"/>
+          <w:numId w:val="11"/>
         </w:numPr>
       </w:pPr>
       <w:r>
@@ -292,7 +292,7 @@
       <w:pPr>
         <w:numPr>
           <w:ilvl w:val="0"/>
-          <w:numId w:val="1"/>
+          <w:numId w:val="11"/>
         </w:numPr>
       </w:pPr>
       <w:r>
@@ -303,7 +303,7 @@
       <w:pPr>
         <w:numPr>
           <w:ilvl w:val="0"/>
-          <w:numId w:val="1"/>
+          <w:numId w:val="11"/>
         </w:numPr>
       </w:pPr>
       <w:r>
@@ -314,7 +314,7 @@
       <w:pPr>
         <w:numPr>
           <w:ilvl w:val="0"/>
-          <w:numId w:val="1"/>
+          <w:numId w:val="11"/>
         </w:numPr>
       </w:pPr>
       <w:r>
@@ -325,7 +325,7 @@
       <w:pPr>
         <w:numPr>
           <w:ilvl w:val="0"/>
-          <w:numId w:val="1"/>
+          <w:numId w:val="11"/>
         </w:numPr>
       </w:pPr>
       <w:r>
@@ -336,7 +336,7 @@
       <w:pPr>
         <w:numPr>
           <w:ilvl w:val="0"/>
-          <w:numId w:val="1"/>
+          <w:numId w:val="11"/>
         </w:numPr>
       </w:pPr>
       <w:r>
@@ -347,7 +347,7 @@
       <w:pPr>
         <w:numPr>
           <w:ilvl w:val="0"/>
-          <w:numId w:val="1"/>
+          <w:numId w:val="11"/>
         </w:numPr>
       </w:pPr>
       <w:r>
@@ -358,7 +358,7 @@
       <w:pPr>
         <w:numPr>
           <w:ilvl w:val="0"/>
-          <w:numId w:val="1"/>
+          <w:numId w:val="11"/>
         </w:numPr>
       </w:pPr>
       <w:r>
@@ -369,7 +369,7 @@
       <w:pPr>
         <w:numPr>
           <w:ilvl w:val="0"/>
-          <w:numId w:val="1"/>
+          <w:numId w:val="11"/>
         </w:numPr>
       </w:pPr>
       <w:r>
@@ -380,7 +380,7 @@
       <w:pPr>
         <w:numPr>
           <w:ilvl w:val="0"/>
-          <w:numId w:val="1"/>
+          <w:numId w:val="11"/>
         </w:numPr>
       </w:pPr>
       <w:r>
@@ -391,7 +391,7 @@
       <w:pPr>
         <w:numPr>
           <w:ilvl w:val="0"/>
-          <w:numId w:val="1"/>
+          <w:numId w:val="11"/>
         </w:numPr>
       </w:pPr>
       <w:r>
@@ -458,7 +458,7 @@
       <w:pPr>
         <w:numPr>
           <w:ilvl w:val="0"/>
-          <w:numId w:val="1"/>
+          <w:numId w:val="12"/>
         </w:numPr>
       </w:pPr>
       <w:r>
@@ -469,7 +469,7 @@
       <w:pPr>
         <w:numPr>
           <w:ilvl w:val="0"/>
-          <w:numId w:val="1"/>
+          <w:numId w:val="12"/>
         </w:numPr>
       </w:pPr>
       <w:r>
@@ -480,7 +480,7 @@
       <w:pPr>
         <w:numPr>
           <w:ilvl w:val="0"/>
-          <w:numId w:val="1"/>
+          <w:numId w:val="12"/>
         </w:numPr>
       </w:pPr>
       <w:r>
@@ -491,7 +491,7 @@
       <w:pPr>
         <w:numPr>
           <w:ilvl w:val="0"/>
-          <w:numId w:val="1"/>
+          <w:numId w:val="12"/>
         </w:numPr>
       </w:pPr>
       <w:r>
@@ -502,7 +502,7 @@
       <w:pPr>
         <w:numPr>
           <w:ilvl w:val="0"/>
-          <w:numId w:val="1"/>
+          <w:numId w:val="12"/>
         </w:numPr>
       </w:pPr>
       <w:r>
@@ -513,7 +513,7 @@
       <w:pPr>
         <w:numPr>
           <w:ilvl w:val="0"/>
-          <w:numId w:val="1"/>
+          <w:numId w:val="12"/>
         </w:numPr>
       </w:pPr>
       <w:r>
@@ -524,7 +524,7 @@
       <w:pPr>
         <w:numPr>
           <w:ilvl w:val="0"/>
-          <w:numId w:val="1"/>
+          <w:numId w:val="12"/>
         </w:numPr>
       </w:pPr>
       <w:r>
@@ -535,7 +535,7 @@
       <w:pPr>
         <w:numPr>
           <w:ilvl w:val="0"/>
-          <w:numId w:val="1"/>
+          <w:numId w:val="12"/>
         </w:numPr>
       </w:pPr>
       <w:r>
@@ -602,7 +602,7 @@
       <w:pPr>
         <w:numPr>
           <w:ilvl w:val="0"/>
-          <w:numId w:val="1"/>
+          <w:numId w:val="13"/>
         </w:numPr>
       </w:pPr>
       <w:r>
@@ -613,7 +613,7 @@
       <w:pPr>
         <w:numPr>
           <w:ilvl w:val="0"/>
-          <w:numId w:val="1"/>
+          <w:numId w:val="13"/>
         </w:numPr>
       </w:pPr>
       <w:r>
@@ -624,7 +624,7 @@
       <w:pPr>
         <w:numPr>
           <w:ilvl w:val="0"/>
-          <w:numId w:val="1"/>
+          <w:numId w:val="13"/>
         </w:numPr>
       </w:pPr>
       <w:r>
@@ -635,7 +635,7 @@
       <w:pPr>
         <w:numPr>
           <w:ilvl w:val="0"/>
-          <w:numId w:val="1"/>
+          <w:numId w:val="13"/>
         </w:numPr>
       </w:pPr>
       <w:r>
@@ -646,7 +646,7 @@
       <w:pPr>
         <w:numPr>
           <w:ilvl w:val="0"/>
-          <w:numId w:val="1"/>
+          <w:numId w:val="13"/>
         </w:numPr>
       </w:pPr>
       <w:r>
@@ -657,7 +657,7 @@
       <w:pPr>
         <w:numPr>
           <w:ilvl w:val="0"/>
-          <w:numId w:val="1"/>
+          <w:numId w:val="13"/>
         </w:numPr>
       </w:pPr>
       <w:r>
@@ -668,7 +668,7 @@
       <w:pPr>
         <w:numPr>
           <w:ilvl w:val="0"/>
-          <w:numId w:val="1"/>
+          <w:numId w:val="13"/>
         </w:numPr>
       </w:pPr>
       <w:r>
@@ -679,7 +679,7 @@
       <w:pPr>
         <w:numPr>
           <w:ilvl w:val="0"/>
-          <w:numId w:val="1"/>
+          <w:numId w:val="13"/>
         </w:numPr>
       </w:pPr>
       <w:r>
@@ -690,7 +690,7 @@
       <w:pPr>
         <w:numPr>
           <w:ilvl w:val="0"/>
-          <w:numId w:val="1"/>
+          <w:numId w:val="13"/>
         </w:numPr>
       </w:pPr>
       <w:r>
@@ -701,7 +701,7 @@
       <w:pPr>
         <w:numPr>
           <w:ilvl w:val="0"/>
-          <w:numId w:val="1"/>
+          <w:numId w:val="13"/>
         </w:numPr>
       </w:pPr>
       <w:r>
@@ -768,7 +768,7 @@
       <w:pPr>
         <w:numPr>
           <w:ilvl w:val="0"/>
-          <w:numId w:val="1"/>
+          <w:numId w:val="14"/>
         </w:numPr>
       </w:pPr>
       <w:r>
@@ -779,7 +779,7 @@
       <w:pPr>
         <w:numPr>
           <w:ilvl w:val="0"/>
-          <w:numId w:val="1"/>
+          <w:numId w:val="14"/>
         </w:numPr>
       </w:pPr>
       <w:r>
@@ -790,7 +790,7 @@
       <w:pPr>
         <w:numPr>
           <w:ilvl w:val="0"/>
-          <w:numId w:val="1"/>
+          <w:numId w:val="14"/>
         </w:numPr>
       </w:pPr>
       <w:r>
@@ -801,7 +801,7 @@
       <w:pPr>
         <w:numPr>
           <w:ilvl w:val="0"/>
-          <w:numId w:val="1"/>
+          <w:numId w:val="14"/>
         </w:numPr>
       </w:pPr>
       <w:r>
@@ -812,7 +812,7 @@
       <w:pPr>
         <w:numPr>
           <w:ilvl w:val="0"/>
-          <w:numId w:val="1"/>
+          <w:numId w:val="14"/>
         </w:numPr>
       </w:pPr>
       <w:r>
@@ -823,7 +823,7 @@
       <w:pPr>
         <w:numPr>
           <w:ilvl w:val="0"/>
-          <w:numId w:val="1"/>
+          <w:numId w:val="14"/>
         </w:numPr>
       </w:pPr>
       <w:r>
@@ -834,7 +834,7 @@
       <w:pPr>
         <w:numPr>
           <w:ilvl w:val="0"/>
-          <w:numId w:val="1"/>
+          <w:numId w:val="14"/>
         </w:numPr>
       </w:pPr>
       <w:r>
@@ -845,7 +845,7 @@
       <w:pPr>
         <w:numPr>
           <w:ilvl w:val="0"/>
-          <w:numId w:val="1"/>
+          <w:numId w:val="14"/>
         </w:numPr>
       </w:pPr>
       <w:r>
@@ -856,7 +856,7 @@
       <w:pPr>
         <w:numPr>
           <w:ilvl w:val="0"/>
-          <w:numId w:val="1"/>
+          <w:numId w:val="14"/>
         </w:numPr>
       </w:pPr>
       <w:r>
@@ -867,7 +867,7 @@
       <w:pPr>
         <w:numPr>
           <w:ilvl w:val="0"/>
-          <w:numId w:val="1"/>
+          <w:numId w:val="14"/>
         </w:numPr>
       </w:pPr>
       <w:r>
@@ -878,7 +878,7 @@
       <w:pPr>
         <w:numPr>
           <w:ilvl w:val="0"/>
-          <w:numId w:val="1"/>
+          <w:numId w:val="14"/>
         </w:numPr>
       </w:pPr>
       <w:r>
@@ -889,7 +889,7 @@
       <w:pPr>
         <w:numPr>
           <w:ilvl w:val="0"/>
-          <w:numId w:val="1"/>
+          <w:numId w:val="14"/>
         </w:numPr>
       </w:pPr>
       <w:r>
@@ -900,7 +900,7 @@
       <w:pPr>
         <w:numPr>
           <w:ilvl w:val="0"/>
-          <w:numId w:val="1"/>
+          <w:numId w:val="14"/>
         </w:numPr>
       </w:pPr>
       <w:r>
@@ -911,7 +911,7 @@
       <w:pPr>
         <w:numPr>
           <w:ilvl w:val="0"/>
-          <w:numId w:val="1"/>
+          <w:numId w:val="14"/>
         </w:numPr>
       </w:pPr>
       <w:r>
@@ -922,7 +922,7 @@
       <w:pPr>
         <w:numPr>
           <w:ilvl w:val="0"/>
-          <w:numId w:val="1"/>
+          <w:numId w:val="14"/>
         </w:numPr>
       </w:pPr>
       <w:r>
@@ -933,7 +933,7 @@
       <w:pPr>
         <w:numPr>
           <w:ilvl w:val="0"/>
-          <w:numId w:val="1"/>
+          <w:numId w:val="14"/>
         </w:numPr>
       </w:pPr>
       <w:r>
@@ -944,7 +944,7 @@
       <w:pPr>
         <w:numPr>
           <w:ilvl w:val="0"/>
-          <w:numId w:val="1"/>
+          <w:numId w:val="14"/>
         </w:numPr>
       </w:pPr>
       <w:r>
@@ -955,7 +955,7 @@
       <w:pPr>
         <w:numPr>
           <w:ilvl w:val="0"/>
-          <w:numId w:val="1"/>
+          <w:numId w:val="14"/>
         </w:numPr>
       </w:pPr>
       <w:r>
@@ -4058,7 +4058,7 @@
       <w:pPr>
         <w:numPr>
           <w:ilvl w:val="0"/>
-          <w:numId w:val="10"/>
+          <w:numId w:val="15"/>
         </w:numPr>
       </w:pPr>
       <w:r>
@@ -4069,7 +4069,7 @@
       <w:pPr>
         <w:numPr>
           <w:ilvl w:val="0"/>
-          <w:numId w:val="10"/>
+          <w:numId w:val="15"/>
         </w:numPr>
       </w:pPr>
       <w:r>
@@ -4080,7 +4080,7 @@
       <w:pPr>
         <w:numPr>
           <w:ilvl w:val="0"/>
-          <w:numId w:val="10"/>
+          <w:numId w:val="15"/>
         </w:numPr>
       </w:pPr>
       <w:r>
@@ -4091,7 +4091,7 @@
       <w:pPr>
         <w:numPr>
           <w:ilvl w:val="0"/>
-          <w:numId w:val="10"/>
+          <w:numId w:val="15"/>
         </w:numPr>
       </w:pPr>
       <w:r>
@@ -4102,7 +4102,7 @@
       <w:pPr>
         <w:numPr>
           <w:ilvl w:val="0"/>
-          <w:numId w:val="10"/>
+          <w:numId w:val="15"/>
         </w:numPr>
       </w:pPr>
       <w:r>
@@ -4113,7 +4113,7 @@
       <w:pPr>
         <w:numPr>
           <w:ilvl w:val="0"/>
-          <w:numId w:val="10"/>
+          <w:numId w:val="15"/>
         </w:numPr>
       </w:pPr>
       <w:r>
@@ -4124,7 +4124,7 @@
       <w:pPr>
         <w:numPr>
           <w:ilvl w:val="0"/>
-          <w:numId w:val="10"/>
+          <w:numId w:val="15"/>
         </w:numPr>
       </w:pPr>
       <w:r>
@@ -4135,7 +4135,7 @@
       <w:pPr>
         <w:numPr>
           <w:ilvl w:val="0"/>
-          <w:numId w:val="10"/>
+          <w:numId w:val="15"/>
         </w:numPr>
       </w:pPr>
       <w:r>
@@ -4146,7 +4146,7 @@
       <w:pPr>
         <w:numPr>
           <w:ilvl w:val="0"/>
-          <w:numId w:val="10"/>
+          <w:numId w:val="15"/>
         </w:numPr>
       </w:pPr>
       <w:r>
@@ -4157,7 +4157,7 @@
       <w:pPr>
         <w:numPr>
           <w:ilvl w:val="0"/>
-          <w:numId w:val="10"/>
+          <w:numId w:val="15"/>
         </w:numPr>
       </w:pPr>
       <w:r>
@@ -4168,7 +4168,7 @@
       <w:pPr>
         <w:numPr>
           <w:ilvl w:val="0"/>
-          <w:numId w:val="10"/>
+          <w:numId w:val="15"/>
         </w:numPr>
       </w:pPr>
       <w:r>
@@ -4179,7 +4179,7 @@
       <w:pPr>
         <w:numPr>
           <w:ilvl w:val="0"/>
-          <w:numId w:val="10"/>
+          <w:numId w:val="15"/>
         </w:numPr>
       </w:pPr>
       <w:r>
@@ -4190,7 +4190,7 @@
       <w:pPr>
         <w:numPr>
           <w:ilvl w:val="0"/>
-          <w:numId w:val="10"/>
+          <w:numId w:val="15"/>
         </w:numPr>
       </w:pPr>
       <w:r>
@@ -4257,7 +4257,7 @@
       <w:pPr>
         <w:numPr>
           <w:ilvl w:val="0"/>
-          <w:numId w:val="11"/>
+          <w:numId w:val="16"/>
         </w:numPr>
       </w:pPr>
       <w:r>
@@ -4268,7 +4268,7 @@
       <w:pPr>
         <w:numPr>
           <w:ilvl w:val="0"/>
-          <w:numId w:val="11"/>
+          <w:numId w:val="16"/>
         </w:numPr>
       </w:pPr>
       <w:r>
@@ -4279,7 +4279,7 @@
       <w:pPr>
         <w:numPr>
           <w:ilvl w:val="0"/>
-          <w:numId w:val="11"/>
+          <w:numId w:val="16"/>
         </w:numPr>
       </w:pPr>
       <w:r>
@@ -4290,7 +4290,7 @@
       <w:pPr>
         <w:numPr>
           <w:ilvl w:val="0"/>
-          <w:numId w:val="11"/>
+          <w:numId w:val="16"/>
         </w:numPr>
       </w:pPr>
       <w:r>
@@ -4301,7 +4301,7 @@
       <w:pPr>
         <w:numPr>
           <w:ilvl w:val="0"/>
-          <w:numId w:val="11"/>
+          <w:numId w:val="16"/>
         </w:numPr>
       </w:pPr>
       <w:r>
@@ -4312,7 +4312,7 @@
       <w:pPr>
         <w:numPr>
           <w:ilvl w:val="0"/>
-          <w:numId w:val="11"/>
+          <w:numId w:val="16"/>
         </w:numPr>
       </w:pPr>
       <w:r>
@@ -4323,7 +4323,7 @@
       <w:pPr>
         <w:numPr>
           <w:ilvl w:val="0"/>
-          <w:numId w:val="11"/>
+          <w:numId w:val="16"/>
         </w:numPr>
       </w:pPr>
       <w:r>
@@ -4334,7 +4334,7 @@
       <w:pPr>
         <w:numPr>
           <w:ilvl w:val="0"/>
-          <w:numId w:val="11"/>
+          <w:numId w:val="16"/>
         </w:numPr>
       </w:pPr>
       <w:r>
@@ -4345,7 +4345,7 @@
       <w:pPr>
         <w:numPr>
           <w:ilvl w:val="0"/>
-          <w:numId w:val="11"/>
+          <w:numId w:val="16"/>
         </w:numPr>
       </w:pPr>
       <w:r>
@@ -4356,7 +4356,7 @@
       <w:pPr>
         <w:numPr>
           <w:ilvl w:val="0"/>
-          <w:numId w:val="11"/>
+          <w:numId w:val="16"/>
         </w:numPr>
       </w:pPr>
       <w:r>
@@ -4367,7 +4367,7 @@
       <w:pPr>
         <w:numPr>
           <w:ilvl w:val="0"/>
-          <w:numId w:val="11"/>
+          <w:numId w:val="16"/>
         </w:numPr>
       </w:pPr>
       <w:r>
@@ -4378,7 +4378,7 @@
       <w:pPr>
         <w:numPr>
           <w:ilvl w:val="0"/>
-          <w:numId w:val="11"/>
+          <w:numId w:val="16"/>
         </w:numPr>
       </w:pPr>
       <w:r>
@@ -4389,7 +4389,7 @@
       <w:pPr>
         <w:numPr>
           <w:ilvl w:val="0"/>
-          <w:numId w:val="11"/>
+          <w:numId w:val="16"/>
         </w:numPr>
       </w:pPr>
       <w:r>
@@ -4400,7 +4400,7 @@
       <w:pPr>
         <w:numPr>
           <w:ilvl w:val="0"/>
-          <w:numId w:val="11"/>
+          <w:numId w:val="16"/>
         </w:numPr>
       </w:pPr>
       <w:r>
@@ -4411,7 +4411,7 @@
       <w:pPr>
         <w:numPr>
           <w:ilvl w:val="0"/>
-          <w:numId w:val="11"/>
+          <w:numId w:val="16"/>
         </w:numPr>
       </w:pPr>
       <w:r>
@@ -4422,7 +4422,7 @@
       <w:pPr>
         <w:numPr>
           <w:ilvl w:val="0"/>
-          <w:numId w:val="11"/>
+          <w:numId w:val="16"/>
         </w:numPr>
       </w:pPr>
       <w:r>
@@ -4433,7 +4433,7 @@
       <w:pPr>
         <w:numPr>
           <w:ilvl w:val="0"/>
-          <w:numId w:val="11"/>
+          <w:numId w:val="16"/>
         </w:numPr>
       </w:pPr>
       <w:r>
@@ -4444,7 +4444,7 @@
       <w:pPr>
         <w:numPr>
           <w:ilvl w:val="0"/>
-          <w:numId w:val="11"/>
+          <w:numId w:val="16"/>
         </w:numPr>
       </w:pPr>
       <w:r>
@@ -4455,7 +4455,7 @@
       <w:pPr>
         <w:numPr>
           <w:ilvl w:val="0"/>
-          <w:numId w:val="11"/>
+          <w:numId w:val="16"/>
         </w:numPr>
       </w:pPr>
       <w:r>
@@ -4466,7 +4466,7 @@
       <w:pPr>
         <w:numPr>
           <w:ilvl w:val="0"/>
-          <w:numId w:val="11"/>
+          <w:numId w:val="16"/>
         </w:numPr>
       </w:pPr>
       <w:r>
@@ -4477,7 +4477,7 @@
       <w:pPr>
         <w:numPr>
           <w:ilvl w:val="0"/>
-          <w:numId w:val="11"/>
+          <w:numId w:val="16"/>
         </w:numPr>
       </w:pPr>
       <w:r>
@@ -4488,7 +4488,7 @@
       <w:pPr>
         <w:numPr>
           <w:ilvl w:val="0"/>
-          <w:numId w:val="11"/>
+          <w:numId w:val="16"/>
         </w:numPr>
       </w:pPr>
       <w:r>
@@ -4499,7 +4499,7 @@
       <w:pPr>
         <w:numPr>
           <w:ilvl w:val="0"/>
-          <w:numId w:val="11"/>
+          <w:numId w:val="16"/>
         </w:numPr>
       </w:pPr>
       <w:r>
@@ -4510,7 +4510,7 @@
       <w:pPr>
         <w:numPr>
           <w:ilvl w:val="0"/>
-          <w:numId w:val="11"/>
+          <w:numId w:val="16"/>
         </w:numPr>
       </w:pPr>
       <w:r>
@@ -4521,7 +4521,7 @@
       <w:pPr>
         <w:numPr>
           <w:ilvl w:val="0"/>
-          <w:numId w:val="11"/>
+          <w:numId w:val="16"/>
         </w:numPr>
       </w:pPr>
       <w:r>
@@ -4588,7 +4588,7 @@
       <w:pPr>
         <w:numPr>
           <w:ilvl w:val="0"/>
-          <w:numId w:val="12"/>
+          <w:numId w:val="17"/>
         </w:numPr>
       </w:pPr>
       <w:r>
@@ -4599,7 +4599,7 @@
       <w:pPr>
         <w:numPr>
           <w:ilvl w:val="0"/>
-          <w:numId w:val="12"/>
+          <w:numId w:val="17"/>
         </w:numPr>
       </w:pPr>
       <w:r>
@@ -4610,7 +4610,7 @@
       <w:pPr>
         <w:numPr>
           <w:ilvl w:val="0"/>
-          <w:numId w:val="12"/>
+          <w:numId w:val="17"/>
         </w:numPr>
       </w:pPr>
       <w:r>
@@ -4621,7 +4621,7 @@
       <w:pPr>
         <w:numPr>
           <w:ilvl w:val="0"/>
-          <w:numId w:val="12"/>
+          <w:numId w:val="17"/>
         </w:numPr>
       </w:pPr>
       <w:r>
@@ -4632,7 +4632,7 @@
       <w:pPr>
         <w:numPr>
           <w:ilvl w:val="0"/>
-          <w:numId w:val="12"/>
+          <w:numId w:val="17"/>
         </w:numPr>
       </w:pPr>
       <w:r>
@@ -4643,7 +4643,7 @@
       <w:pPr>
         <w:numPr>
           <w:ilvl w:val="0"/>
-          <w:numId w:val="12"/>
+          <w:numId w:val="17"/>
         </w:numPr>
       </w:pPr>
       <w:r>
@@ -4654,7 +4654,7 @@
       <w:pPr>
         <w:numPr>
           <w:ilvl w:val="0"/>
-          <w:numId w:val="12"/>
+          <w:numId w:val="17"/>
         </w:numPr>
       </w:pPr>
       <w:r>
@@ -4665,7 +4665,7 @@
       <w:pPr>
         <w:numPr>
           <w:ilvl w:val="0"/>
-          <w:numId w:val="12"/>
+          <w:numId w:val="17"/>
         </w:numPr>
       </w:pPr>
       <w:r>
@@ -4676,7 +4676,7 @@
       <w:pPr>
         <w:numPr>
           <w:ilvl w:val="0"/>
-          <w:numId w:val="12"/>
+          <w:numId w:val="17"/>
         </w:numPr>
       </w:pPr>
       <w:r>
@@ -4687,7 +4687,7 @@
       <w:pPr>
         <w:numPr>
           <w:ilvl w:val="0"/>
-          <w:numId w:val="12"/>
+          <w:numId w:val="17"/>
         </w:numPr>
       </w:pPr>
       <w:r>
@@ -4698,7 +4698,7 @@
       <w:pPr>
         <w:numPr>
           <w:ilvl w:val="0"/>
-          <w:numId w:val="12"/>
+          <w:numId w:val="17"/>
         </w:numPr>
       </w:pPr>
       <w:r>
@@ -4709,7 +4709,7 @@
       <w:pPr>
         <w:numPr>
           <w:ilvl w:val="0"/>
-          <w:numId w:val="12"/>
+          <w:numId w:val="17"/>
         </w:numPr>
       </w:pPr>
       <w:r>
@@ -4720,7 +4720,7 @@
       <w:pPr>
         <w:numPr>
           <w:ilvl w:val="0"/>
-          <w:numId w:val="12"/>
+          <w:numId w:val="17"/>
         </w:numPr>
       </w:pPr>
       <w:r>
@@ -4731,7 +4731,7 @@
       <w:pPr>
         <w:numPr>
           <w:ilvl w:val="0"/>
-          <w:numId w:val="12"/>
+          <w:numId w:val="17"/>
         </w:numPr>
       </w:pPr>
       <w:r>
@@ -4742,7 +4742,7 @@
       <w:pPr>
         <w:numPr>
           <w:ilvl w:val="0"/>
-          <w:numId w:val="12"/>
+          <w:numId w:val="17"/>
         </w:numPr>
       </w:pPr>
       <w:r>
@@ -4753,7 +4753,7 @@
       <w:pPr>
         <w:numPr>
           <w:ilvl w:val="0"/>
-          <w:numId w:val="12"/>
+          <w:numId w:val="17"/>
         </w:numPr>
       </w:pPr>
       <w:r>
@@ -4764,7 +4764,7 @@
       <w:pPr>
         <w:numPr>
           <w:ilvl w:val="0"/>
-          <w:numId w:val="12"/>
+          <w:numId w:val="17"/>
         </w:numPr>
       </w:pPr>
       <w:r>
@@ -4831,7 +4831,7 @@
       <w:pPr>
         <w:numPr>
           <w:ilvl w:val="0"/>
-          <w:numId w:val="13"/>
+          <w:numId w:val="18"/>
         </w:numPr>
       </w:pPr>
       <w:r>
@@ -4842,7 +4842,7 @@
       <w:pPr>
         <w:numPr>
           <w:ilvl w:val="0"/>
-          <w:numId w:val="13"/>
+          <w:numId w:val="18"/>
         </w:numPr>
       </w:pPr>
       <w:r>
@@ -4853,7 +4853,7 @@
       <w:pPr>
         <w:numPr>
           <w:ilvl w:val="0"/>
-          <w:numId w:val="13"/>
+          <w:numId w:val="18"/>
         </w:numPr>
       </w:pPr>
       <w:r>
@@ -4864,7 +4864,7 @@
       <w:pPr>
         <w:numPr>
           <w:ilvl w:val="0"/>
-          <w:numId w:val="13"/>
+          <w:numId w:val="18"/>
         </w:numPr>
       </w:pPr>
       <w:r>
@@ -4875,7 +4875,7 @@
       <w:pPr>
         <w:numPr>
           <w:ilvl w:val="0"/>
-          <w:numId w:val="13"/>
+          <w:numId w:val="18"/>
         </w:numPr>
       </w:pPr>
       <w:r>
@@ -4886,7 +4886,7 @@
       <w:pPr>
         <w:numPr>
           <w:ilvl w:val="0"/>
-          <w:numId w:val="13"/>
+          <w:numId w:val="18"/>
         </w:numPr>
       </w:pPr>
       <w:r>
@@ -4897,7 +4897,7 @@
       <w:pPr>
         <w:numPr>
           <w:ilvl w:val="0"/>
-          <w:numId w:val="13"/>
+          <w:numId w:val="18"/>
         </w:numPr>
       </w:pPr>
       <w:r>
@@ -4908,7 +4908,7 @@
       <w:pPr>
         <w:numPr>
           <w:ilvl w:val="0"/>
-          <w:numId w:val="13"/>
+          <w:numId w:val="18"/>
         </w:numPr>
       </w:pPr>
       <w:r>
@@ -4919,7 +4919,7 @@
       <w:pPr>
         <w:numPr>
           <w:ilvl w:val="0"/>
-          <w:numId w:val="13"/>
+          <w:numId w:val="18"/>
         </w:numPr>
       </w:pPr>
       <w:r>
@@ -4930,7 +4930,7 @@
       <w:pPr>
         <w:numPr>
           <w:ilvl w:val="0"/>
-          <w:numId w:val="13"/>
+          <w:numId w:val="18"/>
         </w:numPr>
       </w:pPr>
       <w:r>
@@ -4941,7 +4941,7 @@
       <w:pPr>
         <w:numPr>
           <w:ilvl w:val="0"/>
-          <w:numId w:val="13"/>
+          <w:numId w:val="18"/>
         </w:numPr>
       </w:pPr>
       <w:r>
@@ -4952,7 +4952,7 @@
       <w:pPr>
         <w:numPr>
           <w:ilvl w:val="0"/>
-          <w:numId w:val="13"/>
+          <w:numId w:val="18"/>
         </w:numPr>
       </w:pPr>
       <w:r>
@@ -4963,7 +4963,7 @@
       <w:pPr>
         <w:numPr>
           <w:ilvl w:val="0"/>
-          <w:numId w:val="13"/>
+          <w:numId w:val="18"/>
         </w:numPr>
       </w:pPr>
       <w:r>
@@ -4974,7 +4974,7 @@
       <w:pPr>
         <w:numPr>
           <w:ilvl w:val="0"/>
-          <w:numId w:val="13"/>
+          <w:numId w:val="18"/>
         </w:numPr>
       </w:pPr>
       <w:r>
@@ -4985,7 +4985,7 @@
       <w:pPr>
         <w:numPr>
           <w:ilvl w:val="0"/>
-          <w:numId w:val="13"/>
+          <w:numId w:val="18"/>
         </w:numPr>
       </w:pPr>
       <w:r>
@@ -4996,7 +4996,7 @@
       <w:pPr>
         <w:numPr>
           <w:ilvl w:val="0"/>
-          <w:numId w:val="13"/>
+          <w:numId w:val="18"/>
         </w:numPr>
       </w:pPr>
       <w:r>
@@ -5007,7 +5007,7 @@
       <w:pPr>
         <w:numPr>
           <w:ilvl w:val="0"/>
-          <w:numId w:val="13"/>
+          <w:numId w:val="18"/>
         </w:numPr>
       </w:pPr>
       <w:r>
@@ -5018,7 +5018,7 @@
       <w:pPr>
         <w:numPr>
           <w:ilvl w:val="0"/>
-          <w:numId w:val="13"/>
+          <w:numId w:val="18"/>
         </w:numPr>
       </w:pPr>
       <w:r>
@@ -5029,7 +5029,7 @@
       <w:pPr>
         <w:numPr>
           <w:ilvl w:val="0"/>
-          <w:numId w:val="13"/>
+          <w:numId w:val="18"/>
         </w:numPr>
       </w:pPr>
       <w:r>
@@ -5040,7 +5040,7 @@
       <w:pPr>
         <w:numPr>
           <w:ilvl w:val="0"/>
-          <w:numId w:val="13"/>
+          <w:numId w:val="18"/>
         </w:numPr>
       </w:pPr>
       <w:r>
@@ -5107,7 +5107,7 @@
       <w:pPr>
         <w:numPr>
           <w:ilvl w:val="0"/>
-          <w:numId w:val="14"/>
+          <w:numId w:val="19"/>
         </w:numPr>
       </w:pPr>
       <w:r>
@@ -5118,7 +5118,7 @@
       <w:pPr>
         <w:numPr>
           <w:ilvl w:val="0"/>
-          <w:numId w:val="14"/>
+          <w:numId w:val="19"/>
         </w:numPr>
       </w:pPr>
       <w:r>
@@ -5129,7 +5129,7 @@
       <w:pPr>
         <w:numPr>
           <w:ilvl w:val="0"/>
-          <w:numId w:val="14"/>
+          <w:numId w:val="19"/>
         </w:numPr>
       </w:pPr>
       <w:r>
@@ -5140,7 +5140,7 @@
       <w:pPr>
         <w:numPr>
           <w:ilvl w:val="0"/>
-          <w:numId w:val="14"/>
+          <w:numId w:val="19"/>
         </w:numPr>
       </w:pPr>
       <w:r>
@@ -5151,7 +5151,7 @@
       <w:pPr>
         <w:numPr>
           <w:ilvl w:val="0"/>
-          <w:numId w:val="14"/>
+          <w:numId w:val="19"/>
         </w:numPr>
       </w:pPr>
       <w:r>
@@ -5162,7 +5162,7 @@
       <w:pPr>
         <w:numPr>
           <w:ilvl w:val="0"/>
-          <w:numId w:val="14"/>
+          <w:numId w:val="19"/>
         </w:numPr>
       </w:pPr>
       <w:r>
@@ -5173,7 +5173,7 @@
       <w:pPr>
         <w:numPr>
           <w:ilvl w:val="0"/>
-          <w:numId w:val="14"/>
+          <w:numId w:val="19"/>
         </w:numPr>
       </w:pPr>
       <w:r>
@@ -5184,7 +5184,7 @@
       <w:pPr>
         <w:numPr>
           <w:ilvl w:val="0"/>
-          <w:numId w:val="14"/>
+          <w:numId w:val="19"/>
         </w:numPr>
       </w:pPr>
       <w:r>
@@ -5195,7 +5195,7 @@
       <w:pPr>
         <w:numPr>
           <w:ilvl w:val="0"/>
-          <w:numId w:val="14"/>
+          <w:numId w:val="19"/>
         </w:numPr>
       </w:pPr>
       <w:r>
@@ -5206,7 +5206,7 @@
       <w:pPr>
         <w:numPr>
           <w:ilvl w:val="0"/>
-          <w:numId w:val="14"/>
+          <w:numId w:val="19"/>
         </w:numPr>
       </w:pPr>
       <w:r>
@@ -5217,7 +5217,7 @@
       <w:pPr>
         <w:numPr>
           <w:ilvl w:val="0"/>
-          <w:numId w:val="14"/>
+          <w:numId w:val="19"/>
         </w:numPr>
       </w:pPr>
       <w:r>
@@ -5228,7 +5228,7 @@
       <w:pPr>
         <w:numPr>
           <w:ilvl w:val="0"/>
-          <w:numId w:val="14"/>
+          <w:numId w:val="19"/>
         </w:numPr>
       </w:pPr>
       <w:r>
@@ -5239,7 +5239,7 @@
       <w:pPr>
         <w:numPr>
           <w:ilvl w:val="0"/>
-          <w:numId w:val="14"/>
+          <w:numId w:val="19"/>
         </w:numPr>
       </w:pPr>
       <w:r>
@@ -5250,7 +5250,7 @@
       <w:pPr>
         <w:numPr>
           <w:ilvl w:val="0"/>
-          <w:numId w:val="14"/>
+          <w:numId w:val="19"/>
         </w:numPr>
       </w:pPr>
       <w:r>
@@ -5261,7 +5261,7 @@
       <w:pPr>
         <w:numPr>
           <w:ilvl w:val="0"/>
-          <w:numId w:val="14"/>
+          <w:numId w:val="19"/>
         </w:numPr>
       </w:pPr>
       <w:r>
@@ -5272,7 +5272,7 @@
       <w:pPr>
         <w:numPr>
           <w:ilvl w:val="0"/>
-          <w:numId w:val="14"/>
+          <w:numId w:val="19"/>
         </w:numPr>
       </w:pPr>
       <w:r>
@@ -5283,7 +5283,7 @@
       <w:pPr>
         <w:numPr>
           <w:ilvl w:val="0"/>
-          <w:numId w:val="14"/>
+          <w:numId w:val="19"/>
         </w:numPr>
       </w:pPr>
       <w:r>
@@ -5294,7 +5294,7 @@
       <w:pPr>
         <w:numPr>
           <w:ilvl w:val="0"/>
-          <w:numId w:val="14"/>
+          <w:numId w:val="19"/>
         </w:numPr>
       </w:pPr>
       <w:r>
@@ -5305,7 +5305,7 @@
       <w:pPr>
         <w:numPr>
           <w:ilvl w:val="0"/>
-          <w:numId w:val="14"/>
+          <w:numId w:val="19"/>
         </w:numPr>
       </w:pPr>
       <w:r>
@@ -5316,7 +5316,7 @@
       <w:pPr>
         <w:numPr>
           <w:ilvl w:val="0"/>
-          <w:numId w:val="14"/>
+          <w:numId w:val="19"/>
         </w:numPr>
       </w:pPr>
       <w:r>
@@ -5327,7 +5327,7 @@
       <w:pPr>
         <w:numPr>
           <w:ilvl w:val="0"/>
-          <w:numId w:val="14"/>
+          <w:numId w:val="19"/>
         </w:numPr>
       </w:pPr>
       <w:r>
@@ -5338,7 +5338,7 @@
       <w:pPr>
         <w:numPr>
           <w:ilvl w:val="0"/>
-          <w:numId w:val="14"/>
+          <w:numId w:val="19"/>
         </w:numPr>
       </w:pPr>
       <w:r>
@@ -5349,7 +5349,7 @@
       <w:pPr>
         <w:numPr>
           <w:ilvl w:val="0"/>
-          <w:numId w:val="14"/>
+          <w:numId w:val="19"/>
         </w:numPr>
       </w:pPr>
       <w:r>
@@ -5360,7 +5360,7 @@
       <w:pPr>
         <w:numPr>
           <w:ilvl w:val="0"/>
-          <w:numId w:val="14"/>
+          <w:numId w:val="19"/>
         </w:numPr>
       </w:pPr>
       <w:r>
@@ -5371,7 +5371,7 @@
       <w:pPr>
         <w:numPr>
           <w:ilvl w:val="0"/>
-          <w:numId w:val="14"/>
+          <w:numId w:val="19"/>
         </w:numPr>
       </w:pPr>
       <w:r>
@@ -5382,7 +5382,7 @@
       <w:pPr>
         <w:numPr>
           <w:ilvl w:val="0"/>
-          <w:numId w:val="14"/>
+          <w:numId w:val="19"/>
         </w:numPr>
       </w:pPr>
       <w:r>
@@ -27080,6 +27080,141 @@
       </w:pPr>
     </w:lvl>
   </w:abstractNum>
+  <w:abstractNum w:abstractNumId="14">
+    <w:multiLevelType w:val="hybridMultilevel"/>
+    <w:lvl w:ilvl="0">
+      <w:start w:val="1"/>
+      <w:numFmt w:val="decimal"/>
+      <w:lvlText w:val="%1."/>
+      <w:pPr>
+        <w:ind w:left="360" w:hanging="360"/>
+      </w:pPr>
+    </w:lvl>
+    <w:lvl w:ilvl="1">
+      <w:start w:val="1"/>
+      <w:numFmt w:val="decimal"/>
+      <w:lvlText w:val="%2."/>
+      <w:pPr>
+        <w:ind w:left="720" w:hanging="360"/>
+      </w:pPr>
+    </w:lvl>
+    <w:lvl w:ilvl="2">
+      <w:start w:val="1"/>
+      <w:numFmt w:val="decimal"/>
+      <w:lvlText w:val="%3."/>
+      <w:pPr>
+        <w:ind w:left="1080" w:hanging="360"/>
+      </w:pPr>
+    </w:lvl>
+  </w:abstractNum>
+  <w:abstractNum w:abstractNumId="15">
+    <w:multiLevelType w:val="hybridMultilevel"/>
+    <w:lvl w:ilvl="0">
+      <w:start w:val="1"/>
+      <w:numFmt w:val="decimal"/>
+      <w:lvlText w:val="%1."/>
+      <w:pPr>
+        <w:ind w:left="360" w:hanging="360"/>
+      </w:pPr>
+    </w:lvl>
+    <w:lvl w:ilvl="1">
+      <w:start w:val="1"/>
+      <w:numFmt w:val="decimal"/>
+      <w:lvlText w:val="%2."/>
+      <w:pPr>
+        <w:ind w:left="720" w:hanging="360"/>
+      </w:pPr>
+    </w:lvl>
+    <w:lvl w:ilvl="2">
+      <w:start w:val="1"/>
+      <w:numFmt w:val="decimal"/>
+      <w:lvlText w:val="%3."/>
+      <w:pPr>
+        <w:ind w:left="1080" w:hanging="360"/>
+      </w:pPr>
+    </w:lvl>
+  </w:abstractNum>
+  <w:abstractNum w:abstractNumId="16">
+    <w:multiLevelType w:val="hybridMultilevel"/>
+    <w:lvl w:ilvl="0">
+      <w:start w:val="1"/>
+      <w:numFmt w:val="decimal"/>
+      <w:lvlText w:val="%1."/>
+      <w:pPr>
+        <w:ind w:left="360" w:hanging="360"/>
+      </w:pPr>
+    </w:lvl>
+    <w:lvl w:ilvl="1">
+      <w:start w:val="1"/>
+      <w:numFmt w:val="decimal"/>
+      <w:lvlText w:val="%2."/>
+      <w:pPr>
+        <w:ind w:left="720" w:hanging="360"/>
+      </w:pPr>
+    </w:lvl>
+    <w:lvl w:ilvl="2">
+      <w:start w:val="1"/>
+      <w:numFmt w:val="decimal"/>
+      <w:lvlText w:val="%3."/>
+      <w:pPr>
+        <w:ind w:left="1080" w:hanging="360"/>
+      </w:pPr>
+    </w:lvl>
+  </w:abstractNum>
+  <w:abstractNum w:abstractNumId="17">
+    <w:multiLevelType w:val="hybridMultilevel"/>
+    <w:lvl w:ilvl="0">
+      <w:start w:val="1"/>
+      <w:numFmt w:val="decimal"/>
+      <w:lvlText w:val="%1."/>
+      <w:pPr>
+        <w:ind w:left="360" w:hanging="360"/>
+      </w:pPr>
+    </w:lvl>
+    <w:lvl w:ilvl="1">
+      <w:start w:val="1"/>
+      <w:numFmt w:val="decimal"/>
+      <w:lvlText w:val="%2."/>
+      <w:pPr>
+        <w:ind w:left="720" w:hanging="360"/>
+      </w:pPr>
+    </w:lvl>
+    <w:lvl w:ilvl="2">
+      <w:start w:val="1"/>
+      <w:numFmt w:val="decimal"/>
+      <w:lvlText w:val="%3."/>
+      <w:pPr>
+        <w:ind w:left="1080" w:hanging="360"/>
+      </w:pPr>
+    </w:lvl>
+  </w:abstractNum>
+  <w:abstractNum w:abstractNumId="18">
+    <w:multiLevelType w:val="hybridMultilevel"/>
+    <w:lvl w:ilvl="0">
+      <w:start w:val="1"/>
+      <w:numFmt w:val="decimal"/>
+      <w:lvlText w:val="%1."/>
+      <w:pPr>
+        <w:ind w:left="360" w:hanging="360"/>
+      </w:pPr>
+    </w:lvl>
+    <w:lvl w:ilvl="1">
+      <w:start w:val="1"/>
+      <w:numFmt w:val="decimal"/>
+      <w:lvlText w:val="%2."/>
+      <w:pPr>
+        <w:ind w:left="720" w:hanging="360"/>
+      </w:pPr>
+    </w:lvl>
+    <w:lvl w:ilvl="2">
+      <w:start w:val="1"/>
+      <w:numFmt w:val="decimal"/>
+      <w:lvlText w:val="%3."/>
+      <w:pPr>
+        <w:ind w:left="1080" w:hanging="360"/>
+      </w:pPr>
+    </w:lvl>
+  </w:abstractNum>
   <w:num w:numId="1">
     <w:abstractNumId w:val="8"/>
   </w:num>
@@ -27184,6 +27319,21 @@
   </w:num>
   <w:num w:numId="14">
     <w:abstractNumId w:val="13"/>
+  </w:num>
+  <w:num w:numId="15">
+    <w:abstractNumId w:val="14"/>
+  </w:num>
+  <w:num w:numId="16">
+    <w:abstractNumId w:val="15"/>
+  </w:num>
+  <w:num w:numId="17">
+    <w:abstractNumId w:val="16"/>
+  </w:num>
+  <w:num w:numId="18">
+    <w:abstractNumId w:val="17"/>
+  </w:num>
+  <w:num w:numId="19">
+    <w:abstractNumId w:val="18"/>
   </w:num>
 </w:numbering>
 </file>

</xml_diff>